<commit_message>
the summary table is dynamic with bonus also
</commit_message>
<xml_diff>
--- a/out-Angebot.docx
+++ b/out-Angebot.docx
@@ -312,7 +312,6 @@
               <w:rPr>
                 <w:spacing w:val="0"/>
                 <w:position w:val="0"/>
-                <w:shd w:fill="auto" w:val="clear"/>
               </w:rPr>
             </w:pPr>
             <w:r>
@@ -517,7 +516,6 @@
               <w:rPr>
                 <w:spacing w:val="0"/>
                 <w:position w:val="0"/>
-                <w:shd w:fill="auto" w:val="clear"/>
               </w:rPr>
             </w:pPr>
             <w:r>
@@ -766,7 +764,6 @@
                 <w:spacing w:val="0"/>
                 <w:position w:val="0"/>
                 <w:sz w:val="22"/>
-                <w:shd w:fill="auto" w:val="clear"/>
               </w:rPr>
             </w:pPr>
             <w:r>
@@ -807,7 +804,6 @@
                 <w:spacing w:val="0"/>
                 <w:position w:val="0"/>
                 <w:sz w:val="22"/>
-                <w:shd w:fill="auto" w:val="clear"/>
               </w:rPr>
             </w:pPr>
             <w:r>
@@ -849,7 +845,6 @@
                 <w:spacing w:val="0"/>
                 <w:position w:val="0"/>
                 <w:sz w:val="22"/>
-                <w:shd w:fill="auto" w:val="clear"/>
               </w:rPr>
             </w:pPr>
             <w:r>
@@ -891,7 +886,6 @@
                 <w:spacing w:val="0"/>
                 <w:position w:val="0"/>
                 <w:sz w:val="22"/>
-                <w:shd w:fill="auto" w:val="clear"/>
               </w:rPr>
             </w:pPr>
             <w:r>
@@ -933,7 +927,6 @@
                 <w:spacing w:val="0"/>
                 <w:position w:val="0"/>
                 <w:sz w:val="22"/>
-                <w:shd w:fill="auto" w:val="clear"/>
               </w:rPr>
             </w:pPr>
             <w:r>
@@ -979,7 +972,6 @@
               <w:rPr>
                 <w:spacing w:val="0"/>
                 <w:position w:val="0"/>
-                <w:shd w:fill="auto" w:val="clear"/>
               </w:rPr>
             </w:pPr>
             <w:r>
@@ -1019,7 +1011,6 @@
               <w:rPr>
                 <w:spacing w:val="0"/>
                 <w:position w:val="0"/>
-                <w:shd w:fill="auto" w:val="clear"/>
               </w:rPr>
             </w:pPr>
             <w:r>
@@ -1060,7 +1051,6 @@
                 <w:color w:val="auto"/>
                 <w:spacing w:val="0"/>
                 <w:position w:val="0"/>
-                <w:shd w:fill="auto" w:val="clear"/>
               </w:rPr>
             </w:pPr>
             <w:r>
@@ -1102,7 +1092,6 @@
                 <w:color w:val="auto"/>
                 <w:spacing w:val="0"/>
                 <w:position w:val="0"/>
-                <w:shd w:fill="auto" w:val="clear"/>
               </w:rPr>
             </w:pPr>
             <w:r>
@@ -1143,7 +1132,6 @@
                 <w:color w:val="auto"/>
                 <w:spacing w:val="0"/>
                 <w:position w:val="0"/>
-                <w:shd w:fill="auto" w:val="clear"/>
               </w:rPr>
             </w:pPr>
             <w:r>
@@ -1254,7 +1242,6 @@
                 <w:color w:val="auto"/>
                 <w:spacing w:val="0"/>
                 <w:position w:val="0"/>
-                <w:shd w:fill="auto" w:val="clear"/>
               </w:rPr>
             </w:pPr>
             <w:r>
@@ -1726,7 +1713,6 @@
               <w:rPr>
                 <w:spacing w:val="0"/>
                 <w:position w:val="0"/>
-                <w:shd w:fill="auto" w:val="clear"/>
               </w:rPr>
             </w:pPr>
             <w:r>
@@ -1766,7 +1752,6 @@
               <w:rPr>
                 <w:spacing w:val="0"/>
                 <w:position w:val="0"/>
-                <w:shd w:fill="auto" w:val="clear"/>
               </w:rPr>
             </w:pPr>
             <w:r>
@@ -1807,7 +1792,6 @@
                 <w:color w:val="auto"/>
                 <w:spacing w:val="0"/>
                 <w:position w:val="0"/>
-                <w:shd w:fill="auto" w:val="clear"/>
               </w:rPr>
             </w:pPr>
             <w:r>
@@ -1848,7 +1832,6 @@
                 <w:color w:val="auto"/>
                 <w:spacing w:val="0"/>
                 <w:position w:val="0"/>
-                <w:shd w:fill="auto" w:val="clear"/>
               </w:rPr>
             </w:pPr>
             <w:r>
@@ -1889,7 +1872,6 @@
                 <w:color w:val="auto"/>
                 <w:spacing w:val="0"/>
                 <w:position w:val="0"/>
-                <w:shd w:fill="auto" w:val="clear"/>
               </w:rPr>
             </w:pPr>
             <w:r>
@@ -1935,7 +1917,6 @@
               <w:rPr>
                 <w:spacing w:val="0"/>
                 <w:position w:val="0"/>
-                <w:shd w:fill="auto" w:val="clear"/>
               </w:rPr>
             </w:pPr>
             <w:r>
@@ -1975,7 +1956,6 @@
               <w:rPr>
                 <w:spacing w:val="0"/>
                 <w:position w:val="0"/>
-                <w:shd w:fill="auto" w:val="clear"/>
               </w:rPr>
             </w:pPr>
             <w:r>
@@ -2016,7 +1996,6 @@
                 <w:color w:val="auto"/>
                 <w:spacing w:val="0"/>
                 <w:position w:val="0"/>
-                <w:shd w:fill="auto" w:val="clear"/>
               </w:rPr>
             </w:pPr>
             <w:r>
@@ -2058,7 +2037,6 @@
                 <w:color w:val="auto"/>
                 <w:spacing w:val="0"/>
                 <w:position w:val="0"/>
-                <w:shd w:fill="auto" w:val="clear"/>
               </w:rPr>
             </w:pPr>
             <w:r>
@@ -2099,7 +2077,6 @@
                 <w:color w:val="auto"/>
                 <w:spacing w:val="0"/>
                 <w:position w:val="0"/>
-                <w:shd w:fill="auto" w:val="clear"/>
               </w:rPr>
             </w:pPr>
             <w:r>
@@ -2210,7 +2187,6 @@
                 <w:color w:val="auto"/>
                 <w:spacing w:val="0"/>
                 <w:position w:val="0"/>
-                <w:shd w:fill="auto" w:val="clear"/>
               </w:rPr>
             </w:pPr>
             <w:r>
@@ -2599,23 +2575,14 @@
               <w:ind w:right="-26" w:left="0" w:firstLine="0"/>
               <w:jc w:val="left"/>
               <w:rPr>
-                <w:color w:val="auto"/>
-                <w:spacing w:val="0"/>
-                <w:position w:val="0"/>
-                <w:shd w:fill="auto" w:val="clear"/>
-              </w:rPr>
-            </w:pPr>
-            <w:r>
-              <w:rPr>
-                <w:rFonts w:ascii="Open Sans" w:hAnsi="Open Sans" w:cs="Open Sans" w:eastAsia="Open Sans"/>
-                <w:color w:val="auto"/>
-                <w:spacing w:val="0"/>
-                <w:position w:val="0"/>
-                <w:sz w:val="20"/>
-                <w:shd w:fill="auto" w:val="clear"/>
-              </w:rPr>
-              <w:t xml:space="preserve">undefined</w:t>
-            </w:r>
+                <w:rFonts w:ascii="Calibri" w:hAnsi="Calibri" w:cs="Calibri" w:eastAsia="Calibri"/>
+                <w:color w:val="auto"/>
+                <w:spacing w:val="0"/>
+                <w:position w:val="0"/>
+                <w:sz w:val="22"/>
+                <w:shd w:fill="auto" w:val="clear"/>
+              </w:rPr>
+            </w:pPr>
           </w:p>
         </w:tc>
         <w:tc>
@@ -2640,23 +2607,14 @@
               <w:ind w:right="314" w:left="0" w:firstLine="0"/>
               <w:jc w:val="left"/>
               <w:rPr>
-                <w:color w:val="auto"/>
-                <w:spacing w:val="0"/>
-                <w:position w:val="0"/>
-                <w:shd w:fill="auto" w:val="clear"/>
-              </w:rPr>
-            </w:pPr>
-            <w:r>
-              <w:rPr>
-                <w:rFonts w:ascii="Open Sans" w:hAnsi="Open Sans" w:cs="Open Sans" w:eastAsia="Open Sans"/>
-                <w:color w:val="auto"/>
-                <w:spacing w:val="0"/>
-                <w:position w:val="0"/>
-                <w:sz w:val="20"/>
-                <w:shd w:fill="auto" w:val="clear"/>
-              </w:rPr>
-              <w:t xml:space="preserve">undefined</w:t>
-            </w:r>
+                <w:rFonts w:ascii="Calibri" w:hAnsi="Calibri" w:cs="Calibri" w:eastAsia="Calibri"/>
+                <w:color w:val="auto"/>
+                <w:spacing w:val="0"/>
+                <w:position w:val="0"/>
+                <w:sz w:val="22"/>
+                <w:shd w:fill="auto" w:val="clear"/>
+              </w:rPr>
+            </w:pPr>
           </w:p>
         </w:tc>
         <w:tc>
@@ -2684,7 +2642,6 @@
                 <w:color w:val="auto"/>
                 <w:spacing w:val="0"/>
                 <w:position w:val="0"/>
-                <w:shd w:fill="auto" w:val="clear"/>
               </w:rPr>
             </w:pPr>
             <w:r>
@@ -2725,7 +2682,6 @@
                 <w:color w:val="auto"/>
                 <w:spacing w:val="0"/>
                 <w:position w:val="0"/>
-                <w:shd w:fill="auto" w:val="clear"/>
               </w:rPr>
             </w:pPr>
             <w:r>
@@ -2766,7 +2722,6 @@
                 <w:color w:val="auto"/>
                 <w:spacing w:val="0"/>
                 <w:position w:val="0"/>
-                <w:shd w:fill="auto" w:val="clear"/>
               </w:rPr>
             </w:pPr>
             <w:r>
@@ -2810,23 +2765,14 @@
               <w:ind w:right="-26" w:left="0" w:firstLine="0"/>
               <w:jc w:val="left"/>
               <w:rPr>
-                <w:color w:val="auto"/>
-                <w:spacing w:val="0"/>
-                <w:position w:val="0"/>
-                <w:shd w:fill="auto" w:val="clear"/>
-              </w:rPr>
-            </w:pPr>
-            <w:r>
-              <w:rPr>
-                <w:rFonts w:ascii="Open Sans" w:hAnsi="Open Sans" w:cs="Open Sans" w:eastAsia="Open Sans"/>
-                <w:color w:val="auto"/>
-                <w:spacing w:val="0"/>
-                <w:position w:val="0"/>
-                <w:sz w:val="20"/>
-                <w:shd w:fill="auto" w:val="clear"/>
-              </w:rPr>
-              <w:t xml:space="preserve">undefined</w:t>
-            </w:r>
+                <w:rFonts w:ascii="Calibri" w:hAnsi="Calibri" w:cs="Calibri" w:eastAsia="Calibri"/>
+                <w:color w:val="auto"/>
+                <w:spacing w:val="0"/>
+                <w:position w:val="0"/>
+                <w:sz w:val="22"/>
+                <w:shd w:fill="auto" w:val="clear"/>
+              </w:rPr>
+            </w:pPr>
           </w:p>
         </w:tc>
         <w:tc>
@@ -2851,23 +2797,14 @@
               <w:ind w:right="314" w:left="0" w:firstLine="0"/>
               <w:jc w:val="left"/>
               <w:rPr>
-                <w:color w:val="auto"/>
-                <w:spacing w:val="0"/>
-                <w:position w:val="0"/>
-                <w:shd w:fill="auto" w:val="clear"/>
-              </w:rPr>
-            </w:pPr>
-            <w:r>
-              <w:rPr>
-                <w:rFonts w:ascii="Open Sans" w:hAnsi="Open Sans" w:cs="Open Sans" w:eastAsia="Open Sans"/>
-                <w:color w:val="auto"/>
-                <w:spacing w:val="0"/>
-                <w:position w:val="0"/>
-                <w:sz w:val="20"/>
-                <w:shd w:fill="auto" w:val="clear"/>
-              </w:rPr>
-              <w:t xml:space="preserve">undefined</w:t>
-            </w:r>
+                <w:rFonts w:ascii="Calibri" w:hAnsi="Calibri" w:cs="Calibri" w:eastAsia="Calibri"/>
+                <w:color w:val="auto"/>
+                <w:spacing w:val="0"/>
+                <w:position w:val="0"/>
+                <w:sz w:val="22"/>
+                <w:shd w:fill="auto" w:val="clear"/>
+              </w:rPr>
+            </w:pPr>
           </w:p>
         </w:tc>
         <w:tc>
@@ -2895,7 +2832,6 @@
                 <w:color w:val="auto"/>
                 <w:spacing w:val="0"/>
                 <w:position w:val="0"/>
-                <w:shd w:fill="auto" w:val="clear"/>
               </w:rPr>
             </w:pPr>
             <w:r>
@@ -2936,7 +2872,6 @@
                 <w:color w:val="auto"/>
                 <w:spacing w:val="0"/>
                 <w:position w:val="0"/>
-                <w:shd w:fill="auto" w:val="clear"/>
               </w:rPr>
             </w:pPr>
             <w:r>
@@ -2977,7 +2912,6 @@
                 <w:color w:val="auto"/>
                 <w:spacing w:val="0"/>
                 <w:position w:val="0"/>
-                <w:shd w:fill="auto" w:val="clear"/>
               </w:rPr>
             </w:pPr>
             <w:r>
@@ -3051,7 +2985,6 @@
               <w:rPr>
                 <w:spacing w:val="0"/>
                 <w:position w:val="0"/>
-                <w:shd w:fill="auto" w:val="clear"/>
               </w:rPr>
             </w:pPr>
             <w:r>
@@ -3157,7 +3090,6 @@
                 <w:spacing w:val="0"/>
                 <w:position w:val="0"/>
                 <w:sz w:val="22"/>
-                <w:shd w:fill="auto" w:val="clear"/>
               </w:rPr>
             </w:pPr>
             <w:r>
@@ -3203,7 +3135,6 @@
               <w:rPr>
                 <w:spacing w:val="0"/>
                 <w:position w:val="0"/>
-                <w:shd w:fill="auto" w:val="clear"/>
               </w:rPr>
             </w:pPr>
             <w:r>
@@ -3215,7 +3146,7 @@
                 <w:sz w:val="20"/>
                 <w:shd w:fill="auto" w:val="clear"/>
               </w:rPr>
-              <w:t xml:space="preserve">zzgl. 19% MwSt.</w:t>
+              <w:t xml:space="preserve">Rabatt</w:t>
             </w:r>
           </w:p>
         </w:tc>
@@ -3309,7 +3240,6 @@
                 <w:spacing w:val="0"/>
                 <w:position w:val="0"/>
                 <w:sz w:val="22"/>
-                <w:shd w:fill="auto" w:val="clear"/>
               </w:rPr>
             </w:pPr>
             <w:r>
@@ -3321,7 +3251,7 @@
                 <w:sz w:val="22"/>
                 <w:shd w:fill="auto" w:val="clear"/>
               </w:rPr>
-              <w:t xml:space="preserve">581,02 €</w:t>
+              <w:t xml:space="preserve">8,20 €</w:t>
             </w:r>
           </w:p>
         </w:tc>
@@ -3355,7 +3285,6 @@
               <w:rPr>
                 <w:spacing w:val="0"/>
                 <w:position w:val="0"/>
-                <w:shd w:fill="auto" w:val="clear"/>
               </w:rPr>
             </w:pPr>
             <w:r>
@@ -3367,7 +3296,7 @@
                 <w:sz w:val="20"/>
                 <w:shd w:fill="auto" w:val="clear"/>
               </w:rPr>
-              <w:t xml:space="preserve">Gesamtsumme</w:t>
+              <w:t xml:space="preserve">zzgl. 19% MwSt.</w:t>
             </w:r>
           </w:p>
         </w:tc>
@@ -3461,7 +3390,6 @@
                 <w:spacing w:val="0"/>
                 <w:position w:val="0"/>
                 <w:sz w:val="22"/>
-                <w:shd w:fill="auto" w:val="clear"/>
               </w:rPr>
             </w:pPr>
             <w:r>
@@ -3473,7 +3401,7 @@
                 <w:sz w:val="22"/>
                 <w:shd w:fill="auto" w:val="clear"/>
               </w:rPr>
-              <w:t xml:space="preserve">3.639,04 €</w:t>
+              <w:t xml:space="preserve">581,02 €</w:t>
             </w:r>
           </w:p>
         </w:tc>
@@ -3507,7 +3435,6 @@
               <w:rPr>
                 <w:spacing w:val="0"/>
                 <w:position w:val="0"/>
-                <w:shd w:fill="auto" w:val="clear"/>
               </w:rPr>
             </w:pPr>
             <w:r>
@@ -3519,7 +3446,7 @@
                 <w:sz w:val="20"/>
                 <w:shd w:fill="auto" w:val="clear"/>
               </w:rPr>
-              <w:t xml:space="preserve">Rabatt</w:t>
+              <w:t xml:space="preserve">Gesamtsumme</w:t>
             </w:r>
           </w:p>
         </w:tc>
@@ -3613,7 +3540,6 @@
                 <w:spacing w:val="0"/>
                 <w:position w:val="0"/>
                 <w:sz w:val="22"/>
-                <w:shd w:fill="auto" w:val="clear"/>
               </w:rPr>
             </w:pPr>
             <w:r>
@@ -3625,7 +3551,7 @@
                 <w:sz w:val="22"/>
                 <w:shd w:fill="auto" w:val="clear"/>
               </w:rPr>
-              <w:t xml:space="preserve">2,46 €</w:t>
+              <w:t xml:space="preserve">3.639,04 €</w:t>
             </w:r>
           </w:p>
         </w:tc>
@@ -3659,7 +3585,6 @@
               <w:rPr>
                 <w:spacing w:val="0"/>
                 <w:position w:val="0"/>
-                <w:shd w:fill="auto" w:val="clear"/>
               </w:rPr>
             </w:pPr>
             <w:r>
@@ -3765,7 +3690,6 @@
                 <w:spacing w:val="0"/>
                 <w:position w:val="0"/>
                 <w:sz w:val="22"/>
-                <w:shd w:fill="auto" w:val="clear"/>
               </w:rPr>
             </w:pPr>
             <w:r>
@@ -3777,7 +3701,7 @@
                 <w:sz w:val="22"/>
                 <w:shd w:fill="auto" w:val="clear"/>
               </w:rPr>
-              <w:t xml:space="preserve">3.636,12 €</w:t>
+              <w:t xml:space="preserve">3.629,29 €</w:t>
             </w:r>
           </w:p>
         </w:tc>

</xml_diff>

<commit_message>
little bold fields in the docx template
</commit_message>
<xml_diff>
--- a/out-Angebot.docx
+++ b/out-Angebot.docx
@@ -2541,484 +2541,6 @@
           </w:p>
         </w:tc>
       </w:tr>
-      <w:tr>
-        <w:trPr>
-          <w:trHeight w:val="1" w:hRule="atLeast"/>
-          <w:jc w:val="left"/>
-        </w:trPr>
-        <w:tc>
-          <w:tcPr>
-            <w:tcW w:w="660" w:type="dxa"/>
-            <w:tcBorders>
-              <w:top w:val="single" w:color="ffffff" w:sz="8"/>
-              <w:left w:val="single" w:color="ffffff" w:sz="8"/>
-              <w:bottom w:val="single" w:color="ffffff" w:sz="8"/>
-              <w:right w:val="single" w:color="ffffff" w:sz="8"/>
-            </w:tcBorders>
-            <w:shd w:color="000000" w:fill="ffffff" w:val="clear"/>
-            <w:tcMar>
-              <w:left w:w="56" w:type="dxa"/>
-              <w:right w:w="56" w:type="dxa"/>
-            </w:tcMar>
-            <w:vAlign w:val="top"/>
-          </w:tcPr>
-          <w:p>
-            <w:pPr>
-              <w:spacing w:before="0" w:after="0" w:line="278"/>
-              <w:ind w:right="-26" w:left="0" w:firstLine="0"/>
-              <w:jc w:val="left"/>
-              <w:rPr>
-                <w:color w:val="auto"/>
-                <w:spacing w:val="0"/>
-                <w:position w:val="0"/>
-                <w:shd w:fill="auto" w:val="clear"/>
-              </w:rPr>
-            </w:pPr>
-            <w:r>
-              <w:rPr>
-                <w:rFonts w:ascii="Open Sans" w:hAnsi="Open Sans" w:cs="Open Sans" w:eastAsia="Open Sans"/>
-                <w:color w:val="auto"/>
-                <w:spacing w:val="0"/>
-                <w:position w:val="0"/>
-                <w:sz w:val="20"/>
-                <w:shd w:fill="auto" w:val="clear"/>
-              </w:rPr>
-              <w:t xml:space="preserve">003</w:t>
-            </w:r>
-          </w:p>
-        </w:tc>
-        <w:tc>
-          <w:tcPr>
-            <w:tcW w:w="1035" w:type="dxa"/>
-            <w:tcBorders>
-              <w:top w:val="single" w:color="ffffff" w:sz="8"/>
-              <w:left w:val="single" w:color="ffffff" w:sz="8"/>
-              <w:bottom w:val="single" w:color="ffffff" w:sz="8"/>
-              <w:right w:val="single" w:color="ffffff" w:sz="8"/>
-            </w:tcBorders>
-            <w:shd w:color="000000" w:fill="ffffff" w:val="clear"/>
-            <w:tcMar>
-              <w:left w:w="56" w:type="dxa"/>
-              <w:right w:w="56" w:type="dxa"/>
-            </w:tcMar>
-            <w:vAlign w:val="top"/>
-          </w:tcPr>
-          <w:p>
-            <w:pPr>
-              <w:spacing w:before="0" w:after="0" w:line="278"/>
-              <w:ind w:right="314" w:left="0" w:firstLine="0"/>
-              <w:jc w:val="left"/>
-              <w:rPr>
-                <w:color w:val="auto"/>
-                <w:spacing w:val="0"/>
-                <w:position w:val="0"/>
-                <w:shd w:fill="auto" w:val="clear"/>
-              </w:rPr>
-            </w:pPr>
-            <w:r>
-              <w:rPr>
-                <w:rFonts w:ascii="Open Sans" w:hAnsi="Open Sans" w:cs="Open Sans" w:eastAsia="Open Sans"/>
-                <w:color w:val="auto"/>
-                <w:spacing w:val="0"/>
-                <w:position w:val="0"/>
-                <w:sz w:val="20"/>
-                <w:shd w:fill="auto" w:val="clear"/>
-              </w:rPr>
-              <w:t xml:space="preserve">1 Stk</w:t>
-            </w:r>
-          </w:p>
-        </w:tc>
-        <w:tc>
-          <w:tcPr>
-            <w:tcW w:w="4107" w:type="dxa"/>
-            <w:tcBorders>
-              <w:top w:val="single" w:color="ffffff" w:sz="8"/>
-              <w:left w:val="single" w:color="ffffff" w:sz="8"/>
-              <w:bottom w:val="single" w:color="ffffff" w:sz="8"/>
-              <w:right w:val="single" w:color="ffffff" w:sz="8"/>
-            </w:tcBorders>
-            <w:shd w:color="000000" w:fill="ffffff" w:val="clear"/>
-            <w:tcMar>
-              <w:left w:w="56" w:type="dxa"/>
-              <w:right w:w="56" w:type="dxa"/>
-            </w:tcMar>
-            <w:vAlign w:val="top"/>
-          </w:tcPr>
-          <w:p>
-            <w:pPr>
-              <w:spacing w:before="0" w:after="0" w:line="278"/>
-              <w:ind w:right="314" w:left="0" w:firstLine="0"/>
-              <w:jc w:val="left"/>
-              <w:rPr>
-                <w:rFonts w:ascii="Open Sans" w:hAnsi="Open Sans" w:cs="Open Sans" w:eastAsia="Open Sans"/>
-                <w:b/>
-                <w:color w:val="auto"/>
-                <w:spacing w:val="0"/>
-                <w:position w:val="0"/>
-                <w:sz w:val="20"/>
-                <w:shd w:fill="auto" w:val="clear"/>
-              </w:rPr>
-            </w:pPr>
-            <w:r>
-              <w:rPr>
-                <w:rFonts w:ascii="Open Sans" w:hAnsi="Open Sans" w:cs="Open Sans" w:eastAsia="Open Sans"/>
-                <w:b/>
-                <w:color w:val="auto"/>
-                <w:spacing w:val="0"/>
-                <w:position w:val="0"/>
-                <w:sz w:val="20"/>
-                <w:shd w:fill="auto" w:val="clear"/>
-              </w:rPr>
-              <w:t xml:space="preserve">Aktion: Haltegriff</w:t>
-            </w:r>
-          </w:p>
-          <w:p>
-            <w:pPr>
-              <w:spacing w:before="0" w:after="0" w:line="278"/>
-              <w:ind w:right="314" w:left="0" w:firstLine="0"/>
-              <w:jc w:val="left"/>
-              <w:rPr>
-                <w:color w:val="auto"/>
-                <w:spacing w:val="0"/>
-                <w:position w:val="0"/>
-                <w:shd w:fill="auto" w:val="clear"/>
-              </w:rPr>
-            </w:pPr>
-            <w:r>
-              <w:rPr>
-                <w:rFonts w:ascii="Open Sans" w:hAnsi="Open Sans" w:cs="Open Sans" w:eastAsia="Open Sans"/>
-                <w:color w:val="auto"/>
-                <w:spacing w:val="0"/>
-                <w:position w:val="0"/>
-                <w:sz w:val="20"/>
-                <w:shd w:fill="auto" w:val="clear"/>
-              </w:rPr>
-              <w:t xml:space="preserve">– 1 Haltegriff gratis im Wert von 175 € inkl. Lieferung und Montage</w:t>
-            </w:r>
-          </w:p>
-        </w:tc>
-        <w:tc>
-          <w:tcPr>
-            <w:tcW w:w="2268" w:type="dxa"/>
-            <w:tcBorders>
-              <w:top w:val="single" w:color="ffffff" w:sz="8"/>
-              <w:left w:val="single" w:color="ffffff" w:sz="8"/>
-              <w:bottom w:val="single" w:color="ffffff" w:sz="8"/>
-              <w:right w:val="single" w:color="ffffff" w:sz="8"/>
-            </w:tcBorders>
-            <w:shd w:color="000000" w:fill="ffffff" w:val="clear"/>
-            <w:tcMar>
-              <w:left w:w="56" w:type="dxa"/>
-              <w:right w:w="56" w:type="dxa"/>
-            </w:tcMar>
-            <w:vAlign w:val="top"/>
-          </w:tcPr>
-          <w:p>
-            <w:pPr>
-              <w:spacing w:before="0" w:after="0" w:line="278"/>
-              <w:ind w:right="314" w:left="0" w:firstLine="0"/>
-              <w:jc w:val="left"/>
-              <w:rPr>
-                <w:color w:val="auto"/>
-                <w:spacing w:val="0"/>
-                <w:position w:val="0"/>
-                <w:shd w:fill="auto" w:val="clear"/>
-              </w:rPr>
-            </w:pPr>
-            <w:r>
-              <w:rPr>
-                <w:rFonts w:ascii="Open Sans" w:hAnsi="Open Sans" w:cs="Open Sans" w:eastAsia="Open Sans"/>
-                <w:color w:val="auto"/>
-                <w:spacing w:val="0"/>
-                <w:position w:val="0"/>
-                <w:sz w:val="20"/>
-                <w:shd w:fill="auto" w:val="clear"/>
-              </w:rPr>
-              <w:t xml:space="preserve">-147,06 €</w:t>
-            </w:r>
-          </w:p>
-        </w:tc>
-        <w:tc>
-          <w:tcPr>
-            <w:tcW w:w="1710" w:type="dxa"/>
-            <w:tcBorders>
-              <w:top w:val="single" w:color="ffffff" w:sz="8"/>
-              <w:left w:val="single" w:color="ffffff" w:sz="8"/>
-              <w:bottom w:val="single" w:color="ffffff" w:sz="8"/>
-              <w:right w:val="single" w:color="ffffff" w:sz="8"/>
-            </w:tcBorders>
-            <w:shd w:color="000000" w:fill="ffffff" w:val="clear"/>
-            <w:tcMar>
-              <w:left w:w="56" w:type="dxa"/>
-              <w:right w:w="56" w:type="dxa"/>
-            </w:tcMar>
-            <w:vAlign w:val="top"/>
-          </w:tcPr>
-          <w:p>
-            <w:pPr>
-              <w:spacing w:before="0" w:after="0" w:line="278"/>
-              <w:ind w:right="314" w:left="0" w:firstLine="0"/>
-              <w:jc w:val="left"/>
-              <w:rPr>
-                <w:color w:val="auto"/>
-                <w:spacing w:val="0"/>
-                <w:position w:val="0"/>
-                <w:shd w:fill="auto" w:val="clear"/>
-              </w:rPr>
-            </w:pPr>
-            <w:r>
-              <w:rPr>
-                <w:rFonts w:ascii="Open Sans" w:hAnsi="Open Sans" w:cs="Open Sans" w:eastAsia="Open Sans"/>
-                <w:color w:val="auto"/>
-                <w:spacing w:val="0"/>
-                <w:position w:val="0"/>
-                <w:sz w:val="20"/>
-                <w:shd w:fill="auto" w:val="clear"/>
-              </w:rPr>
-              <w:t xml:space="preserve">-147,06 €</w:t>
-            </w:r>
-          </w:p>
-        </w:tc>
-      </w:tr>
-      <w:tr>
-        <w:trPr>
-          <w:trHeight w:val="1" w:hRule="atLeast"/>
-          <w:jc w:val="left"/>
-        </w:trPr>
-        <w:tc>
-          <w:tcPr>
-            <w:tcW w:w="660" w:type="dxa"/>
-            <w:tcBorders>
-              <w:top w:val="single" w:color="ffffff" w:sz="8"/>
-              <w:left w:val="single" w:color="ffffff" w:sz="8"/>
-              <w:bottom w:val="single" w:color="ffffff" w:sz="8"/>
-              <w:right w:val="single" w:color="ffffff" w:sz="8"/>
-            </w:tcBorders>
-            <w:shd w:color="000000" w:fill="ffffff" w:val="clear"/>
-            <w:tcMar>
-              <w:left w:w="56" w:type="dxa"/>
-              <w:right w:w="56" w:type="dxa"/>
-            </w:tcMar>
-            <w:vAlign w:val="top"/>
-          </w:tcPr>
-          <w:p>
-            <w:pPr>
-              <w:spacing w:before="0" w:after="0" w:line="278"/>
-              <w:ind w:right="-26" w:left="0" w:firstLine="0"/>
-              <w:jc w:val="left"/>
-              <w:rPr>
-                <w:color w:val="auto"/>
-                <w:spacing w:val="0"/>
-                <w:position w:val="0"/>
-                <w:shd w:fill="auto" w:val="clear"/>
-              </w:rPr>
-            </w:pPr>
-            <w:r>
-              <w:rPr>
-                <w:rFonts w:ascii="Open Sans" w:hAnsi="Open Sans" w:cs="Open Sans" w:eastAsia="Open Sans"/>
-                <w:color w:val="auto"/>
-                <w:spacing w:val="0"/>
-                <w:position w:val="0"/>
-                <w:sz w:val="20"/>
-                <w:shd w:fill="auto" w:val="clear"/>
-              </w:rPr>
-              <w:t xml:space="preserve">004</w:t>
-            </w:r>
-          </w:p>
-        </w:tc>
-        <w:tc>
-          <w:tcPr>
-            <w:tcW w:w="1035" w:type="dxa"/>
-            <w:tcBorders>
-              <w:top w:val="single" w:color="ffffff" w:sz="8"/>
-              <w:left w:val="single" w:color="ffffff" w:sz="8"/>
-              <w:bottom w:val="single" w:color="ffffff" w:sz="8"/>
-              <w:right w:val="single" w:color="ffffff" w:sz="8"/>
-            </w:tcBorders>
-            <w:shd w:color="000000" w:fill="ffffff" w:val="clear"/>
-            <w:tcMar>
-              <w:left w:w="56" w:type="dxa"/>
-              <w:right w:w="56" w:type="dxa"/>
-            </w:tcMar>
-            <w:vAlign w:val="top"/>
-          </w:tcPr>
-          <w:p>
-            <w:pPr>
-              <w:spacing w:before="0" w:after="0" w:line="278"/>
-              <w:ind w:right="314" w:left="0" w:firstLine="0"/>
-              <w:jc w:val="left"/>
-              <w:rPr>
-                <w:color w:val="auto"/>
-                <w:spacing w:val="0"/>
-                <w:position w:val="0"/>
-                <w:shd w:fill="auto" w:val="clear"/>
-              </w:rPr>
-            </w:pPr>
-            <w:r>
-              <w:rPr>
-                <w:rFonts w:ascii="Open Sans" w:hAnsi="Open Sans" w:cs="Open Sans" w:eastAsia="Open Sans"/>
-                <w:color w:val="auto"/>
-                <w:spacing w:val="0"/>
-                <w:position w:val="0"/>
-                <w:sz w:val="20"/>
-                <w:shd w:fill="auto" w:val="clear"/>
-              </w:rPr>
-              <w:t xml:space="preserve">1 Stk</w:t>
-            </w:r>
-          </w:p>
-        </w:tc>
-        <w:tc>
-          <w:tcPr>
-            <w:tcW w:w="4107" w:type="dxa"/>
-            <w:tcBorders>
-              <w:top w:val="single" w:color="ffffff" w:sz="8"/>
-              <w:left w:val="single" w:color="ffffff" w:sz="8"/>
-              <w:bottom w:val="single" w:color="ffffff" w:sz="8"/>
-              <w:right w:val="single" w:color="ffffff" w:sz="8"/>
-            </w:tcBorders>
-            <w:shd w:color="000000" w:fill="ffffff" w:val="clear"/>
-            <w:tcMar>
-              <w:left w:w="56" w:type="dxa"/>
-              <w:right w:w="56" w:type="dxa"/>
-            </w:tcMar>
-            <w:vAlign w:val="top"/>
-          </w:tcPr>
-          <w:p>
-            <w:pPr>
-              <w:spacing w:before="0" w:after="0" w:line="278"/>
-              <w:ind w:right="314" w:left="0" w:firstLine="0"/>
-              <w:jc w:val="left"/>
-              <w:rPr>
-                <w:rFonts w:ascii="Open Sans" w:hAnsi="Open Sans" w:cs="Open Sans" w:eastAsia="Open Sans"/>
-                <w:b/>
-                <w:color w:val="auto"/>
-                <w:spacing w:val="0"/>
-                <w:position w:val="0"/>
-                <w:sz w:val="20"/>
-                <w:shd w:fill="auto" w:val="clear"/>
-              </w:rPr>
-            </w:pPr>
-            <w:r>
-              <w:rPr>
-                <w:rFonts w:ascii="Open Sans" w:hAnsi="Open Sans" w:cs="Open Sans" w:eastAsia="Open Sans"/>
-                <w:b/>
-                <w:color w:val="auto"/>
-                <w:spacing w:val="0"/>
-                <w:position w:val="0"/>
-                <w:sz w:val="20"/>
-                <w:shd w:fill="auto" w:val="clear"/>
-              </w:rPr>
-              <w:t xml:space="preserve">Bestandkundenbonus:</w:t>
-            </w:r>
-          </w:p>
-          <w:p>
-            <w:pPr>
-              <w:spacing w:before="0" w:after="0" w:line="278"/>
-              <w:ind w:right="314" w:left="0" w:firstLine="0"/>
-              <w:jc w:val="left"/>
-              <w:rPr>
-                <w:color w:val="auto"/>
-                <w:spacing w:val="0"/>
-                <w:position w:val="0"/>
-                <w:shd w:fill="auto" w:val="clear"/>
-              </w:rPr>
-            </w:pPr>
-            <w:r>
-              <w:rPr>
-                <w:rFonts w:ascii="Open Sans" w:hAnsi="Open Sans" w:cs="Open Sans" w:eastAsia="Open Sans"/>
-                <w:color w:val="auto"/>
-                <w:spacing w:val="0"/>
-                <w:position w:val="0"/>
-                <w:sz w:val="20"/>
-                <w:shd w:fill="auto" w:val="clear"/>
-              </w:rPr>
-              <w:t xml:space="preserve">– Rabatt von 300 € ab einem Gesamtwert von 3.000</w:t>
-            </w:r>
-          </w:p>
-        </w:tc>
-        <w:tc>
-          <w:tcPr>
-            <w:tcW w:w="2268" w:type="dxa"/>
-            <w:tcBorders>
-              <w:top w:val="single" w:color="ffffff" w:sz="8"/>
-              <w:left w:val="single" w:color="ffffff" w:sz="8"/>
-              <w:bottom w:val="single" w:color="ffffff" w:sz="8"/>
-              <w:right w:val="single" w:color="ffffff" w:sz="8"/>
-            </w:tcBorders>
-            <w:shd w:color="000000" w:fill="ffffff" w:val="clear"/>
-            <w:tcMar>
-              <w:left w:w="56" w:type="dxa"/>
-              <w:right w:w="56" w:type="dxa"/>
-            </w:tcMar>
-            <w:vAlign w:val="top"/>
-          </w:tcPr>
-          <w:p>
-            <w:pPr>
-              <w:spacing w:before="0" w:after="0" w:line="278"/>
-              <w:ind w:right="314" w:left="0" w:firstLine="0"/>
-              <w:jc w:val="left"/>
-              <w:rPr>
-                <w:color w:val="auto"/>
-                <w:spacing w:val="0"/>
-                <w:position w:val="0"/>
-                <w:shd w:fill="auto" w:val="clear"/>
-              </w:rPr>
-            </w:pPr>
-            <w:r>
-              <w:rPr>
-                <w:rFonts w:ascii="Open Sans" w:hAnsi="Open Sans" w:cs="Open Sans" w:eastAsia="Open Sans"/>
-                <w:color w:val="auto"/>
-                <w:spacing w:val="0"/>
-                <w:position w:val="0"/>
-                <w:sz w:val="20"/>
-                <w:shd w:fill="auto" w:val="clear"/>
-              </w:rPr>
-              <w:t xml:space="preserve">-252,10 €</w:t>
-            </w:r>
-          </w:p>
-        </w:tc>
-        <w:tc>
-          <w:tcPr>
-            <w:tcW w:w="1710" w:type="dxa"/>
-            <w:tcBorders>
-              <w:top w:val="single" w:color="ffffff" w:sz="8"/>
-              <w:left w:val="single" w:color="ffffff" w:sz="8"/>
-              <w:bottom w:val="single" w:color="ffffff" w:sz="8"/>
-              <w:right w:val="single" w:color="ffffff" w:sz="8"/>
-            </w:tcBorders>
-            <w:shd w:color="000000" w:fill="ffffff" w:val="clear"/>
-            <w:tcMar>
-              <w:left w:w="56" w:type="dxa"/>
-              <w:right w:w="56" w:type="dxa"/>
-            </w:tcMar>
-            <w:vAlign w:val="top"/>
-          </w:tcPr>
-          <w:p>
-            <w:pPr>
-              <w:spacing w:before="0" w:after="0" w:line="278"/>
-              <w:ind w:right="314" w:left="0" w:firstLine="0"/>
-              <w:jc w:val="left"/>
-              <w:rPr>
-                <w:color w:val="auto"/>
-                <w:spacing w:val="0"/>
-                <w:position w:val="0"/>
-                <w:shd w:fill="auto" w:val="clear"/>
-              </w:rPr>
-            </w:pPr>
-            <w:r>
-              <w:rPr>
-                <w:rFonts w:ascii="Open Sans" w:hAnsi="Open Sans" w:cs="Open Sans" w:eastAsia="Open Sans"/>
-                <w:color w:val="auto"/>
-                <w:spacing w:val="0"/>
-                <w:position w:val="0"/>
-                <w:sz w:val="20"/>
-                <w:shd w:fill="auto" w:val="clear"/>
-              </w:rPr>
-              <w:t xml:space="preserve">-252,10 €</w:t>
-            </w:r>
-          </w:p>
-        </w:tc>
-      </w:tr>
     </w:tbl>
     <w:p>
       <w:pPr>
@@ -3276,7 +2798,7 @@
                 <w:sz w:val="20"/>
                 <w:shd w:fill="auto" w:val="clear"/>
               </w:rPr>
-              <w:t xml:space="preserve">Rabatt</w:t>
+              <w:t xml:space="preserve">zzgl. 19% MwSt.</w:t>
             </w:r>
           </w:p>
         </w:tc>
@@ -3383,7 +2905,7 @@
                 <w:sz w:val="22"/>
                 <w:shd w:fill="auto" w:val="clear"/>
               </w:rPr>
-              <w:t xml:space="preserve">3,28 €</w:t>
+              <w:t xml:space="preserve">581,02 €</w:t>
             </w:r>
             <w:r>
               <w:rPr>
@@ -3452,7 +2974,7 @@
                 <w:sz w:val="20"/>
                 <w:shd w:fill="auto" w:val="clear"/>
               </w:rPr>
-              <w:t xml:space="preserve">zzgl. 19% MwSt.</w:t>
+              <w:t xml:space="preserve">Gesamtsumme</w:t>
             </w:r>
           </w:p>
         </w:tc>
@@ -3559,535 +3081,7 @@
                 <w:sz w:val="22"/>
                 <w:shd w:fill="auto" w:val="clear"/>
               </w:rPr>
-              <w:t xml:space="preserve">581,02 €</w:t>
-            </w:r>
-            <w:r>
-              <w:rPr>
-                <w:rFonts w:ascii="Open Sans SemiBold" w:hAnsi="Open Sans SemiBold" w:cs="Open Sans SemiBold" w:eastAsia="Open Sans SemiBold"/>
-                <w:color w:val="auto"/>
-                <w:spacing w:val="0"/>
-                <w:position w:val="0"/>
-                <w:sz w:val="22"/>
-                <w:shd w:fill="auto" w:val="clear"/>
-              </w:rPr>
-              <w:t/>
-            </w:r>
-          </w:p>
-        </w:tc>
-      </w:tr>
-      <w:tr>
-        <w:trPr>
-          <w:trHeight w:val="285" w:hRule="auto"/>
-          <w:jc w:val="left"/>
-        </w:trPr>
-        <w:tc>
-          <w:tcPr>
-            <w:tcW w:w="3915" w:type="dxa"/>
-            <w:tcBorders>
-              <w:top w:val="single" w:color="ffffff" w:sz="8"/>
-              <w:left w:val="single" w:color="ffffff" w:sz="8"/>
-              <w:bottom w:val="single" w:color="ffffff" w:sz="8"/>
-              <w:right w:val="single" w:color="ffffff" w:sz="8"/>
-            </w:tcBorders>
-            <w:shd w:color="000000" w:fill="ffffff" w:val="clear"/>
-            <w:tcMar>
-              <w:left w:w="0" w:type="dxa"/>
-              <w:right w:w="0" w:type="dxa"/>
-            </w:tcMar>
-            <w:vAlign w:val="center"/>
-          </w:tcPr>
-          <w:p>
-            <w:pPr>
-              <w:spacing w:before="57" w:after="0" w:line="240"/>
-              <w:ind w:right="0" w:left="0" w:firstLine="0"/>
-              <w:jc w:val="left"/>
-              <w:rPr>
-                <w:spacing w:val="0"/>
-                <w:position w:val="0"/>
-                <w:shd w:fill="auto" w:val="clear"/>
-              </w:rPr>
-            </w:pPr>
-            <w:r>
-              <w:rPr>
-                <w:rFonts w:ascii="Open Sans SemiBold" w:hAnsi="Open Sans SemiBold" w:cs="Open Sans SemiBold" w:eastAsia="Open Sans SemiBold"/>
-                <w:color w:val="030303"/>
-                <w:spacing w:val="0"/>
-                <w:position w:val="0"/>
-                <w:sz w:val="20"/>
-                <w:shd w:fill="auto" w:val="clear"/>
-              </w:rPr>
-              <w:t/>
-            </w:r>
-            <w:r>
-              <w:rPr>
-                <w:rFonts w:ascii="Open Sans SemiBold" w:hAnsi="Open Sans SemiBold" w:cs="Open Sans SemiBold" w:eastAsia="Open Sans SemiBold"/>
-                <w:b/>
-                <w:color w:val="030303"/>
-                <w:spacing w:val="0"/>
-                <w:position w:val="0"/>
-                <w:sz w:val="20"/>
-                <w:shd w:fill="auto" w:val="clear"/>
-              </w:rPr>
-              <w:t xml:space="preserve">Gesamtsumme</w:t>
-            </w:r>
-          </w:p>
-        </w:tc>
-        <w:tc>
-          <w:tcPr>
-            <w:tcW w:w="915" w:type="dxa"/>
-            <w:tcBorders>
-              <w:top w:val="single" w:color="ffffff" w:sz="8"/>
-              <w:left w:val="single" w:color="ffffff" w:sz="8"/>
-              <w:bottom w:val="single" w:color="ffffff" w:sz="8"/>
-              <w:right w:val="single" w:color="ffffff" w:sz="8"/>
-            </w:tcBorders>
-            <w:shd w:color="000000" w:fill="ffffff" w:val="clear"/>
-            <w:tcMar>
-              <w:left w:w="0" w:type="dxa"/>
-              <w:right w:w="0" w:type="dxa"/>
-            </w:tcMar>
-            <w:vAlign w:val="center"/>
-          </w:tcPr>
-          <w:p>
-            <w:pPr>
-              <w:spacing w:before="0" w:after="0" w:line="240"/>
-              <w:ind w:right="0" w:left="0" w:firstLine="0"/>
-              <w:jc w:val="left"/>
-              <w:rPr>
-                <w:rFonts w:ascii="Calibri" w:hAnsi="Calibri" w:cs="Calibri" w:eastAsia="Calibri"/>
-                <w:color w:val="auto"/>
-                <w:spacing w:val="0"/>
-                <w:position w:val="0"/>
-                <w:sz w:val="22"/>
-                <w:shd w:fill="auto" w:val="clear"/>
-              </w:rPr>
-            </w:pPr>
-          </w:p>
-        </w:tc>
-        <w:tc>
-          <w:tcPr>
-            <w:tcW w:w="2106" w:type="dxa"/>
-            <w:tcBorders>
-              <w:top w:val="single" w:color="ffffff" w:sz="8"/>
-              <w:left w:val="single" w:color="ffffff" w:sz="8"/>
-              <w:bottom w:val="single" w:color="ffffff" w:sz="8"/>
-              <w:right w:val="single" w:color="ffffff" w:sz="8"/>
-            </w:tcBorders>
-            <w:shd w:color="000000" w:fill="ffffff" w:val="clear"/>
-            <w:tcMar>
-              <w:left w:w="0" w:type="dxa"/>
-              <w:right w:w="0" w:type="dxa"/>
-            </w:tcMar>
-            <w:vAlign w:val="center"/>
-          </w:tcPr>
-          <w:p>
-            <w:pPr>
-              <w:spacing w:before="0" w:after="0" w:line="240"/>
-              <w:ind w:right="0" w:left="0" w:firstLine="0"/>
-              <w:jc w:val="left"/>
-              <w:rPr>
-                <w:rFonts w:ascii="Calibri" w:hAnsi="Calibri" w:cs="Calibri" w:eastAsia="Calibri"/>
-                <w:color w:val="auto"/>
-                <w:spacing w:val="0"/>
-                <w:position w:val="0"/>
-                <w:sz w:val="22"/>
-                <w:shd w:fill="auto" w:val="clear"/>
-              </w:rPr>
-            </w:pPr>
-          </w:p>
-        </w:tc>
-        <w:tc>
-          <w:tcPr>
-            <w:tcW w:w="2724" w:type="dxa"/>
-            <w:tcBorders>
-              <w:top w:val="single" w:color="ffffff" w:sz="8"/>
-              <w:left w:val="single" w:color="ffffff" w:sz="8"/>
-              <w:bottom w:val="single" w:color="ffffff" w:sz="8"/>
-              <w:right w:val="single" w:color="ffffff" w:sz="8"/>
-            </w:tcBorders>
-            <w:shd w:color="000000" w:fill="ffffff" w:val="clear"/>
-            <w:tcMar>
-              <w:left w:w="0" w:type="dxa"/>
-              <w:right w:w="0" w:type="dxa"/>
-            </w:tcMar>
-            <w:vAlign w:val="center"/>
-          </w:tcPr>
-          <w:p>
-            <w:pPr>
-              <w:spacing w:before="0" w:after="0" w:line="278"/>
-              <w:ind w:right="314" w:left="0" w:firstLine="0"/>
-              <w:jc w:val="right"/>
-              <w:rPr>
-                <w:color w:val="auto"/>
-                <w:spacing w:val="0"/>
-                <w:position w:val="0"/>
-                <w:sz w:val="22"/>
-                <w:shd w:fill="auto" w:val="clear"/>
-              </w:rPr>
-            </w:pPr>
-            <w:r>
-              <w:rPr>
-                <w:rFonts w:ascii="Open Sans SemiBold" w:hAnsi="Open Sans SemiBold" w:cs="Open Sans SemiBold" w:eastAsia="Open Sans SemiBold"/>
-                <w:b/>
-                <w:color w:val="auto"/>
-                <w:spacing w:val="0"/>
-                <w:position w:val="0"/>
-                <w:sz w:val="22"/>
-                <w:shd w:fill="auto" w:val="clear"/>
-              </w:rPr>
               <w:t xml:space="preserve">3.639,04 €</w:t>
-            </w:r>
-            <w:r>
-              <w:rPr>
-                <w:rFonts w:ascii="Open Sans SemiBold" w:hAnsi="Open Sans SemiBold" w:cs="Open Sans SemiBold" w:eastAsia="Open Sans SemiBold"/>
-                <w:color w:val="auto"/>
-                <w:spacing w:val="0"/>
-                <w:position w:val="0"/>
-                <w:sz w:val="22"/>
-                <w:shd w:fill="auto" w:val="clear"/>
-              </w:rPr>
-              <w:t/>
-            </w:r>
-          </w:p>
-        </w:tc>
-      </w:tr>
-      <w:tr>
-        <w:trPr>
-          <w:trHeight w:val="1" w:hRule="atLeast"/>
-          <w:jc w:val="left"/>
-        </w:trPr>
-        <w:tc>
-          <w:tcPr>
-            <w:tcW w:w="3915" w:type="dxa"/>
-            <w:tcBorders>
-              <w:top w:val="single" w:color="ffffff" w:sz="8"/>
-              <w:left w:val="single" w:color="d9d9d9" w:sz="8"/>
-              <w:bottom w:val="single" w:color="ffffff" w:sz="8"/>
-              <w:right w:val="single" w:color="d9d9d9" w:sz="8"/>
-            </w:tcBorders>
-            <w:shd w:color="000000" w:fill="d9d9d9" w:val="clear"/>
-            <w:tcMar>
-              <w:left w:w="0" w:type="dxa"/>
-              <w:right w:w="0" w:type="dxa"/>
-            </w:tcMar>
-            <w:vAlign w:val="center"/>
-          </w:tcPr>
-          <w:p>
-            <w:pPr>
-              <w:spacing w:before="56" w:after="0" w:line="240"/>
-              <w:ind w:right="0" w:left="50" w:firstLine="0"/>
-              <w:jc w:val="left"/>
-              <w:rPr>
-                <w:spacing w:val="0"/>
-                <w:position w:val="0"/>
-                <w:shd w:fill="auto" w:val="clear"/>
-              </w:rPr>
-            </w:pPr>
-            <w:r>
-              <w:rPr>
-                <w:rFonts w:ascii="Open Sans SemiBold" w:hAnsi="Open Sans SemiBold" w:cs="Open Sans SemiBold" w:eastAsia="Open Sans SemiBold"/>
-                <w:color w:val="030303"/>
-                <w:spacing w:val="0"/>
-                <w:position w:val="0"/>
-                <w:sz w:val="20"/>
-                <w:shd w:fill="auto" w:val="clear"/>
-              </w:rPr>
-              <w:t/>
-            </w:r>
-            <w:r>
-              <w:rPr>
-                <w:rFonts w:ascii="Open Sans SemiBold" w:hAnsi="Open Sans SemiBold" w:cs="Open Sans SemiBold" w:eastAsia="Open Sans SemiBold"/>
-                <w:b/>
-                <w:color w:val="030303"/>
-                <w:spacing w:val="0"/>
-                <w:position w:val="0"/>
-                <w:sz w:val="20"/>
-                <w:shd w:fill="auto" w:val="clear"/>
-              </w:rPr>
-              <w:t xml:space="preserve">Gesamtbetrag nach Materialrabatt</w:t>
-            </w:r>
-          </w:p>
-        </w:tc>
-        <w:tc>
-          <w:tcPr>
-            <w:tcW w:w="915" w:type="dxa"/>
-            <w:tcBorders>
-              <w:top w:val="single" w:color="ffffff" w:sz="8"/>
-              <w:left w:val="single" w:color="d9d9d9" w:sz="8"/>
-              <w:bottom w:val="single" w:color="ffffff" w:sz="8"/>
-              <w:right w:val="single" w:color="d9d9d9" w:sz="8"/>
-            </w:tcBorders>
-            <w:shd w:color="000000" w:fill="d9d9d9" w:val="clear"/>
-            <w:tcMar>
-              <w:left w:w="0" w:type="dxa"/>
-              <w:right w:w="0" w:type="dxa"/>
-            </w:tcMar>
-            <w:vAlign w:val="center"/>
-          </w:tcPr>
-          <w:p>
-            <w:pPr>
-              <w:spacing w:before="0" w:after="0" w:line="240"/>
-              <w:ind w:right="0" w:left="0" w:firstLine="0"/>
-              <w:jc w:val="left"/>
-              <w:rPr>
-                <w:rFonts w:ascii="Calibri" w:hAnsi="Calibri" w:cs="Calibri" w:eastAsia="Calibri"/>
-                <w:color w:val="auto"/>
-                <w:spacing w:val="0"/>
-                <w:position w:val="0"/>
-                <w:sz w:val="22"/>
-                <w:shd w:fill="auto" w:val="clear"/>
-              </w:rPr>
-            </w:pPr>
-          </w:p>
-        </w:tc>
-        <w:tc>
-          <w:tcPr>
-            <w:tcW w:w="2106" w:type="dxa"/>
-            <w:tcBorders>
-              <w:top w:val="single" w:color="ffffff" w:sz="8"/>
-              <w:left w:val="single" w:color="d9d9d9" w:sz="8"/>
-              <w:bottom w:val="single" w:color="ffffff" w:sz="8"/>
-              <w:right w:val="single" w:color="d9d9d9" w:sz="8"/>
-            </w:tcBorders>
-            <w:shd w:color="000000" w:fill="d9d9d9" w:val="clear"/>
-            <w:tcMar>
-              <w:left w:w="0" w:type="dxa"/>
-              <w:right w:w="0" w:type="dxa"/>
-            </w:tcMar>
-            <w:vAlign w:val="center"/>
-          </w:tcPr>
-          <w:p>
-            <w:pPr>
-              <w:spacing w:before="0" w:after="0" w:line="240"/>
-              <w:ind w:right="0" w:left="0" w:firstLine="0"/>
-              <w:jc w:val="left"/>
-              <w:rPr>
-                <w:rFonts w:ascii="Calibri" w:hAnsi="Calibri" w:cs="Calibri" w:eastAsia="Calibri"/>
-                <w:color w:val="auto"/>
-                <w:spacing w:val="0"/>
-                <w:position w:val="0"/>
-                <w:sz w:val="22"/>
-                <w:shd w:fill="auto" w:val="clear"/>
-              </w:rPr>
-            </w:pPr>
-          </w:p>
-        </w:tc>
-        <w:tc>
-          <w:tcPr>
-            <w:tcW w:w="2724" w:type="dxa"/>
-            <w:tcBorders>
-              <w:top w:val="single" w:color="ffffff" w:sz="8"/>
-              <w:left w:val="single" w:color="d9d9d9" w:sz="8"/>
-              <w:bottom w:val="single" w:color="ffffff" w:sz="8"/>
-              <w:right w:val="single" w:color="d9d9d9" w:sz="8"/>
-            </w:tcBorders>
-            <w:shd w:color="000000" w:fill="d9d9d9" w:val="clear"/>
-            <w:tcMar>
-              <w:left w:w="0" w:type="dxa"/>
-              <w:right w:w="0" w:type="dxa"/>
-            </w:tcMar>
-            <w:vAlign w:val="center"/>
-          </w:tcPr>
-          <w:p>
-            <w:pPr>
-              <w:spacing w:before="0" w:after="0" w:line="278"/>
-              <w:ind w:right="314" w:left="0" w:firstLine="0"/>
-              <w:jc w:val="right"/>
-              <w:rPr>
-                <w:color w:val="auto"/>
-                <w:spacing w:val="0"/>
-                <w:position w:val="0"/>
-                <w:sz w:val="22"/>
-                <w:shd w:fill="auto" w:val="clear"/>
-              </w:rPr>
-            </w:pPr>
-            <w:r>
-              <w:rPr>
-                <w:rFonts w:ascii="Open Sans SemiBold" w:hAnsi="Open Sans SemiBold" w:cs="Open Sans SemiBold" w:eastAsia="Open Sans SemiBold"/>
-                <w:b/>
-                <w:color w:val="auto"/>
-                <w:spacing w:val="0"/>
-                <w:position w:val="0"/>
-                <w:sz w:val="22"/>
-                <w:shd w:fill="auto" w:val="clear"/>
-              </w:rPr>
-              <w:t xml:space="preserve">3.635,14 €</w:t>
-            </w:r>
-            <w:r>
-              <w:rPr>
-                <w:rFonts w:ascii="Open Sans SemiBold" w:hAnsi="Open Sans SemiBold" w:cs="Open Sans SemiBold" w:eastAsia="Open Sans SemiBold"/>
-                <w:color w:val="auto"/>
-                <w:spacing w:val="0"/>
-                <w:position w:val="0"/>
-                <w:sz w:val="22"/>
-                <w:shd w:fill="auto" w:val="clear"/>
-              </w:rPr>
-              <w:t/>
-            </w:r>
-          </w:p>
-        </w:tc>
-      </w:tr>
-      <w:tr>
-        <w:trPr>
-          <w:trHeight w:val="285" w:hRule="auto"/>
-          <w:jc w:val="left"/>
-        </w:trPr>
-        <w:tc>
-          <w:tcPr>
-            <w:tcW w:w="3915" w:type="dxa"/>
-            <w:tcBorders>
-              <w:top w:val="single" w:color="ffffff" w:sz="8"/>
-              <w:left w:val="single" w:color="ffffff" w:sz="8"/>
-              <w:bottom w:val="single" w:color="ffffff" w:sz="8"/>
-              <w:right w:val="single" w:color="ffffff" w:sz="8"/>
-            </w:tcBorders>
-            <w:shd w:color="000000" w:fill="ffffff" w:val="clear"/>
-            <w:tcMar>
-              <w:left w:w="0" w:type="dxa"/>
-              <w:right w:w="0" w:type="dxa"/>
-            </w:tcMar>
-            <w:vAlign w:val="center"/>
-          </w:tcPr>
-          <w:p>
-            <w:pPr>
-              <w:spacing w:before="57" w:after="0" w:line="240"/>
-              <w:ind w:right="0" w:left="0" w:firstLine="0"/>
-              <w:jc w:val="left"/>
-              <w:rPr>
-                <w:spacing w:val="0"/>
-                <w:position w:val="0"/>
-                <w:shd w:fill="auto" w:val="clear"/>
-              </w:rPr>
-            </w:pPr>
-            <w:r>
-              <w:rPr>
-                <w:rFonts w:ascii="Open Sans SemiBold" w:hAnsi="Open Sans SemiBold" w:cs="Open Sans SemiBold" w:eastAsia="Open Sans SemiBold"/>
-                <w:color w:val="030303"/>
-                <w:spacing w:val="0"/>
-                <w:position w:val="0"/>
-                <w:sz w:val="20"/>
-                <w:shd w:fill="auto" w:val="clear"/>
-              </w:rPr>
-              <w:t/>
-            </w:r>
-            <w:r>
-              <w:rPr>
-                <w:rFonts w:ascii="Open Sans SemiBold" w:hAnsi="Open Sans SemiBold" w:cs="Open Sans SemiBold" w:eastAsia="Open Sans SemiBold"/>
-                <w:b/>
-                <w:color w:val="030303"/>
-                <w:spacing w:val="0"/>
-                <w:position w:val="0"/>
-                <w:sz w:val="20"/>
-                <w:shd w:fill="auto" w:val="clear"/>
-              </w:rPr>
-              <w:t xml:space="preserve">Gesamtbetrag nach Neukundenbonus</w:t>
-            </w:r>
-          </w:p>
-        </w:tc>
-        <w:tc>
-          <w:tcPr>
-            <w:tcW w:w="915" w:type="dxa"/>
-            <w:tcBorders>
-              <w:top w:val="single" w:color="ffffff" w:sz="8"/>
-              <w:left w:val="single" w:color="ffffff" w:sz="8"/>
-              <w:bottom w:val="single" w:color="ffffff" w:sz="8"/>
-              <w:right w:val="single" w:color="ffffff" w:sz="8"/>
-            </w:tcBorders>
-            <w:shd w:color="000000" w:fill="ffffff" w:val="clear"/>
-            <w:tcMar>
-              <w:left w:w="0" w:type="dxa"/>
-              <w:right w:w="0" w:type="dxa"/>
-            </w:tcMar>
-            <w:vAlign w:val="center"/>
-          </w:tcPr>
-          <w:p>
-            <w:pPr>
-              <w:spacing w:before="0" w:after="0" w:line="240"/>
-              <w:ind w:right="0" w:left="0" w:firstLine="0"/>
-              <w:jc w:val="left"/>
-              <w:rPr>
-                <w:rFonts w:ascii="Calibri" w:hAnsi="Calibri" w:cs="Calibri" w:eastAsia="Calibri"/>
-                <w:color w:val="auto"/>
-                <w:spacing w:val="0"/>
-                <w:position w:val="0"/>
-                <w:sz w:val="22"/>
-                <w:shd w:fill="auto" w:val="clear"/>
-              </w:rPr>
-            </w:pPr>
-          </w:p>
-        </w:tc>
-        <w:tc>
-          <w:tcPr>
-            <w:tcW w:w="2106" w:type="dxa"/>
-            <w:tcBorders>
-              <w:top w:val="single" w:color="ffffff" w:sz="8"/>
-              <w:left w:val="single" w:color="ffffff" w:sz="8"/>
-              <w:bottom w:val="single" w:color="ffffff" w:sz="8"/>
-              <w:right w:val="single" w:color="ffffff" w:sz="8"/>
-            </w:tcBorders>
-            <w:shd w:color="000000" w:fill="ffffff" w:val="clear"/>
-            <w:tcMar>
-              <w:left w:w="0" w:type="dxa"/>
-              <w:right w:w="0" w:type="dxa"/>
-            </w:tcMar>
-            <w:vAlign w:val="center"/>
-          </w:tcPr>
-          <w:p>
-            <w:pPr>
-              <w:spacing w:before="0" w:after="0" w:line="240"/>
-              <w:ind w:right="0" w:left="0" w:firstLine="0"/>
-              <w:jc w:val="left"/>
-              <w:rPr>
-                <w:rFonts w:ascii="Calibri" w:hAnsi="Calibri" w:cs="Calibri" w:eastAsia="Calibri"/>
-                <w:color w:val="auto"/>
-                <w:spacing w:val="0"/>
-                <w:position w:val="0"/>
-                <w:sz w:val="22"/>
-                <w:shd w:fill="auto" w:val="clear"/>
-              </w:rPr>
-            </w:pPr>
-          </w:p>
-        </w:tc>
-        <w:tc>
-          <w:tcPr>
-            <w:tcW w:w="2724" w:type="dxa"/>
-            <w:tcBorders>
-              <w:top w:val="single" w:color="ffffff" w:sz="8"/>
-              <w:left w:val="single" w:color="ffffff" w:sz="8"/>
-              <w:bottom w:val="single" w:color="ffffff" w:sz="8"/>
-              <w:right w:val="single" w:color="ffffff" w:sz="8"/>
-            </w:tcBorders>
-            <w:shd w:color="000000" w:fill="ffffff" w:val="clear"/>
-            <w:tcMar>
-              <w:left w:w="0" w:type="dxa"/>
-              <w:right w:w="0" w:type="dxa"/>
-            </w:tcMar>
-            <w:vAlign w:val="center"/>
-          </w:tcPr>
-          <w:p>
-            <w:pPr>
-              <w:spacing w:before="0" w:after="0" w:line="278"/>
-              <w:ind w:right="314" w:left="0" w:firstLine="0"/>
-              <w:jc w:val="right"/>
-              <w:rPr>
-                <w:color w:val="auto"/>
-                <w:spacing w:val="0"/>
-                <w:position w:val="0"/>
-                <w:sz w:val="22"/>
-                <w:shd w:fill="auto" w:val="clear"/>
-              </w:rPr>
-            </w:pPr>
-            <w:r>
-              <w:rPr>
-                <w:rFonts w:ascii="Open Sans SemiBold" w:hAnsi="Open Sans SemiBold" w:cs="Open Sans SemiBold" w:eastAsia="Open Sans SemiBold"/>
-                <w:b/>
-                <w:color w:val="auto"/>
-                <w:spacing w:val="0"/>
-                <w:position w:val="0"/>
-                <w:sz w:val="22"/>
-                <w:shd w:fill="auto" w:val="clear"/>
-              </w:rPr>
-              <w:t xml:space="preserve">3.160,14 €</w:t>
             </w:r>
             <w:r>
               <w:rPr>

</xml_diff>

<commit_message>
working on Selbstkostenanteil part
</commit_message>
<xml_diff>
--- a/out-Angebot.docx
+++ b/out-Angebot.docx
@@ -296,7 +296,6 @@
               <w:rPr>
                 <w:spacing w:val="0"/>
                 <w:position w:val="0"/>
-                <w:shd w:fill="auto" w:val="clear"/>
               </w:rPr>
             </w:pPr>
             <w:r>
@@ -501,7 +500,6 @@
               <w:rPr>
                 <w:spacing w:val="0"/>
                 <w:position w:val="0"/>
-                <w:shd w:fill="auto" w:val="clear"/>
               </w:rPr>
             </w:pPr>
             <w:r>
@@ -735,7 +733,6 @@
                 <w:spacing w:val="0"/>
                 <w:position w:val="0"/>
                 <w:sz w:val="22"/>
-                <w:shd w:fill="auto" w:val="clear"/>
               </w:rPr>
             </w:pPr>
             <w:r>
@@ -776,7 +773,6 @@
                 <w:spacing w:val="0"/>
                 <w:position w:val="0"/>
                 <w:sz w:val="22"/>
-                <w:shd w:fill="auto" w:val="clear"/>
               </w:rPr>
             </w:pPr>
             <w:r>
@@ -818,7 +814,6 @@
                 <w:spacing w:val="0"/>
                 <w:position w:val="0"/>
                 <w:sz w:val="22"/>
-                <w:shd w:fill="auto" w:val="clear"/>
               </w:rPr>
             </w:pPr>
             <w:r>
@@ -860,7 +855,6 @@
                 <w:spacing w:val="0"/>
                 <w:position w:val="0"/>
                 <w:sz w:val="22"/>
-                <w:shd w:fill="auto" w:val="clear"/>
               </w:rPr>
             </w:pPr>
             <w:r>
@@ -902,7 +896,6 @@
                 <w:spacing w:val="0"/>
                 <w:position w:val="0"/>
                 <w:sz w:val="22"/>
-                <w:shd w:fill="auto" w:val="clear"/>
               </w:rPr>
             </w:pPr>
             <w:r>
@@ -948,7 +941,6 @@
               <w:rPr>
                 <w:spacing w:val="0"/>
                 <w:position w:val="0"/>
-                <w:shd w:fill="auto" w:val="clear"/>
               </w:rPr>
             </w:pPr>
             <w:r>
@@ -988,7 +980,6 @@
               <w:rPr>
                 <w:spacing w:val="0"/>
                 <w:position w:val="0"/>
-                <w:shd w:fill="auto" w:val="clear"/>
               </w:rPr>
             </w:pPr>
             <w:r>
@@ -1029,7 +1020,6 @@
                 <w:color w:val="auto"/>
                 <w:spacing w:val="0"/>
                 <w:position w:val="0"/>
-                <w:shd w:fill="auto" w:val="clear"/>
               </w:rPr>
             </w:pPr>
             <w:r>
@@ -1071,19 +1061,18 @@
                 <w:color w:val="auto"/>
                 <w:spacing w:val="0"/>
                 <w:position w:val="0"/>
-                <w:shd w:fill="auto" w:val="clear"/>
-              </w:rPr>
-            </w:pPr>
-            <w:r>
-              <w:rPr>
-                <w:rFonts w:ascii="Open Sans" w:hAnsi="Open Sans" w:cs="Open Sans" w:eastAsia="Open Sans"/>
-                <w:color w:val="auto"/>
-                <w:spacing w:val="0"/>
-                <w:position w:val="0"/>
-                <w:sz w:val="20"/>
-                <w:shd w:fill="auto" w:val="clear"/>
-              </w:rPr>
-              <w:t xml:space="preserve">1.289,40 €</w:t>
+              </w:rPr>
+            </w:pPr>
+            <w:r>
+              <w:rPr>
+                <w:rFonts w:ascii="Open Sans" w:hAnsi="Open Sans" w:cs="Open Sans" w:eastAsia="Open Sans"/>
+                <w:color w:val="auto"/>
+                <w:spacing w:val="0"/>
+                <w:position w:val="0"/>
+                <w:sz w:val="20"/>
+                <w:shd w:fill="auto" w:val="clear"/>
+              </w:rPr>
+              <w:t xml:space="preserve">1.567,40 €</w:t>
             </w:r>
           </w:p>
         </w:tc>
@@ -1112,19 +1101,18 @@
                 <w:color w:val="auto"/>
                 <w:spacing w:val="0"/>
                 <w:position w:val="0"/>
-                <w:shd w:fill="auto" w:val="clear"/>
-              </w:rPr>
-            </w:pPr>
-            <w:r>
-              <w:rPr>
-                <w:rFonts w:ascii="Open Sans" w:hAnsi="Open Sans" w:cs="Open Sans" w:eastAsia="Open Sans"/>
-                <w:color w:val="auto"/>
-                <w:spacing w:val="0"/>
-                <w:position w:val="0"/>
-                <w:sz w:val="20"/>
-                <w:shd w:fill="auto" w:val="clear"/>
-              </w:rPr>
-              <w:t xml:space="preserve">1.289,40 €</w:t>
+              </w:rPr>
+            </w:pPr>
+            <w:r>
+              <w:rPr>
+                <w:rFonts w:ascii="Open Sans" w:hAnsi="Open Sans" w:cs="Open Sans" w:eastAsia="Open Sans"/>
+                <w:color w:val="auto"/>
+                <w:spacing w:val="0"/>
+                <w:position w:val="0"/>
+                <w:sz w:val="20"/>
+                <w:shd w:fill="auto" w:val="clear"/>
+              </w:rPr>
+              <w:t xml:space="preserve">1.567,40 €</w:t>
             </w:r>
           </w:p>
         </w:tc>
@@ -1223,7 +1211,6 @@
                 <w:color w:val="auto"/>
                 <w:spacing w:val="0"/>
                 <w:position w:val="0"/>
-                <w:shd w:fill="auto" w:val="clear"/>
               </w:rPr>
             </w:pPr>
             <w:r>
@@ -1516,7 +1503,7 @@
                 <w:sz w:val="18"/>
                 <w:shd w:fill="auto" w:val="clear"/>
               </w:rPr>
-              <w:t xml:space="preserve">- 8 Std × 2 Facharbeiter × 69.50 €</w:t>
+              <w:t xml:space="preserve">- 10 Std × 2 Facharbeiter × 69.50 €</w:t>
             </w:r>
           </w:p>
           <w:p>
@@ -1695,7 +1682,6 @@
               <w:rPr>
                 <w:spacing w:val="0"/>
                 <w:position w:val="0"/>
-                <w:shd w:fill="auto" w:val="clear"/>
               </w:rPr>
             </w:pPr>
             <w:r>
@@ -1735,7 +1721,6 @@
               <w:rPr>
                 <w:spacing w:val="0"/>
                 <w:position w:val="0"/>
-                <w:shd w:fill="auto" w:val="clear"/>
               </w:rPr>
             </w:pPr>
             <w:r>
@@ -1776,7 +1761,6 @@
                 <w:color w:val="auto"/>
                 <w:spacing w:val="0"/>
                 <w:position w:val="0"/>
-                <w:shd w:fill="auto" w:val="clear"/>
               </w:rPr>
             </w:pPr>
             <w:r>
@@ -1817,7 +1801,6 @@
                 <w:color w:val="auto"/>
                 <w:spacing w:val="0"/>
                 <w:position w:val="0"/>
-                <w:shd w:fill="auto" w:val="clear"/>
               </w:rPr>
             </w:pPr>
             <w:r>
@@ -1858,7 +1841,6 @@
                 <w:color w:val="auto"/>
                 <w:spacing w:val="0"/>
                 <w:position w:val="0"/>
-                <w:shd w:fill="auto" w:val="clear"/>
               </w:rPr>
             </w:pPr>
             <w:r>
@@ -1904,7 +1886,6 @@
               <w:rPr>
                 <w:spacing w:val="0"/>
                 <w:position w:val="0"/>
-                <w:shd w:fill="auto" w:val="clear"/>
               </w:rPr>
             </w:pPr>
             <w:r>
@@ -1944,7 +1925,6 @@
               <w:rPr>
                 <w:spacing w:val="0"/>
                 <w:position w:val="0"/>
-                <w:shd w:fill="auto" w:val="clear"/>
               </w:rPr>
             </w:pPr>
             <w:r>
@@ -1985,7 +1965,6 @@
                 <w:color w:val="auto"/>
                 <w:spacing w:val="0"/>
                 <w:position w:val="0"/>
-                <w:shd w:fill="auto" w:val="clear"/>
               </w:rPr>
             </w:pPr>
             <w:r>
@@ -2027,7 +2006,6 @@
                 <w:color w:val="auto"/>
                 <w:spacing w:val="0"/>
                 <w:position w:val="0"/>
-                <w:shd w:fill="auto" w:val="clear"/>
               </w:rPr>
             </w:pPr>
             <w:r>
@@ -2068,7 +2046,6 @@
                 <w:color w:val="auto"/>
                 <w:spacing w:val="0"/>
                 <w:position w:val="0"/>
-                <w:shd w:fill="auto" w:val="clear"/>
               </w:rPr>
             </w:pPr>
             <w:r>
@@ -2179,7 +2156,6 @@
                 <w:color w:val="auto"/>
                 <w:spacing w:val="0"/>
                 <w:position w:val="0"/>
-                <w:shd w:fill="auto" w:val="clear"/>
               </w:rPr>
             </w:pPr>
             <w:r>
@@ -2538,6 +2514,240 @@
                 <w:shd w:fill="auto" w:val="clear"/>
               </w:rPr>
             </w:pPr>
+          </w:p>
+        </w:tc>
+      </w:tr>
+      <w:tr>
+        <w:trPr>
+          <w:trHeight w:val="1" w:hRule="atLeast"/>
+          <w:jc w:val="left"/>
+        </w:trPr>
+        <w:tc>
+          <w:tcPr>
+            <w:tcW w:w="660" w:type="dxa"/>
+            <w:tcBorders>
+              <w:top w:val="single" w:color="ffffff" w:sz="8"/>
+              <w:left w:val="single" w:color="ffffff" w:sz="8"/>
+              <w:bottom w:val="single" w:color="ffffff" w:sz="8"/>
+              <w:right w:val="single" w:color="ffffff" w:sz="8"/>
+            </w:tcBorders>
+            <w:shd w:color="000000" w:fill="ffffff" w:val="clear"/>
+            <w:tcMar>
+              <w:left w:w="56" w:type="dxa"/>
+              <w:right w:w="56" w:type="dxa"/>
+            </w:tcMar>
+            <w:vAlign w:val="top"/>
+          </w:tcPr>
+          <w:p>
+            <w:pPr>
+              <w:spacing w:before="0" w:after="0" w:line="278"/>
+              <w:ind w:right="-26" w:left="0" w:firstLine="0"/>
+              <w:jc w:val="left"/>
+              <w:rPr>
+                <w:color w:val="auto"/>
+                <w:spacing w:val="0"/>
+                <w:position w:val="0"/>
+              </w:rPr>
+            </w:pPr>
+            <w:r>
+              <w:rPr>
+                <w:rFonts w:ascii="Open Sans" w:hAnsi="Open Sans" w:cs="Open Sans" w:eastAsia="Open Sans"/>
+                <w:color w:val="auto"/>
+                <w:spacing w:val="0"/>
+                <w:position w:val="0"/>
+                <w:sz w:val="20"/>
+                <w:shd w:fill="auto" w:val="clear"/>
+              </w:rPr>
+              <w:t xml:space="preserve">003</w:t>
+            </w:r>
+          </w:p>
+        </w:tc>
+        <w:tc>
+          <w:tcPr>
+            <w:tcW w:w="1035" w:type="dxa"/>
+            <w:tcBorders>
+              <w:top w:val="single" w:color="ffffff" w:sz="8"/>
+              <w:left w:val="single" w:color="ffffff" w:sz="8"/>
+              <w:bottom w:val="single" w:color="ffffff" w:sz="8"/>
+              <w:right w:val="single" w:color="ffffff" w:sz="8"/>
+            </w:tcBorders>
+            <w:shd w:color="000000" w:fill="ffffff" w:val="clear"/>
+            <w:tcMar>
+              <w:left w:w="56" w:type="dxa"/>
+              <w:right w:w="56" w:type="dxa"/>
+            </w:tcMar>
+            <w:vAlign w:val="top"/>
+          </w:tcPr>
+          <w:p>
+            <w:pPr>
+              <w:spacing w:before="0" w:after="0" w:line="278"/>
+              <w:ind w:right="314" w:left="0" w:firstLine="0"/>
+              <w:jc w:val="left"/>
+              <w:rPr>
+                <w:color w:val="auto"/>
+                <w:spacing w:val="0"/>
+                <w:position w:val="0"/>
+              </w:rPr>
+            </w:pPr>
+            <w:r>
+              <w:rPr>
+                <w:rFonts w:ascii="Open Sans" w:hAnsi="Open Sans" w:cs="Open Sans" w:eastAsia="Open Sans"/>
+                <w:color w:val="auto"/>
+                <w:spacing w:val="0"/>
+                <w:position w:val="0"/>
+                <w:sz w:val="20"/>
+                <w:shd w:fill="auto" w:val="clear"/>
+              </w:rPr>
+              <w:t xml:space="preserve">1 Stk</w:t>
+            </w:r>
+          </w:p>
+        </w:tc>
+        <w:tc>
+          <w:tcPr>
+            <w:tcW w:w="4107" w:type="dxa"/>
+            <w:tcBorders>
+              <w:top w:val="single" w:color="ffffff" w:sz="8"/>
+              <w:left w:val="single" w:color="ffffff" w:sz="8"/>
+              <w:bottom w:val="single" w:color="ffffff" w:sz="8"/>
+              <w:right w:val="single" w:color="ffffff" w:sz="8"/>
+            </w:tcBorders>
+            <w:shd w:color="000000" w:fill="ffffff" w:val="clear"/>
+            <w:tcMar>
+              <w:left w:w="56" w:type="dxa"/>
+              <w:right w:w="56" w:type="dxa"/>
+            </w:tcMar>
+            <w:vAlign w:val="top"/>
+          </w:tcPr>
+          <w:p>
+            <w:pPr>
+              <w:spacing w:before="0" w:after="0" w:line="278"/>
+              <w:ind w:right="314" w:left="0" w:firstLine="0"/>
+              <w:jc w:val="left"/>
+              <w:rPr>
+                <w:rFonts w:ascii="Open Sans" w:hAnsi="Open Sans" w:cs="Open Sans" w:eastAsia="Open Sans"/>
+                <w:b/>
+                <w:color w:val="auto"/>
+                <w:spacing w:val="0"/>
+                <w:position w:val="0"/>
+                <w:sz w:val="20"/>
+                <w:shd w:fill="auto" w:val="clear"/>
+              </w:rPr>
+            </w:pPr>
+            <w:r>
+              <w:rPr>
+                <w:rFonts w:ascii="Open Sans" w:hAnsi="Open Sans" w:cs="Open Sans" w:eastAsia="Open Sans"/>
+                <w:b/>
+                <w:color w:val="auto"/>
+                <w:spacing w:val="0"/>
+                <w:position w:val="0"/>
+                <w:sz w:val="20"/>
+                <w:shd w:fill="auto" w:val="clear"/>
+              </w:rPr>
+              <w:t xml:space="preserve">Bestandkundenbonus:</w:t>
+            </w:r>
+          </w:p>
+          <w:p>
+            <w:pPr>
+              <w:spacing w:before="0" w:after="0" w:line="278"/>
+              <w:ind w:right="314" w:left="0" w:firstLine="0"/>
+              <w:jc w:val="left"/>
+              <w:rPr>
+                <w:color w:val="auto"/>
+                <w:spacing w:val="0"/>
+                <w:position w:val="0"/>
+              </w:rPr>
+            </w:pPr>
+            <w:r>
+              <w:rPr>
+                <w:rFonts w:ascii="Open Sans" w:hAnsi="Open Sans" w:cs="Open Sans" w:eastAsia="Open Sans"/>
+                <w:color w:val="auto"/>
+                <w:spacing w:val="0"/>
+                <w:position w:val="0"/>
+                <w:sz w:val="20"/>
+                <w:shd w:fill="auto" w:val="clear"/>
+              </w:rPr>
+              <w:t xml:space="preserve">– Rabatt von 300 € ab einem Gesamtwert von 3.000</w:t>
+            </w:r>
+          </w:p>
+        </w:tc>
+        <w:tc>
+          <w:tcPr>
+            <w:tcW w:w="2268" w:type="dxa"/>
+            <w:tcBorders>
+              <w:top w:val="single" w:color="ffffff" w:sz="8"/>
+              <w:left w:val="single" w:color="ffffff" w:sz="8"/>
+              <w:bottom w:val="single" w:color="ffffff" w:sz="8"/>
+              <w:right w:val="single" w:color="ffffff" w:sz="8"/>
+            </w:tcBorders>
+            <w:shd w:color="000000" w:fill="ffffff" w:val="clear"/>
+            <w:tcMar>
+              <w:left w:w="56" w:type="dxa"/>
+              <w:right w:w="56" w:type="dxa"/>
+            </w:tcMar>
+            <w:vAlign w:val="top"/>
+          </w:tcPr>
+          <w:p>
+            <w:pPr>
+              <w:spacing w:before="0" w:after="0" w:line="278"/>
+              <w:ind w:right="314" w:left="0" w:firstLine="0"/>
+              <w:jc w:val="left"/>
+              <w:rPr>
+                <w:color w:val="auto"/>
+                <w:spacing w:val="0"/>
+                <w:position w:val="0"/>
+              </w:rPr>
+            </w:pPr>
+            <w:r>
+              <w:rPr>
+                <w:rFonts w:ascii="Open Sans" w:hAnsi="Open Sans" w:cs="Open Sans" w:eastAsia="Open Sans"/>
+                <w:color w:val="auto"/>
+                <w:spacing w:val="0"/>
+                <w:position w:val="0"/>
+                <w:sz w:val="20"/>
+                <w:shd w:fill="auto" w:val="clear"/>
+              </w:rPr>
+              <w:t xml:space="preserve">-252,10 €</w:t>
+            </w:r>
+          </w:p>
+        </w:tc>
+        <w:tc>
+          <w:tcPr>
+            <w:tcW w:w="1710" w:type="dxa"/>
+            <w:tcBorders>
+              <w:top w:val="single" w:color="ffffff" w:sz="8"/>
+              <w:left w:val="single" w:color="ffffff" w:sz="8"/>
+              <w:bottom w:val="single" w:color="ffffff" w:sz="8"/>
+              <w:right w:val="single" w:color="ffffff" w:sz="8"/>
+            </w:tcBorders>
+            <w:shd w:color="000000" w:fill="ffffff" w:val="clear"/>
+            <w:tcMar>
+              <w:left w:w="56" w:type="dxa"/>
+              <w:right w:w="56" w:type="dxa"/>
+            </w:tcMar>
+            <w:vAlign w:val="top"/>
+          </w:tcPr>
+          <w:p>
+            <w:pPr>
+              <w:spacing w:before="0" w:after="0" w:line="278"/>
+              <w:ind w:right="314" w:left="0" w:firstLine="0"/>
+              <w:jc w:val="left"/>
+              <w:rPr>
+                <w:color w:val="auto"/>
+                <w:spacing w:val="0"/>
+                <w:position w:val="0"/>
+              </w:rPr>
+            </w:pPr>
+            <w:r>
+              <w:rPr>
+                <w:rFonts w:ascii="Open Sans" w:hAnsi="Open Sans" w:cs="Open Sans" w:eastAsia="Open Sans"/>
+                <w:color w:val="auto"/>
+                <w:spacing w:val="0"/>
+                <w:position w:val="0"/>
+                <w:sz w:val="20"/>
+                <w:shd w:fill="auto" w:val="clear"/>
+              </w:rPr>
+              <w:t xml:space="preserve">-252,10 €</w:t>
+            </w:r>
           </w:p>
         </w:tc>
       </w:tr>
@@ -2598,7 +2808,6 @@
               <w:rPr>
                 <w:spacing w:val="0"/>
                 <w:position w:val="0"/>
-                <w:shd w:fill="auto" w:val="clear"/>
               </w:rPr>
             </w:pPr>
             <w:r>
@@ -2716,7 +2925,6 @@
                 <w:spacing w:val="0"/>
                 <w:position w:val="0"/>
                 <w:sz w:val="22"/>
-                <w:shd w:fill="auto" w:val="clear"/>
               </w:rPr>
             </w:pPr>
             <w:r>
@@ -2729,7 +2937,7 @@
                 <w:sz w:val="22"/>
                 <w:shd w:fill="auto" w:val="clear"/>
               </w:rPr>
-              <w:t xml:space="preserve">3.058,02 €</w:t>
+              <w:t xml:space="preserve">3.580,47 €</w:t>
             </w:r>
             <w:r>
               <w:rPr>
@@ -2774,7 +2982,6 @@
               <w:rPr>
                 <w:spacing w:val="0"/>
                 <w:position w:val="0"/>
-                <w:shd w:fill="auto" w:val="clear"/>
               </w:rPr>
             </w:pPr>
             <w:r>
@@ -2798,7 +3005,7 @@
                 <w:sz w:val="20"/>
                 <w:shd w:fill="auto" w:val="clear"/>
               </w:rPr>
-              <w:t xml:space="preserve">zzgl. 19% MwSt.</w:t>
+              <w:t xml:space="preserve">Rabatt</w:t>
             </w:r>
           </w:p>
         </w:tc>
@@ -2892,7 +3099,6 @@
                 <w:spacing w:val="0"/>
                 <w:position w:val="0"/>
                 <w:sz w:val="22"/>
-                <w:shd w:fill="auto" w:val="clear"/>
               </w:rPr>
             </w:pPr>
             <w:r>
@@ -2905,7 +3111,7 @@
                 <w:sz w:val="22"/>
                 <w:shd w:fill="auto" w:val="clear"/>
               </w:rPr>
-              <w:t xml:space="preserve">581,02 €</w:t>
+              <w:t xml:space="preserve">10,65 €</w:t>
             </w:r>
             <w:r>
               <w:rPr>
@@ -2950,7 +3156,6 @@
               <w:rPr>
                 <w:spacing w:val="0"/>
                 <w:position w:val="0"/>
-                <w:shd w:fill="auto" w:val="clear"/>
               </w:rPr>
             </w:pPr>
             <w:r>
@@ -2974,7 +3179,7 @@
                 <w:sz w:val="20"/>
                 <w:shd w:fill="auto" w:val="clear"/>
               </w:rPr>
-              <w:t xml:space="preserve">Gesamtsumme</w:t>
+              <w:t xml:space="preserve">zzgl. 19% MwSt.</w:t>
             </w:r>
           </w:p>
         </w:tc>
@@ -3068,7 +3273,6 @@
                 <w:spacing w:val="0"/>
                 <w:position w:val="0"/>
                 <w:sz w:val="22"/>
-                <w:shd w:fill="auto" w:val="clear"/>
               </w:rPr>
             </w:pPr>
             <w:r>
@@ -3081,7 +3285,529 @@
                 <w:sz w:val="22"/>
                 <w:shd w:fill="auto" w:val="clear"/>
               </w:rPr>
-              <w:t xml:space="preserve">3.639,04 €</w:t>
+              <w:t xml:space="preserve">680,29 €</w:t>
+            </w:r>
+            <w:r>
+              <w:rPr>
+                <w:rFonts w:ascii="Open Sans SemiBold" w:hAnsi="Open Sans SemiBold" w:cs="Open Sans SemiBold" w:eastAsia="Open Sans SemiBold"/>
+                <w:color w:val="auto"/>
+                <w:spacing w:val="0"/>
+                <w:position w:val="0"/>
+                <w:sz w:val="22"/>
+                <w:shd w:fill="auto" w:val="clear"/>
+              </w:rPr>
+              <w:t/>
+            </w:r>
+          </w:p>
+        </w:tc>
+      </w:tr>
+      <w:tr>
+        <w:trPr>
+          <w:trHeight w:val="285" w:hRule="auto"/>
+          <w:jc w:val="left"/>
+        </w:trPr>
+        <w:tc>
+          <w:tcPr>
+            <w:tcW w:w="3915" w:type="dxa"/>
+            <w:tcBorders>
+              <w:top w:val="single" w:color="ffffff" w:sz="8"/>
+              <w:left w:val="single" w:color="ffffff" w:sz="8"/>
+              <w:bottom w:val="single" w:color="ffffff" w:sz="8"/>
+              <w:right w:val="single" w:color="ffffff" w:sz="8"/>
+            </w:tcBorders>
+            <w:shd w:color="000000" w:fill="ffffff" w:val="clear"/>
+            <w:tcMar>
+              <w:left w:w="0" w:type="dxa"/>
+              <w:right w:w="0" w:type="dxa"/>
+            </w:tcMar>
+            <w:vAlign w:val="center"/>
+          </w:tcPr>
+          <w:p>
+            <w:pPr>
+              <w:spacing w:before="57" w:after="0" w:line="240"/>
+              <w:ind w:right="0" w:left="0" w:firstLine="0"/>
+              <w:jc w:val="left"/>
+              <w:rPr>
+                <w:spacing w:val="0"/>
+                <w:position w:val="0"/>
+              </w:rPr>
+            </w:pPr>
+            <w:r>
+              <w:rPr>
+                <w:rFonts w:ascii="Open Sans SemiBold" w:hAnsi="Open Sans SemiBold" w:cs="Open Sans SemiBold" w:eastAsia="Open Sans SemiBold"/>
+                <w:color w:val="030303"/>
+                <w:spacing w:val="0"/>
+                <w:position w:val="0"/>
+                <w:sz w:val="20"/>
+                <w:shd w:fill="auto" w:val="clear"/>
+              </w:rPr>
+              <w:t/>
+            </w:r>
+            <w:r>
+              <w:rPr>
+                <w:rFonts w:ascii="Open Sans SemiBold" w:hAnsi="Open Sans SemiBold" w:cs="Open Sans SemiBold" w:eastAsia="Open Sans SemiBold"/>
+                <w:b/>
+                <w:color w:val="030303"/>
+                <w:spacing w:val="0"/>
+                <w:position w:val="0"/>
+                <w:sz w:val="20"/>
+                <w:shd w:fill="auto" w:val="clear"/>
+              </w:rPr>
+              <w:t xml:space="preserve">Gesamtsumme</w:t>
+            </w:r>
+          </w:p>
+        </w:tc>
+        <w:tc>
+          <w:tcPr>
+            <w:tcW w:w="915" w:type="dxa"/>
+            <w:tcBorders>
+              <w:top w:val="single" w:color="ffffff" w:sz="8"/>
+              <w:left w:val="single" w:color="ffffff" w:sz="8"/>
+              <w:bottom w:val="single" w:color="ffffff" w:sz="8"/>
+              <w:right w:val="single" w:color="ffffff" w:sz="8"/>
+            </w:tcBorders>
+            <w:shd w:color="000000" w:fill="ffffff" w:val="clear"/>
+            <w:tcMar>
+              <w:left w:w="0" w:type="dxa"/>
+              <w:right w:w="0" w:type="dxa"/>
+            </w:tcMar>
+            <w:vAlign w:val="center"/>
+          </w:tcPr>
+          <w:p>
+            <w:pPr>
+              <w:spacing w:before="0" w:after="0" w:line="240"/>
+              <w:ind w:right="0" w:left="0" w:firstLine="0"/>
+              <w:jc w:val="left"/>
+              <w:rPr>
+                <w:rFonts w:ascii="Calibri" w:hAnsi="Calibri" w:cs="Calibri" w:eastAsia="Calibri"/>
+                <w:color w:val="auto"/>
+                <w:spacing w:val="0"/>
+                <w:position w:val="0"/>
+                <w:sz w:val="22"/>
+                <w:shd w:fill="auto" w:val="clear"/>
+              </w:rPr>
+            </w:pPr>
+          </w:p>
+        </w:tc>
+        <w:tc>
+          <w:tcPr>
+            <w:tcW w:w="2106" w:type="dxa"/>
+            <w:tcBorders>
+              <w:top w:val="single" w:color="ffffff" w:sz="8"/>
+              <w:left w:val="single" w:color="ffffff" w:sz="8"/>
+              <w:bottom w:val="single" w:color="ffffff" w:sz="8"/>
+              <w:right w:val="single" w:color="ffffff" w:sz="8"/>
+            </w:tcBorders>
+            <w:shd w:color="000000" w:fill="ffffff" w:val="clear"/>
+            <w:tcMar>
+              <w:left w:w="0" w:type="dxa"/>
+              <w:right w:w="0" w:type="dxa"/>
+            </w:tcMar>
+            <w:vAlign w:val="center"/>
+          </w:tcPr>
+          <w:p>
+            <w:pPr>
+              <w:spacing w:before="0" w:after="0" w:line="240"/>
+              <w:ind w:right="0" w:left="0" w:firstLine="0"/>
+              <w:jc w:val="left"/>
+              <w:rPr>
+                <w:rFonts w:ascii="Calibri" w:hAnsi="Calibri" w:cs="Calibri" w:eastAsia="Calibri"/>
+                <w:color w:val="auto"/>
+                <w:spacing w:val="0"/>
+                <w:position w:val="0"/>
+                <w:sz w:val="22"/>
+                <w:shd w:fill="auto" w:val="clear"/>
+              </w:rPr>
+            </w:pPr>
+          </w:p>
+        </w:tc>
+        <w:tc>
+          <w:tcPr>
+            <w:tcW w:w="2724" w:type="dxa"/>
+            <w:tcBorders>
+              <w:top w:val="single" w:color="ffffff" w:sz="8"/>
+              <w:left w:val="single" w:color="ffffff" w:sz="8"/>
+              <w:bottom w:val="single" w:color="ffffff" w:sz="8"/>
+              <w:right w:val="single" w:color="ffffff" w:sz="8"/>
+            </w:tcBorders>
+            <w:shd w:color="000000" w:fill="ffffff" w:val="clear"/>
+            <w:tcMar>
+              <w:left w:w="0" w:type="dxa"/>
+              <w:right w:w="0" w:type="dxa"/>
+            </w:tcMar>
+            <w:vAlign w:val="center"/>
+          </w:tcPr>
+          <w:p>
+            <w:pPr>
+              <w:spacing w:before="0" w:after="0" w:line="278"/>
+              <w:ind w:right="314" w:left="0" w:firstLine="0"/>
+              <w:jc w:val="right"/>
+              <w:rPr>
+                <w:color w:val="auto"/>
+                <w:spacing w:val="0"/>
+                <w:position w:val="0"/>
+                <w:sz w:val="22"/>
+              </w:rPr>
+            </w:pPr>
+            <w:r>
+              <w:rPr>
+                <w:rFonts w:ascii="Open Sans SemiBold" w:hAnsi="Open Sans SemiBold" w:cs="Open Sans SemiBold" w:eastAsia="Open Sans SemiBold"/>
+                <w:b/>
+                <w:color w:val="auto"/>
+                <w:spacing w:val="0"/>
+                <w:position w:val="0"/>
+                <w:sz w:val="22"/>
+                <w:shd w:fill="auto" w:val="clear"/>
+              </w:rPr>
+              <w:t xml:space="preserve">4.260,76 €</w:t>
+            </w:r>
+            <w:r>
+              <w:rPr>
+                <w:rFonts w:ascii="Open Sans SemiBold" w:hAnsi="Open Sans SemiBold" w:cs="Open Sans SemiBold" w:eastAsia="Open Sans SemiBold"/>
+                <w:color w:val="auto"/>
+                <w:spacing w:val="0"/>
+                <w:position w:val="0"/>
+                <w:sz w:val="22"/>
+                <w:shd w:fill="auto" w:val="clear"/>
+              </w:rPr>
+              <w:t/>
+            </w:r>
+          </w:p>
+        </w:tc>
+      </w:tr>
+      <w:tr>
+        <w:trPr>
+          <w:trHeight w:val="1" w:hRule="atLeast"/>
+          <w:jc w:val="left"/>
+        </w:trPr>
+        <w:tc>
+          <w:tcPr>
+            <w:tcW w:w="3915" w:type="dxa"/>
+            <w:tcBorders>
+              <w:top w:val="single" w:color="ffffff" w:sz="8"/>
+              <w:left w:val="single" w:color="d9d9d9" w:sz="8"/>
+              <w:bottom w:val="single" w:color="ffffff" w:sz="8"/>
+              <w:right w:val="single" w:color="d9d9d9" w:sz="8"/>
+            </w:tcBorders>
+            <w:shd w:color="000000" w:fill="d9d9d9" w:val="clear"/>
+            <w:tcMar>
+              <w:left w:w="0" w:type="dxa"/>
+              <w:right w:w="0" w:type="dxa"/>
+            </w:tcMar>
+            <w:vAlign w:val="center"/>
+          </w:tcPr>
+          <w:p>
+            <w:pPr>
+              <w:spacing w:before="56" w:after="0" w:line="240"/>
+              <w:ind w:right="0" w:left="50" w:firstLine="0"/>
+              <w:jc w:val="left"/>
+              <w:rPr>
+                <w:spacing w:val="0"/>
+                <w:position w:val="0"/>
+              </w:rPr>
+            </w:pPr>
+            <w:r>
+              <w:rPr>
+                <w:rFonts w:ascii="Open Sans SemiBold" w:hAnsi="Open Sans SemiBold" w:cs="Open Sans SemiBold" w:eastAsia="Open Sans SemiBold"/>
+                <w:color w:val="030303"/>
+                <w:spacing w:val="0"/>
+                <w:position w:val="0"/>
+                <w:sz w:val="20"/>
+                <w:shd w:fill="auto" w:val="clear"/>
+              </w:rPr>
+              <w:t/>
+            </w:r>
+            <w:r>
+              <w:rPr>
+                <w:rFonts w:ascii="Open Sans SemiBold" w:hAnsi="Open Sans SemiBold" w:cs="Open Sans SemiBold" w:eastAsia="Open Sans SemiBold"/>
+                <w:b/>
+                <w:color w:val="030303"/>
+                <w:spacing w:val="0"/>
+                <w:position w:val="0"/>
+                <w:sz w:val="20"/>
+                <w:shd w:fill="auto" w:val="clear"/>
+              </w:rPr>
+              <w:t xml:space="preserve">Gesamtbetrag nach Materialrabatt</w:t>
+            </w:r>
+          </w:p>
+        </w:tc>
+        <w:tc>
+          <w:tcPr>
+            <w:tcW w:w="915" w:type="dxa"/>
+            <w:tcBorders>
+              <w:top w:val="single" w:color="ffffff" w:sz="8"/>
+              <w:left w:val="single" w:color="d9d9d9" w:sz="8"/>
+              <w:bottom w:val="single" w:color="ffffff" w:sz="8"/>
+              <w:right w:val="single" w:color="d9d9d9" w:sz="8"/>
+            </w:tcBorders>
+            <w:shd w:color="000000" w:fill="d9d9d9" w:val="clear"/>
+            <w:tcMar>
+              <w:left w:w="0" w:type="dxa"/>
+              <w:right w:w="0" w:type="dxa"/>
+            </w:tcMar>
+            <w:vAlign w:val="center"/>
+          </w:tcPr>
+          <w:p>
+            <w:pPr>
+              <w:spacing w:before="0" w:after="0" w:line="240"/>
+              <w:ind w:right="0" w:left="0" w:firstLine="0"/>
+              <w:jc w:val="left"/>
+              <w:rPr>
+                <w:rFonts w:ascii="Calibri" w:hAnsi="Calibri" w:cs="Calibri" w:eastAsia="Calibri"/>
+                <w:color w:val="auto"/>
+                <w:spacing w:val="0"/>
+                <w:position w:val="0"/>
+                <w:sz w:val="22"/>
+                <w:shd w:fill="auto" w:val="clear"/>
+              </w:rPr>
+            </w:pPr>
+          </w:p>
+        </w:tc>
+        <w:tc>
+          <w:tcPr>
+            <w:tcW w:w="2106" w:type="dxa"/>
+            <w:tcBorders>
+              <w:top w:val="single" w:color="ffffff" w:sz="8"/>
+              <w:left w:val="single" w:color="d9d9d9" w:sz="8"/>
+              <w:bottom w:val="single" w:color="ffffff" w:sz="8"/>
+              <w:right w:val="single" w:color="d9d9d9" w:sz="8"/>
+            </w:tcBorders>
+            <w:shd w:color="000000" w:fill="d9d9d9" w:val="clear"/>
+            <w:tcMar>
+              <w:left w:w="0" w:type="dxa"/>
+              <w:right w:w="0" w:type="dxa"/>
+            </w:tcMar>
+            <w:vAlign w:val="center"/>
+          </w:tcPr>
+          <w:p>
+            <w:pPr>
+              <w:spacing w:before="0" w:after="0" w:line="240"/>
+              <w:ind w:right="0" w:left="0" w:firstLine="0"/>
+              <w:jc w:val="left"/>
+              <w:rPr>
+                <w:rFonts w:ascii="Calibri" w:hAnsi="Calibri" w:cs="Calibri" w:eastAsia="Calibri"/>
+                <w:color w:val="auto"/>
+                <w:spacing w:val="0"/>
+                <w:position w:val="0"/>
+                <w:sz w:val="22"/>
+                <w:shd w:fill="auto" w:val="clear"/>
+              </w:rPr>
+            </w:pPr>
+          </w:p>
+        </w:tc>
+        <w:tc>
+          <w:tcPr>
+            <w:tcW w:w="2724" w:type="dxa"/>
+            <w:tcBorders>
+              <w:top w:val="single" w:color="ffffff" w:sz="8"/>
+              <w:left w:val="single" w:color="d9d9d9" w:sz="8"/>
+              <w:bottom w:val="single" w:color="ffffff" w:sz="8"/>
+              <w:right w:val="single" w:color="d9d9d9" w:sz="8"/>
+            </w:tcBorders>
+            <w:shd w:color="000000" w:fill="d9d9d9" w:val="clear"/>
+            <w:tcMar>
+              <w:left w:w="0" w:type="dxa"/>
+              <w:right w:w="0" w:type="dxa"/>
+            </w:tcMar>
+            <w:vAlign w:val="center"/>
+          </w:tcPr>
+          <w:p>
+            <w:pPr>
+              <w:spacing w:before="0" w:after="0" w:line="278"/>
+              <w:ind w:right="314" w:left="0" w:firstLine="0"/>
+              <w:jc w:val="right"/>
+              <w:rPr>
+                <w:color w:val="auto"/>
+                <w:spacing w:val="0"/>
+                <w:position w:val="0"/>
+                <w:sz w:val="22"/>
+              </w:rPr>
+            </w:pPr>
+            <w:r>
+              <w:rPr>
+                <w:rFonts w:ascii="Open Sans SemiBold" w:hAnsi="Open Sans SemiBold" w:cs="Open Sans SemiBold" w:eastAsia="Open Sans SemiBold"/>
+                <w:b/>
+                <w:color w:val="auto"/>
+                <w:spacing w:val="0"/>
+                <w:position w:val="0"/>
+                <w:sz w:val="22"/>
+                <w:shd w:fill="auto" w:val="clear"/>
+              </w:rPr>
+              <w:t xml:space="preserve">4.248,09 €</w:t>
+            </w:r>
+            <w:r>
+              <w:rPr>
+                <w:rFonts w:ascii="Open Sans SemiBold" w:hAnsi="Open Sans SemiBold" w:cs="Open Sans SemiBold" w:eastAsia="Open Sans SemiBold"/>
+                <w:color w:val="auto"/>
+                <w:spacing w:val="0"/>
+                <w:position w:val="0"/>
+                <w:sz w:val="22"/>
+                <w:shd w:fill="auto" w:val="clear"/>
+              </w:rPr>
+              <w:t/>
+            </w:r>
+          </w:p>
+        </w:tc>
+      </w:tr>
+      <w:tr>
+        <w:trPr>
+          <w:trHeight w:val="285" w:hRule="auto"/>
+          <w:jc w:val="left"/>
+        </w:trPr>
+        <w:tc>
+          <w:tcPr>
+            <w:tcW w:w="3915" w:type="dxa"/>
+            <w:tcBorders>
+              <w:top w:val="single" w:color="ffffff" w:sz="8"/>
+              <w:left w:val="single" w:color="ffffff" w:sz="8"/>
+              <w:bottom w:val="single" w:color="ffffff" w:sz="8"/>
+              <w:right w:val="single" w:color="ffffff" w:sz="8"/>
+            </w:tcBorders>
+            <w:shd w:color="000000" w:fill="ffffff" w:val="clear"/>
+            <w:tcMar>
+              <w:left w:w="0" w:type="dxa"/>
+              <w:right w:w="0" w:type="dxa"/>
+            </w:tcMar>
+            <w:vAlign w:val="center"/>
+          </w:tcPr>
+          <w:p>
+            <w:pPr>
+              <w:spacing w:before="57" w:after="0" w:line="240"/>
+              <w:ind w:right="0" w:left="0" w:firstLine="0"/>
+              <w:jc w:val="left"/>
+              <w:rPr>
+                <w:spacing w:val="0"/>
+                <w:position w:val="0"/>
+              </w:rPr>
+            </w:pPr>
+            <w:r>
+              <w:rPr>
+                <w:rFonts w:ascii="Open Sans SemiBold" w:hAnsi="Open Sans SemiBold" w:cs="Open Sans SemiBold" w:eastAsia="Open Sans SemiBold"/>
+                <w:color w:val="030303"/>
+                <w:spacing w:val="0"/>
+                <w:position w:val="0"/>
+                <w:sz w:val="20"/>
+                <w:shd w:fill="auto" w:val="clear"/>
+              </w:rPr>
+              <w:t/>
+            </w:r>
+            <w:r>
+              <w:rPr>
+                <w:rFonts w:ascii="Open Sans SemiBold" w:hAnsi="Open Sans SemiBold" w:cs="Open Sans SemiBold" w:eastAsia="Open Sans SemiBold"/>
+                <w:b/>
+                <w:color w:val="030303"/>
+                <w:spacing w:val="0"/>
+                <w:position w:val="0"/>
+                <w:sz w:val="20"/>
+                <w:shd w:fill="auto" w:val="clear"/>
+              </w:rPr>
+              <w:t xml:space="preserve">Gesamtbetrag nach Neukundenbonus</w:t>
+            </w:r>
+          </w:p>
+        </w:tc>
+        <w:tc>
+          <w:tcPr>
+            <w:tcW w:w="915" w:type="dxa"/>
+            <w:tcBorders>
+              <w:top w:val="single" w:color="ffffff" w:sz="8"/>
+              <w:left w:val="single" w:color="ffffff" w:sz="8"/>
+              <w:bottom w:val="single" w:color="ffffff" w:sz="8"/>
+              <w:right w:val="single" w:color="ffffff" w:sz="8"/>
+            </w:tcBorders>
+            <w:shd w:color="000000" w:fill="ffffff" w:val="clear"/>
+            <w:tcMar>
+              <w:left w:w="0" w:type="dxa"/>
+              <w:right w:w="0" w:type="dxa"/>
+            </w:tcMar>
+            <w:vAlign w:val="center"/>
+          </w:tcPr>
+          <w:p>
+            <w:pPr>
+              <w:spacing w:before="0" w:after="0" w:line="240"/>
+              <w:ind w:right="0" w:left="0" w:firstLine="0"/>
+              <w:jc w:val="left"/>
+              <w:rPr>
+                <w:rFonts w:ascii="Calibri" w:hAnsi="Calibri" w:cs="Calibri" w:eastAsia="Calibri"/>
+                <w:color w:val="auto"/>
+                <w:spacing w:val="0"/>
+                <w:position w:val="0"/>
+                <w:sz w:val="22"/>
+                <w:shd w:fill="auto" w:val="clear"/>
+              </w:rPr>
+            </w:pPr>
+          </w:p>
+        </w:tc>
+        <w:tc>
+          <w:tcPr>
+            <w:tcW w:w="2106" w:type="dxa"/>
+            <w:tcBorders>
+              <w:top w:val="single" w:color="ffffff" w:sz="8"/>
+              <w:left w:val="single" w:color="ffffff" w:sz="8"/>
+              <w:bottom w:val="single" w:color="ffffff" w:sz="8"/>
+              <w:right w:val="single" w:color="ffffff" w:sz="8"/>
+            </w:tcBorders>
+            <w:shd w:color="000000" w:fill="ffffff" w:val="clear"/>
+            <w:tcMar>
+              <w:left w:w="0" w:type="dxa"/>
+              <w:right w:w="0" w:type="dxa"/>
+            </w:tcMar>
+            <w:vAlign w:val="center"/>
+          </w:tcPr>
+          <w:p>
+            <w:pPr>
+              <w:spacing w:before="0" w:after="0" w:line="240"/>
+              <w:ind w:right="0" w:left="0" w:firstLine="0"/>
+              <w:jc w:val="left"/>
+              <w:rPr>
+                <w:rFonts w:ascii="Calibri" w:hAnsi="Calibri" w:cs="Calibri" w:eastAsia="Calibri"/>
+                <w:color w:val="auto"/>
+                <w:spacing w:val="0"/>
+                <w:position w:val="0"/>
+                <w:sz w:val="22"/>
+                <w:shd w:fill="auto" w:val="clear"/>
+              </w:rPr>
+            </w:pPr>
+          </w:p>
+        </w:tc>
+        <w:tc>
+          <w:tcPr>
+            <w:tcW w:w="2724" w:type="dxa"/>
+            <w:tcBorders>
+              <w:top w:val="single" w:color="ffffff" w:sz="8"/>
+              <w:left w:val="single" w:color="ffffff" w:sz="8"/>
+              <w:bottom w:val="single" w:color="ffffff" w:sz="8"/>
+              <w:right w:val="single" w:color="ffffff" w:sz="8"/>
+            </w:tcBorders>
+            <w:shd w:color="000000" w:fill="ffffff" w:val="clear"/>
+            <w:tcMar>
+              <w:left w:w="0" w:type="dxa"/>
+              <w:right w:w="0" w:type="dxa"/>
+            </w:tcMar>
+            <w:vAlign w:val="center"/>
+          </w:tcPr>
+          <w:p>
+            <w:pPr>
+              <w:spacing w:before="0" w:after="0" w:line="278"/>
+              <w:ind w:right="314" w:left="0" w:firstLine="0"/>
+              <w:jc w:val="right"/>
+              <w:rPr>
+                <w:color w:val="auto"/>
+                <w:spacing w:val="0"/>
+                <w:position w:val="0"/>
+                <w:sz w:val="22"/>
+              </w:rPr>
+            </w:pPr>
+            <w:r>
+              <w:rPr>
+                <w:rFonts w:ascii="Open Sans SemiBold" w:hAnsi="Open Sans SemiBold" w:cs="Open Sans SemiBold" w:eastAsia="Open Sans SemiBold"/>
+                <w:b/>
+                <w:color w:val="auto"/>
+                <w:spacing w:val="0"/>
+                <w:position w:val="0"/>
+                <w:sz w:val="22"/>
+                <w:shd w:fill="auto" w:val="clear"/>
+              </w:rPr>
+              <w:t xml:space="preserve">3.948,09 €</w:t>
             </w:r>
             <w:r>
               <w:rPr>
@@ -3225,6 +3951,32 @@
         <w:jc w:val="left"/>
         <w:rPr>
           <w:rFonts w:ascii="Open Sans" w:hAnsi="Open Sans" w:cs="Open Sans" w:eastAsia="Open Sans"/>
+          <w:color w:val="030303"/>
+          <w:spacing w:val="0"/>
+          <w:position w:val="0"/>
+          <w:sz w:val="22"/>
+          <w:shd w:fill="auto" w:val="clear"/>
+        </w:rPr>
+      </w:pPr>
+      <w:r>
+        <w:rPr>
+          <w:rFonts w:ascii="Open Sans" w:hAnsi="Open Sans" w:cs="Open Sans" w:eastAsia="Open Sans"/>
+          <w:color w:val="030303"/>
+          <w:spacing w:val="0"/>
+          <w:position w:val="0"/>
+          <w:sz w:val="22"/>
+          <w:shd w:fill="auto" w:val="clear"/>
+        </w:rPr>
+        <w:t xml:space="preserve">Der Selbstkostenanteil beträgt 0,00 € unter … i.H.v. 4.180,00 €</w:t>
+      </w:r>
+    </w:p>
+    <w:p>
+      <w:pPr>
+        <w:spacing w:before="224" w:after="0" w:line="288"/>
+        <w:ind w:right="0" w:left="125" w:firstLine="0"/>
+        <w:jc w:val="left"/>
+        <w:rPr>
+          <w:rFonts w:ascii="Open Sans" w:hAnsi="Open Sans" w:cs="Open Sans" w:eastAsia="Open Sans"/>
           <w:b/>
           <w:i/>
           <w:color w:val="030303"/>
@@ -3268,7 +4020,7 @@
           <w:sz w:val="22"/>
           <w:shd w:fill="auto" w:val="clear"/>
         </w:rPr>
-        <w:t/>
+        <w:t xml:space="preserve">0,00 €</w:t>
       </w:r>
       <w:r>
         <w:rPr>
@@ -3280,7 +4032,7 @@
           <w:sz w:val="22"/>
           <w:shd w:fill="auto" w:val="clear"/>
         </w:rPr>
-        <w:t xml:space="preserve"> unter Berücksichtigung eines gewährten Zuschusses durch die Pflegekasse i.H.v. </w:t>
+        <w:t xml:space="preserve"> unter Berücksichtigung eines gewährten Zuschusses durch die Pflegekasse i.H.v. 4.180,00 €</w:t>
       </w:r>
       <w:r>
         <w:rPr>

</xml_diff>

<commit_message>
{Selbstkostenanteil} part in template
</commit_message>
<xml_diff>
--- a/out-Angebot.docx
+++ b/out-Angebot.docx
@@ -1529,7 +1529,7 @@
                 <w:sz w:val="18"/>
                 <w:shd w:fill="auto" w:val="clear"/>
               </w:rPr>
-              <w:t xml:space="preserve">- Schließen der Fehlstellen</w:t>
+              <w:t xml:space="preserve">- Verkleidung Deckenhoch im Dusch/ Wannenbereich</w:t>
             </w:r>
           </w:p>
           <w:p>
@@ -2017,7 +2017,7 @@
                 <w:sz w:val="20"/>
                 <w:shd w:fill="auto" w:val="clear"/>
               </w:rPr>
-              <w:t xml:space="preserve">733,22 €</w:t>
+              <w:t xml:space="preserve">3.623,48 €</w:t>
             </w:r>
           </w:p>
         </w:tc>
@@ -2057,7 +2057,7 @@
                 <w:sz w:val="20"/>
                 <w:shd w:fill="auto" w:val="clear"/>
               </w:rPr>
-              <w:t xml:space="preserve">733,22 €</w:t>
+              <w:t xml:space="preserve">3.623,48 €</w:t>
             </w:r>
           </w:p>
         </w:tc>
@@ -2449,6 +2449,110 @@
                 <w:shd w:fill="auto" w:val="clear"/>
               </w:rPr>
               <w:t xml:space="preserve">- 1 Stk Stelzlager höhenverstellar Set</w:t>
+            </w:r>
+          </w:p>
+          <w:p>
+            <w:pPr>
+              <w:spacing w:before="0" w:after="0" w:line="278"/>
+              <w:ind w:right="314" w:left="0" w:firstLine="0"/>
+              <w:jc w:val="left"/>
+              <w:rPr>
+                <w:rFonts w:ascii="Open Sans" w:hAnsi="Open Sans" w:cs="Open Sans" w:eastAsia="Open Sans"/>
+                <w:color w:val="auto"/>
+                <w:spacing w:val="0"/>
+                <w:position w:val="0"/>
+                <w:sz w:val="20"/>
+                <w:shd w:fill="auto" w:val="clear"/>
+              </w:rPr>
+            </w:pPr>
+            <w:r>
+              <w:rPr>
+                <w:rFonts w:ascii="Open Sans" w:hAnsi="Open Sans" w:cs="Open Sans" w:eastAsia="Open Sans"/>
+                <w:color w:val="auto"/>
+                <w:spacing w:val="0"/>
+                <w:position w:val="0"/>
+                <w:sz w:val="20"/>
+                <w:shd w:fill="auto" w:val="clear"/>
+              </w:rPr>
+              <w:t xml:space="preserve">- 1 Stk TRINNITY Wandabdichtung BASIS-Set 5 qm DW bis 100 x 100 / BW bis 180 x 80 cm</w:t>
+            </w:r>
+          </w:p>
+          <w:p>
+            <w:pPr>
+              <w:spacing w:before="0" w:after="0" w:line="278"/>
+              <w:ind w:right="314" w:left="0" w:firstLine="0"/>
+              <w:jc w:val="left"/>
+              <w:rPr>
+                <w:rFonts w:ascii="Open Sans" w:hAnsi="Open Sans" w:cs="Open Sans" w:eastAsia="Open Sans"/>
+                <w:color w:val="auto"/>
+                <w:spacing w:val="0"/>
+                <w:position w:val="0"/>
+                <w:sz w:val="20"/>
+                <w:shd w:fill="auto" w:val="clear"/>
+              </w:rPr>
+            </w:pPr>
+            <w:r>
+              <w:rPr>
+                <w:rFonts w:ascii="Open Sans" w:hAnsi="Open Sans" w:cs="Open Sans" w:eastAsia="Open Sans"/>
+                <w:color w:val="auto"/>
+                <w:spacing w:val="0"/>
+                <w:position w:val="0"/>
+                <w:sz w:val="20"/>
+                <w:shd w:fill="auto" w:val="clear"/>
+              </w:rPr>
+              <w:t xml:space="preserve">- 66 Stk Wandverkleidungsklebstoff 3.0/4.0</w:t>
+            </w:r>
+          </w:p>
+          <w:p>
+            <w:pPr>
+              <w:spacing w:before="0" w:after="0" w:line="278"/>
+              <w:ind w:right="314" w:left="0" w:firstLine="0"/>
+              <w:jc w:val="left"/>
+              <w:rPr>
+                <w:rFonts w:ascii="Open Sans" w:hAnsi="Open Sans" w:cs="Open Sans" w:eastAsia="Open Sans"/>
+                <w:color w:val="auto"/>
+                <w:spacing w:val="0"/>
+                <w:position w:val="0"/>
+                <w:sz w:val="20"/>
+                <w:shd w:fill="auto" w:val="clear"/>
+              </w:rPr>
+            </w:pPr>
+            <w:r>
+              <w:rPr>
+                <w:rFonts w:ascii="Open Sans" w:hAnsi="Open Sans" w:cs="Open Sans" w:eastAsia="Open Sans"/>
+                <w:color w:val="auto"/>
+                <w:spacing w:val="0"/>
+                <w:position w:val="0"/>
+                <w:sz w:val="20"/>
+                <w:shd w:fill="auto" w:val="clear"/>
+              </w:rPr>
+              <w:t xml:space="preserve">- 30 Stk Abschlussprofil 3.0 255 cm silber eloxiert VIGOUR</w:t>
+            </w:r>
+          </w:p>
+          <w:p>
+            <w:pPr>
+              <w:spacing w:before="0" w:after="0" w:line="278"/>
+              <w:ind w:right="314" w:left="0" w:firstLine="0"/>
+              <w:jc w:val="left"/>
+              <w:rPr>
+                <w:rFonts w:ascii="Open Sans" w:hAnsi="Open Sans" w:cs="Open Sans" w:eastAsia="Open Sans"/>
+                <w:color w:val="auto"/>
+                <w:spacing w:val="0"/>
+                <w:position w:val="0"/>
+                <w:sz w:val="20"/>
+                <w:shd w:fill="auto" w:val="clear"/>
+              </w:rPr>
+            </w:pPr>
+            <w:r>
+              <w:rPr>
+                <w:rFonts w:ascii="Open Sans" w:hAnsi="Open Sans" w:cs="Open Sans" w:eastAsia="Open Sans"/>
+                <w:color w:val="auto"/>
+                <w:spacing w:val="0"/>
+                <w:position w:val="0"/>
+                <w:sz w:val="20"/>
+                <w:shd w:fill="auto" w:val="clear"/>
+              </w:rPr>
+              <w:t xml:space="preserve">- 20 Stk Profilklebstoff (pro Abschlussprofil 1 Stk)</w:t>
             </w:r>
           </w:p>
         </w:tc>
@@ -2937,7 +3041,7 @@
                 <w:sz w:val="22"/>
                 <w:shd w:fill="auto" w:val="clear"/>
               </w:rPr>
-              <w:t xml:space="preserve">3.580,47 €</w:t>
+              <w:t xml:space="preserve">7.915,86 €</w:t>
             </w:r>
             <w:r>
               <w:rPr>
@@ -3111,7 +3215,7 @@
                 <w:sz w:val="22"/>
                 <w:shd w:fill="auto" w:val="clear"/>
               </w:rPr>
-              <w:t xml:space="preserve">10,65 €</w:t>
+              <w:t xml:space="preserve">7,42 €</w:t>
             </w:r>
             <w:r>
               <w:rPr>
@@ -3285,7 +3389,7 @@
                 <w:sz w:val="22"/>
                 <w:shd w:fill="auto" w:val="clear"/>
               </w:rPr>
-              <w:t xml:space="preserve">680,29 €</w:t>
+              <w:t xml:space="preserve">1.504,01 €</w:t>
             </w:r>
             <w:r>
               <w:rPr>
@@ -3459,7 +3563,7 @@
                 <w:sz w:val="22"/>
                 <w:shd w:fill="auto" w:val="clear"/>
               </w:rPr>
-              <w:t xml:space="preserve">4.260,76 €</w:t>
+              <w:t xml:space="preserve">9.419,87 €</w:t>
             </w:r>
             <w:r>
               <w:rPr>
@@ -3633,7 +3737,7 @@
                 <w:sz w:val="22"/>
                 <w:shd w:fill="auto" w:val="clear"/>
               </w:rPr>
-              <w:t xml:space="preserve">4.248,09 €</w:t>
+              <w:t xml:space="preserve">9.411,04 €</w:t>
             </w:r>
             <w:r>
               <w:rPr>
@@ -3807,7 +3911,7 @@
                 <w:sz w:val="22"/>
                 <w:shd w:fill="auto" w:val="clear"/>
               </w:rPr>
-              <w:t xml:space="preserve">3.948,09 €</w:t>
+              <w:t xml:space="preserve">9.111,04 €</w:t>
             </w:r>
             <w:r>
               <w:rPr>
@@ -3925,58 +4029,6 @@
         <w:jc w:val="both"/>
         <w:rPr>
           <w:rFonts w:ascii="Open Sans" w:hAnsi="Open Sans" w:cs="Open Sans" w:eastAsia="Open Sans"/>
-          <w:color w:val="000000"/>
-          <w:spacing w:val="0"/>
-          <w:position w:val="0"/>
-          <w:sz w:val="22"/>
-          <w:shd w:fill="auto" w:val="clear"/>
-        </w:rPr>
-      </w:pPr>
-      <w:r>
-        <w:rPr>
-          <w:rFonts w:ascii="Open Sans" w:hAnsi="Open Sans" w:cs="Open Sans" w:eastAsia="Open Sans"/>
-          <w:color w:val="030303"/>
-          <w:spacing w:val="0"/>
-          <w:position w:val="0"/>
-          <w:sz w:val="22"/>
-          <w:shd w:fill="auto" w:val="clear"/>
-        </w:rPr>
-        <w:t xml:space="preserve">Diese werden vorab mit Ihnen besprochen, bedürfen lhrer Zustimmung und werden auf Regiebasis nach tatsächlichem Aufwand abgerechnet. (Stundensatz-Facharbeiter: 69,50€ netto)</w:t>
-      </w:r>
-    </w:p>
-    <w:p>
-      <w:pPr>
-        <w:spacing w:before="224" w:after="0" w:line="288"/>
-        <w:ind w:right="0" w:left="125" w:firstLine="0"/>
-        <w:jc w:val="left"/>
-        <w:rPr>
-          <w:rFonts w:ascii="Open Sans" w:hAnsi="Open Sans" w:cs="Open Sans" w:eastAsia="Open Sans"/>
-          <w:color w:val="030303"/>
-          <w:spacing w:val="0"/>
-          <w:position w:val="0"/>
-          <w:sz w:val="22"/>
-          <w:shd w:fill="auto" w:val="clear"/>
-        </w:rPr>
-      </w:pPr>
-      <w:r>
-        <w:rPr>
-          <w:rFonts w:ascii="Open Sans" w:hAnsi="Open Sans" w:cs="Open Sans" w:eastAsia="Open Sans"/>
-          <w:color w:val="030303"/>
-          <w:spacing w:val="0"/>
-          <w:position w:val="0"/>
-          <w:sz w:val="22"/>
-          <w:shd w:fill="auto" w:val="clear"/>
-        </w:rPr>
-        <w:t xml:space="preserve">Der Selbstkostenanteil beträgt 0,00 € unter … i.H.v. 4.180,00 €</w:t>
-      </w:r>
-    </w:p>
-    <w:p>
-      <w:pPr>
-        <w:spacing w:before="224" w:after="0" w:line="288"/>
-        <w:ind w:right="0" w:left="125" w:firstLine="0"/>
-        <w:jc w:val="left"/>
-        <w:rPr>
-          <w:rFonts w:ascii="Open Sans" w:hAnsi="Open Sans" w:cs="Open Sans" w:eastAsia="Open Sans"/>
           <w:b/>
           <w:i/>
           <w:color w:val="030303"/>
@@ -3995,57 +4047,56 @@
           <w:sz w:val="22"/>
           <w:shd w:fill="auto" w:val="clear"/>
         </w:rPr>
-        <w:t xml:space="preserve">Der</w:t>
+        <w:t xml:space="preserve">Diese werden vorab mit Ihnen besprochen, bedürfen lhrer Zustimmung und werden auf Regiebasis nach tatsächlichem Aufwand abgerechnet. (Stundensatz-Facharbeiter: 69,50€ netto)</w:t>
+        <w:br/>
+        <w:br/>
+        <w:t xml:space="preserve">Der Selbstkostenanteil beträgt </w:t>
       </w:r>
       <w:r>
         <w:rPr>
           <w:rFonts w:ascii="Open Sans" w:hAnsi="Open Sans" w:cs="Open Sans" w:eastAsia="Open Sans"/>
-          <w:i/>
+          <w:b/>
           <w:color w:val="030303"/>
           <w:spacing w:val="0"/>
           <w:position w:val="0"/>
           <w:sz w:val="22"/>
           <w:shd w:fill="auto" w:val="clear"/>
         </w:rPr>
-        <w:t xml:space="preserve"> Selbstkostenanteil beträgt </w:t>
+        <w:t xml:space="preserve">751,04 €</w:t>
       </w:r>
       <w:r>
         <w:rPr>
           <w:rFonts w:ascii="Open Sans" w:hAnsi="Open Sans" w:cs="Open Sans" w:eastAsia="Open Sans"/>
-          <w:b/>
-          <w:i/>
           <w:color w:val="030303"/>
           <w:spacing w:val="0"/>
           <w:position w:val="0"/>
           <w:sz w:val="22"/>
           <w:shd w:fill="auto" w:val="clear"/>
         </w:rPr>
-        <w:t xml:space="preserve">0,00 €</w:t>
+        <w:t xml:space="preserve"> unter Berücksichtigung eines gewährten Zuschusses durch die Pflegekasse i.H.v. </w:t>
       </w:r>
       <w:r>
         <w:rPr>
           <w:rFonts w:ascii="Open Sans" w:hAnsi="Open Sans" w:cs="Open Sans" w:eastAsia="Open Sans"/>
-          <w:i/>
+          <w:b/>
           <w:color w:val="030303"/>
           <w:spacing w:val="0"/>
           <w:position w:val="0"/>
           <w:sz w:val="22"/>
           <w:shd w:fill="auto" w:val="clear"/>
         </w:rPr>
-        <w:t xml:space="preserve"> unter Berücksichtigung eines gewährten Zuschusses durch die Pflegekasse i.H.v. 4.180,00 €</w:t>
+        <w:t xml:space="preserve">8.360,00 €</w:t>
       </w:r>
       <w:r>
         <w:rPr>
           <w:rFonts w:ascii="Open Sans" w:hAnsi="Open Sans" w:cs="Open Sans" w:eastAsia="Open Sans"/>
-          <w:b/>
-          <w:i/>
           <w:color w:val="030303"/>
           <w:spacing w:val="0"/>
           <w:position w:val="0"/>
           <w:sz w:val="22"/>
           <w:shd w:fill="auto" w:val="clear"/>
         </w:rPr>
-        <w:t/>
+        <w:t xml:space="preserve">.</w:t>
       </w:r>
     </w:p>
     <w:p>

</xml_diff>

<commit_message>
Selbstkostenanteil table + paragraph
</commit_message>
<xml_diff>
--- a/out-Angebot.docx
+++ b/out-Angebot.docx
@@ -1532,32 +1532,6 @@
               <w:t xml:space="preserve">- Verkleidung Deckenhoch im Dusch/ Wannenbereich</w:t>
             </w:r>
           </w:p>
-          <w:p>
-            <w:pPr>
-              <w:spacing w:before="0" w:after="0" w:line="278"/>
-              <w:ind w:right="314" w:left="0" w:firstLine="0"/>
-              <w:jc w:val="left"/>
-              <w:rPr>
-                <w:rFonts w:ascii="Open Sans" w:hAnsi="Open Sans" w:cs="Open Sans" w:eastAsia="Open Sans"/>
-                <w:color w:val="auto"/>
-                <w:spacing w:val="0"/>
-                <w:position w:val="0"/>
-                <w:sz w:val="18"/>
-                <w:shd w:fill="auto" w:val="clear"/>
-              </w:rPr>
-            </w:pPr>
-            <w:r>
-              <w:rPr>
-                <w:rFonts w:ascii="Open Sans" w:hAnsi="Open Sans" w:cs="Open Sans" w:eastAsia="Open Sans"/>
-                <w:color w:val="auto"/>
-                <w:spacing w:val="0"/>
-                <w:position w:val="0"/>
-                <w:sz w:val="18"/>
-                <w:shd w:fill="auto" w:val="clear"/>
-              </w:rPr>
-              <w:t xml:space="preserve">- Anbringen zusätzlicher Haltegriffe</w:t>
-            </w:r>
-          </w:p>
         </w:tc>
         <w:tc>
           <w:tcPr>
@@ -2017,7 +1991,7 @@
                 <w:sz w:val="20"/>
                 <w:shd w:fill="auto" w:val="clear"/>
               </w:rPr>
-              <w:t xml:space="preserve">3.623,48 €</w:t>
+              <w:t xml:space="preserve">2.267,18 €</w:t>
             </w:r>
           </w:p>
         </w:tc>
@@ -2057,7 +2031,7 @@
                 <w:sz w:val="20"/>
                 <w:shd w:fill="auto" w:val="clear"/>
               </w:rPr>
-              <w:t xml:space="preserve">3.623,48 €</w:t>
+              <w:t xml:space="preserve">2.267,18 €</w:t>
             </w:r>
           </w:p>
         </w:tc>
@@ -2396,7 +2370,7 @@
                 <w:sz w:val="20"/>
                 <w:shd w:fill="auto" w:val="clear"/>
               </w:rPr>
-              <w:t xml:space="preserve">- 1 Stk Ablaufgarnitur Rohbauset m. Sifon BH60mm f. Flache Duschw. m. 90mm Ablauf TRINNITY</w:t>
+              <w:t xml:space="preserve">- 1 Stk Kleinmaterial groß</w:t>
             </w:r>
           </w:p>
           <w:p>
@@ -2422,7 +2396,7 @@
                 <w:sz w:val="20"/>
                 <w:shd w:fill="auto" w:val="clear"/>
               </w:rPr>
-              <w:t xml:space="preserve">- 1 Stk Kleinmaterial groß</w:t>
+              <w:t xml:space="preserve">- 1 Stk TRINNITY Wandabdichtung BASIS-Set 5 qm DW bis 100 x 100 / BW bis 180 x 80 cm</w:t>
             </w:r>
           </w:p>
           <w:p>
@@ -2448,111 +2422,7 @@
                 <w:sz w:val="20"/>
                 <w:shd w:fill="auto" w:val="clear"/>
               </w:rPr>
-              <w:t xml:space="preserve">- 1 Stk Stelzlager höhenverstellar Set</w:t>
-            </w:r>
-          </w:p>
-          <w:p>
-            <w:pPr>
-              <w:spacing w:before="0" w:after="0" w:line="278"/>
-              <w:ind w:right="314" w:left="0" w:firstLine="0"/>
-              <w:jc w:val="left"/>
-              <w:rPr>
-                <w:rFonts w:ascii="Open Sans" w:hAnsi="Open Sans" w:cs="Open Sans" w:eastAsia="Open Sans"/>
-                <w:color w:val="auto"/>
-                <w:spacing w:val="0"/>
-                <w:position w:val="0"/>
-                <w:sz w:val="20"/>
-                <w:shd w:fill="auto" w:val="clear"/>
-              </w:rPr>
-            </w:pPr>
-            <w:r>
-              <w:rPr>
-                <w:rFonts w:ascii="Open Sans" w:hAnsi="Open Sans" w:cs="Open Sans" w:eastAsia="Open Sans"/>
-                <w:color w:val="auto"/>
-                <w:spacing w:val="0"/>
-                <w:position w:val="0"/>
-                <w:sz w:val="20"/>
-                <w:shd w:fill="auto" w:val="clear"/>
-              </w:rPr>
-              <w:t xml:space="preserve">- 1 Stk TRINNITY Wandabdichtung BASIS-Set 5 qm DW bis 100 x 100 / BW bis 180 x 80 cm</w:t>
-            </w:r>
-          </w:p>
-          <w:p>
-            <w:pPr>
-              <w:spacing w:before="0" w:after="0" w:line="278"/>
-              <w:ind w:right="314" w:left="0" w:firstLine="0"/>
-              <w:jc w:val="left"/>
-              <w:rPr>
-                <w:rFonts w:ascii="Open Sans" w:hAnsi="Open Sans" w:cs="Open Sans" w:eastAsia="Open Sans"/>
-                <w:color w:val="auto"/>
-                <w:spacing w:val="0"/>
-                <w:position w:val="0"/>
-                <w:sz w:val="20"/>
-                <w:shd w:fill="auto" w:val="clear"/>
-              </w:rPr>
-            </w:pPr>
-            <w:r>
-              <w:rPr>
-                <w:rFonts w:ascii="Open Sans" w:hAnsi="Open Sans" w:cs="Open Sans" w:eastAsia="Open Sans"/>
-                <w:color w:val="auto"/>
-                <w:spacing w:val="0"/>
-                <w:position w:val="0"/>
-                <w:sz w:val="20"/>
-                <w:shd w:fill="auto" w:val="clear"/>
-              </w:rPr>
               <w:t xml:space="preserve">- 66 Stk Wandverkleidungsklebstoff 3.0/4.0</w:t>
-            </w:r>
-          </w:p>
-          <w:p>
-            <w:pPr>
-              <w:spacing w:before="0" w:after="0" w:line="278"/>
-              <w:ind w:right="314" w:left="0" w:firstLine="0"/>
-              <w:jc w:val="left"/>
-              <w:rPr>
-                <w:rFonts w:ascii="Open Sans" w:hAnsi="Open Sans" w:cs="Open Sans" w:eastAsia="Open Sans"/>
-                <w:color w:val="auto"/>
-                <w:spacing w:val="0"/>
-                <w:position w:val="0"/>
-                <w:sz w:val="20"/>
-                <w:shd w:fill="auto" w:val="clear"/>
-              </w:rPr>
-            </w:pPr>
-            <w:r>
-              <w:rPr>
-                <w:rFonts w:ascii="Open Sans" w:hAnsi="Open Sans" w:cs="Open Sans" w:eastAsia="Open Sans"/>
-                <w:color w:val="auto"/>
-                <w:spacing w:val="0"/>
-                <w:position w:val="0"/>
-                <w:sz w:val="20"/>
-                <w:shd w:fill="auto" w:val="clear"/>
-              </w:rPr>
-              <w:t xml:space="preserve">- 30 Stk Abschlussprofil 3.0 255 cm silber eloxiert VIGOUR</w:t>
-            </w:r>
-          </w:p>
-          <w:p>
-            <w:pPr>
-              <w:spacing w:before="0" w:after="0" w:line="278"/>
-              <w:ind w:right="314" w:left="0" w:firstLine="0"/>
-              <w:jc w:val="left"/>
-              <w:rPr>
-                <w:rFonts w:ascii="Open Sans" w:hAnsi="Open Sans" w:cs="Open Sans" w:eastAsia="Open Sans"/>
-                <w:color w:val="auto"/>
-                <w:spacing w:val="0"/>
-                <w:position w:val="0"/>
-                <w:sz w:val="20"/>
-                <w:shd w:fill="auto" w:val="clear"/>
-              </w:rPr>
-            </w:pPr>
-            <w:r>
-              <w:rPr>
-                <w:rFonts w:ascii="Open Sans" w:hAnsi="Open Sans" w:cs="Open Sans" w:eastAsia="Open Sans"/>
-                <w:color w:val="auto"/>
-                <w:spacing w:val="0"/>
-                <w:position w:val="0"/>
-                <w:sz w:val="20"/>
-                <w:shd w:fill="auto" w:val="clear"/>
-              </w:rPr>
-              <w:t xml:space="preserve">- 20 Stk Profilklebstoff (pro Abschlussprofil 1 Stk)</w:t>
             </w:r>
           </w:p>
         </w:tc>
@@ -3041,7 +2911,7 @@
                 <w:sz w:val="22"/>
                 <w:shd w:fill="auto" w:val="clear"/>
               </w:rPr>
-              <w:t xml:space="preserve">7.915,86 €</w:t>
+              <w:t xml:space="preserve">5.751,87 €</w:t>
             </w:r>
             <w:r>
               <w:rPr>
@@ -3215,7 +3085,7 @@
                 <w:sz w:val="22"/>
                 <w:shd w:fill="auto" w:val="clear"/>
               </w:rPr>
-              <w:t xml:space="preserve">7,42 €</w:t>
+              <w:t xml:space="preserve">2,27 €</w:t>
             </w:r>
             <w:r>
               <w:rPr>
@@ -3389,7 +3259,7 @@
                 <w:sz w:val="22"/>
                 <w:shd w:fill="auto" w:val="clear"/>
               </w:rPr>
-              <w:t xml:space="preserve">1.504,01 €</w:t>
+              <w:t xml:space="preserve">1.092,86 €</w:t>
             </w:r>
             <w:r>
               <w:rPr>
@@ -3563,7 +3433,7 @@
                 <w:sz w:val="22"/>
                 <w:shd w:fill="auto" w:val="clear"/>
               </w:rPr>
-              <w:t xml:space="preserve">9.419,87 €</w:t>
+              <w:t xml:space="preserve">6.844,73 €</w:t>
             </w:r>
             <w:r>
               <w:rPr>
@@ -3737,7 +3607,7 @@
                 <w:sz w:val="22"/>
                 <w:shd w:fill="auto" w:val="clear"/>
               </w:rPr>
-              <w:t xml:space="preserve">9.411,04 €</w:t>
+              <w:t xml:space="preserve">6.842,02 €</w:t>
             </w:r>
             <w:r>
               <w:rPr>
@@ -3911,7 +3781,355 @@
                 <w:sz w:val="22"/>
                 <w:shd w:fill="auto" w:val="clear"/>
               </w:rPr>
-              <w:t xml:space="preserve">9.111,04 €</w:t>
+              <w:t xml:space="preserve">6.542,02 €</w:t>
+            </w:r>
+            <w:r>
+              <w:rPr>
+                <w:rFonts w:ascii="Open Sans SemiBold" w:hAnsi="Open Sans SemiBold" w:cs="Open Sans SemiBold" w:eastAsia="Open Sans SemiBold"/>
+                <w:color w:val="auto"/>
+                <w:spacing w:val="0"/>
+                <w:position w:val="0"/>
+                <w:sz w:val="22"/>
+                <w:shd w:fill="auto" w:val="clear"/>
+              </w:rPr>
+              <w:t/>
+            </w:r>
+          </w:p>
+        </w:tc>
+      </w:tr>
+      <w:tr>
+        <w:trPr>
+          <w:trHeight w:val="1" w:hRule="atLeast"/>
+          <w:jc w:val="left"/>
+        </w:trPr>
+        <w:tc>
+          <w:tcPr>
+            <w:tcW w:w="3915" w:type="dxa"/>
+            <w:tcBorders>
+              <w:top w:val="single" w:color="ffffff" w:sz="8"/>
+              <w:left w:val="single" w:color="d9d9d9" w:sz="8"/>
+              <w:bottom w:val="single" w:color="ffffff" w:sz="8"/>
+              <w:right w:val="single" w:color="d9d9d9" w:sz="8"/>
+            </w:tcBorders>
+            <w:shd w:color="000000" w:fill="d9d9d9" w:val="clear"/>
+            <w:tcMar>
+              <w:left w:w="0" w:type="dxa"/>
+              <w:right w:w="0" w:type="dxa"/>
+            </w:tcMar>
+            <w:vAlign w:val="center"/>
+          </w:tcPr>
+          <w:p>
+            <w:pPr>
+              <w:spacing w:before="56" w:after="0" w:line="240"/>
+              <w:ind w:right="0" w:left="50" w:firstLine="0"/>
+              <w:jc w:val="left"/>
+              <w:rPr>
+                <w:spacing w:val="0"/>
+                <w:position w:val="0"/>
+              </w:rPr>
+            </w:pPr>
+            <w:r>
+              <w:rPr>
+                <w:rFonts w:ascii="Open Sans SemiBold" w:hAnsi="Open Sans SemiBold" w:cs="Open Sans SemiBold" w:eastAsia="Open Sans SemiBold"/>
+                <w:color w:val="030303"/>
+                <w:spacing w:val="0"/>
+                <w:position w:val="0"/>
+                <w:sz w:val="20"/>
+                <w:shd w:fill="auto" w:val="clear"/>
+              </w:rPr>
+              <w:t/>
+            </w:r>
+            <w:r>
+              <w:rPr>
+                <w:rFonts w:ascii="Open Sans SemiBold" w:hAnsi="Open Sans SemiBold" w:cs="Open Sans SemiBold" w:eastAsia="Open Sans SemiBold"/>
+                <w:b/>
+                <w:color w:val="030303"/>
+                <w:spacing w:val="0"/>
+                <w:position w:val="0"/>
+                <w:sz w:val="20"/>
+                <w:shd w:fill="auto" w:val="clear"/>
+              </w:rPr>
+              <w:t xml:space="preserve">Zuschuss Krankenkasse</w:t>
+            </w:r>
+          </w:p>
+        </w:tc>
+        <w:tc>
+          <w:tcPr>
+            <w:tcW w:w="915" w:type="dxa"/>
+            <w:tcBorders>
+              <w:top w:val="single" w:color="ffffff" w:sz="8"/>
+              <w:left w:val="single" w:color="d9d9d9" w:sz="8"/>
+              <w:bottom w:val="single" w:color="ffffff" w:sz="8"/>
+              <w:right w:val="single" w:color="d9d9d9" w:sz="8"/>
+            </w:tcBorders>
+            <w:shd w:color="000000" w:fill="d9d9d9" w:val="clear"/>
+            <w:tcMar>
+              <w:left w:w="0" w:type="dxa"/>
+              <w:right w:w="0" w:type="dxa"/>
+            </w:tcMar>
+            <w:vAlign w:val="center"/>
+          </w:tcPr>
+          <w:p>
+            <w:pPr>
+              <w:spacing w:before="0" w:after="0" w:line="240"/>
+              <w:ind w:right="0" w:left="0" w:firstLine="0"/>
+              <w:jc w:val="left"/>
+              <w:rPr>
+                <w:rFonts w:ascii="Calibri" w:hAnsi="Calibri" w:cs="Calibri" w:eastAsia="Calibri"/>
+                <w:color w:val="auto"/>
+                <w:spacing w:val="0"/>
+                <w:position w:val="0"/>
+                <w:sz w:val="22"/>
+                <w:shd w:fill="auto" w:val="clear"/>
+              </w:rPr>
+            </w:pPr>
+          </w:p>
+        </w:tc>
+        <w:tc>
+          <w:tcPr>
+            <w:tcW w:w="2106" w:type="dxa"/>
+            <w:tcBorders>
+              <w:top w:val="single" w:color="ffffff" w:sz="8"/>
+              <w:left w:val="single" w:color="d9d9d9" w:sz="8"/>
+              <w:bottom w:val="single" w:color="ffffff" w:sz="8"/>
+              <w:right w:val="single" w:color="d9d9d9" w:sz="8"/>
+            </w:tcBorders>
+            <w:shd w:color="000000" w:fill="d9d9d9" w:val="clear"/>
+            <w:tcMar>
+              <w:left w:w="0" w:type="dxa"/>
+              <w:right w:w="0" w:type="dxa"/>
+            </w:tcMar>
+            <w:vAlign w:val="center"/>
+          </w:tcPr>
+          <w:p>
+            <w:pPr>
+              <w:spacing w:before="0" w:after="0" w:line="240"/>
+              <w:ind w:right="0" w:left="0" w:firstLine="0"/>
+              <w:jc w:val="left"/>
+              <w:rPr>
+                <w:rFonts w:ascii="Calibri" w:hAnsi="Calibri" w:cs="Calibri" w:eastAsia="Calibri"/>
+                <w:color w:val="auto"/>
+                <w:spacing w:val="0"/>
+                <w:position w:val="0"/>
+                <w:sz w:val="22"/>
+                <w:shd w:fill="auto" w:val="clear"/>
+              </w:rPr>
+            </w:pPr>
+          </w:p>
+        </w:tc>
+        <w:tc>
+          <w:tcPr>
+            <w:tcW w:w="2724" w:type="dxa"/>
+            <w:tcBorders>
+              <w:top w:val="single" w:color="ffffff" w:sz="8"/>
+              <w:left w:val="single" w:color="d9d9d9" w:sz="8"/>
+              <w:bottom w:val="single" w:color="ffffff" w:sz="8"/>
+              <w:right w:val="single" w:color="d9d9d9" w:sz="8"/>
+            </w:tcBorders>
+            <w:shd w:color="000000" w:fill="d9d9d9" w:val="clear"/>
+            <w:tcMar>
+              <w:left w:w="0" w:type="dxa"/>
+              <w:right w:w="0" w:type="dxa"/>
+            </w:tcMar>
+            <w:vAlign w:val="center"/>
+          </w:tcPr>
+          <w:p>
+            <w:pPr>
+              <w:spacing w:before="0" w:after="0" w:line="278"/>
+              <w:ind w:right="314" w:left="0" w:firstLine="0"/>
+              <w:jc w:val="right"/>
+              <w:rPr>
+                <w:color w:val="auto"/>
+                <w:spacing w:val="0"/>
+                <w:position w:val="0"/>
+                <w:sz w:val="22"/>
+              </w:rPr>
+            </w:pPr>
+            <w:r>
+              <w:rPr>
+                <w:rFonts w:ascii="Open Sans SemiBold" w:hAnsi="Open Sans SemiBold" w:cs="Open Sans SemiBold" w:eastAsia="Open Sans SemiBold"/>
+                <w:b/>
+                <w:color w:val="auto"/>
+                <w:spacing w:val="0"/>
+                <w:position w:val="0"/>
+                <w:sz w:val="22"/>
+                <w:shd w:fill="auto" w:val="clear"/>
+              </w:rPr>
+              <w:t xml:space="preserve">4.180,00 €</w:t>
+            </w:r>
+            <w:r>
+              <w:rPr>
+                <w:rFonts w:ascii="Open Sans SemiBold" w:hAnsi="Open Sans SemiBold" w:cs="Open Sans SemiBold" w:eastAsia="Open Sans SemiBold"/>
+                <w:color w:val="auto"/>
+                <w:spacing w:val="0"/>
+                <w:position w:val="0"/>
+                <w:sz w:val="22"/>
+                <w:shd w:fill="auto" w:val="clear"/>
+              </w:rPr>
+              <w:t/>
+            </w:r>
+          </w:p>
+        </w:tc>
+      </w:tr>
+      <w:tr>
+        <w:trPr>
+          <w:trHeight w:val="285" w:hRule="auto"/>
+          <w:jc w:val="left"/>
+        </w:trPr>
+        <w:tc>
+          <w:tcPr>
+            <w:tcW w:w="3915" w:type="dxa"/>
+            <w:tcBorders>
+              <w:top w:val="single" w:color="ffffff" w:sz="8"/>
+              <w:left w:val="single" w:color="ffffff" w:sz="8"/>
+              <w:bottom w:val="single" w:color="ffffff" w:sz="8"/>
+              <w:right w:val="single" w:color="ffffff" w:sz="8"/>
+            </w:tcBorders>
+            <w:shd w:color="000000" w:fill="ffffff" w:val="clear"/>
+            <w:tcMar>
+              <w:left w:w="0" w:type="dxa"/>
+              <w:right w:w="0" w:type="dxa"/>
+            </w:tcMar>
+            <w:vAlign w:val="center"/>
+          </w:tcPr>
+          <w:p>
+            <w:pPr>
+              <w:spacing w:before="57" w:after="0" w:line="240"/>
+              <w:ind w:right="0" w:left="0" w:firstLine="0"/>
+              <w:jc w:val="left"/>
+              <w:rPr>
+                <w:spacing w:val="0"/>
+                <w:position w:val="0"/>
+              </w:rPr>
+            </w:pPr>
+            <w:r>
+              <w:rPr>
+                <w:rFonts w:ascii="Open Sans SemiBold" w:hAnsi="Open Sans SemiBold" w:cs="Open Sans SemiBold" w:eastAsia="Open Sans SemiBold"/>
+                <w:color w:val="030303"/>
+                <w:spacing w:val="0"/>
+                <w:position w:val="0"/>
+                <w:sz w:val="20"/>
+                <w:shd w:fill="auto" w:val="clear"/>
+              </w:rPr>
+              <w:t/>
+            </w:r>
+            <w:r>
+              <w:rPr>
+                <w:rFonts w:ascii="Open Sans SemiBold" w:hAnsi="Open Sans SemiBold" w:cs="Open Sans SemiBold" w:eastAsia="Open Sans SemiBold"/>
+                <w:b/>
+                <w:color w:val="030303"/>
+                <w:spacing w:val="0"/>
+                <w:position w:val="0"/>
+                <w:sz w:val="20"/>
+                <w:shd w:fill="auto" w:val="clear"/>
+              </w:rPr>
+              <w:t xml:space="preserve">Selbstkostenanteil</w:t>
+            </w:r>
+          </w:p>
+        </w:tc>
+        <w:tc>
+          <w:tcPr>
+            <w:tcW w:w="915" w:type="dxa"/>
+            <w:tcBorders>
+              <w:top w:val="single" w:color="ffffff" w:sz="8"/>
+              <w:left w:val="single" w:color="ffffff" w:sz="8"/>
+              <w:bottom w:val="single" w:color="ffffff" w:sz="8"/>
+              <w:right w:val="single" w:color="ffffff" w:sz="8"/>
+            </w:tcBorders>
+            <w:shd w:color="000000" w:fill="ffffff" w:val="clear"/>
+            <w:tcMar>
+              <w:left w:w="0" w:type="dxa"/>
+              <w:right w:w="0" w:type="dxa"/>
+            </w:tcMar>
+            <w:vAlign w:val="center"/>
+          </w:tcPr>
+          <w:p>
+            <w:pPr>
+              <w:spacing w:before="0" w:after="0" w:line="240"/>
+              <w:ind w:right="0" w:left="0" w:firstLine="0"/>
+              <w:jc w:val="left"/>
+              <w:rPr>
+                <w:rFonts w:ascii="Calibri" w:hAnsi="Calibri" w:cs="Calibri" w:eastAsia="Calibri"/>
+                <w:color w:val="auto"/>
+                <w:spacing w:val="0"/>
+                <w:position w:val="0"/>
+                <w:sz w:val="22"/>
+                <w:shd w:fill="auto" w:val="clear"/>
+              </w:rPr>
+            </w:pPr>
+          </w:p>
+        </w:tc>
+        <w:tc>
+          <w:tcPr>
+            <w:tcW w:w="2106" w:type="dxa"/>
+            <w:tcBorders>
+              <w:top w:val="single" w:color="ffffff" w:sz="8"/>
+              <w:left w:val="single" w:color="ffffff" w:sz="8"/>
+              <w:bottom w:val="single" w:color="ffffff" w:sz="8"/>
+              <w:right w:val="single" w:color="ffffff" w:sz="8"/>
+            </w:tcBorders>
+            <w:shd w:color="000000" w:fill="ffffff" w:val="clear"/>
+            <w:tcMar>
+              <w:left w:w="0" w:type="dxa"/>
+              <w:right w:w="0" w:type="dxa"/>
+            </w:tcMar>
+            <w:vAlign w:val="center"/>
+          </w:tcPr>
+          <w:p>
+            <w:pPr>
+              <w:spacing w:before="0" w:after="0" w:line="240"/>
+              <w:ind w:right="0" w:left="0" w:firstLine="0"/>
+              <w:jc w:val="left"/>
+              <w:rPr>
+                <w:rFonts w:ascii="Calibri" w:hAnsi="Calibri" w:cs="Calibri" w:eastAsia="Calibri"/>
+                <w:color w:val="auto"/>
+                <w:spacing w:val="0"/>
+                <w:position w:val="0"/>
+                <w:sz w:val="22"/>
+                <w:shd w:fill="auto" w:val="clear"/>
+              </w:rPr>
+            </w:pPr>
+          </w:p>
+        </w:tc>
+        <w:tc>
+          <w:tcPr>
+            <w:tcW w:w="2724" w:type="dxa"/>
+            <w:tcBorders>
+              <w:top w:val="single" w:color="ffffff" w:sz="8"/>
+              <w:left w:val="single" w:color="ffffff" w:sz="8"/>
+              <w:bottom w:val="single" w:color="ffffff" w:sz="8"/>
+              <w:right w:val="single" w:color="ffffff" w:sz="8"/>
+            </w:tcBorders>
+            <w:shd w:color="000000" w:fill="ffffff" w:val="clear"/>
+            <w:tcMar>
+              <w:left w:w="0" w:type="dxa"/>
+              <w:right w:w="0" w:type="dxa"/>
+            </w:tcMar>
+            <w:vAlign w:val="center"/>
+          </w:tcPr>
+          <w:p>
+            <w:pPr>
+              <w:spacing w:before="0" w:after="0" w:line="278"/>
+              <w:ind w:right="314" w:left="0" w:firstLine="0"/>
+              <w:jc w:val="right"/>
+              <w:rPr>
+                <w:color w:val="auto"/>
+                <w:spacing w:val="0"/>
+                <w:position w:val="0"/>
+                <w:sz w:val="22"/>
+              </w:rPr>
+            </w:pPr>
+            <w:r>
+              <w:rPr>
+                <w:rFonts w:ascii="Open Sans SemiBold" w:hAnsi="Open Sans SemiBold" w:cs="Open Sans SemiBold" w:eastAsia="Open Sans SemiBold"/>
+                <w:b/>
+                <w:color w:val="auto"/>
+                <w:spacing w:val="0"/>
+                <w:position w:val="0"/>
+                <w:sz w:val="22"/>
+                <w:shd w:fill="auto" w:val="clear"/>
+              </w:rPr>
+              <w:t xml:space="preserve">2.362,02 €</w:t>
             </w:r>
             <w:r>
               <w:rPr>
@@ -4062,7 +4280,7 @@
           <w:sz w:val="22"/>
           <w:shd w:fill="auto" w:val="clear"/>
         </w:rPr>
-        <w:t xml:space="preserve">751,04 €</w:t>
+        <w:t xml:space="preserve">2.362,02 €</w:t>
       </w:r>
       <w:r>
         <w:rPr>
@@ -4085,7 +4303,7 @@
           <w:sz w:val="22"/>
           <w:shd w:fill="auto" w:val="clear"/>
         </w:rPr>
-        <w:t xml:space="preserve">8.360,00 €</w:t>
+        <w:t xml:space="preserve">4.180,00 €</w:t>
       </w:r>
       <w:r>
         <w:rPr>

</xml_diff>

<commit_message>
fixing the angebote nummer
</commit_message>
<xml_diff>
--- a/out-Angebot.docx
+++ b/out-Angebot.docx
@@ -93,7 +93,7 @@
           <w:sz w:val="22"/>
           <w:shd w:fill="auto" w:val="clear"/>
         </w:rPr>
-        <w:t xml:space="preserve">Noelani Decker</w:t>
+        <w:t xml:space="preserve">Michelle Brown</w:t>
       </w:r>
     </w:p>
     <w:p>
@@ -119,7 +119,7 @@
           <w:sz w:val="22"/>
           <w:shd w:fill="auto" w:val="clear"/>
         </w:rPr>
-        <w:t xml:space="preserve">Fugiat id qui quia i,</w:t>
+        <w:t xml:space="preserve">Sunt ex eum corrupti,</w:t>
       </w:r>
     </w:p>
     <w:p>
@@ -145,7 +145,7 @@
           <w:sz w:val="22"/>
           <w:shd w:fill="auto" w:val="clear"/>
         </w:rPr>
-        <w:t xml:space="preserve">Aliquam beatae qui o Explicabo Ea invent</w:t>
+        <w:t xml:space="preserve">Veniam est exercita Est distinctio Quia</w:t>
       </w:r>
     </w:p>
     <w:tbl>
@@ -320,7 +320,7 @@
                 <w:sz w:val="22"/>
                 <w:shd w:fill="auto" w:val="clear"/>
               </w:rPr>
-              <w:t xml:space="preserve">Carolyn Hewitt</w:t>
+              <w:t xml:space="preserve">Eliana Weaver</w:t>
             </w:r>
           </w:p>
         </w:tc>
@@ -363,7 +363,7 @@
                 <w:sz w:val="22"/>
                 <w:shd w:fill="auto" w:val="clear"/>
               </w:rPr>
-              <w:t xml:space="preserve">ANG-0001</w:t>
+              <w:t xml:space="preserve">AN20250923152324</w:t>
             </w:r>
             <w:r>
               <w:rPr>
@@ -411,7 +411,7 @@
                 <w:sz w:val="22"/>
                 <w:shd w:fill="auto" w:val="clear"/>
               </w:rPr>
-              <w:t xml:space="preserve">2023-09-21</w:t>
+              <w:t xml:space="preserve">2011-11-01</w:t>
             </w:r>
             <w:r>
               <w:rPr>
@@ -455,7 +455,7 @@
                 <w:sz w:val="22"/>
                 <w:shd w:fill="auto" w:val="clear"/>
               </w:rPr>
-              <w:t xml:space="preserve">Mercedes Emerson</w:t>
+              <w:t xml:space="preserve">Raven Powers</w:t>
             </w:r>
             <w:r>
               <w:rPr>
@@ -617,7 +617,7 @@
           <w:sz w:val="24"/>
           <w:shd w:fill="auto" w:val="clear"/>
         </w:rPr>
-        <w:t xml:space="preserve">  Ihr Angebot ANG-0001</w:t>
+        <w:t xml:space="preserve">  Ihr Angebot AN20250923152324</w:t>
       </w:r>
     </w:p>
     <w:p>
@@ -643,7 +643,7 @@
           <w:sz w:val="22"/>
           <w:shd w:fill="auto" w:val="clear"/>
         </w:rPr>
-        <w:t xml:space="preserve">  Sehr geehrte Frau Decker,</w:t>
+        <w:t xml:space="preserve">  Sehr geehrte Frau Brown,</w:t>
         <w:br/>
       </w:r>
     </w:p>
@@ -1072,7 +1072,7 @@
                 <w:sz w:val="20"/>
                 <w:shd w:fill="auto" w:val="clear"/>
               </w:rPr>
-              <w:t xml:space="preserve">1.567,40 €</w:t>
+              <w:t xml:space="preserve">1.213,80 €</w:t>
             </w:r>
           </w:p>
         </w:tc>
@@ -1112,7 +1112,7 @@
                 <w:sz w:val="20"/>
                 <w:shd w:fill="auto" w:val="clear"/>
               </w:rPr>
-              <w:t xml:space="preserve">1.567,40 €</w:t>
+              <w:t xml:space="preserve">1.213,80 €</w:t>
             </w:r>
           </w:p>
         </w:tc>
@@ -1477,7 +1477,7 @@
                 <w:sz w:val="18"/>
                 <w:shd w:fill="auto" w:val="clear"/>
               </w:rPr>
-              <w:t xml:space="preserve">- 122 km Kilometerpauschale (Hin- &amp; Rückfahrt)</w:t>
+              <w:t xml:space="preserve">- 14 km Kilometerpauschale (Hin- &amp; Rückfahrt)</w:t>
             </w:r>
           </w:p>
           <w:p>
@@ -1503,7 +1503,7 @@
                 <w:sz w:val="18"/>
                 <w:shd w:fill="auto" w:val="clear"/>
               </w:rPr>
-              <w:t xml:space="preserve">- 10 Std × 2 Facharbeiter × 69.50 €</w:t>
+              <w:t xml:space="preserve">- 8 Std × 2 Facharbeiter × 69.50 €</w:t>
             </w:r>
           </w:p>
           <w:p>
@@ -1530,6 +1530,32 @@
                 <w:shd w:fill="auto" w:val="clear"/>
               </w:rPr>
               <w:t xml:space="preserve">- Verkleidung Deckenhoch im Dusch/ Wannenbereich</w:t>
+            </w:r>
+          </w:p>
+          <w:p>
+            <w:pPr>
+              <w:spacing w:before="0" w:after="0" w:line="278"/>
+              <w:ind w:right="314" w:left="0" w:firstLine="0"/>
+              <w:jc w:val="left"/>
+              <w:rPr>
+                <w:rFonts w:ascii="Open Sans" w:hAnsi="Open Sans" w:cs="Open Sans" w:eastAsia="Open Sans"/>
+                <w:color w:val="auto"/>
+                <w:spacing w:val="0"/>
+                <w:position w:val="0"/>
+                <w:sz w:val="18"/>
+                <w:shd w:fill="auto" w:val="clear"/>
+              </w:rPr>
+            </w:pPr>
+            <w:r>
+              <w:rPr>
+                <w:rFonts w:ascii="Open Sans" w:hAnsi="Open Sans" w:cs="Open Sans" w:eastAsia="Open Sans"/>
+                <w:color w:val="auto"/>
+                <w:spacing w:val="0"/>
+                <w:position w:val="0"/>
+                <w:sz w:val="18"/>
+                <w:shd w:fill="auto" w:val="clear"/>
+              </w:rPr>
+              <w:t xml:space="preserve">- Auswechseln des Duschsystems</w:t>
             </w:r>
           </w:p>
         </w:tc>
@@ -1991,7 +2017,7 @@
                 <w:sz w:val="20"/>
                 <w:shd w:fill="auto" w:val="clear"/>
               </w:rPr>
-              <w:t xml:space="preserve">2.267,18 €</w:t>
+              <w:t xml:space="preserve">1.523,03 €</w:t>
             </w:r>
           </w:p>
         </w:tc>
@@ -2031,7 +2057,7 @@
                 <w:sz w:val="20"/>
                 <w:shd w:fill="auto" w:val="clear"/>
               </w:rPr>
-              <w:t xml:space="preserve">2.267,18 €</w:t>
+              <w:t xml:space="preserve">1.523,03 €</w:t>
             </w:r>
           </w:p>
         </w:tc>
@@ -2318,7 +2344,7 @@
                 <w:sz w:val="20"/>
                 <w:shd w:fill="auto" w:val="clear"/>
               </w:rPr>
-              <w:t xml:space="preserve">- 1 Stk Duschwanne Slate 160x100x3cm Mineralguss weiss Nuovvo</w:t>
+              <w:t xml:space="preserve">- 1 Stk Duschwanne Slate 140x100x3cm Mineralguss weiss Nuovvo</w:t>
             </w:r>
           </w:p>
           <w:p>
@@ -2370,6 +2396,32 @@
                 <w:sz w:val="20"/>
                 <w:shd w:fill="auto" w:val="clear"/>
               </w:rPr>
+              <w:t xml:space="preserve">- 1 Stk Ablaufgarnitur Rohbauset m. Sifon BH60mm f. Flache Duschw. m. 90mm Ablauf TRINNITY</w:t>
+            </w:r>
+          </w:p>
+          <w:p>
+            <w:pPr>
+              <w:spacing w:before="0" w:after="0" w:line="278"/>
+              <w:ind w:right="314" w:left="0" w:firstLine="0"/>
+              <w:jc w:val="left"/>
+              <w:rPr>
+                <w:rFonts w:ascii="Open Sans" w:hAnsi="Open Sans" w:cs="Open Sans" w:eastAsia="Open Sans"/>
+                <w:color w:val="auto"/>
+                <w:spacing w:val="0"/>
+                <w:position w:val="0"/>
+                <w:sz w:val="20"/>
+                <w:shd w:fill="auto" w:val="clear"/>
+              </w:rPr>
+            </w:pPr>
+            <w:r>
+              <w:rPr>
+                <w:rFonts w:ascii="Open Sans" w:hAnsi="Open Sans" w:cs="Open Sans" w:eastAsia="Open Sans"/>
+                <w:color w:val="auto"/>
+                <w:spacing w:val="0"/>
+                <w:position w:val="0"/>
+                <w:sz w:val="20"/>
+                <w:shd w:fill="auto" w:val="clear"/>
+              </w:rPr>
               <w:t xml:space="preserve">- 1 Stk Kleinmaterial groß</w:t>
             </w:r>
           </w:p>
@@ -2396,6 +2448,84 @@
                 <w:sz w:val="20"/>
                 <w:shd w:fill="auto" w:val="clear"/>
               </w:rPr>
+              <w:t xml:space="preserve">- 1 Stk Stelzlager höhenverstellar Set</w:t>
+            </w:r>
+          </w:p>
+          <w:p>
+            <w:pPr>
+              <w:spacing w:before="0" w:after="0" w:line="278"/>
+              <w:ind w:right="314" w:left="0" w:firstLine="0"/>
+              <w:jc w:val="left"/>
+              <w:rPr>
+                <w:rFonts w:ascii="Open Sans" w:hAnsi="Open Sans" w:cs="Open Sans" w:eastAsia="Open Sans"/>
+                <w:color w:val="auto"/>
+                <w:spacing w:val="0"/>
+                <w:position w:val="0"/>
+                <w:sz w:val="20"/>
+                <w:shd w:fill="auto" w:val="clear"/>
+              </w:rPr>
+            </w:pPr>
+            <w:r>
+              <w:rPr>
+                <w:rFonts w:ascii="Open Sans" w:hAnsi="Open Sans" w:cs="Open Sans" w:eastAsia="Open Sans"/>
+                <w:color w:val="auto"/>
+                <w:spacing w:val="0"/>
+                <w:position w:val="0"/>
+                <w:sz w:val="20"/>
+                <w:shd w:fill="auto" w:val="clear"/>
+              </w:rPr>
+              <w:t xml:space="preserve">- 8 Stk Fußboden-Paneele (1 m² = 4 Paneele)</w:t>
+            </w:r>
+          </w:p>
+          <w:p>
+            <w:pPr>
+              <w:spacing w:before="0" w:after="0" w:line="278"/>
+              <w:ind w:right="314" w:left="0" w:firstLine="0"/>
+              <w:jc w:val="left"/>
+              <w:rPr>
+                <w:rFonts w:ascii="Open Sans" w:hAnsi="Open Sans" w:cs="Open Sans" w:eastAsia="Open Sans"/>
+                <w:color w:val="auto"/>
+                <w:spacing w:val="0"/>
+                <w:position w:val="0"/>
+                <w:sz w:val="20"/>
+                <w:shd w:fill="auto" w:val="clear"/>
+              </w:rPr>
+            </w:pPr>
+            <w:r>
+              <w:rPr>
+                <w:rFonts w:ascii="Open Sans" w:hAnsi="Open Sans" w:cs="Open Sans" w:eastAsia="Open Sans"/>
+                <w:color w:val="auto"/>
+                <w:spacing w:val="0"/>
+                <w:position w:val="0"/>
+                <w:sz w:val="20"/>
+                <w:shd w:fill="auto" w:val="clear"/>
+              </w:rPr>
+              <w:t xml:space="preserve">- 4 Pkg Flächenkleber (1 Pkg je 0,60 m²)</w:t>
+            </w:r>
+          </w:p>
+          <w:p>
+            <w:pPr>
+              <w:spacing w:before="0" w:after="0" w:line="278"/>
+              <w:ind w:right="314" w:left="0" w:firstLine="0"/>
+              <w:jc w:val="left"/>
+              <w:rPr>
+                <w:rFonts w:ascii="Open Sans" w:hAnsi="Open Sans" w:cs="Open Sans" w:eastAsia="Open Sans"/>
+                <w:color w:val="auto"/>
+                <w:spacing w:val="0"/>
+                <w:position w:val="0"/>
+                <w:sz w:val="20"/>
+                <w:shd w:fill="auto" w:val="clear"/>
+              </w:rPr>
+            </w:pPr>
+            <w:r>
+              <w:rPr>
+                <w:rFonts w:ascii="Open Sans" w:hAnsi="Open Sans" w:cs="Open Sans" w:eastAsia="Open Sans"/>
+                <w:color w:val="auto"/>
+                <w:spacing w:val="0"/>
+                <w:position w:val="0"/>
+                <w:sz w:val="20"/>
+                <w:shd w:fill="auto" w:val="clear"/>
+              </w:rPr>
               <w:t xml:space="preserve">- 1 Stk TRINNITY Wandabdichtung BASIS-Set 5 qm DW bis 100 x 100 / BW bis 180 x 80 cm</w:t>
             </w:r>
           </w:p>
@@ -2422,7 +2552,85 @@
                 <w:sz w:val="20"/>
                 <w:shd w:fill="auto" w:val="clear"/>
               </w:rPr>
-              <w:t xml:space="preserve">- 66 Stk Wandverkleidungsklebstoff 3.0/4.0</w:t>
+              <w:t xml:space="preserve">- 11 Stk Wandverkleidungsklebstoff 3.0/4.0</w:t>
+            </w:r>
+          </w:p>
+          <w:p>
+            <w:pPr>
+              <w:spacing w:before="0" w:after="0" w:line="278"/>
+              <w:ind w:right="314" w:left="0" w:firstLine="0"/>
+              <w:jc w:val="left"/>
+              <w:rPr>
+                <w:rFonts w:ascii="Open Sans" w:hAnsi="Open Sans" w:cs="Open Sans" w:eastAsia="Open Sans"/>
+                <w:color w:val="auto"/>
+                <w:spacing w:val="0"/>
+                <w:position w:val="0"/>
+                <w:sz w:val="20"/>
+                <w:shd w:fill="auto" w:val="clear"/>
+              </w:rPr>
+            </w:pPr>
+            <w:r>
+              <w:rPr>
+                <w:rFonts w:ascii="Open Sans" w:hAnsi="Open Sans" w:cs="Open Sans" w:eastAsia="Open Sans"/>
+                <w:color w:val="auto"/>
+                <w:spacing w:val="0"/>
+                <w:position w:val="0"/>
+                <w:sz w:val="20"/>
+                <w:shd w:fill="auto" w:val="clear"/>
+              </w:rPr>
+              <w:t xml:space="preserve">- 3 Stk Abschlussprofil 3.0 255 cm silber eloxiert VIGOUR</w:t>
+            </w:r>
+          </w:p>
+          <w:p>
+            <w:pPr>
+              <w:spacing w:before="0" w:after="0" w:line="278"/>
+              <w:ind w:right="314" w:left="0" w:firstLine="0"/>
+              <w:jc w:val="left"/>
+              <w:rPr>
+                <w:rFonts w:ascii="Open Sans" w:hAnsi="Open Sans" w:cs="Open Sans" w:eastAsia="Open Sans"/>
+                <w:color w:val="auto"/>
+                <w:spacing w:val="0"/>
+                <w:position w:val="0"/>
+                <w:sz w:val="20"/>
+                <w:shd w:fill="auto" w:val="clear"/>
+              </w:rPr>
+            </w:pPr>
+            <w:r>
+              <w:rPr>
+                <w:rFonts w:ascii="Open Sans" w:hAnsi="Open Sans" w:cs="Open Sans" w:eastAsia="Open Sans"/>
+                <w:color w:val="auto"/>
+                <w:spacing w:val="0"/>
+                <w:position w:val="0"/>
+                <w:sz w:val="20"/>
+                <w:shd w:fill="auto" w:val="clear"/>
+              </w:rPr>
+              <w:t xml:space="preserve">- 2 Stk Verbindungsprofil(e) (Plattenanzahl - 1)</w:t>
+            </w:r>
+          </w:p>
+          <w:p>
+            <w:pPr>
+              <w:spacing w:before="0" w:after="0" w:line="278"/>
+              <w:ind w:right="314" w:left="0" w:firstLine="0"/>
+              <w:jc w:val="left"/>
+              <w:rPr>
+                <w:rFonts w:ascii="Open Sans" w:hAnsi="Open Sans" w:cs="Open Sans" w:eastAsia="Open Sans"/>
+                <w:color w:val="auto"/>
+                <w:spacing w:val="0"/>
+                <w:position w:val="0"/>
+                <w:sz w:val="20"/>
+                <w:shd w:fill="auto" w:val="clear"/>
+              </w:rPr>
+            </w:pPr>
+            <w:r>
+              <w:rPr>
+                <w:rFonts w:ascii="Open Sans" w:hAnsi="Open Sans" w:cs="Open Sans" w:eastAsia="Open Sans"/>
+                <w:color w:val="auto"/>
+                <w:spacing w:val="0"/>
+                <w:position w:val="0"/>
+                <w:sz w:val="20"/>
+                <w:shd w:fill="auto" w:val="clear"/>
+              </w:rPr>
+              <w:t xml:space="preserve">- 3 Stk Profilklebstoff (pro Abschlussprofil 1 Stk)</w:t>
             </w:r>
           </w:p>
         </w:tc>
@@ -2488,240 +2696,6 @@
                 <w:shd w:fill="auto" w:val="clear"/>
               </w:rPr>
             </w:pPr>
-          </w:p>
-        </w:tc>
-      </w:tr>
-      <w:tr>
-        <w:trPr>
-          <w:trHeight w:val="1" w:hRule="atLeast"/>
-          <w:jc w:val="left"/>
-        </w:trPr>
-        <w:tc>
-          <w:tcPr>
-            <w:tcW w:w="660" w:type="dxa"/>
-            <w:tcBorders>
-              <w:top w:val="single" w:color="ffffff" w:sz="8"/>
-              <w:left w:val="single" w:color="ffffff" w:sz="8"/>
-              <w:bottom w:val="single" w:color="ffffff" w:sz="8"/>
-              <w:right w:val="single" w:color="ffffff" w:sz="8"/>
-            </w:tcBorders>
-            <w:shd w:color="000000" w:fill="ffffff" w:val="clear"/>
-            <w:tcMar>
-              <w:left w:w="56" w:type="dxa"/>
-              <w:right w:w="56" w:type="dxa"/>
-            </w:tcMar>
-            <w:vAlign w:val="top"/>
-          </w:tcPr>
-          <w:p>
-            <w:pPr>
-              <w:spacing w:before="0" w:after="0" w:line="278"/>
-              <w:ind w:right="-26" w:left="0" w:firstLine="0"/>
-              <w:jc w:val="left"/>
-              <w:rPr>
-                <w:color w:val="auto"/>
-                <w:spacing w:val="0"/>
-                <w:position w:val="0"/>
-              </w:rPr>
-            </w:pPr>
-            <w:r>
-              <w:rPr>
-                <w:rFonts w:ascii="Open Sans" w:hAnsi="Open Sans" w:cs="Open Sans" w:eastAsia="Open Sans"/>
-                <w:color w:val="auto"/>
-                <w:spacing w:val="0"/>
-                <w:position w:val="0"/>
-                <w:sz w:val="20"/>
-                <w:shd w:fill="auto" w:val="clear"/>
-              </w:rPr>
-              <w:t xml:space="preserve">003</w:t>
-            </w:r>
-          </w:p>
-        </w:tc>
-        <w:tc>
-          <w:tcPr>
-            <w:tcW w:w="1035" w:type="dxa"/>
-            <w:tcBorders>
-              <w:top w:val="single" w:color="ffffff" w:sz="8"/>
-              <w:left w:val="single" w:color="ffffff" w:sz="8"/>
-              <w:bottom w:val="single" w:color="ffffff" w:sz="8"/>
-              <w:right w:val="single" w:color="ffffff" w:sz="8"/>
-            </w:tcBorders>
-            <w:shd w:color="000000" w:fill="ffffff" w:val="clear"/>
-            <w:tcMar>
-              <w:left w:w="56" w:type="dxa"/>
-              <w:right w:w="56" w:type="dxa"/>
-            </w:tcMar>
-            <w:vAlign w:val="top"/>
-          </w:tcPr>
-          <w:p>
-            <w:pPr>
-              <w:spacing w:before="0" w:after="0" w:line="278"/>
-              <w:ind w:right="314" w:left="0" w:firstLine="0"/>
-              <w:jc w:val="left"/>
-              <w:rPr>
-                <w:color w:val="auto"/>
-                <w:spacing w:val="0"/>
-                <w:position w:val="0"/>
-              </w:rPr>
-            </w:pPr>
-            <w:r>
-              <w:rPr>
-                <w:rFonts w:ascii="Open Sans" w:hAnsi="Open Sans" w:cs="Open Sans" w:eastAsia="Open Sans"/>
-                <w:color w:val="auto"/>
-                <w:spacing w:val="0"/>
-                <w:position w:val="0"/>
-                <w:sz w:val="20"/>
-                <w:shd w:fill="auto" w:val="clear"/>
-              </w:rPr>
-              <w:t xml:space="preserve">1 Stk</w:t>
-            </w:r>
-          </w:p>
-        </w:tc>
-        <w:tc>
-          <w:tcPr>
-            <w:tcW w:w="4107" w:type="dxa"/>
-            <w:tcBorders>
-              <w:top w:val="single" w:color="ffffff" w:sz="8"/>
-              <w:left w:val="single" w:color="ffffff" w:sz="8"/>
-              <w:bottom w:val="single" w:color="ffffff" w:sz="8"/>
-              <w:right w:val="single" w:color="ffffff" w:sz="8"/>
-            </w:tcBorders>
-            <w:shd w:color="000000" w:fill="ffffff" w:val="clear"/>
-            <w:tcMar>
-              <w:left w:w="56" w:type="dxa"/>
-              <w:right w:w="56" w:type="dxa"/>
-            </w:tcMar>
-            <w:vAlign w:val="top"/>
-          </w:tcPr>
-          <w:p>
-            <w:pPr>
-              <w:spacing w:before="0" w:after="0" w:line="278"/>
-              <w:ind w:right="314" w:left="0" w:firstLine="0"/>
-              <w:jc w:val="left"/>
-              <w:rPr>
-                <w:rFonts w:ascii="Open Sans" w:hAnsi="Open Sans" w:cs="Open Sans" w:eastAsia="Open Sans"/>
-                <w:b/>
-                <w:color w:val="auto"/>
-                <w:spacing w:val="0"/>
-                <w:position w:val="0"/>
-                <w:sz w:val="20"/>
-                <w:shd w:fill="auto" w:val="clear"/>
-              </w:rPr>
-            </w:pPr>
-            <w:r>
-              <w:rPr>
-                <w:rFonts w:ascii="Open Sans" w:hAnsi="Open Sans" w:cs="Open Sans" w:eastAsia="Open Sans"/>
-                <w:b/>
-                <w:color w:val="auto"/>
-                <w:spacing w:val="0"/>
-                <w:position w:val="0"/>
-                <w:sz w:val="20"/>
-                <w:shd w:fill="auto" w:val="clear"/>
-              </w:rPr>
-              <w:t xml:space="preserve">Bestandkundenbonus:</w:t>
-            </w:r>
-          </w:p>
-          <w:p>
-            <w:pPr>
-              <w:spacing w:before="0" w:after="0" w:line="278"/>
-              <w:ind w:right="314" w:left="0" w:firstLine="0"/>
-              <w:jc w:val="left"/>
-              <w:rPr>
-                <w:color w:val="auto"/>
-                <w:spacing w:val="0"/>
-                <w:position w:val="0"/>
-              </w:rPr>
-            </w:pPr>
-            <w:r>
-              <w:rPr>
-                <w:rFonts w:ascii="Open Sans" w:hAnsi="Open Sans" w:cs="Open Sans" w:eastAsia="Open Sans"/>
-                <w:color w:val="auto"/>
-                <w:spacing w:val="0"/>
-                <w:position w:val="0"/>
-                <w:sz w:val="20"/>
-                <w:shd w:fill="auto" w:val="clear"/>
-              </w:rPr>
-              <w:t xml:space="preserve">-- Rabatt von 300 € ab einem Gesamtwert von 3.000</w:t>
-            </w:r>
-          </w:p>
-        </w:tc>
-        <w:tc>
-          <w:tcPr>
-            <w:tcW w:w="2268" w:type="dxa"/>
-            <w:tcBorders>
-              <w:top w:val="single" w:color="ffffff" w:sz="8"/>
-              <w:left w:val="single" w:color="ffffff" w:sz="8"/>
-              <w:bottom w:val="single" w:color="ffffff" w:sz="8"/>
-              <w:right w:val="single" w:color="ffffff" w:sz="8"/>
-            </w:tcBorders>
-            <w:shd w:color="000000" w:fill="ffffff" w:val="clear"/>
-            <w:tcMar>
-              <w:left w:w="56" w:type="dxa"/>
-              <w:right w:w="56" w:type="dxa"/>
-            </w:tcMar>
-            <w:vAlign w:val="top"/>
-          </w:tcPr>
-          <w:p>
-            <w:pPr>
-              <w:spacing w:before="0" w:after="0" w:line="278"/>
-              <w:ind w:right="314" w:left="0" w:firstLine="0"/>
-              <w:jc w:val="left"/>
-              <w:rPr>
-                <w:color w:val="auto"/>
-                <w:spacing w:val="0"/>
-                <w:position w:val="0"/>
-              </w:rPr>
-            </w:pPr>
-            <w:r>
-              <w:rPr>
-                <w:rFonts w:ascii="Open Sans" w:hAnsi="Open Sans" w:cs="Open Sans" w:eastAsia="Open Sans"/>
-                <w:color w:val="auto"/>
-                <w:spacing w:val="0"/>
-                <w:position w:val="0"/>
-                <w:sz w:val="20"/>
-                <w:shd w:fill="auto" w:val="clear"/>
-              </w:rPr>
-              <w:t xml:space="preserve">-252,10 €</w:t>
-            </w:r>
-          </w:p>
-        </w:tc>
-        <w:tc>
-          <w:tcPr>
-            <w:tcW w:w="1710" w:type="dxa"/>
-            <w:tcBorders>
-              <w:top w:val="single" w:color="ffffff" w:sz="8"/>
-              <w:left w:val="single" w:color="ffffff" w:sz="8"/>
-              <w:bottom w:val="single" w:color="ffffff" w:sz="8"/>
-              <w:right w:val="single" w:color="ffffff" w:sz="8"/>
-            </w:tcBorders>
-            <w:shd w:color="000000" w:fill="ffffff" w:val="clear"/>
-            <w:tcMar>
-              <w:left w:w="56" w:type="dxa"/>
-              <w:right w:w="56" w:type="dxa"/>
-            </w:tcMar>
-            <w:vAlign w:val="top"/>
-          </w:tcPr>
-          <w:p>
-            <w:pPr>
-              <w:spacing w:before="0" w:after="0" w:line="278"/>
-              <w:ind w:right="314" w:left="0" w:firstLine="0"/>
-              <w:jc w:val="left"/>
-              <w:rPr>
-                <w:color w:val="auto"/>
-                <w:spacing w:val="0"/>
-                <w:position w:val="0"/>
-              </w:rPr>
-            </w:pPr>
-            <w:r>
-              <w:rPr>
-                <w:rFonts w:ascii="Open Sans" w:hAnsi="Open Sans" w:cs="Open Sans" w:eastAsia="Open Sans"/>
-                <w:color w:val="auto"/>
-                <w:spacing w:val="0"/>
-                <w:position w:val="0"/>
-                <w:sz w:val="20"/>
-                <w:shd w:fill="auto" w:val="clear"/>
-              </w:rPr>
-              <w:t xml:space="preserve">-252,10 €</w:t>
-            </w:r>
           </w:p>
         </w:tc>
       </w:tr>
@@ -2911,7 +2885,7 @@
                 <w:sz w:val="22"/>
                 <w:shd w:fill="auto" w:val="clear"/>
               </w:rPr>
-              <w:t xml:space="preserve">5.751,87 €</w:t>
+              <w:t xml:space="preserve">4.164,32 €</w:t>
             </w:r>
             <w:r>
               <w:rPr>
@@ -2979,7 +2953,7 @@
                 <w:sz w:val="20"/>
                 <w:shd w:fill="auto" w:val="clear"/>
               </w:rPr>
-              <w:t xml:space="preserve">Rabatt</w:t>
+              <w:t xml:space="preserve">zzgl. 19% MwSt.</w:t>
             </w:r>
           </w:p>
         </w:tc>
@@ -3085,7 +3059,7 @@
                 <w:sz w:val="22"/>
                 <w:shd w:fill="auto" w:val="clear"/>
               </w:rPr>
-              <w:t xml:space="preserve">2,27 €</w:t>
+              <w:t xml:space="preserve">791,22 €</w:t>
             </w:r>
             <w:r>
               <w:rPr>
@@ -3153,7 +3127,7 @@
                 <w:sz w:val="20"/>
                 <w:shd w:fill="auto" w:val="clear"/>
               </w:rPr>
-              <w:t xml:space="preserve">zzgl. 19% MwSt.</w:t>
+              <w:t xml:space="preserve">Gesamtsumme</w:t>
             </w:r>
           </w:p>
         </w:tc>
@@ -3259,7 +3233,7 @@
                 <w:sz w:val="22"/>
                 <w:shd w:fill="auto" w:val="clear"/>
               </w:rPr>
-              <w:t xml:space="preserve">1.092,86 €</w:t>
+              <w:t xml:space="preserve">4.955,54 €</w:t>
             </w:r>
             <w:r>
               <w:rPr>
@@ -3327,7 +3301,7 @@
                 <w:sz w:val="20"/>
                 <w:shd w:fill="auto" w:val="clear"/>
               </w:rPr>
-              <w:t xml:space="preserve">Gesamtsumme</w:t>
+              <w:t xml:space="preserve">Zuschuss Krankenkasse</w:t>
             </w:r>
           </w:p>
         </w:tc>
@@ -3433,7 +3407,7 @@
                 <w:sz w:val="22"/>
                 <w:shd w:fill="auto" w:val="clear"/>
               </w:rPr>
-              <w:t xml:space="preserve">6.844,73 €</w:t>
+              <w:t xml:space="preserve">4.180,00 €</w:t>
             </w:r>
             <w:r>
               <w:rPr>
@@ -3501,7 +3475,7 @@
                 <w:sz w:val="20"/>
                 <w:shd w:fill="auto" w:val="clear"/>
               </w:rPr>
-              <w:t xml:space="preserve">Gesamtbetrag nach Materialrabatt</w:t>
+              <w:t xml:space="preserve">Selbstkostenanteil</w:t>
             </w:r>
           </w:p>
         </w:tc>
@@ -3607,529 +3581,7 @@
                 <w:sz w:val="22"/>
                 <w:shd w:fill="auto" w:val="clear"/>
               </w:rPr>
-              <w:t xml:space="preserve">6.842,02 €</w:t>
-            </w:r>
-            <w:r>
-              <w:rPr>
-                <w:rFonts w:ascii="Open Sans SemiBold" w:hAnsi="Open Sans SemiBold" w:cs="Open Sans SemiBold" w:eastAsia="Open Sans SemiBold"/>
-                <w:color w:val="auto"/>
-                <w:spacing w:val="0"/>
-                <w:position w:val="0"/>
-                <w:sz w:val="22"/>
-                <w:shd w:fill="auto" w:val="clear"/>
-              </w:rPr>
-              <w:t/>
-            </w:r>
-          </w:p>
-        </w:tc>
-      </w:tr>
-      <w:tr>
-        <w:trPr>
-          <w:trHeight w:val="285" w:hRule="auto"/>
-          <w:jc w:val="left"/>
-        </w:trPr>
-        <w:tc>
-          <w:tcPr>
-            <w:tcW w:w="3915" w:type="dxa"/>
-            <w:tcBorders>
-              <w:top w:val="single" w:color="ffffff" w:sz="8"/>
-              <w:left w:val="single" w:color="ffffff" w:sz="8"/>
-              <w:bottom w:val="single" w:color="ffffff" w:sz="8"/>
-              <w:right w:val="single" w:color="ffffff" w:sz="8"/>
-            </w:tcBorders>
-            <w:shd w:color="000000" w:fill="ffffff" w:val="clear"/>
-            <w:tcMar>
-              <w:left w:w="0" w:type="dxa"/>
-              <w:right w:w="0" w:type="dxa"/>
-            </w:tcMar>
-            <w:vAlign w:val="center"/>
-          </w:tcPr>
-          <w:p>
-            <w:pPr>
-              <w:spacing w:before="57" w:after="0" w:line="240"/>
-              <w:ind w:right="0" w:left="0" w:firstLine="0"/>
-              <w:jc w:val="left"/>
-              <w:rPr>
-                <w:spacing w:val="0"/>
-                <w:position w:val="0"/>
-              </w:rPr>
-            </w:pPr>
-            <w:r>
-              <w:rPr>
-                <w:rFonts w:ascii="Open Sans SemiBold" w:hAnsi="Open Sans SemiBold" w:cs="Open Sans SemiBold" w:eastAsia="Open Sans SemiBold"/>
-                <w:color w:val="030303"/>
-                <w:spacing w:val="0"/>
-                <w:position w:val="0"/>
-                <w:sz w:val="20"/>
-                <w:shd w:fill="auto" w:val="clear"/>
-              </w:rPr>
-              <w:t/>
-            </w:r>
-            <w:r>
-              <w:rPr>
-                <w:rFonts w:ascii="Open Sans SemiBold" w:hAnsi="Open Sans SemiBold" w:cs="Open Sans SemiBold" w:eastAsia="Open Sans SemiBold"/>
-                <w:b/>
-                <w:color w:val="030303"/>
-                <w:spacing w:val="0"/>
-                <w:position w:val="0"/>
-                <w:sz w:val="20"/>
-                <w:shd w:fill="auto" w:val="clear"/>
-              </w:rPr>
-              <w:t xml:space="preserve">Gesamtbetrag nach Neukundenbonus</w:t>
-            </w:r>
-          </w:p>
-        </w:tc>
-        <w:tc>
-          <w:tcPr>
-            <w:tcW w:w="915" w:type="dxa"/>
-            <w:tcBorders>
-              <w:top w:val="single" w:color="ffffff" w:sz="8"/>
-              <w:left w:val="single" w:color="ffffff" w:sz="8"/>
-              <w:bottom w:val="single" w:color="ffffff" w:sz="8"/>
-              <w:right w:val="single" w:color="ffffff" w:sz="8"/>
-            </w:tcBorders>
-            <w:shd w:color="000000" w:fill="ffffff" w:val="clear"/>
-            <w:tcMar>
-              <w:left w:w="0" w:type="dxa"/>
-              <w:right w:w="0" w:type="dxa"/>
-            </w:tcMar>
-            <w:vAlign w:val="center"/>
-          </w:tcPr>
-          <w:p>
-            <w:pPr>
-              <w:spacing w:before="0" w:after="0" w:line="240"/>
-              <w:ind w:right="0" w:left="0" w:firstLine="0"/>
-              <w:jc w:val="left"/>
-              <w:rPr>
-                <w:rFonts w:ascii="Calibri" w:hAnsi="Calibri" w:cs="Calibri" w:eastAsia="Calibri"/>
-                <w:color w:val="auto"/>
-                <w:spacing w:val="0"/>
-                <w:position w:val="0"/>
-                <w:sz w:val="22"/>
-                <w:shd w:fill="auto" w:val="clear"/>
-              </w:rPr>
-            </w:pPr>
-          </w:p>
-        </w:tc>
-        <w:tc>
-          <w:tcPr>
-            <w:tcW w:w="2106" w:type="dxa"/>
-            <w:tcBorders>
-              <w:top w:val="single" w:color="ffffff" w:sz="8"/>
-              <w:left w:val="single" w:color="ffffff" w:sz="8"/>
-              <w:bottom w:val="single" w:color="ffffff" w:sz="8"/>
-              <w:right w:val="single" w:color="ffffff" w:sz="8"/>
-            </w:tcBorders>
-            <w:shd w:color="000000" w:fill="ffffff" w:val="clear"/>
-            <w:tcMar>
-              <w:left w:w="0" w:type="dxa"/>
-              <w:right w:w="0" w:type="dxa"/>
-            </w:tcMar>
-            <w:vAlign w:val="center"/>
-          </w:tcPr>
-          <w:p>
-            <w:pPr>
-              <w:spacing w:before="0" w:after="0" w:line="240"/>
-              <w:ind w:right="0" w:left="0" w:firstLine="0"/>
-              <w:jc w:val="left"/>
-              <w:rPr>
-                <w:rFonts w:ascii="Calibri" w:hAnsi="Calibri" w:cs="Calibri" w:eastAsia="Calibri"/>
-                <w:color w:val="auto"/>
-                <w:spacing w:val="0"/>
-                <w:position w:val="0"/>
-                <w:sz w:val="22"/>
-                <w:shd w:fill="auto" w:val="clear"/>
-              </w:rPr>
-            </w:pPr>
-          </w:p>
-        </w:tc>
-        <w:tc>
-          <w:tcPr>
-            <w:tcW w:w="2724" w:type="dxa"/>
-            <w:tcBorders>
-              <w:top w:val="single" w:color="ffffff" w:sz="8"/>
-              <w:left w:val="single" w:color="ffffff" w:sz="8"/>
-              <w:bottom w:val="single" w:color="ffffff" w:sz="8"/>
-              <w:right w:val="single" w:color="ffffff" w:sz="8"/>
-            </w:tcBorders>
-            <w:shd w:color="000000" w:fill="ffffff" w:val="clear"/>
-            <w:tcMar>
-              <w:left w:w="0" w:type="dxa"/>
-              <w:right w:w="0" w:type="dxa"/>
-            </w:tcMar>
-            <w:vAlign w:val="center"/>
-          </w:tcPr>
-          <w:p>
-            <w:pPr>
-              <w:spacing w:before="0" w:after="0" w:line="278"/>
-              <w:ind w:right="314" w:left="0" w:firstLine="0"/>
-              <w:jc w:val="right"/>
-              <w:rPr>
-                <w:color w:val="auto"/>
-                <w:spacing w:val="0"/>
-                <w:position w:val="0"/>
-                <w:sz w:val="22"/>
-              </w:rPr>
-            </w:pPr>
-            <w:r>
-              <w:rPr>
-                <w:rFonts w:ascii="Open Sans SemiBold" w:hAnsi="Open Sans SemiBold" w:cs="Open Sans SemiBold" w:eastAsia="Open Sans SemiBold"/>
-                <w:b/>
-                <w:color w:val="auto"/>
-                <w:spacing w:val="0"/>
-                <w:position w:val="0"/>
-                <w:sz w:val="22"/>
-                <w:shd w:fill="auto" w:val="clear"/>
-              </w:rPr>
-              <w:t xml:space="preserve">6.542,02 €</w:t>
-            </w:r>
-            <w:r>
-              <w:rPr>
-                <w:rFonts w:ascii="Open Sans SemiBold" w:hAnsi="Open Sans SemiBold" w:cs="Open Sans SemiBold" w:eastAsia="Open Sans SemiBold"/>
-                <w:color w:val="auto"/>
-                <w:spacing w:val="0"/>
-                <w:position w:val="0"/>
-                <w:sz w:val="22"/>
-                <w:shd w:fill="auto" w:val="clear"/>
-              </w:rPr>
-              <w:t/>
-            </w:r>
-          </w:p>
-        </w:tc>
-      </w:tr>
-      <w:tr>
-        <w:trPr>
-          <w:trHeight w:val="1" w:hRule="atLeast"/>
-          <w:jc w:val="left"/>
-        </w:trPr>
-        <w:tc>
-          <w:tcPr>
-            <w:tcW w:w="3915" w:type="dxa"/>
-            <w:tcBorders>
-              <w:top w:val="single" w:color="ffffff" w:sz="8"/>
-              <w:left w:val="single" w:color="d9d9d9" w:sz="8"/>
-              <w:bottom w:val="single" w:color="ffffff" w:sz="8"/>
-              <w:right w:val="single" w:color="d9d9d9" w:sz="8"/>
-            </w:tcBorders>
-            <w:shd w:color="000000" w:fill="d9d9d9" w:val="clear"/>
-            <w:tcMar>
-              <w:left w:w="0" w:type="dxa"/>
-              <w:right w:w="0" w:type="dxa"/>
-            </w:tcMar>
-            <w:vAlign w:val="center"/>
-          </w:tcPr>
-          <w:p>
-            <w:pPr>
-              <w:spacing w:before="56" w:after="0" w:line="240"/>
-              <w:ind w:right="0" w:left="50" w:firstLine="0"/>
-              <w:jc w:val="left"/>
-              <w:rPr>
-                <w:spacing w:val="0"/>
-                <w:position w:val="0"/>
-              </w:rPr>
-            </w:pPr>
-            <w:r>
-              <w:rPr>
-                <w:rFonts w:ascii="Open Sans SemiBold" w:hAnsi="Open Sans SemiBold" w:cs="Open Sans SemiBold" w:eastAsia="Open Sans SemiBold"/>
-                <w:color w:val="030303"/>
-                <w:spacing w:val="0"/>
-                <w:position w:val="0"/>
-                <w:sz w:val="20"/>
-                <w:shd w:fill="auto" w:val="clear"/>
-              </w:rPr>
-              <w:t/>
-            </w:r>
-            <w:r>
-              <w:rPr>
-                <w:rFonts w:ascii="Open Sans SemiBold" w:hAnsi="Open Sans SemiBold" w:cs="Open Sans SemiBold" w:eastAsia="Open Sans SemiBold"/>
-                <w:b/>
-                <w:color w:val="030303"/>
-                <w:spacing w:val="0"/>
-                <w:position w:val="0"/>
-                <w:sz w:val="20"/>
-                <w:shd w:fill="auto" w:val="clear"/>
-              </w:rPr>
-              <w:t xml:space="preserve">Zuschuss Krankenkasse</w:t>
-            </w:r>
-          </w:p>
-        </w:tc>
-        <w:tc>
-          <w:tcPr>
-            <w:tcW w:w="915" w:type="dxa"/>
-            <w:tcBorders>
-              <w:top w:val="single" w:color="ffffff" w:sz="8"/>
-              <w:left w:val="single" w:color="d9d9d9" w:sz="8"/>
-              <w:bottom w:val="single" w:color="ffffff" w:sz="8"/>
-              <w:right w:val="single" w:color="d9d9d9" w:sz="8"/>
-            </w:tcBorders>
-            <w:shd w:color="000000" w:fill="d9d9d9" w:val="clear"/>
-            <w:tcMar>
-              <w:left w:w="0" w:type="dxa"/>
-              <w:right w:w="0" w:type="dxa"/>
-            </w:tcMar>
-            <w:vAlign w:val="center"/>
-          </w:tcPr>
-          <w:p>
-            <w:pPr>
-              <w:spacing w:before="0" w:after="0" w:line="240"/>
-              <w:ind w:right="0" w:left="0" w:firstLine="0"/>
-              <w:jc w:val="left"/>
-              <w:rPr>
-                <w:rFonts w:ascii="Calibri" w:hAnsi="Calibri" w:cs="Calibri" w:eastAsia="Calibri"/>
-                <w:color w:val="auto"/>
-                <w:spacing w:val="0"/>
-                <w:position w:val="0"/>
-                <w:sz w:val="22"/>
-                <w:shd w:fill="auto" w:val="clear"/>
-              </w:rPr>
-            </w:pPr>
-          </w:p>
-        </w:tc>
-        <w:tc>
-          <w:tcPr>
-            <w:tcW w:w="2106" w:type="dxa"/>
-            <w:tcBorders>
-              <w:top w:val="single" w:color="ffffff" w:sz="8"/>
-              <w:left w:val="single" w:color="d9d9d9" w:sz="8"/>
-              <w:bottom w:val="single" w:color="ffffff" w:sz="8"/>
-              <w:right w:val="single" w:color="d9d9d9" w:sz="8"/>
-            </w:tcBorders>
-            <w:shd w:color="000000" w:fill="d9d9d9" w:val="clear"/>
-            <w:tcMar>
-              <w:left w:w="0" w:type="dxa"/>
-              <w:right w:w="0" w:type="dxa"/>
-            </w:tcMar>
-            <w:vAlign w:val="center"/>
-          </w:tcPr>
-          <w:p>
-            <w:pPr>
-              <w:spacing w:before="0" w:after="0" w:line="240"/>
-              <w:ind w:right="0" w:left="0" w:firstLine="0"/>
-              <w:jc w:val="left"/>
-              <w:rPr>
-                <w:rFonts w:ascii="Calibri" w:hAnsi="Calibri" w:cs="Calibri" w:eastAsia="Calibri"/>
-                <w:color w:val="auto"/>
-                <w:spacing w:val="0"/>
-                <w:position w:val="0"/>
-                <w:sz w:val="22"/>
-                <w:shd w:fill="auto" w:val="clear"/>
-              </w:rPr>
-            </w:pPr>
-          </w:p>
-        </w:tc>
-        <w:tc>
-          <w:tcPr>
-            <w:tcW w:w="2724" w:type="dxa"/>
-            <w:tcBorders>
-              <w:top w:val="single" w:color="ffffff" w:sz="8"/>
-              <w:left w:val="single" w:color="d9d9d9" w:sz="8"/>
-              <w:bottom w:val="single" w:color="ffffff" w:sz="8"/>
-              <w:right w:val="single" w:color="d9d9d9" w:sz="8"/>
-            </w:tcBorders>
-            <w:shd w:color="000000" w:fill="d9d9d9" w:val="clear"/>
-            <w:tcMar>
-              <w:left w:w="0" w:type="dxa"/>
-              <w:right w:w="0" w:type="dxa"/>
-            </w:tcMar>
-            <w:vAlign w:val="center"/>
-          </w:tcPr>
-          <w:p>
-            <w:pPr>
-              <w:spacing w:before="0" w:after="0" w:line="278"/>
-              <w:ind w:right="314" w:left="0" w:firstLine="0"/>
-              <w:jc w:val="right"/>
-              <w:rPr>
-                <w:color w:val="auto"/>
-                <w:spacing w:val="0"/>
-                <w:position w:val="0"/>
-                <w:sz w:val="22"/>
-              </w:rPr>
-            </w:pPr>
-            <w:r>
-              <w:rPr>
-                <w:rFonts w:ascii="Open Sans SemiBold" w:hAnsi="Open Sans SemiBold" w:cs="Open Sans SemiBold" w:eastAsia="Open Sans SemiBold"/>
-                <w:b/>
-                <w:color w:val="auto"/>
-                <w:spacing w:val="0"/>
-                <w:position w:val="0"/>
-                <w:sz w:val="22"/>
-                <w:shd w:fill="auto" w:val="clear"/>
-              </w:rPr>
-              <w:t xml:space="preserve">4.280,00 €</w:t>
-            </w:r>
-            <w:r>
-              <w:rPr>
-                <w:rFonts w:ascii="Open Sans SemiBold" w:hAnsi="Open Sans SemiBold" w:cs="Open Sans SemiBold" w:eastAsia="Open Sans SemiBold"/>
-                <w:color w:val="auto"/>
-                <w:spacing w:val="0"/>
-                <w:position w:val="0"/>
-                <w:sz w:val="22"/>
-                <w:shd w:fill="auto" w:val="clear"/>
-              </w:rPr>
-              <w:t/>
-            </w:r>
-          </w:p>
-        </w:tc>
-      </w:tr>
-      <w:tr>
-        <w:trPr>
-          <w:trHeight w:val="285" w:hRule="auto"/>
-          <w:jc w:val="left"/>
-        </w:trPr>
-        <w:tc>
-          <w:tcPr>
-            <w:tcW w:w="3915" w:type="dxa"/>
-            <w:tcBorders>
-              <w:top w:val="single" w:color="ffffff" w:sz="8"/>
-              <w:left w:val="single" w:color="ffffff" w:sz="8"/>
-              <w:bottom w:val="single" w:color="ffffff" w:sz="8"/>
-              <w:right w:val="single" w:color="ffffff" w:sz="8"/>
-            </w:tcBorders>
-            <w:shd w:color="000000" w:fill="ffffff" w:val="clear"/>
-            <w:tcMar>
-              <w:left w:w="0" w:type="dxa"/>
-              <w:right w:w="0" w:type="dxa"/>
-            </w:tcMar>
-            <w:vAlign w:val="center"/>
-          </w:tcPr>
-          <w:p>
-            <w:pPr>
-              <w:spacing w:before="57" w:after="0" w:line="240"/>
-              <w:ind w:right="0" w:left="0" w:firstLine="0"/>
-              <w:jc w:val="left"/>
-              <w:rPr>
-                <w:spacing w:val="0"/>
-                <w:position w:val="0"/>
-              </w:rPr>
-            </w:pPr>
-            <w:r>
-              <w:rPr>
-                <w:rFonts w:ascii="Open Sans SemiBold" w:hAnsi="Open Sans SemiBold" w:cs="Open Sans SemiBold" w:eastAsia="Open Sans SemiBold"/>
-                <w:color w:val="030303"/>
-                <w:spacing w:val="0"/>
-                <w:position w:val="0"/>
-                <w:sz w:val="20"/>
-                <w:shd w:fill="auto" w:val="clear"/>
-              </w:rPr>
-              <w:t/>
-            </w:r>
-            <w:r>
-              <w:rPr>
-                <w:rFonts w:ascii="Open Sans SemiBold" w:hAnsi="Open Sans SemiBold" w:cs="Open Sans SemiBold" w:eastAsia="Open Sans SemiBold"/>
-                <w:b/>
-                <w:color w:val="030303"/>
-                <w:spacing w:val="0"/>
-                <w:position w:val="0"/>
-                <w:sz w:val="20"/>
-                <w:shd w:fill="auto" w:val="clear"/>
-              </w:rPr>
-              <w:t xml:space="preserve">Selbstkostenanteil</w:t>
-            </w:r>
-          </w:p>
-        </w:tc>
-        <w:tc>
-          <w:tcPr>
-            <w:tcW w:w="915" w:type="dxa"/>
-            <w:tcBorders>
-              <w:top w:val="single" w:color="ffffff" w:sz="8"/>
-              <w:left w:val="single" w:color="ffffff" w:sz="8"/>
-              <w:bottom w:val="single" w:color="ffffff" w:sz="8"/>
-              <w:right w:val="single" w:color="ffffff" w:sz="8"/>
-            </w:tcBorders>
-            <w:shd w:color="000000" w:fill="ffffff" w:val="clear"/>
-            <w:tcMar>
-              <w:left w:w="0" w:type="dxa"/>
-              <w:right w:w="0" w:type="dxa"/>
-            </w:tcMar>
-            <w:vAlign w:val="center"/>
-          </w:tcPr>
-          <w:p>
-            <w:pPr>
-              <w:spacing w:before="0" w:after="0" w:line="240"/>
-              <w:ind w:right="0" w:left="0" w:firstLine="0"/>
-              <w:jc w:val="left"/>
-              <w:rPr>
-                <w:rFonts w:ascii="Calibri" w:hAnsi="Calibri" w:cs="Calibri" w:eastAsia="Calibri"/>
-                <w:color w:val="auto"/>
-                <w:spacing w:val="0"/>
-                <w:position w:val="0"/>
-                <w:sz w:val="22"/>
-                <w:shd w:fill="auto" w:val="clear"/>
-              </w:rPr>
-            </w:pPr>
-          </w:p>
-        </w:tc>
-        <w:tc>
-          <w:tcPr>
-            <w:tcW w:w="2106" w:type="dxa"/>
-            <w:tcBorders>
-              <w:top w:val="single" w:color="ffffff" w:sz="8"/>
-              <w:left w:val="single" w:color="ffffff" w:sz="8"/>
-              <w:bottom w:val="single" w:color="ffffff" w:sz="8"/>
-              <w:right w:val="single" w:color="ffffff" w:sz="8"/>
-            </w:tcBorders>
-            <w:shd w:color="000000" w:fill="ffffff" w:val="clear"/>
-            <w:tcMar>
-              <w:left w:w="0" w:type="dxa"/>
-              <w:right w:w="0" w:type="dxa"/>
-            </w:tcMar>
-            <w:vAlign w:val="center"/>
-          </w:tcPr>
-          <w:p>
-            <w:pPr>
-              <w:spacing w:before="0" w:after="0" w:line="240"/>
-              <w:ind w:right="0" w:left="0" w:firstLine="0"/>
-              <w:jc w:val="left"/>
-              <w:rPr>
-                <w:rFonts w:ascii="Calibri" w:hAnsi="Calibri" w:cs="Calibri" w:eastAsia="Calibri"/>
-                <w:color w:val="auto"/>
-                <w:spacing w:val="0"/>
-                <w:position w:val="0"/>
-                <w:sz w:val="22"/>
-                <w:shd w:fill="auto" w:val="clear"/>
-              </w:rPr>
-            </w:pPr>
-          </w:p>
-        </w:tc>
-        <w:tc>
-          <w:tcPr>
-            <w:tcW w:w="2724" w:type="dxa"/>
-            <w:tcBorders>
-              <w:top w:val="single" w:color="ffffff" w:sz="8"/>
-              <w:left w:val="single" w:color="ffffff" w:sz="8"/>
-              <w:bottom w:val="single" w:color="ffffff" w:sz="8"/>
-              <w:right w:val="single" w:color="ffffff" w:sz="8"/>
-            </w:tcBorders>
-            <w:shd w:color="000000" w:fill="ffffff" w:val="clear"/>
-            <w:tcMar>
-              <w:left w:w="0" w:type="dxa"/>
-              <w:right w:w="0" w:type="dxa"/>
-            </w:tcMar>
-            <w:vAlign w:val="center"/>
-          </w:tcPr>
-          <w:p>
-            <w:pPr>
-              <w:spacing w:before="0" w:after="0" w:line="278"/>
-              <w:ind w:right="314" w:left="0" w:firstLine="0"/>
-              <w:jc w:val="right"/>
-              <w:rPr>
-                <w:color w:val="auto"/>
-                <w:spacing w:val="0"/>
-                <w:position w:val="0"/>
-                <w:sz w:val="22"/>
-              </w:rPr>
-            </w:pPr>
-            <w:r>
-              <w:rPr>
-                <w:rFonts w:ascii="Open Sans SemiBold" w:hAnsi="Open Sans SemiBold" w:cs="Open Sans SemiBold" w:eastAsia="Open Sans SemiBold"/>
-                <w:b/>
-                <w:color w:val="auto"/>
-                <w:spacing w:val="0"/>
-                <w:position w:val="0"/>
-                <w:sz w:val="22"/>
-                <w:shd w:fill="auto" w:val="clear"/>
-              </w:rPr>
-              <w:t xml:space="preserve">2.262,02 €</w:t>
+              <w:t xml:space="preserve">775,54 €</w:t>
             </w:r>
             <w:r>
               <w:rPr>
@@ -4280,7 +3732,7 @@
           <w:sz w:val="22"/>
           <w:shd w:fill="auto" w:val="clear"/>
         </w:rPr>
-        <w:t xml:space="preserve">2.262,02 €</w:t>
+        <w:t xml:space="preserve">775,54 €</w:t>
       </w:r>
       <w:r>
         <w:rPr>
@@ -4303,7 +3755,7 @@
           <w:sz w:val="22"/>
           <w:shd w:fill="auto" w:val="clear"/>
         </w:rPr>
-        <w:t xml:space="preserve">4.280,00 €</w:t>
+        <w:t xml:space="preserve">4.180,00 €</w:t>
       </w:r>
       <w:r>
         <w:rPr>

</xml_diff>

<commit_message>
fixing the summary table (ohne rabatt)r
</commit_message>
<xml_diff>
--- a/out-Angebot.docx
+++ b/out-Angebot.docx
@@ -363,7 +363,7 @@
                 <w:sz w:val="22"/>
                 <w:shd w:fill="auto" w:val="clear"/>
               </w:rPr>
-              <w:t xml:space="preserve">AN20250923152324</w:t>
+              <w:t xml:space="preserve">AN20250923161501</w:t>
             </w:r>
             <w:r>
               <w:rPr>
@@ -617,7 +617,7 @@
           <w:sz w:val="24"/>
           <w:shd w:fill="auto" w:val="clear"/>
         </w:rPr>
-        <w:t xml:space="preserve">  Ihr Angebot AN20250923152324</w:t>
+        <w:t xml:space="preserve">  Ihr Angebot AN20250923161501</w:t>
       </w:r>
     </w:p>
     <w:p>
@@ -2017,7 +2017,7 @@
                 <w:sz w:val="20"/>
                 <w:shd w:fill="auto" w:val="clear"/>
               </w:rPr>
-              <w:t xml:space="preserve">1.523,03 €</w:t>
+              <w:t xml:space="preserve">1.552,54 €</w:t>
             </w:r>
           </w:p>
         </w:tc>
@@ -2057,7 +2057,7 @@
                 <w:sz w:val="20"/>
                 <w:shd w:fill="auto" w:val="clear"/>
               </w:rPr>
-              <w:t xml:space="preserve">1.523,03 €</w:t>
+              <w:t xml:space="preserve">1.552,54 €</w:t>
             </w:r>
           </w:p>
         </w:tc>
@@ -2604,7 +2604,7 @@
                 <w:sz w:val="20"/>
                 <w:shd w:fill="auto" w:val="clear"/>
               </w:rPr>
-              <w:t xml:space="preserve">- 2 Stk Verbindungsprofil(e) (Plattenanzahl - 1)</w:t>
+              <w:t xml:space="preserve">- 3 Stk Verbindungsprofil(e) (Plattenanzahl - 1)</w:t>
             </w:r>
           </w:p>
           <w:p>
@@ -2696,6 +2696,240 @@
                 <w:shd w:fill="auto" w:val="clear"/>
               </w:rPr>
             </w:pPr>
+          </w:p>
+        </w:tc>
+      </w:tr>
+      <w:tr>
+        <w:trPr>
+          <w:trHeight w:val="1" w:hRule="atLeast"/>
+          <w:jc w:val="left"/>
+        </w:trPr>
+        <w:tc>
+          <w:tcPr>
+            <w:tcW w:w="660" w:type="dxa"/>
+            <w:tcBorders>
+              <w:top w:val="single" w:color="ffffff" w:sz="8"/>
+              <w:left w:val="single" w:color="ffffff" w:sz="8"/>
+              <w:bottom w:val="single" w:color="ffffff" w:sz="8"/>
+              <w:right w:val="single" w:color="ffffff" w:sz="8"/>
+            </w:tcBorders>
+            <w:shd w:color="000000" w:fill="ffffff" w:val="clear"/>
+            <w:tcMar>
+              <w:left w:w="56" w:type="dxa"/>
+              <w:right w:w="56" w:type="dxa"/>
+            </w:tcMar>
+            <w:vAlign w:val="top"/>
+          </w:tcPr>
+          <w:p>
+            <w:pPr>
+              <w:spacing w:before="0" w:after="0" w:line="278"/>
+              <w:ind w:right="-26" w:left="0" w:firstLine="0"/>
+              <w:jc w:val="left"/>
+              <w:rPr>
+                <w:color w:val="auto"/>
+                <w:spacing w:val="0"/>
+                <w:position w:val="0"/>
+              </w:rPr>
+            </w:pPr>
+            <w:r>
+              <w:rPr>
+                <w:rFonts w:ascii="Open Sans" w:hAnsi="Open Sans" w:cs="Open Sans" w:eastAsia="Open Sans"/>
+                <w:color w:val="auto"/>
+                <w:spacing w:val="0"/>
+                <w:position w:val="0"/>
+                <w:sz w:val="20"/>
+                <w:shd w:fill="auto" w:val="clear"/>
+              </w:rPr>
+              <w:t xml:space="preserve">003</w:t>
+            </w:r>
+          </w:p>
+        </w:tc>
+        <w:tc>
+          <w:tcPr>
+            <w:tcW w:w="1035" w:type="dxa"/>
+            <w:tcBorders>
+              <w:top w:val="single" w:color="ffffff" w:sz="8"/>
+              <w:left w:val="single" w:color="ffffff" w:sz="8"/>
+              <w:bottom w:val="single" w:color="ffffff" w:sz="8"/>
+              <w:right w:val="single" w:color="ffffff" w:sz="8"/>
+            </w:tcBorders>
+            <w:shd w:color="000000" w:fill="ffffff" w:val="clear"/>
+            <w:tcMar>
+              <w:left w:w="56" w:type="dxa"/>
+              <w:right w:w="56" w:type="dxa"/>
+            </w:tcMar>
+            <w:vAlign w:val="top"/>
+          </w:tcPr>
+          <w:p>
+            <w:pPr>
+              <w:spacing w:before="0" w:after="0" w:line="278"/>
+              <w:ind w:right="314" w:left="0" w:firstLine="0"/>
+              <w:jc w:val="left"/>
+              <w:rPr>
+                <w:color w:val="auto"/>
+                <w:spacing w:val="0"/>
+                <w:position w:val="0"/>
+              </w:rPr>
+            </w:pPr>
+            <w:r>
+              <w:rPr>
+                <w:rFonts w:ascii="Open Sans" w:hAnsi="Open Sans" w:cs="Open Sans" w:eastAsia="Open Sans"/>
+                <w:color w:val="auto"/>
+                <w:spacing w:val="0"/>
+                <w:position w:val="0"/>
+                <w:sz w:val="20"/>
+                <w:shd w:fill="auto" w:val="clear"/>
+              </w:rPr>
+              <w:t xml:space="preserve">1 Stk</w:t>
+            </w:r>
+          </w:p>
+        </w:tc>
+        <w:tc>
+          <w:tcPr>
+            <w:tcW w:w="4107" w:type="dxa"/>
+            <w:tcBorders>
+              <w:top w:val="single" w:color="ffffff" w:sz="8"/>
+              <w:left w:val="single" w:color="ffffff" w:sz="8"/>
+              <w:bottom w:val="single" w:color="ffffff" w:sz="8"/>
+              <w:right w:val="single" w:color="ffffff" w:sz="8"/>
+            </w:tcBorders>
+            <w:shd w:color="000000" w:fill="ffffff" w:val="clear"/>
+            <w:tcMar>
+              <w:left w:w="56" w:type="dxa"/>
+              <w:right w:w="56" w:type="dxa"/>
+            </w:tcMar>
+            <w:vAlign w:val="top"/>
+          </w:tcPr>
+          <w:p>
+            <w:pPr>
+              <w:spacing w:before="0" w:after="0" w:line="278"/>
+              <w:ind w:right="314" w:left="0" w:firstLine="0"/>
+              <w:jc w:val="left"/>
+              <w:rPr>
+                <w:rFonts w:ascii="Open Sans" w:hAnsi="Open Sans" w:cs="Open Sans" w:eastAsia="Open Sans"/>
+                <w:b/>
+                <w:color w:val="auto"/>
+                <w:spacing w:val="0"/>
+                <w:position w:val="0"/>
+                <w:sz w:val="20"/>
+                <w:shd w:fill="auto" w:val="clear"/>
+              </w:rPr>
+            </w:pPr>
+            <w:r>
+              <w:rPr>
+                <w:rFonts w:ascii="Open Sans" w:hAnsi="Open Sans" w:cs="Open Sans" w:eastAsia="Open Sans"/>
+                <w:b/>
+                <w:color w:val="auto"/>
+                <w:spacing w:val="0"/>
+                <w:position w:val="0"/>
+                <w:sz w:val="20"/>
+                <w:shd w:fill="auto" w:val="clear"/>
+              </w:rPr>
+              <w:t xml:space="preserve">Bestandkundenbonus:</w:t>
+            </w:r>
+          </w:p>
+          <w:p>
+            <w:pPr>
+              <w:spacing w:before="0" w:after="0" w:line="278"/>
+              <w:ind w:right="314" w:left="0" w:firstLine="0"/>
+              <w:jc w:val="left"/>
+              <w:rPr>
+                <w:color w:val="auto"/>
+                <w:spacing w:val="0"/>
+                <w:position w:val="0"/>
+              </w:rPr>
+            </w:pPr>
+            <w:r>
+              <w:rPr>
+                <w:rFonts w:ascii="Open Sans" w:hAnsi="Open Sans" w:cs="Open Sans" w:eastAsia="Open Sans"/>
+                <w:color w:val="auto"/>
+                <w:spacing w:val="0"/>
+                <w:position w:val="0"/>
+                <w:sz w:val="20"/>
+                <w:shd w:fill="auto" w:val="clear"/>
+              </w:rPr>
+              <w:t xml:space="preserve">-- Rabatt von 300 € ab einem Gesamtwert von 3.000</w:t>
+            </w:r>
+          </w:p>
+        </w:tc>
+        <w:tc>
+          <w:tcPr>
+            <w:tcW w:w="2268" w:type="dxa"/>
+            <w:tcBorders>
+              <w:top w:val="single" w:color="ffffff" w:sz="8"/>
+              <w:left w:val="single" w:color="ffffff" w:sz="8"/>
+              <w:bottom w:val="single" w:color="ffffff" w:sz="8"/>
+              <w:right w:val="single" w:color="ffffff" w:sz="8"/>
+            </w:tcBorders>
+            <w:shd w:color="000000" w:fill="ffffff" w:val="clear"/>
+            <w:tcMar>
+              <w:left w:w="56" w:type="dxa"/>
+              <w:right w:w="56" w:type="dxa"/>
+            </w:tcMar>
+            <w:vAlign w:val="top"/>
+          </w:tcPr>
+          <w:p>
+            <w:pPr>
+              <w:spacing w:before="0" w:after="0" w:line="278"/>
+              <w:ind w:right="314" w:left="0" w:firstLine="0"/>
+              <w:jc w:val="left"/>
+              <w:rPr>
+                <w:color w:val="auto"/>
+                <w:spacing w:val="0"/>
+                <w:position w:val="0"/>
+              </w:rPr>
+            </w:pPr>
+            <w:r>
+              <w:rPr>
+                <w:rFonts w:ascii="Open Sans" w:hAnsi="Open Sans" w:cs="Open Sans" w:eastAsia="Open Sans"/>
+                <w:color w:val="auto"/>
+                <w:spacing w:val="0"/>
+                <w:position w:val="0"/>
+                <w:sz w:val="20"/>
+                <w:shd w:fill="auto" w:val="clear"/>
+              </w:rPr>
+              <w:t xml:space="preserve">-252,10 €</w:t>
+            </w:r>
+          </w:p>
+        </w:tc>
+        <w:tc>
+          <w:tcPr>
+            <w:tcW w:w="1710" w:type="dxa"/>
+            <w:tcBorders>
+              <w:top w:val="single" w:color="ffffff" w:sz="8"/>
+              <w:left w:val="single" w:color="ffffff" w:sz="8"/>
+              <w:bottom w:val="single" w:color="ffffff" w:sz="8"/>
+              <w:right w:val="single" w:color="ffffff" w:sz="8"/>
+            </w:tcBorders>
+            <w:shd w:color="000000" w:fill="ffffff" w:val="clear"/>
+            <w:tcMar>
+              <w:left w:w="56" w:type="dxa"/>
+              <w:right w:w="56" w:type="dxa"/>
+            </w:tcMar>
+            <w:vAlign w:val="top"/>
+          </w:tcPr>
+          <w:p>
+            <w:pPr>
+              <w:spacing w:before="0" w:after="0" w:line="278"/>
+              <w:ind w:right="314" w:left="0" w:firstLine="0"/>
+              <w:jc w:val="left"/>
+              <w:rPr>
+                <w:color w:val="auto"/>
+                <w:spacing w:val="0"/>
+                <w:position w:val="0"/>
+              </w:rPr>
+            </w:pPr>
+            <w:r>
+              <w:rPr>
+                <w:rFonts w:ascii="Open Sans" w:hAnsi="Open Sans" w:cs="Open Sans" w:eastAsia="Open Sans"/>
+                <w:color w:val="auto"/>
+                <w:spacing w:val="0"/>
+                <w:position w:val="0"/>
+                <w:sz w:val="20"/>
+                <w:shd w:fill="auto" w:val="clear"/>
+              </w:rPr>
+              <w:t xml:space="preserve">-252,10 €</w:t>
+            </w:r>
           </w:p>
         </w:tc>
       </w:tr>
@@ -2779,7 +3013,7 @@
                 <w:sz w:val="20"/>
                 <w:shd w:fill="auto" w:val="clear"/>
               </w:rPr>
-              <w:t xml:space="preserve">Nettobetrag (ohne Rabatt)</w:t>
+              <w:t xml:space="preserve">Nettobetrag</w:t>
             </w:r>
           </w:p>
         </w:tc>
@@ -2885,7 +3119,7 @@
                 <w:sz w:val="22"/>
                 <w:shd w:fill="auto" w:val="clear"/>
               </w:rPr>
-              <w:t xml:space="preserve">4.164,32 €</w:t>
+              <w:t xml:space="preserve">4.208,58 €</w:t>
             </w:r>
             <w:r>
               <w:rPr>
@@ -3059,7 +3293,7 @@
                 <w:sz w:val="22"/>
                 <w:shd w:fill="auto" w:val="clear"/>
               </w:rPr>
-              <w:t xml:space="preserve">791,22 €</w:t>
+              <w:t xml:space="preserve">799,63 €</w:t>
             </w:r>
             <w:r>
               <w:rPr>
@@ -3233,7 +3467,7 @@
                 <w:sz w:val="22"/>
                 <w:shd w:fill="auto" w:val="clear"/>
               </w:rPr>
-              <w:t xml:space="preserve">4.955,54 €</w:t>
+              <w:t xml:space="preserve">5.008,21 €</w:t>
             </w:r>
             <w:r>
               <w:rPr>
@@ -3301,7 +3535,7 @@
                 <w:sz w:val="20"/>
                 <w:shd w:fill="auto" w:val="clear"/>
               </w:rPr>
-              <w:t xml:space="preserve">Zuschuss Krankenkasse</w:t>
+              <w:t xml:space="preserve">Gesamtbetrag nach Neukundenbonus</w:t>
             </w:r>
           </w:p>
         </w:tc>
@@ -3407,7 +3641,7 @@
                 <w:sz w:val="22"/>
                 <w:shd w:fill="auto" w:val="clear"/>
               </w:rPr>
-              <w:t xml:space="preserve">4.180,00 €</w:t>
+              <w:t xml:space="preserve">4.708,21 €</w:t>
             </w:r>
             <w:r>
               <w:rPr>
@@ -3475,7 +3709,7 @@
                 <w:sz w:val="20"/>
                 <w:shd w:fill="auto" w:val="clear"/>
               </w:rPr>
-              <w:t xml:space="preserve">Selbstkostenanteil</w:t>
+              <w:t xml:space="preserve">Zuschuss Krankenkasse</w:t>
             </w:r>
           </w:p>
         </w:tc>
@@ -3581,7 +3815,181 @@
                 <w:sz w:val="22"/>
                 <w:shd w:fill="auto" w:val="clear"/>
               </w:rPr>
-              <w:t xml:space="preserve">775,54 €</w:t>
+              <w:t xml:space="preserve">4.680,00 €</w:t>
+            </w:r>
+            <w:r>
+              <w:rPr>
+                <w:rFonts w:ascii="Open Sans SemiBold" w:hAnsi="Open Sans SemiBold" w:cs="Open Sans SemiBold" w:eastAsia="Open Sans SemiBold"/>
+                <w:color w:val="auto"/>
+                <w:spacing w:val="0"/>
+                <w:position w:val="0"/>
+                <w:sz w:val="22"/>
+                <w:shd w:fill="auto" w:val="clear"/>
+              </w:rPr>
+              <w:t/>
+            </w:r>
+          </w:p>
+        </w:tc>
+      </w:tr>
+      <w:tr>
+        <w:trPr>
+          <w:trHeight w:val="285" w:hRule="auto"/>
+          <w:jc w:val="left"/>
+        </w:trPr>
+        <w:tc>
+          <w:tcPr>
+            <w:tcW w:w="3915" w:type="dxa"/>
+            <w:tcBorders>
+              <w:top w:val="single" w:color="ffffff" w:sz="8"/>
+              <w:left w:val="single" w:color="ffffff" w:sz="8"/>
+              <w:bottom w:val="single" w:color="ffffff" w:sz="8"/>
+              <w:right w:val="single" w:color="ffffff" w:sz="8"/>
+            </w:tcBorders>
+            <w:shd w:color="000000" w:fill="ffffff" w:val="clear"/>
+            <w:tcMar>
+              <w:left w:w="0" w:type="dxa"/>
+              <w:right w:w="0" w:type="dxa"/>
+            </w:tcMar>
+            <w:vAlign w:val="center"/>
+          </w:tcPr>
+          <w:p>
+            <w:pPr>
+              <w:spacing w:before="57" w:after="0" w:line="240"/>
+              <w:ind w:right="0" w:left="0" w:firstLine="0"/>
+              <w:jc w:val="left"/>
+              <w:rPr>
+                <w:spacing w:val="0"/>
+                <w:position w:val="0"/>
+              </w:rPr>
+            </w:pPr>
+            <w:r>
+              <w:rPr>
+                <w:rFonts w:ascii="Open Sans SemiBold" w:hAnsi="Open Sans SemiBold" w:cs="Open Sans SemiBold" w:eastAsia="Open Sans SemiBold"/>
+                <w:color w:val="030303"/>
+                <w:spacing w:val="0"/>
+                <w:position w:val="0"/>
+                <w:sz w:val="20"/>
+                <w:shd w:fill="auto" w:val="clear"/>
+              </w:rPr>
+              <w:t/>
+            </w:r>
+            <w:r>
+              <w:rPr>
+                <w:rFonts w:ascii="Open Sans SemiBold" w:hAnsi="Open Sans SemiBold" w:cs="Open Sans SemiBold" w:eastAsia="Open Sans SemiBold"/>
+                <w:b/>
+                <w:color w:val="030303"/>
+                <w:spacing w:val="0"/>
+                <w:position w:val="0"/>
+                <w:sz w:val="20"/>
+                <w:shd w:fill="auto" w:val="clear"/>
+              </w:rPr>
+              <w:t xml:space="preserve">Selbstkostenanteil</w:t>
+            </w:r>
+          </w:p>
+        </w:tc>
+        <w:tc>
+          <w:tcPr>
+            <w:tcW w:w="915" w:type="dxa"/>
+            <w:tcBorders>
+              <w:top w:val="single" w:color="ffffff" w:sz="8"/>
+              <w:left w:val="single" w:color="ffffff" w:sz="8"/>
+              <w:bottom w:val="single" w:color="ffffff" w:sz="8"/>
+              <w:right w:val="single" w:color="ffffff" w:sz="8"/>
+            </w:tcBorders>
+            <w:shd w:color="000000" w:fill="ffffff" w:val="clear"/>
+            <w:tcMar>
+              <w:left w:w="0" w:type="dxa"/>
+              <w:right w:w="0" w:type="dxa"/>
+            </w:tcMar>
+            <w:vAlign w:val="center"/>
+          </w:tcPr>
+          <w:p>
+            <w:pPr>
+              <w:spacing w:before="0" w:after="0" w:line="240"/>
+              <w:ind w:right="0" w:left="0" w:firstLine="0"/>
+              <w:jc w:val="left"/>
+              <w:rPr>
+                <w:rFonts w:ascii="Calibri" w:hAnsi="Calibri" w:cs="Calibri" w:eastAsia="Calibri"/>
+                <w:color w:val="auto"/>
+                <w:spacing w:val="0"/>
+                <w:position w:val="0"/>
+                <w:sz w:val="22"/>
+                <w:shd w:fill="auto" w:val="clear"/>
+              </w:rPr>
+            </w:pPr>
+          </w:p>
+        </w:tc>
+        <w:tc>
+          <w:tcPr>
+            <w:tcW w:w="2106" w:type="dxa"/>
+            <w:tcBorders>
+              <w:top w:val="single" w:color="ffffff" w:sz="8"/>
+              <w:left w:val="single" w:color="ffffff" w:sz="8"/>
+              <w:bottom w:val="single" w:color="ffffff" w:sz="8"/>
+              <w:right w:val="single" w:color="ffffff" w:sz="8"/>
+            </w:tcBorders>
+            <w:shd w:color="000000" w:fill="ffffff" w:val="clear"/>
+            <w:tcMar>
+              <w:left w:w="0" w:type="dxa"/>
+              <w:right w:w="0" w:type="dxa"/>
+            </w:tcMar>
+            <w:vAlign w:val="center"/>
+          </w:tcPr>
+          <w:p>
+            <w:pPr>
+              <w:spacing w:before="0" w:after="0" w:line="240"/>
+              <w:ind w:right="0" w:left="0" w:firstLine="0"/>
+              <w:jc w:val="left"/>
+              <w:rPr>
+                <w:rFonts w:ascii="Calibri" w:hAnsi="Calibri" w:cs="Calibri" w:eastAsia="Calibri"/>
+                <w:color w:val="auto"/>
+                <w:spacing w:val="0"/>
+                <w:position w:val="0"/>
+                <w:sz w:val="22"/>
+                <w:shd w:fill="auto" w:val="clear"/>
+              </w:rPr>
+            </w:pPr>
+          </w:p>
+        </w:tc>
+        <w:tc>
+          <w:tcPr>
+            <w:tcW w:w="2724" w:type="dxa"/>
+            <w:tcBorders>
+              <w:top w:val="single" w:color="ffffff" w:sz="8"/>
+              <w:left w:val="single" w:color="ffffff" w:sz="8"/>
+              <w:bottom w:val="single" w:color="ffffff" w:sz="8"/>
+              <w:right w:val="single" w:color="ffffff" w:sz="8"/>
+            </w:tcBorders>
+            <w:shd w:color="000000" w:fill="ffffff" w:val="clear"/>
+            <w:tcMar>
+              <w:left w:w="0" w:type="dxa"/>
+              <w:right w:w="0" w:type="dxa"/>
+            </w:tcMar>
+            <w:vAlign w:val="center"/>
+          </w:tcPr>
+          <w:p>
+            <w:pPr>
+              <w:spacing w:before="0" w:after="0" w:line="278"/>
+              <w:ind w:right="314" w:left="0" w:firstLine="0"/>
+              <w:jc w:val="right"/>
+              <w:rPr>
+                <w:color w:val="auto"/>
+                <w:spacing w:val="0"/>
+                <w:position w:val="0"/>
+                <w:sz w:val="22"/>
+              </w:rPr>
+            </w:pPr>
+            <w:r>
+              <w:rPr>
+                <w:rFonts w:ascii="Open Sans SemiBold" w:hAnsi="Open Sans SemiBold" w:cs="Open Sans SemiBold" w:eastAsia="Open Sans SemiBold"/>
+                <w:b/>
+                <w:color w:val="auto"/>
+                <w:spacing w:val="0"/>
+                <w:position w:val="0"/>
+                <w:sz w:val="22"/>
+                <w:shd w:fill="auto" w:val="clear"/>
+              </w:rPr>
+              <w:t xml:space="preserve">28,21 €</w:t>
             </w:r>
             <w:r>
               <w:rPr>
@@ -3732,7 +4140,7 @@
           <w:sz w:val="22"/>
           <w:shd w:fill="auto" w:val="clear"/>
         </w:rPr>
-        <w:t xml:space="preserve">775,54 €</w:t>
+        <w:t xml:space="preserve">28,21 €</w:t>
       </w:r>
       <w:r>
         <w:rPr>
@@ -3755,7 +4163,7 @@
           <w:sz w:val="22"/>
           <w:shd w:fill="auto" w:val="clear"/>
         </w:rPr>
-        <w:t xml:space="preserve">4.180,00 €</w:t>
+        <w:t xml:space="preserve">4.680,00 €</w:t>
       </w:r>
       <w:r>
         <w:rPr>

</xml_diff>

<commit_message>
fixing the zuzaglung calcul
</commit_message>
<xml_diff>
--- a/out-Angebot.docx
+++ b/out-Angebot.docx
@@ -363,7 +363,7 @@
                 <w:sz w:val="22"/>
                 <w:shd w:fill="auto" w:val="clear"/>
               </w:rPr>
-              <w:t xml:space="preserve">AN20250923161501</w:t>
+              <w:t xml:space="preserve">AN20250923162141</w:t>
             </w:r>
             <w:r>
               <w:rPr>
@@ -617,7 +617,7 @@
           <w:sz w:val="24"/>
           <w:shd w:fill="auto" w:val="clear"/>
         </w:rPr>
-        <w:t xml:space="preserve">  Ihr Angebot AN20250923161501</w:t>
+        <w:t xml:space="preserve">  Ihr Angebot AN20250923162141</w:t>
       </w:r>
     </w:p>
     <w:p>
@@ -3815,7 +3815,7 @@
                 <w:sz w:val="22"/>
                 <w:shd w:fill="auto" w:val="clear"/>
               </w:rPr>
-              <w:t xml:space="preserve">4.680,00 €</w:t>
+              <w:t xml:space="preserve">4.180,00 €</w:t>
             </w:r>
             <w:r>
               <w:rPr>
@@ -3989,7 +3989,7 @@
                 <w:sz w:val="22"/>
                 <w:shd w:fill="auto" w:val="clear"/>
               </w:rPr>
-              <w:t xml:space="preserve">28,21 €</w:t>
+              <w:t xml:space="preserve">528,21 €</w:t>
             </w:r>
             <w:r>
               <w:rPr>
@@ -4140,7 +4140,7 @@
           <w:sz w:val="22"/>
           <w:shd w:fill="auto" w:val="clear"/>
         </w:rPr>
-        <w:t xml:space="preserve">28,21 €</w:t>
+        <w:t xml:space="preserve">528,21 €</w:t>
       </w:r>
       <w:r>
         <w:rPr>
@@ -4163,7 +4163,7 @@
           <w:sz w:val="22"/>
           <w:shd w:fill="auto" w:val="clear"/>
         </w:rPr>
-        <w:t xml:space="preserve">4.680,00 €</w:t>
+        <w:t xml:space="preserve">4.180,00 €</w:t>
       </w:r>
       <w:r>
         <w:rPr>

</xml_diff>

<commit_message>
8 Std. × 2 Facharbeiter hided
</commit_message>
<xml_diff>
--- a/out-Angebot.docx
+++ b/out-Angebot.docx
@@ -363,7 +363,7 @@
                 <w:sz w:val="22"/>
                 <w:shd w:fill="auto" w:val="clear"/>
               </w:rPr>
-              <w:t xml:space="preserve">AN20250923162141</w:t>
+              <w:t xml:space="preserve">AN20250924092924</w:t>
             </w:r>
             <w:r>
               <w:rPr>
@@ -617,7 +617,7 @@
           <w:sz w:val="24"/>
           <w:shd w:fill="auto" w:val="clear"/>
         </w:rPr>
-        <w:t xml:space="preserve">  Ihr Angebot AN20250923162141</w:t>
+        <w:t xml:space="preserve">  Ihr Angebot AN20250924092924</w:t>
       </w:r>
     </w:p>
     <w:p>
@@ -1072,7 +1072,7 @@
                 <w:sz w:val="20"/>
                 <w:shd w:fill="auto" w:val="clear"/>
               </w:rPr>
-              <w:t xml:space="preserve">1.213,80 €</w:t>
+              <w:t xml:space="preserve">1.633,60 €</w:t>
             </w:r>
           </w:p>
         </w:tc>
@@ -1112,7 +1112,7 @@
                 <w:sz w:val="20"/>
                 <w:shd w:fill="auto" w:val="clear"/>
               </w:rPr>
-              <w:t xml:space="preserve">1.213,80 €</w:t>
+              <w:t xml:space="preserve">1.633,60 €</w:t>
             </w:r>
           </w:p>
         </w:tc>
@@ -1477,33 +1477,7 @@
                 <w:sz w:val="18"/>
                 <w:shd w:fill="auto" w:val="clear"/>
               </w:rPr>
-              <w:t xml:space="preserve">- 14 km Kilometerpauschale (Hin- &amp; Rückfahrt)</w:t>
-            </w:r>
-          </w:p>
-          <w:p>
-            <w:pPr>
-              <w:spacing w:before="0" w:after="0" w:line="278"/>
-              <w:ind w:right="314" w:left="0" w:firstLine="0"/>
-              <w:jc w:val="left"/>
-              <w:rPr>
-                <w:rFonts w:ascii="Open Sans" w:hAnsi="Open Sans" w:cs="Open Sans" w:eastAsia="Open Sans"/>
-                <w:color w:val="auto"/>
-                <w:spacing w:val="0"/>
-                <w:position w:val="0"/>
-                <w:sz w:val="18"/>
-                <w:shd w:fill="auto" w:val="clear"/>
-              </w:rPr>
-            </w:pPr>
-            <w:r>
-              <w:rPr>
-                <w:rFonts w:ascii="Open Sans" w:hAnsi="Open Sans" w:cs="Open Sans" w:eastAsia="Open Sans"/>
-                <w:color w:val="auto"/>
-                <w:spacing w:val="0"/>
-                <w:position w:val="0"/>
-                <w:sz w:val="18"/>
-                <w:shd w:fill="auto" w:val="clear"/>
-              </w:rPr>
-              <w:t xml:space="preserve">- 8 Std × 2 Facharbeiter × 69.50 €</w:t>
+              <w:t xml:space="preserve">- 18 km Kilometerpauschale (Hin- &amp; Rückfahrt)</w:t>
             </w:r>
           </w:p>
           <w:p>
@@ -2699,240 +2673,6 @@
           </w:p>
         </w:tc>
       </w:tr>
-      <w:tr>
-        <w:trPr>
-          <w:trHeight w:val="1" w:hRule="atLeast"/>
-          <w:jc w:val="left"/>
-        </w:trPr>
-        <w:tc>
-          <w:tcPr>
-            <w:tcW w:w="660" w:type="dxa"/>
-            <w:tcBorders>
-              <w:top w:val="single" w:color="ffffff" w:sz="8"/>
-              <w:left w:val="single" w:color="ffffff" w:sz="8"/>
-              <w:bottom w:val="single" w:color="ffffff" w:sz="8"/>
-              <w:right w:val="single" w:color="ffffff" w:sz="8"/>
-            </w:tcBorders>
-            <w:shd w:color="000000" w:fill="ffffff" w:val="clear"/>
-            <w:tcMar>
-              <w:left w:w="56" w:type="dxa"/>
-              <w:right w:w="56" w:type="dxa"/>
-            </w:tcMar>
-            <w:vAlign w:val="top"/>
-          </w:tcPr>
-          <w:p>
-            <w:pPr>
-              <w:spacing w:before="0" w:after="0" w:line="278"/>
-              <w:ind w:right="-26" w:left="0" w:firstLine="0"/>
-              <w:jc w:val="left"/>
-              <w:rPr>
-                <w:color w:val="auto"/>
-                <w:spacing w:val="0"/>
-                <w:position w:val="0"/>
-              </w:rPr>
-            </w:pPr>
-            <w:r>
-              <w:rPr>
-                <w:rFonts w:ascii="Open Sans" w:hAnsi="Open Sans" w:cs="Open Sans" w:eastAsia="Open Sans"/>
-                <w:color w:val="auto"/>
-                <w:spacing w:val="0"/>
-                <w:position w:val="0"/>
-                <w:sz w:val="20"/>
-                <w:shd w:fill="auto" w:val="clear"/>
-              </w:rPr>
-              <w:t xml:space="preserve">003</w:t>
-            </w:r>
-          </w:p>
-        </w:tc>
-        <w:tc>
-          <w:tcPr>
-            <w:tcW w:w="1035" w:type="dxa"/>
-            <w:tcBorders>
-              <w:top w:val="single" w:color="ffffff" w:sz="8"/>
-              <w:left w:val="single" w:color="ffffff" w:sz="8"/>
-              <w:bottom w:val="single" w:color="ffffff" w:sz="8"/>
-              <w:right w:val="single" w:color="ffffff" w:sz="8"/>
-            </w:tcBorders>
-            <w:shd w:color="000000" w:fill="ffffff" w:val="clear"/>
-            <w:tcMar>
-              <w:left w:w="56" w:type="dxa"/>
-              <w:right w:w="56" w:type="dxa"/>
-            </w:tcMar>
-            <w:vAlign w:val="top"/>
-          </w:tcPr>
-          <w:p>
-            <w:pPr>
-              <w:spacing w:before="0" w:after="0" w:line="278"/>
-              <w:ind w:right="314" w:left="0" w:firstLine="0"/>
-              <w:jc w:val="left"/>
-              <w:rPr>
-                <w:color w:val="auto"/>
-                <w:spacing w:val="0"/>
-                <w:position w:val="0"/>
-              </w:rPr>
-            </w:pPr>
-            <w:r>
-              <w:rPr>
-                <w:rFonts w:ascii="Open Sans" w:hAnsi="Open Sans" w:cs="Open Sans" w:eastAsia="Open Sans"/>
-                <w:color w:val="auto"/>
-                <w:spacing w:val="0"/>
-                <w:position w:val="0"/>
-                <w:sz w:val="20"/>
-                <w:shd w:fill="auto" w:val="clear"/>
-              </w:rPr>
-              <w:t xml:space="preserve">1 Stk</w:t>
-            </w:r>
-          </w:p>
-        </w:tc>
-        <w:tc>
-          <w:tcPr>
-            <w:tcW w:w="4107" w:type="dxa"/>
-            <w:tcBorders>
-              <w:top w:val="single" w:color="ffffff" w:sz="8"/>
-              <w:left w:val="single" w:color="ffffff" w:sz="8"/>
-              <w:bottom w:val="single" w:color="ffffff" w:sz="8"/>
-              <w:right w:val="single" w:color="ffffff" w:sz="8"/>
-            </w:tcBorders>
-            <w:shd w:color="000000" w:fill="ffffff" w:val="clear"/>
-            <w:tcMar>
-              <w:left w:w="56" w:type="dxa"/>
-              <w:right w:w="56" w:type="dxa"/>
-            </w:tcMar>
-            <w:vAlign w:val="top"/>
-          </w:tcPr>
-          <w:p>
-            <w:pPr>
-              <w:spacing w:before="0" w:after="0" w:line="278"/>
-              <w:ind w:right="314" w:left="0" w:firstLine="0"/>
-              <w:jc w:val="left"/>
-              <w:rPr>
-                <w:rFonts w:ascii="Open Sans" w:hAnsi="Open Sans" w:cs="Open Sans" w:eastAsia="Open Sans"/>
-                <w:b/>
-                <w:color w:val="auto"/>
-                <w:spacing w:val="0"/>
-                <w:position w:val="0"/>
-                <w:sz w:val="20"/>
-                <w:shd w:fill="auto" w:val="clear"/>
-              </w:rPr>
-            </w:pPr>
-            <w:r>
-              <w:rPr>
-                <w:rFonts w:ascii="Open Sans" w:hAnsi="Open Sans" w:cs="Open Sans" w:eastAsia="Open Sans"/>
-                <w:b/>
-                <w:color w:val="auto"/>
-                <w:spacing w:val="0"/>
-                <w:position w:val="0"/>
-                <w:sz w:val="20"/>
-                <w:shd w:fill="auto" w:val="clear"/>
-              </w:rPr>
-              <w:t xml:space="preserve">Bestandkundenbonus:</w:t>
-            </w:r>
-          </w:p>
-          <w:p>
-            <w:pPr>
-              <w:spacing w:before="0" w:after="0" w:line="278"/>
-              <w:ind w:right="314" w:left="0" w:firstLine="0"/>
-              <w:jc w:val="left"/>
-              <w:rPr>
-                <w:color w:val="auto"/>
-                <w:spacing w:val="0"/>
-                <w:position w:val="0"/>
-              </w:rPr>
-            </w:pPr>
-            <w:r>
-              <w:rPr>
-                <w:rFonts w:ascii="Open Sans" w:hAnsi="Open Sans" w:cs="Open Sans" w:eastAsia="Open Sans"/>
-                <w:color w:val="auto"/>
-                <w:spacing w:val="0"/>
-                <w:position w:val="0"/>
-                <w:sz w:val="20"/>
-                <w:shd w:fill="auto" w:val="clear"/>
-              </w:rPr>
-              <w:t xml:space="preserve">-- Rabatt von 300 € ab einem Gesamtwert von 3.000</w:t>
-            </w:r>
-          </w:p>
-        </w:tc>
-        <w:tc>
-          <w:tcPr>
-            <w:tcW w:w="2268" w:type="dxa"/>
-            <w:tcBorders>
-              <w:top w:val="single" w:color="ffffff" w:sz="8"/>
-              <w:left w:val="single" w:color="ffffff" w:sz="8"/>
-              <w:bottom w:val="single" w:color="ffffff" w:sz="8"/>
-              <w:right w:val="single" w:color="ffffff" w:sz="8"/>
-            </w:tcBorders>
-            <w:shd w:color="000000" w:fill="ffffff" w:val="clear"/>
-            <w:tcMar>
-              <w:left w:w="56" w:type="dxa"/>
-              <w:right w:w="56" w:type="dxa"/>
-            </w:tcMar>
-            <w:vAlign w:val="top"/>
-          </w:tcPr>
-          <w:p>
-            <w:pPr>
-              <w:spacing w:before="0" w:after="0" w:line="278"/>
-              <w:ind w:right="314" w:left="0" w:firstLine="0"/>
-              <w:jc w:val="left"/>
-              <w:rPr>
-                <w:color w:val="auto"/>
-                <w:spacing w:val="0"/>
-                <w:position w:val="0"/>
-              </w:rPr>
-            </w:pPr>
-            <w:r>
-              <w:rPr>
-                <w:rFonts w:ascii="Open Sans" w:hAnsi="Open Sans" w:cs="Open Sans" w:eastAsia="Open Sans"/>
-                <w:color w:val="auto"/>
-                <w:spacing w:val="0"/>
-                <w:position w:val="0"/>
-                <w:sz w:val="20"/>
-                <w:shd w:fill="auto" w:val="clear"/>
-              </w:rPr>
-              <w:t xml:space="preserve">-252,10 €</w:t>
-            </w:r>
-          </w:p>
-        </w:tc>
-        <w:tc>
-          <w:tcPr>
-            <w:tcW w:w="1710" w:type="dxa"/>
-            <w:tcBorders>
-              <w:top w:val="single" w:color="ffffff" w:sz="8"/>
-              <w:left w:val="single" w:color="ffffff" w:sz="8"/>
-              <w:bottom w:val="single" w:color="ffffff" w:sz="8"/>
-              <w:right w:val="single" w:color="ffffff" w:sz="8"/>
-            </w:tcBorders>
-            <w:shd w:color="000000" w:fill="ffffff" w:val="clear"/>
-            <w:tcMar>
-              <w:left w:w="56" w:type="dxa"/>
-              <w:right w:w="56" w:type="dxa"/>
-            </w:tcMar>
-            <w:vAlign w:val="top"/>
-          </w:tcPr>
-          <w:p>
-            <w:pPr>
-              <w:spacing w:before="0" w:after="0" w:line="278"/>
-              <w:ind w:right="314" w:left="0" w:firstLine="0"/>
-              <w:jc w:val="left"/>
-              <w:rPr>
-                <w:color w:val="auto"/>
-                <w:spacing w:val="0"/>
-                <w:position w:val="0"/>
-              </w:rPr>
-            </w:pPr>
-            <w:r>
-              <w:rPr>
-                <w:rFonts w:ascii="Open Sans" w:hAnsi="Open Sans" w:cs="Open Sans" w:eastAsia="Open Sans"/>
-                <w:color w:val="auto"/>
-                <w:spacing w:val="0"/>
-                <w:position w:val="0"/>
-                <w:sz w:val="20"/>
-                <w:shd w:fill="auto" w:val="clear"/>
-              </w:rPr>
-              <w:t xml:space="preserve">-252,10 €</w:t>
-            </w:r>
-          </w:p>
-        </w:tc>
-      </w:tr>
     </w:tbl>
     <w:p>
       <w:pPr>
@@ -3013,7 +2753,7 @@
                 <w:sz w:val="20"/>
                 <w:shd w:fill="auto" w:val="clear"/>
               </w:rPr>
-              <w:t xml:space="preserve">Nettobetrag</w:t>
+              <w:t xml:space="preserve">Nettobetrag (ohne Rabatt)</w:t>
             </w:r>
           </w:p>
         </w:tc>
@@ -3119,7 +2859,7 @@
                 <w:sz w:val="22"/>
                 <w:shd w:fill="auto" w:val="clear"/>
               </w:rPr>
-              <w:t xml:space="preserve">4.208,58 €</w:t>
+              <w:t xml:space="preserve">4.021,48 €</w:t>
             </w:r>
             <w:r>
               <w:rPr>
@@ -3187,7 +2927,7 @@
                 <w:sz w:val="20"/>
                 <w:shd w:fill="auto" w:val="clear"/>
               </w:rPr>
-              <w:t xml:space="preserve">zzgl. 19% MwSt.</w:t>
+              <w:t xml:space="preserve">Rabatt</w:t>
             </w:r>
           </w:p>
         </w:tc>
@@ -3293,7 +3033,7 @@
                 <w:sz w:val="22"/>
                 <w:shd w:fill="auto" w:val="clear"/>
               </w:rPr>
-              <w:t xml:space="preserve">799,63 €</w:t>
+              <w:t xml:space="preserve">7,96 €</w:t>
             </w:r>
             <w:r>
               <w:rPr>
@@ -3361,7 +3101,7 @@
                 <w:sz w:val="20"/>
                 <w:shd w:fill="auto" w:val="clear"/>
               </w:rPr>
-              <w:t xml:space="preserve">Gesamtsumme</w:t>
+              <w:t xml:space="preserve">zzgl. 19% MwSt.</w:t>
             </w:r>
           </w:p>
         </w:tc>
@@ -3467,7 +3207,7 @@
                 <w:sz w:val="22"/>
                 <w:shd w:fill="auto" w:val="clear"/>
               </w:rPr>
-              <w:t xml:space="preserve">5.008,21 €</w:t>
+              <w:t xml:space="preserve">764,08 €</w:t>
             </w:r>
             <w:r>
               <w:rPr>
@@ -3535,7 +3275,7 @@
                 <w:sz w:val="20"/>
                 <w:shd w:fill="auto" w:val="clear"/>
               </w:rPr>
-              <w:t xml:space="preserve">Gesamtbetrag nach Neukundenbonus</w:t>
+              <w:t xml:space="preserve">Gesamtsumme</w:t>
             </w:r>
           </w:p>
         </w:tc>
@@ -3641,7 +3381,7 @@
                 <w:sz w:val="22"/>
                 <w:shd w:fill="auto" w:val="clear"/>
               </w:rPr>
-              <w:t xml:space="preserve">4.708,21 €</w:t>
+              <w:t xml:space="preserve">4.785,56 €</w:t>
             </w:r>
             <w:r>
               <w:rPr>
@@ -3709,7 +3449,7 @@
                 <w:sz w:val="20"/>
                 <w:shd w:fill="auto" w:val="clear"/>
               </w:rPr>
-              <w:t xml:space="preserve">Zuschuss Krankenkasse</w:t>
+              <w:t xml:space="preserve">Gesamtbetrag nach Materialrabatt</w:t>
             </w:r>
           </w:p>
         </w:tc>
@@ -3815,181 +3555,7 @@
                 <w:sz w:val="22"/>
                 <w:shd w:fill="auto" w:val="clear"/>
               </w:rPr>
-              <w:t xml:space="preserve">4.180,00 €</w:t>
-            </w:r>
-            <w:r>
-              <w:rPr>
-                <w:rFonts w:ascii="Open Sans SemiBold" w:hAnsi="Open Sans SemiBold" w:cs="Open Sans SemiBold" w:eastAsia="Open Sans SemiBold"/>
-                <w:color w:val="auto"/>
-                <w:spacing w:val="0"/>
-                <w:position w:val="0"/>
-                <w:sz w:val="22"/>
-                <w:shd w:fill="auto" w:val="clear"/>
-              </w:rPr>
-              <w:t/>
-            </w:r>
-          </w:p>
-        </w:tc>
-      </w:tr>
-      <w:tr>
-        <w:trPr>
-          <w:trHeight w:val="285" w:hRule="auto"/>
-          <w:jc w:val="left"/>
-        </w:trPr>
-        <w:tc>
-          <w:tcPr>
-            <w:tcW w:w="3915" w:type="dxa"/>
-            <w:tcBorders>
-              <w:top w:val="single" w:color="ffffff" w:sz="8"/>
-              <w:left w:val="single" w:color="ffffff" w:sz="8"/>
-              <w:bottom w:val="single" w:color="ffffff" w:sz="8"/>
-              <w:right w:val="single" w:color="ffffff" w:sz="8"/>
-            </w:tcBorders>
-            <w:shd w:color="000000" w:fill="ffffff" w:val="clear"/>
-            <w:tcMar>
-              <w:left w:w="0" w:type="dxa"/>
-              <w:right w:w="0" w:type="dxa"/>
-            </w:tcMar>
-            <w:vAlign w:val="center"/>
-          </w:tcPr>
-          <w:p>
-            <w:pPr>
-              <w:spacing w:before="57" w:after="0" w:line="240"/>
-              <w:ind w:right="0" w:left="0" w:firstLine="0"/>
-              <w:jc w:val="left"/>
-              <w:rPr>
-                <w:spacing w:val="0"/>
-                <w:position w:val="0"/>
-              </w:rPr>
-            </w:pPr>
-            <w:r>
-              <w:rPr>
-                <w:rFonts w:ascii="Open Sans SemiBold" w:hAnsi="Open Sans SemiBold" w:cs="Open Sans SemiBold" w:eastAsia="Open Sans SemiBold"/>
-                <w:color w:val="030303"/>
-                <w:spacing w:val="0"/>
-                <w:position w:val="0"/>
-                <w:sz w:val="20"/>
-                <w:shd w:fill="auto" w:val="clear"/>
-              </w:rPr>
-              <w:t/>
-            </w:r>
-            <w:r>
-              <w:rPr>
-                <w:rFonts w:ascii="Open Sans SemiBold" w:hAnsi="Open Sans SemiBold" w:cs="Open Sans SemiBold" w:eastAsia="Open Sans SemiBold"/>
-                <w:b/>
-                <w:color w:val="030303"/>
-                <w:spacing w:val="0"/>
-                <w:position w:val="0"/>
-                <w:sz w:val="20"/>
-                <w:shd w:fill="auto" w:val="clear"/>
-              </w:rPr>
-              <w:t xml:space="preserve">Selbstkostenanteil</w:t>
-            </w:r>
-          </w:p>
-        </w:tc>
-        <w:tc>
-          <w:tcPr>
-            <w:tcW w:w="915" w:type="dxa"/>
-            <w:tcBorders>
-              <w:top w:val="single" w:color="ffffff" w:sz="8"/>
-              <w:left w:val="single" w:color="ffffff" w:sz="8"/>
-              <w:bottom w:val="single" w:color="ffffff" w:sz="8"/>
-              <w:right w:val="single" w:color="ffffff" w:sz="8"/>
-            </w:tcBorders>
-            <w:shd w:color="000000" w:fill="ffffff" w:val="clear"/>
-            <w:tcMar>
-              <w:left w:w="0" w:type="dxa"/>
-              <w:right w:w="0" w:type="dxa"/>
-            </w:tcMar>
-            <w:vAlign w:val="center"/>
-          </w:tcPr>
-          <w:p>
-            <w:pPr>
-              <w:spacing w:before="0" w:after="0" w:line="240"/>
-              <w:ind w:right="0" w:left="0" w:firstLine="0"/>
-              <w:jc w:val="left"/>
-              <w:rPr>
-                <w:rFonts w:ascii="Calibri" w:hAnsi="Calibri" w:cs="Calibri" w:eastAsia="Calibri"/>
-                <w:color w:val="auto"/>
-                <w:spacing w:val="0"/>
-                <w:position w:val="0"/>
-                <w:sz w:val="22"/>
-                <w:shd w:fill="auto" w:val="clear"/>
-              </w:rPr>
-            </w:pPr>
-          </w:p>
-        </w:tc>
-        <w:tc>
-          <w:tcPr>
-            <w:tcW w:w="2106" w:type="dxa"/>
-            <w:tcBorders>
-              <w:top w:val="single" w:color="ffffff" w:sz="8"/>
-              <w:left w:val="single" w:color="ffffff" w:sz="8"/>
-              <w:bottom w:val="single" w:color="ffffff" w:sz="8"/>
-              <w:right w:val="single" w:color="ffffff" w:sz="8"/>
-            </w:tcBorders>
-            <w:shd w:color="000000" w:fill="ffffff" w:val="clear"/>
-            <w:tcMar>
-              <w:left w:w="0" w:type="dxa"/>
-              <w:right w:w="0" w:type="dxa"/>
-            </w:tcMar>
-            <w:vAlign w:val="center"/>
-          </w:tcPr>
-          <w:p>
-            <w:pPr>
-              <w:spacing w:before="0" w:after="0" w:line="240"/>
-              <w:ind w:right="0" w:left="0" w:firstLine="0"/>
-              <w:jc w:val="left"/>
-              <w:rPr>
-                <w:rFonts w:ascii="Calibri" w:hAnsi="Calibri" w:cs="Calibri" w:eastAsia="Calibri"/>
-                <w:color w:val="auto"/>
-                <w:spacing w:val="0"/>
-                <w:position w:val="0"/>
-                <w:sz w:val="22"/>
-                <w:shd w:fill="auto" w:val="clear"/>
-              </w:rPr>
-            </w:pPr>
-          </w:p>
-        </w:tc>
-        <w:tc>
-          <w:tcPr>
-            <w:tcW w:w="2724" w:type="dxa"/>
-            <w:tcBorders>
-              <w:top w:val="single" w:color="ffffff" w:sz="8"/>
-              <w:left w:val="single" w:color="ffffff" w:sz="8"/>
-              <w:bottom w:val="single" w:color="ffffff" w:sz="8"/>
-              <w:right w:val="single" w:color="ffffff" w:sz="8"/>
-            </w:tcBorders>
-            <w:shd w:color="000000" w:fill="ffffff" w:val="clear"/>
-            <w:tcMar>
-              <w:left w:w="0" w:type="dxa"/>
-              <w:right w:w="0" w:type="dxa"/>
-            </w:tcMar>
-            <w:vAlign w:val="center"/>
-          </w:tcPr>
-          <w:p>
-            <w:pPr>
-              <w:spacing w:before="0" w:after="0" w:line="278"/>
-              <w:ind w:right="314" w:left="0" w:firstLine="0"/>
-              <w:jc w:val="right"/>
-              <w:rPr>
-                <w:color w:val="auto"/>
-                <w:spacing w:val="0"/>
-                <w:position w:val="0"/>
-                <w:sz w:val="22"/>
-              </w:rPr>
-            </w:pPr>
-            <w:r>
-              <w:rPr>
-                <w:rFonts w:ascii="Open Sans SemiBold" w:hAnsi="Open Sans SemiBold" w:cs="Open Sans SemiBold" w:eastAsia="Open Sans SemiBold"/>
-                <w:b/>
-                <w:color w:val="auto"/>
-                <w:spacing w:val="0"/>
-                <w:position w:val="0"/>
-                <w:sz w:val="22"/>
-                <w:shd w:fill="auto" w:val="clear"/>
-              </w:rPr>
-              <w:t xml:space="preserve">528,21 €</w:t>
+              <w:t xml:space="preserve">4.776,09 €</w:t>
             </w:r>
             <w:r>
               <w:rPr>
@@ -4126,55 +3692,6 @@
           <w:shd w:fill="auto" w:val="clear"/>
         </w:rPr>
         <w:t xml:space="preserve">Diese werden vorab mit Ihnen besprochen, bedürfen lhrer Zustimmung und werden auf Regiebasis nach tatsächlichem Aufwand abgerechnet. (Stundensatz-Facharbeiter: 69,50€ netto)</w:t>
-        <w:br/>
-        <w:br/>
-        <w:t xml:space="preserve">Der Selbstkostenanteil beträgt </w:t>
-      </w:r>
-      <w:r>
-        <w:rPr>
-          <w:rFonts w:ascii="Open Sans" w:hAnsi="Open Sans" w:cs="Open Sans" w:eastAsia="Open Sans"/>
-          <w:b/>
-          <w:color w:val="030303"/>
-          <w:spacing w:val="0"/>
-          <w:position w:val="0"/>
-          <w:sz w:val="22"/>
-          <w:shd w:fill="auto" w:val="clear"/>
-        </w:rPr>
-        <w:t xml:space="preserve">528,21 €</w:t>
-      </w:r>
-      <w:r>
-        <w:rPr>
-          <w:rFonts w:ascii="Open Sans" w:hAnsi="Open Sans" w:cs="Open Sans" w:eastAsia="Open Sans"/>
-          <w:color w:val="030303"/>
-          <w:spacing w:val="0"/>
-          <w:position w:val="0"/>
-          <w:sz w:val="22"/>
-          <w:shd w:fill="auto" w:val="clear"/>
-        </w:rPr>
-        <w:t xml:space="preserve"> unter Berücksichtigung eines gewährten Zuschusses durch die Pflegekasse i.H.v. </w:t>
-      </w:r>
-      <w:r>
-        <w:rPr>
-          <w:rFonts w:ascii="Open Sans" w:hAnsi="Open Sans" w:cs="Open Sans" w:eastAsia="Open Sans"/>
-          <w:b/>
-          <w:color w:val="030303"/>
-          <w:spacing w:val="0"/>
-          <w:position w:val="0"/>
-          <w:sz w:val="22"/>
-          <w:shd w:fill="auto" w:val="clear"/>
-        </w:rPr>
-        <w:t xml:space="preserve">4.180,00 €</w:t>
-      </w:r>
-      <w:r>
-        <w:rPr>
-          <w:rFonts w:ascii="Open Sans" w:hAnsi="Open Sans" w:cs="Open Sans" w:eastAsia="Open Sans"/>
-          <w:color w:val="030303"/>
-          <w:spacing w:val="0"/>
-          <w:position w:val="0"/>
-          <w:sz w:val="22"/>
-          <w:shd w:fill="auto" w:val="clear"/>
-        </w:rPr>
-        <w:t xml:space="preserve">.</w:t>
       </w:r>
     </w:p>
     <w:p>

</xml_diff>

<commit_message>
Kunde hat Pflegegrad? set again
</commit_message>
<xml_diff>
--- a/out-Angebot.docx
+++ b/out-Angebot.docx
@@ -93,7 +93,7 @@
           <w:sz w:val="22"/>
           <w:shd w:fill="auto" w:val="clear"/>
         </w:rPr>
-        <w:t xml:space="preserve">Michelle Brown</w:t>
+        <w:t xml:space="preserve">Cherokee Hogan</w:t>
       </w:r>
     </w:p>
     <w:p>
@@ -119,7 +119,7 @@
           <w:sz w:val="22"/>
           <w:shd w:fill="auto" w:val="clear"/>
         </w:rPr>
-        <w:t xml:space="preserve">Sunt ex eum corrupti,</w:t>
+        <w:t xml:space="preserve">Earum dignissimos ea,</w:t>
       </w:r>
     </w:p>
     <w:p>
@@ -145,7 +145,7 @@
           <w:sz w:val="22"/>
           <w:shd w:fill="auto" w:val="clear"/>
         </w:rPr>
-        <w:t xml:space="preserve">Veniam est exercita Est distinctio Quia</w:t>
+        <w:t xml:space="preserve">Hic sint quia offici Amet quasi consequu</w:t>
       </w:r>
     </w:p>
     <w:tbl>
@@ -320,7 +320,7 @@
                 <w:sz w:val="22"/>
                 <w:shd w:fill="auto" w:val="clear"/>
               </w:rPr>
-              <w:t xml:space="preserve">Eliana Weaver</w:t>
+              <w:t xml:space="preserve">Victoria Mcfadden</w:t>
             </w:r>
           </w:p>
         </w:tc>
@@ -363,7 +363,7 @@
                 <w:sz w:val="22"/>
                 <w:shd w:fill="auto" w:val="clear"/>
               </w:rPr>
-              <w:t xml:space="preserve">AN20250924100449</w:t>
+              <w:t xml:space="preserve">AN20250924141205</w:t>
             </w:r>
             <w:r>
               <w:rPr>
@@ -411,7 +411,7 @@
                 <w:sz w:val="22"/>
                 <w:shd w:fill="auto" w:val="clear"/>
               </w:rPr>
-              <w:t xml:space="preserve">2011-11-01</w:t>
+              <w:t xml:space="preserve">1998-11-15</w:t>
             </w:r>
             <w:r>
               <w:rPr>
@@ -455,7 +455,7 @@
                 <w:sz w:val="22"/>
                 <w:shd w:fill="auto" w:val="clear"/>
               </w:rPr>
-              <w:t xml:space="preserve">Raven Powers</w:t>
+              <w:t xml:space="preserve">Deanna Bridges</w:t>
             </w:r>
             <w:r>
               <w:rPr>
@@ -617,7 +617,7 @@
           <w:sz w:val="24"/>
           <w:shd w:fill="auto" w:val="clear"/>
         </w:rPr>
-        <w:t xml:space="preserve">  Ihr Angebot AN20250924100449</w:t>
+        <w:t xml:space="preserve">  Ihr Angebot AN20250924141205</w:t>
       </w:r>
     </w:p>
     <w:p>
@@ -643,7 +643,7 @@
           <w:sz w:val="22"/>
           <w:shd w:fill="auto" w:val="clear"/>
         </w:rPr>
-        <w:t xml:space="preserve">  Sehr geehrte Frau Brown,</w:t>
+        <w:t xml:space="preserve">  Sehr geehrte Frau Hogan,</w:t>
         <w:br/>
       </w:r>
     </w:p>
@@ -1072,7 +1072,7 @@
                 <w:sz w:val="20"/>
                 <w:shd w:fill="auto" w:val="clear"/>
               </w:rPr>
-              <w:t xml:space="preserve">1.633,60 €</w:t>
+              <w:t xml:space="preserve">3.640,80 €</w:t>
             </w:r>
           </w:p>
         </w:tc>
@@ -1112,7 +1112,7 @@
                 <w:sz w:val="20"/>
                 <w:shd w:fill="auto" w:val="clear"/>
               </w:rPr>
-              <w:t xml:space="preserve">1.633,60 €</w:t>
+              <w:t xml:space="preserve">3.640,80 €</w:t>
             </w:r>
           </w:p>
         </w:tc>
@@ -1477,7 +1477,7 @@
                 <w:sz w:val="18"/>
                 <w:shd w:fill="auto" w:val="clear"/>
               </w:rPr>
-              <w:t xml:space="preserve">- 18 km Kilometerpauschale (Hin- &amp; Rückfahrt)</w:t>
+              <w:t xml:space="preserve">- 26 km Kilometerpauschale (Hin- &amp; Rückfahrt)</w:t>
             </w:r>
           </w:p>
           <w:p>
@@ -1503,33 +1503,7 @@
                 <w:sz w:val="18"/>
                 <w:shd w:fill="auto" w:val="clear"/>
               </w:rPr>
-              <w:t xml:space="preserve">- Schließen der Fehlstellen</w:t>
-            </w:r>
-          </w:p>
-          <w:p>
-            <w:pPr>
-              <w:spacing w:before="0" w:after="0" w:line="278"/>
-              <w:ind w:right="314" w:left="0" w:firstLine="0"/>
-              <w:jc w:val="left"/>
-              <w:rPr>
-                <w:rFonts w:ascii="Open Sans" w:hAnsi="Open Sans" w:cs="Open Sans" w:eastAsia="Open Sans"/>
-                <w:color w:val="auto"/>
-                <w:spacing w:val="0"/>
-                <w:position w:val="0"/>
-                <w:sz w:val="18"/>
-                <w:shd w:fill="auto" w:val="clear"/>
-              </w:rPr>
-            </w:pPr>
-            <w:r>
-              <w:rPr>
-                <w:rFonts w:ascii="Open Sans" w:hAnsi="Open Sans" w:cs="Open Sans" w:eastAsia="Open Sans"/>
-                <w:color w:val="auto"/>
-                <w:spacing w:val="0"/>
-                <w:position w:val="0"/>
-                <w:sz w:val="18"/>
-                <w:shd w:fill="auto" w:val="clear"/>
-              </w:rPr>
-              <w:t xml:space="preserve">- Auswechseln des Duschsystems</w:t>
+              <w:t xml:space="preserve">- Verkleidung Deckenhoch im Dusch/ Wannenbereich</w:t>
             </w:r>
           </w:p>
         </w:tc>
@@ -1991,7 +1965,7 @@
                 <w:sz w:val="20"/>
                 <w:shd w:fill="auto" w:val="clear"/>
               </w:rPr>
-              <w:t xml:space="preserve">830,68 €</w:t>
+              <w:t xml:space="preserve">684,08 €</w:t>
             </w:r>
           </w:p>
         </w:tc>
@@ -2031,7 +2005,7 @@
                 <w:sz w:val="20"/>
                 <w:shd w:fill="auto" w:val="clear"/>
               </w:rPr>
-              <w:t xml:space="preserve">830,68 €</w:t>
+              <w:t xml:space="preserve">684,08 €</w:t>
             </w:r>
           </w:p>
         </w:tc>
@@ -2318,7 +2292,7 @@
                 <w:sz w:val="20"/>
                 <w:shd w:fill="auto" w:val="clear"/>
               </w:rPr>
-              <w:t xml:space="preserve">- 1 Stk Duschwanne Slate 100x100x3cm Mineralguss weiss Nuovvo</w:t>
+              <w:t xml:space="preserve">- 1 Stk Duschwanne Slate 140x100x3cm Mineralguss weiss Nuovvo</w:t>
             </w:r>
           </w:p>
           <w:p>
@@ -2423,58 +2397,6 @@
                 <w:shd w:fill="auto" w:val="clear"/>
               </w:rPr>
               <w:t xml:space="preserve">- 1 Stk Stelzlager höhenverstellar Set</w:t>
-            </w:r>
-          </w:p>
-          <w:p>
-            <w:pPr>
-              <w:spacing w:before="0" w:after="0" w:line="278"/>
-              <w:ind w:right="314" w:left="0" w:firstLine="0"/>
-              <w:jc w:val="left"/>
-              <w:rPr>
-                <w:rFonts w:ascii="Open Sans" w:hAnsi="Open Sans" w:cs="Open Sans" w:eastAsia="Open Sans"/>
-                <w:color w:val="auto"/>
-                <w:spacing w:val="0"/>
-                <w:position w:val="0"/>
-                <w:sz w:val="20"/>
-                <w:shd w:fill="auto" w:val="clear"/>
-              </w:rPr>
-            </w:pPr>
-            <w:r>
-              <w:rPr>
-                <w:rFonts w:ascii="Open Sans" w:hAnsi="Open Sans" w:cs="Open Sans" w:eastAsia="Open Sans"/>
-                <w:color w:val="auto"/>
-                <w:spacing w:val="0"/>
-                <w:position w:val="0"/>
-                <w:sz w:val="20"/>
-                <w:shd w:fill="auto" w:val="clear"/>
-              </w:rPr>
-              <w:t xml:space="preserve">- 8 Stk Fußboden-Paneele (1 m² = 4 Paneele)</w:t>
-            </w:r>
-          </w:p>
-          <w:p>
-            <w:pPr>
-              <w:spacing w:before="0" w:after="0" w:line="278"/>
-              <w:ind w:right="314" w:left="0" w:firstLine="0"/>
-              <w:jc w:val="left"/>
-              <w:rPr>
-                <w:rFonts w:ascii="Open Sans" w:hAnsi="Open Sans" w:cs="Open Sans" w:eastAsia="Open Sans"/>
-                <w:color w:val="auto"/>
-                <w:spacing w:val="0"/>
-                <w:position w:val="0"/>
-                <w:sz w:val="20"/>
-                <w:shd w:fill="auto" w:val="clear"/>
-              </w:rPr>
-            </w:pPr>
-            <w:r>
-              <w:rPr>
-                <w:rFonts w:ascii="Open Sans" w:hAnsi="Open Sans" w:cs="Open Sans" w:eastAsia="Open Sans"/>
-                <w:color w:val="auto"/>
-                <w:spacing w:val="0"/>
-                <w:position w:val="0"/>
-                <w:sz w:val="20"/>
-                <w:shd w:fill="auto" w:val="clear"/>
-              </w:rPr>
-              <w:t xml:space="preserve">- 4 Pkg Flächenkleber (1 Pkg je 0,60 m²)</w:t>
             </w:r>
           </w:p>
         </w:tc>
@@ -2540,6 +2462,240 @@
                 <w:shd w:fill="auto" w:val="clear"/>
               </w:rPr>
             </w:pPr>
+          </w:p>
+        </w:tc>
+      </w:tr>
+      <w:tr>
+        <w:trPr>
+          <w:trHeight w:val="1" w:hRule="atLeast"/>
+          <w:jc w:val="left"/>
+        </w:trPr>
+        <w:tc>
+          <w:tcPr>
+            <w:tcW w:w="660" w:type="dxa"/>
+            <w:tcBorders>
+              <w:top w:val="single" w:color="ffffff" w:sz="8"/>
+              <w:left w:val="single" w:color="ffffff" w:sz="8"/>
+              <w:bottom w:val="single" w:color="ffffff" w:sz="8"/>
+              <w:right w:val="single" w:color="ffffff" w:sz="8"/>
+            </w:tcBorders>
+            <w:shd w:color="000000" w:fill="ffffff" w:val="clear"/>
+            <w:tcMar>
+              <w:left w:w="56" w:type="dxa"/>
+              <w:right w:w="56" w:type="dxa"/>
+            </w:tcMar>
+            <w:vAlign w:val="top"/>
+          </w:tcPr>
+          <w:p>
+            <w:pPr>
+              <w:spacing w:before="0" w:after="0" w:line="278"/>
+              <w:ind w:right="-26" w:left="0" w:firstLine="0"/>
+              <w:jc w:val="left"/>
+              <w:rPr>
+                <w:color w:val="auto"/>
+                <w:spacing w:val="0"/>
+                <w:position w:val="0"/>
+              </w:rPr>
+            </w:pPr>
+            <w:r>
+              <w:rPr>
+                <w:rFonts w:ascii="Open Sans" w:hAnsi="Open Sans" w:cs="Open Sans" w:eastAsia="Open Sans"/>
+                <w:color w:val="auto"/>
+                <w:spacing w:val="0"/>
+                <w:position w:val="0"/>
+                <w:sz w:val="20"/>
+                <w:shd w:fill="auto" w:val="clear"/>
+              </w:rPr>
+              <w:t xml:space="preserve">003</w:t>
+            </w:r>
+          </w:p>
+        </w:tc>
+        <w:tc>
+          <w:tcPr>
+            <w:tcW w:w="1035" w:type="dxa"/>
+            <w:tcBorders>
+              <w:top w:val="single" w:color="ffffff" w:sz="8"/>
+              <w:left w:val="single" w:color="ffffff" w:sz="8"/>
+              <w:bottom w:val="single" w:color="ffffff" w:sz="8"/>
+              <w:right w:val="single" w:color="ffffff" w:sz="8"/>
+            </w:tcBorders>
+            <w:shd w:color="000000" w:fill="ffffff" w:val="clear"/>
+            <w:tcMar>
+              <w:left w:w="56" w:type="dxa"/>
+              <w:right w:w="56" w:type="dxa"/>
+            </w:tcMar>
+            <w:vAlign w:val="top"/>
+          </w:tcPr>
+          <w:p>
+            <w:pPr>
+              <w:spacing w:before="0" w:after="0" w:line="278"/>
+              <w:ind w:right="314" w:left="0" w:firstLine="0"/>
+              <w:jc w:val="left"/>
+              <w:rPr>
+                <w:color w:val="auto"/>
+                <w:spacing w:val="0"/>
+                <w:position w:val="0"/>
+              </w:rPr>
+            </w:pPr>
+            <w:r>
+              <w:rPr>
+                <w:rFonts w:ascii="Open Sans" w:hAnsi="Open Sans" w:cs="Open Sans" w:eastAsia="Open Sans"/>
+                <w:color w:val="auto"/>
+                <w:spacing w:val="0"/>
+                <w:position w:val="0"/>
+                <w:sz w:val="20"/>
+                <w:shd w:fill="auto" w:val="clear"/>
+              </w:rPr>
+              <w:t xml:space="preserve">1 Stk</w:t>
+            </w:r>
+          </w:p>
+        </w:tc>
+        <w:tc>
+          <w:tcPr>
+            <w:tcW w:w="4107" w:type="dxa"/>
+            <w:tcBorders>
+              <w:top w:val="single" w:color="ffffff" w:sz="8"/>
+              <w:left w:val="single" w:color="ffffff" w:sz="8"/>
+              <w:bottom w:val="single" w:color="ffffff" w:sz="8"/>
+              <w:right w:val="single" w:color="ffffff" w:sz="8"/>
+            </w:tcBorders>
+            <w:shd w:color="000000" w:fill="ffffff" w:val="clear"/>
+            <w:tcMar>
+              <w:left w:w="56" w:type="dxa"/>
+              <w:right w:w="56" w:type="dxa"/>
+            </w:tcMar>
+            <w:vAlign w:val="top"/>
+          </w:tcPr>
+          <w:p>
+            <w:pPr>
+              <w:spacing w:before="0" w:after="0" w:line="278"/>
+              <w:ind w:right="314" w:left="0" w:firstLine="0"/>
+              <w:jc w:val="left"/>
+              <w:rPr>
+                <w:rFonts w:ascii="Open Sans" w:hAnsi="Open Sans" w:cs="Open Sans" w:eastAsia="Open Sans"/>
+                <w:b/>
+                <w:color w:val="auto"/>
+                <w:spacing w:val="0"/>
+                <w:position w:val="0"/>
+                <w:sz w:val="20"/>
+                <w:shd w:fill="auto" w:val="clear"/>
+              </w:rPr>
+            </w:pPr>
+            <w:r>
+              <w:rPr>
+                <w:rFonts w:ascii="Open Sans" w:hAnsi="Open Sans" w:cs="Open Sans" w:eastAsia="Open Sans"/>
+                <w:b/>
+                <w:color w:val="auto"/>
+                <w:spacing w:val="0"/>
+                <w:position w:val="0"/>
+                <w:sz w:val="20"/>
+                <w:shd w:fill="auto" w:val="clear"/>
+              </w:rPr>
+              <w:t xml:space="preserve">Bestandkundenbonus:</w:t>
+            </w:r>
+          </w:p>
+          <w:p>
+            <w:pPr>
+              <w:spacing w:before="0" w:after="0" w:line="278"/>
+              <w:ind w:right="314" w:left="0" w:firstLine="0"/>
+              <w:jc w:val="left"/>
+              <w:rPr>
+                <w:color w:val="auto"/>
+                <w:spacing w:val="0"/>
+                <w:position w:val="0"/>
+              </w:rPr>
+            </w:pPr>
+            <w:r>
+              <w:rPr>
+                <w:rFonts w:ascii="Open Sans" w:hAnsi="Open Sans" w:cs="Open Sans" w:eastAsia="Open Sans"/>
+                <w:color w:val="auto"/>
+                <w:spacing w:val="0"/>
+                <w:position w:val="0"/>
+                <w:sz w:val="20"/>
+                <w:shd w:fill="auto" w:val="clear"/>
+              </w:rPr>
+              <w:t xml:space="preserve">-- Rabatt von 300 € ab einem Gesamtwert von 3.000</w:t>
+            </w:r>
+          </w:p>
+        </w:tc>
+        <w:tc>
+          <w:tcPr>
+            <w:tcW w:w="2268" w:type="dxa"/>
+            <w:tcBorders>
+              <w:top w:val="single" w:color="ffffff" w:sz="8"/>
+              <w:left w:val="single" w:color="ffffff" w:sz="8"/>
+              <w:bottom w:val="single" w:color="ffffff" w:sz="8"/>
+              <w:right w:val="single" w:color="ffffff" w:sz="8"/>
+            </w:tcBorders>
+            <w:shd w:color="000000" w:fill="ffffff" w:val="clear"/>
+            <w:tcMar>
+              <w:left w:w="56" w:type="dxa"/>
+              <w:right w:w="56" w:type="dxa"/>
+            </w:tcMar>
+            <w:vAlign w:val="top"/>
+          </w:tcPr>
+          <w:p>
+            <w:pPr>
+              <w:spacing w:before="0" w:after="0" w:line="278"/>
+              <w:ind w:right="314" w:left="0" w:firstLine="0"/>
+              <w:jc w:val="left"/>
+              <w:rPr>
+                <w:color w:val="auto"/>
+                <w:spacing w:val="0"/>
+                <w:position w:val="0"/>
+              </w:rPr>
+            </w:pPr>
+            <w:r>
+              <w:rPr>
+                <w:rFonts w:ascii="Open Sans" w:hAnsi="Open Sans" w:cs="Open Sans" w:eastAsia="Open Sans"/>
+                <w:color w:val="auto"/>
+                <w:spacing w:val="0"/>
+                <w:position w:val="0"/>
+                <w:sz w:val="20"/>
+                <w:shd w:fill="auto" w:val="clear"/>
+              </w:rPr>
+              <w:t xml:space="preserve">-252,10 €</w:t>
+            </w:r>
+          </w:p>
+        </w:tc>
+        <w:tc>
+          <w:tcPr>
+            <w:tcW w:w="1710" w:type="dxa"/>
+            <w:tcBorders>
+              <w:top w:val="single" w:color="ffffff" w:sz="8"/>
+              <w:left w:val="single" w:color="ffffff" w:sz="8"/>
+              <w:bottom w:val="single" w:color="ffffff" w:sz="8"/>
+              <w:right w:val="single" w:color="ffffff" w:sz="8"/>
+            </w:tcBorders>
+            <w:shd w:color="000000" w:fill="ffffff" w:val="clear"/>
+            <w:tcMar>
+              <w:left w:w="56" w:type="dxa"/>
+              <w:right w:w="56" w:type="dxa"/>
+            </w:tcMar>
+            <w:vAlign w:val="top"/>
+          </w:tcPr>
+          <w:p>
+            <w:pPr>
+              <w:spacing w:before="0" w:after="0" w:line="278"/>
+              <w:ind w:right="314" w:left="0" w:firstLine="0"/>
+              <w:jc w:val="left"/>
+              <w:rPr>
+                <w:color w:val="auto"/>
+                <w:spacing w:val="0"/>
+                <w:position w:val="0"/>
+              </w:rPr>
+            </w:pPr>
+            <w:r>
+              <w:rPr>
+                <w:rFonts w:ascii="Open Sans" w:hAnsi="Open Sans" w:cs="Open Sans" w:eastAsia="Open Sans"/>
+                <w:color w:val="auto"/>
+                <w:spacing w:val="0"/>
+                <w:position w:val="0"/>
+                <w:sz w:val="20"/>
+                <w:shd w:fill="auto" w:val="clear"/>
+              </w:rPr>
+              <w:t xml:space="preserve">-252,10 €</w:t>
+            </w:r>
           </w:p>
         </w:tc>
       </w:tr>
@@ -2623,7 +2779,7 @@
                 <w:sz w:val="20"/>
                 <w:shd w:fill="auto" w:val="clear"/>
               </w:rPr>
-              <w:t xml:space="preserve">Nettobetrag</w:t>
+              <w:t xml:space="preserve">Nettobetrag (ohne Rabatt)</w:t>
             </w:r>
           </w:p>
         </w:tc>
@@ -2729,7 +2885,7 @@
                 <w:sz w:val="22"/>
                 <w:shd w:fill="auto" w:val="clear"/>
               </w:rPr>
-              <w:t xml:space="preserve">2.938,69 €</w:t>
+              <w:t xml:space="preserve">4.666,92 €</w:t>
             </w:r>
             <w:r>
               <w:rPr>
@@ -2797,7 +2953,7 @@
                 <w:sz w:val="20"/>
                 <w:shd w:fill="auto" w:val="clear"/>
               </w:rPr>
-              <w:t xml:space="preserve">zzgl. 19% MwSt.</w:t>
+              <w:t xml:space="preserve">Rabatt</w:t>
             </w:r>
           </w:p>
         </w:tc>
@@ -2903,7 +3059,7 @@
                 <w:sz w:val="22"/>
                 <w:shd w:fill="auto" w:val="clear"/>
               </w:rPr>
-              <w:t xml:space="preserve">558,35 €</w:t>
+              <w:t xml:space="preserve">5,47 €</w:t>
             </w:r>
             <w:r>
               <w:rPr>
@@ -2971,7 +3127,7 @@
                 <w:sz w:val="20"/>
                 <w:shd w:fill="auto" w:val="clear"/>
               </w:rPr>
-              <w:t xml:space="preserve">Gesamtsumme</w:t>
+              <w:t xml:space="preserve">zzgl. 19% MwSt.</w:t>
             </w:r>
           </w:p>
         </w:tc>
@@ -3077,7 +3233,7 @@
                 <w:sz w:val="22"/>
                 <w:shd w:fill="auto" w:val="clear"/>
               </w:rPr>
-              <w:t xml:space="preserve">3.497,04 €</w:t>
+              <w:t xml:space="preserve">886,71 €</w:t>
             </w:r>
             <w:r>
               <w:rPr>
@@ -3145,7 +3301,7 @@
                 <w:sz w:val="20"/>
                 <w:shd w:fill="auto" w:val="clear"/>
               </w:rPr>
-              <w:t xml:space="preserve">Zuschuss Krankenkasse</w:t>
+              <w:t xml:space="preserve">Gesamtsumme</w:t>
             </w:r>
           </w:p>
         </w:tc>
@@ -3251,7 +3407,7 @@
                 <w:sz w:val="22"/>
                 <w:shd w:fill="auto" w:val="clear"/>
               </w:rPr>
-              <w:t xml:space="preserve">4.180,00 €</w:t>
+              <w:t xml:space="preserve">5.553,63 €</w:t>
             </w:r>
             <w:r>
               <w:rPr>
@@ -3319,7 +3475,7 @@
                 <w:sz w:val="20"/>
                 <w:shd w:fill="auto" w:val="clear"/>
               </w:rPr>
-              <w:t xml:space="preserve">Selbstkostenanteil</w:t>
+              <w:t xml:space="preserve">Gesamtbetrag nach Materialrabatt</w:t>
             </w:r>
           </w:p>
         </w:tc>
@@ -3425,7 +3581,529 @@
                 <w:sz w:val="22"/>
                 <w:shd w:fill="auto" w:val="clear"/>
               </w:rPr>
-              <w:t xml:space="preserve">0,00 €</w:t>
+              <w:t xml:space="preserve">5.547,13 €</w:t>
+            </w:r>
+            <w:r>
+              <w:rPr>
+                <w:rFonts w:ascii="Open Sans SemiBold" w:hAnsi="Open Sans SemiBold" w:cs="Open Sans SemiBold" w:eastAsia="Open Sans SemiBold"/>
+                <w:color w:val="auto"/>
+                <w:spacing w:val="0"/>
+                <w:position w:val="0"/>
+                <w:sz w:val="22"/>
+                <w:shd w:fill="auto" w:val="clear"/>
+              </w:rPr>
+              <w:t/>
+            </w:r>
+          </w:p>
+        </w:tc>
+      </w:tr>
+      <w:tr>
+        <w:trPr>
+          <w:trHeight w:val="285" w:hRule="auto"/>
+          <w:jc w:val="left"/>
+        </w:trPr>
+        <w:tc>
+          <w:tcPr>
+            <w:tcW w:w="3915" w:type="dxa"/>
+            <w:tcBorders>
+              <w:top w:val="single" w:color="ffffff" w:sz="8"/>
+              <w:left w:val="single" w:color="ffffff" w:sz="8"/>
+              <w:bottom w:val="single" w:color="ffffff" w:sz="8"/>
+              <w:right w:val="single" w:color="ffffff" w:sz="8"/>
+            </w:tcBorders>
+            <w:shd w:color="000000" w:fill="ffffff" w:val="clear"/>
+            <w:tcMar>
+              <w:left w:w="0" w:type="dxa"/>
+              <w:right w:w="0" w:type="dxa"/>
+            </w:tcMar>
+            <w:vAlign w:val="center"/>
+          </w:tcPr>
+          <w:p>
+            <w:pPr>
+              <w:spacing w:before="57" w:after="0" w:line="240"/>
+              <w:ind w:right="0" w:left="0" w:firstLine="0"/>
+              <w:jc w:val="left"/>
+              <w:rPr>
+                <w:spacing w:val="0"/>
+                <w:position w:val="0"/>
+              </w:rPr>
+            </w:pPr>
+            <w:r>
+              <w:rPr>
+                <w:rFonts w:ascii="Open Sans SemiBold" w:hAnsi="Open Sans SemiBold" w:cs="Open Sans SemiBold" w:eastAsia="Open Sans SemiBold"/>
+                <w:color w:val="030303"/>
+                <w:spacing w:val="0"/>
+                <w:position w:val="0"/>
+                <w:sz w:val="20"/>
+                <w:shd w:fill="auto" w:val="clear"/>
+              </w:rPr>
+              <w:t/>
+            </w:r>
+            <w:r>
+              <w:rPr>
+                <w:rFonts w:ascii="Open Sans SemiBold" w:hAnsi="Open Sans SemiBold" w:cs="Open Sans SemiBold" w:eastAsia="Open Sans SemiBold"/>
+                <w:b/>
+                <w:color w:val="030303"/>
+                <w:spacing w:val="0"/>
+                <w:position w:val="0"/>
+                <w:sz w:val="20"/>
+                <w:shd w:fill="auto" w:val="clear"/>
+              </w:rPr>
+              <w:t xml:space="preserve">Gesamtbetrag nach Neukundenbonus</w:t>
+            </w:r>
+          </w:p>
+        </w:tc>
+        <w:tc>
+          <w:tcPr>
+            <w:tcW w:w="915" w:type="dxa"/>
+            <w:tcBorders>
+              <w:top w:val="single" w:color="ffffff" w:sz="8"/>
+              <w:left w:val="single" w:color="ffffff" w:sz="8"/>
+              <w:bottom w:val="single" w:color="ffffff" w:sz="8"/>
+              <w:right w:val="single" w:color="ffffff" w:sz="8"/>
+            </w:tcBorders>
+            <w:shd w:color="000000" w:fill="ffffff" w:val="clear"/>
+            <w:tcMar>
+              <w:left w:w="0" w:type="dxa"/>
+              <w:right w:w="0" w:type="dxa"/>
+            </w:tcMar>
+            <w:vAlign w:val="center"/>
+          </w:tcPr>
+          <w:p>
+            <w:pPr>
+              <w:spacing w:before="0" w:after="0" w:line="240"/>
+              <w:ind w:right="0" w:left="0" w:firstLine="0"/>
+              <w:jc w:val="left"/>
+              <w:rPr>
+                <w:rFonts w:ascii="Calibri" w:hAnsi="Calibri" w:cs="Calibri" w:eastAsia="Calibri"/>
+                <w:color w:val="auto"/>
+                <w:spacing w:val="0"/>
+                <w:position w:val="0"/>
+                <w:sz w:val="22"/>
+                <w:shd w:fill="auto" w:val="clear"/>
+              </w:rPr>
+            </w:pPr>
+          </w:p>
+        </w:tc>
+        <w:tc>
+          <w:tcPr>
+            <w:tcW w:w="2106" w:type="dxa"/>
+            <w:tcBorders>
+              <w:top w:val="single" w:color="ffffff" w:sz="8"/>
+              <w:left w:val="single" w:color="ffffff" w:sz="8"/>
+              <w:bottom w:val="single" w:color="ffffff" w:sz="8"/>
+              <w:right w:val="single" w:color="ffffff" w:sz="8"/>
+            </w:tcBorders>
+            <w:shd w:color="000000" w:fill="ffffff" w:val="clear"/>
+            <w:tcMar>
+              <w:left w:w="0" w:type="dxa"/>
+              <w:right w:w="0" w:type="dxa"/>
+            </w:tcMar>
+            <w:vAlign w:val="center"/>
+          </w:tcPr>
+          <w:p>
+            <w:pPr>
+              <w:spacing w:before="0" w:after="0" w:line="240"/>
+              <w:ind w:right="0" w:left="0" w:firstLine="0"/>
+              <w:jc w:val="left"/>
+              <w:rPr>
+                <w:rFonts w:ascii="Calibri" w:hAnsi="Calibri" w:cs="Calibri" w:eastAsia="Calibri"/>
+                <w:color w:val="auto"/>
+                <w:spacing w:val="0"/>
+                <w:position w:val="0"/>
+                <w:sz w:val="22"/>
+                <w:shd w:fill="auto" w:val="clear"/>
+              </w:rPr>
+            </w:pPr>
+          </w:p>
+        </w:tc>
+        <w:tc>
+          <w:tcPr>
+            <w:tcW w:w="2724" w:type="dxa"/>
+            <w:tcBorders>
+              <w:top w:val="single" w:color="ffffff" w:sz="8"/>
+              <w:left w:val="single" w:color="ffffff" w:sz="8"/>
+              <w:bottom w:val="single" w:color="ffffff" w:sz="8"/>
+              <w:right w:val="single" w:color="ffffff" w:sz="8"/>
+            </w:tcBorders>
+            <w:shd w:color="000000" w:fill="ffffff" w:val="clear"/>
+            <w:tcMar>
+              <w:left w:w="0" w:type="dxa"/>
+              <w:right w:w="0" w:type="dxa"/>
+            </w:tcMar>
+            <w:vAlign w:val="center"/>
+          </w:tcPr>
+          <w:p>
+            <w:pPr>
+              <w:spacing w:before="0" w:after="0" w:line="278"/>
+              <w:ind w:right="314" w:left="0" w:firstLine="0"/>
+              <w:jc w:val="right"/>
+              <w:rPr>
+                <w:color w:val="auto"/>
+                <w:spacing w:val="0"/>
+                <w:position w:val="0"/>
+                <w:sz w:val="22"/>
+              </w:rPr>
+            </w:pPr>
+            <w:r>
+              <w:rPr>
+                <w:rFonts w:ascii="Open Sans SemiBold" w:hAnsi="Open Sans SemiBold" w:cs="Open Sans SemiBold" w:eastAsia="Open Sans SemiBold"/>
+                <w:b/>
+                <w:color w:val="auto"/>
+                <w:spacing w:val="0"/>
+                <w:position w:val="0"/>
+                <w:sz w:val="22"/>
+                <w:shd w:fill="auto" w:val="clear"/>
+              </w:rPr>
+              <w:t xml:space="preserve">5.247,13 €</w:t>
+            </w:r>
+            <w:r>
+              <w:rPr>
+                <w:rFonts w:ascii="Open Sans SemiBold" w:hAnsi="Open Sans SemiBold" w:cs="Open Sans SemiBold" w:eastAsia="Open Sans SemiBold"/>
+                <w:color w:val="auto"/>
+                <w:spacing w:val="0"/>
+                <w:position w:val="0"/>
+                <w:sz w:val="22"/>
+                <w:shd w:fill="auto" w:val="clear"/>
+              </w:rPr>
+              <w:t/>
+            </w:r>
+          </w:p>
+        </w:tc>
+      </w:tr>
+      <w:tr>
+        <w:trPr>
+          <w:trHeight w:val="1" w:hRule="atLeast"/>
+          <w:jc w:val="left"/>
+        </w:trPr>
+        <w:tc>
+          <w:tcPr>
+            <w:tcW w:w="3915" w:type="dxa"/>
+            <w:tcBorders>
+              <w:top w:val="single" w:color="ffffff" w:sz="8"/>
+              <w:left w:val="single" w:color="d9d9d9" w:sz="8"/>
+              <w:bottom w:val="single" w:color="ffffff" w:sz="8"/>
+              <w:right w:val="single" w:color="d9d9d9" w:sz="8"/>
+            </w:tcBorders>
+            <w:shd w:color="000000" w:fill="d9d9d9" w:val="clear"/>
+            <w:tcMar>
+              <w:left w:w="0" w:type="dxa"/>
+              <w:right w:w="0" w:type="dxa"/>
+            </w:tcMar>
+            <w:vAlign w:val="center"/>
+          </w:tcPr>
+          <w:p>
+            <w:pPr>
+              <w:spacing w:before="56" w:after="0" w:line="240"/>
+              <w:ind w:right="0" w:left="50" w:firstLine="0"/>
+              <w:jc w:val="left"/>
+              <w:rPr>
+                <w:spacing w:val="0"/>
+                <w:position w:val="0"/>
+              </w:rPr>
+            </w:pPr>
+            <w:r>
+              <w:rPr>
+                <w:rFonts w:ascii="Open Sans SemiBold" w:hAnsi="Open Sans SemiBold" w:cs="Open Sans SemiBold" w:eastAsia="Open Sans SemiBold"/>
+                <w:color w:val="030303"/>
+                <w:spacing w:val="0"/>
+                <w:position w:val="0"/>
+                <w:sz w:val="20"/>
+                <w:shd w:fill="auto" w:val="clear"/>
+              </w:rPr>
+              <w:t/>
+            </w:r>
+            <w:r>
+              <w:rPr>
+                <w:rFonts w:ascii="Open Sans SemiBold" w:hAnsi="Open Sans SemiBold" w:cs="Open Sans SemiBold" w:eastAsia="Open Sans SemiBold"/>
+                <w:b/>
+                <w:color w:val="030303"/>
+                <w:spacing w:val="0"/>
+                <w:position w:val="0"/>
+                <w:sz w:val="20"/>
+                <w:shd w:fill="auto" w:val="clear"/>
+              </w:rPr>
+              <w:t xml:space="preserve">Zuschuss Krankenkasse</w:t>
+            </w:r>
+          </w:p>
+        </w:tc>
+        <w:tc>
+          <w:tcPr>
+            <w:tcW w:w="915" w:type="dxa"/>
+            <w:tcBorders>
+              <w:top w:val="single" w:color="ffffff" w:sz="8"/>
+              <w:left w:val="single" w:color="d9d9d9" w:sz="8"/>
+              <w:bottom w:val="single" w:color="ffffff" w:sz="8"/>
+              <w:right w:val="single" w:color="d9d9d9" w:sz="8"/>
+            </w:tcBorders>
+            <w:shd w:color="000000" w:fill="d9d9d9" w:val="clear"/>
+            <w:tcMar>
+              <w:left w:w="0" w:type="dxa"/>
+              <w:right w:w="0" w:type="dxa"/>
+            </w:tcMar>
+            <w:vAlign w:val="center"/>
+          </w:tcPr>
+          <w:p>
+            <w:pPr>
+              <w:spacing w:before="0" w:after="0" w:line="240"/>
+              <w:ind w:right="0" w:left="0" w:firstLine="0"/>
+              <w:jc w:val="left"/>
+              <w:rPr>
+                <w:rFonts w:ascii="Calibri" w:hAnsi="Calibri" w:cs="Calibri" w:eastAsia="Calibri"/>
+                <w:color w:val="auto"/>
+                <w:spacing w:val="0"/>
+                <w:position w:val="0"/>
+                <w:sz w:val="22"/>
+                <w:shd w:fill="auto" w:val="clear"/>
+              </w:rPr>
+            </w:pPr>
+          </w:p>
+        </w:tc>
+        <w:tc>
+          <w:tcPr>
+            <w:tcW w:w="2106" w:type="dxa"/>
+            <w:tcBorders>
+              <w:top w:val="single" w:color="ffffff" w:sz="8"/>
+              <w:left w:val="single" w:color="d9d9d9" w:sz="8"/>
+              <w:bottom w:val="single" w:color="ffffff" w:sz="8"/>
+              <w:right w:val="single" w:color="d9d9d9" w:sz="8"/>
+            </w:tcBorders>
+            <w:shd w:color="000000" w:fill="d9d9d9" w:val="clear"/>
+            <w:tcMar>
+              <w:left w:w="0" w:type="dxa"/>
+              <w:right w:w="0" w:type="dxa"/>
+            </w:tcMar>
+            <w:vAlign w:val="center"/>
+          </w:tcPr>
+          <w:p>
+            <w:pPr>
+              <w:spacing w:before="0" w:after="0" w:line="240"/>
+              <w:ind w:right="0" w:left="0" w:firstLine="0"/>
+              <w:jc w:val="left"/>
+              <w:rPr>
+                <w:rFonts w:ascii="Calibri" w:hAnsi="Calibri" w:cs="Calibri" w:eastAsia="Calibri"/>
+                <w:color w:val="auto"/>
+                <w:spacing w:val="0"/>
+                <w:position w:val="0"/>
+                <w:sz w:val="22"/>
+                <w:shd w:fill="auto" w:val="clear"/>
+              </w:rPr>
+            </w:pPr>
+          </w:p>
+        </w:tc>
+        <w:tc>
+          <w:tcPr>
+            <w:tcW w:w="2724" w:type="dxa"/>
+            <w:tcBorders>
+              <w:top w:val="single" w:color="ffffff" w:sz="8"/>
+              <w:left w:val="single" w:color="d9d9d9" w:sz="8"/>
+              <w:bottom w:val="single" w:color="ffffff" w:sz="8"/>
+              <w:right w:val="single" w:color="d9d9d9" w:sz="8"/>
+            </w:tcBorders>
+            <w:shd w:color="000000" w:fill="d9d9d9" w:val="clear"/>
+            <w:tcMar>
+              <w:left w:w="0" w:type="dxa"/>
+              <w:right w:w="0" w:type="dxa"/>
+            </w:tcMar>
+            <w:vAlign w:val="center"/>
+          </w:tcPr>
+          <w:p>
+            <w:pPr>
+              <w:spacing w:before="0" w:after="0" w:line="278"/>
+              <w:ind w:right="314" w:left="0" w:firstLine="0"/>
+              <w:jc w:val="right"/>
+              <w:rPr>
+                <w:color w:val="auto"/>
+                <w:spacing w:val="0"/>
+                <w:position w:val="0"/>
+                <w:sz w:val="22"/>
+              </w:rPr>
+            </w:pPr>
+            <w:r>
+              <w:rPr>
+                <w:rFonts w:ascii="Open Sans SemiBold" w:hAnsi="Open Sans SemiBold" w:cs="Open Sans SemiBold" w:eastAsia="Open Sans SemiBold"/>
+                <w:b/>
+                <w:color w:val="auto"/>
+                <w:spacing w:val="0"/>
+                <w:position w:val="0"/>
+                <w:sz w:val="22"/>
+                <w:shd w:fill="auto" w:val="clear"/>
+              </w:rPr>
+              <w:t xml:space="preserve">4.080,00 €</w:t>
+            </w:r>
+            <w:r>
+              <w:rPr>
+                <w:rFonts w:ascii="Open Sans SemiBold" w:hAnsi="Open Sans SemiBold" w:cs="Open Sans SemiBold" w:eastAsia="Open Sans SemiBold"/>
+                <w:color w:val="auto"/>
+                <w:spacing w:val="0"/>
+                <w:position w:val="0"/>
+                <w:sz w:val="22"/>
+                <w:shd w:fill="auto" w:val="clear"/>
+              </w:rPr>
+              <w:t/>
+            </w:r>
+          </w:p>
+        </w:tc>
+      </w:tr>
+      <w:tr>
+        <w:trPr>
+          <w:trHeight w:val="285" w:hRule="auto"/>
+          <w:jc w:val="left"/>
+        </w:trPr>
+        <w:tc>
+          <w:tcPr>
+            <w:tcW w:w="3915" w:type="dxa"/>
+            <w:tcBorders>
+              <w:top w:val="single" w:color="ffffff" w:sz="8"/>
+              <w:left w:val="single" w:color="ffffff" w:sz="8"/>
+              <w:bottom w:val="single" w:color="ffffff" w:sz="8"/>
+              <w:right w:val="single" w:color="ffffff" w:sz="8"/>
+            </w:tcBorders>
+            <w:shd w:color="000000" w:fill="ffffff" w:val="clear"/>
+            <w:tcMar>
+              <w:left w:w="0" w:type="dxa"/>
+              <w:right w:w="0" w:type="dxa"/>
+            </w:tcMar>
+            <w:vAlign w:val="center"/>
+          </w:tcPr>
+          <w:p>
+            <w:pPr>
+              <w:spacing w:before="57" w:after="0" w:line="240"/>
+              <w:ind w:right="0" w:left="0" w:firstLine="0"/>
+              <w:jc w:val="left"/>
+              <w:rPr>
+                <w:spacing w:val="0"/>
+                <w:position w:val="0"/>
+              </w:rPr>
+            </w:pPr>
+            <w:r>
+              <w:rPr>
+                <w:rFonts w:ascii="Open Sans SemiBold" w:hAnsi="Open Sans SemiBold" w:cs="Open Sans SemiBold" w:eastAsia="Open Sans SemiBold"/>
+                <w:color w:val="030303"/>
+                <w:spacing w:val="0"/>
+                <w:position w:val="0"/>
+                <w:sz w:val="20"/>
+                <w:shd w:fill="auto" w:val="clear"/>
+              </w:rPr>
+              <w:t/>
+            </w:r>
+            <w:r>
+              <w:rPr>
+                <w:rFonts w:ascii="Open Sans SemiBold" w:hAnsi="Open Sans SemiBold" w:cs="Open Sans SemiBold" w:eastAsia="Open Sans SemiBold"/>
+                <w:b/>
+                <w:color w:val="030303"/>
+                <w:spacing w:val="0"/>
+                <w:position w:val="0"/>
+                <w:sz w:val="20"/>
+                <w:shd w:fill="auto" w:val="clear"/>
+              </w:rPr>
+              <w:t xml:space="preserve">Selbstkostenanteil</w:t>
+            </w:r>
+          </w:p>
+        </w:tc>
+        <w:tc>
+          <w:tcPr>
+            <w:tcW w:w="915" w:type="dxa"/>
+            <w:tcBorders>
+              <w:top w:val="single" w:color="ffffff" w:sz="8"/>
+              <w:left w:val="single" w:color="ffffff" w:sz="8"/>
+              <w:bottom w:val="single" w:color="ffffff" w:sz="8"/>
+              <w:right w:val="single" w:color="ffffff" w:sz="8"/>
+            </w:tcBorders>
+            <w:shd w:color="000000" w:fill="ffffff" w:val="clear"/>
+            <w:tcMar>
+              <w:left w:w="0" w:type="dxa"/>
+              <w:right w:w="0" w:type="dxa"/>
+            </w:tcMar>
+            <w:vAlign w:val="center"/>
+          </w:tcPr>
+          <w:p>
+            <w:pPr>
+              <w:spacing w:before="0" w:after="0" w:line="240"/>
+              <w:ind w:right="0" w:left="0" w:firstLine="0"/>
+              <w:jc w:val="left"/>
+              <w:rPr>
+                <w:rFonts w:ascii="Calibri" w:hAnsi="Calibri" w:cs="Calibri" w:eastAsia="Calibri"/>
+                <w:color w:val="auto"/>
+                <w:spacing w:val="0"/>
+                <w:position w:val="0"/>
+                <w:sz w:val="22"/>
+                <w:shd w:fill="auto" w:val="clear"/>
+              </w:rPr>
+            </w:pPr>
+          </w:p>
+        </w:tc>
+        <w:tc>
+          <w:tcPr>
+            <w:tcW w:w="2106" w:type="dxa"/>
+            <w:tcBorders>
+              <w:top w:val="single" w:color="ffffff" w:sz="8"/>
+              <w:left w:val="single" w:color="ffffff" w:sz="8"/>
+              <w:bottom w:val="single" w:color="ffffff" w:sz="8"/>
+              <w:right w:val="single" w:color="ffffff" w:sz="8"/>
+            </w:tcBorders>
+            <w:shd w:color="000000" w:fill="ffffff" w:val="clear"/>
+            <w:tcMar>
+              <w:left w:w="0" w:type="dxa"/>
+              <w:right w:w="0" w:type="dxa"/>
+            </w:tcMar>
+            <w:vAlign w:val="center"/>
+          </w:tcPr>
+          <w:p>
+            <w:pPr>
+              <w:spacing w:before="0" w:after="0" w:line="240"/>
+              <w:ind w:right="0" w:left="0" w:firstLine="0"/>
+              <w:jc w:val="left"/>
+              <w:rPr>
+                <w:rFonts w:ascii="Calibri" w:hAnsi="Calibri" w:cs="Calibri" w:eastAsia="Calibri"/>
+                <w:color w:val="auto"/>
+                <w:spacing w:val="0"/>
+                <w:position w:val="0"/>
+                <w:sz w:val="22"/>
+                <w:shd w:fill="auto" w:val="clear"/>
+              </w:rPr>
+            </w:pPr>
+          </w:p>
+        </w:tc>
+        <w:tc>
+          <w:tcPr>
+            <w:tcW w:w="2724" w:type="dxa"/>
+            <w:tcBorders>
+              <w:top w:val="single" w:color="ffffff" w:sz="8"/>
+              <w:left w:val="single" w:color="ffffff" w:sz="8"/>
+              <w:bottom w:val="single" w:color="ffffff" w:sz="8"/>
+              <w:right w:val="single" w:color="ffffff" w:sz="8"/>
+            </w:tcBorders>
+            <w:shd w:color="000000" w:fill="ffffff" w:val="clear"/>
+            <w:tcMar>
+              <w:left w:w="0" w:type="dxa"/>
+              <w:right w:w="0" w:type="dxa"/>
+            </w:tcMar>
+            <w:vAlign w:val="center"/>
+          </w:tcPr>
+          <w:p>
+            <w:pPr>
+              <w:spacing w:before="0" w:after="0" w:line="278"/>
+              <w:ind w:right="314" w:left="0" w:firstLine="0"/>
+              <w:jc w:val="right"/>
+              <w:rPr>
+                <w:color w:val="auto"/>
+                <w:spacing w:val="0"/>
+                <w:position w:val="0"/>
+                <w:sz w:val="22"/>
+              </w:rPr>
+            </w:pPr>
+            <w:r>
+              <w:rPr>
+                <w:rFonts w:ascii="Open Sans SemiBold" w:hAnsi="Open Sans SemiBold" w:cs="Open Sans SemiBold" w:eastAsia="Open Sans SemiBold"/>
+                <w:b/>
+                <w:color w:val="auto"/>
+                <w:spacing w:val="0"/>
+                <w:position w:val="0"/>
+                <w:sz w:val="22"/>
+                <w:shd w:fill="auto" w:val="clear"/>
+              </w:rPr>
+              <w:t xml:space="preserve">1.167,13 €</w:t>
             </w:r>
             <w:r>
               <w:rPr>
@@ -3576,7 +4254,7 @@
           <w:sz w:val="22"/>
           <w:shd w:fill="auto" w:val="clear"/>
         </w:rPr>
-        <w:t xml:space="preserve">0,00 €</w:t>
+        <w:t xml:space="preserve">1.167,13 €</w:t>
       </w:r>
       <w:r>
         <w:rPr>
@@ -3599,7 +4277,7 @@
           <w:sz w:val="22"/>
           <w:shd w:fill="auto" w:val="clear"/>
         </w:rPr>
-        <w:t xml:space="preserve">4.180,00 €</w:t>
+        <w:t xml:space="preserve">4.080,00 €</w:t>
       </w:r>
       <w:r>
         <w:rPr>

</xml_diff>

<commit_message>
wenn ja, wohnumfeldAmount calculated
</commit_message>
<xml_diff>
--- a/out-Angebot.docx
+++ b/out-Angebot.docx
@@ -363,7 +363,7 @@
                 <w:sz w:val="22"/>
                 <w:shd w:fill="auto" w:val="clear"/>
               </w:rPr>
-              <w:t xml:space="preserve">AN20250924141205</w:t>
+              <w:t xml:space="preserve">AN20250924150406</w:t>
             </w:r>
             <w:r>
               <w:rPr>
@@ -617,7 +617,7 @@
           <w:sz w:val="24"/>
           <w:shd w:fill="auto" w:val="clear"/>
         </w:rPr>
-        <w:t xml:space="preserve">  Ihr Angebot AN20250924141205</w:t>
+        <w:t xml:space="preserve">  Ihr Angebot AN20250924150406</w:t>
       </w:r>
     </w:p>
     <w:p>
@@ -3929,7 +3929,7 @@
                 <w:sz w:val="22"/>
                 <w:shd w:fill="auto" w:val="clear"/>
               </w:rPr>
-              <w:t xml:space="preserve">4.080,00 €</w:t>
+              <w:t xml:space="preserve">2.180,00 €</w:t>
             </w:r>
             <w:r>
               <w:rPr>
@@ -4103,7 +4103,7 @@
                 <w:sz w:val="22"/>
                 <w:shd w:fill="auto" w:val="clear"/>
               </w:rPr>
-              <w:t xml:space="preserve">1.167,13 €</w:t>
+              <w:t xml:space="preserve">3.067,13 €</w:t>
             </w:r>
             <w:r>
               <w:rPr>
@@ -4254,7 +4254,7 @@
           <w:sz w:val="22"/>
           <w:shd w:fill="auto" w:val="clear"/>
         </w:rPr>
-        <w:t xml:space="preserve">1.167,13 €</w:t>
+        <w:t xml:space="preserve">3.067,13 €</w:t>
       </w:r>
       <w:r>
         <w:rPr>
@@ -4277,7 +4277,7 @@
           <w:sz w:val="22"/>
           <w:shd w:fill="auto" w:val="clear"/>
         </w:rPr>
-        <w:t xml:space="preserve">4.080,00 €</w:t>
+        <w:t xml:space="preserve">2.180,00 €</w:t>
       </w:r>
       <w:r>
         <w:rPr>

</xml_diff>

<commit_message>
top 4 closest dimensions from radio selections
</commit_message>
<xml_diff>
--- a/out-Angebot.docx
+++ b/out-Angebot.docx
@@ -363,7 +363,7 @@
                 <w:sz w:val="22"/>
                 <w:shd w:fill="auto" w:val="clear"/>
               </w:rPr>
-              <w:t xml:space="preserve">AN20250924150406</w:t>
+              <w:t xml:space="preserve">AN20250924161725</w:t>
             </w:r>
             <w:r>
               <w:rPr>
@@ -617,7 +617,7 @@
           <w:sz w:val="24"/>
           <w:shd w:fill="auto" w:val="clear"/>
         </w:rPr>
-        <w:t xml:space="preserve">  Ihr Angebot AN20250924150406</w:t>
+        <w:t xml:space="preserve">  Ihr Angebot AN20250924161725</w:t>
       </w:r>
     </w:p>
     <w:p>
@@ -2591,7 +2591,7 @@
                 <w:sz w:val="20"/>
                 <w:shd w:fill="auto" w:val="clear"/>
               </w:rPr>
-              <w:t xml:space="preserve">Bestandkundenbonus:</w:t>
+              <w:t xml:space="preserve">Aktion: Haltegriff</w:t>
             </w:r>
           </w:p>
           <w:p>
@@ -2614,7 +2614,7 @@
                 <w:sz w:val="20"/>
                 <w:shd w:fill="auto" w:val="clear"/>
               </w:rPr>
-              <w:t xml:space="preserve">-- Rabatt von 300 € ab einem Gesamtwert von 3.000</w:t>
+              <w:t xml:space="preserve">-- 1 Haltegriff gratis im Wert von 175 € inkl. Lieferung und Montage</w:t>
             </w:r>
           </w:p>
         </w:tc>
@@ -2654,7 +2654,7 @@
                 <w:sz w:val="20"/>
                 <w:shd w:fill="auto" w:val="clear"/>
               </w:rPr>
-              <w:t xml:space="preserve">-252,10 €</w:t>
+              <w:t xml:space="preserve">-147,06 €</w:t>
             </w:r>
           </w:p>
         </w:tc>
@@ -2694,7 +2694,7 @@
                 <w:sz w:val="20"/>
                 <w:shd w:fill="auto" w:val="clear"/>
               </w:rPr>
-              <w:t xml:space="preserve">-252,10 €</w:t>
+              <w:t xml:space="preserve">-147,06 €</w:t>
             </w:r>
           </w:p>
         </w:tc>
@@ -2779,7 +2779,7 @@
                 <w:sz w:val="20"/>
                 <w:shd w:fill="auto" w:val="clear"/>
               </w:rPr>
-              <w:t xml:space="preserve">Nettobetrag (ohne Rabatt)</w:t>
+              <w:t xml:space="preserve">Nettobetrag</w:t>
             </w:r>
           </w:p>
         </w:tc>
@@ -2953,7 +2953,7 @@
                 <w:sz w:val="20"/>
                 <w:shd w:fill="auto" w:val="clear"/>
               </w:rPr>
-              <w:t xml:space="preserve">Rabatt</w:t>
+              <w:t xml:space="preserve">zzgl. 19% MwSt.</w:t>
             </w:r>
           </w:p>
         </w:tc>
@@ -3059,7 +3059,7 @@
                 <w:sz w:val="22"/>
                 <w:shd w:fill="auto" w:val="clear"/>
               </w:rPr>
-              <w:t xml:space="preserve">5,47 €</w:t>
+              <w:t xml:space="preserve">886,71 €</w:t>
             </w:r>
             <w:r>
               <w:rPr>
@@ -3127,7 +3127,7 @@
                 <w:sz w:val="20"/>
                 <w:shd w:fill="auto" w:val="clear"/>
               </w:rPr>
-              <w:t xml:space="preserve">zzgl. 19% MwSt.</w:t>
+              <w:t xml:space="preserve">Gesamtsumme</w:t>
             </w:r>
           </w:p>
         </w:tc>
@@ -3233,7 +3233,7 @@
                 <w:sz w:val="22"/>
                 <w:shd w:fill="auto" w:val="clear"/>
               </w:rPr>
-              <w:t xml:space="preserve">886,71 €</w:t>
+              <w:t xml:space="preserve">5.553,63 €</w:t>
             </w:r>
             <w:r>
               <w:rPr>
@@ -3301,7 +3301,7 @@
                 <w:sz w:val="20"/>
                 <w:shd w:fill="auto" w:val="clear"/>
               </w:rPr>
-              <w:t xml:space="preserve">Gesamtsumme</w:t>
+              <w:t xml:space="preserve">Gesamtbetrag nach Neukundenbonus</w:t>
             </w:r>
           </w:p>
         </w:tc>
@@ -3407,7 +3407,7 @@
                 <w:sz w:val="22"/>
                 <w:shd w:fill="auto" w:val="clear"/>
               </w:rPr>
-              <w:t xml:space="preserve">5.553,63 €</w:t>
+              <w:t xml:space="preserve">5.378,63 €</w:t>
             </w:r>
             <w:r>
               <w:rPr>
@@ -3475,7 +3475,7 @@
                 <w:sz w:val="20"/>
                 <w:shd w:fill="auto" w:val="clear"/>
               </w:rPr>
-              <w:t xml:space="preserve">Gesamtbetrag nach Materialrabatt</w:t>
+              <w:t xml:space="preserve">Zuschuss Krankenkasse</w:t>
             </w:r>
           </w:p>
         </w:tc>
@@ -3581,7 +3581,7 @@
                 <w:sz w:val="22"/>
                 <w:shd w:fill="auto" w:val="clear"/>
               </w:rPr>
-              <w:t xml:space="preserve">5.547,13 €</w:t>
+              <w:t xml:space="preserve">2.100,00 €</w:t>
             </w:r>
             <w:r>
               <w:rPr>
@@ -3649,7 +3649,7 @@
                 <w:sz w:val="20"/>
                 <w:shd w:fill="auto" w:val="clear"/>
               </w:rPr>
-              <w:t xml:space="preserve">Gesamtbetrag nach Neukundenbonus</w:t>
+              <w:t xml:space="preserve">Selbstkostenanteil</w:t>
             </w:r>
           </w:p>
         </w:tc>
@@ -3755,355 +3755,7 @@
                 <w:sz w:val="22"/>
                 <w:shd w:fill="auto" w:val="clear"/>
               </w:rPr>
-              <w:t xml:space="preserve">5.247,13 €</w:t>
-            </w:r>
-            <w:r>
-              <w:rPr>
-                <w:rFonts w:ascii="Open Sans SemiBold" w:hAnsi="Open Sans SemiBold" w:cs="Open Sans SemiBold" w:eastAsia="Open Sans SemiBold"/>
-                <w:color w:val="auto"/>
-                <w:spacing w:val="0"/>
-                <w:position w:val="0"/>
-                <w:sz w:val="22"/>
-                <w:shd w:fill="auto" w:val="clear"/>
-              </w:rPr>
-              <w:t/>
-            </w:r>
-          </w:p>
-        </w:tc>
-      </w:tr>
-      <w:tr>
-        <w:trPr>
-          <w:trHeight w:val="1" w:hRule="atLeast"/>
-          <w:jc w:val="left"/>
-        </w:trPr>
-        <w:tc>
-          <w:tcPr>
-            <w:tcW w:w="3915" w:type="dxa"/>
-            <w:tcBorders>
-              <w:top w:val="single" w:color="ffffff" w:sz="8"/>
-              <w:left w:val="single" w:color="d9d9d9" w:sz="8"/>
-              <w:bottom w:val="single" w:color="ffffff" w:sz="8"/>
-              <w:right w:val="single" w:color="d9d9d9" w:sz="8"/>
-            </w:tcBorders>
-            <w:shd w:color="000000" w:fill="d9d9d9" w:val="clear"/>
-            <w:tcMar>
-              <w:left w:w="0" w:type="dxa"/>
-              <w:right w:w="0" w:type="dxa"/>
-            </w:tcMar>
-            <w:vAlign w:val="center"/>
-          </w:tcPr>
-          <w:p>
-            <w:pPr>
-              <w:spacing w:before="56" w:after="0" w:line="240"/>
-              <w:ind w:right="0" w:left="50" w:firstLine="0"/>
-              <w:jc w:val="left"/>
-              <w:rPr>
-                <w:spacing w:val="0"/>
-                <w:position w:val="0"/>
-              </w:rPr>
-            </w:pPr>
-            <w:r>
-              <w:rPr>
-                <w:rFonts w:ascii="Open Sans SemiBold" w:hAnsi="Open Sans SemiBold" w:cs="Open Sans SemiBold" w:eastAsia="Open Sans SemiBold"/>
-                <w:color w:val="030303"/>
-                <w:spacing w:val="0"/>
-                <w:position w:val="0"/>
-                <w:sz w:val="20"/>
-                <w:shd w:fill="auto" w:val="clear"/>
-              </w:rPr>
-              <w:t/>
-            </w:r>
-            <w:r>
-              <w:rPr>
-                <w:rFonts w:ascii="Open Sans SemiBold" w:hAnsi="Open Sans SemiBold" w:cs="Open Sans SemiBold" w:eastAsia="Open Sans SemiBold"/>
-                <w:b/>
-                <w:color w:val="030303"/>
-                <w:spacing w:val="0"/>
-                <w:position w:val="0"/>
-                <w:sz w:val="20"/>
-                <w:shd w:fill="auto" w:val="clear"/>
-              </w:rPr>
-              <w:t xml:space="preserve">Zuschuss Krankenkasse</w:t>
-            </w:r>
-          </w:p>
-        </w:tc>
-        <w:tc>
-          <w:tcPr>
-            <w:tcW w:w="915" w:type="dxa"/>
-            <w:tcBorders>
-              <w:top w:val="single" w:color="ffffff" w:sz="8"/>
-              <w:left w:val="single" w:color="d9d9d9" w:sz="8"/>
-              <w:bottom w:val="single" w:color="ffffff" w:sz="8"/>
-              <w:right w:val="single" w:color="d9d9d9" w:sz="8"/>
-            </w:tcBorders>
-            <w:shd w:color="000000" w:fill="d9d9d9" w:val="clear"/>
-            <w:tcMar>
-              <w:left w:w="0" w:type="dxa"/>
-              <w:right w:w="0" w:type="dxa"/>
-            </w:tcMar>
-            <w:vAlign w:val="center"/>
-          </w:tcPr>
-          <w:p>
-            <w:pPr>
-              <w:spacing w:before="0" w:after="0" w:line="240"/>
-              <w:ind w:right="0" w:left="0" w:firstLine="0"/>
-              <w:jc w:val="left"/>
-              <w:rPr>
-                <w:rFonts w:ascii="Calibri" w:hAnsi="Calibri" w:cs="Calibri" w:eastAsia="Calibri"/>
-                <w:color w:val="auto"/>
-                <w:spacing w:val="0"/>
-                <w:position w:val="0"/>
-                <w:sz w:val="22"/>
-                <w:shd w:fill="auto" w:val="clear"/>
-              </w:rPr>
-            </w:pPr>
-          </w:p>
-        </w:tc>
-        <w:tc>
-          <w:tcPr>
-            <w:tcW w:w="2106" w:type="dxa"/>
-            <w:tcBorders>
-              <w:top w:val="single" w:color="ffffff" w:sz="8"/>
-              <w:left w:val="single" w:color="d9d9d9" w:sz="8"/>
-              <w:bottom w:val="single" w:color="ffffff" w:sz="8"/>
-              <w:right w:val="single" w:color="d9d9d9" w:sz="8"/>
-            </w:tcBorders>
-            <w:shd w:color="000000" w:fill="d9d9d9" w:val="clear"/>
-            <w:tcMar>
-              <w:left w:w="0" w:type="dxa"/>
-              <w:right w:w="0" w:type="dxa"/>
-            </w:tcMar>
-            <w:vAlign w:val="center"/>
-          </w:tcPr>
-          <w:p>
-            <w:pPr>
-              <w:spacing w:before="0" w:after="0" w:line="240"/>
-              <w:ind w:right="0" w:left="0" w:firstLine="0"/>
-              <w:jc w:val="left"/>
-              <w:rPr>
-                <w:rFonts w:ascii="Calibri" w:hAnsi="Calibri" w:cs="Calibri" w:eastAsia="Calibri"/>
-                <w:color w:val="auto"/>
-                <w:spacing w:val="0"/>
-                <w:position w:val="0"/>
-                <w:sz w:val="22"/>
-                <w:shd w:fill="auto" w:val="clear"/>
-              </w:rPr>
-            </w:pPr>
-          </w:p>
-        </w:tc>
-        <w:tc>
-          <w:tcPr>
-            <w:tcW w:w="2724" w:type="dxa"/>
-            <w:tcBorders>
-              <w:top w:val="single" w:color="ffffff" w:sz="8"/>
-              <w:left w:val="single" w:color="d9d9d9" w:sz="8"/>
-              <w:bottom w:val="single" w:color="ffffff" w:sz="8"/>
-              <w:right w:val="single" w:color="d9d9d9" w:sz="8"/>
-            </w:tcBorders>
-            <w:shd w:color="000000" w:fill="d9d9d9" w:val="clear"/>
-            <w:tcMar>
-              <w:left w:w="0" w:type="dxa"/>
-              <w:right w:w="0" w:type="dxa"/>
-            </w:tcMar>
-            <w:vAlign w:val="center"/>
-          </w:tcPr>
-          <w:p>
-            <w:pPr>
-              <w:spacing w:before="0" w:after="0" w:line="278"/>
-              <w:ind w:right="314" w:left="0" w:firstLine="0"/>
-              <w:jc w:val="right"/>
-              <w:rPr>
-                <w:color w:val="auto"/>
-                <w:spacing w:val="0"/>
-                <w:position w:val="0"/>
-                <w:sz w:val="22"/>
-              </w:rPr>
-            </w:pPr>
-            <w:r>
-              <w:rPr>
-                <w:rFonts w:ascii="Open Sans SemiBold" w:hAnsi="Open Sans SemiBold" w:cs="Open Sans SemiBold" w:eastAsia="Open Sans SemiBold"/>
-                <w:b/>
-                <w:color w:val="auto"/>
-                <w:spacing w:val="0"/>
-                <w:position w:val="0"/>
-                <w:sz w:val="22"/>
-                <w:shd w:fill="auto" w:val="clear"/>
-              </w:rPr>
-              <w:t xml:space="preserve">2.180,00 €</w:t>
-            </w:r>
-            <w:r>
-              <w:rPr>
-                <w:rFonts w:ascii="Open Sans SemiBold" w:hAnsi="Open Sans SemiBold" w:cs="Open Sans SemiBold" w:eastAsia="Open Sans SemiBold"/>
-                <w:color w:val="auto"/>
-                <w:spacing w:val="0"/>
-                <w:position w:val="0"/>
-                <w:sz w:val="22"/>
-                <w:shd w:fill="auto" w:val="clear"/>
-              </w:rPr>
-              <w:t/>
-            </w:r>
-          </w:p>
-        </w:tc>
-      </w:tr>
-      <w:tr>
-        <w:trPr>
-          <w:trHeight w:val="285" w:hRule="auto"/>
-          <w:jc w:val="left"/>
-        </w:trPr>
-        <w:tc>
-          <w:tcPr>
-            <w:tcW w:w="3915" w:type="dxa"/>
-            <w:tcBorders>
-              <w:top w:val="single" w:color="ffffff" w:sz="8"/>
-              <w:left w:val="single" w:color="ffffff" w:sz="8"/>
-              <w:bottom w:val="single" w:color="ffffff" w:sz="8"/>
-              <w:right w:val="single" w:color="ffffff" w:sz="8"/>
-            </w:tcBorders>
-            <w:shd w:color="000000" w:fill="ffffff" w:val="clear"/>
-            <w:tcMar>
-              <w:left w:w="0" w:type="dxa"/>
-              <w:right w:w="0" w:type="dxa"/>
-            </w:tcMar>
-            <w:vAlign w:val="center"/>
-          </w:tcPr>
-          <w:p>
-            <w:pPr>
-              <w:spacing w:before="57" w:after="0" w:line="240"/>
-              <w:ind w:right="0" w:left="0" w:firstLine="0"/>
-              <w:jc w:val="left"/>
-              <w:rPr>
-                <w:spacing w:val="0"/>
-                <w:position w:val="0"/>
-              </w:rPr>
-            </w:pPr>
-            <w:r>
-              <w:rPr>
-                <w:rFonts w:ascii="Open Sans SemiBold" w:hAnsi="Open Sans SemiBold" w:cs="Open Sans SemiBold" w:eastAsia="Open Sans SemiBold"/>
-                <w:color w:val="030303"/>
-                <w:spacing w:val="0"/>
-                <w:position w:val="0"/>
-                <w:sz w:val="20"/>
-                <w:shd w:fill="auto" w:val="clear"/>
-              </w:rPr>
-              <w:t/>
-            </w:r>
-            <w:r>
-              <w:rPr>
-                <w:rFonts w:ascii="Open Sans SemiBold" w:hAnsi="Open Sans SemiBold" w:cs="Open Sans SemiBold" w:eastAsia="Open Sans SemiBold"/>
-                <w:b/>
-                <w:color w:val="030303"/>
-                <w:spacing w:val="0"/>
-                <w:position w:val="0"/>
-                <w:sz w:val="20"/>
-                <w:shd w:fill="auto" w:val="clear"/>
-              </w:rPr>
-              <w:t xml:space="preserve">Selbstkostenanteil</w:t>
-            </w:r>
-          </w:p>
-        </w:tc>
-        <w:tc>
-          <w:tcPr>
-            <w:tcW w:w="915" w:type="dxa"/>
-            <w:tcBorders>
-              <w:top w:val="single" w:color="ffffff" w:sz="8"/>
-              <w:left w:val="single" w:color="ffffff" w:sz="8"/>
-              <w:bottom w:val="single" w:color="ffffff" w:sz="8"/>
-              <w:right w:val="single" w:color="ffffff" w:sz="8"/>
-            </w:tcBorders>
-            <w:shd w:color="000000" w:fill="ffffff" w:val="clear"/>
-            <w:tcMar>
-              <w:left w:w="0" w:type="dxa"/>
-              <w:right w:w="0" w:type="dxa"/>
-            </w:tcMar>
-            <w:vAlign w:val="center"/>
-          </w:tcPr>
-          <w:p>
-            <w:pPr>
-              <w:spacing w:before="0" w:after="0" w:line="240"/>
-              <w:ind w:right="0" w:left="0" w:firstLine="0"/>
-              <w:jc w:val="left"/>
-              <w:rPr>
-                <w:rFonts w:ascii="Calibri" w:hAnsi="Calibri" w:cs="Calibri" w:eastAsia="Calibri"/>
-                <w:color w:val="auto"/>
-                <w:spacing w:val="0"/>
-                <w:position w:val="0"/>
-                <w:sz w:val="22"/>
-                <w:shd w:fill="auto" w:val="clear"/>
-              </w:rPr>
-            </w:pPr>
-          </w:p>
-        </w:tc>
-        <w:tc>
-          <w:tcPr>
-            <w:tcW w:w="2106" w:type="dxa"/>
-            <w:tcBorders>
-              <w:top w:val="single" w:color="ffffff" w:sz="8"/>
-              <w:left w:val="single" w:color="ffffff" w:sz="8"/>
-              <w:bottom w:val="single" w:color="ffffff" w:sz="8"/>
-              <w:right w:val="single" w:color="ffffff" w:sz="8"/>
-            </w:tcBorders>
-            <w:shd w:color="000000" w:fill="ffffff" w:val="clear"/>
-            <w:tcMar>
-              <w:left w:w="0" w:type="dxa"/>
-              <w:right w:w="0" w:type="dxa"/>
-            </w:tcMar>
-            <w:vAlign w:val="center"/>
-          </w:tcPr>
-          <w:p>
-            <w:pPr>
-              <w:spacing w:before="0" w:after="0" w:line="240"/>
-              <w:ind w:right="0" w:left="0" w:firstLine="0"/>
-              <w:jc w:val="left"/>
-              <w:rPr>
-                <w:rFonts w:ascii="Calibri" w:hAnsi="Calibri" w:cs="Calibri" w:eastAsia="Calibri"/>
-                <w:color w:val="auto"/>
-                <w:spacing w:val="0"/>
-                <w:position w:val="0"/>
-                <w:sz w:val="22"/>
-                <w:shd w:fill="auto" w:val="clear"/>
-              </w:rPr>
-            </w:pPr>
-          </w:p>
-        </w:tc>
-        <w:tc>
-          <w:tcPr>
-            <w:tcW w:w="2724" w:type="dxa"/>
-            <w:tcBorders>
-              <w:top w:val="single" w:color="ffffff" w:sz="8"/>
-              <w:left w:val="single" w:color="ffffff" w:sz="8"/>
-              <w:bottom w:val="single" w:color="ffffff" w:sz="8"/>
-              <w:right w:val="single" w:color="ffffff" w:sz="8"/>
-            </w:tcBorders>
-            <w:shd w:color="000000" w:fill="ffffff" w:val="clear"/>
-            <w:tcMar>
-              <w:left w:w="0" w:type="dxa"/>
-              <w:right w:w="0" w:type="dxa"/>
-            </w:tcMar>
-            <w:vAlign w:val="center"/>
-          </w:tcPr>
-          <w:p>
-            <w:pPr>
-              <w:spacing w:before="0" w:after="0" w:line="278"/>
-              <w:ind w:right="314" w:left="0" w:firstLine="0"/>
-              <w:jc w:val="right"/>
-              <w:rPr>
-                <w:color w:val="auto"/>
-                <w:spacing w:val="0"/>
-                <w:position w:val="0"/>
-                <w:sz w:val="22"/>
-              </w:rPr>
-            </w:pPr>
-            <w:r>
-              <w:rPr>
-                <w:rFonts w:ascii="Open Sans SemiBold" w:hAnsi="Open Sans SemiBold" w:cs="Open Sans SemiBold" w:eastAsia="Open Sans SemiBold"/>
-                <w:b/>
-                <w:color w:val="auto"/>
-                <w:spacing w:val="0"/>
-                <w:position w:val="0"/>
-                <w:sz w:val="22"/>
-                <w:shd w:fill="auto" w:val="clear"/>
-              </w:rPr>
-              <w:t xml:space="preserve">3.067,13 €</w:t>
+              <w:t xml:space="preserve">3.278,63 €</w:t>
             </w:r>
             <w:r>
               <w:rPr>
@@ -4254,7 +3906,7 @@
           <w:sz w:val="22"/>
           <w:shd w:fill="auto" w:val="clear"/>
         </w:rPr>
-        <w:t xml:space="preserve">3.067,13 €</w:t>
+        <w:t xml:space="preserve">3.278,63 €</w:t>
       </w:r>
       <w:r>
         <w:rPr>
@@ -4277,7 +3929,7 @@
           <w:sz w:val="22"/>
           <w:shd w:fill="auto" w:val="clear"/>
         </w:rPr>
-        <w:t xml:space="preserve">2.180,00 €</w:t>
+        <w:t xml:space="preserve">2.100,00 €</w:t>
       </w:r>
       <w:r>
         <w:rPr>

</xml_diff>

<commit_message>
Aktion: Haltegriff GRATIS modification
</commit_message>
<xml_diff>
--- a/out-Angebot.docx
+++ b/out-Angebot.docx
@@ -93,7 +93,7 @@
           <w:sz w:val="22"/>
           <w:shd w:fill="auto" w:val="clear"/>
         </w:rPr>
-        <w:t xml:space="preserve">Cherokee Hogan</w:t>
+        <w:t xml:space="preserve">Emma Gutierrez</w:t>
       </w:r>
     </w:p>
     <w:p>
@@ -119,7 +119,7 @@
           <w:sz w:val="22"/>
           <w:shd w:fill="auto" w:val="clear"/>
         </w:rPr>
-        <w:t xml:space="preserve">Earum dignissimos ea,</w:t>
+        <w:t xml:space="preserve">Dolorem amet expedi,</w:t>
       </w:r>
     </w:p>
     <w:p>
@@ -145,7 +145,7 @@
           <w:sz w:val="22"/>
           <w:shd w:fill="auto" w:val="clear"/>
         </w:rPr>
-        <w:t xml:space="preserve">Hic sint quia offici Amet quasi consequu</w:t>
+        <w:t xml:space="preserve">Quasi est veniam au Consectetur reprehen</w:t>
       </w:r>
     </w:p>
     <w:tbl>
@@ -320,7 +320,7 @@
                 <w:sz w:val="22"/>
                 <w:shd w:fill="auto" w:val="clear"/>
               </w:rPr>
-              <w:t xml:space="preserve">Victoria Mcfadden</w:t>
+              <w:t xml:space="preserve">Justina Keller</w:t>
             </w:r>
           </w:p>
         </w:tc>
@@ -363,7 +363,7 @@
                 <w:sz w:val="22"/>
                 <w:shd w:fill="auto" w:val="clear"/>
               </w:rPr>
-              <w:t xml:space="preserve">AN20250924161725</w:t>
+              <w:t xml:space="preserve">AN20250926092159</w:t>
             </w:r>
             <w:r>
               <w:rPr>
@@ -411,7 +411,7 @@
                 <w:sz w:val="22"/>
                 <w:shd w:fill="auto" w:val="clear"/>
               </w:rPr>
-              <w:t xml:space="preserve">1998-11-15</w:t>
+              <w:t xml:space="preserve">1999-02-17</w:t>
             </w:r>
             <w:r>
               <w:rPr>
@@ -455,7 +455,7 @@
                 <w:sz w:val="22"/>
                 <w:shd w:fill="auto" w:val="clear"/>
               </w:rPr>
-              <w:t xml:space="preserve">Deanna Bridges</w:t>
+              <w:t xml:space="preserve">Aidan Langley</w:t>
             </w:r>
             <w:r>
               <w:rPr>
@@ -617,7 +617,7 @@
           <w:sz w:val="24"/>
           <w:shd w:fill="auto" w:val="clear"/>
         </w:rPr>
-        <w:t xml:space="preserve">  Ihr Angebot AN20250924161725</w:t>
+        <w:t xml:space="preserve">  Ihr Angebot AN20250926092159</w:t>
       </w:r>
     </w:p>
     <w:p>
@@ -643,7 +643,7 @@
           <w:sz w:val="22"/>
           <w:shd w:fill="auto" w:val="clear"/>
         </w:rPr>
-        <w:t xml:space="preserve">  Sehr geehrte Frau Hogan,</w:t>
+        <w:t xml:space="preserve">  Sehr geehrte Frau Gutierrez,</w:t>
         <w:br/>
       </w:r>
     </w:p>
@@ -1072,7 +1072,7 @@
                 <w:sz w:val="20"/>
                 <w:shd w:fill="auto" w:val="clear"/>
               </w:rPr>
-              <w:t xml:space="preserve">3.640,80 €</w:t>
+              <w:t xml:space="preserve">1.717,60 €</w:t>
             </w:r>
           </w:p>
         </w:tc>
@@ -1112,7 +1112,7 @@
                 <w:sz w:val="20"/>
                 <w:shd w:fill="auto" w:val="clear"/>
               </w:rPr>
-              <w:t xml:space="preserve">3.640,80 €</w:t>
+              <w:t xml:space="preserve">1.717,60 €</w:t>
             </w:r>
           </w:p>
         </w:tc>
@@ -1477,7 +1477,7 @@
                 <w:sz w:val="18"/>
                 <w:shd w:fill="auto" w:val="clear"/>
               </w:rPr>
-              <w:t xml:space="preserve">- 26 km Kilometerpauschale (Hin- &amp; Rückfahrt)</w:t>
+              <w:t xml:space="preserve">- 138 km Kilometerpauschale </w:t>
             </w:r>
           </w:p>
           <w:p>
@@ -1965,7 +1965,7 @@
                 <w:sz w:val="20"/>
                 <w:shd w:fill="auto" w:val="clear"/>
               </w:rPr>
-              <w:t xml:space="preserve">684,08 €</w:t>
+              <w:t xml:space="preserve">599,57 €</w:t>
             </w:r>
           </w:p>
         </w:tc>
@@ -2005,7 +2005,7 @@
                 <w:sz w:val="20"/>
                 <w:shd w:fill="auto" w:val="clear"/>
               </w:rPr>
-              <w:t xml:space="preserve">684,08 €</w:t>
+              <w:t xml:space="preserve">599,57 €</w:t>
             </w:r>
           </w:p>
         </w:tc>
@@ -2292,7 +2292,7 @@
                 <w:sz w:val="20"/>
                 <w:shd w:fill="auto" w:val="clear"/>
               </w:rPr>
-              <w:t xml:space="preserve">- 1 Stk Duschwanne Slate 140x100x3cm Mineralguss weiss Nuovvo</w:t>
+              <w:t xml:space="preserve">- 1 Stk TRINNITY Wannenabdichtband-Set 3,4 m Nass-/Trockenanbindung entspr. DIN 18534</w:t>
             </w:r>
           </w:p>
           <w:p>
@@ -2318,7 +2318,7 @@
                 <w:sz w:val="20"/>
                 <w:shd w:fill="auto" w:val="clear"/>
               </w:rPr>
-              <w:t xml:space="preserve">- 1 Stk TRINNITY Wannenabdichtband-Set 3,4 m Nass-/Trockenanbindung entspr. DIN 18534</w:t>
+              <w:t xml:space="preserve">- 1 Stk Ablaufgarnitur Rohbauset m. Sifon BH60mm f. Flache Duschw. m. 90mm Ablauf TRINNITY</w:t>
             </w:r>
           </w:p>
           <w:p>
@@ -2344,7 +2344,7 @@
                 <w:sz w:val="20"/>
                 <w:shd w:fill="auto" w:val="clear"/>
               </w:rPr>
-              <w:t xml:space="preserve">- 1 Stk Ablaufgarnitur Rohbauset m. Sifon BH60mm f. Flache Duschw. m. 90mm Ablauf TRINNITY</w:t>
+              <w:t xml:space="preserve">- 1 Stk Kleinmaterial groß</w:t>
             </w:r>
           </w:p>
           <w:p>
@@ -2370,7 +2370,7 @@
                 <w:sz w:val="20"/>
                 <w:shd w:fill="auto" w:val="clear"/>
               </w:rPr>
-              <w:t xml:space="preserve">- 1 Stk Kleinmaterial groß</w:t>
+              <w:t xml:space="preserve">- 1 Stk TRINNITY Wandabdichtung BASIS-Set 5 qm DW bis 100 x 100 / BW bis 180 x 80 cm</w:t>
             </w:r>
           </w:p>
           <w:p>
@@ -2396,7 +2396,85 @@
                 <w:sz w:val="20"/>
                 <w:shd w:fill="auto" w:val="clear"/>
               </w:rPr>
-              <w:t xml:space="preserve">- 1 Stk Stelzlager höhenverstellar Set</w:t>
+              <w:t xml:space="preserve">- 4 Stk Wandverkleidungsklebstoff 3.0/4.0</w:t>
+            </w:r>
+          </w:p>
+          <w:p>
+            <w:pPr>
+              <w:spacing w:before="0" w:after="0" w:line="278"/>
+              <w:ind w:right="314" w:left="0" w:firstLine="0"/>
+              <w:jc w:val="left"/>
+              <w:rPr>
+                <w:rFonts w:ascii="Open Sans" w:hAnsi="Open Sans" w:cs="Open Sans" w:eastAsia="Open Sans"/>
+                <w:color w:val="auto"/>
+                <w:spacing w:val="0"/>
+                <w:position w:val="0"/>
+                <w:sz w:val="20"/>
+                <w:shd w:fill="auto" w:val="clear"/>
+              </w:rPr>
+            </w:pPr>
+            <w:r>
+              <w:rPr>
+                <w:rFonts w:ascii="Open Sans" w:hAnsi="Open Sans" w:cs="Open Sans" w:eastAsia="Open Sans"/>
+                <w:color w:val="auto"/>
+                <w:spacing w:val="0"/>
+                <w:position w:val="0"/>
+                <w:sz w:val="20"/>
+                <w:shd w:fill="auto" w:val="clear"/>
+              </w:rPr>
+              <w:t xml:space="preserve">- 2 Stk Abschlussprofil 3.0 255 cm silber eloxiert VIGOUR</w:t>
+            </w:r>
+          </w:p>
+          <w:p>
+            <w:pPr>
+              <w:spacing w:before="0" w:after="0" w:line="278"/>
+              <w:ind w:right="314" w:left="0" w:firstLine="0"/>
+              <w:jc w:val="left"/>
+              <w:rPr>
+                <w:rFonts w:ascii="Open Sans" w:hAnsi="Open Sans" w:cs="Open Sans" w:eastAsia="Open Sans"/>
+                <w:color w:val="auto"/>
+                <w:spacing w:val="0"/>
+                <w:position w:val="0"/>
+                <w:sz w:val="20"/>
+                <w:shd w:fill="auto" w:val="clear"/>
+              </w:rPr>
+            </w:pPr>
+            <w:r>
+              <w:rPr>
+                <w:rFonts w:ascii="Open Sans" w:hAnsi="Open Sans" w:cs="Open Sans" w:eastAsia="Open Sans"/>
+                <w:color w:val="auto"/>
+                <w:spacing w:val="0"/>
+                <w:position w:val="0"/>
+                <w:sz w:val="20"/>
+                <w:shd w:fill="auto" w:val="clear"/>
+              </w:rPr>
+              <w:t xml:space="preserve">- 2 Stk Verbindungsprofil(e) (Plattenanzahl - 1)</w:t>
+            </w:r>
+          </w:p>
+          <w:p>
+            <w:pPr>
+              <w:spacing w:before="0" w:after="0" w:line="278"/>
+              <w:ind w:right="314" w:left="0" w:firstLine="0"/>
+              <w:jc w:val="left"/>
+              <w:rPr>
+                <w:rFonts w:ascii="Open Sans" w:hAnsi="Open Sans" w:cs="Open Sans" w:eastAsia="Open Sans"/>
+                <w:color w:val="auto"/>
+                <w:spacing w:val="0"/>
+                <w:position w:val="0"/>
+                <w:sz w:val="20"/>
+                <w:shd w:fill="auto" w:val="clear"/>
+              </w:rPr>
+            </w:pPr>
+            <w:r>
+              <w:rPr>
+                <w:rFonts w:ascii="Open Sans" w:hAnsi="Open Sans" w:cs="Open Sans" w:eastAsia="Open Sans"/>
+                <w:color w:val="auto"/>
+                <w:spacing w:val="0"/>
+                <w:position w:val="0"/>
+                <w:sz w:val="20"/>
+                <w:shd w:fill="auto" w:val="clear"/>
+              </w:rPr>
+              <w:t xml:space="preserve">- 2 Stk Profilklebstoff (pro Abschlussprofil 1 Stk)</w:t>
             </w:r>
           </w:p>
         </w:tc>
@@ -2462,240 +2540,6 @@
                 <w:shd w:fill="auto" w:val="clear"/>
               </w:rPr>
             </w:pPr>
-          </w:p>
-        </w:tc>
-      </w:tr>
-      <w:tr>
-        <w:trPr>
-          <w:trHeight w:val="1" w:hRule="atLeast"/>
-          <w:jc w:val="left"/>
-        </w:trPr>
-        <w:tc>
-          <w:tcPr>
-            <w:tcW w:w="660" w:type="dxa"/>
-            <w:tcBorders>
-              <w:top w:val="single" w:color="ffffff" w:sz="8"/>
-              <w:left w:val="single" w:color="ffffff" w:sz="8"/>
-              <w:bottom w:val="single" w:color="ffffff" w:sz="8"/>
-              <w:right w:val="single" w:color="ffffff" w:sz="8"/>
-            </w:tcBorders>
-            <w:shd w:color="000000" w:fill="ffffff" w:val="clear"/>
-            <w:tcMar>
-              <w:left w:w="56" w:type="dxa"/>
-              <w:right w:w="56" w:type="dxa"/>
-            </w:tcMar>
-            <w:vAlign w:val="top"/>
-          </w:tcPr>
-          <w:p>
-            <w:pPr>
-              <w:spacing w:before="0" w:after="0" w:line="278"/>
-              <w:ind w:right="-26" w:left="0" w:firstLine="0"/>
-              <w:jc w:val="left"/>
-              <w:rPr>
-                <w:color w:val="auto"/>
-                <w:spacing w:val="0"/>
-                <w:position w:val="0"/>
-              </w:rPr>
-            </w:pPr>
-            <w:r>
-              <w:rPr>
-                <w:rFonts w:ascii="Open Sans" w:hAnsi="Open Sans" w:cs="Open Sans" w:eastAsia="Open Sans"/>
-                <w:color w:val="auto"/>
-                <w:spacing w:val="0"/>
-                <w:position w:val="0"/>
-                <w:sz w:val="20"/>
-                <w:shd w:fill="auto" w:val="clear"/>
-              </w:rPr>
-              <w:t xml:space="preserve">003</w:t>
-            </w:r>
-          </w:p>
-        </w:tc>
-        <w:tc>
-          <w:tcPr>
-            <w:tcW w:w="1035" w:type="dxa"/>
-            <w:tcBorders>
-              <w:top w:val="single" w:color="ffffff" w:sz="8"/>
-              <w:left w:val="single" w:color="ffffff" w:sz="8"/>
-              <w:bottom w:val="single" w:color="ffffff" w:sz="8"/>
-              <w:right w:val="single" w:color="ffffff" w:sz="8"/>
-            </w:tcBorders>
-            <w:shd w:color="000000" w:fill="ffffff" w:val="clear"/>
-            <w:tcMar>
-              <w:left w:w="56" w:type="dxa"/>
-              <w:right w:w="56" w:type="dxa"/>
-            </w:tcMar>
-            <w:vAlign w:val="top"/>
-          </w:tcPr>
-          <w:p>
-            <w:pPr>
-              <w:spacing w:before="0" w:after="0" w:line="278"/>
-              <w:ind w:right="314" w:left="0" w:firstLine="0"/>
-              <w:jc w:val="left"/>
-              <w:rPr>
-                <w:color w:val="auto"/>
-                <w:spacing w:val="0"/>
-                <w:position w:val="0"/>
-              </w:rPr>
-            </w:pPr>
-            <w:r>
-              <w:rPr>
-                <w:rFonts w:ascii="Open Sans" w:hAnsi="Open Sans" w:cs="Open Sans" w:eastAsia="Open Sans"/>
-                <w:color w:val="auto"/>
-                <w:spacing w:val="0"/>
-                <w:position w:val="0"/>
-                <w:sz w:val="20"/>
-                <w:shd w:fill="auto" w:val="clear"/>
-              </w:rPr>
-              <w:t xml:space="preserve">1 Stk</w:t>
-            </w:r>
-          </w:p>
-        </w:tc>
-        <w:tc>
-          <w:tcPr>
-            <w:tcW w:w="4107" w:type="dxa"/>
-            <w:tcBorders>
-              <w:top w:val="single" w:color="ffffff" w:sz="8"/>
-              <w:left w:val="single" w:color="ffffff" w:sz="8"/>
-              <w:bottom w:val="single" w:color="ffffff" w:sz="8"/>
-              <w:right w:val="single" w:color="ffffff" w:sz="8"/>
-            </w:tcBorders>
-            <w:shd w:color="000000" w:fill="ffffff" w:val="clear"/>
-            <w:tcMar>
-              <w:left w:w="56" w:type="dxa"/>
-              <w:right w:w="56" w:type="dxa"/>
-            </w:tcMar>
-            <w:vAlign w:val="top"/>
-          </w:tcPr>
-          <w:p>
-            <w:pPr>
-              <w:spacing w:before="0" w:after="0" w:line="278"/>
-              <w:ind w:right="314" w:left="0" w:firstLine="0"/>
-              <w:jc w:val="left"/>
-              <w:rPr>
-                <w:rFonts w:ascii="Open Sans" w:hAnsi="Open Sans" w:cs="Open Sans" w:eastAsia="Open Sans"/>
-                <w:b/>
-                <w:color w:val="auto"/>
-                <w:spacing w:val="0"/>
-                <w:position w:val="0"/>
-                <w:sz w:val="20"/>
-                <w:shd w:fill="auto" w:val="clear"/>
-              </w:rPr>
-            </w:pPr>
-            <w:r>
-              <w:rPr>
-                <w:rFonts w:ascii="Open Sans" w:hAnsi="Open Sans" w:cs="Open Sans" w:eastAsia="Open Sans"/>
-                <w:b/>
-                <w:color w:val="auto"/>
-                <w:spacing w:val="0"/>
-                <w:position w:val="0"/>
-                <w:sz w:val="20"/>
-                <w:shd w:fill="auto" w:val="clear"/>
-              </w:rPr>
-              <w:t xml:space="preserve">Aktion: Haltegriff</w:t>
-            </w:r>
-          </w:p>
-          <w:p>
-            <w:pPr>
-              <w:spacing w:before="0" w:after="0" w:line="278"/>
-              <w:ind w:right="314" w:left="0" w:firstLine="0"/>
-              <w:jc w:val="left"/>
-              <w:rPr>
-                <w:color w:val="auto"/>
-                <w:spacing w:val="0"/>
-                <w:position w:val="0"/>
-              </w:rPr>
-            </w:pPr>
-            <w:r>
-              <w:rPr>
-                <w:rFonts w:ascii="Open Sans" w:hAnsi="Open Sans" w:cs="Open Sans" w:eastAsia="Open Sans"/>
-                <w:color w:val="auto"/>
-                <w:spacing w:val="0"/>
-                <w:position w:val="0"/>
-                <w:sz w:val="20"/>
-                <w:shd w:fill="auto" w:val="clear"/>
-              </w:rPr>
-              <w:t xml:space="preserve">-- 1 Haltegriff gratis im Wert von 175 € inkl. Lieferung und Montage</w:t>
-            </w:r>
-          </w:p>
-        </w:tc>
-        <w:tc>
-          <w:tcPr>
-            <w:tcW w:w="2268" w:type="dxa"/>
-            <w:tcBorders>
-              <w:top w:val="single" w:color="ffffff" w:sz="8"/>
-              <w:left w:val="single" w:color="ffffff" w:sz="8"/>
-              <w:bottom w:val="single" w:color="ffffff" w:sz="8"/>
-              <w:right w:val="single" w:color="ffffff" w:sz="8"/>
-            </w:tcBorders>
-            <w:shd w:color="000000" w:fill="ffffff" w:val="clear"/>
-            <w:tcMar>
-              <w:left w:w="56" w:type="dxa"/>
-              <w:right w:w="56" w:type="dxa"/>
-            </w:tcMar>
-            <w:vAlign w:val="top"/>
-          </w:tcPr>
-          <w:p>
-            <w:pPr>
-              <w:spacing w:before="0" w:after="0" w:line="278"/>
-              <w:ind w:right="314" w:left="0" w:firstLine="0"/>
-              <w:jc w:val="left"/>
-              <w:rPr>
-                <w:color w:val="auto"/>
-                <w:spacing w:val="0"/>
-                <w:position w:val="0"/>
-              </w:rPr>
-            </w:pPr>
-            <w:r>
-              <w:rPr>
-                <w:rFonts w:ascii="Open Sans" w:hAnsi="Open Sans" w:cs="Open Sans" w:eastAsia="Open Sans"/>
-                <w:color w:val="auto"/>
-                <w:spacing w:val="0"/>
-                <w:position w:val="0"/>
-                <w:sz w:val="20"/>
-                <w:shd w:fill="auto" w:val="clear"/>
-              </w:rPr>
-              <w:t xml:space="preserve">-147,06 €</w:t>
-            </w:r>
-          </w:p>
-        </w:tc>
-        <w:tc>
-          <w:tcPr>
-            <w:tcW w:w="1710" w:type="dxa"/>
-            <w:tcBorders>
-              <w:top w:val="single" w:color="ffffff" w:sz="8"/>
-              <w:left w:val="single" w:color="ffffff" w:sz="8"/>
-              <w:bottom w:val="single" w:color="ffffff" w:sz="8"/>
-              <w:right w:val="single" w:color="ffffff" w:sz="8"/>
-            </w:tcBorders>
-            <w:shd w:color="000000" w:fill="ffffff" w:val="clear"/>
-            <w:tcMar>
-              <w:left w:w="56" w:type="dxa"/>
-              <w:right w:w="56" w:type="dxa"/>
-            </w:tcMar>
-            <w:vAlign w:val="top"/>
-          </w:tcPr>
-          <w:p>
-            <w:pPr>
-              <w:spacing w:before="0" w:after="0" w:line="278"/>
-              <w:ind w:right="314" w:left="0" w:firstLine="0"/>
-              <w:jc w:val="left"/>
-              <w:rPr>
-                <w:color w:val="auto"/>
-                <w:spacing w:val="0"/>
-                <w:position w:val="0"/>
-              </w:rPr>
-            </w:pPr>
-            <w:r>
-              <w:rPr>
-                <w:rFonts w:ascii="Open Sans" w:hAnsi="Open Sans" w:cs="Open Sans" w:eastAsia="Open Sans"/>
-                <w:color w:val="auto"/>
-                <w:spacing w:val="0"/>
-                <w:position w:val="0"/>
-                <w:sz w:val="20"/>
-                <w:shd w:fill="auto" w:val="clear"/>
-              </w:rPr>
-              <w:t xml:space="preserve">-147,06 €</w:t>
-            </w:r>
           </w:p>
         </w:tc>
       </w:tr>
@@ -2885,7 +2729,7 @@
                 <w:sz w:val="22"/>
                 <w:shd w:fill="auto" w:val="clear"/>
               </w:rPr>
-              <w:t xml:space="preserve">4.666,92 €</w:t>
+              <w:t xml:space="preserve">2.616,96 €</w:t>
             </w:r>
             <w:r>
               <w:rPr>
@@ -3059,7 +2903,7 @@
                 <w:sz w:val="22"/>
                 <w:shd w:fill="auto" w:val="clear"/>
               </w:rPr>
-              <w:t xml:space="preserve">886,71 €</w:t>
+              <w:t xml:space="preserve">497,22 €</w:t>
             </w:r>
             <w:r>
               <w:rPr>
@@ -3233,529 +3077,7 @@
                 <w:sz w:val="22"/>
                 <w:shd w:fill="auto" w:val="clear"/>
               </w:rPr>
-              <w:t xml:space="preserve">5.553,63 €</w:t>
-            </w:r>
-            <w:r>
-              <w:rPr>
-                <w:rFonts w:ascii="Open Sans SemiBold" w:hAnsi="Open Sans SemiBold" w:cs="Open Sans SemiBold" w:eastAsia="Open Sans SemiBold"/>
-                <w:color w:val="auto"/>
-                <w:spacing w:val="0"/>
-                <w:position w:val="0"/>
-                <w:sz w:val="22"/>
-                <w:shd w:fill="auto" w:val="clear"/>
-              </w:rPr>
-              <w:t/>
-            </w:r>
-          </w:p>
-        </w:tc>
-      </w:tr>
-      <w:tr>
-        <w:trPr>
-          <w:trHeight w:val="285" w:hRule="auto"/>
-          <w:jc w:val="left"/>
-        </w:trPr>
-        <w:tc>
-          <w:tcPr>
-            <w:tcW w:w="3915" w:type="dxa"/>
-            <w:tcBorders>
-              <w:top w:val="single" w:color="ffffff" w:sz="8"/>
-              <w:left w:val="single" w:color="ffffff" w:sz="8"/>
-              <w:bottom w:val="single" w:color="ffffff" w:sz="8"/>
-              <w:right w:val="single" w:color="ffffff" w:sz="8"/>
-            </w:tcBorders>
-            <w:shd w:color="000000" w:fill="ffffff" w:val="clear"/>
-            <w:tcMar>
-              <w:left w:w="0" w:type="dxa"/>
-              <w:right w:w="0" w:type="dxa"/>
-            </w:tcMar>
-            <w:vAlign w:val="center"/>
-          </w:tcPr>
-          <w:p>
-            <w:pPr>
-              <w:spacing w:before="57" w:after="0" w:line="240"/>
-              <w:ind w:right="0" w:left="0" w:firstLine="0"/>
-              <w:jc w:val="left"/>
-              <w:rPr>
-                <w:spacing w:val="0"/>
-                <w:position w:val="0"/>
-              </w:rPr>
-            </w:pPr>
-            <w:r>
-              <w:rPr>
-                <w:rFonts w:ascii="Open Sans SemiBold" w:hAnsi="Open Sans SemiBold" w:cs="Open Sans SemiBold" w:eastAsia="Open Sans SemiBold"/>
-                <w:color w:val="030303"/>
-                <w:spacing w:val="0"/>
-                <w:position w:val="0"/>
-                <w:sz w:val="20"/>
-                <w:shd w:fill="auto" w:val="clear"/>
-              </w:rPr>
-              <w:t/>
-            </w:r>
-            <w:r>
-              <w:rPr>
-                <w:rFonts w:ascii="Open Sans SemiBold" w:hAnsi="Open Sans SemiBold" w:cs="Open Sans SemiBold" w:eastAsia="Open Sans SemiBold"/>
-                <w:b/>
-                <w:color w:val="030303"/>
-                <w:spacing w:val="0"/>
-                <w:position w:val="0"/>
-                <w:sz w:val="20"/>
-                <w:shd w:fill="auto" w:val="clear"/>
-              </w:rPr>
-              <w:t xml:space="preserve">Gesamtbetrag nach Neukundenbonus</w:t>
-            </w:r>
-          </w:p>
-        </w:tc>
-        <w:tc>
-          <w:tcPr>
-            <w:tcW w:w="915" w:type="dxa"/>
-            <w:tcBorders>
-              <w:top w:val="single" w:color="ffffff" w:sz="8"/>
-              <w:left w:val="single" w:color="ffffff" w:sz="8"/>
-              <w:bottom w:val="single" w:color="ffffff" w:sz="8"/>
-              <w:right w:val="single" w:color="ffffff" w:sz="8"/>
-            </w:tcBorders>
-            <w:shd w:color="000000" w:fill="ffffff" w:val="clear"/>
-            <w:tcMar>
-              <w:left w:w="0" w:type="dxa"/>
-              <w:right w:w="0" w:type="dxa"/>
-            </w:tcMar>
-            <w:vAlign w:val="center"/>
-          </w:tcPr>
-          <w:p>
-            <w:pPr>
-              <w:spacing w:before="0" w:after="0" w:line="240"/>
-              <w:ind w:right="0" w:left="0" w:firstLine="0"/>
-              <w:jc w:val="left"/>
-              <w:rPr>
-                <w:rFonts w:ascii="Calibri" w:hAnsi="Calibri" w:cs="Calibri" w:eastAsia="Calibri"/>
-                <w:color w:val="auto"/>
-                <w:spacing w:val="0"/>
-                <w:position w:val="0"/>
-                <w:sz w:val="22"/>
-                <w:shd w:fill="auto" w:val="clear"/>
-              </w:rPr>
-            </w:pPr>
-          </w:p>
-        </w:tc>
-        <w:tc>
-          <w:tcPr>
-            <w:tcW w:w="2106" w:type="dxa"/>
-            <w:tcBorders>
-              <w:top w:val="single" w:color="ffffff" w:sz="8"/>
-              <w:left w:val="single" w:color="ffffff" w:sz="8"/>
-              <w:bottom w:val="single" w:color="ffffff" w:sz="8"/>
-              <w:right w:val="single" w:color="ffffff" w:sz="8"/>
-            </w:tcBorders>
-            <w:shd w:color="000000" w:fill="ffffff" w:val="clear"/>
-            <w:tcMar>
-              <w:left w:w="0" w:type="dxa"/>
-              <w:right w:w="0" w:type="dxa"/>
-            </w:tcMar>
-            <w:vAlign w:val="center"/>
-          </w:tcPr>
-          <w:p>
-            <w:pPr>
-              <w:spacing w:before="0" w:after="0" w:line="240"/>
-              <w:ind w:right="0" w:left="0" w:firstLine="0"/>
-              <w:jc w:val="left"/>
-              <w:rPr>
-                <w:rFonts w:ascii="Calibri" w:hAnsi="Calibri" w:cs="Calibri" w:eastAsia="Calibri"/>
-                <w:color w:val="auto"/>
-                <w:spacing w:val="0"/>
-                <w:position w:val="0"/>
-                <w:sz w:val="22"/>
-                <w:shd w:fill="auto" w:val="clear"/>
-              </w:rPr>
-            </w:pPr>
-          </w:p>
-        </w:tc>
-        <w:tc>
-          <w:tcPr>
-            <w:tcW w:w="2724" w:type="dxa"/>
-            <w:tcBorders>
-              <w:top w:val="single" w:color="ffffff" w:sz="8"/>
-              <w:left w:val="single" w:color="ffffff" w:sz="8"/>
-              <w:bottom w:val="single" w:color="ffffff" w:sz="8"/>
-              <w:right w:val="single" w:color="ffffff" w:sz="8"/>
-            </w:tcBorders>
-            <w:shd w:color="000000" w:fill="ffffff" w:val="clear"/>
-            <w:tcMar>
-              <w:left w:w="0" w:type="dxa"/>
-              <w:right w:w="0" w:type="dxa"/>
-            </w:tcMar>
-            <w:vAlign w:val="center"/>
-          </w:tcPr>
-          <w:p>
-            <w:pPr>
-              <w:spacing w:before="0" w:after="0" w:line="278"/>
-              <w:ind w:right="314" w:left="0" w:firstLine="0"/>
-              <w:jc w:val="right"/>
-              <w:rPr>
-                <w:color w:val="auto"/>
-                <w:spacing w:val="0"/>
-                <w:position w:val="0"/>
-                <w:sz w:val="22"/>
-              </w:rPr>
-            </w:pPr>
-            <w:r>
-              <w:rPr>
-                <w:rFonts w:ascii="Open Sans SemiBold" w:hAnsi="Open Sans SemiBold" w:cs="Open Sans SemiBold" w:eastAsia="Open Sans SemiBold"/>
-                <w:b/>
-                <w:color w:val="auto"/>
-                <w:spacing w:val="0"/>
-                <w:position w:val="0"/>
-                <w:sz w:val="22"/>
-                <w:shd w:fill="auto" w:val="clear"/>
-              </w:rPr>
-              <w:t xml:space="preserve">5.378,63 €</w:t>
-            </w:r>
-            <w:r>
-              <w:rPr>
-                <w:rFonts w:ascii="Open Sans SemiBold" w:hAnsi="Open Sans SemiBold" w:cs="Open Sans SemiBold" w:eastAsia="Open Sans SemiBold"/>
-                <w:color w:val="auto"/>
-                <w:spacing w:val="0"/>
-                <w:position w:val="0"/>
-                <w:sz w:val="22"/>
-                <w:shd w:fill="auto" w:val="clear"/>
-              </w:rPr>
-              <w:t/>
-            </w:r>
-          </w:p>
-        </w:tc>
-      </w:tr>
-      <w:tr>
-        <w:trPr>
-          <w:trHeight w:val="1" w:hRule="atLeast"/>
-          <w:jc w:val="left"/>
-        </w:trPr>
-        <w:tc>
-          <w:tcPr>
-            <w:tcW w:w="3915" w:type="dxa"/>
-            <w:tcBorders>
-              <w:top w:val="single" w:color="ffffff" w:sz="8"/>
-              <w:left w:val="single" w:color="d9d9d9" w:sz="8"/>
-              <w:bottom w:val="single" w:color="ffffff" w:sz="8"/>
-              <w:right w:val="single" w:color="d9d9d9" w:sz="8"/>
-            </w:tcBorders>
-            <w:shd w:color="000000" w:fill="d9d9d9" w:val="clear"/>
-            <w:tcMar>
-              <w:left w:w="0" w:type="dxa"/>
-              <w:right w:w="0" w:type="dxa"/>
-            </w:tcMar>
-            <w:vAlign w:val="center"/>
-          </w:tcPr>
-          <w:p>
-            <w:pPr>
-              <w:spacing w:before="56" w:after="0" w:line="240"/>
-              <w:ind w:right="0" w:left="50" w:firstLine="0"/>
-              <w:jc w:val="left"/>
-              <w:rPr>
-                <w:spacing w:val="0"/>
-                <w:position w:val="0"/>
-              </w:rPr>
-            </w:pPr>
-            <w:r>
-              <w:rPr>
-                <w:rFonts w:ascii="Open Sans SemiBold" w:hAnsi="Open Sans SemiBold" w:cs="Open Sans SemiBold" w:eastAsia="Open Sans SemiBold"/>
-                <w:color w:val="030303"/>
-                <w:spacing w:val="0"/>
-                <w:position w:val="0"/>
-                <w:sz w:val="20"/>
-                <w:shd w:fill="auto" w:val="clear"/>
-              </w:rPr>
-              <w:t/>
-            </w:r>
-            <w:r>
-              <w:rPr>
-                <w:rFonts w:ascii="Open Sans SemiBold" w:hAnsi="Open Sans SemiBold" w:cs="Open Sans SemiBold" w:eastAsia="Open Sans SemiBold"/>
-                <w:b/>
-                <w:color w:val="030303"/>
-                <w:spacing w:val="0"/>
-                <w:position w:val="0"/>
-                <w:sz w:val="20"/>
-                <w:shd w:fill="auto" w:val="clear"/>
-              </w:rPr>
-              <w:t xml:space="preserve">Zuschuss Krankenkasse</w:t>
-            </w:r>
-          </w:p>
-        </w:tc>
-        <w:tc>
-          <w:tcPr>
-            <w:tcW w:w="915" w:type="dxa"/>
-            <w:tcBorders>
-              <w:top w:val="single" w:color="ffffff" w:sz="8"/>
-              <w:left w:val="single" w:color="d9d9d9" w:sz="8"/>
-              <w:bottom w:val="single" w:color="ffffff" w:sz="8"/>
-              <w:right w:val="single" w:color="d9d9d9" w:sz="8"/>
-            </w:tcBorders>
-            <w:shd w:color="000000" w:fill="d9d9d9" w:val="clear"/>
-            <w:tcMar>
-              <w:left w:w="0" w:type="dxa"/>
-              <w:right w:w="0" w:type="dxa"/>
-            </w:tcMar>
-            <w:vAlign w:val="center"/>
-          </w:tcPr>
-          <w:p>
-            <w:pPr>
-              <w:spacing w:before="0" w:after="0" w:line="240"/>
-              <w:ind w:right="0" w:left="0" w:firstLine="0"/>
-              <w:jc w:val="left"/>
-              <w:rPr>
-                <w:rFonts w:ascii="Calibri" w:hAnsi="Calibri" w:cs="Calibri" w:eastAsia="Calibri"/>
-                <w:color w:val="auto"/>
-                <w:spacing w:val="0"/>
-                <w:position w:val="0"/>
-                <w:sz w:val="22"/>
-                <w:shd w:fill="auto" w:val="clear"/>
-              </w:rPr>
-            </w:pPr>
-          </w:p>
-        </w:tc>
-        <w:tc>
-          <w:tcPr>
-            <w:tcW w:w="2106" w:type="dxa"/>
-            <w:tcBorders>
-              <w:top w:val="single" w:color="ffffff" w:sz="8"/>
-              <w:left w:val="single" w:color="d9d9d9" w:sz="8"/>
-              <w:bottom w:val="single" w:color="ffffff" w:sz="8"/>
-              <w:right w:val="single" w:color="d9d9d9" w:sz="8"/>
-            </w:tcBorders>
-            <w:shd w:color="000000" w:fill="d9d9d9" w:val="clear"/>
-            <w:tcMar>
-              <w:left w:w="0" w:type="dxa"/>
-              <w:right w:w="0" w:type="dxa"/>
-            </w:tcMar>
-            <w:vAlign w:val="center"/>
-          </w:tcPr>
-          <w:p>
-            <w:pPr>
-              <w:spacing w:before="0" w:after="0" w:line="240"/>
-              <w:ind w:right="0" w:left="0" w:firstLine="0"/>
-              <w:jc w:val="left"/>
-              <w:rPr>
-                <w:rFonts w:ascii="Calibri" w:hAnsi="Calibri" w:cs="Calibri" w:eastAsia="Calibri"/>
-                <w:color w:val="auto"/>
-                <w:spacing w:val="0"/>
-                <w:position w:val="0"/>
-                <w:sz w:val="22"/>
-                <w:shd w:fill="auto" w:val="clear"/>
-              </w:rPr>
-            </w:pPr>
-          </w:p>
-        </w:tc>
-        <w:tc>
-          <w:tcPr>
-            <w:tcW w:w="2724" w:type="dxa"/>
-            <w:tcBorders>
-              <w:top w:val="single" w:color="ffffff" w:sz="8"/>
-              <w:left w:val="single" w:color="d9d9d9" w:sz="8"/>
-              <w:bottom w:val="single" w:color="ffffff" w:sz="8"/>
-              <w:right w:val="single" w:color="d9d9d9" w:sz="8"/>
-            </w:tcBorders>
-            <w:shd w:color="000000" w:fill="d9d9d9" w:val="clear"/>
-            <w:tcMar>
-              <w:left w:w="0" w:type="dxa"/>
-              <w:right w:w="0" w:type="dxa"/>
-            </w:tcMar>
-            <w:vAlign w:val="center"/>
-          </w:tcPr>
-          <w:p>
-            <w:pPr>
-              <w:spacing w:before="0" w:after="0" w:line="278"/>
-              <w:ind w:right="314" w:left="0" w:firstLine="0"/>
-              <w:jc w:val="right"/>
-              <w:rPr>
-                <w:color w:val="auto"/>
-                <w:spacing w:val="0"/>
-                <w:position w:val="0"/>
-                <w:sz w:val="22"/>
-              </w:rPr>
-            </w:pPr>
-            <w:r>
-              <w:rPr>
-                <w:rFonts w:ascii="Open Sans SemiBold" w:hAnsi="Open Sans SemiBold" w:cs="Open Sans SemiBold" w:eastAsia="Open Sans SemiBold"/>
-                <w:b/>
-                <w:color w:val="auto"/>
-                <w:spacing w:val="0"/>
-                <w:position w:val="0"/>
-                <w:sz w:val="22"/>
-                <w:shd w:fill="auto" w:val="clear"/>
-              </w:rPr>
-              <w:t xml:space="preserve">2.100,00 €</w:t>
-            </w:r>
-            <w:r>
-              <w:rPr>
-                <w:rFonts w:ascii="Open Sans SemiBold" w:hAnsi="Open Sans SemiBold" w:cs="Open Sans SemiBold" w:eastAsia="Open Sans SemiBold"/>
-                <w:color w:val="auto"/>
-                <w:spacing w:val="0"/>
-                <w:position w:val="0"/>
-                <w:sz w:val="22"/>
-                <w:shd w:fill="auto" w:val="clear"/>
-              </w:rPr>
-              <w:t/>
-            </w:r>
-          </w:p>
-        </w:tc>
-      </w:tr>
-      <w:tr>
-        <w:trPr>
-          <w:trHeight w:val="285" w:hRule="auto"/>
-          <w:jc w:val="left"/>
-        </w:trPr>
-        <w:tc>
-          <w:tcPr>
-            <w:tcW w:w="3915" w:type="dxa"/>
-            <w:tcBorders>
-              <w:top w:val="single" w:color="ffffff" w:sz="8"/>
-              <w:left w:val="single" w:color="ffffff" w:sz="8"/>
-              <w:bottom w:val="single" w:color="ffffff" w:sz="8"/>
-              <w:right w:val="single" w:color="ffffff" w:sz="8"/>
-            </w:tcBorders>
-            <w:shd w:color="000000" w:fill="ffffff" w:val="clear"/>
-            <w:tcMar>
-              <w:left w:w="0" w:type="dxa"/>
-              <w:right w:w="0" w:type="dxa"/>
-            </w:tcMar>
-            <w:vAlign w:val="center"/>
-          </w:tcPr>
-          <w:p>
-            <w:pPr>
-              <w:spacing w:before="57" w:after="0" w:line="240"/>
-              <w:ind w:right="0" w:left="0" w:firstLine="0"/>
-              <w:jc w:val="left"/>
-              <w:rPr>
-                <w:spacing w:val="0"/>
-                <w:position w:val="0"/>
-              </w:rPr>
-            </w:pPr>
-            <w:r>
-              <w:rPr>
-                <w:rFonts w:ascii="Open Sans SemiBold" w:hAnsi="Open Sans SemiBold" w:cs="Open Sans SemiBold" w:eastAsia="Open Sans SemiBold"/>
-                <w:color w:val="030303"/>
-                <w:spacing w:val="0"/>
-                <w:position w:val="0"/>
-                <w:sz w:val="20"/>
-                <w:shd w:fill="auto" w:val="clear"/>
-              </w:rPr>
-              <w:t/>
-            </w:r>
-            <w:r>
-              <w:rPr>
-                <w:rFonts w:ascii="Open Sans SemiBold" w:hAnsi="Open Sans SemiBold" w:cs="Open Sans SemiBold" w:eastAsia="Open Sans SemiBold"/>
-                <w:b/>
-                <w:color w:val="030303"/>
-                <w:spacing w:val="0"/>
-                <w:position w:val="0"/>
-                <w:sz w:val="20"/>
-                <w:shd w:fill="auto" w:val="clear"/>
-              </w:rPr>
-              <w:t xml:space="preserve">Selbstkostenanteil</w:t>
-            </w:r>
-          </w:p>
-        </w:tc>
-        <w:tc>
-          <w:tcPr>
-            <w:tcW w:w="915" w:type="dxa"/>
-            <w:tcBorders>
-              <w:top w:val="single" w:color="ffffff" w:sz="8"/>
-              <w:left w:val="single" w:color="ffffff" w:sz="8"/>
-              <w:bottom w:val="single" w:color="ffffff" w:sz="8"/>
-              <w:right w:val="single" w:color="ffffff" w:sz="8"/>
-            </w:tcBorders>
-            <w:shd w:color="000000" w:fill="ffffff" w:val="clear"/>
-            <w:tcMar>
-              <w:left w:w="0" w:type="dxa"/>
-              <w:right w:w="0" w:type="dxa"/>
-            </w:tcMar>
-            <w:vAlign w:val="center"/>
-          </w:tcPr>
-          <w:p>
-            <w:pPr>
-              <w:spacing w:before="0" w:after="0" w:line="240"/>
-              <w:ind w:right="0" w:left="0" w:firstLine="0"/>
-              <w:jc w:val="left"/>
-              <w:rPr>
-                <w:rFonts w:ascii="Calibri" w:hAnsi="Calibri" w:cs="Calibri" w:eastAsia="Calibri"/>
-                <w:color w:val="auto"/>
-                <w:spacing w:val="0"/>
-                <w:position w:val="0"/>
-                <w:sz w:val="22"/>
-                <w:shd w:fill="auto" w:val="clear"/>
-              </w:rPr>
-            </w:pPr>
-          </w:p>
-        </w:tc>
-        <w:tc>
-          <w:tcPr>
-            <w:tcW w:w="2106" w:type="dxa"/>
-            <w:tcBorders>
-              <w:top w:val="single" w:color="ffffff" w:sz="8"/>
-              <w:left w:val="single" w:color="ffffff" w:sz="8"/>
-              <w:bottom w:val="single" w:color="ffffff" w:sz="8"/>
-              <w:right w:val="single" w:color="ffffff" w:sz="8"/>
-            </w:tcBorders>
-            <w:shd w:color="000000" w:fill="ffffff" w:val="clear"/>
-            <w:tcMar>
-              <w:left w:w="0" w:type="dxa"/>
-              <w:right w:w="0" w:type="dxa"/>
-            </w:tcMar>
-            <w:vAlign w:val="center"/>
-          </w:tcPr>
-          <w:p>
-            <w:pPr>
-              <w:spacing w:before="0" w:after="0" w:line="240"/>
-              <w:ind w:right="0" w:left="0" w:firstLine="0"/>
-              <w:jc w:val="left"/>
-              <w:rPr>
-                <w:rFonts w:ascii="Calibri" w:hAnsi="Calibri" w:cs="Calibri" w:eastAsia="Calibri"/>
-                <w:color w:val="auto"/>
-                <w:spacing w:val="0"/>
-                <w:position w:val="0"/>
-                <w:sz w:val="22"/>
-                <w:shd w:fill="auto" w:val="clear"/>
-              </w:rPr>
-            </w:pPr>
-          </w:p>
-        </w:tc>
-        <w:tc>
-          <w:tcPr>
-            <w:tcW w:w="2724" w:type="dxa"/>
-            <w:tcBorders>
-              <w:top w:val="single" w:color="ffffff" w:sz="8"/>
-              <w:left w:val="single" w:color="ffffff" w:sz="8"/>
-              <w:bottom w:val="single" w:color="ffffff" w:sz="8"/>
-              <w:right w:val="single" w:color="ffffff" w:sz="8"/>
-            </w:tcBorders>
-            <w:shd w:color="000000" w:fill="ffffff" w:val="clear"/>
-            <w:tcMar>
-              <w:left w:w="0" w:type="dxa"/>
-              <w:right w:w="0" w:type="dxa"/>
-            </w:tcMar>
-            <w:vAlign w:val="center"/>
-          </w:tcPr>
-          <w:p>
-            <w:pPr>
-              <w:spacing w:before="0" w:after="0" w:line="278"/>
-              <w:ind w:right="314" w:left="0" w:firstLine="0"/>
-              <w:jc w:val="right"/>
-              <w:rPr>
-                <w:color w:val="auto"/>
-                <w:spacing w:val="0"/>
-                <w:position w:val="0"/>
-                <w:sz w:val="22"/>
-              </w:rPr>
-            </w:pPr>
-            <w:r>
-              <w:rPr>
-                <w:rFonts w:ascii="Open Sans SemiBold" w:hAnsi="Open Sans SemiBold" w:cs="Open Sans SemiBold" w:eastAsia="Open Sans SemiBold"/>
-                <w:b/>
-                <w:color w:val="auto"/>
-                <w:spacing w:val="0"/>
-                <w:position w:val="0"/>
-                <w:sz w:val="22"/>
-                <w:shd w:fill="auto" w:val="clear"/>
-              </w:rPr>
-              <w:t xml:space="preserve">3.278,63 €</w:t>
+              <w:t xml:space="preserve">3.114,18 €</w:t>
             </w:r>
             <w:r>
               <w:rPr>
@@ -3892,55 +3214,6 @@
           <w:shd w:fill="auto" w:val="clear"/>
         </w:rPr>
         <w:t xml:space="preserve">Diese werden vorab mit Ihnen besprochen, bedürfen lhrer Zustimmung und werden auf Regiebasis nach tatsächlichem Aufwand abgerechnet. (Stundensatz-Facharbeiter: 69,50€ netto)</w:t>
-        <w:br/>
-        <w:br/>
-        <w:t xml:space="preserve">Der Selbstkostenanteil beträgt </w:t>
-      </w:r>
-      <w:r>
-        <w:rPr>
-          <w:rFonts w:ascii="Open Sans" w:hAnsi="Open Sans" w:cs="Open Sans" w:eastAsia="Open Sans"/>
-          <w:b/>
-          <w:color w:val="030303"/>
-          <w:spacing w:val="0"/>
-          <w:position w:val="0"/>
-          <w:sz w:val="22"/>
-          <w:shd w:fill="auto" w:val="clear"/>
-        </w:rPr>
-        <w:t xml:space="preserve">3.278,63 €</w:t>
-      </w:r>
-      <w:r>
-        <w:rPr>
-          <w:rFonts w:ascii="Open Sans" w:hAnsi="Open Sans" w:cs="Open Sans" w:eastAsia="Open Sans"/>
-          <w:color w:val="030303"/>
-          <w:spacing w:val="0"/>
-          <w:position w:val="0"/>
-          <w:sz w:val="22"/>
-          <w:shd w:fill="auto" w:val="clear"/>
-        </w:rPr>
-        <w:t xml:space="preserve"> unter Berücksichtigung eines gewährten Zuschusses durch die Pflegekasse i.H.v. </w:t>
-      </w:r>
-      <w:r>
-        <w:rPr>
-          <w:rFonts w:ascii="Open Sans" w:hAnsi="Open Sans" w:cs="Open Sans" w:eastAsia="Open Sans"/>
-          <w:b/>
-          <w:color w:val="030303"/>
-          <w:spacing w:val="0"/>
-          <w:position w:val="0"/>
-          <w:sz w:val="22"/>
-          <w:shd w:fill="auto" w:val="clear"/>
-        </w:rPr>
-        <w:t xml:space="preserve">2.100,00 €</w:t>
-      </w:r>
-      <w:r>
-        <w:rPr>
-          <w:rFonts w:ascii="Open Sans" w:hAnsi="Open Sans" w:cs="Open Sans" w:eastAsia="Open Sans"/>
-          <w:color w:val="030303"/>
-          <w:spacing w:val="0"/>
-          <w:position w:val="0"/>
-          <w:sz w:val="22"/>
-          <w:shd w:fill="auto" w:val="clear"/>
-        </w:rPr>
-        <w:t xml:space="preserve">.</w:t>
       </w:r>
     </w:p>
     <w:p>

</xml_diff>

<commit_message>
top same or biggesr 3 duschwanne smart search
</commit_message>
<xml_diff>
--- a/out-Angebot.docx
+++ b/out-Angebot.docx
@@ -93,7 +93,7 @@
           <w:sz w:val="22"/>
           <w:shd w:fill="auto" w:val="clear"/>
         </w:rPr>
-        <w:t xml:space="preserve">Emma Gutierrez</w:t>
+        <w:t xml:space="preserve">Kareem Rowland</w:t>
       </w:r>
     </w:p>
     <w:p>
@@ -119,7 +119,7 @@
           <w:sz w:val="22"/>
           <w:shd w:fill="auto" w:val="clear"/>
         </w:rPr>
-        <w:t xml:space="preserve">Dolorem amet expedi,</w:t>
+        <w:t xml:space="preserve">Et a similique alias,</w:t>
       </w:r>
     </w:p>
     <w:p>
@@ -145,7 +145,7 @@
           <w:sz w:val="22"/>
           <w:shd w:fill="auto" w:val="clear"/>
         </w:rPr>
-        <w:t xml:space="preserve">Quasi est veniam au Consectetur reprehen</w:t>
+        <w:t xml:space="preserve">Magni provident hic Ab ad fuga Delectus</w:t>
       </w:r>
     </w:p>
     <w:tbl>
@@ -320,7 +320,7 @@
                 <w:sz w:val="22"/>
                 <w:shd w:fill="auto" w:val="clear"/>
               </w:rPr>
-              <w:t xml:space="preserve">Justina Keller</w:t>
+              <w:t xml:space="preserve">Sonya Sheppard</w:t>
             </w:r>
           </w:p>
         </w:tc>
@@ -363,7 +363,7 @@
                 <w:sz w:val="22"/>
                 <w:shd w:fill="auto" w:val="clear"/>
               </w:rPr>
-              <w:t xml:space="preserve">AN20250926092159</w:t>
+              <w:t xml:space="preserve">AN20250926141612</w:t>
             </w:r>
             <w:r>
               <w:rPr>
@@ -411,7 +411,7 @@
                 <w:sz w:val="22"/>
                 <w:shd w:fill="auto" w:val="clear"/>
               </w:rPr>
-              <w:t xml:space="preserve">1999-02-17</w:t>
+              <w:t xml:space="preserve">2014-11-02</w:t>
             </w:r>
             <w:r>
               <w:rPr>
@@ -455,7 +455,7 @@
                 <w:sz w:val="22"/>
                 <w:shd w:fill="auto" w:val="clear"/>
               </w:rPr>
-              <w:t xml:space="preserve">Aidan Langley</w:t>
+              <w:t xml:space="preserve">Blossom Barron</w:t>
             </w:r>
             <w:r>
               <w:rPr>
@@ -617,7 +617,7 @@
           <w:sz w:val="24"/>
           <w:shd w:fill="auto" w:val="clear"/>
         </w:rPr>
-        <w:t xml:space="preserve">  Ihr Angebot AN20250926092159</w:t>
+        <w:t xml:space="preserve">  Ihr Angebot AN20250926141612</w:t>
       </w:r>
     </w:p>
     <w:p>
@@ -643,7 +643,7 @@
           <w:sz w:val="22"/>
           <w:shd w:fill="auto" w:val="clear"/>
         </w:rPr>
-        <w:t xml:space="preserve">  Sehr geehrte Frau Gutierrez,</w:t>
+        <w:t xml:space="preserve">  Sehr geehrte Frau Rowland,</w:t>
         <w:br/>
       </w:r>
     </w:p>
@@ -1072,7 +1072,7 @@
                 <w:sz w:val="20"/>
                 <w:shd w:fill="auto" w:val="clear"/>
               </w:rPr>
-              <w:t xml:space="preserve">1.717,60 €</w:t>
+              <w:t xml:space="preserve">1.065,00 €</w:t>
             </w:r>
           </w:p>
         </w:tc>
@@ -1112,7 +1112,7 @@
                 <w:sz w:val="20"/>
                 <w:shd w:fill="auto" w:val="clear"/>
               </w:rPr>
-              <w:t xml:space="preserve">1.717,60 €</w:t>
+              <w:t xml:space="preserve">1.065,00 €</w:t>
             </w:r>
           </w:p>
         </w:tc>
@@ -1452,32 +1452,6 @@
                 <w:shd w:fill="auto" w:val="clear"/>
               </w:rPr>
               <w:t xml:space="preserve">- 1,00 Stk Beräumung der Baustelle</w:t>
-            </w:r>
-          </w:p>
-          <w:p>
-            <w:pPr>
-              <w:spacing w:before="0" w:after="0" w:line="278"/>
-              <w:ind w:right="314" w:left="0" w:firstLine="0"/>
-              <w:jc w:val="left"/>
-              <w:rPr>
-                <w:rFonts w:ascii="Open Sans" w:hAnsi="Open Sans" w:cs="Open Sans" w:eastAsia="Open Sans"/>
-                <w:color w:val="auto"/>
-                <w:spacing w:val="0"/>
-                <w:position w:val="0"/>
-                <w:sz w:val="18"/>
-                <w:shd w:fill="auto" w:val="clear"/>
-              </w:rPr>
-            </w:pPr>
-            <w:r>
-              <w:rPr>
-                <w:rFonts w:ascii="Open Sans" w:hAnsi="Open Sans" w:cs="Open Sans" w:eastAsia="Open Sans"/>
-                <w:color w:val="auto"/>
-                <w:spacing w:val="0"/>
-                <w:position w:val="0"/>
-                <w:sz w:val="18"/>
-                <w:shd w:fill="auto" w:val="clear"/>
-              </w:rPr>
-              <w:t xml:space="preserve">- 138 km Kilometerpauschale </w:t>
             </w:r>
           </w:p>
           <w:p>
@@ -1965,7 +1939,7 @@
                 <w:sz w:val="20"/>
                 <w:shd w:fill="auto" w:val="clear"/>
               </w:rPr>
-              <w:t xml:space="preserve">599,57 €</w:t>
+              <w:t xml:space="preserve">533,06 €</w:t>
             </w:r>
           </w:p>
         </w:tc>
@@ -2005,7 +1979,7 @@
                 <w:sz w:val="20"/>
                 <w:shd w:fill="auto" w:val="clear"/>
               </w:rPr>
-              <w:t xml:space="preserve">599,57 €</w:t>
+              <w:t xml:space="preserve">533,06 €</w:t>
             </w:r>
           </w:p>
         </w:tc>
@@ -2292,7 +2266,7 @@
                 <w:sz w:val="20"/>
                 <w:shd w:fill="auto" w:val="clear"/>
               </w:rPr>
-              <w:t xml:space="preserve">- 1 Stk TRINNITY Wannenabdichtband-Set 3,4 m Nass-/Trockenanbindung entspr. DIN 18534</w:t>
+              <w:t xml:space="preserve">- 1 Stk Ablaufgarnitur Rohbauset m. Sifon BH60mm f. Flache Duschw. m. 90mm Ablauf TRINNITY</w:t>
             </w:r>
           </w:p>
           <w:p>
@@ -2318,7 +2292,7 @@
                 <w:sz w:val="20"/>
                 <w:shd w:fill="auto" w:val="clear"/>
               </w:rPr>
-              <w:t xml:space="preserve">- 1 Stk Ablaufgarnitur Rohbauset m. Sifon BH60mm f. Flache Duschw. m. 90mm Ablauf TRINNITY</w:t>
+              <w:t xml:space="preserve">- 4 Stk Fußboden-Paneele (1 m² = 4 Paneele)</w:t>
             </w:r>
           </w:p>
           <w:p>
@@ -2344,7 +2318,7 @@
                 <w:sz w:val="20"/>
                 <w:shd w:fill="auto" w:val="clear"/>
               </w:rPr>
-              <w:t xml:space="preserve">- 1 Stk Kleinmaterial groß</w:t>
+              <w:t xml:space="preserve">- 2 Pkg Flächenkleber (1 Pkg je 0,60 m²)</w:t>
             </w:r>
           </w:p>
           <w:p>
@@ -2396,7 +2370,7 @@
                 <w:sz w:val="20"/>
                 <w:shd w:fill="auto" w:val="clear"/>
               </w:rPr>
-              <w:t xml:space="preserve">- 4 Stk Wandverkleidungsklebstoff 3.0/4.0</w:t>
+              <w:t xml:space="preserve">- 3 Stk Abschlussprofil 3.0 255 cm silber eloxiert VIGOUR</w:t>
             </w:r>
           </w:p>
           <w:p>
@@ -2422,7 +2396,7 @@
                 <w:sz w:val="20"/>
                 <w:shd w:fill="auto" w:val="clear"/>
               </w:rPr>
-              <w:t xml:space="preserve">- 2 Stk Abschlussprofil 3.0 255 cm silber eloxiert VIGOUR</w:t>
+              <w:t xml:space="preserve">- 3 Stk Verbindungsprofil(e) (Plattenanzahl - 1)</w:t>
             </w:r>
           </w:p>
           <w:p>
@@ -2448,33 +2422,7 @@
                 <w:sz w:val="20"/>
                 <w:shd w:fill="auto" w:val="clear"/>
               </w:rPr>
-              <w:t xml:space="preserve">- 2 Stk Verbindungsprofil(e) (Plattenanzahl - 1)</w:t>
-            </w:r>
-          </w:p>
-          <w:p>
-            <w:pPr>
-              <w:spacing w:before="0" w:after="0" w:line="278"/>
-              <w:ind w:right="314" w:left="0" w:firstLine="0"/>
-              <w:jc w:val="left"/>
-              <w:rPr>
-                <w:rFonts w:ascii="Open Sans" w:hAnsi="Open Sans" w:cs="Open Sans" w:eastAsia="Open Sans"/>
-                <w:color w:val="auto"/>
-                <w:spacing w:val="0"/>
-                <w:position w:val="0"/>
-                <w:sz w:val="20"/>
-                <w:shd w:fill="auto" w:val="clear"/>
-              </w:rPr>
-            </w:pPr>
-            <w:r>
-              <w:rPr>
-                <w:rFonts w:ascii="Open Sans" w:hAnsi="Open Sans" w:cs="Open Sans" w:eastAsia="Open Sans"/>
-                <w:color w:val="auto"/>
-                <w:spacing w:val="0"/>
-                <w:position w:val="0"/>
-                <w:sz w:val="20"/>
-                <w:shd w:fill="auto" w:val="clear"/>
-              </w:rPr>
-              <w:t xml:space="preserve">- 2 Stk Profilklebstoff (pro Abschlussprofil 1 Stk)</w:t>
+              <w:t xml:space="preserve">- 3 Stk Profilklebstoff (pro Abschlussprofil 1 Stk)</w:t>
             </w:r>
           </w:p>
         </w:tc>
@@ -2623,7 +2571,7 @@
                 <w:sz w:val="20"/>
                 <w:shd w:fill="auto" w:val="clear"/>
               </w:rPr>
-              <w:t xml:space="preserve">Nettobetrag</w:t>
+              <w:t xml:space="preserve">Nettobetrag (ohne Rabatt)</w:t>
             </w:r>
           </w:p>
         </w:tc>
@@ -2729,7 +2677,7 @@
                 <w:sz w:val="22"/>
                 <w:shd w:fill="auto" w:val="clear"/>
               </w:rPr>
-              <w:t xml:space="preserve">2.616,96 €</w:t>
+              <w:t xml:space="preserve">1.864,59 €</w:t>
             </w:r>
             <w:r>
               <w:rPr>
@@ -2797,7 +2745,7 @@
                 <w:sz w:val="20"/>
                 <w:shd w:fill="auto" w:val="clear"/>
               </w:rPr>
-              <w:t xml:space="preserve">zzgl. 19% MwSt.</w:t>
+              <w:t xml:space="preserve">Rabatt</w:t>
             </w:r>
           </w:p>
         </w:tc>
@@ -2903,7 +2851,7 @@
                 <w:sz w:val="22"/>
                 <w:shd w:fill="auto" w:val="clear"/>
               </w:rPr>
-              <w:t xml:space="preserve">497,22 €</w:t>
+              <w:t xml:space="preserve">47,98 €</w:t>
             </w:r>
             <w:r>
               <w:rPr>
@@ -2971,7 +2919,7 @@
                 <w:sz w:val="20"/>
                 <w:shd w:fill="auto" w:val="clear"/>
               </w:rPr>
-              <w:t xml:space="preserve">Gesamtsumme</w:t>
+              <w:t xml:space="preserve">zzgl. 19% MwSt.</w:t>
             </w:r>
           </w:p>
         </w:tc>
@@ -3077,7 +3025,355 @@
                 <w:sz w:val="22"/>
                 <w:shd w:fill="auto" w:val="clear"/>
               </w:rPr>
-              <w:t xml:space="preserve">3.114,18 €</w:t>
+              <w:t xml:space="preserve">354,27 €</w:t>
+            </w:r>
+            <w:r>
+              <w:rPr>
+                <w:rFonts w:ascii="Open Sans SemiBold" w:hAnsi="Open Sans SemiBold" w:cs="Open Sans SemiBold" w:eastAsia="Open Sans SemiBold"/>
+                <w:color w:val="auto"/>
+                <w:spacing w:val="0"/>
+                <w:position w:val="0"/>
+                <w:sz w:val="22"/>
+                <w:shd w:fill="auto" w:val="clear"/>
+              </w:rPr>
+              <w:t/>
+            </w:r>
+          </w:p>
+        </w:tc>
+      </w:tr>
+      <w:tr>
+        <w:trPr>
+          <w:trHeight w:val="285" w:hRule="auto"/>
+          <w:jc w:val="left"/>
+        </w:trPr>
+        <w:tc>
+          <w:tcPr>
+            <w:tcW w:w="3915" w:type="dxa"/>
+            <w:tcBorders>
+              <w:top w:val="single" w:color="ffffff" w:sz="8"/>
+              <w:left w:val="single" w:color="ffffff" w:sz="8"/>
+              <w:bottom w:val="single" w:color="ffffff" w:sz="8"/>
+              <w:right w:val="single" w:color="ffffff" w:sz="8"/>
+            </w:tcBorders>
+            <w:shd w:color="000000" w:fill="ffffff" w:val="clear"/>
+            <w:tcMar>
+              <w:left w:w="0" w:type="dxa"/>
+              <w:right w:w="0" w:type="dxa"/>
+            </w:tcMar>
+            <w:vAlign w:val="center"/>
+          </w:tcPr>
+          <w:p>
+            <w:pPr>
+              <w:spacing w:before="57" w:after="0" w:line="240"/>
+              <w:ind w:right="0" w:left="0" w:firstLine="0"/>
+              <w:jc w:val="left"/>
+              <w:rPr>
+                <w:spacing w:val="0"/>
+                <w:position w:val="0"/>
+              </w:rPr>
+            </w:pPr>
+            <w:r>
+              <w:rPr>
+                <w:rFonts w:ascii="Open Sans SemiBold" w:hAnsi="Open Sans SemiBold" w:cs="Open Sans SemiBold" w:eastAsia="Open Sans SemiBold"/>
+                <w:color w:val="030303"/>
+                <w:spacing w:val="0"/>
+                <w:position w:val="0"/>
+                <w:sz w:val="20"/>
+                <w:shd w:fill="auto" w:val="clear"/>
+              </w:rPr>
+              <w:t/>
+            </w:r>
+            <w:r>
+              <w:rPr>
+                <w:rFonts w:ascii="Open Sans SemiBold" w:hAnsi="Open Sans SemiBold" w:cs="Open Sans SemiBold" w:eastAsia="Open Sans SemiBold"/>
+                <w:b/>
+                <w:color w:val="030303"/>
+                <w:spacing w:val="0"/>
+                <w:position w:val="0"/>
+                <w:sz w:val="20"/>
+                <w:shd w:fill="auto" w:val="clear"/>
+              </w:rPr>
+              <w:t xml:space="preserve">Gesamtsumme</w:t>
+            </w:r>
+          </w:p>
+        </w:tc>
+        <w:tc>
+          <w:tcPr>
+            <w:tcW w:w="915" w:type="dxa"/>
+            <w:tcBorders>
+              <w:top w:val="single" w:color="ffffff" w:sz="8"/>
+              <w:left w:val="single" w:color="ffffff" w:sz="8"/>
+              <w:bottom w:val="single" w:color="ffffff" w:sz="8"/>
+              <w:right w:val="single" w:color="ffffff" w:sz="8"/>
+            </w:tcBorders>
+            <w:shd w:color="000000" w:fill="ffffff" w:val="clear"/>
+            <w:tcMar>
+              <w:left w:w="0" w:type="dxa"/>
+              <w:right w:w="0" w:type="dxa"/>
+            </w:tcMar>
+            <w:vAlign w:val="center"/>
+          </w:tcPr>
+          <w:p>
+            <w:pPr>
+              <w:spacing w:before="0" w:after="0" w:line="240"/>
+              <w:ind w:right="0" w:left="0" w:firstLine="0"/>
+              <w:jc w:val="left"/>
+              <w:rPr>
+                <w:rFonts w:ascii="Calibri" w:hAnsi="Calibri" w:cs="Calibri" w:eastAsia="Calibri"/>
+                <w:color w:val="auto"/>
+                <w:spacing w:val="0"/>
+                <w:position w:val="0"/>
+                <w:sz w:val="22"/>
+                <w:shd w:fill="auto" w:val="clear"/>
+              </w:rPr>
+            </w:pPr>
+          </w:p>
+        </w:tc>
+        <w:tc>
+          <w:tcPr>
+            <w:tcW w:w="2106" w:type="dxa"/>
+            <w:tcBorders>
+              <w:top w:val="single" w:color="ffffff" w:sz="8"/>
+              <w:left w:val="single" w:color="ffffff" w:sz="8"/>
+              <w:bottom w:val="single" w:color="ffffff" w:sz="8"/>
+              <w:right w:val="single" w:color="ffffff" w:sz="8"/>
+            </w:tcBorders>
+            <w:shd w:color="000000" w:fill="ffffff" w:val="clear"/>
+            <w:tcMar>
+              <w:left w:w="0" w:type="dxa"/>
+              <w:right w:w="0" w:type="dxa"/>
+            </w:tcMar>
+            <w:vAlign w:val="center"/>
+          </w:tcPr>
+          <w:p>
+            <w:pPr>
+              <w:spacing w:before="0" w:after="0" w:line="240"/>
+              <w:ind w:right="0" w:left="0" w:firstLine="0"/>
+              <w:jc w:val="left"/>
+              <w:rPr>
+                <w:rFonts w:ascii="Calibri" w:hAnsi="Calibri" w:cs="Calibri" w:eastAsia="Calibri"/>
+                <w:color w:val="auto"/>
+                <w:spacing w:val="0"/>
+                <w:position w:val="0"/>
+                <w:sz w:val="22"/>
+                <w:shd w:fill="auto" w:val="clear"/>
+              </w:rPr>
+            </w:pPr>
+          </w:p>
+        </w:tc>
+        <w:tc>
+          <w:tcPr>
+            <w:tcW w:w="2724" w:type="dxa"/>
+            <w:tcBorders>
+              <w:top w:val="single" w:color="ffffff" w:sz="8"/>
+              <w:left w:val="single" w:color="ffffff" w:sz="8"/>
+              <w:bottom w:val="single" w:color="ffffff" w:sz="8"/>
+              <w:right w:val="single" w:color="ffffff" w:sz="8"/>
+            </w:tcBorders>
+            <w:shd w:color="000000" w:fill="ffffff" w:val="clear"/>
+            <w:tcMar>
+              <w:left w:w="0" w:type="dxa"/>
+              <w:right w:w="0" w:type="dxa"/>
+            </w:tcMar>
+            <w:vAlign w:val="center"/>
+          </w:tcPr>
+          <w:p>
+            <w:pPr>
+              <w:spacing w:before="0" w:after="0" w:line="278"/>
+              <w:ind w:right="314" w:left="0" w:firstLine="0"/>
+              <w:jc w:val="right"/>
+              <w:rPr>
+                <w:color w:val="auto"/>
+                <w:spacing w:val="0"/>
+                <w:position w:val="0"/>
+                <w:sz w:val="22"/>
+              </w:rPr>
+            </w:pPr>
+            <w:r>
+              <w:rPr>
+                <w:rFonts w:ascii="Open Sans SemiBold" w:hAnsi="Open Sans SemiBold" w:cs="Open Sans SemiBold" w:eastAsia="Open Sans SemiBold"/>
+                <w:b/>
+                <w:color w:val="auto"/>
+                <w:spacing w:val="0"/>
+                <w:position w:val="0"/>
+                <w:sz w:val="22"/>
+                <w:shd w:fill="auto" w:val="clear"/>
+              </w:rPr>
+              <w:t xml:space="preserve">2.218,86 €</w:t>
+            </w:r>
+            <w:r>
+              <w:rPr>
+                <w:rFonts w:ascii="Open Sans SemiBold" w:hAnsi="Open Sans SemiBold" w:cs="Open Sans SemiBold" w:eastAsia="Open Sans SemiBold"/>
+                <w:color w:val="auto"/>
+                <w:spacing w:val="0"/>
+                <w:position w:val="0"/>
+                <w:sz w:val="22"/>
+                <w:shd w:fill="auto" w:val="clear"/>
+              </w:rPr>
+              <w:t/>
+            </w:r>
+          </w:p>
+        </w:tc>
+      </w:tr>
+      <w:tr>
+        <w:trPr>
+          <w:trHeight w:val="1" w:hRule="atLeast"/>
+          <w:jc w:val="left"/>
+        </w:trPr>
+        <w:tc>
+          <w:tcPr>
+            <w:tcW w:w="3915" w:type="dxa"/>
+            <w:tcBorders>
+              <w:top w:val="single" w:color="ffffff" w:sz="8"/>
+              <w:left w:val="single" w:color="d9d9d9" w:sz="8"/>
+              <w:bottom w:val="single" w:color="ffffff" w:sz="8"/>
+              <w:right w:val="single" w:color="d9d9d9" w:sz="8"/>
+            </w:tcBorders>
+            <w:shd w:color="000000" w:fill="d9d9d9" w:val="clear"/>
+            <w:tcMar>
+              <w:left w:w="0" w:type="dxa"/>
+              <w:right w:w="0" w:type="dxa"/>
+            </w:tcMar>
+            <w:vAlign w:val="center"/>
+          </w:tcPr>
+          <w:p>
+            <w:pPr>
+              <w:spacing w:before="56" w:after="0" w:line="240"/>
+              <w:ind w:right="0" w:left="50" w:firstLine="0"/>
+              <w:jc w:val="left"/>
+              <w:rPr>
+                <w:spacing w:val="0"/>
+                <w:position w:val="0"/>
+              </w:rPr>
+            </w:pPr>
+            <w:r>
+              <w:rPr>
+                <w:rFonts w:ascii="Open Sans SemiBold" w:hAnsi="Open Sans SemiBold" w:cs="Open Sans SemiBold" w:eastAsia="Open Sans SemiBold"/>
+                <w:color w:val="030303"/>
+                <w:spacing w:val="0"/>
+                <w:position w:val="0"/>
+                <w:sz w:val="20"/>
+                <w:shd w:fill="auto" w:val="clear"/>
+              </w:rPr>
+              <w:t/>
+            </w:r>
+            <w:r>
+              <w:rPr>
+                <w:rFonts w:ascii="Open Sans SemiBold" w:hAnsi="Open Sans SemiBold" w:cs="Open Sans SemiBold" w:eastAsia="Open Sans SemiBold"/>
+                <w:b/>
+                <w:color w:val="030303"/>
+                <w:spacing w:val="0"/>
+                <w:position w:val="0"/>
+                <w:sz w:val="20"/>
+                <w:shd w:fill="auto" w:val="clear"/>
+              </w:rPr>
+              <w:t xml:space="preserve">Gesamtbetrag nach Materialrabatt</w:t>
+            </w:r>
+          </w:p>
+        </w:tc>
+        <w:tc>
+          <w:tcPr>
+            <w:tcW w:w="915" w:type="dxa"/>
+            <w:tcBorders>
+              <w:top w:val="single" w:color="ffffff" w:sz="8"/>
+              <w:left w:val="single" w:color="d9d9d9" w:sz="8"/>
+              <w:bottom w:val="single" w:color="ffffff" w:sz="8"/>
+              <w:right w:val="single" w:color="d9d9d9" w:sz="8"/>
+            </w:tcBorders>
+            <w:shd w:color="000000" w:fill="d9d9d9" w:val="clear"/>
+            <w:tcMar>
+              <w:left w:w="0" w:type="dxa"/>
+              <w:right w:w="0" w:type="dxa"/>
+            </w:tcMar>
+            <w:vAlign w:val="center"/>
+          </w:tcPr>
+          <w:p>
+            <w:pPr>
+              <w:spacing w:before="0" w:after="0" w:line="240"/>
+              <w:ind w:right="0" w:left="0" w:firstLine="0"/>
+              <w:jc w:val="left"/>
+              <w:rPr>
+                <w:rFonts w:ascii="Calibri" w:hAnsi="Calibri" w:cs="Calibri" w:eastAsia="Calibri"/>
+                <w:color w:val="auto"/>
+                <w:spacing w:val="0"/>
+                <w:position w:val="0"/>
+                <w:sz w:val="22"/>
+                <w:shd w:fill="auto" w:val="clear"/>
+              </w:rPr>
+            </w:pPr>
+          </w:p>
+        </w:tc>
+        <w:tc>
+          <w:tcPr>
+            <w:tcW w:w="2106" w:type="dxa"/>
+            <w:tcBorders>
+              <w:top w:val="single" w:color="ffffff" w:sz="8"/>
+              <w:left w:val="single" w:color="d9d9d9" w:sz="8"/>
+              <w:bottom w:val="single" w:color="ffffff" w:sz="8"/>
+              <w:right w:val="single" w:color="d9d9d9" w:sz="8"/>
+            </w:tcBorders>
+            <w:shd w:color="000000" w:fill="d9d9d9" w:val="clear"/>
+            <w:tcMar>
+              <w:left w:w="0" w:type="dxa"/>
+              <w:right w:w="0" w:type="dxa"/>
+            </w:tcMar>
+            <w:vAlign w:val="center"/>
+          </w:tcPr>
+          <w:p>
+            <w:pPr>
+              <w:spacing w:before="0" w:after="0" w:line="240"/>
+              <w:ind w:right="0" w:left="0" w:firstLine="0"/>
+              <w:jc w:val="left"/>
+              <w:rPr>
+                <w:rFonts w:ascii="Calibri" w:hAnsi="Calibri" w:cs="Calibri" w:eastAsia="Calibri"/>
+                <w:color w:val="auto"/>
+                <w:spacing w:val="0"/>
+                <w:position w:val="0"/>
+                <w:sz w:val="22"/>
+                <w:shd w:fill="auto" w:val="clear"/>
+              </w:rPr>
+            </w:pPr>
+          </w:p>
+        </w:tc>
+        <w:tc>
+          <w:tcPr>
+            <w:tcW w:w="2724" w:type="dxa"/>
+            <w:tcBorders>
+              <w:top w:val="single" w:color="ffffff" w:sz="8"/>
+              <w:left w:val="single" w:color="d9d9d9" w:sz="8"/>
+              <w:bottom w:val="single" w:color="ffffff" w:sz="8"/>
+              <w:right w:val="single" w:color="d9d9d9" w:sz="8"/>
+            </w:tcBorders>
+            <w:shd w:color="000000" w:fill="d9d9d9" w:val="clear"/>
+            <w:tcMar>
+              <w:left w:w="0" w:type="dxa"/>
+              <w:right w:w="0" w:type="dxa"/>
+            </w:tcMar>
+            <w:vAlign w:val="center"/>
+          </w:tcPr>
+          <w:p>
+            <w:pPr>
+              <w:spacing w:before="0" w:after="0" w:line="278"/>
+              <w:ind w:right="314" w:left="0" w:firstLine="0"/>
+              <w:jc w:val="right"/>
+              <w:rPr>
+                <w:color w:val="auto"/>
+                <w:spacing w:val="0"/>
+                <w:position w:val="0"/>
+                <w:sz w:val="22"/>
+              </w:rPr>
+            </w:pPr>
+            <w:r>
+              <w:rPr>
+                <w:rFonts w:ascii="Open Sans SemiBold" w:hAnsi="Open Sans SemiBold" w:cs="Open Sans SemiBold" w:eastAsia="Open Sans SemiBold"/>
+                <w:b/>
+                <w:color w:val="auto"/>
+                <w:spacing w:val="0"/>
+                <w:position w:val="0"/>
+                <w:sz w:val="22"/>
+                <w:shd w:fill="auto" w:val="clear"/>
+              </w:rPr>
+              <w:t xml:space="preserve">2.161,77 €</w:t>
             </w:r>
             <w:r>
               <w:rPr>

</xml_diff>

<commit_message>
duschwanne added to the docment generated and to the kostendetails
</commit_message>
<xml_diff>
--- a/out-Angebot.docx
+++ b/out-Angebot.docx
@@ -93,7 +93,7 @@
           <w:sz w:val="22"/>
           <w:shd w:fill="auto" w:val="clear"/>
         </w:rPr>
-        <w:t xml:space="preserve">Kareem Rowland</w:t>
+        <w:t xml:space="preserve">Quintessa Dickerson</w:t>
       </w:r>
     </w:p>
     <w:p>
@@ -119,7 +119,7 @@
           <w:sz w:val="22"/>
           <w:shd w:fill="auto" w:val="clear"/>
         </w:rPr>
-        <w:t xml:space="preserve">Et a similique alias,</w:t>
+        <w:t xml:space="preserve">Dolores placeat nob,</w:t>
       </w:r>
     </w:p>
     <w:p>
@@ -145,7 +145,7 @@
           <w:sz w:val="22"/>
           <w:shd w:fill="auto" w:val="clear"/>
         </w:rPr>
-        <w:t xml:space="preserve">Magni provident hic Ab ad fuga Delectus</w:t>
+        <w:t xml:space="preserve">Voluptatum excepturi Praesentium qui comm</w:t>
       </w:r>
     </w:p>
     <w:tbl>
@@ -320,7 +320,7 @@
                 <w:sz w:val="22"/>
                 <w:shd w:fill="auto" w:val="clear"/>
               </w:rPr>
-              <w:t xml:space="preserve">Sonya Sheppard</w:t>
+              <w:t xml:space="preserve">Levi Rosales</w:t>
             </w:r>
           </w:p>
         </w:tc>
@@ -363,7 +363,7 @@
                 <w:sz w:val="22"/>
                 <w:shd w:fill="auto" w:val="clear"/>
               </w:rPr>
-              <w:t xml:space="preserve">AN20250926141612</w:t>
+              <w:t xml:space="preserve">AN20250926171623</w:t>
             </w:r>
             <w:r>
               <w:rPr>
@@ -411,7 +411,7 @@
                 <w:sz w:val="22"/>
                 <w:shd w:fill="auto" w:val="clear"/>
               </w:rPr>
-              <w:t xml:space="preserve">2014-11-02</w:t>
+              <w:t xml:space="preserve">1973-10-19</w:t>
             </w:r>
             <w:r>
               <w:rPr>
@@ -455,7 +455,7 @@
                 <w:sz w:val="22"/>
                 <w:shd w:fill="auto" w:val="clear"/>
               </w:rPr>
-              <w:t xml:space="preserve">Blossom Barron</w:t>
+              <w:t xml:space="preserve">Audrey Key</w:t>
             </w:r>
             <w:r>
               <w:rPr>
@@ -617,7 +617,7 @@
           <w:sz w:val="24"/>
           <w:shd w:fill="auto" w:val="clear"/>
         </w:rPr>
-        <w:t xml:space="preserve">  Ihr Angebot AN20250926141612</w:t>
+        <w:t xml:space="preserve">  Ihr Angebot AN20250926171623</w:t>
       </w:r>
     </w:p>
     <w:p>
@@ -643,7 +643,7 @@
           <w:sz w:val="22"/>
           <w:shd w:fill="auto" w:val="clear"/>
         </w:rPr>
-        <w:t xml:space="preserve">  Sehr geehrte Frau Rowland,</w:t>
+        <w:t xml:space="preserve">  Sehr geehrte Frau Dickerson,</w:t>
         <w:br/>
       </w:r>
     </w:p>
@@ -1072,7 +1072,7 @@
                 <w:sz w:val="20"/>
                 <w:shd w:fill="auto" w:val="clear"/>
               </w:rPr>
-              <w:t xml:space="preserve">1.065,00 €</w:t>
+              <w:t xml:space="preserve">1.111,20 €</w:t>
             </w:r>
           </w:p>
         </w:tc>
@@ -1112,7 +1112,7 @@
                 <w:sz w:val="20"/>
                 <w:shd w:fill="auto" w:val="clear"/>
               </w:rPr>
-              <w:t xml:space="preserve">1.065,00 €</w:t>
+              <w:t xml:space="preserve">1.111,20 €</w:t>
             </w:r>
           </w:p>
         </w:tc>
@@ -1452,6 +1452,32 @@
                 <w:shd w:fill="auto" w:val="clear"/>
               </w:rPr>
               <w:t xml:space="preserve">- 1,00 Stk Beräumung der Baustelle</w:t>
+            </w:r>
+          </w:p>
+          <w:p>
+            <w:pPr>
+              <w:spacing w:before="0" w:after="0" w:line="278"/>
+              <w:ind w:right="314" w:left="0" w:firstLine="0"/>
+              <w:jc w:val="left"/>
+              <w:rPr>
+                <w:rFonts w:ascii="Open Sans" w:hAnsi="Open Sans" w:cs="Open Sans" w:eastAsia="Open Sans"/>
+                <w:color w:val="auto"/>
+                <w:spacing w:val="0"/>
+                <w:position w:val="0"/>
+                <w:sz w:val="18"/>
+                <w:shd w:fill="auto" w:val="clear"/>
+              </w:rPr>
+            </w:pPr>
+            <w:r>
+              <w:rPr>
+                <w:rFonts w:ascii="Open Sans" w:hAnsi="Open Sans" w:cs="Open Sans" w:eastAsia="Open Sans"/>
+                <w:color w:val="auto"/>
+                <w:spacing w:val="0"/>
+                <w:position w:val="0"/>
+                <w:sz w:val="18"/>
+                <w:shd w:fill="auto" w:val="clear"/>
+              </w:rPr>
+              <w:t xml:space="preserve">- 66 km Kilometerpauschale </w:t>
             </w:r>
           </w:p>
           <w:p>
@@ -1939,7 +1965,7 @@
                 <w:sz w:val="20"/>
                 <w:shd w:fill="auto" w:val="clear"/>
               </w:rPr>
-              <w:t xml:space="preserve">533,06 €</w:t>
+              <w:t xml:space="preserve">526,11 €</w:t>
             </w:r>
           </w:p>
         </w:tc>
@@ -1979,7 +2005,7 @@
                 <w:sz w:val="20"/>
                 <w:shd w:fill="auto" w:val="clear"/>
               </w:rPr>
-              <w:t xml:space="preserve">533,06 €</w:t>
+              <w:t xml:space="preserve">526,11 €</w:t>
             </w:r>
           </w:p>
         </w:tc>
@@ -2266,7 +2292,7 @@
                 <w:sz w:val="20"/>
                 <w:shd w:fill="auto" w:val="clear"/>
               </w:rPr>
-              <w:t xml:space="preserve">- 1 Stk Ablaufgarnitur Rohbauset m. Sifon BH60mm f. Flache Duschw. m. 90mm Ablauf TRINNITY</w:t>
+              <w:t xml:space="preserve">- 1 Stk Duschwanne 100 x 100 x 3 cm</w:t>
             </w:r>
           </w:p>
           <w:p>
@@ -2292,137 +2318,7 @@
                 <w:sz w:val="20"/>
                 <w:shd w:fill="auto" w:val="clear"/>
               </w:rPr>
-              <w:t xml:space="preserve">- 4 Stk Fußboden-Paneele (1 m² = 4 Paneele)</w:t>
-            </w:r>
-          </w:p>
-          <w:p>
-            <w:pPr>
-              <w:spacing w:before="0" w:after="0" w:line="278"/>
-              <w:ind w:right="314" w:left="0" w:firstLine="0"/>
-              <w:jc w:val="left"/>
-              <w:rPr>
-                <w:rFonts w:ascii="Open Sans" w:hAnsi="Open Sans" w:cs="Open Sans" w:eastAsia="Open Sans"/>
-                <w:color w:val="auto"/>
-                <w:spacing w:val="0"/>
-                <w:position w:val="0"/>
-                <w:sz w:val="20"/>
-                <w:shd w:fill="auto" w:val="clear"/>
-              </w:rPr>
-            </w:pPr>
-            <w:r>
-              <w:rPr>
-                <w:rFonts w:ascii="Open Sans" w:hAnsi="Open Sans" w:cs="Open Sans" w:eastAsia="Open Sans"/>
-                <w:color w:val="auto"/>
-                <w:spacing w:val="0"/>
-                <w:position w:val="0"/>
-                <w:sz w:val="20"/>
-                <w:shd w:fill="auto" w:val="clear"/>
-              </w:rPr>
-              <w:t xml:space="preserve">- 2 Pkg Flächenkleber (1 Pkg je 0,60 m²)</w:t>
-            </w:r>
-          </w:p>
-          <w:p>
-            <w:pPr>
-              <w:spacing w:before="0" w:after="0" w:line="278"/>
-              <w:ind w:right="314" w:left="0" w:firstLine="0"/>
-              <w:jc w:val="left"/>
-              <w:rPr>
-                <w:rFonts w:ascii="Open Sans" w:hAnsi="Open Sans" w:cs="Open Sans" w:eastAsia="Open Sans"/>
-                <w:color w:val="auto"/>
-                <w:spacing w:val="0"/>
-                <w:position w:val="0"/>
-                <w:sz w:val="20"/>
-                <w:shd w:fill="auto" w:val="clear"/>
-              </w:rPr>
-            </w:pPr>
-            <w:r>
-              <w:rPr>
-                <w:rFonts w:ascii="Open Sans" w:hAnsi="Open Sans" w:cs="Open Sans" w:eastAsia="Open Sans"/>
-                <w:color w:val="auto"/>
-                <w:spacing w:val="0"/>
-                <w:position w:val="0"/>
-                <w:sz w:val="20"/>
-                <w:shd w:fill="auto" w:val="clear"/>
-              </w:rPr>
               <w:t xml:space="preserve">- 1 Stk TRINNITY Wandabdichtung BASIS-Set 5 qm DW bis 100 x 100 / BW bis 180 x 80 cm</w:t>
-            </w:r>
-          </w:p>
-          <w:p>
-            <w:pPr>
-              <w:spacing w:before="0" w:after="0" w:line="278"/>
-              <w:ind w:right="314" w:left="0" w:firstLine="0"/>
-              <w:jc w:val="left"/>
-              <w:rPr>
-                <w:rFonts w:ascii="Open Sans" w:hAnsi="Open Sans" w:cs="Open Sans" w:eastAsia="Open Sans"/>
-                <w:color w:val="auto"/>
-                <w:spacing w:val="0"/>
-                <w:position w:val="0"/>
-                <w:sz w:val="20"/>
-                <w:shd w:fill="auto" w:val="clear"/>
-              </w:rPr>
-            </w:pPr>
-            <w:r>
-              <w:rPr>
-                <w:rFonts w:ascii="Open Sans" w:hAnsi="Open Sans" w:cs="Open Sans" w:eastAsia="Open Sans"/>
-                <w:color w:val="auto"/>
-                <w:spacing w:val="0"/>
-                <w:position w:val="0"/>
-                <w:sz w:val="20"/>
-                <w:shd w:fill="auto" w:val="clear"/>
-              </w:rPr>
-              <w:t xml:space="preserve">- 3 Stk Abschlussprofil 3.0 255 cm silber eloxiert VIGOUR</w:t>
-            </w:r>
-          </w:p>
-          <w:p>
-            <w:pPr>
-              <w:spacing w:before="0" w:after="0" w:line="278"/>
-              <w:ind w:right="314" w:left="0" w:firstLine="0"/>
-              <w:jc w:val="left"/>
-              <w:rPr>
-                <w:rFonts w:ascii="Open Sans" w:hAnsi="Open Sans" w:cs="Open Sans" w:eastAsia="Open Sans"/>
-                <w:color w:val="auto"/>
-                <w:spacing w:val="0"/>
-                <w:position w:val="0"/>
-                <w:sz w:val="20"/>
-                <w:shd w:fill="auto" w:val="clear"/>
-              </w:rPr>
-            </w:pPr>
-            <w:r>
-              <w:rPr>
-                <w:rFonts w:ascii="Open Sans" w:hAnsi="Open Sans" w:cs="Open Sans" w:eastAsia="Open Sans"/>
-                <w:color w:val="auto"/>
-                <w:spacing w:val="0"/>
-                <w:position w:val="0"/>
-                <w:sz w:val="20"/>
-                <w:shd w:fill="auto" w:val="clear"/>
-              </w:rPr>
-              <w:t xml:space="preserve">- 3 Stk Verbindungsprofil(e) (Plattenanzahl - 1)</w:t>
-            </w:r>
-          </w:p>
-          <w:p>
-            <w:pPr>
-              <w:spacing w:before="0" w:after="0" w:line="278"/>
-              <w:ind w:right="314" w:left="0" w:firstLine="0"/>
-              <w:jc w:val="left"/>
-              <w:rPr>
-                <w:rFonts w:ascii="Open Sans" w:hAnsi="Open Sans" w:cs="Open Sans" w:eastAsia="Open Sans"/>
-                <w:color w:val="auto"/>
-                <w:spacing w:val="0"/>
-                <w:position w:val="0"/>
-                <w:sz w:val="20"/>
-                <w:shd w:fill="auto" w:val="clear"/>
-              </w:rPr>
-            </w:pPr>
-            <w:r>
-              <w:rPr>
-                <w:rFonts w:ascii="Open Sans" w:hAnsi="Open Sans" w:cs="Open Sans" w:eastAsia="Open Sans"/>
-                <w:color w:val="auto"/>
-                <w:spacing w:val="0"/>
-                <w:position w:val="0"/>
-                <w:sz w:val="20"/>
-                <w:shd w:fill="auto" w:val="clear"/>
-              </w:rPr>
-              <w:t xml:space="preserve">- 3 Stk Profilklebstoff (pro Abschlussprofil 1 Stk)</w:t>
             </w:r>
           </w:p>
         </w:tc>
@@ -2571,7 +2467,7 @@
                 <w:sz w:val="20"/>
                 <w:shd w:fill="auto" w:val="clear"/>
               </w:rPr>
-              <w:t xml:space="preserve">Nettobetrag (ohne Rabatt)</w:t>
+              <w:t xml:space="preserve">Nettobetrag</w:t>
             </w:r>
           </w:p>
         </w:tc>
@@ -2677,7 +2573,7 @@
                 <w:sz w:val="22"/>
                 <w:shd w:fill="auto" w:val="clear"/>
               </w:rPr>
-              <w:t xml:space="preserve">1.864,59 €</w:t>
+              <w:t xml:space="preserve">1.900,37 €</w:t>
             </w:r>
             <w:r>
               <w:rPr>
@@ -2745,7 +2641,7 @@
                 <w:sz w:val="20"/>
                 <w:shd w:fill="auto" w:val="clear"/>
               </w:rPr>
-              <w:t xml:space="preserve">Rabatt</w:t>
+              <w:t xml:space="preserve">zzgl. 19% MwSt.</w:t>
             </w:r>
           </w:p>
         </w:tc>
@@ -2851,7 +2747,7 @@
                 <w:sz w:val="22"/>
                 <w:shd w:fill="auto" w:val="clear"/>
               </w:rPr>
-              <w:t xml:space="preserve">47,98 €</w:t>
+              <w:t xml:space="preserve">361,07 €</w:t>
             </w:r>
             <w:r>
               <w:rPr>
@@ -2919,7 +2815,7 @@
                 <w:sz w:val="20"/>
                 <w:shd w:fill="auto" w:val="clear"/>
               </w:rPr>
-              <w:t xml:space="preserve">zzgl. 19% MwSt.</w:t>
+              <w:t xml:space="preserve">Gesamtsumme</w:t>
             </w:r>
           </w:p>
         </w:tc>
@@ -3025,355 +2921,7 @@
                 <w:sz w:val="22"/>
                 <w:shd w:fill="auto" w:val="clear"/>
               </w:rPr>
-              <w:t xml:space="preserve">354,27 €</w:t>
-            </w:r>
-            <w:r>
-              <w:rPr>
-                <w:rFonts w:ascii="Open Sans SemiBold" w:hAnsi="Open Sans SemiBold" w:cs="Open Sans SemiBold" w:eastAsia="Open Sans SemiBold"/>
-                <w:color w:val="auto"/>
-                <w:spacing w:val="0"/>
-                <w:position w:val="0"/>
-                <w:sz w:val="22"/>
-                <w:shd w:fill="auto" w:val="clear"/>
-              </w:rPr>
-              <w:t/>
-            </w:r>
-          </w:p>
-        </w:tc>
-      </w:tr>
-      <w:tr>
-        <w:trPr>
-          <w:trHeight w:val="285" w:hRule="auto"/>
-          <w:jc w:val="left"/>
-        </w:trPr>
-        <w:tc>
-          <w:tcPr>
-            <w:tcW w:w="3915" w:type="dxa"/>
-            <w:tcBorders>
-              <w:top w:val="single" w:color="ffffff" w:sz="8"/>
-              <w:left w:val="single" w:color="ffffff" w:sz="8"/>
-              <w:bottom w:val="single" w:color="ffffff" w:sz="8"/>
-              <w:right w:val="single" w:color="ffffff" w:sz="8"/>
-            </w:tcBorders>
-            <w:shd w:color="000000" w:fill="ffffff" w:val="clear"/>
-            <w:tcMar>
-              <w:left w:w="0" w:type="dxa"/>
-              <w:right w:w="0" w:type="dxa"/>
-            </w:tcMar>
-            <w:vAlign w:val="center"/>
-          </w:tcPr>
-          <w:p>
-            <w:pPr>
-              <w:spacing w:before="57" w:after="0" w:line="240"/>
-              <w:ind w:right="0" w:left="0" w:firstLine="0"/>
-              <w:jc w:val="left"/>
-              <w:rPr>
-                <w:spacing w:val="0"/>
-                <w:position w:val="0"/>
-              </w:rPr>
-            </w:pPr>
-            <w:r>
-              <w:rPr>
-                <w:rFonts w:ascii="Open Sans SemiBold" w:hAnsi="Open Sans SemiBold" w:cs="Open Sans SemiBold" w:eastAsia="Open Sans SemiBold"/>
-                <w:color w:val="030303"/>
-                <w:spacing w:val="0"/>
-                <w:position w:val="0"/>
-                <w:sz w:val="20"/>
-                <w:shd w:fill="auto" w:val="clear"/>
-              </w:rPr>
-              <w:t/>
-            </w:r>
-            <w:r>
-              <w:rPr>
-                <w:rFonts w:ascii="Open Sans SemiBold" w:hAnsi="Open Sans SemiBold" w:cs="Open Sans SemiBold" w:eastAsia="Open Sans SemiBold"/>
-                <w:b/>
-                <w:color w:val="030303"/>
-                <w:spacing w:val="0"/>
-                <w:position w:val="0"/>
-                <w:sz w:val="20"/>
-                <w:shd w:fill="auto" w:val="clear"/>
-              </w:rPr>
-              <w:t xml:space="preserve">Gesamtsumme</w:t>
-            </w:r>
-          </w:p>
-        </w:tc>
-        <w:tc>
-          <w:tcPr>
-            <w:tcW w:w="915" w:type="dxa"/>
-            <w:tcBorders>
-              <w:top w:val="single" w:color="ffffff" w:sz="8"/>
-              <w:left w:val="single" w:color="ffffff" w:sz="8"/>
-              <w:bottom w:val="single" w:color="ffffff" w:sz="8"/>
-              <w:right w:val="single" w:color="ffffff" w:sz="8"/>
-            </w:tcBorders>
-            <w:shd w:color="000000" w:fill="ffffff" w:val="clear"/>
-            <w:tcMar>
-              <w:left w:w="0" w:type="dxa"/>
-              <w:right w:w="0" w:type="dxa"/>
-            </w:tcMar>
-            <w:vAlign w:val="center"/>
-          </w:tcPr>
-          <w:p>
-            <w:pPr>
-              <w:spacing w:before="0" w:after="0" w:line="240"/>
-              <w:ind w:right="0" w:left="0" w:firstLine="0"/>
-              <w:jc w:val="left"/>
-              <w:rPr>
-                <w:rFonts w:ascii="Calibri" w:hAnsi="Calibri" w:cs="Calibri" w:eastAsia="Calibri"/>
-                <w:color w:val="auto"/>
-                <w:spacing w:val="0"/>
-                <w:position w:val="0"/>
-                <w:sz w:val="22"/>
-                <w:shd w:fill="auto" w:val="clear"/>
-              </w:rPr>
-            </w:pPr>
-          </w:p>
-        </w:tc>
-        <w:tc>
-          <w:tcPr>
-            <w:tcW w:w="2106" w:type="dxa"/>
-            <w:tcBorders>
-              <w:top w:val="single" w:color="ffffff" w:sz="8"/>
-              <w:left w:val="single" w:color="ffffff" w:sz="8"/>
-              <w:bottom w:val="single" w:color="ffffff" w:sz="8"/>
-              <w:right w:val="single" w:color="ffffff" w:sz="8"/>
-            </w:tcBorders>
-            <w:shd w:color="000000" w:fill="ffffff" w:val="clear"/>
-            <w:tcMar>
-              <w:left w:w="0" w:type="dxa"/>
-              <w:right w:w="0" w:type="dxa"/>
-            </w:tcMar>
-            <w:vAlign w:val="center"/>
-          </w:tcPr>
-          <w:p>
-            <w:pPr>
-              <w:spacing w:before="0" w:after="0" w:line="240"/>
-              <w:ind w:right="0" w:left="0" w:firstLine="0"/>
-              <w:jc w:val="left"/>
-              <w:rPr>
-                <w:rFonts w:ascii="Calibri" w:hAnsi="Calibri" w:cs="Calibri" w:eastAsia="Calibri"/>
-                <w:color w:val="auto"/>
-                <w:spacing w:val="0"/>
-                <w:position w:val="0"/>
-                <w:sz w:val="22"/>
-                <w:shd w:fill="auto" w:val="clear"/>
-              </w:rPr>
-            </w:pPr>
-          </w:p>
-        </w:tc>
-        <w:tc>
-          <w:tcPr>
-            <w:tcW w:w="2724" w:type="dxa"/>
-            <w:tcBorders>
-              <w:top w:val="single" w:color="ffffff" w:sz="8"/>
-              <w:left w:val="single" w:color="ffffff" w:sz="8"/>
-              <w:bottom w:val="single" w:color="ffffff" w:sz="8"/>
-              <w:right w:val="single" w:color="ffffff" w:sz="8"/>
-            </w:tcBorders>
-            <w:shd w:color="000000" w:fill="ffffff" w:val="clear"/>
-            <w:tcMar>
-              <w:left w:w="0" w:type="dxa"/>
-              <w:right w:w="0" w:type="dxa"/>
-            </w:tcMar>
-            <w:vAlign w:val="center"/>
-          </w:tcPr>
-          <w:p>
-            <w:pPr>
-              <w:spacing w:before="0" w:after="0" w:line="278"/>
-              <w:ind w:right="314" w:left="0" w:firstLine="0"/>
-              <w:jc w:val="right"/>
-              <w:rPr>
-                <w:color w:val="auto"/>
-                <w:spacing w:val="0"/>
-                <w:position w:val="0"/>
-                <w:sz w:val="22"/>
-              </w:rPr>
-            </w:pPr>
-            <w:r>
-              <w:rPr>
-                <w:rFonts w:ascii="Open Sans SemiBold" w:hAnsi="Open Sans SemiBold" w:cs="Open Sans SemiBold" w:eastAsia="Open Sans SemiBold"/>
-                <w:b/>
-                <w:color w:val="auto"/>
-                <w:spacing w:val="0"/>
-                <w:position w:val="0"/>
-                <w:sz w:val="22"/>
-                <w:shd w:fill="auto" w:val="clear"/>
-              </w:rPr>
-              <w:t xml:space="preserve">2.218,86 €</w:t>
-            </w:r>
-            <w:r>
-              <w:rPr>
-                <w:rFonts w:ascii="Open Sans SemiBold" w:hAnsi="Open Sans SemiBold" w:cs="Open Sans SemiBold" w:eastAsia="Open Sans SemiBold"/>
-                <w:color w:val="auto"/>
-                <w:spacing w:val="0"/>
-                <w:position w:val="0"/>
-                <w:sz w:val="22"/>
-                <w:shd w:fill="auto" w:val="clear"/>
-              </w:rPr>
-              <w:t/>
-            </w:r>
-          </w:p>
-        </w:tc>
-      </w:tr>
-      <w:tr>
-        <w:trPr>
-          <w:trHeight w:val="1" w:hRule="atLeast"/>
-          <w:jc w:val="left"/>
-        </w:trPr>
-        <w:tc>
-          <w:tcPr>
-            <w:tcW w:w="3915" w:type="dxa"/>
-            <w:tcBorders>
-              <w:top w:val="single" w:color="ffffff" w:sz="8"/>
-              <w:left w:val="single" w:color="d9d9d9" w:sz="8"/>
-              <w:bottom w:val="single" w:color="ffffff" w:sz="8"/>
-              <w:right w:val="single" w:color="d9d9d9" w:sz="8"/>
-            </w:tcBorders>
-            <w:shd w:color="000000" w:fill="d9d9d9" w:val="clear"/>
-            <w:tcMar>
-              <w:left w:w="0" w:type="dxa"/>
-              <w:right w:w="0" w:type="dxa"/>
-            </w:tcMar>
-            <w:vAlign w:val="center"/>
-          </w:tcPr>
-          <w:p>
-            <w:pPr>
-              <w:spacing w:before="56" w:after="0" w:line="240"/>
-              <w:ind w:right="0" w:left="50" w:firstLine="0"/>
-              <w:jc w:val="left"/>
-              <w:rPr>
-                <w:spacing w:val="0"/>
-                <w:position w:val="0"/>
-              </w:rPr>
-            </w:pPr>
-            <w:r>
-              <w:rPr>
-                <w:rFonts w:ascii="Open Sans SemiBold" w:hAnsi="Open Sans SemiBold" w:cs="Open Sans SemiBold" w:eastAsia="Open Sans SemiBold"/>
-                <w:color w:val="030303"/>
-                <w:spacing w:val="0"/>
-                <w:position w:val="0"/>
-                <w:sz w:val="20"/>
-                <w:shd w:fill="auto" w:val="clear"/>
-              </w:rPr>
-              <w:t/>
-            </w:r>
-            <w:r>
-              <w:rPr>
-                <w:rFonts w:ascii="Open Sans SemiBold" w:hAnsi="Open Sans SemiBold" w:cs="Open Sans SemiBold" w:eastAsia="Open Sans SemiBold"/>
-                <w:b/>
-                <w:color w:val="030303"/>
-                <w:spacing w:val="0"/>
-                <w:position w:val="0"/>
-                <w:sz w:val="20"/>
-                <w:shd w:fill="auto" w:val="clear"/>
-              </w:rPr>
-              <w:t xml:space="preserve">Gesamtbetrag nach Materialrabatt</w:t>
-            </w:r>
-          </w:p>
-        </w:tc>
-        <w:tc>
-          <w:tcPr>
-            <w:tcW w:w="915" w:type="dxa"/>
-            <w:tcBorders>
-              <w:top w:val="single" w:color="ffffff" w:sz="8"/>
-              <w:left w:val="single" w:color="d9d9d9" w:sz="8"/>
-              <w:bottom w:val="single" w:color="ffffff" w:sz="8"/>
-              <w:right w:val="single" w:color="d9d9d9" w:sz="8"/>
-            </w:tcBorders>
-            <w:shd w:color="000000" w:fill="d9d9d9" w:val="clear"/>
-            <w:tcMar>
-              <w:left w:w="0" w:type="dxa"/>
-              <w:right w:w="0" w:type="dxa"/>
-            </w:tcMar>
-            <w:vAlign w:val="center"/>
-          </w:tcPr>
-          <w:p>
-            <w:pPr>
-              <w:spacing w:before="0" w:after="0" w:line="240"/>
-              <w:ind w:right="0" w:left="0" w:firstLine="0"/>
-              <w:jc w:val="left"/>
-              <w:rPr>
-                <w:rFonts w:ascii="Calibri" w:hAnsi="Calibri" w:cs="Calibri" w:eastAsia="Calibri"/>
-                <w:color w:val="auto"/>
-                <w:spacing w:val="0"/>
-                <w:position w:val="0"/>
-                <w:sz w:val="22"/>
-                <w:shd w:fill="auto" w:val="clear"/>
-              </w:rPr>
-            </w:pPr>
-          </w:p>
-        </w:tc>
-        <w:tc>
-          <w:tcPr>
-            <w:tcW w:w="2106" w:type="dxa"/>
-            <w:tcBorders>
-              <w:top w:val="single" w:color="ffffff" w:sz="8"/>
-              <w:left w:val="single" w:color="d9d9d9" w:sz="8"/>
-              <w:bottom w:val="single" w:color="ffffff" w:sz="8"/>
-              <w:right w:val="single" w:color="d9d9d9" w:sz="8"/>
-            </w:tcBorders>
-            <w:shd w:color="000000" w:fill="d9d9d9" w:val="clear"/>
-            <w:tcMar>
-              <w:left w:w="0" w:type="dxa"/>
-              <w:right w:w="0" w:type="dxa"/>
-            </w:tcMar>
-            <w:vAlign w:val="center"/>
-          </w:tcPr>
-          <w:p>
-            <w:pPr>
-              <w:spacing w:before="0" w:after="0" w:line="240"/>
-              <w:ind w:right="0" w:left="0" w:firstLine="0"/>
-              <w:jc w:val="left"/>
-              <w:rPr>
-                <w:rFonts w:ascii="Calibri" w:hAnsi="Calibri" w:cs="Calibri" w:eastAsia="Calibri"/>
-                <w:color w:val="auto"/>
-                <w:spacing w:val="0"/>
-                <w:position w:val="0"/>
-                <w:sz w:val="22"/>
-                <w:shd w:fill="auto" w:val="clear"/>
-              </w:rPr>
-            </w:pPr>
-          </w:p>
-        </w:tc>
-        <w:tc>
-          <w:tcPr>
-            <w:tcW w:w="2724" w:type="dxa"/>
-            <w:tcBorders>
-              <w:top w:val="single" w:color="ffffff" w:sz="8"/>
-              <w:left w:val="single" w:color="d9d9d9" w:sz="8"/>
-              <w:bottom w:val="single" w:color="ffffff" w:sz="8"/>
-              <w:right w:val="single" w:color="d9d9d9" w:sz="8"/>
-            </w:tcBorders>
-            <w:shd w:color="000000" w:fill="d9d9d9" w:val="clear"/>
-            <w:tcMar>
-              <w:left w:w="0" w:type="dxa"/>
-              <w:right w:w="0" w:type="dxa"/>
-            </w:tcMar>
-            <w:vAlign w:val="center"/>
-          </w:tcPr>
-          <w:p>
-            <w:pPr>
-              <w:spacing w:before="0" w:after="0" w:line="278"/>
-              <w:ind w:right="314" w:left="0" w:firstLine="0"/>
-              <w:jc w:val="right"/>
-              <w:rPr>
-                <w:color w:val="auto"/>
-                <w:spacing w:val="0"/>
-                <w:position w:val="0"/>
-                <w:sz w:val="22"/>
-              </w:rPr>
-            </w:pPr>
-            <w:r>
-              <w:rPr>
-                <w:rFonts w:ascii="Open Sans SemiBold" w:hAnsi="Open Sans SemiBold" w:cs="Open Sans SemiBold" w:eastAsia="Open Sans SemiBold"/>
-                <w:b/>
-                <w:color w:val="auto"/>
-                <w:spacing w:val="0"/>
-                <w:position w:val="0"/>
-                <w:sz w:val="22"/>
-                <w:shd w:fill="auto" w:val="clear"/>
-              </w:rPr>
-              <w:t xml:space="preserve">2.161,77 €</w:t>
+              <w:t xml:space="preserve">2.261,44 €</w:t>
             </w:r>
             <w:r>
               <w:rPr>

</xml_diff>

<commit_message>
Wandverkleidung price and quantity added
</commit_message>
<xml_diff>
--- a/out-Angebot.docx
+++ b/out-Angebot.docx
@@ -93,7 +93,7 @@
           <w:sz w:val="22"/>
           <w:shd w:fill="auto" w:val="clear"/>
         </w:rPr>
-        <w:t xml:space="preserve">Quintessa Dickerson</w:t>
+        <w:t xml:space="preserve">Troy Blevins</w:t>
       </w:r>
     </w:p>
     <w:p>
@@ -119,7 +119,7 @@
           <w:sz w:val="22"/>
           <w:shd w:fill="auto" w:val="clear"/>
         </w:rPr>
-        <w:t xml:space="preserve">Dolores placeat nob,</w:t>
+        <w:t xml:space="preserve">Et dolores dolore co,</w:t>
       </w:r>
     </w:p>
     <w:p>
@@ -145,7 +145,7 @@
           <w:sz w:val="22"/>
           <w:shd w:fill="auto" w:val="clear"/>
         </w:rPr>
-        <w:t xml:space="preserve">Voluptatum excepturi Praesentium qui comm</w:t>
+        <w:t xml:space="preserve">Molestiae deserunt a Numquam commodo erro</w:t>
       </w:r>
     </w:p>
     <w:tbl>
@@ -320,7 +320,7 @@
                 <w:sz w:val="22"/>
                 <w:shd w:fill="auto" w:val="clear"/>
               </w:rPr>
-              <w:t xml:space="preserve">Levi Rosales</w:t>
+              <w:t xml:space="preserve">Marny Crane</w:t>
             </w:r>
           </w:p>
         </w:tc>
@@ -363,7 +363,7 @@
                 <w:sz w:val="22"/>
                 <w:shd w:fill="auto" w:val="clear"/>
               </w:rPr>
-              <w:t xml:space="preserve">AN20250926171623</w:t>
+              <w:t xml:space="preserve">AN20250929111904</w:t>
             </w:r>
             <w:r>
               <w:rPr>
@@ -411,7 +411,7 @@
                 <w:sz w:val="22"/>
                 <w:shd w:fill="auto" w:val="clear"/>
               </w:rPr>
-              <w:t xml:space="preserve">1973-10-19</w:t>
+              <w:t xml:space="preserve">1992-02-04</w:t>
             </w:r>
             <w:r>
               <w:rPr>
@@ -455,7 +455,7 @@
                 <w:sz w:val="22"/>
                 <w:shd w:fill="auto" w:val="clear"/>
               </w:rPr>
-              <w:t xml:space="preserve">Audrey Key</w:t>
+              <w:t xml:space="preserve">Burke Garcia</w:t>
             </w:r>
             <w:r>
               <w:rPr>
@@ -617,7 +617,7 @@
           <w:sz w:val="24"/>
           <w:shd w:fill="auto" w:val="clear"/>
         </w:rPr>
-        <w:t xml:space="preserve">  Ihr Angebot AN20250926171623</w:t>
+        <w:t xml:space="preserve">  Ihr Angebot AN20250929111904</w:t>
       </w:r>
     </w:p>
     <w:p>
@@ -643,7 +643,7 @@
           <w:sz w:val="22"/>
           <w:shd w:fill="auto" w:val="clear"/>
         </w:rPr>
-        <w:t xml:space="preserve">  Sehr geehrte Frau Dickerson,</w:t>
+        <w:t xml:space="preserve">  Sehr geehrte Frau Blevins,</w:t>
         <w:br/>
       </w:r>
     </w:p>
@@ -1072,7 +1072,7 @@
                 <w:sz w:val="20"/>
                 <w:shd w:fill="auto" w:val="clear"/>
               </w:rPr>
-              <w:t xml:space="preserve">1.111,20 €</w:t>
+              <w:t xml:space="preserve">2.483,00 €</w:t>
             </w:r>
           </w:p>
         </w:tc>
@@ -1112,7 +1112,7 @@
                 <w:sz w:val="20"/>
                 <w:shd w:fill="auto" w:val="clear"/>
               </w:rPr>
-              <w:t xml:space="preserve">1.111,20 €</w:t>
+              <w:t xml:space="preserve">2.483,00 €</w:t>
             </w:r>
           </w:p>
         </w:tc>
@@ -1477,7 +1477,7 @@
                 <w:sz w:val="18"/>
                 <w:shd w:fill="auto" w:val="clear"/>
               </w:rPr>
-              <w:t xml:space="preserve">- 66 km Kilometerpauschale </w:t>
+              <w:t xml:space="preserve">- 40 km Kilometerpauschale </w:t>
             </w:r>
           </w:p>
           <w:p>
@@ -1965,7 +1965,7 @@
                 <w:sz w:val="20"/>
                 <w:shd w:fill="auto" w:val="clear"/>
               </w:rPr>
-              <w:t xml:space="preserve">526,11 €</w:t>
+              <w:t xml:space="preserve">1.771,43 €</w:t>
             </w:r>
           </w:p>
         </w:tc>
@@ -2005,7 +2005,7 @@
                 <w:sz w:val="20"/>
                 <w:shd w:fill="auto" w:val="clear"/>
               </w:rPr>
-              <w:t xml:space="preserve">526,11 €</w:t>
+              <w:t xml:space="preserve">1.771,43 €</w:t>
             </w:r>
           </w:p>
         </w:tc>
@@ -2292,7 +2292,7 @@
                 <w:sz w:val="20"/>
                 <w:shd w:fill="auto" w:val="clear"/>
               </w:rPr>
-              <w:t xml:space="preserve">- 1 Stk Duschwanne 100 x 100 x 3 cm</w:t>
+              <w:t xml:space="preserve">- 2 Stk Wandverkleidung 3.0 Alu 997×2550 mm</w:t>
             </w:r>
           </w:p>
           <w:p>
@@ -2318,7 +2318,85 @@
                 <w:sz w:val="20"/>
                 <w:shd w:fill="auto" w:val="clear"/>
               </w:rPr>
+              <w:t xml:space="preserve">- 3 Stk Wandverkleidung 3.0 Alu 1497×2550 mm</w:t>
+            </w:r>
+          </w:p>
+          <w:p>
+            <w:pPr>
+              <w:spacing w:before="0" w:after="0" w:line="278"/>
+              <w:ind w:right="314" w:left="0" w:firstLine="0"/>
+              <w:jc w:val="left"/>
+              <w:rPr>
+                <w:rFonts w:ascii="Open Sans" w:hAnsi="Open Sans" w:cs="Open Sans" w:eastAsia="Open Sans"/>
+                <w:color w:val="auto"/>
+                <w:spacing w:val="0"/>
+                <w:position w:val="0"/>
+                <w:sz w:val="20"/>
+                <w:shd w:fill="auto" w:val="clear"/>
+              </w:rPr>
+            </w:pPr>
+            <w:r>
+              <w:rPr>
+                <w:rFonts w:ascii="Open Sans" w:hAnsi="Open Sans" w:cs="Open Sans" w:eastAsia="Open Sans"/>
+                <w:color w:val="auto"/>
+                <w:spacing w:val="0"/>
+                <w:position w:val="0"/>
+                <w:sz w:val="20"/>
+                <w:shd w:fill="auto" w:val="clear"/>
+              </w:rPr>
               <w:t xml:space="preserve">- 1 Stk TRINNITY Wandabdichtung BASIS-Set 5 qm DW bis 100 x 100 / BW bis 180 x 80 cm</w:t>
+            </w:r>
+          </w:p>
+          <w:p>
+            <w:pPr>
+              <w:spacing w:before="0" w:after="0" w:line="278"/>
+              <w:ind w:right="314" w:left="0" w:firstLine="0"/>
+              <w:jc w:val="left"/>
+              <w:rPr>
+                <w:rFonts w:ascii="Open Sans" w:hAnsi="Open Sans" w:cs="Open Sans" w:eastAsia="Open Sans"/>
+                <w:color w:val="auto"/>
+                <w:spacing w:val="0"/>
+                <w:position w:val="0"/>
+                <w:sz w:val="20"/>
+                <w:shd w:fill="auto" w:val="clear"/>
+              </w:rPr>
+            </w:pPr>
+            <w:r>
+              <w:rPr>
+                <w:rFonts w:ascii="Open Sans" w:hAnsi="Open Sans" w:cs="Open Sans" w:eastAsia="Open Sans"/>
+                <w:color w:val="auto"/>
+                <w:spacing w:val="0"/>
+                <w:position w:val="0"/>
+                <w:sz w:val="20"/>
+                <w:shd w:fill="auto" w:val="clear"/>
+              </w:rPr>
+              <w:t xml:space="preserve">- 4 Stk Verbindungsprofil(e) (Plattenanzahl - 1)</w:t>
+            </w:r>
+          </w:p>
+          <w:p>
+            <w:pPr>
+              <w:spacing w:before="0" w:after="0" w:line="278"/>
+              <w:ind w:right="314" w:left="0" w:firstLine="0"/>
+              <w:jc w:val="left"/>
+              <w:rPr>
+                <w:rFonts w:ascii="Open Sans" w:hAnsi="Open Sans" w:cs="Open Sans" w:eastAsia="Open Sans"/>
+                <w:color w:val="auto"/>
+                <w:spacing w:val="0"/>
+                <w:position w:val="0"/>
+                <w:sz w:val="20"/>
+                <w:shd w:fill="auto" w:val="clear"/>
+              </w:rPr>
+            </w:pPr>
+            <w:r>
+              <w:rPr>
+                <w:rFonts w:ascii="Open Sans" w:hAnsi="Open Sans" w:cs="Open Sans" w:eastAsia="Open Sans"/>
+                <w:color w:val="auto"/>
+                <w:spacing w:val="0"/>
+                <w:position w:val="0"/>
+                <w:sz w:val="20"/>
+                <w:shd w:fill="auto" w:val="clear"/>
+              </w:rPr>
+              <w:t xml:space="preserve">- 1 Stk Duschwanne</w:t>
             </w:r>
           </w:p>
         </w:tc>
@@ -2573,7 +2651,7 @@
                 <w:sz w:val="22"/>
                 <w:shd w:fill="auto" w:val="clear"/>
               </w:rPr>
-              <w:t xml:space="preserve">1.900,37 €</w:t>
+              <w:t xml:space="preserve">5.051,57 €</w:t>
             </w:r>
             <w:r>
               <w:rPr>
@@ -2747,7 +2825,7 @@
                 <w:sz w:val="22"/>
                 <w:shd w:fill="auto" w:val="clear"/>
               </w:rPr>
-              <w:t xml:space="preserve">361,07 €</w:t>
+              <w:t xml:space="preserve">959,80 €</w:t>
             </w:r>
             <w:r>
               <w:rPr>
@@ -2921,7 +2999,7 @@
                 <w:sz w:val="22"/>
                 <w:shd w:fill="auto" w:val="clear"/>
               </w:rPr>
-              <w:t xml:space="preserve">2.261,44 €</w:t>
+              <w:t xml:space="preserve">6.011,37 €</w:t>
             </w:r>
             <w:r>
               <w:rPr>

</xml_diff>

<commit_message>
duschwanne value in Kosten-Details (Debug) corrected
</commit_message>
<xml_diff>
--- a/out-Angebot.docx
+++ b/out-Angebot.docx
@@ -93,7 +93,7 @@
           <w:sz w:val="22"/>
           <w:shd w:fill="auto" w:val="clear"/>
         </w:rPr>
-        <w:t xml:space="preserve">Alisa Graham</w:t>
+        <w:t xml:space="preserve">Veronica Maxwell</w:t>
       </w:r>
     </w:p>
     <w:p>
@@ -119,7 +119,7 @@
           <w:sz w:val="22"/>
           <w:shd w:fill="auto" w:val="clear"/>
         </w:rPr>
-        <w:t xml:space="preserve">Nesciunt earum quis,</w:t>
+        <w:t xml:space="preserve">Mollitia harum velit,</w:t>
       </w:r>
     </w:p>
     <w:p>
@@ -145,7 +145,7 @@
           <w:sz w:val="22"/>
           <w:shd w:fill="auto" w:val="clear"/>
         </w:rPr>
-        <w:t xml:space="preserve">Consequatur anim acc Dolorum omnis elit </w:t>
+        <w:t xml:space="preserve">Sit quasi labore est Anim ipsam ut qui ni</w:t>
       </w:r>
     </w:p>
     <w:tbl>
@@ -320,7 +320,7 @@
                 <w:sz w:val="22"/>
                 <w:shd w:fill="auto" w:val="clear"/>
               </w:rPr>
-              <w:t xml:space="preserve">Sade Roman</w:t>
+              <w:t xml:space="preserve">Rylee Wilcox</w:t>
             </w:r>
           </w:p>
         </w:tc>
@@ -363,7 +363,7 @@
                 <w:sz w:val="22"/>
                 <w:shd w:fill="auto" w:val="clear"/>
               </w:rPr>
-              <w:t xml:space="preserve">AN20250929164224</w:t>
+              <w:t xml:space="preserve">AN20250930101311</w:t>
             </w:r>
             <w:r>
               <w:rPr>
@@ -411,7 +411,7 @@
                 <w:sz w:val="22"/>
                 <w:shd w:fill="auto" w:val="clear"/>
               </w:rPr>
-              <w:t xml:space="preserve">2004-10-25</w:t>
+              <w:t xml:space="preserve">1988-06-06</w:t>
             </w:r>
             <w:r>
               <w:rPr>
@@ -455,7 +455,7 @@
                 <w:sz w:val="22"/>
                 <w:shd w:fill="auto" w:val="clear"/>
               </w:rPr>
-              <w:t xml:space="preserve">Fiona Fulton</w:t>
+              <w:t xml:space="preserve">Harper Briggs</w:t>
             </w:r>
             <w:r>
               <w:rPr>
@@ -617,7 +617,7 @@
           <w:sz w:val="24"/>
           <w:shd w:fill="auto" w:val="clear"/>
         </w:rPr>
-        <w:t xml:space="preserve">  Ihr Angebot AN20250929164224</w:t>
+        <w:t xml:space="preserve">  Ihr Angebot AN20250930101311</w:t>
       </w:r>
     </w:p>
     <w:p>
@@ -643,7 +643,7 @@
           <w:sz w:val="22"/>
           <w:shd w:fill="auto" w:val="clear"/>
         </w:rPr>
-        <w:t xml:space="preserve">  Sehr geehrte Frau Graham,</w:t>
+        <w:t xml:space="preserve">  Sehr geehrte Frau Maxwell,</w:t>
         <w:br/>
       </w:r>
     </w:p>
@@ -1072,7 +1072,7 @@
                 <w:sz w:val="20"/>
                 <w:shd w:fill="auto" w:val="clear"/>
               </w:rPr>
-              <w:t xml:space="preserve">1.154,60 €</w:t>
+              <w:t xml:space="preserve">2.576,80 €</w:t>
             </w:r>
           </w:p>
         </w:tc>
@@ -1112,7 +1112,7 @@
                 <w:sz w:val="20"/>
                 <w:shd w:fill="auto" w:val="clear"/>
               </w:rPr>
-              <w:t xml:space="preserve">1.154,60 €</w:t>
+              <w:t xml:space="preserve">2.576,80 €</w:t>
             </w:r>
           </w:p>
         </w:tc>
@@ -1477,33 +1477,7 @@
                 <w:sz w:val="18"/>
                 <w:shd w:fill="auto" w:val="clear"/>
               </w:rPr>
-              <w:t xml:space="preserve">- 128 km Kilometerpauschale </w:t>
-            </w:r>
-          </w:p>
-          <w:p>
-            <w:pPr>
-              <w:spacing w:before="0" w:after="0" w:line="278"/>
-              <w:ind w:right="314" w:left="0" w:firstLine="0"/>
-              <w:jc w:val="left"/>
-              <w:rPr>
-                <w:rFonts w:ascii="Open Sans" w:hAnsi="Open Sans" w:cs="Open Sans" w:eastAsia="Open Sans"/>
-                <w:color w:val="auto"/>
-                <w:spacing w:val="0"/>
-                <w:position w:val="0"/>
-                <w:sz w:val="18"/>
-                <w:shd w:fill="auto" w:val="clear"/>
-              </w:rPr>
-            </w:pPr>
-            <w:r>
-              <w:rPr>
-                <w:rFonts w:ascii="Open Sans" w:hAnsi="Open Sans" w:cs="Open Sans" w:eastAsia="Open Sans"/>
-                <w:color w:val="auto"/>
-                <w:spacing w:val="0"/>
-                <w:position w:val="0"/>
-                <w:sz w:val="18"/>
-                <w:shd w:fill="auto" w:val="clear"/>
-              </w:rPr>
-              <w:t xml:space="preserve">- Verkleidung Deckenhoch im Dusch/ Wannenbereich</w:t>
+              <w:t xml:space="preserve">- 174 km Kilometerpauschale </w:t>
             </w:r>
           </w:p>
         </w:tc>
@@ -1965,7 +1939,7 @@
                 <w:sz w:val="20"/>
                 <w:shd w:fill="auto" w:val="clear"/>
               </w:rPr>
-              <w:t xml:space="preserve">1.947,80 €</w:t>
+              <w:t xml:space="preserve">699,26 €</w:t>
             </w:r>
           </w:p>
         </w:tc>
@@ -2005,7 +1979,7 @@
                 <w:sz w:val="20"/>
                 <w:shd w:fill="auto" w:val="clear"/>
               </w:rPr>
-              <w:t xml:space="preserve">1.947,80 €</w:t>
+              <w:t xml:space="preserve">699,26 €</w:t>
             </w:r>
           </w:p>
         </w:tc>
@@ -2344,7 +2318,7 @@
                 <w:sz w:val="20"/>
                 <w:shd w:fill="auto" w:val="clear"/>
               </w:rPr>
-              <w:t xml:space="preserve">- 1 Stk Stelzlager höhenverstellar Set</w:t>
+              <w:t xml:space="preserve">- 1 Stk Kleinmaterial groß</w:t>
             </w:r>
           </w:p>
           <w:p>
@@ -2370,7 +2344,7 @@
                 <w:sz w:val="20"/>
                 <w:shd w:fill="auto" w:val="clear"/>
               </w:rPr>
-              <w:t xml:space="preserve">- 39 Stk Fußboden-Paneele (1 Paneele = 0.3 m² )</w:t>
+              <w:t xml:space="preserve">- 1 Stk Stelzlager höhenverstellar Set</w:t>
             </w:r>
           </w:p>
           <w:p>
@@ -2396,7 +2370,7 @@
                 <w:sz w:val="20"/>
                 <w:shd w:fill="auto" w:val="clear"/>
               </w:rPr>
-              <w:t xml:space="preserve">- 17 Pkg Flächenkleber (1 Pkg je 0,60 m²)</w:t>
+              <w:t xml:space="preserve">- 1 Stk TRINNITY Wandabdichtung BASIS-Set 5 qm DW bis 100 x 100 / BW bis 180 x 80 cm</w:t>
             </w:r>
           </w:p>
           <w:p>
@@ -2422,111 +2396,7 @@
                 <w:sz w:val="20"/>
                 <w:shd w:fill="auto" w:val="clear"/>
               </w:rPr>
-              <w:t xml:space="preserve">- 1 Stk Wandverkleidung 3.0 Alu 997×2550 mm — Farbe: Marmor weiß</w:t>
-            </w:r>
-          </w:p>
-          <w:p>
-            <w:pPr>
-              <w:spacing w:before="0" w:after="0" w:line="278"/>
-              <w:ind w:right="314" w:left="0" w:firstLine="0"/>
-              <w:jc w:val="left"/>
-              <w:rPr>
-                <w:rFonts w:ascii="Open Sans" w:hAnsi="Open Sans" w:cs="Open Sans" w:eastAsia="Open Sans"/>
-                <w:color w:val="auto"/>
-                <w:spacing w:val="0"/>
-                <w:position w:val="0"/>
-                <w:sz w:val="20"/>
-                <w:shd w:fill="auto" w:val="clear"/>
-              </w:rPr>
-            </w:pPr>
-            <w:r>
-              <w:rPr>
-                <w:rFonts w:ascii="Open Sans" w:hAnsi="Open Sans" w:cs="Open Sans" w:eastAsia="Open Sans"/>
-                <w:color w:val="auto"/>
-                <w:spacing w:val="0"/>
-                <w:position w:val="0"/>
-                <w:sz w:val="20"/>
-                <w:shd w:fill="auto" w:val="clear"/>
-              </w:rPr>
-              <w:t xml:space="preserve">- 1 Stk Wandverkleidung 3.0 Alu 1497×2550 mm — Farbe: Marmor weiß</w:t>
-            </w:r>
-          </w:p>
-          <w:p>
-            <w:pPr>
-              <w:spacing w:before="0" w:after="0" w:line="278"/>
-              <w:ind w:right="314" w:left="0" w:firstLine="0"/>
-              <w:jc w:val="left"/>
-              <w:rPr>
-                <w:rFonts w:ascii="Open Sans" w:hAnsi="Open Sans" w:cs="Open Sans" w:eastAsia="Open Sans"/>
-                <w:color w:val="auto"/>
-                <w:spacing w:val="0"/>
-                <w:position w:val="0"/>
-                <w:sz w:val="20"/>
-                <w:shd w:fill="auto" w:val="clear"/>
-              </w:rPr>
-            </w:pPr>
-            <w:r>
-              <w:rPr>
-                <w:rFonts w:ascii="Open Sans" w:hAnsi="Open Sans" w:cs="Open Sans" w:eastAsia="Open Sans"/>
-                <w:color w:val="auto"/>
-                <w:spacing w:val="0"/>
-                <w:position w:val="0"/>
-                <w:sz w:val="20"/>
-                <w:shd w:fill="auto" w:val="clear"/>
-              </w:rPr>
-              <w:t xml:space="preserve">- 1 Stk TRINNITY Wandabdichtung BASIS-Set 5 qm DW bis 100 x 100 / BW bis 180 x 80 cm</w:t>
-            </w:r>
-          </w:p>
-          <w:p>
-            <w:pPr>
-              <w:spacing w:before="0" w:after="0" w:line="278"/>
-              <w:ind w:right="314" w:left="0" w:firstLine="0"/>
-              <w:jc w:val="left"/>
-              <w:rPr>
-                <w:rFonts w:ascii="Open Sans" w:hAnsi="Open Sans" w:cs="Open Sans" w:eastAsia="Open Sans"/>
-                <w:color w:val="auto"/>
-                <w:spacing w:val="0"/>
-                <w:position w:val="0"/>
-                <w:sz w:val="20"/>
-                <w:shd w:fill="auto" w:val="clear"/>
-              </w:rPr>
-            </w:pPr>
-            <w:r>
-              <w:rPr>
-                <w:rFonts w:ascii="Open Sans" w:hAnsi="Open Sans" w:cs="Open Sans" w:eastAsia="Open Sans"/>
-                <w:color w:val="auto"/>
-                <w:spacing w:val="0"/>
-                <w:position w:val="0"/>
-                <w:sz w:val="20"/>
-                <w:shd w:fill="auto" w:val="clear"/>
-              </w:rPr>
-              <w:t xml:space="preserve">- 7 Stk Wandverkleidungsklebstoff 3.0/4.0</w:t>
-            </w:r>
-          </w:p>
-          <w:p>
-            <w:pPr>
-              <w:spacing w:before="0" w:after="0" w:line="278"/>
-              <w:ind w:right="314" w:left="0" w:firstLine="0"/>
-              <w:jc w:val="left"/>
-              <w:rPr>
-                <w:rFonts w:ascii="Open Sans" w:hAnsi="Open Sans" w:cs="Open Sans" w:eastAsia="Open Sans"/>
-                <w:color w:val="auto"/>
-                <w:spacing w:val="0"/>
-                <w:position w:val="0"/>
-                <w:sz w:val="20"/>
-                <w:shd w:fill="auto" w:val="clear"/>
-              </w:rPr>
-            </w:pPr>
-            <w:r>
-              <w:rPr>
-                <w:rFonts w:ascii="Open Sans" w:hAnsi="Open Sans" w:cs="Open Sans" w:eastAsia="Open Sans"/>
-                <w:color w:val="auto"/>
-                <w:spacing w:val="0"/>
-                <w:position w:val="0"/>
-                <w:sz w:val="20"/>
-                <w:shd w:fill="auto" w:val="clear"/>
-              </w:rPr>
-              <w:t xml:space="preserve">- 1 Stk Verbindungsprofil(e) (Plattenanzahl - 1)</w:t>
+              <w:t xml:space="preserve">- 1 Stk Duschwanne 100 x 100 x 3 cm</w:t>
             </w:r>
           </w:p>
         </w:tc>
@@ -2781,7 +2651,7 @@
                 <w:sz w:val="22"/>
                 <w:shd w:fill="auto" w:val="clear"/>
               </w:rPr>
-              <w:t xml:space="preserve">4.076,30 €</w:t>
+              <w:t xml:space="preserve">3.625,69 €</w:t>
             </w:r>
             <w:r>
               <w:rPr>
@@ -2955,7 +2825,7 @@
                 <w:sz w:val="22"/>
                 <w:shd w:fill="auto" w:val="clear"/>
               </w:rPr>
-              <w:t xml:space="preserve">774,50 €</w:t>
+              <w:t xml:space="preserve">688,88 €</w:t>
             </w:r>
             <w:r>
               <w:rPr>
@@ -3129,7 +2999,7 @@
                 <w:sz w:val="22"/>
                 <w:shd w:fill="auto" w:val="clear"/>
               </w:rPr>
-              <w:t xml:space="preserve">4.850,80 €</w:t>
+              <w:t xml:space="preserve">4.314,57 €</w:t>
             </w:r>
             <w:r>
               <w:rPr>

</xml_diff>

<commit_message>
optional waschtisches workingwith flexibility
</commit_message>
<xml_diff>
--- a/out-Angebot.docx
+++ b/out-Angebot.docx
@@ -93,7 +93,7 @@
           <w:sz w:val="22"/>
           <w:shd w:fill="auto" w:val="clear"/>
         </w:rPr>
-        <w:t xml:space="preserve">Samson Pitts</w:t>
+        <w:t xml:space="preserve">Tamekah Hahn</w:t>
       </w:r>
     </w:p>
     <w:p>
@@ -119,7 +119,7 @@
           <w:sz w:val="22"/>
           <w:shd w:fill="auto" w:val="clear"/>
         </w:rPr>
-        <w:t xml:space="preserve">Enim voluptatem qui,</w:t>
+        <w:t xml:space="preserve">Rerum temporibus qui,</w:t>
       </w:r>
     </w:p>
     <w:p>
@@ -145,7 +145,7 @@
           <w:sz w:val="22"/>
           <w:shd w:fill="auto" w:val="clear"/>
         </w:rPr>
-        <w:t xml:space="preserve">Rerum fugiat facere Et ut qui harum ut t</w:t>
+        <w:t xml:space="preserve">Alias Nam aut volupt Nostrud odit maiores</w:t>
       </w:r>
     </w:p>
     <w:tbl>
@@ -320,7 +320,7 @@
                 <w:sz w:val="22"/>
                 <w:shd w:fill="auto" w:val="clear"/>
               </w:rPr>
-              <w:t xml:space="preserve">Audrey Casey</w:t>
+              <w:t xml:space="preserve">Nadine Morrow</w:t>
             </w:r>
           </w:p>
         </w:tc>
@@ -363,7 +363,7 @@
                 <w:sz w:val="22"/>
                 <w:shd w:fill="auto" w:val="clear"/>
               </w:rPr>
-              <w:t xml:space="preserve">AN20250930122610</w:t>
+              <w:t xml:space="preserve">AN20250930135545</w:t>
             </w:r>
             <w:r>
               <w:rPr>
@@ -411,7 +411,7 @@
                 <w:sz w:val="22"/>
                 <w:shd w:fill="auto" w:val="clear"/>
               </w:rPr>
-              <w:t xml:space="preserve">2020-02-24</w:t>
+              <w:t xml:space="preserve">2008-09-13</w:t>
             </w:r>
             <w:r>
               <w:rPr>
@@ -455,7 +455,7 @@
                 <w:sz w:val="22"/>
                 <w:shd w:fill="auto" w:val="clear"/>
               </w:rPr>
-              <w:t xml:space="preserve">Kelsey Blanchard</w:t>
+              <w:t xml:space="preserve">Lucian Vasquez</w:t>
             </w:r>
             <w:r>
               <w:rPr>
@@ -617,7 +617,7 @@
           <w:sz w:val="24"/>
           <w:shd w:fill="auto" w:val="clear"/>
         </w:rPr>
-        <w:t xml:space="preserve">  Ihr Angebot AN20250930122610</w:t>
+        <w:t xml:space="preserve">  Ihr Angebot AN20250930135545</w:t>
       </w:r>
     </w:p>
     <w:p>
@@ -643,7 +643,7 @@
           <w:sz w:val="22"/>
           <w:shd w:fill="auto" w:val="clear"/>
         </w:rPr>
-        <w:t xml:space="preserve">  Sehr geehrte Frau Pitts,</w:t>
+        <w:t xml:space="preserve">  Sehr geehrte Frau Hahn,</w:t>
         <w:br/>
       </w:r>
     </w:p>
@@ -1072,7 +1072,7 @@
                 <w:sz w:val="20"/>
                 <w:shd w:fill="auto" w:val="clear"/>
               </w:rPr>
-              <w:t xml:space="preserve">626,60 €</w:t>
+              <w:t xml:space="preserve">3.089,40 €</w:t>
             </w:r>
           </w:p>
         </w:tc>
@@ -1112,7 +1112,7 @@
                 <w:sz w:val="20"/>
                 <w:shd w:fill="auto" w:val="clear"/>
               </w:rPr>
-              <w:t xml:space="preserve">626,60 €</w:t>
+              <w:t xml:space="preserve">3.089,40 €</w:t>
             </w:r>
           </w:p>
         </w:tc>
@@ -1477,7 +1477,33 @@
                 <w:sz w:val="18"/>
                 <w:shd w:fill="auto" w:val="clear"/>
               </w:rPr>
-              <w:t xml:space="preserve">- 168 km Kilometerpauschale </w:t>
+              <w:t xml:space="preserve">- 112 km Kilometerpauschale </w:t>
+            </w:r>
+          </w:p>
+          <w:p>
+            <w:pPr>
+              <w:spacing w:before="0" w:after="0" w:line="278"/>
+              <w:ind w:right="314" w:left="0" w:firstLine="0"/>
+              <w:jc w:val="left"/>
+              <w:rPr>
+                <w:rFonts w:ascii="Open Sans" w:hAnsi="Open Sans" w:cs="Open Sans" w:eastAsia="Open Sans"/>
+                <w:color w:val="auto"/>
+                <w:spacing w:val="0"/>
+                <w:position w:val="0"/>
+                <w:sz w:val="18"/>
+                <w:shd w:fill="auto" w:val="clear"/>
+              </w:rPr>
+            </w:pPr>
+            <w:r>
+              <w:rPr>
+                <w:rFonts w:ascii="Open Sans" w:hAnsi="Open Sans" w:cs="Open Sans" w:eastAsia="Open Sans"/>
+                <w:color w:val="auto"/>
+                <w:spacing w:val="0"/>
+                <w:position w:val="0"/>
+                <w:sz w:val="18"/>
+                <w:shd w:fill="auto" w:val="clear"/>
+              </w:rPr>
+              <w:t xml:space="preserve">- Auswechseln eines Waschtisches</w:t>
             </w:r>
           </w:p>
         </w:tc>
@@ -2651,7 +2677,7 @@
                 <w:sz w:val="22"/>
                 <w:shd w:fill="auto" w:val="clear"/>
               </w:rPr>
-              <w:t xml:space="preserve">1.556,42 €</w:t>
+              <w:t xml:space="preserve">4.415,40 €</w:t>
             </w:r>
             <w:r>
               <w:rPr>
@@ -2825,7 +2851,7 @@
                 <w:sz w:val="22"/>
                 <w:shd w:fill="auto" w:val="clear"/>
               </w:rPr>
-              <w:t xml:space="preserve">295,72 €</w:t>
+              <w:t xml:space="preserve">838,93 €</w:t>
             </w:r>
             <w:r>
               <w:rPr>
@@ -2999,7 +3025,7 @@
                 <w:sz w:val="22"/>
                 <w:shd w:fill="auto" w:val="clear"/>
               </w:rPr>
-              <w:t xml:space="preserve">1.852,14 €</w:t>
+              <w:t xml:space="preserve">5.254,33 €</w:t>
             </w:r>
             <w:r>
               <w:rPr>

</xml_diff>

<commit_message>
optional reset sub items when desselect big items
</commit_message>
<xml_diff>
--- a/out-Angebot.docx
+++ b/out-Angebot.docx
@@ -93,7 +93,7 @@
           <w:sz w:val="22"/>
           <w:shd w:fill="auto" w:val="clear"/>
         </w:rPr>
-        <w:t xml:space="preserve">Idola Fowler</w:t>
+        <w:t xml:space="preserve">Amber Wheeler</w:t>
       </w:r>
     </w:p>
     <w:p>
@@ -119,7 +119,7 @@
           <w:sz w:val="22"/>
           <w:shd w:fill="auto" w:val="clear"/>
         </w:rPr>
-        <w:t xml:space="preserve">Accusantium voluptat,</w:t>
+        <w:t xml:space="preserve">Magna enim quia cons,</w:t>
       </w:r>
     </w:p>
     <w:p>
@@ -145,7 +145,7 @@
           <w:sz w:val="22"/>
           <w:shd w:fill="auto" w:val="clear"/>
         </w:rPr>
-        <w:t xml:space="preserve">Incididunt eos ad do Tempore perferendis</w:t>
+        <w:t xml:space="preserve">Sit quo qui ipsum q Culpa Nam nulla id </w:t>
       </w:r>
     </w:p>
     <w:tbl>
@@ -320,7 +320,7 @@
                 <w:sz w:val="22"/>
                 <w:shd w:fill="auto" w:val="clear"/>
               </w:rPr>
-              <w:t xml:space="preserve">Logan Wilkinson</w:t>
+              <w:t xml:space="preserve">Orson Dickerson</w:t>
             </w:r>
           </w:p>
         </w:tc>
@@ -363,7 +363,7 @@
                 <w:sz w:val="22"/>
                 <w:shd w:fill="auto" w:val="clear"/>
               </w:rPr>
-              <w:t xml:space="preserve">AN20250930143908</w:t>
+              <w:t xml:space="preserve">AN20250930155106</w:t>
             </w:r>
             <w:r>
               <w:rPr>
@@ -411,7 +411,7 @@
                 <w:sz w:val="22"/>
                 <w:shd w:fill="auto" w:val="clear"/>
               </w:rPr>
-              <w:t xml:space="preserve">1974-08-05</w:t>
+              <w:t xml:space="preserve">2003-01-25</w:t>
             </w:r>
             <w:r>
               <w:rPr>
@@ -455,7 +455,7 @@
                 <w:sz w:val="22"/>
                 <w:shd w:fill="auto" w:val="clear"/>
               </w:rPr>
-              <w:t xml:space="preserve">Rama Harris</w:t>
+              <w:t xml:space="preserve">Troy Kline</w:t>
             </w:r>
             <w:r>
               <w:rPr>
@@ -617,7 +617,7 @@
           <w:sz w:val="24"/>
           <w:shd w:fill="auto" w:val="clear"/>
         </w:rPr>
-        <w:t xml:space="preserve">  Ihr Angebot AN20250930143908</w:t>
+        <w:t xml:space="preserve">  Ihr Angebot AN20250930155106</w:t>
       </w:r>
     </w:p>
     <w:p>
@@ -643,7 +643,7 @@
           <w:sz w:val="22"/>
           <w:shd w:fill="auto" w:val="clear"/>
         </w:rPr>
-        <w:t xml:space="preserve">  Sehr geehrte Frau Fowler,</w:t>
+        <w:t xml:space="preserve">  Sehr geehrte Frau Wheeler,</w:t>
         <w:br/>
       </w:r>
     </w:p>
@@ -1072,7 +1072,7 @@
                 <w:sz w:val="20"/>
                 <w:shd w:fill="auto" w:val="clear"/>
               </w:rPr>
-              <w:t xml:space="preserve">2.228,80 €</w:t>
+              <w:t xml:space="preserve">2.223,20 €</w:t>
             </w:r>
           </w:p>
         </w:tc>
@@ -1112,7 +1112,7 @@
                 <w:sz w:val="20"/>
                 <w:shd w:fill="auto" w:val="clear"/>
               </w:rPr>
-              <w:t xml:space="preserve">2.228,80 €</w:t>
+              <w:t xml:space="preserve">2.223,20 €</w:t>
             </w:r>
           </w:p>
         </w:tc>
@@ -1477,7 +1477,7 @@
                 <w:sz w:val="18"/>
                 <w:shd w:fill="auto" w:val="clear"/>
               </w:rPr>
-              <w:t xml:space="preserve">- 74 km Kilometerpauschale </w:t>
+              <w:t xml:space="preserve">- 66 km Kilometerpauschale </w:t>
             </w:r>
           </w:p>
           <w:p>
@@ -1965,7 +1965,7 @@
                 <w:sz w:val="20"/>
                 <w:shd w:fill="auto" w:val="clear"/>
               </w:rPr>
-              <w:t xml:space="preserve">619,88 €</w:t>
+              <w:t xml:space="preserve">984,34 €</w:t>
             </w:r>
           </w:p>
         </w:tc>
@@ -2005,7 +2005,7 @@
                 <w:sz w:val="20"/>
                 <w:shd w:fill="auto" w:val="clear"/>
               </w:rPr>
-              <w:t xml:space="preserve">619,88 €</w:t>
+              <w:t xml:space="preserve">984,34 €</w:t>
             </w:r>
           </w:p>
         </w:tc>
@@ -2396,6 +2396,58 @@
                 <w:sz w:val="20"/>
                 <w:shd w:fill="auto" w:val="clear"/>
               </w:rPr>
+              <w:t xml:space="preserve">- 1 Stk Wandverkleidung 3.0 Alu 997×2550 mm — Farbe: Marmor weiß</w:t>
+            </w:r>
+          </w:p>
+          <w:p>
+            <w:pPr>
+              <w:spacing w:before="0" w:after="0" w:line="278"/>
+              <w:ind w:right="314" w:left="0" w:firstLine="0"/>
+              <w:jc w:val="left"/>
+              <w:rPr>
+                <w:rFonts w:ascii="Open Sans" w:hAnsi="Open Sans" w:cs="Open Sans" w:eastAsia="Open Sans"/>
+                <w:color w:val="auto"/>
+                <w:spacing w:val="0"/>
+                <w:position w:val="0"/>
+                <w:sz w:val="20"/>
+                <w:shd w:fill="auto" w:val="clear"/>
+              </w:rPr>
+            </w:pPr>
+            <w:r>
+              <w:rPr>
+                <w:rFonts w:ascii="Open Sans" w:hAnsi="Open Sans" w:cs="Open Sans" w:eastAsia="Open Sans"/>
+                <w:color w:val="auto"/>
+                <w:spacing w:val="0"/>
+                <w:position w:val="0"/>
+                <w:sz w:val="20"/>
+                <w:shd w:fill="auto" w:val="clear"/>
+              </w:rPr>
+              <w:t xml:space="preserve">- 1 Stk Wandverkleidung 3.0 Alu 1497×2550 mm — Farbe: Marmor weiß</w:t>
+            </w:r>
+          </w:p>
+          <w:p>
+            <w:pPr>
+              <w:spacing w:before="0" w:after="0" w:line="278"/>
+              <w:ind w:right="314" w:left="0" w:firstLine="0"/>
+              <w:jc w:val="left"/>
+              <w:rPr>
+                <w:rFonts w:ascii="Open Sans" w:hAnsi="Open Sans" w:cs="Open Sans" w:eastAsia="Open Sans"/>
+                <w:color w:val="auto"/>
+                <w:spacing w:val="0"/>
+                <w:position w:val="0"/>
+                <w:sz w:val="20"/>
+                <w:shd w:fill="auto" w:val="clear"/>
+              </w:rPr>
+            </w:pPr>
+            <w:r>
+              <w:rPr>
+                <w:rFonts w:ascii="Open Sans" w:hAnsi="Open Sans" w:cs="Open Sans" w:eastAsia="Open Sans"/>
+                <w:color w:val="auto"/>
+                <w:spacing w:val="0"/>
+                <w:position w:val="0"/>
+                <w:sz w:val="20"/>
+                <w:shd w:fill="auto" w:val="clear"/>
+              </w:rPr>
               <w:t xml:space="preserve">- 1 Stk TRINNITY Wandabdichtung BASIS-Set 5 qm DW bis 100 x 100 / BW bis 180 x 80 cm</w:t>
             </w:r>
           </w:p>
@@ -2422,7 +2474,33 @@
                 <w:sz w:val="20"/>
                 <w:shd w:fill="auto" w:val="clear"/>
               </w:rPr>
-              <w:t xml:space="preserve">- 1 Stk Duschwanne 90 x 70 x 3 cm</w:t>
+              <w:t xml:space="preserve">- 7 Stk Wandverkleidungsklebstoff 3.0/4.0</w:t>
+            </w:r>
+          </w:p>
+          <w:p>
+            <w:pPr>
+              <w:spacing w:before="0" w:after="0" w:line="278"/>
+              <w:ind w:right="314" w:left="0" w:firstLine="0"/>
+              <w:jc w:val="left"/>
+              <w:rPr>
+                <w:rFonts w:ascii="Open Sans" w:hAnsi="Open Sans" w:cs="Open Sans" w:eastAsia="Open Sans"/>
+                <w:color w:val="auto"/>
+                <w:spacing w:val="0"/>
+                <w:position w:val="0"/>
+                <w:sz w:val="20"/>
+                <w:shd w:fill="auto" w:val="clear"/>
+              </w:rPr>
+            </w:pPr>
+            <w:r>
+              <w:rPr>
+                <w:rFonts w:ascii="Open Sans" w:hAnsi="Open Sans" w:cs="Open Sans" w:eastAsia="Open Sans"/>
+                <w:color w:val="auto"/>
+                <w:spacing w:val="0"/>
+                <w:position w:val="0"/>
+                <w:sz w:val="20"/>
+                <w:shd w:fill="auto" w:val="clear"/>
+              </w:rPr>
+              <w:t xml:space="preserve">- 1 Stk Verbindungsprofil(e) (Plattenanzahl - 1)</w:t>
             </w:r>
           </w:p>
         </w:tc>
@@ -2677,7 +2755,7 @@
                 <w:sz w:val="22"/>
                 <w:shd w:fill="auto" w:val="clear"/>
               </w:rPr>
-              <w:t xml:space="preserve">3.182,63 €</w:t>
+              <w:t xml:space="preserve">3.797,27 €</w:t>
             </w:r>
             <w:r>
               <w:rPr>
@@ -2851,7 +2929,7 @@
                 <w:sz w:val="22"/>
                 <w:shd w:fill="auto" w:val="clear"/>
               </w:rPr>
-              <w:t xml:space="preserve">604,70 €</w:t>
+              <w:t xml:space="preserve">721,48 €</w:t>
             </w:r>
             <w:r>
               <w:rPr>
@@ -3025,7 +3103,7 @@
                 <w:sz w:val="22"/>
                 <w:shd w:fill="auto" w:val="clear"/>
               </w:rPr>
-              <w:t xml:space="preserve">3.787,33 €</w:t>
+              <w:t xml:space="preserve">4.518,75 €</w:t>
             </w:r>
             <w:r>
               <w:rPr>

</xml_diff>

<commit_message>
optional items correct names in kosten-details shown
</commit_message>
<xml_diff>
--- a/out-Angebot.docx
+++ b/out-Angebot.docx
@@ -93,7 +93,7 @@
           <w:sz w:val="22"/>
           <w:shd w:fill="auto" w:val="clear"/>
         </w:rPr>
-        <w:t xml:space="preserve">Amber Wheeler</w:t>
+        <w:t xml:space="preserve">Rylee Morris</w:t>
       </w:r>
     </w:p>
     <w:p>
@@ -119,7 +119,7 @@
           <w:sz w:val="22"/>
           <w:shd w:fill="auto" w:val="clear"/>
         </w:rPr>
-        <w:t xml:space="preserve">Magna enim quia cons,</w:t>
+        <w:t xml:space="preserve">Quia rerum quas moll,</w:t>
       </w:r>
     </w:p>
     <w:p>
@@ -145,7 +145,7 @@
           <w:sz w:val="22"/>
           <w:shd w:fill="auto" w:val="clear"/>
         </w:rPr>
-        <w:t xml:space="preserve">Sit quo qui ipsum q Culpa Nam nulla id </w:t>
+        <w:t xml:space="preserve">Ullamco hic tenetur  Harum aut tenetur ip</w:t>
       </w:r>
     </w:p>
     <w:tbl>
@@ -320,7 +320,7 @@
                 <w:sz w:val="22"/>
                 <w:shd w:fill="auto" w:val="clear"/>
               </w:rPr>
-              <w:t xml:space="preserve">Orson Dickerson</w:t>
+              <w:t xml:space="preserve">Deirdre Neal</w:t>
             </w:r>
           </w:p>
         </w:tc>
@@ -363,7 +363,7 @@
                 <w:sz w:val="22"/>
                 <w:shd w:fill="auto" w:val="clear"/>
               </w:rPr>
-              <w:t xml:space="preserve">AN20250930155106</w:t>
+              <w:t xml:space="preserve">AN20251001083541</w:t>
             </w:r>
             <w:r>
               <w:rPr>
@@ -411,7 +411,7 @@
                 <w:sz w:val="22"/>
                 <w:shd w:fill="auto" w:val="clear"/>
               </w:rPr>
-              <w:t xml:space="preserve">2003-01-25</w:t>
+              <w:t xml:space="preserve">1992-12-12</w:t>
             </w:r>
             <w:r>
               <w:rPr>
@@ -455,7 +455,7 @@
                 <w:sz w:val="22"/>
                 <w:shd w:fill="auto" w:val="clear"/>
               </w:rPr>
-              <w:t xml:space="preserve">Troy Kline</w:t>
+              <w:t xml:space="preserve">Neve Roman</w:t>
             </w:r>
             <w:r>
               <w:rPr>
@@ -617,7 +617,7 @@
           <w:sz w:val="24"/>
           <w:shd w:fill="auto" w:val="clear"/>
         </w:rPr>
-        <w:t xml:space="preserve">  Ihr Angebot AN20250930155106</w:t>
+        <w:t xml:space="preserve">  Ihr Angebot AN20251001083541</w:t>
       </w:r>
     </w:p>
     <w:p>
@@ -643,7 +643,7 @@
           <w:sz w:val="22"/>
           <w:shd w:fill="auto" w:val="clear"/>
         </w:rPr>
-        <w:t xml:space="preserve">  Sehr geehrte Frau Wheeler,</w:t>
+        <w:t xml:space="preserve">  Sehr geehrte Frau Morris,</w:t>
         <w:br/>
       </w:r>
     </w:p>
@@ -1072,7 +1072,7 @@
                 <w:sz w:val="20"/>
                 <w:shd w:fill="auto" w:val="clear"/>
               </w:rPr>
-              <w:t xml:space="preserve">2.223,20 €</w:t>
+              <w:t xml:space="preserve">2.562,80 €</w:t>
             </w:r>
           </w:p>
         </w:tc>
@@ -1112,7 +1112,7 @@
                 <w:sz w:val="20"/>
                 <w:shd w:fill="auto" w:val="clear"/>
               </w:rPr>
-              <w:t xml:space="preserve">2.223,20 €</w:t>
+              <w:t xml:space="preserve">2.562,80 €</w:t>
             </w:r>
           </w:p>
         </w:tc>
@@ -1477,7 +1477,33 @@
                 <w:sz w:val="18"/>
                 <w:shd w:fill="auto" w:val="clear"/>
               </w:rPr>
-              <w:t xml:space="preserve">- 66 km Kilometerpauschale </w:t>
+              <w:t xml:space="preserve">- 154 km Kilometerpauschale </w:t>
+            </w:r>
+          </w:p>
+          <w:p>
+            <w:pPr>
+              <w:spacing w:before="0" w:after="0" w:line="278"/>
+              <w:ind w:right="314" w:left="0" w:firstLine="0"/>
+              <w:jc w:val="left"/>
+              <w:rPr>
+                <w:rFonts w:ascii="Open Sans" w:hAnsi="Open Sans" w:cs="Open Sans" w:eastAsia="Open Sans"/>
+                <w:color w:val="auto"/>
+                <w:spacing w:val="0"/>
+                <w:position w:val="0"/>
+                <w:sz w:val="18"/>
+                <w:shd w:fill="auto" w:val="clear"/>
+              </w:rPr>
+            </w:pPr>
+            <w:r>
+              <w:rPr>
+                <w:rFonts w:ascii="Open Sans" w:hAnsi="Open Sans" w:cs="Open Sans" w:eastAsia="Open Sans"/>
+                <w:color w:val="auto"/>
+                <w:spacing w:val="0"/>
+                <w:position w:val="0"/>
+                <w:sz w:val="18"/>
+                <w:shd w:fill="auto" w:val="clear"/>
+              </w:rPr>
+              <w:t xml:space="preserve">- Verkleidung Deckenhoch im Dusch/ Wannenbereich</w:t>
             </w:r>
           </w:p>
           <w:p>
@@ -2755,7 +2781,7 @@
                 <w:sz w:val="22"/>
                 <w:shd w:fill="auto" w:val="clear"/>
               </w:rPr>
-              <w:t xml:space="preserve">3.797,27 €</w:t>
+              <w:t xml:space="preserve">4.136,87 €</w:t>
             </w:r>
             <w:r>
               <w:rPr>
@@ -2929,7 +2955,7 @@
                 <w:sz w:val="22"/>
                 <w:shd w:fill="auto" w:val="clear"/>
               </w:rPr>
-              <w:t xml:space="preserve">721,48 €</w:t>
+              <w:t xml:space="preserve">786,01 €</w:t>
             </w:r>
             <w:r>
               <w:rPr>
@@ -3103,7 +3129,7 @@
                 <w:sz w:val="22"/>
                 <w:shd w:fill="auto" w:val="clear"/>
               </w:rPr>
-              <w:t xml:space="preserve">4.518,75 €</w:t>
+              <w:t xml:space="preserve">4.922,88 €</w:t>
             </w:r>
             <w:r>
               <w:rPr>

</xml_diff>

<commit_message>
optional items added in docx and pdf
</commit_message>
<xml_diff>
--- a/out-Angebot.docx
+++ b/out-Angebot.docx
@@ -363,7 +363,7 @@
                 <w:sz w:val="22"/>
                 <w:shd w:fill="auto" w:val="clear"/>
               </w:rPr>
-              <w:t xml:space="preserve">AN20251001083541</w:t>
+              <w:t xml:space="preserve">AN20251001091333</w:t>
             </w:r>
             <w:r>
               <w:rPr>
@@ -617,7 +617,7 @@
           <w:sz w:val="24"/>
           <w:shd w:fill="auto" w:val="clear"/>
         </w:rPr>
-        <w:t xml:space="preserve">  Ihr Angebot AN20251001083541</w:t>
+        <w:t xml:space="preserve">  Ihr Angebot AN20251001091333</w:t>
       </w:r>
     </w:p>
     <w:p>
@@ -1529,6 +1529,32 @@
                 <w:sz w:val="18"/>
                 <w:shd w:fill="auto" w:val="clear"/>
               </w:rPr>
+              <w:t xml:space="preserve">- Anbringen zusätzlicher Haltegriffe</w:t>
+            </w:r>
+          </w:p>
+          <w:p>
+            <w:pPr>
+              <w:spacing w:before="0" w:after="0" w:line="278"/>
+              <w:ind w:right="314" w:left="0" w:firstLine="0"/>
+              <w:jc w:val="left"/>
+              <w:rPr>
+                <w:rFonts w:ascii="Open Sans" w:hAnsi="Open Sans" w:cs="Open Sans" w:eastAsia="Open Sans"/>
+                <w:color w:val="auto"/>
+                <w:spacing w:val="0"/>
+                <w:position w:val="0"/>
+                <w:sz w:val="18"/>
+                <w:shd w:fill="auto" w:val="clear"/>
+              </w:rPr>
+            </w:pPr>
+            <w:r>
+              <w:rPr>
+                <w:rFonts w:ascii="Open Sans" w:hAnsi="Open Sans" w:cs="Open Sans" w:eastAsia="Open Sans"/>
+                <w:color w:val="auto"/>
+                <w:spacing w:val="0"/>
+                <w:position w:val="0"/>
+                <w:sz w:val="18"/>
+                <w:shd w:fill="auto" w:val="clear"/>
+              </w:rPr>
               <w:t xml:space="preserve">- Auswechseln eines Waschtisches</w:t>
             </w:r>
           </w:p>
@@ -1991,7 +2017,7 @@
                 <w:sz w:val="20"/>
                 <w:shd w:fill="auto" w:val="clear"/>
               </w:rPr>
-              <w:t xml:space="preserve">984,34 €</w:t>
+              <w:t xml:space="preserve">727,77 €</w:t>
             </w:r>
           </w:p>
         </w:tc>
@@ -2031,7 +2057,7 @@
                 <w:sz w:val="20"/>
                 <w:shd w:fill="auto" w:val="clear"/>
               </w:rPr>
-              <w:t xml:space="preserve">984,34 €</w:t>
+              <w:t xml:space="preserve">727,77 €</w:t>
             </w:r>
           </w:p>
         </w:tc>
@@ -2422,58 +2448,6 @@
                 <w:sz w:val="20"/>
                 <w:shd w:fill="auto" w:val="clear"/>
               </w:rPr>
-              <w:t xml:space="preserve">- 1 Stk Wandverkleidung 3.0 Alu 997×2550 mm — Farbe: Marmor weiß</w:t>
-            </w:r>
-          </w:p>
-          <w:p>
-            <w:pPr>
-              <w:spacing w:before="0" w:after="0" w:line="278"/>
-              <w:ind w:right="314" w:left="0" w:firstLine="0"/>
-              <w:jc w:val="left"/>
-              <w:rPr>
-                <w:rFonts w:ascii="Open Sans" w:hAnsi="Open Sans" w:cs="Open Sans" w:eastAsia="Open Sans"/>
-                <w:color w:val="auto"/>
-                <w:spacing w:val="0"/>
-                <w:position w:val="0"/>
-                <w:sz w:val="20"/>
-                <w:shd w:fill="auto" w:val="clear"/>
-              </w:rPr>
-            </w:pPr>
-            <w:r>
-              <w:rPr>
-                <w:rFonts w:ascii="Open Sans" w:hAnsi="Open Sans" w:cs="Open Sans" w:eastAsia="Open Sans"/>
-                <w:color w:val="auto"/>
-                <w:spacing w:val="0"/>
-                <w:position w:val="0"/>
-                <w:sz w:val="20"/>
-                <w:shd w:fill="auto" w:val="clear"/>
-              </w:rPr>
-              <w:t xml:space="preserve">- 1 Stk Wandverkleidung 3.0 Alu 1497×2550 mm — Farbe: Marmor weiß</w:t>
-            </w:r>
-          </w:p>
-          <w:p>
-            <w:pPr>
-              <w:spacing w:before="0" w:after="0" w:line="278"/>
-              <w:ind w:right="314" w:left="0" w:firstLine="0"/>
-              <w:jc w:val="left"/>
-              <w:rPr>
-                <w:rFonts w:ascii="Open Sans" w:hAnsi="Open Sans" w:cs="Open Sans" w:eastAsia="Open Sans"/>
-                <w:color w:val="auto"/>
-                <w:spacing w:val="0"/>
-                <w:position w:val="0"/>
-                <w:sz w:val="20"/>
-                <w:shd w:fill="auto" w:val="clear"/>
-              </w:rPr>
-            </w:pPr>
-            <w:r>
-              <w:rPr>
-                <w:rFonts w:ascii="Open Sans" w:hAnsi="Open Sans" w:cs="Open Sans" w:eastAsia="Open Sans"/>
-                <w:color w:val="auto"/>
-                <w:spacing w:val="0"/>
-                <w:position w:val="0"/>
-                <w:sz w:val="20"/>
-                <w:shd w:fill="auto" w:val="clear"/>
-              </w:rPr>
               <w:t xml:space="preserve">- 1 Stk TRINNITY Wandabdichtung BASIS-Set 5 qm DW bis 100 x 100 / BW bis 180 x 80 cm</w:t>
             </w:r>
           </w:p>
@@ -2500,33 +2474,137 @@
                 <w:sz w:val="20"/>
                 <w:shd w:fill="auto" w:val="clear"/>
               </w:rPr>
-              <w:t xml:space="preserve">- 7 Stk Wandverkleidungsklebstoff 3.0/4.0</w:t>
-            </w:r>
-          </w:p>
-          <w:p>
-            <w:pPr>
-              <w:spacing w:before="0" w:after="0" w:line="278"/>
-              <w:ind w:right="314" w:left="0" w:firstLine="0"/>
-              <w:jc w:val="left"/>
-              <w:rPr>
-                <w:rFonts w:ascii="Open Sans" w:hAnsi="Open Sans" w:cs="Open Sans" w:eastAsia="Open Sans"/>
-                <w:color w:val="auto"/>
-                <w:spacing w:val="0"/>
-                <w:position w:val="0"/>
-                <w:sz w:val="20"/>
-                <w:shd w:fill="auto" w:val="clear"/>
-              </w:rPr>
-            </w:pPr>
-            <w:r>
-              <w:rPr>
-                <w:rFonts w:ascii="Open Sans" w:hAnsi="Open Sans" w:cs="Open Sans" w:eastAsia="Open Sans"/>
-                <w:color w:val="auto"/>
-                <w:spacing w:val="0"/>
-                <w:position w:val="0"/>
-                <w:sz w:val="20"/>
-                <w:shd w:fill="auto" w:val="clear"/>
-              </w:rPr>
-              <w:t xml:space="preserve">- 1 Stk Verbindungsprofil(e) (Plattenanzahl - 1)</w:t>
+              <w:t xml:space="preserve">- 1 Stk Haltegriff clivia plus 32/400mm m. Ros. Edelstahl glatt poliert, VIGOUR</w:t>
+            </w:r>
+          </w:p>
+          <w:p>
+            <w:pPr>
+              <w:spacing w:before="0" w:after="0" w:line="278"/>
+              <w:ind w:right="314" w:left="0" w:firstLine="0"/>
+              <w:jc w:val="left"/>
+              <w:rPr>
+                <w:rFonts w:ascii="Open Sans" w:hAnsi="Open Sans" w:cs="Open Sans" w:eastAsia="Open Sans"/>
+                <w:color w:val="auto"/>
+                <w:spacing w:val="0"/>
+                <w:position w:val="0"/>
+                <w:sz w:val="20"/>
+                <w:shd w:fill="auto" w:val="clear"/>
+              </w:rPr>
+            </w:pPr>
+            <w:r>
+              <w:rPr>
+                <w:rFonts w:ascii="Open Sans" w:hAnsi="Open Sans" w:cs="Open Sans" w:eastAsia="Open Sans"/>
+                <w:color w:val="auto"/>
+                <w:spacing w:val="0"/>
+                <w:position w:val="0"/>
+                <w:sz w:val="20"/>
+                <w:shd w:fill="auto" w:val="clear"/>
+              </w:rPr>
+              <w:t xml:space="preserve">- 1 Stk Haltegriff clivia plus 32/600mm m. Ros. Edelstahl glatt poliert, VIGOUR</w:t>
+            </w:r>
+          </w:p>
+          <w:p>
+            <w:pPr>
+              <w:spacing w:before="0" w:after="0" w:line="278"/>
+              <w:ind w:right="314" w:left="0" w:firstLine="0"/>
+              <w:jc w:val="left"/>
+              <w:rPr>
+                <w:rFonts w:ascii="Open Sans" w:hAnsi="Open Sans" w:cs="Open Sans" w:eastAsia="Open Sans"/>
+                <w:color w:val="auto"/>
+                <w:spacing w:val="0"/>
+                <w:position w:val="0"/>
+                <w:sz w:val="20"/>
+                <w:shd w:fill="auto" w:val="clear"/>
+              </w:rPr>
+            </w:pPr>
+            <w:r>
+              <w:rPr>
+                <w:rFonts w:ascii="Open Sans" w:hAnsi="Open Sans" w:cs="Open Sans" w:eastAsia="Open Sans"/>
+                <w:color w:val="auto"/>
+                <w:spacing w:val="0"/>
+                <w:position w:val="0"/>
+                <w:sz w:val="20"/>
+                <w:shd w:fill="auto" w:val="clear"/>
+              </w:rPr>
+              <w:t xml:space="preserve">- 4 Stk Waschtisch clivia 60x48 cm weiss VIGOUR</w:t>
+            </w:r>
+          </w:p>
+          <w:p>
+            <w:pPr>
+              <w:spacing w:before="0" w:after="0" w:line="278"/>
+              <w:ind w:right="314" w:left="0" w:firstLine="0"/>
+              <w:jc w:val="left"/>
+              <w:rPr>
+                <w:rFonts w:ascii="Open Sans" w:hAnsi="Open Sans" w:cs="Open Sans" w:eastAsia="Open Sans"/>
+                <w:color w:val="auto"/>
+                <w:spacing w:val="0"/>
+                <w:position w:val="0"/>
+                <w:sz w:val="20"/>
+                <w:shd w:fill="auto" w:val="clear"/>
+              </w:rPr>
+            </w:pPr>
+            <w:r>
+              <w:rPr>
+                <w:rFonts w:ascii="Open Sans" w:hAnsi="Open Sans" w:cs="Open Sans" w:eastAsia="Open Sans"/>
+                <w:color w:val="auto"/>
+                <w:spacing w:val="0"/>
+                <w:position w:val="0"/>
+                <w:sz w:val="20"/>
+                <w:shd w:fill="auto" w:val="clear"/>
+              </w:rPr>
+              <w:t xml:space="preserve">- 4 Stk Befestigungssatz Fischer WST 10x140</w:t>
+            </w:r>
+          </w:p>
+          <w:p>
+            <w:pPr>
+              <w:spacing w:before="0" w:after="0" w:line="278"/>
+              <w:ind w:right="314" w:left="0" w:firstLine="0"/>
+              <w:jc w:val="left"/>
+              <w:rPr>
+                <w:rFonts w:ascii="Open Sans" w:hAnsi="Open Sans" w:cs="Open Sans" w:eastAsia="Open Sans"/>
+                <w:color w:val="auto"/>
+                <w:spacing w:val="0"/>
+                <w:position w:val="0"/>
+                <w:sz w:val="20"/>
+                <w:shd w:fill="auto" w:val="clear"/>
+              </w:rPr>
+            </w:pPr>
+            <w:r>
+              <w:rPr>
+                <w:rFonts w:ascii="Open Sans" w:hAnsi="Open Sans" w:cs="Open Sans" w:eastAsia="Open Sans"/>
+                <w:color w:val="auto"/>
+                <w:spacing w:val="0"/>
+                <w:position w:val="0"/>
+                <w:sz w:val="20"/>
+                <w:shd w:fill="auto" w:val="clear"/>
+              </w:rPr>
+              <w:t xml:space="preserve">- 4 Stk Waschtisch-Röhrensiphon 1 1/4" G mit Verstellrohr 120mm TRINNITY</w:t>
+            </w:r>
+          </w:p>
+          <w:p>
+            <w:pPr>
+              <w:spacing w:before="0" w:after="0" w:line="278"/>
+              <w:ind w:right="314" w:left="0" w:firstLine="0"/>
+              <w:jc w:val="left"/>
+              <w:rPr>
+                <w:rFonts w:ascii="Open Sans" w:hAnsi="Open Sans" w:cs="Open Sans" w:eastAsia="Open Sans"/>
+                <w:color w:val="auto"/>
+                <w:spacing w:val="0"/>
+                <w:position w:val="0"/>
+                <w:sz w:val="20"/>
+                <w:shd w:fill="auto" w:val="clear"/>
+              </w:rPr>
+            </w:pPr>
+            <w:r>
+              <w:rPr>
+                <w:rFonts w:ascii="Open Sans" w:hAnsi="Open Sans" w:cs="Open Sans" w:eastAsia="Open Sans"/>
+                <w:color w:val="auto"/>
+                <w:spacing w:val="0"/>
+                <w:position w:val="0"/>
+                <w:sz w:val="20"/>
+                <w:shd w:fill="auto" w:val="clear"/>
+              </w:rPr>
+              <w:t xml:space="preserve">- 8 Stk SCHELL Eckventil COMFORT regulierbar, ASAG, 1/2", chrom</w:t>
             </w:r>
           </w:p>
         </w:tc>
@@ -2781,7 +2859,7 @@
                 <w:sz w:val="22"/>
                 <w:shd w:fill="auto" w:val="clear"/>
               </w:rPr>
-              <w:t xml:space="preserve">4.136,87 €</w:t>
+              <w:t xml:space="preserve">4.187,68 €</w:t>
             </w:r>
             <w:r>
               <w:rPr>
@@ -2955,7 +3033,7 @@
                 <w:sz w:val="22"/>
                 <w:shd w:fill="auto" w:val="clear"/>
               </w:rPr>
-              <w:t xml:space="preserve">786,01 €</w:t>
+              <w:t xml:space="preserve">795,66 €</w:t>
             </w:r>
             <w:r>
               <w:rPr>
@@ -3129,7 +3207,7 @@
                 <w:sz w:val="22"/>
                 <w:shd w:fill="auto" w:val="clear"/>
               </w:rPr>
-              <w:t xml:space="preserve">4.922,88 €</w:t>
+              <w:t xml:space="preserve">4.983,34 €</w:t>
             </w:r>
             <w:r>
               <w:rPr>

</xml_diff>

<commit_message>
add individ v5fb02 kosten-details menus and in the generated file
</commit_message>
<xml_diff>
--- a/out-Angebot.docx
+++ b/out-Angebot.docx
@@ -363,7 +363,7 @@
                 <w:sz w:val="22"/>
                 <w:shd w:fill="auto" w:val="clear"/>
               </w:rPr>
-              <w:t xml:space="preserve">AN20251001100530</w:t>
+              <w:t xml:space="preserve">AN20251001111820</w:t>
             </w:r>
             <w:r>
               <w:rPr>
@@ -617,7 +617,7 @@
           <w:sz w:val="24"/>
           <w:shd w:fill="auto" w:val="clear"/>
         </w:rPr>
-        <w:t xml:space="preserve">  Ihr Angebot AN20251001100530</w:t>
+        <w:t xml:space="preserve">  Ihr Angebot AN20251001111820</w:t>
       </w:r>
     </w:p>
     <w:p>
@@ -1529,58 +1529,6 @@
                 <w:sz w:val="18"/>
                 <w:shd w:fill="auto" w:val="clear"/>
               </w:rPr>
-              <w:t xml:space="preserve">- Auswechseln des Duschsystems</w:t>
-            </w:r>
-          </w:p>
-          <w:p>
-            <w:pPr>
-              <w:spacing w:before="0" w:after="0" w:line="278"/>
-              <w:ind w:right="314" w:left="0" w:firstLine="0"/>
-              <w:jc w:val="left"/>
-              <w:rPr>
-                <w:rFonts w:ascii="Open Sans" w:hAnsi="Open Sans" w:cs="Open Sans" w:eastAsia="Open Sans"/>
-                <w:color w:val="auto"/>
-                <w:spacing w:val="0"/>
-                <w:position w:val="0"/>
-                <w:sz w:val="18"/>
-                <w:shd w:fill="auto" w:val="clear"/>
-              </w:rPr>
-            </w:pPr>
-            <w:r>
-              <w:rPr>
-                <w:rFonts w:ascii="Open Sans" w:hAnsi="Open Sans" w:cs="Open Sans" w:eastAsia="Open Sans"/>
-                <w:color w:val="auto"/>
-                <w:spacing w:val="0"/>
-                <w:position w:val="0"/>
-                <w:sz w:val="18"/>
-                <w:shd w:fill="auto" w:val="clear"/>
-              </w:rPr>
-              <w:t xml:space="preserve">- Anbringen zusätzlicher Haltegriffe</w:t>
-            </w:r>
-          </w:p>
-          <w:p>
-            <w:pPr>
-              <w:spacing w:before="0" w:after="0" w:line="278"/>
-              <w:ind w:right="314" w:left="0" w:firstLine="0"/>
-              <w:jc w:val="left"/>
-              <w:rPr>
-                <w:rFonts w:ascii="Open Sans" w:hAnsi="Open Sans" w:cs="Open Sans" w:eastAsia="Open Sans"/>
-                <w:color w:val="auto"/>
-                <w:spacing w:val="0"/>
-                <w:position w:val="0"/>
-                <w:sz w:val="18"/>
-                <w:shd w:fill="auto" w:val="clear"/>
-              </w:rPr>
-            </w:pPr>
-            <w:r>
-              <w:rPr>
-                <w:rFonts w:ascii="Open Sans" w:hAnsi="Open Sans" w:cs="Open Sans" w:eastAsia="Open Sans"/>
-                <w:color w:val="auto"/>
-                <w:spacing w:val="0"/>
-                <w:position w:val="0"/>
-                <w:sz w:val="18"/>
-                <w:shd w:fill="auto" w:val="clear"/>
-              </w:rPr>
               <w:t xml:space="preserve">- Auswechseln eines Waschtisches</w:t>
             </w:r>
           </w:p>
@@ -2043,7 +1991,7 @@
                 <w:sz w:val="20"/>
                 <w:shd w:fill="auto" w:val="clear"/>
               </w:rPr>
-              <w:t xml:space="preserve">1.543,82 €</w:t>
+              <w:t xml:space="preserve">2.480,36 €</w:t>
             </w:r>
           </w:p>
         </w:tc>
@@ -2083,7 +2031,7 @@
                 <w:sz w:val="20"/>
                 <w:shd w:fill="auto" w:val="clear"/>
               </w:rPr>
-              <w:t xml:space="preserve">1.543,82 €</w:t>
+              <w:t xml:space="preserve">2.480,36 €</w:t>
             </w:r>
           </w:p>
         </w:tc>
@@ -2474,33 +2422,59 @@
                 <w:sz w:val="20"/>
                 <w:shd w:fill="auto" w:val="clear"/>
               </w:rPr>
-              <w:t xml:space="preserve">- 8 Stk Fußboden-Paneele (1 Paneele = 0.3 m² )</w:t>
-            </w:r>
-          </w:p>
-          <w:p>
-            <w:pPr>
-              <w:spacing w:before="0" w:after="0" w:line="278"/>
-              <w:ind w:right="314" w:left="0" w:firstLine="0"/>
-              <w:jc w:val="left"/>
-              <w:rPr>
-                <w:rFonts w:ascii="Open Sans" w:hAnsi="Open Sans" w:cs="Open Sans" w:eastAsia="Open Sans"/>
-                <w:color w:val="auto"/>
-                <w:spacing w:val="0"/>
-                <w:position w:val="0"/>
-                <w:sz w:val="20"/>
-                <w:shd w:fill="auto" w:val="clear"/>
-              </w:rPr>
-            </w:pPr>
-            <w:r>
-              <w:rPr>
-                <w:rFonts w:ascii="Open Sans" w:hAnsi="Open Sans" w:cs="Open Sans" w:eastAsia="Open Sans"/>
-                <w:color w:val="auto"/>
-                <w:spacing w:val="0"/>
-                <w:position w:val="0"/>
-                <w:sz w:val="20"/>
-                <w:shd w:fill="auto" w:val="clear"/>
-              </w:rPr>
-              <w:t xml:space="preserve">- 4 Pkg Flächenkleber (1 Pkg je 0,60 m²)</w:t>
+              <w:t xml:space="preserve">- 20 Stk Fußboden-Paneele (1 Paneele = 0.3 m² )</w:t>
+            </w:r>
+          </w:p>
+          <w:p>
+            <w:pPr>
+              <w:spacing w:before="0" w:after="0" w:line="278"/>
+              <w:ind w:right="314" w:left="0" w:firstLine="0"/>
+              <w:jc w:val="left"/>
+              <w:rPr>
+                <w:rFonts w:ascii="Open Sans" w:hAnsi="Open Sans" w:cs="Open Sans" w:eastAsia="Open Sans"/>
+                <w:color w:val="auto"/>
+                <w:spacing w:val="0"/>
+                <w:position w:val="0"/>
+                <w:sz w:val="20"/>
+                <w:shd w:fill="auto" w:val="clear"/>
+              </w:rPr>
+            </w:pPr>
+            <w:r>
+              <w:rPr>
+                <w:rFonts w:ascii="Open Sans" w:hAnsi="Open Sans" w:cs="Open Sans" w:eastAsia="Open Sans"/>
+                <w:color w:val="auto"/>
+                <w:spacing w:val="0"/>
+                <w:position w:val="0"/>
+                <w:sz w:val="20"/>
+                <w:shd w:fill="auto" w:val="clear"/>
+              </w:rPr>
+              <w:t xml:space="preserve">- 9 Pkg Flächenkleber (1 Pkg je 0,60 m²)</w:t>
+            </w:r>
+          </w:p>
+          <w:p>
+            <w:pPr>
+              <w:spacing w:before="0" w:after="0" w:line="278"/>
+              <w:ind w:right="314" w:left="0" w:firstLine="0"/>
+              <w:jc w:val="left"/>
+              <w:rPr>
+                <w:rFonts w:ascii="Open Sans" w:hAnsi="Open Sans" w:cs="Open Sans" w:eastAsia="Open Sans"/>
+                <w:color w:val="auto"/>
+                <w:spacing w:val="0"/>
+                <w:position w:val="0"/>
+                <w:sz w:val="20"/>
+                <w:shd w:fill="auto" w:val="clear"/>
+              </w:rPr>
+            </w:pPr>
+            <w:r>
+              <w:rPr>
+                <w:rFonts w:ascii="Open Sans" w:hAnsi="Open Sans" w:cs="Open Sans" w:eastAsia="Open Sans"/>
+                <w:color w:val="auto"/>
+                <w:spacing w:val="0"/>
+                <w:position w:val="0"/>
+                <w:sz w:val="20"/>
+                <w:shd w:fill="auto" w:val="clear"/>
+              </w:rPr>
+              <w:t xml:space="preserve">- 5 m² Fußboden individ.5.0 V5FB02</w:t>
             </w:r>
           </w:p>
           <w:p>
@@ -2527,110 +2501,6 @@
                 <w:shd w:fill="auto" w:val="clear"/>
               </w:rPr>
               <w:t xml:space="preserve">- 1 Stk TRINNITY Wandabdichtung BASIS-Set 5 qm DW bis 100 x 100 / BW bis 180 x 80 cm</w:t>
-            </w:r>
-          </w:p>
-          <w:p>
-            <w:pPr>
-              <w:spacing w:before="0" w:after="0" w:line="278"/>
-              <w:ind w:right="314" w:left="0" w:firstLine="0"/>
-              <w:jc w:val="left"/>
-              <w:rPr>
-                <w:rFonts w:ascii="Open Sans" w:hAnsi="Open Sans" w:cs="Open Sans" w:eastAsia="Open Sans"/>
-                <w:color w:val="auto"/>
-                <w:spacing w:val="0"/>
-                <w:position w:val="0"/>
-                <w:sz w:val="20"/>
-                <w:shd w:fill="auto" w:val="clear"/>
-              </w:rPr>
-            </w:pPr>
-            <w:r>
-              <w:rPr>
-                <w:rFonts w:ascii="Open Sans" w:hAnsi="Open Sans" w:cs="Open Sans" w:eastAsia="Open Sans"/>
-                <w:color w:val="auto"/>
-                <w:spacing w:val="0"/>
-                <w:position w:val="0"/>
-                <w:sz w:val="20"/>
-                <w:shd w:fill="auto" w:val="clear"/>
-              </w:rPr>
-              <w:t xml:space="preserve">- 1 Stk Wannenset individual 2.2 m. Wandhalter Schlauch u. HB 1-str. rund verchr. VIGOUR</w:t>
-            </w:r>
-          </w:p>
-          <w:p>
-            <w:pPr>
-              <w:spacing w:before="0" w:after="0" w:line="278"/>
-              <w:ind w:right="314" w:left="0" w:firstLine="0"/>
-              <w:jc w:val="left"/>
-              <w:rPr>
-                <w:rFonts w:ascii="Open Sans" w:hAnsi="Open Sans" w:cs="Open Sans" w:eastAsia="Open Sans"/>
-                <w:color w:val="auto"/>
-                <w:spacing w:val="0"/>
-                <w:position w:val="0"/>
-                <w:sz w:val="20"/>
-                <w:shd w:fill="auto" w:val="clear"/>
-              </w:rPr>
-            </w:pPr>
-            <w:r>
-              <w:rPr>
-                <w:rFonts w:ascii="Open Sans" w:hAnsi="Open Sans" w:cs="Open Sans" w:eastAsia="Open Sans"/>
-                <w:color w:val="auto"/>
-                <w:spacing w:val="0"/>
-                <w:position w:val="0"/>
-                <w:sz w:val="20"/>
-                <w:shd w:fill="auto" w:val="clear"/>
-              </w:rPr>
-              <w:t xml:space="preserve">- 1 Stk Brausegarnitur individ. 2.2 m. Stange 90cm Schlauch u. HB 3-str. rund verchr. VIGOUR</w:t>
-            </w:r>
-          </w:p>
-          <w:p>
-            <w:pPr>
-              <w:spacing w:before="0" w:after="0" w:line="278"/>
-              <w:ind w:right="314" w:left="0" w:firstLine="0"/>
-              <w:jc w:val="left"/>
-              <w:rPr>
-                <w:rFonts w:ascii="Open Sans" w:hAnsi="Open Sans" w:cs="Open Sans" w:eastAsia="Open Sans"/>
-                <w:color w:val="auto"/>
-                <w:spacing w:val="0"/>
-                <w:position w:val="0"/>
-                <w:sz w:val="20"/>
-                <w:shd w:fill="auto" w:val="clear"/>
-              </w:rPr>
-            </w:pPr>
-            <w:r>
-              <w:rPr>
-                <w:rFonts w:ascii="Open Sans" w:hAnsi="Open Sans" w:cs="Open Sans" w:eastAsia="Open Sans"/>
-                <w:color w:val="auto"/>
-                <w:spacing w:val="0"/>
-                <w:position w:val="0"/>
-                <w:sz w:val="20"/>
-                <w:shd w:fill="auto" w:val="clear"/>
-              </w:rPr>
-              <w:t xml:space="preserve">- 1 Stk Haltegriff clivia plus 32/400mm m. Ros. Edelstahl glatt poliert, VIGOUR</w:t>
-            </w:r>
-          </w:p>
-          <w:p>
-            <w:pPr>
-              <w:spacing w:before="0" w:after="0" w:line="278"/>
-              <w:ind w:right="314" w:left="0" w:firstLine="0"/>
-              <w:jc w:val="left"/>
-              <w:rPr>
-                <w:rFonts w:ascii="Open Sans" w:hAnsi="Open Sans" w:cs="Open Sans" w:eastAsia="Open Sans"/>
-                <w:color w:val="auto"/>
-                <w:spacing w:val="0"/>
-                <w:position w:val="0"/>
-                <w:sz w:val="20"/>
-                <w:shd w:fill="auto" w:val="clear"/>
-              </w:rPr>
-            </w:pPr>
-            <w:r>
-              <w:rPr>
-                <w:rFonts w:ascii="Open Sans" w:hAnsi="Open Sans" w:cs="Open Sans" w:eastAsia="Open Sans"/>
-                <w:color w:val="auto"/>
-                <w:spacing w:val="0"/>
-                <w:position w:val="0"/>
-                <w:sz w:val="20"/>
-                <w:shd w:fill="auto" w:val="clear"/>
-              </w:rPr>
-              <w:t xml:space="preserve">- 1 Stk Haltegriff clivia plus 32/600mm m. Ros. Edelstahl glatt poliert, VIGOUR</w:t>
             </w:r>
           </w:p>
           <w:p>
@@ -3483,7 +3353,7 @@
                 <w:sz w:val="22"/>
                 <w:shd w:fill="auto" w:val="clear"/>
               </w:rPr>
-              <w:t xml:space="preserve">5.765,77 €</w:t>
+              <w:t xml:space="preserve">6.868,70 €</w:t>
             </w:r>
             <w:r>
               <w:rPr>
@@ -3657,7 +3527,7 @@
                 <w:sz w:val="22"/>
                 <w:shd w:fill="auto" w:val="clear"/>
               </w:rPr>
-              <w:t xml:space="preserve">21,35 €</w:t>
+              <w:t xml:space="preserve">28,71 €</w:t>
             </w:r>
             <w:r>
               <w:rPr>
@@ -3831,7 +3701,7 @@
                 <w:sz w:val="22"/>
                 <w:shd w:fill="auto" w:val="clear"/>
               </w:rPr>
-              <w:t xml:space="preserve">1.095,50 €</w:t>
+              <w:t xml:space="preserve">1.305,05 €</w:t>
             </w:r>
             <w:r>
               <w:rPr>
@@ -4005,7 +3875,7 @@
                 <w:sz w:val="22"/>
                 <w:shd w:fill="auto" w:val="clear"/>
               </w:rPr>
-              <w:t xml:space="preserve">6.861,27 €</w:t>
+              <w:t xml:space="preserve">8.173,75 €</w:t>
             </w:r>
             <w:r>
               <w:rPr>
@@ -4179,7 +4049,7 @@
                 <w:sz w:val="22"/>
                 <w:shd w:fill="auto" w:val="clear"/>
               </w:rPr>
-              <w:t xml:space="preserve">6.835,86 €</w:t>
+              <w:t xml:space="preserve">8.139,59 €</w:t>
             </w:r>
             <w:r>
               <w:rPr>
@@ -4353,7 +4223,7 @@
                 <w:sz w:val="22"/>
                 <w:shd w:fill="auto" w:val="clear"/>
               </w:rPr>
-              <w:t xml:space="preserve">6.360,86 €</w:t>
+              <w:t xml:space="preserve">7.664,59 €</w:t>
             </w:r>
             <w:r>
               <w:rPr>

</xml_diff>

<commit_message>
added Bodenabdichtung in kosten-details and in pdf
</commit_message>
<xml_diff>
--- a/out-Angebot.docx
+++ b/out-Angebot.docx
@@ -363,7 +363,7 @@
                 <w:sz w:val="22"/>
                 <w:shd w:fill="auto" w:val="clear"/>
               </w:rPr>
-              <w:t xml:space="preserve">AN20251001111820</w:t>
+              <w:t xml:space="preserve">AN20251001112914</w:t>
             </w:r>
             <w:r>
               <w:rPr>
@@ -617,7 +617,7 @@
           <w:sz w:val="24"/>
           <w:shd w:fill="auto" w:val="clear"/>
         </w:rPr>
-        <w:t xml:space="preserve">  Ihr Angebot AN20251001111820</w:t>
+        <w:t xml:space="preserve">  Ihr Angebot AN20251001112914</w:t>
       </w:r>
     </w:p>
     <w:p>
@@ -1991,7 +1991,7 @@
                 <w:sz w:val="20"/>
                 <w:shd w:fill="auto" w:val="clear"/>
               </w:rPr>
-              <w:t xml:space="preserve">2.480,36 €</w:t>
+              <w:t xml:space="preserve">2.709,04 €</w:t>
             </w:r>
           </w:p>
         </w:tc>
@@ -2031,7 +2031,7 @@
                 <w:sz w:val="20"/>
                 <w:shd w:fill="auto" w:val="clear"/>
               </w:rPr>
-              <w:t xml:space="preserve">2.480,36 €</w:t>
+              <w:t xml:space="preserve">2.709,04 €</w:t>
             </w:r>
           </w:p>
         </w:tc>
@@ -2449,6 +2449,32 @@
                 <w:shd w:fill="auto" w:val="clear"/>
               </w:rPr>
               <w:t xml:space="preserve">- 9 Pkg Flächenkleber (1 Pkg je 0,60 m²)</w:t>
+            </w:r>
+          </w:p>
+          <w:p>
+            <w:pPr>
+              <w:spacing w:before="0" w:after="0" w:line="278"/>
+              <w:ind w:right="314" w:left="0" w:firstLine="0"/>
+              <w:jc w:val="left"/>
+              <w:rPr>
+                <w:rFonts w:ascii="Open Sans" w:hAnsi="Open Sans" w:cs="Open Sans" w:eastAsia="Open Sans"/>
+                <w:color w:val="auto"/>
+                <w:spacing w:val="0"/>
+                <w:position w:val="0"/>
+                <w:sz w:val="20"/>
+                <w:shd w:fill="auto" w:val="clear"/>
+              </w:rPr>
+            </w:pPr>
+            <w:r>
+              <w:rPr>
+                <w:rFonts w:ascii="Open Sans" w:hAnsi="Open Sans" w:cs="Open Sans" w:eastAsia="Open Sans"/>
+                <w:color w:val="auto"/>
+                <w:spacing w:val="0"/>
+                <w:position w:val="0"/>
+                <w:sz w:val="20"/>
+                <w:shd w:fill="auto" w:val="clear"/>
+              </w:rPr>
+              <w:t xml:space="preserve">- 5.75 m² Trinnity Bodenabdichtung (inkl. 15% Verschnitt)</w:t>
             </w:r>
           </w:p>
           <w:p>
@@ -3353,7 +3379,7 @@
                 <w:sz w:val="22"/>
                 <w:shd w:fill="auto" w:val="clear"/>
               </w:rPr>
-              <w:t xml:space="preserve">6.868,70 €</w:t>
+              <w:t xml:space="preserve">7.211,72 €</w:t>
             </w:r>
             <w:r>
               <w:rPr>
@@ -3527,7 +3553,7 @@
                 <w:sz w:val="22"/>
                 <w:shd w:fill="auto" w:val="clear"/>
               </w:rPr>
-              <w:t xml:space="preserve">28,71 €</w:t>
+              <w:t xml:space="preserve">30,99 €</w:t>
             </w:r>
             <w:r>
               <w:rPr>
@@ -3701,7 +3727,7 @@
                 <w:sz w:val="22"/>
                 <w:shd w:fill="auto" w:val="clear"/>
               </w:rPr>
-              <w:t xml:space="preserve">1.305,05 €</w:t>
+              <w:t xml:space="preserve">1.370,23 €</w:t>
             </w:r>
             <w:r>
               <w:rPr>
@@ -3875,7 +3901,7 @@
                 <w:sz w:val="22"/>
                 <w:shd w:fill="auto" w:val="clear"/>
               </w:rPr>
-              <w:t xml:space="preserve">8.173,75 €</w:t>
+              <w:t xml:space="preserve">8.581,95 €</w:t>
             </w:r>
             <w:r>
               <w:rPr>
@@ -4049,7 +4075,7 @@
                 <w:sz w:val="22"/>
                 <w:shd w:fill="auto" w:val="clear"/>
               </w:rPr>
-              <w:t xml:space="preserve">8.139,59 €</w:t>
+              <w:t xml:space="preserve">8.545,07 €</w:t>
             </w:r>
             <w:r>
               <w:rPr>
@@ -4223,7 +4249,7 @@
                 <w:sz w:val="22"/>
                 <w:shd w:fill="auto" w:val="clear"/>
               </w:rPr>
-              <w:t xml:space="preserve">7.664,59 €</w:t>
+              <w:t xml:space="preserve">8.070,07 €</w:t>
             </w:r>
             <w:r>
               <w:rPr>

</xml_diff>

<commit_message>
Zuzahlung ampunt not mandatory and not affecting calcul
</commit_message>
<xml_diff>
--- a/out-Angebot.docx
+++ b/out-Angebot.docx
@@ -93,7 +93,7 @@
           <w:sz w:val="22"/>
           <w:shd w:fill="auto" w:val="clear"/>
         </w:rPr>
-        <w:t xml:space="preserve">Rylee Morris</w:t>
+        <w:t xml:space="preserve">Marshall Bell</w:t>
       </w:r>
     </w:p>
     <w:p>
@@ -119,7 +119,7 @@
           <w:sz w:val="22"/>
           <w:shd w:fill="auto" w:val="clear"/>
         </w:rPr>
-        <w:t xml:space="preserve">Quia rerum quas moll,</w:t>
+        <w:t xml:space="preserve">Quis fuga Nostrum n,</w:t>
       </w:r>
     </w:p>
     <w:p>
@@ -145,7 +145,7 @@
           <w:sz w:val="22"/>
           <w:shd w:fill="auto" w:val="clear"/>
         </w:rPr>
-        <w:t xml:space="preserve">Ullamco hic tenetur  Harum aut tenetur ip</w:t>
+        <w:t xml:space="preserve">Nostrum nulla aut de Saepe rem recusandae</w:t>
       </w:r>
     </w:p>
     <w:tbl>
@@ -320,7 +320,7 @@
                 <w:sz w:val="22"/>
                 <w:shd w:fill="auto" w:val="clear"/>
               </w:rPr>
-              <w:t xml:space="preserve">Deirdre Neal</w:t>
+              <w:t xml:space="preserve">Mufutau White</w:t>
             </w:r>
           </w:p>
         </w:tc>
@@ -363,7 +363,7 @@
                 <w:sz w:val="22"/>
                 <w:shd w:fill="auto" w:val="clear"/>
               </w:rPr>
-              <w:t xml:space="preserve">AN20251001112914</w:t>
+              <w:t xml:space="preserve">AN20251001130839</w:t>
             </w:r>
             <w:r>
               <w:rPr>
@@ -411,7 +411,7 @@
                 <w:sz w:val="22"/>
                 <w:shd w:fill="auto" w:val="clear"/>
               </w:rPr>
-              <w:t xml:space="preserve">1992-12-12</w:t>
+              <w:t xml:space="preserve">2021-06-18</w:t>
             </w:r>
             <w:r>
               <w:rPr>
@@ -455,7 +455,7 @@
                 <w:sz w:val="22"/>
                 <w:shd w:fill="auto" w:val="clear"/>
               </w:rPr>
-              <w:t xml:space="preserve">Neve Roman</w:t>
+              <w:t xml:space="preserve">Preston Decker</w:t>
             </w:r>
             <w:r>
               <w:rPr>
@@ -617,7 +617,7 @@
           <w:sz w:val="24"/>
           <w:shd w:fill="auto" w:val="clear"/>
         </w:rPr>
-        <w:t xml:space="preserve">  Ihr Angebot AN20251001112914</w:t>
+        <w:t xml:space="preserve">  Ihr Angebot AN20251001130839</w:t>
       </w:r>
     </w:p>
     <w:p>
@@ -643,7 +643,7 @@
           <w:sz w:val="22"/>
           <w:shd w:fill="auto" w:val="clear"/>
         </w:rPr>
-        <w:t xml:space="preserve">  Sehr geehrte Frau Morris,</w:t>
+        <w:t xml:space="preserve">  Sehr geehrte Frau Bell,</w:t>
         <w:br/>
       </w:r>
     </w:p>
@@ -1072,7 +1072,7 @@
                 <w:sz w:val="20"/>
                 <w:shd w:fill="auto" w:val="clear"/>
               </w:rPr>
-              <w:t xml:space="preserve">2.562,80 €</w:t>
+              <w:t xml:space="preserve">3.116,00 €</w:t>
             </w:r>
           </w:p>
         </w:tc>
@@ -1112,7 +1112,7 @@
                 <w:sz w:val="20"/>
                 <w:shd w:fill="auto" w:val="clear"/>
               </w:rPr>
-              <w:t xml:space="preserve">2.562,80 €</w:t>
+              <w:t xml:space="preserve">3.116,00 €</w:t>
             </w:r>
           </w:p>
         </w:tc>
@@ -1477,7 +1477,7 @@
                 <w:sz w:val="18"/>
                 <w:shd w:fill="auto" w:val="clear"/>
               </w:rPr>
-              <w:t xml:space="preserve">- 154 km Kilometerpauschale </w:t>
+              <w:t xml:space="preserve">- 150 km Kilometerpauschale </w:t>
             </w:r>
           </w:p>
           <w:p>
@@ -1529,7 +1529,85 @@
                 <w:sz w:val="18"/>
                 <w:shd w:fill="auto" w:val="clear"/>
               </w:rPr>
-              <w:t xml:space="preserve">- Auswechseln eines Waschtisches</w:t>
+              <w:t xml:space="preserve">- Auswechseln des Duschsystems</w:t>
+            </w:r>
+          </w:p>
+          <w:p>
+            <w:pPr>
+              <w:spacing w:before="0" w:after="0" w:line="278"/>
+              <w:ind w:right="314" w:left="0" w:firstLine="0"/>
+              <w:jc w:val="left"/>
+              <w:rPr>
+                <w:rFonts w:ascii="Open Sans" w:hAnsi="Open Sans" w:cs="Open Sans" w:eastAsia="Open Sans"/>
+                <w:color w:val="auto"/>
+                <w:spacing w:val="0"/>
+                <w:position w:val="0"/>
+                <w:sz w:val="18"/>
+                <w:shd w:fill="auto" w:val="clear"/>
+              </w:rPr>
+            </w:pPr>
+            <w:r>
+              <w:rPr>
+                <w:rFonts w:ascii="Open Sans" w:hAnsi="Open Sans" w:cs="Open Sans" w:eastAsia="Open Sans"/>
+                <w:color w:val="auto"/>
+                <w:spacing w:val="0"/>
+                <w:position w:val="0"/>
+                <w:sz w:val="18"/>
+                <w:shd w:fill="auto" w:val="clear"/>
+              </w:rPr>
+              <w:t xml:space="preserve">- Anbringen zusätzlicher Haltegriffe</w:t>
+            </w:r>
+          </w:p>
+          <w:p>
+            <w:pPr>
+              <w:spacing w:before="0" w:after="0" w:line="278"/>
+              <w:ind w:right="314" w:left="0" w:firstLine="0"/>
+              <w:jc w:val="left"/>
+              <w:rPr>
+                <w:rFonts w:ascii="Open Sans" w:hAnsi="Open Sans" w:cs="Open Sans" w:eastAsia="Open Sans"/>
+                <w:color w:val="auto"/>
+                <w:spacing w:val="0"/>
+                <w:position w:val="0"/>
+                <w:sz w:val="18"/>
+                <w:shd w:fill="auto" w:val="clear"/>
+              </w:rPr>
+            </w:pPr>
+            <w:r>
+              <w:rPr>
+                <w:rFonts w:ascii="Open Sans" w:hAnsi="Open Sans" w:cs="Open Sans" w:eastAsia="Open Sans"/>
+                <w:color w:val="auto"/>
+                <w:spacing w:val="0"/>
+                <w:position w:val="0"/>
+                <w:sz w:val="18"/>
+                <w:shd w:fill="auto" w:val="clear"/>
+              </w:rPr>
+              <w:t xml:space="preserve">- Anbringen zusätzlicher Stützklappgriffe</w:t>
+            </w:r>
+          </w:p>
+          <w:p>
+            <w:pPr>
+              <w:spacing w:before="0" w:after="0" w:line="278"/>
+              <w:ind w:right="314" w:left="0" w:firstLine="0"/>
+              <w:jc w:val="left"/>
+              <w:rPr>
+                <w:rFonts w:ascii="Open Sans" w:hAnsi="Open Sans" w:cs="Open Sans" w:eastAsia="Open Sans"/>
+                <w:color w:val="auto"/>
+                <w:spacing w:val="0"/>
+                <w:position w:val="0"/>
+                <w:sz w:val="18"/>
+                <w:shd w:fill="auto" w:val="clear"/>
+              </w:rPr>
+            </w:pPr>
+            <w:r>
+              <w:rPr>
+                <w:rFonts w:ascii="Open Sans" w:hAnsi="Open Sans" w:cs="Open Sans" w:eastAsia="Open Sans"/>
+                <w:color w:val="auto"/>
+                <w:spacing w:val="0"/>
+                <w:position w:val="0"/>
+                <w:sz w:val="18"/>
+                <w:shd w:fill="auto" w:val="clear"/>
+              </w:rPr>
+              <w:t xml:space="preserve">- Austausch eines Thermostates</w:t>
             </w:r>
           </w:p>
         </w:tc>
@@ -1991,7 +2069,7 @@
                 <w:sz w:val="20"/>
                 <w:shd w:fill="auto" w:val="clear"/>
               </w:rPr>
-              <w:t xml:space="preserve">2.709,04 €</w:t>
+              <w:t xml:space="preserve">1.586,92 €</w:t>
             </w:r>
           </w:p>
         </w:tc>
@@ -2031,7 +2109,7 @@
                 <w:sz w:val="20"/>
                 <w:shd w:fill="auto" w:val="clear"/>
               </w:rPr>
-              <w:t xml:space="preserve">2.709,04 €</w:t>
+              <w:t xml:space="preserve">1.586,92 €</w:t>
             </w:r>
           </w:p>
         </w:tc>
@@ -2422,85 +2500,85 @@
                 <w:sz w:val="20"/>
                 <w:shd w:fill="auto" w:val="clear"/>
               </w:rPr>
-              <w:t xml:space="preserve">- 20 Stk Fußboden-Paneele (1 Paneele = 0.3 m² )</w:t>
-            </w:r>
-          </w:p>
-          <w:p>
-            <w:pPr>
-              <w:spacing w:before="0" w:after="0" w:line="278"/>
-              <w:ind w:right="314" w:left="0" w:firstLine="0"/>
-              <w:jc w:val="left"/>
-              <w:rPr>
-                <w:rFonts w:ascii="Open Sans" w:hAnsi="Open Sans" w:cs="Open Sans" w:eastAsia="Open Sans"/>
-                <w:color w:val="auto"/>
-                <w:spacing w:val="0"/>
-                <w:position w:val="0"/>
-                <w:sz w:val="20"/>
-                <w:shd w:fill="auto" w:val="clear"/>
-              </w:rPr>
-            </w:pPr>
-            <w:r>
-              <w:rPr>
-                <w:rFonts w:ascii="Open Sans" w:hAnsi="Open Sans" w:cs="Open Sans" w:eastAsia="Open Sans"/>
-                <w:color w:val="auto"/>
-                <w:spacing w:val="0"/>
-                <w:position w:val="0"/>
-                <w:sz w:val="20"/>
-                <w:shd w:fill="auto" w:val="clear"/>
-              </w:rPr>
-              <w:t xml:space="preserve">- 9 Pkg Flächenkleber (1 Pkg je 0,60 m²)</w:t>
-            </w:r>
-          </w:p>
-          <w:p>
-            <w:pPr>
-              <w:spacing w:before="0" w:after="0" w:line="278"/>
-              <w:ind w:right="314" w:left="0" w:firstLine="0"/>
-              <w:jc w:val="left"/>
-              <w:rPr>
-                <w:rFonts w:ascii="Open Sans" w:hAnsi="Open Sans" w:cs="Open Sans" w:eastAsia="Open Sans"/>
-                <w:color w:val="auto"/>
-                <w:spacing w:val="0"/>
-                <w:position w:val="0"/>
-                <w:sz w:val="20"/>
-                <w:shd w:fill="auto" w:val="clear"/>
-              </w:rPr>
-            </w:pPr>
-            <w:r>
-              <w:rPr>
-                <w:rFonts w:ascii="Open Sans" w:hAnsi="Open Sans" w:cs="Open Sans" w:eastAsia="Open Sans"/>
-                <w:color w:val="auto"/>
-                <w:spacing w:val="0"/>
-                <w:position w:val="0"/>
-                <w:sz w:val="20"/>
-                <w:shd w:fill="auto" w:val="clear"/>
-              </w:rPr>
-              <w:t xml:space="preserve">- 5.75 m² Trinnity Bodenabdichtung (inkl. 15% Verschnitt)</w:t>
-            </w:r>
-          </w:p>
-          <w:p>
-            <w:pPr>
-              <w:spacing w:before="0" w:after="0" w:line="278"/>
-              <w:ind w:right="314" w:left="0" w:firstLine="0"/>
-              <w:jc w:val="left"/>
-              <w:rPr>
-                <w:rFonts w:ascii="Open Sans" w:hAnsi="Open Sans" w:cs="Open Sans" w:eastAsia="Open Sans"/>
-                <w:color w:val="auto"/>
-                <w:spacing w:val="0"/>
-                <w:position w:val="0"/>
-                <w:sz w:val="20"/>
-                <w:shd w:fill="auto" w:val="clear"/>
-              </w:rPr>
-            </w:pPr>
-            <w:r>
-              <w:rPr>
-                <w:rFonts w:ascii="Open Sans" w:hAnsi="Open Sans" w:cs="Open Sans" w:eastAsia="Open Sans"/>
-                <w:color w:val="auto"/>
-                <w:spacing w:val="0"/>
-                <w:position w:val="0"/>
-                <w:sz w:val="20"/>
-                <w:shd w:fill="auto" w:val="clear"/>
-              </w:rPr>
-              <w:t xml:space="preserve">- 5 m² Fußboden individ.5.0 V5FB02</w:t>
+              <w:t xml:space="preserve">- 8 Stk Fußboden-Paneele (1 Paneele = 0.3 m² )</w:t>
+            </w:r>
+          </w:p>
+          <w:p>
+            <w:pPr>
+              <w:spacing w:before="0" w:after="0" w:line="278"/>
+              <w:ind w:right="314" w:left="0" w:firstLine="0"/>
+              <w:jc w:val="left"/>
+              <w:rPr>
+                <w:rFonts w:ascii="Open Sans" w:hAnsi="Open Sans" w:cs="Open Sans" w:eastAsia="Open Sans"/>
+                <w:color w:val="auto"/>
+                <w:spacing w:val="0"/>
+                <w:position w:val="0"/>
+                <w:sz w:val="20"/>
+                <w:shd w:fill="auto" w:val="clear"/>
+              </w:rPr>
+            </w:pPr>
+            <w:r>
+              <w:rPr>
+                <w:rFonts w:ascii="Open Sans" w:hAnsi="Open Sans" w:cs="Open Sans" w:eastAsia="Open Sans"/>
+                <w:color w:val="auto"/>
+                <w:spacing w:val="0"/>
+                <w:position w:val="0"/>
+                <w:sz w:val="20"/>
+                <w:shd w:fill="auto" w:val="clear"/>
+              </w:rPr>
+              <w:t xml:space="preserve">- 4 Pkg Flächenkleber (1 Pkg je 0,60 m²)</w:t>
+            </w:r>
+          </w:p>
+          <w:p>
+            <w:pPr>
+              <w:spacing w:before="0" w:after="0" w:line="278"/>
+              <w:ind w:right="314" w:left="0" w:firstLine="0"/>
+              <w:jc w:val="left"/>
+              <w:rPr>
+                <w:rFonts w:ascii="Open Sans" w:hAnsi="Open Sans" w:cs="Open Sans" w:eastAsia="Open Sans"/>
+                <w:color w:val="auto"/>
+                <w:spacing w:val="0"/>
+                <w:position w:val="0"/>
+                <w:sz w:val="20"/>
+                <w:shd w:fill="auto" w:val="clear"/>
+              </w:rPr>
+            </w:pPr>
+            <w:r>
+              <w:rPr>
+                <w:rFonts w:ascii="Open Sans" w:hAnsi="Open Sans" w:cs="Open Sans" w:eastAsia="Open Sans"/>
+                <w:color w:val="auto"/>
+                <w:spacing w:val="0"/>
+                <w:position w:val="0"/>
+                <w:sz w:val="20"/>
+                <w:shd w:fill="auto" w:val="clear"/>
+              </w:rPr>
+              <w:t xml:space="preserve">- 2.3 m² Trinnity Bodenabdichtung (inkl. 15% Verschnitt)</w:t>
+            </w:r>
+          </w:p>
+          <w:p>
+            <w:pPr>
+              <w:spacing w:before="0" w:after="0" w:line="278"/>
+              <w:ind w:right="314" w:left="0" w:firstLine="0"/>
+              <w:jc w:val="left"/>
+              <w:rPr>
+                <w:rFonts w:ascii="Open Sans" w:hAnsi="Open Sans" w:cs="Open Sans" w:eastAsia="Open Sans"/>
+                <w:color w:val="auto"/>
+                <w:spacing w:val="0"/>
+                <w:position w:val="0"/>
+                <w:sz w:val="20"/>
+                <w:shd w:fill="auto" w:val="clear"/>
+              </w:rPr>
+            </w:pPr>
+            <w:r>
+              <w:rPr>
+                <w:rFonts w:ascii="Open Sans" w:hAnsi="Open Sans" w:cs="Open Sans" w:eastAsia="Open Sans"/>
+                <w:color w:val="auto"/>
+                <w:spacing w:val="0"/>
+                <w:position w:val="0"/>
+                <w:sz w:val="20"/>
+                <w:shd w:fill="auto" w:val="clear"/>
+              </w:rPr>
+              <w:t xml:space="preserve">- 2 m² Fußboden individ.5.0 V5FB02</w:t>
             </w:r>
           </w:p>
           <w:p>
@@ -2552,111 +2630,85 @@
                 <w:sz w:val="20"/>
                 <w:shd w:fill="auto" w:val="clear"/>
               </w:rPr>
-              <w:t xml:space="preserve">- 6 Stk Waschtisch clivia 60x48 cm weiss VIGOUR</w:t>
-            </w:r>
-          </w:p>
-          <w:p>
-            <w:pPr>
-              <w:spacing w:before="0" w:after="0" w:line="278"/>
-              <w:ind w:right="314" w:left="0" w:firstLine="0"/>
-              <w:jc w:val="left"/>
-              <w:rPr>
-                <w:rFonts w:ascii="Open Sans" w:hAnsi="Open Sans" w:cs="Open Sans" w:eastAsia="Open Sans"/>
-                <w:color w:val="auto"/>
-                <w:spacing w:val="0"/>
-                <w:position w:val="0"/>
-                <w:sz w:val="20"/>
-                <w:shd w:fill="auto" w:val="clear"/>
-              </w:rPr>
-            </w:pPr>
-            <w:r>
-              <w:rPr>
-                <w:rFonts w:ascii="Open Sans" w:hAnsi="Open Sans" w:cs="Open Sans" w:eastAsia="Open Sans"/>
-                <w:color w:val="auto"/>
-                <w:spacing w:val="0"/>
-                <w:position w:val="0"/>
-                <w:sz w:val="20"/>
-                <w:shd w:fill="auto" w:val="clear"/>
-              </w:rPr>
-              <w:t xml:space="preserve">- 6 Stk Befestigungssatz Fischer WST 10x140</w:t>
-            </w:r>
-          </w:p>
-          <w:p>
-            <w:pPr>
-              <w:spacing w:before="0" w:after="0" w:line="278"/>
-              <w:ind w:right="314" w:left="0" w:firstLine="0"/>
-              <w:jc w:val="left"/>
-              <w:rPr>
-                <w:rFonts w:ascii="Open Sans" w:hAnsi="Open Sans" w:cs="Open Sans" w:eastAsia="Open Sans"/>
-                <w:color w:val="auto"/>
-                <w:spacing w:val="0"/>
-                <w:position w:val="0"/>
-                <w:sz w:val="20"/>
-                <w:shd w:fill="auto" w:val="clear"/>
-              </w:rPr>
-            </w:pPr>
-            <w:r>
-              <w:rPr>
-                <w:rFonts w:ascii="Open Sans" w:hAnsi="Open Sans" w:cs="Open Sans" w:eastAsia="Open Sans"/>
-                <w:color w:val="auto"/>
-                <w:spacing w:val="0"/>
-                <w:position w:val="0"/>
-                <w:sz w:val="20"/>
-                <w:shd w:fill="auto" w:val="clear"/>
-              </w:rPr>
-              <w:t xml:space="preserve">- 6 Stk Waschtisch-Röhrensiphon 1 1/4" G mit Verstellrohr 120mm TRINNITY</w:t>
-            </w:r>
-          </w:p>
-          <w:p>
-            <w:pPr>
-              <w:spacing w:before="0" w:after="0" w:line="278"/>
-              <w:ind w:right="314" w:left="0" w:firstLine="0"/>
-              <w:jc w:val="left"/>
-              <w:rPr>
-                <w:rFonts w:ascii="Open Sans" w:hAnsi="Open Sans" w:cs="Open Sans" w:eastAsia="Open Sans"/>
-                <w:color w:val="auto"/>
-                <w:spacing w:val="0"/>
-                <w:position w:val="0"/>
-                <w:sz w:val="20"/>
-                <w:shd w:fill="auto" w:val="clear"/>
-              </w:rPr>
-            </w:pPr>
-            <w:r>
-              <w:rPr>
-                <w:rFonts w:ascii="Open Sans" w:hAnsi="Open Sans" w:cs="Open Sans" w:eastAsia="Open Sans"/>
-                <w:color w:val="auto"/>
-                <w:spacing w:val="0"/>
-                <w:position w:val="0"/>
-                <w:sz w:val="20"/>
-                <w:shd w:fill="auto" w:val="clear"/>
-              </w:rPr>
-              <w:t xml:space="preserve">- 12 Stk SCHELL Eckventil COMFORT regulierbar, ASAG, 1/2", chrom</w:t>
-            </w:r>
-          </w:p>
-          <w:p>
-            <w:pPr>
-              <w:spacing w:before="0" w:after="0" w:line="278"/>
-              <w:ind w:right="314" w:left="0" w:firstLine="0"/>
-              <w:jc w:val="left"/>
-              <w:rPr>
-                <w:rFonts w:ascii="Open Sans" w:hAnsi="Open Sans" w:cs="Open Sans" w:eastAsia="Open Sans"/>
-                <w:color w:val="auto"/>
-                <w:spacing w:val="0"/>
-                <w:position w:val="0"/>
-                <w:sz w:val="20"/>
-                <w:shd w:fill="auto" w:val="clear"/>
-              </w:rPr>
-            </w:pPr>
-            <w:r>
-              <w:rPr>
-                <w:rFonts w:ascii="Open Sans" w:hAnsi="Open Sans" w:cs="Open Sans" w:eastAsia="Open Sans"/>
-                <w:color w:val="auto"/>
-                <w:spacing w:val="0"/>
-                <w:position w:val="0"/>
-                <w:sz w:val="20"/>
-                <w:shd w:fill="auto" w:val="clear"/>
-              </w:rPr>
-              <w:t xml:space="preserve">- 1 Stk Duschwanne 100 x 90 x 3 cm</w:t>
+              <w:t xml:space="preserve">- 1 Stk Wannenset individual 2.2 m. Wandhalter Schlauch u. HB 1-str. rund verchr. VIGOUR</w:t>
+            </w:r>
+          </w:p>
+          <w:p>
+            <w:pPr>
+              <w:spacing w:before="0" w:after="0" w:line="278"/>
+              <w:ind w:right="314" w:left="0" w:firstLine="0"/>
+              <w:jc w:val="left"/>
+              <w:rPr>
+                <w:rFonts w:ascii="Open Sans" w:hAnsi="Open Sans" w:cs="Open Sans" w:eastAsia="Open Sans"/>
+                <w:color w:val="auto"/>
+                <w:spacing w:val="0"/>
+                <w:position w:val="0"/>
+                <w:sz w:val="20"/>
+                <w:shd w:fill="auto" w:val="clear"/>
+              </w:rPr>
+            </w:pPr>
+            <w:r>
+              <w:rPr>
+                <w:rFonts w:ascii="Open Sans" w:hAnsi="Open Sans" w:cs="Open Sans" w:eastAsia="Open Sans"/>
+                <w:color w:val="auto"/>
+                <w:spacing w:val="0"/>
+                <w:position w:val="0"/>
+                <w:sz w:val="20"/>
+                <w:shd w:fill="auto" w:val="clear"/>
+              </w:rPr>
+              <w:t xml:space="preserve">- 1 Stk AP-Brause-Thermostat clivia, ohne Brausegarnitur</w:t>
+            </w:r>
+          </w:p>
+          <w:p>
+            <w:pPr>
+              <w:spacing w:before="0" w:after="0" w:line="278"/>
+              <w:ind w:right="314" w:left="0" w:firstLine="0"/>
+              <w:jc w:val="left"/>
+              <w:rPr>
+                <w:rFonts w:ascii="Open Sans" w:hAnsi="Open Sans" w:cs="Open Sans" w:eastAsia="Open Sans"/>
+                <w:color w:val="auto"/>
+                <w:spacing w:val="0"/>
+                <w:position w:val="0"/>
+                <w:sz w:val="20"/>
+                <w:shd w:fill="auto" w:val="clear"/>
+              </w:rPr>
+            </w:pPr>
+            <w:r>
+              <w:rPr>
+                <w:rFonts w:ascii="Open Sans" w:hAnsi="Open Sans" w:cs="Open Sans" w:eastAsia="Open Sans"/>
+                <w:color w:val="auto"/>
+                <w:spacing w:val="0"/>
+                <w:position w:val="0"/>
+                <w:sz w:val="20"/>
+                <w:shd w:fill="auto" w:val="clear"/>
+              </w:rPr>
+              <w:t xml:space="preserve">- 1 Stk Haltegriff clivia plus 32/400mm m. Ros. Edelstahl glatt poliert, VIGOUR</w:t>
+            </w:r>
+          </w:p>
+          <w:p>
+            <w:pPr>
+              <w:spacing w:before="0" w:after="0" w:line="278"/>
+              <w:ind w:right="314" w:left="0" w:firstLine="0"/>
+              <w:jc w:val="left"/>
+              <w:rPr>
+                <w:rFonts w:ascii="Open Sans" w:hAnsi="Open Sans" w:cs="Open Sans" w:eastAsia="Open Sans"/>
+                <w:color w:val="auto"/>
+                <w:spacing w:val="0"/>
+                <w:position w:val="0"/>
+                <w:sz w:val="20"/>
+                <w:shd w:fill="auto" w:val="clear"/>
+              </w:rPr>
+            </w:pPr>
+            <w:r>
+              <w:rPr>
+                <w:rFonts w:ascii="Open Sans" w:hAnsi="Open Sans" w:cs="Open Sans" w:eastAsia="Open Sans"/>
+                <w:color w:val="auto"/>
+                <w:spacing w:val="0"/>
+                <w:position w:val="0"/>
+                <w:sz w:val="20"/>
+                <w:shd w:fill="auto" w:val="clear"/>
+              </w:rPr>
+              <w:t xml:space="preserve">- 1 Stk Stützklappgriff derby plus 600mm verchromt m. ABS-Ummantelung VIGOUR</w:t>
             </w:r>
           </w:p>
         </w:tc>
@@ -2722,474 +2774,6 @@
                 <w:shd w:fill="auto" w:val="clear"/>
               </w:rPr>
             </w:pPr>
-          </w:p>
-        </w:tc>
-      </w:tr>
-      <w:tr>
-        <w:trPr>
-          <w:trHeight w:val="1" w:hRule="atLeast"/>
-          <w:jc w:val="left"/>
-        </w:trPr>
-        <w:tc>
-          <w:tcPr>
-            <w:tcW w:w="660" w:type="dxa"/>
-            <w:tcBorders>
-              <w:top w:val="single" w:color="ffffff" w:sz="8"/>
-              <w:left w:val="single" w:color="ffffff" w:sz="8"/>
-              <w:bottom w:val="single" w:color="ffffff" w:sz="8"/>
-              <w:right w:val="single" w:color="ffffff" w:sz="8"/>
-            </w:tcBorders>
-            <w:shd w:color="000000" w:fill="ffffff" w:val="clear"/>
-            <w:tcMar>
-              <w:left w:w="56" w:type="dxa"/>
-              <w:right w:w="56" w:type="dxa"/>
-            </w:tcMar>
-            <w:vAlign w:val="top"/>
-          </w:tcPr>
-          <w:p>
-            <w:pPr>
-              <w:spacing w:before="0" w:after="0" w:line="278"/>
-              <w:ind w:right="-26" w:left="0" w:firstLine="0"/>
-              <w:jc w:val="left"/>
-              <w:rPr>
-                <w:color w:val="auto"/>
-                <w:spacing w:val="0"/>
-                <w:position w:val="0"/>
-              </w:rPr>
-            </w:pPr>
-            <w:r>
-              <w:rPr>
-                <w:rFonts w:ascii="Open Sans" w:hAnsi="Open Sans" w:cs="Open Sans" w:eastAsia="Open Sans"/>
-                <w:color w:val="auto"/>
-                <w:spacing w:val="0"/>
-                <w:position w:val="0"/>
-                <w:sz w:val="20"/>
-                <w:shd w:fill="auto" w:val="clear"/>
-              </w:rPr>
-              <w:t xml:space="preserve">003</w:t>
-            </w:r>
-          </w:p>
-        </w:tc>
-        <w:tc>
-          <w:tcPr>
-            <w:tcW w:w="1035" w:type="dxa"/>
-            <w:tcBorders>
-              <w:top w:val="single" w:color="ffffff" w:sz="8"/>
-              <w:left w:val="single" w:color="ffffff" w:sz="8"/>
-              <w:bottom w:val="single" w:color="ffffff" w:sz="8"/>
-              <w:right w:val="single" w:color="ffffff" w:sz="8"/>
-            </w:tcBorders>
-            <w:shd w:color="000000" w:fill="ffffff" w:val="clear"/>
-            <w:tcMar>
-              <w:left w:w="56" w:type="dxa"/>
-              <w:right w:w="56" w:type="dxa"/>
-            </w:tcMar>
-            <w:vAlign w:val="top"/>
-          </w:tcPr>
-          <w:p>
-            <w:pPr>
-              <w:spacing w:before="0" w:after="0" w:line="278"/>
-              <w:ind w:right="314" w:left="0" w:firstLine="0"/>
-              <w:jc w:val="left"/>
-              <w:rPr>
-                <w:color w:val="auto"/>
-                <w:spacing w:val="0"/>
-                <w:position w:val="0"/>
-              </w:rPr>
-            </w:pPr>
-            <w:r>
-              <w:rPr>
-                <w:rFonts w:ascii="Open Sans" w:hAnsi="Open Sans" w:cs="Open Sans" w:eastAsia="Open Sans"/>
-                <w:color w:val="auto"/>
-                <w:spacing w:val="0"/>
-                <w:position w:val="0"/>
-                <w:sz w:val="20"/>
-                <w:shd w:fill="auto" w:val="clear"/>
-              </w:rPr>
-              <w:t xml:space="preserve">1 Stk</w:t>
-            </w:r>
-          </w:p>
-        </w:tc>
-        <w:tc>
-          <w:tcPr>
-            <w:tcW w:w="4107" w:type="dxa"/>
-            <w:tcBorders>
-              <w:top w:val="single" w:color="ffffff" w:sz="8"/>
-              <w:left w:val="single" w:color="ffffff" w:sz="8"/>
-              <w:bottom w:val="single" w:color="ffffff" w:sz="8"/>
-              <w:right w:val="single" w:color="ffffff" w:sz="8"/>
-            </w:tcBorders>
-            <w:shd w:color="000000" w:fill="ffffff" w:val="clear"/>
-            <w:tcMar>
-              <w:left w:w="56" w:type="dxa"/>
-              <w:right w:w="56" w:type="dxa"/>
-            </w:tcMar>
-            <w:vAlign w:val="top"/>
-          </w:tcPr>
-          <w:p>
-            <w:pPr>
-              <w:spacing w:before="0" w:after="0" w:line="278"/>
-              <w:ind w:right="314" w:left="0" w:firstLine="0"/>
-              <w:jc w:val="left"/>
-              <w:rPr>
-                <w:rFonts w:ascii="Open Sans" w:hAnsi="Open Sans" w:cs="Open Sans" w:eastAsia="Open Sans"/>
-                <w:b/>
-                <w:color w:val="auto"/>
-                <w:spacing w:val="0"/>
-                <w:position w:val="0"/>
-                <w:sz w:val="20"/>
-                <w:shd w:fill="auto" w:val="clear"/>
-              </w:rPr>
-            </w:pPr>
-            <w:r>
-              <w:rPr>
-                <w:rFonts w:ascii="Open Sans" w:hAnsi="Open Sans" w:cs="Open Sans" w:eastAsia="Open Sans"/>
-                <w:b/>
-                <w:color w:val="auto"/>
-                <w:spacing w:val="0"/>
-                <w:position w:val="0"/>
-                <w:sz w:val="20"/>
-                <w:shd w:fill="auto" w:val="clear"/>
-              </w:rPr>
-              <w:t xml:space="preserve">Aktion: Haltegriff</w:t>
-            </w:r>
-          </w:p>
-          <w:p>
-            <w:pPr>
-              <w:spacing w:before="0" w:after="0" w:line="278"/>
-              <w:ind w:right="314" w:left="0" w:firstLine="0"/>
-              <w:jc w:val="left"/>
-              <w:rPr>
-                <w:color w:val="auto"/>
-                <w:spacing w:val="0"/>
-                <w:position w:val="0"/>
-              </w:rPr>
-            </w:pPr>
-            <w:r>
-              <w:rPr>
-                <w:rFonts w:ascii="Open Sans" w:hAnsi="Open Sans" w:cs="Open Sans" w:eastAsia="Open Sans"/>
-                <w:color w:val="auto"/>
-                <w:spacing w:val="0"/>
-                <w:position w:val="0"/>
-                <w:sz w:val="20"/>
-                <w:shd w:fill="auto" w:val="clear"/>
-              </w:rPr>
-              <w:t xml:space="preserve">-- 1 Haltegriff gratis im Wert von 175 € inkl. Lieferung und Montage</w:t>
-            </w:r>
-          </w:p>
-        </w:tc>
-        <w:tc>
-          <w:tcPr>
-            <w:tcW w:w="2268" w:type="dxa"/>
-            <w:tcBorders>
-              <w:top w:val="single" w:color="ffffff" w:sz="8"/>
-              <w:left w:val="single" w:color="ffffff" w:sz="8"/>
-              <w:bottom w:val="single" w:color="ffffff" w:sz="8"/>
-              <w:right w:val="single" w:color="ffffff" w:sz="8"/>
-            </w:tcBorders>
-            <w:shd w:color="000000" w:fill="ffffff" w:val="clear"/>
-            <w:tcMar>
-              <w:left w:w="56" w:type="dxa"/>
-              <w:right w:w="56" w:type="dxa"/>
-            </w:tcMar>
-            <w:vAlign w:val="top"/>
-          </w:tcPr>
-          <w:p>
-            <w:pPr>
-              <w:spacing w:before="0" w:after="0" w:line="278"/>
-              <w:ind w:right="314" w:left="0" w:firstLine="0"/>
-              <w:jc w:val="left"/>
-              <w:rPr>
-                <w:color w:val="auto"/>
-                <w:spacing w:val="0"/>
-                <w:position w:val="0"/>
-              </w:rPr>
-            </w:pPr>
-            <w:r>
-              <w:rPr>
-                <w:rFonts w:ascii="Open Sans" w:hAnsi="Open Sans" w:cs="Open Sans" w:eastAsia="Open Sans"/>
-                <w:color w:val="auto"/>
-                <w:spacing w:val="0"/>
-                <w:position w:val="0"/>
-                <w:sz w:val="20"/>
-                <w:shd w:fill="auto" w:val="clear"/>
-              </w:rPr>
-              <w:t xml:space="preserve">-147,06 €</w:t>
-            </w:r>
-          </w:p>
-        </w:tc>
-        <w:tc>
-          <w:tcPr>
-            <w:tcW w:w="1710" w:type="dxa"/>
-            <w:tcBorders>
-              <w:top w:val="single" w:color="ffffff" w:sz="8"/>
-              <w:left w:val="single" w:color="ffffff" w:sz="8"/>
-              <w:bottom w:val="single" w:color="ffffff" w:sz="8"/>
-              <w:right w:val="single" w:color="ffffff" w:sz="8"/>
-            </w:tcBorders>
-            <w:shd w:color="000000" w:fill="ffffff" w:val="clear"/>
-            <w:tcMar>
-              <w:left w:w="56" w:type="dxa"/>
-              <w:right w:w="56" w:type="dxa"/>
-            </w:tcMar>
-            <w:vAlign w:val="top"/>
-          </w:tcPr>
-          <w:p>
-            <w:pPr>
-              <w:spacing w:before="0" w:after="0" w:line="278"/>
-              <w:ind w:right="314" w:left="0" w:firstLine="0"/>
-              <w:jc w:val="left"/>
-              <w:rPr>
-                <w:color w:val="auto"/>
-                <w:spacing w:val="0"/>
-                <w:position w:val="0"/>
-              </w:rPr>
-            </w:pPr>
-            <w:r>
-              <w:rPr>
-                <w:rFonts w:ascii="Open Sans" w:hAnsi="Open Sans" w:cs="Open Sans" w:eastAsia="Open Sans"/>
-                <w:color w:val="auto"/>
-                <w:spacing w:val="0"/>
-                <w:position w:val="0"/>
-                <w:sz w:val="20"/>
-                <w:shd w:fill="auto" w:val="clear"/>
-              </w:rPr>
-              <w:t xml:space="preserve">-147,06 €</w:t>
-            </w:r>
-          </w:p>
-        </w:tc>
-      </w:tr>
-      <w:tr>
-        <w:trPr>
-          <w:trHeight w:val="1" w:hRule="atLeast"/>
-          <w:jc w:val="left"/>
-        </w:trPr>
-        <w:tc>
-          <w:tcPr>
-            <w:tcW w:w="660" w:type="dxa"/>
-            <w:tcBorders>
-              <w:top w:val="single" w:color="ffffff" w:sz="8"/>
-              <w:left w:val="single" w:color="ffffff" w:sz="8"/>
-              <w:bottom w:val="single" w:color="ffffff" w:sz="8"/>
-              <w:right w:val="single" w:color="ffffff" w:sz="8"/>
-            </w:tcBorders>
-            <w:shd w:color="000000" w:fill="ffffff" w:val="clear"/>
-            <w:tcMar>
-              <w:left w:w="56" w:type="dxa"/>
-              <w:right w:w="56" w:type="dxa"/>
-            </w:tcMar>
-            <w:vAlign w:val="top"/>
-          </w:tcPr>
-          <w:p>
-            <w:pPr>
-              <w:spacing w:before="0" w:after="0" w:line="278"/>
-              <w:ind w:right="-26" w:left="0" w:firstLine="0"/>
-              <w:jc w:val="left"/>
-              <w:rPr>
-                <w:color w:val="auto"/>
-                <w:spacing w:val="0"/>
-                <w:position w:val="0"/>
-              </w:rPr>
-            </w:pPr>
-            <w:r>
-              <w:rPr>
-                <w:rFonts w:ascii="Open Sans" w:hAnsi="Open Sans" w:cs="Open Sans" w:eastAsia="Open Sans"/>
-                <w:color w:val="auto"/>
-                <w:spacing w:val="0"/>
-                <w:position w:val="0"/>
-                <w:sz w:val="20"/>
-                <w:shd w:fill="auto" w:val="clear"/>
-              </w:rPr>
-              <w:t xml:space="preserve">004</w:t>
-            </w:r>
-          </w:p>
-        </w:tc>
-        <w:tc>
-          <w:tcPr>
-            <w:tcW w:w="1035" w:type="dxa"/>
-            <w:tcBorders>
-              <w:top w:val="single" w:color="ffffff" w:sz="8"/>
-              <w:left w:val="single" w:color="ffffff" w:sz="8"/>
-              <w:bottom w:val="single" w:color="ffffff" w:sz="8"/>
-              <w:right w:val="single" w:color="ffffff" w:sz="8"/>
-            </w:tcBorders>
-            <w:shd w:color="000000" w:fill="ffffff" w:val="clear"/>
-            <w:tcMar>
-              <w:left w:w="56" w:type="dxa"/>
-              <w:right w:w="56" w:type="dxa"/>
-            </w:tcMar>
-            <w:vAlign w:val="top"/>
-          </w:tcPr>
-          <w:p>
-            <w:pPr>
-              <w:spacing w:before="0" w:after="0" w:line="278"/>
-              <w:ind w:right="314" w:left="0" w:firstLine="0"/>
-              <w:jc w:val="left"/>
-              <w:rPr>
-                <w:color w:val="auto"/>
-                <w:spacing w:val="0"/>
-                <w:position w:val="0"/>
-              </w:rPr>
-            </w:pPr>
-            <w:r>
-              <w:rPr>
-                <w:rFonts w:ascii="Open Sans" w:hAnsi="Open Sans" w:cs="Open Sans" w:eastAsia="Open Sans"/>
-                <w:color w:val="auto"/>
-                <w:spacing w:val="0"/>
-                <w:position w:val="0"/>
-                <w:sz w:val="20"/>
-                <w:shd w:fill="auto" w:val="clear"/>
-              </w:rPr>
-              <w:t xml:space="preserve">1 Stk</w:t>
-            </w:r>
-          </w:p>
-        </w:tc>
-        <w:tc>
-          <w:tcPr>
-            <w:tcW w:w="4107" w:type="dxa"/>
-            <w:tcBorders>
-              <w:top w:val="single" w:color="ffffff" w:sz="8"/>
-              <w:left w:val="single" w:color="ffffff" w:sz="8"/>
-              <w:bottom w:val="single" w:color="ffffff" w:sz="8"/>
-              <w:right w:val="single" w:color="ffffff" w:sz="8"/>
-            </w:tcBorders>
-            <w:shd w:color="000000" w:fill="ffffff" w:val="clear"/>
-            <w:tcMar>
-              <w:left w:w="56" w:type="dxa"/>
-              <w:right w:w="56" w:type="dxa"/>
-            </w:tcMar>
-            <w:vAlign w:val="top"/>
-          </w:tcPr>
-          <w:p>
-            <w:pPr>
-              <w:spacing w:before="0" w:after="0" w:line="278"/>
-              <w:ind w:right="314" w:left="0" w:firstLine="0"/>
-              <w:jc w:val="left"/>
-              <w:rPr>
-                <w:rFonts w:ascii="Open Sans" w:hAnsi="Open Sans" w:cs="Open Sans" w:eastAsia="Open Sans"/>
-                <w:b/>
-                <w:color w:val="auto"/>
-                <w:spacing w:val="0"/>
-                <w:position w:val="0"/>
-                <w:sz w:val="20"/>
-                <w:shd w:fill="auto" w:val="clear"/>
-              </w:rPr>
-            </w:pPr>
-            <w:r>
-              <w:rPr>
-                <w:rFonts w:ascii="Open Sans" w:hAnsi="Open Sans" w:cs="Open Sans" w:eastAsia="Open Sans"/>
-                <w:b/>
-                <w:color w:val="auto"/>
-                <w:spacing w:val="0"/>
-                <w:position w:val="0"/>
-                <w:sz w:val="20"/>
-                <w:shd w:fill="auto" w:val="clear"/>
-              </w:rPr>
-              <w:t xml:space="preserve">Bestandkundenbonus:</w:t>
-            </w:r>
-          </w:p>
-          <w:p>
-            <w:pPr>
-              <w:spacing w:before="0" w:after="0" w:line="278"/>
-              <w:ind w:right="314" w:left="0" w:firstLine="0"/>
-              <w:jc w:val="left"/>
-              <w:rPr>
-                <w:color w:val="auto"/>
-                <w:spacing w:val="0"/>
-                <w:position w:val="0"/>
-              </w:rPr>
-            </w:pPr>
-            <w:r>
-              <w:rPr>
-                <w:rFonts w:ascii="Open Sans" w:hAnsi="Open Sans" w:cs="Open Sans" w:eastAsia="Open Sans"/>
-                <w:color w:val="auto"/>
-                <w:spacing w:val="0"/>
-                <w:position w:val="0"/>
-                <w:sz w:val="20"/>
-                <w:shd w:fill="auto" w:val="clear"/>
-              </w:rPr>
-              <w:t xml:space="preserve">-- Rabatt von 300 € ab einem Gesamtwert von 3.000</w:t>
-            </w:r>
-          </w:p>
-        </w:tc>
-        <w:tc>
-          <w:tcPr>
-            <w:tcW w:w="2268" w:type="dxa"/>
-            <w:tcBorders>
-              <w:top w:val="single" w:color="ffffff" w:sz="8"/>
-              <w:left w:val="single" w:color="ffffff" w:sz="8"/>
-              <w:bottom w:val="single" w:color="ffffff" w:sz="8"/>
-              <w:right w:val="single" w:color="ffffff" w:sz="8"/>
-            </w:tcBorders>
-            <w:shd w:color="000000" w:fill="ffffff" w:val="clear"/>
-            <w:tcMar>
-              <w:left w:w="56" w:type="dxa"/>
-              <w:right w:w="56" w:type="dxa"/>
-            </w:tcMar>
-            <w:vAlign w:val="top"/>
-          </w:tcPr>
-          <w:p>
-            <w:pPr>
-              <w:spacing w:before="0" w:after="0" w:line="278"/>
-              <w:ind w:right="314" w:left="0" w:firstLine="0"/>
-              <w:jc w:val="left"/>
-              <w:rPr>
-                <w:color w:val="auto"/>
-                <w:spacing w:val="0"/>
-                <w:position w:val="0"/>
-              </w:rPr>
-            </w:pPr>
-            <w:r>
-              <w:rPr>
-                <w:rFonts w:ascii="Open Sans" w:hAnsi="Open Sans" w:cs="Open Sans" w:eastAsia="Open Sans"/>
-                <w:color w:val="auto"/>
-                <w:spacing w:val="0"/>
-                <w:position w:val="0"/>
-                <w:sz w:val="20"/>
-                <w:shd w:fill="auto" w:val="clear"/>
-              </w:rPr>
-              <w:t xml:space="preserve">-252,10 €</w:t>
-            </w:r>
-          </w:p>
-        </w:tc>
-        <w:tc>
-          <w:tcPr>
-            <w:tcW w:w="1710" w:type="dxa"/>
-            <w:tcBorders>
-              <w:top w:val="single" w:color="ffffff" w:sz="8"/>
-              <w:left w:val="single" w:color="ffffff" w:sz="8"/>
-              <w:bottom w:val="single" w:color="ffffff" w:sz="8"/>
-              <w:right w:val="single" w:color="ffffff" w:sz="8"/>
-            </w:tcBorders>
-            <w:shd w:color="000000" w:fill="ffffff" w:val="clear"/>
-            <w:tcMar>
-              <w:left w:w="56" w:type="dxa"/>
-              <w:right w:w="56" w:type="dxa"/>
-            </w:tcMar>
-            <w:vAlign w:val="top"/>
-          </w:tcPr>
-          <w:p>
-            <w:pPr>
-              <w:spacing w:before="0" w:after="0" w:line="278"/>
-              <w:ind w:right="314" w:left="0" w:firstLine="0"/>
-              <w:jc w:val="left"/>
-              <w:rPr>
-                <w:color w:val="auto"/>
-                <w:spacing w:val="0"/>
-                <w:position w:val="0"/>
-              </w:rPr>
-            </w:pPr>
-            <w:r>
-              <w:rPr>
-                <w:rFonts w:ascii="Open Sans" w:hAnsi="Open Sans" w:cs="Open Sans" w:eastAsia="Open Sans"/>
-                <w:color w:val="auto"/>
-                <w:spacing w:val="0"/>
-                <w:position w:val="0"/>
-                <w:sz w:val="20"/>
-                <w:shd w:fill="auto" w:val="clear"/>
-              </w:rPr>
-              <w:t xml:space="preserve">-252,10 €</w:t>
-            </w:r>
           </w:p>
         </w:tc>
       </w:tr>
@@ -3379,7 +2963,7 @@
                 <w:sz w:val="22"/>
                 <w:shd w:fill="auto" w:val="clear"/>
               </w:rPr>
-              <w:t xml:space="preserve">7.211,72 €</w:t>
+              <w:t xml:space="preserve">6.345,62 €</w:t>
             </w:r>
             <w:r>
               <w:rPr>
@@ -3553,7 +3137,7 @@
                 <w:sz w:val="22"/>
                 <w:shd w:fill="auto" w:val="clear"/>
               </w:rPr>
-              <w:t xml:space="preserve">30,99 €</w:t>
+              <w:t xml:space="preserve">12,92 €</w:t>
             </w:r>
             <w:r>
               <w:rPr>
@@ -3727,7 +3311,7 @@
                 <w:sz w:val="22"/>
                 <w:shd w:fill="auto" w:val="clear"/>
               </w:rPr>
-              <w:t xml:space="preserve">1.370,23 €</w:t>
+              <w:t xml:space="preserve">1.205,67 €</w:t>
             </w:r>
             <w:r>
               <w:rPr>
@@ -3901,7 +3485,7 @@
                 <w:sz w:val="22"/>
                 <w:shd w:fill="auto" w:val="clear"/>
               </w:rPr>
-              <w:t xml:space="preserve">8.581,95 €</w:t>
+              <w:t xml:space="preserve">7.551,29 €</w:t>
             </w:r>
             <w:r>
               <w:rPr>
@@ -4075,7 +3659,7 @@
                 <w:sz w:val="22"/>
                 <w:shd w:fill="auto" w:val="clear"/>
               </w:rPr>
-              <w:t xml:space="preserve">8.545,07 €</w:t>
+              <w:t xml:space="preserve">7.535,91 €</w:t>
             </w:r>
             <w:r>
               <w:rPr>
@@ -4143,7 +3727,7 @@
                 <w:sz w:val="20"/>
                 <w:shd w:fill="auto" w:val="clear"/>
               </w:rPr>
-              <w:t xml:space="preserve">Gesamtbetrag nach Neukundenbonus</w:t>
+              <w:t xml:space="preserve">Zuschuss Krankenkasse</w:t>
             </w:r>
           </w:p>
         </w:tc>
@@ -4249,7 +3833,181 @@
                 <w:sz w:val="22"/>
                 <w:shd w:fill="auto" w:val="clear"/>
               </w:rPr>
-              <w:t xml:space="preserve">8.070,07 €</w:t>
+              <w:t xml:space="preserve">4.180,00 €</w:t>
+            </w:r>
+            <w:r>
+              <w:rPr>
+                <w:rFonts w:ascii="Open Sans SemiBold" w:hAnsi="Open Sans SemiBold" w:cs="Open Sans SemiBold" w:eastAsia="Open Sans SemiBold"/>
+                <w:color w:val="auto"/>
+                <w:spacing w:val="0"/>
+                <w:position w:val="0"/>
+                <w:sz w:val="22"/>
+                <w:shd w:fill="auto" w:val="clear"/>
+              </w:rPr>
+              <w:t/>
+            </w:r>
+          </w:p>
+        </w:tc>
+      </w:tr>
+      <w:tr>
+        <w:trPr>
+          <w:trHeight w:val="1" w:hRule="atLeast"/>
+          <w:jc w:val="left"/>
+        </w:trPr>
+        <w:tc>
+          <w:tcPr>
+            <w:tcW w:w="3915" w:type="dxa"/>
+            <w:tcBorders>
+              <w:top w:val="single" w:color="ffffff" w:sz="8"/>
+              <w:left w:val="single" w:color="d9d9d9" w:sz="8"/>
+              <w:bottom w:val="single" w:color="ffffff" w:sz="8"/>
+              <w:right w:val="single" w:color="d9d9d9" w:sz="8"/>
+            </w:tcBorders>
+            <w:shd w:color="000000" w:fill="d9d9d9" w:val="clear"/>
+            <w:tcMar>
+              <w:left w:w="0" w:type="dxa"/>
+              <w:right w:w="0" w:type="dxa"/>
+            </w:tcMar>
+            <w:vAlign w:val="center"/>
+          </w:tcPr>
+          <w:p>
+            <w:pPr>
+              <w:spacing w:before="56" w:after="0" w:line="240"/>
+              <w:ind w:right="0" w:left="50" w:firstLine="0"/>
+              <w:jc w:val="left"/>
+              <w:rPr>
+                <w:spacing w:val="0"/>
+                <w:position w:val="0"/>
+              </w:rPr>
+            </w:pPr>
+            <w:r>
+              <w:rPr>
+                <w:rFonts w:ascii="Open Sans SemiBold" w:hAnsi="Open Sans SemiBold" w:cs="Open Sans SemiBold" w:eastAsia="Open Sans SemiBold"/>
+                <w:color w:val="030303"/>
+                <w:spacing w:val="0"/>
+                <w:position w:val="0"/>
+                <w:sz w:val="20"/>
+                <w:shd w:fill="auto" w:val="clear"/>
+              </w:rPr>
+              <w:t/>
+            </w:r>
+            <w:r>
+              <w:rPr>
+                <w:rFonts w:ascii="Open Sans SemiBold" w:hAnsi="Open Sans SemiBold" w:cs="Open Sans SemiBold" w:eastAsia="Open Sans SemiBold"/>
+                <w:b/>
+                <w:color w:val="030303"/>
+                <w:spacing w:val="0"/>
+                <w:position w:val="0"/>
+                <w:sz w:val="20"/>
+                <w:shd w:fill="auto" w:val="clear"/>
+              </w:rPr>
+              <w:t xml:space="preserve">Selbstkostenanteil</w:t>
+            </w:r>
+          </w:p>
+        </w:tc>
+        <w:tc>
+          <w:tcPr>
+            <w:tcW w:w="915" w:type="dxa"/>
+            <w:tcBorders>
+              <w:top w:val="single" w:color="ffffff" w:sz="8"/>
+              <w:left w:val="single" w:color="d9d9d9" w:sz="8"/>
+              <w:bottom w:val="single" w:color="ffffff" w:sz="8"/>
+              <w:right w:val="single" w:color="d9d9d9" w:sz="8"/>
+            </w:tcBorders>
+            <w:shd w:color="000000" w:fill="d9d9d9" w:val="clear"/>
+            <w:tcMar>
+              <w:left w:w="0" w:type="dxa"/>
+              <w:right w:w="0" w:type="dxa"/>
+            </w:tcMar>
+            <w:vAlign w:val="center"/>
+          </w:tcPr>
+          <w:p>
+            <w:pPr>
+              <w:spacing w:before="0" w:after="0" w:line="240"/>
+              <w:ind w:right="0" w:left="0" w:firstLine="0"/>
+              <w:jc w:val="left"/>
+              <w:rPr>
+                <w:rFonts w:ascii="Calibri" w:hAnsi="Calibri" w:cs="Calibri" w:eastAsia="Calibri"/>
+                <w:color w:val="auto"/>
+                <w:spacing w:val="0"/>
+                <w:position w:val="0"/>
+                <w:sz w:val="22"/>
+                <w:shd w:fill="auto" w:val="clear"/>
+              </w:rPr>
+            </w:pPr>
+          </w:p>
+        </w:tc>
+        <w:tc>
+          <w:tcPr>
+            <w:tcW w:w="2106" w:type="dxa"/>
+            <w:tcBorders>
+              <w:top w:val="single" w:color="ffffff" w:sz="8"/>
+              <w:left w:val="single" w:color="d9d9d9" w:sz="8"/>
+              <w:bottom w:val="single" w:color="ffffff" w:sz="8"/>
+              <w:right w:val="single" w:color="d9d9d9" w:sz="8"/>
+            </w:tcBorders>
+            <w:shd w:color="000000" w:fill="d9d9d9" w:val="clear"/>
+            <w:tcMar>
+              <w:left w:w="0" w:type="dxa"/>
+              <w:right w:w="0" w:type="dxa"/>
+            </w:tcMar>
+            <w:vAlign w:val="center"/>
+          </w:tcPr>
+          <w:p>
+            <w:pPr>
+              <w:spacing w:before="0" w:after="0" w:line="240"/>
+              <w:ind w:right="0" w:left="0" w:firstLine="0"/>
+              <w:jc w:val="left"/>
+              <w:rPr>
+                <w:rFonts w:ascii="Calibri" w:hAnsi="Calibri" w:cs="Calibri" w:eastAsia="Calibri"/>
+                <w:color w:val="auto"/>
+                <w:spacing w:val="0"/>
+                <w:position w:val="0"/>
+                <w:sz w:val="22"/>
+                <w:shd w:fill="auto" w:val="clear"/>
+              </w:rPr>
+            </w:pPr>
+          </w:p>
+        </w:tc>
+        <w:tc>
+          <w:tcPr>
+            <w:tcW w:w="2724" w:type="dxa"/>
+            <w:tcBorders>
+              <w:top w:val="single" w:color="ffffff" w:sz="8"/>
+              <w:left w:val="single" w:color="d9d9d9" w:sz="8"/>
+              <w:bottom w:val="single" w:color="ffffff" w:sz="8"/>
+              <w:right w:val="single" w:color="d9d9d9" w:sz="8"/>
+            </w:tcBorders>
+            <w:shd w:color="000000" w:fill="d9d9d9" w:val="clear"/>
+            <w:tcMar>
+              <w:left w:w="0" w:type="dxa"/>
+              <w:right w:w="0" w:type="dxa"/>
+            </w:tcMar>
+            <w:vAlign w:val="center"/>
+          </w:tcPr>
+          <w:p>
+            <w:pPr>
+              <w:spacing w:before="0" w:after="0" w:line="278"/>
+              <w:ind w:right="314" w:left="0" w:firstLine="0"/>
+              <w:jc w:val="right"/>
+              <w:rPr>
+                <w:color w:val="auto"/>
+                <w:spacing w:val="0"/>
+                <w:position w:val="0"/>
+                <w:sz w:val="22"/>
+              </w:rPr>
+            </w:pPr>
+            <w:r>
+              <w:rPr>
+                <w:rFonts w:ascii="Open Sans SemiBold" w:hAnsi="Open Sans SemiBold" w:cs="Open Sans SemiBold" w:eastAsia="Open Sans SemiBold"/>
+                <w:b/>
+                <w:color w:val="auto"/>
+                <w:spacing w:val="0"/>
+                <w:position w:val="0"/>
+                <w:sz w:val="22"/>
+                <w:shd w:fill="auto" w:val="clear"/>
+              </w:rPr>
+              <w:t xml:space="preserve">3.355,91 €</w:t>
             </w:r>
             <w:r>
               <w:rPr>
@@ -4386,6 +4144,55 @@
           <w:shd w:fill="auto" w:val="clear"/>
         </w:rPr>
         <w:t xml:space="preserve">Diese werden vorab mit Ihnen besprochen, bedürfen lhrer Zustimmung und werden auf Regiebasis nach tatsächlichem Aufwand abgerechnet. (Stundensatz-Facharbeiter: 69,50€ netto)</w:t>
+        <w:br/>
+        <w:br/>
+        <w:t xml:space="preserve">Der Selbstkostenanteil beträgt </w:t>
+      </w:r>
+      <w:r>
+        <w:rPr>
+          <w:rFonts w:ascii="Open Sans" w:hAnsi="Open Sans" w:cs="Open Sans" w:eastAsia="Open Sans"/>
+          <w:b/>
+          <w:color w:val="030303"/>
+          <w:spacing w:val="0"/>
+          <w:position w:val="0"/>
+          <w:sz w:val="22"/>
+          <w:shd w:fill="auto" w:val="clear"/>
+        </w:rPr>
+        <w:t xml:space="preserve">3.355,91 €</w:t>
+      </w:r>
+      <w:r>
+        <w:rPr>
+          <w:rFonts w:ascii="Open Sans" w:hAnsi="Open Sans" w:cs="Open Sans" w:eastAsia="Open Sans"/>
+          <w:color w:val="030303"/>
+          <w:spacing w:val="0"/>
+          <w:position w:val="0"/>
+          <w:sz w:val="22"/>
+          <w:shd w:fill="auto" w:val="clear"/>
+        </w:rPr>
+        <w:t xml:space="preserve"> unter Berücksichtigung eines gewährten Zuschusses durch die Pflegekasse i.H.v. </w:t>
+      </w:r>
+      <w:r>
+        <w:rPr>
+          <w:rFonts w:ascii="Open Sans" w:hAnsi="Open Sans" w:cs="Open Sans" w:eastAsia="Open Sans"/>
+          <w:b/>
+          <w:color w:val="030303"/>
+          <w:spacing w:val="0"/>
+          <w:position w:val="0"/>
+          <w:sz w:val="22"/>
+          <w:shd w:fill="auto" w:val="clear"/>
+        </w:rPr>
+        <w:t xml:space="preserve">4.180,00 €</w:t>
+      </w:r>
+      <w:r>
+        <w:rPr>
+          <w:rFonts w:ascii="Open Sans" w:hAnsi="Open Sans" w:cs="Open Sans" w:eastAsia="Open Sans"/>
+          <w:color w:val="030303"/>
+          <w:spacing w:val="0"/>
+          <w:position w:val="0"/>
+          <w:sz w:val="22"/>
+          <w:shd w:fill="auto" w:val="clear"/>
+        </w:rPr>
+        <w:t xml:space="preserve">.</w:t>
       </w:r>
     </w:p>
     <w:p>

</xml_diff>

<commit_message>
zzgl. 19% MwSt. and Gesamtbetrag not dynamic anymore, they wil lalways have the anount before a rabatt (if exist)
</commit_message>
<xml_diff>
--- a/out-Angebot.docx
+++ b/out-Angebot.docx
@@ -370,7 +370,7 @@
                 <w:sz w:val="22"/>
                 <w:shd w:fill="auto" w:val="clear"/>
               </w:rPr>
-              <w:t xml:space="preserve">AN20251001145033</w:t>
+              <w:t xml:space="preserve">AN20251001162123</w:t>
             </w:r>
             <w:r>
               <w:rPr>
@@ -676,7 +676,7 @@
           <w:sz w:val="24"/>
           <w:shd w:fill="auto" w:val="clear"/>
         </w:rPr>
-        <w:t xml:space="preserve">Ihr Angebot AN20251001145033</w:t>
+        <w:t xml:space="preserve">Ihr Angebot AN20251001162123</w:t>
       </w:r>
     </w:p>
     <w:p>
@@ -1617,110 +1617,6 @@
               <w:t xml:space="preserve">- Verkleidung Deckenhoch im Dusch/ Wannenbereich</w:t>
             </w:r>
           </w:p>
-          <w:p>
-            <w:pPr>
-              <w:pStyle w:val="Normal"/>
-              <w:bidi w:val="0"/>
-              <w:spacing w:lineRule="auto" w:line="278" w:before="0" w:after="0"/>
-              <w:ind w:hanging="0" w:left="0" w:right="314"/>
-              <w:jc w:val="left"/>
-              <w:rPr>
-                <w:rFonts w:ascii="Open Sans" w:hAnsi="Open Sans" w:eastAsia="Open Sans" w:cs="Open Sans"/>
-                <w:color w:val="auto"/>
-                <w:spacing w:val="0"/>
-                <w:sz w:val="18"/>
-                <w:shd w:fill="auto" w:val="clear"/>
-              </w:rPr>
-            </w:pPr>
-            <w:r>
-              <w:rPr>
-                <w:rFonts w:eastAsia="Open Sans" w:cs="Open Sans" w:ascii="Open Sans" w:hAnsi="Open Sans"/>
-                <w:color w:val="000000"/>
-                <w:spacing w:val="0"/>
-                <w:sz w:val="18"/>
-                <w:shd w:fill="auto" w:val="clear"/>
-              </w:rPr>
-              <w:t xml:space="preserve">- Auswechseln des Duschsystems</w:t>
-            </w:r>
-          </w:p>
-          <w:p>
-            <w:pPr>
-              <w:pStyle w:val="Normal"/>
-              <w:bidi w:val="0"/>
-              <w:spacing w:lineRule="auto" w:line="278" w:before="0" w:after="0"/>
-              <w:ind w:hanging="0" w:left="0" w:right="314"/>
-              <w:jc w:val="left"/>
-              <w:rPr>
-                <w:rFonts w:ascii="Open Sans" w:hAnsi="Open Sans" w:eastAsia="Open Sans" w:cs="Open Sans"/>
-                <w:color w:val="auto"/>
-                <w:spacing w:val="0"/>
-                <w:sz w:val="18"/>
-                <w:shd w:fill="auto" w:val="clear"/>
-              </w:rPr>
-            </w:pPr>
-            <w:r>
-              <w:rPr>
-                <w:rFonts w:eastAsia="Open Sans" w:cs="Open Sans" w:ascii="Open Sans" w:hAnsi="Open Sans"/>
-                <w:color w:val="000000"/>
-                <w:spacing w:val="0"/>
-                <w:sz w:val="18"/>
-                <w:shd w:fill="auto" w:val="clear"/>
-              </w:rPr>
-              <w:t xml:space="preserve">- Anbringen zusätzlicher Haltegriffe</w:t>
-            </w:r>
-          </w:p>
-          <w:p>
-            <w:pPr>
-              <w:pStyle w:val="Normal"/>
-              <w:bidi w:val="0"/>
-              <w:spacing w:lineRule="auto" w:line="278" w:before="0" w:after="0"/>
-              <w:ind w:hanging="0" w:left="0" w:right="314"/>
-              <w:jc w:val="left"/>
-              <w:rPr>
-                <w:rFonts w:ascii="Open Sans" w:hAnsi="Open Sans" w:eastAsia="Open Sans" w:cs="Open Sans"/>
-                <w:color w:val="auto"/>
-                <w:spacing w:val="0"/>
-                <w:sz w:val="18"/>
-                <w:shd w:fill="auto" w:val="clear"/>
-              </w:rPr>
-            </w:pPr>
-            <w:r>
-              <w:rPr>
-                <w:rFonts w:eastAsia="Open Sans" w:cs="Open Sans" w:ascii="Open Sans" w:hAnsi="Open Sans"/>
-                <w:color w:val="000000"/>
-                <w:spacing w:val="0"/>
-                <w:sz w:val="18"/>
-                <w:shd w:fill="auto" w:val="clear"/>
-              </w:rPr>
-              <w:t xml:space="preserve">- Anbringen zusätzlicher Stützklappgriffe</w:t>
-            </w:r>
-          </w:p>
-          <w:p>
-            <w:pPr>
-              <w:pStyle w:val="Normal"/>
-              <w:bidi w:val="0"/>
-              <w:spacing w:lineRule="auto" w:line="278" w:before="0" w:after="0"/>
-              <w:ind w:hanging="0" w:left="0" w:right="314"/>
-              <w:jc w:val="left"/>
-              <w:rPr>
-                <w:rFonts w:ascii="Open Sans" w:hAnsi="Open Sans" w:eastAsia="Open Sans" w:cs="Open Sans"/>
-                <w:color w:val="auto"/>
-                <w:spacing w:val="0"/>
-                <w:sz w:val="18"/>
-                <w:shd w:fill="auto" w:val="clear"/>
-              </w:rPr>
-            </w:pPr>
-            <w:r>
-              <w:rPr>
-                <w:rFonts w:eastAsia="Open Sans" w:cs="Open Sans" w:ascii="Open Sans" w:hAnsi="Open Sans"/>
-                <w:color w:val="000000"/>
-                <w:spacing w:val="0"/>
-                <w:sz w:val="18"/>
-                <w:shd w:fill="auto" w:val="clear"/>
-              </w:rPr>
-              <w:t xml:space="preserve">- Austausch eines Thermostates</w:t>
-            </w:r>
-          </w:p>
         </w:tc>
         <w:tc>
           <w:tcPr>
@@ -2191,7 +2087,7 @@
                 <w:sz w:val="20"/>
                 <w:shd w:fill="auto" w:val="clear"/>
               </w:rPr>
-              <w:t xml:space="preserve">1.586,92 €</w:t>
+              <w:t xml:space="preserve">1.020,76 €</w:t>
             </w:r>
           </w:p>
         </w:tc>
@@ -2231,7 +2127,7 @@
                 <w:sz w:val="20"/>
                 <w:shd w:fill="auto" w:val="clear"/>
               </w:rPr>
-              <w:t xml:space="preserve">1.586,92 €</w:t>
+              <w:t xml:space="preserve">1.020,76 €</w:t>
             </w:r>
           </w:p>
         </w:tc>
@@ -2780,110 +2676,6 @@
               <w:t xml:space="preserve">- 1 Stk TRINNITY Wandabdichtung BASIS-Set 5 qm DW bis 100 x 100 / BW bis 180 x 80 cm</w:t>
             </w:r>
           </w:p>
-          <w:p>
-            <w:pPr>
-              <w:pStyle w:val="Normal"/>
-              <w:bidi w:val="0"/>
-              <w:spacing w:lineRule="auto" w:line="278" w:before="0" w:after="0"/>
-              <w:ind w:hanging="0" w:left="0" w:right="314"/>
-              <w:jc w:val="left"/>
-              <w:rPr>
-                <w:rFonts w:ascii="Open Sans" w:hAnsi="Open Sans" w:eastAsia="Open Sans" w:cs="Open Sans"/>
-                <w:color w:val="auto"/>
-                <w:spacing w:val="0"/>
-                <w:sz w:val="20"/>
-                <w:shd w:fill="auto" w:val="clear"/>
-              </w:rPr>
-            </w:pPr>
-            <w:r>
-              <w:rPr>
-                <w:rFonts w:eastAsia="Open Sans" w:cs="Open Sans" w:ascii="Open Sans" w:hAnsi="Open Sans"/>
-                <w:color w:val="000000"/>
-                <w:spacing w:val="0"/>
-                <w:sz w:val="20"/>
-                <w:shd w:fill="auto" w:val="clear"/>
-              </w:rPr>
-              <w:t xml:space="preserve">- 1 Stk Wannenset individual 2.2 m. Wandhalter Schlauch u. HB 1-str. rund verchr. VIGOUR</w:t>
-            </w:r>
-          </w:p>
-          <w:p>
-            <w:pPr>
-              <w:pStyle w:val="Normal"/>
-              <w:bidi w:val="0"/>
-              <w:spacing w:lineRule="auto" w:line="278" w:before="0" w:after="0"/>
-              <w:ind w:hanging="0" w:left="0" w:right="314"/>
-              <w:jc w:val="left"/>
-              <w:rPr>
-                <w:rFonts w:ascii="Open Sans" w:hAnsi="Open Sans" w:eastAsia="Open Sans" w:cs="Open Sans"/>
-                <w:color w:val="auto"/>
-                <w:spacing w:val="0"/>
-                <w:sz w:val="20"/>
-                <w:shd w:fill="auto" w:val="clear"/>
-              </w:rPr>
-            </w:pPr>
-            <w:r>
-              <w:rPr>
-                <w:rFonts w:eastAsia="Open Sans" w:cs="Open Sans" w:ascii="Open Sans" w:hAnsi="Open Sans"/>
-                <w:color w:val="000000"/>
-                <w:spacing w:val="0"/>
-                <w:sz w:val="20"/>
-                <w:shd w:fill="auto" w:val="clear"/>
-              </w:rPr>
-              <w:t xml:space="preserve">- 1 Stk AP-Brause-Thermostat clivia, ohne Brausegarnitur</w:t>
-            </w:r>
-          </w:p>
-          <w:p>
-            <w:pPr>
-              <w:pStyle w:val="Normal"/>
-              <w:bidi w:val="0"/>
-              <w:spacing w:lineRule="auto" w:line="278" w:before="0" w:after="0"/>
-              <w:ind w:hanging="0" w:left="0" w:right="314"/>
-              <w:jc w:val="left"/>
-              <w:rPr>
-                <w:rFonts w:ascii="Open Sans" w:hAnsi="Open Sans" w:eastAsia="Open Sans" w:cs="Open Sans"/>
-                <w:color w:val="auto"/>
-                <w:spacing w:val="0"/>
-                <w:sz w:val="20"/>
-                <w:shd w:fill="auto" w:val="clear"/>
-              </w:rPr>
-            </w:pPr>
-            <w:r>
-              <w:rPr>
-                <w:rFonts w:eastAsia="Open Sans" w:cs="Open Sans" w:ascii="Open Sans" w:hAnsi="Open Sans"/>
-                <w:color w:val="000000"/>
-                <w:spacing w:val="0"/>
-                <w:sz w:val="20"/>
-                <w:shd w:fill="auto" w:val="clear"/>
-              </w:rPr>
-              <w:t xml:space="preserve">- 1 Stk Haltegriff clivia plus 32/400mm m. Ros. Edelstahl glatt poliert, VIGOUR</w:t>
-            </w:r>
-          </w:p>
-          <w:p>
-            <w:pPr>
-              <w:pStyle w:val="Normal"/>
-              <w:bidi w:val="0"/>
-              <w:spacing w:lineRule="auto" w:line="278" w:before="0" w:after="0"/>
-              <w:ind w:hanging="0" w:left="0" w:right="314"/>
-              <w:jc w:val="left"/>
-              <w:rPr>
-                <w:rFonts w:ascii="Open Sans" w:hAnsi="Open Sans" w:eastAsia="Open Sans" w:cs="Open Sans"/>
-                <w:color w:val="auto"/>
-                <w:spacing w:val="0"/>
-                <w:sz w:val="20"/>
-                <w:shd w:fill="auto" w:val="clear"/>
-              </w:rPr>
-            </w:pPr>
-            <w:r>
-              <w:rPr>
-                <w:rFonts w:eastAsia="Open Sans" w:cs="Open Sans" w:ascii="Open Sans" w:hAnsi="Open Sans"/>
-                <w:color w:val="000000"/>
-                <w:spacing w:val="0"/>
-                <w:sz w:val="20"/>
-                <w:shd w:fill="auto" w:val="clear"/>
-              </w:rPr>
-              <w:t xml:space="preserve">- 1 Stk Stützklappgriff derby plus 600mm verchromt m. ABS-Ummantelung VIGOUR</w:t>
-            </w:r>
-          </w:p>
         </w:tc>
         <w:tc>
           <w:tcPr>
@@ -2965,6 +2757,462 @@
                 <w:sz w:val="22"/>
                 <w:shd w:fill="auto" w:val="clear"/>
               </w:rPr>
+            </w:r>
+          </w:p>
+        </w:tc>
+      </w:tr>
+      <w:tr>
+        <w:trPr>
+          <w:trHeight w:val="1" w:hRule="atLeast"/>
+        </w:trPr>
+        <w:tc>
+          <w:tcPr>
+            <w:tcW w:w="660" w:type="dxa"/>
+            <w:tcBorders>
+              <w:top w:val="single" w:sz="8" w:space="0" w:color="FFFFFF"/>
+              <w:left w:val="single" w:sz="8" w:space="0" w:color="FFFFFF"/>
+              <w:bottom w:val="single" w:sz="8" w:space="0" w:color="FFFFFF"/>
+              <w:right w:val="single" w:sz="8" w:space="0" w:color="FFFFFF"/>
+            </w:tcBorders>
+            <w:shd w:color="000000" w:fill="FFFFFF" w:val="clear"/>
+            <w:tcMar>
+              <w:left w:w="56" w:type="dxa"/>
+              <w:right w:w="56" w:type="dxa"/>
+            </w:tcMar>
+          </w:tcPr>
+          <w:p>
+            <w:pPr>
+              <w:pStyle w:val="Normal"/>
+              <w:bidi w:val="0"/>
+              <w:spacing w:lineRule="auto" w:line="278" w:before="0" w:after="0"/>
+              <w:ind w:hanging="0" w:left="0" w:right="-26"/>
+              <w:jc w:val="left"/>
+              <w:rPr>
+                <w:color w:val="auto"/>
+                <w:spacing w:val="0"/>
+              </w:rPr>
+            </w:pPr>
+            <w:r>
+              <w:rPr>
+                <w:rFonts w:eastAsia="Open Sans" w:cs="Open Sans" w:ascii="Open Sans" w:hAnsi="Open Sans"/>
+                <w:color w:val="000000"/>
+                <w:spacing w:val="0"/>
+                <w:sz w:val="20"/>
+                <w:shd w:fill="auto" w:val="clear"/>
+              </w:rPr>
+              <w:t xml:space="preserve">003</w:t>
+            </w:r>
+          </w:p>
+        </w:tc>
+        <w:tc>
+          <w:tcPr>
+            <w:tcW w:w="1034" w:type="dxa"/>
+            <w:tcBorders>
+              <w:top w:val="single" w:sz="8" w:space="0" w:color="FFFFFF"/>
+              <w:left w:val="single" w:sz="8" w:space="0" w:color="FFFFFF"/>
+              <w:bottom w:val="single" w:sz="8" w:space="0" w:color="FFFFFF"/>
+              <w:right w:val="single" w:sz="8" w:space="0" w:color="FFFFFF"/>
+            </w:tcBorders>
+            <w:shd w:color="000000" w:fill="FFFFFF" w:val="clear"/>
+            <w:tcMar>
+              <w:left w:w="56" w:type="dxa"/>
+              <w:right w:w="56" w:type="dxa"/>
+            </w:tcMar>
+          </w:tcPr>
+          <w:p>
+            <w:pPr>
+              <w:pStyle w:val="Normal"/>
+              <w:bidi w:val="0"/>
+              <w:spacing w:lineRule="auto" w:line="278" w:before="0" w:after="0"/>
+              <w:ind w:hanging="0" w:left="0" w:right="314"/>
+              <w:jc w:val="left"/>
+              <w:rPr>
+                <w:color w:val="auto"/>
+                <w:spacing w:val="0"/>
+              </w:rPr>
+            </w:pPr>
+            <w:r>
+              <w:rPr>
+                <w:rFonts w:eastAsia="Open Sans" w:cs="Open Sans" w:ascii="Open Sans" w:hAnsi="Open Sans"/>
+                <w:color w:val="000000"/>
+                <w:spacing w:val="0"/>
+                <w:sz w:val="20"/>
+                <w:shd w:fill="auto" w:val="clear"/>
+              </w:rPr>
+              <w:t xml:space="preserve">1 Stk</w:t>
+            </w:r>
+          </w:p>
+        </w:tc>
+        <w:tc>
+          <w:tcPr>
+            <w:tcW w:w="4108" w:type="dxa"/>
+            <w:tcBorders>
+              <w:top w:val="single" w:sz="8" w:space="0" w:color="FFFFFF"/>
+              <w:left w:val="single" w:sz="8" w:space="0" w:color="FFFFFF"/>
+              <w:bottom w:val="single" w:sz="8" w:space="0" w:color="FFFFFF"/>
+              <w:right w:val="single" w:sz="8" w:space="0" w:color="FFFFFF"/>
+            </w:tcBorders>
+            <w:shd w:color="000000" w:fill="FFFFFF" w:val="clear"/>
+            <w:tcMar>
+              <w:left w:w="56" w:type="dxa"/>
+              <w:right w:w="56" w:type="dxa"/>
+            </w:tcMar>
+          </w:tcPr>
+          <w:p>
+            <w:pPr>
+              <w:pStyle w:val="Normal"/>
+              <w:bidi w:val="0"/>
+              <w:spacing w:lineRule="auto" w:line="278" w:before="0" w:after="0"/>
+              <w:ind w:hanging="0" w:left="0" w:right="314"/>
+              <w:jc w:val="left"/>
+              <w:rPr>
+                <w:rFonts w:ascii="Open Sans" w:hAnsi="Open Sans" w:eastAsia="Open Sans" w:cs="Open Sans"/>
+                <w:b/>
+                <w:color w:val="auto"/>
+                <w:spacing w:val="0"/>
+                <w:sz w:val="20"/>
+                <w:shd w:fill="auto" w:val="clear"/>
+              </w:rPr>
+            </w:pPr>
+            <w:r>
+              <w:rPr>
+                <w:rFonts w:eastAsia="Open Sans" w:cs="Open Sans" w:ascii="Open Sans" w:hAnsi="Open Sans"/>
+                <w:b/>
+                <w:color w:val="000000"/>
+                <w:spacing w:val="0"/>
+                <w:sz w:val="20"/>
+                <w:shd w:fill="auto" w:val="clear"/>
+              </w:rPr>
+              <w:t xml:space="preserve">Aktion: Haltegriff</w:t>
+            </w:r>
+          </w:p>
+          <w:p>
+            <w:pPr>
+              <w:pStyle w:val="Normal"/>
+              <w:bidi w:val="0"/>
+              <w:spacing w:lineRule="auto" w:line="278" w:before="0" w:after="0"/>
+              <w:ind w:hanging="0" w:left="0" w:right="314"/>
+              <w:jc w:val="left"/>
+              <w:rPr>
+                <w:color w:val="auto"/>
+                <w:spacing w:val="0"/>
+              </w:rPr>
+            </w:pPr>
+            <w:r>
+              <w:rPr>
+                <w:rFonts w:eastAsia="Open Sans" w:cs="Open Sans" w:ascii="Open Sans" w:hAnsi="Open Sans"/>
+                <w:color w:val="000000"/>
+                <w:spacing w:val="0"/>
+                <w:sz w:val="20"/>
+                <w:shd w:fill="auto" w:val="clear"/>
+              </w:rPr>
+              <w:t xml:space="preserve">1 Haltegriff gratis im Wert von 175 € inkl. Lieferung und Montage</w:t>
+            </w:r>
+          </w:p>
+        </w:tc>
+        <w:tc>
+          <w:tcPr>
+            <w:tcW w:w="2268" w:type="dxa"/>
+            <w:tcBorders>
+              <w:top w:val="single" w:sz="8" w:space="0" w:color="FFFFFF"/>
+              <w:left w:val="single" w:sz="8" w:space="0" w:color="FFFFFF"/>
+              <w:bottom w:val="single" w:sz="8" w:space="0" w:color="FFFFFF"/>
+              <w:right w:val="single" w:sz="8" w:space="0" w:color="FFFFFF"/>
+            </w:tcBorders>
+            <w:shd w:color="000000" w:fill="FFFFFF" w:val="clear"/>
+            <w:tcMar>
+              <w:left w:w="56" w:type="dxa"/>
+              <w:right w:w="56" w:type="dxa"/>
+            </w:tcMar>
+          </w:tcPr>
+          <w:p>
+            <w:pPr>
+              <w:pStyle w:val="Normal"/>
+              <w:bidi w:val="0"/>
+              <w:spacing w:lineRule="auto" w:line="278" w:before="0" w:after="0"/>
+              <w:ind w:hanging="0" w:left="0" w:right="314"/>
+              <w:jc w:val="left"/>
+              <w:rPr>
+                <w:color w:val="auto"/>
+                <w:spacing w:val="0"/>
+              </w:rPr>
+            </w:pPr>
+            <w:r>
+              <w:rPr>
+                <w:rFonts w:eastAsia="Open Sans" w:cs="Open Sans" w:ascii="Open Sans" w:hAnsi="Open Sans"/>
+                <w:color w:val="000000"/>
+                <w:spacing w:val="0"/>
+                <w:sz w:val="20"/>
+                <w:shd w:fill="auto" w:val="clear"/>
+              </w:rPr>
+              <w:t xml:space="preserve">0,00 €</w:t>
+            </w:r>
+          </w:p>
+        </w:tc>
+        <w:tc>
+          <w:tcPr>
+            <w:tcW w:w="1710" w:type="dxa"/>
+            <w:tcBorders>
+              <w:top w:val="single" w:sz="8" w:space="0" w:color="FFFFFF"/>
+              <w:left w:val="single" w:sz="8" w:space="0" w:color="FFFFFF"/>
+              <w:bottom w:val="single" w:sz="8" w:space="0" w:color="FFFFFF"/>
+              <w:right w:val="single" w:sz="8" w:space="0" w:color="FFFFFF"/>
+            </w:tcBorders>
+            <w:shd w:color="000000" w:fill="FFFFFF" w:val="clear"/>
+            <w:tcMar>
+              <w:left w:w="56" w:type="dxa"/>
+              <w:right w:w="56" w:type="dxa"/>
+            </w:tcMar>
+          </w:tcPr>
+          <w:p>
+            <w:pPr>
+              <w:pStyle w:val="Normal"/>
+              <w:bidi w:val="0"/>
+              <w:spacing w:lineRule="auto" w:line="278" w:before="0" w:after="0"/>
+              <w:ind w:hanging="0" w:left="0" w:right="314"/>
+              <w:jc w:val="left"/>
+              <w:rPr>
+                <w:color w:val="auto"/>
+                <w:spacing w:val="0"/>
+              </w:rPr>
+            </w:pPr>
+            <w:r>
+              <w:rPr>
+                <w:rFonts w:eastAsia="Open Sans" w:cs="Open Sans" w:ascii="Open Sans" w:hAnsi="Open Sans"/>
+                <w:color w:val="000000"/>
+                <w:spacing w:val="0"/>
+                <w:sz w:val="20"/>
+                <w:shd w:fill="auto" w:val="clear"/>
+              </w:rPr>
+              <w:t xml:space="preserve">0,00 €</w:t>
+            </w:r>
+          </w:p>
+        </w:tc>
+      </w:tr>
+      <w:tr>
+        <w:trPr>
+          <w:trHeight w:val="1" w:hRule="atLeast"/>
+        </w:trPr>
+        <w:tc>
+          <w:tcPr>
+            <w:tcW w:w="660" w:type="dxa"/>
+            <w:tcBorders>
+              <w:top w:val="single" w:sz="8" w:space="0" w:color="FFFFFF"/>
+              <w:left w:val="single" w:sz="8" w:space="0" w:color="FFFFFF"/>
+              <w:bottom w:val="single" w:sz="8" w:space="0" w:color="FFFFFF"/>
+              <w:right w:val="single" w:sz="8" w:space="0" w:color="FFFFFF"/>
+            </w:tcBorders>
+            <w:shd w:color="000000" w:fill="FFFFFF" w:val="clear"/>
+            <w:tcMar>
+              <w:left w:w="56" w:type="dxa"/>
+              <w:right w:w="56" w:type="dxa"/>
+            </w:tcMar>
+          </w:tcPr>
+          <w:p>
+            <w:pPr>
+              <w:pStyle w:val="Normal"/>
+              <w:bidi w:val="0"/>
+              <w:spacing w:lineRule="auto" w:line="278" w:before="0" w:after="0"/>
+              <w:ind w:hanging="0" w:left="0" w:right="-26"/>
+              <w:jc w:val="left"/>
+              <w:rPr>
+                <w:color w:val="auto"/>
+                <w:spacing w:val="0"/>
+              </w:rPr>
+            </w:pPr>
+            <w:r>
+              <w:rPr>
+                <w:rFonts w:eastAsia="Open Sans" w:cs="Open Sans" w:ascii="Open Sans" w:hAnsi="Open Sans"/>
+                <w:color w:val="000000"/>
+                <w:spacing w:val="0"/>
+                <w:sz w:val="20"/>
+                <w:shd w:fill="auto" w:val="clear"/>
+              </w:rPr>
+              <w:t xml:space="preserve">004</w:t>
+            </w:r>
+          </w:p>
+        </w:tc>
+        <w:tc>
+          <w:tcPr>
+            <w:tcW w:w="1034" w:type="dxa"/>
+            <w:tcBorders>
+              <w:top w:val="single" w:sz="8" w:space="0" w:color="FFFFFF"/>
+              <w:left w:val="single" w:sz="8" w:space="0" w:color="FFFFFF"/>
+              <w:bottom w:val="single" w:sz="8" w:space="0" w:color="FFFFFF"/>
+              <w:right w:val="single" w:sz="8" w:space="0" w:color="FFFFFF"/>
+            </w:tcBorders>
+            <w:shd w:color="000000" w:fill="FFFFFF" w:val="clear"/>
+            <w:tcMar>
+              <w:left w:w="56" w:type="dxa"/>
+              <w:right w:w="56" w:type="dxa"/>
+            </w:tcMar>
+          </w:tcPr>
+          <w:p>
+            <w:pPr>
+              <w:pStyle w:val="Normal"/>
+              <w:bidi w:val="0"/>
+              <w:spacing w:lineRule="auto" w:line="278" w:before="0" w:after="0"/>
+              <w:ind w:hanging="0" w:left="0" w:right="314"/>
+              <w:jc w:val="left"/>
+              <w:rPr>
+                <w:color w:val="auto"/>
+                <w:spacing w:val="0"/>
+              </w:rPr>
+            </w:pPr>
+            <w:r>
+              <w:rPr>
+                <w:rFonts w:eastAsia="Open Sans" w:cs="Open Sans" w:ascii="Open Sans" w:hAnsi="Open Sans"/>
+                <w:color w:val="000000"/>
+                <w:spacing w:val="0"/>
+                <w:sz w:val="20"/>
+                <w:shd w:fill="auto" w:val="clear"/>
+              </w:rPr>
+              <w:t xml:space="preserve">1 Stk</w:t>
+            </w:r>
+          </w:p>
+        </w:tc>
+        <w:tc>
+          <w:tcPr>
+            <w:tcW w:w="4108" w:type="dxa"/>
+            <w:tcBorders>
+              <w:top w:val="single" w:sz="8" w:space="0" w:color="FFFFFF"/>
+              <w:left w:val="single" w:sz="8" w:space="0" w:color="FFFFFF"/>
+              <w:bottom w:val="single" w:sz="8" w:space="0" w:color="FFFFFF"/>
+              <w:right w:val="single" w:sz="8" w:space="0" w:color="FFFFFF"/>
+            </w:tcBorders>
+            <w:shd w:color="000000" w:fill="FFFFFF" w:val="clear"/>
+            <w:tcMar>
+              <w:left w:w="56" w:type="dxa"/>
+              <w:right w:w="56" w:type="dxa"/>
+            </w:tcMar>
+          </w:tcPr>
+          <w:p>
+            <w:pPr>
+              <w:pStyle w:val="Normal"/>
+              <w:bidi w:val="0"/>
+              <w:spacing w:lineRule="auto" w:line="278" w:before="0" w:after="0"/>
+              <w:ind w:hanging="0" w:left="0" w:right="314"/>
+              <w:jc w:val="left"/>
+              <w:rPr>
+                <w:rFonts w:ascii="Open Sans" w:hAnsi="Open Sans" w:eastAsia="Open Sans" w:cs="Open Sans"/>
+                <w:b/>
+                <w:color w:val="auto"/>
+                <w:spacing w:val="0"/>
+                <w:sz w:val="20"/>
+                <w:shd w:fill="auto" w:val="clear"/>
+              </w:rPr>
+            </w:pPr>
+            <w:r>
+              <w:rPr>
+                <w:rFonts w:eastAsia="Open Sans" w:cs="Open Sans" w:ascii="Open Sans" w:hAnsi="Open Sans"/>
+                <w:b/>
+                <w:color w:val="000000"/>
+                <w:spacing w:val="0"/>
+                <w:sz w:val="20"/>
+                <w:shd w:fill="auto" w:val="clear"/>
+              </w:rPr>
+              <w:t xml:space="preserve">Bestandkundenbonus:</w:t>
+            </w:r>
+          </w:p>
+          <w:p>
+            <w:pPr>
+              <w:pStyle w:val="Normal"/>
+              <w:bidi w:val="0"/>
+              <w:spacing w:lineRule="auto" w:line="278" w:before="0" w:after="0"/>
+              <w:ind w:hanging="0" w:left="0" w:right="314"/>
+              <w:jc w:val="left"/>
+              <w:rPr>
+                <w:color w:val="auto"/>
+                <w:spacing w:val="0"/>
+              </w:rPr>
+            </w:pPr>
+            <w:r>
+              <w:rPr>
+                <w:rFonts w:eastAsia="Open Sans" w:cs="Open Sans" w:ascii="Open Sans" w:hAnsi="Open Sans"/>
+                <w:color w:val="000000"/>
+                <w:spacing w:val="0"/>
+                <w:sz w:val="20"/>
+                <w:shd w:fill="auto" w:val="clear"/>
+              </w:rPr>
+              <w:t xml:space="preserve">-- Rabatt von 300 € ab einem Gesamtwert von 3.000</w:t>
+            </w:r>
+          </w:p>
+        </w:tc>
+        <w:tc>
+          <w:tcPr>
+            <w:tcW w:w="2268" w:type="dxa"/>
+            <w:tcBorders>
+              <w:top w:val="single" w:sz="8" w:space="0" w:color="FFFFFF"/>
+              <w:left w:val="single" w:sz="8" w:space="0" w:color="FFFFFF"/>
+              <w:bottom w:val="single" w:sz="8" w:space="0" w:color="FFFFFF"/>
+              <w:right w:val="single" w:sz="8" w:space="0" w:color="FFFFFF"/>
+            </w:tcBorders>
+            <w:shd w:color="000000" w:fill="FFFFFF" w:val="clear"/>
+            <w:tcMar>
+              <w:left w:w="56" w:type="dxa"/>
+              <w:right w:w="56" w:type="dxa"/>
+            </w:tcMar>
+          </w:tcPr>
+          <w:p>
+            <w:pPr>
+              <w:pStyle w:val="Normal"/>
+              <w:bidi w:val="0"/>
+              <w:spacing w:lineRule="auto" w:line="278" w:before="0" w:after="0"/>
+              <w:ind w:hanging="0" w:left="0" w:right="314"/>
+              <w:jc w:val="left"/>
+              <w:rPr>
+                <w:color w:val="auto"/>
+                <w:spacing w:val="0"/>
+              </w:rPr>
+            </w:pPr>
+            <w:r>
+              <w:rPr>
+                <w:rFonts w:eastAsia="Open Sans" w:cs="Open Sans" w:ascii="Open Sans" w:hAnsi="Open Sans"/>
+                <w:color w:val="000000"/>
+                <w:spacing w:val="0"/>
+                <w:sz w:val="20"/>
+                <w:shd w:fill="auto" w:val="clear"/>
+              </w:rPr>
+              <w:t xml:space="preserve">-252,10 €</w:t>
+            </w:r>
+          </w:p>
+        </w:tc>
+        <w:tc>
+          <w:tcPr>
+            <w:tcW w:w="1710" w:type="dxa"/>
+            <w:tcBorders>
+              <w:top w:val="single" w:sz="8" w:space="0" w:color="FFFFFF"/>
+              <w:left w:val="single" w:sz="8" w:space="0" w:color="FFFFFF"/>
+              <w:bottom w:val="single" w:sz="8" w:space="0" w:color="FFFFFF"/>
+              <w:right w:val="single" w:sz="8" w:space="0" w:color="FFFFFF"/>
+            </w:tcBorders>
+            <w:shd w:color="000000" w:fill="FFFFFF" w:val="clear"/>
+            <w:tcMar>
+              <w:left w:w="56" w:type="dxa"/>
+              <w:right w:w="56" w:type="dxa"/>
+            </w:tcMar>
+          </w:tcPr>
+          <w:p>
+            <w:pPr>
+              <w:pStyle w:val="Normal"/>
+              <w:bidi w:val="0"/>
+              <w:spacing w:lineRule="auto" w:line="278" w:before="0" w:after="0"/>
+              <w:ind w:hanging="0" w:left="0" w:right="314"/>
+              <w:jc w:val="left"/>
+              <w:rPr>
+                <w:color w:val="auto"/>
+                <w:spacing w:val="0"/>
+              </w:rPr>
+            </w:pPr>
+            <w:r>
+              <w:rPr>
+                <w:rFonts w:eastAsia="Open Sans" w:cs="Open Sans" w:ascii="Open Sans" w:hAnsi="Open Sans"/>
+                <w:color w:val="000000"/>
+                <w:spacing w:val="0"/>
+                <w:sz w:val="20"/>
+                <w:shd w:fill="auto" w:val="clear"/>
+              </w:rPr>
+              <w:t xml:space="preserve">-252,10 €</w:t>
             </w:r>
           </w:p>
         </w:tc>
@@ -3179,7 +3427,7 @@
                 <w:sz w:val="22"/>
                 <w:shd w:fill="auto" w:val="clear"/>
               </w:rPr>
-              <w:t xml:space="preserve">6.345,62 €</w:t>
+              <w:t xml:space="preserve">4.647,14 €</w:t>
             </w:r>
             <w:r>
               <w:rPr>
@@ -3354,7 +3602,7 @@
                 <w:sz w:val="22"/>
                 <w:shd w:fill="auto" w:val="clear"/>
               </w:rPr>
-              <w:t xml:space="preserve">1.205,67 €</w:t>
+              <w:t xml:space="preserve">807,12 €</w:t>
             </w:r>
             <w:r>
               <w:rPr>
@@ -3529,7 +3777,7 @@
                 <w:sz w:val="22"/>
                 <w:shd w:fill="auto" w:val="clear"/>
               </w:rPr>
-              <w:t xml:space="preserve">7.551,29 €</w:t>
+              <w:t xml:space="preserve">5.055,10 €</w:t>
             </w:r>
             <w:r>
               <w:rPr>
@@ -3698,7 +3946,7 @@
           <w:sz w:val="22"/>
           <w:shd w:fill="auto" w:val="clear"/>
         </w:rPr>
-        <w:t xml:space="preserve">4.371,29 €</w:t>
+        <w:t xml:space="preserve">1.875,10 €</w:t>
       </w:r>
       <w:r>
         <w:rPr>

</xml_diff>

<commit_message>
bonus haltegriff checkbox added only for the CLPESG40 + update the kosten_details and pdf file
</commit_message>
<xml_diff>
--- a/out-Angebot.docx
+++ b/out-Angebot.docx
@@ -104,7 +104,7 @@
           <w:sz w:val="22"/>
           <w:shd w:fill="auto" w:val="clear"/>
         </w:rPr>
-        <w:t xml:space="preserve">Tara Lucas</w:t>
+        <w:t xml:space="preserve">Hasad Decker</w:t>
       </w:r>
     </w:p>
     <w:p>
@@ -130,7 +130,7 @@
           <w:sz w:val="22"/>
           <w:shd w:fill="auto" w:val="clear"/>
         </w:rPr>
-        <w:t xml:space="preserve">Animi in sint amet,</w:t>
+        <w:t xml:space="preserve">Omnis consectetur f,</w:t>
       </w:r>
     </w:p>
     <w:p>
@@ -156,7 +156,7 @@
           <w:sz w:val="22"/>
           <w:shd w:fill="auto" w:val="clear"/>
         </w:rPr>
-        <w:t xml:space="preserve">Ut cupidatat ipsam o Ipsam accusantium ni</w:t>
+        <w:t xml:space="preserve">Quis deserunt obcaec Itaque cum explicabo</w:t>
       </w:r>
     </w:p>
     <w:tbl>
@@ -332,7 +332,7 @@
                 <w:sz w:val="22"/>
                 <w:shd w:fill="auto" w:val="clear"/>
               </w:rPr>
-              <w:t xml:space="preserve">Brock Dickson</w:t>
+              <w:t xml:space="preserve">Cullen Rios</w:t>
             </w:r>
           </w:p>
         </w:tc>
@@ -370,7 +370,7 @@
                 <w:sz w:val="22"/>
                 <w:shd w:fill="auto" w:val="clear"/>
               </w:rPr>
-              <w:t xml:space="preserve">AN20251002114203</w:t>
+              <w:t xml:space="preserve">AN20251002142723</w:t>
             </w:r>
             <w:r>
               <w:rPr>
@@ -416,7 +416,7 @@
                 <w:sz w:val="22"/>
                 <w:shd w:fill="auto" w:val="clear"/>
               </w:rPr>
-              <w:t xml:space="preserve">2021-03-23</w:t>
+              <w:t xml:space="preserve">2001-07-22</w:t>
             </w:r>
             <w:r>
               <w:rPr>
@@ -456,7 +456,7 @@
                 <w:sz w:val="22"/>
                 <w:shd w:fill="auto" w:val="clear"/>
               </w:rPr>
-              <w:t xml:space="preserve">Brennan Bernard</w:t>
+              <w:t xml:space="preserve">Eleanor Hodges</w:t>
             </w:r>
             <w:r>
               <w:rPr>
@@ -676,7 +676,7 @@
           <w:sz w:val="24"/>
           <w:shd w:fill="auto" w:val="clear"/>
         </w:rPr>
-        <w:t xml:space="preserve">Ihr Angebot AN20251002114203</w:t>
+        <w:t xml:space="preserve">Ihr Angebot AN20251002142723</w:t>
       </w:r>
     </w:p>
     <w:p>
@@ -712,7 +712,7 @@
           <w:sz w:val="22"/>
           <w:shd w:fill="auto" w:val="clear"/>
         </w:rPr>
-        <w:t xml:space="preserve">Sehr geehrte Frau Lucas,</w:t>
+        <w:t xml:space="preserve">Sehr geehrte Frau Decker,</w:t>
         <w:br/>
       </w:r>
     </w:p>
@@ -1133,7 +1133,7 @@
                 <w:sz w:val="20"/>
                 <w:shd w:fill="auto" w:val="clear"/>
               </w:rPr>
-              <w:t xml:space="preserve">2.555,80 €</w:t>
+              <w:t xml:space="preserve">2.497,00 €</w:t>
             </w:r>
           </w:p>
         </w:tc>
@@ -1172,7 +1172,7 @@
                 <w:sz w:val="20"/>
                 <w:shd w:fill="auto" w:val="clear"/>
               </w:rPr>
-              <w:t xml:space="preserve">2.555,80 €</w:t>
+              <w:t xml:space="preserve">2.497,00 €</w:t>
             </w:r>
           </w:p>
         </w:tc>
@@ -1588,7 +1588,7 @@
                 <w:sz w:val="18"/>
                 <w:shd w:fill="auto" w:val="clear"/>
               </w:rPr>
-              <w:t xml:space="preserve">- 144 km Kilometerpauschale </w:t>
+              <w:t xml:space="preserve">- 60 km Kilometerpauschale </w:t>
             </w:r>
           </w:p>
           <w:p>
@@ -1614,7 +1614,7 @@
                 <w:sz w:val="18"/>
                 <w:shd w:fill="auto" w:val="clear"/>
               </w:rPr>
-              <w:t xml:space="preserve">- Anbringen zusätzlicher Haltegriffe</w:t>
+              <w:t xml:space="preserve">- Verkleidung Deckenhoch im Dusch/ Wannenbereich</w:t>
             </w:r>
           </w:p>
         </w:tc>
@@ -2087,7 +2087,7 @@
                 <w:sz w:val="20"/>
                 <w:shd w:fill="auto" w:val="clear"/>
               </w:rPr>
-              <w:t xml:space="preserve">415,47 €</w:t>
+              <w:t xml:space="preserve">1.382,21 €</w:t>
             </w:r>
           </w:p>
         </w:tc>
@@ -2127,7 +2127,7 @@
                 <w:sz w:val="20"/>
                 <w:shd w:fill="auto" w:val="clear"/>
               </w:rPr>
-              <w:t xml:space="preserve">415,47 €</w:t>
+              <w:t xml:space="preserve">1.382,21 €</w:t>
             </w:r>
           </w:p>
         </w:tc>
@@ -2569,6 +2569,58 @@
                 <w:sz w:val="20"/>
                 <w:shd w:fill="auto" w:val="clear"/>
               </w:rPr>
+              <w:t xml:space="preserve">- 1 Stk Wandverkleidung 3.0 Alu 997×2550 mm — Farbe: Weiß</w:t>
+            </w:r>
+          </w:p>
+          <w:p>
+            <w:pPr>
+              <w:pStyle w:val="Normal"/>
+              <w:bidi w:val="0"/>
+              <w:spacing w:lineRule="auto" w:line="278" w:before="0" w:after="0"/>
+              <w:ind w:hanging="0" w:left="0" w:right="314"/>
+              <w:jc w:val="left"/>
+              <w:rPr>
+                <w:rFonts w:ascii="Open Sans" w:hAnsi="Open Sans" w:eastAsia="Open Sans" w:cs="Open Sans"/>
+                <w:color w:val="auto"/>
+                <w:spacing w:val="0"/>
+                <w:sz w:val="20"/>
+                <w:shd w:fill="auto" w:val="clear"/>
+              </w:rPr>
+            </w:pPr>
+            <w:r>
+              <w:rPr>
+                <w:rFonts w:eastAsia="Open Sans" w:cs="Open Sans" w:ascii="Open Sans" w:hAnsi="Open Sans"/>
+                <w:color w:val="000000"/>
+                <w:spacing w:val="0"/>
+                <w:sz w:val="20"/>
+                <w:shd w:fill="auto" w:val="clear"/>
+              </w:rPr>
+              <w:t xml:space="preserve">- 1 Stk Wandverkleidung 3.0 Alu 1497×2550 mm — Farbe: Weiß</w:t>
+            </w:r>
+          </w:p>
+          <w:p>
+            <w:pPr>
+              <w:pStyle w:val="Normal"/>
+              <w:bidi w:val="0"/>
+              <w:spacing w:lineRule="auto" w:line="278" w:before="0" w:after="0"/>
+              <w:ind w:hanging="0" w:left="0" w:right="314"/>
+              <w:jc w:val="left"/>
+              <w:rPr>
+                <w:rFonts w:ascii="Open Sans" w:hAnsi="Open Sans" w:eastAsia="Open Sans" w:cs="Open Sans"/>
+                <w:color w:val="auto"/>
+                <w:spacing w:val="0"/>
+                <w:sz w:val="20"/>
+                <w:shd w:fill="auto" w:val="clear"/>
+              </w:rPr>
+            </w:pPr>
+            <w:r>
+              <w:rPr>
+                <w:rFonts w:eastAsia="Open Sans" w:cs="Open Sans" w:ascii="Open Sans" w:hAnsi="Open Sans"/>
+                <w:color w:val="000000"/>
+                <w:spacing w:val="0"/>
+                <w:sz w:val="20"/>
+                <w:shd w:fill="auto" w:val="clear"/>
+              </w:rPr>
               <w:t xml:space="preserve">- 1 Stk TRINNITY Wandabdichtung BASIS-Set 5 qm DW bis 100 x 100 / BW bis 180 x 80 cm</w:t>
             </w:r>
           </w:p>
@@ -2595,7 +2647,33 @@
                 <w:sz w:val="20"/>
                 <w:shd w:fill="auto" w:val="clear"/>
               </w:rPr>
-              <w:t xml:space="preserve">- 1 Stk Haltegriff clivia plus 32/400mm m. Ros. Edelstahl glatt poliert, VIGOUR</w:t>
+              <w:t xml:space="preserve">- 7 Stk Wandverkleidungsklebstoff 3.0/4.0</w:t>
+            </w:r>
+          </w:p>
+          <w:p>
+            <w:pPr>
+              <w:pStyle w:val="Normal"/>
+              <w:bidi w:val="0"/>
+              <w:spacing w:lineRule="auto" w:line="278" w:before="0" w:after="0"/>
+              <w:ind w:hanging="0" w:left="0" w:right="314"/>
+              <w:jc w:val="left"/>
+              <w:rPr>
+                <w:rFonts w:ascii="Open Sans" w:hAnsi="Open Sans" w:eastAsia="Open Sans" w:cs="Open Sans"/>
+                <w:color w:val="auto"/>
+                <w:spacing w:val="0"/>
+                <w:sz w:val="20"/>
+                <w:shd w:fill="auto" w:val="clear"/>
+              </w:rPr>
+            </w:pPr>
+            <w:r>
+              <w:rPr>
+                <w:rFonts w:eastAsia="Open Sans" w:cs="Open Sans" w:ascii="Open Sans" w:hAnsi="Open Sans"/>
+                <w:color w:val="000000"/>
+                <w:spacing w:val="0"/>
+                <w:sz w:val="20"/>
+                <w:shd w:fill="auto" w:val="clear"/>
+              </w:rPr>
+              <w:t xml:space="preserve">- 1 Stk Verbindungsprofil(e) (Plattenanzahl - 1)</w:t>
             </w:r>
           </w:p>
         </w:tc>
@@ -2679,6 +2757,234 @@
                 <w:sz w:val="22"/>
                 <w:shd w:fill="auto" w:val="clear"/>
               </w:rPr>
+            </w:r>
+          </w:p>
+        </w:tc>
+      </w:tr>
+      <w:tr>
+        <w:trPr>
+          <w:trHeight w:val="1" w:hRule="atLeast"/>
+        </w:trPr>
+        <w:tc>
+          <w:tcPr>
+            <w:tcW w:w="660" w:type="dxa"/>
+            <w:tcBorders>
+              <w:top w:val="single" w:sz="8" w:space="0" w:color="FFFFFF"/>
+              <w:left w:val="single" w:sz="8" w:space="0" w:color="FFFFFF"/>
+              <w:bottom w:val="single" w:sz="8" w:space="0" w:color="FFFFFF"/>
+              <w:right w:val="single" w:sz="8" w:space="0" w:color="FFFFFF"/>
+            </w:tcBorders>
+            <w:shd w:color="000000" w:fill="FFFFFF" w:val="clear"/>
+            <w:tcMar>
+              <w:left w:w="56" w:type="dxa"/>
+              <w:right w:w="56" w:type="dxa"/>
+            </w:tcMar>
+          </w:tcPr>
+          <w:p>
+            <w:pPr>
+              <w:pStyle w:val="Normal"/>
+              <w:bidi w:val="0"/>
+              <w:spacing w:lineRule="auto" w:line="278" w:before="0" w:after="0"/>
+              <w:ind w:hanging="0" w:left="0" w:right="-26"/>
+              <w:jc w:val="left"/>
+              <w:rPr>
+                <w:color w:val="auto"/>
+                <w:spacing w:val="0"/>
+              </w:rPr>
+            </w:pPr>
+            <w:r>
+              <w:rPr>
+                <w:rFonts w:eastAsia="Open Sans" w:cs="Open Sans" w:ascii="Open Sans" w:hAnsi="Open Sans"/>
+                <w:color w:val="000000"/>
+                <w:spacing w:val="0"/>
+                <w:sz w:val="20"/>
+                <w:shd w:fill="auto" w:val="clear"/>
+              </w:rPr>
+              <w:t xml:space="preserve">003</w:t>
+            </w:r>
+          </w:p>
+        </w:tc>
+        <w:tc>
+          <w:tcPr>
+            <w:tcW w:w="1034" w:type="dxa"/>
+            <w:tcBorders>
+              <w:top w:val="single" w:sz="8" w:space="0" w:color="FFFFFF"/>
+              <w:left w:val="single" w:sz="8" w:space="0" w:color="FFFFFF"/>
+              <w:bottom w:val="single" w:sz="8" w:space="0" w:color="FFFFFF"/>
+              <w:right w:val="single" w:sz="8" w:space="0" w:color="FFFFFF"/>
+            </w:tcBorders>
+            <w:shd w:color="000000" w:fill="FFFFFF" w:val="clear"/>
+            <w:tcMar>
+              <w:left w:w="56" w:type="dxa"/>
+              <w:right w:w="56" w:type="dxa"/>
+            </w:tcMar>
+          </w:tcPr>
+          <w:p>
+            <w:pPr>
+              <w:pStyle w:val="Normal"/>
+              <w:bidi w:val="0"/>
+              <w:spacing w:lineRule="auto" w:line="278" w:before="0" w:after="0"/>
+              <w:ind w:hanging="0" w:left="0" w:right="314"/>
+              <w:jc w:val="left"/>
+              <w:rPr>
+                <w:color w:val="auto"/>
+                <w:spacing w:val="0"/>
+              </w:rPr>
+            </w:pPr>
+            <w:r>
+              <w:rPr>
+                <w:rFonts w:eastAsia="Open Sans" w:cs="Open Sans" w:ascii="Open Sans" w:hAnsi="Open Sans"/>
+                <w:color w:val="000000"/>
+                <w:spacing w:val="0"/>
+                <w:sz w:val="20"/>
+                <w:shd w:fill="auto" w:val="clear"/>
+              </w:rPr>
+              <w:t xml:space="preserve">1 Stk</w:t>
+            </w:r>
+          </w:p>
+        </w:tc>
+        <w:tc>
+          <w:tcPr>
+            <w:tcW w:w="4108" w:type="dxa"/>
+            <w:tcBorders>
+              <w:top w:val="single" w:sz="8" w:space="0" w:color="FFFFFF"/>
+              <w:left w:val="single" w:sz="8" w:space="0" w:color="FFFFFF"/>
+              <w:bottom w:val="single" w:sz="8" w:space="0" w:color="FFFFFF"/>
+              <w:right w:val="single" w:sz="8" w:space="0" w:color="FFFFFF"/>
+            </w:tcBorders>
+            <w:shd w:color="000000" w:fill="FFFFFF" w:val="clear"/>
+            <w:tcMar>
+              <w:left w:w="56" w:type="dxa"/>
+              <w:right w:w="56" w:type="dxa"/>
+            </w:tcMar>
+          </w:tcPr>
+          <w:p>
+            <w:pPr>
+              <w:pStyle w:val="Normal"/>
+              <w:bidi w:val="0"/>
+              <w:spacing w:lineRule="auto" w:line="278" w:before="0" w:after="0"/>
+              <w:ind w:hanging="0" w:left="0" w:right="314"/>
+              <w:jc w:val="left"/>
+              <w:rPr>
+                <w:rFonts w:ascii="Open Sans" w:hAnsi="Open Sans" w:eastAsia="Open Sans" w:cs="Open Sans"/>
+                <w:b/>
+                <w:color w:val="auto"/>
+                <w:spacing w:val="0"/>
+                <w:sz w:val="20"/>
+                <w:shd w:fill="auto" w:val="clear"/>
+              </w:rPr>
+            </w:pPr>
+            <w:r>
+              <w:rPr>
+                <w:rFonts w:eastAsia="Open Sans" w:cs="Open Sans" w:ascii="Open Sans" w:hAnsi="Open Sans"/>
+                <w:b/>
+                <w:color w:val="000000"/>
+                <w:spacing w:val="0"/>
+                <w:sz w:val="20"/>
+                <w:shd w:fill="auto" w:val="clear"/>
+              </w:rPr>
+              <w:t xml:space="preserve">Aktion: Haltegriff</w:t>
+            </w:r>
+          </w:p>
+          <w:p>
+            <w:pPr>
+              <w:pStyle w:val="Normal"/>
+              <w:bidi w:val="0"/>
+              <w:spacing w:lineRule="auto" w:line="278" w:before="0" w:after="0"/>
+              <w:ind w:hanging="0" w:left="0" w:right="314"/>
+              <w:jc w:val="left"/>
+              <w:rPr>
+                <w:color w:val="auto"/>
+                <w:spacing w:val="0"/>
+              </w:rPr>
+            </w:pPr>
+            <w:r>
+              <w:rPr>
+                <w:rFonts w:eastAsia="Open Sans" w:cs="Open Sans" w:ascii="Open Sans" w:hAnsi="Open Sans"/>
+                <w:color w:val="000000"/>
+                <w:spacing w:val="0"/>
+                <w:sz w:val="20"/>
+                <w:shd w:fill="auto" w:val="clear"/>
+              </w:rPr>
+              <w:t xml:space="preserve">1 Haltegriff gratis im Wert von 175 € inkl. Lieferung und Montage</w:t>
+            </w:r>
+          </w:p>
+        </w:tc>
+        <w:tc>
+          <w:tcPr>
+            <w:tcW w:w="2268" w:type="dxa"/>
+            <w:tcBorders>
+              <w:top w:val="single" w:sz="8" w:space="0" w:color="FFFFFF"/>
+              <w:left w:val="single" w:sz="8" w:space="0" w:color="FFFFFF"/>
+              <w:bottom w:val="single" w:sz="8" w:space="0" w:color="FFFFFF"/>
+              <w:right w:val="single" w:sz="8" w:space="0" w:color="FFFFFF"/>
+            </w:tcBorders>
+            <w:shd w:color="000000" w:fill="FFFFFF" w:val="clear"/>
+            <w:tcMar>
+              <w:left w:w="56" w:type="dxa"/>
+              <w:right w:w="56" w:type="dxa"/>
+            </w:tcMar>
+          </w:tcPr>
+          <w:p>
+            <w:pPr>
+              <w:pStyle w:val="Normal"/>
+              <w:bidi w:val="0"/>
+              <w:spacing w:lineRule="auto" w:line="278" w:before="0" w:after="0"/>
+              <w:ind w:hanging="0" w:left="0" w:right="314"/>
+              <w:jc w:val="left"/>
+              <w:rPr>
+                <w:color w:val="auto"/>
+                <w:spacing w:val="0"/>
+              </w:rPr>
+            </w:pPr>
+            <w:r>
+              <w:rPr>
+                <w:rFonts w:eastAsia="Open Sans" w:cs="Open Sans" w:ascii="Open Sans" w:hAnsi="Open Sans"/>
+                <w:color w:val="000000"/>
+                <w:spacing w:val="0"/>
+                <w:sz w:val="20"/>
+                <w:shd w:fill="auto" w:val="clear"/>
+              </w:rPr>
+              <w:t xml:space="preserve">0,00 €</w:t>
+            </w:r>
+          </w:p>
+        </w:tc>
+        <w:tc>
+          <w:tcPr>
+            <w:tcW w:w="1710" w:type="dxa"/>
+            <w:tcBorders>
+              <w:top w:val="single" w:sz="8" w:space="0" w:color="FFFFFF"/>
+              <w:left w:val="single" w:sz="8" w:space="0" w:color="FFFFFF"/>
+              <w:bottom w:val="single" w:sz="8" w:space="0" w:color="FFFFFF"/>
+              <w:right w:val="single" w:sz="8" w:space="0" w:color="FFFFFF"/>
+            </w:tcBorders>
+            <w:shd w:color="000000" w:fill="FFFFFF" w:val="clear"/>
+            <w:tcMar>
+              <w:left w:w="56" w:type="dxa"/>
+              <w:right w:w="56" w:type="dxa"/>
+            </w:tcMar>
+          </w:tcPr>
+          <w:p>
+            <w:pPr>
+              <w:pStyle w:val="Normal"/>
+              <w:bidi w:val="0"/>
+              <w:spacing w:lineRule="auto" w:line="278" w:before="0" w:after="0"/>
+              <w:ind w:hanging="0" w:left="0" w:right="314"/>
+              <w:jc w:val="left"/>
+              <w:rPr>
+                <w:color w:val="auto"/>
+                <w:spacing w:val="0"/>
+              </w:rPr>
+            </w:pPr>
+            <w:r>
+              <w:rPr>
+                <w:rFonts w:eastAsia="Open Sans" w:cs="Open Sans" w:ascii="Open Sans" w:hAnsi="Open Sans"/>
+                <w:color w:val="000000"/>
+                <w:spacing w:val="0"/>
+                <w:sz w:val="20"/>
+                <w:shd w:fill="auto" w:val="clear"/>
+              </w:rPr>
+              <w:t xml:space="preserve">0,00 €</w:t>
             </w:r>
           </w:p>
         </w:tc>
@@ -2893,7 +3199,7 @@
                 <w:sz w:val="22"/>
                 <w:shd w:fill="auto" w:val="clear"/>
               </w:rPr>
-              <w:t xml:space="preserve">3.243,78 €</w:t>
+              <w:t xml:space="preserve">4.635,09 €</w:t>
             </w:r>
             <w:r>
               <w:rPr>
@@ -3068,7 +3374,7 @@
                 <w:sz w:val="22"/>
                 <w:shd w:fill="auto" w:val="clear"/>
               </w:rPr>
-              <w:t xml:space="preserve">615,97 €</w:t>
+              <w:t xml:space="preserve">852,73 €</w:t>
             </w:r>
             <w:r>
               <w:rPr>
@@ -3243,7 +3549,7 @@
                 <w:sz w:val="22"/>
                 <w:shd w:fill="auto" w:val="clear"/>
               </w:rPr>
-              <w:t xml:space="preserve">3.857,92 €</w:t>
+              <w:t xml:space="preserve">5.340,76 €</w:t>
             </w:r>
             <w:r>
               <w:rPr>

</xml_diff>

<commit_message>
update on haltigriffe optional displayed in pdf
</commit_message>
<xml_diff>
--- a/out-Angebot.docx
+++ b/out-Angebot.docx
@@ -104,7 +104,7 @@
           <w:sz w:val="22"/>
           <w:shd w:fill="auto" w:val="clear"/>
         </w:rPr>
-        <w:t xml:space="preserve">Hasad Decker</w:t>
+        <w:t xml:space="preserve">Tasha Richmond</w:t>
       </w:r>
     </w:p>
     <w:p>
@@ -130,7 +130,7 @@
           <w:sz w:val="22"/>
           <w:shd w:fill="auto" w:val="clear"/>
         </w:rPr>
-        <w:t xml:space="preserve">Omnis consectetur f,</w:t>
+        <w:t xml:space="preserve">Et natus sed ullamco,</w:t>
       </w:r>
     </w:p>
     <w:p>
@@ -156,7 +156,7 @@
           <w:sz w:val="22"/>
           <w:shd w:fill="auto" w:val="clear"/>
         </w:rPr>
-        <w:t xml:space="preserve">Quis deserunt obcaec Itaque cum explicabo</w:t>
+        <w:t xml:space="preserve">Non suscipit aut pro Quis optio tenetur </w:t>
       </w:r>
     </w:p>
     <w:tbl>
@@ -332,7 +332,7 @@
                 <w:sz w:val="22"/>
                 <w:shd w:fill="auto" w:val="clear"/>
               </w:rPr>
-              <w:t xml:space="preserve">Cullen Rios</w:t>
+              <w:t xml:space="preserve">Sonya Hogan</w:t>
             </w:r>
           </w:p>
         </w:tc>
@@ -370,7 +370,7 @@
                 <w:sz w:val="22"/>
                 <w:shd w:fill="auto" w:val="clear"/>
               </w:rPr>
-              <w:t xml:space="preserve">AN20251002142723</w:t>
+              <w:t xml:space="preserve">AN20251002154941</w:t>
             </w:r>
             <w:r>
               <w:rPr>
@@ -416,7 +416,7 @@
                 <w:sz w:val="22"/>
                 <w:shd w:fill="auto" w:val="clear"/>
               </w:rPr>
-              <w:t xml:space="preserve">2001-07-22</w:t>
+              <w:t xml:space="preserve">1990-04-20</w:t>
             </w:r>
             <w:r>
               <w:rPr>
@@ -456,7 +456,7 @@
                 <w:sz w:val="22"/>
                 <w:shd w:fill="auto" w:val="clear"/>
               </w:rPr>
-              <w:t xml:space="preserve">Eleanor Hodges</w:t>
+              <w:t xml:space="preserve">Zeph Kerr</w:t>
             </w:r>
             <w:r>
               <w:rPr>
@@ -676,7 +676,7 @@
           <w:sz w:val="24"/>
           <w:shd w:fill="auto" w:val="clear"/>
         </w:rPr>
-        <w:t xml:space="preserve">Ihr Angebot AN20251002142723</w:t>
+        <w:t xml:space="preserve">Ihr Angebot AN20251002154941</w:t>
       </w:r>
     </w:p>
     <w:p>
@@ -712,7 +712,7 @@
           <w:sz w:val="22"/>
           <w:shd w:fill="auto" w:val="clear"/>
         </w:rPr>
-        <w:t xml:space="preserve">Sehr geehrte Frau Decker,</w:t>
+        <w:t xml:space="preserve">Sehr geehrte Frau Richmond,</w:t>
         <w:br/>
       </w:r>
     </w:p>
@@ -1133,7 +1133,7 @@
                 <w:sz w:val="20"/>
                 <w:shd w:fill="auto" w:val="clear"/>
               </w:rPr>
-              <w:t xml:space="preserve">2.497,00 €</w:t>
+              <w:t xml:space="preserve">2.547,40 €</w:t>
             </w:r>
           </w:p>
         </w:tc>
@@ -1172,7 +1172,7 @@
                 <w:sz w:val="20"/>
                 <w:shd w:fill="auto" w:val="clear"/>
               </w:rPr>
-              <w:t xml:space="preserve">2.497,00 €</w:t>
+              <w:t xml:space="preserve">2.547,40 €</w:t>
             </w:r>
           </w:p>
         </w:tc>
@@ -1588,7 +1588,7 @@
                 <w:sz w:val="18"/>
                 <w:shd w:fill="auto" w:val="clear"/>
               </w:rPr>
-              <w:t xml:space="preserve">- 60 km Kilometerpauschale </w:t>
+              <w:t xml:space="preserve">- 132 km Kilometerpauschale </w:t>
             </w:r>
           </w:p>
           <w:p>
@@ -1614,7 +1614,7 @@
                 <w:sz w:val="18"/>
                 <w:shd w:fill="auto" w:val="clear"/>
               </w:rPr>
-              <w:t xml:space="preserve">- Verkleidung Deckenhoch im Dusch/ Wannenbereich</w:t>
+              <w:t xml:space="preserve">- Anbringen zusätzlicher Haltegriffe</w:t>
             </w:r>
           </w:p>
         </w:tc>
@@ -2087,7 +2087,7 @@
                 <w:sz w:val="20"/>
                 <w:shd w:fill="auto" w:val="clear"/>
               </w:rPr>
-              <w:t xml:space="preserve">1.382,21 €</w:t>
+              <w:t xml:space="preserve">853,51 €</w:t>
             </w:r>
           </w:p>
         </w:tc>
@@ -2127,7 +2127,7 @@
                 <w:sz w:val="20"/>
                 <w:shd w:fill="auto" w:val="clear"/>
               </w:rPr>
-              <w:t xml:space="preserve">1.382,21 €</w:t>
+              <w:t xml:space="preserve">853,51 €</w:t>
             </w:r>
           </w:p>
         </w:tc>
@@ -2569,7 +2569,7 @@
                 <w:sz w:val="20"/>
                 <w:shd w:fill="auto" w:val="clear"/>
               </w:rPr>
-              <w:t xml:space="preserve">- 1 Stk Wandverkleidung 3.0 Alu 997×2550 mm — Farbe: Weiß</w:t>
+              <w:t xml:space="preserve">- 1 Stk TRINNITY Wandabdichtung BASIS-Set 5 qm DW bis 100 x 100 / BW bis 180 x 80 cm</w:t>
             </w:r>
           </w:p>
           <w:p>
@@ -2595,7 +2595,7 @@
                 <w:sz w:val="20"/>
                 <w:shd w:fill="auto" w:val="clear"/>
               </w:rPr>
-              <w:t xml:space="preserve">- 1 Stk Wandverkleidung 3.0 Alu 1497×2550 mm — Farbe: Weiß</w:t>
+              <w:t xml:space="preserve">- 2 Stk Haltegriff clivia plus 32/400mm m. Ros. Edelstahl glatt poliert, VIGOUR</w:t>
             </w:r>
           </w:p>
           <w:p>
@@ -2621,59 +2621,7 @@
                 <w:sz w:val="20"/>
                 <w:shd w:fill="auto" w:val="clear"/>
               </w:rPr>
-              <w:t xml:space="preserve">- 1 Stk TRINNITY Wandabdichtung BASIS-Set 5 qm DW bis 100 x 100 / BW bis 180 x 80 cm</w:t>
-            </w:r>
-          </w:p>
-          <w:p>
-            <w:pPr>
-              <w:pStyle w:val="Normal"/>
-              <w:bidi w:val="0"/>
-              <w:spacing w:lineRule="auto" w:line="278" w:before="0" w:after="0"/>
-              <w:ind w:hanging="0" w:left="0" w:right="314"/>
-              <w:jc w:val="left"/>
-              <w:rPr>
-                <w:rFonts w:ascii="Open Sans" w:hAnsi="Open Sans" w:eastAsia="Open Sans" w:cs="Open Sans"/>
-                <w:color w:val="auto"/>
-                <w:spacing w:val="0"/>
-                <w:sz w:val="20"/>
-                <w:shd w:fill="auto" w:val="clear"/>
-              </w:rPr>
-            </w:pPr>
-            <w:r>
-              <w:rPr>
-                <w:rFonts w:eastAsia="Open Sans" w:cs="Open Sans" w:ascii="Open Sans" w:hAnsi="Open Sans"/>
-                <w:color w:val="000000"/>
-                <w:spacing w:val="0"/>
-                <w:sz w:val="20"/>
-                <w:shd w:fill="auto" w:val="clear"/>
-              </w:rPr>
-              <w:t xml:space="preserve">- 7 Stk Wandverkleidungsklebstoff 3.0/4.0</w:t>
-            </w:r>
-          </w:p>
-          <w:p>
-            <w:pPr>
-              <w:pStyle w:val="Normal"/>
-              <w:bidi w:val="0"/>
-              <w:spacing w:lineRule="auto" w:line="278" w:before="0" w:after="0"/>
-              <w:ind w:hanging="0" w:left="0" w:right="314"/>
-              <w:jc w:val="left"/>
-              <w:rPr>
-                <w:rFonts w:ascii="Open Sans" w:hAnsi="Open Sans" w:eastAsia="Open Sans" w:cs="Open Sans"/>
-                <w:color w:val="auto"/>
-                <w:spacing w:val="0"/>
-                <w:sz w:val="20"/>
-                <w:shd w:fill="auto" w:val="clear"/>
-              </w:rPr>
-            </w:pPr>
-            <w:r>
-              <w:rPr>
-                <w:rFonts w:eastAsia="Open Sans" w:cs="Open Sans" w:ascii="Open Sans" w:hAnsi="Open Sans"/>
-                <w:color w:val="000000"/>
-                <w:spacing w:val="0"/>
-                <w:sz w:val="20"/>
-                <w:shd w:fill="auto" w:val="clear"/>
-              </w:rPr>
-              <w:t xml:space="preserve">- 1 Stk Verbindungsprofil(e) (Plattenanzahl - 1)</w:t>
+              <w:t xml:space="preserve">- 1 Stk Haltegriff clivia plus 32/600mm m. Ros. Edelstahl glatt poliert, VIGOUR</w:t>
             </w:r>
           </w:p>
         </w:tc>
@@ -3199,7 +3147,7 @@
                 <w:sz w:val="22"/>
                 <w:shd w:fill="auto" w:val="clear"/>
               </w:rPr>
-              <w:t xml:space="preserve">4.635,09 €</w:t>
+              <w:t xml:space="preserve">4.035,42 €</w:t>
             </w:r>
             <w:r>
               <w:rPr>
@@ -3374,7 +3322,7 @@
                 <w:sz w:val="22"/>
                 <w:shd w:fill="auto" w:val="clear"/>
               </w:rPr>
-              <w:t xml:space="preserve">852,73 €</w:t>
+              <w:t xml:space="preserve">738,79 €</w:t>
             </w:r>
             <w:r>
               <w:rPr>
@@ -3549,7 +3497,7 @@
                 <w:sz w:val="22"/>
                 <w:shd w:fill="auto" w:val="clear"/>
               </w:rPr>
-              <w:t xml:space="preserve">5.340,76 €</w:t>
+              <w:t xml:space="preserve">4.627,15 €</w:t>
             </w:r>
             <w:r>
               <w:rPr>

</xml_diff>

<commit_message>
haltegriff changement display in kosten-Details when only one cl40 choosed + bonus checked
</commit_message>
<xml_diff>
--- a/out-Angebot.docx
+++ b/out-Angebot.docx
@@ -104,7 +104,7 @@
           <w:sz w:val="22"/>
           <w:shd w:fill="auto" w:val="clear"/>
         </w:rPr>
-        <w:t xml:space="preserve">Tasha Richmond</w:t>
+        <w:t xml:space="preserve">Megan Hahn</w:t>
       </w:r>
     </w:p>
     <w:p>
@@ -130,7 +130,7 @@
           <w:sz w:val="22"/>
           <w:shd w:fill="auto" w:val="clear"/>
         </w:rPr>
-        <w:t xml:space="preserve">Et natus sed ullamco,</w:t>
+        <w:t xml:space="preserve">Sed quidem in quis v,</w:t>
       </w:r>
     </w:p>
     <w:p>
@@ -156,7 +156,7 @@
           <w:sz w:val="22"/>
           <w:shd w:fill="auto" w:val="clear"/>
         </w:rPr>
-        <w:t xml:space="preserve">Non suscipit aut pro Quis optio tenetur </w:t>
+        <w:t xml:space="preserve">Sunt obcaecati provi Et qui id ea est et </w:t>
       </w:r>
     </w:p>
     <w:tbl>
@@ -332,7 +332,7 @@
                 <w:sz w:val="22"/>
                 <w:shd w:fill="auto" w:val="clear"/>
               </w:rPr>
-              <w:t xml:space="preserve">Sonya Hogan</w:t>
+              <w:t xml:space="preserve">Rhea Cox</w:t>
             </w:r>
           </w:p>
         </w:tc>
@@ -370,7 +370,7 @@
                 <w:sz w:val="22"/>
                 <w:shd w:fill="auto" w:val="clear"/>
               </w:rPr>
-              <w:t xml:space="preserve">AN20251002154941</w:t>
+              <w:t xml:space="preserve">AN20251006084953</w:t>
             </w:r>
             <w:r>
               <w:rPr>
@@ -416,7 +416,7 @@
                 <w:sz w:val="22"/>
                 <w:shd w:fill="auto" w:val="clear"/>
               </w:rPr>
-              <w:t xml:space="preserve">1990-04-20</w:t>
+              <w:t xml:space="preserve">1989-05-11</w:t>
             </w:r>
             <w:r>
               <w:rPr>
@@ -456,7 +456,7 @@
                 <w:sz w:val="22"/>
                 <w:shd w:fill="auto" w:val="clear"/>
               </w:rPr>
-              <w:t xml:space="preserve">Zeph Kerr</w:t>
+              <w:t xml:space="preserve">Prescott Reeves</w:t>
             </w:r>
             <w:r>
               <w:rPr>
@@ -676,7 +676,7 @@
           <w:sz w:val="24"/>
           <w:shd w:fill="auto" w:val="clear"/>
         </w:rPr>
-        <w:t xml:space="preserve">Ihr Angebot AN20251002154941</w:t>
+        <w:t xml:space="preserve">Ihr Angebot AN20251006084953</w:t>
       </w:r>
     </w:p>
     <w:p>
@@ -712,7 +712,7 @@
           <w:sz w:val="22"/>
           <w:shd w:fill="auto" w:val="clear"/>
         </w:rPr>
-        <w:t xml:space="preserve">Sehr geehrte Frau Richmond,</w:t>
+        <w:t xml:space="preserve">Sehr geehrte Frau Hahn,</w:t>
         <w:br/>
       </w:r>
     </w:p>
@@ -1133,7 +1133,7 @@
                 <w:sz w:val="20"/>
                 <w:shd w:fill="auto" w:val="clear"/>
               </w:rPr>
-              <w:t xml:space="preserve">2.547,40 €</w:t>
+              <w:t xml:space="preserve">1.074,80 €</w:t>
             </w:r>
           </w:p>
         </w:tc>
@@ -1172,7 +1172,7 @@
                 <w:sz w:val="20"/>
                 <w:shd w:fill="auto" w:val="clear"/>
               </w:rPr>
-              <w:t xml:space="preserve">2.547,40 €</w:t>
+              <w:t xml:space="preserve">1.074,80 €</w:t>
             </w:r>
           </w:p>
         </w:tc>
@@ -1588,7 +1588,7 @@
                 <w:sz w:val="18"/>
                 <w:shd w:fill="auto" w:val="clear"/>
               </w:rPr>
-              <w:t xml:space="preserve">- 132 km Kilometerpauschale </w:t>
+              <w:t xml:space="preserve">- 14 km Kilometerpauschale </w:t>
             </w:r>
           </w:p>
           <w:p>
@@ -2087,7 +2087,7 @@
                 <w:sz w:val="20"/>
                 <w:shd w:fill="auto" w:val="clear"/>
               </w:rPr>
-              <w:t xml:space="preserve">853,51 €</w:t>
+              <w:t xml:space="preserve">510,79 €</w:t>
             </w:r>
           </w:p>
         </w:tc>
@@ -2127,7 +2127,7 @@
                 <w:sz w:val="20"/>
                 <w:shd w:fill="auto" w:val="clear"/>
               </w:rPr>
-              <w:t xml:space="preserve">853,51 €</w:t>
+              <w:t xml:space="preserve">510,79 €</w:t>
             </w:r>
           </w:p>
         </w:tc>
@@ -2595,7 +2595,7 @@
                 <w:sz w:val="20"/>
                 <w:shd w:fill="auto" w:val="clear"/>
               </w:rPr>
-              <w:t xml:space="preserve">- 2 Stk Haltegriff clivia plus 32/400mm m. Ros. Edelstahl glatt poliert, VIGOUR</w:t>
+              <w:t xml:space="preserve">- 1 Stk Haltegriff clivia plus 32/400mm m. Ros. Edelstahl glatt poliert, VIGOUR</w:t>
             </w:r>
           </w:p>
           <w:p>
@@ -3147,7 +3147,7 @@
                 <w:sz w:val="22"/>
                 <w:shd w:fill="auto" w:val="clear"/>
               </w:rPr>
-              <w:t xml:space="preserve">4.035,42 €</w:t>
+              <w:t xml:space="preserve">2.048,74 €</w:t>
             </w:r>
             <w:r>
               <w:rPr>
@@ -3322,7 +3322,7 @@
                 <w:sz w:val="22"/>
                 <w:shd w:fill="auto" w:val="clear"/>
               </w:rPr>
-              <w:t xml:space="preserve">738,79 €</w:t>
+              <w:t xml:space="preserve">361,32 €</w:t>
             </w:r>
             <w:r>
               <w:rPr>
@@ -3497,7 +3497,7 @@
                 <w:sz w:val="22"/>
                 <w:shd w:fill="auto" w:val="clear"/>
               </w:rPr>
-              <w:t xml:space="preserve">4.627,15 €</w:t>
+              <w:t xml:space="preserve">2.263,00 €</w:t>
             </w:r>
             <w:r>
               <w:rPr>

</xml_diff>

<commit_message>
adding arbeiten auszufuhrende in duschwanne menu
</commit_message>
<xml_diff>
--- a/out-Angebot.docx
+++ b/out-Angebot.docx
@@ -370,7 +370,7 @@
                 <w:sz w:val="22"/>
                 <w:shd w:fill="auto" w:val="clear"/>
               </w:rPr>
-              <w:t xml:space="preserve">AN20251006084953</w:t>
+              <w:t xml:space="preserve">AN20251006094001</w:t>
             </w:r>
             <w:r>
               <w:rPr>
@@ -676,7 +676,7 @@
           <w:sz w:val="24"/>
           <w:shd w:fill="auto" w:val="clear"/>
         </w:rPr>
-        <w:t xml:space="preserve">Ihr Angebot AN20251006084953</w:t>
+        <w:t xml:space="preserve">Ihr Angebot AN20251006094001</w:t>
       </w:r>
     </w:p>
     <w:p>
@@ -1617,6 +1617,110 @@
               <w:t xml:space="preserve">- Anbringen zusätzlicher Haltegriffe</w:t>
             </w:r>
           </w:p>
+          <w:p>
+            <w:pPr>
+              <w:pStyle w:val="Normal"/>
+              <w:bidi w:val="0"/>
+              <w:spacing w:lineRule="auto" w:line="278" w:before="0" w:after="0"/>
+              <w:ind w:hanging="0" w:left="0" w:right="314"/>
+              <w:jc w:val="left"/>
+              <w:rPr>
+                <w:rFonts w:ascii="Open Sans" w:hAnsi="Open Sans" w:eastAsia="Open Sans" w:cs="Open Sans"/>
+                <w:color w:val="auto"/>
+                <w:spacing w:val="0"/>
+                <w:sz w:val="18"/>
+                <w:shd w:fill="auto" w:val="clear"/>
+              </w:rPr>
+            </w:pPr>
+            <w:r>
+              <w:rPr>
+                <w:rFonts w:eastAsia="Open Sans" w:cs="Open Sans" w:ascii="Open Sans" w:hAnsi="Open Sans"/>
+                <w:color w:val="000000"/>
+                <w:spacing w:val="0"/>
+                <w:sz w:val="18"/>
+                <w:shd w:fill="auto" w:val="clear"/>
+              </w:rPr>
+              <w:t xml:space="preserve">- Entfernen und Entsorgen der Badewanne inkl. Befliesung</w:t>
+            </w:r>
+          </w:p>
+          <w:p>
+            <w:pPr>
+              <w:pStyle w:val="Normal"/>
+              <w:bidi w:val="0"/>
+              <w:spacing w:lineRule="auto" w:line="278" w:before="0" w:after="0"/>
+              <w:ind w:hanging="0" w:left="0" w:right="314"/>
+              <w:jc w:val="left"/>
+              <w:rPr>
+                <w:rFonts w:ascii="Open Sans" w:hAnsi="Open Sans" w:eastAsia="Open Sans" w:cs="Open Sans"/>
+                <w:color w:val="auto"/>
+                <w:spacing w:val="0"/>
+                <w:sz w:val="18"/>
+                <w:shd w:fill="auto" w:val="clear"/>
+              </w:rPr>
+            </w:pPr>
+            <w:r>
+              <w:rPr>
+                <w:rFonts w:eastAsia="Open Sans" w:cs="Open Sans" w:ascii="Open Sans" w:hAnsi="Open Sans"/>
+                <w:color w:val="000000"/>
+                <w:spacing w:val="0"/>
+                <w:sz w:val="18"/>
+                <w:shd w:fill="auto" w:val="clear"/>
+              </w:rPr>
+              <w:t xml:space="preserve">- Entfernen und Entsorgen der Duschabtrennung</w:t>
+            </w:r>
+          </w:p>
+          <w:p>
+            <w:pPr>
+              <w:pStyle w:val="Normal"/>
+              <w:bidi w:val="0"/>
+              <w:spacing w:lineRule="auto" w:line="278" w:before="0" w:after="0"/>
+              <w:ind w:hanging="0" w:left="0" w:right="314"/>
+              <w:jc w:val="left"/>
+              <w:rPr>
+                <w:rFonts w:ascii="Open Sans" w:hAnsi="Open Sans" w:eastAsia="Open Sans" w:cs="Open Sans"/>
+                <w:color w:val="auto"/>
+                <w:spacing w:val="0"/>
+                <w:sz w:val="18"/>
+                <w:shd w:fill="auto" w:val="clear"/>
+              </w:rPr>
+            </w:pPr>
+            <w:r>
+              <w:rPr>
+                <w:rFonts w:eastAsia="Open Sans" w:cs="Open Sans" w:ascii="Open Sans" w:hAnsi="Open Sans"/>
+                <w:color w:val="000000"/>
+                <w:spacing w:val="0"/>
+                <w:sz w:val="18"/>
+                <w:shd w:fill="auto" w:val="clear"/>
+              </w:rPr>
+              <w:t xml:space="preserve">- Einbau der Duschwanne</w:t>
+            </w:r>
+          </w:p>
+          <w:p>
+            <w:pPr>
+              <w:pStyle w:val="Normal"/>
+              <w:bidi w:val="0"/>
+              <w:spacing w:lineRule="auto" w:line="278" w:before="0" w:after="0"/>
+              <w:ind w:hanging="0" w:left="0" w:right="314"/>
+              <w:jc w:val="left"/>
+              <w:rPr>
+                <w:rFonts w:ascii="Open Sans" w:hAnsi="Open Sans" w:eastAsia="Open Sans" w:cs="Open Sans"/>
+                <w:color w:val="auto"/>
+                <w:spacing w:val="0"/>
+                <w:sz w:val="18"/>
+                <w:shd w:fill="auto" w:val="clear"/>
+              </w:rPr>
+            </w:pPr>
+            <w:r>
+              <w:rPr>
+                <w:rFonts w:eastAsia="Open Sans" w:cs="Open Sans" w:ascii="Open Sans" w:hAnsi="Open Sans"/>
+                <w:color w:val="000000"/>
+                <w:spacing w:val="0"/>
+                <w:sz w:val="18"/>
+                <w:shd w:fill="auto" w:val="clear"/>
+              </w:rPr>
+              <w:t xml:space="preserve">- Einbau der Duschabtrennung</w:t>
+            </w:r>
+          </w:p>
         </w:tc>
         <w:tc>
           <w:tcPr>
@@ -2087,7 +2191,7 @@
                 <w:sz w:val="20"/>
                 <w:shd w:fill="auto" w:val="clear"/>
               </w:rPr>
-              <w:t xml:space="preserve">510,79 €</w:t>
+              <w:t xml:space="preserve">842,17 €</w:t>
             </w:r>
           </w:p>
         </w:tc>
@@ -2127,7 +2231,7 @@
                 <w:sz w:val="20"/>
                 <w:shd w:fill="auto" w:val="clear"/>
               </w:rPr>
-              <w:t xml:space="preserve">510,79 €</w:t>
+              <w:t xml:space="preserve">842,17 €</w:t>
             </w:r>
           </w:p>
         </w:tc>
@@ -3147,7 +3251,7 @@
                 <w:sz w:val="22"/>
                 <w:shd w:fill="auto" w:val="clear"/>
               </w:rPr>
-              <w:t xml:space="preserve">2.048,74 €</w:t>
+              <w:t xml:space="preserve">2.545,81 €</w:t>
             </w:r>
             <w:r>
               <w:rPr>
@@ -3322,7 +3426,7 @@
                 <w:sz w:val="22"/>
                 <w:shd w:fill="auto" w:val="clear"/>
               </w:rPr>
-              <w:t xml:space="preserve">361,32 €</w:t>
+              <w:t xml:space="preserve">455,76 €</w:t>
             </w:r>
             <w:r>
               <w:rPr>
@@ -3497,7 +3601,7 @@
                 <w:sz w:val="22"/>
                 <w:shd w:fill="auto" w:val="clear"/>
               </w:rPr>
-              <w:t xml:space="preserve">2.263,00 €</w:t>
+              <w:t xml:space="preserve">2.854,51 €</w:t>
             </w:r>
             <w:r>
               <w:rPr>

</xml_diff>

<commit_message>
implement auto refresh when we navigate through menus
</commit_message>
<xml_diff>
--- a/out-Angebot.docx
+++ b/out-Angebot.docx
@@ -370,7 +370,7 @@
                 <w:sz w:val="22"/>
                 <w:shd w:fill="auto" w:val="clear"/>
               </w:rPr>
-              <w:t xml:space="preserve">AN20251006094001</w:t>
+              <w:t xml:space="preserve">AN20251006095325</w:t>
             </w:r>
             <w:r>
               <w:rPr>
@@ -676,7 +676,7 @@
           <w:sz w:val="24"/>
           <w:shd w:fill="auto" w:val="clear"/>
         </w:rPr>
-        <w:t xml:space="preserve">Ihr Angebot AN20251006094001</w:t>
+        <w:t xml:space="preserve">Ihr Angebot AN20251006095325</w:t>
       </w:r>
     </w:p>
     <w:p>
@@ -1640,84 +1640,6 @@
                 <w:sz w:val="18"/>
                 <w:shd w:fill="auto" w:val="clear"/>
               </w:rPr>
-              <w:t xml:space="preserve">- Entfernen und Entsorgen der Badewanne inkl. Befliesung</w:t>
-            </w:r>
-          </w:p>
-          <w:p>
-            <w:pPr>
-              <w:pStyle w:val="Normal"/>
-              <w:bidi w:val="0"/>
-              <w:spacing w:lineRule="auto" w:line="278" w:before="0" w:after="0"/>
-              <w:ind w:hanging="0" w:left="0" w:right="314"/>
-              <w:jc w:val="left"/>
-              <w:rPr>
-                <w:rFonts w:ascii="Open Sans" w:hAnsi="Open Sans" w:eastAsia="Open Sans" w:cs="Open Sans"/>
-                <w:color w:val="auto"/>
-                <w:spacing w:val="0"/>
-                <w:sz w:val="18"/>
-                <w:shd w:fill="auto" w:val="clear"/>
-              </w:rPr>
-            </w:pPr>
-            <w:r>
-              <w:rPr>
-                <w:rFonts w:eastAsia="Open Sans" w:cs="Open Sans" w:ascii="Open Sans" w:hAnsi="Open Sans"/>
-                <w:color w:val="000000"/>
-                <w:spacing w:val="0"/>
-                <w:sz w:val="18"/>
-                <w:shd w:fill="auto" w:val="clear"/>
-              </w:rPr>
-              <w:t xml:space="preserve">- Entfernen und Entsorgen der Duschabtrennung</w:t>
-            </w:r>
-          </w:p>
-          <w:p>
-            <w:pPr>
-              <w:pStyle w:val="Normal"/>
-              <w:bidi w:val="0"/>
-              <w:spacing w:lineRule="auto" w:line="278" w:before="0" w:after="0"/>
-              <w:ind w:hanging="0" w:left="0" w:right="314"/>
-              <w:jc w:val="left"/>
-              <w:rPr>
-                <w:rFonts w:ascii="Open Sans" w:hAnsi="Open Sans" w:eastAsia="Open Sans" w:cs="Open Sans"/>
-                <w:color w:val="auto"/>
-                <w:spacing w:val="0"/>
-                <w:sz w:val="18"/>
-                <w:shd w:fill="auto" w:val="clear"/>
-              </w:rPr>
-            </w:pPr>
-            <w:r>
-              <w:rPr>
-                <w:rFonts w:eastAsia="Open Sans" w:cs="Open Sans" w:ascii="Open Sans" w:hAnsi="Open Sans"/>
-                <w:color w:val="000000"/>
-                <w:spacing w:val="0"/>
-                <w:sz w:val="18"/>
-                <w:shd w:fill="auto" w:val="clear"/>
-              </w:rPr>
-              <w:t xml:space="preserve">- Einbau der Duschwanne</w:t>
-            </w:r>
-          </w:p>
-          <w:p>
-            <w:pPr>
-              <w:pStyle w:val="Normal"/>
-              <w:bidi w:val="0"/>
-              <w:spacing w:lineRule="auto" w:line="278" w:before="0" w:after="0"/>
-              <w:ind w:hanging="0" w:left="0" w:right="314"/>
-              <w:jc w:val="left"/>
-              <w:rPr>
-                <w:rFonts w:ascii="Open Sans" w:hAnsi="Open Sans" w:eastAsia="Open Sans" w:cs="Open Sans"/>
-                <w:color w:val="auto"/>
-                <w:spacing w:val="0"/>
-                <w:sz w:val="18"/>
-                <w:shd w:fill="auto" w:val="clear"/>
-              </w:rPr>
-            </w:pPr>
-            <w:r>
-              <w:rPr>
-                <w:rFonts w:eastAsia="Open Sans" w:cs="Open Sans" w:ascii="Open Sans" w:hAnsi="Open Sans"/>
-                <w:color w:val="000000"/>
-                <w:spacing w:val="0"/>
-                <w:sz w:val="18"/>
-                <w:shd w:fill="auto" w:val="clear"/>
-              </w:rPr>
               <w:t xml:space="preserve">- Einbau der Duschabtrennung</w:t>
             </w:r>
           </w:p>
@@ -2191,7 +2113,7 @@
                 <w:sz w:val="20"/>
                 <w:shd w:fill="auto" w:val="clear"/>
               </w:rPr>
-              <w:t xml:space="preserve">842,17 €</w:t>
+              <w:t xml:space="preserve">846,58 €</w:t>
             </w:r>
           </w:p>
         </w:tc>
@@ -2231,7 +2153,7 @@
                 <w:sz w:val="20"/>
                 <w:shd w:fill="auto" w:val="clear"/>
               </w:rPr>
-              <w:t xml:space="preserve">842,17 €</w:t>
+              <w:t xml:space="preserve">846,58 €</w:t>
             </w:r>
           </w:p>
         </w:tc>
@@ -2726,6 +2648,32 @@
                 <w:shd w:fill="auto" w:val="clear"/>
               </w:rPr>
               <w:t xml:space="preserve">- 1 Stk Haltegriff clivia plus 32/600mm m. Ros. Edelstahl glatt poliert, VIGOUR</w:t>
+            </w:r>
+          </w:p>
+          <w:p>
+            <w:pPr>
+              <w:pStyle w:val="Normal"/>
+              <w:bidi w:val="0"/>
+              <w:spacing w:lineRule="auto" w:line="278" w:before="0" w:after="0"/>
+              <w:ind w:hanging="0" w:left="0" w:right="314"/>
+              <w:jc w:val="left"/>
+              <w:rPr>
+                <w:rFonts w:ascii="Open Sans" w:hAnsi="Open Sans" w:eastAsia="Open Sans" w:cs="Open Sans"/>
+                <w:color w:val="auto"/>
+                <w:spacing w:val="0"/>
+                <w:sz w:val="20"/>
+                <w:shd w:fill="auto" w:val="clear"/>
+              </w:rPr>
+            </w:pPr>
+            <w:r>
+              <w:rPr>
+                <w:rFonts w:eastAsia="Open Sans" w:cs="Open Sans" w:ascii="Open Sans" w:hAnsi="Open Sans"/>
+                <w:color w:val="000000"/>
+                <w:spacing w:val="0"/>
+                <w:sz w:val="20"/>
+                <w:shd w:fill="auto" w:val="clear"/>
+              </w:rPr>
+              <w:t xml:space="preserve">- 1 Stk Duschwanne 100 x 80 x 3 cm</w:t>
             </w:r>
           </w:p>
         </w:tc>
@@ -3251,7 +3199,7 @@
                 <w:sz w:val="22"/>
                 <w:shd w:fill="auto" w:val="clear"/>
               </w:rPr>
-              <w:t xml:space="preserve">2.545,81 €</w:t>
+              <w:t xml:space="preserve">2.552,42 €</w:t>
             </w:r>
             <w:r>
               <w:rPr>
@@ -3426,7 +3374,7 @@
                 <w:sz w:val="22"/>
                 <w:shd w:fill="auto" w:val="clear"/>
               </w:rPr>
-              <w:t xml:space="preserve">455,76 €</w:t>
+              <w:t xml:space="preserve">457,02 €</w:t>
             </w:r>
             <w:r>
               <w:rPr>
@@ -3601,7 +3549,7 @@
                 <w:sz w:val="22"/>
                 <w:shd w:fill="auto" w:val="clear"/>
               </w:rPr>
-              <w:t xml:space="preserve">2.854,51 €</w:t>
+              <w:t xml:space="preserve">2.862,38 €</w:t>
             </w:r>
             <w:r>
               <w:rPr>

</xml_diff>

<commit_message>
Anbringen zusätzlicher Haltegriffe under arbeiten
</commit_message>
<xml_diff>
--- a/out-Angebot.docx
+++ b/out-Angebot.docx
@@ -104,7 +104,7 @@
           <w:sz w:val="22"/>
           <w:shd w:fill="auto" w:val="clear"/>
         </w:rPr>
-        <w:t xml:space="preserve">Megan Hahn</w:t>
+        <w:t xml:space="preserve">Cruz Hunter</w:t>
       </w:r>
     </w:p>
     <w:p>
@@ -130,7 +130,7 @@
           <w:sz w:val="22"/>
           <w:shd w:fill="auto" w:val="clear"/>
         </w:rPr>
-        <w:t xml:space="preserve">Sed quidem in quis v,</w:t>
+        <w:t xml:space="preserve">Ducimus et voluptat,</w:t>
       </w:r>
     </w:p>
     <w:p>
@@ -156,20 +156,20 @@
           <w:sz w:val="22"/>
           <w:shd w:fill="auto" w:val="clear"/>
         </w:rPr>
-        <w:t xml:space="preserve">Sunt obcaecati provi Et qui id ea est et </w:t>
+        <w:t xml:space="preserve">Quam qui quia eu aut Nihil est debitis fu</w:t>
       </w:r>
     </w:p>
     <w:tbl>
       <w:tblPr>
         <w:tblW w:w="4155" w:type="dxa"/>
         <w:jc w:val="left"/>
-        <w:tblInd w:w="10" w:type="dxa"/>
+        <w:tblInd w:w="11" w:type="dxa"/>
         <w:tblLayout w:type="fixed"/>
         <w:tblCellMar>
           <w:top w:w="0" w:type="dxa"/>
-          <w:left w:w="0" w:type="dxa"/>
+          <w:left w:w="10" w:type="dxa"/>
           <w:bottom w:w="0" w:type="dxa"/>
-          <w:right w:w="0" w:type="dxa"/>
+          <w:right w:w="10" w:type="dxa"/>
         </w:tblCellMar>
       </w:tblPr>
       <w:tblGrid>
@@ -236,16 +236,6 @@
               </w:rPr>
               <w:t>Datum</w:t>
             </w:r>
-            <w:r>
-              <w:rPr>
-                <w:rFonts w:eastAsia="Open Sans" w:cs="Open Sans" w:ascii="Open Sans" w:hAnsi="Open Sans"/>
-                <w:color w:val="000000"/>
-                <w:spacing w:val="0"/>
-                <w:sz w:val="21"/>
-                <w:shd w:fill="auto" w:val="clear"/>
-              </w:rPr>
-              <w:t xml:space="preserve">        </w:t>
-            </w:r>
           </w:p>
           <w:p>
             <w:pPr>
@@ -332,7 +322,7 @@
                 <w:sz w:val="22"/>
                 <w:shd w:fill="auto" w:val="clear"/>
               </w:rPr>
-              <w:t xml:space="preserve">Rhea Cox</w:t>
+              <w:t xml:space="preserve">Chaim Boyer</w:t>
             </w:r>
           </w:p>
         </w:tc>
@@ -370,7 +360,7 @@
                 <w:sz w:val="22"/>
                 <w:shd w:fill="auto" w:val="clear"/>
               </w:rPr>
-              <w:t xml:space="preserve">AN20251006095325</w:t>
+              <w:t xml:space="preserve">AN20251006123105</w:t>
             </w:r>
             <w:r>
               <w:rPr>
@@ -416,7 +406,7 @@
                 <w:sz w:val="22"/>
                 <w:shd w:fill="auto" w:val="clear"/>
               </w:rPr>
-              <w:t xml:space="preserve">1989-05-11</w:t>
+              <w:t xml:space="preserve">1977-11-28</w:t>
             </w:r>
             <w:r>
               <w:rPr>
@@ -456,7 +446,7 @@
                 <w:sz w:val="22"/>
                 <w:shd w:fill="auto" w:val="clear"/>
               </w:rPr>
-              <w:t xml:space="preserve">Prescott Reeves</w:t>
+              <w:t xml:space="preserve">Tanisha Barron</w:t>
             </w:r>
             <w:r>
               <w:rPr>
@@ -676,7 +666,7 @@
           <w:sz w:val="24"/>
           <w:shd w:fill="auto" w:val="clear"/>
         </w:rPr>
-        <w:t xml:space="preserve">Ihr Angebot AN20251006095325</w:t>
+        <w:t xml:space="preserve">Ihr Angebot AN20251006123105</w:t>
       </w:r>
     </w:p>
     <w:p>
@@ -712,7 +702,7 @@
           <w:sz w:val="22"/>
           <w:shd w:fill="auto" w:val="clear"/>
         </w:rPr>
-        <w:t xml:space="preserve">Sehr geehrte Frau Hahn,</w:t>
+        <w:t xml:space="preserve">Sehr geehrte Frau Hunter,</w:t>
         <w:br/>
       </w:r>
     </w:p>
@@ -778,20 +768,20 @@
       <w:tblPr>
         <w:tblW w:w="9780" w:type="dxa"/>
         <w:jc w:val="left"/>
-        <w:tblInd w:w="10" w:type="dxa"/>
+        <w:tblInd w:w="11" w:type="dxa"/>
         <w:tblLayout w:type="fixed"/>
         <w:tblCellMar>
           <w:top w:w="0" w:type="dxa"/>
-          <w:left w:w="0" w:type="dxa"/>
+          <w:left w:w="10" w:type="dxa"/>
           <w:bottom w:w="0" w:type="dxa"/>
-          <w:right w:w="0" w:type="dxa"/>
+          <w:right w:w="10" w:type="dxa"/>
         </w:tblCellMar>
       </w:tblPr>
       <w:tblGrid>
         <w:gridCol w:w="660"/>
-        <w:gridCol w:w="899"/>
+        <w:gridCol w:w="896"/>
         <w:gridCol w:w="4100"/>
-        <w:gridCol w:w="2411"/>
+        <w:gridCol w:w="2414"/>
         <w:gridCol w:w="1710"/>
       </w:tblGrid>
       <w:tr>
@@ -835,7 +825,7 @@
         </w:tc>
         <w:tc>
           <w:tcPr>
-            <w:tcW w:w="899" w:type="dxa"/>
+            <w:tcW w:w="896" w:type="dxa"/>
             <w:tcBorders>
               <w:top w:val="single" w:sz="8" w:space="0" w:color="CCCCCC"/>
               <w:left w:val="single" w:sz="8" w:space="0" w:color="CCCCCC"/>
@@ -906,7 +896,7 @@
         </w:tc>
         <w:tc>
           <w:tcPr>
-            <w:tcW w:w="2411" w:type="dxa"/>
+            <w:tcW w:w="2414" w:type="dxa"/>
             <w:tcBorders>
               <w:top w:val="single" w:sz="8" w:space="0" w:color="CCCCCC"/>
               <w:left w:val="single" w:sz="8" w:space="0" w:color="CCCCCC"/>
@@ -1022,7 +1012,7 @@
         </w:tc>
         <w:tc>
           <w:tcPr>
-            <w:tcW w:w="899" w:type="dxa"/>
+            <w:tcW w:w="896" w:type="dxa"/>
             <w:tcBorders>
               <w:top w:val="single" w:sz="8" w:space="0" w:color="FFFFFF"/>
               <w:left w:val="single" w:sz="8" w:space="0" w:color="FFFFFF"/>
@@ -1100,7 +1090,7 @@
         </w:tc>
         <w:tc>
           <w:tcPr>
-            <w:tcW w:w="2411" w:type="dxa"/>
+            <w:tcW w:w="2414" w:type="dxa"/>
             <w:tcBorders>
               <w:top w:val="single" w:sz="8" w:space="0" w:color="FFFFFF"/>
               <w:left w:val="single" w:sz="8" w:space="0" w:color="FFFFFF"/>
@@ -1133,7 +1123,7 @@
                 <w:sz w:val="20"/>
                 <w:shd w:fill="auto" w:val="clear"/>
               </w:rPr>
-              <w:t xml:space="preserve">1.074,80 €</w:t>
+              <w:t xml:space="preserve">3.110,40 €</w:t>
             </w:r>
           </w:p>
         </w:tc>
@@ -1172,7 +1162,7 @@
                 <w:sz w:val="20"/>
                 <w:shd w:fill="auto" w:val="clear"/>
               </w:rPr>
-              <w:t xml:space="preserve">1.074,80 €</w:t>
+              <w:t xml:space="preserve">3.110,40 €</w:t>
             </w:r>
           </w:p>
         </w:tc>
@@ -1224,7 +1214,7 @@
         </w:tc>
         <w:tc>
           <w:tcPr>
-            <w:tcW w:w="899" w:type="dxa"/>
+            <w:tcW w:w="896" w:type="dxa"/>
             <w:tcBorders>
               <w:top w:val="single" w:sz="8" w:space="0" w:color="FFFFFF"/>
               <w:left w:val="single" w:sz="8" w:space="0" w:color="FFFFFF"/>
@@ -1298,13 +1288,193 @@
                 <w:sz w:val="20"/>
                 <w:shd w:fill="auto" w:val="clear"/>
               </w:rPr>
-              <w:t xml:space="preserve">Auszuführende Arbeiten</w:t>
-            </w:r>
-          </w:p>
-        </w:tc>
-        <w:tc>
-          <w:tcPr>
-            <w:tcW w:w="2411" w:type="dxa"/>
+              <w:t xml:space="preserve">- Anbringen zusätzlicher Haltegriffe</w:t>
+            </w:r>
+          </w:p>
+          <w:p>
+            <w:pPr>
+              <w:pStyle w:val="Normal"/>
+              <w:bidi w:val="0"/>
+              <w:spacing w:lineRule="auto" w:line="278" w:before="0" w:after="0"/>
+              <w:ind w:hanging="0" w:left="0" w:right="314"/>
+              <w:jc w:val="left"/>
+              <w:rPr>
+                <w:color w:val="auto"/>
+                <w:spacing w:val="0"/>
+              </w:rPr>
+            </w:pPr>
+            <w:r>
+              <w:rPr>
+                <w:rFonts w:eastAsia="Open Sans" w:cs="Open Sans" w:ascii="Open Sans" w:hAnsi="Open Sans"/>
+                <w:color w:val="000000"/>
+                <w:spacing w:val="0"/>
+                <w:sz w:val="20"/>
+                <w:shd w:fill="auto" w:val="clear"/>
+              </w:rPr>
+              <w:t xml:space="preserve">- Entfernen und Entsorgen der Badewanne inkl. Befliesung</w:t>
+            </w:r>
+          </w:p>
+          <w:p>
+            <w:pPr>
+              <w:pStyle w:val="Normal"/>
+              <w:bidi w:val="0"/>
+              <w:spacing w:lineRule="auto" w:line="278" w:before="0" w:after="0"/>
+              <w:ind w:hanging="0" w:left="0" w:right="314"/>
+              <w:jc w:val="left"/>
+              <w:rPr>
+                <w:color w:val="auto"/>
+                <w:spacing w:val="0"/>
+              </w:rPr>
+            </w:pPr>
+            <w:r>
+              <w:rPr>
+                <w:rFonts w:eastAsia="Open Sans" w:cs="Open Sans" w:ascii="Open Sans" w:hAnsi="Open Sans"/>
+                <w:color w:val="000000"/>
+                <w:spacing w:val="0"/>
+                <w:sz w:val="20"/>
+                <w:shd w:fill="auto" w:val="clear"/>
+              </w:rPr>
+              <w:t xml:space="preserve">- Entfernen und Entsorgen der Duschabtrennung</w:t>
+            </w:r>
+          </w:p>
+          <w:p>
+            <w:pPr>
+              <w:pStyle w:val="Normal"/>
+              <w:bidi w:val="0"/>
+              <w:spacing w:lineRule="auto" w:line="278" w:before="0" w:after="0"/>
+              <w:ind w:hanging="0" w:left="0" w:right="314"/>
+              <w:jc w:val="left"/>
+              <w:rPr>
+                <w:color w:val="auto"/>
+                <w:spacing w:val="0"/>
+              </w:rPr>
+            </w:pPr>
+            <w:r>
+              <w:rPr>
+                <w:color w:val="auto"/>
+                <w:spacing w:val="0"/>
+              </w:rPr>
+            </w:r>
+          </w:p>
+          <w:p>
+            <w:pPr>
+              <w:pStyle w:val="Normal"/>
+              <w:bidi w:val="0"/>
+              <w:spacing w:lineRule="auto" w:line="278" w:before="0" w:after="0"/>
+              <w:ind w:hanging="0" w:left="0" w:right="314"/>
+              <w:jc w:val="left"/>
+              <w:rPr>
+                <w:color w:val="auto"/>
+                <w:spacing w:val="0"/>
+              </w:rPr>
+            </w:pPr>
+            <w:r>
+              <w:rPr>
+                <w:rFonts w:eastAsia="Open Sans" w:cs="Open Sans" w:ascii="Open Sans" w:hAnsi="Open Sans"/>
+                <w:color w:val="000000"/>
+                <w:spacing w:val="0"/>
+                <w:sz w:val="20"/>
+                <w:shd w:fill="auto" w:val="clear"/>
+              </w:rPr>
+              <w:t xml:space="preserve">Enthält je Einheit</w:t>
+            </w:r>
+          </w:p>
+          <w:p>
+            <w:pPr>
+              <w:pStyle w:val="Normal"/>
+              <w:bidi w:val="0"/>
+              <w:spacing w:lineRule="auto" w:line="278" w:before="0" w:after="0"/>
+              <w:ind w:hanging="0" w:left="0" w:right="314"/>
+              <w:jc w:val="left"/>
+              <w:rPr>
+                <w:color w:val="auto"/>
+                <w:spacing w:val="0"/>
+              </w:rPr>
+            </w:pPr>
+            <w:r>
+              <w:rPr>
+                <w:rFonts w:eastAsia="Open Sans" w:cs="Open Sans" w:ascii="Open Sans" w:hAnsi="Open Sans"/>
+                <w:color w:val="000000"/>
+                <w:spacing w:val="0"/>
+                <w:sz w:val="20"/>
+                <w:shd w:fill="auto" w:val="clear"/>
+              </w:rPr>
+              <w:t xml:space="preserve">- 1,00 Stk Fahrzeugbereitstellung</w:t>
+            </w:r>
+          </w:p>
+          <w:p>
+            <w:pPr>
+              <w:pStyle w:val="Normal"/>
+              <w:bidi w:val="0"/>
+              <w:spacing w:lineRule="auto" w:line="278" w:before="0" w:after="0"/>
+              <w:ind w:hanging="0" w:left="0" w:right="314"/>
+              <w:jc w:val="left"/>
+              <w:rPr>
+                <w:color w:val="auto"/>
+                <w:spacing w:val="0"/>
+              </w:rPr>
+            </w:pPr>
+            <w:r>
+              <w:rPr>
+                <w:rFonts w:eastAsia="Open Sans" w:cs="Open Sans" w:ascii="Open Sans" w:hAnsi="Open Sans"/>
+                <w:color w:val="000000"/>
+                <w:spacing w:val="0"/>
+                <w:sz w:val="20"/>
+                <w:shd w:fill="auto" w:val="clear"/>
+              </w:rPr>
+              <w:t xml:space="preserve">- 1,00 Stk Bereitstellung und Vorhaltung von Maschinen &amp; Werkzeugen</w:t>
+            </w:r>
+          </w:p>
+          <w:p>
+            <w:pPr>
+              <w:pStyle w:val="Normal"/>
+              <w:bidi w:val="0"/>
+              <w:spacing w:lineRule="auto" w:line="278" w:before="0" w:after="0"/>
+              <w:ind w:hanging="0" w:left="0" w:right="314"/>
+              <w:jc w:val="left"/>
+              <w:rPr>
+                <w:color w:val="auto"/>
+                <w:spacing w:val="0"/>
+              </w:rPr>
+            </w:pPr>
+            <w:r>
+              <w:rPr>
+                <w:rFonts w:eastAsia="Open Sans" w:cs="Open Sans" w:ascii="Open Sans" w:hAnsi="Open Sans"/>
+                <w:color w:val="000000"/>
+                <w:spacing w:val="0"/>
+                <w:sz w:val="20"/>
+                <w:shd w:fill="auto" w:val="clear"/>
+              </w:rPr>
+              <w:t xml:space="preserve">- 1,00 Stk Beräumung der Baustelle</w:t>
+            </w:r>
+          </w:p>
+          <w:p>
+            <w:pPr>
+              <w:pStyle w:val="Normal"/>
+              <w:bidi w:val="0"/>
+              <w:spacing w:lineRule="auto" w:line="278" w:before="0" w:after="0"/>
+              <w:ind w:hanging="0" w:left="0" w:right="314"/>
+              <w:jc w:val="left"/>
+              <w:rPr>
+                <w:color w:val="auto"/>
+                <w:spacing w:val="0"/>
+              </w:rPr>
+            </w:pPr>
+            <w:r>
+              <w:rPr>
+                <w:rFonts w:eastAsia="Open Sans" w:cs="Open Sans" w:ascii="Open Sans" w:hAnsi="Open Sans"/>
+                <w:color w:val="000000"/>
+                <w:spacing w:val="0"/>
+                <w:sz w:val="20"/>
+                <w:shd w:fill="auto" w:val="clear"/>
+              </w:rPr>
+              <w:t xml:space="preserve">- 142 km Kilometerpauschale</w:t>
+            </w:r>
+          </w:p>
+        </w:tc>
+        <w:tc>
+          <w:tcPr>
+            <w:tcW w:w="2414" w:type="dxa"/>
             <w:tcBorders>
               <w:top w:val="single" w:sz="8" w:space="0" w:color="FFFFFF"/>
               <w:left w:val="single" w:sz="8" w:space="0" w:color="FFFFFF"/>
@@ -1433,7 +1603,7 @@
         </w:tc>
         <w:tc>
           <w:tcPr>
-            <w:tcW w:w="899" w:type="dxa"/>
+            <w:tcW w:w="896" w:type="dxa"/>
             <w:tcBorders>
               <w:top w:val="single" w:sz="8" w:space="0" w:color="FFFFFF"/>
               <w:left w:val="single" w:sz="8" w:space="0" w:color="FFFFFF"/>
@@ -1510,143 +1680,12 @@
                 <w:sz w:val="18"/>
                 <w:shd w:fill="auto" w:val="clear"/>
               </w:rPr>
-              <w:t xml:space="preserve">- 1,00 Stk Fahrzeugbereitstellung</w:t>
-            </w:r>
-          </w:p>
-          <w:p>
-            <w:pPr>
-              <w:pStyle w:val="Normal"/>
-              <w:bidi w:val="0"/>
-              <w:spacing w:lineRule="auto" w:line="278" w:before="0" w:after="0"/>
-              <w:ind w:hanging="0" w:left="0" w:right="314"/>
-              <w:jc w:val="left"/>
-              <w:rPr>
-                <w:rFonts w:ascii="Open Sans" w:hAnsi="Open Sans" w:eastAsia="Open Sans" w:cs="Open Sans"/>
-                <w:color w:val="auto"/>
-                <w:spacing w:val="0"/>
-                <w:sz w:val="18"/>
-                <w:shd w:fill="auto" w:val="clear"/>
-              </w:rPr>
-            </w:pPr>
-            <w:r>
-              <w:rPr>
-                <w:rFonts w:eastAsia="Open Sans" w:cs="Open Sans" w:ascii="Open Sans" w:hAnsi="Open Sans"/>
-                <w:color w:val="000000"/>
-                <w:spacing w:val="0"/>
-                <w:sz w:val="18"/>
-                <w:shd w:fill="auto" w:val="clear"/>
-              </w:rPr>
-              <w:t xml:space="preserve">- 1,00 Stk Bereitstellung und Vorhaltung von Maschinen &amp; Werkzeugen</w:t>
-            </w:r>
-          </w:p>
-          <w:p>
-            <w:pPr>
-              <w:pStyle w:val="Normal"/>
-              <w:bidi w:val="0"/>
-              <w:spacing w:lineRule="auto" w:line="278" w:before="0" w:after="0"/>
-              <w:ind w:hanging="0" w:left="0" w:right="314"/>
-              <w:jc w:val="left"/>
-              <w:rPr>
-                <w:rFonts w:ascii="Open Sans" w:hAnsi="Open Sans" w:eastAsia="Open Sans" w:cs="Open Sans"/>
-                <w:color w:val="auto"/>
-                <w:spacing w:val="0"/>
-                <w:sz w:val="18"/>
-                <w:shd w:fill="auto" w:val="clear"/>
-              </w:rPr>
-            </w:pPr>
-            <w:r>
-              <w:rPr>
-                <w:rFonts w:eastAsia="Open Sans" w:cs="Open Sans" w:ascii="Open Sans" w:hAnsi="Open Sans"/>
-                <w:color w:val="000000"/>
-                <w:spacing w:val="0"/>
-                <w:sz w:val="18"/>
-                <w:shd w:fill="auto" w:val="clear"/>
-              </w:rPr>
-              <w:t xml:space="preserve">- 1,00 Stk Beräumung der Baustelle</w:t>
-            </w:r>
-          </w:p>
-          <w:p>
-            <w:pPr>
-              <w:pStyle w:val="Normal"/>
-              <w:bidi w:val="0"/>
-              <w:spacing w:lineRule="auto" w:line="278" w:before="0" w:after="0"/>
-              <w:ind w:hanging="0" w:left="0" w:right="314"/>
-              <w:jc w:val="left"/>
-              <w:rPr>
-                <w:rFonts w:ascii="Open Sans" w:hAnsi="Open Sans" w:eastAsia="Open Sans" w:cs="Open Sans"/>
-                <w:color w:val="auto"/>
-                <w:spacing w:val="0"/>
-                <w:sz w:val="18"/>
-                <w:shd w:fill="auto" w:val="clear"/>
-              </w:rPr>
-            </w:pPr>
-            <w:r>
-              <w:rPr>
-                <w:rFonts w:eastAsia="Open Sans" w:cs="Open Sans" w:ascii="Open Sans" w:hAnsi="Open Sans"/>
-                <w:color w:val="000000"/>
-                <w:spacing w:val="0"/>
-                <w:sz w:val="18"/>
-                <w:shd w:fill="auto" w:val="clear"/>
-              </w:rPr>
-              <w:t xml:space="preserve">- 14 km Kilometerpauschale </w:t>
-            </w:r>
-          </w:p>
-          <w:p>
-            <w:pPr>
-              <w:pStyle w:val="Normal"/>
-              <w:bidi w:val="0"/>
-              <w:spacing w:lineRule="auto" w:line="278" w:before="0" w:after="0"/>
-              <w:ind w:hanging="0" w:left="0" w:right="314"/>
-              <w:jc w:val="left"/>
-              <w:rPr>
-                <w:rFonts w:ascii="Open Sans" w:hAnsi="Open Sans" w:eastAsia="Open Sans" w:cs="Open Sans"/>
-                <w:color w:val="auto"/>
-                <w:spacing w:val="0"/>
-                <w:sz w:val="18"/>
-                <w:shd w:fill="auto" w:val="clear"/>
-              </w:rPr>
-            </w:pPr>
-            <w:r>
-              <w:rPr>
-                <w:rFonts w:eastAsia="Open Sans" w:cs="Open Sans" w:ascii="Open Sans" w:hAnsi="Open Sans"/>
-                <w:color w:val="000000"/>
-                <w:spacing w:val="0"/>
-                <w:sz w:val="18"/>
-                <w:shd w:fill="auto" w:val="clear"/>
-              </w:rPr>
-              <w:t xml:space="preserve">- Anbringen zusätzlicher Haltegriffe</w:t>
-            </w:r>
-          </w:p>
-          <w:p>
-            <w:pPr>
-              <w:pStyle w:val="Normal"/>
-              <w:bidi w:val="0"/>
-              <w:spacing w:lineRule="auto" w:line="278" w:before="0" w:after="0"/>
-              <w:ind w:hanging="0" w:left="0" w:right="314"/>
-              <w:jc w:val="left"/>
-              <w:rPr>
-                <w:rFonts w:ascii="Open Sans" w:hAnsi="Open Sans" w:eastAsia="Open Sans" w:cs="Open Sans"/>
-                <w:color w:val="auto"/>
-                <w:spacing w:val="0"/>
-                <w:sz w:val="18"/>
-                <w:shd w:fill="auto" w:val="clear"/>
-              </w:rPr>
-            </w:pPr>
-            <w:r>
-              <w:rPr>
-                <w:rFonts w:eastAsia="Open Sans" w:cs="Open Sans" w:ascii="Open Sans" w:hAnsi="Open Sans"/>
-                <w:color w:val="000000"/>
-                <w:spacing w:val="0"/>
-                <w:sz w:val="18"/>
-                <w:shd w:fill="auto" w:val="clear"/>
-              </w:rPr>
-              <w:t xml:space="preserve">- Einbau der Duschabtrennung</w:t>
-            </w:r>
-          </w:p>
-        </w:tc>
-        <w:tc>
-          <w:tcPr>
-            <w:tcW w:w="2411" w:type="dxa"/>
+            </w:r>
+          </w:p>
+        </w:tc>
+        <w:tc>
+          <w:tcPr>
+            <w:tcW w:w="2414" w:type="dxa"/>
             <w:tcBorders>
               <w:top w:val="single" w:sz="8" w:space="0" w:color="FFFFFF"/>
               <w:left w:val="single" w:sz="8" w:space="0" w:color="FFFFFF"/>
@@ -1763,19 +1802,19 @@
       <w:tblPr>
         <w:tblW w:w="9780" w:type="dxa"/>
         <w:jc w:val="left"/>
-        <w:tblInd w:w="10" w:type="dxa"/>
+        <w:tblInd w:w="11" w:type="dxa"/>
         <w:tblLayout w:type="fixed"/>
         <w:tblCellMar>
           <w:top w:w="0" w:type="dxa"/>
-          <w:left w:w="0" w:type="dxa"/>
+          <w:left w:w="10" w:type="dxa"/>
           <w:bottom w:w="0" w:type="dxa"/>
-          <w:right w:w="0" w:type="dxa"/>
+          <w:right w:w="10" w:type="dxa"/>
         </w:tblCellMar>
       </w:tblPr>
       <w:tblGrid>
         <w:gridCol w:w="660"/>
-        <w:gridCol w:w="1034"/>
-        <w:gridCol w:w="4108"/>
+        <w:gridCol w:w="1031"/>
+        <w:gridCol w:w="4111"/>
         <w:gridCol w:w="2268"/>
         <w:gridCol w:w="1710"/>
       </w:tblGrid>
@@ -1819,7 +1858,7 @@
         </w:tc>
         <w:tc>
           <w:tcPr>
-            <w:tcW w:w="1034" w:type="dxa"/>
+            <w:tcW w:w="1031" w:type="dxa"/>
             <w:tcBorders>
               <w:top w:val="single" w:sz="8" w:space="0" w:color="CCCCCC"/>
               <w:left w:val="single" w:sz="8" w:space="0" w:color="CCCCCC"/>
@@ -1853,7 +1892,7 @@
         </w:tc>
         <w:tc>
           <w:tcPr>
-            <w:tcW w:w="4108" w:type="dxa"/>
+            <w:tcW w:w="4111" w:type="dxa"/>
             <w:tcBorders>
               <w:top w:val="single" w:sz="8" w:space="0" w:color="CCCCCC"/>
               <w:left w:val="single" w:sz="8" w:space="0" w:color="CCCCCC"/>
@@ -2002,7 +2041,7 @@
         </w:tc>
         <w:tc>
           <w:tcPr>
-            <w:tcW w:w="1034" w:type="dxa"/>
+            <w:tcW w:w="1031" w:type="dxa"/>
             <w:tcBorders>
               <w:top w:val="single" w:sz="8" w:space="0" w:color="FFFFFF"/>
               <w:left w:val="single" w:sz="8" w:space="0" w:color="FFFFFF"/>
@@ -2040,7 +2079,7 @@
         </w:tc>
         <w:tc>
           <w:tcPr>
-            <w:tcW w:w="4108" w:type="dxa"/>
+            <w:tcW w:w="4111" w:type="dxa"/>
             <w:tcBorders>
               <w:top w:val="single" w:sz="8" w:space="0" w:color="FFFFFF"/>
               <w:left w:val="single" w:sz="8" w:space="0" w:color="FFFFFF"/>
@@ -2113,7 +2152,7 @@
                 <w:sz w:val="20"/>
                 <w:shd w:fill="auto" w:val="clear"/>
               </w:rPr>
-              <w:t xml:space="preserve">846,58 €</w:t>
+              <w:t xml:space="preserve">1.710,84 €</w:t>
             </w:r>
           </w:p>
         </w:tc>
@@ -2153,7 +2192,7 @@
                 <w:sz w:val="20"/>
                 <w:shd w:fill="auto" w:val="clear"/>
               </w:rPr>
-              <w:t xml:space="preserve">846,58 €</w:t>
+              <w:t xml:space="preserve">1.710,84 €</w:t>
             </w:r>
           </w:p>
         </w:tc>
@@ -2205,7 +2244,7 @@
         </w:tc>
         <w:tc>
           <w:tcPr>
-            <w:tcW w:w="1034" w:type="dxa"/>
+            <w:tcW w:w="1031" w:type="dxa"/>
             <w:tcBorders>
               <w:top w:val="single" w:sz="8" w:space="0" w:color="FFFFFF"/>
               <w:left w:val="single" w:sz="8" w:space="0" w:color="FFFFFF"/>
@@ -2246,7 +2285,7 @@
         </w:tc>
         <w:tc>
           <w:tcPr>
-            <w:tcW w:w="4108" w:type="dxa"/>
+            <w:tcW w:w="4111" w:type="dxa"/>
             <w:tcBorders>
               <w:top w:val="single" w:sz="8" w:space="0" w:color="FFFFFF"/>
               <w:left w:val="single" w:sz="8" w:space="0" w:color="FFFFFF"/>
@@ -2414,7 +2453,7 @@
         </w:tc>
         <w:tc>
           <w:tcPr>
-            <w:tcW w:w="1034" w:type="dxa"/>
+            <w:tcW w:w="1031" w:type="dxa"/>
             <w:tcBorders>
               <w:top w:val="single" w:sz="8" w:space="0" w:color="FFFFFF"/>
               <w:left w:val="single" w:sz="8" w:space="0" w:color="FFFFFF"/>
@@ -2455,7 +2494,7 @@
         </w:tc>
         <w:tc>
           <w:tcPr>
-            <w:tcW w:w="4108" w:type="dxa"/>
+            <w:tcW w:w="4111" w:type="dxa"/>
             <w:tcBorders>
               <w:top w:val="single" w:sz="8" w:space="0" w:color="FFFFFF"/>
               <w:left w:val="single" w:sz="8" w:space="0" w:color="FFFFFF"/>
@@ -2595,6 +2634,136 @@
                 <w:sz w:val="20"/>
                 <w:shd w:fill="auto" w:val="clear"/>
               </w:rPr>
+              <w:t xml:space="preserve">- 8 Stk Fußboden-Paneele (1 Paneele = 0.3 m² )</w:t>
+            </w:r>
+          </w:p>
+          <w:p>
+            <w:pPr>
+              <w:pStyle w:val="Normal"/>
+              <w:bidi w:val="0"/>
+              <w:spacing w:lineRule="auto" w:line="278" w:before="0" w:after="0"/>
+              <w:ind w:hanging="0" w:left="0" w:right="314"/>
+              <w:jc w:val="left"/>
+              <w:rPr>
+                <w:rFonts w:ascii="Open Sans" w:hAnsi="Open Sans" w:eastAsia="Open Sans" w:cs="Open Sans"/>
+                <w:color w:val="auto"/>
+                <w:spacing w:val="0"/>
+                <w:sz w:val="20"/>
+                <w:shd w:fill="auto" w:val="clear"/>
+              </w:rPr>
+            </w:pPr>
+            <w:r>
+              <w:rPr>
+                <w:rFonts w:eastAsia="Open Sans" w:cs="Open Sans" w:ascii="Open Sans" w:hAnsi="Open Sans"/>
+                <w:color w:val="000000"/>
+                <w:spacing w:val="0"/>
+                <w:sz w:val="20"/>
+                <w:shd w:fill="auto" w:val="clear"/>
+              </w:rPr>
+              <w:t xml:space="preserve">- 4 Pkg Flächenkleber (1 Pkg je 0,60 m²)</w:t>
+            </w:r>
+          </w:p>
+          <w:p>
+            <w:pPr>
+              <w:pStyle w:val="Normal"/>
+              <w:bidi w:val="0"/>
+              <w:spacing w:lineRule="auto" w:line="278" w:before="0" w:after="0"/>
+              <w:ind w:hanging="0" w:left="0" w:right="314"/>
+              <w:jc w:val="left"/>
+              <w:rPr>
+                <w:rFonts w:ascii="Open Sans" w:hAnsi="Open Sans" w:eastAsia="Open Sans" w:cs="Open Sans"/>
+                <w:color w:val="auto"/>
+                <w:spacing w:val="0"/>
+                <w:sz w:val="20"/>
+                <w:shd w:fill="auto" w:val="clear"/>
+              </w:rPr>
+            </w:pPr>
+            <w:r>
+              <w:rPr>
+                <w:rFonts w:eastAsia="Open Sans" w:cs="Open Sans" w:ascii="Open Sans" w:hAnsi="Open Sans"/>
+                <w:color w:val="000000"/>
+                <w:spacing w:val="0"/>
+                <w:sz w:val="20"/>
+                <w:shd w:fill="auto" w:val="clear"/>
+              </w:rPr>
+              <w:t xml:space="preserve">- 2.3 m² Trinnity Bodenabdichtung (inkl. 15% Verschnitt)</w:t>
+            </w:r>
+          </w:p>
+          <w:p>
+            <w:pPr>
+              <w:pStyle w:val="Normal"/>
+              <w:bidi w:val="0"/>
+              <w:spacing w:lineRule="auto" w:line="278" w:before="0" w:after="0"/>
+              <w:ind w:hanging="0" w:left="0" w:right="314"/>
+              <w:jc w:val="left"/>
+              <w:rPr>
+                <w:rFonts w:ascii="Open Sans" w:hAnsi="Open Sans" w:eastAsia="Open Sans" w:cs="Open Sans"/>
+                <w:color w:val="auto"/>
+                <w:spacing w:val="0"/>
+                <w:sz w:val="20"/>
+                <w:shd w:fill="auto" w:val="clear"/>
+              </w:rPr>
+            </w:pPr>
+            <w:r>
+              <w:rPr>
+                <w:rFonts w:eastAsia="Open Sans" w:cs="Open Sans" w:ascii="Open Sans" w:hAnsi="Open Sans"/>
+                <w:color w:val="000000"/>
+                <w:spacing w:val="0"/>
+                <w:sz w:val="20"/>
+                <w:shd w:fill="auto" w:val="clear"/>
+              </w:rPr>
+              <w:t xml:space="preserve">- 2 m² Fußboden individ.5.0 V5FB02</w:t>
+            </w:r>
+          </w:p>
+          <w:p>
+            <w:pPr>
+              <w:pStyle w:val="Normal"/>
+              <w:bidi w:val="0"/>
+              <w:spacing w:lineRule="auto" w:line="278" w:before="0" w:after="0"/>
+              <w:ind w:hanging="0" w:left="0" w:right="314"/>
+              <w:jc w:val="left"/>
+              <w:rPr>
+                <w:rFonts w:ascii="Open Sans" w:hAnsi="Open Sans" w:eastAsia="Open Sans" w:cs="Open Sans"/>
+                <w:color w:val="auto"/>
+                <w:spacing w:val="0"/>
+                <w:sz w:val="20"/>
+                <w:shd w:fill="auto" w:val="clear"/>
+              </w:rPr>
+            </w:pPr>
+            <w:r>
+              <w:rPr>
+                <w:rFonts w:eastAsia="Open Sans" w:cs="Open Sans" w:ascii="Open Sans" w:hAnsi="Open Sans"/>
+                <w:color w:val="000000"/>
+                <w:spacing w:val="0"/>
+                <w:sz w:val="20"/>
+                <w:shd w:fill="auto" w:val="clear"/>
+              </w:rPr>
+              <w:t xml:space="preserve">- 1 Stk Wandverkleidung 3.0 Alu 1497×2550 mm — Farbe: Marmor weiß</w:t>
+            </w:r>
+          </w:p>
+          <w:p>
+            <w:pPr>
+              <w:pStyle w:val="Normal"/>
+              <w:bidi w:val="0"/>
+              <w:spacing w:lineRule="auto" w:line="278" w:before="0" w:after="0"/>
+              <w:ind w:hanging="0" w:left="0" w:right="314"/>
+              <w:jc w:val="left"/>
+              <w:rPr>
+                <w:rFonts w:ascii="Open Sans" w:hAnsi="Open Sans" w:eastAsia="Open Sans" w:cs="Open Sans"/>
+                <w:color w:val="auto"/>
+                <w:spacing w:val="0"/>
+                <w:sz w:val="20"/>
+                <w:shd w:fill="auto" w:val="clear"/>
+              </w:rPr>
+            </w:pPr>
+            <w:r>
+              <w:rPr>
+                <w:rFonts w:eastAsia="Open Sans" w:cs="Open Sans" w:ascii="Open Sans" w:hAnsi="Open Sans"/>
+                <w:color w:val="000000"/>
+                <w:spacing w:val="0"/>
+                <w:sz w:val="20"/>
+                <w:shd w:fill="auto" w:val="clear"/>
+              </w:rPr>
               <w:t xml:space="preserve">- 1 Stk TRINNITY Wandabdichtung BASIS-Set 5 qm DW bis 100 x 100 / BW bis 180 x 80 cm</w:t>
             </w:r>
           </w:p>
@@ -2621,6 +2790,58 @@
                 <w:sz w:val="20"/>
                 <w:shd w:fill="auto" w:val="clear"/>
               </w:rPr>
+              <w:t xml:space="preserve">- 2 Stk Wandverkleidungsklebstoff 3.0/4.0</w:t>
+            </w:r>
+          </w:p>
+          <w:p>
+            <w:pPr>
+              <w:pStyle w:val="Normal"/>
+              <w:bidi w:val="0"/>
+              <w:spacing w:lineRule="auto" w:line="278" w:before="0" w:after="0"/>
+              <w:ind w:hanging="0" w:left="0" w:right="314"/>
+              <w:jc w:val="left"/>
+              <w:rPr>
+                <w:rFonts w:ascii="Open Sans" w:hAnsi="Open Sans" w:eastAsia="Open Sans" w:cs="Open Sans"/>
+                <w:color w:val="auto"/>
+                <w:spacing w:val="0"/>
+                <w:sz w:val="20"/>
+                <w:shd w:fill="auto" w:val="clear"/>
+              </w:rPr>
+            </w:pPr>
+            <w:r>
+              <w:rPr>
+                <w:rFonts w:eastAsia="Open Sans" w:cs="Open Sans" w:ascii="Open Sans" w:hAnsi="Open Sans"/>
+                <w:color w:val="000000"/>
+                <w:spacing w:val="0"/>
+                <w:sz w:val="20"/>
+                <w:shd w:fill="auto" w:val="clear"/>
+              </w:rPr>
+              <w:t xml:space="preserve">- 1 Stk Profilklebstoff (pro Abschlussprofil 1 Stk)</w:t>
+            </w:r>
+          </w:p>
+          <w:p>
+            <w:pPr>
+              <w:pStyle w:val="Normal"/>
+              <w:bidi w:val="0"/>
+              <w:spacing w:lineRule="auto" w:line="278" w:before="0" w:after="0"/>
+              <w:ind w:hanging="0" w:left="0" w:right="314"/>
+              <w:jc w:val="left"/>
+              <w:rPr>
+                <w:rFonts w:ascii="Open Sans" w:hAnsi="Open Sans" w:eastAsia="Open Sans" w:cs="Open Sans"/>
+                <w:color w:val="auto"/>
+                <w:spacing w:val="0"/>
+                <w:sz w:val="20"/>
+                <w:shd w:fill="auto" w:val="clear"/>
+              </w:rPr>
+            </w:pPr>
+            <w:r>
+              <w:rPr>
+                <w:rFonts w:eastAsia="Open Sans" w:cs="Open Sans" w:ascii="Open Sans" w:hAnsi="Open Sans"/>
+                <w:color w:val="000000"/>
+                <w:spacing w:val="0"/>
+                <w:sz w:val="20"/>
+                <w:shd w:fill="auto" w:val="clear"/>
+              </w:rPr>
               <w:t xml:space="preserve">- 1 Stk Haltegriff clivia plus 32/400mm m. Ros. Edelstahl glatt poliert, VIGOUR</w:t>
             </w:r>
           </w:p>
@@ -2673,7 +2894,33 @@
                 <w:sz w:val="20"/>
                 <w:shd w:fill="auto" w:val="clear"/>
               </w:rPr>
-              <w:t xml:space="preserve">- 1 Stk Duschwanne 100 x 80 x 3 cm</w:t>
+              <w:t xml:space="preserve">- 1 Stk Haltegriff clivia plus 32/800mm m. Ros. Edelstahl glatt poliert, VIGOUR</w:t>
+            </w:r>
+          </w:p>
+          <w:p>
+            <w:pPr>
+              <w:pStyle w:val="Normal"/>
+              <w:bidi w:val="0"/>
+              <w:spacing w:lineRule="auto" w:line="278" w:before="0" w:after="0"/>
+              <w:ind w:hanging="0" w:left="0" w:right="314"/>
+              <w:jc w:val="left"/>
+              <w:rPr>
+                <w:rFonts w:ascii="Open Sans" w:hAnsi="Open Sans" w:eastAsia="Open Sans" w:cs="Open Sans"/>
+                <w:color w:val="auto"/>
+                <w:spacing w:val="0"/>
+                <w:sz w:val="20"/>
+                <w:shd w:fill="auto" w:val="clear"/>
+              </w:rPr>
+            </w:pPr>
+            <w:r>
+              <w:rPr>
+                <w:rFonts w:eastAsia="Open Sans" w:cs="Open Sans" w:ascii="Open Sans" w:hAnsi="Open Sans"/>
+                <w:color w:val="000000"/>
+                <w:spacing w:val="0"/>
+                <w:sz w:val="20"/>
+                <w:shd w:fill="auto" w:val="clear"/>
+              </w:rPr>
+              <w:t xml:space="preserve">- 1 Stk Duschwanne 70 x 70 x 3 cm</w:t>
             </w:r>
           </w:p>
         </w:tc>
@@ -2757,234 +3004,6 @@
                 <w:sz w:val="22"/>
                 <w:shd w:fill="auto" w:val="clear"/>
               </w:rPr>
-            </w:r>
-          </w:p>
-        </w:tc>
-      </w:tr>
-      <w:tr>
-        <w:trPr>
-          <w:trHeight w:val="1" w:hRule="atLeast"/>
-        </w:trPr>
-        <w:tc>
-          <w:tcPr>
-            <w:tcW w:w="660" w:type="dxa"/>
-            <w:tcBorders>
-              <w:top w:val="single" w:sz="8" w:space="0" w:color="FFFFFF"/>
-              <w:left w:val="single" w:sz="8" w:space="0" w:color="FFFFFF"/>
-              <w:bottom w:val="single" w:sz="8" w:space="0" w:color="FFFFFF"/>
-              <w:right w:val="single" w:sz="8" w:space="0" w:color="FFFFFF"/>
-            </w:tcBorders>
-            <w:shd w:color="000000" w:fill="FFFFFF" w:val="clear"/>
-            <w:tcMar>
-              <w:left w:w="56" w:type="dxa"/>
-              <w:right w:w="56" w:type="dxa"/>
-            </w:tcMar>
-          </w:tcPr>
-          <w:p>
-            <w:pPr>
-              <w:pStyle w:val="Normal"/>
-              <w:bidi w:val="0"/>
-              <w:spacing w:lineRule="auto" w:line="278" w:before="0" w:after="0"/>
-              <w:ind w:hanging="0" w:left="0" w:right="-26"/>
-              <w:jc w:val="left"/>
-              <w:rPr>
-                <w:color w:val="auto"/>
-                <w:spacing w:val="0"/>
-              </w:rPr>
-            </w:pPr>
-            <w:r>
-              <w:rPr>
-                <w:rFonts w:eastAsia="Open Sans" w:cs="Open Sans" w:ascii="Open Sans" w:hAnsi="Open Sans"/>
-                <w:color w:val="000000"/>
-                <w:spacing w:val="0"/>
-                <w:sz w:val="20"/>
-                <w:shd w:fill="auto" w:val="clear"/>
-              </w:rPr>
-              <w:t xml:space="preserve">003</w:t>
-            </w:r>
-          </w:p>
-        </w:tc>
-        <w:tc>
-          <w:tcPr>
-            <w:tcW w:w="1034" w:type="dxa"/>
-            <w:tcBorders>
-              <w:top w:val="single" w:sz="8" w:space="0" w:color="FFFFFF"/>
-              <w:left w:val="single" w:sz="8" w:space="0" w:color="FFFFFF"/>
-              <w:bottom w:val="single" w:sz="8" w:space="0" w:color="FFFFFF"/>
-              <w:right w:val="single" w:sz="8" w:space="0" w:color="FFFFFF"/>
-            </w:tcBorders>
-            <w:shd w:color="000000" w:fill="FFFFFF" w:val="clear"/>
-            <w:tcMar>
-              <w:left w:w="56" w:type="dxa"/>
-              <w:right w:w="56" w:type="dxa"/>
-            </w:tcMar>
-          </w:tcPr>
-          <w:p>
-            <w:pPr>
-              <w:pStyle w:val="Normal"/>
-              <w:bidi w:val="0"/>
-              <w:spacing w:lineRule="auto" w:line="278" w:before="0" w:after="0"/>
-              <w:ind w:hanging="0" w:left="0" w:right="314"/>
-              <w:jc w:val="left"/>
-              <w:rPr>
-                <w:color w:val="auto"/>
-                <w:spacing w:val="0"/>
-              </w:rPr>
-            </w:pPr>
-            <w:r>
-              <w:rPr>
-                <w:rFonts w:eastAsia="Open Sans" w:cs="Open Sans" w:ascii="Open Sans" w:hAnsi="Open Sans"/>
-                <w:color w:val="000000"/>
-                <w:spacing w:val="0"/>
-                <w:sz w:val="20"/>
-                <w:shd w:fill="auto" w:val="clear"/>
-              </w:rPr>
-              <w:t xml:space="preserve">1 Stk</w:t>
-            </w:r>
-          </w:p>
-        </w:tc>
-        <w:tc>
-          <w:tcPr>
-            <w:tcW w:w="4108" w:type="dxa"/>
-            <w:tcBorders>
-              <w:top w:val="single" w:sz="8" w:space="0" w:color="FFFFFF"/>
-              <w:left w:val="single" w:sz="8" w:space="0" w:color="FFFFFF"/>
-              <w:bottom w:val="single" w:sz="8" w:space="0" w:color="FFFFFF"/>
-              <w:right w:val="single" w:sz="8" w:space="0" w:color="FFFFFF"/>
-            </w:tcBorders>
-            <w:shd w:color="000000" w:fill="FFFFFF" w:val="clear"/>
-            <w:tcMar>
-              <w:left w:w="56" w:type="dxa"/>
-              <w:right w:w="56" w:type="dxa"/>
-            </w:tcMar>
-          </w:tcPr>
-          <w:p>
-            <w:pPr>
-              <w:pStyle w:val="Normal"/>
-              <w:bidi w:val="0"/>
-              <w:spacing w:lineRule="auto" w:line="278" w:before="0" w:after="0"/>
-              <w:ind w:hanging="0" w:left="0" w:right="314"/>
-              <w:jc w:val="left"/>
-              <w:rPr>
-                <w:rFonts w:ascii="Open Sans" w:hAnsi="Open Sans" w:eastAsia="Open Sans" w:cs="Open Sans"/>
-                <w:b/>
-                <w:color w:val="auto"/>
-                <w:spacing w:val="0"/>
-                <w:sz w:val="20"/>
-                <w:shd w:fill="auto" w:val="clear"/>
-              </w:rPr>
-            </w:pPr>
-            <w:r>
-              <w:rPr>
-                <w:rFonts w:eastAsia="Open Sans" w:cs="Open Sans" w:ascii="Open Sans" w:hAnsi="Open Sans"/>
-                <w:b/>
-                <w:color w:val="000000"/>
-                <w:spacing w:val="0"/>
-                <w:sz w:val="20"/>
-                <w:shd w:fill="auto" w:val="clear"/>
-              </w:rPr>
-              <w:t xml:space="preserve">Aktion: Haltegriff</w:t>
-            </w:r>
-          </w:p>
-          <w:p>
-            <w:pPr>
-              <w:pStyle w:val="Normal"/>
-              <w:bidi w:val="0"/>
-              <w:spacing w:lineRule="auto" w:line="278" w:before="0" w:after="0"/>
-              <w:ind w:hanging="0" w:left="0" w:right="314"/>
-              <w:jc w:val="left"/>
-              <w:rPr>
-                <w:color w:val="auto"/>
-                <w:spacing w:val="0"/>
-              </w:rPr>
-            </w:pPr>
-            <w:r>
-              <w:rPr>
-                <w:rFonts w:eastAsia="Open Sans" w:cs="Open Sans" w:ascii="Open Sans" w:hAnsi="Open Sans"/>
-                <w:color w:val="000000"/>
-                <w:spacing w:val="0"/>
-                <w:sz w:val="20"/>
-                <w:shd w:fill="auto" w:val="clear"/>
-              </w:rPr>
-              <w:t xml:space="preserve">1 Haltegriff gratis im Wert von 175 € inkl. Lieferung und Montage</w:t>
-            </w:r>
-          </w:p>
-        </w:tc>
-        <w:tc>
-          <w:tcPr>
-            <w:tcW w:w="2268" w:type="dxa"/>
-            <w:tcBorders>
-              <w:top w:val="single" w:sz="8" w:space="0" w:color="FFFFFF"/>
-              <w:left w:val="single" w:sz="8" w:space="0" w:color="FFFFFF"/>
-              <w:bottom w:val="single" w:sz="8" w:space="0" w:color="FFFFFF"/>
-              <w:right w:val="single" w:sz="8" w:space="0" w:color="FFFFFF"/>
-            </w:tcBorders>
-            <w:shd w:color="000000" w:fill="FFFFFF" w:val="clear"/>
-            <w:tcMar>
-              <w:left w:w="56" w:type="dxa"/>
-              <w:right w:w="56" w:type="dxa"/>
-            </w:tcMar>
-          </w:tcPr>
-          <w:p>
-            <w:pPr>
-              <w:pStyle w:val="Normal"/>
-              <w:bidi w:val="0"/>
-              <w:spacing w:lineRule="auto" w:line="278" w:before="0" w:after="0"/>
-              <w:ind w:hanging="0" w:left="0" w:right="314"/>
-              <w:jc w:val="left"/>
-              <w:rPr>
-                <w:color w:val="auto"/>
-                <w:spacing w:val="0"/>
-              </w:rPr>
-            </w:pPr>
-            <w:r>
-              <w:rPr>
-                <w:rFonts w:eastAsia="Open Sans" w:cs="Open Sans" w:ascii="Open Sans" w:hAnsi="Open Sans"/>
-                <w:color w:val="000000"/>
-                <w:spacing w:val="0"/>
-                <w:sz w:val="20"/>
-                <w:shd w:fill="auto" w:val="clear"/>
-              </w:rPr>
-              <w:t xml:space="preserve">0,00 €</w:t>
-            </w:r>
-          </w:p>
-        </w:tc>
-        <w:tc>
-          <w:tcPr>
-            <w:tcW w:w="1710" w:type="dxa"/>
-            <w:tcBorders>
-              <w:top w:val="single" w:sz="8" w:space="0" w:color="FFFFFF"/>
-              <w:left w:val="single" w:sz="8" w:space="0" w:color="FFFFFF"/>
-              <w:bottom w:val="single" w:sz="8" w:space="0" w:color="FFFFFF"/>
-              <w:right w:val="single" w:sz="8" w:space="0" w:color="FFFFFF"/>
-            </w:tcBorders>
-            <w:shd w:color="000000" w:fill="FFFFFF" w:val="clear"/>
-            <w:tcMar>
-              <w:left w:w="56" w:type="dxa"/>
-              <w:right w:w="56" w:type="dxa"/>
-            </w:tcMar>
-          </w:tcPr>
-          <w:p>
-            <w:pPr>
-              <w:pStyle w:val="Normal"/>
-              <w:bidi w:val="0"/>
-              <w:spacing w:lineRule="auto" w:line="278" w:before="0" w:after="0"/>
-              <w:ind w:hanging="0" w:left="0" w:right="314"/>
-              <w:jc w:val="left"/>
-              <w:rPr>
-                <w:color w:val="auto"/>
-                <w:spacing w:val="0"/>
-              </w:rPr>
-            </w:pPr>
-            <w:r>
-              <w:rPr>
-                <w:rFonts w:eastAsia="Open Sans" w:cs="Open Sans" w:ascii="Open Sans" w:hAnsi="Open Sans"/>
-                <w:color w:val="000000"/>
-                <w:spacing w:val="0"/>
-                <w:sz w:val="20"/>
-                <w:shd w:fill="auto" w:val="clear"/>
-              </w:rPr>
-              <w:t xml:space="preserve">0,00 €</w:t>
             </w:r>
           </w:p>
         </w:tc>
@@ -3024,20 +3043,20 @@
       <w:tblPr>
         <w:tblW w:w="9660" w:type="dxa"/>
         <w:jc w:val="left"/>
-        <w:tblInd w:w="10" w:type="dxa"/>
+        <w:tblInd w:w="11" w:type="dxa"/>
         <w:tblLayout w:type="fixed"/>
         <w:tblCellMar>
           <w:top w:w="0" w:type="dxa"/>
-          <w:left w:w="0" w:type="dxa"/>
+          <w:left w:w="10" w:type="dxa"/>
           <w:bottom w:w="0" w:type="dxa"/>
-          <w:right w:w="0" w:type="dxa"/>
+          <w:right w:w="10" w:type="dxa"/>
         </w:tblCellMar>
       </w:tblPr>
       <w:tblGrid>
         <w:gridCol w:w="3915"/>
         <w:gridCol w:w="915"/>
-        <w:gridCol w:w="2105"/>
-        <w:gridCol w:w="2725"/>
+        <w:gridCol w:w="2102"/>
+        <w:gridCol w:w="2728"/>
       </w:tblGrid>
       <w:tr>
         <w:trPr>
@@ -3129,7 +3148,7 @@
         </w:tc>
         <w:tc>
           <w:tcPr>
-            <w:tcW w:w="2105" w:type="dxa"/>
+            <w:tcW w:w="2102" w:type="dxa"/>
             <w:tcBorders>
               <w:top w:val="single" w:sz="8" w:space="0" w:color="FFFFFF"/>
               <w:left w:val="single" w:sz="8" w:space="0" w:color="D9D9D9"/>
@@ -3167,7 +3186,7 @@
         </w:tc>
         <w:tc>
           <w:tcPr>
-            <w:tcW w:w="2725" w:type="dxa"/>
+            <w:tcW w:w="2728" w:type="dxa"/>
             <w:tcBorders>
               <w:top w:val="single" w:sz="8" w:space="0" w:color="FFFFFF"/>
               <w:left w:val="single" w:sz="8" w:space="0" w:color="D9D9D9"/>
@@ -3199,7 +3218,7 @@
                 <w:sz w:val="22"/>
                 <w:shd w:fill="auto" w:val="clear"/>
               </w:rPr>
-              <w:t xml:space="preserve">2.552,42 €</w:t>
+              <w:t xml:space="preserve">5.921,54 €</w:t>
             </w:r>
             <w:r>
               <w:rPr>
@@ -3304,7 +3323,7 @@
         </w:tc>
         <w:tc>
           <w:tcPr>
-            <w:tcW w:w="2105" w:type="dxa"/>
+            <w:tcW w:w="2102" w:type="dxa"/>
             <w:tcBorders>
               <w:top w:val="single" w:sz="8" w:space="0" w:color="FFFFFF"/>
               <w:left w:val="single" w:sz="8" w:space="0" w:color="FFFFFF"/>
@@ -3342,7 +3361,7 @@
         </w:tc>
         <w:tc>
           <w:tcPr>
-            <w:tcW w:w="2725" w:type="dxa"/>
+            <w:tcW w:w="2728" w:type="dxa"/>
             <w:tcBorders>
               <w:top w:val="single" w:sz="8" w:space="0" w:color="FFFFFF"/>
               <w:left w:val="single" w:sz="8" w:space="0" w:color="FFFFFF"/>
@@ -3374,7 +3393,7 @@
                 <w:sz w:val="22"/>
                 <w:shd w:fill="auto" w:val="clear"/>
               </w:rPr>
-              <w:t xml:space="preserve">457,02 €</w:t>
+              <w:t xml:space="preserve">1.125,09 €</w:t>
             </w:r>
             <w:r>
               <w:rPr>
@@ -3479,7 +3498,7 @@
         </w:tc>
         <w:tc>
           <w:tcPr>
-            <w:tcW w:w="2105" w:type="dxa"/>
+            <w:tcW w:w="2102" w:type="dxa"/>
             <w:tcBorders>
               <w:top w:val="single" w:sz="8" w:space="0" w:color="FFFFFF"/>
               <w:left w:val="single" w:sz="8" w:space="0" w:color="D9D9D9"/>
@@ -3517,7 +3536,7 @@
         </w:tc>
         <w:tc>
           <w:tcPr>
-            <w:tcW w:w="2725" w:type="dxa"/>
+            <w:tcW w:w="2728" w:type="dxa"/>
             <w:tcBorders>
               <w:top w:val="single" w:sz="8" w:space="0" w:color="FFFFFF"/>
               <w:left w:val="single" w:sz="8" w:space="0" w:color="D9D9D9"/>
@@ -3549,7 +3568,7 @@
                 <w:sz w:val="22"/>
                 <w:shd w:fill="auto" w:val="clear"/>
               </w:rPr>
-              <w:t xml:space="preserve">2.862,38 €</w:t>
+              <w:t xml:space="preserve">7.046,63 €</w:t>
             </w:r>
             <w:r>
               <w:rPr>
@@ -4170,7 +4189,7 @@
       <w:pgNumType w:fmt="decimal"/>
       <w:formProt w:val="false"/>
       <w:textDirection w:val="lrTb"/>
-      <w:docGrid w:type="default" w:linePitch="100" w:charSpace="4294963199"/>
+      <w:docGrid w:type="default" w:linePitch="100" w:charSpace="0"/>
     </w:sectPr>
   </w:body>
 </w:document>
@@ -4199,7 +4218,10 @@
     <w:qFormat/>
     <w:pPr>
       <w:widowControl w:val="false"/>
+      <w:suppressAutoHyphens w:val="true"/>
       <w:bidi w:val="0"/>
+      <w:spacing w:before="0" w:after="0"/>
+      <w:jc w:val="left"/>
     </w:pPr>
     <w:rPr>
       <w:rFonts w:ascii="Calibri" w:hAnsi="Calibri" w:eastAsia="NSimSun" w:cs="Arial"/>

</xml_diff>

<commit_message>
show Facharbeiter again in kodten-details
</commit_message>
<xml_diff>
--- a/out-Angebot.docx
+++ b/out-Angebot.docx
@@ -360,7 +360,7 @@
                 <w:sz w:val="22"/>
                 <w:shd w:fill="auto" w:val="clear"/>
               </w:rPr>
-              <w:t xml:space="preserve">AN20251006123105</w:t>
+              <w:t xml:space="preserve">AN20251006130339</w:t>
             </w:r>
             <w:r>
               <w:rPr>
@@ -666,7 +666,7 @@
           <w:sz w:val="24"/>
           <w:shd w:fill="auto" w:val="clear"/>
         </w:rPr>
-        <w:t xml:space="preserve">Ihr Angebot AN20251006123105</w:t>
+        <w:t xml:space="preserve">Ihr Angebot AN20251006130339</w:t>
       </w:r>
     </w:p>
     <w:p>
@@ -779,9 +779,9 @@
       </w:tblPr>
       <w:tblGrid>
         <w:gridCol w:w="660"/>
-        <w:gridCol w:w="896"/>
+        <w:gridCol w:w="895"/>
         <w:gridCol w:w="4100"/>
-        <w:gridCol w:w="2414"/>
+        <w:gridCol w:w="2415"/>
         <w:gridCol w:w="1710"/>
       </w:tblGrid>
       <w:tr>
@@ -825,7 +825,7 @@
         </w:tc>
         <w:tc>
           <w:tcPr>
-            <w:tcW w:w="896" w:type="dxa"/>
+            <w:tcW w:w="895" w:type="dxa"/>
             <w:tcBorders>
               <w:top w:val="single" w:sz="8" w:space="0" w:color="CCCCCC"/>
               <w:left w:val="single" w:sz="8" w:space="0" w:color="CCCCCC"/>
@@ -896,7 +896,7 @@
         </w:tc>
         <w:tc>
           <w:tcPr>
-            <w:tcW w:w="2414" w:type="dxa"/>
+            <w:tcW w:w="2415" w:type="dxa"/>
             <w:tcBorders>
               <w:top w:val="single" w:sz="8" w:space="0" w:color="CCCCCC"/>
               <w:left w:val="single" w:sz="8" w:space="0" w:color="CCCCCC"/>
@@ -1012,7 +1012,7 @@
         </w:tc>
         <w:tc>
           <w:tcPr>
-            <w:tcW w:w="896" w:type="dxa"/>
+            <w:tcW w:w="895" w:type="dxa"/>
             <w:tcBorders>
               <w:top w:val="single" w:sz="8" w:space="0" w:color="FFFFFF"/>
               <w:left w:val="single" w:sz="8" w:space="0" w:color="FFFFFF"/>
@@ -1090,7 +1090,7 @@
         </w:tc>
         <w:tc>
           <w:tcPr>
-            <w:tcW w:w="2414" w:type="dxa"/>
+            <w:tcW w:w="2415" w:type="dxa"/>
             <w:tcBorders>
               <w:top w:val="single" w:sz="8" w:space="0" w:color="FFFFFF"/>
               <w:left w:val="single" w:sz="8" w:space="0" w:color="FFFFFF"/>
@@ -1214,7 +1214,7 @@
         </w:tc>
         <w:tc>
           <w:tcPr>
-            <w:tcW w:w="896" w:type="dxa"/>
+            <w:tcW w:w="895" w:type="dxa"/>
             <w:tcBorders>
               <w:top w:val="single" w:sz="8" w:space="0" w:color="FFFFFF"/>
               <w:left w:val="single" w:sz="8" w:space="0" w:color="FFFFFF"/>
@@ -1474,7 +1474,7 @@
         </w:tc>
         <w:tc>
           <w:tcPr>
-            <w:tcW w:w="2414" w:type="dxa"/>
+            <w:tcW w:w="2415" w:type="dxa"/>
             <w:tcBorders>
               <w:top w:val="single" w:sz="8" w:space="0" w:color="FFFFFF"/>
               <w:left w:val="single" w:sz="8" w:space="0" w:color="FFFFFF"/>
@@ -1603,7 +1603,7 @@
         </w:tc>
         <w:tc>
           <w:tcPr>
-            <w:tcW w:w="896" w:type="dxa"/>
+            <w:tcW w:w="895" w:type="dxa"/>
             <w:tcBorders>
               <w:top w:val="single" w:sz="8" w:space="0" w:color="FFFFFF"/>
               <w:left w:val="single" w:sz="8" w:space="0" w:color="FFFFFF"/>
@@ -1685,7 +1685,7 @@
         </w:tc>
         <w:tc>
           <w:tcPr>
-            <w:tcW w:w="2414" w:type="dxa"/>
+            <w:tcW w:w="2415" w:type="dxa"/>
             <w:tcBorders>
               <w:top w:val="single" w:sz="8" w:space="0" w:color="FFFFFF"/>
               <w:left w:val="single" w:sz="8" w:space="0" w:color="FFFFFF"/>
@@ -1813,8 +1813,8 @@
       </w:tblPr>
       <w:tblGrid>
         <w:gridCol w:w="660"/>
-        <w:gridCol w:w="1031"/>
-        <w:gridCol w:w="4111"/>
+        <w:gridCol w:w="1030"/>
+        <w:gridCol w:w="4112"/>
         <w:gridCol w:w="2268"/>
         <w:gridCol w:w="1710"/>
       </w:tblGrid>
@@ -1858,7 +1858,7 @@
         </w:tc>
         <w:tc>
           <w:tcPr>
-            <w:tcW w:w="1031" w:type="dxa"/>
+            <w:tcW w:w="1030" w:type="dxa"/>
             <w:tcBorders>
               <w:top w:val="single" w:sz="8" w:space="0" w:color="CCCCCC"/>
               <w:left w:val="single" w:sz="8" w:space="0" w:color="CCCCCC"/>
@@ -1892,7 +1892,7 @@
         </w:tc>
         <w:tc>
           <w:tcPr>
-            <w:tcW w:w="4111" w:type="dxa"/>
+            <w:tcW w:w="4112" w:type="dxa"/>
             <w:tcBorders>
               <w:top w:val="single" w:sz="8" w:space="0" w:color="CCCCCC"/>
               <w:left w:val="single" w:sz="8" w:space="0" w:color="CCCCCC"/>
@@ -2041,7 +2041,7 @@
         </w:tc>
         <w:tc>
           <w:tcPr>
-            <w:tcW w:w="1031" w:type="dxa"/>
+            <w:tcW w:w="1030" w:type="dxa"/>
             <w:tcBorders>
               <w:top w:val="single" w:sz="8" w:space="0" w:color="FFFFFF"/>
               <w:left w:val="single" w:sz="8" w:space="0" w:color="FFFFFF"/>
@@ -2079,7 +2079,7 @@
         </w:tc>
         <w:tc>
           <w:tcPr>
-            <w:tcW w:w="4111" w:type="dxa"/>
+            <w:tcW w:w="4112" w:type="dxa"/>
             <w:tcBorders>
               <w:top w:val="single" w:sz="8" w:space="0" w:color="FFFFFF"/>
               <w:left w:val="single" w:sz="8" w:space="0" w:color="FFFFFF"/>
@@ -2244,7 +2244,7 @@
         </w:tc>
         <w:tc>
           <w:tcPr>
-            <w:tcW w:w="1031" w:type="dxa"/>
+            <w:tcW w:w="1030" w:type="dxa"/>
             <w:tcBorders>
               <w:top w:val="single" w:sz="8" w:space="0" w:color="FFFFFF"/>
               <w:left w:val="single" w:sz="8" w:space="0" w:color="FFFFFF"/>
@@ -2285,7 +2285,7 @@
         </w:tc>
         <w:tc>
           <w:tcPr>
-            <w:tcW w:w="4111" w:type="dxa"/>
+            <w:tcW w:w="4112" w:type="dxa"/>
             <w:tcBorders>
               <w:top w:val="single" w:sz="8" w:space="0" w:color="FFFFFF"/>
               <w:left w:val="single" w:sz="8" w:space="0" w:color="FFFFFF"/>
@@ -2311,14 +2311,7 @@
               </w:rPr>
             </w:pPr>
             <w:r>
-              <w:rPr>
-                <w:rFonts w:eastAsia="Open Sans" w:cs="Open Sans" w:ascii="Open Sans" w:hAnsi="Open Sans"/>
-                <w:color w:val="000000"/>
-                <w:spacing w:val="0"/>
-                <w:sz w:val="20"/>
-                <w:shd w:fill="auto" w:val="clear"/>
-              </w:rPr>
-              <w:t xml:space="preserve">Material für Badumbau</w:t>
+              <w:rPr/>
             </w:r>
           </w:p>
         </w:tc>
@@ -2453,7 +2446,7 @@
         </w:tc>
         <w:tc>
           <w:tcPr>
-            <w:tcW w:w="1031" w:type="dxa"/>
+            <w:tcW w:w="1030" w:type="dxa"/>
             <w:tcBorders>
               <w:top w:val="single" w:sz="8" w:space="0" w:color="FFFFFF"/>
               <w:left w:val="single" w:sz="8" w:space="0" w:color="FFFFFF"/>
@@ -2494,7 +2487,7 @@
         </w:tc>
         <w:tc>
           <w:tcPr>
-            <w:tcW w:w="4111" w:type="dxa"/>
+            <w:tcW w:w="4112" w:type="dxa"/>
             <w:tcBorders>
               <w:top w:val="single" w:sz="8" w:space="0" w:color="FFFFFF"/>
               <w:left w:val="single" w:sz="8" w:space="0" w:color="FFFFFF"/>

</xml_diff>

<commit_message>
fixing the Nettobetrag value in the pdf
</commit_message>
<xml_diff>
--- a/out-Angebot.docx
+++ b/out-Angebot.docx
@@ -360,7 +360,7 @@
                 <w:sz w:val="22"/>
                 <w:shd w:fill="auto" w:val="clear"/>
               </w:rPr>
-              <w:t xml:space="preserve">AN20251006151556</w:t>
+              <w:t xml:space="preserve">AN20251006155310</w:t>
             </w:r>
             <w:r>
               <w:rPr>
@@ -666,7 +666,7 @@
           <w:sz w:val="24"/>
           <w:shd w:fill="auto" w:val="clear"/>
         </w:rPr>
-        <w:t xml:space="preserve">Ihr Angebot AN20251006151556</w:t>
+        <w:t xml:space="preserve">Ihr Angebot AN20251006155310</w:t>
       </w:r>
     </w:p>
     <w:p>
@@ -3278,6 +3278,234 @@
           </w:p>
         </w:tc>
       </w:tr>
+      <w:tr>
+        <w:trPr>
+          <w:trHeight w:val="1" w:hRule="atLeast"/>
+        </w:trPr>
+        <w:tc>
+          <w:tcPr>
+            <w:tcW w:w="660" w:type="dxa"/>
+            <w:tcBorders>
+              <w:top w:val="single" w:sz="8" w:space="0" w:color="FFFFFF"/>
+              <w:left w:val="single" w:sz="8" w:space="0" w:color="FFFFFF"/>
+              <w:bottom w:val="single" w:sz="8" w:space="0" w:color="FFFFFF"/>
+              <w:right w:val="single" w:sz="8" w:space="0" w:color="FFFFFF"/>
+            </w:tcBorders>
+            <w:shd w:color="000000" w:fill="FFFFFF" w:val="clear"/>
+            <w:tcMar>
+              <w:left w:w="56" w:type="dxa"/>
+              <w:right w:w="56" w:type="dxa"/>
+            </w:tcMar>
+          </w:tcPr>
+          <w:p>
+            <w:pPr>
+              <w:pStyle w:val="Normal"/>
+              <w:bidi w:val="0"/>
+              <w:spacing w:lineRule="auto" w:line="278" w:before="0" w:after="0"/>
+              <w:ind w:hanging="0" w:left="0" w:right="-26"/>
+              <w:jc w:val="left"/>
+              <w:rPr>
+                <w:color w:val="auto"/>
+                <w:spacing w:val="0"/>
+              </w:rPr>
+            </w:pPr>
+            <w:r>
+              <w:rPr>
+                <w:rFonts w:eastAsia="Open Sans" w:cs="Open Sans" w:ascii="Open Sans" w:hAnsi="Open Sans"/>
+                <w:color w:val="000000"/>
+                <w:spacing w:val="0"/>
+                <w:sz w:val="20"/>
+                <w:shd w:fill="auto" w:val="clear"/>
+              </w:rPr>
+              <w:t xml:space="preserve">004</w:t>
+            </w:r>
+          </w:p>
+        </w:tc>
+        <w:tc>
+          <w:tcPr>
+            <w:tcW w:w="1030" w:type="dxa"/>
+            <w:tcBorders>
+              <w:top w:val="single" w:sz="8" w:space="0" w:color="FFFFFF"/>
+              <w:left w:val="single" w:sz="8" w:space="0" w:color="FFFFFF"/>
+              <w:bottom w:val="single" w:sz="8" w:space="0" w:color="FFFFFF"/>
+              <w:right w:val="single" w:sz="8" w:space="0" w:color="FFFFFF"/>
+            </w:tcBorders>
+            <w:shd w:color="000000" w:fill="FFFFFF" w:val="clear"/>
+            <w:tcMar>
+              <w:left w:w="56" w:type="dxa"/>
+              <w:right w:w="56" w:type="dxa"/>
+            </w:tcMar>
+          </w:tcPr>
+          <w:p>
+            <w:pPr>
+              <w:pStyle w:val="Normal"/>
+              <w:bidi w:val="0"/>
+              <w:spacing w:lineRule="auto" w:line="278" w:before="0" w:after="0"/>
+              <w:ind w:hanging="0" w:left="0" w:right="314"/>
+              <w:jc w:val="left"/>
+              <w:rPr>
+                <w:color w:val="auto"/>
+                <w:spacing w:val="0"/>
+              </w:rPr>
+            </w:pPr>
+            <w:r>
+              <w:rPr>
+                <w:rFonts w:eastAsia="Open Sans" w:cs="Open Sans" w:ascii="Open Sans" w:hAnsi="Open Sans"/>
+                <w:color w:val="000000"/>
+                <w:spacing w:val="0"/>
+                <w:sz w:val="20"/>
+                <w:shd w:fill="auto" w:val="clear"/>
+              </w:rPr>
+              <w:t xml:space="preserve">1 Stk</w:t>
+            </w:r>
+          </w:p>
+        </w:tc>
+        <w:tc>
+          <w:tcPr>
+            <w:tcW w:w="4112" w:type="dxa"/>
+            <w:tcBorders>
+              <w:top w:val="single" w:sz="8" w:space="0" w:color="FFFFFF"/>
+              <w:left w:val="single" w:sz="8" w:space="0" w:color="FFFFFF"/>
+              <w:bottom w:val="single" w:sz="8" w:space="0" w:color="FFFFFF"/>
+              <w:right w:val="single" w:sz="8" w:space="0" w:color="FFFFFF"/>
+            </w:tcBorders>
+            <w:shd w:color="000000" w:fill="FFFFFF" w:val="clear"/>
+            <w:tcMar>
+              <w:left w:w="56" w:type="dxa"/>
+              <w:right w:w="56" w:type="dxa"/>
+            </w:tcMar>
+          </w:tcPr>
+          <w:p>
+            <w:pPr>
+              <w:pStyle w:val="Normal"/>
+              <w:bidi w:val="0"/>
+              <w:spacing w:lineRule="auto" w:line="278" w:before="0" w:after="0"/>
+              <w:ind w:hanging="0" w:left="0" w:right="314"/>
+              <w:jc w:val="left"/>
+              <w:rPr>
+                <w:rFonts w:ascii="Open Sans" w:hAnsi="Open Sans" w:eastAsia="Open Sans" w:cs="Open Sans"/>
+                <w:b/>
+                <w:color w:val="auto"/>
+                <w:spacing w:val="0"/>
+                <w:sz w:val="20"/>
+                <w:shd w:fill="auto" w:val="clear"/>
+              </w:rPr>
+            </w:pPr>
+            <w:r>
+              <w:rPr>
+                <w:rFonts w:eastAsia="Open Sans" w:cs="Open Sans" w:ascii="Open Sans" w:hAnsi="Open Sans"/>
+                <w:b/>
+                <w:color w:val="000000"/>
+                <w:spacing w:val="0"/>
+                <w:sz w:val="20"/>
+                <w:shd w:fill="auto" w:val="clear"/>
+              </w:rPr>
+              <w:t xml:space="preserve">Bestandkundenbonus:</w:t>
+            </w:r>
+          </w:p>
+          <w:p>
+            <w:pPr>
+              <w:pStyle w:val="Normal"/>
+              <w:bidi w:val="0"/>
+              <w:spacing w:lineRule="auto" w:line="278" w:before="0" w:after="0"/>
+              <w:ind w:hanging="0" w:left="0" w:right="314"/>
+              <w:jc w:val="left"/>
+              <w:rPr>
+                <w:color w:val="auto"/>
+                <w:spacing w:val="0"/>
+              </w:rPr>
+            </w:pPr>
+            <w:r>
+              <w:rPr>
+                <w:rFonts w:eastAsia="Open Sans" w:cs="Open Sans" w:ascii="Open Sans" w:hAnsi="Open Sans"/>
+                <w:color w:val="000000"/>
+                <w:spacing w:val="0"/>
+                <w:sz w:val="20"/>
+                <w:shd w:fill="auto" w:val="clear"/>
+              </w:rPr>
+              <w:t xml:space="preserve">-- Rabatt von 300 € ab einem Gesamtwert von 3.000</w:t>
+            </w:r>
+          </w:p>
+        </w:tc>
+        <w:tc>
+          <w:tcPr>
+            <w:tcW w:w="2268" w:type="dxa"/>
+            <w:tcBorders>
+              <w:top w:val="single" w:sz="8" w:space="0" w:color="FFFFFF"/>
+              <w:left w:val="single" w:sz="8" w:space="0" w:color="FFFFFF"/>
+              <w:bottom w:val="single" w:sz="8" w:space="0" w:color="FFFFFF"/>
+              <w:right w:val="single" w:sz="8" w:space="0" w:color="FFFFFF"/>
+            </w:tcBorders>
+            <w:shd w:color="000000" w:fill="FFFFFF" w:val="clear"/>
+            <w:tcMar>
+              <w:left w:w="56" w:type="dxa"/>
+              <w:right w:w="56" w:type="dxa"/>
+            </w:tcMar>
+          </w:tcPr>
+          <w:p>
+            <w:pPr>
+              <w:pStyle w:val="Normal"/>
+              <w:bidi w:val="0"/>
+              <w:spacing w:lineRule="auto" w:line="278" w:before="0" w:after="0"/>
+              <w:ind w:hanging="0" w:left="0" w:right="314"/>
+              <w:jc w:val="left"/>
+              <w:rPr>
+                <w:color w:val="auto"/>
+                <w:spacing w:val="0"/>
+              </w:rPr>
+            </w:pPr>
+            <w:r>
+              <w:rPr>
+                <w:rFonts w:eastAsia="Open Sans" w:cs="Open Sans" w:ascii="Open Sans" w:hAnsi="Open Sans"/>
+                <w:color w:val="000000"/>
+                <w:spacing w:val="0"/>
+                <w:sz w:val="20"/>
+                <w:shd w:fill="auto" w:val="clear"/>
+              </w:rPr>
+              <w:t xml:space="preserve">-252,10 €</w:t>
+            </w:r>
+          </w:p>
+        </w:tc>
+        <w:tc>
+          <w:tcPr>
+            <w:tcW w:w="1710" w:type="dxa"/>
+            <w:tcBorders>
+              <w:top w:val="single" w:sz="8" w:space="0" w:color="FFFFFF"/>
+              <w:left w:val="single" w:sz="8" w:space="0" w:color="FFFFFF"/>
+              <w:bottom w:val="single" w:sz="8" w:space="0" w:color="FFFFFF"/>
+              <w:right w:val="single" w:sz="8" w:space="0" w:color="FFFFFF"/>
+            </w:tcBorders>
+            <w:shd w:color="000000" w:fill="FFFFFF" w:val="clear"/>
+            <w:tcMar>
+              <w:left w:w="56" w:type="dxa"/>
+              <w:right w:w="56" w:type="dxa"/>
+            </w:tcMar>
+          </w:tcPr>
+          <w:p>
+            <w:pPr>
+              <w:pStyle w:val="Normal"/>
+              <w:bidi w:val="0"/>
+              <w:spacing w:lineRule="auto" w:line="278" w:before="0" w:after="0"/>
+              <w:ind w:hanging="0" w:left="0" w:right="314"/>
+              <w:jc w:val="left"/>
+              <w:rPr>
+                <w:color w:val="auto"/>
+                <w:spacing w:val="0"/>
+              </w:rPr>
+            </w:pPr>
+            <w:r>
+              <w:rPr>
+                <w:rFonts w:eastAsia="Open Sans" w:cs="Open Sans" w:ascii="Open Sans" w:hAnsi="Open Sans"/>
+                <w:color w:val="000000"/>
+                <w:spacing w:val="0"/>
+                <w:sz w:val="20"/>
+                <w:shd w:fill="auto" w:val="clear"/>
+              </w:rPr>
+              <w:t xml:space="preserve">-252,10 €</w:t>
+            </w:r>
+          </w:p>
+        </w:tc>
+      </w:tr>
     </w:tbl>
     <w:p>
       <w:pPr>
@@ -3488,7 +3716,7 @@
                 <w:sz w:val="22"/>
                 <w:shd w:fill="auto" w:val="clear"/>
               </w:rPr>
-              <w:t xml:space="preserve">6.522,88 €</w:t>
+              <w:t xml:space="preserve">6.113,96 €</w:t>
             </w:r>
             <w:r>
               <w:rPr>
@@ -3663,7 +3891,7 @@
                 <w:sz w:val="22"/>
                 <w:shd w:fill="auto" w:val="clear"/>
               </w:rPr>
-              <w:t xml:space="preserve">1.205,84 €</w:t>
+              <w:t xml:space="preserve">1.161,65 €</w:t>
             </w:r>
             <w:r>
               <w:rPr>
@@ -3838,7 +4066,7 @@
                 <w:sz w:val="22"/>
                 <w:shd w:fill="auto" w:val="clear"/>
               </w:rPr>
-              <w:t xml:space="preserve">7.552,38 €</w:t>
+              <w:t xml:space="preserve">7.275,61 €</w:t>
             </w:r>
             <w:r>
               <w:rPr>

</xml_diff>

<commit_message>
TRINNITY Bodenabdichtung für Fußboden more stable
</commit_message>
<xml_diff>
--- a/out-Angebot.docx
+++ b/out-Angebot.docx
@@ -310,7 +310,7 @@
                 <w:rFonts w:ascii="Open Sans" w:cs="Open Sans" w:eastAsia="Open Sans" w:hAnsi="Open Sans"/>
                 <w:rtl w:val="0"/>
               </w:rPr>
-              <w:t xml:space="preserve">ANG2025-1009-101813</w:t>
+              <w:t xml:space="preserve">ANG2025-1009-105307</w:t>
             </w:r>
             <w:r>
               <w:rPr>
@@ -578,7 +578,7 @@
           <w:shd w:fill="auto" w:val="clear"/>
           <w:rtl w:val="0"/>
         </w:rPr>
-        <w:t xml:space="preserve">  Ihr Angebot ANG2025-1009-101813</w:t>
+        <w:t xml:space="preserve">  Ihr Angebot ANG2025-1009-105307</w:t>
       </w:r>
     </w:p>
     <w:p>

</xml_diff>

<commit_message>
display Hin- & Rückfahrt) again
</commit_message>
<xml_diff>
--- a/out-Angebot.docx
+++ b/out-Angebot.docx
@@ -310,7 +310,7 @@
                 <w:rFonts w:ascii="Open Sans" w:cs="Open Sans" w:eastAsia="Open Sans" w:hAnsi="Open Sans"/>
                 <w:rtl w:val="0"/>
               </w:rPr>
-              <w:t xml:space="preserve">ANG2025-1009-105307</w:t>
+              <w:t xml:space="preserve">ANG2025-1009-110727</w:t>
             </w:r>
             <w:r>
               <w:rPr>
@@ -578,7 +578,7 @@
           <w:shd w:fill="auto" w:val="clear"/>
           <w:rtl w:val="0"/>
         </w:rPr>
-        <w:t xml:space="preserve">  Ihr Angebot ANG2025-1009-105307</w:t>
+        <w:t xml:space="preserve">  Ihr Angebot ANG2025-1009-110727</w:t>
       </w:r>
     </w:p>
     <w:p>

</xml_diff>

<commit_message>
changement in the template
</commit_message>
<xml_diff>
--- a/out-Angebot.docx
+++ b/out-Angebot.docx
@@ -310,7 +310,7 @@
                 <w:rFonts w:ascii="Open Sans" w:cs="Open Sans" w:eastAsia="Open Sans" w:hAnsi="Open Sans"/>
                 <w:rtl w:val="0"/>
               </w:rPr>
-              <w:t xml:space="preserve">ANG2025-1009-110727</w:t>
+              <w:t xml:space="preserve">ANG2025-1009-143607</w:t>
             </w:r>
             <w:r>
               <w:rPr>
@@ -345,7 +345,7 @@
                 <w:rFonts w:ascii="Open Sans" w:cs="Open Sans" w:eastAsia="Open Sans" w:hAnsi="Open Sans"/>
                 <w:rtl w:val="0"/>
               </w:rPr>
-              <w:t xml:space="preserve">2017-01-15</w:t>
+              <w:t xml:space="preserve">15.01.2017</w:t>
             </w:r>
             <w:r>
               <w:rPr>
@@ -578,7 +578,7 @@
           <w:shd w:fill="auto" w:val="clear"/>
           <w:rtl w:val="0"/>
         </w:rPr>
-        <w:t xml:space="preserve">  Ihr Angebot ANG2025-1009-110727</w:t>
+        <w:t xml:space="preserve">  Ihr Angebot ANG2025-1009-143607</w:t>
       </w:r>
     </w:p>
     <w:p>
@@ -673,16 +673,16 @@
       </w:tblPr>
       <w:tblGrid>
         <w:gridCol w:w="660"/>
-        <w:gridCol w:w="900"/>
-        <w:gridCol w:w="4350"/>
-        <w:gridCol w:w="2385"/>
+        <w:gridCol w:w="780"/>
+        <w:gridCol w:w="4530"/>
+        <w:gridCol w:w="2325"/>
         <w:gridCol w:w="1485"/>
         <w:tblGridChange w:id="0">
           <w:tblGrid>
             <w:gridCol w:w="660"/>
-            <w:gridCol w:w="900"/>
-            <w:gridCol w:w="4350"/>
-            <w:gridCol w:w="2385"/>
+            <w:gridCol w:w="780"/>
+            <w:gridCol w:w="4530"/>
+            <w:gridCol w:w="2325"/>
             <w:gridCol w:w="1485"/>
           </w:tblGrid>
         </w:tblGridChange>
@@ -1075,7 +1075,7 @@
                 <w:shd w:fill="auto" w:val="clear"/>
                 <w:rtl w:val="0"/>
               </w:rPr>
-              <w:t xml:space="preserve">1.119,26 €</w:t>
+              <w:t xml:space="preserve">1.086,00 €</w:t>
             </w:r>
             <w:r>
               <w:rPr>
@@ -1116,7 +1116,7 @@
                 <w:shd w:fill="auto" w:val="clear"/>
                 <w:rtl w:val="0"/>
               </w:rPr>
-              <w:t xml:space="preserve">1.119,26 €</w:t>
+              <w:t xml:space="preserve">1.086,00 €</w:t>
             </w:r>
             <w:r>
               <w:rPr>
@@ -1517,7 +1517,7 @@
                 <w:shd w:fill="auto" w:val="clear"/>
                 <w:rtl w:val="0"/>
               </w:rPr>
-              <w:t xml:space="preserve">- 10 km Kilometerpauschale</w:t>
+              <w:t xml:space="preserve">- 60 km Kilometerpauschale</w:t>
             </w:r>
             <w:r>
               <w:rPr>
@@ -1579,7 +1579,7 @@
             <w:pPr>
               <w:spacing w:after="0" w:before="0" w:line="278.00000000000006" w:lineRule="auto"/>
               <w:ind w:left="0" w:right="314" w:firstLine="0"/>
-              <w:jc w:val="right"/>
+              <w:jc w:val="left"/>
               <w:rPr>
                 <w:rFonts w:ascii="Calibri" w:cs="Calibri" w:eastAsia="Calibri" w:hAnsi="Calibri"/>
                 <w:color w:val="000000"/>
@@ -1623,7 +1623,7 @@
     <w:tbl>
       <w:tblPr>
         <w:tblStyle w:val="Table3"/>
-        <w:tblW w:w="9780.0" w:type="dxa"/>
+        <w:tblW w:w="10050.0" w:type="dxa"/>
         <w:jc w:val="left"/>
         <w:tblInd w:w="1.0000000000000009" w:type="dxa"/>
         <w:tblLayout w:type="fixed"/>
@@ -1631,199 +1631,20 @@
       </w:tblPr>
       <w:tblGrid>
         <w:gridCol w:w="675"/>
-        <w:gridCol w:w="1020"/>
-        <w:gridCol w:w="4275"/>
-        <w:gridCol w:w="2220"/>
-        <w:gridCol w:w="1590"/>
+        <w:gridCol w:w="780"/>
+        <w:gridCol w:w="4515"/>
+        <w:gridCol w:w="2325"/>
+        <w:gridCol w:w="1755"/>
         <w:tblGridChange w:id="0">
           <w:tblGrid>
             <w:gridCol w:w="675"/>
-            <w:gridCol w:w="1020"/>
-            <w:gridCol w:w="4275"/>
-            <w:gridCol w:w="2220"/>
-            <w:gridCol w:w="1590"/>
+            <w:gridCol w:w="780"/>
+            <w:gridCol w:w="4515"/>
+            <w:gridCol w:w="2325"/>
+            <w:gridCol w:w="1755"/>
           </w:tblGrid>
         </w:tblGridChange>
       </w:tblGrid>
-      <w:tr>
-        <w:trPr>
-          <w:cantSplit w:val="0"/>
-          <w:trHeight w:val="1" w:hRule="atLeast"/>
-          <w:tblHeader w:val="0"/>
-        </w:trPr>
-        <w:tc>
-          <w:tcPr>
-            <w:tcBorders>
-              <w:top w:color="cccccc" w:space="0" w:sz="8" w:val="single"/>
-              <w:left w:color="cccccc" w:space="0" w:sz="8" w:val="single"/>
-              <w:bottom w:color="ffffff" w:space="0" w:sz="8" w:val="single"/>
-              <w:right w:color="cccccc" w:space="0" w:sz="8" w:val="single"/>
-            </w:tcBorders>
-            <w:shd w:fill="cccccc" w:val="clear"/>
-          </w:tcPr>
-          <w:p>
-            <w:pPr>
-              <w:spacing w:after="0" w:before="0" w:line="240" w:lineRule="auto"/>
-              <w:ind w:left="0" w:right="0" w:firstLine="0"/>
-              <w:jc w:val="left"/>
-              <w:rPr/>
-            </w:pPr>
-            <w:r>
-              <w:rPr>
-                <w:rFonts w:ascii="Open Sans" w:cs="Open Sans" w:eastAsia="Open Sans" w:hAnsi="Open Sans"/>
-                <w:color w:val="070707"/>
-                <w:shd w:fill="auto" w:val="clear"/>
-                <w:rtl w:val="0"/>
-              </w:rPr>
-              <w:t xml:space="preserve">Pos</w:t>
-            </w:r>
-            <w:r>
-              <w:rPr>
-                <w:rtl w:val="0"/>
-              </w:rPr>
-            </w:r>
-          </w:p>
-        </w:tc>
-        <w:tc>
-          <w:tcPr>
-            <w:tcBorders>
-              <w:top w:color="cccccc" w:space="0" w:sz="8" w:val="single"/>
-              <w:left w:color="cccccc" w:space="0" w:sz="8" w:val="single"/>
-              <w:bottom w:color="ffffff" w:space="0" w:sz="8" w:val="single"/>
-              <w:right w:color="cccccc" w:space="0" w:sz="8" w:val="single"/>
-            </w:tcBorders>
-            <w:shd w:fill="cccccc" w:val="clear"/>
-          </w:tcPr>
-          <w:p>
-            <w:pPr>
-              <w:spacing w:after="0" w:before="0" w:line="240" w:lineRule="auto"/>
-              <w:ind w:left="0" w:right="0" w:firstLine="0"/>
-              <w:jc w:val="left"/>
-              <w:rPr/>
-            </w:pPr>
-            <w:r>
-              <w:rPr>
-                <w:rFonts w:ascii="Open Sans" w:cs="Open Sans" w:eastAsia="Open Sans" w:hAnsi="Open Sans"/>
-                <w:color w:val="070707"/>
-                <w:shd w:fill="auto" w:val="clear"/>
-                <w:rtl w:val="0"/>
-              </w:rPr>
-              <w:t xml:space="preserve">Menge</w:t>
-            </w:r>
-            <w:r>
-              <w:rPr>
-                <w:rtl w:val="0"/>
-              </w:rPr>
-            </w:r>
-          </w:p>
-        </w:tc>
-        <w:tc>
-          <w:tcPr>
-            <w:tcBorders>
-              <w:top w:color="cccccc" w:space="0" w:sz="8" w:val="single"/>
-              <w:left w:color="cccccc" w:space="0" w:sz="8" w:val="single"/>
-              <w:bottom w:color="ffffff" w:space="0" w:sz="8" w:val="single"/>
-              <w:right w:color="cccccc" w:space="0" w:sz="8" w:val="single"/>
-            </w:tcBorders>
-            <w:shd w:fill="cccccc" w:val="clear"/>
-          </w:tcPr>
-          <w:p>
-            <w:pPr>
-              <w:spacing w:after="0" w:before="0" w:line="278.00000000000006" w:lineRule="auto"/>
-              <w:ind w:left="0" w:right="314" w:firstLine="0"/>
-              <w:jc w:val="left"/>
-              <w:rPr>
-                <w:color w:val="000000"/>
-              </w:rPr>
-            </w:pPr>
-            <w:r>
-              <w:rPr>
-                <w:rFonts w:ascii="Open Sans" w:cs="Open Sans" w:eastAsia="Open Sans" w:hAnsi="Open Sans"/>
-                <w:color w:val="000000"/>
-                <w:shd w:fill="auto" w:val="clear"/>
-                <w:rtl w:val="0"/>
-              </w:rPr>
-              <w:t xml:space="preserve">Bezeichnung</w:t>
-            </w:r>
-            <w:r>
-              <w:rPr>
-                <w:rtl w:val="0"/>
-              </w:rPr>
-            </w:r>
-          </w:p>
-        </w:tc>
-        <w:tc>
-          <w:tcPr>
-            <w:tcBorders>
-              <w:top w:color="cccccc" w:space="0" w:sz="8" w:val="single"/>
-              <w:left w:color="cccccc" w:space="0" w:sz="8" w:val="single"/>
-              <w:bottom w:color="ffffff" w:space="0" w:sz="8" w:val="single"/>
-              <w:right w:color="cccccc" w:space="0" w:sz="8" w:val="single"/>
-            </w:tcBorders>
-            <w:shd w:fill="cccccc" w:val="clear"/>
-          </w:tcPr>
-          <w:p>
-            <w:pPr>
-              <w:spacing w:after="0" w:before="0" w:line="278.00000000000006" w:lineRule="auto"/>
-              <w:ind w:left="0" w:right="314" w:firstLine="0"/>
-              <w:jc w:val="center"/>
-              <w:rPr>
-                <w:color w:val="000000"/>
-              </w:rPr>
-            </w:pPr>
-            <w:r>
-              <w:rPr>
-                <w:rFonts w:ascii="Open Sans" w:cs="Open Sans" w:eastAsia="Open Sans" w:hAnsi="Open Sans"/>
-                <w:color w:val="000000"/>
-                <w:shd w:fill="auto" w:val="clear"/>
-                <w:rtl w:val="0"/>
-              </w:rPr>
-              <w:t xml:space="preserve">Einheitspreis</w:t>
-            </w:r>
-            <w:r>
-              <w:rPr>
-                <w:rtl w:val="0"/>
-              </w:rPr>
-            </w:r>
-          </w:p>
-        </w:tc>
-        <w:tc>
-          <w:tcPr>
-            <w:tcBorders>
-              <w:top w:color="cccccc" w:space="0" w:sz="8" w:val="single"/>
-              <w:left w:color="cccccc" w:space="0" w:sz="8" w:val="single"/>
-              <w:bottom w:color="ffffff" w:space="0" w:sz="8" w:val="single"/>
-              <w:right w:color="cccccc" w:space="0" w:sz="8" w:val="single"/>
-            </w:tcBorders>
-            <w:shd w:fill="cccccc" w:val="clear"/>
-            <w:vAlign w:val="center"/>
-          </w:tcPr>
-          <w:p>
-            <w:pPr>
-              <w:spacing w:after="0" w:before="0" w:line="278.00000000000006" w:lineRule="auto"/>
-              <w:ind w:left="0" w:right="314" w:firstLine="0"/>
-              <w:jc w:val="center"/>
-              <w:rPr>
-                <w:color w:val="000000"/>
-              </w:rPr>
-            </w:pPr>
-            <w:r>
-              <w:rPr>
-                <w:rFonts w:ascii="Open Sans" w:cs="Open Sans" w:eastAsia="Open Sans" w:hAnsi="Open Sans"/>
-                <w:color w:val="000000"/>
-                <w:shd w:fill="auto" w:val="clear"/>
-                <w:rtl w:val="0"/>
-              </w:rPr>
-              <w:t xml:space="preserve">Gesamt</w:t>
-            </w:r>
-            <w:r>
-              <w:rPr>
-                <w:rtl w:val="0"/>
-              </w:rPr>
-            </w:r>
-          </w:p>
-        </w:tc>
-      </w:tr>
       <w:tr>
         <w:trPr>
           <w:cantSplit w:val="0"/>
@@ -1982,8 +1803,514 @@
                 <w:shd w:fill="auto" w:val="clear"/>
                 <w:rtl w:val="0"/>
               </w:rPr>
-              <w:t xml:space="preserve">2.567,94 €</w:t>
-            </w:r>
+              <w:t xml:space="preserve">3.134,48 €</w:t>
+            </w:r>
+            <w:r>
+              <w:rPr>
+                <w:rtl w:val="0"/>
+              </w:rPr>
+            </w:r>
+          </w:p>
+        </w:tc>
+        <w:tc>
+          <w:tcPr>
+            <w:tcBorders>
+              <w:top w:color="ffffff" w:space="0" w:sz="8" w:val="single"/>
+              <w:left w:color="ffffff" w:space="0" w:sz="8" w:val="single"/>
+              <w:bottom w:color="ffffff" w:space="0" w:sz="8" w:val="single"/>
+              <w:right w:color="ffffff" w:space="0" w:sz="8" w:val="single"/>
+            </w:tcBorders>
+            <w:shd w:fill="ffffff" w:val="clear"/>
+            <w:tcMar>
+              <w:left w:w="0.0" w:type="dxa"/>
+              <w:right w:w="0.0" w:type="dxa"/>
+            </w:tcMar>
+          </w:tcPr>
+          <w:p>
+            <w:pPr>
+              <w:jc w:val="center"/>
+              <w:rPr/>
+            </w:pPr>
+            <w:r>
+              <w:rPr>
+                <w:rtl w:val="0"/>
+              </w:rPr>
+              <w:t xml:space="preserve">3.134,48 €</w:t>
+            </w:r>
+            <w:r>
+              <w:rPr>
+                <w:rtl w:val="0"/>
+              </w:rPr>
+            </w:r>
+          </w:p>
+        </w:tc>
+      </w:tr>
+      <w:tr>
+        <w:trPr>
+          <w:cantSplit w:val="0"/>
+          <w:trHeight w:val="1" w:hRule="atLeast"/>
+          <w:tblHeader w:val="0"/>
+        </w:trPr>
+        <w:tc>
+          <w:tcPr>
+            <w:tcBorders>
+              <w:top w:color="ffffff" w:space="0" w:sz="8" w:val="single"/>
+              <w:left w:color="ffffff" w:space="0" w:sz="8" w:val="single"/>
+              <w:bottom w:color="ffffff" w:space="0" w:sz="8" w:val="single"/>
+              <w:right w:color="ffffff" w:space="0" w:sz="8" w:val="single"/>
+            </w:tcBorders>
+            <w:shd w:fill="ffffff" w:val="clear"/>
+            <w:tcMar>
+              <w:left w:w="56.0" w:type="dxa"/>
+              <w:right w:w="56.0" w:type="dxa"/>
+            </w:tcMar>
+          </w:tcPr>
+          <w:p>
+            <w:pPr>
+              <w:spacing w:after="0" w:before="0" w:line="240" w:lineRule="auto"/>
+              <w:ind w:left="0" w:right="0" w:firstLine="0"/>
+              <w:jc w:val="left"/>
+              <w:rPr>
+                <w:rFonts w:ascii="Calibri" w:cs="Calibri" w:eastAsia="Calibri" w:hAnsi="Calibri"/>
+                <w:color w:val="000000"/>
+                <w:sz w:val="22"/>
+                <w:szCs w:val="22"/>
+                <w:shd w:fill="auto" w:val="clear"/>
+              </w:rPr>
+            </w:pPr>
+            <w:r>
+              <w:rPr>
+                <w:rtl w:val="0"/>
+              </w:rPr>
+            </w:r>
+          </w:p>
+        </w:tc>
+        <w:tc>
+          <w:tcPr>
+            <w:tcBorders>
+              <w:top w:color="ffffff" w:space="0" w:sz="8" w:val="single"/>
+              <w:left w:color="ffffff" w:space="0" w:sz="8" w:val="single"/>
+              <w:bottom w:color="ffffff" w:space="0" w:sz="8" w:val="single"/>
+              <w:right w:color="ffffff" w:space="0" w:sz="8" w:val="single"/>
+            </w:tcBorders>
+            <w:shd w:fill="ffffff" w:val="clear"/>
+            <w:tcMar>
+              <w:left w:w="56.0" w:type="dxa"/>
+              <w:right w:w="56.0" w:type="dxa"/>
+            </w:tcMar>
+          </w:tcPr>
+          <w:p>
+            <w:pPr>
+              <w:spacing w:after="0" w:before="0" w:line="240" w:lineRule="auto"/>
+              <w:ind w:left="0" w:right="0" w:firstLine="0"/>
+              <w:jc w:val="left"/>
+              <w:rPr>
+                <w:rFonts w:ascii="Calibri" w:cs="Calibri" w:eastAsia="Calibri" w:hAnsi="Calibri"/>
+                <w:color w:val="000000"/>
+                <w:sz w:val="22"/>
+                <w:szCs w:val="22"/>
+                <w:shd w:fill="auto" w:val="clear"/>
+              </w:rPr>
+            </w:pPr>
+            <w:r>
+              <w:rPr>
+                <w:rtl w:val="0"/>
+              </w:rPr>
+            </w:r>
+          </w:p>
+        </w:tc>
+        <w:tc>
+          <w:tcPr>
+            <w:tcBorders>
+              <w:top w:color="ffffff" w:space="0" w:sz="8" w:val="single"/>
+              <w:left w:color="ffffff" w:space="0" w:sz="8" w:val="single"/>
+              <w:bottom w:color="ffffff" w:space="0" w:sz="8" w:val="single"/>
+              <w:right w:color="ffffff" w:space="0" w:sz="8" w:val="single"/>
+            </w:tcBorders>
+            <w:shd w:fill="ffffff" w:val="clear"/>
+            <w:tcMar>
+              <w:left w:w="56.0" w:type="dxa"/>
+              <w:right w:w="56.0" w:type="dxa"/>
+            </w:tcMar>
+          </w:tcPr>
+          <w:p>
+            <w:pPr>
+              <w:spacing w:after="0" w:before="0" w:line="278.00000000000006" w:lineRule="auto"/>
+              <w:ind w:left="0" w:right="314" w:firstLine="0"/>
+              <w:jc w:val="left"/>
+              <w:rPr>
+                <w:rFonts w:ascii="Open Sans" w:cs="Open Sans" w:eastAsia="Open Sans" w:hAnsi="Open Sans"/>
+                <w:color w:val="000000"/>
+                <w:sz w:val="18"/>
+                <w:szCs w:val="18"/>
+                <w:shd w:fill="auto" w:val="clear"/>
+              </w:rPr>
+            </w:pPr>
+            <w:r>
+              <w:rPr>
+                <w:rFonts w:ascii="Open Sans" w:cs="Open Sans" w:eastAsia="Open Sans" w:hAnsi="Open Sans"/>
+                <w:color w:val="000000"/>
+                <w:sz w:val="18"/>
+                <w:szCs w:val="18"/>
+                <w:shd w:fill="auto" w:val="clear"/>
+                <w:rtl w:val="0"/>
+              </w:rPr>
+              <w:t xml:space="preserve">- 1 Stk TRINNITY Wannenabdichtband-Set 3,4 m Nass-/Trockenanbindung entspr. DIN 18534</w:t>
+            </w:r>
+          </w:p>
+          <w:p>
+            <w:pPr>
+              <w:spacing w:after="0" w:before="0" w:line="278.00000000000006" w:lineRule="auto"/>
+              <w:ind w:left="0" w:right="314" w:firstLine="0"/>
+              <w:jc w:val="left"/>
+              <w:rPr>
+                <w:rFonts w:ascii="Open Sans" w:cs="Open Sans" w:eastAsia="Open Sans" w:hAnsi="Open Sans"/>
+                <w:color w:val="000000"/>
+                <w:sz w:val="18"/>
+                <w:szCs w:val="18"/>
+                <w:shd w:fill="auto" w:val="clear"/>
+              </w:rPr>
+            </w:pPr>
+            <w:r>
+              <w:rPr>
+                <w:rFonts w:ascii="Open Sans" w:cs="Open Sans" w:eastAsia="Open Sans" w:hAnsi="Open Sans"/>
+                <w:color w:val="000000"/>
+                <w:sz w:val="18"/>
+                <w:szCs w:val="18"/>
+                <w:shd w:fill="auto" w:val="clear"/>
+                <w:rtl w:val="0"/>
+              </w:rPr>
+              <w:t xml:space="preserve">- 1 Stk Ablaufgarnitur Rohbauset m. Sifon BH60mm f. Flache Duschw. m. 90mm Ablauf TRINNITY</w:t>
+            </w:r>
+          </w:p>
+          <w:p>
+            <w:pPr>
+              <w:spacing w:after="0" w:before="0" w:line="278.00000000000006" w:lineRule="auto"/>
+              <w:ind w:left="0" w:right="314" w:firstLine="0"/>
+              <w:jc w:val="left"/>
+              <w:rPr>
+                <w:rFonts w:ascii="Open Sans" w:cs="Open Sans" w:eastAsia="Open Sans" w:hAnsi="Open Sans"/>
+                <w:color w:val="000000"/>
+                <w:sz w:val="18"/>
+                <w:szCs w:val="18"/>
+                <w:shd w:fill="auto" w:val="clear"/>
+              </w:rPr>
+            </w:pPr>
+            <w:r>
+              <w:rPr>
+                <w:rFonts w:ascii="Open Sans" w:cs="Open Sans" w:eastAsia="Open Sans" w:hAnsi="Open Sans"/>
+                <w:color w:val="000000"/>
+                <w:sz w:val="18"/>
+                <w:szCs w:val="18"/>
+                <w:shd w:fill="auto" w:val="clear"/>
+                <w:rtl w:val="0"/>
+              </w:rPr>
+              <w:t xml:space="preserve">- 1 Stk Kleinmaterial groß</w:t>
+            </w:r>
+          </w:p>
+          <w:p>
+            <w:pPr>
+              <w:spacing w:after="0" w:before="0" w:line="278.00000000000006" w:lineRule="auto"/>
+              <w:ind w:left="0" w:right="314" w:firstLine="0"/>
+              <w:jc w:val="left"/>
+              <w:rPr>
+                <w:rFonts w:ascii="Open Sans" w:cs="Open Sans" w:eastAsia="Open Sans" w:hAnsi="Open Sans"/>
+                <w:color w:val="000000"/>
+                <w:sz w:val="18"/>
+                <w:szCs w:val="18"/>
+                <w:shd w:fill="auto" w:val="clear"/>
+              </w:rPr>
+            </w:pPr>
+            <w:r>
+              <w:rPr>
+                <w:rFonts w:ascii="Open Sans" w:cs="Open Sans" w:eastAsia="Open Sans" w:hAnsi="Open Sans"/>
+                <w:color w:val="000000"/>
+                <w:sz w:val="18"/>
+                <w:szCs w:val="18"/>
+                <w:shd w:fill="auto" w:val="clear"/>
+                <w:rtl w:val="0"/>
+              </w:rPr>
+              <w:t xml:space="preserve">- 10 Stk Fußboden-Paneele (1 Paneele = 0.3 m² )</w:t>
+            </w:r>
+          </w:p>
+          <w:p>
+            <w:pPr>
+              <w:spacing w:after="0" w:before="0" w:line="278.00000000000006" w:lineRule="auto"/>
+              <w:ind w:left="0" w:right="314" w:firstLine="0"/>
+              <w:jc w:val="left"/>
+              <w:rPr>
+                <w:rFonts w:ascii="Open Sans" w:cs="Open Sans" w:eastAsia="Open Sans" w:hAnsi="Open Sans"/>
+                <w:color w:val="000000"/>
+                <w:sz w:val="18"/>
+                <w:szCs w:val="18"/>
+                <w:shd w:fill="auto" w:val="clear"/>
+              </w:rPr>
+            </w:pPr>
+            <w:r>
+              <w:rPr>
+                <w:rFonts w:ascii="Open Sans" w:cs="Open Sans" w:eastAsia="Open Sans" w:hAnsi="Open Sans"/>
+                <w:color w:val="000000"/>
+                <w:sz w:val="18"/>
+                <w:szCs w:val="18"/>
+                <w:shd w:fill="auto" w:val="clear"/>
+                <w:rtl w:val="0"/>
+              </w:rPr>
+              <w:t xml:space="preserve">- 4 Pkg Flächenkleber (1 Pkg je 0,60 m²)</w:t>
+            </w:r>
+          </w:p>
+          <w:p>
+            <w:pPr>
+              <w:spacing w:after="0" w:before="0" w:line="278.00000000000006" w:lineRule="auto"/>
+              <w:ind w:left="0" w:right="314" w:firstLine="0"/>
+              <w:jc w:val="left"/>
+              <w:rPr>
+                <w:rFonts w:ascii="Open Sans" w:cs="Open Sans" w:eastAsia="Open Sans" w:hAnsi="Open Sans"/>
+                <w:color w:val="000000"/>
+                <w:sz w:val="18"/>
+                <w:szCs w:val="18"/>
+                <w:shd w:fill="auto" w:val="clear"/>
+              </w:rPr>
+            </w:pPr>
+            <w:r>
+              <w:rPr>
+                <w:rFonts w:ascii="Open Sans" w:cs="Open Sans" w:eastAsia="Open Sans" w:hAnsi="Open Sans"/>
+                <w:color w:val="000000"/>
+                <w:sz w:val="18"/>
+                <w:szCs w:val="18"/>
+                <w:shd w:fill="auto" w:val="clear"/>
+                <w:rtl w:val="0"/>
+              </w:rPr>
+              <w:t xml:space="preserve">- 3 Stk Wandverkleidung 3.0 Alu 1497×2550 mm — Farbe: Marmor weiß</w:t>
+            </w:r>
+          </w:p>
+          <w:p>
+            <w:pPr>
+              <w:spacing w:after="0" w:before="0" w:line="278.00000000000006" w:lineRule="auto"/>
+              <w:ind w:left="0" w:right="314" w:firstLine="0"/>
+              <w:jc w:val="left"/>
+              <w:rPr>
+                <w:rFonts w:ascii="Open Sans" w:cs="Open Sans" w:eastAsia="Open Sans" w:hAnsi="Open Sans"/>
+                <w:color w:val="000000"/>
+                <w:sz w:val="18"/>
+                <w:szCs w:val="18"/>
+                <w:shd w:fill="auto" w:val="clear"/>
+              </w:rPr>
+            </w:pPr>
+            <w:r>
+              <w:rPr>
+                <w:rFonts w:ascii="Open Sans" w:cs="Open Sans" w:eastAsia="Open Sans" w:hAnsi="Open Sans"/>
+                <w:color w:val="000000"/>
+                <w:sz w:val="18"/>
+                <w:szCs w:val="18"/>
+                <w:shd w:fill="auto" w:val="clear"/>
+                <w:rtl w:val="0"/>
+              </w:rPr>
+              <w:t xml:space="preserve">- 1 Stk TRINNITY Wandabdichtung BASIS-Set 5 qm DW bis 100 x 100 / BW bis 180 x 80 cm</w:t>
+            </w:r>
+          </w:p>
+          <w:p>
+            <w:pPr>
+              <w:spacing w:after="0" w:before="0" w:line="278.00000000000006" w:lineRule="auto"/>
+              <w:ind w:left="0" w:right="314" w:firstLine="0"/>
+              <w:jc w:val="left"/>
+              <w:rPr>
+                <w:rFonts w:ascii="Open Sans" w:cs="Open Sans" w:eastAsia="Open Sans" w:hAnsi="Open Sans"/>
+                <w:color w:val="000000"/>
+                <w:sz w:val="18"/>
+                <w:szCs w:val="18"/>
+                <w:shd w:fill="auto" w:val="clear"/>
+              </w:rPr>
+            </w:pPr>
+            <w:r>
+              <w:rPr>
+                <w:rFonts w:ascii="Open Sans" w:cs="Open Sans" w:eastAsia="Open Sans" w:hAnsi="Open Sans"/>
+                <w:color w:val="000000"/>
+                <w:sz w:val="18"/>
+                <w:szCs w:val="18"/>
+                <w:shd w:fill="auto" w:val="clear"/>
+                <w:rtl w:val="0"/>
+              </w:rPr>
+              <w:t xml:space="preserve">- 4 Stk Wandverkleidungsklebstoff 3.0/4.0</w:t>
+            </w:r>
+          </w:p>
+          <w:p>
+            <w:pPr>
+              <w:spacing w:after="0" w:before="0" w:line="278.00000000000006" w:lineRule="auto"/>
+              <w:ind w:left="0" w:right="314" w:firstLine="0"/>
+              <w:jc w:val="left"/>
+              <w:rPr>
+                <w:rFonts w:ascii="Open Sans" w:cs="Open Sans" w:eastAsia="Open Sans" w:hAnsi="Open Sans"/>
+                <w:color w:val="000000"/>
+                <w:sz w:val="18"/>
+                <w:szCs w:val="18"/>
+                <w:shd w:fill="auto" w:val="clear"/>
+              </w:rPr>
+            </w:pPr>
+            <w:r>
+              <w:rPr>
+                <w:rFonts w:ascii="Open Sans" w:cs="Open Sans" w:eastAsia="Open Sans" w:hAnsi="Open Sans"/>
+                <w:color w:val="000000"/>
+                <w:sz w:val="18"/>
+                <w:szCs w:val="18"/>
+                <w:shd w:fill="auto" w:val="clear"/>
+                <w:rtl w:val="0"/>
+              </w:rPr>
+              <w:t xml:space="preserve">- 2 Stk Abschlussprofil 3.0 255 cm silber eloxiert VIGOUR</w:t>
+            </w:r>
+          </w:p>
+          <w:p>
+            <w:pPr>
+              <w:spacing w:after="0" w:before="0" w:line="278.00000000000006" w:lineRule="auto"/>
+              <w:ind w:left="0" w:right="314" w:firstLine="0"/>
+              <w:jc w:val="left"/>
+              <w:rPr>
+                <w:rFonts w:ascii="Open Sans" w:cs="Open Sans" w:eastAsia="Open Sans" w:hAnsi="Open Sans"/>
+                <w:color w:val="000000"/>
+                <w:sz w:val="18"/>
+                <w:szCs w:val="18"/>
+                <w:shd w:fill="auto" w:val="clear"/>
+              </w:rPr>
+            </w:pPr>
+            <w:r>
+              <w:rPr>
+                <w:rFonts w:ascii="Open Sans" w:cs="Open Sans" w:eastAsia="Open Sans" w:hAnsi="Open Sans"/>
+                <w:color w:val="000000"/>
+                <w:sz w:val="18"/>
+                <w:szCs w:val="18"/>
+                <w:shd w:fill="auto" w:val="clear"/>
+                <w:rtl w:val="0"/>
+              </w:rPr>
+              <w:t xml:space="preserve">- 2 Stk Verbindungsprofil(e) (Plattenanzahl - 1)</w:t>
+            </w:r>
+          </w:p>
+          <w:p>
+            <w:pPr>
+              <w:spacing w:after="0" w:before="0" w:line="278.00000000000006" w:lineRule="auto"/>
+              <w:ind w:left="0" w:right="314" w:firstLine="0"/>
+              <w:jc w:val="left"/>
+              <w:rPr>
+                <w:rFonts w:ascii="Open Sans" w:cs="Open Sans" w:eastAsia="Open Sans" w:hAnsi="Open Sans"/>
+                <w:color w:val="000000"/>
+                <w:sz w:val="18"/>
+                <w:szCs w:val="18"/>
+                <w:shd w:fill="auto" w:val="clear"/>
+              </w:rPr>
+            </w:pPr>
+            <w:r>
+              <w:rPr>
+                <w:rFonts w:ascii="Open Sans" w:cs="Open Sans" w:eastAsia="Open Sans" w:hAnsi="Open Sans"/>
+                <w:color w:val="000000"/>
+                <w:sz w:val="18"/>
+                <w:szCs w:val="18"/>
+                <w:shd w:fill="auto" w:val="clear"/>
+                <w:rtl w:val="0"/>
+              </w:rPr>
+              <w:t xml:space="preserve">- 2 Stk Profilklebstoff (pro Abschlussprofil 1 Stk)</w:t>
+            </w:r>
+          </w:p>
+          <w:p>
+            <w:pPr>
+              <w:spacing w:after="0" w:before="0" w:line="278.00000000000006" w:lineRule="auto"/>
+              <w:ind w:left="0" w:right="314" w:firstLine="0"/>
+              <w:jc w:val="left"/>
+              <w:rPr>
+                <w:rFonts w:ascii="Open Sans" w:cs="Open Sans" w:eastAsia="Open Sans" w:hAnsi="Open Sans"/>
+                <w:color w:val="000000"/>
+                <w:sz w:val="18"/>
+                <w:szCs w:val="18"/>
+                <w:shd w:fill="auto" w:val="clear"/>
+              </w:rPr>
+            </w:pPr>
+            <w:r>
+              <w:rPr>
+                <w:rFonts w:ascii="Open Sans" w:cs="Open Sans" w:eastAsia="Open Sans" w:hAnsi="Open Sans"/>
+                <w:color w:val="000000"/>
+                <w:sz w:val="18"/>
+                <w:szCs w:val="18"/>
+                <w:shd w:fill="auto" w:val="clear"/>
+                <w:rtl w:val="0"/>
+              </w:rPr>
+              <w:t xml:space="preserve">- 1 Stk Duschsystem derby Thermostat m KB 250mm HB 3.2 3-fach edge u. Schl. verchr. VIG (verchromt)</w:t>
+            </w:r>
+          </w:p>
+          <w:p>
+            <w:pPr>
+              <w:spacing w:after="0" w:before="0" w:line="278.00000000000006" w:lineRule="auto"/>
+              <w:ind w:left="0" w:right="314" w:firstLine="0"/>
+              <w:jc w:val="left"/>
+              <w:rPr>
+                <w:rFonts w:ascii="Open Sans" w:cs="Open Sans" w:eastAsia="Open Sans" w:hAnsi="Open Sans"/>
+                <w:color w:val="000000"/>
+                <w:sz w:val="18"/>
+                <w:szCs w:val="18"/>
+                <w:shd w:fill="auto" w:val="clear"/>
+              </w:rPr>
+            </w:pPr>
+            <w:r>
+              <w:rPr>
+                <w:rFonts w:ascii="Open Sans" w:cs="Open Sans" w:eastAsia="Open Sans" w:hAnsi="Open Sans"/>
+                <w:color w:val="000000"/>
+                <w:sz w:val="18"/>
+                <w:szCs w:val="18"/>
+                <w:shd w:fill="auto" w:val="clear"/>
+                <w:rtl w:val="0"/>
+              </w:rPr>
+              <w:t xml:space="preserve">- 1 Stk Sonderduschabtrennung Hassmann</w:t>
+            </w:r>
+          </w:p>
+          <w:p>
+            <w:pPr>
+              <w:spacing w:after="0" w:before="0" w:line="278.00000000000006" w:lineRule="auto"/>
+              <w:ind w:left="0" w:right="314" w:firstLine="0"/>
+              <w:jc w:val="left"/>
+              <w:rPr>
+                <w:rFonts w:ascii="Open Sans" w:cs="Open Sans" w:eastAsia="Open Sans" w:hAnsi="Open Sans"/>
+                <w:color w:val="000000"/>
+                <w:sz w:val="18"/>
+                <w:szCs w:val="18"/>
+                <w:shd w:fill="auto" w:val="clear"/>
+              </w:rPr>
+            </w:pPr>
+            <w:r>
+              <w:rPr>
+                <w:rFonts w:ascii="Open Sans" w:cs="Open Sans" w:eastAsia="Open Sans" w:hAnsi="Open Sans"/>
+                <w:color w:val="000000"/>
+                <w:sz w:val="18"/>
+                <w:szCs w:val="18"/>
+                <w:shd w:fill="auto" w:val="clear"/>
+                <w:rtl w:val="0"/>
+              </w:rPr>
+              <w:t xml:space="preserve">- 1 Stk Duschwanne 100 x 80 x 3 cm</w:t>
+            </w:r>
+          </w:p>
+        </w:tc>
+        <w:tc>
+          <w:tcPr>
+            <w:tcBorders>
+              <w:top w:color="ffffff" w:space="0" w:sz="8" w:val="single"/>
+              <w:left w:color="ffffff" w:space="0" w:sz="8" w:val="single"/>
+              <w:bottom w:color="ffffff" w:space="0" w:sz="8" w:val="single"/>
+              <w:right w:color="ffffff" w:space="0" w:sz="8" w:val="single"/>
+            </w:tcBorders>
+            <w:shd w:fill="ffffff" w:val="clear"/>
+            <w:tcMar>
+              <w:left w:w="56.0" w:type="dxa"/>
+              <w:right w:w="56.0" w:type="dxa"/>
+            </w:tcMar>
+          </w:tcPr>
+          <w:p>
+            <w:pPr>
+              <w:spacing w:after="0" w:before="0" w:line="278.00000000000006" w:lineRule="auto"/>
+              <w:ind w:left="0" w:right="314" w:firstLine="0"/>
+              <w:jc w:val="left"/>
+              <w:rPr>
+                <w:rFonts w:ascii="Calibri" w:cs="Calibri" w:eastAsia="Calibri" w:hAnsi="Calibri"/>
+                <w:color w:val="000000"/>
+                <w:sz w:val="22"/>
+                <w:szCs w:val="22"/>
+                <w:shd w:fill="auto" w:val="clear"/>
+              </w:rPr>
+            </w:pPr>
             <w:r>
               <w:rPr>
                 <w:rtl w:val="0"/>
@@ -2009,23 +2336,16 @@
           <w:p>
             <w:pPr>
               <w:spacing w:after="0" w:before="0" w:line="278.00000000000006" w:lineRule="auto"/>
-              <w:ind w:left="-141" w:right="314" w:firstLine="0"/>
-              <w:jc w:val="center"/>
-              <w:rPr>
-                <w:color w:val="000000"/>
-              </w:rPr>
-            </w:pPr>
-            <w:r>
-              <w:rPr>
-                <w:rFonts w:ascii="Open Sans" w:cs="Open Sans" w:eastAsia="Open Sans" w:hAnsi="Open Sans"/>
-                <w:color w:val="000000"/>
-                <w:sz w:val="20"/>
-                <w:szCs w:val="20"/>
-                <w:shd w:fill="auto" w:val="clear"/>
-                <w:rtl w:val="0"/>
-              </w:rPr>
-              <w:t xml:space="preserve">2.567,94 €</w:t>
-            </w:r>
+              <w:ind w:left="0" w:right="314" w:firstLine="0"/>
+              <w:jc w:val="left"/>
+              <w:rPr>
+                <w:rFonts w:ascii="Calibri" w:cs="Calibri" w:eastAsia="Calibri" w:hAnsi="Calibri"/>
+                <w:color w:val="000000"/>
+                <w:sz w:val="22"/>
+                <w:szCs w:val="22"/>
+                <w:shd w:fill="auto" w:val="clear"/>
+              </w:rPr>
+            </w:pPr>
             <w:r>
               <w:rPr>
                 <w:rtl w:val="0"/>
@@ -2056,17 +2376,24 @@
           </w:tcPr>
           <w:p>
             <w:pPr>
-              <w:spacing w:after="0" w:before="0" w:line="240" w:lineRule="auto"/>
-              <w:ind w:left="0" w:right="0" w:firstLine="0"/>
-              <w:jc w:val="left"/>
-              <w:rPr>
-                <w:rFonts w:ascii="Calibri" w:cs="Calibri" w:eastAsia="Calibri" w:hAnsi="Calibri"/>
-                <w:color w:val="000000"/>
-                <w:sz w:val="22"/>
-                <w:szCs w:val="22"/>
-                <w:shd w:fill="auto" w:val="clear"/>
-              </w:rPr>
-            </w:pPr>
+              <w:spacing w:after="0" w:before="0" w:line="278.00000000000006" w:lineRule="auto"/>
+              <w:ind w:left="0" w:right="-26" w:firstLine="0"/>
+              <w:jc w:val="left"/>
+              <w:rPr>
+                <w:color w:val="000000"/>
+              </w:rPr>
+            </w:pPr>
+            <w:r>
+              <w:rPr>
+                <w:rFonts w:ascii="Open Sans" w:cs="Open Sans" w:eastAsia="Open Sans" w:hAnsi="Open Sans"/>
+                <w:color w:val="000000"/>
+                <w:sz w:val="20"/>
+                <w:szCs w:val="20"/>
+                <w:shd w:fill="auto" w:val="clear"/>
+                <w:rtl w:val="0"/>
+              </w:rPr>
+              <w:t xml:space="preserve">003</w:t>
+            </w:r>
             <w:r>
               <w:rPr>
                 <w:rtl w:val="0"/>
@@ -2090,17 +2417,24 @@
           </w:tcPr>
           <w:p>
             <w:pPr>
-              <w:spacing w:after="0" w:before="0" w:line="240" w:lineRule="auto"/>
-              <w:ind w:left="0" w:right="0" w:firstLine="0"/>
-              <w:jc w:val="left"/>
-              <w:rPr>
-                <w:rFonts w:ascii="Calibri" w:cs="Calibri" w:eastAsia="Calibri" w:hAnsi="Calibri"/>
-                <w:color w:val="000000"/>
-                <w:sz w:val="22"/>
-                <w:szCs w:val="22"/>
-                <w:shd w:fill="auto" w:val="clear"/>
-              </w:rPr>
-            </w:pPr>
+              <w:spacing w:after="0" w:before="0" w:line="278.00000000000006" w:lineRule="auto"/>
+              <w:ind w:left="0" w:right="314" w:firstLine="0"/>
+              <w:jc w:val="left"/>
+              <w:rPr>
+                <w:color w:val="000000"/>
+              </w:rPr>
+            </w:pPr>
+            <w:r>
+              <w:rPr>
+                <w:rFonts w:ascii="Open Sans" w:cs="Open Sans" w:eastAsia="Open Sans" w:hAnsi="Open Sans"/>
+                <w:color w:val="000000"/>
+                <w:sz w:val="20"/>
+                <w:szCs w:val="20"/>
+                <w:shd w:fill="auto" w:val="clear"/>
+                <w:rtl w:val="0"/>
+              </w:rPr>
+              <w:t xml:space="preserve">1 Stk</w:t>
+            </w:r>
             <w:r>
               <w:rPr>
                 <w:rtl w:val="0"/>
@@ -2129,22 +2463,24 @@
               <w:jc w:val="left"/>
               <w:rPr>
                 <w:rFonts w:ascii="Open Sans" w:cs="Open Sans" w:eastAsia="Open Sans" w:hAnsi="Open Sans"/>
-                <w:color w:val="000000"/>
-                <w:sz w:val="18"/>
-                <w:szCs w:val="18"/>
-                <w:shd w:fill="auto" w:val="clear"/>
-              </w:rPr>
-            </w:pPr>
-            <w:r>
-              <w:rPr>
-                <w:rFonts w:ascii="Open Sans" w:cs="Open Sans" w:eastAsia="Open Sans" w:hAnsi="Open Sans"/>
-                <w:color w:val="000000"/>
-                <w:sz w:val="18"/>
-                <w:szCs w:val="18"/>
-                <w:shd w:fill="auto" w:val="clear"/>
-                <w:rtl w:val="0"/>
-              </w:rPr>
-              <w:t xml:space="preserve">- 1 Stk TRINNITY Wannenabdichtband-Set 3,4 m Nass-/Trockenanbindung entspr. DIN 18534</w:t>
+                <w:b w:val="1"/>
+                <w:color w:val="000000"/>
+                <w:sz w:val="18"/>
+                <w:szCs w:val="18"/>
+                <w:shd w:fill="auto" w:val="clear"/>
+              </w:rPr>
+            </w:pPr>
+            <w:r>
+              <w:rPr>
+                <w:rFonts w:ascii="Open Sans" w:cs="Open Sans" w:eastAsia="Open Sans" w:hAnsi="Open Sans"/>
+                <w:b w:val="1"/>
+                <w:color w:val="000000"/>
+                <w:sz w:val="18"/>
+                <w:szCs w:val="18"/>
+                <w:shd w:fill="auto" w:val="clear"/>
+                <w:rtl w:val="0"/>
+              </w:rPr>
+              <w:t xml:space="preserve">Aktion: Haltegriff</w:t>
             </w:r>
           </w:p>
           <w:p>
@@ -2153,323 +2489,26 @@
               <w:ind w:left="0" w:right="314" w:firstLine="0"/>
               <w:jc w:val="left"/>
               <w:rPr>
-                <w:rFonts w:ascii="Open Sans" w:cs="Open Sans" w:eastAsia="Open Sans" w:hAnsi="Open Sans"/>
-                <w:color w:val="000000"/>
-                <w:sz w:val="18"/>
-                <w:szCs w:val="18"/>
-                <w:shd w:fill="auto" w:val="clear"/>
-              </w:rPr>
-            </w:pPr>
-            <w:r>
-              <w:rPr>
-                <w:rFonts w:ascii="Open Sans" w:cs="Open Sans" w:eastAsia="Open Sans" w:hAnsi="Open Sans"/>
-                <w:color w:val="000000"/>
-                <w:sz w:val="18"/>
-                <w:szCs w:val="18"/>
-                <w:shd w:fill="auto" w:val="clear"/>
-                <w:rtl w:val="0"/>
-              </w:rPr>
-              <w:t xml:space="preserve">- 1 Stk Ablaufgarnitur Rohbauset m. Sifon BH60mm f. Flache Duschw. m. 90mm Ablauf TRINNITY</w:t>
-            </w:r>
-          </w:p>
-          <w:p>
-            <w:pPr>
-              <w:spacing w:after="0" w:before="0" w:line="278.00000000000006" w:lineRule="auto"/>
-              <w:ind w:left="0" w:right="314" w:firstLine="0"/>
-              <w:jc w:val="left"/>
-              <w:rPr>
-                <w:rFonts w:ascii="Open Sans" w:cs="Open Sans" w:eastAsia="Open Sans" w:hAnsi="Open Sans"/>
-                <w:color w:val="000000"/>
-                <w:sz w:val="18"/>
-                <w:szCs w:val="18"/>
-                <w:shd w:fill="auto" w:val="clear"/>
-              </w:rPr>
-            </w:pPr>
-            <w:r>
-              <w:rPr>
-                <w:rFonts w:ascii="Open Sans" w:cs="Open Sans" w:eastAsia="Open Sans" w:hAnsi="Open Sans"/>
-                <w:color w:val="000000"/>
-                <w:sz w:val="18"/>
-                <w:szCs w:val="18"/>
-                <w:shd w:fill="auto" w:val="clear"/>
-                <w:rtl w:val="0"/>
-              </w:rPr>
-              <w:t xml:space="preserve">- 1 Stk Kleinmaterial groß</w:t>
-            </w:r>
-          </w:p>
-          <w:p>
-            <w:pPr>
-              <w:spacing w:after="0" w:before="0" w:line="278.00000000000006" w:lineRule="auto"/>
-              <w:ind w:left="0" w:right="314" w:firstLine="0"/>
-              <w:jc w:val="left"/>
-              <w:rPr>
-                <w:rFonts w:ascii="Open Sans" w:cs="Open Sans" w:eastAsia="Open Sans" w:hAnsi="Open Sans"/>
-                <w:color w:val="000000"/>
-                <w:sz w:val="18"/>
-                <w:szCs w:val="18"/>
-                <w:shd w:fill="auto" w:val="clear"/>
-              </w:rPr>
-            </w:pPr>
-            <w:r>
-              <w:rPr>
-                <w:rFonts w:ascii="Open Sans" w:cs="Open Sans" w:eastAsia="Open Sans" w:hAnsi="Open Sans"/>
-                <w:color w:val="000000"/>
-                <w:sz w:val="18"/>
-                <w:szCs w:val="18"/>
-                <w:shd w:fill="auto" w:val="clear"/>
-                <w:rtl w:val="0"/>
-              </w:rPr>
-              <w:t xml:space="preserve">- 1 Stk Stelzlager höhenverstellar Set</w:t>
-            </w:r>
-          </w:p>
-          <w:p>
-            <w:pPr>
-              <w:spacing w:after="0" w:before="0" w:line="278.00000000000006" w:lineRule="auto"/>
-              <w:ind w:left="0" w:right="314" w:firstLine="0"/>
-              <w:jc w:val="left"/>
-              <w:rPr>
-                <w:rFonts w:ascii="Open Sans" w:cs="Open Sans" w:eastAsia="Open Sans" w:hAnsi="Open Sans"/>
-                <w:color w:val="000000"/>
-                <w:sz w:val="18"/>
-                <w:szCs w:val="18"/>
-                <w:shd w:fill="auto" w:val="clear"/>
-              </w:rPr>
-            </w:pPr>
-            <w:r>
-              <w:rPr>
-                <w:rFonts w:ascii="Open Sans" w:cs="Open Sans" w:eastAsia="Open Sans" w:hAnsi="Open Sans"/>
-                <w:color w:val="000000"/>
-                <w:sz w:val="18"/>
-                <w:szCs w:val="18"/>
-                <w:shd w:fill="auto" w:val="clear"/>
-                <w:rtl w:val="0"/>
-              </w:rPr>
-              <w:t xml:space="preserve">- 10 Stk Fußboden-Paneele (1 Paneele = 0.3 m² )</w:t>
-            </w:r>
-          </w:p>
-          <w:p>
-            <w:pPr>
-              <w:spacing w:after="0" w:before="0" w:line="278.00000000000006" w:lineRule="auto"/>
-              <w:ind w:left="0" w:right="314" w:firstLine="0"/>
-              <w:jc w:val="left"/>
-              <w:rPr>
-                <w:rFonts w:ascii="Open Sans" w:cs="Open Sans" w:eastAsia="Open Sans" w:hAnsi="Open Sans"/>
-                <w:color w:val="000000"/>
-                <w:sz w:val="18"/>
-                <w:szCs w:val="18"/>
-                <w:shd w:fill="auto" w:val="clear"/>
-              </w:rPr>
-            </w:pPr>
-            <w:r>
-              <w:rPr>
-                <w:rFonts w:ascii="Open Sans" w:cs="Open Sans" w:eastAsia="Open Sans" w:hAnsi="Open Sans"/>
-                <w:color w:val="000000"/>
-                <w:sz w:val="18"/>
-                <w:szCs w:val="18"/>
-                <w:shd w:fill="auto" w:val="clear"/>
-                <w:rtl w:val="0"/>
-              </w:rPr>
-              <w:t xml:space="preserve">- 4 Pkg Flächenkleber (1 Pkg je 0,60 m²)</w:t>
-            </w:r>
-          </w:p>
-          <w:p>
-            <w:pPr>
-              <w:spacing w:after="0" w:before="0" w:line="278.00000000000006" w:lineRule="auto"/>
-              <w:ind w:left="0" w:right="314" w:firstLine="0"/>
-              <w:jc w:val="left"/>
-              <w:rPr>
-                <w:rFonts w:ascii="Open Sans" w:cs="Open Sans" w:eastAsia="Open Sans" w:hAnsi="Open Sans"/>
-                <w:color w:val="000000"/>
-                <w:sz w:val="18"/>
-                <w:szCs w:val="18"/>
-                <w:shd w:fill="auto" w:val="clear"/>
-              </w:rPr>
-            </w:pPr>
-            <w:r>
-              <w:rPr>
-                <w:rFonts w:ascii="Open Sans" w:cs="Open Sans" w:eastAsia="Open Sans" w:hAnsi="Open Sans"/>
-                <w:color w:val="000000"/>
-                <w:sz w:val="18"/>
-                <w:szCs w:val="18"/>
-                <w:shd w:fill="auto" w:val="clear"/>
-                <w:rtl w:val="0"/>
-              </w:rPr>
-              <w:t xml:space="preserve">- 1 Stk Wandverkleidung 3.0 Alu 1497×2550 mm — Farbe: Marmor weiß</w:t>
-            </w:r>
-          </w:p>
-          <w:p>
-            <w:pPr>
-              <w:spacing w:after="0" w:before="0" w:line="278.00000000000006" w:lineRule="auto"/>
-              <w:ind w:left="0" w:right="314" w:firstLine="0"/>
-              <w:jc w:val="left"/>
-              <w:rPr>
-                <w:rFonts w:ascii="Open Sans" w:cs="Open Sans" w:eastAsia="Open Sans" w:hAnsi="Open Sans"/>
-                <w:color w:val="000000"/>
-                <w:sz w:val="18"/>
-                <w:szCs w:val="18"/>
-                <w:shd w:fill="auto" w:val="clear"/>
-              </w:rPr>
-            </w:pPr>
-            <w:r>
-              <w:rPr>
-                <w:rFonts w:ascii="Open Sans" w:cs="Open Sans" w:eastAsia="Open Sans" w:hAnsi="Open Sans"/>
-                <w:color w:val="000000"/>
-                <w:sz w:val="18"/>
-                <w:szCs w:val="18"/>
-                <w:shd w:fill="auto" w:val="clear"/>
-                <w:rtl w:val="0"/>
-              </w:rPr>
-              <w:t xml:space="preserve">- 1 Stk TRINNITY Wandabdichtung BASIS-Set 5 qm DW bis 100 x 100 / BW bis 180 x 80 cm</w:t>
-            </w:r>
-          </w:p>
-          <w:p>
-            <w:pPr>
-              <w:spacing w:after="0" w:before="0" w:line="278.00000000000006" w:lineRule="auto"/>
-              <w:ind w:left="0" w:right="314" w:firstLine="0"/>
-              <w:jc w:val="left"/>
-              <w:rPr>
-                <w:rFonts w:ascii="Open Sans" w:cs="Open Sans" w:eastAsia="Open Sans" w:hAnsi="Open Sans"/>
-                <w:color w:val="000000"/>
-                <w:sz w:val="18"/>
-                <w:szCs w:val="18"/>
-                <w:shd w:fill="auto" w:val="clear"/>
-              </w:rPr>
-            </w:pPr>
-            <w:r>
-              <w:rPr>
-                <w:rFonts w:ascii="Open Sans" w:cs="Open Sans" w:eastAsia="Open Sans" w:hAnsi="Open Sans"/>
-                <w:color w:val="000000"/>
-                <w:sz w:val="18"/>
-                <w:szCs w:val="18"/>
-                <w:shd w:fill="auto" w:val="clear"/>
-                <w:rtl w:val="0"/>
-              </w:rPr>
-              <w:t xml:space="preserve">- 4 Stk Wandverkleidungsklebstoff 3.0/4.0</w:t>
-            </w:r>
-          </w:p>
-          <w:p>
-            <w:pPr>
-              <w:spacing w:after="0" w:before="0" w:line="278.00000000000006" w:lineRule="auto"/>
-              <w:ind w:left="0" w:right="314" w:firstLine="0"/>
-              <w:jc w:val="left"/>
-              <w:rPr>
-                <w:rFonts w:ascii="Open Sans" w:cs="Open Sans" w:eastAsia="Open Sans" w:hAnsi="Open Sans"/>
-                <w:color w:val="000000"/>
-                <w:sz w:val="18"/>
-                <w:szCs w:val="18"/>
-                <w:shd w:fill="auto" w:val="clear"/>
-              </w:rPr>
-            </w:pPr>
-            <w:r>
-              <w:rPr>
-                <w:rFonts w:ascii="Open Sans" w:cs="Open Sans" w:eastAsia="Open Sans" w:hAnsi="Open Sans"/>
-                <w:color w:val="000000"/>
-                <w:sz w:val="18"/>
-                <w:szCs w:val="18"/>
-                <w:shd w:fill="auto" w:val="clear"/>
-                <w:rtl w:val="0"/>
-              </w:rPr>
-              <w:t xml:space="preserve">- 2 Stk Abschlussprofil 3.0 255 cm silber eloxiert VIGOUR</w:t>
-            </w:r>
-          </w:p>
-          <w:p>
-            <w:pPr>
-              <w:spacing w:after="0" w:before="0" w:line="278.00000000000006" w:lineRule="auto"/>
-              <w:ind w:left="0" w:right="314" w:firstLine="0"/>
-              <w:jc w:val="left"/>
-              <w:rPr>
-                <w:rFonts w:ascii="Open Sans" w:cs="Open Sans" w:eastAsia="Open Sans" w:hAnsi="Open Sans"/>
-                <w:color w:val="000000"/>
-                <w:sz w:val="18"/>
-                <w:szCs w:val="18"/>
-                <w:shd w:fill="auto" w:val="clear"/>
-              </w:rPr>
-            </w:pPr>
-            <w:r>
-              <w:rPr>
-                <w:rFonts w:ascii="Open Sans" w:cs="Open Sans" w:eastAsia="Open Sans" w:hAnsi="Open Sans"/>
-                <w:color w:val="000000"/>
-                <w:sz w:val="18"/>
-                <w:szCs w:val="18"/>
-                <w:shd w:fill="auto" w:val="clear"/>
-                <w:rtl w:val="0"/>
-              </w:rPr>
-              <w:t xml:space="preserve">- 2 Stk Profilklebstoff (pro Abschlussprofil 1 Stk)</w:t>
-            </w:r>
-          </w:p>
-          <w:p>
-            <w:pPr>
-              <w:spacing w:after="0" w:before="0" w:line="278.00000000000006" w:lineRule="auto"/>
-              <w:ind w:left="0" w:right="314" w:firstLine="0"/>
-              <w:jc w:val="left"/>
-              <w:rPr>
-                <w:rFonts w:ascii="Open Sans" w:cs="Open Sans" w:eastAsia="Open Sans" w:hAnsi="Open Sans"/>
-                <w:color w:val="000000"/>
-                <w:sz w:val="18"/>
-                <w:szCs w:val="18"/>
-                <w:shd w:fill="auto" w:val="clear"/>
-              </w:rPr>
-            </w:pPr>
-            <w:r>
-              <w:rPr>
-                <w:rFonts w:ascii="Open Sans" w:cs="Open Sans" w:eastAsia="Open Sans" w:hAnsi="Open Sans"/>
-                <w:color w:val="000000"/>
-                <w:sz w:val="18"/>
-                <w:szCs w:val="18"/>
-                <w:shd w:fill="auto" w:val="clear"/>
-                <w:rtl w:val="0"/>
-              </w:rPr>
-              <w:t xml:space="preserve">- 1 Stk Duschsystem derby Thermostat m KB 250mm HB 3.2 3-fach edge u. Schl. verchr. VIG (verchromt)</w:t>
-            </w:r>
-          </w:p>
-          <w:p>
-            <w:pPr>
-              <w:spacing w:after="0" w:before="0" w:line="278.00000000000006" w:lineRule="auto"/>
-              <w:ind w:left="0" w:right="314" w:firstLine="0"/>
-              <w:jc w:val="left"/>
-              <w:rPr>
-                <w:rFonts w:ascii="Open Sans" w:cs="Open Sans" w:eastAsia="Open Sans" w:hAnsi="Open Sans"/>
-                <w:color w:val="000000"/>
-                <w:sz w:val="18"/>
-                <w:szCs w:val="18"/>
-                <w:shd w:fill="auto" w:val="clear"/>
-              </w:rPr>
-            </w:pPr>
-            <w:r>
-              <w:rPr>
-                <w:rFonts w:ascii="Open Sans" w:cs="Open Sans" w:eastAsia="Open Sans" w:hAnsi="Open Sans"/>
-                <w:color w:val="000000"/>
-                <w:sz w:val="18"/>
-                <w:szCs w:val="18"/>
-                <w:shd w:fill="auto" w:val="clear"/>
-                <w:rtl w:val="0"/>
-              </w:rPr>
-              <w:t xml:space="preserve">- 1 Stk Sonderduschabtrennung Hassmann</w:t>
-            </w:r>
-          </w:p>
-          <w:p>
-            <w:pPr>
-              <w:spacing w:after="0" w:before="0" w:line="278.00000000000006" w:lineRule="auto"/>
-              <w:ind w:left="0" w:right="314" w:firstLine="0"/>
-              <w:jc w:val="left"/>
-              <w:rPr>
-                <w:rFonts w:ascii="Open Sans" w:cs="Open Sans" w:eastAsia="Open Sans" w:hAnsi="Open Sans"/>
-                <w:color w:val="000000"/>
-                <w:sz w:val="18"/>
-                <w:szCs w:val="18"/>
-                <w:shd w:fill="auto" w:val="clear"/>
-              </w:rPr>
-            </w:pPr>
-            <w:r>
-              <w:rPr>
-                <w:rFonts w:ascii="Open Sans" w:cs="Open Sans" w:eastAsia="Open Sans" w:hAnsi="Open Sans"/>
-                <w:color w:val="000000"/>
-                <w:sz w:val="18"/>
-                <w:szCs w:val="18"/>
-                <w:shd w:fill="auto" w:val="clear"/>
-                <w:rtl w:val="0"/>
-              </w:rPr>
-              <w:t xml:space="preserve">- 1 Stk Duschwanne 100 x 80 x 3 cm</w:t>
+                <w:color w:val="000000"/>
+                <w:sz w:val="18"/>
+                <w:szCs w:val="18"/>
+              </w:rPr>
+            </w:pPr>
+            <w:r>
+              <w:rPr>
+                <w:rFonts w:ascii="Open Sans" w:cs="Open Sans" w:eastAsia="Open Sans" w:hAnsi="Open Sans"/>
+                <w:color w:val="000000"/>
+                <w:sz w:val="18"/>
+                <w:szCs w:val="18"/>
+                <w:shd w:fill="auto" w:val="clear"/>
+                <w:rtl w:val="0"/>
+              </w:rPr>
+              <w:t xml:space="preserve">1 Haltegriff gratis im Wert von 175 € inkl. Lieferung und Montage</w:t>
+            </w:r>
+            <w:r>
+              <w:rPr>
+                <w:rtl w:val="0"/>
+              </w:rPr>
             </w:r>
           </w:p>
         </w:tc>
@@ -2491,15 +2530,22 @@
             <w:pPr>
               <w:spacing w:after="0" w:before="0" w:line="278.00000000000006" w:lineRule="auto"/>
               <w:ind w:left="0" w:right="314" w:firstLine="0"/>
-              <w:jc w:val="right"/>
-              <w:rPr>
-                <w:rFonts w:ascii="Calibri" w:cs="Calibri" w:eastAsia="Calibri" w:hAnsi="Calibri"/>
-                <w:color w:val="000000"/>
-                <w:sz w:val="22"/>
-                <w:szCs w:val="22"/>
-                <w:shd w:fill="auto" w:val="clear"/>
-              </w:rPr>
-            </w:pPr>
+              <w:jc w:val="left"/>
+              <w:rPr>
+                <w:color w:val="000000"/>
+              </w:rPr>
+            </w:pPr>
+            <w:r>
+              <w:rPr>
+                <w:rFonts w:ascii="Open Sans" w:cs="Open Sans" w:eastAsia="Open Sans" w:hAnsi="Open Sans"/>
+                <w:color w:val="000000"/>
+                <w:sz w:val="20"/>
+                <w:szCs w:val="20"/>
+                <w:shd w:fill="auto" w:val="clear"/>
+                <w:rtl w:val="0"/>
+              </w:rPr>
+              <w:t xml:space="preserve">0,00 €</w:t>
+            </w:r>
             <w:r>
               <w:rPr>
                 <w:rtl w:val="0"/>
@@ -2520,21 +2566,27 @@
               <w:left w:w="56.0" w:type="dxa"/>
               <w:right w:w="56.0" w:type="dxa"/>
             </w:tcMar>
-            <w:vAlign w:val="center"/>
           </w:tcPr>
           <w:p>
             <w:pPr>
               <w:spacing w:after="0" w:before="0" w:line="278.00000000000006" w:lineRule="auto"/>
               <w:ind w:left="0" w:right="314" w:firstLine="0"/>
-              <w:jc w:val="right"/>
-              <w:rPr>
-                <w:rFonts w:ascii="Calibri" w:cs="Calibri" w:eastAsia="Calibri" w:hAnsi="Calibri"/>
-                <w:color w:val="000000"/>
-                <w:sz w:val="22"/>
-                <w:szCs w:val="22"/>
-                <w:shd w:fill="auto" w:val="clear"/>
-              </w:rPr>
-            </w:pPr>
+              <w:jc w:val="center"/>
+              <w:rPr>
+                <w:color w:val="000000"/>
+              </w:rPr>
+            </w:pPr>
+            <w:r>
+              <w:rPr>
+                <w:rFonts w:ascii="Open Sans" w:cs="Open Sans" w:eastAsia="Open Sans" w:hAnsi="Open Sans"/>
+                <w:color w:val="000000"/>
+                <w:sz w:val="20"/>
+                <w:szCs w:val="20"/>
+                <w:shd w:fill="auto" w:val="clear"/>
+                <w:rtl w:val="0"/>
+              </w:rPr>
+              <w:t xml:space="preserve">0,00 €</w:t>
+            </w:r>
             <w:r>
               <w:rPr>
                 <w:rtl w:val="0"/>
@@ -2581,7 +2633,7 @@
                 <w:shd w:fill="auto" w:val="clear"/>
                 <w:rtl w:val="0"/>
               </w:rPr>
-              <w:t xml:space="preserve">003</w:t>
+              <w:t xml:space="preserve">004</w:t>
             </w:r>
             <w:r>
               <w:rPr>
@@ -2669,7 +2721,7 @@
                 <w:shd w:fill="auto" w:val="clear"/>
                 <w:rtl w:val="0"/>
               </w:rPr>
-              <w:t xml:space="preserve">Aktion: Haltegriff</w:t>
+              <w:t xml:space="preserve">Bestandkundenbonus:</w:t>
             </w:r>
           </w:p>
           <w:p>
@@ -2692,7 +2744,7 @@
                 <w:shd w:fill="auto" w:val="clear"/>
                 <w:rtl w:val="0"/>
               </w:rPr>
-              <w:t xml:space="preserve">1 Haltegriff gratis im Wert von 175 € inkl. Lieferung und Montage</w:t>
+              <w:t xml:space="preserve">-- Rabatt von 300 € ab einem Gesamtwert von 3.000</w:t>
             </w:r>
             <w:r>
               <w:rPr>
@@ -2733,7 +2785,7 @@
                 <w:shd w:fill="auto" w:val="clear"/>
                 <w:rtl w:val="0"/>
               </w:rPr>
-              <w:t xml:space="preserve">0,00 €</w:t>
+              <w:t xml:space="preserve">-252,10 €</w:t>
             </w:r>
             <w:r>
               <w:rPr>
@@ -2760,248 +2812,7 @@
             <w:pPr>
               <w:spacing w:after="0" w:before="0" w:line="278.00000000000006" w:lineRule="auto"/>
               <w:ind w:left="0" w:right="314" w:firstLine="0"/>
-              <w:jc w:val="left"/>
-              <w:rPr>
-                <w:color w:val="000000"/>
-              </w:rPr>
-            </w:pPr>
-            <w:r>
-              <w:rPr>
-                <w:rFonts w:ascii="Open Sans" w:cs="Open Sans" w:eastAsia="Open Sans" w:hAnsi="Open Sans"/>
-                <w:color w:val="000000"/>
-                <w:sz w:val="20"/>
-                <w:szCs w:val="20"/>
-                <w:shd w:fill="auto" w:val="clear"/>
-                <w:rtl w:val="0"/>
-              </w:rPr>
-              <w:t xml:space="preserve">0,00 €</w:t>
-            </w:r>
-            <w:r>
-              <w:rPr>
-                <w:rtl w:val="0"/>
-              </w:rPr>
-            </w:r>
-          </w:p>
-        </w:tc>
-      </w:tr>
-      <w:tr>
-        <w:trPr>
-          <w:cantSplit w:val="0"/>
-          <w:trHeight w:val="1" w:hRule="atLeast"/>
-          <w:tblHeader w:val="0"/>
-        </w:trPr>
-        <w:tc>
-          <w:tcPr>
-            <w:tcBorders>
-              <w:top w:color="ffffff" w:space="0" w:sz="8" w:val="single"/>
-              <w:left w:color="ffffff" w:space="0" w:sz="8" w:val="single"/>
-              <w:bottom w:color="ffffff" w:space="0" w:sz="8" w:val="single"/>
-              <w:right w:color="ffffff" w:space="0" w:sz="8" w:val="single"/>
-            </w:tcBorders>
-            <w:shd w:fill="ffffff" w:val="clear"/>
-            <w:tcMar>
-              <w:left w:w="56.0" w:type="dxa"/>
-              <w:right w:w="56.0" w:type="dxa"/>
-            </w:tcMar>
-          </w:tcPr>
-          <w:p>
-            <w:pPr>
-              <w:spacing w:after="0" w:before="0" w:line="278.00000000000006" w:lineRule="auto"/>
-              <w:ind w:left="0" w:right="-26" w:firstLine="0"/>
-              <w:jc w:val="left"/>
-              <w:rPr>
-                <w:color w:val="000000"/>
-              </w:rPr>
-            </w:pPr>
-            <w:r>
-              <w:rPr>
-                <w:rFonts w:ascii="Open Sans" w:cs="Open Sans" w:eastAsia="Open Sans" w:hAnsi="Open Sans"/>
-                <w:color w:val="000000"/>
-                <w:sz w:val="20"/>
-                <w:szCs w:val="20"/>
-                <w:shd w:fill="auto" w:val="clear"/>
-                <w:rtl w:val="0"/>
-              </w:rPr>
-              <w:t xml:space="preserve">004</w:t>
-            </w:r>
-            <w:r>
-              <w:rPr>
-                <w:rtl w:val="0"/>
-              </w:rPr>
-            </w:r>
-          </w:p>
-        </w:tc>
-        <w:tc>
-          <w:tcPr>
-            <w:tcBorders>
-              <w:top w:color="ffffff" w:space="0" w:sz="8" w:val="single"/>
-              <w:left w:color="ffffff" w:space="0" w:sz="8" w:val="single"/>
-              <w:bottom w:color="ffffff" w:space="0" w:sz="8" w:val="single"/>
-              <w:right w:color="ffffff" w:space="0" w:sz="8" w:val="single"/>
-            </w:tcBorders>
-            <w:shd w:fill="ffffff" w:val="clear"/>
-            <w:tcMar>
-              <w:left w:w="56.0" w:type="dxa"/>
-              <w:right w:w="56.0" w:type="dxa"/>
-            </w:tcMar>
-          </w:tcPr>
-          <w:p>
-            <w:pPr>
-              <w:spacing w:after="0" w:before="0" w:line="278.00000000000006" w:lineRule="auto"/>
-              <w:ind w:left="0" w:right="314" w:firstLine="0"/>
-              <w:jc w:val="left"/>
-              <w:rPr>
-                <w:color w:val="000000"/>
-              </w:rPr>
-            </w:pPr>
-            <w:r>
-              <w:rPr>
-                <w:rFonts w:ascii="Open Sans" w:cs="Open Sans" w:eastAsia="Open Sans" w:hAnsi="Open Sans"/>
-                <w:color w:val="000000"/>
-                <w:sz w:val="20"/>
-                <w:szCs w:val="20"/>
-                <w:shd w:fill="auto" w:val="clear"/>
-                <w:rtl w:val="0"/>
-              </w:rPr>
-              <w:t xml:space="preserve">1 Stk</w:t>
-            </w:r>
-            <w:r>
-              <w:rPr>
-                <w:rtl w:val="0"/>
-              </w:rPr>
-            </w:r>
-          </w:p>
-        </w:tc>
-        <w:tc>
-          <w:tcPr>
-            <w:tcBorders>
-              <w:top w:color="ffffff" w:space="0" w:sz="8" w:val="single"/>
-              <w:left w:color="ffffff" w:space="0" w:sz="8" w:val="single"/>
-              <w:bottom w:color="ffffff" w:space="0" w:sz="8" w:val="single"/>
-              <w:right w:color="ffffff" w:space="0" w:sz="8" w:val="single"/>
-            </w:tcBorders>
-            <w:shd w:fill="ffffff" w:val="clear"/>
-            <w:tcMar>
-              <w:left w:w="56.0" w:type="dxa"/>
-              <w:right w:w="56.0" w:type="dxa"/>
-            </w:tcMar>
-          </w:tcPr>
-          <w:p>
-            <w:pPr>
-              <w:spacing w:after="0" w:before="0" w:line="278.00000000000006" w:lineRule="auto"/>
-              <w:ind w:left="0" w:right="314" w:firstLine="0"/>
-              <w:jc w:val="left"/>
-              <w:rPr>
-                <w:rFonts w:ascii="Open Sans" w:cs="Open Sans" w:eastAsia="Open Sans" w:hAnsi="Open Sans"/>
-                <w:b w:val="1"/>
-                <w:color w:val="000000"/>
-                <w:sz w:val="18"/>
-                <w:szCs w:val="18"/>
-                <w:shd w:fill="auto" w:val="clear"/>
-              </w:rPr>
-            </w:pPr>
-            <w:r>
-              <w:rPr>
-                <w:rFonts w:ascii="Open Sans" w:cs="Open Sans" w:eastAsia="Open Sans" w:hAnsi="Open Sans"/>
-                <w:b w:val="1"/>
-                <w:color w:val="000000"/>
-                <w:sz w:val="18"/>
-                <w:szCs w:val="18"/>
-                <w:shd w:fill="auto" w:val="clear"/>
-                <w:rtl w:val="0"/>
-              </w:rPr>
-              <w:t xml:space="preserve">Bestandkundenbonus:</w:t>
-            </w:r>
-          </w:p>
-          <w:p>
-            <w:pPr>
-              <w:spacing w:after="0" w:before="0" w:line="278.00000000000006" w:lineRule="auto"/>
-              <w:ind w:left="0" w:right="314" w:firstLine="0"/>
-              <w:jc w:val="left"/>
-              <w:rPr>
-                <w:color w:val="000000"/>
-                <w:sz w:val="18"/>
-                <w:szCs w:val="18"/>
-              </w:rPr>
-            </w:pPr>
-            <w:r>
-              <w:rPr>
-                <w:rFonts w:ascii="Open Sans" w:cs="Open Sans" w:eastAsia="Open Sans" w:hAnsi="Open Sans"/>
-                <w:color w:val="000000"/>
-                <w:sz w:val="18"/>
-                <w:szCs w:val="18"/>
-                <w:shd w:fill="auto" w:val="clear"/>
-                <w:rtl w:val="0"/>
-              </w:rPr>
-              <w:t xml:space="preserve">-- Rabatt von 300 € ab einem Gesamtwert von 3.000</w:t>
-            </w:r>
-            <w:r>
-              <w:rPr>
-                <w:rtl w:val="0"/>
-              </w:rPr>
-            </w:r>
-          </w:p>
-        </w:tc>
-        <w:tc>
-          <w:tcPr>
-            <w:tcBorders>
-              <w:top w:color="ffffff" w:space="0" w:sz="8" w:val="single"/>
-              <w:left w:color="ffffff" w:space="0" w:sz="8" w:val="single"/>
-              <w:bottom w:color="ffffff" w:space="0" w:sz="8" w:val="single"/>
-              <w:right w:color="ffffff" w:space="0" w:sz="8" w:val="single"/>
-            </w:tcBorders>
-            <w:shd w:fill="ffffff" w:val="clear"/>
-            <w:tcMar>
-              <w:left w:w="56.0" w:type="dxa"/>
-              <w:right w:w="56.0" w:type="dxa"/>
-            </w:tcMar>
-          </w:tcPr>
-          <w:p>
-            <w:pPr>
-              <w:spacing w:after="0" w:before="0" w:line="278.00000000000006" w:lineRule="auto"/>
-              <w:ind w:left="0" w:right="314" w:firstLine="0"/>
-              <w:jc w:val="left"/>
-              <w:rPr>
-                <w:color w:val="000000"/>
-              </w:rPr>
-            </w:pPr>
-            <w:r>
-              <w:rPr>
-                <w:rFonts w:ascii="Open Sans" w:cs="Open Sans" w:eastAsia="Open Sans" w:hAnsi="Open Sans"/>
-                <w:color w:val="000000"/>
-                <w:sz w:val="20"/>
-                <w:szCs w:val="20"/>
-                <w:shd w:fill="auto" w:val="clear"/>
-                <w:rtl w:val="0"/>
-              </w:rPr>
-              <w:t xml:space="preserve">-252,10 €</w:t>
-            </w:r>
-            <w:r>
-              <w:rPr>
-                <w:rtl w:val="0"/>
-              </w:rPr>
-            </w:r>
-          </w:p>
-        </w:tc>
-        <w:tc>
-          <w:tcPr>
-            <w:tcBorders>
-              <w:top w:color="ffffff" w:space="0" w:sz="8" w:val="single"/>
-              <w:left w:color="ffffff" w:space="0" w:sz="8" w:val="single"/>
-              <w:bottom w:color="ffffff" w:space="0" w:sz="8" w:val="single"/>
-              <w:right w:color="ffffff" w:space="0" w:sz="8" w:val="single"/>
-            </w:tcBorders>
-            <w:shd w:fill="ffffff" w:val="clear"/>
-            <w:tcMar>
-              <w:left w:w="56.0" w:type="dxa"/>
-              <w:right w:w="56.0" w:type="dxa"/>
-            </w:tcMar>
-          </w:tcPr>
-          <w:p>
-            <w:pPr>
-              <w:spacing w:after="0" w:before="0" w:line="278.00000000000006" w:lineRule="auto"/>
-              <w:ind w:left="0" w:right="314" w:firstLine="0"/>
-              <w:jc w:val="left"/>
+              <w:jc w:val="center"/>
               <w:rPr>
                 <w:color w:val="000000"/>
               </w:rPr>
@@ -3220,7 +3031,7 @@
                 <w:shd w:fill="auto" w:val="clear"/>
                 <w:rtl w:val="0"/>
               </w:rPr>
-              <w:t xml:space="preserve">4.572,01 €</w:t>
+              <w:t xml:space="preserve">4.918,39 €</w:t>
             </w:r>
             <w:r>
               <w:rPr>
@@ -3389,7 +3200,7 @@
                 <w:shd w:fill="auto" w:val="clear"/>
                 <w:rtl w:val="0"/>
               </w:rPr>
-              <w:t xml:space="preserve">868,68 €</w:t>
+              <w:t xml:space="preserve">934,49 €</w:t>
             </w:r>
             <w:r>
               <w:rPr>
@@ -3558,7 +3369,7 @@
                 <w:shd w:fill="auto" w:val="clear"/>
                 <w:rtl w:val="0"/>
               </w:rPr>
-              <w:t xml:space="preserve">5.440,69 €</w:t>
+              <w:t xml:space="preserve">5.852,88 €</w:t>
             </w:r>
             <w:r>
               <w:rPr>
@@ -3694,7 +3505,6 @@
       <w:pPr>
         <w:spacing w:after="0" w:before="0" w:line="283" w:lineRule="auto"/>
         <w:ind w:left="125" w:right="1024" w:firstLine="0"/>
-        <w:jc w:val="both"/>
         <w:rPr>
           <w:rFonts w:ascii="Open Sans" w:cs="Open Sans" w:eastAsia="Open Sans" w:hAnsi="Open Sans"/>
           <w:b w:val="1"/>
@@ -3714,22 +3524,15 @@
           <w:shd w:fill="auto" w:val="clear"/>
           <w:rtl w:val="0"/>
         </w:rPr>
-        <w:t xml:space="preserve">Diese werden vorab mit Ihnen besprochen, bedürfen lhrer Zustimmung und werden auf Regiebasis nach tatsächlichem Aufwand abgerechnet. (Stundensatz-Facharbeiter: 69,50€ netto)</w:t>
-        <w:br w:type="textWrapping"/>
-        <w:br w:type="textWrapping"/>
-        <w:t xml:space="preserve">Der Selbstkostenanteil beträgt </w:t>
+        <w:t xml:space="preserve">Diese werden vorab mit Ihnen besprochen, bedürfen lhrer Zustimmung und</w:t>
       </w:r>
       <w:r>
         <w:rPr>
           <w:rFonts w:ascii="Open Sans" w:cs="Open Sans" w:eastAsia="Open Sans" w:hAnsi="Open Sans"/>
-          <w:b w:val="1"/>
           <w:color w:val="030303"/>
-          <w:sz w:val="22"/>
-          <w:szCs w:val="22"/>
-          <w:shd w:fill="auto" w:val="clear"/>
           <w:rtl w:val="0"/>
         </w:rPr>
-        <w:t xml:space="preserve">1.260,69 €</w:t>
+        <w:t xml:space="preserve"> </w:t>
       </w:r>
       <w:r>
         <w:rPr>
@@ -3740,19 +3543,15 @@
           <w:shd w:fill="auto" w:val="clear"/>
           <w:rtl w:val="0"/>
         </w:rPr>
-        <w:t xml:space="preserve"> unter Berücksichtigung eines gewährten Zuschusses durch die Pflegekasse i.H.v. </w:t>
+        <w:t xml:space="preserve">werden auf Regiebasis nach tatsächlichem Aufwand</w:t>
       </w:r>
       <w:r>
         <w:rPr>
           <w:rFonts w:ascii="Open Sans" w:cs="Open Sans" w:eastAsia="Open Sans" w:hAnsi="Open Sans"/>
-          <w:b w:val="1"/>
           <w:color w:val="030303"/>
-          <w:sz w:val="22"/>
-          <w:szCs w:val="22"/>
-          <w:shd w:fill="auto" w:val="clear"/>
           <w:rtl w:val="0"/>
         </w:rPr>
-        <w:t xml:space="preserve">4.180,00 €</w:t>
+        <w:t xml:space="preserve"> </w:t>
       </w:r>
       <w:r>
         <w:rPr>
@@ -3763,7 +3562,7 @@
           <w:shd w:fill="auto" w:val="clear"/>
           <w:rtl w:val="0"/>
         </w:rPr>
-        <w:t xml:space="preserve">.</w:t>
+        <w:t xml:space="preserve">abgerechnet. (Stundensatz-Facharbeiter: 59,50€ netto)</w:t>
       </w:r>
       <w:r>
         <w:rPr>
@@ -4078,21 +3877,6 @@
 </file>
 
 <file path=word/footer1.xml><?xml version="1.0" encoding="utf-8"?>
-<w:ftr xmlns:mc="http://schemas.openxmlformats.org/markup-compatibility/2006" xmlns:o="urn:schemas-microsoft-com:office:office" xmlns:r="http://schemas.openxmlformats.org/officeDocument/2006/relationships" xmlns:m="http://schemas.openxmlformats.org/officeDocument/2006/math" xmlns:v="urn:schemas-microsoft-com:vml" xmlns:wp="http://schemas.openxmlformats.org/drawingml/2006/wordprocessingDrawing" xmlns:w10="urn:schemas-microsoft-com:office:word" xmlns:w="http://schemas.openxmlformats.org/wordprocessingml/2006/main" xmlns:wne="http://schemas.microsoft.com/office/word/2006/wordml" xmlns:sl="http://schemas.openxmlformats.org/schemaLibrary/2006/main" xmlns:a="http://schemas.openxmlformats.org/drawingml/2006/main" xmlns:pic="http://schemas.openxmlformats.org/drawingml/2006/picture" xmlns:c="http://schemas.openxmlformats.org/drawingml/2006/chart" xmlns:lc="http://schemas.openxmlformats.org/drawingml/2006/lockedCanvas" xmlns:dgm="http://schemas.openxmlformats.org/drawingml/2006/diagram" xmlns:wps="http://schemas.microsoft.com/office/word/2010/wordprocessingShape" xmlns:wpg="http://schemas.microsoft.com/office/word/2010/wordprocessingGroup" xmlns:w14="http://schemas.microsoft.com/office/word/2010/wordml" xmlns:w15="http://schemas.microsoft.com/office/word/2012/wordml" xmlns:w16="http://schemas.microsoft.com/office/word/2018/wordml" xmlns:w16cex="http://schemas.microsoft.com/office/word/2018/wordml/cex" xmlns:w16cid="http://schemas.microsoft.com/office/word/2016/wordml/cid" xmlns="http://schemas.microsoft.com/office/tasks/2019/documenttasks" xmlns:cr="http://schemas.microsoft.com/office/comments/2020/reactions">
-  <w:p>
-    <w:pPr>
-      <w:rPr/>
-    </w:pPr>
-    <w:r>
-      <w:rPr>
-        <w:rtl w:val="0"/>
-      </w:rPr>
-    </w:r>
-  </w:p>
-</w:ftr>
-</file>
-
-<file path=word/footer2.xml><?xml version="1.0" encoding="utf-8"?>
 <w:ftr xmlns:mc="http://schemas.openxmlformats.org/markup-compatibility/2006" xmlns:o="urn:schemas-microsoft-com:office:office" xmlns:r="http://schemas.openxmlformats.org/officeDocument/2006/relationships" xmlns:m="http://schemas.openxmlformats.org/officeDocument/2006/math" xmlns:v="urn:schemas-microsoft-com:vml" xmlns:wp="http://schemas.openxmlformats.org/drawingml/2006/wordprocessingDrawing" xmlns:w10="urn:schemas-microsoft-com:office:word" xmlns:w="http://schemas.openxmlformats.org/wordprocessingml/2006/main" xmlns:wne="http://schemas.microsoft.com/office/word/2006/wordml" xmlns:sl="http://schemas.openxmlformats.org/schemaLibrary/2006/main" xmlns:a="http://schemas.openxmlformats.org/drawingml/2006/main" xmlns:pic="http://schemas.openxmlformats.org/drawingml/2006/picture" xmlns:c="http://schemas.openxmlformats.org/drawingml/2006/chart" xmlns:lc="http://schemas.openxmlformats.org/drawingml/2006/lockedCanvas" xmlns:dgm="http://schemas.openxmlformats.org/drawingml/2006/diagram" xmlns:wps="http://schemas.microsoft.com/office/word/2010/wordprocessingShape" xmlns:wpg="http://schemas.microsoft.com/office/word/2010/wordprocessingGroup" xmlns:w14="http://schemas.microsoft.com/office/word/2010/wordml" xmlns:w15="http://schemas.microsoft.com/office/word/2012/wordml" xmlns:w16="http://schemas.microsoft.com/office/word/2018/wordml" xmlns:w16cex="http://schemas.microsoft.com/office/word/2018/wordml/cex" xmlns:w16cid="http://schemas.microsoft.com/office/word/2016/wordml/cid" xmlns="http://schemas.microsoft.com/office/tasks/2019/documenttasks" xmlns:cr="http://schemas.microsoft.com/office/comments/2020/reactions">
   <w:p>
     <w:pPr>
@@ -4224,7 +4008,6 @@
           <w:pPr>
             <w:keepNext w:val="0"/>
             <w:keepLines w:val="0"/>
-            <w:pageBreakBefore w:val="0"/>
             <w:widowControl w:val="0"/>
             <w:pBdr>
               <w:top w:space="0" w:sz="0" w:val="nil"/>
@@ -4292,6 +4075,21 @@
     <w:pPr>
       <w:spacing w:after="240" w:before="240" w:line="14.399999999999999" w:lineRule="auto"/>
       <w:jc w:val="center"/>
+      <w:rPr/>
+    </w:pPr>
+    <w:r>
+      <w:rPr>
+        <w:rtl w:val="0"/>
+      </w:rPr>
+    </w:r>
+  </w:p>
+</w:ftr>
+</file>
+
+<file path=word/footer2.xml><?xml version="1.0" encoding="utf-8"?>
+<w:ftr xmlns:mc="http://schemas.openxmlformats.org/markup-compatibility/2006" xmlns:o="urn:schemas-microsoft-com:office:office" xmlns:r="http://schemas.openxmlformats.org/officeDocument/2006/relationships" xmlns:m="http://schemas.openxmlformats.org/officeDocument/2006/math" xmlns:v="urn:schemas-microsoft-com:vml" xmlns:wp="http://schemas.openxmlformats.org/drawingml/2006/wordprocessingDrawing" xmlns:w10="urn:schemas-microsoft-com:office:word" xmlns:w="http://schemas.openxmlformats.org/wordprocessingml/2006/main" xmlns:wne="http://schemas.microsoft.com/office/word/2006/wordml" xmlns:sl="http://schemas.openxmlformats.org/schemaLibrary/2006/main" xmlns:a="http://schemas.openxmlformats.org/drawingml/2006/main" xmlns:pic="http://schemas.openxmlformats.org/drawingml/2006/picture" xmlns:c="http://schemas.openxmlformats.org/drawingml/2006/chart" xmlns:lc="http://schemas.openxmlformats.org/drawingml/2006/lockedCanvas" xmlns:dgm="http://schemas.openxmlformats.org/drawingml/2006/diagram" xmlns:wps="http://schemas.microsoft.com/office/word/2010/wordprocessingShape" xmlns:wpg="http://schemas.microsoft.com/office/word/2010/wordprocessingGroup" xmlns:w14="http://schemas.microsoft.com/office/word/2010/wordml" xmlns:w15="http://schemas.microsoft.com/office/word/2012/wordml" xmlns:w16="http://schemas.microsoft.com/office/word/2018/wordml" xmlns:w16cex="http://schemas.microsoft.com/office/word/2018/wordml/cex" xmlns:w16cid="http://schemas.microsoft.com/office/word/2016/wordml/cid" xmlns="http://schemas.microsoft.com/office/tasks/2019/documenttasks" xmlns:cr="http://schemas.microsoft.com/office/comments/2020/reactions">
+  <w:p>
+    <w:pPr>
       <w:rPr/>
     </w:pPr>
     <w:r>
@@ -4559,7 +4357,32 @@
     <w:tblPr>
       <w:tblStyleRowBandSize w:val="1"/>
       <w:tblStyleColBandSize w:val="1"/>
-      <w:tblCellMar/>
+    </w:tblPr>
+  </w:style>
+  <w:style w:type="table" w:styleId="Table2">
+    <w:basedOn w:val="TableNormal"/>
+    <w:tblPr>
+      <w:tblStyleRowBandSize w:val="1"/>
+      <w:tblStyleColBandSize w:val="1"/>
+      <w:tblCellMar>
+        <w:top w:w="0.0" w:type="dxa"/>
+        <w:left w:w="10.0" w:type="dxa"/>
+        <w:bottom w:w="0.0" w:type="dxa"/>
+        <w:right w:w="10.0" w:type="dxa"/>
+      </w:tblCellMar>
+    </w:tblPr>
+  </w:style>
+  <w:style w:type="table" w:styleId="Table3">
+    <w:basedOn w:val="TableNormal"/>
+    <w:tblPr>
+      <w:tblStyleRowBandSize w:val="1"/>
+      <w:tblStyleColBandSize w:val="1"/>
+      <w:tblCellMar>
+        <w:top w:w="0.0" w:type="dxa"/>
+        <w:left w:w="10.0" w:type="dxa"/>
+        <w:bottom w:w="0.0" w:type="dxa"/>
+        <w:right w:w="10.0" w:type="dxa"/>
+      </w:tblCellMar>
     </w:tblPr>
     <w:tblStylePr w:type="band1Horz">
       <w:tcPr/>
@@ -4598,32 +4421,6 @@
       <w:tcPr/>
     </w:tblStylePr>
   </w:style>
-  <w:style w:type="table" w:styleId="Table2">
-    <w:basedOn w:val="TableNormal"/>
-    <w:tblPr>
-      <w:tblStyleRowBandSize w:val="1"/>
-      <w:tblStyleColBandSize w:val="1"/>
-      <w:tblCellMar>
-        <w:top w:w="0.0" w:type="dxa"/>
-        <w:left w:w="10.0" w:type="dxa"/>
-        <w:bottom w:w="0.0" w:type="dxa"/>
-        <w:right w:w="10.0" w:type="dxa"/>
-      </w:tblCellMar>
-    </w:tblPr>
-  </w:style>
-  <w:style w:type="table" w:styleId="Table3">
-    <w:basedOn w:val="TableNormal"/>
-    <w:tblPr>
-      <w:tblStyleRowBandSize w:val="1"/>
-      <w:tblStyleColBandSize w:val="1"/>
-      <w:tblCellMar>
-        <w:top w:w="0.0" w:type="dxa"/>
-        <w:left w:w="10.0" w:type="dxa"/>
-        <w:bottom w:w="0.0" w:type="dxa"/>
-        <w:right w:w="10.0" w:type="dxa"/>
-      </w:tblCellMar>
-    </w:tblPr>
-  </w:style>
   <w:style w:type="table" w:styleId="Table4">
     <w:basedOn w:val="TableNormal"/>
     <w:tblPr>
@@ -4642,44 +4439,7 @@
     <w:tblPr>
       <w:tblStyleRowBandSize w:val="1"/>
       <w:tblStyleColBandSize w:val="1"/>
-      <w:tblCellMar/>
     </w:tblPr>
-    <w:tblStylePr w:type="band1Horz">
-      <w:tcPr/>
-    </w:tblStylePr>
-    <w:tblStylePr w:type="band1Vert">
-      <w:tcPr/>
-    </w:tblStylePr>
-    <w:tblStylePr w:type="band2Horz">
-      <w:tcPr/>
-    </w:tblStylePr>
-    <w:tblStylePr w:type="band2Vert">
-      <w:tcPr/>
-    </w:tblStylePr>
-    <w:tblStylePr w:type="firstCol">
-      <w:tcPr/>
-    </w:tblStylePr>
-    <w:tblStylePr w:type="firstRow">
-      <w:tcPr/>
-    </w:tblStylePr>
-    <w:tblStylePr w:type="lastCol">
-      <w:tcPr/>
-    </w:tblStylePr>
-    <w:tblStylePr w:type="lastRow">
-      <w:tcPr/>
-    </w:tblStylePr>
-    <w:tblStylePr w:type="neCell">
-      <w:tcPr/>
-    </w:tblStylePr>
-    <w:tblStylePr w:type="nwCell">
-      <w:tcPr/>
-    </w:tblStylePr>
-    <w:tblStylePr w:type="seCell">
-      <w:tcPr/>
-    </w:tblStylePr>
-    <w:tblStylePr w:type="swCell">
-      <w:tcPr/>
-    </w:tblStylePr>
   </w:style>
 </w:styles>
 </file>

</xml_diff>

<commit_message>
adding Waschtisch ohne Unterschrank into Auszuführende Arbeiten
</commit_message>
<xml_diff>
--- a/out-Angebot.docx
+++ b/out-Angebot.docx
@@ -112,7 +112,7 @@
                 <w:rFonts w:ascii="Open Sans" w:cs="Open Sans" w:eastAsia="Open Sans" w:hAnsi="Open Sans"/>
                 <w:rtl w:val="0"/>
               </w:rPr>
-              <w:t xml:space="preserve">Frau</w:t>
+              <w:t xml:space="preserve">Herr</w:t>
             </w:r>
           </w:p>
           <w:p>
@@ -310,7 +310,7 @@
                 <w:rFonts w:ascii="Open Sans" w:cs="Open Sans" w:eastAsia="Open Sans" w:hAnsi="Open Sans"/>
                 <w:rtl w:val="0"/>
               </w:rPr>
-              <w:t xml:space="preserve">ANG2025-1009-164106</w:t>
+              <w:t xml:space="preserve">ANG2025-1010-085804</w:t>
             </w:r>
             <w:r>
               <w:rPr>
@@ -578,7 +578,7 @@
           <w:shd w:fill="auto" w:val="clear"/>
           <w:rtl w:val="0"/>
         </w:rPr>
-        <w:t xml:space="preserve">  Ihr Angebot ANG2025-1009-164106</w:t>
+        <w:t xml:space="preserve">  Ihr Angebot ANG2025-1010-085804</w:t>
       </w:r>
     </w:p>
     <w:p>
@@ -603,7 +603,7 @@
           <w:shd w:fill="auto" w:val="clear"/>
           <w:rtl w:val="0"/>
         </w:rPr>
-        <w:t xml:space="preserve">  Sehr geehrte Frau Calderon,</w:t>
+        <w:t xml:space="preserve">  Sehr geehrter Herr Calderon,</w:t>
         <w:br w:type="textWrapping"/>
       </w:r>
     </w:p>
@@ -1276,63 +1276,7 @@
                 <w:shd w:fill="auto" w:val="clear"/>
                 <w:rtl w:val="0"/>
               </w:rPr>
-              <w:t xml:space="preserve">- Auswechseln des Duschsystems</w:t>
-            </w:r>
-            <w:r>
-              <w:rPr>
-                <w:rtl w:val="0"/>
-              </w:rPr>
-            </w:r>
-          </w:p>
-          <w:p>
-            <w:pPr>
-              <w:spacing w:after="0" w:before="0" w:line="278.00000000000006" w:lineRule="auto"/>
-              <w:ind w:left="0" w:right="314" w:firstLine="0"/>
-              <w:jc w:val="left"/>
-              <w:rPr>
-                <w:color w:val="000000"/>
-                <w:sz w:val="18"/>
-                <w:szCs w:val="18"/>
-              </w:rPr>
-            </w:pPr>
-            <w:r>
-              <w:rPr>
-                <w:rFonts w:ascii="Open Sans" w:cs="Open Sans" w:eastAsia="Open Sans" w:hAnsi="Open Sans"/>
-                <w:color w:val="000000"/>
-                <w:sz w:val="18"/>
-                <w:szCs w:val="18"/>
-                <w:shd w:fill="auto" w:val="clear"/>
-                <w:rtl w:val="0"/>
-              </w:rPr>
-              <w:t xml:space="preserve">- Anbringen zusätzlicher Haltegriffe</w:t>
-            </w:r>
-            <w:r>
-              <w:rPr>
-                <w:rtl w:val="0"/>
-              </w:rPr>
-            </w:r>
-          </w:p>
-          <w:p>
-            <w:pPr>
-              <w:spacing w:after="0" w:before="0" w:line="278.00000000000006" w:lineRule="auto"/>
-              <w:ind w:left="0" w:right="314" w:firstLine="0"/>
-              <w:jc w:val="left"/>
-              <w:rPr>
-                <w:color w:val="000000"/>
-                <w:sz w:val="18"/>
-                <w:szCs w:val="18"/>
-              </w:rPr>
-            </w:pPr>
-            <w:r>
-              <w:rPr>
-                <w:rFonts w:ascii="Open Sans" w:cs="Open Sans" w:eastAsia="Open Sans" w:hAnsi="Open Sans"/>
-                <w:color w:val="000000"/>
-                <w:sz w:val="18"/>
-                <w:szCs w:val="18"/>
-                <w:shd w:fill="auto" w:val="clear"/>
-                <w:rtl w:val="0"/>
-              </w:rPr>
-              <w:t xml:space="preserve">- Einbau der Duschwanne</w:t>
+              <w:t xml:space="preserve">- Anbringen zusätzliches Waschbeckens ohne Unterschrank</w:t>
             </w:r>
             <w:r>
               <w:rPr>
@@ -1803,7 +1747,7 @@
                 <w:shd w:fill="auto" w:val="clear"/>
                 <w:rtl w:val="0"/>
               </w:rPr>
-              <w:t xml:space="preserve">2.908,46 €</w:t>
+              <w:t xml:space="preserve">2.651,92 €</w:t>
             </w:r>
             <w:r>
               <w:rPr>
@@ -1835,7 +1779,7 @@
               <w:rPr>
                 <w:rtl w:val="0"/>
               </w:rPr>
-              <w:t xml:space="preserve">2.908,46 €</w:t>
+              <w:t xml:space="preserve">2.651,92 €</w:t>
             </w:r>
             <w:r>
               <w:rPr>
@@ -2255,7 +2199,7 @@
                 <w:shd w:fill="auto" w:val="clear"/>
                 <w:rtl w:val="0"/>
               </w:rPr>
-              <w:t xml:space="preserve">- 1 Stk Duschsystem derby Thermostat m KB 250mm HB 3.2 3-fach edge u. Schl. verchr. VIG (verchromt)</w:t>
+              <w:t xml:space="preserve">- 1 Stk Waschtisch clivia 60x48 cm weiss VIGOUR</w:t>
             </w:r>
           </w:p>
           <w:p>
@@ -2280,7 +2224,57 @@
                 <w:shd w:fill="auto" w:val="clear"/>
                 <w:rtl w:val="0"/>
               </w:rPr>
-              <w:t xml:space="preserve">- 1 Stk Haltegriff clivia plus 32/400mm m. Ros. Edelstahl glatt poliert, VIGOUR</w:t>
+              <w:t xml:space="preserve">- 1 Stk Befestigungssatz Fischer WST 10x140</w:t>
+            </w:r>
+          </w:p>
+          <w:p>
+            <w:pPr>
+              <w:spacing w:after="0" w:before="0" w:line="278.00000000000006" w:lineRule="auto"/>
+              <w:ind w:left="0" w:right="314" w:firstLine="0"/>
+              <w:jc w:val="left"/>
+              <w:rPr>
+                <w:rFonts w:ascii="Open Sans" w:cs="Open Sans" w:eastAsia="Open Sans" w:hAnsi="Open Sans"/>
+                <w:color w:val="000000"/>
+                <w:sz w:val="18"/>
+                <w:szCs w:val="18"/>
+                <w:shd w:fill="auto" w:val="clear"/>
+              </w:rPr>
+            </w:pPr>
+            <w:r>
+              <w:rPr>
+                <w:rFonts w:ascii="Open Sans" w:cs="Open Sans" w:eastAsia="Open Sans" w:hAnsi="Open Sans"/>
+                <w:color w:val="000000"/>
+                <w:sz w:val="18"/>
+                <w:szCs w:val="18"/>
+                <w:shd w:fill="auto" w:val="clear"/>
+                <w:rtl w:val="0"/>
+              </w:rPr>
+              <w:t xml:space="preserve">- 1 Stk Waschtisch-Röhrensiphon 1 1/4" G mit Verstellrohr 120mm TRINNITY</w:t>
+            </w:r>
+          </w:p>
+          <w:p>
+            <w:pPr>
+              <w:spacing w:after="0" w:before="0" w:line="278.00000000000006" w:lineRule="auto"/>
+              <w:ind w:left="0" w:right="314" w:firstLine="0"/>
+              <w:jc w:val="left"/>
+              <w:rPr>
+                <w:rFonts w:ascii="Open Sans" w:cs="Open Sans" w:eastAsia="Open Sans" w:hAnsi="Open Sans"/>
+                <w:color w:val="000000"/>
+                <w:sz w:val="18"/>
+                <w:szCs w:val="18"/>
+                <w:shd w:fill="auto" w:val="clear"/>
+              </w:rPr>
+            </w:pPr>
+            <w:r>
+              <w:rPr>
+                <w:rFonts w:ascii="Open Sans" w:cs="Open Sans" w:eastAsia="Open Sans" w:hAnsi="Open Sans"/>
+                <w:color w:val="000000"/>
+                <w:sz w:val="18"/>
+                <w:szCs w:val="18"/>
+                <w:shd w:fill="auto" w:val="clear"/>
+                <w:rtl w:val="0"/>
+              </w:rPr>
+              <w:t xml:space="preserve">- 2 Stk SCHELL Eckventil COMFORT regulierbar, ASAG, 1/2", chrom</w:t>
             </w:r>
           </w:p>
           <w:p>
@@ -2574,7 +2568,7 @@
                 <w:shd w:fill="auto" w:val="clear"/>
                 <w:rtl w:val="0"/>
               </w:rPr>
-              <w:t xml:space="preserve">5.608,69 €</w:t>
+              <w:t xml:space="preserve">5.223,88 €</w:t>
             </w:r>
             <w:r>
               <w:rPr>
@@ -2743,7 +2737,7 @@
                 <w:shd w:fill="auto" w:val="clear"/>
                 <w:rtl w:val="0"/>
               </w:rPr>
-              <w:t xml:space="preserve">1.065,65 €</w:t>
+              <w:t xml:space="preserve">992,54 €</w:t>
             </w:r>
             <w:r>
               <w:rPr>
@@ -2912,7 +2906,7 @@
                 <w:shd w:fill="auto" w:val="clear"/>
                 <w:rtl w:val="0"/>
               </w:rPr>
-              <w:t xml:space="preserve">6.674,34 €</w:t>
+              <w:t xml:space="preserve">6.216,42 €</w:t>
             </w:r>
             <w:r>
               <w:rPr>
@@ -2976,6 +2970,66 @@
           <w:rtl w:val="0"/>
         </w:rPr>
         <w:t xml:space="preserve">Es handelt sich hierbei um ein Festpreisangebot für die oben definierten Leistungen.</w:t>
+      </w:r>
+      <w:r>
+        <w:rPr>
+          <w:rtl w:val="0"/>
+        </w:rPr>
+      </w:r>
+    </w:p>
+    <w:p>
+      <w:pPr>
+        <w:spacing w:after="0" w:before="23" w:line="240" w:lineRule="auto"/>
+        <w:ind w:left="0" w:right="0" w:firstLine="0"/>
+        <w:jc w:val="left"/>
+        <w:rPr>
+          <w:rFonts w:ascii="Open Sans" w:cs="Open Sans" w:eastAsia="Open Sans" w:hAnsi="Open Sans"/>
+          <w:color w:val="000000"/>
+          <w:sz w:val="22"/>
+          <w:szCs w:val="22"/>
+          <w:shd w:fill="auto" w:val="clear"/>
+        </w:rPr>
+      </w:pPr>
+      <w:r>
+        <w:rPr>
+          <w:rtl w:val="0"/>
+        </w:rPr>
+      </w:r>
+    </w:p>
+    <w:p>
+      <w:pPr>
+        <w:spacing w:after="0" w:before="0" w:line="286" w:lineRule="auto"/>
+        <w:ind w:left="123" w:right="0" w:firstLine="0"/>
+        <w:jc w:val="left"/>
+        <w:rPr>
+          <w:rFonts w:ascii="Open Sans" w:cs="Open Sans" w:eastAsia="Open Sans" w:hAnsi="Open Sans"/>
+          <w:color w:val="000000"/>
+          <w:sz w:val="22"/>
+          <w:szCs w:val="22"/>
+          <w:shd w:fill="auto" w:val="clear"/>
+        </w:rPr>
+      </w:pPr>
+      <w:r>
+        <w:rPr>
+          <w:rFonts w:ascii="Open Sans SemiBold" w:cs="Open Sans SemiBold" w:eastAsia="Open Sans SemiBold" w:hAnsi="Open Sans SemiBold"/>
+          <w:color w:val="030303"/>
+          <w:sz w:val="22"/>
+          <w:szCs w:val="22"/>
+          <w:shd w:fill="auto" w:val="clear"/>
+          <w:rtl w:val="0"/>
+        </w:rPr>
+        <w:t xml:space="preserve">ACHTUNG:</w:t>
+      </w:r>
+      <w:r>
+        <w:rPr>
+          <w:rFonts w:ascii="Open Sans" w:cs="Open Sans" w:eastAsia="Open Sans" w:hAnsi="Open Sans"/>
+          <w:color w:val="030303"/>
+          <w:sz w:val="22"/>
+          <w:szCs w:val="22"/>
+          <w:shd w:fill="auto" w:val="clear"/>
+          <w:rtl w:val="0"/>
+        </w:rPr>
+        <w:t xml:space="preserve"> Ob eine ebenerdige Montage der Duschwanne möglich ist, kann erst nach dem Ausbau der bestehenden Wanne beurteilen werden. Sollten dabei zusätzliche oder weitere Leistungen erforderlich oder von Ihnen gewünscht sein, können zusätzliche Kosten entstehen.</w:t>
         <w:br w:type="textWrapping"/>
       </w:r>
       <w:r>

</xml_diff>

<commit_message>
modification UI hassman schnell products
</commit_message>
<xml_diff>
--- a/out-Angebot.docx
+++ b/out-Angebot.docx
@@ -310,7 +310,7 @@
                 <w:rFonts w:ascii="Open Sans" w:cs="Open Sans" w:eastAsia="Open Sans" w:hAnsi="Open Sans"/>
                 <w:rtl w:val="0"/>
               </w:rPr>
-              <w:t xml:space="preserve">ANG2025-1010-112857</w:t>
+              <w:t xml:space="preserve">ANG2025-1010-131441</w:t>
             </w:r>
             <w:r>
               <w:rPr>
@@ -578,7 +578,7 @@
           <w:shd w:fill="auto" w:val="clear"/>
           <w:rtl w:val="0"/>
         </w:rPr>
-        <w:t xml:space="preserve">  Ihr Angebot ANG2025-1010-112857</w:t>
+        <w:t xml:space="preserve">  Ihr Angebot ANG2025-1010-131441</w:t>
       </w:r>
     </w:p>
     <w:p>
@@ -1691,7 +1691,7 @@
                 <w:shd w:fill="auto" w:val="clear"/>
                 <w:rtl w:val="0"/>
               </w:rPr>
-              <w:t xml:space="preserve">1.879,88 €</w:t>
+              <w:t xml:space="preserve">2.079,88 €</w:t>
             </w:r>
             <w:r>
               <w:rPr>
@@ -1723,7 +1723,7 @@
               <w:rPr>
                 <w:rtl w:val="0"/>
               </w:rPr>
-              <w:t xml:space="preserve">1.879,88 €</w:t>
+              <w:t xml:space="preserve">2.079,88 €</w:t>
             </w:r>
             <w:r>
               <w:rPr>
@@ -2143,7 +2143,32 @@
                 <w:shd w:fill="auto" w:val="clear"/>
                 <w:rtl w:val="0"/>
               </w:rPr>
-              <w:t xml:space="preserve">- 1 Stk Sonderduschabtrennung Hassmann</w:t>
+              <w:t xml:space="preserve">- 1 Stk Pendeltür Hassmann</w:t>
+            </w:r>
+          </w:p>
+          <w:p>
+            <w:pPr>
+              <w:spacing w:after="0" w:before="0" w:line="278.00000000000006" w:lineRule="auto"/>
+              <w:ind w:left="0" w:right="314" w:firstLine="0"/>
+              <w:jc w:val="left"/>
+              <w:rPr>
+                <w:rFonts w:ascii="Open Sans" w:cs="Open Sans" w:eastAsia="Open Sans" w:hAnsi="Open Sans"/>
+                <w:color w:val="000000"/>
+                <w:sz w:val="18"/>
+                <w:szCs w:val="18"/>
+                <w:shd w:fill="auto" w:val="clear"/>
+              </w:rPr>
+            </w:pPr>
+            <w:r>
+              <w:rPr>
+                <w:rFonts w:ascii="Open Sans" w:cs="Open Sans" w:eastAsia="Open Sans" w:hAnsi="Open Sans"/>
+                <w:color w:val="000000"/>
+                <w:sz w:val="18"/>
+                <w:szCs w:val="18"/>
+                <w:shd w:fill="auto" w:val="clear"/>
+                <w:rtl w:val="0"/>
+              </w:rPr>
+              <w:t xml:space="preserve">- 1 Stk Walk-In Hassmann</w:t>
             </w:r>
           </w:p>
         </w:tc>
@@ -2412,7 +2437,7 @@
                 <w:shd w:fill="auto" w:val="clear"/>
                 <w:rtl w:val="0"/>
               </w:rPr>
-              <w:t xml:space="preserve">3.990,82 €</w:t>
+              <w:t xml:space="preserve">4.290,82 €</w:t>
             </w:r>
             <w:r>
               <w:rPr>
@@ -2581,7 +2606,7 @@
                 <w:shd w:fill="auto" w:val="clear"/>
                 <w:rtl w:val="0"/>
               </w:rPr>
-              <w:t xml:space="preserve">758,26 €</w:t>
+              <w:t xml:space="preserve">815,26 €</w:t>
             </w:r>
             <w:r>
               <w:rPr>
@@ -2750,7 +2775,7 @@
                 <w:shd w:fill="auto" w:val="clear"/>
                 <w:rtl w:val="0"/>
               </w:rPr>
-              <w:t xml:space="preserve">4.749,08 €</w:t>
+              <w:t xml:space="preserve">5.106,08 €</w:t>
             </w:r>
             <w:r>
               <w:rPr>

</xml_diff>

<commit_message>
bonus haltegriff is exactly unit price of CLPESG40
</commit_message>
<xml_diff>
--- a/out-Angebot.docx
+++ b/out-Angebot.docx
@@ -310,7 +310,7 @@
                 <w:rFonts w:ascii="Open Sans" w:cs="Open Sans" w:eastAsia="Open Sans" w:hAnsi="Open Sans"/>
                 <w:rtl w:val="0"/>
               </w:rPr>
-              <w:t xml:space="preserve">ANG2025-1010-131647</w:t>
+              <w:t xml:space="preserve">ANG2025-1010-141339</w:t>
             </w:r>
             <w:r>
               <w:rPr>
@@ -578,7 +578,7 @@
           <w:shd w:fill="auto" w:val="clear"/>
           <w:rtl w:val="0"/>
         </w:rPr>
-        <w:t xml:space="preserve">  Ihr Angebot ANG2025-1010-131647</w:t>
+        <w:t xml:space="preserve">  Ihr Angebot ANG2025-1010-141339</w:t>
       </w:r>
     </w:p>
     <w:p>
@@ -1269,6 +1269,34 @@
             </w:pPr>
             <w:r>
               <w:rPr>
+                <w:rFonts w:ascii="Open Sans" w:cs="Open Sans" w:eastAsia="Open Sans" w:hAnsi="Open Sans"/>
+                <w:color w:val="000000"/>
+                <w:sz w:val="18"/>
+                <w:szCs w:val="18"/>
+                <w:shd w:fill="auto" w:val="clear"/>
+                <w:rtl w:val="0"/>
+              </w:rPr>
+              <w:t xml:space="preserve">- Anbringen zusätzlicher Haltegriffe</w:t>
+            </w:r>
+            <w:r>
+              <w:rPr>
+                <w:rtl w:val="0"/>
+              </w:rPr>
+            </w:r>
+          </w:p>
+          <w:p>
+            <w:pPr>
+              <w:spacing w:after="0" w:before="0" w:line="278.00000000000006" w:lineRule="auto"/>
+              <w:ind w:left="0" w:right="314" w:firstLine="0"/>
+              <w:jc w:val="left"/>
+              <w:rPr>
+                <w:color w:val="000000"/>
+                <w:sz w:val="18"/>
+                <w:szCs w:val="18"/>
+              </w:rPr>
+            </w:pPr>
+            <w:r>
+              <w:rPr>
                 <w:rtl w:val="0"/>
               </w:rPr>
             </w:r>
@@ -1691,7 +1719,7 @@
                 <w:shd w:fill="auto" w:val="clear"/>
                 <w:rtl w:val="0"/>
               </w:rPr>
-              <w:t xml:space="preserve">2.279,88 €</w:t>
+              <w:t xml:space="preserve">3.109,42 €</w:t>
             </w:r>
             <w:r>
               <w:rPr>
@@ -1723,7 +1751,7 @@
               <w:rPr>
                 <w:rtl w:val="0"/>
               </w:rPr>
-              <w:t xml:space="preserve">2.279,88 €</w:t>
+              <w:t xml:space="preserve">3.109,42 €</w:t>
             </w:r>
             <w:r>
               <w:rPr>
@@ -2143,7 +2171,7 @@
                 <w:shd w:fill="auto" w:val="clear"/>
                 <w:rtl w:val="0"/>
               </w:rPr>
-              <w:t xml:space="preserve">- 1 Stk Sonderduschabtrennung Hassmann</w:t>
+              <w:t xml:space="preserve">- 2 Stk Haltegriff clivia plus 32/400mm m. Ros. Edelstahl glatt poliert, VIGOUR</w:t>
             </w:r>
           </w:p>
           <w:p>
@@ -2168,7 +2196,7 @@
                 <w:shd w:fill="auto" w:val="clear"/>
                 <w:rtl w:val="0"/>
               </w:rPr>
-              <w:t xml:space="preserve">- 1 Stk Pendeltür Hassmann</w:t>
+              <w:t xml:space="preserve">- 1 Stk Sonderduschabtrennung Hassmann</w:t>
             </w:r>
           </w:p>
           <w:p>
@@ -2193,7 +2221,32 @@
                 <w:shd w:fill="auto" w:val="clear"/>
                 <w:rtl w:val="0"/>
               </w:rPr>
-              <w:t xml:space="preserve">- 1 Stk Walk-In Hassmann</w:t>
+              <w:t xml:space="preserve">- 2 Stk Pendeltür Hassmann</w:t>
+            </w:r>
+          </w:p>
+          <w:p>
+            <w:pPr>
+              <w:spacing w:after="0" w:before="0" w:line="278.00000000000006" w:lineRule="auto"/>
+              <w:ind w:left="0" w:right="314" w:firstLine="0"/>
+              <w:jc w:val="left"/>
+              <w:rPr>
+                <w:rFonts w:ascii="Open Sans" w:cs="Open Sans" w:eastAsia="Open Sans" w:hAnsi="Open Sans"/>
+                <w:color w:val="000000"/>
+                <w:sz w:val="18"/>
+                <w:szCs w:val="18"/>
+                <w:shd w:fill="auto" w:val="clear"/>
+              </w:rPr>
+            </w:pPr>
+            <w:r>
+              <w:rPr>
+                <w:rFonts w:ascii="Open Sans" w:cs="Open Sans" w:eastAsia="Open Sans" w:hAnsi="Open Sans"/>
+                <w:color w:val="000000"/>
+                <w:sz w:val="18"/>
+                <w:szCs w:val="18"/>
+                <w:shd w:fill="auto" w:val="clear"/>
+                <w:rtl w:val="0"/>
+              </w:rPr>
+              <w:t xml:space="preserve">- 1 Stk Falt-Pendeltür Hassmann</w:t>
             </w:r>
           </w:p>
         </w:tc>
@@ -2259,6 +2312,247 @@
                 <w:shd w:fill="auto" w:val="clear"/>
               </w:rPr>
             </w:pPr>
+            <w:r>
+              <w:rPr>
+                <w:rtl w:val="0"/>
+              </w:rPr>
+            </w:r>
+          </w:p>
+        </w:tc>
+      </w:tr>
+      <w:tr>
+        <w:trPr>
+          <w:cantSplit w:val="0"/>
+          <w:trHeight w:val="1" w:hRule="atLeast"/>
+          <w:tblHeader w:val="0"/>
+        </w:trPr>
+        <w:tc>
+          <w:tcPr>
+            <w:tcBorders>
+              <w:top w:color="ffffff" w:space="0" w:sz="8" w:val="single"/>
+              <w:left w:color="ffffff" w:space="0" w:sz="8" w:val="single"/>
+              <w:bottom w:color="ffffff" w:space="0" w:sz="8" w:val="single"/>
+              <w:right w:color="ffffff" w:space="0" w:sz="8" w:val="single"/>
+            </w:tcBorders>
+            <w:shd w:fill="ffffff" w:val="clear"/>
+            <w:tcMar>
+              <w:left w:w="56.0" w:type="dxa"/>
+              <w:right w:w="56.0" w:type="dxa"/>
+            </w:tcMar>
+          </w:tcPr>
+          <w:p>
+            <w:pPr>
+              <w:spacing w:after="0" w:before="0" w:line="278.00000000000006" w:lineRule="auto"/>
+              <w:ind w:left="0" w:right="-26" w:firstLine="0"/>
+              <w:jc w:val="left"/>
+              <w:rPr>
+                <w:color w:val="000000"/>
+              </w:rPr>
+            </w:pPr>
+            <w:r>
+              <w:rPr>
+                <w:rFonts w:ascii="Open Sans" w:cs="Open Sans" w:eastAsia="Open Sans" w:hAnsi="Open Sans"/>
+                <w:color w:val="000000"/>
+                <w:sz w:val="20"/>
+                <w:szCs w:val="20"/>
+                <w:shd w:fill="auto" w:val="clear"/>
+                <w:rtl w:val="0"/>
+              </w:rPr>
+              <w:t xml:space="preserve">003</w:t>
+            </w:r>
+            <w:r>
+              <w:rPr>
+                <w:rtl w:val="0"/>
+              </w:rPr>
+            </w:r>
+          </w:p>
+        </w:tc>
+        <w:tc>
+          <w:tcPr>
+            <w:tcBorders>
+              <w:top w:color="ffffff" w:space="0" w:sz="8" w:val="single"/>
+              <w:left w:color="ffffff" w:space="0" w:sz="8" w:val="single"/>
+              <w:bottom w:color="ffffff" w:space="0" w:sz="8" w:val="single"/>
+              <w:right w:color="ffffff" w:space="0" w:sz="8" w:val="single"/>
+            </w:tcBorders>
+            <w:shd w:fill="ffffff" w:val="clear"/>
+            <w:tcMar>
+              <w:left w:w="56.0" w:type="dxa"/>
+              <w:right w:w="56.0" w:type="dxa"/>
+            </w:tcMar>
+          </w:tcPr>
+          <w:p>
+            <w:pPr>
+              <w:spacing w:after="0" w:before="0" w:line="278.00000000000006" w:lineRule="auto"/>
+              <w:ind w:left="0" w:right="314" w:firstLine="0"/>
+              <w:jc w:val="left"/>
+              <w:rPr>
+                <w:color w:val="000000"/>
+              </w:rPr>
+            </w:pPr>
+            <w:r>
+              <w:rPr>
+                <w:rFonts w:ascii="Open Sans" w:cs="Open Sans" w:eastAsia="Open Sans" w:hAnsi="Open Sans"/>
+                <w:color w:val="000000"/>
+                <w:sz w:val="20"/>
+                <w:szCs w:val="20"/>
+                <w:shd w:fill="auto" w:val="clear"/>
+                <w:rtl w:val="0"/>
+              </w:rPr>
+              <w:t xml:space="preserve">1 Stk</w:t>
+            </w:r>
+            <w:r>
+              <w:rPr>
+                <w:rtl w:val="0"/>
+              </w:rPr>
+            </w:r>
+          </w:p>
+        </w:tc>
+        <w:tc>
+          <w:tcPr>
+            <w:tcBorders>
+              <w:top w:color="ffffff" w:space="0" w:sz="8" w:val="single"/>
+              <w:left w:color="ffffff" w:space="0" w:sz="8" w:val="single"/>
+              <w:bottom w:color="ffffff" w:space="0" w:sz="8" w:val="single"/>
+              <w:right w:color="ffffff" w:space="0" w:sz="8" w:val="single"/>
+            </w:tcBorders>
+            <w:shd w:fill="ffffff" w:val="clear"/>
+            <w:tcMar>
+              <w:left w:w="56.0" w:type="dxa"/>
+              <w:right w:w="56.0" w:type="dxa"/>
+            </w:tcMar>
+          </w:tcPr>
+          <w:p>
+            <w:pPr>
+              <w:spacing w:after="0" w:before="0" w:line="278.00000000000006" w:lineRule="auto"/>
+              <w:ind w:left="0" w:right="314" w:firstLine="0"/>
+              <w:jc w:val="left"/>
+              <w:rPr>
+                <w:rFonts w:ascii="Open Sans" w:cs="Open Sans" w:eastAsia="Open Sans" w:hAnsi="Open Sans"/>
+                <w:b w:val="1"/>
+                <w:color w:val="000000"/>
+                <w:sz w:val="18"/>
+                <w:szCs w:val="18"/>
+                <w:shd w:fill="auto" w:val="clear"/>
+              </w:rPr>
+            </w:pPr>
+            <w:r>
+              <w:rPr>
+                <w:rFonts w:ascii="Open Sans" w:cs="Open Sans" w:eastAsia="Open Sans" w:hAnsi="Open Sans"/>
+                <w:b w:val="1"/>
+                <w:color w:val="000000"/>
+                <w:sz w:val="18"/>
+                <w:szCs w:val="18"/>
+                <w:shd w:fill="auto" w:val="clear"/>
+                <w:rtl w:val="0"/>
+              </w:rPr>
+              <w:t xml:space="preserve">Aktion: Haltegriff</w:t>
+            </w:r>
+          </w:p>
+          <w:p>
+            <w:pPr>
+              <w:spacing w:after="0" w:before="0" w:line="278.00000000000006" w:lineRule="auto"/>
+              <w:ind w:left="0" w:right="314" w:firstLine="0"/>
+              <w:jc w:val="left"/>
+              <w:rPr>
+                <w:color w:val="000000"/>
+                <w:sz w:val="18"/>
+                <w:szCs w:val="18"/>
+              </w:rPr>
+            </w:pPr>
+            <w:r>
+              <w:rPr>
+                <w:rFonts w:ascii="Open Sans" w:cs="Open Sans" w:eastAsia="Open Sans" w:hAnsi="Open Sans"/>
+                <w:color w:val="000000"/>
+                <w:sz w:val="18"/>
+                <w:szCs w:val="18"/>
+                <w:shd w:fill="auto" w:val="clear"/>
+                <w:rtl w:val="0"/>
+              </w:rPr>
+              <w:t xml:space="preserve">1 Haltegriff gratis im Wert von 175 € inkl. Lieferung und Montage</w:t>
+            </w:r>
+            <w:r>
+              <w:rPr>
+                <w:rtl w:val="0"/>
+              </w:rPr>
+            </w:r>
+          </w:p>
+        </w:tc>
+        <w:tc>
+          <w:tcPr>
+            <w:tcBorders>
+              <w:top w:color="ffffff" w:space="0" w:sz="8" w:val="single"/>
+              <w:left w:color="ffffff" w:space="0" w:sz="8" w:val="single"/>
+              <w:bottom w:color="ffffff" w:space="0" w:sz="8" w:val="single"/>
+              <w:right w:color="ffffff" w:space="0" w:sz="8" w:val="single"/>
+            </w:tcBorders>
+            <w:shd w:fill="ffffff" w:val="clear"/>
+            <w:tcMar>
+              <w:left w:w="56.0" w:type="dxa"/>
+              <w:right w:w="56.0" w:type="dxa"/>
+            </w:tcMar>
+          </w:tcPr>
+          <w:p>
+            <w:pPr>
+              <w:spacing w:after="0" w:before="0" w:line="278.00000000000006" w:lineRule="auto"/>
+              <w:ind w:left="0" w:right="314" w:firstLine="0"/>
+              <w:jc w:val="left"/>
+              <w:rPr>
+                <w:color w:val="000000"/>
+              </w:rPr>
+            </w:pPr>
+            <w:r>
+              <w:rPr>
+                <w:rFonts w:ascii="Open Sans" w:cs="Open Sans" w:eastAsia="Open Sans" w:hAnsi="Open Sans"/>
+                <w:color w:val="000000"/>
+                <w:sz w:val="20"/>
+                <w:szCs w:val="20"/>
+                <w:shd w:fill="auto" w:val="clear"/>
+                <w:rtl w:val="0"/>
+              </w:rPr>
+              <w:t xml:space="preserve">0,00 €</w:t>
+            </w:r>
+            <w:r>
+              <w:rPr>
+                <w:rtl w:val="0"/>
+              </w:rPr>
+            </w:r>
+          </w:p>
+        </w:tc>
+        <w:tc>
+          <w:tcPr>
+            <w:tcBorders>
+              <w:top w:color="ffffff" w:space="0" w:sz="8" w:val="single"/>
+              <w:left w:color="ffffff" w:space="0" w:sz="8" w:val="single"/>
+              <w:bottom w:color="ffffff" w:space="0" w:sz="8" w:val="single"/>
+              <w:right w:color="ffffff" w:space="0" w:sz="8" w:val="single"/>
+            </w:tcBorders>
+            <w:shd w:fill="ffffff" w:val="clear"/>
+            <w:tcMar>
+              <w:left w:w="56.0" w:type="dxa"/>
+              <w:right w:w="56.0" w:type="dxa"/>
+            </w:tcMar>
+          </w:tcPr>
+          <w:p>
+            <w:pPr>
+              <w:spacing w:after="0" w:before="0" w:line="278.00000000000006" w:lineRule="auto"/>
+              <w:ind w:left="0" w:right="314" w:firstLine="0"/>
+              <w:jc w:val="center"/>
+              <w:rPr>
+                <w:color w:val="000000"/>
+              </w:rPr>
+            </w:pPr>
+            <w:r>
+              <w:rPr>
+                <w:rFonts w:ascii="Open Sans" w:cs="Open Sans" w:eastAsia="Open Sans" w:hAnsi="Open Sans"/>
+                <w:color w:val="000000"/>
+                <w:sz w:val="20"/>
+                <w:szCs w:val="20"/>
+                <w:shd w:fill="auto" w:val="clear"/>
+                <w:rtl w:val="0"/>
+              </w:rPr>
+              <w:t xml:space="preserve">0,00 €</w:t>
+            </w:r>
             <w:r>
               <w:rPr>
                 <w:rtl w:val="0"/>
@@ -2462,7 +2756,7 @@
                 <w:shd w:fill="auto" w:val="clear"/>
                 <w:rtl w:val="0"/>
               </w:rPr>
-              <w:t xml:space="preserve">4.590,82 €</w:t>
+              <w:t xml:space="preserve">5.770,36 €</w:t>
             </w:r>
             <w:r>
               <w:rPr>
@@ -2631,7 +2925,7 @@
                 <w:shd w:fill="auto" w:val="clear"/>
                 <w:rtl w:val="0"/>
               </w:rPr>
-              <w:t xml:space="preserve">872,26 €</w:t>
+              <w:t xml:space="preserve">1.096,37 €</w:t>
             </w:r>
             <w:r>
               <w:rPr>
@@ -2800,7 +3094,7 @@
                 <w:shd w:fill="auto" w:val="clear"/>
                 <w:rtl w:val="0"/>
               </w:rPr>
-              <w:t xml:space="preserve">5.463,08 €</w:t>
+              <w:t xml:space="preserve">6.866,73 €</w:t>
             </w:r>
             <w:r>
               <w:rPr>

</xml_diff>

<commit_message>
showing id product hassman in kosten-details
</commit_message>
<xml_diff>
--- a/out-Angebot.docx
+++ b/out-Angebot.docx
@@ -112,7 +112,7 @@
                 <w:rFonts w:ascii="Open Sans" w:cs="Open Sans" w:eastAsia="Open Sans" w:hAnsi="Open Sans"/>
                 <w:rtl w:val="0"/>
               </w:rPr>
-              <w:t xml:space="preserve">Herr</w:t>
+              <w:t xml:space="preserve">Frau</w:t>
             </w:r>
           </w:p>
           <w:p>
@@ -129,7 +129,7 @@
                 <w:rFonts w:ascii="Open Sans" w:cs="Open Sans" w:eastAsia="Open Sans" w:hAnsi="Open Sans"/>
                 <w:rtl w:val="0"/>
               </w:rPr>
-              <w:t xml:space="preserve">Zahir Calderon</w:t>
+              <w:t xml:space="preserve">Dora Humphrey</w:t>
             </w:r>
             <w:r>
               <w:rPr>
@@ -151,7 +151,7 @@
                 <w:rFonts w:ascii="Open Sans" w:cs="Open Sans" w:eastAsia="Open Sans" w:hAnsi="Open Sans"/>
                 <w:rtl w:val="0"/>
               </w:rPr>
-              <w:t xml:space="preserve">Odit reiciendis fugi,</w:t>
+              <w:t xml:space="preserve">Sit sit possimus i,</w:t>
             </w:r>
             <w:r>
               <w:rPr>
@@ -175,7 +175,7 @@
                 <w:rFonts w:ascii="Open Sans" w:cs="Open Sans" w:eastAsia="Open Sans" w:hAnsi="Open Sans"/>
                 <w:rtl w:val="0"/>
               </w:rPr>
-              <w:t xml:space="preserve">Aliquid ab in ipsam  Commodi duis volupta</w:t>
+              <w:t xml:space="preserve">Ut quia aliqua Ipsu Beatae omnis eos dic</w:t>
             </w:r>
             <w:r>
               <w:rPr>
@@ -310,7 +310,7 @@
                 <w:rFonts w:ascii="Open Sans" w:cs="Open Sans" w:eastAsia="Open Sans" w:hAnsi="Open Sans"/>
                 <w:rtl w:val="0"/>
               </w:rPr>
-              <w:t xml:space="preserve">ANG2025-1010-141339</w:t>
+              <w:t xml:space="preserve">ANG2025-1013-090839</w:t>
             </w:r>
             <w:r>
               <w:rPr>
@@ -345,7 +345,7 @@
                 <w:rFonts w:ascii="Open Sans" w:cs="Open Sans" w:eastAsia="Open Sans" w:hAnsi="Open Sans"/>
                 <w:rtl w:val="0"/>
               </w:rPr>
-              <w:t xml:space="preserve">15.01.2017</w:t>
+              <w:t xml:space="preserve">11.02.1983</w:t>
             </w:r>
             <w:r>
               <w:rPr>
@@ -379,7 +379,7 @@
                 <w:rFonts w:ascii="Open Sans" w:cs="Open Sans" w:eastAsia="Open Sans" w:hAnsi="Open Sans"/>
                 <w:rtl w:val="0"/>
               </w:rPr>
-              <w:t xml:space="preserve">Florence Hart</w:t>
+              <w:t xml:space="preserve">Meghan Cameron</w:t>
             </w:r>
             <w:r>
               <w:rPr>
@@ -524,7 +524,7 @@
                 <w:rFonts w:ascii="Open Sans" w:cs="Open Sans" w:eastAsia="Open Sans" w:hAnsi="Open Sans"/>
                 <w:rtl w:val="0"/>
               </w:rPr>
-              <w:t xml:space="preserve">Britanni Davis</w:t>
+              <w:t xml:space="preserve">Carla Moses</w:t>
             </w:r>
             <w:r>
               <w:rPr>
@@ -578,7 +578,7 @@
           <w:shd w:fill="auto" w:val="clear"/>
           <w:rtl w:val="0"/>
         </w:rPr>
-        <w:t xml:space="preserve">  Ihr Angebot ANG2025-1010-141339</w:t>
+        <w:t xml:space="preserve">  Ihr Angebot ANG2025-1013-090839</w:t>
       </w:r>
     </w:p>
     <w:p>
@@ -603,7 +603,7 @@
           <w:shd w:fill="auto" w:val="clear"/>
           <w:rtl w:val="0"/>
         </w:rPr>
-        <w:t xml:space="preserve">  Sehr geehrter Herr Calderon,</w:t>
+        <w:t xml:space="preserve">  Sehr geehrte Frau Humphrey,</w:t>
         <w:br w:type="textWrapping"/>
       </w:r>
     </w:p>
@@ -1075,7 +1075,7 @@
                 <w:shd w:fill="auto" w:val="clear"/>
                 <w:rtl w:val="0"/>
               </w:rPr>
-              <w:t xml:space="preserve">1.246,00 €</w:t>
+              <w:t xml:space="preserve">2.553,00 €</w:t>
             </w:r>
             <w:r>
               <w:rPr>
@@ -1116,7 +1116,7 @@
                 <w:shd w:fill="auto" w:val="clear"/>
                 <w:rtl w:val="0"/>
               </w:rPr>
-              <w:t xml:space="preserve">1.246,00 €</w:t>
+              <w:t xml:space="preserve">2.553,00 €</w:t>
             </w:r>
             <w:r>
               <w:rPr>
@@ -1241,17 +1241,6 @@
             </w:pPr>
             <w:r>
               <w:rPr>
-                <w:rFonts w:ascii="Open Sans" w:cs="Open Sans" w:eastAsia="Open Sans" w:hAnsi="Open Sans"/>
-                <w:color w:val="000000"/>
-                <w:sz w:val="18"/>
-                <w:szCs w:val="18"/>
-                <w:shd w:fill="auto" w:val="clear"/>
-                <w:rtl w:val="0"/>
-              </w:rPr>
-              <w:t xml:space="preserve">- Schließen der Fehlstellen</w:t>
-            </w:r>
-            <w:r>
-              <w:rPr>
                 <w:rtl w:val="0"/>
               </w:rPr>
             </w:r>
@@ -1263,20 +1252,20 @@
               <w:jc w:val="left"/>
               <w:rPr>
                 <w:color w:val="000000"/>
-                <w:sz w:val="18"/>
-                <w:szCs w:val="18"/>
-              </w:rPr>
-            </w:pPr>
-            <w:r>
-              <w:rPr>
-                <w:rFonts w:ascii="Open Sans" w:cs="Open Sans" w:eastAsia="Open Sans" w:hAnsi="Open Sans"/>
-                <w:color w:val="000000"/>
-                <w:sz w:val="18"/>
-                <w:szCs w:val="18"/>
-                <w:shd w:fill="auto" w:val="clear"/>
-                <w:rtl w:val="0"/>
-              </w:rPr>
-              <w:t xml:space="preserve">- Anbringen zusätzlicher Haltegriffe</w:t>
+                <w:sz w:val="20"/>
+                <w:szCs w:val="20"/>
+              </w:rPr>
+            </w:pPr>
+            <w:r>
+              <w:rPr>
+                <w:rFonts w:ascii="Open Sans" w:cs="Open Sans" w:eastAsia="Open Sans" w:hAnsi="Open Sans"/>
+                <w:color w:val="000000"/>
+                <w:sz w:val="20"/>
+                <w:szCs w:val="20"/>
+                <w:shd w:fill="auto" w:val="clear"/>
+                <w:rtl w:val="0"/>
+              </w:rPr>
+              <w:t xml:space="preserve">Enthält je Einheit</w:t>
             </w:r>
             <w:r>
               <w:rPr>
@@ -1297,6 +1286,17 @@
             </w:pPr>
             <w:r>
               <w:rPr>
+                <w:rFonts w:ascii="Open Sans" w:cs="Open Sans" w:eastAsia="Open Sans" w:hAnsi="Open Sans"/>
+                <w:color w:val="000000"/>
+                <w:sz w:val="18"/>
+                <w:szCs w:val="18"/>
+                <w:shd w:fill="auto" w:val="clear"/>
+                <w:rtl w:val="0"/>
+              </w:rPr>
+              <w:t xml:space="preserve">- 1,00 Stk Fahrzeugbereitstellung</w:t>
+            </w:r>
+            <w:r>
+              <w:rPr>
                 <w:rtl w:val="0"/>
               </w:rPr>
             </w:r>
@@ -1308,20 +1308,20 @@
               <w:jc w:val="left"/>
               <w:rPr>
                 <w:color w:val="000000"/>
-                <w:sz w:val="20"/>
-                <w:szCs w:val="20"/>
-              </w:rPr>
-            </w:pPr>
-            <w:r>
-              <w:rPr>
-                <w:rFonts w:ascii="Open Sans" w:cs="Open Sans" w:eastAsia="Open Sans" w:hAnsi="Open Sans"/>
-                <w:color w:val="000000"/>
-                <w:sz w:val="20"/>
-                <w:szCs w:val="20"/>
-                <w:shd w:fill="auto" w:val="clear"/>
-                <w:rtl w:val="0"/>
-              </w:rPr>
-              <w:t xml:space="preserve">Enthält je Einheit</w:t>
+                <w:sz w:val="18"/>
+                <w:szCs w:val="18"/>
+              </w:rPr>
+            </w:pPr>
+            <w:r>
+              <w:rPr>
+                <w:rFonts w:ascii="Open Sans" w:cs="Open Sans" w:eastAsia="Open Sans" w:hAnsi="Open Sans"/>
+                <w:color w:val="000000"/>
+                <w:sz w:val="18"/>
+                <w:szCs w:val="18"/>
+                <w:shd w:fill="auto" w:val="clear"/>
+                <w:rtl w:val="0"/>
+              </w:rPr>
+              <w:t xml:space="preserve">- 1,00 Stk Bereitstellung und Vorhaltung von Maschinen &amp; Werkzeugen</w:t>
             </w:r>
             <w:r>
               <w:rPr>
@@ -1349,7 +1349,7 @@
                 <w:shd w:fill="auto" w:val="clear"/>
                 <w:rtl w:val="0"/>
               </w:rPr>
-              <w:t xml:space="preserve">- 1,00 Stk Fahrzeugbereitstellung</w:t>
+              <w:t xml:space="preserve">- 1,00 Stk Beräumung der Baustelle</w:t>
             </w:r>
             <w:r>
               <w:rPr>
@@ -1377,63 +1377,7 @@
                 <w:shd w:fill="auto" w:val="clear"/>
                 <w:rtl w:val="0"/>
               </w:rPr>
-              <w:t xml:space="preserve">- 1,00 Stk Bereitstellung und Vorhaltung von Maschinen &amp; Werkzeugen</w:t>
-            </w:r>
-            <w:r>
-              <w:rPr>
-                <w:rtl w:val="0"/>
-              </w:rPr>
-            </w:r>
-          </w:p>
-          <w:p>
-            <w:pPr>
-              <w:spacing w:after="0" w:before="0" w:line="278.00000000000006" w:lineRule="auto"/>
-              <w:ind w:left="0" w:right="314" w:firstLine="0"/>
-              <w:jc w:val="left"/>
-              <w:rPr>
-                <w:color w:val="000000"/>
-                <w:sz w:val="18"/>
-                <w:szCs w:val="18"/>
-              </w:rPr>
-            </w:pPr>
-            <w:r>
-              <w:rPr>
-                <w:rFonts w:ascii="Open Sans" w:cs="Open Sans" w:eastAsia="Open Sans" w:hAnsi="Open Sans"/>
-                <w:color w:val="000000"/>
-                <w:sz w:val="18"/>
-                <w:szCs w:val="18"/>
-                <w:shd w:fill="auto" w:val="clear"/>
-                <w:rtl w:val="0"/>
-              </w:rPr>
-              <w:t xml:space="preserve">- 1,00 Stk Beräumung der Baustelle</w:t>
-            </w:r>
-            <w:r>
-              <w:rPr>
-                <w:rtl w:val="0"/>
-              </w:rPr>
-            </w:r>
-          </w:p>
-          <w:p>
-            <w:pPr>
-              <w:spacing w:after="0" w:before="0" w:line="278.00000000000006" w:lineRule="auto"/>
-              <w:ind w:left="0" w:right="314" w:firstLine="0"/>
-              <w:jc w:val="left"/>
-              <w:rPr>
-                <w:color w:val="000000"/>
-                <w:sz w:val="18"/>
-                <w:szCs w:val="18"/>
-              </w:rPr>
-            </w:pPr>
-            <w:r>
-              <w:rPr>
-                <w:rFonts w:ascii="Open Sans" w:cs="Open Sans" w:eastAsia="Open Sans" w:hAnsi="Open Sans"/>
-                <w:color w:val="000000"/>
-                <w:sz w:val="18"/>
-                <w:szCs w:val="18"/>
-                <w:shd w:fill="auto" w:val="clear"/>
-                <w:rtl w:val="0"/>
-              </w:rPr>
-              <w:t xml:space="preserve">- 60 km Kilometerpauschale</w:t>
+              <w:t xml:space="preserve">- 140 km Kilometerpauschale</w:t>
             </w:r>
             <w:r>
               <w:rPr>
@@ -1719,7 +1663,7 @@
                 <w:shd w:fill="auto" w:val="clear"/>
                 <w:rtl w:val="0"/>
               </w:rPr>
-              <w:t xml:space="preserve">3.109,42 €</w:t>
+              <w:t xml:space="preserve">672,29 €</w:t>
             </w:r>
             <w:r>
               <w:rPr>
@@ -1751,7 +1695,7 @@
               <w:rPr>
                 <w:rtl w:val="0"/>
               </w:rPr>
-              <w:t xml:space="preserve">3.109,42 €</w:t>
+              <w:t xml:space="preserve">672,29 €</w:t>
             </w:r>
             <w:r>
               <w:rPr>
@@ -1946,7 +1890,7 @@
                 <w:shd w:fill="auto" w:val="clear"/>
                 <w:rtl w:val="0"/>
               </w:rPr>
-              <w:t xml:space="preserve">- 10 Stk Fußboden-Paneele (1 Paneele = 0.3 m² )</w:t>
+              <w:t xml:space="preserve">- 1 Stk Stelzlager höhenverstellar Set</w:t>
             </w:r>
           </w:p>
           <w:p>
@@ -1971,7 +1915,7 @@
                 <w:shd w:fill="auto" w:val="clear"/>
                 <w:rtl w:val="0"/>
               </w:rPr>
-              <w:t xml:space="preserve">- 4 Pkg Flächenkleber (1 Pkg je 0,60 m²)</w:t>
+              <w:t xml:space="preserve">- 1 Stk TRINNITY Wandabdichtung BASIS-Set 5 qm DW bis 100 x 100 / BW bis 180 x 80 cm</w:t>
             </w:r>
           </w:p>
           <w:p>
@@ -1996,7 +1940,7 @@
                 <w:shd w:fill="auto" w:val="clear"/>
                 <w:rtl w:val="0"/>
               </w:rPr>
-              <w:t xml:space="preserve">- 2.76 m² Trinnity Bodenabdichtung (inkl. 15% Verschnitt)</w:t>
+              <w:t xml:space="preserve">- 1 Stk Gleittür Hassmann</w:t>
             </w:r>
           </w:p>
           <w:p>
@@ -2021,232 +1965,7 @@
                 <w:shd w:fill="auto" w:val="clear"/>
                 <w:rtl w:val="0"/>
               </w:rPr>
-              <w:t xml:space="preserve">- 3 Stk Wandverkleidung 3.0 Alu 1497×2550 mm — Farbe: Marmor weiß</w:t>
-            </w:r>
-          </w:p>
-          <w:p>
-            <w:pPr>
-              <w:spacing w:after="0" w:before="0" w:line="278.00000000000006" w:lineRule="auto"/>
-              <w:ind w:left="0" w:right="314" w:firstLine="0"/>
-              <w:jc w:val="left"/>
-              <w:rPr>
-                <w:rFonts w:ascii="Open Sans" w:cs="Open Sans" w:eastAsia="Open Sans" w:hAnsi="Open Sans"/>
-                <w:color w:val="000000"/>
-                <w:sz w:val="18"/>
-                <w:szCs w:val="18"/>
-                <w:shd w:fill="auto" w:val="clear"/>
-              </w:rPr>
-            </w:pPr>
-            <w:r>
-              <w:rPr>
-                <w:rFonts w:ascii="Open Sans" w:cs="Open Sans" w:eastAsia="Open Sans" w:hAnsi="Open Sans"/>
-                <w:color w:val="000000"/>
-                <w:sz w:val="18"/>
-                <w:szCs w:val="18"/>
-                <w:shd w:fill="auto" w:val="clear"/>
-                <w:rtl w:val="0"/>
-              </w:rPr>
-              <w:t xml:space="preserve">- 1 Stk TRINNITY Wandabdichtung BASIS-Set 5 qm DW bis 100 x 100 / BW bis 180 x 80 cm</w:t>
-            </w:r>
-          </w:p>
-          <w:p>
-            <w:pPr>
-              <w:spacing w:after="0" w:before="0" w:line="278.00000000000006" w:lineRule="auto"/>
-              <w:ind w:left="0" w:right="314" w:firstLine="0"/>
-              <w:jc w:val="left"/>
-              <w:rPr>
-                <w:rFonts w:ascii="Open Sans" w:cs="Open Sans" w:eastAsia="Open Sans" w:hAnsi="Open Sans"/>
-                <w:color w:val="000000"/>
-                <w:sz w:val="18"/>
-                <w:szCs w:val="18"/>
-                <w:shd w:fill="auto" w:val="clear"/>
-              </w:rPr>
-            </w:pPr>
-            <w:r>
-              <w:rPr>
-                <w:rFonts w:ascii="Open Sans" w:cs="Open Sans" w:eastAsia="Open Sans" w:hAnsi="Open Sans"/>
-                <w:color w:val="000000"/>
-                <w:sz w:val="18"/>
-                <w:szCs w:val="18"/>
-                <w:shd w:fill="auto" w:val="clear"/>
-                <w:rtl w:val="0"/>
-              </w:rPr>
-              <w:t xml:space="preserve">- 4 Stk Wandverkleidungsklebstoff 3.0/4.0</w:t>
-            </w:r>
-          </w:p>
-          <w:p>
-            <w:pPr>
-              <w:spacing w:after="0" w:before="0" w:line="278.00000000000006" w:lineRule="auto"/>
-              <w:ind w:left="0" w:right="314" w:firstLine="0"/>
-              <w:jc w:val="left"/>
-              <w:rPr>
-                <w:rFonts w:ascii="Open Sans" w:cs="Open Sans" w:eastAsia="Open Sans" w:hAnsi="Open Sans"/>
-                <w:color w:val="000000"/>
-                <w:sz w:val="18"/>
-                <w:szCs w:val="18"/>
-                <w:shd w:fill="auto" w:val="clear"/>
-              </w:rPr>
-            </w:pPr>
-            <w:r>
-              <w:rPr>
-                <w:rFonts w:ascii="Open Sans" w:cs="Open Sans" w:eastAsia="Open Sans" w:hAnsi="Open Sans"/>
-                <w:color w:val="000000"/>
-                <w:sz w:val="18"/>
-                <w:szCs w:val="18"/>
-                <w:shd w:fill="auto" w:val="clear"/>
-                <w:rtl w:val="0"/>
-              </w:rPr>
-              <w:t xml:space="preserve">- 2 Stk Abschlussprofil 3.0 255 cm silber eloxiert VIGOUR</w:t>
-            </w:r>
-          </w:p>
-          <w:p>
-            <w:pPr>
-              <w:spacing w:after="0" w:before="0" w:line="278.00000000000006" w:lineRule="auto"/>
-              <w:ind w:left="0" w:right="314" w:firstLine="0"/>
-              <w:jc w:val="left"/>
-              <w:rPr>
-                <w:rFonts w:ascii="Open Sans" w:cs="Open Sans" w:eastAsia="Open Sans" w:hAnsi="Open Sans"/>
-                <w:color w:val="000000"/>
-                <w:sz w:val="18"/>
-                <w:szCs w:val="18"/>
-                <w:shd w:fill="auto" w:val="clear"/>
-              </w:rPr>
-            </w:pPr>
-            <w:r>
-              <w:rPr>
-                <w:rFonts w:ascii="Open Sans" w:cs="Open Sans" w:eastAsia="Open Sans" w:hAnsi="Open Sans"/>
-                <w:color w:val="000000"/>
-                <w:sz w:val="18"/>
-                <w:szCs w:val="18"/>
-                <w:shd w:fill="auto" w:val="clear"/>
-                <w:rtl w:val="0"/>
-              </w:rPr>
-              <w:t xml:space="preserve">- 2 Stk Verbindungsprofil(e) (Plattenanzahl - 1)</w:t>
-            </w:r>
-          </w:p>
-          <w:p>
-            <w:pPr>
-              <w:spacing w:after="0" w:before="0" w:line="278.00000000000006" w:lineRule="auto"/>
-              <w:ind w:left="0" w:right="314" w:firstLine="0"/>
-              <w:jc w:val="left"/>
-              <w:rPr>
-                <w:rFonts w:ascii="Open Sans" w:cs="Open Sans" w:eastAsia="Open Sans" w:hAnsi="Open Sans"/>
-                <w:color w:val="000000"/>
-                <w:sz w:val="18"/>
-                <w:szCs w:val="18"/>
-                <w:shd w:fill="auto" w:val="clear"/>
-              </w:rPr>
-            </w:pPr>
-            <w:r>
-              <w:rPr>
-                <w:rFonts w:ascii="Open Sans" w:cs="Open Sans" w:eastAsia="Open Sans" w:hAnsi="Open Sans"/>
-                <w:color w:val="000000"/>
-                <w:sz w:val="18"/>
-                <w:szCs w:val="18"/>
-                <w:shd w:fill="auto" w:val="clear"/>
-                <w:rtl w:val="0"/>
-              </w:rPr>
-              <w:t xml:space="preserve">- 2 Stk Profilklebstoff (pro Abschlussprofil 1 Stk)</w:t>
-            </w:r>
-          </w:p>
-          <w:p>
-            <w:pPr>
-              <w:spacing w:after="0" w:before="0" w:line="278.00000000000006" w:lineRule="auto"/>
-              <w:ind w:left="0" w:right="314" w:firstLine="0"/>
-              <w:jc w:val="left"/>
-              <w:rPr>
-                <w:rFonts w:ascii="Open Sans" w:cs="Open Sans" w:eastAsia="Open Sans" w:hAnsi="Open Sans"/>
-                <w:color w:val="000000"/>
-                <w:sz w:val="18"/>
-                <w:szCs w:val="18"/>
-                <w:shd w:fill="auto" w:val="clear"/>
-              </w:rPr>
-            </w:pPr>
-            <w:r>
-              <w:rPr>
-                <w:rFonts w:ascii="Open Sans" w:cs="Open Sans" w:eastAsia="Open Sans" w:hAnsi="Open Sans"/>
-                <w:color w:val="000000"/>
-                <w:sz w:val="18"/>
-                <w:szCs w:val="18"/>
-                <w:shd w:fill="auto" w:val="clear"/>
-                <w:rtl w:val="0"/>
-              </w:rPr>
-              <w:t xml:space="preserve">- 2 Stk Haltegriff clivia plus 32/400mm m. Ros. Edelstahl glatt poliert, VIGOUR</w:t>
-            </w:r>
-          </w:p>
-          <w:p>
-            <w:pPr>
-              <w:spacing w:after="0" w:before="0" w:line="278.00000000000006" w:lineRule="auto"/>
-              <w:ind w:left="0" w:right="314" w:firstLine="0"/>
-              <w:jc w:val="left"/>
-              <w:rPr>
-                <w:rFonts w:ascii="Open Sans" w:cs="Open Sans" w:eastAsia="Open Sans" w:hAnsi="Open Sans"/>
-                <w:color w:val="000000"/>
-                <w:sz w:val="18"/>
-                <w:szCs w:val="18"/>
-                <w:shd w:fill="auto" w:val="clear"/>
-              </w:rPr>
-            </w:pPr>
-            <w:r>
-              <w:rPr>
-                <w:rFonts w:ascii="Open Sans" w:cs="Open Sans" w:eastAsia="Open Sans" w:hAnsi="Open Sans"/>
-                <w:color w:val="000000"/>
-                <w:sz w:val="18"/>
-                <w:szCs w:val="18"/>
-                <w:shd w:fill="auto" w:val="clear"/>
-                <w:rtl w:val="0"/>
-              </w:rPr>
-              <w:t xml:space="preserve">- 1 Stk Sonderduschabtrennung Hassmann</w:t>
-            </w:r>
-          </w:p>
-          <w:p>
-            <w:pPr>
-              <w:spacing w:after="0" w:before="0" w:line="278.00000000000006" w:lineRule="auto"/>
-              <w:ind w:left="0" w:right="314" w:firstLine="0"/>
-              <w:jc w:val="left"/>
-              <w:rPr>
-                <w:rFonts w:ascii="Open Sans" w:cs="Open Sans" w:eastAsia="Open Sans" w:hAnsi="Open Sans"/>
-                <w:color w:val="000000"/>
-                <w:sz w:val="18"/>
-                <w:szCs w:val="18"/>
-                <w:shd w:fill="auto" w:val="clear"/>
-              </w:rPr>
-            </w:pPr>
-            <w:r>
-              <w:rPr>
-                <w:rFonts w:ascii="Open Sans" w:cs="Open Sans" w:eastAsia="Open Sans" w:hAnsi="Open Sans"/>
-                <w:color w:val="000000"/>
-                <w:sz w:val="18"/>
-                <w:szCs w:val="18"/>
-                <w:shd w:fill="auto" w:val="clear"/>
-                <w:rtl w:val="0"/>
-              </w:rPr>
-              <w:t xml:space="preserve">- 2 Stk Pendeltür Hassmann</w:t>
-            </w:r>
-          </w:p>
-          <w:p>
-            <w:pPr>
-              <w:spacing w:after="0" w:before="0" w:line="278.00000000000006" w:lineRule="auto"/>
-              <w:ind w:left="0" w:right="314" w:firstLine="0"/>
-              <w:jc w:val="left"/>
-              <w:rPr>
-                <w:rFonts w:ascii="Open Sans" w:cs="Open Sans" w:eastAsia="Open Sans" w:hAnsi="Open Sans"/>
-                <w:color w:val="000000"/>
-                <w:sz w:val="18"/>
-                <w:szCs w:val="18"/>
-                <w:shd w:fill="auto" w:val="clear"/>
-              </w:rPr>
-            </w:pPr>
-            <w:r>
-              <w:rPr>
-                <w:rFonts w:ascii="Open Sans" w:cs="Open Sans" w:eastAsia="Open Sans" w:hAnsi="Open Sans"/>
-                <w:color w:val="000000"/>
-                <w:sz w:val="18"/>
-                <w:szCs w:val="18"/>
-                <w:shd w:fill="auto" w:val="clear"/>
-                <w:rtl w:val="0"/>
-              </w:rPr>
-              <w:t xml:space="preserve">- 1 Stk Falt-Pendeltür Hassmann</w:t>
+              <w:t xml:space="preserve">- 1 Stk Gleittür Hassmann</w:t>
             </w:r>
           </w:p>
         </w:tc>
@@ -2312,247 +2031,6 @@
                 <w:shd w:fill="auto" w:val="clear"/>
               </w:rPr>
             </w:pPr>
-            <w:r>
-              <w:rPr>
-                <w:rtl w:val="0"/>
-              </w:rPr>
-            </w:r>
-          </w:p>
-        </w:tc>
-      </w:tr>
-      <w:tr>
-        <w:trPr>
-          <w:cantSplit w:val="0"/>
-          <w:trHeight w:val="1" w:hRule="atLeast"/>
-          <w:tblHeader w:val="0"/>
-        </w:trPr>
-        <w:tc>
-          <w:tcPr>
-            <w:tcBorders>
-              <w:top w:color="ffffff" w:space="0" w:sz="8" w:val="single"/>
-              <w:left w:color="ffffff" w:space="0" w:sz="8" w:val="single"/>
-              <w:bottom w:color="ffffff" w:space="0" w:sz="8" w:val="single"/>
-              <w:right w:color="ffffff" w:space="0" w:sz="8" w:val="single"/>
-            </w:tcBorders>
-            <w:shd w:fill="ffffff" w:val="clear"/>
-            <w:tcMar>
-              <w:left w:w="56.0" w:type="dxa"/>
-              <w:right w:w="56.0" w:type="dxa"/>
-            </w:tcMar>
-          </w:tcPr>
-          <w:p>
-            <w:pPr>
-              <w:spacing w:after="0" w:before="0" w:line="278.00000000000006" w:lineRule="auto"/>
-              <w:ind w:left="0" w:right="-26" w:firstLine="0"/>
-              <w:jc w:val="left"/>
-              <w:rPr>
-                <w:color w:val="000000"/>
-              </w:rPr>
-            </w:pPr>
-            <w:r>
-              <w:rPr>
-                <w:rFonts w:ascii="Open Sans" w:cs="Open Sans" w:eastAsia="Open Sans" w:hAnsi="Open Sans"/>
-                <w:color w:val="000000"/>
-                <w:sz w:val="20"/>
-                <w:szCs w:val="20"/>
-                <w:shd w:fill="auto" w:val="clear"/>
-                <w:rtl w:val="0"/>
-              </w:rPr>
-              <w:t xml:space="preserve">003</w:t>
-            </w:r>
-            <w:r>
-              <w:rPr>
-                <w:rtl w:val="0"/>
-              </w:rPr>
-            </w:r>
-          </w:p>
-        </w:tc>
-        <w:tc>
-          <w:tcPr>
-            <w:tcBorders>
-              <w:top w:color="ffffff" w:space="0" w:sz="8" w:val="single"/>
-              <w:left w:color="ffffff" w:space="0" w:sz="8" w:val="single"/>
-              <w:bottom w:color="ffffff" w:space="0" w:sz="8" w:val="single"/>
-              <w:right w:color="ffffff" w:space="0" w:sz="8" w:val="single"/>
-            </w:tcBorders>
-            <w:shd w:fill="ffffff" w:val="clear"/>
-            <w:tcMar>
-              <w:left w:w="56.0" w:type="dxa"/>
-              <w:right w:w="56.0" w:type="dxa"/>
-            </w:tcMar>
-          </w:tcPr>
-          <w:p>
-            <w:pPr>
-              <w:spacing w:after="0" w:before="0" w:line="278.00000000000006" w:lineRule="auto"/>
-              <w:ind w:left="0" w:right="314" w:firstLine="0"/>
-              <w:jc w:val="left"/>
-              <w:rPr>
-                <w:color w:val="000000"/>
-              </w:rPr>
-            </w:pPr>
-            <w:r>
-              <w:rPr>
-                <w:rFonts w:ascii="Open Sans" w:cs="Open Sans" w:eastAsia="Open Sans" w:hAnsi="Open Sans"/>
-                <w:color w:val="000000"/>
-                <w:sz w:val="20"/>
-                <w:szCs w:val="20"/>
-                <w:shd w:fill="auto" w:val="clear"/>
-                <w:rtl w:val="0"/>
-              </w:rPr>
-              <w:t xml:space="preserve">1 Stk</w:t>
-            </w:r>
-            <w:r>
-              <w:rPr>
-                <w:rtl w:val="0"/>
-              </w:rPr>
-            </w:r>
-          </w:p>
-        </w:tc>
-        <w:tc>
-          <w:tcPr>
-            <w:tcBorders>
-              <w:top w:color="ffffff" w:space="0" w:sz="8" w:val="single"/>
-              <w:left w:color="ffffff" w:space="0" w:sz="8" w:val="single"/>
-              <w:bottom w:color="ffffff" w:space="0" w:sz="8" w:val="single"/>
-              <w:right w:color="ffffff" w:space="0" w:sz="8" w:val="single"/>
-            </w:tcBorders>
-            <w:shd w:fill="ffffff" w:val="clear"/>
-            <w:tcMar>
-              <w:left w:w="56.0" w:type="dxa"/>
-              <w:right w:w="56.0" w:type="dxa"/>
-            </w:tcMar>
-          </w:tcPr>
-          <w:p>
-            <w:pPr>
-              <w:spacing w:after="0" w:before="0" w:line="278.00000000000006" w:lineRule="auto"/>
-              <w:ind w:left="0" w:right="314" w:firstLine="0"/>
-              <w:jc w:val="left"/>
-              <w:rPr>
-                <w:rFonts w:ascii="Open Sans" w:cs="Open Sans" w:eastAsia="Open Sans" w:hAnsi="Open Sans"/>
-                <w:b w:val="1"/>
-                <w:color w:val="000000"/>
-                <w:sz w:val="18"/>
-                <w:szCs w:val="18"/>
-                <w:shd w:fill="auto" w:val="clear"/>
-              </w:rPr>
-            </w:pPr>
-            <w:r>
-              <w:rPr>
-                <w:rFonts w:ascii="Open Sans" w:cs="Open Sans" w:eastAsia="Open Sans" w:hAnsi="Open Sans"/>
-                <w:b w:val="1"/>
-                <w:color w:val="000000"/>
-                <w:sz w:val="18"/>
-                <w:szCs w:val="18"/>
-                <w:shd w:fill="auto" w:val="clear"/>
-                <w:rtl w:val="0"/>
-              </w:rPr>
-              <w:t xml:space="preserve">Aktion: Haltegriff</w:t>
-            </w:r>
-          </w:p>
-          <w:p>
-            <w:pPr>
-              <w:spacing w:after="0" w:before="0" w:line="278.00000000000006" w:lineRule="auto"/>
-              <w:ind w:left="0" w:right="314" w:firstLine="0"/>
-              <w:jc w:val="left"/>
-              <w:rPr>
-                <w:color w:val="000000"/>
-                <w:sz w:val="18"/>
-                <w:szCs w:val="18"/>
-              </w:rPr>
-            </w:pPr>
-            <w:r>
-              <w:rPr>
-                <w:rFonts w:ascii="Open Sans" w:cs="Open Sans" w:eastAsia="Open Sans" w:hAnsi="Open Sans"/>
-                <w:color w:val="000000"/>
-                <w:sz w:val="18"/>
-                <w:szCs w:val="18"/>
-                <w:shd w:fill="auto" w:val="clear"/>
-                <w:rtl w:val="0"/>
-              </w:rPr>
-              <w:t xml:space="preserve">1 Haltegriff gratis im Wert von 175 € inkl. Lieferung und Montage</w:t>
-            </w:r>
-            <w:r>
-              <w:rPr>
-                <w:rtl w:val="0"/>
-              </w:rPr>
-            </w:r>
-          </w:p>
-        </w:tc>
-        <w:tc>
-          <w:tcPr>
-            <w:tcBorders>
-              <w:top w:color="ffffff" w:space="0" w:sz="8" w:val="single"/>
-              <w:left w:color="ffffff" w:space="0" w:sz="8" w:val="single"/>
-              <w:bottom w:color="ffffff" w:space="0" w:sz="8" w:val="single"/>
-              <w:right w:color="ffffff" w:space="0" w:sz="8" w:val="single"/>
-            </w:tcBorders>
-            <w:shd w:fill="ffffff" w:val="clear"/>
-            <w:tcMar>
-              <w:left w:w="56.0" w:type="dxa"/>
-              <w:right w:w="56.0" w:type="dxa"/>
-            </w:tcMar>
-          </w:tcPr>
-          <w:p>
-            <w:pPr>
-              <w:spacing w:after="0" w:before="0" w:line="278.00000000000006" w:lineRule="auto"/>
-              <w:ind w:left="0" w:right="314" w:firstLine="0"/>
-              <w:jc w:val="left"/>
-              <w:rPr>
-                <w:color w:val="000000"/>
-              </w:rPr>
-            </w:pPr>
-            <w:r>
-              <w:rPr>
-                <w:rFonts w:ascii="Open Sans" w:cs="Open Sans" w:eastAsia="Open Sans" w:hAnsi="Open Sans"/>
-                <w:color w:val="000000"/>
-                <w:sz w:val="20"/>
-                <w:szCs w:val="20"/>
-                <w:shd w:fill="auto" w:val="clear"/>
-                <w:rtl w:val="0"/>
-              </w:rPr>
-              <w:t xml:space="preserve">0,00 €</w:t>
-            </w:r>
-            <w:r>
-              <w:rPr>
-                <w:rtl w:val="0"/>
-              </w:rPr>
-            </w:r>
-          </w:p>
-        </w:tc>
-        <w:tc>
-          <w:tcPr>
-            <w:tcBorders>
-              <w:top w:color="ffffff" w:space="0" w:sz="8" w:val="single"/>
-              <w:left w:color="ffffff" w:space="0" w:sz="8" w:val="single"/>
-              <w:bottom w:color="ffffff" w:space="0" w:sz="8" w:val="single"/>
-              <w:right w:color="ffffff" w:space="0" w:sz="8" w:val="single"/>
-            </w:tcBorders>
-            <w:shd w:fill="ffffff" w:val="clear"/>
-            <w:tcMar>
-              <w:left w:w="56.0" w:type="dxa"/>
-              <w:right w:w="56.0" w:type="dxa"/>
-            </w:tcMar>
-          </w:tcPr>
-          <w:p>
-            <w:pPr>
-              <w:spacing w:after="0" w:before="0" w:line="278.00000000000006" w:lineRule="auto"/>
-              <w:ind w:left="0" w:right="314" w:firstLine="0"/>
-              <w:jc w:val="center"/>
-              <w:rPr>
-                <w:color w:val="000000"/>
-              </w:rPr>
-            </w:pPr>
-            <w:r>
-              <w:rPr>
-                <w:rFonts w:ascii="Open Sans" w:cs="Open Sans" w:eastAsia="Open Sans" w:hAnsi="Open Sans"/>
-                <w:color w:val="000000"/>
-                <w:sz w:val="20"/>
-                <w:szCs w:val="20"/>
-                <w:shd w:fill="auto" w:val="clear"/>
-                <w:rtl w:val="0"/>
-              </w:rPr>
-              <w:t xml:space="preserve">0,00 €</w:t>
-            </w:r>
             <w:r>
               <w:rPr>
                 <w:rtl w:val="0"/>
@@ -2756,7 +2234,7 @@
                 <w:shd w:fill="auto" w:val="clear"/>
                 <w:rtl w:val="0"/>
               </w:rPr>
-              <w:t xml:space="preserve">5.770,36 €</w:t>
+              <w:t xml:space="preserve">3.486,44 €</w:t>
             </w:r>
             <w:r>
               <w:rPr>
@@ -2925,7 +2403,7 @@
                 <w:shd w:fill="auto" w:val="clear"/>
                 <w:rtl w:val="0"/>
               </w:rPr>
-              <w:t xml:space="preserve">1.096,37 €</w:t>
+              <w:t xml:space="preserve">662,42 €</w:t>
             </w:r>
             <w:r>
               <w:rPr>
@@ -3094,7 +2572,7 @@
                 <w:shd w:fill="auto" w:val="clear"/>
                 <w:rtl w:val="0"/>
               </w:rPr>
-              <w:t xml:space="preserve">6.866,73 €</w:t>
+              <w:t xml:space="preserve">4.148,86 €</w:t>
             </w:r>
             <w:r>
               <w:rPr>

</xml_diff>

<commit_message>
storing the data and fetching it again using ang number
</commit_message>
<xml_diff>
--- a/out-Angebot.docx
+++ b/out-Angebot.docx
@@ -129,7 +129,7 @@
                 <w:rFonts w:ascii="Open Sans" w:cs="Open Sans" w:eastAsia="Open Sans" w:hAnsi="Open Sans"/>
                 <w:rtl w:val="0"/>
               </w:rPr>
-              <w:t xml:space="preserve">Dora Humphrey</w:t>
+              <w:t xml:space="preserve">Abbot Vazquez</w:t>
             </w:r>
             <w:r>
               <w:rPr>
@@ -151,7 +151,7 @@
                 <w:rFonts w:ascii="Open Sans" w:cs="Open Sans" w:eastAsia="Open Sans" w:hAnsi="Open Sans"/>
                 <w:rtl w:val="0"/>
               </w:rPr>
-              <w:t xml:space="preserve">Sit sit possimus i,</w:t>
+              <w:t xml:space="preserve">Atque est optio ips,</w:t>
             </w:r>
             <w:r>
               <w:rPr>
@@ -175,7 +175,7 @@
                 <w:rFonts w:ascii="Open Sans" w:cs="Open Sans" w:eastAsia="Open Sans" w:hAnsi="Open Sans"/>
                 <w:rtl w:val="0"/>
               </w:rPr>
-              <w:t xml:space="preserve">Ut quia aliqua Ipsu Beatae omnis eos dic</w:t>
+              <w:t xml:space="preserve">Pariatur Quaerat et Veniam reprehenderi</w:t>
             </w:r>
             <w:r>
               <w:rPr>
@@ -310,7 +310,7 @@
                 <w:rFonts w:ascii="Open Sans" w:cs="Open Sans" w:eastAsia="Open Sans" w:hAnsi="Open Sans"/>
                 <w:rtl w:val="0"/>
               </w:rPr>
-              <w:t xml:space="preserve">ANG2025-1013-120745</w:t>
+              <w:t xml:space="preserve">ANG2025-1013-163304</w:t>
             </w:r>
             <w:r>
               <w:rPr>
@@ -345,7 +345,7 @@
                 <w:rFonts w:ascii="Open Sans" w:cs="Open Sans" w:eastAsia="Open Sans" w:hAnsi="Open Sans"/>
                 <w:rtl w:val="0"/>
               </w:rPr>
-              <w:t xml:space="preserve">11.02.1983</w:t>
+              <w:t xml:space="preserve">11.03.2016</w:t>
             </w:r>
             <w:r>
               <w:rPr>
@@ -379,7 +379,7 @@
                 <w:rFonts w:ascii="Open Sans" w:cs="Open Sans" w:eastAsia="Open Sans" w:hAnsi="Open Sans"/>
                 <w:rtl w:val="0"/>
               </w:rPr>
-              <w:t xml:space="preserve">Meghan Cameron</w:t>
+              <w:t xml:space="preserve">Hamish Banks</w:t>
             </w:r>
             <w:r>
               <w:rPr>
@@ -524,7 +524,7 @@
                 <w:rFonts w:ascii="Open Sans" w:cs="Open Sans" w:eastAsia="Open Sans" w:hAnsi="Open Sans"/>
                 <w:rtl w:val="0"/>
               </w:rPr>
-              <w:t xml:space="preserve">Carla Moses</w:t>
+              <w:t xml:space="preserve">Igor Weber</w:t>
             </w:r>
             <w:r>
               <w:rPr>
@@ -578,7 +578,7 @@
           <w:shd w:fill="auto" w:val="clear"/>
           <w:rtl w:val="0"/>
         </w:rPr>
-        <w:t xml:space="preserve">  Ihr Angebot ANG2025-1013-120745</w:t>
+        <w:t xml:space="preserve">  Ihr Angebot ANG2025-1013-163304</w:t>
       </w:r>
     </w:p>
     <w:p>
@@ -603,7 +603,7 @@
           <w:shd w:fill="auto" w:val="clear"/>
           <w:rtl w:val="0"/>
         </w:rPr>
-        <w:t xml:space="preserve">  Sehr geehrte Frau Humphrey,</w:t>
+        <w:t xml:space="preserve">  Sehr geehrte Frau Vazquez,</w:t>
         <w:br w:type="textWrapping"/>
       </w:r>
     </w:p>
@@ -1075,7 +1075,7 @@
                 <w:shd w:fill="auto" w:val="clear"/>
                 <w:rtl w:val="0"/>
               </w:rPr>
-              <w:t xml:space="preserve">1.903,50 €</w:t>
+              <w:t xml:space="preserve">1.109,10 €</w:t>
             </w:r>
             <w:r>
               <w:rPr>
@@ -1116,7 +1116,7 @@
                 <w:shd w:fill="auto" w:val="clear"/>
                 <w:rtl w:val="0"/>
               </w:rPr>
-              <w:t xml:space="preserve">1.903,50 €</w:t>
+              <w:t xml:space="preserve">1.109,10 €</w:t>
             </w:r>
             <w:r>
               <w:rPr>
@@ -1248,7 +1248,7 @@
                 <w:shd w:fill="auto" w:val="clear"/>
                 <w:rtl w:val="0"/>
               </w:rPr>
-              <w:t xml:space="preserve">- Verkleidung Deckenhoch im Dusch/ Wannenbereich</w:t>
+              <w:t xml:space="preserve">- Schließen der Fehlstellen</w:t>
             </w:r>
             <w:r>
               <w:rPr>
@@ -1276,7 +1276,7 @@
                 <w:shd w:fill="auto" w:val="clear"/>
                 <w:rtl w:val="0"/>
               </w:rPr>
-              <w:t xml:space="preserve">- Anbringen zusätzlicher Haltegriffe</w:t>
+              <w:t xml:space="preserve">- Anbringen zusätzlicher Stützklappgriffe</w:t>
             </w:r>
             <w:r>
               <w:rPr>
@@ -1433,7 +1433,7 @@
                 <w:shd w:fill="auto" w:val="clear"/>
                 <w:rtl w:val="0"/>
               </w:rPr>
-              <w:t xml:space="preserve">- 140 km Kilometerpauschale</w:t>
+              <w:t xml:space="preserve">- 126 km Kilometerpauschale</w:t>
             </w:r>
             <w:r>
               <w:rPr>
@@ -1719,7 +1719,7 @@
                 <w:shd w:fill="auto" w:val="clear"/>
                 <w:rtl w:val="0"/>
               </w:rPr>
-              <w:t xml:space="preserve">1.639,57 €</w:t>
+              <w:t xml:space="preserve">1.146,12 €</w:t>
             </w:r>
             <w:r>
               <w:rPr>
@@ -1751,7 +1751,7 @@
               <w:rPr>
                 <w:rtl w:val="0"/>
               </w:rPr>
-              <w:t xml:space="preserve">1.639,57 €</w:t>
+              <w:t xml:space="preserve">1.146,12 €</w:t>
             </w:r>
             <w:r>
               <w:rPr>
@@ -1971,7 +1971,7 @@
                 <w:shd w:fill="auto" w:val="clear"/>
                 <w:rtl w:val="0"/>
               </w:rPr>
-              <w:t xml:space="preserve">- 2 Stk Wandverkleidung 3.0 Alu 997×2550 mm — Farbe: Marmor weiß</w:t>
+              <w:t xml:space="preserve">- 1 Stk TRINNITY Wandabdichtung BASIS-Set 5 qm DW bis 100 x 100 / BW bis 180 x 80 cm</w:t>
             </w:r>
           </w:p>
           <w:p>
@@ -1996,7 +1996,7 @@
                 <w:shd w:fill="auto" w:val="clear"/>
                 <w:rtl w:val="0"/>
               </w:rPr>
-              <w:t xml:space="preserve">- 2 Stk Wandverkleidung 3.0 Alu 1497×2550 mm — Farbe: Marmor weiß</w:t>
+              <w:t xml:space="preserve">- 2 Stk Verbindungsprofil(e)</w:t>
             </w:r>
           </w:p>
           <w:p>
@@ -2021,7 +2021,7 @@
                 <w:shd w:fill="auto" w:val="clear"/>
                 <w:rtl w:val="0"/>
               </w:rPr>
-              <w:t xml:space="preserve">- 1 Stk TRINNITY Wandabdichtung BASIS-Set 5 qm DW bis 100 x 100 / BW bis 180 x 80 cm</w:t>
+              <w:t xml:space="preserve">- 1 Stk Stützklappgriff derby plus 600mm verchromt m. ABS-Ummantelung VIGOUR</w:t>
             </w:r>
           </w:p>
           <w:p>
@@ -2046,57 +2046,7 @@
                 <w:shd w:fill="auto" w:val="clear"/>
                 <w:rtl w:val="0"/>
               </w:rPr>
-              <w:t xml:space="preserve">- 14 Stk Wandverkleidungsklebstoff 3.0/4.0</w:t>
-            </w:r>
-          </w:p>
-          <w:p>
-            <w:pPr>
-              <w:spacing w:after="0" w:before="0" w:line="278.00000000000006" w:lineRule="auto"/>
-              <w:ind w:left="0" w:right="314" w:firstLine="0"/>
-              <w:jc w:val="left"/>
-              <w:rPr>
-                <w:rFonts w:ascii="Open Sans" w:cs="Open Sans" w:eastAsia="Open Sans" w:hAnsi="Open Sans"/>
-                <w:color w:val="000000"/>
-                <w:sz w:val="18"/>
-                <w:szCs w:val="18"/>
-                <w:shd w:fill="auto" w:val="clear"/>
-              </w:rPr>
-            </w:pPr>
-            <w:r>
-              <w:rPr>
-                <w:rFonts w:ascii="Open Sans" w:cs="Open Sans" w:eastAsia="Open Sans" w:hAnsi="Open Sans"/>
-                <w:color w:val="000000"/>
-                <w:sz w:val="18"/>
-                <w:szCs w:val="18"/>
-                <w:shd w:fill="auto" w:val="clear"/>
-                <w:rtl w:val="0"/>
-              </w:rPr>
-              <w:t xml:space="preserve">- 2 Stk Verbindungsprofil(e) (Plattenanzahl - 1 - ecken)</w:t>
-            </w:r>
-          </w:p>
-          <w:p>
-            <w:pPr>
-              <w:spacing w:after="0" w:before="0" w:line="278.00000000000006" w:lineRule="auto"/>
-              <w:ind w:left="0" w:right="314" w:firstLine="0"/>
-              <w:jc w:val="left"/>
-              <w:rPr>
-                <w:rFonts w:ascii="Open Sans" w:cs="Open Sans" w:eastAsia="Open Sans" w:hAnsi="Open Sans"/>
-                <w:color w:val="000000"/>
-                <w:sz w:val="18"/>
-                <w:szCs w:val="18"/>
-                <w:shd w:fill="auto" w:val="clear"/>
-              </w:rPr>
-            </w:pPr>
-            <w:r>
-              <w:rPr>
-                <w:rFonts w:ascii="Open Sans" w:cs="Open Sans" w:eastAsia="Open Sans" w:hAnsi="Open Sans"/>
-                <w:color w:val="000000"/>
-                <w:sz w:val="18"/>
-                <w:szCs w:val="18"/>
-                <w:shd w:fill="auto" w:val="clear"/>
-                <w:rtl w:val="0"/>
-              </w:rPr>
-              <w:t xml:space="preserve">- 1 Stk Haltegriff clivia plus 32/400mm m. Ros. Edelstahl glatt poliert, VIGOUR</w:t>
+              <w:t xml:space="preserve">- 1 Stk Duschwanne 100 x 70 x 3 cm</w:t>
             </w:r>
           </w:p>
         </w:tc>
@@ -2365,7 +2315,7 @@
                 <w:shd w:fill="auto" w:val="clear"/>
                 <w:rtl w:val="0"/>
               </w:rPr>
-              <w:t xml:space="preserve">4.064,42 €</w:t>
+              <w:t xml:space="preserve">2.753,28 €</w:t>
             </w:r>
             <w:r>
               <w:rPr>
@@ -2534,7 +2484,7 @@
                 <w:shd w:fill="auto" w:val="clear"/>
                 <w:rtl w:val="0"/>
               </w:rPr>
-              <w:t xml:space="preserve">772,24 €</w:t>
+              <w:t xml:space="preserve">523,12 €</w:t>
             </w:r>
             <w:r>
               <w:rPr>
@@ -2703,7 +2653,7 @@
                 <w:shd w:fill="auto" w:val="clear"/>
                 <w:rtl w:val="0"/>
               </w:rPr>
-              <w:t xml:space="preserve">4.836,66 €</w:t>
+              <w:t xml:space="preserve">3.276,40 €</w:t>
             </w:r>
             <w:r>
               <w:rPr>
@@ -2836,7 +2786,75 @@
           <w:shd w:fill="auto" w:val="clear"/>
           <w:rtl w:val="0"/>
         </w:rPr>
-        <w:t xml:space="preserve">abgerechnet. (Stundensatz-Facharbeiter: 59,50€ netto)</w:t>
+        <w:t xml:space="preserve">abgerechnet. (Stundensatz-Facharbeiter: 69,50€ netto)</w:t>
+        <w:br w:type="textWrapping"/>
+        <w:br w:type="textWrapping"/>
+        <w:t xml:space="preserve">Der</w:t>
+      </w:r>
+      <w:r>
+        <w:rPr>
+          <w:rFonts w:ascii="Open Sans" w:cs="Open Sans" w:eastAsia="Open Sans" w:hAnsi="Open Sans"/>
+          <w:color w:val="030303"/>
+          <w:rtl w:val="0"/>
+        </w:rPr>
+        <w:t xml:space="preserve"> </w:t>
+      </w:r>
+      <w:r>
+        <w:rPr>
+          <w:rFonts w:ascii="Open Sans" w:cs="Open Sans" w:eastAsia="Open Sans" w:hAnsi="Open Sans"/>
+          <w:color w:val="030303"/>
+          <w:sz w:val="22"/>
+          <w:szCs w:val="22"/>
+          <w:shd w:fill="auto" w:val="clear"/>
+          <w:rtl w:val="0"/>
+        </w:rPr>
+        <w:t xml:space="preserve">Selbstkostenanteil beträgt </w:t>
+      </w:r>
+      <w:r>
+        <w:rPr>
+          <w:rFonts w:ascii="Open Sans" w:cs="Open Sans" w:eastAsia="Open Sans" w:hAnsi="Open Sans"/>
+          <w:b w:val="1"/>
+          <w:color w:val="030303"/>
+          <w:sz w:val="22"/>
+          <w:szCs w:val="22"/>
+          <w:shd w:fill="auto" w:val="clear"/>
+          <w:rtl w:val="0"/>
+        </w:rPr>
+        <w:t xml:space="preserve">0,00 €</w:t>
+      </w:r>
+      <w:r>
+        <w:rPr>
+          <w:rFonts w:ascii="Open Sans" w:cs="Open Sans" w:eastAsia="Open Sans" w:hAnsi="Open Sans"/>
+          <w:color w:val="030303"/>
+          <w:sz w:val="22"/>
+          <w:szCs w:val="22"/>
+          <w:shd w:fill="auto" w:val="clear"/>
+          <w:rtl w:val="0"/>
+        </w:rPr>
+        <w:t xml:space="preserve"> unter Berücksichtigung eines gewährten Zuschusses durch die Pflegekasse i.H.v. </w:t>
+      </w:r>
+      <w:r>
+        <w:rPr>
+          <w:rFonts w:ascii="Open Sans" w:cs="Open Sans" w:eastAsia="Open Sans" w:hAnsi="Open Sans"/>
+          <w:b w:val="1"/>
+          <w:color w:val="030303"/>
+          <w:sz w:val="22"/>
+          <w:szCs w:val="22"/>
+          <w:shd w:fill="auto" w:val="clear"/>
+          <w:rtl w:val="0"/>
+        </w:rPr>
+        <w:t xml:space="preserve">4.180,00 €</w:t>
+      </w:r>
+      <w:r>
+        <w:rPr>
+          <w:rFonts w:ascii="Open Sans" w:cs="Open Sans" w:eastAsia="Open Sans" w:hAnsi="Open Sans"/>
+          <w:color w:val="030303"/>
+          <w:sz w:val="22"/>
+          <w:szCs w:val="22"/>
+          <w:shd w:fill="auto" w:val="clear"/>
+          <w:rtl w:val="0"/>
+        </w:rPr>
+        <w:t xml:space="preserve">.</w:t>
       </w:r>
       <w:r>
         <w:rPr>

</xml_diff>

<commit_message>
changing the way we fetch angebote
</commit_message>
<xml_diff>
--- a/out-Angebot.docx
+++ b/out-Angebot.docx
@@ -129,7 +129,7 @@
                 <w:rFonts w:ascii="Open Sans" w:cs="Open Sans" w:eastAsia="Open Sans" w:hAnsi="Open Sans"/>
                 <w:rtl w:val="0"/>
               </w:rPr>
-              <w:t xml:space="preserve">Abbot Vazquez</w:t>
+              <w:t xml:space="preserve">Jamalia Vance</w:t>
             </w:r>
             <w:r>
               <w:rPr>
@@ -151,7 +151,7 @@
                 <w:rFonts w:ascii="Open Sans" w:cs="Open Sans" w:eastAsia="Open Sans" w:hAnsi="Open Sans"/>
                 <w:rtl w:val="0"/>
               </w:rPr>
-              <w:t xml:space="preserve">Atque est optio ips,</w:t>
+              <w:t xml:space="preserve">Duis odio quia provi,</w:t>
             </w:r>
             <w:r>
               <w:rPr>
@@ -175,7 +175,7 @@
                 <w:rFonts w:ascii="Open Sans" w:cs="Open Sans" w:eastAsia="Open Sans" w:hAnsi="Open Sans"/>
                 <w:rtl w:val="0"/>
               </w:rPr>
-              <w:t xml:space="preserve">Pariatur Quaerat et Veniam reprehenderi</w:t>
+              <w:t xml:space="preserve">Perspiciatis ex sed Esse incidunt volu</w:t>
             </w:r>
             <w:r>
               <w:rPr>
@@ -310,7 +310,7 @@
                 <w:rFonts w:ascii="Open Sans" w:cs="Open Sans" w:eastAsia="Open Sans" w:hAnsi="Open Sans"/>
                 <w:rtl w:val="0"/>
               </w:rPr>
-              <w:t xml:space="preserve">ANG2025-1013-163304</w:t>
+              <w:t xml:space="preserve">ANG2025-1014-090428</w:t>
             </w:r>
             <w:r>
               <w:rPr>
@@ -345,7 +345,7 @@
                 <w:rFonts w:ascii="Open Sans" w:cs="Open Sans" w:eastAsia="Open Sans" w:hAnsi="Open Sans"/>
                 <w:rtl w:val="0"/>
               </w:rPr>
-              <w:t xml:space="preserve">11.03.2016</w:t>
+              <w:t xml:space="preserve">01.08.2017</w:t>
             </w:r>
             <w:r>
               <w:rPr>
@@ -379,7 +379,7 @@
                 <w:rFonts w:ascii="Open Sans" w:cs="Open Sans" w:eastAsia="Open Sans" w:hAnsi="Open Sans"/>
                 <w:rtl w:val="0"/>
               </w:rPr>
-              <w:t xml:space="preserve">Hamish Banks</w:t>
+              <w:t xml:space="preserve">Flavia Salazar</w:t>
             </w:r>
             <w:r>
               <w:rPr>
@@ -524,7 +524,7 @@
                 <w:rFonts w:ascii="Open Sans" w:cs="Open Sans" w:eastAsia="Open Sans" w:hAnsi="Open Sans"/>
                 <w:rtl w:val="0"/>
               </w:rPr>
-              <w:t xml:space="preserve">Igor Weber</w:t>
+              <w:t xml:space="preserve">Veda Moreno</w:t>
             </w:r>
             <w:r>
               <w:rPr>
@@ -578,7 +578,7 @@
           <w:shd w:fill="auto" w:val="clear"/>
           <w:rtl w:val="0"/>
         </w:rPr>
-        <w:t xml:space="preserve">  Ihr Angebot ANG2025-1013-163304</w:t>
+        <w:t xml:space="preserve">  Ihr Angebot ANG2025-1014-090428</w:t>
       </w:r>
     </w:p>
     <w:p>
@@ -603,7 +603,7 @@
           <w:shd w:fill="auto" w:val="clear"/>
           <w:rtl w:val="0"/>
         </w:rPr>
-        <w:t xml:space="preserve">  Sehr geehrte Frau Vazquez,</w:t>
+        <w:t xml:space="preserve">  Sehr geehrte Frau Vance,</w:t>
         <w:br w:type="textWrapping"/>
       </w:r>
     </w:p>
@@ -1075,7 +1075,7 @@
                 <w:shd w:fill="auto" w:val="clear"/>
                 <w:rtl w:val="0"/>
               </w:rPr>
-              <w:t xml:space="preserve">1.109,10 €</w:t>
+              <w:t xml:space="preserve">1.840,00 €</w:t>
             </w:r>
             <w:r>
               <w:rPr>
@@ -1116,7 +1116,7 @@
                 <w:shd w:fill="auto" w:val="clear"/>
                 <w:rtl w:val="0"/>
               </w:rPr>
-              <w:t xml:space="preserve">1.109,10 €</w:t>
+              <w:t xml:space="preserve">1.840,00 €</w:t>
             </w:r>
             <w:r>
               <w:rPr>
@@ -1248,7 +1248,7 @@
                 <w:shd w:fill="auto" w:val="clear"/>
                 <w:rtl w:val="0"/>
               </w:rPr>
-              <w:t xml:space="preserve">- Schließen der Fehlstellen</w:t>
+              <w:t xml:space="preserve">- Auswechseln des Duschsystems</w:t>
             </w:r>
             <w:r>
               <w:rPr>
@@ -1269,14 +1269,59 @@
             </w:pPr>
             <w:r>
               <w:rPr>
-                <w:rFonts w:ascii="Open Sans" w:cs="Open Sans" w:eastAsia="Open Sans" w:hAnsi="Open Sans"/>
+                <w:rtl w:val="0"/>
+              </w:rPr>
+            </w:r>
+          </w:p>
+          <w:p>
+            <w:pPr>
+              <w:spacing w:after="0" w:before="0" w:line="278.00000000000006" w:lineRule="auto"/>
+              <w:ind w:left="0" w:right="314" w:firstLine="0"/>
+              <w:jc w:val="left"/>
+              <w:rPr>
+                <w:color w:val="000000"/>
+                <w:sz w:val="20"/>
+                <w:szCs w:val="20"/>
+              </w:rPr>
+            </w:pPr>
+            <w:r>
+              <w:rPr>
+                <w:rFonts w:ascii="Open Sans" w:cs="Open Sans" w:eastAsia="Open Sans" w:hAnsi="Open Sans"/>
+                <w:color w:val="000000"/>
+                <w:sz w:val="20"/>
+                <w:szCs w:val="20"/>
+                <w:shd w:fill="auto" w:val="clear"/>
+                <w:rtl w:val="0"/>
+              </w:rPr>
+              <w:t xml:space="preserve">Enthält je Einheit</w:t>
+            </w:r>
+            <w:r>
+              <w:rPr>
+                <w:rtl w:val="0"/>
+              </w:rPr>
+            </w:r>
+          </w:p>
+          <w:p>
+            <w:pPr>
+              <w:spacing w:after="0" w:before="0" w:line="278.00000000000006" w:lineRule="auto"/>
+              <w:ind w:left="0" w:right="314" w:firstLine="0"/>
+              <w:jc w:val="left"/>
+              <w:rPr>
                 <w:color w:val="000000"/>
                 <w:sz w:val="18"/>
                 <w:szCs w:val="18"/>
-                <w:shd w:fill="auto" w:val="clear"/>
-                <w:rtl w:val="0"/>
-              </w:rPr>
-              <w:t xml:space="preserve">- Anbringen zusätzlicher Stützklappgriffe</w:t>
+              </w:rPr>
+            </w:pPr>
+            <w:r>
+              <w:rPr>
+                <w:rFonts w:ascii="Open Sans" w:cs="Open Sans" w:eastAsia="Open Sans" w:hAnsi="Open Sans"/>
+                <w:color w:val="000000"/>
+                <w:sz w:val="18"/>
+                <w:szCs w:val="18"/>
+                <w:shd w:fill="auto" w:val="clear"/>
+                <w:rtl w:val="0"/>
+              </w:rPr>
+              <w:t xml:space="preserve">- 1,00 Stk Fahrzeugbereitstellung</w:t>
             </w:r>
             <w:r>
               <w:rPr>
@@ -1297,6 +1342,17 @@
             </w:pPr>
             <w:r>
               <w:rPr>
+                <w:rFonts w:ascii="Open Sans" w:cs="Open Sans" w:eastAsia="Open Sans" w:hAnsi="Open Sans"/>
+                <w:color w:val="000000"/>
+                <w:sz w:val="18"/>
+                <w:szCs w:val="18"/>
+                <w:shd w:fill="auto" w:val="clear"/>
+                <w:rtl w:val="0"/>
+              </w:rPr>
+              <w:t xml:space="preserve">- 1,00 Stk Bereitstellung und Vorhaltung von Maschinen &amp; Werkzeugen</w:t>
+            </w:r>
+            <w:r>
+              <w:rPr>
                 <w:rtl w:val="0"/>
               </w:rPr>
             </w:r>
@@ -1308,20 +1364,20 @@
               <w:jc w:val="left"/>
               <w:rPr>
                 <w:color w:val="000000"/>
-                <w:sz w:val="20"/>
-                <w:szCs w:val="20"/>
-              </w:rPr>
-            </w:pPr>
-            <w:r>
-              <w:rPr>
-                <w:rFonts w:ascii="Open Sans" w:cs="Open Sans" w:eastAsia="Open Sans" w:hAnsi="Open Sans"/>
-                <w:color w:val="000000"/>
-                <w:sz w:val="20"/>
-                <w:szCs w:val="20"/>
-                <w:shd w:fill="auto" w:val="clear"/>
-                <w:rtl w:val="0"/>
-              </w:rPr>
-              <w:t xml:space="preserve">Enthält je Einheit</w:t>
+                <w:sz w:val="18"/>
+                <w:szCs w:val="18"/>
+              </w:rPr>
+            </w:pPr>
+            <w:r>
+              <w:rPr>
+                <w:rFonts w:ascii="Open Sans" w:cs="Open Sans" w:eastAsia="Open Sans" w:hAnsi="Open Sans"/>
+                <w:color w:val="000000"/>
+                <w:sz w:val="18"/>
+                <w:szCs w:val="18"/>
+                <w:shd w:fill="auto" w:val="clear"/>
+                <w:rtl w:val="0"/>
+              </w:rPr>
+              <w:t xml:space="preserve">- 1,00 Stk Beräumung der Baustelle</w:t>
             </w:r>
             <w:r>
               <w:rPr>
@@ -1349,91 +1405,7 @@
                 <w:shd w:fill="auto" w:val="clear"/>
                 <w:rtl w:val="0"/>
               </w:rPr>
-              <w:t xml:space="preserve">- 1,00 Stk Fahrzeugbereitstellung</w:t>
-            </w:r>
-            <w:r>
-              <w:rPr>
-                <w:rtl w:val="0"/>
-              </w:rPr>
-            </w:r>
-          </w:p>
-          <w:p>
-            <w:pPr>
-              <w:spacing w:after="0" w:before="0" w:line="278.00000000000006" w:lineRule="auto"/>
-              <w:ind w:left="0" w:right="314" w:firstLine="0"/>
-              <w:jc w:val="left"/>
-              <w:rPr>
-                <w:color w:val="000000"/>
-                <w:sz w:val="18"/>
-                <w:szCs w:val="18"/>
-              </w:rPr>
-            </w:pPr>
-            <w:r>
-              <w:rPr>
-                <w:rFonts w:ascii="Open Sans" w:cs="Open Sans" w:eastAsia="Open Sans" w:hAnsi="Open Sans"/>
-                <w:color w:val="000000"/>
-                <w:sz w:val="18"/>
-                <w:szCs w:val="18"/>
-                <w:shd w:fill="auto" w:val="clear"/>
-                <w:rtl w:val="0"/>
-              </w:rPr>
-              <w:t xml:space="preserve">- 1,00 Stk Bereitstellung und Vorhaltung von Maschinen &amp; Werkzeugen</w:t>
-            </w:r>
-            <w:r>
-              <w:rPr>
-                <w:rtl w:val="0"/>
-              </w:rPr>
-            </w:r>
-          </w:p>
-          <w:p>
-            <w:pPr>
-              <w:spacing w:after="0" w:before="0" w:line="278.00000000000006" w:lineRule="auto"/>
-              <w:ind w:left="0" w:right="314" w:firstLine="0"/>
-              <w:jc w:val="left"/>
-              <w:rPr>
-                <w:color w:val="000000"/>
-                <w:sz w:val="18"/>
-                <w:szCs w:val="18"/>
-              </w:rPr>
-            </w:pPr>
-            <w:r>
-              <w:rPr>
-                <w:rFonts w:ascii="Open Sans" w:cs="Open Sans" w:eastAsia="Open Sans" w:hAnsi="Open Sans"/>
-                <w:color w:val="000000"/>
-                <w:sz w:val="18"/>
-                <w:szCs w:val="18"/>
-                <w:shd w:fill="auto" w:val="clear"/>
-                <w:rtl w:val="0"/>
-              </w:rPr>
-              <w:t xml:space="preserve">- 1,00 Stk Beräumung der Baustelle</w:t>
-            </w:r>
-            <w:r>
-              <w:rPr>
-                <w:rtl w:val="0"/>
-              </w:rPr>
-            </w:r>
-          </w:p>
-          <w:p>
-            <w:pPr>
-              <w:spacing w:after="0" w:before="0" w:line="278.00000000000006" w:lineRule="auto"/>
-              <w:ind w:left="0" w:right="314" w:firstLine="0"/>
-              <w:jc w:val="left"/>
-              <w:rPr>
-                <w:color w:val="000000"/>
-                <w:sz w:val="18"/>
-                <w:szCs w:val="18"/>
-              </w:rPr>
-            </w:pPr>
-            <w:r>
-              <w:rPr>
-                <w:rFonts w:ascii="Open Sans" w:cs="Open Sans" w:eastAsia="Open Sans" w:hAnsi="Open Sans"/>
-                <w:color w:val="000000"/>
-                <w:sz w:val="18"/>
-                <w:szCs w:val="18"/>
-                <w:shd w:fill="auto" w:val="clear"/>
-                <w:rtl w:val="0"/>
-              </w:rPr>
-              <w:t xml:space="preserve">- 126 km Kilometerpauschale</w:t>
+              <w:t xml:space="preserve">- 200 km Kilometerpauschale</w:t>
             </w:r>
             <w:r>
               <w:rPr>
@@ -1719,7 +1691,7 @@
                 <w:shd w:fill="auto" w:val="clear"/>
                 <w:rtl w:val="0"/>
               </w:rPr>
-              <w:t xml:space="preserve">1.146,12 €</w:t>
+              <w:t xml:space="preserve">821,95 €</w:t>
             </w:r>
             <w:r>
               <w:rPr>
@@ -1751,7 +1723,7 @@
               <w:rPr>
                 <w:rtl w:val="0"/>
               </w:rPr>
-              <w:t xml:space="preserve">1.146,12 €</w:t>
+              <w:t xml:space="preserve">821,95 €</w:t>
             </w:r>
             <w:r>
               <w:rPr>
@@ -1996,7 +1968,7 @@
                 <w:shd w:fill="auto" w:val="clear"/>
                 <w:rtl w:val="0"/>
               </w:rPr>
-              <w:t xml:space="preserve">- 2 Stk Verbindungsprofil(e)</w:t>
+              <w:t xml:space="preserve">- 1 Stk Wannenset individual 2.2 m. Wandhalter Schlauch u. HB 1-str. rund verchr. VIGOUR</w:t>
             </w:r>
           </w:p>
           <w:p>
@@ -2021,7 +1993,7 @@
                 <w:shd w:fill="auto" w:val="clear"/>
                 <w:rtl w:val="0"/>
               </w:rPr>
-              <w:t xml:space="preserve">- 1 Stk Stützklappgriff derby plus 600mm verchromt m. ABS-Ummantelung VIGOUR</w:t>
+              <w:t xml:space="preserve">- 1 Stk Duschsystem Tempesta Flex verchromt m. Umstellung KB 210mm Brausegarn. Grohe</w:t>
             </w:r>
           </w:p>
           <w:p>
@@ -2046,7 +2018,32 @@
                 <w:shd w:fill="auto" w:val="clear"/>
                 <w:rtl w:val="0"/>
               </w:rPr>
-              <w:t xml:space="preserve">- 1 Stk Duschwanne 100 x 70 x 3 cm</w:t>
+              <w:t xml:space="preserve">- 2 Stk Pendeltür Hassmann</w:t>
+            </w:r>
+          </w:p>
+          <w:p>
+            <w:pPr>
+              <w:spacing w:after="0" w:before="0" w:line="278.00000000000006" w:lineRule="auto"/>
+              <w:ind w:left="0" w:right="314" w:firstLine="0"/>
+              <w:jc w:val="left"/>
+              <w:rPr>
+                <w:rFonts w:ascii="Open Sans" w:cs="Open Sans" w:eastAsia="Open Sans" w:hAnsi="Open Sans"/>
+                <w:color w:val="000000"/>
+                <w:sz w:val="18"/>
+                <w:szCs w:val="18"/>
+                <w:shd w:fill="auto" w:val="clear"/>
+              </w:rPr>
+            </w:pPr>
+            <w:r>
+              <w:rPr>
+                <w:rFonts w:ascii="Open Sans" w:cs="Open Sans" w:eastAsia="Open Sans" w:hAnsi="Open Sans"/>
+                <w:color w:val="000000"/>
+                <w:sz w:val="18"/>
+                <w:szCs w:val="18"/>
+                <w:shd w:fill="auto" w:val="clear"/>
+                <w:rtl w:val="0"/>
+              </w:rPr>
+              <w:t xml:space="preserve">- 1 Stk Duschwanne 70 x 70 x 3 cm</w:t>
             </w:r>
           </w:p>
         </w:tc>
@@ -2315,7 +2312,7 @@
                 <w:shd w:fill="auto" w:val="clear"/>
                 <w:rtl w:val="0"/>
               </w:rPr>
-              <w:t xml:space="preserve">2.753,28 €</w:t>
+              <w:t xml:space="preserve">2.897,13 €</w:t>
             </w:r>
             <w:r>
               <w:rPr>
@@ -2484,7 +2481,7 @@
                 <w:shd w:fill="auto" w:val="clear"/>
                 <w:rtl w:val="0"/>
               </w:rPr>
-              <w:t xml:space="preserve">523,12 €</w:t>
+              <w:t xml:space="preserve">550,45 €</w:t>
             </w:r>
             <w:r>
               <w:rPr>
@@ -2653,7 +2650,7 @@
                 <w:shd w:fill="auto" w:val="clear"/>
                 <w:rtl w:val="0"/>
               </w:rPr>
-              <w:t xml:space="preserve">3.276,40 €</w:t>
+              <w:t xml:space="preserve">3.447,58 €</w:t>
             </w:r>
             <w:r>
               <w:rPr>
@@ -2786,75 +2783,7 @@
           <w:shd w:fill="auto" w:val="clear"/>
           <w:rtl w:val="0"/>
         </w:rPr>
-        <w:t xml:space="preserve">abgerechnet. (Stundensatz-Facharbeiter: 69,50€ netto)</w:t>
-        <w:br w:type="textWrapping"/>
-        <w:br w:type="textWrapping"/>
-        <w:t xml:space="preserve">Der</w:t>
-      </w:r>
-      <w:r>
-        <w:rPr>
-          <w:rFonts w:ascii="Open Sans" w:cs="Open Sans" w:eastAsia="Open Sans" w:hAnsi="Open Sans"/>
-          <w:color w:val="030303"/>
-          <w:rtl w:val="0"/>
-        </w:rPr>
-        <w:t xml:space="preserve"> </w:t>
-      </w:r>
-      <w:r>
-        <w:rPr>
-          <w:rFonts w:ascii="Open Sans" w:cs="Open Sans" w:eastAsia="Open Sans" w:hAnsi="Open Sans"/>
-          <w:color w:val="030303"/>
-          <w:sz w:val="22"/>
-          <w:szCs w:val="22"/>
-          <w:shd w:fill="auto" w:val="clear"/>
-          <w:rtl w:val="0"/>
-        </w:rPr>
-        <w:t xml:space="preserve">Selbstkostenanteil beträgt </w:t>
-      </w:r>
-      <w:r>
-        <w:rPr>
-          <w:rFonts w:ascii="Open Sans" w:cs="Open Sans" w:eastAsia="Open Sans" w:hAnsi="Open Sans"/>
-          <w:b w:val="1"/>
-          <w:color w:val="030303"/>
-          <w:sz w:val="22"/>
-          <w:szCs w:val="22"/>
-          <w:shd w:fill="auto" w:val="clear"/>
-          <w:rtl w:val="0"/>
-        </w:rPr>
-        <w:t xml:space="preserve">0,00 €</w:t>
-      </w:r>
-      <w:r>
-        <w:rPr>
-          <w:rFonts w:ascii="Open Sans" w:cs="Open Sans" w:eastAsia="Open Sans" w:hAnsi="Open Sans"/>
-          <w:color w:val="030303"/>
-          <w:sz w:val="22"/>
-          <w:szCs w:val="22"/>
-          <w:shd w:fill="auto" w:val="clear"/>
-          <w:rtl w:val="0"/>
-        </w:rPr>
-        <w:t xml:space="preserve"> unter Berücksichtigung eines gewährten Zuschusses durch die Pflegekasse i.H.v. </w:t>
-      </w:r>
-      <w:r>
-        <w:rPr>
-          <w:rFonts w:ascii="Open Sans" w:cs="Open Sans" w:eastAsia="Open Sans" w:hAnsi="Open Sans"/>
-          <w:b w:val="1"/>
-          <w:color w:val="030303"/>
-          <w:sz w:val="22"/>
-          <w:szCs w:val="22"/>
-          <w:shd w:fill="auto" w:val="clear"/>
-          <w:rtl w:val="0"/>
-        </w:rPr>
-        <w:t xml:space="preserve">4.180,00 €</w:t>
-      </w:r>
-      <w:r>
-        <w:rPr>
-          <w:rFonts w:ascii="Open Sans" w:cs="Open Sans" w:eastAsia="Open Sans" w:hAnsi="Open Sans"/>
-          <w:color w:val="030303"/>
-          <w:sz w:val="22"/>
-          <w:szCs w:val="22"/>
-          <w:shd w:fill="auto" w:val="clear"/>
-          <w:rtl w:val="0"/>
-        </w:rPr>
-        <w:t xml:space="preserve">.</w:t>
+        <w:t xml:space="preserve">abgerechnet. (Stundensatz-Facharbeiter: 59,50€ netto)</w:t>
       </w:r>
       <w:r>
         <w:rPr>

</xml_diff>

<commit_message>
fixing them missed Auszuführende Arbeiten after loading the angebote
</commit_message>
<xml_diff>
--- a/out-Angebot.docx
+++ b/out-Angebot.docx
@@ -129,7 +129,7 @@
                 <w:rFonts w:ascii="Open Sans" w:cs="Open Sans" w:eastAsia="Open Sans" w:hAnsi="Open Sans"/>
                 <w:rtl w:val="0"/>
               </w:rPr>
-              <w:t xml:space="preserve">Jamalia Vance</w:t>
+              <w:t xml:space="preserve">Maya Hebert</w:t>
             </w:r>
             <w:r>
               <w:rPr>
@@ -151,7 +151,7 @@
                 <w:rFonts w:ascii="Open Sans" w:cs="Open Sans" w:eastAsia="Open Sans" w:hAnsi="Open Sans"/>
                 <w:rtl w:val="0"/>
               </w:rPr>
-              <w:t xml:space="preserve">Duis odio quia provi,</w:t>
+              <w:t xml:space="preserve">Fugiat est esse nos,</w:t>
             </w:r>
             <w:r>
               <w:rPr>
@@ -175,7 +175,7 @@
                 <w:rFonts w:ascii="Open Sans" w:cs="Open Sans" w:eastAsia="Open Sans" w:hAnsi="Open Sans"/>
                 <w:rtl w:val="0"/>
               </w:rPr>
-              <w:t xml:space="preserve">Perspiciatis ex sed Esse incidunt volu</w:t>
+              <w:t xml:space="preserve">Obcaecati laboris do Ullamco ut soluta nu</w:t>
             </w:r>
             <w:r>
               <w:rPr>
@@ -310,7 +310,7 @@
                 <w:rFonts w:ascii="Open Sans" w:cs="Open Sans" w:eastAsia="Open Sans" w:hAnsi="Open Sans"/>
                 <w:rtl w:val="0"/>
               </w:rPr>
-              <w:t xml:space="preserve">ANG2025-1014-090428</w:t>
+              <w:t xml:space="preserve">ANG2025-1014-092728</w:t>
             </w:r>
             <w:r>
               <w:rPr>
@@ -345,7 +345,7 @@
                 <w:rFonts w:ascii="Open Sans" w:cs="Open Sans" w:eastAsia="Open Sans" w:hAnsi="Open Sans"/>
                 <w:rtl w:val="0"/>
               </w:rPr>
-              <w:t xml:space="preserve">01.08.2017</w:t>
+              <w:t xml:space="preserve">10.02.1980</w:t>
             </w:r>
             <w:r>
               <w:rPr>
@@ -379,7 +379,7 @@
                 <w:rFonts w:ascii="Open Sans" w:cs="Open Sans" w:eastAsia="Open Sans" w:hAnsi="Open Sans"/>
                 <w:rtl w:val="0"/>
               </w:rPr>
-              <w:t xml:space="preserve">Flavia Salazar</w:t>
+              <w:t xml:space="preserve">Quin Weaver</w:t>
             </w:r>
             <w:r>
               <w:rPr>
@@ -524,7 +524,7 @@
                 <w:rFonts w:ascii="Open Sans" w:cs="Open Sans" w:eastAsia="Open Sans" w:hAnsi="Open Sans"/>
                 <w:rtl w:val="0"/>
               </w:rPr>
-              <w:t xml:space="preserve">Veda Moreno</w:t>
+              <w:t xml:space="preserve">Chase Dominguez</w:t>
             </w:r>
             <w:r>
               <w:rPr>
@@ -578,7 +578,7 @@
           <w:shd w:fill="auto" w:val="clear"/>
           <w:rtl w:val="0"/>
         </w:rPr>
-        <w:t xml:space="preserve">  Ihr Angebot ANG2025-1014-090428</w:t>
+        <w:t xml:space="preserve">  Ihr Angebot ANG2025-1014-092728</w:t>
       </w:r>
     </w:p>
     <w:p>
@@ -603,7 +603,7 @@
           <w:shd w:fill="auto" w:val="clear"/>
           <w:rtl w:val="0"/>
         </w:rPr>
-        <w:t xml:space="preserve">  Sehr geehrte Frau Vance,</w:t>
+        <w:t xml:space="preserve">  Sehr geehrte Frau Hebert,</w:t>
         <w:br w:type="textWrapping"/>
       </w:r>
     </w:p>
@@ -1075,7 +1075,7 @@
                 <w:shd w:fill="auto" w:val="clear"/>
                 <w:rtl w:val="0"/>
               </w:rPr>
-              <w:t xml:space="preserve">1.840,00 €</w:t>
+              <w:t xml:space="preserve">2.018,40 €</w:t>
             </w:r>
             <w:r>
               <w:rPr>
@@ -1116,7 +1116,7 @@
                 <w:shd w:fill="auto" w:val="clear"/>
                 <w:rtl w:val="0"/>
               </w:rPr>
-              <w:t xml:space="preserve">1.840,00 €</w:t>
+              <w:t xml:space="preserve">2.018,40 €</w:t>
             </w:r>
             <w:r>
               <w:rPr>
@@ -1269,6 +1269,17 @@
             </w:pPr>
             <w:r>
               <w:rPr>
+                <w:rFonts w:ascii="Open Sans" w:cs="Open Sans" w:eastAsia="Open Sans" w:hAnsi="Open Sans"/>
+                <w:color w:val="000000"/>
+                <w:sz w:val="18"/>
+                <w:szCs w:val="18"/>
+                <w:shd w:fill="auto" w:val="clear"/>
+                <w:rtl w:val="0"/>
+              </w:rPr>
+              <w:t xml:space="preserve">- Anbringen zusätzlicher Haltegriffe</w:t>
+            </w:r>
+            <w:r>
+              <w:rPr>
                 <w:rtl w:val="0"/>
               </w:rPr>
             </w:r>
@@ -1280,6 +1291,23 @@
               <w:jc w:val="left"/>
               <w:rPr>
                 <w:color w:val="000000"/>
+                <w:sz w:val="18"/>
+                <w:szCs w:val="18"/>
+              </w:rPr>
+            </w:pPr>
+            <w:r>
+              <w:rPr>
+                <w:rtl w:val="0"/>
+              </w:rPr>
+            </w:r>
+          </w:p>
+          <w:p>
+            <w:pPr>
+              <w:spacing w:after="0" w:before="0" w:line="278.00000000000006" w:lineRule="auto"/>
+              <w:ind w:left="0" w:right="314" w:firstLine="0"/>
+              <w:jc w:val="left"/>
+              <w:rPr>
+                <w:color w:val="000000"/>
                 <w:sz w:val="20"/>
                 <w:szCs w:val="20"/>
               </w:rPr>
@@ -1405,7 +1433,7 @@
                 <w:shd w:fill="auto" w:val="clear"/>
                 <w:rtl w:val="0"/>
               </w:rPr>
-              <w:t xml:space="preserve">- 200 km Kilometerpauschale</w:t>
+              <w:t xml:space="preserve">- 24 km Kilometerpauschale</w:t>
             </w:r>
             <w:r>
               <w:rPr>
@@ -1691,7 +1719,7 @@
                 <w:shd w:fill="auto" w:val="clear"/>
                 <w:rtl w:val="0"/>
               </w:rPr>
-              <w:t xml:space="preserve">821,95 €</w:t>
+              <w:t xml:space="preserve">1.332,89 €</w:t>
             </w:r>
             <w:r>
               <w:rPr>
@@ -1723,7 +1751,7 @@
               <w:rPr>
                 <w:rtl w:val="0"/>
               </w:rPr>
-              <w:t xml:space="preserve">821,95 €</w:t>
+              <w:t xml:space="preserve">1.332,89 €</w:t>
             </w:r>
             <w:r>
               <w:rPr>
@@ -1943,7 +1971,7 @@
                 <w:shd w:fill="auto" w:val="clear"/>
                 <w:rtl w:val="0"/>
               </w:rPr>
-              <w:t xml:space="preserve">- 1 Stk TRINNITY Wandabdichtung BASIS-Set 5 qm DW bis 100 x 100 / BW bis 180 x 80 cm</w:t>
+              <w:t xml:space="preserve">- 1 Stk Wandverkleidung 3.0 Alu 997×2550 mm — Farbe: Marmor weiß</w:t>
             </w:r>
           </w:p>
           <w:p>
@@ -1968,7 +1996,7 @@
                 <w:shd w:fill="auto" w:val="clear"/>
                 <w:rtl w:val="0"/>
               </w:rPr>
-              <w:t xml:space="preserve">- 1 Stk Wannenset individual 2.2 m. Wandhalter Schlauch u. HB 1-str. rund verchr. VIGOUR</w:t>
+              <w:t xml:space="preserve">- 1 Stk Wandverkleidung 3.0 Alu 1497×2550 mm — Farbe: Marmor weiß</w:t>
             </w:r>
           </w:p>
           <w:p>
@@ -1993,7 +2021,132 @@
                 <w:shd w:fill="auto" w:val="clear"/>
                 <w:rtl w:val="0"/>
               </w:rPr>
-              <w:t xml:space="preserve">- 1 Stk Duschsystem Tempesta Flex verchromt m. Umstellung KB 210mm Brausegarn. Grohe</w:t>
+              <w:t xml:space="preserve">- 1 Stk TRINNITY Wandabdichtung BASIS-Set 5 qm DW bis 100 x 100 / BW bis 180 x 80 cm</w:t>
+            </w:r>
+          </w:p>
+          <w:p>
+            <w:pPr>
+              <w:spacing w:after="0" w:before="0" w:line="278.00000000000006" w:lineRule="auto"/>
+              <w:ind w:left="0" w:right="314" w:firstLine="0"/>
+              <w:jc w:val="left"/>
+              <w:rPr>
+                <w:rFonts w:ascii="Open Sans" w:cs="Open Sans" w:eastAsia="Open Sans" w:hAnsi="Open Sans"/>
+                <w:color w:val="000000"/>
+                <w:sz w:val="18"/>
+                <w:szCs w:val="18"/>
+                <w:shd w:fill="auto" w:val="clear"/>
+              </w:rPr>
+            </w:pPr>
+            <w:r>
+              <w:rPr>
+                <w:rFonts w:ascii="Open Sans" w:cs="Open Sans" w:eastAsia="Open Sans" w:hAnsi="Open Sans"/>
+                <w:color w:val="000000"/>
+                <w:sz w:val="18"/>
+                <w:szCs w:val="18"/>
+                <w:shd w:fill="auto" w:val="clear"/>
+                <w:rtl w:val="0"/>
+              </w:rPr>
+              <w:t xml:space="preserve">- 7 Stk Wandverkleidungsklebstoff 3.0/4.0</w:t>
+            </w:r>
+          </w:p>
+          <w:p>
+            <w:pPr>
+              <w:spacing w:after="0" w:before="0" w:line="278.00000000000006" w:lineRule="auto"/>
+              <w:ind w:left="0" w:right="314" w:firstLine="0"/>
+              <w:jc w:val="left"/>
+              <w:rPr>
+                <w:rFonts w:ascii="Open Sans" w:cs="Open Sans" w:eastAsia="Open Sans" w:hAnsi="Open Sans"/>
+                <w:color w:val="000000"/>
+                <w:sz w:val="18"/>
+                <w:szCs w:val="18"/>
+                <w:shd w:fill="auto" w:val="clear"/>
+              </w:rPr>
+            </w:pPr>
+            <w:r>
+              <w:rPr>
+                <w:rFonts w:ascii="Open Sans" w:cs="Open Sans" w:eastAsia="Open Sans" w:hAnsi="Open Sans"/>
+                <w:color w:val="000000"/>
+                <w:sz w:val="18"/>
+                <w:szCs w:val="18"/>
+                <w:shd w:fill="auto" w:val="clear"/>
+                <w:rtl w:val="0"/>
+              </w:rPr>
+              <w:t xml:space="preserve">- 1 Stk Abschlussprofil 3.0 255 cm silber eloxiert VIGOUR</w:t>
+            </w:r>
+          </w:p>
+          <w:p>
+            <w:pPr>
+              <w:spacing w:after="0" w:before="0" w:line="278.00000000000006" w:lineRule="auto"/>
+              <w:ind w:left="0" w:right="314" w:firstLine="0"/>
+              <w:jc w:val="left"/>
+              <w:rPr>
+                <w:rFonts w:ascii="Open Sans" w:cs="Open Sans" w:eastAsia="Open Sans" w:hAnsi="Open Sans"/>
+                <w:color w:val="000000"/>
+                <w:sz w:val="18"/>
+                <w:szCs w:val="18"/>
+                <w:shd w:fill="auto" w:val="clear"/>
+              </w:rPr>
+            </w:pPr>
+            <w:r>
+              <w:rPr>
+                <w:rFonts w:ascii="Open Sans" w:cs="Open Sans" w:eastAsia="Open Sans" w:hAnsi="Open Sans"/>
+                <w:color w:val="000000"/>
+                <w:sz w:val="18"/>
+                <w:szCs w:val="18"/>
+                <w:shd w:fill="auto" w:val="clear"/>
+                <w:rtl w:val="0"/>
+              </w:rPr>
+              <w:t xml:space="preserve">- 1 Stk Profilklebstoff (pro Abschlussprofil 1 Stk)</w:t>
+            </w:r>
+          </w:p>
+          <w:p>
+            <w:pPr>
+              <w:spacing w:after="0" w:before="0" w:line="278.00000000000006" w:lineRule="auto"/>
+              <w:ind w:left="0" w:right="314" w:firstLine="0"/>
+              <w:jc w:val="left"/>
+              <w:rPr>
+                <w:rFonts w:ascii="Open Sans" w:cs="Open Sans" w:eastAsia="Open Sans" w:hAnsi="Open Sans"/>
+                <w:color w:val="000000"/>
+                <w:sz w:val="18"/>
+                <w:szCs w:val="18"/>
+                <w:shd w:fill="auto" w:val="clear"/>
+              </w:rPr>
+            </w:pPr>
+            <w:r>
+              <w:rPr>
+                <w:rFonts w:ascii="Open Sans" w:cs="Open Sans" w:eastAsia="Open Sans" w:hAnsi="Open Sans"/>
+                <w:color w:val="000000"/>
+                <w:sz w:val="18"/>
+                <w:szCs w:val="18"/>
+                <w:shd w:fill="auto" w:val="clear"/>
+                <w:rtl w:val="0"/>
+              </w:rPr>
+              <w:t xml:space="preserve">- 1 Stk Wannenset individual 2.2 m. Wandhalter Schlauch u. HB 1-str. rund verchr. VIGOUR</w:t>
+            </w:r>
+          </w:p>
+          <w:p>
+            <w:pPr>
+              <w:spacing w:after="0" w:before="0" w:line="278.00000000000006" w:lineRule="auto"/>
+              <w:ind w:left="0" w:right="314" w:firstLine="0"/>
+              <w:jc w:val="left"/>
+              <w:rPr>
+                <w:rFonts w:ascii="Open Sans" w:cs="Open Sans" w:eastAsia="Open Sans" w:hAnsi="Open Sans"/>
+                <w:color w:val="000000"/>
+                <w:sz w:val="18"/>
+                <w:szCs w:val="18"/>
+                <w:shd w:fill="auto" w:val="clear"/>
+              </w:rPr>
+            </w:pPr>
+            <w:r>
+              <w:rPr>
+                <w:rFonts w:ascii="Open Sans" w:cs="Open Sans" w:eastAsia="Open Sans" w:hAnsi="Open Sans"/>
+                <w:color w:val="000000"/>
+                <w:sz w:val="18"/>
+                <w:szCs w:val="18"/>
+                <w:shd w:fill="auto" w:val="clear"/>
+                <w:rtl w:val="0"/>
+              </w:rPr>
+              <w:t xml:space="preserve">- 1 Stk Haltegriff clivia plus 32/400mm m. Ros. Edelstahl glatt poliert, VIGOUR</w:t>
             </w:r>
           </w:p>
           <w:p>
@@ -2312,7 +2465,7 @@
                 <w:shd w:fill="auto" w:val="clear"/>
                 <w:rtl w:val="0"/>
               </w:rPr>
-              <w:t xml:space="preserve">2.897,13 €</w:t>
+              <w:t xml:space="preserve">3.942,73 €</w:t>
             </w:r>
             <w:r>
               <w:rPr>
@@ -2481,7 +2634,7 @@
                 <w:shd w:fill="auto" w:val="clear"/>
                 <w:rtl w:val="0"/>
               </w:rPr>
-              <w:t xml:space="preserve">550,45 €</w:t>
+              <w:t xml:space="preserve">749,12 €</w:t>
             </w:r>
             <w:r>
               <w:rPr>
@@ -2650,7 +2803,7 @@
                 <w:shd w:fill="auto" w:val="clear"/>
                 <w:rtl w:val="0"/>
               </w:rPr>
-              <w:t xml:space="preserve">3.447,58 €</w:t>
+              <w:t xml:space="preserve">4.691,85 €</w:t>
             </w:r>
             <w:r>
               <w:rPr>
@@ -2783,7 +2936,75 @@
           <w:shd w:fill="auto" w:val="clear"/>
           <w:rtl w:val="0"/>
         </w:rPr>
-        <w:t xml:space="preserve">abgerechnet. (Stundensatz-Facharbeiter: 59,50€ netto)</w:t>
+        <w:t xml:space="preserve">abgerechnet. (Stundensatz-Facharbeiter: 69,50€ netto)</w:t>
+        <w:br w:type="textWrapping"/>
+        <w:br w:type="textWrapping"/>
+        <w:t xml:space="preserve">Der</w:t>
+      </w:r>
+      <w:r>
+        <w:rPr>
+          <w:rFonts w:ascii="Open Sans" w:cs="Open Sans" w:eastAsia="Open Sans" w:hAnsi="Open Sans"/>
+          <w:color w:val="030303"/>
+          <w:rtl w:val="0"/>
+        </w:rPr>
+        <w:t xml:space="preserve"> </w:t>
+      </w:r>
+      <w:r>
+        <w:rPr>
+          <w:rFonts w:ascii="Open Sans" w:cs="Open Sans" w:eastAsia="Open Sans" w:hAnsi="Open Sans"/>
+          <w:color w:val="030303"/>
+          <w:sz w:val="22"/>
+          <w:szCs w:val="22"/>
+          <w:shd w:fill="auto" w:val="clear"/>
+          <w:rtl w:val="0"/>
+        </w:rPr>
+        <w:t xml:space="preserve">Selbstkostenanteil beträgt </w:t>
+      </w:r>
+      <w:r>
+        <w:rPr>
+          <w:rFonts w:ascii="Open Sans" w:cs="Open Sans" w:eastAsia="Open Sans" w:hAnsi="Open Sans"/>
+          <w:b w:val="1"/>
+          <w:color w:val="030303"/>
+          <w:sz w:val="22"/>
+          <w:szCs w:val="22"/>
+          <w:shd w:fill="auto" w:val="clear"/>
+          <w:rtl w:val="0"/>
+        </w:rPr>
+        <w:t xml:space="preserve">711,85 €</w:t>
+      </w:r>
+      <w:r>
+        <w:rPr>
+          <w:rFonts w:ascii="Open Sans" w:cs="Open Sans" w:eastAsia="Open Sans" w:hAnsi="Open Sans"/>
+          <w:color w:val="030303"/>
+          <w:sz w:val="22"/>
+          <w:szCs w:val="22"/>
+          <w:shd w:fill="auto" w:val="clear"/>
+          <w:rtl w:val="0"/>
+        </w:rPr>
+        <w:t xml:space="preserve"> unter Berücksichtigung eines gewährten Zuschusses durch die Pflegekasse i.H.v. </w:t>
+      </w:r>
+      <w:r>
+        <w:rPr>
+          <w:rFonts w:ascii="Open Sans" w:cs="Open Sans" w:eastAsia="Open Sans" w:hAnsi="Open Sans"/>
+          <w:b w:val="1"/>
+          <w:color w:val="030303"/>
+          <w:sz w:val="22"/>
+          <w:szCs w:val="22"/>
+          <w:shd w:fill="auto" w:val="clear"/>
+          <w:rtl w:val="0"/>
+        </w:rPr>
+        <w:t xml:space="preserve">4.180,00 €</w:t>
+      </w:r>
+      <w:r>
+        <w:rPr>
+          <w:rFonts w:ascii="Open Sans" w:cs="Open Sans" w:eastAsia="Open Sans" w:hAnsi="Open Sans"/>
+          <w:color w:val="030303"/>
+          <w:sz w:val="22"/>
+          <w:szCs w:val="22"/>
+          <w:shd w:fill="auto" w:val="clear"/>
+          <w:rtl w:val="0"/>
+        </w:rPr>
+        <w:t xml:space="preserve">.</w:t>
       </w:r>
       <w:r>
         <w:rPr>

</xml_diff>

<commit_message>
loading angebote radio selections fixed
</commit_message>
<xml_diff>
--- a/out-Angebot.docx
+++ b/out-Angebot.docx
@@ -129,7 +129,7 @@
                 <w:rFonts w:ascii="Open Sans" w:cs="Open Sans" w:eastAsia="Open Sans" w:hAnsi="Open Sans"/>
                 <w:rtl w:val="0"/>
               </w:rPr>
-              <w:t xml:space="preserve">Maya Hebert</w:t>
+              <w:t xml:space="preserve">Amir Barrett</w:t>
             </w:r>
             <w:r>
               <w:rPr>
@@ -151,7 +151,7 @@
                 <w:rFonts w:ascii="Open Sans" w:cs="Open Sans" w:eastAsia="Open Sans" w:hAnsi="Open Sans"/>
                 <w:rtl w:val="0"/>
               </w:rPr>
-              <w:t xml:space="preserve">Fugiat est esse nos,</w:t>
+              <w:t xml:space="preserve">Quisquam aspernatur ,</w:t>
             </w:r>
             <w:r>
               <w:rPr>
@@ -175,7 +175,7 @@
                 <w:rFonts w:ascii="Open Sans" w:cs="Open Sans" w:eastAsia="Open Sans" w:hAnsi="Open Sans"/>
                 <w:rtl w:val="0"/>
               </w:rPr>
-              <w:t xml:space="preserve">Obcaecati laboris do Ullamco ut soluta nu</w:t>
+              <w:t xml:space="preserve">Tempor quo minima do Mollit id ullam non </w:t>
             </w:r>
             <w:r>
               <w:rPr>
@@ -310,7 +310,7 @@
                 <w:rFonts w:ascii="Open Sans" w:cs="Open Sans" w:eastAsia="Open Sans" w:hAnsi="Open Sans"/>
                 <w:rtl w:val="0"/>
               </w:rPr>
-              <w:t xml:space="preserve">ANG2025-1014-092728</w:t>
+              <w:t xml:space="preserve">ANG2025-1014-104723</w:t>
             </w:r>
             <w:r>
               <w:rPr>
@@ -345,7 +345,7 @@
                 <w:rFonts w:ascii="Open Sans" w:cs="Open Sans" w:eastAsia="Open Sans" w:hAnsi="Open Sans"/>
                 <w:rtl w:val="0"/>
               </w:rPr>
-              <w:t xml:space="preserve">10.02.1980</w:t>
+              <w:t xml:space="preserve">10.06.1984</w:t>
             </w:r>
             <w:r>
               <w:rPr>
@@ -379,7 +379,7 @@
                 <w:rFonts w:ascii="Open Sans" w:cs="Open Sans" w:eastAsia="Open Sans" w:hAnsi="Open Sans"/>
                 <w:rtl w:val="0"/>
               </w:rPr>
-              <w:t xml:space="preserve">Quin Weaver</w:t>
+              <w:t xml:space="preserve">Gannon Browning</w:t>
             </w:r>
             <w:r>
               <w:rPr>
@@ -524,7 +524,7 @@
                 <w:rFonts w:ascii="Open Sans" w:cs="Open Sans" w:eastAsia="Open Sans" w:hAnsi="Open Sans"/>
                 <w:rtl w:val="0"/>
               </w:rPr>
-              <w:t xml:space="preserve">Chase Dominguez</w:t>
+              <w:t xml:space="preserve">Gray Wise</w:t>
             </w:r>
             <w:r>
               <w:rPr>
@@ -578,7 +578,7 @@
           <w:shd w:fill="auto" w:val="clear"/>
           <w:rtl w:val="0"/>
         </w:rPr>
-        <w:t xml:space="preserve">  Ihr Angebot ANG2025-1014-092728</w:t>
+        <w:t xml:space="preserve">  Ihr Angebot ANG2025-1014-104723</w:t>
       </w:r>
     </w:p>
     <w:p>
@@ -603,7 +603,7 @@
           <w:shd w:fill="auto" w:val="clear"/>
           <w:rtl w:val="0"/>
         </w:rPr>
-        <w:t xml:space="preserve">  Sehr geehrte Frau Hebert,</w:t>
+        <w:t xml:space="preserve">  Sehr geehrte Frau Barrett,</w:t>
         <w:br w:type="textWrapping"/>
       </w:r>
     </w:p>
@@ -1075,7 +1075,7 @@
                 <w:shd w:fill="auto" w:val="clear"/>
                 <w:rtl w:val="0"/>
               </w:rPr>
-              <w:t xml:space="preserve">2.018,40 €</w:t>
+              <w:t xml:space="preserve">2.066,00 €</w:t>
             </w:r>
             <w:r>
               <w:rPr>
@@ -1116,7 +1116,7 @@
                 <w:shd w:fill="auto" w:val="clear"/>
                 <w:rtl w:val="0"/>
               </w:rPr>
-              <w:t xml:space="preserve">2.018,40 €</w:t>
+              <w:t xml:space="preserve">2.066,00 €</w:t>
             </w:r>
             <w:r>
               <w:rPr>
@@ -1248,7 +1248,7 @@
                 <w:shd w:fill="auto" w:val="clear"/>
                 <w:rtl w:val="0"/>
               </w:rPr>
-              <w:t xml:space="preserve">- Auswechseln des Duschsystems</w:t>
+              <w:t xml:space="preserve">- Verkleidung Deckenhoch im Dusch/ Wannenbereich</w:t>
             </w:r>
             <w:r>
               <w:rPr>
@@ -1276,7 +1276,7 @@
                 <w:shd w:fill="auto" w:val="clear"/>
                 <w:rtl w:val="0"/>
               </w:rPr>
-              <w:t xml:space="preserve">- Anbringen zusätzlicher Haltegriffe</w:t>
+              <w:t xml:space="preserve">- Einbau eines Klappsitzes</w:t>
             </w:r>
             <w:r>
               <w:rPr>
@@ -1433,7 +1433,7 @@
                 <w:shd w:fill="auto" w:val="clear"/>
                 <w:rtl w:val="0"/>
               </w:rPr>
-              <w:t xml:space="preserve">- 24 km Kilometerpauschale</w:t>
+              <w:t xml:space="preserve">- 160 km Kilometerpauschale</w:t>
             </w:r>
             <w:r>
               <w:rPr>
@@ -1719,7 +1719,7 @@
                 <w:shd w:fill="auto" w:val="clear"/>
                 <w:rtl w:val="0"/>
               </w:rPr>
-              <w:t xml:space="preserve">1.332,89 €</w:t>
+              <w:t xml:space="preserve">1.628,89 €</w:t>
             </w:r>
             <w:r>
               <w:rPr>
@@ -1751,7 +1751,7 @@
               <w:rPr>
                 <w:rtl w:val="0"/>
               </w:rPr>
-              <w:t xml:space="preserve">1.332,89 €</w:t>
+              <w:t xml:space="preserve">1.628,89 €</w:t>
             </w:r>
             <w:r>
               <w:rPr>
@@ -1971,7 +1971,7 @@
                 <w:shd w:fill="auto" w:val="clear"/>
                 <w:rtl w:val="0"/>
               </w:rPr>
-              <w:t xml:space="preserve">- 1 Stk Wandverkleidung 3.0 Alu 997×2550 mm — Farbe: Marmor weiß</w:t>
+              <w:t xml:space="preserve">- 2 Stk Wandverkleidung 3.0 Alu 997×2550 mm — Farbe: Marmor weiß</w:t>
             </w:r>
           </w:p>
           <w:p>
@@ -2046,7 +2046,7 @@
                 <w:shd w:fill="auto" w:val="clear"/>
                 <w:rtl w:val="0"/>
               </w:rPr>
-              <w:t xml:space="preserve">- 7 Stk Wandverkleidungsklebstoff 3.0/4.0</w:t>
+              <w:t xml:space="preserve">- 1 Stk Wandverkleidungsklebstoff 3.0/4.0</w:t>
             </w:r>
           </w:p>
           <w:p>
@@ -2096,7 +2096,7 @@
                 <w:shd w:fill="auto" w:val="clear"/>
                 <w:rtl w:val="0"/>
               </w:rPr>
-              <w:t xml:space="preserve">- 1 Stk Profilklebstoff (pro Abschlussprofil 1 Stk)</w:t>
+              <w:t xml:space="preserve">- 1 Stk Verbindungsprofil(e)</w:t>
             </w:r>
           </w:p>
           <w:p>
@@ -2121,7 +2121,7 @@
                 <w:shd w:fill="auto" w:val="clear"/>
                 <w:rtl w:val="0"/>
               </w:rPr>
-              <w:t xml:space="preserve">- 1 Stk Wannenset individual 2.2 m. Wandhalter Schlauch u. HB 1-str. rund verchr. VIGOUR</w:t>
+              <w:t xml:space="preserve">- 1 Stk Profilklebstoff (pro Abschlussprofil 1 Stk)</w:t>
             </w:r>
           </w:p>
           <w:p>
@@ -2146,7 +2146,7 @@
                 <w:shd w:fill="auto" w:val="clear"/>
                 <w:rtl w:val="0"/>
               </w:rPr>
-              <w:t xml:space="preserve">- 1 Stk Haltegriff clivia plus 32/400mm m. Ros. Edelstahl glatt poliert, VIGOUR</w:t>
+              <w:t xml:space="preserve">- 1 Stk Klappsitz derby plus 362x91x381mm belastbar bis 110 kg, verchromt VIGOUR</w:t>
             </w:r>
           </w:p>
           <w:p>
@@ -2171,7 +2171,7 @@
                 <w:shd w:fill="auto" w:val="clear"/>
                 <w:rtl w:val="0"/>
               </w:rPr>
-              <w:t xml:space="preserve">- 2 Stk Pendeltür Hassmann</w:t>
+              <w:t xml:space="preserve">- 2 Stk Gleittür Hassmann</w:t>
             </w:r>
           </w:p>
           <w:p>
@@ -2196,7 +2196,7 @@
                 <w:shd w:fill="auto" w:val="clear"/>
                 <w:rtl w:val="0"/>
               </w:rPr>
-              <w:t xml:space="preserve">- 1 Stk Duschwanne 70 x 70 x 3 cm</w:t>
+              <w:t xml:space="preserve">- 1 Stk Duschwanne 75 x 75 x 3 cm</w:t>
             </w:r>
           </w:p>
         </w:tc>
@@ -2262,6 +2262,247 @@
                 <w:shd w:fill="auto" w:val="clear"/>
               </w:rPr>
             </w:pPr>
+            <w:r>
+              <w:rPr>
+                <w:rtl w:val="0"/>
+              </w:rPr>
+            </w:r>
+          </w:p>
+        </w:tc>
+      </w:tr>
+      <w:tr>
+        <w:trPr>
+          <w:cantSplit w:val="0"/>
+          <w:trHeight w:val="1" w:hRule="atLeast"/>
+          <w:tblHeader w:val="0"/>
+        </w:trPr>
+        <w:tc>
+          <w:tcPr>
+            <w:tcBorders>
+              <w:top w:color="ffffff" w:space="0" w:sz="8" w:val="single"/>
+              <w:left w:color="ffffff" w:space="0" w:sz="8" w:val="single"/>
+              <w:bottom w:color="ffffff" w:space="0" w:sz="8" w:val="single"/>
+              <w:right w:color="ffffff" w:space="0" w:sz="8" w:val="single"/>
+            </w:tcBorders>
+            <w:shd w:fill="ffffff" w:val="clear"/>
+            <w:tcMar>
+              <w:left w:w="56.0" w:type="dxa"/>
+              <w:right w:w="56.0" w:type="dxa"/>
+            </w:tcMar>
+          </w:tcPr>
+          <w:p>
+            <w:pPr>
+              <w:spacing w:after="0" w:before="0" w:line="278.00000000000006" w:lineRule="auto"/>
+              <w:ind w:left="0" w:right="-26" w:firstLine="0"/>
+              <w:jc w:val="left"/>
+              <w:rPr>
+                <w:color w:val="000000"/>
+              </w:rPr>
+            </w:pPr>
+            <w:r>
+              <w:rPr>
+                <w:rFonts w:ascii="Open Sans" w:cs="Open Sans" w:eastAsia="Open Sans" w:hAnsi="Open Sans"/>
+                <w:color w:val="000000"/>
+                <w:sz w:val="20"/>
+                <w:szCs w:val="20"/>
+                <w:shd w:fill="auto" w:val="clear"/>
+                <w:rtl w:val="0"/>
+              </w:rPr>
+              <w:t xml:space="preserve">003</w:t>
+            </w:r>
+            <w:r>
+              <w:rPr>
+                <w:rtl w:val="0"/>
+              </w:rPr>
+            </w:r>
+          </w:p>
+        </w:tc>
+        <w:tc>
+          <w:tcPr>
+            <w:tcBorders>
+              <w:top w:color="ffffff" w:space="0" w:sz="8" w:val="single"/>
+              <w:left w:color="ffffff" w:space="0" w:sz="8" w:val="single"/>
+              <w:bottom w:color="ffffff" w:space="0" w:sz="8" w:val="single"/>
+              <w:right w:color="ffffff" w:space="0" w:sz="8" w:val="single"/>
+            </w:tcBorders>
+            <w:shd w:fill="ffffff" w:val="clear"/>
+            <w:tcMar>
+              <w:left w:w="56.0" w:type="dxa"/>
+              <w:right w:w="56.0" w:type="dxa"/>
+            </w:tcMar>
+          </w:tcPr>
+          <w:p>
+            <w:pPr>
+              <w:spacing w:after="0" w:before="0" w:line="278.00000000000006" w:lineRule="auto"/>
+              <w:ind w:left="0" w:right="314" w:firstLine="0"/>
+              <w:jc w:val="left"/>
+              <w:rPr>
+                <w:color w:val="000000"/>
+              </w:rPr>
+            </w:pPr>
+            <w:r>
+              <w:rPr>
+                <w:rFonts w:ascii="Open Sans" w:cs="Open Sans" w:eastAsia="Open Sans" w:hAnsi="Open Sans"/>
+                <w:color w:val="000000"/>
+                <w:sz w:val="20"/>
+                <w:szCs w:val="20"/>
+                <w:shd w:fill="auto" w:val="clear"/>
+                <w:rtl w:val="0"/>
+              </w:rPr>
+              <w:t xml:space="preserve">1 Stk</w:t>
+            </w:r>
+            <w:r>
+              <w:rPr>
+                <w:rtl w:val="0"/>
+              </w:rPr>
+            </w:r>
+          </w:p>
+        </w:tc>
+        <w:tc>
+          <w:tcPr>
+            <w:tcBorders>
+              <w:top w:color="ffffff" w:space="0" w:sz="8" w:val="single"/>
+              <w:left w:color="ffffff" w:space="0" w:sz="8" w:val="single"/>
+              <w:bottom w:color="ffffff" w:space="0" w:sz="8" w:val="single"/>
+              <w:right w:color="ffffff" w:space="0" w:sz="8" w:val="single"/>
+            </w:tcBorders>
+            <w:shd w:fill="ffffff" w:val="clear"/>
+            <w:tcMar>
+              <w:left w:w="56.0" w:type="dxa"/>
+              <w:right w:w="56.0" w:type="dxa"/>
+            </w:tcMar>
+          </w:tcPr>
+          <w:p>
+            <w:pPr>
+              <w:spacing w:after="0" w:before="0" w:line="278.00000000000006" w:lineRule="auto"/>
+              <w:ind w:left="0" w:right="314" w:firstLine="0"/>
+              <w:jc w:val="left"/>
+              <w:rPr>
+                <w:rFonts w:ascii="Open Sans" w:cs="Open Sans" w:eastAsia="Open Sans" w:hAnsi="Open Sans"/>
+                <w:b w:val="1"/>
+                <w:color w:val="000000"/>
+                <w:sz w:val="18"/>
+                <w:szCs w:val="18"/>
+                <w:shd w:fill="auto" w:val="clear"/>
+              </w:rPr>
+            </w:pPr>
+            <w:r>
+              <w:rPr>
+                <w:rFonts w:ascii="Open Sans" w:cs="Open Sans" w:eastAsia="Open Sans" w:hAnsi="Open Sans"/>
+                <w:b w:val="1"/>
+                <w:color w:val="000000"/>
+                <w:sz w:val="18"/>
+                <w:szCs w:val="18"/>
+                <w:shd w:fill="auto" w:val="clear"/>
+                <w:rtl w:val="0"/>
+              </w:rPr>
+              <w:t xml:space="preserve">Aktion: Haltegriff</w:t>
+            </w:r>
+          </w:p>
+          <w:p>
+            <w:pPr>
+              <w:spacing w:after="0" w:before="0" w:line="278.00000000000006" w:lineRule="auto"/>
+              <w:ind w:left="0" w:right="314" w:firstLine="0"/>
+              <w:jc w:val="left"/>
+              <w:rPr>
+                <w:color w:val="000000"/>
+                <w:sz w:val="18"/>
+                <w:szCs w:val="18"/>
+              </w:rPr>
+            </w:pPr>
+            <w:r>
+              <w:rPr>
+                <w:rFonts w:ascii="Open Sans" w:cs="Open Sans" w:eastAsia="Open Sans" w:hAnsi="Open Sans"/>
+                <w:color w:val="000000"/>
+                <w:sz w:val="18"/>
+                <w:szCs w:val="18"/>
+                <w:shd w:fill="auto" w:val="clear"/>
+                <w:rtl w:val="0"/>
+              </w:rPr>
+              <w:t xml:space="preserve">1 Haltegriff gratis im Wert von 175 € inkl. Lieferung und Montage</w:t>
+            </w:r>
+            <w:r>
+              <w:rPr>
+                <w:rtl w:val="0"/>
+              </w:rPr>
+            </w:r>
+          </w:p>
+        </w:tc>
+        <w:tc>
+          <w:tcPr>
+            <w:tcBorders>
+              <w:top w:color="ffffff" w:space="0" w:sz="8" w:val="single"/>
+              <w:left w:color="ffffff" w:space="0" w:sz="8" w:val="single"/>
+              <w:bottom w:color="ffffff" w:space="0" w:sz="8" w:val="single"/>
+              <w:right w:color="ffffff" w:space="0" w:sz="8" w:val="single"/>
+            </w:tcBorders>
+            <w:shd w:fill="ffffff" w:val="clear"/>
+            <w:tcMar>
+              <w:left w:w="56.0" w:type="dxa"/>
+              <w:right w:w="56.0" w:type="dxa"/>
+            </w:tcMar>
+          </w:tcPr>
+          <w:p>
+            <w:pPr>
+              <w:spacing w:after="0" w:before="0" w:line="278.00000000000006" w:lineRule="auto"/>
+              <w:ind w:left="0" w:right="314" w:firstLine="0"/>
+              <w:jc w:val="left"/>
+              <w:rPr>
+                <w:color w:val="000000"/>
+              </w:rPr>
+            </w:pPr>
+            <w:r>
+              <w:rPr>
+                <w:rFonts w:ascii="Open Sans" w:cs="Open Sans" w:eastAsia="Open Sans" w:hAnsi="Open Sans"/>
+                <w:color w:val="000000"/>
+                <w:sz w:val="20"/>
+                <w:szCs w:val="20"/>
+                <w:shd w:fill="auto" w:val="clear"/>
+                <w:rtl w:val="0"/>
+              </w:rPr>
+              <w:t xml:space="preserve">0,00 €</w:t>
+            </w:r>
+            <w:r>
+              <w:rPr>
+                <w:rtl w:val="0"/>
+              </w:rPr>
+            </w:r>
+          </w:p>
+        </w:tc>
+        <w:tc>
+          <w:tcPr>
+            <w:tcBorders>
+              <w:top w:color="ffffff" w:space="0" w:sz="8" w:val="single"/>
+              <w:left w:color="ffffff" w:space="0" w:sz="8" w:val="single"/>
+              <w:bottom w:color="ffffff" w:space="0" w:sz="8" w:val="single"/>
+              <w:right w:color="ffffff" w:space="0" w:sz="8" w:val="single"/>
+            </w:tcBorders>
+            <w:shd w:fill="ffffff" w:val="clear"/>
+            <w:tcMar>
+              <w:left w:w="56.0" w:type="dxa"/>
+              <w:right w:w="56.0" w:type="dxa"/>
+            </w:tcMar>
+          </w:tcPr>
+          <w:p>
+            <w:pPr>
+              <w:spacing w:after="0" w:before="0" w:line="278.00000000000006" w:lineRule="auto"/>
+              <w:ind w:left="0" w:right="314" w:firstLine="0"/>
+              <w:jc w:val="center"/>
+              <w:rPr>
+                <w:color w:val="000000"/>
+              </w:rPr>
+            </w:pPr>
+            <w:r>
+              <w:rPr>
+                <w:rFonts w:ascii="Open Sans" w:cs="Open Sans" w:eastAsia="Open Sans" w:hAnsi="Open Sans"/>
+                <w:color w:val="000000"/>
+                <w:sz w:val="20"/>
+                <w:szCs w:val="20"/>
+                <w:shd w:fill="auto" w:val="clear"/>
+                <w:rtl w:val="0"/>
+              </w:rPr>
+              <w:t xml:space="preserve">0,00 €</w:t>
+            </w:r>
             <w:r>
               <w:rPr>
                 <w:rtl w:val="0"/>
@@ -2465,7 +2706,7 @@
                 <w:shd w:fill="auto" w:val="clear"/>
                 <w:rtl w:val="0"/>
               </w:rPr>
-              <w:t xml:space="preserve">3.942,73 €</w:t>
+              <w:t xml:space="preserve">4.363,04 €</w:t>
             </w:r>
             <w:r>
               <w:rPr>
@@ -2634,7 +2875,7 @@
                 <w:shd w:fill="auto" w:val="clear"/>
                 <w:rtl w:val="0"/>
               </w:rPr>
-              <w:t xml:space="preserve">749,12 €</w:t>
+              <w:t xml:space="preserve">828,98 €</w:t>
             </w:r>
             <w:r>
               <w:rPr>
@@ -2803,7 +3044,7 @@
                 <w:shd w:fill="auto" w:val="clear"/>
                 <w:rtl w:val="0"/>
               </w:rPr>
-              <w:t xml:space="preserve">4.691,85 €</w:t>
+              <w:t xml:space="preserve">5.192,02 €</w:t>
             </w:r>
             <w:r>
               <w:rPr>
@@ -2937,74 +3178,6 @@
           <w:rtl w:val="0"/>
         </w:rPr>
         <w:t xml:space="preserve">abgerechnet. (Stundensatz-Facharbeiter: 69,50€ netto)</w:t>
-        <w:br w:type="textWrapping"/>
-        <w:br w:type="textWrapping"/>
-        <w:t xml:space="preserve">Der</w:t>
-      </w:r>
-      <w:r>
-        <w:rPr>
-          <w:rFonts w:ascii="Open Sans" w:cs="Open Sans" w:eastAsia="Open Sans" w:hAnsi="Open Sans"/>
-          <w:color w:val="030303"/>
-          <w:rtl w:val="0"/>
-        </w:rPr>
-        <w:t xml:space="preserve"> </w:t>
-      </w:r>
-      <w:r>
-        <w:rPr>
-          <w:rFonts w:ascii="Open Sans" w:cs="Open Sans" w:eastAsia="Open Sans" w:hAnsi="Open Sans"/>
-          <w:color w:val="030303"/>
-          <w:sz w:val="22"/>
-          <w:szCs w:val="22"/>
-          <w:shd w:fill="auto" w:val="clear"/>
-          <w:rtl w:val="0"/>
-        </w:rPr>
-        <w:t xml:space="preserve">Selbstkostenanteil beträgt </w:t>
-      </w:r>
-      <w:r>
-        <w:rPr>
-          <w:rFonts w:ascii="Open Sans" w:cs="Open Sans" w:eastAsia="Open Sans" w:hAnsi="Open Sans"/>
-          <w:b w:val="1"/>
-          <w:color w:val="030303"/>
-          <w:sz w:val="22"/>
-          <w:szCs w:val="22"/>
-          <w:shd w:fill="auto" w:val="clear"/>
-          <w:rtl w:val="0"/>
-        </w:rPr>
-        <w:t xml:space="preserve">711,85 €</w:t>
-      </w:r>
-      <w:r>
-        <w:rPr>
-          <w:rFonts w:ascii="Open Sans" w:cs="Open Sans" w:eastAsia="Open Sans" w:hAnsi="Open Sans"/>
-          <w:color w:val="030303"/>
-          <w:sz w:val="22"/>
-          <w:szCs w:val="22"/>
-          <w:shd w:fill="auto" w:val="clear"/>
-          <w:rtl w:val="0"/>
-        </w:rPr>
-        <w:t xml:space="preserve"> unter Berücksichtigung eines gewährten Zuschusses durch die Pflegekasse i.H.v. </w:t>
-      </w:r>
-      <w:r>
-        <w:rPr>
-          <w:rFonts w:ascii="Open Sans" w:cs="Open Sans" w:eastAsia="Open Sans" w:hAnsi="Open Sans"/>
-          <w:b w:val="1"/>
-          <w:color w:val="030303"/>
-          <w:sz w:val="22"/>
-          <w:szCs w:val="22"/>
-          <w:shd w:fill="auto" w:val="clear"/>
-          <w:rtl w:val="0"/>
-        </w:rPr>
-        <w:t xml:space="preserve">4.180,00 €</w:t>
-      </w:r>
-      <w:r>
-        <w:rPr>
-          <w:rFonts w:ascii="Open Sans" w:cs="Open Sans" w:eastAsia="Open Sans" w:hAnsi="Open Sans"/>
-          <w:color w:val="030303"/>
-          <w:sz w:val="22"/>
-          <w:szCs w:val="22"/>
-          <w:shd w:fill="auto" w:val="clear"/>
-          <w:rtl w:val="0"/>
-        </w:rPr>
-        <w:t xml:space="preserve">.</w:t>
       </w:r>
       <w:r>
         <w:rPr>

</xml_diff>

<commit_message>
loading angebote optional and Wandverkleidung correctly
</commit_message>
<xml_diff>
--- a/out-Angebot.docx
+++ b/out-Angebot.docx
@@ -129,7 +129,7 @@
                 <w:rFonts w:ascii="Open Sans" w:cs="Open Sans" w:eastAsia="Open Sans" w:hAnsi="Open Sans"/>
                 <w:rtl w:val="0"/>
               </w:rPr>
-              <w:t xml:space="preserve">Amir Barrett</w:t>
+              <w:t xml:space="preserve">Gary Duffy</w:t>
             </w:r>
             <w:r>
               <w:rPr>
@@ -151,7 +151,7 @@
                 <w:rFonts w:ascii="Open Sans" w:cs="Open Sans" w:eastAsia="Open Sans" w:hAnsi="Open Sans"/>
                 <w:rtl w:val="0"/>
               </w:rPr>
-              <w:t xml:space="preserve">Quisquam aspernatur ,</w:t>
+              <w:t xml:space="preserve">Eaque beatae qui qui,</w:t>
             </w:r>
             <w:r>
               <w:rPr>
@@ -175,7 +175,7 @@
                 <w:rFonts w:ascii="Open Sans" w:cs="Open Sans" w:eastAsia="Open Sans" w:hAnsi="Open Sans"/>
                 <w:rtl w:val="0"/>
               </w:rPr>
-              <w:t xml:space="preserve">Tempor quo minima do Mollit id ullam non </w:t>
+              <w:t xml:space="preserve">Et consectetur cons Repellendus Recusan</w:t>
             </w:r>
             <w:r>
               <w:rPr>
@@ -310,7 +310,7 @@
                 <w:rFonts w:ascii="Open Sans" w:cs="Open Sans" w:eastAsia="Open Sans" w:hAnsi="Open Sans"/>
                 <w:rtl w:val="0"/>
               </w:rPr>
-              <w:t xml:space="preserve">ANG2025-1014-104723</w:t>
+              <w:t xml:space="preserve">ANG2025-1014-112640</w:t>
             </w:r>
             <w:r>
               <w:rPr>
@@ -345,7 +345,7 @@
                 <w:rFonts w:ascii="Open Sans" w:cs="Open Sans" w:eastAsia="Open Sans" w:hAnsi="Open Sans"/>
                 <w:rtl w:val="0"/>
               </w:rPr>
-              <w:t xml:space="preserve">10.06.1984</w:t>
+              <w:t xml:space="preserve">10.09.2008</w:t>
             </w:r>
             <w:r>
               <w:rPr>
@@ -379,7 +379,7 @@
                 <w:rFonts w:ascii="Open Sans" w:cs="Open Sans" w:eastAsia="Open Sans" w:hAnsi="Open Sans"/>
                 <w:rtl w:val="0"/>
               </w:rPr>
-              <w:t xml:space="preserve">Gannon Browning</w:t>
+              <w:t xml:space="preserve">Lilah Hopper</w:t>
             </w:r>
             <w:r>
               <w:rPr>
@@ -524,7 +524,7 @@
                 <w:rFonts w:ascii="Open Sans" w:cs="Open Sans" w:eastAsia="Open Sans" w:hAnsi="Open Sans"/>
                 <w:rtl w:val="0"/>
               </w:rPr>
-              <w:t xml:space="preserve">Gray Wise</w:t>
+              <w:t xml:space="preserve">Pandora Ross</w:t>
             </w:r>
             <w:r>
               <w:rPr>
@@ -578,7 +578,7 @@
           <w:shd w:fill="auto" w:val="clear"/>
           <w:rtl w:val="0"/>
         </w:rPr>
-        <w:t xml:space="preserve">  Ihr Angebot ANG2025-1014-104723</w:t>
+        <w:t xml:space="preserve">  Ihr Angebot ANG2025-1014-112640</w:t>
       </w:r>
     </w:p>
     <w:p>
@@ -603,7 +603,7 @@
           <w:shd w:fill="auto" w:val="clear"/>
           <w:rtl w:val="0"/>
         </w:rPr>
-        <w:t xml:space="preserve">  Sehr geehrte Frau Barrett,</w:t>
+        <w:t xml:space="preserve">  Sehr geehrte Frau Duffy,</w:t>
         <w:br w:type="textWrapping"/>
       </w:r>
     </w:p>
@@ -1075,7 +1075,7 @@
                 <w:shd w:fill="auto" w:val="clear"/>
                 <w:rtl w:val="0"/>
               </w:rPr>
-              <w:t xml:space="preserve">2.066,00 €</w:t>
+              <w:t xml:space="preserve">1.871,40 €</w:t>
             </w:r>
             <w:r>
               <w:rPr>
@@ -1116,7 +1116,7 @@
                 <w:shd w:fill="auto" w:val="clear"/>
                 <w:rtl w:val="0"/>
               </w:rPr>
-              <w:t xml:space="preserve">2.066,00 €</w:t>
+              <w:t xml:space="preserve">1.871,40 €</w:t>
             </w:r>
             <w:r>
               <w:rPr>
@@ -1276,7 +1276,91 @@
                 <w:shd w:fill="auto" w:val="clear"/>
                 <w:rtl w:val="0"/>
               </w:rPr>
-              <w:t xml:space="preserve">- Einbau eines Klappsitzes</w:t>
+              <w:t xml:space="preserve">- Anbringen zusätzlicher Haltegriffe</w:t>
+            </w:r>
+            <w:r>
+              <w:rPr>
+                <w:rtl w:val="0"/>
+              </w:rPr>
+            </w:r>
+          </w:p>
+          <w:p>
+            <w:pPr>
+              <w:spacing w:after="0" w:before="0" w:line="278.00000000000006" w:lineRule="auto"/>
+              <w:ind w:left="0" w:right="314" w:firstLine="0"/>
+              <w:jc w:val="left"/>
+              <w:rPr>
+                <w:color w:val="000000"/>
+                <w:sz w:val="18"/>
+                <w:szCs w:val="18"/>
+              </w:rPr>
+            </w:pPr>
+            <w:r>
+              <w:rPr>
+                <w:rFonts w:ascii="Open Sans" w:cs="Open Sans" w:eastAsia="Open Sans" w:hAnsi="Open Sans"/>
+                <w:color w:val="000000"/>
+                <w:sz w:val="18"/>
+                <w:szCs w:val="18"/>
+                <w:shd w:fill="auto" w:val="clear"/>
+                <w:rtl w:val="0"/>
+              </w:rPr>
+              <w:t xml:space="preserve">- Anbringen zusätzlicher Stützklappgriffe</w:t>
+            </w:r>
+            <w:r>
+              <w:rPr>
+                <w:rtl w:val="0"/>
+              </w:rPr>
+            </w:r>
+          </w:p>
+          <w:p>
+            <w:pPr>
+              <w:spacing w:after="0" w:before="0" w:line="278.00000000000006" w:lineRule="auto"/>
+              <w:ind w:left="0" w:right="314" w:firstLine="0"/>
+              <w:jc w:val="left"/>
+              <w:rPr>
+                <w:color w:val="000000"/>
+                <w:sz w:val="18"/>
+                <w:szCs w:val="18"/>
+              </w:rPr>
+            </w:pPr>
+            <w:r>
+              <w:rPr>
+                <w:rFonts w:ascii="Open Sans" w:cs="Open Sans" w:eastAsia="Open Sans" w:hAnsi="Open Sans"/>
+                <w:color w:val="000000"/>
+                <w:sz w:val="18"/>
+                <w:szCs w:val="18"/>
+                <w:shd w:fill="auto" w:val="clear"/>
+                <w:rtl w:val="0"/>
+              </w:rPr>
+              <w:t xml:space="preserve">- Entfernen und Entsorgen der Badewanne inkl. Befliesung</w:t>
+            </w:r>
+            <w:r>
+              <w:rPr>
+                <w:rtl w:val="0"/>
+              </w:rPr>
+            </w:r>
+          </w:p>
+          <w:p>
+            <w:pPr>
+              <w:spacing w:after="0" w:before="0" w:line="278.00000000000006" w:lineRule="auto"/>
+              <w:ind w:left="0" w:right="314" w:firstLine="0"/>
+              <w:jc w:val="left"/>
+              <w:rPr>
+                <w:color w:val="000000"/>
+                <w:sz w:val="18"/>
+                <w:szCs w:val="18"/>
+              </w:rPr>
+            </w:pPr>
+            <w:r>
+              <w:rPr>
+                <w:rFonts w:ascii="Open Sans" w:cs="Open Sans" w:eastAsia="Open Sans" w:hAnsi="Open Sans"/>
+                <w:color w:val="000000"/>
+                <w:sz w:val="18"/>
+                <w:szCs w:val="18"/>
+                <w:shd w:fill="auto" w:val="clear"/>
+                <w:rtl w:val="0"/>
+              </w:rPr>
+              <w:t xml:space="preserve">- Entfernen und Entsorgen der Duschabtrennung</w:t>
             </w:r>
             <w:r>
               <w:rPr>
@@ -1433,7 +1517,7 @@
                 <w:shd w:fill="auto" w:val="clear"/>
                 <w:rtl w:val="0"/>
               </w:rPr>
-              <w:t xml:space="preserve">- 160 km Kilometerpauschale</w:t>
+              <w:t xml:space="preserve">- 144 km Kilometerpauschale</w:t>
             </w:r>
             <w:r>
               <w:rPr>
@@ -1719,7 +1803,7 @@
                 <w:shd w:fill="auto" w:val="clear"/>
                 <w:rtl w:val="0"/>
               </w:rPr>
-              <w:t xml:space="preserve">1.628,89 €</w:t>
+              <w:t xml:space="preserve">2.232,59 €</w:t>
             </w:r>
             <w:r>
               <w:rPr>
@@ -1751,7 +1835,7 @@
               <w:rPr>
                 <w:rtl w:val="0"/>
               </w:rPr>
-              <w:t xml:space="preserve">1.628,89 €</w:t>
+              <w:t xml:space="preserve">2.232,59 €</w:t>
             </w:r>
             <w:r>
               <w:rPr>
@@ -1921,7 +2005,7 @@
                 <w:shd w:fill="auto" w:val="clear"/>
                 <w:rtl w:val="0"/>
               </w:rPr>
-              <w:t xml:space="preserve">- 1 Stk Kleinmaterial groß</w:t>
+              <w:t xml:space="preserve">- 1 Stk Stelzlager höhenverstellar Set</w:t>
             </w:r>
           </w:p>
           <w:p>
@@ -1946,7 +2030,7 @@
                 <w:shd w:fill="auto" w:val="clear"/>
                 <w:rtl w:val="0"/>
               </w:rPr>
-              <w:t xml:space="preserve">- 1 Stk Stelzlager höhenverstellar Set</w:t>
+              <w:t xml:space="preserve">- 3 Stk Wandverkleidung 3.0 Alu 997×2550 mm — Farbe: Marmor weiß</w:t>
             </w:r>
           </w:p>
           <w:p>
@@ -1971,7 +2055,7 @@
                 <w:shd w:fill="auto" w:val="clear"/>
                 <w:rtl w:val="0"/>
               </w:rPr>
-              <w:t xml:space="preserve">- 2 Stk Wandverkleidung 3.0 Alu 997×2550 mm — Farbe: Marmor weiß</w:t>
+              <w:t xml:space="preserve">- 2 Stk Wandverkleidung 3.0 Alu 1497×2550 mm — Farbe: Marmor weiß</w:t>
             </w:r>
           </w:p>
           <w:p>
@@ -1996,7 +2080,7 @@
                 <w:shd w:fill="auto" w:val="clear"/>
                 <w:rtl w:val="0"/>
               </w:rPr>
-              <w:t xml:space="preserve">- 1 Stk Wandverkleidung 3.0 Alu 1497×2550 mm — Farbe: Marmor weiß</w:t>
+              <w:t xml:space="preserve">- 1 Stk TRINNITY Wandabdichtung BASIS-Set 5 qm DW bis 100 x 100 / BW bis 180 x 80 cm</w:t>
             </w:r>
           </w:p>
           <w:p>
@@ -2021,7 +2105,7 @@
                 <w:shd w:fill="auto" w:val="clear"/>
                 <w:rtl w:val="0"/>
               </w:rPr>
-              <w:t xml:space="preserve">- 1 Stk TRINNITY Wandabdichtung BASIS-Set 5 qm DW bis 100 x 100 / BW bis 180 x 80 cm</w:t>
+              <w:t xml:space="preserve">- 1 Stk Wandverkleidungsklebstoff 3.0/4.0</w:t>
             </w:r>
           </w:p>
           <w:p>
@@ -2046,7 +2130,7 @@
                 <w:shd w:fill="auto" w:val="clear"/>
                 <w:rtl w:val="0"/>
               </w:rPr>
-              <w:t xml:space="preserve">- 1 Stk Wandverkleidungsklebstoff 3.0/4.0</w:t>
+              <w:t xml:space="preserve">- 1 Stk Abschlussprofil 3.0 255 cm silber eloxiert VIGOUR</w:t>
             </w:r>
           </w:p>
           <w:p>
@@ -2071,7 +2155,7 @@
                 <w:shd w:fill="auto" w:val="clear"/>
                 <w:rtl w:val="0"/>
               </w:rPr>
-              <w:t xml:space="preserve">- 1 Stk Abschlussprofil 3.0 255 cm silber eloxiert VIGOUR</w:t>
+              <w:t xml:space="preserve">- 2 Stk Verbindungsprofil(e)</w:t>
             </w:r>
           </w:p>
           <w:p>
@@ -2096,7 +2180,7 @@
                 <w:shd w:fill="auto" w:val="clear"/>
                 <w:rtl w:val="0"/>
               </w:rPr>
-              <w:t xml:space="preserve">- 1 Stk Verbindungsprofil(e)</w:t>
+              <w:t xml:space="preserve">- 1 Stk Profilklebstoff (pro Abschlussprofil 1 Stk)</w:t>
             </w:r>
           </w:p>
           <w:p>
@@ -2121,7 +2205,7 @@
                 <w:shd w:fill="auto" w:val="clear"/>
                 <w:rtl w:val="0"/>
               </w:rPr>
-              <w:t xml:space="preserve">- 1 Stk Profilklebstoff (pro Abschlussprofil 1 Stk)</w:t>
+              <w:t xml:space="preserve">- 1 Stk Haltegriff clivia plus 32/400mm m. Ros. Edelstahl glatt poliert, VIGOUR</w:t>
             </w:r>
           </w:p>
           <w:p>
@@ -2146,7 +2230,7 @@
                 <w:shd w:fill="auto" w:val="clear"/>
                 <w:rtl w:val="0"/>
               </w:rPr>
-              <w:t xml:space="preserve">- 1 Stk Klappsitz derby plus 362x91x381mm belastbar bis 110 kg, verchromt VIGOUR</w:t>
+              <w:t xml:space="preserve">- 1 Stk Stützklappgriff derby plus 600mm verchromt m. ABS-Ummantelung VIGOUR</w:t>
             </w:r>
           </w:p>
           <w:p>
@@ -2196,7 +2280,7 @@
                 <w:shd w:fill="auto" w:val="clear"/>
                 <w:rtl w:val="0"/>
               </w:rPr>
-              <w:t xml:space="preserve">- 1 Stk Duschwanne 75 x 75 x 3 cm</w:t>
+              <w:t xml:space="preserve">- 1 Stk Duschwanne 100 x 70 x 3 cm</w:t>
             </w:r>
           </w:p>
         </w:tc>
@@ -2502,6 +2586,247 @@
                 <w:rtl w:val="0"/>
               </w:rPr>
               <w:t xml:space="preserve">0,00 €</w:t>
+            </w:r>
+            <w:r>
+              <w:rPr>
+                <w:rtl w:val="0"/>
+              </w:rPr>
+            </w:r>
+          </w:p>
+        </w:tc>
+      </w:tr>
+      <w:tr>
+        <w:trPr>
+          <w:cantSplit w:val="0"/>
+          <w:trHeight w:val="1" w:hRule="atLeast"/>
+          <w:tblHeader w:val="0"/>
+        </w:trPr>
+        <w:tc>
+          <w:tcPr>
+            <w:tcBorders>
+              <w:top w:color="ffffff" w:space="0" w:sz="8" w:val="single"/>
+              <w:left w:color="ffffff" w:space="0" w:sz="8" w:val="single"/>
+              <w:bottom w:color="ffffff" w:space="0" w:sz="8" w:val="single"/>
+              <w:right w:color="ffffff" w:space="0" w:sz="8" w:val="single"/>
+            </w:tcBorders>
+            <w:shd w:fill="ffffff" w:val="clear"/>
+            <w:tcMar>
+              <w:left w:w="56.0" w:type="dxa"/>
+              <w:right w:w="56.0" w:type="dxa"/>
+            </w:tcMar>
+          </w:tcPr>
+          <w:p>
+            <w:pPr>
+              <w:spacing w:after="0" w:before="0" w:line="278.00000000000006" w:lineRule="auto"/>
+              <w:ind w:left="0" w:right="-26" w:firstLine="0"/>
+              <w:jc w:val="left"/>
+              <w:rPr>
+                <w:color w:val="000000"/>
+              </w:rPr>
+            </w:pPr>
+            <w:r>
+              <w:rPr>
+                <w:rFonts w:ascii="Open Sans" w:cs="Open Sans" w:eastAsia="Open Sans" w:hAnsi="Open Sans"/>
+                <w:color w:val="000000"/>
+                <w:sz w:val="20"/>
+                <w:szCs w:val="20"/>
+                <w:shd w:fill="auto" w:val="clear"/>
+                <w:rtl w:val="0"/>
+              </w:rPr>
+              <w:t xml:space="preserve">004</w:t>
+            </w:r>
+            <w:r>
+              <w:rPr>
+                <w:rtl w:val="0"/>
+              </w:rPr>
+            </w:r>
+          </w:p>
+        </w:tc>
+        <w:tc>
+          <w:tcPr>
+            <w:tcBorders>
+              <w:top w:color="ffffff" w:space="0" w:sz="8" w:val="single"/>
+              <w:left w:color="ffffff" w:space="0" w:sz="8" w:val="single"/>
+              <w:bottom w:color="ffffff" w:space="0" w:sz="8" w:val="single"/>
+              <w:right w:color="ffffff" w:space="0" w:sz="8" w:val="single"/>
+            </w:tcBorders>
+            <w:shd w:fill="ffffff" w:val="clear"/>
+            <w:tcMar>
+              <w:left w:w="56.0" w:type="dxa"/>
+              <w:right w:w="56.0" w:type="dxa"/>
+            </w:tcMar>
+          </w:tcPr>
+          <w:p>
+            <w:pPr>
+              <w:spacing w:after="0" w:before="0" w:line="278.00000000000006" w:lineRule="auto"/>
+              <w:ind w:left="0" w:right="314" w:firstLine="0"/>
+              <w:jc w:val="left"/>
+              <w:rPr>
+                <w:color w:val="000000"/>
+              </w:rPr>
+            </w:pPr>
+            <w:r>
+              <w:rPr>
+                <w:rFonts w:ascii="Open Sans" w:cs="Open Sans" w:eastAsia="Open Sans" w:hAnsi="Open Sans"/>
+                <w:color w:val="000000"/>
+                <w:sz w:val="20"/>
+                <w:szCs w:val="20"/>
+                <w:shd w:fill="auto" w:val="clear"/>
+                <w:rtl w:val="0"/>
+              </w:rPr>
+              <w:t xml:space="preserve">1 Stk</w:t>
+            </w:r>
+            <w:r>
+              <w:rPr>
+                <w:rtl w:val="0"/>
+              </w:rPr>
+            </w:r>
+          </w:p>
+        </w:tc>
+        <w:tc>
+          <w:tcPr>
+            <w:tcBorders>
+              <w:top w:color="ffffff" w:space="0" w:sz="8" w:val="single"/>
+              <w:left w:color="ffffff" w:space="0" w:sz="8" w:val="single"/>
+              <w:bottom w:color="ffffff" w:space="0" w:sz="8" w:val="single"/>
+              <w:right w:color="ffffff" w:space="0" w:sz="8" w:val="single"/>
+            </w:tcBorders>
+            <w:shd w:fill="ffffff" w:val="clear"/>
+            <w:tcMar>
+              <w:left w:w="56.0" w:type="dxa"/>
+              <w:right w:w="56.0" w:type="dxa"/>
+            </w:tcMar>
+          </w:tcPr>
+          <w:p>
+            <w:pPr>
+              <w:spacing w:after="0" w:before="0" w:line="278.00000000000006" w:lineRule="auto"/>
+              <w:ind w:left="0" w:right="314" w:firstLine="0"/>
+              <w:jc w:val="left"/>
+              <w:rPr>
+                <w:rFonts w:ascii="Open Sans" w:cs="Open Sans" w:eastAsia="Open Sans" w:hAnsi="Open Sans"/>
+                <w:b w:val="1"/>
+                <w:color w:val="000000"/>
+                <w:sz w:val="18"/>
+                <w:szCs w:val="18"/>
+                <w:shd w:fill="auto" w:val="clear"/>
+              </w:rPr>
+            </w:pPr>
+            <w:r>
+              <w:rPr>
+                <w:rFonts w:ascii="Open Sans" w:cs="Open Sans" w:eastAsia="Open Sans" w:hAnsi="Open Sans"/>
+                <w:b w:val="1"/>
+                <w:color w:val="000000"/>
+                <w:sz w:val="18"/>
+                <w:szCs w:val="18"/>
+                <w:shd w:fill="auto" w:val="clear"/>
+                <w:rtl w:val="0"/>
+              </w:rPr>
+              <w:t xml:space="preserve">Bestandkundenbonus:</w:t>
+            </w:r>
+          </w:p>
+          <w:p>
+            <w:pPr>
+              <w:spacing w:after="0" w:before="0" w:line="278.00000000000006" w:lineRule="auto"/>
+              <w:ind w:left="0" w:right="314" w:firstLine="0"/>
+              <w:jc w:val="left"/>
+              <w:rPr>
+                <w:color w:val="000000"/>
+                <w:sz w:val="18"/>
+                <w:szCs w:val="18"/>
+              </w:rPr>
+            </w:pPr>
+            <w:r>
+              <w:rPr>
+                <w:rFonts w:ascii="Open Sans" w:cs="Open Sans" w:eastAsia="Open Sans" w:hAnsi="Open Sans"/>
+                <w:color w:val="000000"/>
+                <w:sz w:val="18"/>
+                <w:szCs w:val="18"/>
+                <w:shd w:fill="auto" w:val="clear"/>
+                <w:rtl w:val="0"/>
+              </w:rPr>
+              <w:t xml:space="preserve">-- Rabatt von 300 € ab einem Gesamtwert von 3.000</w:t>
+            </w:r>
+            <w:r>
+              <w:rPr>
+                <w:rtl w:val="0"/>
+              </w:rPr>
+            </w:r>
+          </w:p>
+        </w:tc>
+        <w:tc>
+          <w:tcPr>
+            <w:tcBorders>
+              <w:top w:color="ffffff" w:space="0" w:sz="8" w:val="single"/>
+              <w:left w:color="ffffff" w:space="0" w:sz="8" w:val="single"/>
+              <w:bottom w:color="ffffff" w:space="0" w:sz="8" w:val="single"/>
+              <w:right w:color="ffffff" w:space="0" w:sz="8" w:val="single"/>
+            </w:tcBorders>
+            <w:shd w:fill="ffffff" w:val="clear"/>
+            <w:tcMar>
+              <w:left w:w="56.0" w:type="dxa"/>
+              <w:right w:w="56.0" w:type="dxa"/>
+            </w:tcMar>
+          </w:tcPr>
+          <w:p>
+            <w:pPr>
+              <w:spacing w:after="0" w:before="0" w:line="278.00000000000006" w:lineRule="auto"/>
+              <w:ind w:left="0" w:right="314" w:firstLine="0"/>
+              <w:jc w:val="left"/>
+              <w:rPr>
+                <w:color w:val="000000"/>
+              </w:rPr>
+            </w:pPr>
+            <w:r>
+              <w:rPr>
+                <w:rFonts w:ascii="Open Sans" w:cs="Open Sans" w:eastAsia="Open Sans" w:hAnsi="Open Sans"/>
+                <w:color w:val="000000"/>
+                <w:sz w:val="20"/>
+                <w:szCs w:val="20"/>
+                <w:shd w:fill="auto" w:val="clear"/>
+                <w:rtl w:val="0"/>
+              </w:rPr>
+              <w:t xml:space="preserve">-252,10 €</w:t>
+            </w:r>
+            <w:r>
+              <w:rPr>
+                <w:rtl w:val="0"/>
+              </w:rPr>
+            </w:r>
+          </w:p>
+        </w:tc>
+        <w:tc>
+          <w:tcPr>
+            <w:tcBorders>
+              <w:top w:color="ffffff" w:space="0" w:sz="8" w:val="single"/>
+              <w:left w:color="ffffff" w:space="0" w:sz="8" w:val="single"/>
+              <w:bottom w:color="ffffff" w:space="0" w:sz="8" w:val="single"/>
+              <w:right w:color="ffffff" w:space="0" w:sz="8" w:val="single"/>
+            </w:tcBorders>
+            <w:shd w:fill="ffffff" w:val="clear"/>
+            <w:tcMar>
+              <w:left w:w="56.0" w:type="dxa"/>
+              <w:right w:w="56.0" w:type="dxa"/>
+            </w:tcMar>
+          </w:tcPr>
+          <w:p>
+            <w:pPr>
+              <w:spacing w:after="0" w:before="0" w:line="278.00000000000006" w:lineRule="auto"/>
+              <w:ind w:left="0" w:right="314" w:firstLine="0"/>
+              <w:jc w:val="center"/>
+              <w:rPr>
+                <w:color w:val="000000"/>
+              </w:rPr>
+            </w:pPr>
+            <w:r>
+              <w:rPr>
+                <w:rFonts w:ascii="Open Sans" w:cs="Open Sans" w:eastAsia="Open Sans" w:hAnsi="Open Sans"/>
+                <w:color w:val="000000"/>
+                <w:sz w:val="20"/>
+                <w:szCs w:val="20"/>
+                <w:shd w:fill="auto" w:val="clear"/>
+                <w:rtl w:val="0"/>
+              </w:rPr>
+              <w:t xml:space="preserve">-252,10 €</w:t>
             </w:r>
             <w:r>
               <w:rPr>
@@ -2706,7 +3031,7 @@
                 <w:shd w:fill="auto" w:val="clear"/>
                 <w:rtl w:val="0"/>
               </w:rPr>
-              <w:t xml:space="preserve">4.363,04 €</w:t>
+              <w:t xml:space="preserve">4.903,42 €</w:t>
             </w:r>
             <w:r>
               <w:rPr>
@@ -2875,7 +3200,7 @@
                 <w:shd w:fill="auto" w:val="clear"/>
                 <w:rtl w:val="0"/>
               </w:rPr>
-              <w:t xml:space="preserve">828,98 €</w:t>
+              <w:t xml:space="preserve">931,65 €</w:t>
             </w:r>
             <w:r>
               <w:rPr>
@@ -3044,7 +3369,7 @@
                 <w:shd w:fill="auto" w:val="clear"/>
                 <w:rtl w:val="0"/>
               </w:rPr>
-              <w:t xml:space="preserve">5.192,02 €</w:t>
+              <w:t xml:space="preserve">5.835,07 €</w:t>
             </w:r>
             <w:r>
               <w:rPr>
@@ -3178,6 +3503,74 @@
           <w:rtl w:val="0"/>
         </w:rPr>
         <w:t xml:space="preserve">abgerechnet. (Stundensatz-Facharbeiter: 69,50€ netto)</w:t>
+        <w:br w:type="textWrapping"/>
+        <w:br w:type="textWrapping"/>
+        <w:t xml:space="preserve">Der</w:t>
+      </w:r>
+      <w:r>
+        <w:rPr>
+          <w:rFonts w:ascii="Open Sans" w:cs="Open Sans" w:eastAsia="Open Sans" w:hAnsi="Open Sans"/>
+          <w:color w:val="030303"/>
+          <w:rtl w:val="0"/>
+        </w:rPr>
+        <w:t xml:space="preserve"> </w:t>
+      </w:r>
+      <w:r>
+        <w:rPr>
+          <w:rFonts w:ascii="Open Sans" w:cs="Open Sans" w:eastAsia="Open Sans" w:hAnsi="Open Sans"/>
+          <w:color w:val="030303"/>
+          <w:sz w:val="22"/>
+          <w:szCs w:val="22"/>
+          <w:shd w:fill="auto" w:val="clear"/>
+          <w:rtl w:val="0"/>
+        </w:rPr>
+        <w:t xml:space="preserve">Selbstkostenanteil beträgt </w:t>
+      </w:r>
+      <w:r>
+        <w:rPr>
+          <w:rFonts w:ascii="Open Sans" w:cs="Open Sans" w:eastAsia="Open Sans" w:hAnsi="Open Sans"/>
+          <w:b w:val="1"/>
+          <w:color w:val="030303"/>
+          <w:sz w:val="22"/>
+          <w:szCs w:val="22"/>
+          <w:shd w:fill="auto" w:val="clear"/>
+          <w:rtl w:val="0"/>
+        </w:rPr>
+        <w:t xml:space="preserve">1.855,07 €</w:t>
+      </w:r>
+      <w:r>
+        <w:rPr>
+          <w:rFonts w:ascii="Open Sans" w:cs="Open Sans" w:eastAsia="Open Sans" w:hAnsi="Open Sans"/>
+          <w:color w:val="030303"/>
+          <w:sz w:val="22"/>
+          <w:szCs w:val="22"/>
+          <w:shd w:fill="auto" w:val="clear"/>
+          <w:rtl w:val="0"/>
+        </w:rPr>
+        <w:t xml:space="preserve"> unter Berücksichtigung eines gewährten Zuschusses durch die Pflegekasse i.H.v. </w:t>
+      </w:r>
+      <w:r>
+        <w:rPr>
+          <w:rFonts w:ascii="Open Sans" w:cs="Open Sans" w:eastAsia="Open Sans" w:hAnsi="Open Sans"/>
+          <w:b w:val="1"/>
+          <w:color w:val="030303"/>
+          <w:sz w:val="22"/>
+          <w:szCs w:val="22"/>
+          <w:shd w:fill="auto" w:val="clear"/>
+          <w:rtl w:val="0"/>
+        </w:rPr>
+        <w:t xml:space="preserve">4.180,00 €</w:t>
+      </w:r>
+      <w:r>
+        <w:rPr>
+          <w:rFonts w:ascii="Open Sans" w:cs="Open Sans" w:eastAsia="Open Sans" w:hAnsi="Open Sans"/>
+          <w:color w:val="030303"/>
+          <w:sz w:val="22"/>
+          <w:szCs w:val="22"/>
+          <w:shd w:fill="auto" w:val="clear"/>
+          <w:rtl w:val="0"/>
+        </w:rPr>
+        <w:t xml:space="preserve">.</w:t>
       </w:r>
       <w:r>
         <w:rPr>

</xml_diff>

<commit_message>
loading angebote bereich  correctly
</commit_message>
<xml_diff>
--- a/out-Angebot.docx
+++ b/out-Angebot.docx
@@ -310,7 +310,7 @@
                 <w:rFonts w:ascii="Open Sans" w:cs="Open Sans" w:eastAsia="Open Sans" w:hAnsi="Open Sans"/>
                 <w:rtl w:val="0"/>
               </w:rPr>
-              <w:t xml:space="preserve">ANG2025-1014-112640</w:t>
+              <w:t xml:space="preserve">ANG2025-1014-120719</w:t>
             </w:r>
             <w:r>
               <w:rPr>
@@ -578,7 +578,7 @@
           <w:shd w:fill="auto" w:val="clear"/>
           <w:rtl w:val="0"/>
         </w:rPr>
-        <w:t xml:space="preserve">  Ihr Angebot ANG2025-1014-112640</w:t>
+        <w:t xml:space="preserve">  Ihr Angebot ANG2025-1014-120719</w:t>
       </w:r>
     </w:p>
     <w:p>
@@ -1803,7 +1803,7 @@
                 <w:shd w:fill="auto" w:val="clear"/>
                 <w:rtl w:val="0"/>
               </w:rPr>
-              <w:t xml:space="preserve">2.232,59 €</w:t>
+              <w:t xml:space="preserve">2.219,37 €</w:t>
             </w:r>
             <w:r>
               <w:rPr>
@@ -1835,7 +1835,7 @@
               <w:rPr>
                 <w:rtl w:val="0"/>
               </w:rPr>
-              <w:t xml:space="preserve">2.232,59 €</w:t>
+              <w:t xml:space="preserve">2.219,37 €</w:t>
             </w:r>
             <w:r>
               <w:rPr>
@@ -1955,7 +1955,7 @@
                 <w:shd w:fill="auto" w:val="clear"/>
                 <w:rtl w:val="0"/>
               </w:rPr>
-              <w:t xml:space="preserve">- 1 Stk TRINNITY Wannenabdichtband-Set 3,4 m Nass-/Trockenanbindung entspr. DIN 18534</w:t>
+              <w:t xml:space="preserve">- 3 Stk Wandverkleidung 3.0 Alu 997×2550 mm — Farbe: Marmor weiß</w:t>
             </w:r>
           </w:p>
           <w:p>
@@ -1980,7 +1980,7 @@
                 <w:shd w:fill="auto" w:val="clear"/>
                 <w:rtl w:val="0"/>
               </w:rPr>
-              <w:t xml:space="preserve">- 1 Stk Ablaufgarnitur Rohbauset m. Sifon BH60mm f. Flache Duschw. m. 90mm Ablauf TRINNITY</w:t>
+              <w:t xml:space="preserve">- 2 Stk Wandverkleidung 3.0 Alu 1497×2550 mm — Farbe: Marmor weiß</w:t>
             </w:r>
           </w:p>
           <w:p>
@@ -2005,7 +2005,7 @@
                 <w:shd w:fill="auto" w:val="clear"/>
                 <w:rtl w:val="0"/>
               </w:rPr>
-              <w:t xml:space="preserve">- 1 Stk Stelzlager höhenverstellar Set</w:t>
+              <w:t xml:space="preserve">- 1 Stk TRINNITY Wandabdichtung BASIS-Set 5 qm DW bis 100 x 100 / BW bis 180 x 80 cm</w:t>
             </w:r>
           </w:p>
           <w:p>
@@ -2030,7 +2030,7 @@
                 <w:shd w:fill="auto" w:val="clear"/>
                 <w:rtl w:val="0"/>
               </w:rPr>
-              <w:t xml:space="preserve">- 3 Stk Wandverkleidung 3.0 Alu 997×2550 mm — Farbe: Marmor weiß</w:t>
+              <w:t xml:space="preserve">- 1 Stk Wandverkleidungsklebstoff 3.0/4.0</w:t>
             </w:r>
           </w:p>
           <w:p>
@@ -2055,7 +2055,7 @@
                 <w:shd w:fill="auto" w:val="clear"/>
                 <w:rtl w:val="0"/>
               </w:rPr>
-              <w:t xml:space="preserve">- 2 Stk Wandverkleidung 3.0 Alu 1497×2550 mm — Farbe: Marmor weiß</w:t>
+              <w:t xml:space="preserve">- 1 Stk Abschlussprofil 3.0 255 cm silber eloxiert VIGOUR</w:t>
             </w:r>
           </w:p>
           <w:p>
@@ -2080,7 +2080,7 @@
                 <w:shd w:fill="auto" w:val="clear"/>
                 <w:rtl w:val="0"/>
               </w:rPr>
-              <w:t xml:space="preserve">- 1 Stk TRINNITY Wandabdichtung BASIS-Set 5 qm DW bis 100 x 100 / BW bis 180 x 80 cm</w:t>
+              <w:t xml:space="preserve">- 2 Stk Verbindungsprofil(e)</w:t>
             </w:r>
           </w:p>
           <w:p>
@@ -2105,7 +2105,7 @@
                 <w:shd w:fill="auto" w:val="clear"/>
                 <w:rtl w:val="0"/>
               </w:rPr>
-              <w:t xml:space="preserve">- 1 Stk Wandverkleidungsklebstoff 3.0/4.0</w:t>
+              <w:t xml:space="preserve">- 1 Stk Profilklebstoff (pro Abschlussprofil 1 Stk)</w:t>
             </w:r>
           </w:p>
           <w:p>
@@ -2130,7 +2130,7 @@
                 <w:shd w:fill="auto" w:val="clear"/>
                 <w:rtl w:val="0"/>
               </w:rPr>
-              <w:t xml:space="preserve">- 1 Stk Abschlussprofil 3.0 255 cm silber eloxiert VIGOUR</w:t>
+              <w:t xml:space="preserve">- 1 Stk Haltegriff clivia plus 32/400mm m. Ros. Edelstahl glatt poliert, VIGOUR</w:t>
             </w:r>
           </w:p>
           <w:p>
@@ -2155,7 +2155,7 @@
                 <w:shd w:fill="auto" w:val="clear"/>
                 <w:rtl w:val="0"/>
               </w:rPr>
-              <w:t xml:space="preserve">- 2 Stk Verbindungsprofil(e)</w:t>
+              <w:t xml:space="preserve">- 1 Stk Haltegriff clivia plus 32/600mm m. Ros. Edelstahl glatt poliert, VIGOUR</w:t>
             </w:r>
           </w:p>
           <w:p>
@@ -2180,7 +2180,7 @@
                 <w:shd w:fill="auto" w:val="clear"/>
                 <w:rtl w:val="0"/>
               </w:rPr>
-              <w:t xml:space="preserve">- 1 Stk Profilklebstoff (pro Abschlussprofil 1 Stk)</w:t>
+              <w:t xml:space="preserve">- 1 Stk Stützklappgriff derby plus 600mm verchromt m. ABS-Ummantelung VIGOUR</w:t>
             </w:r>
           </w:p>
           <w:p>
@@ -2205,7 +2205,7 @@
                 <w:shd w:fill="auto" w:val="clear"/>
                 <w:rtl w:val="0"/>
               </w:rPr>
-              <w:t xml:space="preserve">- 1 Stk Haltegriff clivia plus 32/400mm m. Ros. Edelstahl glatt poliert, VIGOUR</w:t>
+              <w:t xml:space="preserve">- 2 Stk Gleittür Hassmann</w:t>
             </w:r>
           </w:p>
           <w:p>
@@ -2230,57 +2230,7 @@
                 <w:shd w:fill="auto" w:val="clear"/>
                 <w:rtl w:val="0"/>
               </w:rPr>
-              <w:t xml:space="preserve">- 1 Stk Stützklappgriff derby plus 600mm verchromt m. ABS-Ummantelung VIGOUR</w:t>
-            </w:r>
-          </w:p>
-          <w:p>
-            <w:pPr>
-              <w:spacing w:after="0" w:before="0" w:line="278.00000000000006" w:lineRule="auto"/>
-              <w:ind w:left="0" w:right="314" w:firstLine="0"/>
-              <w:jc w:val="left"/>
-              <w:rPr>
-                <w:rFonts w:ascii="Open Sans" w:cs="Open Sans" w:eastAsia="Open Sans" w:hAnsi="Open Sans"/>
-                <w:color w:val="000000"/>
-                <w:sz w:val="18"/>
-                <w:szCs w:val="18"/>
-                <w:shd w:fill="auto" w:val="clear"/>
-              </w:rPr>
-            </w:pPr>
-            <w:r>
-              <w:rPr>
-                <w:rFonts w:ascii="Open Sans" w:cs="Open Sans" w:eastAsia="Open Sans" w:hAnsi="Open Sans"/>
-                <w:color w:val="000000"/>
-                <w:sz w:val="18"/>
-                <w:szCs w:val="18"/>
-                <w:shd w:fill="auto" w:val="clear"/>
-                <w:rtl w:val="0"/>
-              </w:rPr>
-              <w:t xml:space="preserve">- 2 Stk Gleittür Hassmann</w:t>
-            </w:r>
-          </w:p>
-          <w:p>
-            <w:pPr>
-              <w:spacing w:after="0" w:before="0" w:line="278.00000000000006" w:lineRule="auto"/>
-              <w:ind w:left="0" w:right="314" w:firstLine="0"/>
-              <w:jc w:val="left"/>
-              <w:rPr>
-                <w:rFonts w:ascii="Open Sans" w:cs="Open Sans" w:eastAsia="Open Sans" w:hAnsi="Open Sans"/>
-                <w:color w:val="000000"/>
-                <w:sz w:val="18"/>
-                <w:szCs w:val="18"/>
-                <w:shd w:fill="auto" w:val="clear"/>
-              </w:rPr>
-            </w:pPr>
-            <w:r>
-              <w:rPr>
-                <w:rFonts w:ascii="Open Sans" w:cs="Open Sans" w:eastAsia="Open Sans" w:hAnsi="Open Sans"/>
-                <w:color w:val="000000"/>
-                <w:sz w:val="18"/>
-                <w:szCs w:val="18"/>
-                <w:shd w:fill="auto" w:val="clear"/>
-                <w:rtl w:val="0"/>
-              </w:rPr>
-              <w:t xml:space="preserve">- 1 Stk Duschwanne 100 x 70 x 3 cm</w:t>
+              <w:t xml:space="preserve">- 1 Stk Duschwanne 100 x 75 x 3 cm</w:t>
             </w:r>
           </w:p>
         </w:tc>
@@ -3031,7 +2981,7 @@
                 <w:shd w:fill="auto" w:val="clear"/>
                 <w:rtl w:val="0"/>
               </w:rPr>
-              <w:t xml:space="preserve">4.903,42 €</w:t>
+              <w:t xml:space="preserve">4.852,52 €</w:t>
             </w:r>
             <w:r>
               <w:rPr>
@@ -3200,7 +3150,7 @@
                 <w:shd w:fill="auto" w:val="clear"/>
                 <w:rtl w:val="0"/>
               </w:rPr>
-              <w:t xml:space="preserve">931,65 €</w:t>
+              <w:t xml:space="preserve">921,98 €</w:t>
             </w:r>
             <w:r>
               <w:rPr>
@@ -3369,7 +3319,7 @@
                 <w:shd w:fill="auto" w:val="clear"/>
                 <w:rtl w:val="0"/>
               </w:rPr>
-              <w:t xml:space="preserve">5.835,07 €</w:t>
+              <w:t xml:space="preserve">5.774,50 €</w:t>
             </w:r>
             <w:r>
               <w:rPr>
@@ -3536,7 +3486,7 @@
           <w:shd w:fill="auto" w:val="clear"/>
           <w:rtl w:val="0"/>
         </w:rPr>
-        <w:t xml:space="preserve">1.855,07 €</w:t>
+        <w:t xml:space="preserve">1.794,50 €</w:t>
       </w:r>
       <w:r>
         <w:rPr>

</xml_diff>

<commit_message>
loading angebote duschwanne  correctly
</commit_message>
<xml_diff>
--- a/out-Angebot.docx
+++ b/out-Angebot.docx
@@ -310,7 +310,7 @@
                 <w:rFonts w:ascii="Open Sans" w:cs="Open Sans" w:eastAsia="Open Sans" w:hAnsi="Open Sans"/>
                 <w:rtl w:val="0"/>
               </w:rPr>
-              <w:t xml:space="preserve">ANG2025-1014-120719</w:t>
+              <w:t xml:space="preserve">ANG2025-1014-132542</w:t>
             </w:r>
             <w:r>
               <w:rPr>
@@ -578,7 +578,7 @@
           <w:shd w:fill="auto" w:val="clear"/>
           <w:rtl w:val="0"/>
         </w:rPr>
-        <w:t xml:space="preserve">  Ihr Angebot ANG2025-1014-120719</w:t>
+        <w:t xml:space="preserve">  Ihr Angebot ANG2025-1014-132542</w:t>
       </w:r>
     </w:p>
     <w:p>
@@ -1075,7 +1075,7 @@
                 <w:shd w:fill="auto" w:val="clear"/>
                 <w:rtl w:val="0"/>
               </w:rPr>
-              <w:t xml:space="preserve">1.871,40 €</w:t>
+              <w:t xml:space="preserve">2.060,40 €</w:t>
             </w:r>
             <w:r>
               <w:rPr>
@@ -1116,7 +1116,7 @@
                 <w:shd w:fill="auto" w:val="clear"/>
                 <w:rtl w:val="0"/>
               </w:rPr>
-              <w:t xml:space="preserve">1.871,40 €</w:t>
+              <w:t xml:space="preserve">2.060,40 €</w:t>
             </w:r>
             <w:r>
               <w:rPr>
@@ -1803,7 +1803,7 @@
                 <w:shd w:fill="auto" w:val="clear"/>
                 <w:rtl w:val="0"/>
               </w:rPr>
-              <w:t xml:space="preserve">2.219,37 €</w:t>
+              <w:t xml:space="preserve">2.302,86 €</w:t>
             </w:r>
             <w:r>
               <w:rPr>
@@ -1835,7 +1835,7 @@
               <w:rPr>
                 <w:rtl w:val="0"/>
               </w:rPr>
-              <w:t xml:space="preserve">2.219,37 €</w:t>
+              <w:t xml:space="preserve">2.302,86 €</w:t>
             </w:r>
             <w:r>
               <w:rPr>
@@ -1955,6 +1955,56 @@
                 <w:shd w:fill="auto" w:val="clear"/>
                 <w:rtl w:val="0"/>
               </w:rPr>
+              <w:t xml:space="preserve">- 1 Stk TRINNITY Wannenabdichtband-Set 3,4 m Nass-/Trockenanbindung entspr. DIN 18534</w:t>
+            </w:r>
+          </w:p>
+          <w:p>
+            <w:pPr>
+              <w:spacing w:after="0" w:before="0" w:line="278.00000000000006" w:lineRule="auto"/>
+              <w:ind w:left="0" w:right="314" w:firstLine="0"/>
+              <w:jc w:val="left"/>
+              <w:rPr>
+                <w:rFonts w:ascii="Open Sans" w:cs="Open Sans" w:eastAsia="Open Sans" w:hAnsi="Open Sans"/>
+                <w:color w:val="000000"/>
+                <w:sz w:val="18"/>
+                <w:szCs w:val="18"/>
+                <w:shd w:fill="auto" w:val="clear"/>
+              </w:rPr>
+            </w:pPr>
+            <w:r>
+              <w:rPr>
+                <w:rFonts w:ascii="Open Sans" w:cs="Open Sans" w:eastAsia="Open Sans" w:hAnsi="Open Sans"/>
+                <w:color w:val="000000"/>
+                <w:sz w:val="18"/>
+                <w:szCs w:val="18"/>
+                <w:shd w:fill="auto" w:val="clear"/>
+                <w:rtl w:val="0"/>
+              </w:rPr>
+              <w:t xml:space="preserve">- 1 Stk Stelzlager höhenverstellar Set</w:t>
+            </w:r>
+          </w:p>
+          <w:p>
+            <w:pPr>
+              <w:spacing w:after="0" w:before="0" w:line="278.00000000000006" w:lineRule="auto"/>
+              <w:ind w:left="0" w:right="314" w:firstLine="0"/>
+              <w:jc w:val="left"/>
+              <w:rPr>
+                <w:rFonts w:ascii="Open Sans" w:cs="Open Sans" w:eastAsia="Open Sans" w:hAnsi="Open Sans"/>
+                <w:color w:val="000000"/>
+                <w:sz w:val="18"/>
+                <w:szCs w:val="18"/>
+                <w:shd w:fill="auto" w:val="clear"/>
+              </w:rPr>
+            </w:pPr>
+            <w:r>
+              <w:rPr>
+                <w:rFonts w:ascii="Open Sans" w:cs="Open Sans" w:eastAsia="Open Sans" w:hAnsi="Open Sans"/>
+                <w:color w:val="000000"/>
+                <w:sz w:val="18"/>
+                <w:szCs w:val="18"/>
+                <w:shd w:fill="auto" w:val="clear"/>
+                <w:rtl w:val="0"/>
+              </w:rPr>
               <w:t xml:space="preserve">- 3 Stk Wandverkleidung 3.0 Alu 997×2550 mm — Farbe: Marmor weiß</w:t>
             </w:r>
           </w:p>
@@ -2055,7 +2105,7 @@
                 <w:shd w:fill="auto" w:val="clear"/>
                 <w:rtl w:val="0"/>
               </w:rPr>
-              <w:t xml:space="preserve">- 1 Stk Abschlussprofil 3.0 255 cm silber eloxiert VIGOUR</w:t>
+              <w:t xml:space="preserve">- 2 Stk Abschlussprofil 3.0 255 cm silber eloxiert VIGOUR</w:t>
             </w:r>
           </w:p>
           <w:p>
@@ -2230,7 +2280,7 @@
                 <w:shd w:fill="auto" w:val="clear"/>
                 <w:rtl w:val="0"/>
               </w:rPr>
-              <w:t xml:space="preserve">- 1 Stk Duschwanne 100 x 75 x 3 cm</w:t>
+              <w:t xml:space="preserve">- 1 Stk Duschwanne 100 x 80 x 3 cm</w:t>
             </w:r>
           </w:p>
         </w:tc>
@@ -2981,7 +3031,7 @@
                 <w:shd w:fill="auto" w:val="clear"/>
                 <w:rtl w:val="0"/>
               </w:rPr>
-              <w:t xml:space="preserve">4.852,52 €</w:t>
+              <w:t xml:space="preserve">5.165,58 €</w:t>
             </w:r>
             <w:r>
               <w:rPr>
@@ -3150,7 +3200,7 @@
                 <w:shd w:fill="auto" w:val="clear"/>
                 <w:rtl w:val="0"/>
               </w:rPr>
-              <w:t xml:space="preserve">921,98 €</w:t>
+              <w:t xml:space="preserve">981,46 €</w:t>
             </w:r>
             <w:r>
               <w:rPr>
@@ -3319,7 +3369,7 @@
                 <w:shd w:fill="auto" w:val="clear"/>
                 <w:rtl w:val="0"/>
               </w:rPr>
-              <w:t xml:space="preserve">5.774,50 €</w:t>
+              <w:t xml:space="preserve">6.147,04 €</w:t>
             </w:r>
             <w:r>
               <w:rPr>
@@ -3486,7 +3536,7 @@
           <w:shd w:fill="auto" w:val="clear"/>
           <w:rtl w:val="0"/>
         </w:rPr>
-        <w:t xml:space="preserve">1.794,50 €</w:t>
+        <w:t xml:space="preserve">2.117,04 €</w:t>
       </w:r>
       <w:r>
         <w:rPr>

</xml_diff>

<commit_message>
adding ebenerdige Montage on load
</commit_message>
<xml_diff>
--- a/out-Angebot.docx
+++ b/out-Angebot.docx
@@ -310,7 +310,7 @@
                 <w:rFonts w:ascii="Open Sans" w:cs="Open Sans" w:eastAsia="Open Sans" w:hAnsi="Open Sans"/>
                 <w:rtl w:val="0"/>
               </w:rPr>
-              <w:t xml:space="preserve">ANG2025-1014-132542</w:t>
+              <w:t xml:space="preserve">ANG2025-1014-135509</w:t>
             </w:r>
             <w:r>
               <w:rPr>
@@ -578,7 +578,7 @@
           <w:shd w:fill="auto" w:val="clear"/>
           <w:rtl w:val="0"/>
         </w:rPr>
-        <w:t xml:space="preserve">  Ihr Angebot ANG2025-1014-132542</w:t>
+        <w:t xml:space="preserve">  Ihr Angebot ANG2025-1014-135509</w:t>
       </w:r>
     </w:p>
     <w:p>
@@ -1332,7 +1332,7 @@
                 <w:shd w:fill="auto" w:val="clear"/>
                 <w:rtl w:val="0"/>
               </w:rPr>
-              <w:t xml:space="preserve">- Entfernen und Entsorgen der Badewanne inkl. Befliesung</w:t>
+              <w:t xml:space="preserve">- Anbringen zusätzliches Waschbeckens ohne Unterschrank</w:t>
             </w:r>
             <w:r>
               <w:rPr>
@@ -1360,7 +1360,91 @@
                 <w:shd w:fill="auto" w:val="clear"/>
                 <w:rtl w:val="0"/>
               </w:rPr>
+              <w:t xml:space="preserve">- Entfernen und Entsorgen der Badewanne inkl. Befliesung</w:t>
+            </w:r>
+            <w:r>
+              <w:rPr>
+                <w:rtl w:val="0"/>
+              </w:rPr>
+            </w:r>
+          </w:p>
+          <w:p>
+            <w:pPr>
+              <w:spacing w:after="0" w:before="0" w:line="278.00000000000006" w:lineRule="auto"/>
+              <w:ind w:left="0" w:right="314" w:firstLine="0"/>
+              <w:jc w:val="left"/>
+              <w:rPr>
+                <w:color w:val="000000"/>
+                <w:sz w:val="18"/>
+                <w:szCs w:val="18"/>
+              </w:rPr>
+            </w:pPr>
+            <w:r>
+              <w:rPr>
+                <w:rFonts w:ascii="Open Sans" w:cs="Open Sans" w:eastAsia="Open Sans" w:hAnsi="Open Sans"/>
+                <w:color w:val="000000"/>
+                <w:sz w:val="18"/>
+                <w:szCs w:val="18"/>
+                <w:shd w:fill="auto" w:val="clear"/>
+                <w:rtl w:val="0"/>
+              </w:rPr>
               <w:t xml:space="preserve">- Entfernen und Entsorgen der Duschabtrennung</w:t>
+            </w:r>
+            <w:r>
+              <w:rPr>
+                <w:rtl w:val="0"/>
+              </w:rPr>
+            </w:r>
+          </w:p>
+          <w:p>
+            <w:pPr>
+              <w:spacing w:after="0" w:before="0" w:line="278.00000000000006" w:lineRule="auto"/>
+              <w:ind w:left="0" w:right="314" w:firstLine="0"/>
+              <w:jc w:val="left"/>
+              <w:rPr>
+                <w:color w:val="000000"/>
+                <w:sz w:val="18"/>
+                <w:szCs w:val="18"/>
+              </w:rPr>
+            </w:pPr>
+            <w:r>
+              <w:rPr>
+                <w:rFonts w:ascii="Open Sans" w:cs="Open Sans" w:eastAsia="Open Sans" w:hAnsi="Open Sans"/>
+                <w:color w:val="000000"/>
+                <w:sz w:val="18"/>
+                <w:szCs w:val="18"/>
+                <w:shd w:fill="auto" w:val="clear"/>
+                <w:rtl w:val="0"/>
+              </w:rPr>
+              <w:t xml:space="preserve">- Einbau der Duschwanne</w:t>
+            </w:r>
+            <w:r>
+              <w:rPr>
+                <w:rtl w:val="0"/>
+              </w:rPr>
+            </w:r>
+          </w:p>
+          <w:p>
+            <w:pPr>
+              <w:spacing w:after="0" w:before="0" w:line="278.00000000000006" w:lineRule="auto"/>
+              <w:ind w:left="0" w:right="314" w:firstLine="0"/>
+              <w:jc w:val="left"/>
+              <w:rPr>
+                <w:color w:val="000000"/>
+                <w:sz w:val="18"/>
+                <w:szCs w:val="18"/>
+              </w:rPr>
+            </w:pPr>
+            <w:r>
+              <w:rPr>
+                <w:rFonts w:ascii="Open Sans" w:cs="Open Sans" w:eastAsia="Open Sans" w:hAnsi="Open Sans"/>
+                <w:color w:val="000000"/>
+                <w:sz w:val="18"/>
+                <w:szCs w:val="18"/>
+                <w:shd w:fill="auto" w:val="clear"/>
+                <w:rtl w:val="0"/>
+              </w:rPr>
+              <w:t xml:space="preserve">- Einbau der Duschabtrennung</w:t>
             </w:r>
             <w:r>
               <w:rPr>
@@ -1803,7 +1887,7 @@
                 <w:shd w:fill="auto" w:val="clear"/>
                 <w:rtl w:val="0"/>
               </w:rPr>
-              <w:t xml:space="preserve">2.302,86 €</w:t>
+              <w:t xml:space="preserve">2.368,33 €</w:t>
             </w:r>
             <w:r>
               <w:rPr>
@@ -1835,7 +1919,7 @@
               <w:rPr>
                 <w:rtl w:val="0"/>
               </w:rPr>
-              <w:t xml:space="preserve">2.302,86 €</w:t>
+              <w:t xml:space="preserve">2.368,33 €</w:t>
             </w:r>
             <w:r>
               <w:rPr>
@@ -1955,7 +2039,7 @@
                 <w:shd w:fill="auto" w:val="clear"/>
                 <w:rtl w:val="0"/>
               </w:rPr>
-              <w:t xml:space="preserve">- 1 Stk TRINNITY Wannenabdichtband-Set 3,4 m Nass-/Trockenanbindung entspr. DIN 18534</w:t>
+              <w:t xml:space="preserve">- 3 Stk Wandverkleidung 3.0 Alu 997×2550 mm — Farbe: Marmor weiß</w:t>
             </w:r>
           </w:p>
           <w:p>
@@ -1980,7 +2064,7 @@
                 <w:shd w:fill="auto" w:val="clear"/>
                 <w:rtl w:val="0"/>
               </w:rPr>
-              <w:t xml:space="preserve">- 1 Stk Stelzlager höhenverstellar Set</w:t>
+              <w:t xml:space="preserve">- 2 Stk Wandverkleidung 3.0 Alu 1497×2550 mm — Farbe: Marmor weiß</w:t>
             </w:r>
           </w:p>
           <w:p>
@@ -2005,7 +2089,7 @@
                 <w:shd w:fill="auto" w:val="clear"/>
                 <w:rtl w:val="0"/>
               </w:rPr>
-              <w:t xml:space="preserve">- 3 Stk Wandverkleidung 3.0 Alu 997×2550 mm — Farbe: Marmor weiß</w:t>
+              <w:t xml:space="preserve">- 1 Stk TRINNITY Wandabdichtung BASIS-Set 5 qm DW bis 100 x 100 / BW bis 180 x 80 cm</w:t>
             </w:r>
           </w:p>
           <w:p>
@@ -2030,7 +2114,7 @@
                 <w:shd w:fill="auto" w:val="clear"/>
                 <w:rtl w:val="0"/>
               </w:rPr>
-              <w:t xml:space="preserve">- 2 Stk Wandverkleidung 3.0 Alu 1497×2550 mm — Farbe: Marmor weiß</w:t>
+              <w:t xml:space="preserve">- 1 Stk Wandverkleidungsklebstoff 3.0/4.0</w:t>
             </w:r>
           </w:p>
           <w:p>
@@ -2055,7 +2139,7 @@
                 <w:shd w:fill="auto" w:val="clear"/>
                 <w:rtl w:val="0"/>
               </w:rPr>
-              <w:t xml:space="preserve">- 1 Stk TRINNITY Wandabdichtung BASIS-Set 5 qm DW bis 100 x 100 / BW bis 180 x 80 cm</w:t>
+              <w:t xml:space="preserve">- 2 Stk Abschlussprofil 3.0 255 cm silber eloxiert VIGOUR</w:t>
             </w:r>
           </w:p>
           <w:p>
@@ -2080,7 +2164,7 @@
                 <w:shd w:fill="auto" w:val="clear"/>
                 <w:rtl w:val="0"/>
               </w:rPr>
-              <w:t xml:space="preserve">- 1 Stk Wandverkleidungsklebstoff 3.0/4.0</w:t>
+              <w:t xml:space="preserve">- 2 Stk Verbindungsprofil(e)</w:t>
             </w:r>
           </w:p>
           <w:p>
@@ -2105,7 +2189,7 @@
                 <w:shd w:fill="auto" w:val="clear"/>
                 <w:rtl w:val="0"/>
               </w:rPr>
-              <w:t xml:space="preserve">- 2 Stk Abschlussprofil 3.0 255 cm silber eloxiert VIGOUR</w:t>
+              <w:t xml:space="preserve">- 1 Stk Profilklebstoff (pro Abschlussprofil 1 Stk)</w:t>
             </w:r>
           </w:p>
           <w:p>
@@ -2130,7 +2214,7 @@
                 <w:shd w:fill="auto" w:val="clear"/>
                 <w:rtl w:val="0"/>
               </w:rPr>
-              <w:t xml:space="preserve">- 2 Stk Verbindungsprofil(e)</w:t>
+              <w:t xml:space="preserve">- 2 Stk Haltegriff clivia plus 32/400mm m. Ros. Edelstahl glatt poliert, VIGOUR</w:t>
             </w:r>
           </w:p>
           <w:p>
@@ -2155,7 +2239,7 @@
                 <w:shd w:fill="auto" w:val="clear"/>
                 <w:rtl w:val="0"/>
               </w:rPr>
-              <w:t xml:space="preserve">- 1 Stk Profilklebstoff (pro Abschlussprofil 1 Stk)</w:t>
+              <w:t xml:space="preserve">- 1 Stk Haltegriff clivia plus 32/600mm m. Ros. Edelstahl glatt poliert, VIGOUR</w:t>
             </w:r>
           </w:p>
           <w:p>
@@ -2180,7 +2264,7 @@
                 <w:shd w:fill="auto" w:val="clear"/>
                 <w:rtl w:val="0"/>
               </w:rPr>
-              <w:t xml:space="preserve">- 1 Stk Haltegriff clivia plus 32/400mm m. Ros. Edelstahl glatt poliert, VIGOUR</w:t>
+              <w:t xml:space="preserve">- 1 Stk Stützklappgriff derby plus 600mm verchromt m. ABS-Ummantelung VIGOUR</w:t>
             </w:r>
           </w:p>
           <w:p>
@@ -2205,7 +2289,7 @@
                 <w:shd w:fill="auto" w:val="clear"/>
                 <w:rtl w:val="0"/>
               </w:rPr>
-              <w:t xml:space="preserve">- 1 Stk Haltegriff clivia plus 32/600mm m. Ros. Edelstahl glatt poliert, VIGOUR</w:t>
+              <w:t xml:space="preserve">- 1 Stk Waschtisch clivia 60x48 cm weiss VIGOUR</w:t>
             </w:r>
           </w:p>
           <w:p>
@@ -2230,7 +2314,7 @@
                 <w:shd w:fill="auto" w:val="clear"/>
                 <w:rtl w:val="0"/>
               </w:rPr>
-              <w:t xml:space="preserve">- 1 Stk Stützklappgriff derby plus 600mm verchromt m. ABS-Ummantelung VIGOUR</w:t>
+              <w:t xml:space="preserve">- 1 Stk Befestigungssatz Fischer WST 10x140</w:t>
             </w:r>
           </w:p>
           <w:p>
@@ -2255,7 +2339,82 @@
                 <w:shd w:fill="auto" w:val="clear"/>
                 <w:rtl w:val="0"/>
               </w:rPr>
+              <w:t xml:space="preserve">- 1 Stk Waschtisch-Röhrensiphon 1 1/4" G mit Verstellrohr 120mm TRINNITY</w:t>
+            </w:r>
+          </w:p>
+          <w:p>
+            <w:pPr>
+              <w:spacing w:after="0" w:before="0" w:line="278.00000000000006" w:lineRule="auto"/>
+              <w:ind w:left="0" w:right="314" w:firstLine="0"/>
+              <w:jc w:val="left"/>
+              <w:rPr>
+                <w:rFonts w:ascii="Open Sans" w:cs="Open Sans" w:eastAsia="Open Sans" w:hAnsi="Open Sans"/>
+                <w:color w:val="000000"/>
+                <w:sz w:val="18"/>
+                <w:szCs w:val="18"/>
+                <w:shd w:fill="auto" w:val="clear"/>
+              </w:rPr>
+            </w:pPr>
+            <w:r>
+              <w:rPr>
+                <w:rFonts w:ascii="Open Sans" w:cs="Open Sans" w:eastAsia="Open Sans" w:hAnsi="Open Sans"/>
+                <w:color w:val="000000"/>
+                <w:sz w:val="18"/>
+                <w:szCs w:val="18"/>
+                <w:shd w:fill="auto" w:val="clear"/>
+                <w:rtl w:val="0"/>
+              </w:rPr>
+              <w:t xml:space="preserve">- 2 Stk SCHELL Eckventil COMFORT regulierbar, ASAG, 1/2", chrom</w:t>
+            </w:r>
+          </w:p>
+          <w:p>
+            <w:pPr>
+              <w:spacing w:after="0" w:before="0" w:line="278.00000000000006" w:lineRule="auto"/>
+              <w:ind w:left="0" w:right="314" w:firstLine="0"/>
+              <w:jc w:val="left"/>
+              <w:rPr>
+                <w:rFonts w:ascii="Open Sans" w:cs="Open Sans" w:eastAsia="Open Sans" w:hAnsi="Open Sans"/>
+                <w:color w:val="000000"/>
+                <w:sz w:val="18"/>
+                <w:szCs w:val="18"/>
+                <w:shd w:fill="auto" w:val="clear"/>
+              </w:rPr>
+            </w:pPr>
+            <w:r>
+              <w:rPr>
+                <w:rFonts w:ascii="Open Sans" w:cs="Open Sans" w:eastAsia="Open Sans" w:hAnsi="Open Sans"/>
+                <w:color w:val="000000"/>
+                <w:sz w:val="18"/>
+                <w:szCs w:val="18"/>
+                <w:shd w:fill="auto" w:val="clear"/>
+                <w:rtl w:val="0"/>
+              </w:rPr>
               <w:t xml:space="preserve">- 2 Stk Gleittür Hassmann</w:t>
+            </w:r>
+          </w:p>
+          <w:p>
+            <w:pPr>
+              <w:spacing w:after="0" w:before="0" w:line="278.00000000000006" w:lineRule="auto"/>
+              <w:ind w:left="0" w:right="314" w:firstLine="0"/>
+              <w:jc w:val="left"/>
+              <w:rPr>
+                <w:rFonts w:ascii="Open Sans" w:cs="Open Sans" w:eastAsia="Open Sans" w:hAnsi="Open Sans"/>
+                <w:color w:val="000000"/>
+                <w:sz w:val="18"/>
+                <w:szCs w:val="18"/>
+                <w:shd w:fill="auto" w:val="clear"/>
+              </w:rPr>
+            </w:pPr>
+            <w:r>
+              <w:rPr>
+                <w:rFonts w:ascii="Open Sans" w:cs="Open Sans" w:eastAsia="Open Sans" w:hAnsi="Open Sans"/>
+                <w:color w:val="000000"/>
+                <w:sz w:val="18"/>
+                <w:szCs w:val="18"/>
+                <w:shd w:fill="auto" w:val="clear"/>
+                <w:rtl w:val="0"/>
+              </w:rPr>
+              <w:t xml:space="preserve">- 1 Stk Falt-Pendeltür Hassmann</w:t>
             </w:r>
           </w:p>
           <w:p>
@@ -2346,488 +2505,6 @@
                 <w:shd w:fill="auto" w:val="clear"/>
               </w:rPr>
             </w:pPr>
-            <w:r>
-              <w:rPr>
-                <w:rtl w:val="0"/>
-              </w:rPr>
-            </w:r>
-          </w:p>
-        </w:tc>
-      </w:tr>
-      <w:tr>
-        <w:trPr>
-          <w:cantSplit w:val="0"/>
-          <w:trHeight w:val="1" w:hRule="atLeast"/>
-          <w:tblHeader w:val="0"/>
-        </w:trPr>
-        <w:tc>
-          <w:tcPr>
-            <w:tcBorders>
-              <w:top w:color="ffffff" w:space="0" w:sz="8" w:val="single"/>
-              <w:left w:color="ffffff" w:space="0" w:sz="8" w:val="single"/>
-              <w:bottom w:color="ffffff" w:space="0" w:sz="8" w:val="single"/>
-              <w:right w:color="ffffff" w:space="0" w:sz="8" w:val="single"/>
-            </w:tcBorders>
-            <w:shd w:fill="ffffff" w:val="clear"/>
-            <w:tcMar>
-              <w:left w:w="56.0" w:type="dxa"/>
-              <w:right w:w="56.0" w:type="dxa"/>
-            </w:tcMar>
-          </w:tcPr>
-          <w:p>
-            <w:pPr>
-              <w:spacing w:after="0" w:before="0" w:line="278.00000000000006" w:lineRule="auto"/>
-              <w:ind w:left="0" w:right="-26" w:firstLine="0"/>
-              <w:jc w:val="left"/>
-              <w:rPr>
-                <w:color w:val="000000"/>
-              </w:rPr>
-            </w:pPr>
-            <w:r>
-              <w:rPr>
-                <w:rFonts w:ascii="Open Sans" w:cs="Open Sans" w:eastAsia="Open Sans" w:hAnsi="Open Sans"/>
-                <w:color w:val="000000"/>
-                <w:sz w:val="20"/>
-                <w:szCs w:val="20"/>
-                <w:shd w:fill="auto" w:val="clear"/>
-                <w:rtl w:val="0"/>
-              </w:rPr>
-              <w:t xml:space="preserve">003</w:t>
-            </w:r>
-            <w:r>
-              <w:rPr>
-                <w:rtl w:val="0"/>
-              </w:rPr>
-            </w:r>
-          </w:p>
-        </w:tc>
-        <w:tc>
-          <w:tcPr>
-            <w:tcBorders>
-              <w:top w:color="ffffff" w:space="0" w:sz="8" w:val="single"/>
-              <w:left w:color="ffffff" w:space="0" w:sz="8" w:val="single"/>
-              <w:bottom w:color="ffffff" w:space="0" w:sz="8" w:val="single"/>
-              <w:right w:color="ffffff" w:space="0" w:sz="8" w:val="single"/>
-            </w:tcBorders>
-            <w:shd w:fill="ffffff" w:val="clear"/>
-            <w:tcMar>
-              <w:left w:w="56.0" w:type="dxa"/>
-              <w:right w:w="56.0" w:type="dxa"/>
-            </w:tcMar>
-          </w:tcPr>
-          <w:p>
-            <w:pPr>
-              <w:spacing w:after="0" w:before="0" w:line="278.00000000000006" w:lineRule="auto"/>
-              <w:ind w:left="0" w:right="314" w:firstLine="0"/>
-              <w:jc w:val="left"/>
-              <w:rPr>
-                <w:color w:val="000000"/>
-              </w:rPr>
-            </w:pPr>
-            <w:r>
-              <w:rPr>
-                <w:rFonts w:ascii="Open Sans" w:cs="Open Sans" w:eastAsia="Open Sans" w:hAnsi="Open Sans"/>
-                <w:color w:val="000000"/>
-                <w:sz w:val="20"/>
-                <w:szCs w:val="20"/>
-                <w:shd w:fill="auto" w:val="clear"/>
-                <w:rtl w:val="0"/>
-              </w:rPr>
-              <w:t xml:space="preserve">1 Stk</w:t>
-            </w:r>
-            <w:r>
-              <w:rPr>
-                <w:rtl w:val="0"/>
-              </w:rPr>
-            </w:r>
-          </w:p>
-        </w:tc>
-        <w:tc>
-          <w:tcPr>
-            <w:tcBorders>
-              <w:top w:color="ffffff" w:space="0" w:sz="8" w:val="single"/>
-              <w:left w:color="ffffff" w:space="0" w:sz="8" w:val="single"/>
-              <w:bottom w:color="ffffff" w:space="0" w:sz="8" w:val="single"/>
-              <w:right w:color="ffffff" w:space="0" w:sz="8" w:val="single"/>
-            </w:tcBorders>
-            <w:shd w:fill="ffffff" w:val="clear"/>
-            <w:tcMar>
-              <w:left w:w="56.0" w:type="dxa"/>
-              <w:right w:w="56.0" w:type="dxa"/>
-            </w:tcMar>
-          </w:tcPr>
-          <w:p>
-            <w:pPr>
-              <w:spacing w:after="0" w:before="0" w:line="278.00000000000006" w:lineRule="auto"/>
-              <w:ind w:left="0" w:right="314" w:firstLine="0"/>
-              <w:jc w:val="left"/>
-              <w:rPr>
-                <w:rFonts w:ascii="Open Sans" w:cs="Open Sans" w:eastAsia="Open Sans" w:hAnsi="Open Sans"/>
-                <w:b w:val="1"/>
-                <w:color w:val="000000"/>
-                <w:sz w:val="18"/>
-                <w:szCs w:val="18"/>
-                <w:shd w:fill="auto" w:val="clear"/>
-              </w:rPr>
-            </w:pPr>
-            <w:r>
-              <w:rPr>
-                <w:rFonts w:ascii="Open Sans" w:cs="Open Sans" w:eastAsia="Open Sans" w:hAnsi="Open Sans"/>
-                <w:b w:val="1"/>
-                <w:color w:val="000000"/>
-                <w:sz w:val="18"/>
-                <w:szCs w:val="18"/>
-                <w:shd w:fill="auto" w:val="clear"/>
-                <w:rtl w:val="0"/>
-              </w:rPr>
-              <w:t xml:space="preserve">Aktion: Haltegriff</w:t>
-            </w:r>
-          </w:p>
-          <w:p>
-            <w:pPr>
-              <w:spacing w:after="0" w:before="0" w:line="278.00000000000006" w:lineRule="auto"/>
-              <w:ind w:left="0" w:right="314" w:firstLine="0"/>
-              <w:jc w:val="left"/>
-              <w:rPr>
-                <w:color w:val="000000"/>
-                <w:sz w:val="18"/>
-                <w:szCs w:val="18"/>
-              </w:rPr>
-            </w:pPr>
-            <w:r>
-              <w:rPr>
-                <w:rFonts w:ascii="Open Sans" w:cs="Open Sans" w:eastAsia="Open Sans" w:hAnsi="Open Sans"/>
-                <w:color w:val="000000"/>
-                <w:sz w:val="18"/>
-                <w:szCs w:val="18"/>
-                <w:shd w:fill="auto" w:val="clear"/>
-                <w:rtl w:val="0"/>
-              </w:rPr>
-              <w:t xml:space="preserve">1 Haltegriff gratis im Wert von 175 € inkl. Lieferung und Montage</w:t>
-            </w:r>
-            <w:r>
-              <w:rPr>
-                <w:rtl w:val="0"/>
-              </w:rPr>
-            </w:r>
-          </w:p>
-        </w:tc>
-        <w:tc>
-          <w:tcPr>
-            <w:tcBorders>
-              <w:top w:color="ffffff" w:space="0" w:sz="8" w:val="single"/>
-              <w:left w:color="ffffff" w:space="0" w:sz="8" w:val="single"/>
-              <w:bottom w:color="ffffff" w:space="0" w:sz="8" w:val="single"/>
-              <w:right w:color="ffffff" w:space="0" w:sz="8" w:val="single"/>
-            </w:tcBorders>
-            <w:shd w:fill="ffffff" w:val="clear"/>
-            <w:tcMar>
-              <w:left w:w="56.0" w:type="dxa"/>
-              <w:right w:w="56.0" w:type="dxa"/>
-            </w:tcMar>
-          </w:tcPr>
-          <w:p>
-            <w:pPr>
-              <w:spacing w:after="0" w:before="0" w:line="278.00000000000006" w:lineRule="auto"/>
-              <w:ind w:left="0" w:right="314" w:firstLine="0"/>
-              <w:jc w:val="left"/>
-              <w:rPr>
-                <w:color w:val="000000"/>
-              </w:rPr>
-            </w:pPr>
-            <w:r>
-              <w:rPr>
-                <w:rFonts w:ascii="Open Sans" w:cs="Open Sans" w:eastAsia="Open Sans" w:hAnsi="Open Sans"/>
-                <w:color w:val="000000"/>
-                <w:sz w:val="20"/>
-                <w:szCs w:val="20"/>
-                <w:shd w:fill="auto" w:val="clear"/>
-                <w:rtl w:val="0"/>
-              </w:rPr>
-              <w:t xml:space="preserve">0,00 €</w:t>
-            </w:r>
-            <w:r>
-              <w:rPr>
-                <w:rtl w:val="0"/>
-              </w:rPr>
-            </w:r>
-          </w:p>
-        </w:tc>
-        <w:tc>
-          <w:tcPr>
-            <w:tcBorders>
-              <w:top w:color="ffffff" w:space="0" w:sz="8" w:val="single"/>
-              <w:left w:color="ffffff" w:space="0" w:sz="8" w:val="single"/>
-              <w:bottom w:color="ffffff" w:space="0" w:sz="8" w:val="single"/>
-              <w:right w:color="ffffff" w:space="0" w:sz="8" w:val="single"/>
-            </w:tcBorders>
-            <w:shd w:fill="ffffff" w:val="clear"/>
-            <w:tcMar>
-              <w:left w:w="56.0" w:type="dxa"/>
-              <w:right w:w="56.0" w:type="dxa"/>
-            </w:tcMar>
-          </w:tcPr>
-          <w:p>
-            <w:pPr>
-              <w:spacing w:after="0" w:before="0" w:line="278.00000000000006" w:lineRule="auto"/>
-              <w:ind w:left="0" w:right="314" w:firstLine="0"/>
-              <w:jc w:val="center"/>
-              <w:rPr>
-                <w:color w:val="000000"/>
-              </w:rPr>
-            </w:pPr>
-            <w:r>
-              <w:rPr>
-                <w:rFonts w:ascii="Open Sans" w:cs="Open Sans" w:eastAsia="Open Sans" w:hAnsi="Open Sans"/>
-                <w:color w:val="000000"/>
-                <w:sz w:val="20"/>
-                <w:szCs w:val="20"/>
-                <w:shd w:fill="auto" w:val="clear"/>
-                <w:rtl w:val="0"/>
-              </w:rPr>
-              <w:t xml:space="preserve">0,00 €</w:t>
-            </w:r>
-            <w:r>
-              <w:rPr>
-                <w:rtl w:val="0"/>
-              </w:rPr>
-            </w:r>
-          </w:p>
-        </w:tc>
-      </w:tr>
-      <w:tr>
-        <w:trPr>
-          <w:cantSplit w:val="0"/>
-          <w:trHeight w:val="1" w:hRule="atLeast"/>
-          <w:tblHeader w:val="0"/>
-        </w:trPr>
-        <w:tc>
-          <w:tcPr>
-            <w:tcBorders>
-              <w:top w:color="ffffff" w:space="0" w:sz="8" w:val="single"/>
-              <w:left w:color="ffffff" w:space="0" w:sz="8" w:val="single"/>
-              <w:bottom w:color="ffffff" w:space="0" w:sz="8" w:val="single"/>
-              <w:right w:color="ffffff" w:space="0" w:sz="8" w:val="single"/>
-            </w:tcBorders>
-            <w:shd w:fill="ffffff" w:val="clear"/>
-            <w:tcMar>
-              <w:left w:w="56.0" w:type="dxa"/>
-              <w:right w:w="56.0" w:type="dxa"/>
-            </w:tcMar>
-          </w:tcPr>
-          <w:p>
-            <w:pPr>
-              <w:spacing w:after="0" w:before="0" w:line="278.00000000000006" w:lineRule="auto"/>
-              <w:ind w:left="0" w:right="-26" w:firstLine="0"/>
-              <w:jc w:val="left"/>
-              <w:rPr>
-                <w:color w:val="000000"/>
-              </w:rPr>
-            </w:pPr>
-            <w:r>
-              <w:rPr>
-                <w:rFonts w:ascii="Open Sans" w:cs="Open Sans" w:eastAsia="Open Sans" w:hAnsi="Open Sans"/>
-                <w:color w:val="000000"/>
-                <w:sz w:val="20"/>
-                <w:szCs w:val="20"/>
-                <w:shd w:fill="auto" w:val="clear"/>
-                <w:rtl w:val="0"/>
-              </w:rPr>
-              <w:t xml:space="preserve">004</w:t>
-            </w:r>
-            <w:r>
-              <w:rPr>
-                <w:rtl w:val="0"/>
-              </w:rPr>
-            </w:r>
-          </w:p>
-        </w:tc>
-        <w:tc>
-          <w:tcPr>
-            <w:tcBorders>
-              <w:top w:color="ffffff" w:space="0" w:sz="8" w:val="single"/>
-              <w:left w:color="ffffff" w:space="0" w:sz="8" w:val="single"/>
-              <w:bottom w:color="ffffff" w:space="0" w:sz="8" w:val="single"/>
-              <w:right w:color="ffffff" w:space="0" w:sz="8" w:val="single"/>
-            </w:tcBorders>
-            <w:shd w:fill="ffffff" w:val="clear"/>
-            <w:tcMar>
-              <w:left w:w="56.0" w:type="dxa"/>
-              <w:right w:w="56.0" w:type="dxa"/>
-            </w:tcMar>
-          </w:tcPr>
-          <w:p>
-            <w:pPr>
-              <w:spacing w:after="0" w:before="0" w:line="278.00000000000006" w:lineRule="auto"/>
-              <w:ind w:left="0" w:right="314" w:firstLine="0"/>
-              <w:jc w:val="left"/>
-              <w:rPr>
-                <w:color w:val="000000"/>
-              </w:rPr>
-            </w:pPr>
-            <w:r>
-              <w:rPr>
-                <w:rFonts w:ascii="Open Sans" w:cs="Open Sans" w:eastAsia="Open Sans" w:hAnsi="Open Sans"/>
-                <w:color w:val="000000"/>
-                <w:sz w:val="20"/>
-                <w:szCs w:val="20"/>
-                <w:shd w:fill="auto" w:val="clear"/>
-                <w:rtl w:val="0"/>
-              </w:rPr>
-              <w:t xml:space="preserve">1 Stk</w:t>
-            </w:r>
-            <w:r>
-              <w:rPr>
-                <w:rtl w:val="0"/>
-              </w:rPr>
-            </w:r>
-          </w:p>
-        </w:tc>
-        <w:tc>
-          <w:tcPr>
-            <w:tcBorders>
-              <w:top w:color="ffffff" w:space="0" w:sz="8" w:val="single"/>
-              <w:left w:color="ffffff" w:space="0" w:sz="8" w:val="single"/>
-              <w:bottom w:color="ffffff" w:space="0" w:sz="8" w:val="single"/>
-              <w:right w:color="ffffff" w:space="0" w:sz="8" w:val="single"/>
-            </w:tcBorders>
-            <w:shd w:fill="ffffff" w:val="clear"/>
-            <w:tcMar>
-              <w:left w:w="56.0" w:type="dxa"/>
-              <w:right w:w="56.0" w:type="dxa"/>
-            </w:tcMar>
-          </w:tcPr>
-          <w:p>
-            <w:pPr>
-              <w:spacing w:after="0" w:before="0" w:line="278.00000000000006" w:lineRule="auto"/>
-              <w:ind w:left="0" w:right="314" w:firstLine="0"/>
-              <w:jc w:val="left"/>
-              <w:rPr>
-                <w:rFonts w:ascii="Open Sans" w:cs="Open Sans" w:eastAsia="Open Sans" w:hAnsi="Open Sans"/>
-                <w:b w:val="1"/>
-                <w:color w:val="000000"/>
-                <w:sz w:val="18"/>
-                <w:szCs w:val="18"/>
-                <w:shd w:fill="auto" w:val="clear"/>
-              </w:rPr>
-            </w:pPr>
-            <w:r>
-              <w:rPr>
-                <w:rFonts w:ascii="Open Sans" w:cs="Open Sans" w:eastAsia="Open Sans" w:hAnsi="Open Sans"/>
-                <w:b w:val="1"/>
-                <w:color w:val="000000"/>
-                <w:sz w:val="18"/>
-                <w:szCs w:val="18"/>
-                <w:shd w:fill="auto" w:val="clear"/>
-                <w:rtl w:val="0"/>
-              </w:rPr>
-              <w:t xml:space="preserve">Bestandkundenbonus:</w:t>
-            </w:r>
-          </w:p>
-          <w:p>
-            <w:pPr>
-              <w:spacing w:after="0" w:before="0" w:line="278.00000000000006" w:lineRule="auto"/>
-              <w:ind w:left="0" w:right="314" w:firstLine="0"/>
-              <w:jc w:val="left"/>
-              <w:rPr>
-                <w:color w:val="000000"/>
-                <w:sz w:val="18"/>
-                <w:szCs w:val="18"/>
-              </w:rPr>
-            </w:pPr>
-            <w:r>
-              <w:rPr>
-                <w:rFonts w:ascii="Open Sans" w:cs="Open Sans" w:eastAsia="Open Sans" w:hAnsi="Open Sans"/>
-                <w:color w:val="000000"/>
-                <w:sz w:val="18"/>
-                <w:szCs w:val="18"/>
-                <w:shd w:fill="auto" w:val="clear"/>
-                <w:rtl w:val="0"/>
-              </w:rPr>
-              <w:t xml:space="preserve">-- Rabatt von 300 € ab einem Gesamtwert von 3.000</w:t>
-            </w:r>
-            <w:r>
-              <w:rPr>
-                <w:rtl w:val="0"/>
-              </w:rPr>
-            </w:r>
-          </w:p>
-        </w:tc>
-        <w:tc>
-          <w:tcPr>
-            <w:tcBorders>
-              <w:top w:color="ffffff" w:space="0" w:sz="8" w:val="single"/>
-              <w:left w:color="ffffff" w:space="0" w:sz="8" w:val="single"/>
-              <w:bottom w:color="ffffff" w:space="0" w:sz="8" w:val="single"/>
-              <w:right w:color="ffffff" w:space="0" w:sz="8" w:val="single"/>
-            </w:tcBorders>
-            <w:shd w:fill="ffffff" w:val="clear"/>
-            <w:tcMar>
-              <w:left w:w="56.0" w:type="dxa"/>
-              <w:right w:w="56.0" w:type="dxa"/>
-            </w:tcMar>
-          </w:tcPr>
-          <w:p>
-            <w:pPr>
-              <w:spacing w:after="0" w:before="0" w:line="278.00000000000006" w:lineRule="auto"/>
-              <w:ind w:left="0" w:right="314" w:firstLine="0"/>
-              <w:jc w:val="left"/>
-              <w:rPr>
-                <w:color w:val="000000"/>
-              </w:rPr>
-            </w:pPr>
-            <w:r>
-              <w:rPr>
-                <w:rFonts w:ascii="Open Sans" w:cs="Open Sans" w:eastAsia="Open Sans" w:hAnsi="Open Sans"/>
-                <w:color w:val="000000"/>
-                <w:sz w:val="20"/>
-                <w:szCs w:val="20"/>
-                <w:shd w:fill="auto" w:val="clear"/>
-                <w:rtl w:val="0"/>
-              </w:rPr>
-              <w:t xml:space="preserve">-252,10 €</w:t>
-            </w:r>
-            <w:r>
-              <w:rPr>
-                <w:rtl w:val="0"/>
-              </w:rPr>
-            </w:r>
-          </w:p>
-        </w:tc>
-        <w:tc>
-          <w:tcPr>
-            <w:tcBorders>
-              <w:top w:color="ffffff" w:space="0" w:sz="8" w:val="single"/>
-              <w:left w:color="ffffff" w:space="0" w:sz="8" w:val="single"/>
-              <w:bottom w:color="ffffff" w:space="0" w:sz="8" w:val="single"/>
-              <w:right w:color="ffffff" w:space="0" w:sz="8" w:val="single"/>
-            </w:tcBorders>
-            <w:shd w:fill="ffffff" w:val="clear"/>
-            <w:tcMar>
-              <w:left w:w="56.0" w:type="dxa"/>
-              <w:right w:w="56.0" w:type="dxa"/>
-            </w:tcMar>
-          </w:tcPr>
-          <w:p>
-            <w:pPr>
-              <w:spacing w:after="0" w:before="0" w:line="278.00000000000006" w:lineRule="auto"/>
-              <w:ind w:left="0" w:right="314" w:firstLine="0"/>
-              <w:jc w:val="center"/>
-              <w:rPr>
-                <w:color w:val="000000"/>
-              </w:rPr>
-            </w:pPr>
-            <w:r>
-              <w:rPr>
-                <w:rFonts w:ascii="Open Sans" w:cs="Open Sans" w:eastAsia="Open Sans" w:hAnsi="Open Sans"/>
-                <w:color w:val="000000"/>
-                <w:sz w:val="20"/>
-                <w:szCs w:val="20"/>
-                <w:shd w:fill="auto" w:val="clear"/>
-                <w:rtl w:val="0"/>
-              </w:rPr>
-              <w:t xml:space="preserve">-252,10 €</w:t>
-            </w:r>
             <w:r>
               <w:rPr>
                 <w:rtl w:val="0"/>
@@ -3031,7 +2708,7 @@
                 <w:shd w:fill="auto" w:val="clear"/>
                 <w:rtl w:val="0"/>
               </w:rPr>
-              <w:t xml:space="preserve">5.165,58 €</w:t>
+              <w:t xml:space="preserve">5.511,06 €</w:t>
             </w:r>
             <w:r>
               <w:rPr>
@@ -3200,7 +2877,7 @@
                 <w:shd w:fill="auto" w:val="clear"/>
                 <w:rtl w:val="0"/>
               </w:rPr>
-              <w:t xml:space="preserve">981,46 €</w:t>
+              <w:t xml:space="preserve">1.047,10 €</w:t>
             </w:r>
             <w:r>
               <w:rPr>
@@ -3369,7 +3046,7 @@
                 <w:shd w:fill="auto" w:val="clear"/>
                 <w:rtl w:val="0"/>
               </w:rPr>
-              <w:t xml:space="preserve">6.147,04 €</w:t>
+              <w:t xml:space="preserve">6.558,16 €</w:t>
             </w:r>
             <w:r>
               <w:rPr>
@@ -3433,6 +3110,66 @@
           <w:rtl w:val="0"/>
         </w:rPr>
         <w:t xml:space="preserve">Es handelt sich hierbei um ein Festpreisangebot für die oben definierten Leistungen.</w:t>
+      </w:r>
+      <w:r>
+        <w:rPr>
+          <w:rtl w:val="0"/>
+        </w:rPr>
+      </w:r>
+    </w:p>
+    <w:p>
+      <w:pPr>
+        <w:spacing w:after="0" w:before="23" w:line="240" w:lineRule="auto"/>
+        <w:ind w:left="0" w:right="0" w:firstLine="0"/>
+        <w:jc w:val="left"/>
+        <w:rPr>
+          <w:rFonts w:ascii="Open Sans" w:cs="Open Sans" w:eastAsia="Open Sans" w:hAnsi="Open Sans"/>
+          <w:color w:val="000000"/>
+          <w:sz w:val="22"/>
+          <w:szCs w:val="22"/>
+          <w:shd w:fill="auto" w:val="clear"/>
+        </w:rPr>
+      </w:pPr>
+      <w:r>
+        <w:rPr>
+          <w:rtl w:val="0"/>
+        </w:rPr>
+      </w:r>
+    </w:p>
+    <w:p>
+      <w:pPr>
+        <w:spacing w:after="0" w:before="0" w:line="286" w:lineRule="auto"/>
+        <w:ind w:left="123" w:right="0" w:firstLine="0"/>
+        <w:jc w:val="left"/>
+        <w:rPr>
+          <w:rFonts w:ascii="Open Sans" w:cs="Open Sans" w:eastAsia="Open Sans" w:hAnsi="Open Sans"/>
+          <w:color w:val="000000"/>
+          <w:sz w:val="22"/>
+          <w:szCs w:val="22"/>
+          <w:shd w:fill="auto" w:val="clear"/>
+        </w:rPr>
+      </w:pPr>
+      <w:r>
+        <w:rPr>
+          <w:rFonts w:ascii="Open Sans SemiBold" w:cs="Open Sans SemiBold" w:eastAsia="Open Sans SemiBold" w:hAnsi="Open Sans SemiBold"/>
+          <w:color w:val="030303"/>
+          <w:sz w:val="22"/>
+          <w:szCs w:val="22"/>
+          <w:shd w:fill="auto" w:val="clear"/>
+          <w:rtl w:val="0"/>
+        </w:rPr>
+        <w:t xml:space="preserve">ACHTUNG:</w:t>
+      </w:r>
+      <w:r>
+        <w:rPr>
+          <w:rFonts w:ascii="Open Sans" w:cs="Open Sans" w:eastAsia="Open Sans" w:hAnsi="Open Sans"/>
+          <w:color w:val="030303"/>
+          <w:sz w:val="22"/>
+          <w:szCs w:val="22"/>
+          <w:shd w:fill="auto" w:val="clear"/>
+          <w:rtl w:val="0"/>
+        </w:rPr>
+        <w:t xml:space="preserve"> Ob eine ebenerdige Montage der Duschwanne möglich ist, kann erst nach dem Ausbau der bestehenden Wanne beurteilen werden. Sollten dabei zusätzliche oder weitere Leistungen erforderlich oder von Ihnen gewünscht sein, können zusätzliche Kosten entstehen.</w:t>
         <w:br w:type="textWrapping"/>
       </w:r>
       <w:r>
@@ -3536,7 +3273,7 @@
           <w:shd w:fill="auto" w:val="clear"/>
           <w:rtl w:val="0"/>
         </w:rPr>
-        <w:t xml:space="preserve">2.117,04 €</w:t>
+        <w:t xml:space="preserve">2.528,16 €</w:t>
       </w:r>
       <w:r>
         <w:rPr>

</xml_diff>

<commit_message>
rabatt menu load correctly
</commit_message>
<xml_diff>
--- a/out-Angebot.docx
+++ b/out-Angebot.docx
@@ -310,7 +310,7 @@
                 <w:rFonts w:ascii="Open Sans" w:cs="Open Sans" w:eastAsia="Open Sans" w:hAnsi="Open Sans"/>
                 <w:rtl w:val="0"/>
               </w:rPr>
-              <w:t xml:space="preserve">ANG2025-1014-135509</w:t>
+              <w:t xml:space="preserve">ANG2025-1014-142658</w:t>
             </w:r>
             <w:r>
               <w:rPr>
@@ -578,7 +578,7 @@
           <w:shd w:fill="auto" w:val="clear"/>
           <w:rtl w:val="0"/>
         </w:rPr>
-        <w:t xml:space="preserve">  Ihr Angebot ANG2025-1014-135509</w:t>
+        <w:t xml:space="preserve">  Ihr Angebot ANG2025-1014-142658</w:t>
       </w:r>
     </w:p>
     <w:p>
@@ -2214,7 +2214,7 @@
                 <w:shd w:fill="auto" w:val="clear"/>
                 <w:rtl w:val="0"/>
               </w:rPr>
-              <w:t xml:space="preserve">- 2 Stk Haltegriff clivia plus 32/400mm m. Ros. Edelstahl glatt poliert, VIGOUR</w:t>
+              <w:t xml:space="preserve">- 1 Stk Haltegriff clivia plus 32/400mm m. Ros. Edelstahl glatt poliert, VIGOUR</w:t>
             </w:r>
           </w:p>
           <w:p>
@@ -2505,6 +2505,488 @@
                 <w:shd w:fill="auto" w:val="clear"/>
               </w:rPr>
             </w:pPr>
+            <w:r>
+              <w:rPr>
+                <w:rtl w:val="0"/>
+              </w:rPr>
+            </w:r>
+          </w:p>
+        </w:tc>
+      </w:tr>
+      <w:tr>
+        <w:trPr>
+          <w:cantSplit w:val="0"/>
+          <w:trHeight w:val="1" w:hRule="atLeast"/>
+          <w:tblHeader w:val="0"/>
+        </w:trPr>
+        <w:tc>
+          <w:tcPr>
+            <w:tcBorders>
+              <w:top w:color="ffffff" w:space="0" w:sz="8" w:val="single"/>
+              <w:left w:color="ffffff" w:space="0" w:sz="8" w:val="single"/>
+              <w:bottom w:color="ffffff" w:space="0" w:sz="8" w:val="single"/>
+              <w:right w:color="ffffff" w:space="0" w:sz="8" w:val="single"/>
+            </w:tcBorders>
+            <w:shd w:fill="ffffff" w:val="clear"/>
+            <w:tcMar>
+              <w:left w:w="56.0" w:type="dxa"/>
+              <w:right w:w="56.0" w:type="dxa"/>
+            </w:tcMar>
+          </w:tcPr>
+          <w:p>
+            <w:pPr>
+              <w:spacing w:after="0" w:before="0" w:line="278.00000000000006" w:lineRule="auto"/>
+              <w:ind w:left="0" w:right="-26" w:firstLine="0"/>
+              <w:jc w:val="left"/>
+              <w:rPr>
+                <w:color w:val="000000"/>
+              </w:rPr>
+            </w:pPr>
+            <w:r>
+              <w:rPr>
+                <w:rFonts w:ascii="Open Sans" w:cs="Open Sans" w:eastAsia="Open Sans" w:hAnsi="Open Sans"/>
+                <w:color w:val="000000"/>
+                <w:sz w:val="20"/>
+                <w:szCs w:val="20"/>
+                <w:shd w:fill="auto" w:val="clear"/>
+                <w:rtl w:val="0"/>
+              </w:rPr>
+              <w:t xml:space="preserve">003</w:t>
+            </w:r>
+            <w:r>
+              <w:rPr>
+                <w:rtl w:val="0"/>
+              </w:rPr>
+            </w:r>
+          </w:p>
+        </w:tc>
+        <w:tc>
+          <w:tcPr>
+            <w:tcBorders>
+              <w:top w:color="ffffff" w:space="0" w:sz="8" w:val="single"/>
+              <w:left w:color="ffffff" w:space="0" w:sz="8" w:val="single"/>
+              <w:bottom w:color="ffffff" w:space="0" w:sz="8" w:val="single"/>
+              <w:right w:color="ffffff" w:space="0" w:sz="8" w:val="single"/>
+            </w:tcBorders>
+            <w:shd w:fill="ffffff" w:val="clear"/>
+            <w:tcMar>
+              <w:left w:w="56.0" w:type="dxa"/>
+              <w:right w:w="56.0" w:type="dxa"/>
+            </w:tcMar>
+          </w:tcPr>
+          <w:p>
+            <w:pPr>
+              <w:spacing w:after="0" w:before="0" w:line="278.00000000000006" w:lineRule="auto"/>
+              <w:ind w:left="0" w:right="314" w:firstLine="0"/>
+              <w:jc w:val="left"/>
+              <w:rPr>
+                <w:color w:val="000000"/>
+              </w:rPr>
+            </w:pPr>
+            <w:r>
+              <w:rPr>
+                <w:rFonts w:ascii="Open Sans" w:cs="Open Sans" w:eastAsia="Open Sans" w:hAnsi="Open Sans"/>
+                <w:color w:val="000000"/>
+                <w:sz w:val="20"/>
+                <w:szCs w:val="20"/>
+                <w:shd w:fill="auto" w:val="clear"/>
+                <w:rtl w:val="0"/>
+              </w:rPr>
+              <w:t xml:space="preserve">1 Stk</w:t>
+            </w:r>
+            <w:r>
+              <w:rPr>
+                <w:rtl w:val="0"/>
+              </w:rPr>
+            </w:r>
+          </w:p>
+        </w:tc>
+        <w:tc>
+          <w:tcPr>
+            <w:tcBorders>
+              <w:top w:color="ffffff" w:space="0" w:sz="8" w:val="single"/>
+              <w:left w:color="ffffff" w:space="0" w:sz="8" w:val="single"/>
+              <w:bottom w:color="ffffff" w:space="0" w:sz="8" w:val="single"/>
+              <w:right w:color="ffffff" w:space="0" w:sz="8" w:val="single"/>
+            </w:tcBorders>
+            <w:shd w:fill="ffffff" w:val="clear"/>
+            <w:tcMar>
+              <w:left w:w="56.0" w:type="dxa"/>
+              <w:right w:w="56.0" w:type="dxa"/>
+            </w:tcMar>
+          </w:tcPr>
+          <w:p>
+            <w:pPr>
+              <w:spacing w:after="0" w:before="0" w:line="278.00000000000006" w:lineRule="auto"/>
+              <w:ind w:left="0" w:right="314" w:firstLine="0"/>
+              <w:jc w:val="left"/>
+              <w:rPr>
+                <w:rFonts w:ascii="Open Sans" w:cs="Open Sans" w:eastAsia="Open Sans" w:hAnsi="Open Sans"/>
+                <w:b w:val="1"/>
+                <w:color w:val="000000"/>
+                <w:sz w:val="18"/>
+                <w:szCs w:val="18"/>
+                <w:shd w:fill="auto" w:val="clear"/>
+              </w:rPr>
+            </w:pPr>
+            <w:r>
+              <w:rPr>
+                <w:rFonts w:ascii="Open Sans" w:cs="Open Sans" w:eastAsia="Open Sans" w:hAnsi="Open Sans"/>
+                <w:b w:val="1"/>
+                <w:color w:val="000000"/>
+                <w:sz w:val="18"/>
+                <w:szCs w:val="18"/>
+                <w:shd w:fill="auto" w:val="clear"/>
+                <w:rtl w:val="0"/>
+              </w:rPr>
+              <w:t xml:space="preserve">Aktion: Haltegriff</w:t>
+            </w:r>
+          </w:p>
+          <w:p>
+            <w:pPr>
+              <w:spacing w:after="0" w:before="0" w:line="278.00000000000006" w:lineRule="auto"/>
+              <w:ind w:left="0" w:right="314" w:firstLine="0"/>
+              <w:jc w:val="left"/>
+              <w:rPr>
+                <w:color w:val="000000"/>
+                <w:sz w:val="18"/>
+                <w:szCs w:val="18"/>
+              </w:rPr>
+            </w:pPr>
+            <w:r>
+              <w:rPr>
+                <w:rFonts w:ascii="Open Sans" w:cs="Open Sans" w:eastAsia="Open Sans" w:hAnsi="Open Sans"/>
+                <w:color w:val="000000"/>
+                <w:sz w:val="18"/>
+                <w:szCs w:val="18"/>
+                <w:shd w:fill="auto" w:val="clear"/>
+                <w:rtl w:val="0"/>
+              </w:rPr>
+              <w:t xml:space="preserve">1 Haltegriff gratis im Wert von 175 € inkl. Lieferung und Montage</w:t>
+            </w:r>
+            <w:r>
+              <w:rPr>
+                <w:rtl w:val="0"/>
+              </w:rPr>
+            </w:r>
+          </w:p>
+        </w:tc>
+        <w:tc>
+          <w:tcPr>
+            <w:tcBorders>
+              <w:top w:color="ffffff" w:space="0" w:sz="8" w:val="single"/>
+              <w:left w:color="ffffff" w:space="0" w:sz="8" w:val="single"/>
+              <w:bottom w:color="ffffff" w:space="0" w:sz="8" w:val="single"/>
+              <w:right w:color="ffffff" w:space="0" w:sz="8" w:val="single"/>
+            </w:tcBorders>
+            <w:shd w:fill="ffffff" w:val="clear"/>
+            <w:tcMar>
+              <w:left w:w="56.0" w:type="dxa"/>
+              <w:right w:w="56.0" w:type="dxa"/>
+            </w:tcMar>
+          </w:tcPr>
+          <w:p>
+            <w:pPr>
+              <w:spacing w:after="0" w:before="0" w:line="278.00000000000006" w:lineRule="auto"/>
+              <w:ind w:left="0" w:right="314" w:firstLine="0"/>
+              <w:jc w:val="left"/>
+              <w:rPr>
+                <w:color w:val="000000"/>
+              </w:rPr>
+            </w:pPr>
+            <w:r>
+              <w:rPr>
+                <w:rFonts w:ascii="Open Sans" w:cs="Open Sans" w:eastAsia="Open Sans" w:hAnsi="Open Sans"/>
+                <w:color w:val="000000"/>
+                <w:sz w:val="20"/>
+                <w:szCs w:val="20"/>
+                <w:shd w:fill="auto" w:val="clear"/>
+                <w:rtl w:val="0"/>
+              </w:rPr>
+              <w:t xml:space="preserve">0,00 €</w:t>
+            </w:r>
+            <w:r>
+              <w:rPr>
+                <w:rtl w:val="0"/>
+              </w:rPr>
+            </w:r>
+          </w:p>
+        </w:tc>
+        <w:tc>
+          <w:tcPr>
+            <w:tcBorders>
+              <w:top w:color="ffffff" w:space="0" w:sz="8" w:val="single"/>
+              <w:left w:color="ffffff" w:space="0" w:sz="8" w:val="single"/>
+              <w:bottom w:color="ffffff" w:space="0" w:sz="8" w:val="single"/>
+              <w:right w:color="ffffff" w:space="0" w:sz="8" w:val="single"/>
+            </w:tcBorders>
+            <w:shd w:fill="ffffff" w:val="clear"/>
+            <w:tcMar>
+              <w:left w:w="56.0" w:type="dxa"/>
+              <w:right w:w="56.0" w:type="dxa"/>
+            </w:tcMar>
+          </w:tcPr>
+          <w:p>
+            <w:pPr>
+              <w:spacing w:after="0" w:before="0" w:line="278.00000000000006" w:lineRule="auto"/>
+              <w:ind w:left="0" w:right="314" w:firstLine="0"/>
+              <w:jc w:val="center"/>
+              <w:rPr>
+                <w:color w:val="000000"/>
+              </w:rPr>
+            </w:pPr>
+            <w:r>
+              <w:rPr>
+                <w:rFonts w:ascii="Open Sans" w:cs="Open Sans" w:eastAsia="Open Sans" w:hAnsi="Open Sans"/>
+                <w:color w:val="000000"/>
+                <w:sz w:val="20"/>
+                <w:szCs w:val="20"/>
+                <w:shd w:fill="auto" w:val="clear"/>
+                <w:rtl w:val="0"/>
+              </w:rPr>
+              <w:t xml:space="preserve">0,00 €</w:t>
+            </w:r>
+            <w:r>
+              <w:rPr>
+                <w:rtl w:val="0"/>
+              </w:rPr>
+            </w:r>
+          </w:p>
+        </w:tc>
+      </w:tr>
+      <w:tr>
+        <w:trPr>
+          <w:cantSplit w:val="0"/>
+          <w:trHeight w:val="1" w:hRule="atLeast"/>
+          <w:tblHeader w:val="0"/>
+        </w:trPr>
+        <w:tc>
+          <w:tcPr>
+            <w:tcBorders>
+              <w:top w:color="ffffff" w:space="0" w:sz="8" w:val="single"/>
+              <w:left w:color="ffffff" w:space="0" w:sz="8" w:val="single"/>
+              <w:bottom w:color="ffffff" w:space="0" w:sz="8" w:val="single"/>
+              <w:right w:color="ffffff" w:space="0" w:sz="8" w:val="single"/>
+            </w:tcBorders>
+            <w:shd w:fill="ffffff" w:val="clear"/>
+            <w:tcMar>
+              <w:left w:w="56.0" w:type="dxa"/>
+              <w:right w:w="56.0" w:type="dxa"/>
+            </w:tcMar>
+          </w:tcPr>
+          <w:p>
+            <w:pPr>
+              <w:spacing w:after="0" w:before="0" w:line="278.00000000000006" w:lineRule="auto"/>
+              <w:ind w:left="0" w:right="-26" w:firstLine="0"/>
+              <w:jc w:val="left"/>
+              <w:rPr>
+                <w:color w:val="000000"/>
+              </w:rPr>
+            </w:pPr>
+            <w:r>
+              <w:rPr>
+                <w:rFonts w:ascii="Open Sans" w:cs="Open Sans" w:eastAsia="Open Sans" w:hAnsi="Open Sans"/>
+                <w:color w:val="000000"/>
+                <w:sz w:val="20"/>
+                <w:szCs w:val="20"/>
+                <w:shd w:fill="auto" w:val="clear"/>
+                <w:rtl w:val="0"/>
+              </w:rPr>
+              <w:t xml:space="preserve">004</w:t>
+            </w:r>
+            <w:r>
+              <w:rPr>
+                <w:rtl w:val="0"/>
+              </w:rPr>
+            </w:r>
+          </w:p>
+        </w:tc>
+        <w:tc>
+          <w:tcPr>
+            <w:tcBorders>
+              <w:top w:color="ffffff" w:space="0" w:sz="8" w:val="single"/>
+              <w:left w:color="ffffff" w:space="0" w:sz="8" w:val="single"/>
+              <w:bottom w:color="ffffff" w:space="0" w:sz="8" w:val="single"/>
+              <w:right w:color="ffffff" w:space="0" w:sz="8" w:val="single"/>
+            </w:tcBorders>
+            <w:shd w:fill="ffffff" w:val="clear"/>
+            <w:tcMar>
+              <w:left w:w="56.0" w:type="dxa"/>
+              <w:right w:w="56.0" w:type="dxa"/>
+            </w:tcMar>
+          </w:tcPr>
+          <w:p>
+            <w:pPr>
+              <w:spacing w:after="0" w:before="0" w:line="278.00000000000006" w:lineRule="auto"/>
+              <w:ind w:left="0" w:right="314" w:firstLine="0"/>
+              <w:jc w:val="left"/>
+              <w:rPr>
+                <w:color w:val="000000"/>
+              </w:rPr>
+            </w:pPr>
+            <w:r>
+              <w:rPr>
+                <w:rFonts w:ascii="Open Sans" w:cs="Open Sans" w:eastAsia="Open Sans" w:hAnsi="Open Sans"/>
+                <w:color w:val="000000"/>
+                <w:sz w:val="20"/>
+                <w:szCs w:val="20"/>
+                <w:shd w:fill="auto" w:val="clear"/>
+                <w:rtl w:val="0"/>
+              </w:rPr>
+              <w:t xml:space="preserve">1 Stk</w:t>
+            </w:r>
+            <w:r>
+              <w:rPr>
+                <w:rtl w:val="0"/>
+              </w:rPr>
+            </w:r>
+          </w:p>
+        </w:tc>
+        <w:tc>
+          <w:tcPr>
+            <w:tcBorders>
+              <w:top w:color="ffffff" w:space="0" w:sz="8" w:val="single"/>
+              <w:left w:color="ffffff" w:space="0" w:sz="8" w:val="single"/>
+              <w:bottom w:color="ffffff" w:space="0" w:sz="8" w:val="single"/>
+              <w:right w:color="ffffff" w:space="0" w:sz="8" w:val="single"/>
+            </w:tcBorders>
+            <w:shd w:fill="ffffff" w:val="clear"/>
+            <w:tcMar>
+              <w:left w:w="56.0" w:type="dxa"/>
+              <w:right w:w="56.0" w:type="dxa"/>
+            </w:tcMar>
+          </w:tcPr>
+          <w:p>
+            <w:pPr>
+              <w:spacing w:after="0" w:before="0" w:line="278.00000000000006" w:lineRule="auto"/>
+              <w:ind w:left="0" w:right="314" w:firstLine="0"/>
+              <w:jc w:val="left"/>
+              <w:rPr>
+                <w:rFonts w:ascii="Open Sans" w:cs="Open Sans" w:eastAsia="Open Sans" w:hAnsi="Open Sans"/>
+                <w:b w:val="1"/>
+                <w:color w:val="000000"/>
+                <w:sz w:val="18"/>
+                <w:szCs w:val="18"/>
+                <w:shd w:fill="auto" w:val="clear"/>
+              </w:rPr>
+            </w:pPr>
+            <w:r>
+              <w:rPr>
+                <w:rFonts w:ascii="Open Sans" w:cs="Open Sans" w:eastAsia="Open Sans" w:hAnsi="Open Sans"/>
+                <w:b w:val="1"/>
+                <w:color w:val="000000"/>
+                <w:sz w:val="18"/>
+                <w:szCs w:val="18"/>
+                <w:shd w:fill="auto" w:val="clear"/>
+                <w:rtl w:val="0"/>
+              </w:rPr>
+              <w:t xml:space="preserve">Bestandkundenbonus:</w:t>
+            </w:r>
+          </w:p>
+          <w:p>
+            <w:pPr>
+              <w:spacing w:after="0" w:before="0" w:line="278.00000000000006" w:lineRule="auto"/>
+              <w:ind w:left="0" w:right="314" w:firstLine="0"/>
+              <w:jc w:val="left"/>
+              <w:rPr>
+                <w:color w:val="000000"/>
+                <w:sz w:val="18"/>
+                <w:szCs w:val="18"/>
+              </w:rPr>
+            </w:pPr>
+            <w:r>
+              <w:rPr>
+                <w:rFonts w:ascii="Open Sans" w:cs="Open Sans" w:eastAsia="Open Sans" w:hAnsi="Open Sans"/>
+                <w:color w:val="000000"/>
+                <w:sz w:val="18"/>
+                <w:szCs w:val="18"/>
+                <w:shd w:fill="auto" w:val="clear"/>
+                <w:rtl w:val="0"/>
+              </w:rPr>
+              <w:t xml:space="preserve">-- Rabatt von 300 € ab einem Gesamtwert von 3.000</w:t>
+            </w:r>
+            <w:r>
+              <w:rPr>
+                <w:rtl w:val="0"/>
+              </w:rPr>
+            </w:r>
+          </w:p>
+        </w:tc>
+        <w:tc>
+          <w:tcPr>
+            <w:tcBorders>
+              <w:top w:color="ffffff" w:space="0" w:sz="8" w:val="single"/>
+              <w:left w:color="ffffff" w:space="0" w:sz="8" w:val="single"/>
+              <w:bottom w:color="ffffff" w:space="0" w:sz="8" w:val="single"/>
+              <w:right w:color="ffffff" w:space="0" w:sz="8" w:val="single"/>
+            </w:tcBorders>
+            <w:shd w:fill="ffffff" w:val="clear"/>
+            <w:tcMar>
+              <w:left w:w="56.0" w:type="dxa"/>
+              <w:right w:w="56.0" w:type="dxa"/>
+            </w:tcMar>
+          </w:tcPr>
+          <w:p>
+            <w:pPr>
+              <w:spacing w:after="0" w:before="0" w:line="278.00000000000006" w:lineRule="auto"/>
+              <w:ind w:left="0" w:right="314" w:firstLine="0"/>
+              <w:jc w:val="left"/>
+              <w:rPr>
+                <w:color w:val="000000"/>
+              </w:rPr>
+            </w:pPr>
+            <w:r>
+              <w:rPr>
+                <w:rFonts w:ascii="Open Sans" w:cs="Open Sans" w:eastAsia="Open Sans" w:hAnsi="Open Sans"/>
+                <w:color w:val="000000"/>
+                <w:sz w:val="20"/>
+                <w:szCs w:val="20"/>
+                <w:shd w:fill="auto" w:val="clear"/>
+                <w:rtl w:val="0"/>
+              </w:rPr>
+              <w:t xml:space="preserve">-252,10 €</w:t>
+            </w:r>
+            <w:r>
+              <w:rPr>
+                <w:rtl w:val="0"/>
+              </w:rPr>
+            </w:r>
+          </w:p>
+        </w:tc>
+        <w:tc>
+          <w:tcPr>
+            <w:tcBorders>
+              <w:top w:color="ffffff" w:space="0" w:sz="8" w:val="single"/>
+              <w:left w:color="ffffff" w:space="0" w:sz="8" w:val="single"/>
+              <w:bottom w:color="ffffff" w:space="0" w:sz="8" w:val="single"/>
+              <w:right w:color="ffffff" w:space="0" w:sz="8" w:val="single"/>
+            </w:tcBorders>
+            <w:shd w:fill="ffffff" w:val="clear"/>
+            <w:tcMar>
+              <w:left w:w="56.0" w:type="dxa"/>
+              <w:right w:w="56.0" w:type="dxa"/>
+            </w:tcMar>
+          </w:tcPr>
+          <w:p>
+            <w:pPr>
+              <w:spacing w:after="0" w:before="0" w:line="278.00000000000006" w:lineRule="auto"/>
+              <w:ind w:left="0" w:right="314" w:firstLine="0"/>
+              <w:jc w:val="center"/>
+              <w:rPr>
+                <w:color w:val="000000"/>
+              </w:rPr>
+            </w:pPr>
+            <w:r>
+              <w:rPr>
+                <w:rFonts w:ascii="Open Sans" w:cs="Open Sans" w:eastAsia="Open Sans" w:hAnsi="Open Sans"/>
+                <w:color w:val="000000"/>
+                <w:sz w:val="20"/>
+                <w:szCs w:val="20"/>
+                <w:shd w:fill="auto" w:val="clear"/>
+                <w:rtl w:val="0"/>
+              </w:rPr>
+              <w:t xml:space="preserve">-252,10 €</w:t>
+            </w:r>
             <w:r>
               <w:rPr>
                 <w:rtl w:val="0"/>
@@ -2708,7 +3190,7 @@
                 <w:shd w:fill="auto" w:val="clear"/>
                 <w:rtl w:val="0"/>
               </w:rPr>
-              <w:t xml:space="preserve">5.511,06 €</w:t>
+              <w:t xml:space="preserve">5.194,19 €</w:t>
             </w:r>
             <w:r>
               <w:rPr>
@@ -2877,7 +3359,7 @@
                 <w:shd w:fill="auto" w:val="clear"/>
                 <w:rtl w:val="0"/>
               </w:rPr>
-              <w:t xml:space="preserve">1.047,10 €</w:t>
+              <w:t xml:space="preserve">986,90 €</w:t>
             </w:r>
             <w:r>
               <w:rPr>
@@ -3046,7 +3528,7 @@
                 <w:shd w:fill="auto" w:val="clear"/>
                 <w:rtl w:val="0"/>
               </w:rPr>
-              <w:t xml:space="preserve">6.558,16 €</w:t>
+              <w:t xml:space="preserve">6.181,09 €</w:t>
             </w:r>
             <w:r>
               <w:rPr>
@@ -3273,7 +3755,7 @@
           <w:shd w:fill="auto" w:val="clear"/>
           <w:rtl w:val="0"/>
         </w:rPr>
-        <w:t xml:space="preserve">2.528,16 €</w:t>
+        <w:t xml:space="preserve">2.151,09 €</w:t>
       </w:r>
       <w:r>
         <w:rPr>

</xml_diff>

<commit_message>
TRINNITY Bodenabdichtung für Fußboden fixed on load
</commit_message>
<xml_diff>
--- a/out-Angebot.docx
+++ b/out-Angebot.docx
@@ -129,7 +129,7 @@
                 <w:rFonts w:ascii="Open Sans" w:cs="Open Sans" w:eastAsia="Open Sans" w:hAnsi="Open Sans"/>
                 <w:rtl w:val="0"/>
               </w:rPr>
-              <w:t xml:space="preserve">Francis Saunders</w:t>
+              <w:t xml:space="preserve">Christian Chaney</w:t>
             </w:r>
             <w:r>
               <w:rPr>
@@ -151,7 +151,7 @@
                 <w:rFonts w:ascii="Open Sans" w:cs="Open Sans" w:eastAsia="Open Sans" w:hAnsi="Open Sans"/>
                 <w:rtl w:val="0"/>
               </w:rPr>
-              <w:t xml:space="preserve">Vero minim libero do,</w:t>
+              <w:t xml:space="preserve">Nesciunt pariatur ,</w:t>
             </w:r>
             <w:r>
               <w:rPr>
@@ -175,7 +175,7 @@
                 <w:rFonts w:ascii="Open Sans" w:cs="Open Sans" w:eastAsia="Open Sans" w:hAnsi="Open Sans"/>
                 <w:rtl w:val="0"/>
               </w:rPr>
-              <w:t xml:space="preserve">Aut sit consequuntur Ut aspernatur fugiat</w:t>
+              <w:t xml:space="preserve">Inventore nisi dolor Do quae quia id nihi</w:t>
             </w:r>
             <w:r>
               <w:rPr>
@@ -310,7 +310,7 @@
                 <w:rFonts w:ascii="Open Sans" w:cs="Open Sans" w:eastAsia="Open Sans" w:hAnsi="Open Sans"/>
                 <w:rtl w:val="0"/>
               </w:rPr>
-              <w:t xml:space="preserve">ANG2025-1014-144740</w:t>
+              <w:t xml:space="preserve">ANG2025-1014-160402</w:t>
             </w:r>
             <w:r>
               <w:rPr>
@@ -345,7 +345,7 @@
                 <w:rFonts w:ascii="Open Sans" w:cs="Open Sans" w:eastAsia="Open Sans" w:hAnsi="Open Sans"/>
                 <w:rtl w:val="0"/>
               </w:rPr>
-              <w:t xml:space="preserve">24.06.1976</w:t>
+              <w:t xml:space="preserve">29.04.1998</w:t>
             </w:r>
             <w:r>
               <w:rPr>
@@ -379,7 +379,7 @@
                 <w:rFonts w:ascii="Open Sans" w:cs="Open Sans" w:eastAsia="Open Sans" w:hAnsi="Open Sans"/>
                 <w:rtl w:val="0"/>
               </w:rPr>
-              <w:t xml:space="preserve">Nash Jackson</w:t>
+              <w:t xml:space="preserve">Paula Weaver</w:t>
             </w:r>
             <w:r>
               <w:rPr>
@@ -524,7 +524,7 @@
                 <w:rFonts w:ascii="Open Sans" w:cs="Open Sans" w:eastAsia="Open Sans" w:hAnsi="Open Sans"/>
                 <w:rtl w:val="0"/>
               </w:rPr>
-              <w:t xml:space="preserve">Vivien Fernandez</w:t>
+              <w:t xml:space="preserve">Buffy Livingston</w:t>
             </w:r>
             <w:r>
               <w:rPr>
@@ -578,7 +578,7 @@
           <w:shd w:fill="auto" w:val="clear"/>
           <w:rtl w:val="0"/>
         </w:rPr>
-        <w:t xml:space="preserve">  Ihr Angebot ANG2025-1014-144740</w:t>
+        <w:t xml:space="preserve">  Ihr Angebot ANG2025-1014-160402</w:t>
       </w:r>
     </w:p>
     <w:p>
@@ -603,7 +603,7 @@
           <w:shd w:fill="auto" w:val="clear"/>
           <w:rtl w:val="0"/>
         </w:rPr>
-        <w:t xml:space="preserve">  Sehr geehrte Frau Saunders,</w:t>
+        <w:t xml:space="preserve">  Sehr geehrte Frau Chaney,</w:t>
         <w:br w:type="textWrapping"/>
       </w:r>
     </w:p>
@@ -1075,7 +1075,7 @@
                 <w:shd w:fill="auto" w:val="clear"/>
                 <w:rtl w:val="0"/>
               </w:rPr>
-              <w:t xml:space="preserve">1.790,30 €</w:t>
+              <w:t xml:space="preserve">1.743,90 €</w:t>
             </w:r>
             <w:r>
               <w:rPr>
@@ -1116,7 +1116,7 @@
                 <w:shd w:fill="auto" w:val="clear"/>
                 <w:rtl w:val="0"/>
               </w:rPr>
-              <w:t xml:space="preserve">1.790,30 €</w:t>
+              <w:t xml:space="preserve">1.743,90 €</w:t>
             </w:r>
             <w:r>
               <w:rPr>
@@ -1248,7 +1248,7 @@
                 <w:shd w:fill="auto" w:val="clear"/>
                 <w:rtl w:val="0"/>
               </w:rPr>
-              <w:t xml:space="preserve">- Schließen der Fehlstellen</w:t>
+              <w:t xml:space="preserve">- Entfernen und Entsorgen der Badewanne inkl. Befliesung</w:t>
             </w:r>
             <w:r>
               <w:rPr>
@@ -1276,7 +1276,7 @@
                 <w:shd w:fill="auto" w:val="clear"/>
                 <w:rtl w:val="0"/>
               </w:rPr>
-              <w:t xml:space="preserve">- Anbringen zusätzlicher Stützklappgriffe</w:t>
+              <w:t xml:space="preserve">- Entfernen und Entsorgen der Duschabtrennung</w:t>
             </w:r>
             <w:r>
               <w:rPr>
@@ -1297,14 +1297,59 @@
             </w:pPr>
             <w:r>
               <w:rPr>
-                <w:rFonts w:ascii="Open Sans" w:cs="Open Sans" w:eastAsia="Open Sans" w:hAnsi="Open Sans"/>
+                <w:rtl w:val="0"/>
+              </w:rPr>
+            </w:r>
+          </w:p>
+          <w:p>
+            <w:pPr>
+              <w:spacing w:after="0" w:before="0" w:line="278.00000000000006" w:lineRule="auto"/>
+              <w:ind w:left="0" w:right="314" w:firstLine="0"/>
+              <w:jc w:val="left"/>
+              <w:rPr>
+                <w:color w:val="000000"/>
+                <w:sz w:val="20"/>
+                <w:szCs w:val="20"/>
+              </w:rPr>
+            </w:pPr>
+            <w:r>
+              <w:rPr>
+                <w:rFonts w:ascii="Open Sans" w:cs="Open Sans" w:eastAsia="Open Sans" w:hAnsi="Open Sans"/>
+                <w:color w:val="000000"/>
+                <w:sz w:val="20"/>
+                <w:szCs w:val="20"/>
+                <w:shd w:fill="auto" w:val="clear"/>
+                <w:rtl w:val="0"/>
+              </w:rPr>
+              <w:t xml:space="preserve">Enthält je Einheit</w:t>
+            </w:r>
+            <w:r>
+              <w:rPr>
+                <w:rtl w:val="0"/>
+              </w:rPr>
+            </w:r>
+          </w:p>
+          <w:p>
+            <w:pPr>
+              <w:spacing w:after="0" w:before="0" w:line="278.00000000000006" w:lineRule="auto"/>
+              <w:ind w:left="0" w:right="314" w:firstLine="0"/>
+              <w:jc w:val="left"/>
+              <w:rPr>
                 <w:color w:val="000000"/>
                 <w:sz w:val="18"/>
                 <w:szCs w:val="18"/>
-                <w:shd w:fill="auto" w:val="clear"/>
-                <w:rtl w:val="0"/>
-              </w:rPr>
-              <w:t xml:space="preserve">- Entfernen und Entsorgen der Duschabtrennung</w:t>
+              </w:rPr>
+            </w:pPr>
+            <w:r>
+              <w:rPr>
+                <w:rFonts w:ascii="Open Sans" w:cs="Open Sans" w:eastAsia="Open Sans" w:hAnsi="Open Sans"/>
+                <w:color w:val="000000"/>
+                <w:sz w:val="18"/>
+                <w:szCs w:val="18"/>
+                <w:shd w:fill="auto" w:val="clear"/>
+                <w:rtl w:val="0"/>
+              </w:rPr>
+              <w:t xml:space="preserve">- 1,00 Stk Fahrzeugbereitstellung</w:t>
             </w:r>
             <w:r>
               <w:rPr>
@@ -1332,7 +1377,7 @@
                 <w:shd w:fill="auto" w:val="clear"/>
                 <w:rtl w:val="0"/>
               </w:rPr>
-              <w:t xml:space="preserve">- Einbau der Duschwanne</w:t>
+              <w:t xml:space="preserve">- 1,00 Stk Bereitstellung und Vorhaltung von Maschinen &amp; Werkzeugen</w:t>
             </w:r>
             <w:r>
               <w:rPr>
@@ -1353,6 +1398,17 @@
             </w:pPr>
             <w:r>
               <w:rPr>
+                <w:rFonts w:ascii="Open Sans" w:cs="Open Sans" w:eastAsia="Open Sans" w:hAnsi="Open Sans"/>
+                <w:color w:val="000000"/>
+                <w:sz w:val="18"/>
+                <w:szCs w:val="18"/>
+                <w:shd w:fill="auto" w:val="clear"/>
+                <w:rtl w:val="0"/>
+              </w:rPr>
+              <w:t xml:space="preserve">- 1,00 Stk Beräumung der Baustelle</w:t>
+            </w:r>
+            <w:r>
+              <w:rPr>
                 <w:rtl w:val="0"/>
               </w:rPr>
             </w:r>
@@ -1364,34 +1420,6 @@
               <w:jc w:val="left"/>
               <w:rPr>
                 <w:color w:val="000000"/>
-                <w:sz w:val="20"/>
-                <w:szCs w:val="20"/>
-              </w:rPr>
-            </w:pPr>
-            <w:r>
-              <w:rPr>
-                <w:rFonts w:ascii="Open Sans" w:cs="Open Sans" w:eastAsia="Open Sans" w:hAnsi="Open Sans"/>
-                <w:color w:val="000000"/>
-                <w:sz w:val="20"/>
-                <w:szCs w:val="20"/>
-                <w:shd w:fill="auto" w:val="clear"/>
-                <w:rtl w:val="0"/>
-              </w:rPr>
-              <w:t xml:space="preserve">Enthält je Einheit</w:t>
-            </w:r>
-            <w:r>
-              <w:rPr>
-                <w:rtl w:val="0"/>
-              </w:rPr>
-            </w:r>
-          </w:p>
-          <w:p>
-            <w:pPr>
-              <w:spacing w:after="0" w:before="0" w:line="278.00000000000006" w:lineRule="auto"/>
-              <w:ind w:left="0" w:right="314" w:firstLine="0"/>
-              <w:jc w:val="left"/>
-              <w:rPr>
-                <w:color w:val="000000"/>
                 <w:sz w:val="18"/>
                 <w:szCs w:val="18"/>
               </w:rPr>
@@ -1405,91 +1433,7 @@
                 <w:shd w:fill="auto" w:val="clear"/>
                 <w:rtl w:val="0"/>
               </w:rPr>
-              <w:t xml:space="preserve">- 1,00 Stk Fahrzeugbereitstellung</w:t>
-            </w:r>
-            <w:r>
-              <w:rPr>
-                <w:rtl w:val="0"/>
-              </w:rPr>
-            </w:r>
-          </w:p>
-          <w:p>
-            <w:pPr>
-              <w:spacing w:after="0" w:before="0" w:line="278.00000000000006" w:lineRule="auto"/>
-              <w:ind w:left="0" w:right="314" w:firstLine="0"/>
-              <w:jc w:val="left"/>
-              <w:rPr>
-                <w:color w:val="000000"/>
-                <w:sz w:val="18"/>
-                <w:szCs w:val="18"/>
-              </w:rPr>
-            </w:pPr>
-            <w:r>
-              <w:rPr>
-                <w:rFonts w:ascii="Open Sans" w:cs="Open Sans" w:eastAsia="Open Sans" w:hAnsi="Open Sans"/>
-                <w:color w:val="000000"/>
-                <w:sz w:val="18"/>
-                <w:szCs w:val="18"/>
-                <w:shd w:fill="auto" w:val="clear"/>
-                <w:rtl w:val="0"/>
-              </w:rPr>
-              <w:t xml:space="preserve">- 1,00 Stk Bereitstellung und Vorhaltung von Maschinen &amp; Werkzeugen</w:t>
-            </w:r>
-            <w:r>
-              <w:rPr>
-                <w:rtl w:val="0"/>
-              </w:rPr>
-            </w:r>
-          </w:p>
-          <w:p>
-            <w:pPr>
-              <w:spacing w:after="0" w:before="0" w:line="278.00000000000006" w:lineRule="auto"/>
-              <w:ind w:left="0" w:right="314" w:firstLine="0"/>
-              <w:jc w:val="left"/>
-              <w:rPr>
-                <w:color w:val="000000"/>
-                <w:sz w:val="18"/>
-                <w:szCs w:val="18"/>
-              </w:rPr>
-            </w:pPr>
-            <w:r>
-              <w:rPr>
-                <w:rFonts w:ascii="Open Sans" w:cs="Open Sans" w:eastAsia="Open Sans" w:hAnsi="Open Sans"/>
-                <w:color w:val="000000"/>
-                <w:sz w:val="18"/>
-                <w:szCs w:val="18"/>
-                <w:shd w:fill="auto" w:val="clear"/>
-                <w:rtl w:val="0"/>
-              </w:rPr>
-              <w:t xml:space="preserve">- 1,00 Stk Beräumung der Baustelle</w:t>
-            </w:r>
-            <w:r>
-              <w:rPr>
-                <w:rtl w:val="0"/>
-              </w:rPr>
-            </w:r>
-          </w:p>
-          <w:p>
-            <w:pPr>
-              <w:spacing w:after="0" w:before="0" w:line="278.00000000000006" w:lineRule="auto"/>
-              <w:ind w:left="0" w:right="314" w:firstLine="0"/>
-              <w:jc w:val="left"/>
-              <w:rPr>
-                <w:color w:val="000000"/>
-                <w:sz w:val="18"/>
-                <w:szCs w:val="18"/>
-              </w:rPr>
-            </w:pPr>
-            <w:r>
-              <w:rPr>
-                <w:rFonts w:ascii="Open Sans" w:cs="Open Sans" w:eastAsia="Open Sans" w:hAnsi="Open Sans"/>
-                <w:color w:val="000000"/>
-                <w:sz w:val="18"/>
-                <w:szCs w:val="18"/>
-                <w:shd w:fill="auto" w:val="clear"/>
-                <w:rtl w:val="0"/>
-              </w:rPr>
-              <w:t xml:space="preserve">- 58 km Kilometerpauschale</w:t>
+              <w:t xml:space="preserve">- 34 km Kilometerpauschale</w:t>
             </w:r>
             <w:r>
               <w:rPr>
@@ -1775,7 +1719,7 @@
                 <w:shd w:fill="auto" w:val="clear"/>
                 <w:rtl w:val="0"/>
               </w:rPr>
-              <w:t xml:space="preserve">5.373,90 €</w:t>
+              <w:t xml:space="preserve">2.486,31 €</w:t>
             </w:r>
             <w:r>
               <w:rPr>
@@ -1807,7 +1751,7 @@
               <w:rPr>
                 <w:rtl w:val="0"/>
               </w:rPr>
-              <w:t xml:space="preserve">5.373,90 €</w:t>
+              <w:t xml:space="preserve">2.486,31 €</w:t>
             </w:r>
             <w:r>
               <w:rPr>
@@ -1952,7 +1896,7 @@
                 <w:shd w:fill="auto" w:val="clear"/>
                 <w:rtl w:val="0"/>
               </w:rPr>
-              <w:t xml:space="preserve">- 1 Stk Kleinmaterial groß</w:t>
+              <w:t xml:space="preserve">- 1 Stk Stelzlager höhenverstellar Set</w:t>
             </w:r>
           </w:p>
           <w:p>
@@ -1977,7 +1921,7 @@
                 <w:shd w:fill="auto" w:val="clear"/>
                 <w:rtl w:val="0"/>
               </w:rPr>
-              <w:t xml:space="preserve">- 89 Stk Fußboden-Paneele (1 Paneele = 0.3 m² )</w:t>
+              <w:t xml:space="preserve">- 46 Stk Fußboden-Paneele (1 Paneele = 0.3 m² )</w:t>
             </w:r>
           </w:p>
           <w:p>
@@ -2002,7 +1946,7 @@
                 <w:shd w:fill="auto" w:val="clear"/>
                 <w:rtl w:val="0"/>
               </w:rPr>
-              <w:t xml:space="preserve">- 39 Pkg Flächenkleber (1 Pkg je 0,60 m²)</w:t>
+              <w:t xml:space="preserve">- 20 Pkg Flächenkleber (1 Pkg je 0,60 m²)</w:t>
             </w:r>
           </w:p>
           <w:p>
@@ -2027,7 +1971,7 @@
                 <w:shd w:fill="auto" w:val="clear"/>
                 <w:rtl w:val="0"/>
               </w:rPr>
-              <w:t xml:space="preserve">- 26.45 m² Trinnity Bodenabdichtung (inkl. 15% Verschnitt)</w:t>
+              <w:t xml:space="preserve">- 13.8 m² Trinnity Bodenabdichtung (inkl. 15% Verschnitt)</w:t>
             </w:r>
           </w:p>
           <w:p>
@@ -2052,7 +1996,7 @@
                 <w:shd w:fill="auto" w:val="clear"/>
                 <w:rtl w:val="0"/>
               </w:rPr>
-              <w:t xml:space="preserve">- 1 Stk Wandverkleidung 3.0 Alu 997×2550 mm — Farbe: Marmor weiß</w:t>
+              <w:t xml:space="preserve">- 1 Stk TRINNITY Wandabdichtung BASIS-Set 5 qm DW bis 100 x 100 / BW bis 180 x 80 cm</w:t>
             </w:r>
           </w:p>
           <w:p>
@@ -2077,7 +2021,7 @@
                 <w:shd w:fill="auto" w:val="clear"/>
                 <w:rtl w:val="0"/>
               </w:rPr>
-              <w:t xml:space="preserve">- 1 Stk Wandverkleidung 3.0 Alu 1497×2550 mm — Farbe: Marmor weiß</w:t>
+              <w:t xml:space="preserve">- 2 Stk Gleittür Hassmann</w:t>
             </w:r>
           </w:p>
           <w:p>
@@ -2102,7 +2046,7 @@
                 <w:shd w:fill="auto" w:val="clear"/>
                 <w:rtl w:val="0"/>
               </w:rPr>
-              <w:t xml:space="preserve">- 1 Stk TRINNITY Wandabdichtung BASIS-Set 5 qm DW bis 100 x 100 / BW bis 180 x 80 cm</w:t>
+              <w:t xml:space="preserve">- 1 Stk Falt-Pendeltür Hassmann</w:t>
             </w:r>
           </w:p>
           <w:p>
@@ -2127,107 +2071,7 @@
                 <w:shd w:fill="auto" w:val="clear"/>
                 <w:rtl w:val="0"/>
               </w:rPr>
-              <w:t xml:space="preserve">- 7 Stk Wandverkleidungsklebstoff 3.0/4.0</w:t>
-            </w:r>
-          </w:p>
-          <w:p>
-            <w:pPr>
-              <w:spacing w:after="0" w:before="0" w:line="278.00000000000006" w:lineRule="auto"/>
-              <w:ind w:left="0" w:right="314" w:firstLine="0"/>
-              <w:jc w:val="left"/>
-              <w:rPr>
-                <w:rFonts w:ascii="Open Sans" w:cs="Open Sans" w:eastAsia="Open Sans" w:hAnsi="Open Sans"/>
-                <w:color w:val="000000"/>
-                <w:sz w:val="18"/>
-                <w:szCs w:val="18"/>
-                <w:shd w:fill="auto" w:val="clear"/>
-              </w:rPr>
-            </w:pPr>
-            <w:r>
-              <w:rPr>
-                <w:rFonts w:ascii="Open Sans" w:cs="Open Sans" w:eastAsia="Open Sans" w:hAnsi="Open Sans"/>
-                <w:color w:val="000000"/>
-                <w:sz w:val="18"/>
-                <w:szCs w:val="18"/>
-                <w:shd w:fill="auto" w:val="clear"/>
-                <w:rtl w:val="0"/>
-              </w:rPr>
-              <w:t xml:space="preserve">- 1 Stk Stützklappgriff derby plus 600mm verchromt m. ABS-Ummantelung VIGOUR</w:t>
-            </w:r>
-          </w:p>
-          <w:p>
-            <w:pPr>
-              <w:spacing w:after="0" w:before="0" w:line="278.00000000000006" w:lineRule="auto"/>
-              <w:ind w:left="0" w:right="314" w:firstLine="0"/>
-              <w:jc w:val="left"/>
-              <w:rPr>
-                <w:rFonts w:ascii="Open Sans" w:cs="Open Sans" w:eastAsia="Open Sans" w:hAnsi="Open Sans"/>
-                <w:color w:val="000000"/>
-                <w:sz w:val="18"/>
-                <w:szCs w:val="18"/>
-                <w:shd w:fill="auto" w:val="clear"/>
-              </w:rPr>
-            </w:pPr>
-            <w:r>
-              <w:rPr>
-                <w:rFonts w:ascii="Open Sans" w:cs="Open Sans" w:eastAsia="Open Sans" w:hAnsi="Open Sans"/>
-                <w:color w:val="000000"/>
-                <w:sz w:val="18"/>
-                <w:szCs w:val="18"/>
-                <w:shd w:fill="auto" w:val="clear"/>
-                <w:rtl w:val="0"/>
-              </w:rPr>
-              <w:t xml:space="preserve">- 2 Stk Gleittür Hassmann</w:t>
-            </w:r>
-          </w:p>
-          <w:p>
-            <w:pPr>
-              <w:spacing w:after="0" w:before="0" w:line="278.00000000000006" w:lineRule="auto"/>
-              <w:ind w:left="0" w:right="314" w:firstLine="0"/>
-              <w:jc w:val="left"/>
-              <w:rPr>
-                <w:rFonts w:ascii="Open Sans" w:cs="Open Sans" w:eastAsia="Open Sans" w:hAnsi="Open Sans"/>
-                <w:color w:val="000000"/>
-                <w:sz w:val="18"/>
-                <w:szCs w:val="18"/>
-                <w:shd w:fill="auto" w:val="clear"/>
-              </w:rPr>
-            </w:pPr>
-            <w:r>
-              <w:rPr>
-                <w:rFonts w:ascii="Open Sans" w:cs="Open Sans" w:eastAsia="Open Sans" w:hAnsi="Open Sans"/>
-                <w:color w:val="000000"/>
-                <w:sz w:val="18"/>
-                <w:szCs w:val="18"/>
-                <w:shd w:fill="auto" w:val="clear"/>
-                <w:rtl w:val="0"/>
-              </w:rPr>
-              <w:t xml:space="preserve">- 1 Stk Falt-Pendeltür Hassmann</w:t>
-            </w:r>
-          </w:p>
-          <w:p>
-            <w:pPr>
-              <w:spacing w:after="0" w:before="0" w:line="278.00000000000006" w:lineRule="auto"/>
-              <w:ind w:left="0" w:right="314" w:firstLine="0"/>
-              <w:jc w:val="left"/>
-              <w:rPr>
-                <w:rFonts w:ascii="Open Sans" w:cs="Open Sans" w:eastAsia="Open Sans" w:hAnsi="Open Sans"/>
-                <w:color w:val="000000"/>
-                <w:sz w:val="18"/>
-                <w:szCs w:val="18"/>
-                <w:shd w:fill="auto" w:val="clear"/>
-              </w:rPr>
-            </w:pPr>
-            <w:r>
-              <w:rPr>
-                <w:rFonts w:ascii="Open Sans" w:cs="Open Sans" w:eastAsia="Open Sans" w:hAnsi="Open Sans"/>
-                <w:color w:val="000000"/>
-                <w:sz w:val="18"/>
-                <w:szCs w:val="18"/>
-                <w:shd w:fill="auto" w:val="clear"/>
-                <w:rtl w:val="0"/>
-              </w:rPr>
-              <w:t xml:space="preserve">- 1 Stk Duschwanne 100 x 80 x 3 cm</w:t>
+              <w:t xml:space="preserve">- 1 Stk Duschwanne 100 x 70 x 3 cm</w:t>
             </w:r>
           </w:p>
         </w:tc>
@@ -2340,247 +2184,6 @@
                 <w:rtl w:val="0"/>
               </w:rPr>
               <w:t xml:space="preserve">003</w:t>
-            </w:r>
-            <w:r>
-              <w:rPr>
-                <w:rtl w:val="0"/>
-              </w:rPr>
-            </w:r>
-          </w:p>
-        </w:tc>
-        <w:tc>
-          <w:tcPr>
-            <w:tcBorders>
-              <w:top w:color="ffffff" w:space="0" w:sz="8" w:val="single"/>
-              <w:left w:color="ffffff" w:space="0" w:sz="8" w:val="single"/>
-              <w:bottom w:color="ffffff" w:space="0" w:sz="8" w:val="single"/>
-              <w:right w:color="ffffff" w:space="0" w:sz="8" w:val="single"/>
-            </w:tcBorders>
-            <w:shd w:fill="ffffff" w:val="clear"/>
-            <w:tcMar>
-              <w:left w:w="56.0" w:type="dxa"/>
-              <w:right w:w="56.0" w:type="dxa"/>
-            </w:tcMar>
-          </w:tcPr>
-          <w:p>
-            <w:pPr>
-              <w:spacing w:after="0" w:before="0" w:line="278.00000000000006" w:lineRule="auto"/>
-              <w:ind w:left="0" w:right="314" w:firstLine="0"/>
-              <w:jc w:val="left"/>
-              <w:rPr>
-                <w:color w:val="000000"/>
-              </w:rPr>
-            </w:pPr>
-            <w:r>
-              <w:rPr>
-                <w:rFonts w:ascii="Open Sans" w:cs="Open Sans" w:eastAsia="Open Sans" w:hAnsi="Open Sans"/>
-                <w:color w:val="000000"/>
-                <w:sz w:val="20"/>
-                <w:szCs w:val="20"/>
-                <w:shd w:fill="auto" w:val="clear"/>
-                <w:rtl w:val="0"/>
-              </w:rPr>
-              <w:t xml:space="preserve">1 Stk</w:t>
-            </w:r>
-            <w:r>
-              <w:rPr>
-                <w:rtl w:val="0"/>
-              </w:rPr>
-            </w:r>
-          </w:p>
-        </w:tc>
-        <w:tc>
-          <w:tcPr>
-            <w:tcBorders>
-              <w:top w:color="ffffff" w:space="0" w:sz="8" w:val="single"/>
-              <w:left w:color="ffffff" w:space="0" w:sz="8" w:val="single"/>
-              <w:bottom w:color="ffffff" w:space="0" w:sz="8" w:val="single"/>
-              <w:right w:color="ffffff" w:space="0" w:sz="8" w:val="single"/>
-            </w:tcBorders>
-            <w:shd w:fill="ffffff" w:val="clear"/>
-            <w:tcMar>
-              <w:left w:w="56.0" w:type="dxa"/>
-              <w:right w:w="56.0" w:type="dxa"/>
-            </w:tcMar>
-          </w:tcPr>
-          <w:p>
-            <w:pPr>
-              <w:spacing w:after="0" w:before="0" w:line="278.00000000000006" w:lineRule="auto"/>
-              <w:ind w:left="0" w:right="314" w:firstLine="0"/>
-              <w:jc w:val="left"/>
-              <w:rPr>
-                <w:rFonts w:ascii="Open Sans" w:cs="Open Sans" w:eastAsia="Open Sans" w:hAnsi="Open Sans"/>
-                <w:b w:val="1"/>
-                <w:color w:val="000000"/>
-                <w:sz w:val="18"/>
-                <w:szCs w:val="18"/>
-                <w:shd w:fill="auto" w:val="clear"/>
-              </w:rPr>
-            </w:pPr>
-            <w:r>
-              <w:rPr>
-                <w:rFonts w:ascii="Open Sans" w:cs="Open Sans" w:eastAsia="Open Sans" w:hAnsi="Open Sans"/>
-                <w:b w:val="1"/>
-                <w:color w:val="000000"/>
-                <w:sz w:val="18"/>
-                <w:szCs w:val="18"/>
-                <w:shd w:fill="auto" w:val="clear"/>
-                <w:rtl w:val="0"/>
-              </w:rPr>
-              <w:t xml:space="preserve">Aktion: Haltegriff</w:t>
-            </w:r>
-          </w:p>
-          <w:p>
-            <w:pPr>
-              <w:spacing w:after="0" w:before="0" w:line="278.00000000000006" w:lineRule="auto"/>
-              <w:ind w:left="0" w:right="314" w:firstLine="0"/>
-              <w:jc w:val="left"/>
-              <w:rPr>
-                <w:color w:val="000000"/>
-                <w:sz w:val="18"/>
-                <w:szCs w:val="18"/>
-              </w:rPr>
-            </w:pPr>
-            <w:r>
-              <w:rPr>
-                <w:rFonts w:ascii="Open Sans" w:cs="Open Sans" w:eastAsia="Open Sans" w:hAnsi="Open Sans"/>
-                <w:color w:val="000000"/>
-                <w:sz w:val="18"/>
-                <w:szCs w:val="18"/>
-                <w:shd w:fill="auto" w:val="clear"/>
-                <w:rtl w:val="0"/>
-              </w:rPr>
-              <w:t xml:space="preserve">1 Haltegriff gratis im Wert von 175 € inkl. Lieferung und Montage</w:t>
-            </w:r>
-            <w:r>
-              <w:rPr>
-                <w:rtl w:val="0"/>
-              </w:rPr>
-            </w:r>
-          </w:p>
-        </w:tc>
-        <w:tc>
-          <w:tcPr>
-            <w:tcBorders>
-              <w:top w:color="ffffff" w:space="0" w:sz="8" w:val="single"/>
-              <w:left w:color="ffffff" w:space="0" w:sz="8" w:val="single"/>
-              <w:bottom w:color="ffffff" w:space="0" w:sz="8" w:val="single"/>
-              <w:right w:color="ffffff" w:space="0" w:sz="8" w:val="single"/>
-            </w:tcBorders>
-            <w:shd w:fill="ffffff" w:val="clear"/>
-            <w:tcMar>
-              <w:left w:w="56.0" w:type="dxa"/>
-              <w:right w:w="56.0" w:type="dxa"/>
-            </w:tcMar>
-          </w:tcPr>
-          <w:p>
-            <w:pPr>
-              <w:spacing w:after="0" w:before="0" w:line="278.00000000000006" w:lineRule="auto"/>
-              <w:ind w:left="0" w:right="314" w:firstLine="0"/>
-              <w:jc w:val="left"/>
-              <w:rPr>
-                <w:color w:val="000000"/>
-              </w:rPr>
-            </w:pPr>
-            <w:r>
-              <w:rPr>
-                <w:rFonts w:ascii="Open Sans" w:cs="Open Sans" w:eastAsia="Open Sans" w:hAnsi="Open Sans"/>
-                <w:color w:val="000000"/>
-                <w:sz w:val="20"/>
-                <w:szCs w:val="20"/>
-                <w:shd w:fill="auto" w:val="clear"/>
-                <w:rtl w:val="0"/>
-              </w:rPr>
-              <w:t xml:space="preserve">0,00 €</w:t>
-            </w:r>
-            <w:r>
-              <w:rPr>
-                <w:rtl w:val="0"/>
-              </w:rPr>
-            </w:r>
-          </w:p>
-        </w:tc>
-        <w:tc>
-          <w:tcPr>
-            <w:tcBorders>
-              <w:top w:color="ffffff" w:space="0" w:sz="8" w:val="single"/>
-              <w:left w:color="ffffff" w:space="0" w:sz="8" w:val="single"/>
-              <w:bottom w:color="ffffff" w:space="0" w:sz="8" w:val="single"/>
-              <w:right w:color="ffffff" w:space="0" w:sz="8" w:val="single"/>
-            </w:tcBorders>
-            <w:shd w:fill="ffffff" w:val="clear"/>
-            <w:tcMar>
-              <w:left w:w="56.0" w:type="dxa"/>
-              <w:right w:w="56.0" w:type="dxa"/>
-            </w:tcMar>
-          </w:tcPr>
-          <w:p>
-            <w:pPr>
-              <w:spacing w:after="0" w:before="0" w:line="278.00000000000006" w:lineRule="auto"/>
-              <w:ind w:left="0" w:right="314" w:firstLine="0"/>
-              <w:jc w:val="center"/>
-              <w:rPr>
-                <w:color w:val="000000"/>
-              </w:rPr>
-            </w:pPr>
-            <w:r>
-              <w:rPr>
-                <w:rFonts w:ascii="Open Sans" w:cs="Open Sans" w:eastAsia="Open Sans" w:hAnsi="Open Sans"/>
-                <w:color w:val="000000"/>
-                <w:sz w:val="20"/>
-                <w:szCs w:val="20"/>
-                <w:shd w:fill="auto" w:val="clear"/>
-                <w:rtl w:val="0"/>
-              </w:rPr>
-              <w:t xml:space="preserve">0,00 €</w:t>
-            </w:r>
-            <w:r>
-              <w:rPr>
-                <w:rtl w:val="0"/>
-              </w:rPr>
-            </w:r>
-          </w:p>
-        </w:tc>
-      </w:tr>
-      <w:tr>
-        <w:trPr>
-          <w:cantSplit w:val="0"/>
-          <w:trHeight w:val="1" w:hRule="atLeast"/>
-          <w:tblHeader w:val="0"/>
-        </w:trPr>
-        <w:tc>
-          <w:tcPr>
-            <w:tcBorders>
-              <w:top w:color="ffffff" w:space="0" w:sz="8" w:val="single"/>
-              <w:left w:color="ffffff" w:space="0" w:sz="8" w:val="single"/>
-              <w:bottom w:color="ffffff" w:space="0" w:sz="8" w:val="single"/>
-              <w:right w:color="ffffff" w:space="0" w:sz="8" w:val="single"/>
-            </w:tcBorders>
-            <w:shd w:fill="ffffff" w:val="clear"/>
-            <w:tcMar>
-              <w:left w:w="56.0" w:type="dxa"/>
-              <w:right w:w="56.0" w:type="dxa"/>
-            </w:tcMar>
-          </w:tcPr>
-          <w:p>
-            <w:pPr>
-              <w:spacing w:after="0" w:before="0" w:line="278.00000000000006" w:lineRule="auto"/>
-              <w:ind w:left="0" w:right="-26" w:firstLine="0"/>
-              <w:jc w:val="left"/>
-              <w:rPr>
-                <w:color w:val="000000"/>
-              </w:rPr>
-            </w:pPr>
-            <w:r>
-              <w:rPr>
-                <w:rFonts w:ascii="Open Sans" w:cs="Open Sans" w:eastAsia="Open Sans" w:hAnsi="Open Sans"/>
-                <w:color w:val="000000"/>
-                <w:sz w:val="20"/>
-                <w:szCs w:val="20"/>
-                <w:shd w:fill="auto" w:val="clear"/>
-                <w:rtl w:val="0"/>
-              </w:rPr>
-              <w:t xml:space="preserve">004</w:t>
             </w:r>
             <w:r>
               <w:rPr>
@@ -2978,7 +2581,7 @@
                 <w:shd w:fill="auto" w:val="clear"/>
                 <w:rtl w:val="0"/>
               </w:rPr>
-              <w:t xml:space="preserve">8.682,17 €</w:t>
+              <w:t xml:space="preserve">5.096,95 €</w:t>
             </w:r>
             <w:r>
               <w:rPr>
@@ -3147,7 +2750,7 @@
                 <w:shd w:fill="auto" w:val="clear"/>
                 <w:rtl w:val="0"/>
               </w:rPr>
-              <w:t xml:space="preserve">1.649,61 €</w:t>
+              <w:t xml:space="preserve">968,42 €</w:t>
             </w:r>
             <w:r>
               <w:rPr>
@@ -3316,7 +2919,7 @@
                 <w:shd w:fill="auto" w:val="clear"/>
                 <w:rtl w:val="0"/>
               </w:rPr>
-              <w:t xml:space="preserve">10.331,78 €</w:t>
+              <w:t xml:space="preserve">6.065,37 €</w:t>
             </w:r>
             <w:r>
               <w:rPr>
@@ -3449,7 +3052,7 @@
           <w:shd w:fill="auto" w:val="clear"/>
           <w:rtl w:val="0"/>
         </w:rPr>
-        <w:t xml:space="preserve">abgerechnet. (Stundensatz-Facharbeiter: 59,50€ netto)</w:t>
+        <w:t xml:space="preserve">abgerechnet. (Stundensatz-Facharbeiter: 69,50€ netto)</w:t>
       </w:r>
       <w:r>
         <w:rPr>

</xml_diff>

<commit_message>
vw modif pn load
</commit_message>
<xml_diff>
--- a/out-Angebot.docx
+++ b/out-Angebot.docx
@@ -310,7 +310,7 @@
                 <w:rFonts w:ascii="Open Sans" w:cs="Open Sans" w:eastAsia="Open Sans" w:hAnsi="Open Sans"/>
                 <w:rtl w:val="0"/>
               </w:rPr>
-              <w:t xml:space="preserve">ANG2025-1014-160402</w:t>
+              <w:t xml:space="preserve">ANG2025-1014-165317</w:t>
             </w:r>
             <w:r>
               <w:rPr>
@@ -578,7 +578,7 @@
           <w:shd w:fill="auto" w:val="clear"/>
           <w:rtl w:val="0"/>
         </w:rPr>
-        <w:t xml:space="preserve">  Ihr Angebot ANG2025-1014-160402</w:t>
+        <w:t xml:space="preserve">  Ihr Angebot ANG2025-1014-165317</w:t>
       </w:r>
     </w:p>
     <w:p>
@@ -1075,7 +1075,7 @@
                 <w:shd w:fill="auto" w:val="clear"/>
                 <w:rtl w:val="0"/>
               </w:rPr>
-              <w:t xml:space="preserve">1.743,90 €</w:t>
+              <w:t xml:space="preserve">2.021,90 €</w:t>
             </w:r>
             <w:r>
               <w:rPr>
@@ -1116,7 +1116,7 @@
                 <w:shd w:fill="auto" w:val="clear"/>
                 <w:rtl w:val="0"/>
               </w:rPr>
-              <w:t xml:space="preserve">1.743,90 €</w:t>
+              <w:t xml:space="preserve">2.021,90 €</w:t>
             </w:r>
             <w:r>
               <w:rPr>
@@ -1228,6 +1228,62 @@
               <w:right w:w="56.0" w:type="dxa"/>
             </w:tcMar>
           </w:tcPr>
+          <w:p>
+            <w:pPr>
+              <w:spacing w:after="0" w:before="0" w:line="278.00000000000006" w:lineRule="auto"/>
+              <w:ind w:left="0" w:right="314" w:firstLine="0"/>
+              <w:jc w:val="left"/>
+              <w:rPr>
+                <w:color w:val="000000"/>
+                <w:sz w:val="18"/>
+                <w:szCs w:val="18"/>
+              </w:rPr>
+            </w:pPr>
+            <w:r>
+              <w:rPr>
+                <w:rFonts w:ascii="Open Sans" w:cs="Open Sans" w:eastAsia="Open Sans" w:hAnsi="Open Sans"/>
+                <w:color w:val="000000"/>
+                <w:sz w:val="18"/>
+                <w:szCs w:val="18"/>
+                <w:shd w:fill="auto" w:val="clear"/>
+                <w:rtl w:val="0"/>
+              </w:rPr>
+              <w:t xml:space="preserve">- Schließen der Fehlstellen</w:t>
+            </w:r>
+            <w:r>
+              <w:rPr>
+                <w:rtl w:val="0"/>
+              </w:rPr>
+            </w:r>
+          </w:p>
+          <w:p>
+            <w:pPr>
+              <w:spacing w:after="0" w:before="0" w:line="278.00000000000006" w:lineRule="auto"/>
+              <w:ind w:left="0" w:right="314" w:firstLine="0"/>
+              <w:jc w:val="left"/>
+              <w:rPr>
+                <w:color w:val="000000"/>
+                <w:sz w:val="18"/>
+                <w:szCs w:val="18"/>
+              </w:rPr>
+            </w:pPr>
+            <w:r>
+              <w:rPr>
+                <w:rFonts w:ascii="Open Sans" w:cs="Open Sans" w:eastAsia="Open Sans" w:hAnsi="Open Sans"/>
+                <w:color w:val="000000"/>
+                <w:sz w:val="18"/>
+                <w:szCs w:val="18"/>
+                <w:shd w:fill="auto" w:val="clear"/>
+                <w:rtl w:val="0"/>
+              </w:rPr>
+              <w:t xml:space="preserve">- Auswechseln des Duschsystems</w:t>
+            </w:r>
+            <w:r>
+              <w:rPr>
+                <w:rtl w:val="0"/>
+              </w:rPr>
+            </w:r>
+          </w:p>
           <w:p>
             <w:pPr>
               <w:spacing w:after="0" w:before="0" w:line="278.00000000000006" w:lineRule="auto"/>
@@ -1719,7 +1775,7 @@
                 <w:shd w:fill="auto" w:val="clear"/>
                 <w:rtl w:val="0"/>
               </w:rPr>
-              <w:t xml:space="preserve">2.486,31 €</w:t>
+              <w:t xml:space="preserve">3.338,89 €</w:t>
             </w:r>
             <w:r>
               <w:rPr>
@@ -1751,7 +1807,7 @@
               <w:rPr>
                 <w:rtl w:val="0"/>
               </w:rPr>
-              <w:t xml:space="preserve">2.486,31 €</w:t>
+              <w:t xml:space="preserve">3.338,89 €</w:t>
             </w:r>
             <w:r>
               <w:rPr>
@@ -1996,7 +2052,82 @@
                 <w:shd w:fill="auto" w:val="clear"/>
                 <w:rtl w:val="0"/>
               </w:rPr>
-              <w:t xml:space="preserve">- 1 Stk TRINNITY Wandabdichtung BASIS-Set 5 qm DW bis 100 x 100 / BW bis 180 x 80 cm</w:t>
+              <w:t xml:space="preserve">- 2 Stk Wandverkleidung 3.0 Alu 997×2550 mm — Farbe: Schiefer grau</w:t>
+            </w:r>
+          </w:p>
+          <w:p>
+            <w:pPr>
+              <w:spacing w:after="0" w:before="0" w:line="278.00000000000006" w:lineRule="auto"/>
+              <w:ind w:left="0" w:right="314" w:firstLine="0"/>
+              <w:jc w:val="left"/>
+              <w:rPr>
+                <w:rFonts w:ascii="Open Sans" w:cs="Open Sans" w:eastAsia="Open Sans" w:hAnsi="Open Sans"/>
+                <w:color w:val="000000"/>
+                <w:sz w:val="18"/>
+                <w:szCs w:val="18"/>
+                <w:shd w:fill="auto" w:val="clear"/>
+              </w:rPr>
+            </w:pPr>
+            <w:r>
+              <w:rPr>
+                <w:rFonts w:ascii="Open Sans" w:cs="Open Sans" w:eastAsia="Open Sans" w:hAnsi="Open Sans"/>
+                <w:color w:val="000000"/>
+                <w:sz w:val="18"/>
+                <w:szCs w:val="18"/>
+                <w:shd w:fill="auto" w:val="clear"/>
+                <w:rtl w:val="0"/>
+              </w:rPr>
+              <w:t xml:space="preserve">- 2 Stk Wandverkleidung 3.0 Alu 1497×2550 mm — Farbe: Schiefer grau</w:t>
+            </w:r>
+          </w:p>
+          <w:p>
+            <w:pPr>
+              <w:spacing w:after="0" w:before="0" w:line="278.00000000000006" w:lineRule="auto"/>
+              <w:ind w:left="0" w:right="314" w:firstLine="0"/>
+              <w:jc w:val="left"/>
+              <w:rPr>
+                <w:rFonts w:ascii="Open Sans" w:cs="Open Sans" w:eastAsia="Open Sans" w:hAnsi="Open Sans"/>
+                <w:color w:val="000000"/>
+                <w:sz w:val="18"/>
+                <w:szCs w:val="18"/>
+                <w:shd w:fill="auto" w:val="clear"/>
+              </w:rPr>
+            </w:pPr>
+            <w:r>
+              <w:rPr>
+                <w:rFonts w:ascii="Open Sans" w:cs="Open Sans" w:eastAsia="Open Sans" w:hAnsi="Open Sans"/>
+                <w:color w:val="000000"/>
+                <w:sz w:val="18"/>
+                <w:szCs w:val="18"/>
+                <w:shd w:fill="auto" w:val="clear"/>
+                <w:rtl w:val="0"/>
+              </w:rPr>
+              <w:t xml:space="preserve">- 2 Stk Verbindungsprofil(e)</w:t>
+            </w:r>
+          </w:p>
+          <w:p>
+            <w:pPr>
+              <w:spacing w:after="0" w:before="0" w:line="278.00000000000006" w:lineRule="auto"/>
+              <w:ind w:left="0" w:right="314" w:firstLine="0"/>
+              <w:jc w:val="left"/>
+              <w:rPr>
+                <w:rFonts w:ascii="Open Sans" w:cs="Open Sans" w:eastAsia="Open Sans" w:hAnsi="Open Sans"/>
+                <w:color w:val="000000"/>
+                <w:sz w:val="18"/>
+                <w:szCs w:val="18"/>
+                <w:shd w:fill="auto" w:val="clear"/>
+              </w:rPr>
+            </w:pPr>
+            <w:r>
+              <w:rPr>
+                <w:rFonts w:ascii="Open Sans" w:cs="Open Sans" w:eastAsia="Open Sans" w:hAnsi="Open Sans"/>
+                <w:color w:val="000000"/>
+                <w:sz w:val="18"/>
+                <w:szCs w:val="18"/>
+                <w:shd w:fill="auto" w:val="clear"/>
+                <w:rtl w:val="0"/>
+              </w:rPr>
+              <w:t xml:space="preserve">- 1 Stk Wannenset individual 2.2 m. Wandhalter Schlauch u. HB 1-str. rund verchr. VIGOUR</w:t>
             </w:r>
           </w:p>
           <w:p>
@@ -2184,6 +2315,247 @@
                 <w:rtl w:val="0"/>
               </w:rPr>
               <w:t xml:space="preserve">003</w:t>
+            </w:r>
+            <w:r>
+              <w:rPr>
+                <w:rtl w:val="0"/>
+              </w:rPr>
+            </w:r>
+          </w:p>
+        </w:tc>
+        <w:tc>
+          <w:tcPr>
+            <w:tcBorders>
+              <w:top w:color="ffffff" w:space="0" w:sz="8" w:val="single"/>
+              <w:left w:color="ffffff" w:space="0" w:sz="8" w:val="single"/>
+              <w:bottom w:color="ffffff" w:space="0" w:sz="8" w:val="single"/>
+              <w:right w:color="ffffff" w:space="0" w:sz="8" w:val="single"/>
+            </w:tcBorders>
+            <w:shd w:fill="ffffff" w:val="clear"/>
+            <w:tcMar>
+              <w:left w:w="56.0" w:type="dxa"/>
+              <w:right w:w="56.0" w:type="dxa"/>
+            </w:tcMar>
+          </w:tcPr>
+          <w:p>
+            <w:pPr>
+              <w:spacing w:after="0" w:before="0" w:line="278.00000000000006" w:lineRule="auto"/>
+              <w:ind w:left="0" w:right="314" w:firstLine="0"/>
+              <w:jc w:val="left"/>
+              <w:rPr>
+                <w:color w:val="000000"/>
+              </w:rPr>
+            </w:pPr>
+            <w:r>
+              <w:rPr>
+                <w:rFonts w:ascii="Open Sans" w:cs="Open Sans" w:eastAsia="Open Sans" w:hAnsi="Open Sans"/>
+                <w:color w:val="000000"/>
+                <w:sz w:val="20"/>
+                <w:szCs w:val="20"/>
+                <w:shd w:fill="auto" w:val="clear"/>
+                <w:rtl w:val="0"/>
+              </w:rPr>
+              <w:t xml:space="preserve">1 Stk</w:t>
+            </w:r>
+            <w:r>
+              <w:rPr>
+                <w:rtl w:val="0"/>
+              </w:rPr>
+            </w:r>
+          </w:p>
+        </w:tc>
+        <w:tc>
+          <w:tcPr>
+            <w:tcBorders>
+              <w:top w:color="ffffff" w:space="0" w:sz="8" w:val="single"/>
+              <w:left w:color="ffffff" w:space="0" w:sz="8" w:val="single"/>
+              <w:bottom w:color="ffffff" w:space="0" w:sz="8" w:val="single"/>
+              <w:right w:color="ffffff" w:space="0" w:sz="8" w:val="single"/>
+            </w:tcBorders>
+            <w:shd w:fill="ffffff" w:val="clear"/>
+            <w:tcMar>
+              <w:left w:w="56.0" w:type="dxa"/>
+              <w:right w:w="56.0" w:type="dxa"/>
+            </w:tcMar>
+          </w:tcPr>
+          <w:p>
+            <w:pPr>
+              <w:spacing w:after="0" w:before="0" w:line="278.00000000000006" w:lineRule="auto"/>
+              <w:ind w:left="0" w:right="314" w:firstLine="0"/>
+              <w:jc w:val="left"/>
+              <w:rPr>
+                <w:rFonts w:ascii="Open Sans" w:cs="Open Sans" w:eastAsia="Open Sans" w:hAnsi="Open Sans"/>
+                <w:b w:val="1"/>
+                <w:color w:val="000000"/>
+                <w:sz w:val="18"/>
+                <w:szCs w:val="18"/>
+                <w:shd w:fill="auto" w:val="clear"/>
+              </w:rPr>
+            </w:pPr>
+            <w:r>
+              <w:rPr>
+                <w:rFonts w:ascii="Open Sans" w:cs="Open Sans" w:eastAsia="Open Sans" w:hAnsi="Open Sans"/>
+                <w:b w:val="1"/>
+                <w:color w:val="000000"/>
+                <w:sz w:val="18"/>
+                <w:szCs w:val="18"/>
+                <w:shd w:fill="auto" w:val="clear"/>
+                <w:rtl w:val="0"/>
+              </w:rPr>
+              <w:t xml:space="preserve">Aktion: Haltegriff</w:t>
+            </w:r>
+          </w:p>
+          <w:p>
+            <w:pPr>
+              <w:spacing w:after="0" w:before="0" w:line="278.00000000000006" w:lineRule="auto"/>
+              <w:ind w:left="0" w:right="314" w:firstLine="0"/>
+              <w:jc w:val="left"/>
+              <w:rPr>
+                <w:color w:val="000000"/>
+                <w:sz w:val="18"/>
+                <w:szCs w:val="18"/>
+              </w:rPr>
+            </w:pPr>
+            <w:r>
+              <w:rPr>
+                <w:rFonts w:ascii="Open Sans" w:cs="Open Sans" w:eastAsia="Open Sans" w:hAnsi="Open Sans"/>
+                <w:color w:val="000000"/>
+                <w:sz w:val="18"/>
+                <w:szCs w:val="18"/>
+                <w:shd w:fill="auto" w:val="clear"/>
+                <w:rtl w:val="0"/>
+              </w:rPr>
+              <w:t xml:space="preserve">1 Haltegriff gratis im Wert von 175 € inkl. Lieferung und Montage</w:t>
+            </w:r>
+            <w:r>
+              <w:rPr>
+                <w:rtl w:val="0"/>
+              </w:rPr>
+            </w:r>
+          </w:p>
+        </w:tc>
+        <w:tc>
+          <w:tcPr>
+            <w:tcBorders>
+              <w:top w:color="ffffff" w:space="0" w:sz="8" w:val="single"/>
+              <w:left w:color="ffffff" w:space="0" w:sz="8" w:val="single"/>
+              <w:bottom w:color="ffffff" w:space="0" w:sz="8" w:val="single"/>
+              <w:right w:color="ffffff" w:space="0" w:sz="8" w:val="single"/>
+            </w:tcBorders>
+            <w:shd w:fill="ffffff" w:val="clear"/>
+            <w:tcMar>
+              <w:left w:w="56.0" w:type="dxa"/>
+              <w:right w:w="56.0" w:type="dxa"/>
+            </w:tcMar>
+          </w:tcPr>
+          <w:p>
+            <w:pPr>
+              <w:spacing w:after="0" w:before="0" w:line="278.00000000000006" w:lineRule="auto"/>
+              <w:ind w:left="0" w:right="314" w:firstLine="0"/>
+              <w:jc w:val="left"/>
+              <w:rPr>
+                <w:color w:val="000000"/>
+              </w:rPr>
+            </w:pPr>
+            <w:r>
+              <w:rPr>
+                <w:rFonts w:ascii="Open Sans" w:cs="Open Sans" w:eastAsia="Open Sans" w:hAnsi="Open Sans"/>
+                <w:color w:val="000000"/>
+                <w:sz w:val="20"/>
+                <w:szCs w:val="20"/>
+                <w:shd w:fill="auto" w:val="clear"/>
+                <w:rtl w:val="0"/>
+              </w:rPr>
+              <w:t xml:space="preserve">0,00 €</w:t>
+            </w:r>
+            <w:r>
+              <w:rPr>
+                <w:rtl w:val="0"/>
+              </w:rPr>
+            </w:r>
+          </w:p>
+        </w:tc>
+        <w:tc>
+          <w:tcPr>
+            <w:tcBorders>
+              <w:top w:color="ffffff" w:space="0" w:sz="8" w:val="single"/>
+              <w:left w:color="ffffff" w:space="0" w:sz="8" w:val="single"/>
+              <w:bottom w:color="ffffff" w:space="0" w:sz="8" w:val="single"/>
+              <w:right w:color="ffffff" w:space="0" w:sz="8" w:val="single"/>
+            </w:tcBorders>
+            <w:shd w:fill="ffffff" w:val="clear"/>
+            <w:tcMar>
+              <w:left w:w="56.0" w:type="dxa"/>
+              <w:right w:w="56.0" w:type="dxa"/>
+            </w:tcMar>
+          </w:tcPr>
+          <w:p>
+            <w:pPr>
+              <w:spacing w:after="0" w:before="0" w:line="278.00000000000006" w:lineRule="auto"/>
+              <w:ind w:left="0" w:right="314" w:firstLine="0"/>
+              <w:jc w:val="center"/>
+              <w:rPr>
+                <w:color w:val="000000"/>
+              </w:rPr>
+            </w:pPr>
+            <w:r>
+              <w:rPr>
+                <w:rFonts w:ascii="Open Sans" w:cs="Open Sans" w:eastAsia="Open Sans" w:hAnsi="Open Sans"/>
+                <w:color w:val="000000"/>
+                <w:sz w:val="20"/>
+                <w:szCs w:val="20"/>
+                <w:shd w:fill="auto" w:val="clear"/>
+                <w:rtl w:val="0"/>
+              </w:rPr>
+              <w:t xml:space="preserve">0,00 €</w:t>
+            </w:r>
+            <w:r>
+              <w:rPr>
+                <w:rtl w:val="0"/>
+              </w:rPr>
+            </w:r>
+          </w:p>
+        </w:tc>
+      </w:tr>
+      <w:tr>
+        <w:trPr>
+          <w:cantSplit w:val="0"/>
+          <w:trHeight w:val="1" w:hRule="atLeast"/>
+          <w:tblHeader w:val="0"/>
+        </w:trPr>
+        <w:tc>
+          <w:tcPr>
+            <w:tcBorders>
+              <w:top w:color="ffffff" w:space="0" w:sz="8" w:val="single"/>
+              <w:left w:color="ffffff" w:space="0" w:sz="8" w:val="single"/>
+              <w:bottom w:color="ffffff" w:space="0" w:sz="8" w:val="single"/>
+              <w:right w:color="ffffff" w:space="0" w:sz="8" w:val="single"/>
+            </w:tcBorders>
+            <w:shd w:fill="ffffff" w:val="clear"/>
+            <w:tcMar>
+              <w:left w:w="56.0" w:type="dxa"/>
+              <w:right w:w="56.0" w:type="dxa"/>
+            </w:tcMar>
+          </w:tcPr>
+          <w:p>
+            <w:pPr>
+              <w:spacing w:after="0" w:before="0" w:line="278.00000000000006" w:lineRule="auto"/>
+              <w:ind w:left="0" w:right="-26" w:firstLine="0"/>
+              <w:jc w:val="left"/>
+              <w:rPr>
+                <w:color w:val="000000"/>
+              </w:rPr>
+            </w:pPr>
+            <w:r>
+              <w:rPr>
+                <w:rFonts w:ascii="Open Sans" w:cs="Open Sans" w:eastAsia="Open Sans" w:hAnsi="Open Sans"/>
+                <w:color w:val="000000"/>
+                <w:sz w:val="20"/>
+                <w:szCs w:val="20"/>
+                <w:shd w:fill="auto" w:val="clear"/>
+                <w:rtl w:val="0"/>
+              </w:rPr>
+              <w:t xml:space="preserve">004</w:t>
             </w:r>
             <w:r>
               <w:rPr>
@@ -2581,7 +2953,7 @@
                 <w:shd w:fill="auto" w:val="clear"/>
                 <w:rtl w:val="0"/>
               </w:rPr>
-              <w:t xml:space="preserve">5.096,95 €</w:t>
+              <w:t xml:space="preserve">6.548,58 €</w:t>
             </w:r>
             <w:r>
               <w:rPr>
@@ -2750,7 +3122,7 @@
                 <w:shd w:fill="auto" w:val="clear"/>
                 <w:rtl w:val="0"/>
               </w:rPr>
-              <w:t xml:space="preserve">968,42 €</w:t>
+              <w:t xml:space="preserve">1.244,23 €</w:t>
             </w:r>
             <w:r>
               <w:rPr>
@@ -2919,7 +3291,7 @@
                 <w:shd w:fill="auto" w:val="clear"/>
                 <w:rtl w:val="0"/>
               </w:rPr>
-              <w:t xml:space="preserve">6.065,37 €</w:t>
+              <w:t xml:space="preserve">7.792,81 €</w:t>
             </w:r>
             <w:r>
               <w:rPr>

</xml_diff>

<commit_message>
adding checkboxes Armatur verlegen Abfluss verlegen
</commit_message>
<xml_diff>
--- a/out-Angebot.docx
+++ b/out-Angebot.docx
@@ -129,7 +129,7 @@
                 <w:rFonts w:ascii="Open Sans" w:cs="Open Sans" w:eastAsia="Open Sans" w:hAnsi="Open Sans"/>
                 <w:rtl w:val="0"/>
               </w:rPr>
-              <w:t xml:space="preserve">Christian Chaney</w:t>
+              <w:t xml:space="preserve">Octavius Mercer</w:t>
             </w:r>
             <w:r>
               <w:rPr>
@@ -151,7 +151,7 @@
                 <w:rFonts w:ascii="Open Sans" w:cs="Open Sans" w:eastAsia="Open Sans" w:hAnsi="Open Sans"/>
                 <w:rtl w:val="0"/>
               </w:rPr>
-              <w:t xml:space="preserve">Nesciunt pariatur ,</w:t>
+              <w:t xml:space="preserve">Sit modi accusantium,</w:t>
             </w:r>
             <w:r>
               <w:rPr>
@@ -175,7 +175,7 @@
                 <w:rFonts w:ascii="Open Sans" w:cs="Open Sans" w:eastAsia="Open Sans" w:hAnsi="Open Sans"/>
                 <w:rtl w:val="0"/>
               </w:rPr>
-              <w:t xml:space="preserve">Inventore nisi dolor Do quae quia id nihi</w:t>
+              <w:t xml:space="preserve">Harum accusamus quis Omnis voluptatem Ve</w:t>
             </w:r>
             <w:r>
               <w:rPr>
@@ -310,7 +310,7 @@
                 <w:rFonts w:ascii="Open Sans" w:cs="Open Sans" w:eastAsia="Open Sans" w:hAnsi="Open Sans"/>
                 <w:rtl w:val="0"/>
               </w:rPr>
-              <w:t xml:space="preserve">ANG2025-1014-165317</w:t>
+              <w:t xml:space="preserve">ANG2025-1028-160327</w:t>
             </w:r>
             <w:r>
               <w:rPr>
@@ -345,7 +345,7 @@
                 <w:rFonts w:ascii="Open Sans" w:cs="Open Sans" w:eastAsia="Open Sans" w:hAnsi="Open Sans"/>
                 <w:rtl w:val="0"/>
               </w:rPr>
-              <w:t xml:space="preserve">29.04.1998</w:t>
+              <w:t xml:space="preserve">28.03.1986</w:t>
             </w:r>
             <w:r>
               <w:rPr>
@@ -379,7 +379,7 @@
                 <w:rFonts w:ascii="Open Sans" w:cs="Open Sans" w:eastAsia="Open Sans" w:hAnsi="Open Sans"/>
                 <w:rtl w:val="0"/>
               </w:rPr>
-              <w:t xml:space="preserve">Paula Weaver</w:t>
+              <w:t xml:space="preserve">Aphrodite Huffman</w:t>
             </w:r>
             <w:r>
               <w:rPr>
@@ -524,7 +524,7 @@
                 <w:rFonts w:ascii="Open Sans" w:cs="Open Sans" w:eastAsia="Open Sans" w:hAnsi="Open Sans"/>
                 <w:rtl w:val="0"/>
               </w:rPr>
-              <w:t xml:space="preserve">Buffy Livingston</w:t>
+              <w:t xml:space="preserve">Abra Mckay</w:t>
             </w:r>
             <w:r>
               <w:rPr>
@@ -578,7 +578,7 @@
           <w:shd w:fill="auto" w:val="clear"/>
           <w:rtl w:val="0"/>
         </w:rPr>
-        <w:t xml:space="preserve">  Ihr Angebot ANG2025-1014-165317</w:t>
+        <w:t xml:space="preserve">  Ihr Angebot ANG2025-1028-160327</w:t>
       </w:r>
     </w:p>
     <w:p>
@@ -603,7 +603,7 @@
           <w:shd w:fill="auto" w:val="clear"/>
           <w:rtl w:val="0"/>
         </w:rPr>
-        <w:t xml:space="preserve">  Sehr geehrte Frau Chaney,</w:t>
+        <w:t xml:space="preserve">  Sehr geehrte Frau Mercer,</w:t>
         <w:br w:type="textWrapping"/>
       </w:r>
     </w:p>
@@ -1075,7 +1075,7 @@
                 <w:shd w:fill="auto" w:val="clear"/>
                 <w:rtl w:val="0"/>
               </w:rPr>
-              <w:t xml:space="preserve">2.021,90 €</w:t>
+              <w:t xml:space="preserve">2.398,50 €</w:t>
             </w:r>
             <w:r>
               <w:rPr>
@@ -1116,7 +1116,7 @@
                 <w:shd w:fill="auto" w:val="clear"/>
                 <w:rtl w:val="0"/>
               </w:rPr>
-              <w:t xml:space="preserve">2.021,90 €</w:t>
+              <w:t xml:space="preserve">2.398,50 €</w:t>
             </w:r>
             <w:r>
               <w:rPr>
@@ -1248,7 +1248,7 @@
                 <w:shd w:fill="auto" w:val="clear"/>
                 <w:rtl w:val="0"/>
               </w:rPr>
-              <w:t xml:space="preserve">- Schließen der Fehlstellen</w:t>
+              <w:t xml:space="preserve">- Verkleidung Deckenhoch im Dusch/ Wannenbereich</w:t>
             </w:r>
             <w:r>
               <w:rPr>
@@ -1276,7 +1276,7 @@
                 <w:shd w:fill="auto" w:val="clear"/>
                 <w:rtl w:val="0"/>
               </w:rPr>
-              <w:t xml:space="preserve">- Auswechseln des Duschsystems</w:t>
+              <w:t xml:space="preserve">- Entfernen und Entsorgen der Badewanne inkl. Befliesung</w:t>
             </w:r>
             <w:r>
               <w:rPr>
@@ -1304,7 +1304,7 @@
                 <w:shd w:fill="auto" w:val="clear"/>
                 <w:rtl w:val="0"/>
               </w:rPr>
-              <w:t xml:space="preserve">- Entfernen und Entsorgen der Badewanne inkl. Befliesung</w:t>
+              <w:t xml:space="preserve">- Entfernen und Entsorgen der Duschabtrennung</w:t>
             </w:r>
             <w:r>
               <w:rPr>
@@ -1332,7 +1332,7 @@
                 <w:shd w:fill="auto" w:val="clear"/>
                 <w:rtl w:val="0"/>
               </w:rPr>
-              <w:t xml:space="preserve">- Entfernen und Entsorgen der Duschabtrennung</w:t>
+              <w:t xml:space="preserve">- Abfluss verlegen</w:t>
             </w:r>
             <w:r>
               <w:rPr>
@@ -1489,7 +1489,7 @@
                 <w:shd w:fill="auto" w:val="clear"/>
                 <w:rtl w:val="0"/>
               </w:rPr>
-              <w:t xml:space="preserve">- 34 km Kilometerpauschale</w:t>
+              <w:t xml:space="preserve">- 30 km Kilometerpauschale</w:t>
             </w:r>
             <w:r>
               <w:rPr>
@@ -1775,7 +1775,7 @@
                 <w:shd w:fill="auto" w:val="clear"/>
                 <w:rtl w:val="0"/>
               </w:rPr>
-              <w:t xml:space="preserve">3.338,89 €</w:t>
+              <w:t xml:space="preserve">1.323,20 €</w:t>
             </w:r>
             <w:r>
               <w:rPr>
@@ -1807,7 +1807,7 @@
               <w:rPr>
                 <w:rtl w:val="0"/>
               </w:rPr>
-              <w:t xml:space="preserve">3.338,89 €</w:t>
+              <w:t xml:space="preserve">1.323,20 €</w:t>
             </w:r>
             <w:r>
               <w:rPr>
@@ -1952,7 +1952,7 @@
                 <w:shd w:fill="auto" w:val="clear"/>
                 <w:rtl w:val="0"/>
               </w:rPr>
-              <w:t xml:space="preserve">- 1 Stk Stelzlager höhenverstellar Set</w:t>
+              <w:t xml:space="preserve">- 1 Stk Ablaufgarnitur Rohbauset m. Sifon BH60mm f. Flache Duschw. m. 90mm Ablauf TRINNITY</w:t>
             </w:r>
           </w:p>
           <w:p>
@@ -1977,7 +1977,7 @@
                 <w:shd w:fill="auto" w:val="clear"/>
                 <w:rtl w:val="0"/>
               </w:rPr>
-              <w:t xml:space="preserve">- 46 Stk Fußboden-Paneele (1 Paneele = 0.3 m² )</w:t>
+              <w:t xml:space="preserve">- 1 Stk Wandverkleidung 3.0 Alu 997×2550 mm — Farbe: Marmor weiß</w:t>
             </w:r>
           </w:p>
           <w:p>
@@ -2002,7 +2002,7 @@
                 <w:shd w:fill="auto" w:val="clear"/>
                 <w:rtl w:val="0"/>
               </w:rPr>
-              <w:t xml:space="preserve">- 20 Pkg Flächenkleber (1 Pkg je 0,60 m²)</w:t>
+              <w:t xml:space="preserve">- 3 Stk Wandverkleidung 3.0 Alu 1497×2550 mm — Farbe: Marmor weiß</w:t>
             </w:r>
           </w:p>
           <w:p>
@@ -2027,7 +2027,7 @@
                 <w:shd w:fill="auto" w:val="clear"/>
                 <w:rtl w:val="0"/>
               </w:rPr>
-              <w:t xml:space="preserve">- 13.8 m² Trinnity Bodenabdichtung (inkl. 15% Verschnitt)</w:t>
+              <w:t xml:space="preserve">- 3 Stk Wandverkleidungsklebstoff 3.0/4.0</w:t>
             </w:r>
           </w:p>
           <w:p>
@@ -2052,7 +2052,7 @@
                 <w:shd w:fill="auto" w:val="clear"/>
                 <w:rtl w:val="0"/>
               </w:rPr>
-              <w:t xml:space="preserve">- 2 Stk Wandverkleidung 3.0 Alu 997×2550 mm — Farbe: Schiefer grau</w:t>
+              <w:t xml:space="preserve">- 2 Stk Abschlussprofil 3.0 255 cm silber eloxiert VIGOUR</w:t>
             </w:r>
           </w:p>
           <w:p>
@@ -2077,132 +2077,7 @@
                 <w:shd w:fill="auto" w:val="clear"/>
                 <w:rtl w:val="0"/>
               </w:rPr>
-              <w:t xml:space="preserve">- 2 Stk Wandverkleidung 3.0 Alu 1497×2550 mm — Farbe: Schiefer grau</w:t>
-            </w:r>
-          </w:p>
-          <w:p>
-            <w:pPr>
-              <w:spacing w:after="0" w:before="0" w:line="278.00000000000006" w:lineRule="auto"/>
-              <w:ind w:left="0" w:right="314" w:firstLine="0"/>
-              <w:jc w:val="left"/>
-              <w:rPr>
-                <w:rFonts w:ascii="Open Sans" w:cs="Open Sans" w:eastAsia="Open Sans" w:hAnsi="Open Sans"/>
-                <w:color w:val="000000"/>
-                <w:sz w:val="18"/>
-                <w:szCs w:val="18"/>
-                <w:shd w:fill="auto" w:val="clear"/>
-              </w:rPr>
-            </w:pPr>
-            <w:r>
-              <w:rPr>
-                <w:rFonts w:ascii="Open Sans" w:cs="Open Sans" w:eastAsia="Open Sans" w:hAnsi="Open Sans"/>
-                <w:color w:val="000000"/>
-                <w:sz w:val="18"/>
-                <w:szCs w:val="18"/>
-                <w:shd w:fill="auto" w:val="clear"/>
-                <w:rtl w:val="0"/>
-              </w:rPr>
-              <w:t xml:space="preserve">- 2 Stk Verbindungsprofil(e)</w:t>
-            </w:r>
-          </w:p>
-          <w:p>
-            <w:pPr>
-              <w:spacing w:after="0" w:before="0" w:line="278.00000000000006" w:lineRule="auto"/>
-              <w:ind w:left="0" w:right="314" w:firstLine="0"/>
-              <w:jc w:val="left"/>
-              <w:rPr>
-                <w:rFonts w:ascii="Open Sans" w:cs="Open Sans" w:eastAsia="Open Sans" w:hAnsi="Open Sans"/>
-                <w:color w:val="000000"/>
-                <w:sz w:val="18"/>
-                <w:szCs w:val="18"/>
-                <w:shd w:fill="auto" w:val="clear"/>
-              </w:rPr>
-            </w:pPr>
-            <w:r>
-              <w:rPr>
-                <w:rFonts w:ascii="Open Sans" w:cs="Open Sans" w:eastAsia="Open Sans" w:hAnsi="Open Sans"/>
-                <w:color w:val="000000"/>
-                <w:sz w:val="18"/>
-                <w:szCs w:val="18"/>
-                <w:shd w:fill="auto" w:val="clear"/>
-                <w:rtl w:val="0"/>
-              </w:rPr>
-              <w:t xml:space="preserve">- 1 Stk Wannenset individual 2.2 m. Wandhalter Schlauch u. HB 1-str. rund verchr. VIGOUR</w:t>
-            </w:r>
-          </w:p>
-          <w:p>
-            <w:pPr>
-              <w:spacing w:after="0" w:before="0" w:line="278.00000000000006" w:lineRule="auto"/>
-              <w:ind w:left="0" w:right="314" w:firstLine="0"/>
-              <w:jc w:val="left"/>
-              <w:rPr>
-                <w:rFonts w:ascii="Open Sans" w:cs="Open Sans" w:eastAsia="Open Sans" w:hAnsi="Open Sans"/>
-                <w:color w:val="000000"/>
-                <w:sz w:val="18"/>
-                <w:szCs w:val="18"/>
-                <w:shd w:fill="auto" w:val="clear"/>
-              </w:rPr>
-            </w:pPr>
-            <w:r>
-              <w:rPr>
-                <w:rFonts w:ascii="Open Sans" w:cs="Open Sans" w:eastAsia="Open Sans" w:hAnsi="Open Sans"/>
-                <w:color w:val="000000"/>
-                <w:sz w:val="18"/>
-                <w:szCs w:val="18"/>
-                <w:shd w:fill="auto" w:val="clear"/>
-                <w:rtl w:val="0"/>
-              </w:rPr>
-              <w:t xml:space="preserve">- 2 Stk Gleittür Hassmann</w:t>
-            </w:r>
-          </w:p>
-          <w:p>
-            <w:pPr>
-              <w:spacing w:after="0" w:before="0" w:line="278.00000000000006" w:lineRule="auto"/>
-              <w:ind w:left="0" w:right="314" w:firstLine="0"/>
-              <w:jc w:val="left"/>
-              <w:rPr>
-                <w:rFonts w:ascii="Open Sans" w:cs="Open Sans" w:eastAsia="Open Sans" w:hAnsi="Open Sans"/>
-                <w:color w:val="000000"/>
-                <w:sz w:val="18"/>
-                <w:szCs w:val="18"/>
-                <w:shd w:fill="auto" w:val="clear"/>
-              </w:rPr>
-            </w:pPr>
-            <w:r>
-              <w:rPr>
-                <w:rFonts w:ascii="Open Sans" w:cs="Open Sans" w:eastAsia="Open Sans" w:hAnsi="Open Sans"/>
-                <w:color w:val="000000"/>
-                <w:sz w:val="18"/>
-                <w:szCs w:val="18"/>
-                <w:shd w:fill="auto" w:val="clear"/>
-                <w:rtl w:val="0"/>
-              </w:rPr>
-              <w:t xml:space="preserve">- 1 Stk Falt-Pendeltür Hassmann</w:t>
-            </w:r>
-          </w:p>
-          <w:p>
-            <w:pPr>
-              <w:spacing w:after="0" w:before="0" w:line="278.00000000000006" w:lineRule="auto"/>
-              <w:ind w:left="0" w:right="314" w:firstLine="0"/>
-              <w:jc w:val="left"/>
-              <w:rPr>
-                <w:rFonts w:ascii="Open Sans" w:cs="Open Sans" w:eastAsia="Open Sans" w:hAnsi="Open Sans"/>
-                <w:color w:val="000000"/>
-                <w:sz w:val="18"/>
-                <w:szCs w:val="18"/>
-                <w:shd w:fill="auto" w:val="clear"/>
-              </w:rPr>
-            </w:pPr>
-            <w:r>
-              <w:rPr>
-                <w:rFonts w:ascii="Open Sans" w:cs="Open Sans" w:eastAsia="Open Sans" w:hAnsi="Open Sans"/>
-                <w:color w:val="000000"/>
-                <w:sz w:val="18"/>
-                <w:szCs w:val="18"/>
-                <w:shd w:fill="auto" w:val="clear"/>
-                <w:rtl w:val="0"/>
-              </w:rPr>
-              <w:t xml:space="preserve">- 1 Stk Duschwanne 100 x 70 x 3 cm</w:t>
+              <w:t xml:space="preserve">- 1 Stk Duschwanne 70 x 70 x 3 cm</w:t>
             </w:r>
           </w:p>
         </w:tc>
@@ -2268,488 +2143,6 @@
                 <w:shd w:fill="auto" w:val="clear"/>
               </w:rPr>
             </w:pPr>
-            <w:r>
-              <w:rPr>
-                <w:rtl w:val="0"/>
-              </w:rPr>
-            </w:r>
-          </w:p>
-        </w:tc>
-      </w:tr>
-      <w:tr>
-        <w:trPr>
-          <w:cantSplit w:val="0"/>
-          <w:trHeight w:val="1" w:hRule="atLeast"/>
-          <w:tblHeader w:val="0"/>
-        </w:trPr>
-        <w:tc>
-          <w:tcPr>
-            <w:tcBorders>
-              <w:top w:color="ffffff" w:space="0" w:sz="8" w:val="single"/>
-              <w:left w:color="ffffff" w:space="0" w:sz="8" w:val="single"/>
-              <w:bottom w:color="ffffff" w:space="0" w:sz="8" w:val="single"/>
-              <w:right w:color="ffffff" w:space="0" w:sz="8" w:val="single"/>
-            </w:tcBorders>
-            <w:shd w:fill="ffffff" w:val="clear"/>
-            <w:tcMar>
-              <w:left w:w="56.0" w:type="dxa"/>
-              <w:right w:w="56.0" w:type="dxa"/>
-            </w:tcMar>
-          </w:tcPr>
-          <w:p>
-            <w:pPr>
-              <w:spacing w:after="0" w:before="0" w:line="278.00000000000006" w:lineRule="auto"/>
-              <w:ind w:left="0" w:right="-26" w:firstLine="0"/>
-              <w:jc w:val="left"/>
-              <w:rPr>
-                <w:color w:val="000000"/>
-              </w:rPr>
-            </w:pPr>
-            <w:r>
-              <w:rPr>
-                <w:rFonts w:ascii="Open Sans" w:cs="Open Sans" w:eastAsia="Open Sans" w:hAnsi="Open Sans"/>
-                <w:color w:val="000000"/>
-                <w:sz w:val="20"/>
-                <w:szCs w:val="20"/>
-                <w:shd w:fill="auto" w:val="clear"/>
-                <w:rtl w:val="0"/>
-              </w:rPr>
-              <w:t xml:space="preserve">003</w:t>
-            </w:r>
-            <w:r>
-              <w:rPr>
-                <w:rtl w:val="0"/>
-              </w:rPr>
-            </w:r>
-          </w:p>
-        </w:tc>
-        <w:tc>
-          <w:tcPr>
-            <w:tcBorders>
-              <w:top w:color="ffffff" w:space="0" w:sz="8" w:val="single"/>
-              <w:left w:color="ffffff" w:space="0" w:sz="8" w:val="single"/>
-              <w:bottom w:color="ffffff" w:space="0" w:sz="8" w:val="single"/>
-              <w:right w:color="ffffff" w:space="0" w:sz="8" w:val="single"/>
-            </w:tcBorders>
-            <w:shd w:fill="ffffff" w:val="clear"/>
-            <w:tcMar>
-              <w:left w:w="56.0" w:type="dxa"/>
-              <w:right w:w="56.0" w:type="dxa"/>
-            </w:tcMar>
-          </w:tcPr>
-          <w:p>
-            <w:pPr>
-              <w:spacing w:after="0" w:before="0" w:line="278.00000000000006" w:lineRule="auto"/>
-              <w:ind w:left="0" w:right="314" w:firstLine="0"/>
-              <w:jc w:val="left"/>
-              <w:rPr>
-                <w:color w:val="000000"/>
-              </w:rPr>
-            </w:pPr>
-            <w:r>
-              <w:rPr>
-                <w:rFonts w:ascii="Open Sans" w:cs="Open Sans" w:eastAsia="Open Sans" w:hAnsi="Open Sans"/>
-                <w:color w:val="000000"/>
-                <w:sz w:val="20"/>
-                <w:szCs w:val="20"/>
-                <w:shd w:fill="auto" w:val="clear"/>
-                <w:rtl w:val="0"/>
-              </w:rPr>
-              <w:t xml:space="preserve">1 Stk</w:t>
-            </w:r>
-            <w:r>
-              <w:rPr>
-                <w:rtl w:val="0"/>
-              </w:rPr>
-            </w:r>
-          </w:p>
-        </w:tc>
-        <w:tc>
-          <w:tcPr>
-            <w:tcBorders>
-              <w:top w:color="ffffff" w:space="0" w:sz="8" w:val="single"/>
-              <w:left w:color="ffffff" w:space="0" w:sz="8" w:val="single"/>
-              <w:bottom w:color="ffffff" w:space="0" w:sz="8" w:val="single"/>
-              <w:right w:color="ffffff" w:space="0" w:sz="8" w:val="single"/>
-            </w:tcBorders>
-            <w:shd w:fill="ffffff" w:val="clear"/>
-            <w:tcMar>
-              <w:left w:w="56.0" w:type="dxa"/>
-              <w:right w:w="56.0" w:type="dxa"/>
-            </w:tcMar>
-          </w:tcPr>
-          <w:p>
-            <w:pPr>
-              <w:spacing w:after="0" w:before="0" w:line="278.00000000000006" w:lineRule="auto"/>
-              <w:ind w:left="0" w:right="314" w:firstLine="0"/>
-              <w:jc w:val="left"/>
-              <w:rPr>
-                <w:rFonts w:ascii="Open Sans" w:cs="Open Sans" w:eastAsia="Open Sans" w:hAnsi="Open Sans"/>
-                <w:b w:val="1"/>
-                <w:color w:val="000000"/>
-                <w:sz w:val="18"/>
-                <w:szCs w:val="18"/>
-                <w:shd w:fill="auto" w:val="clear"/>
-              </w:rPr>
-            </w:pPr>
-            <w:r>
-              <w:rPr>
-                <w:rFonts w:ascii="Open Sans" w:cs="Open Sans" w:eastAsia="Open Sans" w:hAnsi="Open Sans"/>
-                <w:b w:val="1"/>
-                <w:color w:val="000000"/>
-                <w:sz w:val="18"/>
-                <w:szCs w:val="18"/>
-                <w:shd w:fill="auto" w:val="clear"/>
-                <w:rtl w:val="0"/>
-              </w:rPr>
-              <w:t xml:space="preserve">Aktion: Haltegriff</w:t>
-            </w:r>
-          </w:p>
-          <w:p>
-            <w:pPr>
-              <w:spacing w:after="0" w:before="0" w:line="278.00000000000006" w:lineRule="auto"/>
-              <w:ind w:left="0" w:right="314" w:firstLine="0"/>
-              <w:jc w:val="left"/>
-              <w:rPr>
-                <w:color w:val="000000"/>
-                <w:sz w:val="18"/>
-                <w:szCs w:val="18"/>
-              </w:rPr>
-            </w:pPr>
-            <w:r>
-              <w:rPr>
-                <w:rFonts w:ascii="Open Sans" w:cs="Open Sans" w:eastAsia="Open Sans" w:hAnsi="Open Sans"/>
-                <w:color w:val="000000"/>
-                <w:sz w:val="18"/>
-                <w:szCs w:val="18"/>
-                <w:shd w:fill="auto" w:val="clear"/>
-                <w:rtl w:val="0"/>
-              </w:rPr>
-              <w:t xml:space="preserve">1 Haltegriff gratis im Wert von 175 € inkl. Lieferung und Montage</w:t>
-            </w:r>
-            <w:r>
-              <w:rPr>
-                <w:rtl w:val="0"/>
-              </w:rPr>
-            </w:r>
-          </w:p>
-        </w:tc>
-        <w:tc>
-          <w:tcPr>
-            <w:tcBorders>
-              <w:top w:color="ffffff" w:space="0" w:sz="8" w:val="single"/>
-              <w:left w:color="ffffff" w:space="0" w:sz="8" w:val="single"/>
-              <w:bottom w:color="ffffff" w:space="0" w:sz="8" w:val="single"/>
-              <w:right w:color="ffffff" w:space="0" w:sz="8" w:val="single"/>
-            </w:tcBorders>
-            <w:shd w:fill="ffffff" w:val="clear"/>
-            <w:tcMar>
-              <w:left w:w="56.0" w:type="dxa"/>
-              <w:right w:w="56.0" w:type="dxa"/>
-            </w:tcMar>
-          </w:tcPr>
-          <w:p>
-            <w:pPr>
-              <w:spacing w:after="0" w:before="0" w:line="278.00000000000006" w:lineRule="auto"/>
-              <w:ind w:left="0" w:right="314" w:firstLine="0"/>
-              <w:jc w:val="left"/>
-              <w:rPr>
-                <w:color w:val="000000"/>
-              </w:rPr>
-            </w:pPr>
-            <w:r>
-              <w:rPr>
-                <w:rFonts w:ascii="Open Sans" w:cs="Open Sans" w:eastAsia="Open Sans" w:hAnsi="Open Sans"/>
-                <w:color w:val="000000"/>
-                <w:sz w:val="20"/>
-                <w:szCs w:val="20"/>
-                <w:shd w:fill="auto" w:val="clear"/>
-                <w:rtl w:val="0"/>
-              </w:rPr>
-              <w:t xml:space="preserve">0,00 €</w:t>
-            </w:r>
-            <w:r>
-              <w:rPr>
-                <w:rtl w:val="0"/>
-              </w:rPr>
-            </w:r>
-          </w:p>
-        </w:tc>
-        <w:tc>
-          <w:tcPr>
-            <w:tcBorders>
-              <w:top w:color="ffffff" w:space="0" w:sz="8" w:val="single"/>
-              <w:left w:color="ffffff" w:space="0" w:sz="8" w:val="single"/>
-              <w:bottom w:color="ffffff" w:space="0" w:sz="8" w:val="single"/>
-              <w:right w:color="ffffff" w:space="0" w:sz="8" w:val="single"/>
-            </w:tcBorders>
-            <w:shd w:fill="ffffff" w:val="clear"/>
-            <w:tcMar>
-              <w:left w:w="56.0" w:type="dxa"/>
-              <w:right w:w="56.0" w:type="dxa"/>
-            </w:tcMar>
-          </w:tcPr>
-          <w:p>
-            <w:pPr>
-              <w:spacing w:after="0" w:before="0" w:line="278.00000000000006" w:lineRule="auto"/>
-              <w:ind w:left="0" w:right="314" w:firstLine="0"/>
-              <w:jc w:val="center"/>
-              <w:rPr>
-                <w:color w:val="000000"/>
-              </w:rPr>
-            </w:pPr>
-            <w:r>
-              <w:rPr>
-                <w:rFonts w:ascii="Open Sans" w:cs="Open Sans" w:eastAsia="Open Sans" w:hAnsi="Open Sans"/>
-                <w:color w:val="000000"/>
-                <w:sz w:val="20"/>
-                <w:szCs w:val="20"/>
-                <w:shd w:fill="auto" w:val="clear"/>
-                <w:rtl w:val="0"/>
-              </w:rPr>
-              <w:t xml:space="preserve">0,00 €</w:t>
-            </w:r>
-            <w:r>
-              <w:rPr>
-                <w:rtl w:val="0"/>
-              </w:rPr>
-            </w:r>
-          </w:p>
-        </w:tc>
-      </w:tr>
-      <w:tr>
-        <w:trPr>
-          <w:cantSplit w:val="0"/>
-          <w:trHeight w:val="1" w:hRule="atLeast"/>
-          <w:tblHeader w:val="0"/>
-        </w:trPr>
-        <w:tc>
-          <w:tcPr>
-            <w:tcBorders>
-              <w:top w:color="ffffff" w:space="0" w:sz="8" w:val="single"/>
-              <w:left w:color="ffffff" w:space="0" w:sz="8" w:val="single"/>
-              <w:bottom w:color="ffffff" w:space="0" w:sz="8" w:val="single"/>
-              <w:right w:color="ffffff" w:space="0" w:sz="8" w:val="single"/>
-            </w:tcBorders>
-            <w:shd w:fill="ffffff" w:val="clear"/>
-            <w:tcMar>
-              <w:left w:w="56.0" w:type="dxa"/>
-              <w:right w:w="56.0" w:type="dxa"/>
-            </w:tcMar>
-          </w:tcPr>
-          <w:p>
-            <w:pPr>
-              <w:spacing w:after="0" w:before="0" w:line="278.00000000000006" w:lineRule="auto"/>
-              <w:ind w:left="0" w:right="-26" w:firstLine="0"/>
-              <w:jc w:val="left"/>
-              <w:rPr>
-                <w:color w:val="000000"/>
-              </w:rPr>
-            </w:pPr>
-            <w:r>
-              <w:rPr>
-                <w:rFonts w:ascii="Open Sans" w:cs="Open Sans" w:eastAsia="Open Sans" w:hAnsi="Open Sans"/>
-                <w:color w:val="000000"/>
-                <w:sz w:val="20"/>
-                <w:szCs w:val="20"/>
-                <w:shd w:fill="auto" w:val="clear"/>
-                <w:rtl w:val="0"/>
-              </w:rPr>
-              <w:t xml:space="preserve">004</w:t>
-            </w:r>
-            <w:r>
-              <w:rPr>
-                <w:rtl w:val="0"/>
-              </w:rPr>
-            </w:r>
-          </w:p>
-        </w:tc>
-        <w:tc>
-          <w:tcPr>
-            <w:tcBorders>
-              <w:top w:color="ffffff" w:space="0" w:sz="8" w:val="single"/>
-              <w:left w:color="ffffff" w:space="0" w:sz="8" w:val="single"/>
-              <w:bottom w:color="ffffff" w:space="0" w:sz="8" w:val="single"/>
-              <w:right w:color="ffffff" w:space="0" w:sz="8" w:val="single"/>
-            </w:tcBorders>
-            <w:shd w:fill="ffffff" w:val="clear"/>
-            <w:tcMar>
-              <w:left w:w="56.0" w:type="dxa"/>
-              <w:right w:w="56.0" w:type="dxa"/>
-            </w:tcMar>
-          </w:tcPr>
-          <w:p>
-            <w:pPr>
-              <w:spacing w:after="0" w:before="0" w:line="278.00000000000006" w:lineRule="auto"/>
-              <w:ind w:left="0" w:right="314" w:firstLine="0"/>
-              <w:jc w:val="left"/>
-              <w:rPr>
-                <w:color w:val="000000"/>
-              </w:rPr>
-            </w:pPr>
-            <w:r>
-              <w:rPr>
-                <w:rFonts w:ascii="Open Sans" w:cs="Open Sans" w:eastAsia="Open Sans" w:hAnsi="Open Sans"/>
-                <w:color w:val="000000"/>
-                <w:sz w:val="20"/>
-                <w:szCs w:val="20"/>
-                <w:shd w:fill="auto" w:val="clear"/>
-                <w:rtl w:val="0"/>
-              </w:rPr>
-              <w:t xml:space="preserve">1 Stk</w:t>
-            </w:r>
-            <w:r>
-              <w:rPr>
-                <w:rtl w:val="0"/>
-              </w:rPr>
-            </w:r>
-          </w:p>
-        </w:tc>
-        <w:tc>
-          <w:tcPr>
-            <w:tcBorders>
-              <w:top w:color="ffffff" w:space="0" w:sz="8" w:val="single"/>
-              <w:left w:color="ffffff" w:space="0" w:sz="8" w:val="single"/>
-              <w:bottom w:color="ffffff" w:space="0" w:sz="8" w:val="single"/>
-              <w:right w:color="ffffff" w:space="0" w:sz="8" w:val="single"/>
-            </w:tcBorders>
-            <w:shd w:fill="ffffff" w:val="clear"/>
-            <w:tcMar>
-              <w:left w:w="56.0" w:type="dxa"/>
-              <w:right w:w="56.0" w:type="dxa"/>
-            </w:tcMar>
-          </w:tcPr>
-          <w:p>
-            <w:pPr>
-              <w:spacing w:after="0" w:before="0" w:line="278.00000000000006" w:lineRule="auto"/>
-              <w:ind w:left="0" w:right="314" w:firstLine="0"/>
-              <w:jc w:val="left"/>
-              <w:rPr>
-                <w:rFonts w:ascii="Open Sans" w:cs="Open Sans" w:eastAsia="Open Sans" w:hAnsi="Open Sans"/>
-                <w:b w:val="1"/>
-                <w:color w:val="000000"/>
-                <w:sz w:val="18"/>
-                <w:szCs w:val="18"/>
-                <w:shd w:fill="auto" w:val="clear"/>
-              </w:rPr>
-            </w:pPr>
-            <w:r>
-              <w:rPr>
-                <w:rFonts w:ascii="Open Sans" w:cs="Open Sans" w:eastAsia="Open Sans" w:hAnsi="Open Sans"/>
-                <w:b w:val="1"/>
-                <w:color w:val="000000"/>
-                <w:sz w:val="18"/>
-                <w:szCs w:val="18"/>
-                <w:shd w:fill="auto" w:val="clear"/>
-                <w:rtl w:val="0"/>
-              </w:rPr>
-              <w:t xml:space="preserve">Bestandkundenbonus:</w:t>
-            </w:r>
-          </w:p>
-          <w:p>
-            <w:pPr>
-              <w:spacing w:after="0" w:before="0" w:line="278.00000000000006" w:lineRule="auto"/>
-              <w:ind w:left="0" w:right="314" w:firstLine="0"/>
-              <w:jc w:val="left"/>
-              <w:rPr>
-                <w:color w:val="000000"/>
-                <w:sz w:val="18"/>
-                <w:szCs w:val="18"/>
-              </w:rPr>
-            </w:pPr>
-            <w:r>
-              <w:rPr>
-                <w:rFonts w:ascii="Open Sans" w:cs="Open Sans" w:eastAsia="Open Sans" w:hAnsi="Open Sans"/>
-                <w:color w:val="000000"/>
-                <w:sz w:val="18"/>
-                <w:szCs w:val="18"/>
-                <w:shd w:fill="auto" w:val="clear"/>
-                <w:rtl w:val="0"/>
-              </w:rPr>
-              <w:t xml:space="preserve">-- Rabatt von 300 € ab einem Gesamtwert von 3.000</w:t>
-            </w:r>
-            <w:r>
-              <w:rPr>
-                <w:rtl w:val="0"/>
-              </w:rPr>
-            </w:r>
-          </w:p>
-        </w:tc>
-        <w:tc>
-          <w:tcPr>
-            <w:tcBorders>
-              <w:top w:color="ffffff" w:space="0" w:sz="8" w:val="single"/>
-              <w:left w:color="ffffff" w:space="0" w:sz="8" w:val="single"/>
-              <w:bottom w:color="ffffff" w:space="0" w:sz="8" w:val="single"/>
-              <w:right w:color="ffffff" w:space="0" w:sz="8" w:val="single"/>
-            </w:tcBorders>
-            <w:shd w:fill="ffffff" w:val="clear"/>
-            <w:tcMar>
-              <w:left w:w="56.0" w:type="dxa"/>
-              <w:right w:w="56.0" w:type="dxa"/>
-            </w:tcMar>
-          </w:tcPr>
-          <w:p>
-            <w:pPr>
-              <w:spacing w:after="0" w:before="0" w:line="278.00000000000006" w:lineRule="auto"/>
-              <w:ind w:left="0" w:right="314" w:firstLine="0"/>
-              <w:jc w:val="left"/>
-              <w:rPr>
-                <w:color w:val="000000"/>
-              </w:rPr>
-            </w:pPr>
-            <w:r>
-              <w:rPr>
-                <w:rFonts w:ascii="Open Sans" w:cs="Open Sans" w:eastAsia="Open Sans" w:hAnsi="Open Sans"/>
-                <w:color w:val="000000"/>
-                <w:sz w:val="20"/>
-                <w:szCs w:val="20"/>
-                <w:shd w:fill="auto" w:val="clear"/>
-                <w:rtl w:val="0"/>
-              </w:rPr>
-              <w:t xml:space="preserve">-252,10 €</w:t>
-            </w:r>
-            <w:r>
-              <w:rPr>
-                <w:rtl w:val="0"/>
-              </w:rPr>
-            </w:r>
-          </w:p>
-        </w:tc>
-        <w:tc>
-          <w:tcPr>
-            <w:tcBorders>
-              <w:top w:color="ffffff" w:space="0" w:sz="8" w:val="single"/>
-              <w:left w:color="ffffff" w:space="0" w:sz="8" w:val="single"/>
-              <w:bottom w:color="ffffff" w:space="0" w:sz="8" w:val="single"/>
-              <w:right w:color="ffffff" w:space="0" w:sz="8" w:val="single"/>
-            </w:tcBorders>
-            <w:shd w:fill="ffffff" w:val="clear"/>
-            <w:tcMar>
-              <w:left w:w="56.0" w:type="dxa"/>
-              <w:right w:w="56.0" w:type="dxa"/>
-            </w:tcMar>
-          </w:tcPr>
-          <w:p>
-            <w:pPr>
-              <w:spacing w:after="0" w:before="0" w:line="278.00000000000006" w:lineRule="auto"/>
-              <w:ind w:left="0" w:right="314" w:firstLine="0"/>
-              <w:jc w:val="center"/>
-              <w:rPr>
-                <w:color w:val="000000"/>
-              </w:rPr>
-            </w:pPr>
-            <w:r>
-              <w:rPr>
-                <w:rFonts w:ascii="Open Sans" w:cs="Open Sans" w:eastAsia="Open Sans" w:hAnsi="Open Sans"/>
-                <w:color w:val="000000"/>
-                <w:sz w:val="20"/>
-                <w:szCs w:val="20"/>
-                <w:shd w:fill="auto" w:val="clear"/>
-                <w:rtl w:val="0"/>
-              </w:rPr>
-              <w:t xml:space="preserve">-252,10 €</w:t>
-            </w:r>
             <w:r>
               <w:rPr>
                 <w:rtl w:val="0"/>
@@ -2953,7 +2346,7 @@
                 <w:shd w:fill="auto" w:val="clear"/>
                 <w:rtl w:val="0"/>
               </w:rPr>
-              <w:t xml:space="preserve">6.548,58 €</w:t>
+              <w:t xml:space="preserve">4.383,30 €</w:t>
             </w:r>
             <w:r>
               <w:rPr>
@@ -3122,7 +2515,7 @@
                 <w:shd w:fill="auto" w:val="clear"/>
                 <w:rtl w:val="0"/>
               </w:rPr>
-              <w:t xml:space="preserve">1.244,23 €</w:t>
+              <w:t xml:space="preserve">832,83 €</w:t>
             </w:r>
             <w:r>
               <w:rPr>
@@ -3291,7 +2684,7 @@
                 <w:shd w:fill="auto" w:val="clear"/>
                 <w:rtl w:val="0"/>
               </w:rPr>
-              <w:t xml:space="preserve">7.792,81 €</w:t>
+              <w:t xml:space="preserve">5.216,13 €</w:t>
             </w:r>
             <w:r>
               <w:rPr>

</xml_diff>

<commit_message>
updating Menge TECEADS (x paare)
</commit_message>
<xml_diff>
--- a/out-Angebot.docx
+++ b/out-Angebot.docx
@@ -129,7 +129,7 @@
                 <w:rFonts w:ascii="Open Sans" w:cs="Open Sans" w:eastAsia="Open Sans" w:hAnsi="Open Sans"/>
                 <w:rtl w:val="0"/>
               </w:rPr>
-              <w:t xml:space="preserve">Octavius Mercer</w:t>
+              <w:t xml:space="preserve">Mikayla Rice</w:t>
             </w:r>
             <w:r>
               <w:rPr>
@@ -151,7 +151,7 @@
                 <w:rFonts w:ascii="Open Sans" w:cs="Open Sans" w:eastAsia="Open Sans" w:hAnsi="Open Sans"/>
                 <w:rtl w:val="0"/>
               </w:rPr>
-              <w:t xml:space="preserve">Sit modi accusantium,</w:t>
+              <w:t xml:space="preserve">Aut cumque est quib,</w:t>
             </w:r>
             <w:r>
               <w:rPr>
@@ -175,7 +175,7 @@
                 <w:rFonts w:ascii="Open Sans" w:cs="Open Sans" w:eastAsia="Open Sans" w:hAnsi="Open Sans"/>
                 <w:rtl w:val="0"/>
               </w:rPr>
-              <w:t xml:space="preserve">Harum accusamus quis Omnis voluptatem Ve</w:t>
+              <w:t xml:space="preserve">Nostrud omnis fugit Nisi dolores quia es</w:t>
             </w:r>
             <w:r>
               <w:rPr>
@@ -310,7 +310,7 @@
                 <w:rFonts w:ascii="Open Sans" w:cs="Open Sans" w:eastAsia="Open Sans" w:hAnsi="Open Sans"/>
                 <w:rtl w:val="0"/>
               </w:rPr>
-              <w:t xml:space="preserve">ANG2025-1028-160327</w:t>
+              <w:t xml:space="preserve">ANG2025-1029-145127</w:t>
             </w:r>
             <w:r>
               <w:rPr>
@@ -345,7 +345,7 @@
                 <w:rFonts w:ascii="Open Sans" w:cs="Open Sans" w:eastAsia="Open Sans" w:hAnsi="Open Sans"/>
                 <w:rtl w:val="0"/>
               </w:rPr>
-              <w:t xml:space="preserve">28.03.1986</w:t>
+              <w:t xml:space="preserve">11.01.2018</w:t>
             </w:r>
             <w:r>
               <w:rPr>
@@ -379,7 +379,7 @@
                 <w:rFonts w:ascii="Open Sans" w:cs="Open Sans" w:eastAsia="Open Sans" w:hAnsi="Open Sans"/>
                 <w:rtl w:val="0"/>
               </w:rPr>
-              <w:t xml:space="preserve">Aphrodite Huffman</w:t>
+              <w:t xml:space="preserve">Kim Mullins</w:t>
             </w:r>
             <w:r>
               <w:rPr>
@@ -524,7 +524,7 @@
                 <w:rFonts w:ascii="Open Sans" w:cs="Open Sans" w:eastAsia="Open Sans" w:hAnsi="Open Sans"/>
                 <w:rtl w:val="0"/>
               </w:rPr>
-              <w:t xml:space="preserve">Abra Mckay</w:t>
+              <w:t xml:space="preserve">Jonas Bass</w:t>
             </w:r>
             <w:r>
               <w:rPr>
@@ -578,7 +578,7 @@
           <w:shd w:fill="auto" w:val="clear"/>
           <w:rtl w:val="0"/>
         </w:rPr>
-        <w:t xml:space="preserve">  Ihr Angebot ANG2025-1028-160327</w:t>
+        <w:t xml:space="preserve">  Ihr Angebot ANG2025-1029-145127</w:t>
       </w:r>
     </w:p>
     <w:p>
@@ -603,7 +603,7 @@
           <w:shd w:fill="auto" w:val="clear"/>
           <w:rtl w:val="0"/>
         </w:rPr>
-        <w:t xml:space="preserve">  Sehr geehrte Frau Mercer,</w:t>
+        <w:t xml:space="preserve">  Sehr geehrte Frau Rice,</w:t>
         <w:br w:type="textWrapping"/>
       </w:r>
     </w:p>
@@ -1075,7 +1075,7 @@
                 <w:shd w:fill="auto" w:val="clear"/>
                 <w:rtl w:val="0"/>
               </w:rPr>
-              <w:t xml:space="preserve">2.398,50 €</w:t>
+              <w:t xml:space="preserve">1.054,70 €</w:t>
             </w:r>
             <w:r>
               <w:rPr>
@@ -1116,7 +1116,7 @@
                 <w:shd w:fill="auto" w:val="clear"/>
                 <w:rtl w:val="0"/>
               </w:rPr>
-              <w:t xml:space="preserve">2.398,50 €</w:t>
+              <w:t xml:space="preserve">1.054,70 €</w:t>
             </w:r>
             <w:r>
               <w:rPr>
@@ -1248,7 +1248,7 @@
                 <w:shd w:fill="auto" w:val="clear"/>
                 <w:rtl w:val="0"/>
               </w:rPr>
-              <w:t xml:space="preserve">- Verkleidung Deckenhoch im Dusch/ Wannenbereich</w:t>
+              <w:t xml:space="preserve">- Schließen der Fehlstellen</w:t>
             </w:r>
             <w:r>
               <w:rPr>
@@ -1276,6 +1276,62 @@
                 <w:shd w:fill="auto" w:val="clear"/>
                 <w:rtl w:val="0"/>
               </w:rPr>
+              <w:t xml:space="preserve">- Auswechseln des Duschsystems</w:t>
+            </w:r>
+            <w:r>
+              <w:rPr>
+                <w:rtl w:val="0"/>
+              </w:rPr>
+            </w:r>
+          </w:p>
+          <w:p>
+            <w:pPr>
+              <w:spacing w:after="0" w:before="0" w:line="278.00000000000006" w:lineRule="auto"/>
+              <w:ind w:left="0" w:right="314" w:firstLine="0"/>
+              <w:jc w:val="left"/>
+              <w:rPr>
+                <w:color w:val="000000"/>
+                <w:sz w:val="18"/>
+                <w:szCs w:val="18"/>
+              </w:rPr>
+            </w:pPr>
+            <w:r>
+              <w:rPr>
+                <w:rFonts w:ascii="Open Sans" w:cs="Open Sans" w:eastAsia="Open Sans" w:hAnsi="Open Sans"/>
+                <w:color w:val="000000"/>
+                <w:sz w:val="18"/>
+                <w:szCs w:val="18"/>
+                <w:shd w:fill="auto" w:val="clear"/>
+                <w:rtl w:val="0"/>
+              </w:rPr>
+              <w:t xml:space="preserve">- Einbau einer einhand-Waschtischbatterie</w:t>
+            </w:r>
+            <w:r>
+              <w:rPr>
+                <w:rtl w:val="0"/>
+              </w:rPr>
+            </w:r>
+          </w:p>
+          <w:p>
+            <w:pPr>
+              <w:spacing w:after="0" w:before="0" w:line="278.00000000000006" w:lineRule="auto"/>
+              <w:ind w:left="0" w:right="314" w:firstLine="0"/>
+              <w:jc w:val="left"/>
+              <w:rPr>
+                <w:color w:val="000000"/>
+                <w:sz w:val="18"/>
+                <w:szCs w:val="18"/>
+              </w:rPr>
+            </w:pPr>
+            <w:r>
+              <w:rPr>
+                <w:rFonts w:ascii="Open Sans" w:cs="Open Sans" w:eastAsia="Open Sans" w:hAnsi="Open Sans"/>
+                <w:color w:val="000000"/>
+                <w:sz w:val="18"/>
+                <w:szCs w:val="18"/>
+                <w:shd w:fill="auto" w:val="clear"/>
+                <w:rtl w:val="0"/>
+              </w:rPr>
               <w:t xml:space="preserve">- Entfernen und Entsorgen der Badewanne inkl. Befliesung</w:t>
             </w:r>
             <w:r>
@@ -1332,7 +1388,35 @@
                 <w:shd w:fill="auto" w:val="clear"/>
                 <w:rtl w:val="0"/>
               </w:rPr>
-              <w:t xml:space="preserve">- Abfluss verlegen</w:t>
+              <w:t xml:space="preserve">- Einbau der Duschwanne</w:t>
+            </w:r>
+            <w:r>
+              <w:rPr>
+                <w:rtl w:val="0"/>
+              </w:rPr>
+            </w:r>
+          </w:p>
+          <w:p>
+            <w:pPr>
+              <w:spacing w:after="0" w:before="0" w:line="278.00000000000006" w:lineRule="auto"/>
+              <w:ind w:left="0" w:right="314" w:firstLine="0"/>
+              <w:jc w:val="left"/>
+              <w:rPr>
+                <w:color w:val="000000"/>
+                <w:sz w:val="18"/>
+                <w:szCs w:val="18"/>
+              </w:rPr>
+            </w:pPr>
+            <w:r>
+              <w:rPr>
+                <w:rFonts w:ascii="Open Sans" w:cs="Open Sans" w:eastAsia="Open Sans" w:hAnsi="Open Sans"/>
+                <w:color w:val="000000"/>
+                <w:sz w:val="18"/>
+                <w:szCs w:val="18"/>
+                <w:shd w:fill="auto" w:val="clear"/>
+                <w:rtl w:val="0"/>
+              </w:rPr>
+              <w:t xml:space="preserve">- Einbau der Duschabtrennung</w:t>
             </w:r>
             <w:r>
               <w:rPr>
@@ -1489,7 +1573,7 @@
                 <w:shd w:fill="auto" w:val="clear"/>
                 <w:rtl w:val="0"/>
               </w:rPr>
-              <w:t xml:space="preserve">- 30 km Kilometerpauschale</w:t>
+              <w:t xml:space="preserve">- 82 km Kilometerpauschale</w:t>
             </w:r>
             <w:r>
               <w:rPr>
@@ -1775,7 +1859,7 @@
                 <w:shd w:fill="auto" w:val="clear"/>
                 <w:rtl w:val="0"/>
               </w:rPr>
-              <w:t xml:space="preserve">1.323,20 €</w:t>
+              <w:t xml:space="preserve">1.244,14 €</w:t>
             </w:r>
             <w:r>
               <w:rPr>
@@ -1807,7 +1891,7 @@
               <w:rPr>
                 <w:rtl w:val="0"/>
               </w:rPr>
-              <w:t xml:space="preserve">1.323,20 €</w:t>
+              <w:t xml:space="preserve">1.244,14 €</w:t>
             </w:r>
             <w:r>
               <w:rPr>
@@ -1977,7 +2061,7 @@
                 <w:shd w:fill="auto" w:val="clear"/>
                 <w:rtl w:val="0"/>
               </w:rPr>
-              <w:t xml:space="preserve">- 1 Stk Wandverkleidung 3.0 Alu 997×2550 mm — Farbe: Marmor weiß</w:t>
+              <w:t xml:space="preserve">- 1 Stk Stelzlager höhenverstellar Set</w:t>
             </w:r>
           </w:p>
           <w:p>
@@ -2002,7 +2086,7 @@
                 <w:shd w:fill="auto" w:val="clear"/>
                 <w:rtl w:val="0"/>
               </w:rPr>
-              <w:t xml:space="preserve">- 3 Stk Wandverkleidung 3.0 Alu 1497×2550 mm — Farbe: Marmor weiß</w:t>
+              <w:t xml:space="preserve">- 1 Stk Wandverkleidung 3.0 Alu 997×2550 mm — Farbe: Struktur weiß</w:t>
             </w:r>
           </w:p>
           <w:p>
@@ -2027,7 +2111,7 @@
                 <w:shd w:fill="auto" w:val="clear"/>
                 <w:rtl w:val="0"/>
               </w:rPr>
-              <w:t xml:space="preserve">- 3 Stk Wandverkleidungsklebstoff 3.0/4.0</w:t>
+              <w:t xml:space="preserve">- 1 Stk TRINNITY Wandabdichtung BASIS-Set 5 qm DW bis 100 x 100 / BW bis 180 x 80 cm</w:t>
             </w:r>
           </w:p>
           <w:p>
@@ -2052,7 +2136,7 @@
                 <w:shd w:fill="auto" w:val="clear"/>
                 <w:rtl w:val="0"/>
               </w:rPr>
-              <w:t xml:space="preserve">- 2 Stk Abschlussprofil 3.0 255 cm silber eloxiert VIGOUR</w:t>
+              <w:t xml:space="preserve">- 2 Stk Wandverkleidungsklebstoff 3.0/4.0</w:t>
             </w:r>
           </w:p>
           <w:p>
@@ -2077,7 +2161,107 @@
                 <w:shd w:fill="auto" w:val="clear"/>
                 <w:rtl w:val="0"/>
               </w:rPr>
-              <w:t xml:space="preserve">- 1 Stk Duschwanne 70 x 70 x 3 cm</w:t>
+              <w:t xml:space="preserve">- 1 Stk Abschlussprofil 3.0 255 cm silber eloxiert VIGOUR</w:t>
+            </w:r>
+          </w:p>
+          <w:p>
+            <w:pPr>
+              <w:spacing w:after="0" w:before="0" w:line="278.00000000000006" w:lineRule="auto"/>
+              <w:ind w:left="0" w:right="314" w:firstLine="0"/>
+              <w:jc w:val="left"/>
+              <w:rPr>
+                <w:rFonts w:ascii="Open Sans" w:cs="Open Sans" w:eastAsia="Open Sans" w:hAnsi="Open Sans"/>
+                <w:color w:val="000000"/>
+                <w:sz w:val="18"/>
+                <w:szCs w:val="18"/>
+                <w:shd w:fill="auto" w:val="clear"/>
+              </w:rPr>
+            </w:pPr>
+            <w:r>
+              <w:rPr>
+                <w:rFonts w:ascii="Open Sans" w:cs="Open Sans" w:eastAsia="Open Sans" w:hAnsi="Open Sans"/>
+                <w:color w:val="000000"/>
+                <w:sz w:val="18"/>
+                <w:szCs w:val="18"/>
+                <w:shd w:fill="auto" w:val="clear"/>
+                <w:rtl w:val="0"/>
+              </w:rPr>
+              <w:t xml:space="preserve">- 1 Stk Profilklebstoff (pro Abschlussprofil 1 Stk)</w:t>
+            </w:r>
+          </w:p>
+          <w:p>
+            <w:pPr>
+              <w:spacing w:after="0" w:before="0" w:line="278.00000000000006" w:lineRule="auto"/>
+              <w:ind w:left="0" w:right="314" w:firstLine="0"/>
+              <w:jc w:val="left"/>
+              <w:rPr>
+                <w:rFonts w:ascii="Open Sans" w:cs="Open Sans" w:eastAsia="Open Sans" w:hAnsi="Open Sans"/>
+                <w:color w:val="000000"/>
+                <w:sz w:val="18"/>
+                <w:szCs w:val="18"/>
+                <w:shd w:fill="auto" w:val="clear"/>
+              </w:rPr>
+            </w:pPr>
+            <w:r>
+              <w:rPr>
+                <w:rFonts w:ascii="Open Sans" w:cs="Open Sans" w:eastAsia="Open Sans" w:hAnsi="Open Sans"/>
+                <w:color w:val="000000"/>
+                <w:sz w:val="18"/>
+                <w:szCs w:val="18"/>
+                <w:shd w:fill="auto" w:val="clear"/>
+                <w:rtl w:val="0"/>
+              </w:rPr>
+              <w:t xml:space="preserve">- 1 Stk Duschsystem derby Thermostat m KB 250mm HB 3.2 3-fach edge u. Schl. verchr. VIG (verchromt)</w:t>
+            </w:r>
+          </w:p>
+          <w:p>
+            <w:pPr>
+              <w:spacing w:after="0" w:before="0" w:line="278.00000000000006" w:lineRule="auto"/>
+              <w:ind w:left="0" w:right="314" w:firstLine="0"/>
+              <w:jc w:val="left"/>
+              <w:rPr>
+                <w:rFonts w:ascii="Open Sans" w:cs="Open Sans" w:eastAsia="Open Sans" w:hAnsi="Open Sans"/>
+                <w:color w:val="000000"/>
+                <w:sz w:val="18"/>
+                <w:szCs w:val="18"/>
+                <w:shd w:fill="auto" w:val="clear"/>
+              </w:rPr>
+            </w:pPr>
+            <w:r>
+              <w:rPr>
+                <w:rFonts w:ascii="Open Sans" w:cs="Open Sans" w:eastAsia="Open Sans" w:hAnsi="Open Sans"/>
+                <w:color w:val="000000"/>
+                <w:sz w:val="18"/>
+                <w:szCs w:val="18"/>
+                <w:shd w:fill="auto" w:val="clear"/>
+                <w:rtl w:val="0"/>
+              </w:rPr>
+              <w:t xml:space="preserve">- 1 Stk Einhand-Waschtischbatterie derby plus mit Hebel offen m. Ablg. verchromt VIG.</w:t>
+            </w:r>
+          </w:p>
+          <w:p>
+            <w:pPr>
+              <w:spacing w:after="0" w:before="0" w:line="278.00000000000006" w:lineRule="auto"/>
+              <w:ind w:left="0" w:right="314" w:firstLine="0"/>
+              <w:jc w:val="left"/>
+              <w:rPr>
+                <w:rFonts w:ascii="Open Sans" w:cs="Open Sans" w:eastAsia="Open Sans" w:hAnsi="Open Sans"/>
+                <w:color w:val="000000"/>
+                <w:sz w:val="18"/>
+                <w:szCs w:val="18"/>
+                <w:shd w:fill="auto" w:val="clear"/>
+              </w:rPr>
+            </w:pPr>
+            <w:r>
+              <w:rPr>
+                <w:rFonts w:ascii="Open Sans" w:cs="Open Sans" w:eastAsia="Open Sans" w:hAnsi="Open Sans"/>
+                <w:color w:val="000000"/>
+                <w:sz w:val="18"/>
+                <w:szCs w:val="18"/>
+                <w:shd w:fill="auto" w:val="clear"/>
+                <w:rtl w:val="0"/>
+              </w:rPr>
+              <w:t xml:space="preserve">- 1 Stk Duschwanne 100 x 100 x 3 cm</w:t>
             </w:r>
           </w:p>
         </w:tc>
@@ -2143,6 +2327,488 @@
                 <w:shd w:fill="auto" w:val="clear"/>
               </w:rPr>
             </w:pPr>
+            <w:r>
+              <w:rPr>
+                <w:rtl w:val="0"/>
+              </w:rPr>
+            </w:r>
+          </w:p>
+        </w:tc>
+      </w:tr>
+      <w:tr>
+        <w:trPr>
+          <w:cantSplit w:val="0"/>
+          <w:trHeight w:val="1" w:hRule="atLeast"/>
+          <w:tblHeader w:val="0"/>
+        </w:trPr>
+        <w:tc>
+          <w:tcPr>
+            <w:tcBorders>
+              <w:top w:color="ffffff" w:space="0" w:sz="8" w:val="single"/>
+              <w:left w:color="ffffff" w:space="0" w:sz="8" w:val="single"/>
+              <w:bottom w:color="ffffff" w:space="0" w:sz="8" w:val="single"/>
+              <w:right w:color="ffffff" w:space="0" w:sz="8" w:val="single"/>
+            </w:tcBorders>
+            <w:shd w:fill="ffffff" w:val="clear"/>
+            <w:tcMar>
+              <w:left w:w="56.0" w:type="dxa"/>
+              <w:right w:w="56.0" w:type="dxa"/>
+            </w:tcMar>
+          </w:tcPr>
+          <w:p>
+            <w:pPr>
+              <w:spacing w:after="0" w:before="0" w:line="278.00000000000006" w:lineRule="auto"/>
+              <w:ind w:left="0" w:right="-26" w:firstLine="0"/>
+              <w:jc w:val="left"/>
+              <w:rPr>
+                <w:color w:val="000000"/>
+              </w:rPr>
+            </w:pPr>
+            <w:r>
+              <w:rPr>
+                <w:rFonts w:ascii="Open Sans" w:cs="Open Sans" w:eastAsia="Open Sans" w:hAnsi="Open Sans"/>
+                <w:color w:val="000000"/>
+                <w:sz w:val="20"/>
+                <w:szCs w:val="20"/>
+                <w:shd w:fill="auto" w:val="clear"/>
+                <w:rtl w:val="0"/>
+              </w:rPr>
+              <w:t xml:space="preserve">003</w:t>
+            </w:r>
+            <w:r>
+              <w:rPr>
+                <w:rtl w:val="0"/>
+              </w:rPr>
+            </w:r>
+          </w:p>
+        </w:tc>
+        <w:tc>
+          <w:tcPr>
+            <w:tcBorders>
+              <w:top w:color="ffffff" w:space="0" w:sz="8" w:val="single"/>
+              <w:left w:color="ffffff" w:space="0" w:sz="8" w:val="single"/>
+              <w:bottom w:color="ffffff" w:space="0" w:sz="8" w:val="single"/>
+              <w:right w:color="ffffff" w:space="0" w:sz="8" w:val="single"/>
+            </w:tcBorders>
+            <w:shd w:fill="ffffff" w:val="clear"/>
+            <w:tcMar>
+              <w:left w:w="56.0" w:type="dxa"/>
+              <w:right w:w="56.0" w:type="dxa"/>
+            </w:tcMar>
+          </w:tcPr>
+          <w:p>
+            <w:pPr>
+              <w:spacing w:after="0" w:before="0" w:line="278.00000000000006" w:lineRule="auto"/>
+              <w:ind w:left="0" w:right="314" w:firstLine="0"/>
+              <w:jc w:val="left"/>
+              <w:rPr>
+                <w:color w:val="000000"/>
+              </w:rPr>
+            </w:pPr>
+            <w:r>
+              <w:rPr>
+                <w:rFonts w:ascii="Open Sans" w:cs="Open Sans" w:eastAsia="Open Sans" w:hAnsi="Open Sans"/>
+                <w:color w:val="000000"/>
+                <w:sz w:val="20"/>
+                <w:szCs w:val="20"/>
+                <w:shd w:fill="auto" w:val="clear"/>
+                <w:rtl w:val="0"/>
+              </w:rPr>
+              <w:t xml:space="preserve">1 Stk</w:t>
+            </w:r>
+            <w:r>
+              <w:rPr>
+                <w:rtl w:val="0"/>
+              </w:rPr>
+            </w:r>
+          </w:p>
+        </w:tc>
+        <w:tc>
+          <w:tcPr>
+            <w:tcBorders>
+              <w:top w:color="ffffff" w:space="0" w:sz="8" w:val="single"/>
+              <w:left w:color="ffffff" w:space="0" w:sz="8" w:val="single"/>
+              <w:bottom w:color="ffffff" w:space="0" w:sz="8" w:val="single"/>
+              <w:right w:color="ffffff" w:space="0" w:sz="8" w:val="single"/>
+            </w:tcBorders>
+            <w:shd w:fill="ffffff" w:val="clear"/>
+            <w:tcMar>
+              <w:left w:w="56.0" w:type="dxa"/>
+              <w:right w:w="56.0" w:type="dxa"/>
+            </w:tcMar>
+          </w:tcPr>
+          <w:p>
+            <w:pPr>
+              <w:spacing w:after="0" w:before="0" w:line="278.00000000000006" w:lineRule="auto"/>
+              <w:ind w:left="0" w:right="314" w:firstLine="0"/>
+              <w:jc w:val="left"/>
+              <w:rPr>
+                <w:rFonts w:ascii="Open Sans" w:cs="Open Sans" w:eastAsia="Open Sans" w:hAnsi="Open Sans"/>
+                <w:b w:val="1"/>
+                <w:color w:val="000000"/>
+                <w:sz w:val="18"/>
+                <w:szCs w:val="18"/>
+                <w:shd w:fill="auto" w:val="clear"/>
+              </w:rPr>
+            </w:pPr>
+            <w:r>
+              <w:rPr>
+                <w:rFonts w:ascii="Open Sans" w:cs="Open Sans" w:eastAsia="Open Sans" w:hAnsi="Open Sans"/>
+                <w:b w:val="1"/>
+                <w:color w:val="000000"/>
+                <w:sz w:val="18"/>
+                <w:szCs w:val="18"/>
+                <w:shd w:fill="auto" w:val="clear"/>
+                <w:rtl w:val="0"/>
+              </w:rPr>
+              <w:t xml:space="preserve">Aktion: Haltegriff</w:t>
+            </w:r>
+          </w:p>
+          <w:p>
+            <w:pPr>
+              <w:spacing w:after="0" w:before="0" w:line="278.00000000000006" w:lineRule="auto"/>
+              <w:ind w:left="0" w:right="314" w:firstLine="0"/>
+              <w:jc w:val="left"/>
+              <w:rPr>
+                <w:color w:val="000000"/>
+                <w:sz w:val="18"/>
+                <w:szCs w:val="18"/>
+              </w:rPr>
+            </w:pPr>
+            <w:r>
+              <w:rPr>
+                <w:rFonts w:ascii="Open Sans" w:cs="Open Sans" w:eastAsia="Open Sans" w:hAnsi="Open Sans"/>
+                <w:color w:val="000000"/>
+                <w:sz w:val="18"/>
+                <w:szCs w:val="18"/>
+                <w:shd w:fill="auto" w:val="clear"/>
+                <w:rtl w:val="0"/>
+              </w:rPr>
+              <w:t xml:space="preserve">1 Haltegriff gratis im Wert von 175 € inkl. Lieferung und Montage</w:t>
+            </w:r>
+            <w:r>
+              <w:rPr>
+                <w:rtl w:val="0"/>
+              </w:rPr>
+            </w:r>
+          </w:p>
+        </w:tc>
+        <w:tc>
+          <w:tcPr>
+            <w:tcBorders>
+              <w:top w:color="ffffff" w:space="0" w:sz="8" w:val="single"/>
+              <w:left w:color="ffffff" w:space="0" w:sz="8" w:val="single"/>
+              <w:bottom w:color="ffffff" w:space="0" w:sz="8" w:val="single"/>
+              <w:right w:color="ffffff" w:space="0" w:sz="8" w:val="single"/>
+            </w:tcBorders>
+            <w:shd w:fill="ffffff" w:val="clear"/>
+            <w:tcMar>
+              <w:left w:w="56.0" w:type="dxa"/>
+              <w:right w:w="56.0" w:type="dxa"/>
+            </w:tcMar>
+          </w:tcPr>
+          <w:p>
+            <w:pPr>
+              <w:spacing w:after="0" w:before="0" w:line="278.00000000000006" w:lineRule="auto"/>
+              <w:ind w:left="0" w:right="314" w:firstLine="0"/>
+              <w:jc w:val="left"/>
+              <w:rPr>
+                <w:color w:val="000000"/>
+              </w:rPr>
+            </w:pPr>
+            <w:r>
+              <w:rPr>
+                <w:rFonts w:ascii="Open Sans" w:cs="Open Sans" w:eastAsia="Open Sans" w:hAnsi="Open Sans"/>
+                <w:color w:val="000000"/>
+                <w:sz w:val="20"/>
+                <w:szCs w:val="20"/>
+                <w:shd w:fill="auto" w:val="clear"/>
+                <w:rtl w:val="0"/>
+              </w:rPr>
+              <w:t xml:space="preserve">0,00 €</w:t>
+            </w:r>
+            <w:r>
+              <w:rPr>
+                <w:rtl w:val="0"/>
+              </w:rPr>
+            </w:r>
+          </w:p>
+        </w:tc>
+        <w:tc>
+          <w:tcPr>
+            <w:tcBorders>
+              <w:top w:color="ffffff" w:space="0" w:sz="8" w:val="single"/>
+              <w:left w:color="ffffff" w:space="0" w:sz="8" w:val="single"/>
+              <w:bottom w:color="ffffff" w:space="0" w:sz="8" w:val="single"/>
+              <w:right w:color="ffffff" w:space="0" w:sz="8" w:val="single"/>
+            </w:tcBorders>
+            <w:shd w:fill="ffffff" w:val="clear"/>
+            <w:tcMar>
+              <w:left w:w="56.0" w:type="dxa"/>
+              <w:right w:w="56.0" w:type="dxa"/>
+            </w:tcMar>
+          </w:tcPr>
+          <w:p>
+            <w:pPr>
+              <w:spacing w:after="0" w:before="0" w:line="278.00000000000006" w:lineRule="auto"/>
+              <w:ind w:left="0" w:right="314" w:firstLine="0"/>
+              <w:jc w:val="center"/>
+              <w:rPr>
+                <w:color w:val="000000"/>
+              </w:rPr>
+            </w:pPr>
+            <w:r>
+              <w:rPr>
+                <w:rFonts w:ascii="Open Sans" w:cs="Open Sans" w:eastAsia="Open Sans" w:hAnsi="Open Sans"/>
+                <w:color w:val="000000"/>
+                <w:sz w:val="20"/>
+                <w:szCs w:val="20"/>
+                <w:shd w:fill="auto" w:val="clear"/>
+                <w:rtl w:val="0"/>
+              </w:rPr>
+              <w:t xml:space="preserve">0,00 €</w:t>
+            </w:r>
+            <w:r>
+              <w:rPr>
+                <w:rtl w:val="0"/>
+              </w:rPr>
+            </w:r>
+          </w:p>
+        </w:tc>
+      </w:tr>
+      <w:tr>
+        <w:trPr>
+          <w:cantSplit w:val="0"/>
+          <w:trHeight w:val="1" w:hRule="atLeast"/>
+          <w:tblHeader w:val="0"/>
+        </w:trPr>
+        <w:tc>
+          <w:tcPr>
+            <w:tcBorders>
+              <w:top w:color="ffffff" w:space="0" w:sz="8" w:val="single"/>
+              <w:left w:color="ffffff" w:space="0" w:sz="8" w:val="single"/>
+              <w:bottom w:color="ffffff" w:space="0" w:sz="8" w:val="single"/>
+              <w:right w:color="ffffff" w:space="0" w:sz="8" w:val="single"/>
+            </w:tcBorders>
+            <w:shd w:fill="ffffff" w:val="clear"/>
+            <w:tcMar>
+              <w:left w:w="56.0" w:type="dxa"/>
+              <w:right w:w="56.0" w:type="dxa"/>
+            </w:tcMar>
+          </w:tcPr>
+          <w:p>
+            <w:pPr>
+              <w:spacing w:after="0" w:before="0" w:line="278.00000000000006" w:lineRule="auto"/>
+              <w:ind w:left="0" w:right="-26" w:firstLine="0"/>
+              <w:jc w:val="left"/>
+              <w:rPr>
+                <w:color w:val="000000"/>
+              </w:rPr>
+            </w:pPr>
+            <w:r>
+              <w:rPr>
+                <w:rFonts w:ascii="Open Sans" w:cs="Open Sans" w:eastAsia="Open Sans" w:hAnsi="Open Sans"/>
+                <w:color w:val="000000"/>
+                <w:sz w:val="20"/>
+                <w:szCs w:val="20"/>
+                <w:shd w:fill="auto" w:val="clear"/>
+                <w:rtl w:val="0"/>
+              </w:rPr>
+              <w:t xml:space="preserve">004</w:t>
+            </w:r>
+            <w:r>
+              <w:rPr>
+                <w:rtl w:val="0"/>
+              </w:rPr>
+            </w:r>
+          </w:p>
+        </w:tc>
+        <w:tc>
+          <w:tcPr>
+            <w:tcBorders>
+              <w:top w:color="ffffff" w:space="0" w:sz="8" w:val="single"/>
+              <w:left w:color="ffffff" w:space="0" w:sz="8" w:val="single"/>
+              <w:bottom w:color="ffffff" w:space="0" w:sz="8" w:val="single"/>
+              <w:right w:color="ffffff" w:space="0" w:sz="8" w:val="single"/>
+            </w:tcBorders>
+            <w:shd w:fill="ffffff" w:val="clear"/>
+            <w:tcMar>
+              <w:left w:w="56.0" w:type="dxa"/>
+              <w:right w:w="56.0" w:type="dxa"/>
+            </w:tcMar>
+          </w:tcPr>
+          <w:p>
+            <w:pPr>
+              <w:spacing w:after="0" w:before="0" w:line="278.00000000000006" w:lineRule="auto"/>
+              <w:ind w:left="0" w:right="314" w:firstLine="0"/>
+              <w:jc w:val="left"/>
+              <w:rPr>
+                <w:color w:val="000000"/>
+              </w:rPr>
+            </w:pPr>
+            <w:r>
+              <w:rPr>
+                <w:rFonts w:ascii="Open Sans" w:cs="Open Sans" w:eastAsia="Open Sans" w:hAnsi="Open Sans"/>
+                <w:color w:val="000000"/>
+                <w:sz w:val="20"/>
+                <w:szCs w:val="20"/>
+                <w:shd w:fill="auto" w:val="clear"/>
+                <w:rtl w:val="0"/>
+              </w:rPr>
+              <w:t xml:space="preserve">1 Stk</w:t>
+            </w:r>
+            <w:r>
+              <w:rPr>
+                <w:rtl w:val="0"/>
+              </w:rPr>
+            </w:r>
+          </w:p>
+        </w:tc>
+        <w:tc>
+          <w:tcPr>
+            <w:tcBorders>
+              <w:top w:color="ffffff" w:space="0" w:sz="8" w:val="single"/>
+              <w:left w:color="ffffff" w:space="0" w:sz="8" w:val="single"/>
+              <w:bottom w:color="ffffff" w:space="0" w:sz="8" w:val="single"/>
+              <w:right w:color="ffffff" w:space="0" w:sz="8" w:val="single"/>
+            </w:tcBorders>
+            <w:shd w:fill="ffffff" w:val="clear"/>
+            <w:tcMar>
+              <w:left w:w="56.0" w:type="dxa"/>
+              <w:right w:w="56.0" w:type="dxa"/>
+            </w:tcMar>
+          </w:tcPr>
+          <w:p>
+            <w:pPr>
+              <w:spacing w:after="0" w:before="0" w:line="278.00000000000006" w:lineRule="auto"/>
+              <w:ind w:left="0" w:right="314" w:firstLine="0"/>
+              <w:jc w:val="left"/>
+              <w:rPr>
+                <w:rFonts w:ascii="Open Sans" w:cs="Open Sans" w:eastAsia="Open Sans" w:hAnsi="Open Sans"/>
+                <w:b w:val="1"/>
+                <w:color w:val="000000"/>
+                <w:sz w:val="18"/>
+                <w:szCs w:val="18"/>
+                <w:shd w:fill="auto" w:val="clear"/>
+              </w:rPr>
+            </w:pPr>
+            <w:r>
+              <w:rPr>
+                <w:rFonts w:ascii="Open Sans" w:cs="Open Sans" w:eastAsia="Open Sans" w:hAnsi="Open Sans"/>
+                <w:b w:val="1"/>
+                <w:color w:val="000000"/>
+                <w:sz w:val="18"/>
+                <w:szCs w:val="18"/>
+                <w:shd w:fill="auto" w:val="clear"/>
+                <w:rtl w:val="0"/>
+              </w:rPr>
+              <w:t xml:space="preserve">Bestandkundenbonus:</w:t>
+            </w:r>
+          </w:p>
+          <w:p>
+            <w:pPr>
+              <w:spacing w:after="0" w:before="0" w:line="278.00000000000006" w:lineRule="auto"/>
+              <w:ind w:left="0" w:right="314" w:firstLine="0"/>
+              <w:jc w:val="left"/>
+              <w:rPr>
+                <w:color w:val="000000"/>
+                <w:sz w:val="18"/>
+                <w:szCs w:val="18"/>
+              </w:rPr>
+            </w:pPr>
+            <w:r>
+              <w:rPr>
+                <w:rFonts w:ascii="Open Sans" w:cs="Open Sans" w:eastAsia="Open Sans" w:hAnsi="Open Sans"/>
+                <w:color w:val="000000"/>
+                <w:sz w:val="18"/>
+                <w:szCs w:val="18"/>
+                <w:shd w:fill="auto" w:val="clear"/>
+                <w:rtl w:val="0"/>
+              </w:rPr>
+              <w:t xml:space="preserve">-- Rabatt von 300 € ab einem Gesamtwert von 3.000</w:t>
+            </w:r>
+            <w:r>
+              <w:rPr>
+                <w:rtl w:val="0"/>
+              </w:rPr>
+            </w:r>
+          </w:p>
+        </w:tc>
+        <w:tc>
+          <w:tcPr>
+            <w:tcBorders>
+              <w:top w:color="ffffff" w:space="0" w:sz="8" w:val="single"/>
+              <w:left w:color="ffffff" w:space="0" w:sz="8" w:val="single"/>
+              <w:bottom w:color="ffffff" w:space="0" w:sz="8" w:val="single"/>
+              <w:right w:color="ffffff" w:space="0" w:sz="8" w:val="single"/>
+            </w:tcBorders>
+            <w:shd w:fill="ffffff" w:val="clear"/>
+            <w:tcMar>
+              <w:left w:w="56.0" w:type="dxa"/>
+              <w:right w:w="56.0" w:type="dxa"/>
+            </w:tcMar>
+          </w:tcPr>
+          <w:p>
+            <w:pPr>
+              <w:spacing w:after="0" w:before="0" w:line="278.00000000000006" w:lineRule="auto"/>
+              <w:ind w:left="0" w:right="314" w:firstLine="0"/>
+              <w:jc w:val="left"/>
+              <w:rPr>
+                <w:color w:val="000000"/>
+              </w:rPr>
+            </w:pPr>
+            <w:r>
+              <w:rPr>
+                <w:rFonts w:ascii="Open Sans" w:cs="Open Sans" w:eastAsia="Open Sans" w:hAnsi="Open Sans"/>
+                <w:color w:val="000000"/>
+                <w:sz w:val="20"/>
+                <w:szCs w:val="20"/>
+                <w:shd w:fill="auto" w:val="clear"/>
+                <w:rtl w:val="0"/>
+              </w:rPr>
+              <w:t xml:space="preserve">-252,10 €</w:t>
+            </w:r>
+            <w:r>
+              <w:rPr>
+                <w:rtl w:val="0"/>
+              </w:rPr>
+            </w:r>
+          </w:p>
+        </w:tc>
+        <w:tc>
+          <w:tcPr>
+            <w:tcBorders>
+              <w:top w:color="ffffff" w:space="0" w:sz="8" w:val="single"/>
+              <w:left w:color="ffffff" w:space="0" w:sz="8" w:val="single"/>
+              <w:bottom w:color="ffffff" w:space="0" w:sz="8" w:val="single"/>
+              <w:right w:color="ffffff" w:space="0" w:sz="8" w:val="single"/>
+            </w:tcBorders>
+            <w:shd w:fill="ffffff" w:val="clear"/>
+            <w:tcMar>
+              <w:left w:w="56.0" w:type="dxa"/>
+              <w:right w:w="56.0" w:type="dxa"/>
+            </w:tcMar>
+          </w:tcPr>
+          <w:p>
+            <w:pPr>
+              <w:spacing w:after="0" w:before="0" w:line="278.00000000000006" w:lineRule="auto"/>
+              <w:ind w:left="0" w:right="314" w:firstLine="0"/>
+              <w:jc w:val="center"/>
+              <w:rPr>
+                <w:color w:val="000000"/>
+              </w:rPr>
+            </w:pPr>
+            <w:r>
+              <w:rPr>
+                <w:rFonts w:ascii="Open Sans" w:cs="Open Sans" w:eastAsia="Open Sans" w:hAnsi="Open Sans"/>
+                <w:color w:val="000000"/>
+                <w:sz w:val="20"/>
+                <w:szCs w:val="20"/>
+                <w:shd w:fill="auto" w:val="clear"/>
+                <w:rtl w:val="0"/>
+              </w:rPr>
+              <w:t xml:space="preserve">-252,10 €</w:t>
+            </w:r>
             <w:r>
               <w:rPr>
                 <w:rtl w:val="0"/>
@@ -2346,7 +3012,7 @@
                 <w:shd w:fill="auto" w:val="clear"/>
                 <w:rtl w:val="0"/>
               </w:rPr>
-              <w:t xml:space="preserve">4.383,30 €</w:t>
+              <w:t xml:space="preserve">2.604,04 €</w:t>
             </w:r>
             <w:r>
               <w:rPr>
@@ -2515,7 +3181,7 @@
                 <w:shd w:fill="auto" w:val="clear"/>
                 <w:rtl w:val="0"/>
               </w:rPr>
-              <w:t xml:space="preserve">832,83 €</w:t>
+              <w:t xml:space="preserve">494,77 €</w:t>
             </w:r>
             <w:r>
               <w:rPr>
@@ -2684,7 +3350,7 @@
                 <w:shd w:fill="auto" w:val="clear"/>
                 <w:rtl w:val="0"/>
               </w:rPr>
-              <w:t xml:space="preserve">5.216,13 €</w:t>
+              <w:t xml:space="preserve">3.098,81 €</w:t>
             </w:r>
             <w:r>
               <w:rPr>
@@ -2748,6 +3414,66 @@
           <w:rtl w:val="0"/>
         </w:rPr>
         <w:t xml:space="preserve">Es handelt sich hierbei um ein Festpreisangebot für die oben definierten Leistungen.</w:t>
+      </w:r>
+      <w:r>
+        <w:rPr>
+          <w:rtl w:val="0"/>
+        </w:rPr>
+      </w:r>
+    </w:p>
+    <w:p>
+      <w:pPr>
+        <w:spacing w:after="0" w:before="23" w:line="240" w:lineRule="auto"/>
+        <w:ind w:left="0" w:right="0" w:firstLine="0"/>
+        <w:jc w:val="left"/>
+        <w:rPr>
+          <w:rFonts w:ascii="Open Sans" w:cs="Open Sans" w:eastAsia="Open Sans" w:hAnsi="Open Sans"/>
+          <w:color w:val="000000"/>
+          <w:sz w:val="22"/>
+          <w:szCs w:val="22"/>
+          <w:shd w:fill="auto" w:val="clear"/>
+        </w:rPr>
+      </w:pPr>
+      <w:r>
+        <w:rPr>
+          <w:rtl w:val="0"/>
+        </w:rPr>
+      </w:r>
+    </w:p>
+    <w:p>
+      <w:pPr>
+        <w:spacing w:after="0" w:before="0" w:line="286" w:lineRule="auto"/>
+        <w:ind w:left="123" w:right="0" w:firstLine="0"/>
+        <w:jc w:val="left"/>
+        <w:rPr>
+          <w:rFonts w:ascii="Open Sans" w:cs="Open Sans" w:eastAsia="Open Sans" w:hAnsi="Open Sans"/>
+          <w:color w:val="000000"/>
+          <w:sz w:val="22"/>
+          <w:szCs w:val="22"/>
+          <w:shd w:fill="auto" w:val="clear"/>
+        </w:rPr>
+      </w:pPr>
+      <w:r>
+        <w:rPr>
+          <w:rFonts w:ascii="Open Sans SemiBold" w:cs="Open Sans SemiBold" w:eastAsia="Open Sans SemiBold" w:hAnsi="Open Sans SemiBold"/>
+          <w:color w:val="030303"/>
+          <w:sz w:val="22"/>
+          <w:szCs w:val="22"/>
+          <w:shd w:fill="auto" w:val="clear"/>
+          <w:rtl w:val="0"/>
+        </w:rPr>
+        <w:t xml:space="preserve">ACHTUNG:</w:t>
+      </w:r>
+      <w:r>
+        <w:rPr>
+          <w:rFonts w:ascii="Open Sans" w:cs="Open Sans" w:eastAsia="Open Sans" w:hAnsi="Open Sans"/>
+          <w:color w:val="030303"/>
+          <w:sz w:val="22"/>
+          <w:szCs w:val="22"/>
+          <w:shd w:fill="auto" w:val="clear"/>
+          <w:rtl w:val="0"/>
+        </w:rPr>
+        <w:t xml:space="preserve"> Ob eine ebenerdige Montage der Duschwanne möglich ist, kann erst nach dem Ausbau der bestehenden Wanne beurteilen werden. Sollten dabei zusätzliche oder weitere Leistungen erforderlich oder von Ihnen gewünscht sein, können zusätzliche Kosten entstehen.</w:t>
         <w:br w:type="textWrapping"/>
       </w:r>
       <w:r>
@@ -2818,6 +3544,74 @@
           <w:rtl w:val="0"/>
         </w:rPr>
         <w:t xml:space="preserve">abgerechnet. (Stundensatz-Facharbeiter: 69,50€ netto)</w:t>
+        <w:br w:type="textWrapping"/>
+        <w:br w:type="textWrapping"/>
+        <w:t xml:space="preserve">Der</w:t>
+      </w:r>
+      <w:r>
+        <w:rPr>
+          <w:rFonts w:ascii="Open Sans" w:cs="Open Sans" w:eastAsia="Open Sans" w:hAnsi="Open Sans"/>
+          <w:color w:val="030303"/>
+          <w:rtl w:val="0"/>
+        </w:rPr>
+        <w:t xml:space="preserve"> </w:t>
+      </w:r>
+      <w:r>
+        <w:rPr>
+          <w:rFonts w:ascii="Open Sans" w:cs="Open Sans" w:eastAsia="Open Sans" w:hAnsi="Open Sans"/>
+          <w:color w:val="030303"/>
+          <w:sz w:val="22"/>
+          <w:szCs w:val="22"/>
+          <w:shd w:fill="auto" w:val="clear"/>
+          <w:rtl w:val="0"/>
+        </w:rPr>
+        <w:t xml:space="preserve">Selbstkostenanteil beträgt </w:t>
+      </w:r>
+      <w:r>
+        <w:rPr>
+          <w:rFonts w:ascii="Open Sans" w:cs="Open Sans" w:eastAsia="Open Sans" w:hAnsi="Open Sans"/>
+          <w:b w:val="1"/>
+          <w:color w:val="030303"/>
+          <w:sz w:val="22"/>
+          <w:szCs w:val="22"/>
+          <w:shd w:fill="auto" w:val="clear"/>
+          <w:rtl w:val="0"/>
+        </w:rPr>
+        <w:t xml:space="preserve">0,00 €</w:t>
+      </w:r>
+      <w:r>
+        <w:rPr>
+          <w:rFonts w:ascii="Open Sans" w:cs="Open Sans" w:eastAsia="Open Sans" w:hAnsi="Open Sans"/>
+          <w:color w:val="030303"/>
+          <w:sz w:val="22"/>
+          <w:szCs w:val="22"/>
+          <w:shd w:fill="auto" w:val="clear"/>
+          <w:rtl w:val="0"/>
+        </w:rPr>
+        <w:t xml:space="preserve"> unter Berücksichtigung eines gewährten Zuschusses durch die Pflegekasse i.H.v. </w:t>
+      </w:r>
+      <w:r>
+        <w:rPr>
+          <w:rFonts w:ascii="Open Sans" w:cs="Open Sans" w:eastAsia="Open Sans" w:hAnsi="Open Sans"/>
+          <w:b w:val="1"/>
+          <w:color w:val="030303"/>
+          <w:sz w:val="22"/>
+          <w:szCs w:val="22"/>
+          <w:shd w:fill="auto" w:val="clear"/>
+          <w:rtl w:val="0"/>
+        </w:rPr>
+        <w:t xml:space="preserve">4.180,00 €</w:t>
+      </w:r>
+      <w:r>
+        <w:rPr>
+          <w:rFonts w:ascii="Open Sans" w:cs="Open Sans" w:eastAsia="Open Sans" w:hAnsi="Open Sans"/>
+          <w:color w:val="030303"/>
+          <w:sz w:val="22"/>
+          <w:szCs w:val="22"/>
+          <w:shd w:fill="auto" w:val="clear"/>
+          <w:rtl w:val="0"/>
+        </w:rPr>
+        <w:t xml:space="preserve">.</w:t>
       </w:r>
       <w:r>
         <w:rPr>

</xml_diff>

<commit_message>
Hinweis zu möglichen Zusatzkosten einblenden
</commit_message>
<xml_diff>
--- a/out-Angebot.docx
+++ b/out-Angebot.docx
@@ -129,7 +129,7 @@
                 <w:rFonts w:ascii="Open Sans" w:cs="Open Sans" w:eastAsia="Open Sans" w:hAnsi="Open Sans"/>
                 <w:rtl w:val="0"/>
               </w:rPr>
-              <w:t xml:space="preserve">Mikayla Rice</w:t>
+              <w:t xml:space="preserve">Stephen Rich</w:t>
             </w:r>
             <w:r>
               <w:rPr>
@@ -151,7 +151,7 @@
                 <w:rFonts w:ascii="Open Sans" w:cs="Open Sans" w:eastAsia="Open Sans" w:hAnsi="Open Sans"/>
                 <w:rtl w:val="0"/>
               </w:rPr>
-              <w:t xml:space="preserve">Aut cumque est quib,</w:t>
+              <w:t xml:space="preserve">Omnis quia iste Nam ,</w:t>
             </w:r>
             <w:r>
               <w:rPr>
@@ -175,7 +175,7 @@
                 <w:rFonts w:ascii="Open Sans" w:cs="Open Sans" w:eastAsia="Open Sans" w:hAnsi="Open Sans"/>
                 <w:rtl w:val="0"/>
               </w:rPr>
-              <w:t xml:space="preserve">Nostrud omnis fugit Nisi dolores quia es</w:t>
+              <w:t xml:space="preserve">Voluptate iste dolor Aliquid illum dolor</w:t>
             </w:r>
             <w:r>
               <w:rPr>
@@ -310,7 +310,7 @@
                 <w:rFonts w:ascii="Open Sans" w:cs="Open Sans" w:eastAsia="Open Sans" w:hAnsi="Open Sans"/>
                 <w:rtl w:val="0"/>
               </w:rPr>
-              <w:t xml:space="preserve">ANG2025-1029-145127</w:t>
+              <w:t xml:space="preserve">ANG2025-1030-113828</w:t>
             </w:r>
             <w:r>
               <w:rPr>
@@ -345,7 +345,7 @@
                 <w:rFonts w:ascii="Open Sans" w:cs="Open Sans" w:eastAsia="Open Sans" w:hAnsi="Open Sans"/>
                 <w:rtl w:val="0"/>
               </w:rPr>
-              <w:t xml:space="preserve">11.01.2018</w:t>
+              <w:t xml:space="preserve">07.12.2006</w:t>
             </w:r>
             <w:r>
               <w:rPr>
@@ -379,7 +379,7 @@
                 <w:rFonts w:ascii="Open Sans" w:cs="Open Sans" w:eastAsia="Open Sans" w:hAnsi="Open Sans"/>
                 <w:rtl w:val="0"/>
               </w:rPr>
-              <w:t xml:space="preserve">Kim Mullins</w:t>
+              <w:t xml:space="preserve">Colton Vincent</w:t>
             </w:r>
             <w:r>
               <w:rPr>
@@ -524,7 +524,7 @@
                 <w:rFonts w:ascii="Open Sans" w:cs="Open Sans" w:eastAsia="Open Sans" w:hAnsi="Open Sans"/>
                 <w:rtl w:val="0"/>
               </w:rPr>
-              <w:t xml:space="preserve">Jonas Bass</w:t>
+              <w:t xml:space="preserve">Orson Everett</w:t>
             </w:r>
             <w:r>
               <w:rPr>
@@ -578,7 +578,7 @@
           <w:shd w:fill="auto" w:val="clear"/>
           <w:rtl w:val="0"/>
         </w:rPr>
-        <w:t xml:space="preserve">  Ihr Angebot ANG2025-1029-145127</w:t>
+        <w:t xml:space="preserve">  Ihr Angebot ANG2025-1030-113828</w:t>
       </w:r>
     </w:p>
     <w:p>
@@ -603,7 +603,7 @@
           <w:shd w:fill="auto" w:val="clear"/>
           <w:rtl w:val="0"/>
         </w:rPr>
-        <w:t xml:space="preserve">  Sehr geehrte Frau Rice,</w:t>
+        <w:t xml:space="preserve">  Sehr geehrte Frau Rich,</w:t>
         <w:br w:type="textWrapping"/>
       </w:r>
     </w:p>
@@ -1075,7 +1075,7 @@
                 <w:shd w:fill="auto" w:val="clear"/>
                 <w:rtl w:val="0"/>
               </w:rPr>
-              <w:t xml:space="preserve">1.054,70 €</w:t>
+              <w:t xml:space="preserve">1.450,90 €</w:t>
             </w:r>
             <w:r>
               <w:rPr>
@@ -1116,7 +1116,7 @@
                 <w:shd w:fill="auto" w:val="clear"/>
                 <w:rtl w:val="0"/>
               </w:rPr>
-              <w:t xml:space="preserve">1.054,70 €</w:t>
+              <w:t xml:space="preserve">1.450,90 €</w:t>
             </w:r>
             <w:r>
               <w:rPr>
@@ -1241,17 +1241,6 @@
             </w:pPr>
             <w:r>
               <w:rPr>
-                <w:rFonts w:ascii="Open Sans" w:cs="Open Sans" w:eastAsia="Open Sans" w:hAnsi="Open Sans"/>
-                <w:color w:val="000000"/>
-                <w:sz w:val="18"/>
-                <w:szCs w:val="18"/>
-                <w:shd w:fill="auto" w:val="clear"/>
-                <w:rtl w:val="0"/>
-              </w:rPr>
-              <w:t xml:space="preserve">- Schließen der Fehlstellen</w:t>
-            </w:r>
-            <w:r>
-              <w:rPr>
                 <w:rtl w:val="0"/>
               </w:rPr>
             </w:r>
@@ -1263,20 +1252,20 @@
               <w:jc w:val="left"/>
               <w:rPr>
                 <w:color w:val="000000"/>
-                <w:sz w:val="18"/>
-                <w:szCs w:val="18"/>
-              </w:rPr>
-            </w:pPr>
-            <w:r>
-              <w:rPr>
-                <w:rFonts w:ascii="Open Sans" w:cs="Open Sans" w:eastAsia="Open Sans" w:hAnsi="Open Sans"/>
-                <w:color w:val="000000"/>
-                <w:sz w:val="18"/>
-                <w:szCs w:val="18"/>
-                <w:shd w:fill="auto" w:val="clear"/>
-                <w:rtl w:val="0"/>
-              </w:rPr>
-              <w:t xml:space="preserve">- Auswechseln des Duschsystems</w:t>
+                <w:sz w:val="20"/>
+                <w:szCs w:val="20"/>
+              </w:rPr>
+            </w:pPr>
+            <w:r>
+              <w:rPr>
+                <w:rFonts w:ascii="Open Sans" w:cs="Open Sans" w:eastAsia="Open Sans" w:hAnsi="Open Sans"/>
+                <w:color w:val="000000"/>
+                <w:sz w:val="20"/>
+                <w:szCs w:val="20"/>
+                <w:shd w:fill="auto" w:val="clear"/>
+                <w:rtl w:val="0"/>
+              </w:rPr>
+              <w:t xml:space="preserve">Enthält je Einheit</w:t>
             </w:r>
             <w:r>
               <w:rPr>
@@ -1304,7 +1293,7 @@
                 <w:shd w:fill="auto" w:val="clear"/>
                 <w:rtl w:val="0"/>
               </w:rPr>
-              <w:t xml:space="preserve">- Einbau einer einhand-Waschtischbatterie</w:t>
+              <w:t xml:space="preserve">- 1,00 Stk Fahrzeugbereitstellung</w:t>
             </w:r>
             <w:r>
               <w:rPr>
@@ -1332,7 +1321,7 @@
                 <w:shd w:fill="auto" w:val="clear"/>
                 <w:rtl w:val="0"/>
               </w:rPr>
-              <w:t xml:space="preserve">- Entfernen und Entsorgen der Badewanne inkl. Befliesung</w:t>
+              <w:t xml:space="preserve">- 1,00 Stk Bereitstellung und Vorhaltung von Maschinen &amp; Werkzeugen</w:t>
             </w:r>
             <w:r>
               <w:rPr>
@@ -1360,7 +1349,7 @@
                 <w:shd w:fill="auto" w:val="clear"/>
                 <w:rtl w:val="0"/>
               </w:rPr>
-              <w:t xml:space="preserve">- Entfernen und Entsorgen der Duschabtrennung</w:t>
+              <w:t xml:space="preserve">- 1,00 Stk Beräumung der Baustelle</w:t>
             </w:r>
             <w:r>
               <w:rPr>
@@ -1388,192 +1377,7 @@
                 <w:shd w:fill="auto" w:val="clear"/>
                 <w:rtl w:val="0"/>
               </w:rPr>
-              <w:t xml:space="preserve">- Einbau der Duschwanne</w:t>
-            </w:r>
-            <w:r>
-              <w:rPr>
-                <w:rtl w:val="0"/>
-              </w:rPr>
-            </w:r>
-          </w:p>
-          <w:p>
-            <w:pPr>
-              <w:spacing w:after="0" w:before="0" w:line="278.00000000000006" w:lineRule="auto"/>
-              <w:ind w:left="0" w:right="314" w:firstLine="0"/>
-              <w:jc w:val="left"/>
-              <w:rPr>
-                <w:color w:val="000000"/>
-                <w:sz w:val="18"/>
-                <w:szCs w:val="18"/>
-              </w:rPr>
-            </w:pPr>
-            <w:r>
-              <w:rPr>
-                <w:rFonts w:ascii="Open Sans" w:cs="Open Sans" w:eastAsia="Open Sans" w:hAnsi="Open Sans"/>
-                <w:color w:val="000000"/>
-                <w:sz w:val="18"/>
-                <w:szCs w:val="18"/>
-                <w:shd w:fill="auto" w:val="clear"/>
-                <w:rtl w:val="0"/>
-              </w:rPr>
-              <w:t xml:space="preserve">- Einbau der Duschabtrennung</w:t>
-            </w:r>
-            <w:r>
-              <w:rPr>
-                <w:rtl w:val="0"/>
-              </w:rPr>
-            </w:r>
-          </w:p>
-          <w:p>
-            <w:pPr>
-              <w:spacing w:after="0" w:before="0" w:line="278.00000000000006" w:lineRule="auto"/>
-              <w:ind w:left="0" w:right="314" w:firstLine="0"/>
-              <w:jc w:val="left"/>
-              <w:rPr>
-                <w:color w:val="000000"/>
-                <w:sz w:val="18"/>
-                <w:szCs w:val="18"/>
-              </w:rPr>
-            </w:pPr>
-            <w:r>
-              <w:rPr>
-                <w:rtl w:val="0"/>
-              </w:rPr>
-            </w:r>
-          </w:p>
-          <w:p>
-            <w:pPr>
-              <w:spacing w:after="0" w:before="0" w:line="278.00000000000006" w:lineRule="auto"/>
-              <w:ind w:left="0" w:right="314" w:firstLine="0"/>
-              <w:jc w:val="left"/>
-              <w:rPr>
-                <w:color w:val="000000"/>
-                <w:sz w:val="20"/>
-                <w:szCs w:val="20"/>
-              </w:rPr>
-            </w:pPr>
-            <w:r>
-              <w:rPr>
-                <w:rFonts w:ascii="Open Sans" w:cs="Open Sans" w:eastAsia="Open Sans" w:hAnsi="Open Sans"/>
-                <w:color w:val="000000"/>
-                <w:sz w:val="20"/>
-                <w:szCs w:val="20"/>
-                <w:shd w:fill="auto" w:val="clear"/>
-                <w:rtl w:val="0"/>
-              </w:rPr>
-              <w:t xml:space="preserve">Enthält je Einheit</w:t>
-            </w:r>
-            <w:r>
-              <w:rPr>
-                <w:rtl w:val="0"/>
-              </w:rPr>
-            </w:r>
-          </w:p>
-          <w:p>
-            <w:pPr>
-              <w:spacing w:after="0" w:before="0" w:line="278.00000000000006" w:lineRule="auto"/>
-              <w:ind w:left="0" w:right="314" w:firstLine="0"/>
-              <w:jc w:val="left"/>
-              <w:rPr>
-                <w:color w:val="000000"/>
-                <w:sz w:val="18"/>
-                <w:szCs w:val="18"/>
-              </w:rPr>
-            </w:pPr>
-            <w:r>
-              <w:rPr>
-                <w:rFonts w:ascii="Open Sans" w:cs="Open Sans" w:eastAsia="Open Sans" w:hAnsi="Open Sans"/>
-                <w:color w:val="000000"/>
-                <w:sz w:val="18"/>
-                <w:szCs w:val="18"/>
-                <w:shd w:fill="auto" w:val="clear"/>
-                <w:rtl w:val="0"/>
-              </w:rPr>
-              <w:t xml:space="preserve">- 1,00 Stk Fahrzeugbereitstellung</w:t>
-            </w:r>
-            <w:r>
-              <w:rPr>
-                <w:rtl w:val="0"/>
-              </w:rPr>
-            </w:r>
-          </w:p>
-          <w:p>
-            <w:pPr>
-              <w:spacing w:after="0" w:before="0" w:line="278.00000000000006" w:lineRule="auto"/>
-              <w:ind w:left="0" w:right="314" w:firstLine="0"/>
-              <w:jc w:val="left"/>
-              <w:rPr>
-                <w:color w:val="000000"/>
-                <w:sz w:val="18"/>
-                <w:szCs w:val="18"/>
-              </w:rPr>
-            </w:pPr>
-            <w:r>
-              <w:rPr>
-                <w:rFonts w:ascii="Open Sans" w:cs="Open Sans" w:eastAsia="Open Sans" w:hAnsi="Open Sans"/>
-                <w:color w:val="000000"/>
-                <w:sz w:val="18"/>
-                <w:szCs w:val="18"/>
-                <w:shd w:fill="auto" w:val="clear"/>
-                <w:rtl w:val="0"/>
-              </w:rPr>
-              <w:t xml:space="preserve">- 1,00 Stk Bereitstellung und Vorhaltung von Maschinen &amp; Werkzeugen</w:t>
-            </w:r>
-            <w:r>
-              <w:rPr>
-                <w:rtl w:val="0"/>
-              </w:rPr>
-            </w:r>
-          </w:p>
-          <w:p>
-            <w:pPr>
-              <w:spacing w:after="0" w:before="0" w:line="278.00000000000006" w:lineRule="auto"/>
-              <w:ind w:left="0" w:right="314" w:firstLine="0"/>
-              <w:jc w:val="left"/>
-              <w:rPr>
-                <w:color w:val="000000"/>
-                <w:sz w:val="18"/>
-                <w:szCs w:val="18"/>
-              </w:rPr>
-            </w:pPr>
-            <w:r>
-              <w:rPr>
-                <w:rFonts w:ascii="Open Sans" w:cs="Open Sans" w:eastAsia="Open Sans" w:hAnsi="Open Sans"/>
-                <w:color w:val="000000"/>
-                <w:sz w:val="18"/>
-                <w:szCs w:val="18"/>
-                <w:shd w:fill="auto" w:val="clear"/>
-                <w:rtl w:val="0"/>
-              </w:rPr>
-              <w:t xml:space="preserve">- 1,00 Stk Beräumung der Baustelle</w:t>
-            </w:r>
-            <w:r>
-              <w:rPr>
-                <w:rtl w:val="0"/>
-              </w:rPr>
-            </w:r>
-          </w:p>
-          <w:p>
-            <w:pPr>
-              <w:spacing w:after="0" w:before="0" w:line="278.00000000000006" w:lineRule="auto"/>
-              <w:ind w:left="0" w:right="314" w:firstLine="0"/>
-              <w:jc w:val="left"/>
-              <w:rPr>
-                <w:color w:val="000000"/>
-                <w:sz w:val="18"/>
-                <w:szCs w:val="18"/>
-              </w:rPr>
-            </w:pPr>
-            <w:r>
-              <w:rPr>
-                <w:rFonts w:ascii="Open Sans" w:cs="Open Sans" w:eastAsia="Open Sans" w:hAnsi="Open Sans"/>
-                <w:color w:val="000000"/>
-                <w:sz w:val="18"/>
-                <w:szCs w:val="18"/>
-                <w:shd w:fill="auto" w:val="clear"/>
-                <w:rtl w:val="0"/>
-              </w:rPr>
-              <w:t xml:space="preserve">- 82 km Kilometerpauschale</w:t>
+              <w:t xml:space="preserve">- 134 km Kilometerpauschale</w:t>
             </w:r>
             <w:r>
               <w:rPr>
@@ -1859,7 +1663,7 @@
                 <w:shd w:fill="auto" w:val="clear"/>
                 <w:rtl w:val="0"/>
               </w:rPr>
-              <w:t xml:space="preserve">1.244,14 €</w:t>
+              <w:t xml:space="preserve">321,98 €</w:t>
             </w:r>
             <w:r>
               <w:rPr>
@@ -1891,7 +1695,7 @@
               <w:rPr>
                 <w:rtl w:val="0"/>
               </w:rPr>
-              <w:t xml:space="preserve">1.244,14 €</w:t>
+              <w:t xml:space="preserve">321,98 €</w:t>
             </w:r>
             <w:r>
               <w:rPr>
@@ -2061,7 +1865,7 @@
                 <w:shd w:fill="auto" w:val="clear"/>
                 <w:rtl w:val="0"/>
               </w:rPr>
-              <w:t xml:space="preserve">- 1 Stk Stelzlager höhenverstellar Set</w:t>
+              <w:t xml:space="preserve">- 1 Stk Kleinmaterial groß</w:t>
             </w:r>
           </w:p>
           <w:p>
@@ -2086,7 +1890,7 @@
                 <w:shd w:fill="auto" w:val="clear"/>
                 <w:rtl w:val="0"/>
               </w:rPr>
-              <w:t xml:space="preserve">- 1 Stk Wandverkleidung 3.0 Alu 997×2550 mm — Farbe: Struktur weiß</w:t>
+              <w:t xml:space="preserve">- 1 Stk Stelzlager höhenverstellar Set</w:t>
             </w:r>
           </w:p>
           <w:p>
@@ -2136,7 +1940,7 @@
                 <w:shd w:fill="auto" w:val="clear"/>
                 <w:rtl w:val="0"/>
               </w:rPr>
-              <w:t xml:space="preserve">- 2 Stk Wandverkleidungsklebstoff 3.0/4.0</w:t>
+              <w:t xml:space="preserve">- 1 Pkg Flächenkleber (Wandverkleidung)</w:t>
             </w:r>
           </w:p>
           <w:p>
@@ -2187,81 +1991,6 @@
                 <w:rtl w:val="0"/>
               </w:rPr>
               <w:t xml:space="preserve">- 1 Stk Profilklebstoff (pro Abschlussprofil 1 Stk)</w:t>
-            </w:r>
-          </w:p>
-          <w:p>
-            <w:pPr>
-              <w:spacing w:after="0" w:before="0" w:line="278.00000000000006" w:lineRule="auto"/>
-              <w:ind w:left="0" w:right="314" w:firstLine="0"/>
-              <w:jc w:val="left"/>
-              <w:rPr>
-                <w:rFonts w:ascii="Open Sans" w:cs="Open Sans" w:eastAsia="Open Sans" w:hAnsi="Open Sans"/>
-                <w:color w:val="000000"/>
-                <w:sz w:val="18"/>
-                <w:szCs w:val="18"/>
-                <w:shd w:fill="auto" w:val="clear"/>
-              </w:rPr>
-            </w:pPr>
-            <w:r>
-              <w:rPr>
-                <w:rFonts w:ascii="Open Sans" w:cs="Open Sans" w:eastAsia="Open Sans" w:hAnsi="Open Sans"/>
-                <w:color w:val="000000"/>
-                <w:sz w:val="18"/>
-                <w:szCs w:val="18"/>
-                <w:shd w:fill="auto" w:val="clear"/>
-                <w:rtl w:val="0"/>
-              </w:rPr>
-              <w:t xml:space="preserve">- 1 Stk Duschsystem derby Thermostat m KB 250mm HB 3.2 3-fach edge u. Schl. verchr. VIG (verchromt)</w:t>
-            </w:r>
-          </w:p>
-          <w:p>
-            <w:pPr>
-              <w:spacing w:after="0" w:before="0" w:line="278.00000000000006" w:lineRule="auto"/>
-              <w:ind w:left="0" w:right="314" w:firstLine="0"/>
-              <w:jc w:val="left"/>
-              <w:rPr>
-                <w:rFonts w:ascii="Open Sans" w:cs="Open Sans" w:eastAsia="Open Sans" w:hAnsi="Open Sans"/>
-                <w:color w:val="000000"/>
-                <w:sz w:val="18"/>
-                <w:szCs w:val="18"/>
-                <w:shd w:fill="auto" w:val="clear"/>
-              </w:rPr>
-            </w:pPr>
-            <w:r>
-              <w:rPr>
-                <w:rFonts w:ascii="Open Sans" w:cs="Open Sans" w:eastAsia="Open Sans" w:hAnsi="Open Sans"/>
-                <w:color w:val="000000"/>
-                <w:sz w:val="18"/>
-                <w:szCs w:val="18"/>
-                <w:shd w:fill="auto" w:val="clear"/>
-                <w:rtl w:val="0"/>
-              </w:rPr>
-              <w:t xml:space="preserve">- 1 Stk Einhand-Waschtischbatterie derby plus mit Hebel offen m. Ablg. verchromt VIG.</w:t>
-            </w:r>
-          </w:p>
-          <w:p>
-            <w:pPr>
-              <w:spacing w:after="0" w:before="0" w:line="278.00000000000006" w:lineRule="auto"/>
-              <w:ind w:left="0" w:right="314" w:firstLine="0"/>
-              <w:jc w:val="left"/>
-              <w:rPr>
-                <w:rFonts w:ascii="Open Sans" w:cs="Open Sans" w:eastAsia="Open Sans" w:hAnsi="Open Sans"/>
-                <w:color w:val="000000"/>
-                <w:sz w:val="18"/>
-                <w:szCs w:val="18"/>
-                <w:shd w:fill="auto" w:val="clear"/>
-              </w:rPr>
-            </w:pPr>
-            <w:r>
-              <w:rPr>
-                <w:rFonts w:ascii="Open Sans" w:cs="Open Sans" w:eastAsia="Open Sans" w:hAnsi="Open Sans"/>
-                <w:color w:val="000000"/>
-                <w:sz w:val="18"/>
-                <w:szCs w:val="18"/>
-                <w:shd w:fill="auto" w:val="clear"/>
-                <w:rtl w:val="0"/>
-              </w:rPr>
-              <w:t xml:space="preserve">- 1 Stk Duschwanne 100 x 100 x 3 cm</w:t>
             </w:r>
           </w:p>
         </w:tc>
@@ -2327,488 +2056,6 @@
                 <w:shd w:fill="auto" w:val="clear"/>
               </w:rPr>
             </w:pPr>
-            <w:r>
-              <w:rPr>
-                <w:rtl w:val="0"/>
-              </w:rPr>
-            </w:r>
-          </w:p>
-        </w:tc>
-      </w:tr>
-      <w:tr>
-        <w:trPr>
-          <w:cantSplit w:val="0"/>
-          <w:trHeight w:val="1" w:hRule="atLeast"/>
-          <w:tblHeader w:val="0"/>
-        </w:trPr>
-        <w:tc>
-          <w:tcPr>
-            <w:tcBorders>
-              <w:top w:color="ffffff" w:space="0" w:sz="8" w:val="single"/>
-              <w:left w:color="ffffff" w:space="0" w:sz="8" w:val="single"/>
-              <w:bottom w:color="ffffff" w:space="0" w:sz="8" w:val="single"/>
-              <w:right w:color="ffffff" w:space="0" w:sz="8" w:val="single"/>
-            </w:tcBorders>
-            <w:shd w:fill="ffffff" w:val="clear"/>
-            <w:tcMar>
-              <w:left w:w="56.0" w:type="dxa"/>
-              <w:right w:w="56.0" w:type="dxa"/>
-            </w:tcMar>
-          </w:tcPr>
-          <w:p>
-            <w:pPr>
-              <w:spacing w:after="0" w:before="0" w:line="278.00000000000006" w:lineRule="auto"/>
-              <w:ind w:left="0" w:right="-26" w:firstLine="0"/>
-              <w:jc w:val="left"/>
-              <w:rPr>
-                <w:color w:val="000000"/>
-              </w:rPr>
-            </w:pPr>
-            <w:r>
-              <w:rPr>
-                <w:rFonts w:ascii="Open Sans" w:cs="Open Sans" w:eastAsia="Open Sans" w:hAnsi="Open Sans"/>
-                <w:color w:val="000000"/>
-                <w:sz w:val="20"/>
-                <w:szCs w:val="20"/>
-                <w:shd w:fill="auto" w:val="clear"/>
-                <w:rtl w:val="0"/>
-              </w:rPr>
-              <w:t xml:space="preserve">003</w:t>
-            </w:r>
-            <w:r>
-              <w:rPr>
-                <w:rtl w:val="0"/>
-              </w:rPr>
-            </w:r>
-          </w:p>
-        </w:tc>
-        <w:tc>
-          <w:tcPr>
-            <w:tcBorders>
-              <w:top w:color="ffffff" w:space="0" w:sz="8" w:val="single"/>
-              <w:left w:color="ffffff" w:space="0" w:sz="8" w:val="single"/>
-              <w:bottom w:color="ffffff" w:space="0" w:sz="8" w:val="single"/>
-              <w:right w:color="ffffff" w:space="0" w:sz="8" w:val="single"/>
-            </w:tcBorders>
-            <w:shd w:fill="ffffff" w:val="clear"/>
-            <w:tcMar>
-              <w:left w:w="56.0" w:type="dxa"/>
-              <w:right w:w="56.0" w:type="dxa"/>
-            </w:tcMar>
-          </w:tcPr>
-          <w:p>
-            <w:pPr>
-              <w:spacing w:after="0" w:before="0" w:line="278.00000000000006" w:lineRule="auto"/>
-              <w:ind w:left="0" w:right="314" w:firstLine="0"/>
-              <w:jc w:val="left"/>
-              <w:rPr>
-                <w:color w:val="000000"/>
-              </w:rPr>
-            </w:pPr>
-            <w:r>
-              <w:rPr>
-                <w:rFonts w:ascii="Open Sans" w:cs="Open Sans" w:eastAsia="Open Sans" w:hAnsi="Open Sans"/>
-                <w:color w:val="000000"/>
-                <w:sz w:val="20"/>
-                <w:szCs w:val="20"/>
-                <w:shd w:fill="auto" w:val="clear"/>
-                <w:rtl w:val="0"/>
-              </w:rPr>
-              <w:t xml:space="preserve">1 Stk</w:t>
-            </w:r>
-            <w:r>
-              <w:rPr>
-                <w:rtl w:val="0"/>
-              </w:rPr>
-            </w:r>
-          </w:p>
-        </w:tc>
-        <w:tc>
-          <w:tcPr>
-            <w:tcBorders>
-              <w:top w:color="ffffff" w:space="0" w:sz="8" w:val="single"/>
-              <w:left w:color="ffffff" w:space="0" w:sz="8" w:val="single"/>
-              <w:bottom w:color="ffffff" w:space="0" w:sz="8" w:val="single"/>
-              <w:right w:color="ffffff" w:space="0" w:sz="8" w:val="single"/>
-            </w:tcBorders>
-            <w:shd w:fill="ffffff" w:val="clear"/>
-            <w:tcMar>
-              <w:left w:w="56.0" w:type="dxa"/>
-              <w:right w:w="56.0" w:type="dxa"/>
-            </w:tcMar>
-          </w:tcPr>
-          <w:p>
-            <w:pPr>
-              <w:spacing w:after="0" w:before="0" w:line="278.00000000000006" w:lineRule="auto"/>
-              <w:ind w:left="0" w:right="314" w:firstLine="0"/>
-              <w:jc w:val="left"/>
-              <w:rPr>
-                <w:rFonts w:ascii="Open Sans" w:cs="Open Sans" w:eastAsia="Open Sans" w:hAnsi="Open Sans"/>
-                <w:b w:val="1"/>
-                <w:color w:val="000000"/>
-                <w:sz w:val="18"/>
-                <w:szCs w:val="18"/>
-                <w:shd w:fill="auto" w:val="clear"/>
-              </w:rPr>
-            </w:pPr>
-            <w:r>
-              <w:rPr>
-                <w:rFonts w:ascii="Open Sans" w:cs="Open Sans" w:eastAsia="Open Sans" w:hAnsi="Open Sans"/>
-                <w:b w:val="1"/>
-                <w:color w:val="000000"/>
-                <w:sz w:val="18"/>
-                <w:szCs w:val="18"/>
-                <w:shd w:fill="auto" w:val="clear"/>
-                <w:rtl w:val="0"/>
-              </w:rPr>
-              <w:t xml:space="preserve">Aktion: Haltegriff</w:t>
-            </w:r>
-          </w:p>
-          <w:p>
-            <w:pPr>
-              <w:spacing w:after="0" w:before="0" w:line="278.00000000000006" w:lineRule="auto"/>
-              <w:ind w:left="0" w:right="314" w:firstLine="0"/>
-              <w:jc w:val="left"/>
-              <w:rPr>
-                <w:color w:val="000000"/>
-                <w:sz w:val="18"/>
-                <w:szCs w:val="18"/>
-              </w:rPr>
-            </w:pPr>
-            <w:r>
-              <w:rPr>
-                <w:rFonts w:ascii="Open Sans" w:cs="Open Sans" w:eastAsia="Open Sans" w:hAnsi="Open Sans"/>
-                <w:color w:val="000000"/>
-                <w:sz w:val="18"/>
-                <w:szCs w:val="18"/>
-                <w:shd w:fill="auto" w:val="clear"/>
-                <w:rtl w:val="0"/>
-              </w:rPr>
-              <w:t xml:space="preserve">1 Haltegriff gratis im Wert von 175 € inkl. Lieferung und Montage</w:t>
-            </w:r>
-            <w:r>
-              <w:rPr>
-                <w:rtl w:val="0"/>
-              </w:rPr>
-            </w:r>
-          </w:p>
-        </w:tc>
-        <w:tc>
-          <w:tcPr>
-            <w:tcBorders>
-              <w:top w:color="ffffff" w:space="0" w:sz="8" w:val="single"/>
-              <w:left w:color="ffffff" w:space="0" w:sz="8" w:val="single"/>
-              <w:bottom w:color="ffffff" w:space="0" w:sz="8" w:val="single"/>
-              <w:right w:color="ffffff" w:space="0" w:sz="8" w:val="single"/>
-            </w:tcBorders>
-            <w:shd w:fill="ffffff" w:val="clear"/>
-            <w:tcMar>
-              <w:left w:w="56.0" w:type="dxa"/>
-              <w:right w:w="56.0" w:type="dxa"/>
-            </w:tcMar>
-          </w:tcPr>
-          <w:p>
-            <w:pPr>
-              <w:spacing w:after="0" w:before="0" w:line="278.00000000000006" w:lineRule="auto"/>
-              <w:ind w:left="0" w:right="314" w:firstLine="0"/>
-              <w:jc w:val="left"/>
-              <w:rPr>
-                <w:color w:val="000000"/>
-              </w:rPr>
-            </w:pPr>
-            <w:r>
-              <w:rPr>
-                <w:rFonts w:ascii="Open Sans" w:cs="Open Sans" w:eastAsia="Open Sans" w:hAnsi="Open Sans"/>
-                <w:color w:val="000000"/>
-                <w:sz w:val="20"/>
-                <w:szCs w:val="20"/>
-                <w:shd w:fill="auto" w:val="clear"/>
-                <w:rtl w:val="0"/>
-              </w:rPr>
-              <w:t xml:space="preserve">0,00 €</w:t>
-            </w:r>
-            <w:r>
-              <w:rPr>
-                <w:rtl w:val="0"/>
-              </w:rPr>
-            </w:r>
-          </w:p>
-        </w:tc>
-        <w:tc>
-          <w:tcPr>
-            <w:tcBorders>
-              <w:top w:color="ffffff" w:space="0" w:sz="8" w:val="single"/>
-              <w:left w:color="ffffff" w:space="0" w:sz="8" w:val="single"/>
-              <w:bottom w:color="ffffff" w:space="0" w:sz="8" w:val="single"/>
-              <w:right w:color="ffffff" w:space="0" w:sz="8" w:val="single"/>
-            </w:tcBorders>
-            <w:shd w:fill="ffffff" w:val="clear"/>
-            <w:tcMar>
-              <w:left w:w="56.0" w:type="dxa"/>
-              <w:right w:w="56.0" w:type="dxa"/>
-            </w:tcMar>
-          </w:tcPr>
-          <w:p>
-            <w:pPr>
-              <w:spacing w:after="0" w:before="0" w:line="278.00000000000006" w:lineRule="auto"/>
-              <w:ind w:left="0" w:right="314" w:firstLine="0"/>
-              <w:jc w:val="center"/>
-              <w:rPr>
-                <w:color w:val="000000"/>
-              </w:rPr>
-            </w:pPr>
-            <w:r>
-              <w:rPr>
-                <w:rFonts w:ascii="Open Sans" w:cs="Open Sans" w:eastAsia="Open Sans" w:hAnsi="Open Sans"/>
-                <w:color w:val="000000"/>
-                <w:sz w:val="20"/>
-                <w:szCs w:val="20"/>
-                <w:shd w:fill="auto" w:val="clear"/>
-                <w:rtl w:val="0"/>
-              </w:rPr>
-              <w:t xml:space="preserve">0,00 €</w:t>
-            </w:r>
-            <w:r>
-              <w:rPr>
-                <w:rtl w:val="0"/>
-              </w:rPr>
-            </w:r>
-          </w:p>
-        </w:tc>
-      </w:tr>
-      <w:tr>
-        <w:trPr>
-          <w:cantSplit w:val="0"/>
-          <w:trHeight w:val="1" w:hRule="atLeast"/>
-          <w:tblHeader w:val="0"/>
-        </w:trPr>
-        <w:tc>
-          <w:tcPr>
-            <w:tcBorders>
-              <w:top w:color="ffffff" w:space="0" w:sz="8" w:val="single"/>
-              <w:left w:color="ffffff" w:space="0" w:sz="8" w:val="single"/>
-              <w:bottom w:color="ffffff" w:space="0" w:sz="8" w:val="single"/>
-              <w:right w:color="ffffff" w:space="0" w:sz="8" w:val="single"/>
-            </w:tcBorders>
-            <w:shd w:fill="ffffff" w:val="clear"/>
-            <w:tcMar>
-              <w:left w:w="56.0" w:type="dxa"/>
-              <w:right w:w="56.0" w:type="dxa"/>
-            </w:tcMar>
-          </w:tcPr>
-          <w:p>
-            <w:pPr>
-              <w:spacing w:after="0" w:before="0" w:line="278.00000000000006" w:lineRule="auto"/>
-              <w:ind w:left="0" w:right="-26" w:firstLine="0"/>
-              <w:jc w:val="left"/>
-              <w:rPr>
-                <w:color w:val="000000"/>
-              </w:rPr>
-            </w:pPr>
-            <w:r>
-              <w:rPr>
-                <w:rFonts w:ascii="Open Sans" w:cs="Open Sans" w:eastAsia="Open Sans" w:hAnsi="Open Sans"/>
-                <w:color w:val="000000"/>
-                <w:sz w:val="20"/>
-                <w:szCs w:val="20"/>
-                <w:shd w:fill="auto" w:val="clear"/>
-                <w:rtl w:val="0"/>
-              </w:rPr>
-              <w:t xml:space="preserve">004</w:t>
-            </w:r>
-            <w:r>
-              <w:rPr>
-                <w:rtl w:val="0"/>
-              </w:rPr>
-            </w:r>
-          </w:p>
-        </w:tc>
-        <w:tc>
-          <w:tcPr>
-            <w:tcBorders>
-              <w:top w:color="ffffff" w:space="0" w:sz="8" w:val="single"/>
-              <w:left w:color="ffffff" w:space="0" w:sz="8" w:val="single"/>
-              <w:bottom w:color="ffffff" w:space="0" w:sz="8" w:val="single"/>
-              <w:right w:color="ffffff" w:space="0" w:sz="8" w:val="single"/>
-            </w:tcBorders>
-            <w:shd w:fill="ffffff" w:val="clear"/>
-            <w:tcMar>
-              <w:left w:w="56.0" w:type="dxa"/>
-              <w:right w:w="56.0" w:type="dxa"/>
-            </w:tcMar>
-          </w:tcPr>
-          <w:p>
-            <w:pPr>
-              <w:spacing w:after="0" w:before="0" w:line="278.00000000000006" w:lineRule="auto"/>
-              <w:ind w:left="0" w:right="314" w:firstLine="0"/>
-              <w:jc w:val="left"/>
-              <w:rPr>
-                <w:color w:val="000000"/>
-              </w:rPr>
-            </w:pPr>
-            <w:r>
-              <w:rPr>
-                <w:rFonts w:ascii="Open Sans" w:cs="Open Sans" w:eastAsia="Open Sans" w:hAnsi="Open Sans"/>
-                <w:color w:val="000000"/>
-                <w:sz w:val="20"/>
-                <w:szCs w:val="20"/>
-                <w:shd w:fill="auto" w:val="clear"/>
-                <w:rtl w:val="0"/>
-              </w:rPr>
-              <w:t xml:space="preserve">1 Stk</w:t>
-            </w:r>
-            <w:r>
-              <w:rPr>
-                <w:rtl w:val="0"/>
-              </w:rPr>
-            </w:r>
-          </w:p>
-        </w:tc>
-        <w:tc>
-          <w:tcPr>
-            <w:tcBorders>
-              <w:top w:color="ffffff" w:space="0" w:sz="8" w:val="single"/>
-              <w:left w:color="ffffff" w:space="0" w:sz="8" w:val="single"/>
-              <w:bottom w:color="ffffff" w:space="0" w:sz="8" w:val="single"/>
-              <w:right w:color="ffffff" w:space="0" w:sz="8" w:val="single"/>
-            </w:tcBorders>
-            <w:shd w:fill="ffffff" w:val="clear"/>
-            <w:tcMar>
-              <w:left w:w="56.0" w:type="dxa"/>
-              <w:right w:w="56.0" w:type="dxa"/>
-            </w:tcMar>
-          </w:tcPr>
-          <w:p>
-            <w:pPr>
-              <w:spacing w:after="0" w:before="0" w:line="278.00000000000006" w:lineRule="auto"/>
-              <w:ind w:left="0" w:right="314" w:firstLine="0"/>
-              <w:jc w:val="left"/>
-              <w:rPr>
-                <w:rFonts w:ascii="Open Sans" w:cs="Open Sans" w:eastAsia="Open Sans" w:hAnsi="Open Sans"/>
-                <w:b w:val="1"/>
-                <w:color w:val="000000"/>
-                <w:sz w:val="18"/>
-                <w:szCs w:val="18"/>
-                <w:shd w:fill="auto" w:val="clear"/>
-              </w:rPr>
-            </w:pPr>
-            <w:r>
-              <w:rPr>
-                <w:rFonts w:ascii="Open Sans" w:cs="Open Sans" w:eastAsia="Open Sans" w:hAnsi="Open Sans"/>
-                <w:b w:val="1"/>
-                <w:color w:val="000000"/>
-                <w:sz w:val="18"/>
-                <w:szCs w:val="18"/>
-                <w:shd w:fill="auto" w:val="clear"/>
-                <w:rtl w:val="0"/>
-              </w:rPr>
-              <w:t xml:space="preserve">Bestandkundenbonus:</w:t>
-            </w:r>
-          </w:p>
-          <w:p>
-            <w:pPr>
-              <w:spacing w:after="0" w:before="0" w:line="278.00000000000006" w:lineRule="auto"/>
-              <w:ind w:left="0" w:right="314" w:firstLine="0"/>
-              <w:jc w:val="left"/>
-              <w:rPr>
-                <w:color w:val="000000"/>
-                <w:sz w:val="18"/>
-                <w:szCs w:val="18"/>
-              </w:rPr>
-            </w:pPr>
-            <w:r>
-              <w:rPr>
-                <w:rFonts w:ascii="Open Sans" w:cs="Open Sans" w:eastAsia="Open Sans" w:hAnsi="Open Sans"/>
-                <w:color w:val="000000"/>
-                <w:sz w:val="18"/>
-                <w:szCs w:val="18"/>
-                <w:shd w:fill="auto" w:val="clear"/>
-                <w:rtl w:val="0"/>
-              </w:rPr>
-              <w:t xml:space="preserve">-- Rabatt von 300 € ab einem Gesamtwert von 3.000</w:t>
-            </w:r>
-            <w:r>
-              <w:rPr>
-                <w:rtl w:val="0"/>
-              </w:rPr>
-            </w:r>
-          </w:p>
-        </w:tc>
-        <w:tc>
-          <w:tcPr>
-            <w:tcBorders>
-              <w:top w:color="ffffff" w:space="0" w:sz="8" w:val="single"/>
-              <w:left w:color="ffffff" w:space="0" w:sz="8" w:val="single"/>
-              <w:bottom w:color="ffffff" w:space="0" w:sz="8" w:val="single"/>
-              <w:right w:color="ffffff" w:space="0" w:sz="8" w:val="single"/>
-            </w:tcBorders>
-            <w:shd w:fill="ffffff" w:val="clear"/>
-            <w:tcMar>
-              <w:left w:w="56.0" w:type="dxa"/>
-              <w:right w:w="56.0" w:type="dxa"/>
-            </w:tcMar>
-          </w:tcPr>
-          <w:p>
-            <w:pPr>
-              <w:spacing w:after="0" w:before="0" w:line="278.00000000000006" w:lineRule="auto"/>
-              <w:ind w:left="0" w:right="314" w:firstLine="0"/>
-              <w:jc w:val="left"/>
-              <w:rPr>
-                <w:color w:val="000000"/>
-              </w:rPr>
-            </w:pPr>
-            <w:r>
-              <w:rPr>
-                <w:rFonts w:ascii="Open Sans" w:cs="Open Sans" w:eastAsia="Open Sans" w:hAnsi="Open Sans"/>
-                <w:color w:val="000000"/>
-                <w:sz w:val="20"/>
-                <w:szCs w:val="20"/>
-                <w:shd w:fill="auto" w:val="clear"/>
-                <w:rtl w:val="0"/>
-              </w:rPr>
-              <w:t xml:space="preserve">-252,10 €</w:t>
-            </w:r>
-            <w:r>
-              <w:rPr>
-                <w:rtl w:val="0"/>
-              </w:rPr>
-            </w:r>
-          </w:p>
-        </w:tc>
-        <w:tc>
-          <w:tcPr>
-            <w:tcBorders>
-              <w:top w:color="ffffff" w:space="0" w:sz="8" w:val="single"/>
-              <w:left w:color="ffffff" w:space="0" w:sz="8" w:val="single"/>
-              <w:bottom w:color="ffffff" w:space="0" w:sz="8" w:val="single"/>
-              <w:right w:color="ffffff" w:space="0" w:sz="8" w:val="single"/>
-            </w:tcBorders>
-            <w:shd w:fill="ffffff" w:val="clear"/>
-            <w:tcMar>
-              <w:left w:w="56.0" w:type="dxa"/>
-              <w:right w:w="56.0" w:type="dxa"/>
-            </w:tcMar>
-          </w:tcPr>
-          <w:p>
-            <w:pPr>
-              <w:spacing w:after="0" w:before="0" w:line="278.00000000000006" w:lineRule="auto"/>
-              <w:ind w:left="0" w:right="314" w:firstLine="0"/>
-              <w:jc w:val="center"/>
-              <w:rPr>
-                <w:color w:val="000000"/>
-              </w:rPr>
-            </w:pPr>
-            <w:r>
-              <w:rPr>
-                <w:rFonts w:ascii="Open Sans" w:cs="Open Sans" w:eastAsia="Open Sans" w:hAnsi="Open Sans"/>
-                <w:color w:val="000000"/>
-                <w:sz w:val="20"/>
-                <w:szCs w:val="20"/>
-                <w:shd w:fill="auto" w:val="clear"/>
-                <w:rtl w:val="0"/>
-              </w:rPr>
-              <w:t xml:space="preserve">-252,10 €</w:t>
-            </w:r>
             <w:r>
               <w:rPr>
                 <w:rtl w:val="0"/>
@@ -3012,7 +2259,7 @@
                 <w:shd w:fill="auto" w:val="clear"/>
                 <w:rtl w:val="0"/>
               </w:rPr>
-              <w:t xml:space="preserve">2.604,04 €</w:t>
+              <w:t xml:space="preserve">1.866,38 €</w:t>
             </w:r>
             <w:r>
               <w:rPr>
@@ -3181,7 +2428,7 @@
                 <w:shd w:fill="auto" w:val="clear"/>
                 <w:rtl w:val="0"/>
               </w:rPr>
-              <w:t xml:space="preserve">494,77 €</w:t>
+              <w:t xml:space="preserve">354,61 €</w:t>
             </w:r>
             <w:r>
               <w:rPr>
@@ -3350,7 +2597,7 @@
                 <w:shd w:fill="auto" w:val="clear"/>
                 <w:rtl w:val="0"/>
               </w:rPr>
-              <w:t xml:space="preserve">3.098,81 €</w:t>
+              <w:t xml:space="preserve">2.220,99 €</w:t>
             </w:r>
             <w:r>
               <w:rPr>
@@ -3544,74 +2791,6 @@
           <w:rtl w:val="0"/>
         </w:rPr>
         <w:t xml:space="preserve">abgerechnet. (Stundensatz-Facharbeiter: 69,50€ netto)</w:t>
-        <w:br w:type="textWrapping"/>
-        <w:br w:type="textWrapping"/>
-        <w:t xml:space="preserve">Der</w:t>
-      </w:r>
-      <w:r>
-        <w:rPr>
-          <w:rFonts w:ascii="Open Sans" w:cs="Open Sans" w:eastAsia="Open Sans" w:hAnsi="Open Sans"/>
-          <w:color w:val="030303"/>
-          <w:rtl w:val="0"/>
-        </w:rPr>
-        <w:t xml:space="preserve"> </w:t>
-      </w:r>
-      <w:r>
-        <w:rPr>
-          <w:rFonts w:ascii="Open Sans" w:cs="Open Sans" w:eastAsia="Open Sans" w:hAnsi="Open Sans"/>
-          <w:color w:val="030303"/>
-          <w:sz w:val="22"/>
-          <w:szCs w:val="22"/>
-          <w:shd w:fill="auto" w:val="clear"/>
-          <w:rtl w:val="0"/>
-        </w:rPr>
-        <w:t xml:space="preserve">Selbstkostenanteil beträgt </w:t>
-      </w:r>
-      <w:r>
-        <w:rPr>
-          <w:rFonts w:ascii="Open Sans" w:cs="Open Sans" w:eastAsia="Open Sans" w:hAnsi="Open Sans"/>
-          <w:b w:val="1"/>
-          <w:color w:val="030303"/>
-          <w:sz w:val="22"/>
-          <w:szCs w:val="22"/>
-          <w:shd w:fill="auto" w:val="clear"/>
-          <w:rtl w:val="0"/>
-        </w:rPr>
-        <w:t xml:space="preserve">0,00 €</w:t>
-      </w:r>
-      <w:r>
-        <w:rPr>
-          <w:rFonts w:ascii="Open Sans" w:cs="Open Sans" w:eastAsia="Open Sans" w:hAnsi="Open Sans"/>
-          <w:color w:val="030303"/>
-          <w:sz w:val="22"/>
-          <w:szCs w:val="22"/>
-          <w:shd w:fill="auto" w:val="clear"/>
-          <w:rtl w:val="0"/>
-        </w:rPr>
-        <w:t xml:space="preserve"> unter Berücksichtigung eines gewährten Zuschusses durch die Pflegekasse i.H.v. </w:t>
-      </w:r>
-      <w:r>
-        <w:rPr>
-          <w:rFonts w:ascii="Open Sans" w:cs="Open Sans" w:eastAsia="Open Sans" w:hAnsi="Open Sans"/>
-          <w:b w:val="1"/>
-          <w:color w:val="030303"/>
-          <w:sz w:val="22"/>
-          <w:szCs w:val="22"/>
-          <w:shd w:fill="auto" w:val="clear"/>
-          <w:rtl w:val="0"/>
-        </w:rPr>
-        <w:t xml:space="preserve">4.180,00 €</w:t>
-      </w:r>
-      <w:r>
-        <w:rPr>
-          <w:rFonts w:ascii="Open Sans" w:cs="Open Sans" w:eastAsia="Open Sans" w:hAnsi="Open Sans"/>
-          <w:color w:val="030303"/>
-          <w:sz w:val="22"/>
-          <w:szCs w:val="22"/>
-          <w:shd w:fill="auto" w:val="clear"/>
-          <w:rtl w:val="0"/>
-        </w:rPr>
-        <w:t xml:space="preserve">.</w:t>
       </w:r>
       <w:r>
         <w:rPr>

</xml_diff>

<commit_message>
updating fussboden color shown in kosten details
</commit_message>
<xml_diff>
--- a/out-Angebot.docx
+++ b/out-Angebot.docx
@@ -129,7 +129,7 @@
                 <w:rFonts w:ascii="Open Sans" w:cs="Open Sans" w:eastAsia="Open Sans" w:hAnsi="Open Sans"/>
                 <w:rtl w:val="0"/>
               </w:rPr>
-              <w:t xml:space="preserve">Stephen Rich</w:t>
+              <w:t xml:space="preserve">Vincent Simpson</w:t>
             </w:r>
             <w:r>
               <w:rPr>
@@ -151,7 +151,7 @@
                 <w:rFonts w:ascii="Open Sans" w:cs="Open Sans" w:eastAsia="Open Sans" w:hAnsi="Open Sans"/>
                 <w:rtl w:val="0"/>
               </w:rPr>
-              <w:t xml:space="preserve">Omnis quia iste Nam ,</w:t>
+              <w:t xml:space="preserve">Aut rem nulla cillum,</w:t>
             </w:r>
             <w:r>
               <w:rPr>
@@ -175,7 +175,7 @@
                 <w:rFonts w:ascii="Open Sans" w:cs="Open Sans" w:eastAsia="Open Sans" w:hAnsi="Open Sans"/>
                 <w:rtl w:val="0"/>
               </w:rPr>
-              <w:t xml:space="preserve">Voluptate iste dolor Aliquid illum dolor</w:t>
+              <w:t xml:space="preserve">Omnis dolorem sed re Illum placeat et e</w:t>
             </w:r>
             <w:r>
               <w:rPr>
@@ -310,7 +310,7 @@
                 <w:rFonts w:ascii="Open Sans" w:cs="Open Sans" w:eastAsia="Open Sans" w:hAnsi="Open Sans"/>
                 <w:rtl w:val="0"/>
               </w:rPr>
-              <w:t xml:space="preserve">ANG2025-1030-113828</w:t>
+              <w:t xml:space="preserve">ANG2025-1030-162024</w:t>
             </w:r>
             <w:r>
               <w:rPr>
@@ -345,7 +345,7 @@
                 <w:rFonts w:ascii="Open Sans" w:cs="Open Sans" w:eastAsia="Open Sans" w:hAnsi="Open Sans"/>
                 <w:rtl w:val="0"/>
               </w:rPr>
-              <w:t xml:space="preserve">07.12.2006</w:t>
+              <w:t xml:space="preserve">31.10.1995</w:t>
             </w:r>
             <w:r>
               <w:rPr>
@@ -379,7 +379,7 @@
                 <w:rFonts w:ascii="Open Sans" w:cs="Open Sans" w:eastAsia="Open Sans" w:hAnsi="Open Sans"/>
                 <w:rtl w:val="0"/>
               </w:rPr>
-              <w:t xml:space="preserve">Colton Vincent</w:t>
+              <w:t xml:space="preserve">Alma Roy</w:t>
             </w:r>
             <w:r>
               <w:rPr>
@@ -524,7 +524,7 @@
                 <w:rFonts w:ascii="Open Sans" w:cs="Open Sans" w:eastAsia="Open Sans" w:hAnsi="Open Sans"/>
                 <w:rtl w:val="0"/>
               </w:rPr>
-              <w:t xml:space="preserve">Orson Everett</w:t>
+              <w:t xml:space="preserve">Vivien Hays</w:t>
             </w:r>
             <w:r>
               <w:rPr>
@@ -578,7 +578,7 @@
           <w:shd w:fill="auto" w:val="clear"/>
           <w:rtl w:val="0"/>
         </w:rPr>
-        <w:t xml:space="preserve">  Ihr Angebot ANG2025-1030-113828</w:t>
+        <w:t xml:space="preserve">  Ihr Angebot ANG2025-1030-162024</w:t>
       </w:r>
     </w:p>
     <w:p>
@@ -603,7 +603,7 @@
           <w:shd w:fill="auto" w:val="clear"/>
           <w:rtl w:val="0"/>
         </w:rPr>
-        <w:t xml:space="preserve">  Sehr geehrte Frau Rich,</w:t>
+        <w:t xml:space="preserve">  Sehr geehrte Frau Simpson,</w:t>
         <w:br w:type="textWrapping"/>
       </w:r>
     </w:p>
@@ -1075,7 +1075,7 @@
                 <w:shd w:fill="auto" w:val="clear"/>
                 <w:rtl w:val="0"/>
               </w:rPr>
-              <w:t xml:space="preserve">1.450,90 €</w:t>
+              <w:t xml:space="preserve">2.451,00 €</w:t>
             </w:r>
             <w:r>
               <w:rPr>
@@ -1116,7 +1116,7 @@
                 <w:shd w:fill="auto" w:val="clear"/>
                 <w:rtl w:val="0"/>
               </w:rPr>
-              <w:t xml:space="preserve">1.450,90 €</w:t>
+              <w:t xml:space="preserve">2.451,00 €</w:t>
             </w:r>
             <w:r>
               <w:rPr>
@@ -1377,7 +1377,7 @@
                 <w:shd w:fill="auto" w:val="clear"/>
                 <w:rtl w:val="0"/>
               </w:rPr>
-              <w:t xml:space="preserve">- 134 km Kilometerpauschale</w:t>
+              <w:t xml:space="preserve">- 180 km Kilometerpauschale</w:t>
             </w:r>
             <w:r>
               <w:rPr>
@@ -1663,7 +1663,7 @@
                 <w:shd w:fill="auto" w:val="clear"/>
                 <w:rtl w:val="0"/>
               </w:rPr>
-              <w:t xml:space="preserve">321,98 €</w:t>
+              <w:t xml:space="preserve">1.335,28 €</w:t>
             </w:r>
             <w:r>
               <w:rPr>
@@ -1695,7 +1695,7 @@
               <w:rPr>
                 <w:rtl w:val="0"/>
               </w:rPr>
-              <w:t xml:space="preserve">321,98 €</w:t>
+              <w:t xml:space="preserve">1.335,28 €</w:t>
             </w:r>
             <w:r>
               <w:rPr>
@@ -1915,7 +1915,7 @@
                 <w:shd w:fill="auto" w:val="clear"/>
                 <w:rtl w:val="0"/>
               </w:rPr>
-              <w:t xml:space="preserve">- 1 Stk TRINNITY Wandabdichtung BASIS-Set 5 qm DW bis 100 x 100 / BW bis 180 x 80 cm</w:t>
+              <w:t xml:space="preserve">- 4 Stk Fußboden-Paneele (1 Paneele = 0.3 m² )</w:t>
             </w:r>
           </w:p>
           <w:p>
@@ -1940,7 +1940,7 @@
                 <w:shd w:fill="auto" w:val="clear"/>
                 <w:rtl w:val="0"/>
               </w:rPr>
-              <w:t xml:space="preserve">- 1 Pkg Flächenkleber (Wandverkleidung)</w:t>
+              <w:t xml:space="preserve">- 2 Pkg Flächenkleber (1 Pkg je 0,60 m²)</w:t>
             </w:r>
           </w:p>
           <w:p>
@@ -1965,7 +1965,7 @@
                 <w:shd w:fill="auto" w:val="clear"/>
                 <w:rtl w:val="0"/>
               </w:rPr>
-              <w:t xml:space="preserve">- 1 Stk Abschlussprofil 3.0 255 cm silber eloxiert VIGOUR</w:t>
+              <w:t xml:space="preserve">- 1 Stk Wandverkleidung 3.0 Alu 1497×2550 mm — Farbe: Marmor weiß</w:t>
             </w:r>
           </w:p>
           <w:p>
@@ -1990,7 +1990,132 @@
                 <w:shd w:fill="auto" w:val="clear"/>
                 <w:rtl w:val="0"/>
               </w:rPr>
+              <w:t xml:space="preserve">- 1 Stk TRINNITY Wandabdichtung BASIS-Set 5 qm DW bis 100 x 100 / BW bis 180 x 80 cm</w:t>
+            </w:r>
+          </w:p>
+          <w:p>
+            <w:pPr>
+              <w:spacing w:after="0" w:before="0" w:line="278.00000000000006" w:lineRule="auto"/>
+              <w:ind w:left="0" w:right="314" w:firstLine="0"/>
+              <w:jc w:val="left"/>
+              <w:rPr>
+                <w:rFonts w:ascii="Open Sans" w:cs="Open Sans" w:eastAsia="Open Sans" w:hAnsi="Open Sans"/>
+                <w:color w:val="000000"/>
+                <w:sz w:val="18"/>
+                <w:szCs w:val="18"/>
+                <w:shd w:fill="auto" w:val="clear"/>
+              </w:rPr>
+            </w:pPr>
+            <w:r>
+              <w:rPr>
+                <w:rFonts w:ascii="Open Sans" w:cs="Open Sans" w:eastAsia="Open Sans" w:hAnsi="Open Sans"/>
+                <w:color w:val="000000"/>
+                <w:sz w:val="18"/>
+                <w:szCs w:val="18"/>
+                <w:shd w:fill="auto" w:val="clear"/>
+                <w:rtl w:val="0"/>
+              </w:rPr>
+              <w:t xml:space="preserve">- 2 Pkg Flächenkleber (Wandverkleidung)</w:t>
+            </w:r>
+          </w:p>
+          <w:p>
+            <w:pPr>
+              <w:spacing w:after="0" w:before="0" w:line="278.00000000000006" w:lineRule="auto"/>
+              <w:ind w:left="0" w:right="314" w:firstLine="0"/>
+              <w:jc w:val="left"/>
+              <w:rPr>
+                <w:rFonts w:ascii="Open Sans" w:cs="Open Sans" w:eastAsia="Open Sans" w:hAnsi="Open Sans"/>
+                <w:color w:val="000000"/>
+                <w:sz w:val="18"/>
+                <w:szCs w:val="18"/>
+                <w:shd w:fill="auto" w:val="clear"/>
+              </w:rPr>
+            </w:pPr>
+            <w:r>
+              <w:rPr>
+                <w:rFonts w:ascii="Open Sans" w:cs="Open Sans" w:eastAsia="Open Sans" w:hAnsi="Open Sans"/>
+                <w:color w:val="000000"/>
+                <w:sz w:val="18"/>
+                <w:szCs w:val="18"/>
+                <w:shd w:fill="auto" w:val="clear"/>
+                <w:rtl w:val="0"/>
+              </w:rPr>
+              <w:t xml:space="preserve">- 1 Stk Abschlussprofil 3.0 255 cm silber eloxiert VIGOUR</w:t>
+            </w:r>
+          </w:p>
+          <w:p>
+            <w:pPr>
+              <w:spacing w:after="0" w:before="0" w:line="278.00000000000006" w:lineRule="auto"/>
+              <w:ind w:left="0" w:right="314" w:firstLine="0"/>
+              <w:jc w:val="left"/>
+              <w:rPr>
+                <w:rFonts w:ascii="Open Sans" w:cs="Open Sans" w:eastAsia="Open Sans" w:hAnsi="Open Sans"/>
+                <w:color w:val="000000"/>
+                <w:sz w:val="18"/>
+                <w:szCs w:val="18"/>
+                <w:shd w:fill="auto" w:val="clear"/>
+              </w:rPr>
+            </w:pPr>
+            <w:r>
+              <w:rPr>
+                <w:rFonts w:ascii="Open Sans" w:cs="Open Sans" w:eastAsia="Open Sans" w:hAnsi="Open Sans"/>
+                <w:color w:val="000000"/>
+                <w:sz w:val="18"/>
+                <w:szCs w:val="18"/>
+                <w:shd w:fill="auto" w:val="clear"/>
+                <w:rtl w:val="0"/>
+              </w:rPr>
               <w:t xml:space="preserve">- 1 Stk Profilklebstoff (pro Abschlussprofil 1 Stk)</w:t>
+            </w:r>
+          </w:p>
+          <w:p>
+            <w:pPr>
+              <w:spacing w:after="0" w:before="0" w:line="278.00000000000006" w:lineRule="auto"/>
+              <w:ind w:left="0" w:right="314" w:firstLine="0"/>
+              <w:jc w:val="left"/>
+              <w:rPr>
+                <w:rFonts w:ascii="Open Sans" w:cs="Open Sans" w:eastAsia="Open Sans" w:hAnsi="Open Sans"/>
+                <w:color w:val="000000"/>
+                <w:sz w:val="18"/>
+                <w:szCs w:val="18"/>
+                <w:shd w:fill="auto" w:val="clear"/>
+              </w:rPr>
+            </w:pPr>
+            <w:r>
+              <w:rPr>
+                <w:rFonts w:ascii="Open Sans" w:cs="Open Sans" w:eastAsia="Open Sans" w:hAnsi="Open Sans"/>
+                <w:color w:val="000000"/>
+                <w:sz w:val="18"/>
+                <w:szCs w:val="18"/>
+                <w:shd w:fill="auto" w:val="clear"/>
+                <w:rtl w:val="0"/>
+              </w:rPr>
+              <w:t xml:space="preserve">- 1 Stk Pendeltür Hassmann</w:t>
+            </w:r>
+          </w:p>
+          <w:p>
+            <w:pPr>
+              <w:spacing w:after="0" w:before="0" w:line="278.00000000000006" w:lineRule="auto"/>
+              <w:ind w:left="0" w:right="314" w:firstLine="0"/>
+              <w:jc w:val="left"/>
+              <w:rPr>
+                <w:rFonts w:ascii="Open Sans" w:cs="Open Sans" w:eastAsia="Open Sans" w:hAnsi="Open Sans"/>
+                <w:color w:val="000000"/>
+                <w:sz w:val="18"/>
+                <w:szCs w:val="18"/>
+                <w:shd w:fill="auto" w:val="clear"/>
+              </w:rPr>
+            </w:pPr>
+            <w:r>
+              <w:rPr>
+                <w:rFonts w:ascii="Open Sans" w:cs="Open Sans" w:eastAsia="Open Sans" w:hAnsi="Open Sans"/>
+                <w:color w:val="000000"/>
+                <w:sz w:val="18"/>
+                <w:szCs w:val="18"/>
+                <w:shd w:fill="auto" w:val="clear"/>
+                <w:rtl w:val="0"/>
+              </w:rPr>
+              <w:t xml:space="preserve">- 1 Stk Pendeltür Hassmann</w:t>
             </w:r>
           </w:p>
         </w:tc>
@@ -2259,7 +2384,7 @@
                 <w:shd w:fill="auto" w:val="clear"/>
                 <w:rtl w:val="0"/>
               </w:rPr>
-              <w:t xml:space="preserve">1.866,38 €</w:t>
+              <w:t xml:space="preserve">4.426,51 €</w:t>
             </w:r>
             <w:r>
               <w:rPr>
@@ -2428,7 +2553,7 @@
                 <w:shd w:fill="auto" w:val="clear"/>
                 <w:rtl w:val="0"/>
               </w:rPr>
-              <w:t xml:space="preserve">354,61 €</w:t>
+              <w:t xml:space="preserve">841,04 €</w:t>
             </w:r>
             <w:r>
               <w:rPr>
@@ -2597,7 +2722,7 @@
                 <w:shd w:fill="auto" w:val="clear"/>
                 <w:rtl w:val="0"/>
               </w:rPr>
-              <w:t xml:space="preserve">2.220,99 €</w:t>
+              <w:t xml:space="preserve">5.267,55 €</w:t>
             </w:r>
             <w:r>
               <w:rPr>

</xml_diff>

<commit_message>
adding Weitere auszuführende Arbeiten (optional) in duschwanne menu
</commit_message>
<xml_diff>
--- a/out-Angebot.docx
+++ b/out-Angebot.docx
@@ -129,7 +129,7 @@
                 <w:rFonts w:ascii="Open Sans" w:cs="Open Sans" w:eastAsia="Open Sans" w:hAnsi="Open Sans"/>
                 <w:rtl w:val="0"/>
               </w:rPr>
-              <w:t xml:space="preserve">Vincent Simpson</w:t>
+              <w:t xml:space="preserve">Gabriel Kirkland</w:t>
             </w:r>
             <w:r>
               <w:rPr>
@@ -151,7 +151,7 @@
                 <w:rFonts w:ascii="Open Sans" w:cs="Open Sans" w:eastAsia="Open Sans" w:hAnsi="Open Sans"/>
                 <w:rtl w:val="0"/>
               </w:rPr>
-              <w:t xml:space="preserve">Aut rem nulla cillum,</w:t>
+              <w:t xml:space="preserve">Eius impedit lorem ,</w:t>
             </w:r>
             <w:r>
               <w:rPr>
@@ -175,7 +175,7 @@
                 <w:rFonts w:ascii="Open Sans" w:cs="Open Sans" w:eastAsia="Open Sans" w:hAnsi="Open Sans"/>
                 <w:rtl w:val="0"/>
               </w:rPr>
-              <w:t xml:space="preserve">Omnis dolorem sed re Illum placeat et e</w:t>
+              <w:t xml:space="preserve">Facere amet lorem e Fuga At cillum et v</w:t>
             </w:r>
             <w:r>
               <w:rPr>
@@ -310,7 +310,7 @@
                 <w:rFonts w:ascii="Open Sans" w:cs="Open Sans" w:eastAsia="Open Sans" w:hAnsi="Open Sans"/>
                 <w:rtl w:val="0"/>
               </w:rPr>
-              <w:t xml:space="preserve">ANG2025-1030-162024</w:t>
+              <w:t xml:space="preserve">ANG2025-1103-120820</w:t>
             </w:r>
             <w:r>
               <w:rPr>
@@ -345,7 +345,7 @@
                 <w:rFonts w:ascii="Open Sans" w:cs="Open Sans" w:eastAsia="Open Sans" w:hAnsi="Open Sans"/>
                 <w:rtl w:val="0"/>
               </w:rPr>
-              <w:t xml:space="preserve">31.10.1995</w:t>
+              <w:t xml:space="preserve">11.07.2015</w:t>
             </w:r>
             <w:r>
               <w:rPr>
@@ -379,7 +379,7 @@
                 <w:rFonts w:ascii="Open Sans" w:cs="Open Sans" w:eastAsia="Open Sans" w:hAnsi="Open Sans"/>
                 <w:rtl w:val="0"/>
               </w:rPr>
-              <w:t xml:space="preserve">Alma Roy</w:t>
+              <w:t xml:space="preserve">Jade Shaw</w:t>
             </w:r>
             <w:r>
               <w:rPr>
@@ -524,7 +524,7 @@
                 <w:rFonts w:ascii="Open Sans" w:cs="Open Sans" w:eastAsia="Open Sans" w:hAnsi="Open Sans"/>
                 <w:rtl w:val="0"/>
               </w:rPr>
-              <w:t xml:space="preserve">Vivien Hays</w:t>
+              <w:t xml:space="preserve">Aladdin Bender</w:t>
             </w:r>
             <w:r>
               <w:rPr>
@@ -578,7 +578,7 @@
           <w:shd w:fill="auto" w:val="clear"/>
           <w:rtl w:val="0"/>
         </w:rPr>
-        <w:t xml:space="preserve">  Ihr Angebot ANG2025-1030-162024</w:t>
+        <w:t xml:space="preserve">  Ihr Angebot ANG2025-1103-120820</w:t>
       </w:r>
     </w:p>
     <w:p>
@@ -603,7 +603,7 @@
           <w:shd w:fill="auto" w:val="clear"/>
           <w:rtl w:val="0"/>
         </w:rPr>
-        <w:t xml:space="preserve">  Sehr geehrte Frau Simpson,</w:t>
+        <w:t xml:space="preserve">  Sehr geehrte Frau Kirkland,</w:t>
         <w:br w:type="textWrapping"/>
       </w:r>
     </w:p>
@@ -1075,7 +1075,7 @@
                 <w:shd w:fill="auto" w:val="clear"/>
                 <w:rtl w:val="0"/>
               </w:rPr>
-              <w:t xml:space="preserve">2.451,00 €</w:t>
+              <w:t xml:space="preserve">2.063,20 €</w:t>
             </w:r>
             <w:r>
               <w:rPr>
@@ -1116,7 +1116,7 @@
                 <w:shd w:fill="auto" w:val="clear"/>
                 <w:rtl w:val="0"/>
               </w:rPr>
-              <w:t xml:space="preserve">2.451,00 €</w:t>
+              <w:t xml:space="preserve">2.063,20 €</w:t>
             </w:r>
             <w:r>
               <w:rPr>
@@ -1241,6 +1241,17 @@
             </w:pPr>
             <w:r>
               <w:rPr>
+                <w:rFonts w:ascii="Open Sans" w:cs="Open Sans" w:eastAsia="Open Sans" w:hAnsi="Open Sans"/>
+                <w:color w:val="000000"/>
+                <w:sz w:val="18"/>
+                <w:szCs w:val="18"/>
+                <w:shd w:fill="auto" w:val="clear"/>
+                <w:rtl w:val="0"/>
+              </w:rPr>
+              <w:t xml:space="preserve">- Entfernen und Entsorgen der Badewanne inkl. Befliesung</w:t>
+            </w:r>
+            <w:r>
+              <w:rPr>
                 <w:rtl w:val="0"/>
               </w:rPr>
             </w:r>
@@ -1252,21 +1263,10 @@
               <w:jc w:val="left"/>
               <w:rPr>
                 <w:color w:val="000000"/>
-                <w:sz w:val="20"/>
-                <w:szCs w:val="20"/>
-              </w:rPr>
-            </w:pPr>
-            <w:r>
-              <w:rPr>
-                <w:rFonts w:ascii="Open Sans" w:cs="Open Sans" w:eastAsia="Open Sans" w:hAnsi="Open Sans"/>
-                <w:color w:val="000000"/>
-                <w:sz w:val="20"/>
-                <w:szCs w:val="20"/>
-                <w:shd w:fill="auto" w:val="clear"/>
-                <w:rtl w:val="0"/>
-              </w:rPr>
-              <w:t xml:space="preserve">Enthält je Einheit</w:t>
-            </w:r>
+                <w:sz w:val="18"/>
+                <w:szCs w:val="18"/>
+              </w:rPr>
+            </w:pPr>
             <w:r>
               <w:rPr>
                 <w:rtl w:val="0"/>
@@ -1280,20 +1280,20 @@
               <w:jc w:val="left"/>
               <w:rPr>
                 <w:color w:val="000000"/>
-                <w:sz w:val="18"/>
-                <w:szCs w:val="18"/>
-              </w:rPr>
-            </w:pPr>
-            <w:r>
-              <w:rPr>
-                <w:rFonts w:ascii="Open Sans" w:cs="Open Sans" w:eastAsia="Open Sans" w:hAnsi="Open Sans"/>
-                <w:color w:val="000000"/>
-                <w:sz w:val="18"/>
-                <w:szCs w:val="18"/>
-                <w:shd w:fill="auto" w:val="clear"/>
-                <w:rtl w:val="0"/>
-              </w:rPr>
-              <w:t xml:space="preserve">- 1,00 Stk Fahrzeugbereitstellung</w:t>
+                <w:sz w:val="20"/>
+                <w:szCs w:val="20"/>
+              </w:rPr>
+            </w:pPr>
+            <w:r>
+              <w:rPr>
+                <w:rFonts w:ascii="Open Sans" w:cs="Open Sans" w:eastAsia="Open Sans" w:hAnsi="Open Sans"/>
+                <w:color w:val="000000"/>
+                <w:sz w:val="20"/>
+                <w:szCs w:val="20"/>
+                <w:shd w:fill="auto" w:val="clear"/>
+                <w:rtl w:val="0"/>
+              </w:rPr>
+              <w:t xml:space="preserve">Enthält je Einheit</w:t>
             </w:r>
             <w:r>
               <w:rPr>
@@ -1321,7 +1321,7 @@
                 <w:shd w:fill="auto" w:val="clear"/>
                 <w:rtl w:val="0"/>
               </w:rPr>
-              <w:t xml:space="preserve">- 1,00 Stk Bereitstellung und Vorhaltung von Maschinen &amp; Werkzeugen</w:t>
+              <w:t xml:space="preserve">- 1,00 Stk Fahrzeugbereitstellung</w:t>
             </w:r>
             <w:r>
               <w:rPr>
@@ -1349,7 +1349,7 @@
                 <w:shd w:fill="auto" w:val="clear"/>
                 <w:rtl w:val="0"/>
               </w:rPr>
-              <w:t xml:space="preserve">- 1,00 Stk Beräumung der Baustelle</w:t>
+              <w:t xml:space="preserve">- 1,00 Stk Bereitstellung und Vorhaltung von Maschinen &amp; Werkzeugen</w:t>
             </w:r>
             <w:r>
               <w:rPr>
@@ -1377,7 +1377,35 @@
                 <w:shd w:fill="auto" w:val="clear"/>
                 <w:rtl w:val="0"/>
               </w:rPr>
-              <w:t xml:space="preserve">- 180 km Kilometerpauschale</w:t>
+              <w:t xml:space="preserve">- 1,00 Stk Beräumung der Baustelle</w:t>
+            </w:r>
+            <w:r>
+              <w:rPr>
+                <w:rtl w:val="0"/>
+              </w:rPr>
+            </w:r>
+          </w:p>
+          <w:p>
+            <w:pPr>
+              <w:spacing w:after="0" w:before="0" w:line="278.00000000000006" w:lineRule="auto"/>
+              <w:ind w:left="0" w:right="314" w:firstLine="0"/>
+              <w:jc w:val="left"/>
+              <w:rPr>
+                <w:color w:val="000000"/>
+                <w:sz w:val="18"/>
+                <w:szCs w:val="18"/>
+              </w:rPr>
+            </w:pPr>
+            <w:r>
+              <w:rPr>
+                <w:rFonts w:ascii="Open Sans" w:cs="Open Sans" w:eastAsia="Open Sans" w:hAnsi="Open Sans"/>
+                <w:color w:val="000000"/>
+                <w:sz w:val="18"/>
+                <w:szCs w:val="18"/>
+                <w:shd w:fill="auto" w:val="clear"/>
+                <w:rtl w:val="0"/>
+              </w:rPr>
+              <w:t xml:space="preserve">- 152 km Kilometerpauschale</w:t>
             </w:r>
             <w:r>
               <w:rPr>
@@ -1663,7 +1691,7 @@
                 <w:shd w:fill="auto" w:val="clear"/>
                 <w:rtl w:val="0"/>
               </w:rPr>
-              <w:t xml:space="preserve">1.335,28 €</w:t>
+              <w:t xml:space="preserve">334,30 €</w:t>
             </w:r>
             <w:r>
               <w:rPr>
@@ -1695,7 +1723,7 @@
               <w:rPr>
                 <w:rtl w:val="0"/>
               </w:rPr>
-              <w:t xml:space="preserve">1.335,28 €</w:t>
+              <w:t xml:space="preserve">334,30 €</w:t>
             </w:r>
             <w:r>
               <w:rPr>
@@ -1865,7 +1893,7 @@
                 <w:shd w:fill="auto" w:val="clear"/>
                 <w:rtl w:val="0"/>
               </w:rPr>
-              <w:t xml:space="preserve">- 1 Stk Kleinmaterial groß</w:t>
+              <w:t xml:space="preserve">- 1 Stk TRINNITY Wandabdichtung BASIS-Set 5 qm DW bis 100 x 100 / BW bis 180 x 80 cm</w:t>
             </w:r>
           </w:p>
           <w:p>
@@ -1890,7 +1918,7 @@
                 <w:shd w:fill="auto" w:val="clear"/>
                 <w:rtl w:val="0"/>
               </w:rPr>
-              <w:t xml:space="preserve">- 1 Stk Stelzlager höhenverstellar Set</w:t>
+              <w:t xml:space="preserve">- 2 Stk Abschlussprofil 3.0 255 cm silber eloxiert VIGOUR</w:t>
             </w:r>
           </w:p>
           <w:p>
@@ -1915,157 +1943,7 @@
                 <w:shd w:fill="auto" w:val="clear"/>
                 <w:rtl w:val="0"/>
               </w:rPr>
-              <w:t xml:space="preserve">- 4 Stk Fußboden-Paneele (1 Paneele = 0.3 m² )</w:t>
-            </w:r>
-          </w:p>
-          <w:p>
-            <w:pPr>
-              <w:spacing w:after="0" w:before="0" w:line="278.00000000000006" w:lineRule="auto"/>
-              <w:ind w:left="0" w:right="314" w:firstLine="0"/>
-              <w:jc w:val="left"/>
-              <w:rPr>
-                <w:rFonts w:ascii="Open Sans" w:cs="Open Sans" w:eastAsia="Open Sans" w:hAnsi="Open Sans"/>
-                <w:color w:val="000000"/>
-                <w:sz w:val="18"/>
-                <w:szCs w:val="18"/>
-                <w:shd w:fill="auto" w:val="clear"/>
-              </w:rPr>
-            </w:pPr>
-            <w:r>
-              <w:rPr>
-                <w:rFonts w:ascii="Open Sans" w:cs="Open Sans" w:eastAsia="Open Sans" w:hAnsi="Open Sans"/>
-                <w:color w:val="000000"/>
-                <w:sz w:val="18"/>
-                <w:szCs w:val="18"/>
-                <w:shd w:fill="auto" w:val="clear"/>
-                <w:rtl w:val="0"/>
-              </w:rPr>
-              <w:t xml:space="preserve">- 2 Pkg Flächenkleber (1 Pkg je 0,60 m²)</w:t>
-            </w:r>
-          </w:p>
-          <w:p>
-            <w:pPr>
-              <w:spacing w:after="0" w:before="0" w:line="278.00000000000006" w:lineRule="auto"/>
-              <w:ind w:left="0" w:right="314" w:firstLine="0"/>
-              <w:jc w:val="left"/>
-              <w:rPr>
-                <w:rFonts w:ascii="Open Sans" w:cs="Open Sans" w:eastAsia="Open Sans" w:hAnsi="Open Sans"/>
-                <w:color w:val="000000"/>
-                <w:sz w:val="18"/>
-                <w:szCs w:val="18"/>
-                <w:shd w:fill="auto" w:val="clear"/>
-              </w:rPr>
-            </w:pPr>
-            <w:r>
-              <w:rPr>
-                <w:rFonts w:ascii="Open Sans" w:cs="Open Sans" w:eastAsia="Open Sans" w:hAnsi="Open Sans"/>
-                <w:color w:val="000000"/>
-                <w:sz w:val="18"/>
-                <w:szCs w:val="18"/>
-                <w:shd w:fill="auto" w:val="clear"/>
-                <w:rtl w:val="0"/>
-              </w:rPr>
-              <w:t xml:space="preserve">- 1 Stk Wandverkleidung 3.0 Alu 1497×2550 mm — Farbe: Marmor weiß</w:t>
-            </w:r>
-          </w:p>
-          <w:p>
-            <w:pPr>
-              <w:spacing w:after="0" w:before="0" w:line="278.00000000000006" w:lineRule="auto"/>
-              <w:ind w:left="0" w:right="314" w:firstLine="0"/>
-              <w:jc w:val="left"/>
-              <w:rPr>
-                <w:rFonts w:ascii="Open Sans" w:cs="Open Sans" w:eastAsia="Open Sans" w:hAnsi="Open Sans"/>
-                <w:color w:val="000000"/>
-                <w:sz w:val="18"/>
-                <w:szCs w:val="18"/>
-                <w:shd w:fill="auto" w:val="clear"/>
-              </w:rPr>
-            </w:pPr>
-            <w:r>
-              <w:rPr>
-                <w:rFonts w:ascii="Open Sans" w:cs="Open Sans" w:eastAsia="Open Sans" w:hAnsi="Open Sans"/>
-                <w:color w:val="000000"/>
-                <w:sz w:val="18"/>
-                <w:szCs w:val="18"/>
-                <w:shd w:fill="auto" w:val="clear"/>
-                <w:rtl w:val="0"/>
-              </w:rPr>
-              <w:t xml:space="preserve">- 1 Stk TRINNITY Wandabdichtung BASIS-Set 5 qm DW bis 100 x 100 / BW bis 180 x 80 cm</w:t>
-            </w:r>
-          </w:p>
-          <w:p>
-            <w:pPr>
-              <w:spacing w:after="0" w:before="0" w:line="278.00000000000006" w:lineRule="auto"/>
-              <w:ind w:left="0" w:right="314" w:firstLine="0"/>
-              <w:jc w:val="left"/>
-              <w:rPr>
-                <w:rFonts w:ascii="Open Sans" w:cs="Open Sans" w:eastAsia="Open Sans" w:hAnsi="Open Sans"/>
-                <w:color w:val="000000"/>
-                <w:sz w:val="18"/>
-                <w:szCs w:val="18"/>
-                <w:shd w:fill="auto" w:val="clear"/>
-              </w:rPr>
-            </w:pPr>
-            <w:r>
-              <w:rPr>
-                <w:rFonts w:ascii="Open Sans" w:cs="Open Sans" w:eastAsia="Open Sans" w:hAnsi="Open Sans"/>
-                <w:color w:val="000000"/>
-                <w:sz w:val="18"/>
-                <w:szCs w:val="18"/>
-                <w:shd w:fill="auto" w:val="clear"/>
-                <w:rtl w:val="0"/>
-              </w:rPr>
-              <w:t xml:space="preserve">- 2 Pkg Flächenkleber (Wandverkleidung)</w:t>
-            </w:r>
-          </w:p>
-          <w:p>
-            <w:pPr>
-              <w:spacing w:after="0" w:before="0" w:line="278.00000000000006" w:lineRule="auto"/>
-              <w:ind w:left="0" w:right="314" w:firstLine="0"/>
-              <w:jc w:val="left"/>
-              <w:rPr>
-                <w:rFonts w:ascii="Open Sans" w:cs="Open Sans" w:eastAsia="Open Sans" w:hAnsi="Open Sans"/>
-                <w:color w:val="000000"/>
-                <w:sz w:val="18"/>
-                <w:szCs w:val="18"/>
-                <w:shd w:fill="auto" w:val="clear"/>
-              </w:rPr>
-            </w:pPr>
-            <w:r>
-              <w:rPr>
-                <w:rFonts w:ascii="Open Sans" w:cs="Open Sans" w:eastAsia="Open Sans" w:hAnsi="Open Sans"/>
-                <w:color w:val="000000"/>
-                <w:sz w:val="18"/>
-                <w:szCs w:val="18"/>
-                <w:shd w:fill="auto" w:val="clear"/>
-                <w:rtl w:val="0"/>
-              </w:rPr>
-              <w:t xml:space="preserve">- 1 Stk Abschlussprofil 3.0 255 cm silber eloxiert VIGOUR</w:t>
-            </w:r>
-          </w:p>
-          <w:p>
-            <w:pPr>
-              <w:spacing w:after="0" w:before="0" w:line="278.00000000000006" w:lineRule="auto"/>
-              <w:ind w:left="0" w:right="314" w:firstLine="0"/>
-              <w:jc w:val="left"/>
-              <w:rPr>
-                <w:rFonts w:ascii="Open Sans" w:cs="Open Sans" w:eastAsia="Open Sans" w:hAnsi="Open Sans"/>
-                <w:color w:val="000000"/>
-                <w:sz w:val="18"/>
-                <w:szCs w:val="18"/>
-                <w:shd w:fill="auto" w:val="clear"/>
-              </w:rPr>
-            </w:pPr>
-            <w:r>
-              <w:rPr>
-                <w:rFonts w:ascii="Open Sans" w:cs="Open Sans" w:eastAsia="Open Sans" w:hAnsi="Open Sans"/>
-                <w:color w:val="000000"/>
-                <w:sz w:val="18"/>
-                <w:szCs w:val="18"/>
-                <w:shd w:fill="auto" w:val="clear"/>
-                <w:rtl w:val="0"/>
-              </w:rPr>
-              <w:t xml:space="preserve">- 1 Stk Profilklebstoff (pro Abschlussprofil 1 Stk)</w:t>
+              <w:t xml:space="preserve">- 2 Stk Silikon (pro Abschlussprofil 1 Stk)</w:t>
             </w:r>
           </w:p>
           <w:p>
@@ -2384,7 +2262,7 @@
                 <w:shd w:fill="auto" w:val="clear"/>
                 <w:rtl w:val="0"/>
               </w:rPr>
-              <w:t xml:space="preserve">4.426,51 €</w:t>
+              <w:t xml:space="preserve">2.564,65 €</w:t>
             </w:r>
             <w:r>
               <w:rPr>
@@ -2553,7 +2431,7 @@
                 <w:shd w:fill="auto" w:val="clear"/>
                 <w:rtl w:val="0"/>
               </w:rPr>
-              <w:t xml:space="preserve">841,04 €</w:t>
+              <w:t xml:space="preserve">487,28 €</w:t>
             </w:r>
             <w:r>
               <w:rPr>
@@ -2722,7 +2600,7 @@
                 <w:shd w:fill="auto" w:val="clear"/>
                 <w:rtl w:val="0"/>
               </w:rPr>
-              <w:t xml:space="preserve">5.267,55 €</w:t>
+              <w:t xml:space="preserve">3.051,93 €</w:t>
             </w:r>
             <w:r>
               <w:rPr>

</xml_diff>

<commit_message>
adding colors to buttons
</commit_message>
<xml_diff>
--- a/out-Angebot.docx
+++ b/out-Angebot.docx
@@ -310,7 +310,7 @@
                 <w:rFonts w:ascii="Open Sans" w:cs="Open Sans" w:eastAsia="Open Sans" w:hAnsi="Open Sans"/>
                 <w:rtl w:val="0"/>
               </w:rPr>
-              <w:t xml:space="preserve">ANG2025-1103-120820</w:t>
+              <w:t xml:space="preserve">ANG2025-1103-131046</w:t>
             </w:r>
             <w:r>
               <w:rPr>
@@ -578,7 +578,7 @@
           <w:shd w:fill="auto" w:val="clear"/>
           <w:rtl w:val="0"/>
         </w:rPr>
-        <w:t xml:space="preserve">  Ihr Angebot ANG2025-1103-120820</w:t>
+        <w:t xml:space="preserve">  Ihr Angebot ANG2025-1103-131046</w:t>
       </w:r>
     </w:p>
     <w:p>
@@ -1249,6 +1249,62 @@
                 <w:rtl w:val="0"/>
               </w:rPr>
               <w:t xml:space="preserve">- Entfernen und Entsorgen der Badewanne inkl. Befliesung</w:t>
+            </w:r>
+            <w:r>
+              <w:rPr>
+                <w:rtl w:val="0"/>
+              </w:rPr>
+            </w:r>
+          </w:p>
+          <w:p>
+            <w:pPr>
+              <w:spacing w:after="0" w:before="0" w:line="278.00000000000006" w:lineRule="auto"/>
+              <w:ind w:left="0" w:right="314" w:firstLine="0"/>
+              <w:jc w:val="left"/>
+              <w:rPr>
+                <w:color w:val="000000"/>
+                <w:sz w:val="18"/>
+                <w:szCs w:val="18"/>
+              </w:rPr>
+            </w:pPr>
+            <w:r>
+              <w:rPr>
+                <w:rFonts w:ascii="Open Sans" w:cs="Open Sans" w:eastAsia="Open Sans" w:hAnsi="Open Sans"/>
+                <w:color w:val="000000"/>
+                <w:sz w:val="18"/>
+                <w:szCs w:val="18"/>
+                <w:shd w:fill="auto" w:val="clear"/>
+                <w:rtl w:val="0"/>
+              </w:rPr>
+              <w:t xml:space="preserve">- Entfernen und Entsorgen der Duschabtrennung</w:t>
+            </w:r>
+            <w:r>
+              <w:rPr>
+                <w:rtl w:val="0"/>
+              </w:rPr>
+            </w:r>
+          </w:p>
+          <w:p>
+            <w:pPr>
+              <w:spacing w:after="0" w:before="0" w:line="278.00000000000006" w:lineRule="auto"/>
+              <w:ind w:left="0" w:right="314" w:firstLine="0"/>
+              <w:jc w:val="left"/>
+              <w:rPr>
+                <w:color w:val="000000"/>
+                <w:sz w:val="18"/>
+                <w:szCs w:val="18"/>
+              </w:rPr>
+            </w:pPr>
+            <w:r>
+              <w:rPr>
+                <w:rFonts w:ascii="Open Sans" w:cs="Open Sans" w:eastAsia="Open Sans" w:hAnsi="Open Sans"/>
+                <w:color w:val="000000"/>
+                <w:sz w:val="18"/>
+                <w:szCs w:val="18"/>
+                <w:shd w:fill="auto" w:val="clear"/>
+                <w:rtl w:val="0"/>
+              </w:rPr>
+              <w:t xml:space="preserve">- qqqqqq</w:t>
             </w:r>
             <w:r>
               <w:rPr>

</xml_diff>

<commit_message>
fixing the rows delete behavior for sonderprodukte in optional
</commit_message>
<xml_diff>
--- a/out-Angebot.docx
+++ b/out-Angebot.docx
@@ -129,7 +129,7 @@
                 <w:rFonts w:ascii="Open Sans" w:cs="Open Sans" w:eastAsia="Open Sans" w:hAnsi="Open Sans"/>
                 <w:rtl w:val="0"/>
               </w:rPr>
-              <w:t xml:space="preserve">Leigh Leblanc</w:t>
+              <w:t xml:space="preserve">Kareem Sherman</w:t>
             </w:r>
             <w:r>
               <w:rPr>
@@ -151,7 +151,7 @@
                 <w:rFonts w:ascii="Open Sans" w:cs="Open Sans" w:eastAsia="Open Sans" w:hAnsi="Open Sans"/>
                 <w:rtl w:val="0"/>
               </w:rPr>
-              <w:t xml:space="preserve">Cupidatat amet offi,</w:t>
+              <w:t xml:space="preserve">In in cum labore fug,</w:t>
             </w:r>
             <w:r>
               <w:rPr>
@@ -175,7 +175,7 @@
                 <w:rFonts w:ascii="Open Sans" w:cs="Open Sans" w:eastAsia="Open Sans" w:hAnsi="Open Sans"/>
                 <w:rtl w:val="0"/>
               </w:rPr>
-              <w:t xml:space="preserve">Temporibus non rem e Nisi inventore ut cu</w:t>
+              <w:t xml:space="preserve">Autem et tenetur ull Consequat Ad labore</w:t>
             </w:r>
             <w:r>
               <w:rPr>
@@ -310,7 +310,7 @@
                 <w:rFonts w:ascii="Open Sans" w:cs="Open Sans" w:eastAsia="Open Sans" w:hAnsi="Open Sans"/>
                 <w:rtl w:val="0"/>
               </w:rPr>
-              <w:t xml:space="preserve">ANG2025-1106-141016</w:t>
+              <w:t xml:space="preserve">ANG2025-1107-102623</w:t>
             </w:r>
             <w:r>
               <w:rPr>
@@ -345,7 +345,7 @@
                 <w:rFonts w:ascii="Open Sans" w:cs="Open Sans" w:eastAsia="Open Sans" w:hAnsi="Open Sans"/>
                 <w:rtl w:val="0"/>
               </w:rPr>
-              <w:t xml:space="preserve">25.04.1996</w:t>
+              <w:t xml:space="preserve">11.08.1977</w:t>
             </w:r>
             <w:r>
               <w:rPr>
@@ -379,7 +379,7 @@
                 <w:rFonts w:ascii="Open Sans" w:cs="Open Sans" w:eastAsia="Open Sans" w:hAnsi="Open Sans"/>
                 <w:rtl w:val="0"/>
               </w:rPr>
-              <w:t xml:space="preserve">Elizabeth Horn</w:t>
+              <w:t xml:space="preserve">James Little</w:t>
             </w:r>
             <w:r>
               <w:rPr>
@@ -524,7 +524,7 @@
                 <w:rFonts w:ascii="Open Sans" w:cs="Open Sans" w:eastAsia="Open Sans" w:hAnsi="Open Sans"/>
                 <w:rtl w:val="0"/>
               </w:rPr>
-              <w:t xml:space="preserve">Daryl Dejesus</w:t>
+              <w:t xml:space="preserve">Fallon Britt</w:t>
             </w:r>
             <w:r>
               <w:rPr>
@@ -578,7 +578,7 @@
           <w:shd w:fill="auto" w:val="clear"/>
           <w:rtl w:val="0"/>
         </w:rPr>
-        <w:t xml:space="preserve">  Ihr Angebot ANG2025-1106-141016</w:t>
+        <w:t xml:space="preserve">  Ihr Angebot ANG2025-1107-102623</w:t>
       </w:r>
     </w:p>
     <w:p>
@@ -603,7 +603,7 @@
           <w:shd w:fill="auto" w:val="clear"/>
           <w:rtl w:val="0"/>
         </w:rPr>
-        <w:t xml:space="preserve">  Sehr geehrte Frau Leblanc,</w:t>
+        <w:t xml:space="preserve">  Sehr geehrte Frau Sherman,</w:t>
         <w:br w:type="textWrapping"/>
       </w:r>
     </w:p>
@@ -1075,7 +1075,7 @@
                 <w:shd w:fill="auto" w:val="clear"/>
                 <w:rtl w:val="0"/>
               </w:rPr>
-              <w:t xml:space="preserve">4.109,30 €</w:t>
+              <w:t xml:space="preserve">1.844,10 €</w:t>
             </w:r>
             <w:r>
               <w:rPr>
@@ -1116,7 +1116,7 @@
                 <w:shd w:fill="auto" w:val="clear"/>
                 <w:rtl w:val="0"/>
               </w:rPr>
-              <w:t xml:space="preserve">4.109,30 €</w:t>
+              <w:t xml:space="preserve">1.844,10 €</w:t>
             </w:r>
             <w:r>
               <w:rPr>
@@ -1241,6 +1241,17 @@
             </w:pPr>
             <w:r>
               <w:rPr>
+                <w:rFonts w:ascii="Open Sans" w:cs="Open Sans" w:eastAsia="Open Sans" w:hAnsi="Open Sans"/>
+                <w:color w:val="000000"/>
+                <w:sz w:val="18"/>
+                <w:szCs w:val="18"/>
+                <w:shd w:fill="auto" w:val="clear"/>
+                <w:rtl w:val="0"/>
+              </w:rPr>
+              <w:t xml:space="preserve">- Entfernen und Entsorgen der Badewanne inkl. Befliesung</w:t>
+            </w:r>
+            <w:r>
+              <w:rPr>
                 <w:rtl w:val="0"/>
               </w:rPr>
             </w:r>
@@ -1252,6 +1263,79 @@
               <w:jc w:val="left"/>
               <w:rPr>
                 <w:color w:val="000000"/>
+                <w:sz w:val="18"/>
+                <w:szCs w:val="18"/>
+              </w:rPr>
+            </w:pPr>
+            <w:r>
+              <w:rPr>
+                <w:rFonts w:ascii="Open Sans" w:cs="Open Sans" w:eastAsia="Open Sans" w:hAnsi="Open Sans"/>
+                <w:color w:val="000000"/>
+                <w:sz w:val="18"/>
+                <w:szCs w:val="18"/>
+                <w:shd w:fill="auto" w:val="clear"/>
+                <w:rtl w:val="0"/>
+              </w:rPr>
+              <w:t xml:space="preserve">- Entfernen und Entsorgen der Duschabtrennung</w:t>
+            </w:r>
+            <w:r>
+              <w:rPr>
+                <w:rtl w:val="0"/>
+              </w:rPr>
+            </w:r>
+          </w:p>
+          <w:p>
+            <w:pPr>
+              <w:spacing w:after="0" w:before="0" w:line="278.00000000000006" w:lineRule="auto"/>
+              <w:ind w:left="0" w:right="314" w:firstLine="0"/>
+              <w:jc w:val="left"/>
+              <w:rPr>
+                <w:color w:val="000000"/>
+                <w:sz w:val="18"/>
+                <w:szCs w:val="18"/>
+              </w:rPr>
+            </w:pPr>
+            <w:r>
+              <w:rPr>
+                <w:rFonts w:ascii="Open Sans" w:cs="Open Sans" w:eastAsia="Open Sans" w:hAnsi="Open Sans"/>
+                <w:color w:val="000000"/>
+                <w:sz w:val="18"/>
+                <w:szCs w:val="18"/>
+                <w:shd w:fill="auto" w:val="clear"/>
+                <w:rtl w:val="0"/>
+              </w:rPr>
+              <w:t xml:space="preserve">- kkkkkk</w:t>
+            </w:r>
+            <w:r>
+              <w:rPr>
+                <w:rtl w:val="0"/>
+              </w:rPr>
+            </w:r>
+          </w:p>
+          <w:p>
+            <w:pPr>
+              <w:spacing w:after="0" w:before="0" w:line="278.00000000000006" w:lineRule="auto"/>
+              <w:ind w:left="0" w:right="314" w:firstLine="0"/>
+              <w:jc w:val="left"/>
+              <w:rPr>
+                <w:color w:val="000000"/>
+                <w:sz w:val="18"/>
+                <w:szCs w:val="18"/>
+              </w:rPr>
+            </w:pPr>
+            <w:r>
+              <w:rPr>
+                <w:rtl w:val="0"/>
+              </w:rPr>
+            </w:r>
+          </w:p>
+          <w:p>
+            <w:pPr>
+              <w:spacing w:after="0" w:before="0" w:line="278.00000000000006" w:lineRule="auto"/>
+              <w:ind w:left="0" w:right="314" w:firstLine="0"/>
+              <w:jc w:val="left"/>
+              <w:rPr>
+                <w:color w:val="000000"/>
                 <w:sz w:val="20"/>
                 <w:szCs w:val="20"/>
               </w:rPr>
@@ -1377,7 +1461,7 @@
                 <w:shd w:fill="auto" w:val="clear"/>
                 <w:rtl w:val="0"/>
               </w:rPr>
-              <w:t xml:space="preserve">- 58 km Kilometerpauschale</w:t>
+              <w:t xml:space="preserve">- 66 km Kilometerpauschale</w:t>
             </w:r>
             <w:r>
               <w:rPr>
@@ -1663,7 +1747,7 @@
                 <w:shd w:fill="auto" w:val="clear"/>
                 <w:rtl w:val="0"/>
               </w:rPr>
-              <w:t xml:space="preserve">407,44 €</w:t>
+              <w:t xml:space="preserve">583,83 €</w:t>
             </w:r>
             <w:r>
               <w:rPr>
@@ -1695,7 +1779,7 @@
               <w:rPr>
                 <w:rtl w:val="0"/>
               </w:rPr>
-              <w:t xml:space="preserve">407,44 €</w:t>
+              <w:t xml:space="preserve">583,83 €</w:t>
             </w:r>
             <w:r>
               <w:rPr>
@@ -1890,7 +1974,7 @@
                 <w:shd w:fill="auto" w:val="clear"/>
                 <w:rtl w:val="0"/>
               </w:rPr>
-              <w:t xml:space="preserve">- 1 Stk Stelzlager Fixhöhe 8mm</w:t>
+              <w:t xml:space="preserve">- 1 Stk Stelzlager höhenverstellar Set</w:t>
             </w:r>
           </w:p>
           <w:p>
@@ -1990,7 +2074,7 @@
                 <w:shd w:fill="auto" w:val="clear"/>
                 <w:rtl w:val="0"/>
               </w:rPr>
-              <w:t xml:space="preserve">- 1 Stk Pendeltür Hassmann</w:t>
+              <w:t xml:space="preserve">- 1 Stk 11111</w:t>
             </w:r>
           </w:p>
           <w:p>
@@ -2015,7 +2099,82 @@
                 <w:shd w:fill="auto" w:val="clear"/>
                 <w:rtl w:val="0"/>
               </w:rPr>
+              <w:t xml:space="preserve">- 1 Stk Pendeltür Hassmann</w:t>
+            </w:r>
+          </w:p>
+          <w:p>
+            <w:pPr>
+              <w:spacing w:after="0" w:before="0" w:line="278.00000000000006" w:lineRule="auto"/>
+              <w:ind w:left="0" w:right="314" w:firstLine="0"/>
+              <w:jc w:val="left"/>
+              <w:rPr>
+                <w:rFonts w:ascii="Open Sans" w:cs="Open Sans" w:eastAsia="Open Sans" w:hAnsi="Open Sans"/>
+                <w:color w:val="000000"/>
+                <w:sz w:val="18"/>
+                <w:szCs w:val="18"/>
+                <w:shd w:fill="auto" w:val="clear"/>
+              </w:rPr>
+            </w:pPr>
+            <w:r>
+              <w:rPr>
+                <w:rFonts w:ascii="Open Sans" w:cs="Open Sans" w:eastAsia="Open Sans" w:hAnsi="Open Sans"/>
+                <w:color w:val="000000"/>
+                <w:sz w:val="18"/>
+                <w:szCs w:val="18"/>
+                <w:shd w:fill="auto" w:val="clear"/>
+                <w:rtl w:val="0"/>
+              </w:rPr>
+              <w:t xml:space="preserve">- 1 Stk Gleittür Hassmann</w:t>
+            </w:r>
+          </w:p>
+          <w:p>
+            <w:pPr>
+              <w:spacing w:after="0" w:before="0" w:line="278.00000000000006" w:lineRule="auto"/>
+              <w:ind w:left="0" w:right="314" w:firstLine="0"/>
+              <w:jc w:val="left"/>
+              <w:rPr>
+                <w:rFonts w:ascii="Open Sans" w:cs="Open Sans" w:eastAsia="Open Sans" w:hAnsi="Open Sans"/>
+                <w:color w:val="000000"/>
+                <w:sz w:val="18"/>
+                <w:szCs w:val="18"/>
+                <w:shd w:fill="auto" w:val="clear"/>
+              </w:rPr>
+            </w:pPr>
+            <w:r>
+              <w:rPr>
+                <w:rFonts w:ascii="Open Sans" w:cs="Open Sans" w:eastAsia="Open Sans" w:hAnsi="Open Sans"/>
+                <w:color w:val="000000"/>
+                <w:sz w:val="18"/>
+                <w:szCs w:val="18"/>
+                <w:shd w:fill="auto" w:val="clear"/>
+                <w:rtl w:val="0"/>
+              </w:rPr>
               <w:t xml:space="preserve">- 1 Stk Walk-In Hassmann</w:t>
+            </w:r>
+          </w:p>
+          <w:p>
+            <w:pPr>
+              <w:spacing w:after="0" w:before="0" w:line="278.00000000000006" w:lineRule="auto"/>
+              <w:ind w:left="0" w:right="314" w:firstLine="0"/>
+              <w:jc w:val="left"/>
+              <w:rPr>
+                <w:rFonts w:ascii="Open Sans" w:cs="Open Sans" w:eastAsia="Open Sans" w:hAnsi="Open Sans"/>
+                <w:color w:val="000000"/>
+                <w:sz w:val="18"/>
+                <w:szCs w:val="18"/>
+                <w:shd w:fill="auto" w:val="clear"/>
+              </w:rPr>
+            </w:pPr>
+            <w:r>
+              <w:rPr>
+                <w:rFonts w:ascii="Open Sans" w:cs="Open Sans" w:eastAsia="Open Sans" w:hAnsi="Open Sans"/>
+                <w:color w:val="000000"/>
+                <w:sz w:val="18"/>
+                <w:szCs w:val="18"/>
+                <w:shd w:fill="auto" w:val="clear"/>
+                <w:rtl w:val="0"/>
+              </w:rPr>
+              <w:t xml:space="preserve">- 1 Stk zzzzz</w:t>
             </w:r>
           </w:p>
         </w:tc>
@@ -2284,7 +2443,7 @@
                 <w:shd w:fill="auto" w:val="clear"/>
                 <w:rtl w:val="0"/>
               </w:rPr>
-              <w:t xml:space="preserve">4.645,46 €</w:t>
+              <w:t xml:space="preserve">2.644,85 €</w:t>
             </w:r>
             <w:r>
               <w:rPr>
@@ -2453,7 +2612,7 @@
                 <w:shd w:fill="auto" w:val="clear"/>
                 <w:rtl w:val="0"/>
               </w:rPr>
-              <w:t xml:space="preserve">882,64 €</w:t>
+              <w:t xml:space="preserve">502,52 €</w:t>
             </w:r>
             <w:r>
               <w:rPr>
@@ -2622,7 +2781,7 @@
                 <w:shd w:fill="auto" w:val="clear"/>
                 <w:rtl w:val="0"/>
               </w:rPr>
-              <w:t xml:space="preserve">5.528,10 €</w:t>
+              <w:t xml:space="preserve">3.147,37 €</w:t>
             </w:r>
             <w:r>
               <w:rPr>

</xml_diff>

<commit_message>
fixing the row adding behavior in sonder produktel
</commit_message>
<xml_diff>
--- a/out-Angebot.docx
+++ b/out-Angebot.docx
@@ -310,7 +310,7 @@
                 <w:rFonts w:ascii="Open Sans" w:cs="Open Sans" w:eastAsia="Open Sans" w:hAnsi="Open Sans"/>
                 <w:rtl w:val="0"/>
               </w:rPr>
-              <w:t xml:space="preserve">ANG2025-1107-102623</w:t>
+              <w:t xml:space="preserve">ANG2025-1107-110344</w:t>
             </w:r>
             <w:r>
               <w:rPr>
@@ -578,7 +578,7 @@
           <w:shd w:fill="auto" w:val="clear"/>
           <w:rtl w:val="0"/>
         </w:rPr>
-        <w:t xml:space="preserve">  Ihr Angebot ANG2025-1107-102623</w:t>
+        <w:t xml:space="preserve">  Ihr Angebot ANG2025-1107-110344</w:t>
       </w:r>
     </w:p>
     <w:p>
@@ -1747,7 +1747,7 @@
                 <w:shd w:fill="auto" w:val="clear"/>
                 <w:rtl w:val="0"/>
               </w:rPr>
-              <w:t xml:space="preserve">583,83 €</w:t>
+              <w:t xml:space="preserve">574,83 €</w:t>
             </w:r>
             <w:r>
               <w:rPr>
@@ -1779,7 +1779,7 @@
               <w:rPr>
                 <w:rtl w:val="0"/>
               </w:rPr>
-              <w:t xml:space="preserve">583,83 €</w:t>
+              <w:t xml:space="preserve">574,83 €</w:t>
             </w:r>
             <w:r>
               <w:rPr>
@@ -2074,7 +2074,7 @@
                 <w:shd w:fill="auto" w:val="clear"/>
                 <w:rtl w:val="0"/>
               </w:rPr>
-              <w:t xml:space="preserve">- 1 Stk 11111</w:t>
+              <w:t xml:space="preserve">- 1 Stk Pendeltür Hassmann</w:t>
             </w:r>
           </w:p>
           <w:p>
@@ -2099,7 +2099,7 @@
                 <w:shd w:fill="auto" w:val="clear"/>
                 <w:rtl w:val="0"/>
               </w:rPr>
-              <w:t xml:space="preserve">- 1 Stk Pendeltür Hassmann</w:t>
+              <w:t xml:space="preserve">- 1 Stk Gleittür Hassmann</w:t>
             </w:r>
           </w:p>
           <w:p>
@@ -2124,7 +2124,7 @@
                 <w:shd w:fill="auto" w:val="clear"/>
                 <w:rtl w:val="0"/>
               </w:rPr>
-              <w:t xml:space="preserve">- 1 Stk Gleittür Hassmann</w:t>
+              <w:t xml:space="preserve">- 1 Stk Falt-Pendeltür Hassmann</w:t>
             </w:r>
           </w:p>
           <w:p>
@@ -2443,7 +2443,7 @@
                 <w:shd w:fill="auto" w:val="clear"/>
                 <w:rtl w:val="0"/>
               </w:rPr>
-              <w:t xml:space="preserve">2.644,85 €</w:t>
+              <w:t xml:space="preserve">2.631,35 €</w:t>
             </w:r>
             <w:r>
               <w:rPr>
@@ -2612,7 +2612,7 @@
                 <w:shd w:fill="auto" w:val="clear"/>
                 <w:rtl w:val="0"/>
               </w:rPr>
-              <w:t xml:space="preserve">502,52 €</w:t>
+              <w:t xml:space="preserve">499,96 €</w:t>
             </w:r>
             <w:r>
               <w:rPr>
@@ -2781,7 +2781,7 @@
                 <w:shd w:fill="auto" w:val="clear"/>
                 <w:rtl w:val="0"/>
               </w:rPr>
-              <w:t xml:space="preserve">3.147,37 €</w:t>
+              <w:t xml:space="preserve">3.131,31 €</w:t>
             </w:r>
             <w:r>
               <w:rPr>

</xml_diff>

<commit_message>
fixing the behavior when dis-select sonderprodukte
</commit_message>
<xml_diff>
--- a/out-Angebot.docx
+++ b/out-Angebot.docx
@@ -310,7 +310,7 @@
                 <w:rFonts w:ascii="Open Sans" w:cs="Open Sans" w:eastAsia="Open Sans" w:hAnsi="Open Sans"/>
                 <w:rtl w:val="0"/>
               </w:rPr>
-              <w:t xml:space="preserve">ANG2025-1107-110344</w:t>
+              <w:t xml:space="preserve">ANG2025-1107-112943</w:t>
             </w:r>
             <w:r>
               <w:rPr>
@@ -578,7 +578,7 @@
           <w:shd w:fill="auto" w:val="clear"/>
           <w:rtl w:val="0"/>
         </w:rPr>
-        <w:t xml:space="preserve">  Ihr Angebot ANG2025-1107-110344</w:t>
+        <w:t xml:space="preserve">  Ihr Angebot ANG2025-1107-112943</w:t>
       </w:r>
     </w:p>
     <w:p>
@@ -1747,7 +1747,7 @@
                 <w:shd w:fill="auto" w:val="clear"/>
                 <w:rtl w:val="0"/>
               </w:rPr>
-              <w:t xml:space="preserve">574,83 €</w:t>
+              <w:t xml:space="preserve">632,83 €</w:t>
             </w:r>
             <w:r>
               <w:rPr>
@@ -1779,7 +1779,7 @@
               <w:rPr>
                 <w:rtl w:val="0"/>
               </w:rPr>
-              <w:t xml:space="preserve">574,83 €</w:t>
+              <w:t xml:space="preserve">632,83 €</w:t>
             </w:r>
             <w:r>
               <w:rPr>
@@ -2074,7 +2074,7 @@
                 <w:shd w:fill="auto" w:val="clear"/>
                 <w:rtl w:val="0"/>
               </w:rPr>
-              <w:t xml:space="preserve">- 1 Stk Pendeltür Hassmann</w:t>
+              <w:t xml:space="preserve">- 1 Stk 445</w:t>
             </w:r>
           </w:p>
           <w:p>
@@ -2099,7 +2099,7 @@
                 <w:shd w:fill="auto" w:val="clear"/>
                 <w:rtl w:val="0"/>
               </w:rPr>
-              <w:t xml:space="preserve">- 1 Stk Gleittür Hassmann</w:t>
+              <w:t xml:space="preserve">- 1 Stk Pendeltür Hassmann</w:t>
             </w:r>
           </w:p>
           <w:p>
@@ -2124,7 +2124,7 @@
                 <w:shd w:fill="auto" w:val="clear"/>
                 <w:rtl w:val="0"/>
               </w:rPr>
-              <w:t xml:space="preserve">- 1 Stk Falt-Pendeltür Hassmann</w:t>
+              <w:t xml:space="preserve">- 1 Stk Gleittür Hassmann</w:t>
             </w:r>
           </w:p>
           <w:p>
@@ -2149,7 +2149,7 @@
                 <w:shd w:fill="auto" w:val="clear"/>
                 <w:rtl w:val="0"/>
               </w:rPr>
-              <w:t xml:space="preserve">- 1 Stk Walk-In Hassmann</w:t>
+              <w:t xml:space="preserve">- 1 Stk Falt-Pendeltür Hassmann</w:t>
             </w:r>
           </w:p>
           <w:p>
@@ -2174,7 +2174,32 @@
                 <w:shd w:fill="auto" w:val="clear"/>
                 <w:rtl w:val="0"/>
               </w:rPr>
-              <w:t xml:space="preserve">- 1 Stk zzzzz</w:t>
+              <w:t xml:space="preserve">- 1 Stk Walk-In Hassmann</w:t>
+            </w:r>
+          </w:p>
+          <w:p>
+            <w:pPr>
+              <w:spacing w:after="0" w:before="0" w:line="278.00000000000006" w:lineRule="auto"/>
+              <w:ind w:left="0" w:right="314" w:firstLine="0"/>
+              <w:jc w:val="left"/>
+              <w:rPr>
+                <w:rFonts w:ascii="Open Sans" w:cs="Open Sans" w:eastAsia="Open Sans" w:hAnsi="Open Sans"/>
+                <w:color w:val="000000"/>
+                <w:sz w:val="18"/>
+                <w:szCs w:val="18"/>
+                <w:shd w:fill="auto" w:val="clear"/>
+              </w:rPr>
+            </w:pPr>
+            <w:r>
+              <w:rPr>
+                <w:rFonts w:ascii="Open Sans" w:cs="Open Sans" w:eastAsia="Open Sans" w:hAnsi="Open Sans"/>
+                <w:color w:val="000000"/>
+                <w:sz w:val="18"/>
+                <w:szCs w:val="18"/>
+                <w:shd w:fill="auto" w:val="clear"/>
+                <w:rtl w:val="0"/>
+              </w:rPr>
+              <w:t xml:space="preserve">- 1 Stk 447</w:t>
             </w:r>
           </w:p>
         </w:tc>
@@ -2443,7 +2468,7 @@
                 <w:shd w:fill="auto" w:val="clear"/>
                 <w:rtl w:val="0"/>
               </w:rPr>
-              <w:t xml:space="preserve">2.631,35 €</w:t>
+              <w:t xml:space="preserve">2.718,35 €</w:t>
             </w:r>
             <w:r>
               <w:rPr>
@@ -2612,7 +2637,7 @@
                 <w:shd w:fill="auto" w:val="clear"/>
                 <w:rtl w:val="0"/>
               </w:rPr>
-              <w:t xml:space="preserve">499,96 €</w:t>
+              <w:t xml:space="preserve">516,49 €</w:t>
             </w:r>
             <w:r>
               <w:rPr>
@@ -2781,7 +2806,7 @@
                 <w:shd w:fill="auto" w:val="clear"/>
                 <w:rtl w:val="0"/>
               </w:rPr>
-              <w:t xml:space="preserve">3.131,31 €</w:t>
+              <w:t xml:space="preserve">3.234,84 €</w:t>
             </w:r>
             <w:r>
               <w:rPr>

</xml_diff>

<commit_message>
materialubersicht now have all freier posten and turen
</commit_message>
<xml_diff>
--- a/out-Angebot.docx
+++ b/out-Angebot.docx
@@ -129,7 +129,7 @@
                 <w:rFonts w:ascii="Open Sans" w:cs="Open Sans" w:eastAsia="Open Sans" w:hAnsi="Open Sans"/>
                 <w:rtl w:val="0"/>
               </w:rPr>
-              <w:t xml:space="preserve">Kareem Sherman</w:t>
+              <w:t xml:space="preserve">Duncan Cross</w:t>
             </w:r>
             <w:r>
               <w:rPr>
@@ -151,7 +151,7 @@
                 <w:rFonts w:ascii="Open Sans" w:cs="Open Sans" w:eastAsia="Open Sans" w:hAnsi="Open Sans"/>
                 <w:rtl w:val="0"/>
               </w:rPr>
-              <w:t xml:space="preserve">In in cum labore fug,</w:t>
+              <w:t xml:space="preserve">Id vel laborum magna,</w:t>
             </w:r>
             <w:r>
               <w:rPr>
@@ -175,7 +175,7 @@
                 <w:rFonts w:ascii="Open Sans" w:cs="Open Sans" w:eastAsia="Open Sans" w:hAnsi="Open Sans"/>
                 <w:rtl w:val="0"/>
               </w:rPr>
-              <w:t xml:space="preserve">Autem et tenetur ull Consequat Ad labore</w:t>
+              <w:t xml:space="preserve">Non quidem cupiditat Ipsa amet est volu</w:t>
             </w:r>
             <w:r>
               <w:rPr>
@@ -310,7 +310,7 @@
                 <w:rFonts w:ascii="Open Sans" w:cs="Open Sans" w:eastAsia="Open Sans" w:hAnsi="Open Sans"/>
                 <w:rtl w:val="0"/>
               </w:rPr>
-              <w:t xml:space="preserve">ANG2025-1107-112943</w:t>
+              <w:t xml:space="preserve">ANG2025-1107-145133</w:t>
             </w:r>
             <w:r>
               <w:rPr>
@@ -345,7 +345,7 @@
                 <w:rFonts w:ascii="Open Sans" w:cs="Open Sans" w:eastAsia="Open Sans" w:hAnsi="Open Sans"/>
                 <w:rtl w:val="0"/>
               </w:rPr>
-              <w:t xml:space="preserve">11.08.1977</w:t>
+              <w:t xml:space="preserve">07.10.2018</w:t>
             </w:r>
             <w:r>
               <w:rPr>
@@ -379,7 +379,7 @@
                 <w:rFonts w:ascii="Open Sans" w:cs="Open Sans" w:eastAsia="Open Sans" w:hAnsi="Open Sans"/>
                 <w:rtl w:val="0"/>
               </w:rPr>
-              <w:t xml:space="preserve">James Little</w:t>
+              <w:t xml:space="preserve">Gannon Odom</w:t>
             </w:r>
             <w:r>
               <w:rPr>
@@ -524,7 +524,7 @@
                 <w:rFonts w:ascii="Open Sans" w:cs="Open Sans" w:eastAsia="Open Sans" w:hAnsi="Open Sans"/>
                 <w:rtl w:val="0"/>
               </w:rPr>
-              <w:t xml:space="preserve">Fallon Britt</w:t>
+              <w:t xml:space="preserve">Riley Carver</w:t>
             </w:r>
             <w:r>
               <w:rPr>
@@ -578,7 +578,7 @@
           <w:shd w:fill="auto" w:val="clear"/>
           <w:rtl w:val="0"/>
         </w:rPr>
-        <w:t xml:space="preserve">  Ihr Angebot ANG2025-1107-112943</w:t>
+        <w:t xml:space="preserve">  Ihr Angebot ANG2025-1107-145133</w:t>
       </w:r>
     </w:p>
     <w:p>
@@ -603,7 +603,7 @@
           <w:shd w:fill="auto" w:val="clear"/>
           <w:rtl w:val="0"/>
         </w:rPr>
-        <w:t xml:space="preserve">  Sehr geehrte Frau Sherman,</w:t>
+        <w:t xml:space="preserve">  Sehr geehrte Frau Cross,</w:t>
         <w:br w:type="textWrapping"/>
       </w:r>
     </w:p>
@@ -1075,7 +1075,7 @@
                 <w:shd w:fill="auto" w:val="clear"/>
                 <w:rtl w:val="0"/>
               </w:rPr>
-              <w:t xml:space="preserve">1.844,10 €</w:t>
+              <w:t xml:space="preserve">4.128,90 €</w:t>
             </w:r>
             <w:r>
               <w:rPr>
@@ -1116,7 +1116,7 @@
                 <w:shd w:fill="auto" w:val="clear"/>
                 <w:rtl w:val="0"/>
               </w:rPr>
-              <w:t xml:space="preserve">1.844,10 €</w:t>
+              <w:t xml:space="preserve">4.128,90 €</w:t>
             </w:r>
             <w:r>
               <w:rPr>
@@ -1248,7 +1248,7 @@
                 <w:shd w:fill="auto" w:val="clear"/>
                 <w:rtl w:val="0"/>
               </w:rPr>
-              <w:t xml:space="preserve">- Entfernen und Entsorgen der Badewanne inkl. Befliesung</w:t>
+              <w:t xml:space="preserve">- kkkkkk</w:t>
             </w:r>
             <w:r>
               <w:rPr>
@@ -1269,14 +1269,59 @@
             </w:pPr>
             <w:r>
               <w:rPr>
-                <w:rFonts w:ascii="Open Sans" w:cs="Open Sans" w:eastAsia="Open Sans" w:hAnsi="Open Sans"/>
+                <w:rtl w:val="0"/>
+              </w:rPr>
+            </w:r>
+          </w:p>
+          <w:p>
+            <w:pPr>
+              <w:spacing w:after="0" w:before="0" w:line="278.00000000000006" w:lineRule="auto"/>
+              <w:ind w:left="0" w:right="314" w:firstLine="0"/>
+              <w:jc w:val="left"/>
+              <w:rPr>
+                <w:color w:val="000000"/>
+                <w:sz w:val="20"/>
+                <w:szCs w:val="20"/>
+              </w:rPr>
+            </w:pPr>
+            <w:r>
+              <w:rPr>
+                <w:rFonts w:ascii="Open Sans" w:cs="Open Sans" w:eastAsia="Open Sans" w:hAnsi="Open Sans"/>
+                <w:color w:val="000000"/>
+                <w:sz w:val="20"/>
+                <w:szCs w:val="20"/>
+                <w:shd w:fill="auto" w:val="clear"/>
+                <w:rtl w:val="0"/>
+              </w:rPr>
+              <w:t xml:space="preserve">Enthält je Einheit</w:t>
+            </w:r>
+            <w:r>
+              <w:rPr>
+                <w:rtl w:val="0"/>
+              </w:rPr>
+            </w:r>
+          </w:p>
+          <w:p>
+            <w:pPr>
+              <w:spacing w:after="0" w:before="0" w:line="278.00000000000006" w:lineRule="auto"/>
+              <w:ind w:left="0" w:right="314" w:firstLine="0"/>
+              <w:jc w:val="left"/>
+              <w:rPr>
                 <w:color w:val="000000"/>
                 <w:sz w:val="18"/>
                 <w:szCs w:val="18"/>
-                <w:shd w:fill="auto" w:val="clear"/>
-                <w:rtl w:val="0"/>
-              </w:rPr>
-              <w:t xml:space="preserve">- Entfernen und Entsorgen der Duschabtrennung</w:t>
+              </w:rPr>
+            </w:pPr>
+            <w:r>
+              <w:rPr>
+                <w:rFonts w:ascii="Open Sans" w:cs="Open Sans" w:eastAsia="Open Sans" w:hAnsi="Open Sans"/>
+                <w:color w:val="000000"/>
+                <w:sz w:val="18"/>
+                <w:szCs w:val="18"/>
+                <w:shd w:fill="auto" w:val="clear"/>
+                <w:rtl w:val="0"/>
+              </w:rPr>
+              <w:t xml:space="preserve">- 1,00 Stk Fahrzeugbereitstellung</w:t>
             </w:r>
             <w:r>
               <w:rPr>
@@ -1304,7 +1349,7 @@
                 <w:shd w:fill="auto" w:val="clear"/>
                 <w:rtl w:val="0"/>
               </w:rPr>
-              <w:t xml:space="preserve">- kkkkkk</w:t>
+              <w:t xml:space="preserve">- 1,00 Stk Bereitstellung und Vorhaltung von Maschinen &amp; Werkzeugen</w:t>
             </w:r>
             <w:r>
               <w:rPr>
@@ -1325,6 +1370,17 @@
             </w:pPr>
             <w:r>
               <w:rPr>
+                <w:rFonts w:ascii="Open Sans" w:cs="Open Sans" w:eastAsia="Open Sans" w:hAnsi="Open Sans"/>
+                <w:color w:val="000000"/>
+                <w:sz w:val="18"/>
+                <w:szCs w:val="18"/>
+                <w:shd w:fill="auto" w:val="clear"/>
+                <w:rtl w:val="0"/>
+              </w:rPr>
+              <w:t xml:space="preserve">- 1,00 Stk Beräumung der Baustelle</w:t>
+            </w:r>
+            <w:r>
+              <w:rPr>
                 <w:rtl w:val="0"/>
               </w:rPr>
             </w:r>
@@ -1336,34 +1392,6 @@
               <w:jc w:val="left"/>
               <w:rPr>
                 <w:color w:val="000000"/>
-                <w:sz w:val="20"/>
-                <w:szCs w:val="20"/>
-              </w:rPr>
-            </w:pPr>
-            <w:r>
-              <w:rPr>
-                <w:rFonts w:ascii="Open Sans" w:cs="Open Sans" w:eastAsia="Open Sans" w:hAnsi="Open Sans"/>
-                <w:color w:val="000000"/>
-                <w:sz w:val="20"/>
-                <w:szCs w:val="20"/>
-                <w:shd w:fill="auto" w:val="clear"/>
-                <w:rtl w:val="0"/>
-              </w:rPr>
-              <w:t xml:space="preserve">Enthält je Einheit</w:t>
-            </w:r>
-            <w:r>
-              <w:rPr>
-                <w:rtl w:val="0"/>
-              </w:rPr>
-            </w:r>
-          </w:p>
-          <w:p>
-            <w:pPr>
-              <w:spacing w:after="0" w:before="0" w:line="278.00000000000006" w:lineRule="auto"/>
-              <w:ind w:left="0" w:right="314" w:firstLine="0"/>
-              <w:jc w:val="left"/>
-              <w:rPr>
-                <w:color w:val="000000"/>
                 <w:sz w:val="18"/>
                 <w:szCs w:val="18"/>
               </w:rPr>
@@ -1377,91 +1405,7 @@
                 <w:shd w:fill="auto" w:val="clear"/>
                 <w:rtl w:val="0"/>
               </w:rPr>
-              <w:t xml:space="preserve">- 1,00 Stk Fahrzeugbereitstellung</w:t>
-            </w:r>
-            <w:r>
-              <w:rPr>
-                <w:rtl w:val="0"/>
-              </w:rPr>
-            </w:r>
-          </w:p>
-          <w:p>
-            <w:pPr>
-              <w:spacing w:after="0" w:before="0" w:line="278.00000000000006" w:lineRule="auto"/>
-              <w:ind w:left="0" w:right="314" w:firstLine="0"/>
-              <w:jc w:val="left"/>
-              <w:rPr>
-                <w:color w:val="000000"/>
-                <w:sz w:val="18"/>
-                <w:szCs w:val="18"/>
-              </w:rPr>
-            </w:pPr>
-            <w:r>
-              <w:rPr>
-                <w:rFonts w:ascii="Open Sans" w:cs="Open Sans" w:eastAsia="Open Sans" w:hAnsi="Open Sans"/>
-                <w:color w:val="000000"/>
-                <w:sz w:val="18"/>
-                <w:szCs w:val="18"/>
-                <w:shd w:fill="auto" w:val="clear"/>
-                <w:rtl w:val="0"/>
-              </w:rPr>
-              <w:t xml:space="preserve">- 1,00 Stk Bereitstellung und Vorhaltung von Maschinen &amp; Werkzeugen</w:t>
-            </w:r>
-            <w:r>
-              <w:rPr>
-                <w:rtl w:val="0"/>
-              </w:rPr>
-            </w:r>
-          </w:p>
-          <w:p>
-            <w:pPr>
-              <w:spacing w:after="0" w:before="0" w:line="278.00000000000006" w:lineRule="auto"/>
-              <w:ind w:left="0" w:right="314" w:firstLine="0"/>
-              <w:jc w:val="left"/>
-              <w:rPr>
-                <w:color w:val="000000"/>
-                <w:sz w:val="18"/>
-                <w:szCs w:val="18"/>
-              </w:rPr>
-            </w:pPr>
-            <w:r>
-              <w:rPr>
-                <w:rFonts w:ascii="Open Sans" w:cs="Open Sans" w:eastAsia="Open Sans" w:hAnsi="Open Sans"/>
-                <w:color w:val="000000"/>
-                <w:sz w:val="18"/>
-                <w:szCs w:val="18"/>
-                <w:shd w:fill="auto" w:val="clear"/>
-                <w:rtl w:val="0"/>
-              </w:rPr>
-              <w:t xml:space="preserve">- 1,00 Stk Beräumung der Baustelle</w:t>
-            </w:r>
-            <w:r>
-              <w:rPr>
-                <w:rtl w:val="0"/>
-              </w:rPr>
-            </w:r>
-          </w:p>
-          <w:p>
-            <w:pPr>
-              <w:spacing w:after="0" w:before="0" w:line="278.00000000000006" w:lineRule="auto"/>
-              <w:ind w:left="0" w:right="314" w:firstLine="0"/>
-              <w:jc w:val="left"/>
-              <w:rPr>
-                <w:color w:val="000000"/>
-                <w:sz w:val="18"/>
-                <w:szCs w:val="18"/>
-              </w:rPr>
-            </w:pPr>
-            <w:r>
-              <w:rPr>
-                <w:rFonts w:ascii="Open Sans" w:cs="Open Sans" w:eastAsia="Open Sans" w:hAnsi="Open Sans"/>
-                <w:color w:val="000000"/>
-                <w:sz w:val="18"/>
-                <w:szCs w:val="18"/>
-                <w:shd w:fill="auto" w:val="clear"/>
-                <w:rtl w:val="0"/>
-              </w:rPr>
-              <w:t xml:space="preserve">- 66 km Kilometerpauschale</w:t>
+              <w:t xml:space="preserve">- 114 km Kilometerpauschale</w:t>
             </w:r>
             <w:r>
               <w:rPr>
@@ -1747,7 +1691,7 @@
                 <w:shd w:fill="auto" w:val="clear"/>
                 <w:rtl w:val="0"/>
               </w:rPr>
-              <w:t xml:space="preserve">632,83 €</w:t>
+              <w:t xml:space="preserve">700,73 €</w:t>
             </w:r>
             <w:r>
               <w:rPr>
@@ -1779,7 +1723,7 @@
               <w:rPr>
                 <w:rtl w:val="0"/>
               </w:rPr>
-              <w:t xml:space="preserve">632,83 €</w:t>
+              <w:t xml:space="preserve">700,73 €</w:t>
             </w:r>
             <w:r>
               <w:rPr>
@@ -2074,7 +2018,7 @@
                 <w:shd w:fill="auto" w:val="clear"/>
                 <w:rtl w:val="0"/>
               </w:rPr>
-              <w:t xml:space="preserve">- 1 Stk 445</w:t>
+              <w:t xml:space="preserve">- 1 Stk rrr</w:t>
             </w:r>
           </w:p>
           <w:p>
@@ -2149,57 +2093,7 @@
                 <w:shd w:fill="auto" w:val="clear"/>
                 <w:rtl w:val="0"/>
               </w:rPr>
-              <w:t xml:space="preserve">- 1 Stk Falt-Pendeltür Hassmann</w:t>
-            </w:r>
-          </w:p>
-          <w:p>
-            <w:pPr>
-              <w:spacing w:after="0" w:before="0" w:line="278.00000000000006" w:lineRule="auto"/>
-              <w:ind w:left="0" w:right="314" w:firstLine="0"/>
-              <w:jc w:val="left"/>
-              <w:rPr>
-                <w:rFonts w:ascii="Open Sans" w:cs="Open Sans" w:eastAsia="Open Sans" w:hAnsi="Open Sans"/>
-                <w:color w:val="000000"/>
-                <w:sz w:val="18"/>
-                <w:szCs w:val="18"/>
-                <w:shd w:fill="auto" w:val="clear"/>
-              </w:rPr>
-            </w:pPr>
-            <w:r>
-              <w:rPr>
-                <w:rFonts w:ascii="Open Sans" w:cs="Open Sans" w:eastAsia="Open Sans" w:hAnsi="Open Sans"/>
-                <w:color w:val="000000"/>
-                <w:sz w:val="18"/>
-                <w:szCs w:val="18"/>
-                <w:shd w:fill="auto" w:val="clear"/>
-                <w:rtl w:val="0"/>
-              </w:rPr>
-              <w:t xml:space="preserve">- 1 Stk Walk-In Hassmann</w:t>
-            </w:r>
-          </w:p>
-          <w:p>
-            <w:pPr>
-              <w:spacing w:after="0" w:before="0" w:line="278.00000000000006" w:lineRule="auto"/>
-              <w:ind w:left="0" w:right="314" w:firstLine="0"/>
-              <w:jc w:val="left"/>
-              <w:rPr>
-                <w:rFonts w:ascii="Open Sans" w:cs="Open Sans" w:eastAsia="Open Sans" w:hAnsi="Open Sans"/>
-                <w:color w:val="000000"/>
-                <w:sz w:val="18"/>
-                <w:szCs w:val="18"/>
-                <w:shd w:fill="auto" w:val="clear"/>
-              </w:rPr>
-            </w:pPr>
-            <w:r>
-              <w:rPr>
-                <w:rFonts w:ascii="Open Sans" w:cs="Open Sans" w:eastAsia="Open Sans" w:hAnsi="Open Sans"/>
-                <w:color w:val="000000"/>
-                <w:sz w:val="18"/>
-                <w:szCs w:val="18"/>
-                <w:shd w:fill="auto" w:val="clear"/>
-                <w:rtl w:val="0"/>
-              </w:rPr>
-              <w:t xml:space="preserve">- 1 Stk 447</w:t>
+              <w:t xml:space="preserve">- 1 Stk ertttttt</w:t>
             </w:r>
           </w:p>
         </w:tc>
@@ -2468,7 +2362,7 @@
                 <w:shd w:fill="auto" w:val="clear"/>
                 <w:rtl w:val="0"/>
               </w:rPr>
-              <w:t xml:space="preserve">2.718,35 €</w:t>
+              <w:t xml:space="preserve">5.105,00 €</w:t>
             </w:r>
             <w:r>
               <w:rPr>
@@ -2637,7 +2531,7 @@
                 <w:shd w:fill="auto" w:val="clear"/>
                 <w:rtl w:val="0"/>
               </w:rPr>
-              <w:t xml:space="preserve">516,49 €</w:t>
+              <w:t xml:space="preserve">969,95 €</w:t>
             </w:r>
             <w:r>
               <w:rPr>
@@ -2806,7 +2700,7 @@
                 <w:shd w:fill="auto" w:val="clear"/>
                 <w:rtl w:val="0"/>
               </w:rPr>
-              <w:t xml:space="preserve">3.234,84 €</w:t>
+              <w:t xml:space="preserve">6.074,95 €</w:t>
             </w:r>
             <w:r>
               <w:rPr>

</xml_diff>

<commit_message>
Fußboden-Paneele unit price fix
</commit_message>
<xml_diff>
--- a/out-Angebot.docx
+++ b/out-Angebot.docx
@@ -123,7 +123,7 @@
               <w:rPr>
                 <w:rFonts w:eastAsia="Open Sans" w:cs="Open Sans" w:ascii="Open Sans" w:hAnsi="Open Sans"/>
               </w:rPr>
-              <w:t xml:space="preserve">Ray Dale44</w:t>
+              <w:t xml:space="preserve">Quentin Foster</w:t>
             </w:r>
           </w:p>
           <w:p>
@@ -140,7 +140,7 @@
               <w:rPr>
                 <w:rFonts w:eastAsia="Open Sans" w:cs="Open Sans" w:ascii="Open Sans" w:hAnsi="Open Sans"/>
               </w:rPr>
-              <w:t xml:space="preserve">Voluptatem pariatur</w:t>
+              <w:t xml:space="preserve">Optio exercitatione</w:t>
             </w:r>
           </w:p>
           <w:p>
@@ -159,7 +159,7 @@
               <w:rPr>
                 <w:rFonts w:eastAsia="Open Sans" w:cs="Open Sans" w:ascii="Open Sans" w:hAnsi="Open Sans"/>
               </w:rPr>
-              <w:t xml:space="preserve">Sed minim dignissimo Quos ad quo esse cum</w:t>
+              <w:t xml:space="preserve">Necessitatibus fuga Voluptas perferendis</w:t>
             </w:r>
           </w:p>
         </w:tc>
@@ -279,7 +279,7 @@
               <w:rPr>
                 <w:rFonts w:eastAsia="Open Sans" w:cs="Open Sans" w:ascii="Open Sans" w:hAnsi="Open Sans"/>
               </w:rPr>
-              <w:t xml:space="preserve">ANG2025-1110-113326</w:t>
+              <w:t xml:space="preserve">ANG2025-1111-122312</w:t>
             </w:r>
             <w:r>
               <w:rPr>
@@ -312,7 +312,7 @@
               <w:rPr>
                 <w:rFonts w:eastAsia="Open Sans" w:cs="Open Sans" w:ascii="Open Sans" w:hAnsi="Open Sans"/>
               </w:rPr>
-              <w:t xml:space="preserve">02.02.1981</w:t>
+              <w:t xml:space="preserve">06.09.1984</w:t>
             </w:r>
             <w:r>
               <w:rPr>
@@ -342,7 +342,7 @@
               <w:rPr>
                 <w:rFonts w:eastAsia="Open Sans" w:cs="Open Sans" w:ascii="Open Sans" w:hAnsi="Open Sans"/>
               </w:rPr>
-              <w:t xml:space="preserve">Mari Greer</w:t>
+              <w:t xml:space="preserve">Jaden Howell</w:t>
             </w:r>
             <w:r>
               <w:rPr>
@@ -474,7 +474,7 @@
               <w:rPr>
                 <w:rFonts w:eastAsia="Open Sans" w:cs="Open Sans" w:ascii="Open Sans" w:hAnsi="Open Sans"/>
               </w:rPr>
-              <w:t xml:space="preserve">Kasimir Burton</w:t>
+              <w:t xml:space="preserve">Willa Howell</w:t>
             </w:r>
           </w:p>
         </w:tc>
@@ -539,7 +539,7 @@
           <w:szCs w:val="24"/>
           <w:shd w:fill="auto" w:val="clear"/>
         </w:rPr>
-        <w:t xml:space="preserve">Ihr Angebot ANG2025-1110-113326</w:t>
+        <w:t xml:space="preserve">Ihr Angebot ANG2025-1111-122312</w:t>
       </w:r>
     </w:p>
     <w:p>
@@ -574,7 +574,7 @@
           <w:szCs w:val="22"/>
           <w:shd w:fill="auto" w:val="clear"/>
         </w:rPr>
-        <w:t xml:space="preserve">Sehr geehrte Frau Dale44,</w:t>
+        <w:t xml:space="preserve">Sehr geehrte Frau Foster,</w:t>
         <w:br/>
       </w:r>
     </w:p>
@@ -979,7 +979,7 @@
                 <w:szCs w:val="20"/>
                 <w:shd w:fill="auto" w:val="clear"/>
               </w:rPr>
-              <w:t xml:space="preserve">4.098,80 €</w:t>
+              <w:t xml:space="preserve">1.120,60 €</w:t>
             </w:r>
           </w:p>
         </w:tc>
@@ -1016,7 +1016,7 @@
                 <w:szCs w:val="20"/>
                 <w:shd w:fill="auto" w:val="clear"/>
               </w:rPr>
-              <w:t xml:space="preserve">4.098,80 €</w:t>
+              <w:t xml:space="preserve">1.120,60 €</w:t>
             </w:r>
           </w:p>
         </w:tc>
@@ -1265,7 +1265,7 @@
                 <w:szCs w:val="18"/>
                 <w:shd w:fill="auto" w:val="clear"/>
               </w:rPr>
-              <w:t xml:space="preserve">- 28 km Kilometerpauschale</w:t>
+              <w:t xml:space="preserve">- 76 km Kilometerpauschale</w:t>
             </w:r>
           </w:p>
         </w:tc>
@@ -1532,7 +1532,7 @@
                 <w:szCs w:val="20"/>
                 <w:shd w:fill="auto" w:val="clear"/>
               </w:rPr>
-              <w:t xml:space="preserve">575,77 €</w:t>
+              <w:t xml:space="preserve">3.362,09 €</w:t>
             </w:r>
           </w:p>
         </w:tc>
@@ -1559,7 +1559,7 @@
             </w:pPr>
             <w:r>
               <w:rPr/>
-              <w:t xml:space="preserve">575,77 €</w:t>
+              <w:t xml:space="preserve">3.362,09 €</w:t>
             </w:r>
           </w:p>
         </w:tc>
@@ -1723,7 +1723,7 @@
                 <w:szCs w:val="18"/>
                 <w:shd w:fill="auto" w:val="clear"/>
               </w:rPr>
-              <w:t xml:space="preserve">- 1 Stk Stelzlager höhenverstellar Set</w:t>
+              <w:t xml:space="preserve">- 1 Stk Kleinmaterial</w:t>
             </w:r>
           </w:p>
           <w:p>
@@ -1748,7 +1748,7 @@
                 <w:szCs w:val="18"/>
                 <w:shd w:fill="auto" w:val="clear"/>
               </w:rPr>
-              <w:t xml:space="preserve">- 1 Stk TRINNITY Wandabdichtung BASIS-Set 5 qm DW bis 100 x 100 / BW bis 180 x 80 cm</w:t>
+              <w:t xml:space="preserve">- 1 Stk Stelzlager höhenverstellar Set</w:t>
             </w:r>
           </w:p>
           <w:p>
@@ -1773,7 +1773,7 @@
                 <w:szCs w:val="18"/>
                 <w:shd w:fill="auto" w:val="clear"/>
               </w:rPr>
-              <w:t xml:space="preserve">- 2 Stk Abschlussprofil 3.0 255 cm silber eloxiert VIGOUR</w:t>
+              <w:t xml:space="preserve">- 16 Stk Fußboden-Paneele (1 Paneele = 0.3 m² ) — Farbe: Lava-Beige</w:t>
             </w:r>
           </w:p>
           <w:p>
@@ -1798,7 +1798,82 @@
                 <w:szCs w:val="18"/>
                 <w:shd w:fill="auto" w:val="clear"/>
               </w:rPr>
-              <w:t xml:space="preserve">- 2 Stk Silikon (pro Abschlussprofil 1 Stk)</w:t>
+              <w:t xml:space="preserve">- 7 Pkg Flächenkleber (1 Pkg je 0,60 m²)</w:t>
+            </w:r>
+          </w:p>
+          <w:p>
+            <w:pPr>
+              <w:pStyle w:val="normal1"/>
+              <w:spacing w:lineRule="auto" w:line="278" w:before="0" w:after="0"/>
+              <w:ind w:hanging="0" w:start="0" w:end="314"/>
+              <w:jc w:val="start"/>
+              <w:rPr>
+                <w:rFonts w:ascii="Open Sans" w:hAnsi="Open Sans" w:eastAsia="Open Sans" w:cs="Open Sans"/>
+                <w:color w:val="000000"/>
+                <w:sz w:val="18"/>
+                <w:szCs w:val="18"/>
+                <w:shd w:fill="auto" w:val="clear"/>
+              </w:rPr>
+            </w:pPr>
+            <w:r>
+              <w:rPr>
+                <w:rFonts w:eastAsia="Open Sans" w:cs="Open Sans" w:ascii="Open Sans" w:hAnsi="Open Sans"/>
+                <w:color w:val="000000"/>
+                <w:sz w:val="18"/>
+                <w:szCs w:val="18"/>
+                <w:shd w:fill="auto" w:val="clear"/>
+              </w:rPr>
+              <w:t xml:space="preserve">- 1 Stk TRINNITY Wandabdichtung BASIS-Set 5 qm DW bis 100 x 100 / BW bis 180 x 80 cm</w:t>
+            </w:r>
+          </w:p>
+          <w:p>
+            <w:pPr>
+              <w:pStyle w:val="normal1"/>
+              <w:spacing w:lineRule="auto" w:line="278" w:before="0" w:after="0"/>
+              <w:ind w:hanging="0" w:start="0" w:end="314"/>
+              <w:jc w:val="start"/>
+              <w:rPr>
+                <w:rFonts w:ascii="Open Sans" w:hAnsi="Open Sans" w:eastAsia="Open Sans" w:cs="Open Sans"/>
+                <w:color w:val="000000"/>
+                <w:sz w:val="18"/>
+                <w:szCs w:val="18"/>
+                <w:shd w:fill="auto" w:val="clear"/>
+              </w:rPr>
+            </w:pPr>
+            <w:r>
+              <w:rPr>
+                <w:rFonts w:eastAsia="Open Sans" w:cs="Open Sans" w:ascii="Open Sans" w:hAnsi="Open Sans"/>
+                <w:color w:val="000000"/>
+                <w:sz w:val="18"/>
+                <w:szCs w:val="18"/>
+                <w:shd w:fill="auto" w:val="clear"/>
+              </w:rPr>
+              <w:t xml:space="preserve">- 1 Stk Abschlussprofil 3.0 255 cm silber eloxiert VIGOUR</w:t>
+            </w:r>
+          </w:p>
+          <w:p>
+            <w:pPr>
+              <w:pStyle w:val="normal1"/>
+              <w:spacing w:lineRule="auto" w:line="278" w:before="0" w:after="0"/>
+              <w:ind w:hanging="0" w:start="0" w:end="314"/>
+              <w:jc w:val="start"/>
+              <w:rPr>
+                <w:rFonts w:ascii="Open Sans" w:hAnsi="Open Sans" w:eastAsia="Open Sans" w:cs="Open Sans"/>
+                <w:color w:val="000000"/>
+                <w:sz w:val="18"/>
+                <w:szCs w:val="18"/>
+                <w:shd w:fill="auto" w:val="clear"/>
+              </w:rPr>
+            </w:pPr>
+            <w:r>
+              <w:rPr>
+                <w:rFonts w:eastAsia="Open Sans" w:cs="Open Sans" w:ascii="Open Sans" w:hAnsi="Open Sans"/>
+                <w:color w:val="000000"/>
+                <w:sz w:val="18"/>
+                <w:szCs w:val="18"/>
+                <w:shd w:fill="auto" w:val="clear"/>
+              </w:rPr>
+              <w:t xml:space="preserve">- 1 Stk Silikon (pro Abschlussprofil 1 Stk)</w:t>
             </w:r>
           </w:p>
           <w:p>
@@ -2156,7 +2231,7 @@
                 <w:szCs w:val="22"/>
                 <w:shd w:fill="auto" w:val="clear"/>
               </w:rPr>
-              <w:t xml:space="preserve">4.962,46 €</w:t>
+              <w:t xml:space="preserve">5.606,92 €</w:t>
             </w:r>
             <w:r>
               <w:rPr>
@@ -2325,7 +2400,7 @@
                 <w:szCs w:val="22"/>
                 <w:shd w:fill="auto" w:val="clear"/>
               </w:rPr>
-              <w:t xml:space="preserve">942,87 €</w:t>
+              <w:t xml:space="preserve">1.065,31 €</w:t>
             </w:r>
             <w:r>
               <w:rPr>
@@ -2494,7 +2569,7 @@
                 <w:szCs w:val="22"/>
                 <w:shd w:fill="auto" w:val="clear"/>
               </w:rPr>
-              <w:t xml:space="preserve">5.905,33 €</w:t>
+              <w:t xml:space="preserve">6.672,23 €</w:t>
             </w:r>
             <w:r>
               <w:rPr>
@@ -2677,69 +2752,7 @@
           <w:szCs w:val="22"/>
           <w:shd w:fill="auto" w:val="clear"/>
         </w:rPr>
-        <w:t xml:space="preserve">abgerechnet. (Stundensatz-Facharbeiter: 69,50€ netto)</w:t>
-        <w:br/>
-        <w:br/>
-        <w:t xml:space="preserve">Der</w:t>
-      </w:r>
-      <w:r>
-        <w:rPr>
-          <w:rFonts w:eastAsia="Open Sans" w:cs="Open Sans" w:ascii="Open Sans" w:hAnsi="Open Sans"/>
-          <w:color w:val="030303"/>
-        </w:rPr>
-        <w:t xml:space="preserve"> </w:t>
-      </w:r>
-      <w:r>
-        <w:rPr>
-          <w:rFonts w:eastAsia="Open Sans" w:cs="Open Sans" w:ascii="Open Sans" w:hAnsi="Open Sans"/>
-          <w:color w:val="030303"/>
-          <w:sz w:val="22"/>
-          <w:szCs w:val="22"/>
-          <w:shd w:fill="auto" w:val="clear"/>
-        </w:rPr>
-        <w:t xml:space="preserve">Selbstkostenanteil beträgt </w:t>
-      </w:r>
-      <w:r>
-        <w:rPr>
-          <w:rFonts w:eastAsia="Open Sans" w:cs="Open Sans" w:ascii="Open Sans" w:hAnsi="Open Sans"/>
-          <w:b/>
-          <w:color w:val="030303"/>
-          <w:sz w:val="22"/>
-          <w:szCs w:val="22"/>
-          <w:shd w:fill="auto" w:val="clear"/>
-        </w:rPr>
-        <w:t xml:space="preserve">1.725,33 €</w:t>
-      </w:r>
-      <w:r>
-        <w:rPr>
-          <w:rFonts w:eastAsia="Open Sans" w:cs="Open Sans" w:ascii="Open Sans" w:hAnsi="Open Sans"/>
-          <w:color w:val="030303"/>
-          <w:sz w:val="22"/>
-          <w:szCs w:val="22"/>
-          <w:shd w:fill="auto" w:val="clear"/>
-        </w:rPr>
-        <w:t xml:space="preserve"> unter Berücksichtigung eines gewährten Zuschusses durch die Pflegekasse i.H.v. </w:t>
-      </w:r>
-      <w:r>
-        <w:rPr>
-          <w:rFonts w:eastAsia="Open Sans" w:cs="Open Sans" w:ascii="Open Sans" w:hAnsi="Open Sans"/>
-          <w:b/>
-          <w:color w:val="030303"/>
-          <w:sz w:val="22"/>
-          <w:szCs w:val="22"/>
-          <w:shd w:fill="auto" w:val="clear"/>
-        </w:rPr>
-        <w:t xml:space="preserve">4.180,00 €</w:t>
-      </w:r>
-      <w:r>
-        <w:rPr>
-          <w:rFonts w:eastAsia="Open Sans" w:cs="Open Sans" w:ascii="Open Sans" w:hAnsi="Open Sans"/>
-          <w:color w:val="030303"/>
-          <w:sz w:val="22"/>
-          <w:szCs w:val="22"/>
-          <w:shd w:fill="auto" w:val="clear"/>
-        </w:rPr>
-        <w:t xml:space="preserve">.</w:t>
+        <w:t xml:space="preserve">abgerechnet. (Stundensatz-Facharbeiter: 59,50€ netto)</w:t>
       </w:r>
     </w:p>
     <w:p>

</xml_diff>

<commit_message>
silikon qty min is = to abshlussQty
</commit_message>
<xml_diff>
--- a/out-Angebot.docx
+++ b/out-Angebot.docx
@@ -279,7 +279,7 @@
               <w:rPr>
                 <w:rFonts w:eastAsia="Open Sans" w:cs="Open Sans" w:ascii="Open Sans" w:hAnsi="Open Sans"/>
               </w:rPr>
-              <w:t xml:space="preserve">ANG2025-1111-122312</w:t>
+              <w:t xml:space="preserve">ANG2025-1111-123253</w:t>
             </w:r>
             <w:r>
               <w:rPr>
@@ -539,7 +539,7 @@
           <w:szCs w:val="24"/>
           <w:shd w:fill="auto" w:val="clear"/>
         </w:rPr>
-        <w:t xml:space="preserve">Ihr Angebot ANG2025-1111-122312</w:t>
+        <w:t xml:space="preserve">Ihr Angebot ANG2025-1111-123253</w:t>
       </w:r>
     </w:p>
     <w:p>
@@ -1532,7 +1532,7 @@
                 <w:szCs w:val="20"/>
                 <w:shd w:fill="auto" w:val="clear"/>
               </w:rPr>
-              <w:t xml:space="preserve">3.362,09 €</w:t>
+              <w:t xml:space="preserve">1.124,33 €</w:t>
             </w:r>
           </w:p>
         </w:tc>
@@ -1559,7 +1559,7 @@
             </w:pPr>
             <w:r>
               <w:rPr/>
-              <w:t xml:space="preserve">3.362,09 €</w:t>
+              <w:t xml:space="preserve">1.124,33 €</w:t>
             </w:r>
           </w:p>
         </w:tc>
@@ -1773,7 +1773,7 @@
                 <w:szCs w:val="18"/>
                 <w:shd w:fill="auto" w:val="clear"/>
               </w:rPr>
-              <w:t xml:space="preserve">- 16 Stk Fußboden-Paneele (1 Paneele = 0.3 m² ) — Farbe: Lava-Beige</w:t>
+              <w:t xml:space="preserve">- 16 Stk Fußboden-Paneele (1 Paneele = 0.3 m²)— Farbe: Lava-Beige</w:t>
             </w:r>
           </w:p>
           <w:p>
@@ -2231,7 +2231,7 @@
                 <w:szCs w:val="22"/>
                 <w:shd w:fill="auto" w:val="clear"/>
               </w:rPr>
-              <w:t xml:space="preserve">5.606,92 €</w:t>
+              <w:t xml:space="preserve">2.585,95 €</w:t>
             </w:r>
             <w:r>
               <w:rPr>
@@ -2400,7 +2400,7 @@
                 <w:szCs w:val="22"/>
                 <w:shd w:fill="auto" w:val="clear"/>
               </w:rPr>
-              <w:t xml:space="preserve">1.065,31 €</w:t>
+              <w:t xml:space="preserve">491,33 €</w:t>
             </w:r>
             <w:r>
               <w:rPr>
@@ -2569,7 +2569,7 @@
                 <w:szCs w:val="22"/>
                 <w:shd w:fill="auto" w:val="clear"/>
               </w:rPr>
-              <w:t xml:space="preserve">6.672,23 €</w:t>
+              <w:t xml:space="preserve">3.077,28 €</w:t>
             </w:r>
             <w:r>
               <w:rPr>

</xml_diff>

<commit_message>
cleaning whole css section
</commit_message>
<xml_diff>
--- a/out-Angebot.docx
+++ b/out-Angebot.docx
@@ -123,7 +123,7 @@
               <w:rPr>
                 <w:rFonts w:eastAsia="Open Sans" w:cs="Open Sans" w:ascii="Open Sans" w:hAnsi="Open Sans"/>
               </w:rPr>
-              <w:t xml:space="preserve">Quentin Foster</w:t>
+              <w:t xml:space="preserve">Lyle Nguyen</w:t>
             </w:r>
           </w:p>
           <w:p>
@@ -140,7 +140,7 @@
               <w:rPr>
                 <w:rFonts w:eastAsia="Open Sans" w:cs="Open Sans" w:ascii="Open Sans" w:hAnsi="Open Sans"/>
               </w:rPr>
-              <w:t xml:space="preserve">Optio exercitatione</w:t>
+              <w:t xml:space="preserve">Non quia nihil vel n</w:t>
             </w:r>
           </w:p>
           <w:p>
@@ -159,7 +159,7 @@
               <w:rPr>
                 <w:rFonts w:eastAsia="Open Sans" w:cs="Open Sans" w:ascii="Open Sans" w:hAnsi="Open Sans"/>
               </w:rPr>
-              <w:t xml:space="preserve">Necessitatibus fuga Voluptas perferendis</w:t>
+              <w:t xml:space="preserve">Culpa pariatur Ut  Veniam eligendi mol</w:t>
             </w:r>
           </w:p>
         </w:tc>
@@ -279,7 +279,7 @@
               <w:rPr>
                 <w:rFonts w:eastAsia="Open Sans" w:cs="Open Sans" w:ascii="Open Sans" w:hAnsi="Open Sans"/>
               </w:rPr>
-              <w:t xml:space="preserve">ANG2025-1111-123253</w:t>
+              <w:t xml:space="preserve">ANG2025-1112-141444</w:t>
             </w:r>
             <w:r>
               <w:rPr>
@@ -312,7 +312,7 @@
               <w:rPr>
                 <w:rFonts w:eastAsia="Open Sans" w:cs="Open Sans" w:ascii="Open Sans" w:hAnsi="Open Sans"/>
               </w:rPr>
-              <w:t xml:space="preserve">06.09.1984</w:t>
+              <w:t xml:space="preserve">19.09.1999</w:t>
             </w:r>
             <w:r>
               <w:rPr>
@@ -342,7 +342,7 @@
               <w:rPr>
                 <w:rFonts w:eastAsia="Open Sans" w:cs="Open Sans" w:ascii="Open Sans" w:hAnsi="Open Sans"/>
               </w:rPr>
-              <w:t xml:space="preserve">Jaden Howell</w:t>
+              <w:t xml:space="preserve">Aretha Madden</w:t>
             </w:r>
             <w:r>
               <w:rPr>
@@ -474,7 +474,7 @@
               <w:rPr>
                 <w:rFonts w:eastAsia="Open Sans" w:cs="Open Sans" w:ascii="Open Sans" w:hAnsi="Open Sans"/>
               </w:rPr>
-              <w:t xml:space="preserve">Willa Howell</w:t>
+              <w:t xml:space="preserve">Cassady Serrano</w:t>
             </w:r>
           </w:p>
         </w:tc>
@@ -539,7 +539,7 @@
           <w:szCs w:val="24"/>
           <w:shd w:fill="auto" w:val="clear"/>
         </w:rPr>
-        <w:t xml:space="preserve">Ihr Angebot ANG2025-1111-123253</w:t>
+        <w:t xml:space="preserve">Ihr Angebot ANG2025-1112-141444</w:t>
       </w:r>
     </w:p>
     <w:p>
@@ -574,7 +574,7 @@
           <w:szCs w:val="22"/>
           <w:shd w:fill="auto" w:val="clear"/>
         </w:rPr>
-        <w:t xml:space="preserve">Sehr geehrte Frau Foster,</w:t>
+        <w:t xml:space="preserve">Sehr geehrte Frau Nguyen,</w:t>
         <w:br/>
       </w:r>
     </w:p>
@@ -979,7 +979,7 @@
                 <w:szCs w:val="20"/>
                 <w:shd w:fill="auto" w:val="clear"/>
               </w:rPr>
-              <w:t xml:space="preserve">1.120,60 €</w:t>
+              <w:t xml:space="preserve">778,80 €</w:t>
             </w:r>
           </w:p>
         </w:tc>
@@ -1016,7 +1016,7 @@
                 <w:szCs w:val="20"/>
                 <w:shd w:fill="auto" w:val="clear"/>
               </w:rPr>
-              <w:t xml:space="preserve">1.120,60 €</w:t>
+              <w:t xml:space="preserve">778,80 €</w:t>
             </w:r>
           </w:p>
         </w:tc>
@@ -1265,7 +1265,7 @@
                 <w:szCs w:val="18"/>
                 <w:shd w:fill="auto" w:val="clear"/>
               </w:rPr>
-              <w:t xml:space="preserve">- 76 km Kilometerpauschale</w:t>
+              <w:t xml:space="preserve">- 88 km Kilometerpauschale</w:t>
             </w:r>
           </w:p>
         </w:tc>
@@ -1532,7 +1532,7 @@
                 <w:szCs w:val="20"/>
                 <w:shd w:fill="auto" w:val="clear"/>
               </w:rPr>
-              <w:t xml:space="preserve">1.124,33 €</w:t>
+              <w:t xml:space="preserve">688,73 €</w:t>
             </w:r>
           </w:p>
         </w:tc>
@@ -1559,7 +1559,7 @@
             </w:pPr>
             <w:r>
               <w:rPr/>
-              <w:t xml:space="preserve">1.124,33 €</w:t>
+              <w:t xml:space="preserve">688,73 €</w:t>
             </w:r>
           </w:p>
         </w:tc>
@@ -1773,7 +1773,7 @@
                 <w:szCs w:val="18"/>
                 <w:shd w:fill="auto" w:val="clear"/>
               </w:rPr>
-              <w:t xml:space="preserve">- 16 Stk Fußboden-Paneele (1 Paneele = 0.3 m²)— Farbe: Lava-Beige</w:t>
+              <w:t xml:space="preserve">- 1 Stk TRINNITY Wandabdichtung BASIS-Set 5 qm DW bis 100 x 100 / BW bis 180 x 80 cm</w:t>
             </w:r>
           </w:p>
           <w:p>
@@ -1798,7 +1798,7 @@
                 <w:szCs w:val="18"/>
                 <w:shd w:fill="auto" w:val="clear"/>
               </w:rPr>
-              <w:t xml:space="preserve">- 7 Pkg Flächenkleber (1 Pkg je 0,60 m²)</w:t>
+              <w:t xml:space="preserve">- 1 Stk Abschlussprofil 3.0 255 cm silber eloxiert VIGOUR</w:t>
             </w:r>
           </w:p>
           <w:p>
@@ -1823,57 +1823,7 @@
                 <w:szCs w:val="18"/>
                 <w:shd w:fill="auto" w:val="clear"/>
               </w:rPr>
-              <w:t xml:space="preserve">- 1 Stk TRINNITY Wandabdichtung BASIS-Set 5 qm DW bis 100 x 100 / BW bis 180 x 80 cm</w:t>
-            </w:r>
-          </w:p>
-          <w:p>
-            <w:pPr>
-              <w:pStyle w:val="normal1"/>
-              <w:spacing w:lineRule="auto" w:line="278" w:before="0" w:after="0"/>
-              <w:ind w:hanging="0" w:start="0" w:end="314"/>
-              <w:jc w:val="start"/>
-              <w:rPr>
-                <w:rFonts w:ascii="Open Sans" w:hAnsi="Open Sans" w:eastAsia="Open Sans" w:cs="Open Sans"/>
-                <w:color w:val="000000"/>
-                <w:sz w:val="18"/>
-                <w:szCs w:val="18"/>
-                <w:shd w:fill="auto" w:val="clear"/>
-              </w:rPr>
-            </w:pPr>
-            <w:r>
-              <w:rPr>
-                <w:rFonts w:eastAsia="Open Sans" w:cs="Open Sans" w:ascii="Open Sans" w:hAnsi="Open Sans"/>
-                <w:color w:val="000000"/>
-                <w:sz w:val="18"/>
-                <w:szCs w:val="18"/>
-                <w:shd w:fill="auto" w:val="clear"/>
-              </w:rPr>
-              <w:t xml:space="preserve">- 1 Stk Abschlussprofil 3.0 255 cm silber eloxiert VIGOUR</w:t>
-            </w:r>
-          </w:p>
-          <w:p>
-            <w:pPr>
-              <w:pStyle w:val="normal1"/>
-              <w:spacing w:lineRule="auto" w:line="278" w:before="0" w:after="0"/>
-              <w:ind w:hanging="0" w:start="0" w:end="314"/>
-              <w:jc w:val="start"/>
-              <w:rPr>
-                <w:rFonts w:ascii="Open Sans" w:hAnsi="Open Sans" w:eastAsia="Open Sans" w:cs="Open Sans"/>
-                <w:color w:val="000000"/>
-                <w:sz w:val="18"/>
-                <w:szCs w:val="18"/>
-                <w:shd w:fill="auto" w:val="clear"/>
-              </w:rPr>
-            </w:pPr>
-            <w:r>
-              <w:rPr>
-                <w:rFonts w:eastAsia="Open Sans" w:cs="Open Sans" w:ascii="Open Sans" w:hAnsi="Open Sans"/>
-                <w:color w:val="000000"/>
-                <w:sz w:val="18"/>
-                <w:szCs w:val="18"/>
-                <w:shd w:fill="auto" w:val="clear"/>
-              </w:rPr>
-              <w:t xml:space="preserve">- 1 Stk Silikon (pro Abschlussprofil 1 Stk)</w:t>
+              <w:t xml:space="preserve">- 1 Stk CARE Sanitär Silikon Manhatten 310ml</w:t>
             </w:r>
           </w:p>
           <w:p>
@@ -2231,7 +2181,7 @@
                 <w:szCs w:val="22"/>
                 <w:shd w:fill="auto" w:val="clear"/>
               </w:rPr>
-              <w:t xml:space="preserve">2.585,95 €</w:t>
+              <w:t xml:space="preserve">1.736,90 €</w:t>
             </w:r>
             <w:r>
               <w:rPr>
@@ -2400,7 +2350,7 @@
                 <w:szCs w:val="22"/>
                 <w:shd w:fill="auto" w:val="clear"/>
               </w:rPr>
-              <w:t xml:space="preserve">491,33 €</w:t>
+              <w:t xml:space="preserve">330,01 €</w:t>
             </w:r>
             <w:r>
               <w:rPr>
@@ -2569,7 +2519,7 @@
                 <w:szCs w:val="22"/>
                 <w:shd w:fill="auto" w:val="clear"/>
               </w:rPr>
-              <w:t xml:space="preserve">3.077,28 €</w:t>
+              <w:t xml:space="preserve">2.066,91 €</w:t>
             </w:r>
             <w:r>
               <w:rPr>
@@ -2752,7 +2702,7 @@
           <w:szCs w:val="22"/>
           <w:shd w:fill="auto" w:val="clear"/>
         </w:rPr>
-        <w:t xml:space="preserve">abgerechnet. (Stundensatz-Facharbeiter: 59,50€ netto)</w:t>
+        <w:t xml:space="preserve">abgerechnet. (Stundensatz-Facharbeiter: 69,50€ netto)</w:t>
       </w:r>
     </w:p>
     <w:p>

</xml_diff>

<commit_message>
choosing pages for every bereich possible now
</commit_message>
<xml_diff>
--- a/out-Angebot.docx
+++ b/out-Angebot.docx
@@ -123,7 +123,7 @@
               <w:rPr>
                 <w:rFonts w:eastAsia="Open Sans" w:cs="Open Sans" w:ascii="Open Sans" w:hAnsi="Open Sans"/>
               </w:rPr>
-              <w:t xml:space="preserve">Alfonso Hurst</w:t>
+              <w:t xml:space="preserve">rr rfd</w:t>
             </w:r>
           </w:p>
           <w:p>
@@ -140,7 +140,7 @@
               <w:rPr>
                 <w:rFonts w:eastAsia="Open Sans" w:cs="Open Sans" w:ascii="Open Sans" w:hAnsi="Open Sans"/>
               </w:rPr>
-              <w:t xml:space="preserve">Id sit proident odi</w:t>
+              <w:t/>
             </w:r>
           </w:p>
           <w:p>
@@ -159,7 +159,7 @@
               <w:rPr>
                 <w:rFonts w:eastAsia="Open Sans" w:cs="Open Sans" w:ascii="Open Sans" w:hAnsi="Open Sans"/>
               </w:rPr>
-              <w:t xml:space="preserve">Ipsam culpa est ist Voluptate rem invent</w:t>
+              <w:t xml:space="preserve"> </w:t>
             </w:r>
           </w:p>
         </w:tc>
@@ -279,7 +279,7 @@
               <w:rPr>
                 <w:rFonts w:eastAsia="Open Sans" w:cs="Open Sans" w:ascii="Open Sans" w:hAnsi="Open Sans"/>
               </w:rPr>
-              <w:t xml:space="preserve">ANG2025-1112-155506</w:t>
+              <w:t xml:space="preserve">ANG2025-1113-091842</w:t>
             </w:r>
             <w:r>
               <w:rPr>
@@ -312,7 +312,7 @@
               <w:rPr>
                 <w:rFonts w:eastAsia="Open Sans" w:cs="Open Sans" w:ascii="Open Sans" w:hAnsi="Open Sans"/>
               </w:rPr>
-              <w:t xml:space="preserve">13.11.1980</w:t>
+              <w:t xml:space="preserve">08.12.1995</w:t>
             </w:r>
             <w:r>
               <w:rPr>
@@ -342,7 +342,7 @@
               <w:rPr>
                 <w:rFonts w:eastAsia="Open Sans" w:cs="Open Sans" w:ascii="Open Sans" w:hAnsi="Open Sans"/>
               </w:rPr>
-              <w:t xml:space="preserve">Angelica Wilkins</w:t>
+              <w:t xml:space="preserve">hghgf</w:t>
             </w:r>
             <w:r>
               <w:rPr>
@@ -474,7 +474,7 @@
               <w:rPr>
                 <w:rFonts w:eastAsia="Open Sans" w:cs="Open Sans" w:ascii="Open Sans" w:hAnsi="Open Sans"/>
               </w:rPr>
-              <w:t xml:space="preserve">Emma Mann</w:t>
+              <w:t xml:space="preserve">zhh</w:t>
             </w:r>
           </w:p>
         </w:tc>
@@ -539,7 +539,7 @@
           <w:szCs w:val="24"/>
           <w:shd w:fill="auto" w:val="clear"/>
         </w:rPr>
-        <w:t xml:space="preserve">Ihr Angebot ANG2025-1112-155506</w:t>
+        <w:t xml:space="preserve">Ihr Angebot ANG2025-1113-091842</w:t>
       </w:r>
     </w:p>
     <w:p>
@@ -574,7 +574,7 @@
           <w:szCs w:val="22"/>
           <w:shd w:fill="auto" w:val="clear"/>
         </w:rPr>
-        <w:t xml:space="preserve">Sehr geehrte Frau Hurst,</w:t>
+        <w:t xml:space="preserve">Sehr geehrte Frau rfd,</w:t>
         <w:br/>
       </w:r>
     </w:p>
@@ -979,7 +979,7 @@
                 <w:szCs w:val="20"/>
                 <w:shd w:fill="auto" w:val="clear"/>
               </w:rPr>
-              <w:t xml:space="preserve">445,80 €</w:t>
+              <w:t xml:space="preserve">1.095,40 €</w:t>
             </w:r>
           </w:p>
         </w:tc>
@@ -1016,7 +1016,7 @@
                 <w:szCs w:val="20"/>
                 <w:shd w:fill="auto" w:val="clear"/>
               </w:rPr>
-              <w:t xml:space="preserve">445,80 €</w:t>
+              <w:t xml:space="preserve">1.095,40 €</w:t>
             </w:r>
           </w:p>
         </w:tc>
@@ -1265,7 +1265,7 @@
                 <w:szCs w:val="18"/>
                 <w:shd w:fill="auto" w:val="clear"/>
               </w:rPr>
-              <w:t xml:space="preserve">- 188 km Kilometerpauschale</w:t>
+              <w:t xml:space="preserve">- 4 km Kilometerpauschale</w:t>
             </w:r>
           </w:p>
         </w:tc>
@@ -1532,7 +1532,7 @@
                 <w:szCs w:val="20"/>
                 <w:shd w:fill="auto" w:val="clear"/>
               </w:rPr>
-              <w:t xml:space="preserve">568,33 €</w:t>
+              <w:t xml:space="preserve">425,89 €</w:t>
             </w:r>
           </w:p>
         </w:tc>
@@ -1559,7 +1559,7 @@
             </w:pPr>
             <w:r>
               <w:rPr/>
-              <w:t xml:space="preserve">568,33 €</w:t>
+              <w:t xml:space="preserve">425,89 €</w:t>
             </w:r>
           </w:p>
         </w:tc>
@@ -1798,7 +1798,7 @@
                 <w:szCs w:val="18"/>
                 <w:shd w:fill="auto" w:val="clear"/>
               </w:rPr>
-              <w:t xml:space="preserve">- 1 Stk Abschlussprofil 3.0 255 cm silber eloxiert VIGOUR</w:t>
+              <w:t xml:space="preserve">- 1 Pkg Flächenkleber (Wandverkleidung)</w:t>
             </w:r>
           </w:p>
           <w:p>
@@ -1823,7 +1823,7 @@
                 <w:szCs w:val="18"/>
                 <w:shd w:fill="auto" w:val="clear"/>
               </w:rPr>
-              <w:t xml:space="preserve">- 1 Stk CARE Sanitär Silikon Manhatten 310ml</w:t>
+              <w:t xml:space="preserve">- 1 Stk Abschlussprofil 3.0 255 cm silber eloxiert VIGOUR</w:t>
             </w:r>
           </w:p>
           <w:p>
@@ -1848,32 +1848,7 @@
                 <w:szCs w:val="18"/>
                 <w:shd w:fill="auto" w:val="clear"/>
               </w:rPr>
-              <w:t xml:space="preserve">- 1 Stk Pendeltür Hassmann</w:t>
-            </w:r>
-          </w:p>
-          <w:p>
-            <w:pPr>
-              <w:pStyle w:val="normal1"/>
-              <w:spacing w:lineRule="auto" w:line="278" w:before="0" w:after="0"/>
-              <w:ind w:hanging="0" w:start="0" w:end="314"/>
-              <w:jc w:val="start"/>
-              <w:rPr>
-                <w:rFonts w:ascii="Open Sans" w:hAnsi="Open Sans" w:eastAsia="Open Sans" w:cs="Open Sans"/>
-                <w:color w:val="000000"/>
-                <w:sz w:val="18"/>
-                <w:szCs w:val="18"/>
-                <w:shd w:fill="auto" w:val="clear"/>
-              </w:rPr>
-            </w:pPr>
-            <w:r>
-              <w:rPr>
-                <w:rFonts w:eastAsia="Open Sans" w:cs="Open Sans" w:ascii="Open Sans" w:hAnsi="Open Sans"/>
-                <w:color w:val="000000"/>
-                <w:sz w:val="18"/>
-                <w:szCs w:val="18"/>
-                <w:shd w:fill="auto" w:val="clear"/>
-              </w:rPr>
-              <w:t xml:space="preserve">- 1 Stk Gleittür Hassmann</w:t>
+              <w:t xml:space="preserve">- 1 Stk CARE Sanitär Silikon Manhatten 310ml</w:t>
             </w:r>
           </w:p>
         </w:tc>
@@ -2156,7 +2131,7 @@
                 <w:szCs w:val="22"/>
                 <w:shd w:fill="auto" w:val="clear"/>
               </w:rPr>
-              <w:t xml:space="preserve">1.160,55 €</w:t>
+              <w:t xml:space="preserve">1.617,85 €</w:t>
             </w:r>
             <w:r>
               <w:rPr>
@@ -2325,7 +2300,7 @@
                 <w:szCs w:val="22"/>
                 <w:shd w:fill="auto" w:val="clear"/>
               </w:rPr>
-              <w:t xml:space="preserve">220,50 €</w:t>
+              <w:t xml:space="preserve">307,39 €</w:t>
             </w:r>
             <w:r>
               <w:rPr>
@@ -2494,7 +2469,7 @@
                 <w:szCs w:val="22"/>
                 <w:shd w:fill="auto" w:val="clear"/>
               </w:rPr>
-              <w:t xml:space="preserve">1.381,05 €</w:t>
+              <w:t xml:space="preserve">1.925,24 €</w:t>
             </w:r>
             <w:r>
               <w:rPr>

</xml_diff>

<commit_message>
implement logic for payload to suit all diffewrent bereich
</commit_message>
<xml_diff>
--- a/out-Angebot.docx
+++ b/out-Angebot.docx
@@ -123,7 +123,7 @@
               <w:rPr>
                 <w:rFonts w:eastAsia="Open Sans" w:cs="Open Sans" w:ascii="Open Sans" w:hAnsi="Open Sans"/>
               </w:rPr>
-              <w:t xml:space="preserve">rr rfd</w:t>
+              <w:t xml:space="preserve">Jonah Brewer</w:t>
             </w:r>
           </w:p>
           <w:p>
@@ -140,7 +140,7 @@
               <w:rPr>
                 <w:rFonts w:eastAsia="Open Sans" w:cs="Open Sans" w:ascii="Open Sans" w:hAnsi="Open Sans"/>
               </w:rPr>
-              <w:t/>
+              <w:t xml:space="preserve">Ea nihil sequi labor</w:t>
             </w:r>
           </w:p>
           <w:p>
@@ -159,7 +159,7 @@
               <w:rPr>
                 <w:rFonts w:eastAsia="Open Sans" w:cs="Open Sans" w:ascii="Open Sans" w:hAnsi="Open Sans"/>
               </w:rPr>
-              <w:t xml:space="preserve"> </w:t>
+              <w:t xml:space="preserve">Aut recusandae Haru Eum ab qui proident</w:t>
             </w:r>
           </w:p>
         </w:tc>
@@ -279,7 +279,7 @@
               <w:rPr>
                 <w:rFonts w:eastAsia="Open Sans" w:cs="Open Sans" w:ascii="Open Sans" w:hAnsi="Open Sans"/>
               </w:rPr>
-              <w:t xml:space="preserve">ANG2025-1113-091842</w:t>
+              <w:t xml:space="preserve">ANG2025-1113-103008</w:t>
             </w:r>
             <w:r>
               <w:rPr>
@@ -312,7 +312,7 @@
               <w:rPr>
                 <w:rFonts w:eastAsia="Open Sans" w:cs="Open Sans" w:ascii="Open Sans" w:hAnsi="Open Sans"/>
               </w:rPr>
-              <w:t xml:space="preserve">08.12.1995</w:t>
+              <w:t xml:space="preserve">01.11.2018</w:t>
             </w:r>
             <w:r>
               <w:rPr>
@@ -342,7 +342,7 @@
               <w:rPr>
                 <w:rFonts w:eastAsia="Open Sans" w:cs="Open Sans" w:ascii="Open Sans" w:hAnsi="Open Sans"/>
               </w:rPr>
-              <w:t xml:space="preserve">hghgf</w:t>
+              <w:t xml:space="preserve">Adrienne Howell</w:t>
             </w:r>
             <w:r>
               <w:rPr>
@@ -474,7 +474,7 @@
               <w:rPr>
                 <w:rFonts w:eastAsia="Open Sans" w:cs="Open Sans" w:ascii="Open Sans" w:hAnsi="Open Sans"/>
               </w:rPr>
-              <w:t xml:space="preserve">zhh</w:t>
+              <w:t xml:space="preserve">Malcolm Pace</w:t>
             </w:r>
           </w:p>
         </w:tc>
@@ -539,7 +539,7 @@
           <w:szCs w:val="24"/>
           <w:shd w:fill="auto" w:val="clear"/>
         </w:rPr>
-        <w:t xml:space="preserve">Ihr Angebot ANG2025-1113-091842</w:t>
+        <w:t xml:space="preserve">Ihr Angebot ANG2025-1113-103008</w:t>
       </w:r>
     </w:p>
     <w:p>
@@ -574,7 +574,7 @@
           <w:szCs w:val="22"/>
           <w:shd w:fill="auto" w:val="clear"/>
         </w:rPr>
-        <w:t xml:space="preserve">Sehr geehrte Frau rfd,</w:t>
+        <w:t xml:space="preserve">Sehr geehrte Frau Brewer,</w:t>
         <w:br/>
       </w:r>
     </w:p>
@@ -979,7 +979,7 @@
                 <w:szCs w:val="20"/>
                 <w:shd w:fill="auto" w:val="clear"/>
               </w:rPr>
-              <w:t xml:space="preserve">1.095,40 €</w:t>
+              <w:t xml:space="preserve">449,40 €</w:t>
             </w:r>
           </w:p>
         </w:tc>
@@ -1016,7 +1016,7 @@
                 <w:szCs w:val="20"/>
                 <w:shd w:fill="auto" w:val="clear"/>
               </w:rPr>
-              <w:t xml:space="preserve">1.095,40 €</w:t>
+              <w:t xml:space="preserve">449,40 €</w:t>
             </w:r>
           </w:p>
         </w:tc>
@@ -1265,7 +1265,7 @@
                 <w:szCs w:val="18"/>
                 <w:shd w:fill="auto" w:val="clear"/>
               </w:rPr>
-              <w:t xml:space="preserve">- 4 km Kilometerpauschale</w:t>
+              <w:t xml:space="preserve">- 84 km Kilometerpauschale</w:t>
             </w:r>
           </w:p>
         </w:tc>
@@ -1532,7 +1532,7 @@
                 <w:szCs w:val="20"/>
                 <w:shd w:fill="auto" w:val="clear"/>
               </w:rPr>
-              <w:t xml:space="preserve">425,89 €</w:t>
+              <w:t xml:space="preserve">0,00 €</w:t>
             </w:r>
           </w:p>
         </w:tc>
@@ -1559,7 +1559,7 @@
             </w:pPr>
             <w:r>
               <w:rPr/>
-              <w:t xml:space="preserve">425,89 €</w:t>
+              <w:t xml:space="preserve">0,00 €</w:t>
             </w:r>
           </w:p>
         </w:tc>
@@ -1651,206 +1651,7 @@
             </w:tcBorders>
             <w:shd w:fill="FFFFFF" w:val="clear"/>
           </w:tcPr>
-          <w:p>
-            <w:pPr>
-              <w:pStyle w:val="normal1"/>
-              <w:spacing w:lineRule="auto" w:line="278" w:before="0" w:after="0"/>
-              <w:ind w:hanging="0" w:start="0" w:end="314"/>
-              <w:jc w:val="start"/>
-              <w:rPr>
-                <w:rFonts w:ascii="Open Sans" w:hAnsi="Open Sans" w:eastAsia="Open Sans" w:cs="Open Sans"/>
-                <w:color w:val="000000"/>
-                <w:sz w:val="18"/>
-                <w:szCs w:val="18"/>
-                <w:shd w:fill="auto" w:val="clear"/>
-              </w:rPr>
-            </w:pPr>
-            <w:r>
-              <w:rPr>
-                <w:rFonts w:eastAsia="Open Sans" w:cs="Open Sans" w:ascii="Open Sans" w:hAnsi="Open Sans"/>
-                <w:color w:val="000000"/>
-                <w:sz w:val="18"/>
-                <w:szCs w:val="18"/>
-                <w:shd w:fill="auto" w:val="clear"/>
-              </w:rPr>
-              <w:t xml:space="preserve">- 1 Stk TRINNITY Wannenabdichtband-Set 3,4 m Nass-/Trockenanbindung entspr. DIN 18534</w:t>
-            </w:r>
-          </w:p>
-          <w:p>
-            <w:pPr>
-              <w:pStyle w:val="normal1"/>
-              <w:spacing w:lineRule="auto" w:line="278" w:before="0" w:after="0"/>
-              <w:ind w:hanging="0" w:start="0" w:end="314"/>
-              <w:jc w:val="start"/>
-              <w:rPr>
-                <w:rFonts w:ascii="Open Sans" w:hAnsi="Open Sans" w:eastAsia="Open Sans" w:cs="Open Sans"/>
-                <w:color w:val="000000"/>
-                <w:sz w:val="18"/>
-                <w:szCs w:val="18"/>
-                <w:shd w:fill="auto" w:val="clear"/>
-              </w:rPr>
-            </w:pPr>
-            <w:r>
-              <w:rPr>
-                <w:rFonts w:eastAsia="Open Sans" w:cs="Open Sans" w:ascii="Open Sans" w:hAnsi="Open Sans"/>
-                <w:color w:val="000000"/>
-                <w:sz w:val="18"/>
-                <w:szCs w:val="18"/>
-                <w:shd w:fill="auto" w:val="clear"/>
-              </w:rPr>
-              <w:t xml:space="preserve">- 1 Stk Ablaufgarnitur Rohbauset m.Sifon BH60mm f.flache Duschw.m.90mm Ablauf TRINNITY</w:t>
-            </w:r>
-          </w:p>
-          <w:p>
-            <w:pPr>
-              <w:pStyle w:val="normal1"/>
-              <w:spacing w:lineRule="auto" w:line="278" w:before="0" w:after="0"/>
-              <w:ind w:hanging="0" w:start="0" w:end="314"/>
-              <w:jc w:val="start"/>
-              <w:rPr>
-                <w:rFonts w:ascii="Open Sans" w:hAnsi="Open Sans" w:eastAsia="Open Sans" w:cs="Open Sans"/>
-                <w:color w:val="000000"/>
-                <w:sz w:val="18"/>
-                <w:szCs w:val="18"/>
-                <w:shd w:fill="auto" w:val="clear"/>
-              </w:rPr>
-            </w:pPr>
-            <w:r>
-              <w:rPr>
-                <w:rFonts w:eastAsia="Open Sans" w:cs="Open Sans" w:ascii="Open Sans" w:hAnsi="Open Sans"/>
-                <w:color w:val="000000"/>
-                <w:sz w:val="18"/>
-                <w:szCs w:val="18"/>
-                <w:shd w:fill="auto" w:val="clear"/>
-              </w:rPr>
-              <w:t xml:space="preserve">- 1 Stk Kleinmaterial</w:t>
-            </w:r>
-          </w:p>
-          <w:p>
-            <w:pPr>
-              <w:pStyle w:val="normal1"/>
-              <w:spacing w:lineRule="auto" w:line="278" w:before="0" w:after="0"/>
-              <w:ind w:hanging="0" w:start="0" w:end="314"/>
-              <w:jc w:val="start"/>
-              <w:rPr>
-                <w:rFonts w:ascii="Open Sans" w:hAnsi="Open Sans" w:eastAsia="Open Sans" w:cs="Open Sans"/>
-                <w:color w:val="000000"/>
-                <w:sz w:val="18"/>
-                <w:szCs w:val="18"/>
-                <w:shd w:fill="auto" w:val="clear"/>
-              </w:rPr>
-            </w:pPr>
-            <w:r>
-              <w:rPr>
-                <w:rFonts w:eastAsia="Open Sans" w:cs="Open Sans" w:ascii="Open Sans" w:hAnsi="Open Sans"/>
-                <w:color w:val="000000"/>
-                <w:sz w:val="18"/>
-                <w:szCs w:val="18"/>
-                <w:shd w:fill="auto" w:val="clear"/>
-              </w:rPr>
-              <w:t xml:space="preserve">- 1 Stk Stelzlager höhenverstellar Set</w:t>
-            </w:r>
-          </w:p>
-          <w:p>
-            <w:pPr>
-              <w:pStyle w:val="normal1"/>
-              <w:spacing w:lineRule="auto" w:line="278" w:before="0" w:after="0"/>
-              <w:ind w:hanging="0" w:start="0" w:end="314"/>
-              <w:jc w:val="start"/>
-              <w:rPr>
-                <w:rFonts w:ascii="Open Sans" w:hAnsi="Open Sans" w:eastAsia="Open Sans" w:cs="Open Sans"/>
-                <w:color w:val="000000"/>
-                <w:sz w:val="18"/>
-                <w:szCs w:val="18"/>
-                <w:shd w:fill="auto" w:val="clear"/>
-              </w:rPr>
-            </w:pPr>
-            <w:r>
-              <w:rPr>
-                <w:rFonts w:eastAsia="Open Sans" w:cs="Open Sans" w:ascii="Open Sans" w:hAnsi="Open Sans"/>
-                <w:color w:val="000000"/>
-                <w:sz w:val="18"/>
-                <w:szCs w:val="18"/>
-                <w:shd w:fill="auto" w:val="clear"/>
-              </w:rPr>
-              <w:t xml:space="preserve">- 1 Stk TRINNITY Wandabdichtung BASIS-Set 5 qm DW bis 100 x 100 / BW bis 180 x 80 cm</w:t>
-            </w:r>
-          </w:p>
-          <w:p>
-            <w:pPr>
-              <w:pStyle w:val="normal1"/>
-              <w:spacing w:lineRule="auto" w:line="278" w:before="0" w:after="0"/>
-              <w:ind w:hanging="0" w:start="0" w:end="314"/>
-              <w:jc w:val="start"/>
-              <w:rPr>
-                <w:rFonts w:ascii="Open Sans" w:hAnsi="Open Sans" w:eastAsia="Open Sans" w:cs="Open Sans"/>
-                <w:color w:val="000000"/>
-                <w:sz w:val="18"/>
-                <w:szCs w:val="18"/>
-                <w:shd w:fill="auto" w:val="clear"/>
-              </w:rPr>
-            </w:pPr>
-            <w:r>
-              <w:rPr>
-                <w:rFonts w:eastAsia="Open Sans" w:cs="Open Sans" w:ascii="Open Sans" w:hAnsi="Open Sans"/>
-                <w:color w:val="000000"/>
-                <w:sz w:val="18"/>
-                <w:szCs w:val="18"/>
-                <w:shd w:fill="auto" w:val="clear"/>
-              </w:rPr>
-              <w:t xml:space="preserve">- 1 Pkg Flächenkleber (Wandverkleidung)</w:t>
-            </w:r>
-          </w:p>
-          <w:p>
-            <w:pPr>
-              <w:pStyle w:val="normal1"/>
-              <w:spacing w:lineRule="auto" w:line="278" w:before="0" w:after="0"/>
-              <w:ind w:hanging="0" w:start="0" w:end="314"/>
-              <w:jc w:val="start"/>
-              <w:rPr>
-                <w:rFonts w:ascii="Open Sans" w:hAnsi="Open Sans" w:eastAsia="Open Sans" w:cs="Open Sans"/>
-                <w:color w:val="000000"/>
-                <w:sz w:val="18"/>
-                <w:szCs w:val="18"/>
-                <w:shd w:fill="auto" w:val="clear"/>
-              </w:rPr>
-            </w:pPr>
-            <w:r>
-              <w:rPr>
-                <w:rFonts w:eastAsia="Open Sans" w:cs="Open Sans" w:ascii="Open Sans" w:hAnsi="Open Sans"/>
-                <w:color w:val="000000"/>
-                <w:sz w:val="18"/>
-                <w:szCs w:val="18"/>
-                <w:shd w:fill="auto" w:val="clear"/>
-              </w:rPr>
-              <w:t xml:space="preserve">- 1 Stk Abschlussprofil 3.0 255 cm silber eloxiert VIGOUR</w:t>
-            </w:r>
-          </w:p>
-          <w:p>
-            <w:pPr>
-              <w:pStyle w:val="normal1"/>
-              <w:spacing w:lineRule="auto" w:line="278" w:before="0" w:after="0"/>
-              <w:ind w:hanging="0" w:start="0" w:end="314"/>
-              <w:jc w:val="start"/>
-              <w:rPr>
-                <w:rFonts w:ascii="Open Sans" w:hAnsi="Open Sans" w:eastAsia="Open Sans" w:cs="Open Sans"/>
-                <w:color w:val="000000"/>
-                <w:sz w:val="18"/>
-                <w:szCs w:val="18"/>
-                <w:shd w:fill="auto" w:val="clear"/>
-              </w:rPr>
-            </w:pPr>
-            <w:r>
-              <w:rPr>
-                <w:rFonts w:eastAsia="Open Sans" w:cs="Open Sans" w:ascii="Open Sans" w:hAnsi="Open Sans"/>
-                <w:color w:val="000000"/>
-                <w:sz w:val="18"/>
-                <w:szCs w:val="18"/>
-                <w:shd w:fill="auto" w:val="clear"/>
-              </w:rPr>
-              <w:t xml:space="preserve">- 1 Stk CARE Sanitär Silikon Manhatten 310ml</w:t>
-            </w:r>
-          </w:p>
+          <w:p/>
         </w:tc>
         <w:tc>
           <w:tcPr>
@@ -2131,7 +1932,7 @@
                 <w:szCs w:val="22"/>
                 <w:shd w:fill="auto" w:val="clear"/>
               </w:rPr>
-              <w:t xml:space="preserve">1.617,85 €</w:t>
+              <w:t xml:space="preserve">449,40 €</w:t>
             </w:r>
             <w:r>
               <w:rPr>
@@ -2300,7 +2101,7 @@
                 <w:szCs w:val="22"/>
                 <w:shd w:fill="auto" w:val="clear"/>
               </w:rPr>
-              <w:t xml:space="preserve">307,39 €</w:t>
+              <w:t xml:space="preserve">85,39 €</w:t>
             </w:r>
             <w:r>
               <w:rPr>
@@ -2469,7 +2270,7 @@
                 <w:szCs w:val="22"/>
                 <w:shd w:fill="auto" w:val="clear"/>
               </w:rPr>
-              <w:t xml:space="preserve">1.925,24 €</w:t>
+              <w:t xml:space="preserve">534,79 €</w:t>
             </w:r>
             <w:r>
               <w:rPr>
@@ -2532,65 +2333,6 @@
           <w:shd w:fill="auto" w:val="clear"/>
         </w:rPr>
         <w:t xml:space="preserve">Es handelt sich hierbei um ein Festpreisangebot für die oben definierten Leistungen.</w:t>
-      </w:r>
-    </w:p>
-    <w:p>
-      <w:pPr>
-        <w:pStyle w:val="normal1"/>
-        <w:spacing w:lineRule="auto" w:line="240" w:before="23" w:after="0"/>
-        <w:ind w:hanging="0" w:start="0" w:end="0"/>
-        <w:jc w:val="start"/>
-        <w:rPr>
-          <w:rFonts w:ascii="Open Sans" w:hAnsi="Open Sans" w:eastAsia="Open Sans" w:cs="Open Sans"/>
-          <w:color w:val="000000"/>
-          <w:sz w:val="22"/>
-          <w:szCs w:val="22"/>
-          <w:shd w:fill="auto" w:val="clear"/>
-        </w:rPr>
-      </w:pPr>
-      <w:r>
-        <w:rPr>
-          <w:rFonts w:eastAsia="Open Sans" w:cs="Open Sans" w:ascii="Open Sans" w:hAnsi="Open Sans"/>
-          <w:color w:val="000000"/>
-          <w:sz w:val="22"/>
-          <w:szCs w:val="22"/>
-          <w:shd w:fill="auto" w:val="clear"/>
-        </w:rPr>
-      </w:r>
-    </w:p>
-    <w:p>
-      <w:pPr>
-        <w:pStyle w:val="normal1"/>
-        <w:spacing w:lineRule="auto" w:line="286" w:before="0" w:after="0"/>
-        <w:ind w:hanging="0" w:start="123" w:end="0"/>
-        <w:jc w:val="start"/>
-        <w:rPr>
-          <w:rFonts w:ascii="Open Sans" w:hAnsi="Open Sans" w:eastAsia="Open Sans" w:cs="Open Sans"/>
-          <w:color w:val="000000"/>
-          <w:sz w:val="22"/>
-          <w:szCs w:val="22"/>
-          <w:shd w:fill="auto" w:val="clear"/>
-        </w:rPr>
-      </w:pPr>
-      <w:r>
-        <w:rPr>
-          <w:rFonts w:eastAsia="Open Sans SemiBold" w:cs="Open Sans SemiBold" w:ascii="Open Sans SemiBold" w:hAnsi="Open Sans SemiBold"/>
-          <w:color w:val="030303"/>
-          <w:sz w:val="22"/>
-          <w:szCs w:val="22"/>
-          <w:shd w:fill="auto" w:val="clear"/>
-        </w:rPr>
-        <w:t xml:space="preserve">ACHTUNG:</w:t>
-      </w:r>
-      <w:r>
-        <w:rPr>
-          <w:rFonts w:eastAsia="Open Sans" w:cs="Open Sans" w:ascii="Open Sans" w:hAnsi="Open Sans"/>
-          <w:color w:val="030303"/>
-          <w:sz w:val="22"/>
-          <w:szCs w:val="22"/>
-          <w:shd w:fill="auto" w:val="clear"/>
-        </w:rPr>
-        <w:t xml:space="preserve"> Ob eine ebenerdige Montage der Duschwanne möglich ist, kann erst nach dem Ausbau der bestehenden Wanne beurteilen werden. Sollten dabei zusätzliche oder weitere Leistungen erforderlich oder von Ihnen gewünscht sein, können zusätzliche Kosten entstehen.</w:t>
         <w:br/>
       </w:r>
     </w:p>
@@ -2652,7 +2394,7 @@
           <w:szCs w:val="22"/>
           <w:shd w:fill="auto" w:val="clear"/>
         </w:rPr>
-        <w:t xml:space="preserve">abgerechnet. (Stundensatz-Facharbeiter: 59,50€ netto)</w:t>
+        <w:t xml:space="preserve">abgerechnet. (Stundensatz-Facharbeiter: 69,50€ netto)</w:t>
       </w:r>
     </w:p>
     <w:p>

</xml_diff>

<commit_message>
fixing reload problem + manualtype pages in address bar
</commit_message>
<xml_diff>
--- a/out-Angebot.docx
+++ b/out-Angebot.docx
@@ -123,7 +123,7 @@
               <w:rPr>
                 <w:rFonts w:eastAsia="Open Sans" w:cs="Open Sans" w:ascii="Open Sans" w:hAnsi="Open Sans"/>
               </w:rPr>
-              <w:t xml:space="preserve">Jennifer Clements</w:t>
+              <w:t xml:space="preserve">Blaze Wheeler</w:t>
             </w:r>
           </w:p>
           <w:p>
@@ -140,7 +140,7 @@
               <w:rPr>
                 <w:rFonts w:eastAsia="Open Sans" w:cs="Open Sans" w:ascii="Open Sans" w:hAnsi="Open Sans"/>
               </w:rPr>
-              <w:t xml:space="preserve">Minim qui asperiores</w:t>
+              <w:t xml:space="preserve">Ut et totam maxime i</w:t>
             </w:r>
           </w:p>
           <w:p>
@@ -159,7 +159,7 @@
               <w:rPr>
                 <w:rFonts w:eastAsia="Open Sans" w:cs="Open Sans" w:ascii="Open Sans" w:hAnsi="Open Sans"/>
               </w:rPr>
-              <w:t xml:space="preserve">Accusamus ea porro i Incididunt commodo e</w:t>
+              <w:t xml:space="preserve">Aperiam eius delenit Natus eos qui ut eos</w:t>
             </w:r>
           </w:p>
         </w:tc>
@@ -279,7 +279,7 @@
               <w:rPr>
                 <w:rFonts w:eastAsia="Open Sans" w:cs="Open Sans" w:ascii="Open Sans" w:hAnsi="Open Sans"/>
               </w:rPr>
-              <w:t xml:space="preserve">ANG2025-1113-104244</w:t>
+              <w:t xml:space="preserve">ANG2025-1114-085834</w:t>
             </w:r>
             <w:r>
               <w:rPr>
@@ -312,7 +312,7 @@
               <w:rPr>
                 <w:rFonts w:eastAsia="Open Sans" w:cs="Open Sans" w:ascii="Open Sans" w:hAnsi="Open Sans"/>
               </w:rPr>
-              <w:t xml:space="preserve">10.12.2021</w:t>
+              <w:t xml:space="preserve">11.06.2015</w:t>
             </w:r>
             <w:r>
               <w:rPr>
@@ -342,7 +342,7 @@
               <w:rPr>
                 <w:rFonts w:eastAsia="Open Sans" w:cs="Open Sans" w:ascii="Open Sans" w:hAnsi="Open Sans"/>
               </w:rPr>
-              <w:t xml:space="preserve">Orla Macias</w:t>
+              <w:t xml:space="preserve">Quintessa Curry</w:t>
             </w:r>
             <w:r>
               <w:rPr>
@@ -474,7 +474,7 @@
               <w:rPr>
                 <w:rFonts w:eastAsia="Open Sans" w:cs="Open Sans" w:ascii="Open Sans" w:hAnsi="Open Sans"/>
               </w:rPr>
-              <w:t xml:space="preserve">Cynthia Landry</w:t>
+              <w:t xml:space="preserve">Kelsie Lamb</w:t>
             </w:r>
           </w:p>
         </w:tc>
@@ -539,7 +539,7 @@
           <w:szCs w:val="24"/>
           <w:shd w:fill="auto" w:val="clear"/>
         </w:rPr>
-        <w:t xml:space="preserve">Ihr Angebot ANG2025-1113-104244</w:t>
+        <w:t xml:space="preserve">Ihr Angebot ANG2025-1114-085834</w:t>
       </w:r>
     </w:p>
     <w:p>
@@ -574,7 +574,7 @@
           <w:szCs w:val="22"/>
           <w:shd w:fill="auto" w:val="clear"/>
         </w:rPr>
-        <w:t xml:space="preserve">Sehr geehrte Frau Clements,</w:t>
+        <w:t xml:space="preserve">Sehr geehrte Frau Wheeler,</w:t>
         <w:br/>
       </w:r>
     </w:p>
@@ -979,7 +979,7 @@
                 <w:szCs w:val="20"/>
                 <w:shd w:fill="auto" w:val="clear"/>
               </w:rPr>
-              <w:t xml:space="preserve">669,90 €</w:t>
+              <w:t xml:space="preserve">391,90 €</w:t>
             </w:r>
           </w:p>
         </w:tc>
@@ -1016,7 +1016,7 @@
                 <w:szCs w:val="20"/>
                 <w:shd w:fill="auto" w:val="clear"/>
               </w:rPr>
-              <w:t xml:space="preserve">669,90 €</w:t>
+              <w:t xml:space="preserve">391,90 €</w:t>
             </w:r>
           </w:p>
         </w:tc>
@@ -1265,7 +1265,7 @@
                 <w:szCs w:val="18"/>
                 <w:shd w:fill="auto" w:val="clear"/>
               </w:rPr>
-              <w:t xml:space="preserve">- 174 km Kilometerpauschale</w:t>
+              <w:t xml:space="preserve">- 34 km Kilometerpauschale</w:t>
             </w:r>
           </w:p>
         </w:tc>
@@ -1932,7 +1932,7 @@
                 <w:szCs w:val="22"/>
                 <w:shd w:fill="auto" w:val="clear"/>
               </w:rPr>
-              <w:t xml:space="preserve">669,90 €</w:t>
+              <w:t xml:space="preserve">391,90 €</w:t>
             </w:r>
             <w:r>
               <w:rPr>
@@ -2101,7 +2101,7 @@
                 <w:szCs w:val="22"/>
                 <w:shd w:fill="auto" w:val="clear"/>
               </w:rPr>
-              <w:t xml:space="preserve">127,28 €</w:t>
+              <w:t xml:space="preserve">74,46 €</w:t>
             </w:r>
             <w:r>
               <w:rPr>
@@ -2270,7 +2270,7 @@
                 <w:szCs w:val="22"/>
                 <w:shd w:fill="auto" w:val="clear"/>
               </w:rPr>
-              <w:t xml:space="preserve">797,18 €</w:t>
+              <w:t xml:space="preserve">466,36 €</w:t>
             </w:r>
             <w:r>
               <w:rPr>
@@ -2394,7 +2394,7 @@
           <w:szCs w:val="22"/>
           <w:shd w:fill="auto" w:val="clear"/>
         </w:rPr>
-        <w:t xml:space="preserve">abgerechnet. (Stundensatz-Facharbeiter: 69,50€ netto)</w:t>
+        <w:t xml:space="preserve">abgerechnet. (Stundensatz-Facharbeiter: 59,50€ netto)</w:t>
       </w:r>
     </w:p>
     <w:p>

</xml_diff>

<commit_message>
step 1 of pricing.js become offer-aware
</commit_message>
<xml_diff>
--- a/out-Angebot.docx
+++ b/out-Angebot.docx
@@ -140,7 +140,7 @@
               <w:rPr>
                 <w:rFonts w:ascii="Open Sans" w:eastAsia="Open Sans" w:hAnsi="Open Sans" w:cs="Open Sans"/>
               </w:rPr>
-              <w:t xml:space="preserve">Ferris</w:t>
+              <w:t xml:space="preserve">Geoffrey</w:t>
             </w:r>
             <w:proofErr w:type="spellStart"/>
             <w:r>
@@ -154,7 +154,7 @@
               <w:rPr>
                 <w:rFonts w:ascii="Open Sans" w:eastAsia="Open Sans" w:hAnsi="Open Sans" w:cs="Open Sans"/>
               </w:rPr>
-              <w:t xml:space="preserve"> Conway</w:t>
+              <w:t xml:space="preserve"> Knapp</w:t>
             </w:r>
             <w:proofErr w:type="spellStart"/>
             <w:r>
@@ -185,7 +185,7 @@
               <w:rPr>
                 <w:rFonts w:ascii="Open Sans" w:eastAsia="Open Sans" w:hAnsi="Open Sans" w:cs="Open Sans"/>
               </w:rPr>
-              <w:t xml:space="preserve">Dolor non temporibus</w:t>
+              <w:t xml:space="preserve">Laborum Ea velit be</w:t>
             </w:r>
             <w:proofErr w:type="spellStart"/>
             <w:r>
@@ -218,7 +218,7 @@
               <w:rPr>
                 <w:rFonts w:ascii="Open Sans" w:eastAsia="Open Sans" w:hAnsi="Open Sans" w:cs="Open Sans"/>
               </w:rPr>
-              <w:t xml:space="preserve">Exercitationem autem Vitae iusto commodo </w:t>
+              <w:t xml:space="preserve">Ut maxime sit nulla  In in voluptatum sol</w:t>
             </w:r>
           </w:p>
         </w:tc>
@@ -355,7 +355,7 @@
                 <w:rFonts w:ascii="Open Sans" w:eastAsia="Open Sans" w:hAnsi="Open Sans" w:cs="Open Sans"/>
                 <w:lang w:val="de-DE"/>
               </w:rPr>
-              <w:t xml:space="preserve">ANG2025-1114-144445</w:t>
+              <w:t xml:space="preserve">ANG2025-1114-165047</w:t>
             </w:r>
             <w:r>
               <w:rPr>
@@ -392,7 +392,7 @@
                 <w:rFonts w:ascii="Open Sans" w:eastAsia="Open Sans" w:hAnsi="Open Sans" w:cs="Open Sans"/>
                 <w:lang w:val="de-DE"/>
               </w:rPr>
-              <w:t xml:space="preserve">12.03.1987</w:t>
+              <w:t xml:space="preserve">02.10.2005</w:t>
             </w:r>
             <w:r>
               <w:rPr>
@@ -426,7 +426,7 @@
                 <w:rFonts w:ascii="Open Sans" w:eastAsia="Open Sans" w:hAnsi="Open Sans" w:cs="Open Sans"/>
                 <w:lang w:val="de-DE"/>
               </w:rPr>
-              <w:t xml:space="preserve">Gwendolyn Jarvis</w:t>
+              <w:t xml:space="preserve">Kane Moreno</w:t>
             </w:r>
             <w:r>
               <w:rPr>
@@ -557,7 +557,7 @@
               <w:rPr>
                 <w:rFonts w:ascii="Open Sans" w:eastAsia="Open Sans" w:hAnsi="Open Sans" w:cs="Open Sans"/>
               </w:rPr>
-              <w:t xml:space="preserve">Ali Coleman</w:t>
+              <w:t xml:space="preserve">Scott Morse</w:t>
             </w:r>
             <w:proofErr w:type="spellStart"/>
             <w:r>
@@ -650,7 +650,7 @@
           <w:sz w:val="24"/>
           <w:szCs w:val="24"/>
         </w:rPr>
-        <w:t xml:space="preserve"> ANG2025-1114-144445</w:t>
+        <w:t xml:space="preserve"> ANG2025-1114-165047</w:t>
       </w:r>
       <w:proofErr w:type="spellStart"/>
       <w:r>
@@ -689,7 +689,7 @@
           <w:rFonts w:ascii="Open Sans" w:eastAsia="Open Sans" w:hAnsi="Open Sans" w:cs="Open Sans"/>
           <w:color w:val="000000"/>
         </w:rPr>
-        <w:t xml:space="preserve">  Sehr geehrte Frau Conway</w:t>
+        <w:t xml:space="preserve">  Sehr geehrte Frau Knapp</w:t>
       </w:r>
       <w:proofErr w:type="spellStart"/>
       <w:r>
@@ -1211,7 +1211,7 @@
                 <w:sz w:val="20"/>
                 <w:szCs w:val="20"/>
               </w:rPr>
-              <w:t xml:space="preserve">421,30 €</w:t>
+              <w:t xml:space="preserve">420,70 €</w:t>
             </w:r>
             <w:proofErr w:type="spellStart"/>
             <w:r>
@@ -1267,7 +1267,7 @@
                 <w:sz w:val="20"/>
                 <w:szCs w:val="20"/>
               </w:rPr>
-              <w:t xml:space="preserve">421,30 €</w:t>
+              <w:t xml:space="preserve">420,70 €</w:t>
             </w:r>
             <w:proofErr w:type="spellStart"/>
             <w:r>
@@ -1383,6 +1383,35 @@
                 <w:szCs w:val="18"/>
               </w:rPr>
             </w:pPr>
+            <w:r>
+              <w:rPr>
+                <w:rFonts w:ascii="Open Sans" w:eastAsia="Open Sans" w:hAnsi="Open Sans" w:cs="Open Sans"/>
+                <w:color w:val="000000"/>
+                <w:sz w:val="18"/>
+                <w:szCs w:val="18"/>
+              </w:rPr>
+              <w:t xml:space="preserve">- Auswechseln des Duschsystems</w:t>
+            </w:r>
+            <w:proofErr w:type="spellStart"/>
+            <w:r>
+              <w:rPr>
+                <w:rFonts w:ascii="Open Sans" w:eastAsia="Open Sans" w:hAnsi="Open Sans" w:cs="Open Sans"/>
+                <w:color w:val="000000"/>
+                <w:sz w:val="18"/>
+                <w:szCs w:val="18"/>
+              </w:rPr>
+              <w:t/>
+            </w:r>
+            <w:proofErr w:type="spellEnd"/>
+            <w:r>
+              <w:rPr>
+                <w:rFonts w:ascii="Open Sans" w:eastAsia="Open Sans" w:hAnsi="Open Sans" w:cs="Open Sans"/>
+                <w:color w:val="000000"/>
+                <w:sz w:val="18"/>
+                <w:szCs w:val="18"/>
+              </w:rPr>
+              <w:t/>
+            </w:r>
           </w:p>
           <w:p>
             <w:pPr>
@@ -1391,6 +1420,18 @@
               <w:ind w:right="314"/>
               <w:rPr>
                 <w:color w:val="000000"/>
+                <w:sz w:val="18"/>
+                <w:szCs w:val="18"/>
+              </w:rPr>
+            </w:pPr>
+          </w:p>
+          <w:p>
+            <w:pPr>
+              <w:pStyle w:val="normal1"/>
+              <w:spacing w:line="278" w:lineRule="auto"/>
+              <w:ind w:right="314"/>
+              <w:rPr>
+                <w:color w:val="000000"/>
                 <w:sz w:val="20"/>
                 <w:szCs w:val="20"/>
               </w:rPr>
@@ -1557,7 +1598,7 @@
                 <w:sz w:val="18"/>
                 <w:szCs w:val="18"/>
               </w:rPr>
-              <w:t xml:space="preserve">- 118 km Kilometerpauschale</w:t>
+              <w:t xml:space="preserve">- 2 km Kilometerpauschale</w:t>
             </w:r>
             <w:proofErr w:type="spellStart"/>
             <w:r>
@@ -1813,7 +1854,7 @@
                 <w:sz w:val="20"/>
                 <w:szCs w:val="20"/>
               </w:rPr>
-              <w:t xml:space="preserve">0,00 €</w:t>
+              <w:t xml:space="preserve">465,27 €</w:t>
             </w:r>
             <w:proofErr w:type="spellStart"/>
             <w:r>
@@ -1858,7 +1899,7 @@
               <w:jc w:val="center"/>
             </w:pPr>
             <w:r>
-              <w:t xml:space="preserve">0,00 €</w:t>
+              <w:t xml:space="preserve">465,27 €</w:t>
             </w:r>
             <w:proofErr w:type="spellStart"/>
             <w:r>
@@ -1926,7 +1967,384 @@
             </w:tcBorders>
             <w:shd w:val="clear" w:color="auto" w:fill="FFFFFF"/>
           </w:tcPr>
-          <w:p/>
+          <w:p>
+            <w:pPr>
+              <w:pStyle w:val="normal1"/>
+              <w:spacing w:line="278" w:lineRule="auto"/>
+              <w:ind w:right="314"/>
+              <w:rPr>
+                <w:rFonts w:ascii="Open Sans" w:eastAsia="Open Sans" w:hAnsi="Open Sans" w:cs="Open Sans"/>
+                <w:color w:val="000000"/>
+                <w:sz w:val="18"/>
+                <w:szCs w:val="18"/>
+              </w:rPr>
+            </w:pPr>
+            <w:r>
+              <w:rPr>
+                <w:rFonts w:ascii="Open Sans" w:eastAsia="Open Sans" w:hAnsi="Open Sans" w:cs="Open Sans"/>
+                <w:color w:val="000000"/>
+                <w:sz w:val="18"/>
+                <w:szCs w:val="18"/>
+              </w:rPr>
+              <w:t xml:space="preserve">- 1 Stk TRINNITY Wannenabdichtband-Set 3,4 m Nass-/Trockenanbindung entspr. DIN 18534</w:t>
+            </w:r>
+            <w:proofErr w:type="spellStart"/>
+            <w:r>
+              <w:rPr>
+                <w:rFonts w:ascii="Open Sans" w:eastAsia="Open Sans" w:hAnsi="Open Sans" w:cs="Open Sans"/>
+                <w:color w:val="000000"/>
+                <w:sz w:val="18"/>
+                <w:szCs w:val="18"/>
+              </w:rPr>
+              <w:t/>
+            </w:r>
+            <w:proofErr w:type="spellEnd"/>
+            <w:r>
+              <w:rPr>
+                <w:rFonts w:ascii="Open Sans" w:eastAsia="Open Sans" w:hAnsi="Open Sans" w:cs="Open Sans"/>
+                <w:color w:val="000000"/>
+                <w:sz w:val="18"/>
+                <w:szCs w:val="18"/>
+              </w:rPr>
+              <w:t/>
+            </w:r>
+          </w:p>
+          <w:p>
+            <w:pPr>
+              <w:pStyle w:val="normal1"/>
+              <w:spacing w:line="278" w:lineRule="auto"/>
+              <w:ind w:right="314"/>
+              <w:rPr>
+                <w:rFonts w:ascii="Open Sans" w:eastAsia="Open Sans" w:hAnsi="Open Sans" w:cs="Open Sans"/>
+                <w:color w:val="000000"/>
+                <w:sz w:val="18"/>
+                <w:szCs w:val="18"/>
+              </w:rPr>
+            </w:pPr>
+            <w:r>
+              <w:rPr>
+                <w:rFonts w:ascii="Open Sans" w:eastAsia="Open Sans" w:hAnsi="Open Sans" w:cs="Open Sans"/>
+                <w:color w:val="000000"/>
+                <w:sz w:val="18"/>
+                <w:szCs w:val="18"/>
+              </w:rPr>
+              <w:t xml:space="preserve">- 1 Stk Ablaufgarnitur Rohbauset m.Sifon BH60mm f.flache Duschw.m.90mm Ablauf TRINNITY</w:t>
+            </w:r>
+            <w:proofErr w:type="spellStart"/>
+            <w:r>
+              <w:rPr>
+                <w:rFonts w:ascii="Open Sans" w:eastAsia="Open Sans" w:hAnsi="Open Sans" w:cs="Open Sans"/>
+                <w:color w:val="000000"/>
+                <w:sz w:val="18"/>
+                <w:szCs w:val="18"/>
+              </w:rPr>
+              <w:t/>
+            </w:r>
+            <w:proofErr w:type="spellEnd"/>
+            <w:r>
+              <w:rPr>
+                <w:rFonts w:ascii="Open Sans" w:eastAsia="Open Sans" w:hAnsi="Open Sans" w:cs="Open Sans"/>
+                <w:color w:val="000000"/>
+                <w:sz w:val="18"/>
+                <w:szCs w:val="18"/>
+              </w:rPr>
+              <w:t/>
+            </w:r>
+          </w:p>
+          <w:p>
+            <w:pPr>
+              <w:pStyle w:val="normal1"/>
+              <w:spacing w:line="278" w:lineRule="auto"/>
+              <w:ind w:right="314"/>
+              <w:rPr>
+                <w:rFonts w:ascii="Open Sans" w:eastAsia="Open Sans" w:hAnsi="Open Sans" w:cs="Open Sans"/>
+                <w:color w:val="000000"/>
+                <w:sz w:val="18"/>
+                <w:szCs w:val="18"/>
+              </w:rPr>
+            </w:pPr>
+            <w:r>
+              <w:rPr>
+                <w:rFonts w:ascii="Open Sans" w:eastAsia="Open Sans" w:hAnsi="Open Sans" w:cs="Open Sans"/>
+                <w:color w:val="000000"/>
+                <w:sz w:val="18"/>
+                <w:szCs w:val="18"/>
+              </w:rPr>
+              <w:t xml:space="preserve">- 1 Stk Kleinmaterial</w:t>
+            </w:r>
+            <w:proofErr w:type="spellStart"/>
+            <w:r>
+              <w:rPr>
+                <w:rFonts w:ascii="Open Sans" w:eastAsia="Open Sans" w:hAnsi="Open Sans" w:cs="Open Sans"/>
+                <w:color w:val="000000"/>
+                <w:sz w:val="18"/>
+                <w:szCs w:val="18"/>
+              </w:rPr>
+              <w:t/>
+            </w:r>
+            <w:proofErr w:type="spellEnd"/>
+            <w:r>
+              <w:rPr>
+                <w:rFonts w:ascii="Open Sans" w:eastAsia="Open Sans" w:hAnsi="Open Sans" w:cs="Open Sans"/>
+                <w:color w:val="000000"/>
+                <w:sz w:val="18"/>
+                <w:szCs w:val="18"/>
+              </w:rPr>
+              <w:t/>
+            </w:r>
+          </w:p>
+          <w:p>
+            <w:pPr>
+              <w:pStyle w:val="normal1"/>
+              <w:spacing w:line="278" w:lineRule="auto"/>
+              <w:ind w:right="314"/>
+              <w:rPr>
+                <w:rFonts w:ascii="Open Sans" w:eastAsia="Open Sans" w:hAnsi="Open Sans" w:cs="Open Sans"/>
+                <w:color w:val="000000"/>
+                <w:sz w:val="18"/>
+                <w:szCs w:val="18"/>
+              </w:rPr>
+            </w:pPr>
+            <w:r>
+              <w:rPr>
+                <w:rFonts w:ascii="Open Sans" w:eastAsia="Open Sans" w:hAnsi="Open Sans" w:cs="Open Sans"/>
+                <w:color w:val="000000"/>
+                <w:sz w:val="18"/>
+                <w:szCs w:val="18"/>
+              </w:rPr>
+              <w:t xml:space="preserve">- 1 Stk Stelzlager höhenverstellar Set</w:t>
+            </w:r>
+            <w:proofErr w:type="spellStart"/>
+            <w:r>
+              <w:rPr>
+                <w:rFonts w:ascii="Open Sans" w:eastAsia="Open Sans" w:hAnsi="Open Sans" w:cs="Open Sans"/>
+                <w:color w:val="000000"/>
+                <w:sz w:val="18"/>
+                <w:szCs w:val="18"/>
+              </w:rPr>
+              <w:t/>
+            </w:r>
+            <w:proofErr w:type="spellEnd"/>
+            <w:r>
+              <w:rPr>
+                <w:rFonts w:ascii="Open Sans" w:eastAsia="Open Sans" w:hAnsi="Open Sans" w:cs="Open Sans"/>
+                <w:color w:val="000000"/>
+                <w:sz w:val="18"/>
+                <w:szCs w:val="18"/>
+              </w:rPr>
+              <w:t/>
+            </w:r>
+          </w:p>
+          <w:p>
+            <w:pPr>
+              <w:pStyle w:val="normal1"/>
+              <w:spacing w:line="278" w:lineRule="auto"/>
+              <w:ind w:right="314"/>
+              <w:rPr>
+                <w:rFonts w:ascii="Open Sans" w:eastAsia="Open Sans" w:hAnsi="Open Sans" w:cs="Open Sans"/>
+                <w:color w:val="000000"/>
+                <w:sz w:val="18"/>
+                <w:szCs w:val="18"/>
+              </w:rPr>
+            </w:pPr>
+            <w:r>
+              <w:rPr>
+                <w:rFonts w:ascii="Open Sans" w:eastAsia="Open Sans" w:hAnsi="Open Sans" w:cs="Open Sans"/>
+                <w:color w:val="000000"/>
+                <w:sz w:val="18"/>
+                <w:szCs w:val="18"/>
+              </w:rPr>
+              <w:t xml:space="preserve">- 1 Stk TRINNITY Wandabdichtung BASIS-Set 5 qm DW bis 100 x 100 / BW bis 180 x 80 cm</w:t>
+            </w:r>
+            <w:proofErr w:type="spellStart"/>
+            <w:r>
+              <w:rPr>
+                <w:rFonts w:ascii="Open Sans" w:eastAsia="Open Sans" w:hAnsi="Open Sans" w:cs="Open Sans"/>
+                <w:color w:val="000000"/>
+                <w:sz w:val="18"/>
+                <w:szCs w:val="18"/>
+              </w:rPr>
+              <w:t/>
+            </w:r>
+            <w:proofErr w:type="spellEnd"/>
+            <w:r>
+              <w:rPr>
+                <w:rFonts w:ascii="Open Sans" w:eastAsia="Open Sans" w:hAnsi="Open Sans" w:cs="Open Sans"/>
+                <w:color w:val="000000"/>
+                <w:sz w:val="18"/>
+                <w:szCs w:val="18"/>
+              </w:rPr>
+              <w:t/>
+            </w:r>
+          </w:p>
+          <w:p>
+            <w:pPr>
+              <w:pStyle w:val="normal1"/>
+              <w:spacing w:line="278" w:lineRule="auto"/>
+              <w:ind w:right="314"/>
+              <w:rPr>
+                <w:rFonts w:ascii="Open Sans" w:eastAsia="Open Sans" w:hAnsi="Open Sans" w:cs="Open Sans"/>
+                <w:color w:val="000000"/>
+                <w:sz w:val="18"/>
+                <w:szCs w:val="18"/>
+              </w:rPr>
+            </w:pPr>
+            <w:r>
+              <w:rPr>
+                <w:rFonts w:ascii="Open Sans" w:eastAsia="Open Sans" w:hAnsi="Open Sans" w:cs="Open Sans"/>
+                <w:color w:val="000000"/>
+                <w:sz w:val="18"/>
+                <w:szCs w:val="18"/>
+              </w:rPr>
+              <w:t xml:space="preserve">- 1 Pkg Flächenkleber (Wandverkleidung)</w:t>
+            </w:r>
+            <w:proofErr w:type="spellStart"/>
+            <w:r>
+              <w:rPr>
+                <w:rFonts w:ascii="Open Sans" w:eastAsia="Open Sans" w:hAnsi="Open Sans" w:cs="Open Sans"/>
+                <w:color w:val="000000"/>
+                <w:sz w:val="18"/>
+                <w:szCs w:val="18"/>
+              </w:rPr>
+              <w:t/>
+            </w:r>
+            <w:proofErr w:type="spellEnd"/>
+            <w:r>
+              <w:rPr>
+                <w:rFonts w:ascii="Open Sans" w:eastAsia="Open Sans" w:hAnsi="Open Sans" w:cs="Open Sans"/>
+                <w:color w:val="000000"/>
+                <w:sz w:val="18"/>
+                <w:szCs w:val="18"/>
+              </w:rPr>
+              <w:t/>
+            </w:r>
+          </w:p>
+          <w:p>
+            <w:pPr>
+              <w:pStyle w:val="normal1"/>
+              <w:spacing w:line="278" w:lineRule="auto"/>
+              <w:ind w:right="314"/>
+              <w:rPr>
+                <w:rFonts w:ascii="Open Sans" w:eastAsia="Open Sans" w:hAnsi="Open Sans" w:cs="Open Sans"/>
+                <w:color w:val="000000"/>
+                <w:sz w:val="18"/>
+                <w:szCs w:val="18"/>
+              </w:rPr>
+            </w:pPr>
+            <w:r>
+              <w:rPr>
+                <w:rFonts w:ascii="Open Sans" w:eastAsia="Open Sans" w:hAnsi="Open Sans" w:cs="Open Sans"/>
+                <w:color w:val="000000"/>
+                <w:sz w:val="18"/>
+                <w:szCs w:val="18"/>
+              </w:rPr>
+              <w:t xml:space="preserve">- 1 Stk Abschlussprofil 3.0 255 cm silber eloxiert VIGOUR</w:t>
+            </w:r>
+            <w:proofErr w:type="spellStart"/>
+            <w:r>
+              <w:rPr>
+                <w:rFonts w:ascii="Open Sans" w:eastAsia="Open Sans" w:hAnsi="Open Sans" w:cs="Open Sans"/>
+                <w:color w:val="000000"/>
+                <w:sz w:val="18"/>
+                <w:szCs w:val="18"/>
+              </w:rPr>
+              <w:t/>
+            </w:r>
+            <w:proofErr w:type="spellEnd"/>
+            <w:r>
+              <w:rPr>
+                <w:rFonts w:ascii="Open Sans" w:eastAsia="Open Sans" w:hAnsi="Open Sans" w:cs="Open Sans"/>
+                <w:color w:val="000000"/>
+                <w:sz w:val="18"/>
+                <w:szCs w:val="18"/>
+              </w:rPr>
+              <w:t/>
+            </w:r>
+          </w:p>
+          <w:p>
+            <w:pPr>
+              <w:pStyle w:val="normal1"/>
+              <w:spacing w:line="278" w:lineRule="auto"/>
+              <w:ind w:right="314"/>
+              <w:rPr>
+                <w:rFonts w:ascii="Open Sans" w:eastAsia="Open Sans" w:hAnsi="Open Sans" w:cs="Open Sans"/>
+                <w:color w:val="000000"/>
+                <w:sz w:val="18"/>
+                <w:szCs w:val="18"/>
+              </w:rPr>
+            </w:pPr>
+            <w:r>
+              <w:rPr>
+                <w:rFonts w:ascii="Open Sans" w:eastAsia="Open Sans" w:hAnsi="Open Sans" w:cs="Open Sans"/>
+                <w:color w:val="000000"/>
+                <w:sz w:val="18"/>
+                <w:szCs w:val="18"/>
+              </w:rPr>
+              <w:t xml:space="preserve">- 1 Stk CARE Sanitär Silikon Weiß 310ml</w:t>
+            </w:r>
+            <w:proofErr w:type="spellStart"/>
+            <w:r>
+              <w:rPr>
+                <w:rFonts w:ascii="Open Sans" w:eastAsia="Open Sans" w:hAnsi="Open Sans" w:cs="Open Sans"/>
+                <w:color w:val="000000"/>
+                <w:sz w:val="18"/>
+                <w:szCs w:val="18"/>
+              </w:rPr>
+              <w:t/>
+            </w:r>
+            <w:proofErr w:type="spellEnd"/>
+            <w:r>
+              <w:rPr>
+                <w:rFonts w:ascii="Open Sans" w:eastAsia="Open Sans" w:hAnsi="Open Sans" w:cs="Open Sans"/>
+                <w:color w:val="000000"/>
+                <w:sz w:val="18"/>
+                <w:szCs w:val="18"/>
+              </w:rPr>
+              <w:t/>
+            </w:r>
+          </w:p>
+          <w:p>
+            <w:pPr>
+              <w:pStyle w:val="normal1"/>
+              <w:spacing w:line="278" w:lineRule="auto"/>
+              <w:ind w:right="314"/>
+              <w:rPr>
+                <w:rFonts w:ascii="Open Sans" w:eastAsia="Open Sans" w:hAnsi="Open Sans" w:cs="Open Sans"/>
+                <w:color w:val="000000"/>
+                <w:sz w:val="18"/>
+                <w:szCs w:val="18"/>
+              </w:rPr>
+            </w:pPr>
+            <w:r>
+              <w:rPr>
+                <w:rFonts w:ascii="Open Sans" w:eastAsia="Open Sans" w:hAnsi="Open Sans" w:cs="Open Sans"/>
+                <w:color w:val="000000"/>
+                <w:sz w:val="18"/>
+                <w:szCs w:val="18"/>
+              </w:rPr>
+              <w:t xml:space="preserve">- 1 Stk Wannenset individual 2.2 m.Wandhalter Schlauch u.HB 1-str. rund verchr.VIGOUR</w:t>
+            </w:r>
+            <w:proofErr w:type="spellStart"/>
+            <w:r>
+              <w:rPr>
+                <w:rFonts w:ascii="Open Sans" w:eastAsia="Open Sans" w:hAnsi="Open Sans" w:cs="Open Sans"/>
+                <w:color w:val="000000"/>
+                <w:sz w:val="18"/>
+                <w:szCs w:val="18"/>
+              </w:rPr>
+              <w:t/>
+            </w:r>
+            <w:proofErr w:type="spellEnd"/>
+            <w:r>
+              <w:rPr>
+                <w:rFonts w:ascii="Open Sans" w:eastAsia="Open Sans" w:hAnsi="Open Sans" w:cs="Open Sans"/>
+                <w:color w:val="000000"/>
+                <w:sz w:val="18"/>
+                <w:szCs w:val="18"/>
+              </w:rPr>
+              <w:t/>
+            </w:r>
+          </w:p>
         </w:tc>
         <w:tc>
           <w:tcPr>
@@ -2124,7 +2542,7 @@
                 <w:b/>
                 <w:color w:val="000000"/>
               </w:rPr>
-              <w:t xml:space="preserve">421,30 €</w:t>
+              <w:t xml:space="preserve">1.042,21 €</w:t>
             </w:r>
             <w:r>
               <w:rPr>
@@ -2284,7 +2702,7 @@
                 <w:b/>
                 <w:color w:val="000000"/>
               </w:rPr>
-              <w:t xml:space="preserve">80,05 €</w:t>
+              <w:t xml:space="preserve">198,02 €</w:t>
             </w:r>
             <w:r>
               <w:rPr>
@@ -2425,7 +2843,7 @@
                 <w:b/>
                 <w:color w:val="000000"/>
               </w:rPr>
-              <w:t xml:space="preserve">501,35 €</w:t>
+              <w:t xml:space="preserve">1.240,23 €</w:t>
             </w:r>
             <w:r>
               <w:rPr>
@@ -2481,6 +2899,45 @@
         </w:rPr>
         <w:t xml:space="preserve">Es handelt sich hierbei um ein Festpreisangebot für die oben definierten Leistungen.</w:t>
       </w:r>
+    </w:p>
+    <w:p>
+      <w:pPr>
+        <w:pStyle w:val="normal1"/>
+        <w:spacing w:before="23"/>
+        <w:rPr>
+          <w:rFonts w:ascii="Open Sans" w:eastAsia="Open Sans" w:hAnsi="Open Sans" w:cs="Open Sans"/>
+          <w:color w:val="000000"/>
+          <w:lang w:val="de-DE"/>
+        </w:rPr>
+      </w:pPr>
+    </w:p>
+    <w:p>
+      <w:pPr>
+        <w:pStyle w:val="normal1"/>
+        <w:spacing w:line="286" w:lineRule="auto"/>
+        <w:ind w:left="123"/>
+        <w:rPr>
+          <w:rFonts w:ascii="Open Sans" w:eastAsia="Open Sans" w:hAnsi="Open Sans" w:cs="Open Sans"/>
+          <w:color w:val="000000"/>
+          <w:lang w:val="de-DE"/>
+        </w:rPr>
+      </w:pPr>
+      <w:r>
+        <w:rPr>
+          <w:rFonts w:ascii="Open Sans Semibold" w:eastAsia="Open Sans Semibold" w:hAnsi="Open Sans Semibold" w:cs="Open Sans Semibold"/>
+          <w:color w:val="030303"/>
+          <w:lang w:val="de-DE"/>
+        </w:rPr>
+        <w:t xml:space="preserve">ACHTUNG:</w:t>
+      </w:r>
+      <w:r>
+        <w:rPr>
+          <w:rFonts w:ascii="Open Sans" w:eastAsia="Open Sans" w:hAnsi="Open Sans" w:cs="Open Sans"/>
+          <w:color w:val="030303"/>
+          <w:lang w:val="de-DE"/>
+        </w:rPr>
+        <w:t xml:space="preserve"> Ob eine ebenerdige Montage der Duschwanne möglich ist, kann erst nach dem Ausbau der bestehenden Wanne beurteilen werden. Sollten dabei zusätzliche oder weitere Leistungen erforderlich oder von Ihnen gewünscht sein, können zusätzliche Kosten entstehen.</w:t>
+      </w:r>
       <w:proofErr w:type="spellStart"/>
       <w:r>
         <w:rPr>
@@ -2545,7 +3002,7 @@
           <w:color w:val="030303"/>
           <w:lang w:val="de-DE"/>
         </w:rPr>
-        <w:t xml:space="preserve"> Zustimmung und werden auf Regiebasis nach tatsächlichem Aufwand abgerechnet. (Stundensatz-Facharbeiter: 59,50€</w:t>
+        <w:t xml:space="preserve"> Zustimmung und werden auf Regiebasis nach tatsächlichem Aufwand abgerechnet. (Stundensatz-Facharbeiter: 69,50€</w:t>
       </w:r>
       <w:proofErr w:type="spellStart"/>
       <w:r>

</xml_diff>

<commit_message>
little update for bet
</commit_message>
<xml_diff>
--- a/out-Angebot.docx
+++ b/out-Angebot.docx
@@ -140,7 +140,7 @@
               <w:rPr>
                 <w:rFonts w:ascii="Open Sans" w:eastAsia="Open Sans" w:hAnsi="Open Sans" w:cs="Open Sans"/>
               </w:rPr>
-              <w:t xml:space="preserve">Geoffrey</w:t>
+              <w:t xml:space="preserve">Kitra</w:t>
             </w:r>
             <w:proofErr w:type="spellStart"/>
             <w:r>
@@ -154,7 +154,7 @@
               <w:rPr>
                 <w:rFonts w:ascii="Open Sans" w:eastAsia="Open Sans" w:hAnsi="Open Sans" w:cs="Open Sans"/>
               </w:rPr>
-              <w:t xml:space="preserve"> Knapp</w:t>
+              <w:t xml:space="preserve"> Sloan</w:t>
             </w:r>
             <w:proofErr w:type="spellStart"/>
             <w:r>
@@ -185,7 +185,7 @@
               <w:rPr>
                 <w:rFonts w:ascii="Open Sans" w:eastAsia="Open Sans" w:hAnsi="Open Sans" w:cs="Open Sans"/>
               </w:rPr>
-              <w:t xml:space="preserve">Laborum Ea velit be</w:t>
+              <w:t xml:space="preserve">Delectus consectetu</w:t>
             </w:r>
             <w:proofErr w:type="spellStart"/>
             <w:r>
@@ -218,7 +218,7 @@
               <w:rPr>
                 <w:rFonts w:ascii="Open Sans" w:eastAsia="Open Sans" w:hAnsi="Open Sans" w:cs="Open Sans"/>
               </w:rPr>
-              <w:t xml:space="preserve">Ut maxime sit nulla  In in voluptatum sol</w:t>
+              <w:t xml:space="preserve">Perferendis labore i Sed magni id exceptu</w:t>
             </w:r>
           </w:p>
         </w:tc>
@@ -355,7 +355,7 @@
                 <w:rFonts w:ascii="Open Sans" w:eastAsia="Open Sans" w:hAnsi="Open Sans" w:cs="Open Sans"/>
                 <w:lang w:val="de-DE"/>
               </w:rPr>
-              <w:t xml:space="preserve">ANG2025-1114-165047</w:t>
+              <w:t xml:space="preserve">ANG2025-1117-162703</w:t>
             </w:r>
             <w:r>
               <w:rPr>
@@ -392,7 +392,7 @@
                 <w:rFonts w:ascii="Open Sans" w:eastAsia="Open Sans" w:hAnsi="Open Sans" w:cs="Open Sans"/>
                 <w:lang w:val="de-DE"/>
               </w:rPr>
-              <w:t xml:space="preserve">02.10.2005</w:t>
+              <w:t xml:space="preserve">06.02.1989</w:t>
             </w:r>
             <w:r>
               <w:rPr>
@@ -426,7 +426,7 @@
                 <w:rFonts w:ascii="Open Sans" w:eastAsia="Open Sans" w:hAnsi="Open Sans" w:cs="Open Sans"/>
                 <w:lang w:val="de-DE"/>
               </w:rPr>
-              <w:t xml:space="preserve">Kane Moreno</w:t>
+              <w:t xml:space="preserve">Kane Bridges</w:t>
             </w:r>
             <w:r>
               <w:rPr>
@@ -557,7 +557,7 @@
               <w:rPr>
                 <w:rFonts w:ascii="Open Sans" w:eastAsia="Open Sans" w:hAnsi="Open Sans" w:cs="Open Sans"/>
               </w:rPr>
-              <w:t xml:space="preserve">Scott Morse</w:t>
+              <w:t xml:space="preserve">Branden Padilla</w:t>
             </w:r>
             <w:proofErr w:type="spellStart"/>
             <w:r>
@@ -650,7 +650,7 @@
           <w:sz w:val="24"/>
           <w:szCs w:val="24"/>
         </w:rPr>
-        <w:t xml:space="preserve"> ANG2025-1114-165047</w:t>
+        <w:t xml:space="preserve"> ANG2025-1117-162703</w:t>
       </w:r>
       <w:proofErr w:type="spellStart"/>
       <w:r>
@@ -689,7 +689,7 @@
           <w:rFonts w:ascii="Open Sans" w:eastAsia="Open Sans" w:hAnsi="Open Sans" w:cs="Open Sans"/>
           <w:color w:val="000000"/>
         </w:rPr>
-        <w:t xml:space="preserve">  Sehr geehrte Frau Knapp</w:t>
+        <w:t xml:space="preserve">  Sehr geehrte Frau Sloan</w:t>
       </w:r>
       <w:proofErr w:type="spellStart"/>
       <w:r>
@@ -1211,7 +1211,7 @@
                 <w:sz w:val="20"/>
                 <w:szCs w:val="20"/>
               </w:rPr>
-              <w:t xml:space="preserve">420,70 €</w:t>
+              <w:t xml:space="preserve">1.269,40 €</w:t>
             </w:r>
             <w:proofErr w:type="spellStart"/>
             <w:r>
@@ -1267,7 +1267,7 @@
                 <w:sz w:val="20"/>
                 <w:szCs w:val="20"/>
               </w:rPr>
-              <w:t xml:space="preserve">420,70 €</w:t>
+              <w:t xml:space="preserve">1.269,40 €</w:t>
             </w:r>
             <w:proofErr w:type="spellStart"/>
             <w:r>
@@ -1383,16 +1383,50 @@
                 <w:szCs w:val="18"/>
               </w:rPr>
             </w:pPr>
-            <w:r>
-              <w:rPr>
-                <w:rFonts w:ascii="Open Sans" w:eastAsia="Open Sans" w:hAnsi="Open Sans" w:cs="Open Sans"/>
+          </w:p>
+          <w:p>
+            <w:pPr>
+              <w:pStyle w:val="normal1"/>
+              <w:spacing w:line="278" w:lineRule="auto"/>
+              <w:ind w:right="314"/>
+              <w:rPr>
+                <w:color w:val="000000"/>
+                <w:sz w:val="20"/>
+                <w:szCs w:val="20"/>
+              </w:rPr>
+            </w:pPr>
+            <w:proofErr w:type="spellStart"/>
+            <w:r>
+              <w:rPr>
+                <w:rFonts w:ascii="Open Sans" w:eastAsia="Open Sans" w:hAnsi="Open Sans" w:cs="Open Sans"/>
+                <w:color w:val="000000"/>
+                <w:sz w:val="20"/>
+                <w:szCs w:val="20"/>
+              </w:rPr>
+              <w:t xml:space="preserve">Enthält</w:t>
+            </w:r>
+            <w:proofErr w:type="spellEnd"/>
+            <w:r>
+              <w:rPr>
+                <w:rFonts w:ascii="Open Sans" w:eastAsia="Open Sans" w:hAnsi="Open Sans" w:cs="Open Sans"/>
+                <w:color w:val="000000"/>
+                <w:sz w:val="20"/>
+                <w:szCs w:val="20"/>
+              </w:rPr>
+              <w:t xml:space="preserve"> je Einheit</w:t>
+            </w:r>
+          </w:p>
+          <w:p>
+            <w:pPr>
+              <w:pStyle w:val="normal1"/>
+              <w:spacing w:line="278" w:lineRule="auto"/>
+              <w:ind w:right="314"/>
+              <w:rPr>
                 <w:color w:val="000000"/>
                 <w:sz w:val="18"/>
                 <w:szCs w:val="18"/>
               </w:rPr>
-              <w:t xml:space="preserve">- Auswechseln des Duschsystems</w:t>
-            </w:r>
-            <w:proofErr w:type="spellStart"/>
+            </w:pPr>
             <w:r>
               <w:rPr>
                 <w:rFonts w:ascii="Open Sans" w:eastAsia="Open Sans" w:hAnsi="Open Sans" w:cs="Open Sans"/>
@@ -1400,9 +1434,9 @@
                 <w:sz w:val="18"/>
                 <w:szCs w:val="18"/>
               </w:rPr>
-              <w:t/>
-            </w:r>
-            <w:proofErr w:type="spellEnd"/>
+              <w:t xml:space="preserve">- 1,00 Stk Fahrzeugbereitstellung</w:t>
+            </w:r>
+            <w:proofErr w:type="spellStart"/>
             <w:r>
               <w:rPr>
                 <w:rFonts w:ascii="Open Sans" w:eastAsia="Open Sans" w:hAnsi="Open Sans" w:cs="Open Sans"/>
@@ -1412,6 +1446,16 @@
               </w:rPr>
               <w:t/>
             </w:r>
+            <w:proofErr w:type="spellEnd"/>
+            <w:r>
+              <w:rPr>
+                <w:rFonts w:ascii="Open Sans" w:eastAsia="Open Sans" w:hAnsi="Open Sans" w:cs="Open Sans"/>
+                <w:color w:val="000000"/>
+                <w:sz w:val="18"/>
+                <w:szCs w:val="18"/>
+              </w:rPr>
+              <w:t/>
+            </w:r>
           </w:p>
           <w:p>
             <w:pPr>
@@ -1424,6 +1468,35 @@
                 <w:szCs w:val="18"/>
               </w:rPr>
             </w:pPr>
+            <w:r>
+              <w:rPr>
+                <w:rFonts w:ascii="Open Sans" w:eastAsia="Open Sans" w:hAnsi="Open Sans" w:cs="Open Sans"/>
+                <w:color w:val="000000"/>
+                <w:sz w:val="18"/>
+                <w:szCs w:val="18"/>
+              </w:rPr>
+              <w:t xml:space="preserve">- 1,00 Stk Bereitstellung und Vorhaltung von Maschinen &amp; Werkzeugen</w:t>
+            </w:r>
+            <w:proofErr w:type="spellStart"/>
+            <w:r>
+              <w:rPr>
+                <w:rFonts w:ascii="Open Sans" w:eastAsia="Open Sans" w:hAnsi="Open Sans" w:cs="Open Sans"/>
+                <w:color w:val="000000"/>
+                <w:sz w:val="18"/>
+                <w:szCs w:val="18"/>
+              </w:rPr>
+              <w:t/>
+            </w:r>
+            <w:proofErr w:type="spellEnd"/>
+            <w:r>
+              <w:rPr>
+                <w:rFonts w:ascii="Open Sans" w:eastAsia="Open Sans" w:hAnsi="Open Sans" w:cs="Open Sans"/>
+                <w:color w:val="000000"/>
+                <w:sz w:val="18"/>
+                <w:szCs w:val="18"/>
+              </w:rPr>
+              <w:t/>
+            </w:r>
           </w:p>
           <w:p>
             <w:pPr>
@@ -1432,29 +1505,38 @@
               <w:ind w:right="314"/>
               <w:rPr>
                 <w:color w:val="000000"/>
-                <w:sz w:val="20"/>
-                <w:szCs w:val="20"/>
-              </w:rPr>
-            </w:pPr>
+                <w:sz w:val="18"/>
+                <w:szCs w:val="18"/>
+              </w:rPr>
+            </w:pPr>
+            <w:r>
+              <w:rPr>
+                <w:rFonts w:ascii="Open Sans" w:eastAsia="Open Sans" w:hAnsi="Open Sans" w:cs="Open Sans"/>
+                <w:color w:val="000000"/>
+                <w:sz w:val="18"/>
+                <w:szCs w:val="18"/>
+              </w:rPr>
+              <w:t xml:space="preserve">- 1,00 Stk Beräumung der Baustelle</w:t>
+            </w:r>
             <w:proofErr w:type="spellStart"/>
             <w:r>
               <w:rPr>
                 <w:rFonts w:ascii="Open Sans" w:eastAsia="Open Sans" w:hAnsi="Open Sans" w:cs="Open Sans"/>
                 <w:color w:val="000000"/>
-                <w:sz w:val="20"/>
-                <w:szCs w:val="20"/>
-              </w:rPr>
-              <w:t xml:space="preserve">Enthält</w:t>
+                <w:sz w:val="18"/>
+                <w:szCs w:val="18"/>
+              </w:rPr>
+              <w:t/>
             </w:r>
             <w:proofErr w:type="spellEnd"/>
             <w:r>
               <w:rPr>
                 <w:rFonts w:ascii="Open Sans" w:eastAsia="Open Sans" w:hAnsi="Open Sans" w:cs="Open Sans"/>
                 <w:color w:val="000000"/>
-                <w:sz w:val="20"/>
-                <w:szCs w:val="20"/>
-              </w:rPr>
-              <w:t xml:space="preserve"> je Einheit</w:t>
+                <w:sz w:val="18"/>
+                <w:szCs w:val="18"/>
+              </w:rPr>
+              <w:t/>
             </w:r>
           </w:p>
           <w:p>
@@ -1475,130 +1557,7 @@
                 <w:sz w:val="18"/>
                 <w:szCs w:val="18"/>
               </w:rPr>
-              <w:t xml:space="preserve">- 1,00 Stk Fahrzeugbereitstellung</w:t>
-            </w:r>
-            <w:proofErr w:type="spellStart"/>
-            <w:r>
-              <w:rPr>
-                <w:rFonts w:ascii="Open Sans" w:eastAsia="Open Sans" w:hAnsi="Open Sans" w:cs="Open Sans"/>
-                <w:color w:val="000000"/>
-                <w:sz w:val="18"/>
-                <w:szCs w:val="18"/>
-              </w:rPr>
-              <w:t/>
-            </w:r>
-            <w:proofErr w:type="spellEnd"/>
-            <w:r>
-              <w:rPr>
-                <w:rFonts w:ascii="Open Sans" w:eastAsia="Open Sans" w:hAnsi="Open Sans" w:cs="Open Sans"/>
-                <w:color w:val="000000"/>
-                <w:sz w:val="18"/>
-                <w:szCs w:val="18"/>
-              </w:rPr>
-              <w:t/>
-            </w:r>
-          </w:p>
-          <w:p>
-            <w:pPr>
-              <w:pStyle w:val="normal1"/>
-              <w:spacing w:line="278" w:lineRule="auto"/>
-              <w:ind w:right="314"/>
-              <w:rPr>
-                <w:color w:val="000000"/>
-                <w:sz w:val="18"/>
-                <w:szCs w:val="18"/>
-              </w:rPr>
-            </w:pPr>
-            <w:r>
-              <w:rPr>
-                <w:rFonts w:ascii="Open Sans" w:eastAsia="Open Sans" w:hAnsi="Open Sans" w:cs="Open Sans"/>
-                <w:color w:val="000000"/>
-                <w:sz w:val="18"/>
-                <w:szCs w:val="18"/>
-              </w:rPr>
-              <w:t xml:space="preserve">- 1,00 Stk Bereitstellung und Vorhaltung von Maschinen &amp; Werkzeugen</w:t>
-            </w:r>
-            <w:proofErr w:type="spellStart"/>
-            <w:r>
-              <w:rPr>
-                <w:rFonts w:ascii="Open Sans" w:eastAsia="Open Sans" w:hAnsi="Open Sans" w:cs="Open Sans"/>
-                <w:color w:val="000000"/>
-                <w:sz w:val="18"/>
-                <w:szCs w:val="18"/>
-              </w:rPr>
-              <w:t/>
-            </w:r>
-            <w:proofErr w:type="spellEnd"/>
-            <w:r>
-              <w:rPr>
-                <w:rFonts w:ascii="Open Sans" w:eastAsia="Open Sans" w:hAnsi="Open Sans" w:cs="Open Sans"/>
-                <w:color w:val="000000"/>
-                <w:sz w:val="18"/>
-                <w:szCs w:val="18"/>
-              </w:rPr>
-              <w:t/>
-            </w:r>
-          </w:p>
-          <w:p>
-            <w:pPr>
-              <w:pStyle w:val="normal1"/>
-              <w:spacing w:line="278" w:lineRule="auto"/>
-              <w:ind w:right="314"/>
-              <w:rPr>
-                <w:color w:val="000000"/>
-                <w:sz w:val="18"/>
-                <w:szCs w:val="18"/>
-              </w:rPr>
-            </w:pPr>
-            <w:r>
-              <w:rPr>
-                <w:rFonts w:ascii="Open Sans" w:eastAsia="Open Sans" w:hAnsi="Open Sans" w:cs="Open Sans"/>
-                <w:color w:val="000000"/>
-                <w:sz w:val="18"/>
-                <w:szCs w:val="18"/>
-              </w:rPr>
-              <w:t xml:space="preserve">- 1,00 Stk Beräumung der Baustelle</w:t>
-            </w:r>
-            <w:proofErr w:type="spellStart"/>
-            <w:r>
-              <w:rPr>
-                <w:rFonts w:ascii="Open Sans" w:eastAsia="Open Sans" w:hAnsi="Open Sans" w:cs="Open Sans"/>
-                <w:color w:val="000000"/>
-                <w:sz w:val="18"/>
-                <w:szCs w:val="18"/>
-              </w:rPr>
-              <w:t/>
-            </w:r>
-            <w:proofErr w:type="spellEnd"/>
-            <w:r>
-              <w:rPr>
-                <w:rFonts w:ascii="Open Sans" w:eastAsia="Open Sans" w:hAnsi="Open Sans" w:cs="Open Sans"/>
-                <w:color w:val="000000"/>
-                <w:sz w:val="18"/>
-                <w:szCs w:val="18"/>
-              </w:rPr>
-              <w:t/>
-            </w:r>
-          </w:p>
-          <w:p>
-            <w:pPr>
-              <w:pStyle w:val="normal1"/>
-              <w:spacing w:line="278" w:lineRule="auto"/>
-              <w:ind w:right="314"/>
-              <w:rPr>
-                <w:color w:val="000000"/>
-                <w:sz w:val="18"/>
-                <w:szCs w:val="18"/>
-              </w:rPr>
-            </w:pPr>
-            <w:r>
-              <w:rPr>
-                <w:rFonts w:ascii="Open Sans" w:eastAsia="Open Sans" w:hAnsi="Open Sans" w:cs="Open Sans"/>
-                <w:color w:val="000000"/>
-                <w:sz w:val="18"/>
-                <w:szCs w:val="18"/>
-              </w:rPr>
-              <w:t xml:space="preserve">- 2 km Kilometerpauschale</w:t>
+              <w:t xml:space="preserve">- 44 km Kilometerpauschale</w:t>
             </w:r>
             <w:proofErr w:type="spellStart"/>
             <w:r>
@@ -1854,7 +1813,7 @@
                 <w:sz w:val="20"/>
                 <w:szCs w:val="20"/>
               </w:rPr>
-              <w:t xml:space="preserve">465,27 €</w:t>
+              <w:t xml:space="preserve">0,00 €</w:t>
             </w:r>
             <w:proofErr w:type="spellStart"/>
             <w:r>
@@ -1899,7 +1858,7 @@
               <w:jc w:val="center"/>
             </w:pPr>
             <w:r>
-              <w:t xml:space="preserve">465,27 €</w:t>
+              <w:t xml:space="preserve">0,00 €</w:t>
             </w:r>
             <w:proofErr w:type="spellStart"/>
             <w:r>
@@ -1986,7 +1945,7 @@
                 <w:sz w:val="18"/>
                 <w:szCs w:val="18"/>
               </w:rPr>
-              <w:t xml:space="preserve">- 1 Stk TRINNITY Wannenabdichtband-Set 3,4 m Nass-/Trockenanbindung entspr. DIN 18534</w:t>
+              <w:t xml:space="preserve">- 4 Stk TODO_BWT_DOOR_STD</w:t>
             </w:r>
             <w:proofErr w:type="spellStart"/>
             <w:r>
@@ -2028,301 +1987,7 @@
                 <w:sz w:val="18"/>
                 <w:szCs w:val="18"/>
               </w:rPr>
-              <w:t xml:space="preserve">- 1 Stk Ablaufgarnitur Rohbauset m.Sifon BH60mm f.flache Duschw.m.90mm Ablauf TRINNITY</w:t>
-            </w:r>
-            <w:proofErr w:type="spellStart"/>
-            <w:r>
-              <w:rPr>
-                <w:rFonts w:ascii="Open Sans" w:eastAsia="Open Sans" w:hAnsi="Open Sans" w:cs="Open Sans"/>
-                <w:color w:val="000000"/>
-                <w:sz w:val="18"/>
-                <w:szCs w:val="18"/>
-              </w:rPr>
-              <w:t/>
-            </w:r>
-            <w:proofErr w:type="spellEnd"/>
-            <w:r>
-              <w:rPr>
-                <w:rFonts w:ascii="Open Sans" w:eastAsia="Open Sans" w:hAnsi="Open Sans" w:cs="Open Sans"/>
-                <w:color w:val="000000"/>
-                <w:sz w:val="18"/>
-                <w:szCs w:val="18"/>
-              </w:rPr>
-              <w:t/>
-            </w:r>
-          </w:p>
-          <w:p>
-            <w:pPr>
-              <w:pStyle w:val="normal1"/>
-              <w:spacing w:line="278" w:lineRule="auto"/>
-              <w:ind w:right="314"/>
-              <w:rPr>
-                <w:rFonts w:ascii="Open Sans" w:eastAsia="Open Sans" w:hAnsi="Open Sans" w:cs="Open Sans"/>
-                <w:color w:val="000000"/>
-                <w:sz w:val="18"/>
-                <w:szCs w:val="18"/>
-              </w:rPr>
-            </w:pPr>
-            <w:r>
-              <w:rPr>
-                <w:rFonts w:ascii="Open Sans" w:eastAsia="Open Sans" w:hAnsi="Open Sans" w:cs="Open Sans"/>
-                <w:color w:val="000000"/>
-                <w:sz w:val="18"/>
-                <w:szCs w:val="18"/>
-              </w:rPr>
-              <w:t xml:space="preserve">- 1 Stk Kleinmaterial</w:t>
-            </w:r>
-            <w:proofErr w:type="spellStart"/>
-            <w:r>
-              <w:rPr>
-                <w:rFonts w:ascii="Open Sans" w:eastAsia="Open Sans" w:hAnsi="Open Sans" w:cs="Open Sans"/>
-                <w:color w:val="000000"/>
-                <w:sz w:val="18"/>
-                <w:szCs w:val="18"/>
-              </w:rPr>
-              <w:t/>
-            </w:r>
-            <w:proofErr w:type="spellEnd"/>
-            <w:r>
-              <w:rPr>
-                <w:rFonts w:ascii="Open Sans" w:eastAsia="Open Sans" w:hAnsi="Open Sans" w:cs="Open Sans"/>
-                <w:color w:val="000000"/>
-                <w:sz w:val="18"/>
-                <w:szCs w:val="18"/>
-              </w:rPr>
-              <w:t/>
-            </w:r>
-          </w:p>
-          <w:p>
-            <w:pPr>
-              <w:pStyle w:val="normal1"/>
-              <w:spacing w:line="278" w:lineRule="auto"/>
-              <w:ind w:right="314"/>
-              <w:rPr>
-                <w:rFonts w:ascii="Open Sans" w:eastAsia="Open Sans" w:hAnsi="Open Sans" w:cs="Open Sans"/>
-                <w:color w:val="000000"/>
-                <w:sz w:val="18"/>
-                <w:szCs w:val="18"/>
-              </w:rPr>
-            </w:pPr>
-            <w:r>
-              <w:rPr>
-                <w:rFonts w:ascii="Open Sans" w:eastAsia="Open Sans" w:hAnsi="Open Sans" w:cs="Open Sans"/>
-                <w:color w:val="000000"/>
-                <w:sz w:val="18"/>
-                <w:szCs w:val="18"/>
-              </w:rPr>
-              <w:t xml:space="preserve">- 1 Stk Stelzlager höhenverstellar Set</w:t>
-            </w:r>
-            <w:proofErr w:type="spellStart"/>
-            <w:r>
-              <w:rPr>
-                <w:rFonts w:ascii="Open Sans" w:eastAsia="Open Sans" w:hAnsi="Open Sans" w:cs="Open Sans"/>
-                <w:color w:val="000000"/>
-                <w:sz w:val="18"/>
-                <w:szCs w:val="18"/>
-              </w:rPr>
-              <w:t/>
-            </w:r>
-            <w:proofErr w:type="spellEnd"/>
-            <w:r>
-              <w:rPr>
-                <w:rFonts w:ascii="Open Sans" w:eastAsia="Open Sans" w:hAnsi="Open Sans" w:cs="Open Sans"/>
-                <w:color w:val="000000"/>
-                <w:sz w:val="18"/>
-                <w:szCs w:val="18"/>
-              </w:rPr>
-              <w:t/>
-            </w:r>
-          </w:p>
-          <w:p>
-            <w:pPr>
-              <w:pStyle w:val="normal1"/>
-              <w:spacing w:line="278" w:lineRule="auto"/>
-              <w:ind w:right="314"/>
-              <w:rPr>
-                <w:rFonts w:ascii="Open Sans" w:eastAsia="Open Sans" w:hAnsi="Open Sans" w:cs="Open Sans"/>
-                <w:color w:val="000000"/>
-                <w:sz w:val="18"/>
-                <w:szCs w:val="18"/>
-              </w:rPr>
-            </w:pPr>
-            <w:r>
-              <w:rPr>
-                <w:rFonts w:ascii="Open Sans" w:eastAsia="Open Sans" w:hAnsi="Open Sans" w:cs="Open Sans"/>
-                <w:color w:val="000000"/>
-                <w:sz w:val="18"/>
-                <w:szCs w:val="18"/>
-              </w:rPr>
-              <w:t xml:space="preserve">- 1 Stk TRINNITY Wandabdichtung BASIS-Set 5 qm DW bis 100 x 100 / BW bis 180 x 80 cm</w:t>
-            </w:r>
-            <w:proofErr w:type="spellStart"/>
-            <w:r>
-              <w:rPr>
-                <w:rFonts w:ascii="Open Sans" w:eastAsia="Open Sans" w:hAnsi="Open Sans" w:cs="Open Sans"/>
-                <w:color w:val="000000"/>
-                <w:sz w:val="18"/>
-                <w:szCs w:val="18"/>
-              </w:rPr>
-              <w:t/>
-            </w:r>
-            <w:proofErr w:type="spellEnd"/>
-            <w:r>
-              <w:rPr>
-                <w:rFonts w:ascii="Open Sans" w:eastAsia="Open Sans" w:hAnsi="Open Sans" w:cs="Open Sans"/>
-                <w:color w:val="000000"/>
-                <w:sz w:val="18"/>
-                <w:szCs w:val="18"/>
-              </w:rPr>
-              <w:t/>
-            </w:r>
-          </w:p>
-          <w:p>
-            <w:pPr>
-              <w:pStyle w:val="normal1"/>
-              <w:spacing w:line="278" w:lineRule="auto"/>
-              <w:ind w:right="314"/>
-              <w:rPr>
-                <w:rFonts w:ascii="Open Sans" w:eastAsia="Open Sans" w:hAnsi="Open Sans" w:cs="Open Sans"/>
-                <w:color w:val="000000"/>
-                <w:sz w:val="18"/>
-                <w:szCs w:val="18"/>
-              </w:rPr>
-            </w:pPr>
-            <w:r>
-              <w:rPr>
-                <w:rFonts w:ascii="Open Sans" w:eastAsia="Open Sans" w:hAnsi="Open Sans" w:cs="Open Sans"/>
-                <w:color w:val="000000"/>
-                <w:sz w:val="18"/>
-                <w:szCs w:val="18"/>
-              </w:rPr>
-              <w:t xml:space="preserve">- 1 Pkg Flächenkleber (Wandverkleidung)</w:t>
-            </w:r>
-            <w:proofErr w:type="spellStart"/>
-            <w:r>
-              <w:rPr>
-                <w:rFonts w:ascii="Open Sans" w:eastAsia="Open Sans" w:hAnsi="Open Sans" w:cs="Open Sans"/>
-                <w:color w:val="000000"/>
-                <w:sz w:val="18"/>
-                <w:szCs w:val="18"/>
-              </w:rPr>
-              <w:t/>
-            </w:r>
-            <w:proofErr w:type="spellEnd"/>
-            <w:r>
-              <w:rPr>
-                <w:rFonts w:ascii="Open Sans" w:eastAsia="Open Sans" w:hAnsi="Open Sans" w:cs="Open Sans"/>
-                <w:color w:val="000000"/>
-                <w:sz w:val="18"/>
-                <w:szCs w:val="18"/>
-              </w:rPr>
-              <w:t/>
-            </w:r>
-          </w:p>
-          <w:p>
-            <w:pPr>
-              <w:pStyle w:val="normal1"/>
-              <w:spacing w:line="278" w:lineRule="auto"/>
-              <w:ind w:right="314"/>
-              <w:rPr>
-                <w:rFonts w:ascii="Open Sans" w:eastAsia="Open Sans" w:hAnsi="Open Sans" w:cs="Open Sans"/>
-                <w:color w:val="000000"/>
-                <w:sz w:val="18"/>
-                <w:szCs w:val="18"/>
-              </w:rPr>
-            </w:pPr>
-            <w:r>
-              <w:rPr>
-                <w:rFonts w:ascii="Open Sans" w:eastAsia="Open Sans" w:hAnsi="Open Sans" w:cs="Open Sans"/>
-                <w:color w:val="000000"/>
-                <w:sz w:val="18"/>
-                <w:szCs w:val="18"/>
-              </w:rPr>
-              <w:t xml:space="preserve">- 1 Stk Abschlussprofil 3.0 255 cm silber eloxiert VIGOUR</w:t>
-            </w:r>
-            <w:proofErr w:type="spellStart"/>
-            <w:r>
-              <w:rPr>
-                <w:rFonts w:ascii="Open Sans" w:eastAsia="Open Sans" w:hAnsi="Open Sans" w:cs="Open Sans"/>
-                <w:color w:val="000000"/>
-                <w:sz w:val="18"/>
-                <w:szCs w:val="18"/>
-              </w:rPr>
-              <w:t/>
-            </w:r>
-            <w:proofErr w:type="spellEnd"/>
-            <w:r>
-              <w:rPr>
-                <w:rFonts w:ascii="Open Sans" w:eastAsia="Open Sans" w:hAnsi="Open Sans" w:cs="Open Sans"/>
-                <w:color w:val="000000"/>
-                <w:sz w:val="18"/>
-                <w:szCs w:val="18"/>
-              </w:rPr>
-              <w:t/>
-            </w:r>
-          </w:p>
-          <w:p>
-            <w:pPr>
-              <w:pStyle w:val="normal1"/>
-              <w:spacing w:line="278" w:lineRule="auto"/>
-              <w:ind w:right="314"/>
-              <w:rPr>
-                <w:rFonts w:ascii="Open Sans" w:eastAsia="Open Sans" w:hAnsi="Open Sans" w:cs="Open Sans"/>
-                <w:color w:val="000000"/>
-                <w:sz w:val="18"/>
-                <w:szCs w:val="18"/>
-              </w:rPr>
-            </w:pPr>
-            <w:r>
-              <w:rPr>
-                <w:rFonts w:ascii="Open Sans" w:eastAsia="Open Sans" w:hAnsi="Open Sans" w:cs="Open Sans"/>
-                <w:color w:val="000000"/>
-                <w:sz w:val="18"/>
-                <w:szCs w:val="18"/>
-              </w:rPr>
-              <w:t xml:space="preserve">- 1 Stk CARE Sanitär Silikon Weiß 310ml</w:t>
-            </w:r>
-            <w:proofErr w:type="spellStart"/>
-            <w:r>
-              <w:rPr>
-                <w:rFonts w:ascii="Open Sans" w:eastAsia="Open Sans" w:hAnsi="Open Sans" w:cs="Open Sans"/>
-                <w:color w:val="000000"/>
-                <w:sz w:val="18"/>
-                <w:szCs w:val="18"/>
-              </w:rPr>
-              <w:t/>
-            </w:r>
-            <w:proofErr w:type="spellEnd"/>
-            <w:r>
-              <w:rPr>
-                <w:rFonts w:ascii="Open Sans" w:eastAsia="Open Sans" w:hAnsi="Open Sans" w:cs="Open Sans"/>
-                <w:color w:val="000000"/>
-                <w:sz w:val="18"/>
-                <w:szCs w:val="18"/>
-              </w:rPr>
-              <w:t/>
-            </w:r>
-          </w:p>
-          <w:p>
-            <w:pPr>
-              <w:pStyle w:val="normal1"/>
-              <w:spacing w:line="278" w:lineRule="auto"/>
-              <w:ind w:right="314"/>
-              <w:rPr>
-                <w:rFonts w:ascii="Open Sans" w:eastAsia="Open Sans" w:hAnsi="Open Sans" w:cs="Open Sans"/>
-                <w:color w:val="000000"/>
-                <w:sz w:val="18"/>
-                <w:szCs w:val="18"/>
-              </w:rPr>
-            </w:pPr>
-            <w:r>
-              <w:rPr>
-                <w:rFonts w:ascii="Open Sans" w:eastAsia="Open Sans" w:hAnsi="Open Sans" w:cs="Open Sans"/>
-                <w:color w:val="000000"/>
-                <w:sz w:val="18"/>
-                <w:szCs w:val="18"/>
-              </w:rPr>
-              <w:t xml:space="preserve">- 1 Stk Wannenset individual 2.2 m.Wandhalter Schlauch u.HB 1-str. rund verchr.VIGOUR</w:t>
+              <w:t xml:space="preserve">- 2 Stk TODO_BWT_AID_GRAB</w:t>
             </w:r>
             <w:proofErr w:type="spellStart"/>
             <w:r>
@@ -2542,7 +2207,7 @@
                 <w:b/>
                 <w:color w:val="000000"/>
               </w:rPr>
-              <w:t xml:space="preserve">1.042,21 €</w:t>
+              <w:t xml:space="preserve">1.269,40 €</w:t>
             </w:r>
             <w:r>
               <w:rPr>
@@ -2702,7 +2367,7 @@
                 <w:b/>
                 <w:color w:val="000000"/>
               </w:rPr>
-              <w:t xml:space="preserve">198,02 €</w:t>
+              <w:t xml:space="preserve">241,19 €</w:t>
             </w:r>
             <w:r>
               <w:rPr>
@@ -2843,7 +2508,7 @@
                 <w:b/>
                 <w:color w:val="000000"/>
               </w:rPr>
-              <w:t xml:space="preserve">1.240,23 €</w:t>
+              <w:t xml:space="preserve">1.510,59 €</w:t>
             </w:r>
             <w:r>
               <w:rPr>
@@ -2898,45 +2563,6 @@
           <w:lang w:val="de-DE"/>
         </w:rPr>
         <w:t xml:space="preserve">Es handelt sich hierbei um ein Festpreisangebot für die oben definierten Leistungen.</w:t>
-      </w:r>
-    </w:p>
-    <w:p>
-      <w:pPr>
-        <w:pStyle w:val="normal1"/>
-        <w:spacing w:before="23"/>
-        <w:rPr>
-          <w:rFonts w:ascii="Open Sans" w:eastAsia="Open Sans" w:hAnsi="Open Sans" w:cs="Open Sans"/>
-          <w:color w:val="000000"/>
-          <w:lang w:val="de-DE"/>
-        </w:rPr>
-      </w:pPr>
-    </w:p>
-    <w:p>
-      <w:pPr>
-        <w:pStyle w:val="normal1"/>
-        <w:spacing w:line="286" w:lineRule="auto"/>
-        <w:ind w:left="123"/>
-        <w:rPr>
-          <w:rFonts w:ascii="Open Sans" w:eastAsia="Open Sans" w:hAnsi="Open Sans" w:cs="Open Sans"/>
-          <w:color w:val="000000"/>
-          <w:lang w:val="de-DE"/>
-        </w:rPr>
-      </w:pPr>
-      <w:r>
-        <w:rPr>
-          <w:rFonts w:ascii="Open Sans Semibold" w:eastAsia="Open Sans Semibold" w:hAnsi="Open Sans Semibold" w:cs="Open Sans Semibold"/>
-          <w:color w:val="030303"/>
-          <w:lang w:val="de-DE"/>
-        </w:rPr>
-        <w:t xml:space="preserve">ACHTUNG:</w:t>
-      </w:r>
-      <w:r>
-        <w:rPr>
-          <w:rFonts w:ascii="Open Sans" w:eastAsia="Open Sans" w:hAnsi="Open Sans" w:cs="Open Sans"/>
-          <w:color w:val="030303"/>
-          <w:lang w:val="de-DE"/>
-        </w:rPr>
-        <w:t xml:space="preserve"> Ob eine ebenerdige Montage der Duschwanne möglich ist, kann erst nach dem Ausbau der bestehenden Wanne beurteilen werden. Sollten dabei zusätzliche oder weitere Leistungen erforderlich oder von Ihnen gewünscht sein, können zusätzliche Kosten entstehen.</w:t>
       </w:r>
       <w:proofErr w:type="spellStart"/>
       <w:r>

</xml_diff>

<commit_message>
angebote file for bwt updates
</commit_message>
<xml_diff>
--- a/out-Angebot.docx
+++ b/out-Angebot.docx
@@ -127,7 +127,7 @@
                 <w:szCs w:val="22"/>
                 <w:lang w:val="en-US" w:eastAsia="zh-CN" w:bidi="hi-IN"/>
               </w:rPr>
-              <w:t xml:space="preserve">Wyatt Vinson</w:t>
+              <w:t xml:space="preserve">Ian Cortez</w:t>
             </w:r>
           </w:p>
           <w:p>
@@ -150,7 +150,7 @@
                 <w:szCs w:val="22"/>
                 <w:lang w:val="en-US" w:eastAsia="zh-CN" w:bidi="hi-IN"/>
               </w:rPr>
-              <w:t xml:space="preserve">Veniam et molestiae</w:t>
+              <w:t xml:space="preserve">Commodi elit aut cu</w:t>
             </w:r>
           </w:p>
           <w:p>
@@ -175,7 +175,7 @@
                 <w:szCs w:val="22"/>
                 <w:lang w:val="en-US" w:eastAsia="zh-CN" w:bidi="hi-IN"/>
               </w:rPr>
-              <w:t xml:space="preserve">Libero repellendus  Aspernatur enim cons</w:t>
+              <w:t xml:space="preserve">Qui amet dolore con Magna commodo quis r</w:t>
             </w:r>
           </w:p>
         </w:tc>
@@ -322,7 +322,7 @@
                 <w:szCs w:val="22"/>
                 <w:lang w:val="de-DE" w:eastAsia="zh-CN" w:bidi="hi-IN"/>
               </w:rPr>
-              <w:t xml:space="preserve">ANG2025-1118-151459</w:t>
+              <w:t xml:space="preserve">ANG2025-1118-155300</w:t>
             </w:r>
             <w:r>
               <w:rPr>
@@ -368,7 +368,7 @@
                 <w:szCs w:val="22"/>
                 <w:lang w:val="de-DE" w:eastAsia="zh-CN" w:bidi="hi-IN"/>
               </w:rPr>
-              <w:t xml:space="preserve">21.01.1989</w:t>
+              <w:t xml:space="preserve">27.05.1986</w:t>
             </w:r>
             <w:r>
               <w:rPr>
@@ -410,7 +410,7 @@
                 <w:szCs w:val="22"/>
                 <w:lang w:val="de-DE" w:eastAsia="zh-CN" w:bidi="hi-IN"/>
               </w:rPr>
-              <w:t xml:space="preserve">TaShya Coffey</w:t>
+              <w:t xml:space="preserve">Mikayla Moon</w:t>
             </w:r>
             <w:r>
               <w:rPr>
@@ -559,7 +559,7 @@
                 <w:szCs w:val="22"/>
                 <w:lang w:val="en-US" w:eastAsia="zh-CN" w:bidi="hi-IN"/>
               </w:rPr>
-              <w:t xml:space="preserve">Selma Townsend</w:t>
+              <w:t xml:space="preserve">Urielle Wilkins</w:t>
             </w:r>
           </w:p>
         </w:tc>
@@ -610,7 +610,7 @@
           <w:sz w:val="24"/>
           <w:szCs w:val="24"/>
         </w:rPr>
-        <w:t xml:space="preserve">Ihr Angebot ANG2025-1118-151459</w:t>
+        <w:t xml:space="preserve">Ihr Angebot ANG2025-1118-155300</w:t>
       </w:r>
     </w:p>
     <w:p>
@@ -634,7 +634,7 @@
           <w:rFonts w:eastAsia="Open Sans" w:cs="Open Sans" w:ascii="Open Sans" w:hAnsi="Open Sans"/>
           <w:color w:val="000000"/>
         </w:rPr>
-        <w:t xml:space="preserve">Sehr geehrte Frau Vinson,</w:t>
+        <w:t xml:space="preserve">Sehr geehrte Frau Cortez,</w:t>
         <w:br/>
       </w:r>
     </w:p>
@@ -1055,8 +1055,6 @@
               <w:t xml:space="preserve">• inkl. Vorhaltung und Beräumung der Baustelle</w:t>
               <w:br/>
               <w:t xml:space="preserve">• inkl. Lieferkosten</w:t>
-              <w:br/>
-              <w:t xml:space="preserve">• Montage Haltegriff 40 cm</w:t>
             </w:r>
           </w:p>
           <w:p>
@@ -1137,7 +1135,7 @@
                 <w:szCs w:val="20"/>
                 <w:lang w:val="en-US" w:eastAsia="zh-CN" w:bidi="hi-IN"/>
               </w:rPr>
-              <w:t xml:space="preserve">- 200,00 km Kilometerpauschale</w:t>
+              <w:t xml:space="preserve">- 22,00 km Kilometerpauschale</w:t>
             </w:r>
           </w:p>
           <w:p>
@@ -1367,253 +1365,6 @@
                 <w:lang w:val="en-US" w:eastAsia="zh-CN" w:bidi="hi-IN"/>
               </w:rPr>
               <w:t xml:space="preserve">2.980,67 €</w:t>
-            </w:r>
-          </w:p>
-        </w:tc>
-      </w:tr>
-      <w:tr>
-        <w:trPr>
-          <w:trHeight w:val="1741" w:hRule="atLeast"/>
-        </w:trPr>
-        <w:tc>
-          <w:tcPr>
-            <w:tcW w:w="630" w:type="dxa"/>
-            <w:tcBorders>
-              <w:top w:val="single" w:sz="8" w:space="0" w:color="FFFFFF"/>
-              <w:start w:val="single" w:sz="8" w:space="0" w:color="FFFFFF"/>
-              <w:bottom w:val="single" w:sz="8" w:space="0" w:color="FFFFFF"/>
-              <w:end w:val="single" w:sz="8" w:space="0" w:color="FFFFFF"/>
-            </w:tcBorders>
-            <w:shd w:color="auto" w:fill="FFFFFF" w:val="clear"/>
-            <w:tcMar>
-              <w:start w:w="56" w:type="dxa"/>
-              <w:end w:w="56" w:type="dxa"/>
-            </w:tcMar>
-          </w:tcPr>
-          <w:p>
-            <w:pPr>
-              <w:pStyle w:val="normal1"/>
-              <w:tabs>
-                <w:tab w:val="clear" w:pos="720"/>
-                <w:tab w:val="left" w:pos="750" w:leader="none"/>
-                <w:tab w:val="left" w:pos="1416" w:leader="none"/>
-              </w:tabs>
-              <w:suppressAutoHyphens w:val="true"/>
-              <w:spacing w:before="121" w:after="0"/>
-              <w:jc w:val="start"/>
-              <w:rPr>
-                <w:rFonts w:ascii="Open Sans" w:hAnsi="Open Sans" w:eastAsia="Open Sans" w:cs="Open Sans"/>
-                <w:color w:val="070707"/>
-                <w:sz w:val="20"/>
-                <w:szCs w:val="20"/>
-              </w:rPr>
-            </w:pPr>
-            <w:r>
-              <w:rPr>
-                <w:rFonts w:eastAsia="Open Sans" w:cs="Open Sans" w:ascii="Open Sans" w:hAnsi="Open Sans"/>
-                <w:color w:val="070707"/>
-                <w:sz w:val="20"/>
-                <w:szCs w:val="20"/>
-              </w:rPr>
-              <w:t xml:space="preserve">002 </w:t>
-            </w:r>
-          </w:p>
-          <w:p>
-            <w:pPr>
-              <w:pStyle w:val="normal1"/>
-              <w:suppressAutoHyphens w:val="true"/>
-              <w:spacing w:before="0" w:after="0"/>
-              <w:jc w:val="start"/>
-              <w:rPr>
-                <w:rFonts w:ascii="Calibri" w:hAnsi="Calibri" w:eastAsia="Calibri" w:cs="Calibri"/>
-                <w:kern w:val="0"/>
-                <w:sz w:val="22"/>
-                <w:szCs w:val="22"/>
-                <w:lang w:val="en-US" w:eastAsia="zh-CN" w:bidi="hi-IN"/>
-              </w:rPr>
-            </w:pPr>
-            <w:r>
-              <w:rPr>
-                <w:rFonts w:eastAsia="Calibri" w:cs="Calibri"/>
-                <w:kern w:val="0"/>
-                <w:sz w:val="22"/>
-                <w:szCs w:val="22"/>
-                <w:lang w:val="en-US" w:eastAsia="zh-CN" w:bidi="hi-IN"/>
-              </w:rPr>
-            </w:r>
-          </w:p>
-        </w:tc>
-        <w:tc>
-          <w:tcPr>
-            <w:tcW w:w="885" w:type="dxa"/>
-            <w:tcBorders>
-              <w:top w:val="single" w:sz="8" w:space="0" w:color="FFFFFF"/>
-              <w:start w:val="single" w:sz="8" w:space="0" w:color="FFFFFF"/>
-              <w:bottom w:val="single" w:sz="8" w:space="0" w:color="FFFFFF"/>
-              <w:end w:val="single" w:sz="8" w:space="0" w:color="FFFFFF"/>
-            </w:tcBorders>
-            <w:shd w:color="auto" w:fill="FFFFFF" w:val="clear"/>
-            <w:tcMar>
-              <w:start w:w="56" w:type="dxa"/>
-              <w:end w:w="56" w:type="dxa"/>
-            </w:tcMar>
-          </w:tcPr>
-          <w:p>
-            <w:pPr>
-              <w:pStyle w:val="normal1"/>
-              <w:jc w:val="start"/>
-              <w:rPr/>
-            </w:pPr>
-            <w:r>
-              <w:rPr/>
-              <w:t xml:space="preserve">1 Stk </w:t>
-            </w:r>
-          </w:p>
-        </w:tc>
-        <w:tc>
-          <w:tcPr>
-            <w:tcW w:w="4425" w:type="dxa"/>
-            <w:tcBorders>
-              <w:top w:val="single" w:sz="8" w:space="0" w:color="FFFFFF"/>
-              <w:start w:val="single" w:sz="8" w:space="0" w:color="FFFFFF"/>
-              <w:bottom w:val="single" w:sz="8" w:space="0" w:color="FFFFFF"/>
-              <w:end w:val="single" w:sz="8" w:space="0" w:color="FFFFFF"/>
-            </w:tcBorders>
-            <w:shd w:color="auto" w:fill="FFFFFF" w:val="clear"/>
-            <w:tcMar>
-              <w:start w:w="56" w:type="dxa"/>
-              <w:end w:w="56" w:type="dxa"/>
-            </w:tcMar>
-          </w:tcPr>
-          <w:p>
-            <w:pPr>
-              <w:pStyle w:val="BodyText"/>
-              <w:widowControl w:val="false"/>
-              <w:suppressAutoHyphens w:val="true"/>
-              <w:bidi w:val="0"/>
-              <w:spacing w:lineRule="auto" w:line="278" w:before="0" w:after="0"/>
-              <w:ind w:end="314"/>
-              <w:jc w:val="start"/>
-              <w:rPr/>
-            </w:pPr>
-            <w:r>
-              <w:rPr>
-                <w:rFonts w:eastAsia="Open Sans" w:cs="Open Sans" w:ascii="Open Sans" w:hAnsi="Open Sans"/>
-                <w:b/>
-                <w:bCs/>
-                <w:color w:val="000000"/>
-                <w:kern w:val="0"/>
-                <w:sz w:val="18"/>
-                <w:szCs w:val="18"/>
-                <w:lang w:val="en-US" w:eastAsia="zh-CN" w:bidi="hi-IN"/>
-              </w:rPr>
-              <w:t xml:space="preserve">Haltegriff clivia plus 32/400mm m. Ros. Edelstahl glatt poliert,VIGOUR</w:t>
-            </w:r>
-            <w:r>
-              <w:rPr>
-                <w:rFonts w:eastAsia="Arimo" w:cs="Arimo" w:ascii="Arimo" w:hAnsi="Arimo"/>
-                <w:b/>
-                <w:bCs/>
-                <w:color w:val="000000"/>
-                <w:kern w:val="0"/>
-                <w:sz w:val="20"/>
-                <w:szCs w:val="20"/>
-                <w:lang w:val="en-US" w:eastAsia="zh-CN" w:bidi="hi-IN"/>
-              </w:rPr>
-              <w:t/>
-            </w:r>
-            <w:r>
-              <w:rPr>
-                <w:rFonts w:eastAsia="Open Sans" w:cs="Open Sans" w:ascii="Open Sans" w:hAnsi="Open Sans"/>
-                <w:b/>
-                <w:bCs/>
-                <w:color w:val="000000"/>
-                <w:kern w:val="0"/>
-                <w:sz w:val="18"/>
-                <w:szCs w:val="18"/>
-                <w:lang w:val="en-US" w:eastAsia="zh-CN" w:bidi="hi-IN"/>
-              </w:rPr>
-              <w:t/>
-            </w:r>
-            <w:r>
-              <w:rPr>
-                <w:rFonts w:eastAsia="Open Sans" w:cs="Open Sans" w:ascii="Open Sans" w:hAnsi="Open Sans"/>
-                <w:color w:val="000000"/>
-                <w:kern w:val="0"/>
-                <w:sz w:val="18"/>
-                <w:szCs w:val="18"/>
-                <w:lang w:val="en-US" w:eastAsia="zh-CN" w:bidi="hi-IN"/>
-              </w:rPr>
-              <w:t xml:space="preserve"> </w:t>
-            </w:r>
-          </w:p>
-        </w:tc>
-        <w:tc>
-          <w:tcPr>
-            <w:tcW w:w="2325" w:type="dxa"/>
-            <w:tcBorders>
-              <w:top w:val="single" w:sz="8" w:space="0" w:color="FFFFFF"/>
-              <w:start w:val="single" w:sz="8" w:space="0" w:color="FFFFFF"/>
-              <w:bottom w:val="single" w:sz="8" w:space="0" w:color="FFFFFF"/>
-              <w:end w:val="single" w:sz="8" w:space="0" w:color="FFFFFF"/>
-            </w:tcBorders>
-            <w:shd w:color="auto" w:fill="FFFFFF" w:val="clear"/>
-            <w:tcMar>
-              <w:start w:w="56" w:type="dxa"/>
-              <w:end w:w="56" w:type="dxa"/>
-            </w:tcMar>
-          </w:tcPr>
-          <w:p>
-            <w:pPr>
-              <w:pStyle w:val="normal1"/>
-              <w:suppressAutoHyphens w:val="true"/>
-              <w:spacing w:lineRule="auto" w:line="278" w:before="0" w:after="0"/>
-              <w:ind w:end="314"/>
-              <w:jc w:val="start"/>
-              <w:rPr>
-                <w:color w:val="000000"/>
-              </w:rPr>
-            </w:pPr>
-            <w:r>
-              <w:rPr>
-                <w:color w:val="000000"/>
-              </w:rPr>
-              <w:t xml:space="preserve">43,18 € </w:t>
-            </w:r>
-          </w:p>
-        </w:tc>
-        <w:tc>
-          <w:tcPr>
-            <w:tcW w:w="1481" w:type="dxa"/>
-            <w:tcBorders>
-              <w:top w:val="single" w:sz="8" w:space="0" w:color="FFFFFF"/>
-              <w:start w:val="single" w:sz="8" w:space="0" w:color="FFFFFF"/>
-              <w:bottom w:val="single" w:sz="8" w:space="0" w:color="FFFFFF"/>
-              <w:end w:val="single" w:sz="8" w:space="0" w:color="FFFFFF"/>
-            </w:tcBorders>
-            <w:shd w:color="auto" w:fill="FFFFFF" w:val="clear"/>
-            <w:tcMar>
-              <w:start w:w="56" w:type="dxa"/>
-              <w:end w:w="56" w:type="dxa"/>
-            </w:tcMar>
-            <w:vAlign w:val="center"/>
-          </w:tcPr>
-          <w:p>
-            <w:pPr>
-              <w:pStyle w:val="normal1"/>
-              <w:suppressAutoHyphens w:val="true"/>
-              <w:spacing w:lineRule="auto" w:line="278" w:before="0" w:after="0"/>
-              <w:ind w:end="314"/>
-              <w:jc w:val="start"/>
-              <w:rPr>
-                <w:color w:val="000000"/>
-              </w:rPr>
-            </w:pPr>
-            <w:r>
-              <w:rPr>
-                <w:color w:val="000000"/>
-              </w:rPr>
-              <w:t xml:space="preserve">43,18 € </w:t>
             </w:r>
           </w:p>
         </w:tc>
@@ -1837,7 +1588,7 @@
                 <w:szCs w:val="22"/>
                 <w:lang w:val="en-US" w:eastAsia="zh-CN" w:bidi="hi-IN"/>
               </w:rPr>
-              <w:t xml:space="preserve">5.670,78 €</w:t>
+              <w:t xml:space="preserve">5.732,71 €</w:t>
             </w:r>
             <w:r>
               <w:rPr>
@@ -1999,7 +1750,7 @@
                 <w:szCs w:val="22"/>
                 <w:lang w:val="en-US" w:eastAsia="zh-CN" w:bidi="hi-IN"/>
               </w:rPr>
-              <w:t xml:space="preserve">1.077,45 €</w:t>
+              <w:t xml:space="preserve">1.089,21 €</w:t>
             </w:r>
             <w:r>
               <w:rPr>
@@ -2162,7 +1913,7 @@
                 <w:szCs w:val="22"/>
                 <w:lang w:val="en-US" w:eastAsia="zh-CN" w:bidi="hi-IN"/>
               </w:rPr>
-              <w:t xml:space="preserve">6.748,23 €</w:t>
+              <w:t xml:space="preserve">6.821,92 €</w:t>
             </w:r>
             <w:r>
               <w:rPr>
@@ -2725,7 +2476,7 @@
               <w:rFonts w:eastAsia="Calibri" w:cs="Calibri"/>
               <w:lang w:val="en-US" w:eastAsia="zh-CN" w:bidi="hi-IN"/>
             </w:rPr>
-            <w:t>2</w:t>
+            <w:t>3</w:t>
           </w:r>
           <w:r>
             <w:rPr>
@@ -2785,7 +2536,7 @@
               <w:rFonts w:eastAsia="Calibri" w:cs="Calibri"/>
               <w:lang w:val="en-US" w:eastAsia="zh-CN" w:bidi="hi-IN"/>
             </w:rPr>
-            <w:t>2</w:t>
+            <w:t>3</w:t>
           </w:r>
           <w:r>
             <w:rPr>
@@ -3014,7 +2765,7 @@
               <w:rFonts w:eastAsia="Calibri" w:cs="Calibri"/>
               <w:lang w:val="en-US" w:eastAsia="zh-CN" w:bidi="hi-IN"/>
             </w:rPr>
-            <w:t>2</w:t>
+            <w:t>3</w:t>
           </w:r>
           <w:r>
             <w:rPr>
@@ -3074,7 +2825,7 @@
               <w:rFonts w:eastAsia="Calibri" w:cs="Calibri"/>
               <w:lang w:val="en-US" w:eastAsia="zh-CN" w:bidi="hi-IN"/>
             </w:rPr>
-            <w:t>2</w:t>
+            <w:t>3</w:t>
           </w:r>
           <w:r>
             <w:rPr>

</xml_diff>

<commit_message>
Enthält je Einheit part for bwt + changing kosten order in the list for all
</commit_message>
<xml_diff>
--- a/out-Angebot.docx
+++ b/out-Angebot.docx
@@ -127,7 +127,7 @@
                 <w:szCs w:val="22"/>
                 <w:lang w:val="en-US" w:eastAsia="zh-CN" w:bidi="hi-IN"/>
               </w:rPr>
-              <w:t xml:space="preserve">Ian Cortez</w:t>
+              <w:t xml:space="preserve">Cheyenne Blackburn</w:t>
             </w:r>
           </w:p>
           <w:p>
@@ -150,7 +150,7 @@
                 <w:szCs w:val="22"/>
                 <w:lang w:val="en-US" w:eastAsia="zh-CN" w:bidi="hi-IN"/>
               </w:rPr>
-              <w:t xml:space="preserve">Commodi elit aut cu</w:t>
+              <w:t xml:space="preserve">Ipsum mollit dolore</w:t>
             </w:r>
           </w:p>
           <w:p>
@@ -175,7 +175,7 @@
                 <w:szCs w:val="22"/>
                 <w:lang w:val="en-US" w:eastAsia="zh-CN" w:bidi="hi-IN"/>
               </w:rPr>
-              <w:t xml:space="preserve">Qui amet dolore con Magna commodo quis r</w:t>
+              <w:t xml:space="preserve">Velit necessitatibus Quidem numquam amet</w:t>
             </w:r>
           </w:p>
         </w:tc>
@@ -322,7 +322,7 @@
                 <w:szCs w:val="22"/>
                 <w:lang w:val="de-DE" w:eastAsia="zh-CN" w:bidi="hi-IN"/>
               </w:rPr>
-              <w:t xml:space="preserve">ANG2025-1118-155300</w:t>
+              <w:t xml:space="preserve">ANG2025-1118-163104</w:t>
             </w:r>
             <w:r>
               <w:rPr>
@@ -368,7 +368,7 @@
                 <w:szCs w:val="22"/>
                 <w:lang w:val="de-DE" w:eastAsia="zh-CN" w:bidi="hi-IN"/>
               </w:rPr>
-              <w:t xml:space="preserve">27.05.1986</w:t>
+              <w:t xml:space="preserve">15.05.2020</w:t>
             </w:r>
             <w:r>
               <w:rPr>
@@ -410,7 +410,7 @@
                 <w:szCs w:val="22"/>
                 <w:lang w:val="de-DE" w:eastAsia="zh-CN" w:bidi="hi-IN"/>
               </w:rPr>
-              <w:t xml:space="preserve">Mikayla Moon</w:t>
+              <w:t xml:space="preserve">Jenette Whitley</w:t>
             </w:r>
             <w:r>
               <w:rPr>
@@ -559,7 +559,7 @@
                 <w:szCs w:val="22"/>
                 <w:lang w:val="en-US" w:eastAsia="zh-CN" w:bidi="hi-IN"/>
               </w:rPr>
-              <w:t xml:space="preserve">Urielle Wilkins</w:t>
+              <w:t xml:space="preserve">Rajah Roman</w:t>
             </w:r>
           </w:p>
         </w:tc>
@@ -610,7 +610,7 @@
           <w:sz w:val="24"/>
           <w:szCs w:val="24"/>
         </w:rPr>
-        <w:t xml:space="preserve">Ihr Angebot ANG2025-1118-155300</w:t>
+        <w:t xml:space="preserve">Ihr Angebot ANG2025-1118-163104</w:t>
       </w:r>
     </w:p>
     <w:p>
@@ -634,7 +634,7 @@
           <w:rFonts w:eastAsia="Open Sans" w:cs="Open Sans" w:ascii="Open Sans" w:hAnsi="Open Sans"/>
           <w:color w:val="000000"/>
         </w:rPr>
-        <w:t xml:space="preserve">Sehr geehrte Frau Cortez,</w:t>
+        <w:t xml:space="preserve">Sehr geehrte Frau Blackburn,</w:t>
         <w:br/>
       </w:r>
     </w:p>
@@ -1135,7 +1135,7 @@
                 <w:szCs w:val="20"/>
                 <w:lang w:val="en-US" w:eastAsia="zh-CN" w:bidi="hi-IN"/>
               </w:rPr>
-              <w:t xml:space="preserve">- 22,00 km Kilometerpauschale</w:t>
+              <w:t xml:space="preserve">- 44,00 km Kilometerpauschale</w:t>
             </w:r>
           </w:p>
           <w:p>
@@ -1588,7 +1588,7 @@
                 <w:szCs w:val="22"/>
                 <w:lang w:val="en-US" w:eastAsia="zh-CN" w:bidi="hi-IN"/>
               </w:rPr>
-              <w:t xml:space="preserve">5.732,71 €</w:t>
+              <w:t xml:space="preserve">6.307,41 €</w:t>
             </w:r>
             <w:r>
               <w:rPr>
@@ -1750,7 +1750,7 @@
                 <w:szCs w:val="22"/>
                 <w:lang w:val="en-US" w:eastAsia="zh-CN" w:bidi="hi-IN"/>
               </w:rPr>
-              <w:t xml:space="preserve">1.089,21 €</w:t>
+              <w:t xml:space="preserve">1.198,41 €</w:t>
             </w:r>
             <w:r>
               <w:rPr>
@@ -1913,7 +1913,7 @@
                 <w:szCs w:val="22"/>
                 <w:lang w:val="en-US" w:eastAsia="zh-CN" w:bidi="hi-IN"/>
               </w:rPr>
-              <w:t xml:space="preserve">6.821,92 €</w:t>
+              <w:t xml:space="preserve">7.505,82 €</w:t>
             </w:r>
             <w:r>
               <w:rPr>

</xml_diff>

<commit_message>
3 and 8 from feedback
</commit_message>
<xml_diff>
--- a/out-Angebot.docx
+++ b/out-Angebot.docx
@@ -140,7 +140,7 @@
               <w:rPr>
                 <w:rFonts w:ascii="Open Sans" w:eastAsia="Open Sans" w:hAnsi="Open Sans" w:cs="Open Sans"/>
               </w:rPr>
-              <w:t xml:space="preserve">Juliet</w:t>
+              <w:t xml:space="preserve">Giacomo</w:t>
             </w:r>
             <w:proofErr w:type="spellStart"/>
             <w:r>
@@ -154,7 +154,7 @@
               <w:rPr>
                 <w:rFonts w:ascii="Open Sans" w:eastAsia="Open Sans" w:hAnsi="Open Sans" w:cs="Open Sans"/>
               </w:rPr>
-              <w:t xml:space="preserve"> Whitley</w:t>
+              <w:t xml:space="preserve"> Calderon</w:t>
             </w:r>
             <w:proofErr w:type="spellStart"/>
             <w:r>
@@ -185,7 +185,7 @@
               <w:rPr>
                 <w:rFonts w:ascii="Open Sans" w:eastAsia="Open Sans" w:hAnsi="Open Sans" w:cs="Open Sans"/>
               </w:rPr>
-              <w:t xml:space="preserve">Assumenda dicta porr</w:t>
+              <w:t xml:space="preserve">Sed error veniam et</w:t>
             </w:r>
             <w:proofErr w:type="spellStart"/>
             <w:r>
@@ -218,7 +218,7 @@
               <w:rPr>
                 <w:rFonts w:ascii="Open Sans" w:eastAsia="Open Sans" w:hAnsi="Open Sans" w:cs="Open Sans"/>
               </w:rPr>
-              <w:t xml:space="preserve">Ex ut provident nis Est anim voluptatum </w:t>
+              <w:t xml:space="preserve">Quod rem ea ea volup Aut laboriosam fugi</w:t>
             </w:r>
           </w:p>
         </w:tc>
@@ -359,7 +359,7 @@
                 <w:rFonts w:ascii="Open Sans" w:eastAsia="Open Sans" w:hAnsi="Open Sans" w:cs="Open Sans"/>
                 <w:lang w:val="de-DE"/>
               </w:rPr>
-              <w:t xml:space="preserve">ANG2025-1119-091632</w:t>
+              <w:t xml:space="preserve">ANG2025-1119-133851</w:t>
             </w:r>
             <w:r>
               <w:rPr>
@@ -397,7 +397,7 @@
                 <w:rFonts w:ascii="Open Sans" w:eastAsia="Open Sans" w:hAnsi="Open Sans" w:cs="Open Sans"/>
                 <w:lang w:val="de-DE"/>
               </w:rPr>
-              <w:t xml:space="preserve">13.05.1979</w:t>
+              <w:t xml:space="preserve">21.03.2021</w:t>
             </w:r>
             <w:r>
               <w:rPr>
@@ -431,7 +431,7 @@
                 <w:rFonts w:ascii="Open Sans" w:eastAsia="Open Sans" w:hAnsi="Open Sans" w:cs="Open Sans"/>
                 <w:lang w:val="de-DE"/>
               </w:rPr>
-              <w:t xml:space="preserve">Kyla Hodges</w:t>
+              <w:t xml:space="preserve">Noelani Whitney</w:t>
             </w:r>
             <w:r>
               <w:rPr>
@@ -563,7 +563,7 @@
               <w:rPr>
                 <w:rFonts w:ascii="Open Sans" w:eastAsia="Open Sans" w:hAnsi="Open Sans" w:cs="Open Sans"/>
               </w:rPr>
-              <w:t xml:space="preserve">Madaline Robles</w:t>
+              <w:t xml:space="preserve">236</w:t>
             </w:r>
             <w:proofErr w:type="spellStart"/>
             <w:r>
@@ -656,7 +656,7 @@
           <w:sz w:val="24"/>
           <w:szCs w:val="24"/>
         </w:rPr>
-        <w:t xml:space="preserve"> ANG2025-1119-091632</w:t>
+        <w:t xml:space="preserve"> ANG2025-1119-133851</w:t>
       </w:r>
       <w:proofErr w:type="spellStart"/>
       <w:r>
@@ -695,7 +695,7 @@
           <w:rFonts w:ascii="Open Sans" w:eastAsia="Open Sans" w:hAnsi="Open Sans" w:cs="Open Sans"/>
           <w:color w:val="000000"/>
         </w:rPr>
-        <w:t xml:space="preserve">  Sehr geehrte Frau Whitley</w:t>
+        <w:t xml:space="preserve">  Sehr geehrte Frau Calderon</w:t>
       </w:r>
       <w:proofErr w:type="spellStart"/>
       <w:r>
@@ -1165,7 +1165,7 @@
                 <w:sz w:val="20"/>
                 <w:szCs w:val="20"/>
               </w:rPr>
-              <w:t xml:space="preserve">1.065,00 €</w:t>
+              <w:t xml:space="preserve">2.222,10 €</w:t>
             </w:r>
             <w:proofErr w:type="spellStart"/>
             <w:r>
@@ -1215,7 +1215,7 @@
                 <w:sz w:val="20"/>
                 <w:szCs w:val="20"/>
               </w:rPr>
-              <w:t xml:space="preserve">1.065,00 €</w:t>
+              <w:t xml:space="preserve">2.222,10 €</w:t>
             </w:r>
             <w:proofErr w:type="spellStart"/>
             <w:r>
@@ -1328,6 +1328,35 @@
                 <w:szCs w:val="20"/>
               </w:rPr>
             </w:pPr>
+            <w:r>
+              <w:rPr>
+                <w:rFonts w:ascii="Open Sans" w:eastAsia="Open Sans" w:hAnsi="Open Sans" w:cs="Open Sans"/>
+                <w:color w:val="000000"/>
+                <w:sz w:val="20"/>
+                <w:szCs w:val="20"/>
+              </w:rPr>
+              <w:t xml:space="preserve">- Entfernen und Entsorgen der Badewanne inkl. Befliesung</w:t>
+            </w:r>
+            <w:proofErr w:type="spellStart"/>
+            <w:r>
+              <w:rPr>
+                <w:rFonts w:ascii="Open Sans" w:eastAsia="Open Sans" w:hAnsi="Open Sans" w:cs="Open Sans"/>
+                <w:color w:val="000000"/>
+                <w:sz w:val="20"/>
+                <w:szCs w:val="20"/>
+              </w:rPr>
+              <w:t/>
+            </w:r>
+            <w:proofErr w:type="spellEnd"/>
+            <w:r>
+              <w:rPr>
+                <w:rFonts w:ascii="Open Sans" w:eastAsia="Open Sans" w:hAnsi="Open Sans" w:cs="Open Sans"/>
+                <w:color w:val="000000"/>
+                <w:sz w:val="20"/>
+                <w:szCs w:val="20"/>
+              </w:rPr>
+              <w:t/>
+            </w:r>
           </w:p>
           <w:p>
             <w:pPr>
@@ -1340,6 +1369,15 @@
                 <w:szCs w:val="20"/>
               </w:rPr>
             </w:pPr>
+            <w:r>
+              <w:rPr>
+                <w:rFonts w:ascii="Open Sans" w:eastAsia="Open Sans" w:hAnsi="Open Sans" w:cs="Open Sans"/>
+                <w:color w:val="000000"/>
+                <w:sz w:val="20"/>
+                <w:szCs w:val="20"/>
+              </w:rPr>
+              <w:t xml:space="preserve">- Entfernen und Entsorgen der Duschwanne inkl. Befliesung</w:t>
+            </w:r>
             <w:proofErr w:type="spellStart"/>
             <w:r>
               <w:rPr>
@@ -1348,7 +1386,7 @@
                 <w:sz w:val="20"/>
                 <w:szCs w:val="20"/>
               </w:rPr>
-              <w:t xml:space="preserve">Enthält</w:t>
+              <w:t/>
             </w:r>
             <w:proofErr w:type="spellEnd"/>
             <w:r>
@@ -1358,7 +1396,7 @@
                 <w:sz w:val="20"/>
                 <w:szCs w:val="20"/>
               </w:rPr>
-              <w:t xml:space="preserve"> je Einheit</w:t>
+              <w:t/>
             </w:r>
           </w:p>
           <w:p>
@@ -1379,7 +1417,7 @@
                 <w:sz w:val="20"/>
                 <w:szCs w:val="20"/>
               </w:rPr>
-              <w:t xml:space="preserve">- 1,00 Stk Fahrzeugbereitstellung</w:t>
+              <w:t xml:space="preserve">- Entfernen und Entsorgen der Duschabtrennung</w:t>
             </w:r>
             <w:proofErr w:type="spellStart"/>
             <w:r>
@@ -1413,35 +1451,6 @@
                 <w:szCs w:val="20"/>
               </w:rPr>
             </w:pPr>
-            <w:r>
-              <w:rPr>
-                <w:rFonts w:ascii="Open Sans" w:eastAsia="Open Sans" w:hAnsi="Open Sans" w:cs="Open Sans"/>
-                <w:color w:val="000000"/>
-                <w:sz w:val="20"/>
-                <w:szCs w:val="20"/>
-              </w:rPr>
-              <w:t xml:space="preserve">- 1,00 Stk Bereitstellung und Vorhaltung von Maschinen &amp; Werkzeugen</w:t>
-            </w:r>
-            <w:proofErr w:type="spellStart"/>
-            <w:r>
-              <w:rPr>
-                <w:rFonts w:ascii="Open Sans" w:eastAsia="Open Sans" w:hAnsi="Open Sans" w:cs="Open Sans"/>
-                <w:color w:val="000000"/>
-                <w:sz w:val="20"/>
-                <w:szCs w:val="20"/>
-              </w:rPr>
-              <w:t/>
-            </w:r>
-            <w:proofErr w:type="spellEnd"/>
-            <w:r>
-              <w:rPr>
-                <w:rFonts w:ascii="Open Sans" w:eastAsia="Open Sans" w:hAnsi="Open Sans" w:cs="Open Sans"/>
-                <w:color w:val="000000"/>
-                <w:sz w:val="20"/>
-                <w:szCs w:val="20"/>
-              </w:rPr>
-              <w:t/>
-            </w:r>
           </w:p>
           <w:p>
             <w:pPr>
@@ -1454,6 +1463,120 @@
                 <w:szCs w:val="20"/>
               </w:rPr>
             </w:pPr>
+            <w:proofErr w:type="spellStart"/>
+            <w:r>
+              <w:rPr>
+                <w:rFonts w:ascii="Open Sans" w:eastAsia="Open Sans" w:hAnsi="Open Sans" w:cs="Open Sans"/>
+                <w:color w:val="000000"/>
+                <w:sz w:val="20"/>
+                <w:szCs w:val="20"/>
+              </w:rPr>
+              <w:t xml:space="preserve">Enthält</w:t>
+            </w:r>
+            <w:proofErr w:type="spellEnd"/>
+            <w:r>
+              <w:rPr>
+                <w:rFonts w:ascii="Open Sans" w:eastAsia="Open Sans" w:hAnsi="Open Sans" w:cs="Open Sans"/>
+                <w:color w:val="000000"/>
+                <w:sz w:val="20"/>
+                <w:szCs w:val="20"/>
+              </w:rPr>
+              <w:t xml:space="preserve"> je Einheit</w:t>
+            </w:r>
+          </w:p>
+          <w:p>
+            <w:pPr>
+              <w:pStyle w:val="normal1"/>
+              <w:spacing w:line="278" w:lineRule="auto"/>
+              <w:ind w:right="314"/>
+              <w:rPr>
+                <w:color w:val="000000"/>
+                <w:sz w:val="20"/>
+                <w:szCs w:val="20"/>
+              </w:rPr>
+            </w:pPr>
+            <w:r>
+              <w:rPr>
+                <w:rFonts w:ascii="Open Sans" w:eastAsia="Open Sans" w:hAnsi="Open Sans" w:cs="Open Sans"/>
+                <w:color w:val="000000"/>
+                <w:sz w:val="20"/>
+                <w:szCs w:val="20"/>
+              </w:rPr>
+              <w:t xml:space="preserve">- 1,00 Stk Fahrzeugbereitstellung</w:t>
+            </w:r>
+            <w:proofErr w:type="spellStart"/>
+            <w:r>
+              <w:rPr>
+                <w:rFonts w:ascii="Open Sans" w:eastAsia="Open Sans" w:hAnsi="Open Sans" w:cs="Open Sans"/>
+                <w:color w:val="000000"/>
+                <w:sz w:val="20"/>
+                <w:szCs w:val="20"/>
+              </w:rPr>
+              <w:t/>
+            </w:r>
+            <w:proofErr w:type="spellEnd"/>
+            <w:r>
+              <w:rPr>
+                <w:rFonts w:ascii="Open Sans" w:eastAsia="Open Sans" w:hAnsi="Open Sans" w:cs="Open Sans"/>
+                <w:color w:val="000000"/>
+                <w:sz w:val="20"/>
+                <w:szCs w:val="20"/>
+              </w:rPr>
+              <w:t/>
+            </w:r>
+          </w:p>
+          <w:p>
+            <w:pPr>
+              <w:pStyle w:val="normal1"/>
+              <w:spacing w:line="278" w:lineRule="auto"/>
+              <w:ind w:right="314"/>
+              <w:rPr>
+                <w:color w:val="000000"/>
+                <w:sz w:val="20"/>
+                <w:szCs w:val="20"/>
+              </w:rPr>
+            </w:pPr>
+            <w:r>
+              <w:rPr>
+                <w:rFonts w:ascii="Open Sans" w:eastAsia="Open Sans" w:hAnsi="Open Sans" w:cs="Open Sans"/>
+                <w:color w:val="000000"/>
+                <w:sz w:val="20"/>
+                <w:szCs w:val="20"/>
+              </w:rPr>
+              <w:t xml:space="preserve">- 1,00 Stk Bereitstellung und Vorhaltung von Maschinen &amp; Werkzeugen</w:t>
+            </w:r>
+            <w:proofErr w:type="spellStart"/>
+            <w:r>
+              <w:rPr>
+                <w:rFonts w:ascii="Open Sans" w:eastAsia="Open Sans" w:hAnsi="Open Sans" w:cs="Open Sans"/>
+                <w:color w:val="000000"/>
+                <w:sz w:val="20"/>
+                <w:szCs w:val="20"/>
+              </w:rPr>
+              <w:t/>
+            </w:r>
+            <w:proofErr w:type="spellEnd"/>
+            <w:r>
+              <w:rPr>
+                <w:rFonts w:ascii="Open Sans" w:eastAsia="Open Sans" w:hAnsi="Open Sans" w:cs="Open Sans"/>
+                <w:color w:val="000000"/>
+                <w:sz w:val="20"/>
+                <w:szCs w:val="20"/>
+              </w:rPr>
+              <w:t/>
+            </w:r>
+          </w:p>
+          <w:p>
+            <w:pPr>
+              <w:pStyle w:val="normal1"/>
+              <w:spacing w:line="278" w:lineRule="auto"/>
+              <w:ind w:right="314"/>
+              <w:rPr>
+                <w:color w:val="000000"/>
+                <w:sz w:val="20"/>
+                <w:szCs w:val="20"/>
+              </w:rPr>
+            </w:pPr>
             <w:r>
               <w:rPr>
                 <w:rFonts w:ascii="Open Sans" w:eastAsia="Open Sans" w:hAnsi="Open Sans" w:cs="Open Sans"/>
@@ -1462,6 +1585,47 @@
                 <w:szCs w:val="20"/>
               </w:rPr>
               <w:t xml:space="preserve">- 1,00 Stk Beräumung der Baustelle</w:t>
+            </w:r>
+            <w:proofErr w:type="spellStart"/>
+            <w:r>
+              <w:rPr>
+                <w:rFonts w:ascii="Open Sans" w:eastAsia="Open Sans" w:hAnsi="Open Sans" w:cs="Open Sans"/>
+                <w:color w:val="000000"/>
+                <w:sz w:val="20"/>
+                <w:szCs w:val="20"/>
+              </w:rPr>
+              <w:t/>
+            </w:r>
+            <w:proofErr w:type="spellEnd"/>
+            <w:r>
+              <w:rPr>
+                <w:rFonts w:ascii="Open Sans" w:eastAsia="Open Sans" w:hAnsi="Open Sans" w:cs="Open Sans"/>
+                <w:color w:val="000000"/>
+                <w:sz w:val="20"/>
+                <w:szCs w:val="20"/>
+              </w:rPr>
+              <w:t/>
+            </w:r>
+          </w:p>
+          <w:p>
+            <w:pPr>
+              <w:pStyle w:val="normal1"/>
+              <w:spacing w:line="278" w:lineRule="auto"/>
+              <w:ind w:right="314"/>
+              <w:rPr>
+                <w:color w:val="000000"/>
+                <w:sz w:val="20"/>
+                <w:szCs w:val="20"/>
+              </w:rPr>
+            </w:pPr>
+            <w:r>
+              <w:rPr>
+                <w:rFonts w:ascii="Open Sans" w:eastAsia="Open Sans" w:hAnsi="Open Sans" w:cs="Open Sans"/>
+                <w:color w:val="000000"/>
+                <w:sz w:val="20"/>
+                <w:szCs w:val="20"/>
+              </w:rPr>
+              <w:t xml:space="preserve">- 66 km Kilometerpauschale</w:t>
             </w:r>
             <w:proofErr w:type="spellStart"/>
             <w:r>
@@ -1691,7 +1855,7 @@
                 <w:sz w:val="20"/>
                 <w:szCs w:val="20"/>
               </w:rPr>
-              <w:t xml:space="preserve">447,89 €</w:t>
+              <w:t xml:space="preserve">425,89 €</w:t>
             </w:r>
             <w:proofErr w:type="spellStart"/>
             <w:r>
@@ -1730,7 +1894,7 @@
               <w:jc w:val="center"/>
             </w:pPr>
             <w:r>
-              <w:t xml:space="preserve">447,89 €</w:t>
+              <w:t xml:space="preserve">425,89 €</w:t>
             </w:r>
             <w:proofErr w:type="spellStart"/>
             <w:r>
@@ -2094,48 +2258,6 @@
                 <w:szCs w:val="20"/>
               </w:rPr>
               <w:t xml:space="preserve">- 1 Stk CARE Sanitär Silikon Weiß 310ml</w:t>
-            </w:r>
-            <w:proofErr w:type="spellStart"/>
-            <w:r>
-              <w:rPr>
-                <w:rFonts w:ascii="Open Sans" w:eastAsia="Open Sans" w:hAnsi="Open Sans" w:cs="Open Sans"/>
-                <w:color w:val="000000"/>
-                <w:sz w:val="20"/>
-                <w:szCs w:val="20"/>
-              </w:rPr>
-              <w:t/>
-            </w:r>
-            <w:proofErr w:type="spellEnd"/>
-            <w:r>
-              <w:rPr>
-                <w:rFonts w:ascii="Open Sans" w:eastAsia="Open Sans" w:hAnsi="Open Sans" w:cs="Open Sans"/>
-                <w:color w:val="000000"/>
-                <w:sz w:val="20"/>
-                <w:szCs w:val="20"/>
-              </w:rPr>
-              <w:t/>
-            </w:r>
-          </w:p>
-          <w:p>
-            <w:pPr>
-              <w:pStyle w:val="normal1"/>
-              <w:spacing w:line="278" w:lineRule="auto"/>
-              <w:ind w:right="314"/>
-              <w:rPr>
-                <w:rFonts w:ascii="Open Sans" w:eastAsia="Open Sans" w:hAnsi="Open Sans" w:cs="Open Sans"/>
-                <w:color w:val="000000"/>
-                <w:sz w:val="20"/>
-                <w:szCs w:val="20"/>
-              </w:rPr>
-            </w:pPr>
-            <w:r>
-              <w:rPr>
-                <w:rFonts w:ascii="Open Sans" w:eastAsia="Open Sans" w:hAnsi="Open Sans" w:cs="Open Sans"/>
-                <w:color w:val="000000"/>
-                <w:sz w:val="20"/>
-                <w:szCs w:val="20"/>
-              </w:rPr>
-              <w:t xml:space="preserve">- 1 Stk ooo</w:t>
             </w:r>
             <w:proofErr w:type="spellStart"/>
             <w:r>
@@ -2343,7 +2465,7 @@
                 <w:b/>
                 <w:color w:val="000000"/>
               </w:rPr>
-              <w:t xml:space="preserve">1.661,84 €</w:t>
+              <w:t xml:space="preserve">2.785,94 €</w:t>
             </w:r>
             <w:r>
               <w:rPr>
@@ -2503,7 +2625,7 @@
                 <w:b/>
                 <w:color w:val="000000"/>
               </w:rPr>
-              <w:t xml:space="preserve">315,75 €</w:t>
+              <w:t xml:space="preserve">529,33 €</w:t>
             </w:r>
             <w:r>
               <w:rPr>
@@ -2644,7 +2766,7 @@
                 <w:b/>
                 <w:color w:val="000000"/>
               </w:rPr>
-              <w:t xml:space="preserve">1.977,59 €</w:t>
+              <w:t xml:space="preserve">3.315,27 €</w:t>
             </w:r>
             <w:r>
               <w:rPr>

</xml_diff>

<commit_message>
updated the label for optional items
</commit_message>
<xml_diff>
--- a/out-Angebot.docx
+++ b/out-Angebot.docx
@@ -140,7 +140,7 @@
               <w:rPr>
                 <w:rFonts w:ascii="Open Sans" w:eastAsia="Open Sans" w:hAnsi="Open Sans" w:cs="Open Sans"/>
               </w:rPr>
-              <w:t xml:space="preserve">Giacomo</w:t>
+              <w:t xml:space="preserve">Jada</w:t>
             </w:r>
             <w:proofErr w:type="spellStart"/>
             <w:r>
@@ -154,7 +154,7 @@
               <w:rPr>
                 <w:rFonts w:ascii="Open Sans" w:eastAsia="Open Sans" w:hAnsi="Open Sans" w:cs="Open Sans"/>
               </w:rPr>
-              <w:t xml:space="preserve"> Calderon</w:t>
+              <w:t xml:space="preserve"> Coxxxxx</w:t>
             </w:r>
             <w:proofErr w:type="spellStart"/>
             <w:r>
@@ -185,7 +185,7 @@
               <w:rPr>
                 <w:rFonts w:ascii="Open Sans" w:eastAsia="Open Sans" w:hAnsi="Open Sans" w:cs="Open Sans"/>
               </w:rPr>
-              <w:t xml:space="preserve">Sed error veniam et</w:t>
+              <w:t xml:space="preserve">Lorem delectus irur</w:t>
             </w:r>
             <w:proofErr w:type="spellStart"/>
             <w:r>
@@ -218,7 +218,7 @@
               <w:rPr>
                 <w:rFonts w:ascii="Open Sans" w:eastAsia="Open Sans" w:hAnsi="Open Sans" w:cs="Open Sans"/>
               </w:rPr>
-              <w:t xml:space="preserve">Quod rem ea ea volup Aut laboriosam fugi</w:t>
+              <w:t xml:space="preserve">Aut aut maxime et do Natus nulla illo pos</w:t>
             </w:r>
           </w:p>
         </w:tc>
@@ -359,7 +359,7 @@
                 <w:rFonts w:ascii="Open Sans" w:eastAsia="Open Sans" w:hAnsi="Open Sans" w:cs="Open Sans"/>
                 <w:lang w:val="de-DE"/>
               </w:rPr>
-              <w:t xml:space="preserve">ANG2025-1119-133851</w:t>
+              <w:t xml:space="preserve">ANG2025-1119-160556</w:t>
             </w:r>
             <w:r>
               <w:rPr>
@@ -397,7 +397,7 @@
                 <w:rFonts w:ascii="Open Sans" w:eastAsia="Open Sans" w:hAnsi="Open Sans" w:cs="Open Sans"/>
                 <w:lang w:val="de-DE"/>
               </w:rPr>
-              <w:t xml:space="preserve">21.03.2021</w:t>
+              <w:t xml:space="preserve">11.10.1992</w:t>
             </w:r>
             <w:r>
               <w:rPr>
@@ -431,7 +431,7 @@
                 <w:rFonts w:ascii="Open Sans" w:eastAsia="Open Sans" w:hAnsi="Open Sans" w:cs="Open Sans"/>
                 <w:lang w:val="de-DE"/>
               </w:rPr>
-              <w:t xml:space="preserve">Noelani Whitney</w:t>
+              <w:t xml:space="preserve">Chase Arnold</w:t>
             </w:r>
             <w:r>
               <w:rPr>
@@ -563,7 +563,7 @@
               <w:rPr>
                 <w:rFonts w:ascii="Open Sans" w:eastAsia="Open Sans" w:hAnsi="Open Sans" w:cs="Open Sans"/>
               </w:rPr>
-              <w:t xml:space="preserve">236</w:t>
+              <w:t xml:space="preserve">537</w:t>
             </w:r>
             <w:proofErr w:type="spellStart"/>
             <w:r>
@@ -656,7 +656,7 @@
           <w:sz w:val="24"/>
           <w:szCs w:val="24"/>
         </w:rPr>
-        <w:t xml:space="preserve"> ANG2025-1119-133851</w:t>
+        <w:t xml:space="preserve"> ANG2025-1119-160556</w:t>
       </w:r>
       <w:proofErr w:type="spellStart"/>
       <w:r>
@@ -695,7 +695,7 @@
           <w:rFonts w:ascii="Open Sans" w:eastAsia="Open Sans" w:hAnsi="Open Sans" w:cs="Open Sans"/>
           <w:color w:val="000000"/>
         </w:rPr>
-        <w:t xml:space="preserve">  Sehr geehrte Frau Calderon</w:t>
+        <w:t xml:space="preserve">  Sehr geehrte Frau Coxxxxx</w:t>
       </w:r>
       <w:proofErr w:type="spellStart"/>
       <w:r>
@@ -1165,7 +1165,7 @@
                 <w:sz w:val="20"/>
                 <w:szCs w:val="20"/>
               </w:rPr>
-              <w:t xml:space="preserve">2.222,10 €</w:t>
+              <w:t xml:space="preserve">1.080,40 €</w:t>
             </w:r>
             <w:proofErr w:type="spellStart"/>
             <w:r>
@@ -1215,7 +1215,7 @@
                 <w:sz w:val="20"/>
                 <w:szCs w:val="20"/>
               </w:rPr>
-              <w:t xml:space="preserve">2.222,10 €</w:t>
+              <w:t xml:space="preserve">1.080,40 €</w:t>
             </w:r>
             <w:proofErr w:type="spellStart"/>
             <w:r>
@@ -1328,35 +1328,6 @@
                 <w:szCs w:val="20"/>
               </w:rPr>
             </w:pPr>
-            <w:r>
-              <w:rPr>
-                <w:rFonts w:ascii="Open Sans" w:eastAsia="Open Sans" w:hAnsi="Open Sans" w:cs="Open Sans"/>
-                <w:color w:val="000000"/>
-                <w:sz w:val="20"/>
-                <w:szCs w:val="20"/>
-              </w:rPr>
-              <w:t xml:space="preserve">- Entfernen und Entsorgen der Badewanne inkl. Befliesung</w:t>
-            </w:r>
-            <w:proofErr w:type="spellStart"/>
-            <w:r>
-              <w:rPr>
-                <w:rFonts w:ascii="Open Sans" w:eastAsia="Open Sans" w:hAnsi="Open Sans" w:cs="Open Sans"/>
-                <w:color w:val="000000"/>
-                <w:sz w:val="20"/>
-                <w:szCs w:val="20"/>
-              </w:rPr>
-              <w:t/>
-            </w:r>
-            <w:proofErr w:type="spellEnd"/>
-            <w:r>
-              <w:rPr>
-                <w:rFonts w:ascii="Open Sans" w:eastAsia="Open Sans" w:hAnsi="Open Sans" w:cs="Open Sans"/>
-                <w:color w:val="000000"/>
-                <w:sz w:val="20"/>
-                <w:szCs w:val="20"/>
-              </w:rPr>
-              <w:t/>
-            </w:r>
           </w:p>
           <w:p>
             <w:pPr>
@@ -1369,15 +1340,6 @@
                 <w:szCs w:val="20"/>
               </w:rPr>
             </w:pPr>
-            <w:r>
-              <w:rPr>
-                <w:rFonts w:ascii="Open Sans" w:eastAsia="Open Sans" w:hAnsi="Open Sans" w:cs="Open Sans"/>
-                <w:color w:val="000000"/>
-                <w:sz w:val="20"/>
-                <w:szCs w:val="20"/>
-              </w:rPr>
-              <w:t xml:space="preserve">- Entfernen und Entsorgen der Duschwanne inkl. Befliesung</w:t>
-            </w:r>
             <w:proofErr w:type="spellStart"/>
             <w:r>
               <w:rPr>
@@ -1386,7 +1348,7 @@
                 <w:sz w:val="20"/>
                 <w:szCs w:val="20"/>
               </w:rPr>
-              <w:t/>
+              <w:t xml:space="preserve">Enthält</w:t>
             </w:r>
             <w:proofErr w:type="spellEnd"/>
             <w:r>
@@ -1396,7 +1358,7 @@
                 <w:sz w:val="20"/>
                 <w:szCs w:val="20"/>
               </w:rPr>
-              <w:t/>
+              <w:t xml:space="preserve"> je Einheit</w:t>
             </w:r>
           </w:p>
           <w:p>
@@ -1417,7 +1379,7 @@
                 <w:sz w:val="20"/>
                 <w:szCs w:val="20"/>
               </w:rPr>
-              <w:t xml:space="preserve">- Entfernen und Entsorgen der Duschabtrennung</w:t>
+              <w:t xml:space="preserve">- 1,00 Stk Fahrzeugbereitstellung</w:t>
             </w:r>
             <w:proofErr w:type="spellStart"/>
             <w:r>
@@ -1451,6 +1413,35 @@
                 <w:szCs w:val="20"/>
               </w:rPr>
             </w:pPr>
+            <w:r>
+              <w:rPr>
+                <w:rFonts w:ascii="Open Sans" w:eastAsia="Open Sans" w:hAnsi="Open Sans" w:cs="Open Sans"/>
+                <w:color w:val="000000"/>
+                <w:sz w:val="20"/>
+                <w:szCs w:val="20"/>
+              </w:rPr>
+              <w:t xml:space="preserve">- 1,00 Stk Bereitstellung und Vorhaltung von Maschinen &amp; Werkzeugen</w:t>
+            </w:r>
+            <w:proofErr w:type="spellStart"/>
+            <w:r>
+              <w:rPr>
+                <w:rFonts w:ascii="Open Sans" w:eastAsia="Open Sans" w:hAnsi="Open Sans" w:cs="Open Sans"/>
+                <w:color w:val="000000"/>
+                <w:sz w:val="20"/>
+                <w:szCs w:val="20"/>
+              </w:rPr>
+              <w:t/>
+            </w:r>
+            <w:proofErr w:type="spellEnd"/>
+            <w:r>
+              <w:rPr>
+                <w:rFonts w:ascii="Open Sans" w:eastAsia="Open Sans" w:hAnsi="Open Sans" w:cs="Open Sans"/>
+                <w:color w:val="000000"/>
+                <w:sz w:val="20"/>
+                <w:szCs w:val="20"/>
+              </w:rPr>
+              <w:t/>
+            </w:r>
           </w:p>
           <w:p>
             <w:pPr>
@@ -1463,6 +1454,15 @@
                 <w:szCs w:val="20"/>
               </w:rPr>
             </w:pPr>
+            <w:r>
+              <w:rPr>
+                <w:rFonts w:ascii="Open Sans" w:eastAsia="Open Sans" w:hAnsi="Open Sans" w:cs="Open Sans"/>
+                <w:color w:val="000000"/>
+                <w:sz w:val="20"/>
+                <w:szCs w:val="20"/>
+              </w:rPr>
+              <w:t xml:space="preserve">- 1,00 Stk Beräumung der Baustelle</w:t>
+            </w:r>
             <w:proofErr w:type="spellStart"/>
             <w:r>
               <w:rPr>
@@ -1471,7 +1471,7 @@
                 <w:sz w:val="20"/>
                 <w:szCs w:val="20"/>
               </w:rPr>
-              <w:t xml:space="preserve">Enthält</w:t>
+              <w:t/>
             </w:r>
             <w:proofErr w:type="spellEnd"/>
             <w:r>
@@ -1481,7 +1481,7 @@
                 <w:sz w:val="20"/>
                 <w:szCs w:val="20"/>
               </w:rPr>
-              <w:t xml:space="preserve"> je Einheit</w:t>
+              <w:t/>
             </w:r>
           </w:p>
           <w:p>
@@ -1502,130 +1502,7 @@
                 <w:sz w:val="20"/>
                 <w:szCs w:val="20"/>
               </w:rPr>
-              <w:t xml:space="preserve">- 1,00 Stk Fahrzeugbereitstellung</w:t>
-            </w:r>
-            <w:proofErr w:type="spellStart"/>
-            <w:r>
-              <w:rPr>
-                <w:rFonts w:ascii="Open Sans" w:eastAsia="Open Sans" w:hAnsi="Open Sans" w:cs="Open Sans"/>
-                <w:color w:val="000000"/>
-                <w:sz w:val="20"/>
-                <w:szCs w:val="20"/>
-              </w:rPr>
-              <w:t/>
-            </w:r>
-            <w:proofErr w:type="spellEnd"/>
-            <w:r>
-              <w:rPr>
-                <w:rFonts w:ascii="Open Sans" w:eastAsia="Open Sans" w:hAnsi="Open Sans" w:cs="Open Sans"/>
-                <w:color w:val="000000"/>
-                <w:sz w:val="20"/>
-                <w:szCs w:val="20"/>
-              </w:rPr>
-              <w:t/>
-            </w:r>
-          </w:p>
-          <w:p>
-            <w:pPr>
-              <w:pStyle w:val="normal1"/>
-              <w:spacing w:line="278" w:lineRule="auto"/>
-              <w:ind w:right="314"/>
-              <w:rPr>
-                <w:color w:val="000000"/>
-                <w:sz w:val="20"/>
-                <w:szCs w:val="20"/>
-              </w:rPr>
-            </w:pPr>
-            <w:r>
-              <w:rPr>
-                <w:rFonts w:ascii="Open Sans" w:eastAsia="Open Sans" w:hAnsi="Open Sans" w:cs="Open Sans"/>
-                <w:color w:val="000000"/>
-                <w:sz w:val="20"/>
-                <w:szCs w:val="20"/>
-              </w:rPr>
-              <w:t xml:space="preserve">- 1,00 Stk Bereitstellung und Vorhaltung von Maschinen &amp; Werkzeugen</w:t>
-            </w:r>
-            <w:proofErr w:type="spellStart"/>
-            <w:r>
-              <w:rPr>
-                <w:rFonts w:ascii="Open Sans" w:eastAsia="Open Sans" w:hAnsi="Open Sans" w:cs="Open Sans"/>
-                <w:color w:val="000000"/>
-                <w:sz w:val="20"/>
-                <w:szCs w:val="20"/>
-              </w:rPr>
-              <w:t/>
-            </w:r>
-            <w:proofErr w:type="spellEnd"/>
-            <w:r>
-              <w:rPr>
-                <w:rFonts w:ascii="Open Sans" w:eastAsia="Open Sans" w:hAnsi="Open Sans" w:cs="Open Sans"/>
-                <w:color w:val="000000"/>
-                <w:sz w:val="20"/>
-                <w:szCs w:val="20"/>
-              </w:rPr>
-              <w:t/>
-            </w:r>
-          </w:p>
-          <w:p>
-            <w:pPr>
-              <w:pStyle w:val="normal1"/>
-              <w:spacing w:line="278" w:lineRule="auto"/>
-              <w:ind w:right="314"/>
-              <w:rPr>
-                <w:color w:val="000000"/>
-                <w:sz w:val="20"/>
-                <w:szCs w:val="20"/>
-              </w:rPr>
-            </w:pPr>
-            <w:r>
-              <w:rPr>
-                <w:rFonts w:ascii="Open Sans" w:eastAsia="Open Sans" w:hAnsi="Open Sans" w:cs="Open Sans"/>
-                <w:color w:val="000000"/>
-                <w:sz w:val="20"/>
-                <w:szCs w:val="20"/>
-              </w:rPr>
-              <w:t xml:space="preserve">- 1,00 Stk Beräumung der Baustelle</w:t>
-            </w:r>
-            <w:proofErr w:type="spellStart"/>
-            <w:r>
-              <w:rPr>
-                <w:rFonts w:ascii="Open Sans" w:eastAsia="Open Sans" w:hAnsi="Open Sans" w:cs="Open Sans"/>
-                <w:color w:val="000000"/>
-                <w:sz w:val="20"/>
-                <w:szCs w:val="20"/>
-              </w:rPr>
-              <w:t/>
-            </w:r>
-            <w:proofErr w:type="spellEnd"/>
-            <w:r>
-              <w:rPr>
-                <w:rFonts w:ascii="Open Sans" w:eastAsia="Open Sans" w:hAnsi="Open Sans" w:cs="Open Sans"/>
-                <w:color w:val="000000"/>
-                <w:sz w:val="20"/>
-                <w:szCs w:val="20"/>
-              </w:rPr>
-              <w:t/>
-            </w:r>
-          </w:p>
-          <w:p>
-            <w:pPr>
-              <w:pStyle w:val="normal1"/>
-              <w:spacing w:line="278" w:lineRule="auto"/>
-              <w:ind w:right="314"/>
-              <w:rPr>
-                <w:color w:val="000000"/>
-                <w:sz w:val="20"/>
-                <w:szCs w:val="20"/>
-              </w:rPr>
-            </w:pPr>
-            <w:r>
-              <w:rPr>
-                <w:rFonts w:ascii="Open Sans" w:eastAsia="Open Sans" w:hAnsi="Open Sans" w:cs="Open Sans"/>
-                <w:color w:val="000000"/>
-                <w:sz w:val="20"/>
-                <w:szCs w:val="20"/>
-              </w:rPr>
-              <w:t xml:space="preserve">- 66 km Kilometerpauschale</w:t>
+              <w:t xml:space="preserve">- 44 km Kilometerpauschale</w:t>
             </w:r>
             <w:proofErr w:type="spellStart"/>
             <w:r>
@@ -2465,7 +2342,7 @@
                 <w:b/>
                 <w:color w:val="000000"/>
               </w:rPr>
-              <w:t xml:space="preserve">2.785,94 €</w:t>
+              <w:t xml:space="preserve">1.644,24 €</w:t>
             </w:r>
             <w:r>
               <w:rPr>
@@ -2625,7 +2502,7 @@
                 <w:b/>
                 <w:color w:val="000000"/>
               </w:rPr>
-              <w:t xml:space="preserve">529,33 €</w:t>
+              <w:t xml:space="preserve">312,41 €</w:t>
             </w:r>
             <w:r>
               <w:rPr>
@@ -2766,7 +2643,7 @@
                 <w:b/>
                 <w:color w:val="000000"/>
               </w:rPr>
-              <w:t xml:space="preserve">3.315,27 €</w:t>
+              <w:t xml:space="preserve">1.956,65 €</w:t>
             </w:r>
             <w:r>
               <w:rPr>
@@ -2944,6 +2821,95 @@
           <w:lang w:val="de-DE"/>
         </w:rPr>
         <w:t xml:space="preserve"> netto)</w:t>
+      </w:r>
+      <w:r>
+        <w:rPr>
+          <w:rFonts w:ascii="Open Sans" w:eastAsia="Open Sans" w:hAnsi="Open Sans" w:cs="Open Sans"/>
+          <w:color w:val="030303"/>
+          <w:lang w:val="de-DE"/>
+        </w:rPr>
+        <w:br/>
+      </w:r>
+      <w:r>
+        <w:rPr>
+          <w:rFonts w:ascii="Open Sans" w:eastAsia="Open Sans" w:hAnsi="Open Sans" w:cs="Open Sans"/>
+          <w:color w:val="030303"/>
+          <w:lang w:val="de-DE"/>
+        </w:rPr>
+        <w:br/>
+        <w:t xml:space="preserve">Der Selbstkostenanteil beträgt </w:t>
+      </w:r>
+      <w:r>
+        <w:rPr>
+          <w:rFonts w:ascii="Open Sans" w:eastAsia="Open Sans" w:hAnsi="Open Sans" w:cs="Open Sans"/>
+          <w:b/>
+          <w:color w:val="030303"/>
+          <w:lang w:val="de-DE"/>
+        </w:rPr>
+        <w:t xml:space="preserve">0,00 €</w:t>
+      </w:r>
+      <w:proofErr w:type="spellStart"/>
+      <w:r>
+        <w:rPr>
+          <w:rFonts w:ascii="Open Sans" w:eastAsia="Open Sans" w:hAnsi="Open Sans" w:cs="Open Sans"/>
+          <w:b/>
+          <w:color w:val="030303"/>
+          <w:lang w:val="de-DE"/>
+        </w:rPr>
+        <w:t/>
+      </w:r>
+      <w:proofErr w:type="spellEnd"/>
+      <w:r>
+        <w:rPr>
+          <w:rFonts w:ascii="Open Sans" w:eastAsia="Open Sans" w:hAnsi="Open Sans" w:cs="Open Sans"/>
+          <w:b/>
+          <w:color w:val="030303"/>
+          <w:lang w:val="de-DE"/>
+        </w:rPr>
+        <w:t/>
+      </w:r>
+      <w:r>
+        <w:rPr>
+          <w:rFonts w:ascii="Open Sans" w:eastAsia="Open Sans" w:hAnsi="Open Sans" w:cs="Open Sans"/>
+          <w:color w:val="030303"/>
+          <w:lang w:val="de-DE"/>
+        </w:rPr>
+        <w:t xml:space="preserve"> unter Berücksichtigung eines gewährten Zuschusses durch die Pflegekasse </w:t>
+      </w:r>
+      <w:proofErr w:type="spellStart"/>
+      <w:r>
+        <w:rPr>
+          <w:rFonts w:ascii="Open Sans" w:eastAsia="Open Sans" w:hAnsi="Open Sans" w:cs="Open Sans"/>
+          <w:color w:val="030303"/>
+          <w:lang w:val="de-DE"/>
+        </w:rPr>
+        <w:t xml:space="preserve">i.H.v</w:t>
+      </w:r>
+      <w:proofErr w:type="spellEnd"/>
+      <w:r>
+        <w:rPr>
+          <w:rFonts w:ascii="Open Sans" w:eastAsia="Open Sans" w:hAnsi="Open Sans" w:cs="Open Sans"/>
+          <w:color w:val="030303"/>
+          <w:lang w:val="de-DE"/>
+        </w:rPr>
+        <w:t xml:space="preserve">. </w:t>
+      </w:r>
+      <w:r>
+        <w:rPr>
+          <w:rFonts w:ascii="Open Sans" w:eastAsia="Open Sans" w:hAnsi="Open Sans" w:cs="Open Sans"/>
+          <w:b/>
+          <w:color w:val="030303"/>
+          <w:lang w:val="de-DE"/>
+        </w:rPr>
+        <w:t xml:space="preserve">4.180,00 €</w:t>
+      </w:r>
+      <w:r>
+        <w:rPr>
+          <w:rFonts w:ascii="Open Sans" w:eastAsia="Open Sans" w:hAnsi="Open Sans" w:cs="Open Sans"/>
+          <w:color w:val="030303"/>
+          <w:lang w:val="de-DE"/>
+        </w:rPr>
+        <w:t xml:space="preserve">.</w:t>
       </w:r>
       <w:proofErr w:type="spellStart"/>
       <w:r>

</xml_diff>

<commit_message>
bwt can be all stored as draft
</commit_message>
<xml_diff>
--- a/out-Angebot.docx
+++ b/out-Angebot.docx
@@ -127,7 +127,7 @@
                 <w:szCs w:val="22"/>
                 <w:lang w:val="en-US" w:eastAsia="zh-CN" w:bidi="hi-IN"/>
               </w:rPr>
-              <w:t xml:space="preserve">Rudyard Day</w:t>
+              <w:t xml:space="preserve">Walter Yates</w:t>
             </w:r>
           </w:p>
           <w:p>
@@ -150,7 +150,7 @@
                 <w:szCs w:val="22"/>
                 <w:lang w:val="en-US" w:eastAsia="zh-CN" w:bidi="hi-IN"/>
               </w:rPr>
-              <w:t xml:space="preserve">Et id eaque adipisi</w:t>
+              <w:t xml:space="preserve">Aut corporis adipisc</w:t>
             </w:r>
           </w:p>
           <w:p>
@@ -175,7 +175,7 @@
                 <w:szCs w:val="22"/>
                 <w:lang w:val="en-US" w:eastAsia="zh-CN" w:bidi="hi-IN"/>
               </w:rPr>
-              <w:t xml:space="preserve">Est placeat asperna Et quia facere conse</w:t>
+              <w:t xml:space="preserve">Doloribus pariatur  Dolore autem laboris</w:t>
             </w:r>
           </w:p>
         </w:tc>
@@ -322,7 +322,7 @@
                 <w:szCs w:val="22"/>
                 <w:lang w:val="de-DE" w:eastAsia="zh-CN" w:bidi="hi-IN"/>
               </w:rPr>
-              <w:t xml:space="preserve">ANG2025-1125-120129</w:t>
+              <w:t xml:space="preserve">ANG2025-1125-153406</w:t>
             </w:r>
             <w:r>
               <w:rPr>
@@ -368,7 +368,7 @@
                 <w:szCs w:val="22"/>
                 <w:lang w:val="de-DE" w:eastAsia="zh-CN" w:bidi="hi-IN"/>
               </w:rPr>
-              <w:t xml:space="preserve">01.08.1991</w:t>
+              <w:t xml:space="preserve">04.03.2012</w:t>
             </w:r>
             <w:r>
               <w:rPr>
@@ -410,7 +410,7 @@
                 <w:szCs w:val="22"/>
                 <w:lang w:val="de-DE" w:eastAsia="zh-CN" w:bidi="hi-IN"/>
               </w:rPr>
-              <w:t xml:space="preserve">Lareina Madden</w:t>
+              <w:t xml:space="preserve">Scott Wiggins</w:t>
             </w:r>
             <w:r>
               <w:rPr>
@@ -559,7 +559,7 @@
                 <w:szCs w:val="22"/>
                 <w:lang w:val="en-US" w:eastAsia="zh-CN" w:bidi="hi-IN"/>
               </w:rPr>
-              <w:t xml:space="preserve">729</w:t>
+              <w:t xml:space="preserve">631</w:t>
             </w:r>
           </w:p>
         </w:tc>
@@ -610,7 +610,7 @@
           <w:sz w:val="24"/>
           <w:szCs w:val="24"/>
         </w:rPr>
-        <w:t xml:space="preserve">Ihr Angebot ANG2025-1125-120129</w:t>
+        <w:t xml:space="preserve">Ihr Angebot ANG2025-1125-153406</w:t>
       </w:r>
     </w:p>
     <w:p>
@@ -634,7 +634,7 @@
           <w:rFonts w:eastAsia="Open Sans" w:cs="Open Sans" w:ascii="Open Sans" w:hAnsi="Open Sans"/>
           <w:color w:val="000000"/>
         </w:rPr>
-        <w:t xml:space="preserve">Sehr geehrte Frau Day,</w:t>
+        <w:t xml:space="preserve">Sehr geehrte Frau Yates,</w:t>
         <w:br/>
       </w:r>
     </w:p>
@@ -1071,6 +1071,50 @@
             <w:r>
               <w:rPr>
                 <w:rFonts w:eastAsia="Arimo" w:cs="Arimo" w:ascii="Arimo" w:hAnsi="Arimo"/>
+                <w:b/>
+                <w:bCs w:val="false"/>
+                <w:color w:val="000000"/>
+                <w:kern w:val="0"/>
+                <w:sz w:val="20"/>
+                <w:szCs w:val="20"/>
+                <w:lang w:val="en-US" w:eastAsia="zh-CN" w:bidi="hi-IN"/>
+              </w:rPr>
+            </w:r>
+          </w:p>
+          <w:p>
+            <w:pPr>
+              <w:pStyle w:val="BodyText"/>
+              <w:suppressAutoHyphens w:val="true"/>
+              <w:spacing w:lineRule="auto" w:line="278" w:before="0" w:after="0"/>
+              <w:ind w:end="314"/>
+              <w:jc w:val="start"/>
+              <w:rPr>
+                <w:color w:val="000000"/>
+              </w:rPr>
+            </w:pPr>
+            <w:r>
+              <w:rPr>
+                <w:rFonts w:eastAsia="Arimo" w:cs="Arimo" w:ascii="Arimo" w:hAnsi="Arimo"/>
+                <w:b/>
+                <w:bCs w:val="false"/>
+                <w:color w:val="000000"/>
+                <w:kern w:val="0"/>
+                <w:sz w:val="20"/>
+                <w:szCs w:val="20"/>
+                <w:lang w:val="en-US" w:eastAsia="zh-CN" w:bidi="hi-IN"/>
+              </w:rPr>
+              <w:t xml:space="preserve">Enthält je Einheit</w:t>
+            </w:r>
+          </w:p>
+          <w:p>
+            <w:pPr>
+              <w:pStyle w:val="BodyText"/>
+              <w:suppressAutoHyphens w:val="true"/>
+              <w:spacing w:lineRule="auto" w:line="278" w:before="0" w:after="0"/>
+              <w:ind w:end="314"/>
+              <w:jc w:val="start"/>
+              <w:rPr>
+                <w:rFonts w:ascii="Arimo" w:hAnsi="Arimo" w:eastAsia="Arimo" w:cs="Arimo"/>
                 <w:b w:val="false"/>
                 <w:bCs w:val="false"/>
                 <w:color w:val="000000"/>
@@ -1079,8 +1123,7 @@
                 <w:szCs w:val="20"/>
                 <w:lang w:val="en-US" w:eastAsia="zh-CN" w:bidi="hi-IN"/>
               </w:rPr>
-              <w:t xml:space="preserve">• </w:t>
-            </w:r>
+            </w:pPr>
             <w:r>
               <w:rPr>
                 <w:rFonts w:eastAsia="Arimo" w:cs="Arimo" w:ascii="Arimo" w:hAnsi="Arimo"/>
@@ -1092,113 +1135,7 @@
                 <w:szCs w:val="20"/>
                 <w:lang w:val="en-US" w:eastAsia="zh-CN" w:bidi="hi-IN"/>
               </w:rPr>
-              <w:t xml:space="preserve">Montage Haltegriff 40 cm</w:t>
-            </w:r>
-          </w:p>
-          <w:p>
-            <w:pPr>
-              <w:pStyle w:val="BodyText"/>
-              <w:suppressAutoHyphens w:val="true"/>
-              <w:spacing w:lineRule="auto" w:line="278" w:before="0" w:after="0"/>
-              <w:ind w:end="314"/>
-              <w:jc w:val="start"/>
-              <w:rPr>
-                <w:color w:val="000000"/>
-              </w:rPr>
-            </w:pPr>
-            <w:r>
-              <w:rPr>
-                <w:rFonts w:eastAsia="Arimo" w:cs="Arimo" w:ascii="Arimo" w:hAnsi="Arimo"/>
-                <w:b w:val="false"/>
-                <w:bCs w:val="false"/>
-                <w:color w:val="000000"/>
-                <w:kern w:val="0"/>
-                <w:sz w:val="20"/>
-                <w:szCs w:val="20"/>
-                <w:lang w:val="en-US" w:eastAsia="zh-CN" w:bidi="hi-IN"/>
-              </w:rPr>
-              <w:t/>
-            </w:r>
-          </w:p>
-          <w:p>
-            <w:pPr>
-              <w:pStyle w:val="BodyText"/>
-              <w:suppressAutoHyphens w:val="true"/>
-              <w:spacing w:lineRule="auto" w:line="278" w:before="0" w:after="0"/>
-              <w:ind w:end="314"/>
-              <w:jc w:val="start"/>
-              <w:rPr>
-                <w:color w:val="000000"/>
-              </w:rPr>
-            </w:pPr>
-            <w:r>
-              <w:rPr>
-                <w:rFonts w:eastAsia="Arimo" w:cs="Arimo" w:ascii="Arimo" w:hAnsi="Arimo"/>
-                <w:b/>
-                <w:bCs w:val="false"/>
-                <w:color w:val="000000"/>
-                <w:kern w:val="0"/>
-                <w:sz w:val="20"/>
-                <w:szCs w:val="20"/>
-                <w:lang w:val="en-US" w:eastAsia="zh-CN" w:bidi="hi-IN"/>
-              </w:rPr>
-            </w:r>
-          </w:p>
-          <w:p>
-            <w:pPr>
-              <w:pStyle w:val="BodyText"/>
-              <w:suppressAutoHyphens w:val="true"/>
-              <w:spacing w:lineRule="auto" w:line="278" w:before="0" w:after="0"/>
-              <w:ind w:end="314"/>
-              <w:jc w:val="start"/>
-              <w:rPr>
-                <w:color w:val="000000"/>
-              </w:rPr>
-            </w:pPr>
-            <w:r>
-              <w:rPr>
-                <w:rFonts w:eastAsia="Arimo" w:cs="Arimo" w:ascii="Arimo" w:hAnsi="Arimo"/>
-                <w:b/>
-                <w:bCs w:val="false"/>
-                <w:color w:val="000000"/>
-                <w:kern w:val="0"/>
-                <w:sz w:val="20"/>
-                <w:szCs w:val="20"/>
-                <w:lang w:val="en-US" w:eastAsia="zh-CN" w:bidi="hi-IN"/>
-              </w:rPr>
-              <w:t xml:space="preserve">Enthält je Einheit</w:t>
-            </w:r>
-          </w:p>
-          <w:p>
-            <w:pPr>
-              <w:pStyle w:val="BodyText"/>
-              <w:suppressAutoHyphens w:val="true"/>
-              <w:spacing w:lineRule="auto" w:line="278" w:before="0" w:after="0"/>
-              <w:ind w:end="314"/>
-              <w:jc w:val="start"/>
-              <w:rPr>
-                <w:rFonts w:ascii="Arimo" w:hAnsi="Arimo" w:eastAsia="Arimo" w:cs="Arimo"/>
-                <w:b w:val="false"/>
-                <w:bCs w:val="false"/>
-                <w:color w:val="000000"/>
-                <w:kern w:val="0"/>
-                <w:sz w:val="20"/>
-                <w:szCs w:val="20"/>
-                <w:lang w:val="en-US" w:eastAsia="zh-CN" w:bidi="hi-IN"/>
-              </w:rPr>
-            </w:pPr>
-            <w:r>
-              <w:rPr>
-                <w:rFonts w:eastAsia="Arimo" w:cs="Arimo" w:ascii="Arimo" w:hAnsi="Arimo"/>
-                <w:b w:val="false"/>
-                <w:bCs w:val="false"/>
-                <w:color w:val="000000"/>
-                <w:kern w:val="0"/>
-                <w:sz w:val="20"/>
-                <w:szCs w:val="20"/>
-                <w:lang w:val="en-US" w:eastAsia="zh-CN" w:bidi="hi-IN"/>
-              </w:rPr>
-              <w:t xml:space="preserve">- 4,00 km Kilometerpauschale</w:t>
+              <w:t xml:space="preserve">- 254,00 km Kilometerpauschale</w:t>
             </w:r>
           </w:p>
           <w:p>
@@ -1428,253 +1365,6 @@
                 <w:lang w:val="en-US" w:eastAsia="zh-CN" w:bidi="hi-IN"/>
               </w:rPr>
               <w:t xml:space="preserve">2.980,67 €</w:t>
-            </w:r>
-          </w:p>
-        </w:tc>
-      </w:tr>
-      <w:tr>
-        <w:trPr>
-          <w:trHeight w:val="1741" w:hRule="atLeast"/>
-        </w:trPr>
-        <w:tc>
-          <w:tcPr>
-            <w:tcW w:w="630" w:type="dxa"/>
-            <w:tcBorders>
-              <w:top w:val="single" w:sz="8" w:space="0" w:color="FFFFFF"/>
-              <w:start w:val="single" w:sz="8" w:space="0" w:color="FFFFFF"/>
-              <w:bottom w:val="single" w:sz="8" w:space="0" w:color="FFFFFF"/>
-              <w:end w:val="single" w:sz="8" w:space="0" w:color="FFFFFF"/>
-            </w:tcBorders>
-            <w:shd w:color="auto" w:fill="FFFFFF" w:val="clear"/>
-            <w:tcMar>
-              <w:start w:w="56" w:type="dxa"/>
-              <w:end w:w="56" w:type="dxa"/>
-            </w:tcMar>
-          </w:tcPr>
-          <w:p>
-            <w:pPr>
-              <w:pStyle w:val="normal1"/>
-              <w:tabs>
-                <w:tab w:val="clear" w:pos="720"/>
-                <w:tab w:val="left" w:pos="750" w:leader="none"/>
-                <w:tab w:val="left" w:pos="1416" w:leader="none"/>
-              </w:tabs>
-              <w:suppressAutoHyphens w:val="true"/>
-              <w:spacing w:before="121" w:after="0"/>
-              <w:jc w:val="start"/>
-              <w:rPr>
-                <w:rFonts w:ascii="Open Sans" w:hAnsi="Open Sans" w:eastAsia="Open Sans" w:cs="Open Sans"/>
-                <w:color w:val="070707"/>
-                <w:sz w:val="20"/>
-                <w:szCs w:val="20"/>
-              </w:rPr>
-            </w:pPr>
-            <w:r>
-              <w:rPr>
-                <w:rFonts w:eastAsia="Open Sans" w:cs="Open Sans" w:ascii="Open Sans" w:hAnsi="Open Sans"/>
-                <w:color w:val="070707"/>
-                <w:sz w:val="20"/>
-                <w:szCs w:val="20"/>
-              </w:rPr>
-              <w:t xml:space="preserve">002 </w:t>
-            </w:r>
-          </w:p>
-          <w:p>
-            <w:pPr>
-              <w:pStyle w:val="normal1"/>
-              <w:suppressAutoHyphens w:val="true"/>
-              <w:spacing w:before="0" w:after="0"/>
-              <w:jc w:val="start"/>
-              <w:rPr>
-                <w:rFonts w:ascii="Calibri" w:hAnsi="Calibri" w:eastAsia="Calibri" w:cs="Calibri"/>
-                <w:kern w:val="0"/>
-                <w:sz w:val="22"/>
-                <w:szCs w:val="22"/>
-                <w:lang w:val="en-US" w:eastAsia="zh-CN" w:bidi="hi-IN"/>
-              </w:rPr>
-            </w:pPr>
-            <w:r>
-              <w:rPr>
-                <w:rFonts w:eastAsia="Calibri" w:cs="Calibri"/>
-                <w:kern w:val="0"/>
-                <w:sz w:val="22"/>
-                <w:szCs w:val="22"/>
-                <w:lang w:val="en-US" w:eastAsia="zh-CN" w:bidi="hi-IN"/>
-              </w:rPr>
-            </w:r>
-          </w:p>
-        </w:tc>
-        <w:tc>
-          <w:tcPr>
-            <w:tcW w:w="885" w:type="dxa"/>
-            <w:tcBorders>
-              <w:top w:val="single" w:sz="8" w:space="0" w:color="FFFFFF"/>
-              <w:start w:val="single" w:sz="8" w:space="0" w:color="FFFFFF"/>
-              <w:bottom w:val="single" w:sz="8" w:space="0" w:color="FFFFFF"/>
-              <w:end w:val="single" w:sz="8" w:space="0" w:color="FFFFFF"/>
-            </w:tcBorders>
-            <w:shd w:color="auto" w:fill="FFFFFF" w:val="clear"/>
-            <w:tcMar>
-              <w:start w:w="56" w:type="dxa"/>
-              <w:end w:w="56" w:type="dxa"/>
-            </w:tcMar>
-          </w:tcPr>
-          <w:p>
-            <w:pPr>
-              <w:pStyle w:val="normal1"/>
-              <w:jc w:val="start"/>
-              <w:rPr/>
-            </w:pPr>
-            <w:r>
-              <w:rPr/>
-              <w:t xml:space="preserve">1 Stk </w:t>
-            </w:r>
-          </w:p>
-        </w:tc>
-        <w:tc>
-          <w:tcPr>
-            <w:tcW w:w="4425" w:type="dxa"/>
-            <w:tcBorders>
-              <w:top w:val="single" w:sz="8" w:space="0" w:color="FFFFFF"/>
-              <w:start w:val="single" w:sz="8" w:space="0" w:color="FFFFFF"/>
-              <w:bottom w:val="single" w:sz="8" w:space="0" w:color="FFFFFF"/>
-              <w:end w:val="single" w:sz="8" w:space="0" w:color="FFFFFF"/>
-            </w:tcBorders>
-            <w:shd w:color="auto" w:fill="FFFFFF" w:val="clear"/>
-            <w:tcMar>
-              <w:start w:w="56" w:type="dxa"/>
-              <w:end w:w="56" w:type="dxa"/>
-            </w:tcMar>
-          </w:tcPr>
-          <w:p>
-            <w:pPr>
-              <w:pStyle w:val="BodyText"/>
-              <w:widowControl w:val="false"/>
-              <w:suppressAutoHyphens w:val="true"/>
-              <w:bidi w:val="0"/>
-              <w:spacing w:lineRule="auto" w:line="278" w:before="0" w:after="0"/>
-              <w:ind w:end="314"/>
-              <w:jc w:val="start"/>
-              <w:rPr/>
-            </w:pPr>
-            <w:r>
-              <w:rPr>
-                <w:rFonts w:eastAsia="Open Sans" w:cs="Open Sans" w:ascii="Open Sans" w:hAnsi="Open Sans"/>
-                <w:b/>
-                <w:bCs/>
-                <w:color w:val="000000"/>
-                <w:kern w:val="0"/>
-                <w:sz w:val="18"/>
-                <w:szCs w:val="18"/>
-                <w:lang w:val="en-US" w:eastAsia="zh-CN" w:bidi="hi-IN"/>
-              </w:rPr>
-              <w:t xml:space="preserve">Haltegriff clivia plus 32/400mm m. Ros. Edelstahl glatt poliert,VIGOUR</w:t>
-            </w:r>
-            <w:r>
-              <w:rPr>
-                <w:rFonts w:eastAsia="Arimo" w:cs="Arimo" w:ascii="Arimo" w:hAnsi="Arimo"/>
-                <w:b/>
-                <w:bCs/>
-                <w:color w:val="000000"/>
-                <w:kern w:val="0"/>
-                <w:sz w:val="20"/>
-                <w:szCs w:val="20"/>
-                <w:lang w:val="en-US" w:eastAsia="zh-CN" w:bidi="hi-IN"/>
-              </w:rPr>
-              <w:t/>
-            </w:r>
-            <w:r>
-              <w:rPr>
-                <w:rFonts w:eastAsia="Open Sans" w:cs="Open Sans" w:ascii="Open Sans" w:hAnsi="Open Sans"/>
-                <w:b/>
-                <w:bCs/>
-                <w:color w:val="000000"/>
-                <w:kern w:val="0"/>
-                <w:sz w:val="18"/>
-                <w:szCs w:val="18"/>
-                <w:lang w:val="en-US" w:eastAsia="zh-CN" w:bidi="hi-IN"/>
-              </w:rPr>
-              <w:t/>
-            </w:r>
-            <w:r>
-              <w:rPr>
-                <w:rFonts w:eastAsia="Open Sans" w:cs="Open Sans" w:ascii="Open Sans" w:hAnsi="Open Sans"/>
-                <w:color w:val="000000"/>
-                <w:kern w:val="0"/>
-                <w:sz w:val="18"/>
-                <w:szCs w:val="18"/>
-                <w:lang w:val="en-US" w:eastAsia="zh-CN" w:bidi="hi-IN"/>
-              </w:rPr>
-              <w:t xml:space="preserve"> </w:t>
-            </w:r>
-          </w:p>
-        </w:tc>
-        <w:tc>
-          <w:tcPr>
-            <w:tcW w:w="2325" w:type="dxa"/>
-            <w:tcBorders>
-              <w:top w:val="single" w:sz="8" w:space="0" w:color="FFFFFF"/>
-              <w:start w:val="single" w:sz="8" w:space="0" w:color="FFFFFF"/>
-              <w:bottom w:val="single" w:sz="8" w:space="0" w:color="FFFFFF"/>
-              <w:end w:val="single" w:sz="8" w:space="0" w:color="FFFFFF"/>
-            </w:tcBorders>
-            <w:shd w:color="auto" w:fill="FFFFFF" w:val="clear"/>
-            <w:tcMar>
-              <w:start w:w="56" w:type="dxa"/>
-              <w:end w:w="56" w:type="dxa"/>
-            </w:tcMar>
-          </w:tcPr>
-          <w:p>
-            <w:pPr>
-              <w:pStyle w:val="normal1"/>
-              <w:suppressAutoHyphens w:val="true"/>
-              <w:spacing w:lineRule="auto" w:line="278" w:before="0" w:after="0"/>
-              <w:ind w:end="314"/>
-              <w:jc w:val="start"/>
-              <w:rPr>
-                <w:color w:val="000000"/>
-              </w:rPr>
-            </w:pPr>
-            <w:r>
-              <w:rPr>
-                <w:color w:val="000000"/>
-              </w:rPr>
-              <w:t xml:space="preserve">64,77 € </w:t>
-            </w:r>
-          </w:p>
-        </w:tc>
-        <w:tc>
-          <w:tcPr>
-            <w:tcW w:w="1481" w:type="dxa"/>
-            <w:tcBorders>
-              <w:top w:val="single" w:sz="8" w:space="0" w:color="FFFFFF"/>
-              <w:start w:val="single" w:sz="8" w:space="0" w:color="FFFFFF"/>
-              <w:bottom w:val="single" w:sz="8" w:space="0" w:color="FFFFFF"/>
-              <w:end w:val="single" w:sz="8" w:space="0" w:color="FFFFFF"/>
-            </w:tcBorders>
-            <w:shd w:color="auto" w:fill="FFFFFF" w:val="clear"/>
-            <w:tcMar>
-              <w:start w:w="56" w:type="dxa"/>
-              <w:end w:w="56" w:type="dxa"/>
-            </w:tcMar>
-            <w:vAlign w:val="center"/>
-          </w:tcPr>
-          <w:p>
-            <w:pPr>
-              <w:pStyle w:val="normal1"/>
-              <w:suppressAutoHyphens w:val="true"/>
-              <w:spacing w:lineRule="auto" w:line="278" w:before="0" w:after="0"/>
-              <w:ind w:end="314"/>
-              <w:jc w:val="start"/>
-              <w:rPr>
-                <w:color w:val="000000"/>
-              </w:rPr>
-            </w:pPr>
-            <w:r>
-              <w:rPr>
-                <w:color w:val="000000"/>
-              </w:rPr>
-              <w:t xml:space="preserve">64,77 € </w:t>
             </w:r>
           </w:p>
         </w:tc>
@@ -1898,7 +1588,7 @@
                 <w:szCs w:val="22"/>
                 <w:lang w:val="en-US" w:eastAsia="zh-CN" w:bidi="hi-IN"/>
               </w:rPr>
-              <w:t xml:space="preserve">3.957,12 €</w:t>
+              <w:t xml:space="preserve">3.310,47 €</w:t>
             </w:r>
             <w:r>
               <w:rPr>
@@ -2060,7 +1750,7 @@
                 <w:szCs w:val="22"/>
                 <w:lang w:val="en-US" w:eastAsia="zh-CN" w:bidi="hi-IN"/>
               </w:rPr>
-              <w:t xml:space="preserve">751,85 €</w:t>
+              <w:t xml:space="preserve">628,99 €</w:t>
             </w:r>
             <w:r>
               <w:rPr>
@@ -2223,7 +1913,7 @@
                 <w:szCs w:val="22"/>
                 <w:lang w:val="en-US" w:eastAsia="zh-CN" w:bidi="hi-IN"/>
               </w:rPr>
-              <w:t xml:space="preserve">4.708,97 €</w:t>
+              <w:t xml:space="preserve">3.939,46 €</w:t>
             </w:r>
             <w:r>
               <w:rPr>
@@ -2272,52 +1962,6 @@
           <w:lang w:val="de-DE"/>
         </w:rPr>
         <w:t xml:space="preserve">Es handelt sich hierbei um ein Festpreisangebot für die oben definierten Leistungen.</w:t>
-      </w:r>
-    </w:p>
-    <w:p>
-      <w:pPr>
-        <w:pStyle w:val="normal1"/>
-        <w:spacing w:before="23" w:after="0"/>
-        <w:rPr>
-          <w:rFonts w:ascii="Open Sans" w:hAnsi="Open Sans" w:eastAsia="Open Sans" w:cs="Open Sans"/>
-          <w:color w:val="000000"/>
-          <w:lang w:val="de-DE"/>
-        </w:rPr>
-      </w:pPr>
-      <w:r>
-        <w:rPr>
-          <w:rFonts w:eastAsia="Open Sans" w:cs="Open Sans" w:ascii="Open Sans" w:hAnsi="Open Sans"/>
-          <w:color w:val="000000"/>
-          <w:lang w:val="de-DE"/>
-        </w:rPr>
-      </w:r>
-    </w:p>
-    <w:p>
-      <w:pPr>
-        <w:pStyle w:val="normal1"/>
-        <w:spacing w:lineRule="auto" w:line="286"/>
-        <w:ind w:start="123"/>
-        <w:rPr>
-          <w:rFonts w:ascii="Open Sans" w:hAnsi="Open Sans" w:eastAsia="Open Sans" w:cs="Open Sans"/>
-          <w:color w:val="000000"/>
-          <w:lang w:val="de-DE"/>
-        </w:rPr>
-      </w:pPr>
-      <w:r>
-        <w:rPr>
-          <w:rFonts w:eastAsia="Open Sans Semibold" w:cs="Open Sans Semibold" w:ascii="Open Sans Semibold" w:hAnsi="Open Sans Semibold"/>
-          <w:color w:val="030303"/>
-          <w:lang w:val="de-DE"/>
-        </w:rPr>
-        <w:t xml:space="preserve">ACHTUNG:</w:t>
-      </w:r>
-      <w:r>
-        <w:rPr>
-          <w:rFonts w:eastAsia="Open Sans" w:cs="Open Sans" w:ascii="Open Sans" w:hAnsi="Open Sans"/>
-          <w:color w:val="030303"/>
-          <w:lang w:val="de-DE"/>
-        </w:rPr>
-        <w:t xml:space="preserve"> Ob eine ebenerdige Montage der Duschwanne möglich ist, kann erst nach dem Ausbau der bestehenden Wanne beurteilen werden. Sollten dabei zusätzliche oder weitere Leistungen erforderlich oder von Ihnen gewünscht sein, können zusätzliche Kosten entstehen.</w:t>
         <w:br/>
       </w:r>
     </w:p>

</xml_diff>

<commit_message>
bwt can be loaded and saved
</commit_message>
<xml_diff>
--- a/out-Angebot.docx
+++ b/out-Angebot.docx
@@ -127,7 +127,7 @@
                 <w:szCs w:val="22"/>
                 <w:lang w:val="en-US" w:eastAsia="zh-CN" w:bidi="hi-IN"/>
               </w:rPr>
-              <w:t xml:space="preserve">Walter Yates</w:t>
+              <w:t xml:space="preserve">Beatrice Meyers</w:t>
             </w:r>
           </w:p>
           <w:p>
@@ -150,7 +150,7 @@
                 <w:szCs w:val="22"/>
                 <w:lang w:val="en-US" w:eastAsia="zh-CN" w:bidi="hi-IN"/>
               </w:rPr>
-              <w:t xml:space="preserve">Aut corporis adipisc</w:t>
+              <w:t xml:space="preserve">Autem sit ut archit</w:t>
             </w:r>
           </w:p>
           <w:p>
@@ -175,7 +175,7 @@
                 <w:szCs w:val="22"/>
                 <w:lang w:val="en-US" w:eastAsia="zh-CN" w:bidi="hi-IN"/>
               </w:rPr>
-              <w:t xml:space="preserve">Doloribus pariatur  Dolore autem laboris</w:t>
+              <w:t xml:space="preserve">Recusandae Temporib Et dolore est non a</w:t>
             </w:r>
           </w:p>
         </w:tc>
@@ -322,7 +322,7 @@
                 <w:szCs w:val="22"/>
                 <w:lang w:val="de-DE" w:eastAsia="zh-CN" w:bidi="hi-IN"/>
               </w:rPr>
-              <w:t xml:space="preserve">ANG2025-1125-153406</w:t>
+              <w:t xml:space="preserve">ANG2025-1125-161503</w:t>
             </w:r>
             <w:r>
               <w:rPr>
@@ -368,7 +368,7 @@
                 <w:szCs w:val="22"/>
                 <w:lang w:val="de-DE" w:eastAsia="zh-CN" w:bidi="hi-IN"/>
               </w:rPr>
-              <w:t xml:space="preserve">04.03.2012</w:t>
+              <w:t xml:space="preserve">19.11.1985</w:t>
             </w:r>
             <w:r>
               <w:rPr>
@@ -410,7 +410,7 @@
                 <w:szCs w:val="22"/>
                 <w:lang w:val="de-DE" w:eastAsia="zh-CN" w:bidi="hi-IN"/>
               </w:rPr>
-              <w:t xml:space="preserve">Scott Wiggins</w:t>
+              <w:t xml:space="preserve">Nicholas Keith</w:t>
             </w:r>
             <w:r>
               <w:rPr>
@@ -559,7 +559,7 @@
                 <w:szCs w:val="22"/>
                 <w:lang w:val="en-US" w:eastAsia="zh-CN" w:bidi="hi-IN"/>
               </w:rPr>
-              <w:t xml:space="preserve">631</w:t>
+              <w:t xml:space="preserve">404</w:t>
             </w:r>
           </w:p>
         </w:tc>
@@ -610,7 +610,7 @@
           <w:sz w:val="24"/>
           <w:szCs w:val="24"/>
         </w:rPr>
-        <w:t xml:space="preserve">Ihr Angebot ANG2025-1125-153406</w:t>
+        <w:t xml:space="preserve">Ihr Angebot ANG2025-1125-161503</w:t>
       </w:r>
     </w:p>
     <w:p>
@@ -634,7 +634,7 @@
           <w:rFonts w:eastAsia="Open Sans" w:cs="Open Sans" w:ascii="Open Sans" w:hAnsi="Open Sans"/>
           <w:color w:val="000000"/>
         </w:rPr>
-        <w:t xml:space="preserve">Sehr geehrte Frau Yates,</w:t>
+        <w:t xml:space="preserve">Sehr geehrte Frau Meyers,</w:t>
         <w:br/>
       </w:r>
     </w:p>
@@ -1135,7 +1135,7 @@
                 <w:szCs w:val="20"/>
                 <w:lang w:val="en-US" w:eastAsia="zh-CN" w:bidi="hi-IN"/>
               </w:rPr>
-              <w:t xml:space="preserve">- 254,00 km Kilometerpauschale</w:t>
+              <w:t xml:space="preserve">- 20,00 km Kilometerpauschale</w:t>
             </w:r>
           </w:p>
           <w:p>
@@ -1588,7 +1588,7 @@
                 <w:szCs w:val="22"/>
                 <w:lang w:val="en-US" w:eastAsia="zh-CN" w:bidi="hi-IN"/>
               </w:rPr>
-              <w:t xml:space="preserve">3.310,47 €</w:t>
+              <w:t xml:space="preserve">3.267,88 €</w:t>
             </w:r>
             <w:r>
               <w:rPr>
@@ -1750,7 +1750,7 @@
                 <w:szCs w:val="22"/>
                 <w:lang w:val="en-US" w:eastAsia="zh-CN" w:bidi="hi-IN"/>
               </w:rPr>
-              <w:t xml:space="preserve">628,99 €</w:t>
+              <w:t xml:space="preserve">620,90 €</w:t>
             </w:r>
             <w:r>
               <w:rPr>
@@ -1913,7 +1913,7 @@
                 <w:szCs w:val="22"/>
                 <w:lang w:val="en-US" w:eastAsia="zh-CN" w:bidi="hi-IN"/>
               </w:rPr>
-              <w:t xml:space="preserve">3.939,46 €</w:t>
+              <w:t xml:space="preserve">3.888,78 €</w:t>
             </w:r>
             <w:r>
               <w:rPr>
@@ -1986,6 +1986,43 @@
           <w:lang w:val="de-DE"/>
         </w:rPr>
         <w:t xml:space="preserve">Diese werden vorab mit Ihnen besprochen, bedürfen lhrer Zustimmung und werden auf Regiebasis nach tatsächlichem Aufwand abgerechnet. (Stundensatz-Facharbeiter: 69,50€ netto)</w:t>
+        <w:br/>
+        <w:br/>
+        <w:t xml:space="preserve">Der Selbstkostenanteil beträgt </w:t>
+      </w:r>
+      <w:r>
+        <w:rPr>
+          <w:rFonts w:eastAsia="Open Sans" w:cs="Open Sans" w:ascii="Open Sans" w:hAnsi="Open Sans"/>
+          <w:b/>
+          <w:color w:val="030303"/>
+          <w:lang w:val="de-DE"/>
+        </w:rPr>
+        <w:t xml:space="preserve">0,00 €</w:t>
+      </w:r>
+      <w:r>
+        <w:rPr>
+          <w:rFonts w:eastAsia="Open Sans" w:cs="Open Sans" w:ascii="Open Sans" w:hAnsi="Open Sans"/>
+          <w:color w:val="030303"/>
+          <w:lang w:val="de-DE"/>
+        </w:rPr>
+        <w:t xml:space="preserve"> unter Berücksichtigung eines gewährten Zuschusses durch die Pflegekasse i.H.v. </w:t>
+      </w:r>
+      <w:r>
+        <w:rPr>
+          <w:rFonts w:eastAsia="Open Sans" w:cs="Open Sans" w:ascii="Open Sans" w:hAnsi="Open Sans"/>
+          <w:b/>
+          <w:color w:val="030303"/>
+          <w:lang w:val="de-DE"/>
+        </w:rPr>
+        <w:t xml:space="preserve">4.180,00 €</w:t>
+      </w:r>
+      <w:r>
+        <w:rPr>
+          <w:rFonts w:eastAsia="Open Sans" w:cs="Open Sans" w:ascii="Open Sans" w:hAnsi="Open Sans"/>
+          <w:color w:val="030303"/>
+          <w:lang w:val="de-DE"/>
+        </w:rPr>
+        <w:t xml:space="preserve">.</w:t>
       </w:r>
     </w:p>
     <w:p>

</xml_diff>

<commit_message>
update summe material shown in the angebote
</commit_message>
<xml_diff>
--- a/out-Angebot.docx
+++ b/out-Angebot.docx
@@ -67,9 +67,9 @@
         <w:tblLook w:firstRow="0" w:noVBand="1" w:lastRow="0" w:firstColumn="0" w:lastColumn="0" w:noHBand="1" w:val="0600"/>
       </w:tblPr>
       <w:tblGrid>
-        <w:gridCol w:w="4805"/>
+        <w:gridCol w:w="4809"/>
         <w:gridCol w:w="2268"/>
-        <w:gridCol w:w="2962"/>
+        <w:gridCol w:w="2958"/>
       </w:tblGrid>
       <w:tr>
         <w:trPr>
@@ -77,7 +77,7 @@
         </w:trPr>
         <w:tc>
           <w:tcPr>
-            <w:tcW w:w="4805" w:type="dxa"/>
+            <w:tcW w:w="4809" w:type="dxa"/>
             <w:tcBorders>
               <w:top w:val="single" w:sz="8" w:space="0" w:color="FFFFFF"/>
               <w:start w:val="single" w:sz="8" w:space="0" w:color="FFFFFF"/>
@@ -127,7 +127,7 @@
                 <w:szCs w:val="22"/>
                 <w:lang w:val="en-US" w:eastAsia="zh-CN" w:bidi="hi-IN"/>
               </w:rPr>
-              <w:t xml:space="preserve">Beatrice Meyers</w:t>
+              <w:t xml:space="preserve">Cade Baird</w:t>
             </w:r>
           </w:p>
           <w:p>
@@ -150,7 +150,7 @@
                 <w:szCs w:val="22"/>
                 <w:lang w:val="en-US" w:eastAsia="zh-CN" w:bidi="hi-IN"/>
               </w:rPr>
-              <w:t xml:space="preserve">Autem sit ut archit</w:t>
+              <w:t xml:space="preserve">Do velit vero esse o</w:t>
             </w:r>
           </w:p>
           <w:p>
@@ -175,7 +175,7 @@
                 <w:szCs w:val="22"/>
                 <w:lang w:val="en-US" w:eastAsia="zh-CN" w:bidi="hi-IN"/>
               </w:rPr>
-              <w:t xml:space="preserve">Recusandae Temporib Et dolore est non a</w:t>
+              <w:t xml:space="preserve">Debitis molestias et Qui mollit veritatis</w:t>
             </w:r>
           </w:p>
         </w:tc>
@@ -193,7 +193,7 @@
             <w:pPr>
               <w:pStyle w:val="normal1"/>
               <w:suppressAutoHyphens w:val="true"/>
-              <w:spacing w:before="0" w:after="0"/>
+              <w:spacing w:lineRule="auto" w:line="276" w:before="0" w:after="0"/>
               <w:ind w:end="127"/>
               <w:jc w:val="start"/>
               <w:rPr>
@@ -240,7 +240,7 @@
             <w:pPr>
               <w:pStyle w:val="normal1"/>
               <w:suppressAutoHyphens w:val="true"/>
-              <w:spacing w:before="0" w:after="0"/>
+              <w:spacing w:lineRule="auto" w:line="276" w:before="0" w:after="0"/>
               <w:ind w:end="127"/>
               <w:jc w:val="start"/>
               <w:rPr>
@@ -267,7 +267,7 @@
             <w:pPr>
               <w:pStyle w:val="normal1"/>
               <w:suppressAutoHyphens w:val="true"/>
-              <w:spacing w:before="0" w:after="0"/>
+              <w:spacing w:lineRule="auto" w:line="276" w:before="0" w:after="0"/>
               <w:ind w:end="127"/>
               <w:jc w:val="start"/>
               <w:rPr>
@@ -295,7 +295,7 @@
         </w:tc>
         <w:tc>
           <w:tcPr>
-            <w:tcW w:w="2962" w:type="dxa"/>
+            <w:tcW w:w="2958" w:type="dxa"/>
             <w:tcBorders>
               <w:top w:val="single" w:sz="8" w:space="0" w:color="FFFFFF"/>
               <w:start w:val="single" w:sz="8" w:space="0" w:color="FFFFFF"/>
@@ -307,7 +307,7 @@
             <w:pPr>
               <w:pStyle w:val="normal1"/>
               <w:suppressAutoHyphens w:val="true"/>
-              <w:spacing w:before="0" w:after="0"/>
+              <w:spacing w:lineRule="auto" w:line="276" w:before="0" w:after="0"/>
               <w:jc w:val="end"/>
               <w:rPr>
                 <w:rFonts w:ascii="Open Sans" w:hAnsi="Open Sans" w:eastAsia="Open Sans" w:cs="Open Sans"/>
@@ -322,7 +322,7 @@
                 <w:szCs w:val="22"/>
                 <w:lang w:val="de-DE" w:eastAsia="zh-CN" w:bidi="hi-IN"/>
               </w:rPr>
-              <w:t xml:space="preserve">ANG2025-1125-161503</w:t>
+              <w:t xml:space="preserve">ANG2025-1126-110539</w:t>
             </w:r>
             <w:r>
               <w:rPr>
@@ -350,7 +350,7 @@
             <w:pPr>
               <w:pStyle w:val="normal1"/>
               <w:suppressAutoHyphens w:val="true"/>
-              <w:spacing w:before="0" w:after="0"/>
+              <w:spacing w:lineRule="auto" w:line="276" w:before="0" w:after="0"/>
               <w:jc w:val="end"/>
               <w:rPr>
                 <w:rFonts w:ascii="Open Sans" w:hAnsi="Open Sans" w:eastAsia="Open Sans" w:cs="Open Sans"/>
@@ -368,7 +368,7 @@
                 <w:szCs w:val="22"/>
                 <w:lang w:val="de-DE" w:eastAsia="zh-CN" w:bidi="hi-IN"/>
               </w:rPr>
-              <w:t xml:space="preserve">19.11.1985</w:t>
+              <w:t xml:space="preserve">27.01.1973</w:t>
             </w:r>
             <w:r>
               <w:rPr>
@@ -410,7 +410,7 @@
                 <w:szCs w:val="22"/>
                 <w:lang w:val="de-DE" w:eastAsia="zh-CN" w:bidi="hi-IN"/>
               </w:rPr>
-              <w:t xml:space="preserve">Nicholas Keith</w:t>
+              <w:t xml:space="preserve">Mary Dyer</w:t>
             </w:r>
             <w:r>
               <w:rPr>
@@ -450,7 +450,7 @@
             <w:pPr>
               <w:pStyle w:val="normal1"/>
               <w:suppressAutoHyphens w:val="true"/>
-              <w:spacing w:before="0" w:after="0"/>
+              <w:spacing w:lineRule="auto" w:line="276" w:before="0" w:after="0"/>
               <w:jc w:val="end"/>
               <w:rPr>
                 <w:rFonts w:ascii="Open Sans" w:hAnsi="Open Sans" w:eastAsia="Open Sans" w:cs="Open Sans"/>
@@ -480,7 +480,7 @@
         </w:trPr>
         <w:tc>
           <w:tcPr>
-            <w:tcW w:w="4805" w:type="dxa"/>
+            <w:tcW w:w="4809" w:type="dxa"/>
             <w:tcBorders>
               <w:top w:val="single" w:sz="8" w:space="0" w:color="FFFFFF"/>
               <w:start w:val="single" w:sz="8" w:space="0" w:color="FFFFFF"/>
@@ -506,16 +506,17 @@
               <w:rPr>
                 <w:rFonts w:eastAsia="Open Sans" w:cs="Open Sans" w:ascii="Open Sans" w:hAnsi="Open Sans"/>
                 <w:color w:val="070707"/>
+                <w:kern w:val="0"/>
                 <w:sz w:val="17"/>
                 <w:szCs w:val="17"/>
-                <w:lang w:val="de-DE"/>
+                <w:lang w:val="de-DE" w:eastAsia="zh-CN" w:bidi="hi-IN"/>
               </w:rPr>
             </w:r>
           </w:p>
         </w:tc>
         <w:tc>
           <w:tcPr>
-            <w:tcW w:w="5230" w:type="dxa"/>
+            <w:tcW w:w="5226" w:type="dxa"/>
             <w:gridSpan w:val="2"/>
             <w:tcBorders>
               <w:top w:val="single" w:sz="8" w:space="0" w:color="FFFFFF"/>
@@ -559,7 +560,7 @@
                 <w:szCs w:val="22"/>
                 <w:lang w:val="en-US" w:eastAsia="zh-CN" w:bidi="hi-IN"/>
               </w:rPr>
-              <w:t xml:space="preserve">404</w:t>
+              <w:t xml:space="preserve">961</w:t>
             </w:r>
           </w:p>
         </w:tc>
@@ -610,7 +611,7 @@
           <w:sz w:val="24"/>
           <w:szCs w:val="24"/>
         </w:rPr>
-        <w:t xml:space="preserve">Ihr Angebot ANG2025-1125-161503</w:t>
+        <w:t xml:space="preserve">Ihr Angebot ANG2025-1126-110539</w:t>
       </w:r>
     </w:p>
     <w:p>
@@ -634,7 +635,7 @@
           <w:rFonts w:eastAsia="Open Sans" w:cs="Open Sans" w:ascii="Open Sans" w:hAnsi="Open Sans"/>
           <w:color w:val="000000"/>
         </w:rPr>
-        <w:t xml:space="preserve">Sehr geehrte Frau Meyers,</w:t>
+        <w:t xml:space="preserve">Sehr geehrte Frau Baird,</w:t>
         <w:br/>
       </w:r>
     </w:p>
@@ -693,24 +694,24 @@
     <w:tbl>
       <w:tblPr>
         <w:tblStyle w:val="TableNormal"/>
-        <w:tblW w:w="9746" w:type="dxa"/>
+        <w:tblW w:w="9780" w:type="dxa"/>
         <w:jc w:val="start"/>
-        <w:tblInd w:w="35" w:type="dxa"/>
+        <w:tblInd w:w="1" w:type="dxa"/>
         <w:tblLayout w:type="fixed"/>
         <w:tblCellMar>
           <w:top w:w="0" w:type="dxa"/>
-          <w:start w:w="10" w:type="dxa"/>
+          <w:start w:w="0" w:type="dxa"/>
           <w:bottom w:w="0" w:type="dxa"/>
-          <w:end w:w="10" w:type="dxa"/>
+          <w:end w:w="0" w:type="dxa"/>
         </w:tblCellMar>
         <w:tblLook w:firstRow="0" w:noVBand="0" w:lastRow="0" w:firstColumn="0" w:lastColumn="0" w:noHBand="0" w:val="0000"/>
       </w:tblPr>
       <w:tblGrid>
-        <w:gridCol w:w="630"/>
+        <w:gridCol w:w="660"/>
         <w:gridCol w:w="885"/>
-        <w:gridCol w:w="4425"/>
-        <w:gridCol w:w="2325"/>
-        <w:gridCol w:w="1481"/>
+        <w:gridCol w:w="4423"/>
+        <w:gridCol w:w="2327"/>
+        <w:gridCol w:w="1485"/>
       </w:tblGrid>
       <w:tr>
         <w:trPr>
@@ -718,13 +719,8 @@
         </w:trPr>
         <w:tc>
           <w:tcPr>
-            <w:tcW w:w="630" w:type="dxa"/>
-            <w:tcBorders>
-              <w:top w:val="single" w:sz="8" w:space="0" w:color="CCCCCC"/>
-              <w:start w:val="single" w:sz="8" w:space="0" w:color="CCCCCC"/>
-              <w:bottom w:val="single" w:sz="8" w:space="0" w:color="FFFFFF"/>
-              <w:end w:val="single" w:sz="8" w:space="0" w:color="CCCCCC"/>
-            </w:tcBorders>
+            <w:tcW w:w="660" w:type="dxa"/>
+            <w:tcBorders/>
             <w:shd w:color="auto" w:fill="CCCCCC" w:val="clear"/>
           </w:tcPr>
           <w:p>
@@ -757,12 +753,7 @@
         <w:tc>
           <w:tcPr>
             <w:tcW w:w="885" w:type="dxa"/>
-            <w:tcBorders>
-              <w:top w:val="single" w:sz="8" w:space="0" w:color="CCCCCC"/>
-              <w:start w:val="single" w:sz="8" w:space="0" w:color="CCCCCC"/>
-              <w:bottom w:val="single" w:sz="8" w:space="0" w:color="FFFFFF"/>
-              <w:end w:val="single" w:sz="8" w:space="0" w:color="CCCCCC"/>
-            </w:tcBorders>
+            <w:tcBorders/>
             <w:shd w:color="auto" w:fill="CCCCCC" w:val="clear"/>
           </w:tcPr>
           <w:p>
@@ -794,13 +785,8 @@
         </w:tc>
         <w:tc>
           <w:tcPr>
-            <w:tcW w:w="4425" w:type="dxa"/>
-            <w:tcBorders>
-              <w:top w:val="single" w:sz="8" w:space="0" w:color="CCCCCC"/>
-              <w:start w:val="single" w:sz="8" w:space="0" w:color="CCCCCC"/>
-              <w:bottom w:val="single" w:sz="8" w:space="0" w:color="FFFFFF"/>
-              <w:end w:val="single" w:sz="8" w:space="0" w:color="CCCCCC"/>
-            </w:tcBorders>
+            <w:tcW w:w="4423" w:type="dxa"/>
+            <w:tcBorders/>
             <w:shd w:color="auto" w:fill="CCCCCC" w:val="clear"/>
           </w:tcPr>
           <w:p>
@@ -829,13 +815,8 @@
         </w:tc>
         <w:tc>
           <w:tcPr>
-            <w:tcW w:w="2325" w:type="dxa"/>
-            <w:tcBorders>
-              <w:top w:val="single" w:sz="8" w:space="0" w:color="CCCCCC"/>
-              <w:start w:val="single" w:sz="8" w:space="0" w:color="CCCCCC"/>
-              <w:bottom w:val="single" w:sz="8" w:space="0" w:color="FFFFFF"/>
-              <w:end w:val="single" w:sz="8" w:space="0" w:color="CCCCCC"/>
-            </w:tcBorders>
+            <w:tcW w:w="2327" w:type="dxa"/>
+            <w:tcBorders/>
             <w:shd w:color="auto" w:fill="CCCCCC" w:val="clear"/>
           </w:tcPr>
           <w:p>
@@ -864,13 +845,8 @@
         </w:tc>
         <w:tc>
           <w:tcPr>
-            <w:tcW w:w="1481" w:type="dxa"/>
-            <w:tcBorders>
-              <w:top w:val="single" w:sz="8" w:space="0" w:color="CCCCCC"/>
-              <w:start w:val="single" w:sz="8" w:space="0" w:color="CCCCCC"/>
-              <w:bottom w:val="single" w:sz="8" w:space="0" w:color="FFFFFF"/>
-              <w:end w:val="single" w:sz="8" w:space="0" w:color="CCCCCC"/>
-            </w:tcBorders>
+            <w:tcW w:w="1485" w:type="dxa"/>
+            <w:tcBorders/>
             <w:shd w:color="auto" w:fill="CCCCCC" w:val="clear"/>
           </w:tcPr>
           <w:p>
@@ -900,13 +876,194 @@
       </w:tr>
       <w:tr>
         <w:trPr>
-          <w:trHeight w:val="4717" w:hRule="atLeast"/>
+          <w:trHeight w:val="315" w:hRule="atLeast"/>
         </w:trPr>
         <w:tc>
           <w:tcPr>
-            <w:tcW w:w="630" w:type="dxa"/>
+            <w:tcW w:w="660" w:type="dxa"/>
+            <w:tcBorders/>
+            <w:shd w:color="auto" w:fill="FFFFFF" w:val="clear"/>
+            <w:tcMar>
+              <w:start w:w="56" w:type="dxa"/>
+              <w:end w:w="56" w:type="dxa"/>
+            </w:tcMar>
+          </w:tcPr>
+          <w:p>
+            <w:pPr>
+              <w:pStyle w:val="normal1"/>
+              <w:suppressAutoHyphens w:val="true"/>
+              <w:spacing w:before="40" w:after="0"/>
+              <w:jc w:val="start"/>
+              <w:rPr>
+                <w:rFonts w:ascii="Calibri" w:hAnsi="Calibri" w:eastAsia="Calibri" w:cs="Calibri"/>
+                <w:kern w:val="0"/>
+                <w:sz w:val="22"/>
+                <w:szCs w:val="22"/>
+                <w:lang w:val="en-US" w:eastAsia="zh-CN" w:bidi="hi-IN"/>
+              </w:rPr>
+            </w:pPr>
+            <w:r>
+              <w:rPr>
+                <w:rFonts w:eastAsia="Open Sans" w:cs="Open Sans" w:ascii="Open Sans" w:hAnsi="Open Sans"/>
+                <w:color w:val="070707"/>
+                <w:kern w:val="0"/>
+                <w:sz w:val="20"/>
+                <w:szCs w:val="20"/>
+                <w:lang w:val="en-US" w:eastAsia="zh-CN" w:bidi="hi-IN"/>
+              </w:rPr>
+              <w:t>001</w:t>
+            </w:r>
+          </w:p>
+        </w:tc>
+        <w:tc>
+          <w:tcPr>
+            <w:tcW w:w="885" w:type="dxa"/>
+            <w:tcBorders/>
+            <w:shd w:color="auto" w:fill="FFFFFF" w:val="clear"/>
+            <w:tcMar>
+              <w:start w:w="56" w:type="dxa"/>
+              <w:end w:w="56" w:type="dxa"/>
+            </w:tcMar>
+          </w:tcPr>
+          <w:p>
+            <w:pPr>
+              <w:pStyle w:val="normal1"/>
+              <w:suppressAutoHyphens w:val="true"/>
+              <w:spacing w:before="40" w:after="0"/>
+              <w:jc w:val="start"/>
+              <w:rPr>
+                <w:rFonts w:ascii="Calibri" w:hAnsi="Calibri" w:eastAsia="Calibri" w:cs="Calibri"/>
+                <w:kern w:val="0"/>
+                <w:sz w:val="22"/>
+                <w:szCs w:val="22"/>
+                <w:lang w:val="en-US" w:eastAsia="zh-CN" w:bidi="hi-IN"/>
+              </w:rPr>
+            </w:pPr>
+            <w:r>
+              <w:rPr>
+                <w:rFonts w:eastAsia="Open Sans" w:cs="Open Sans" w:ascii="Open Sans" w:hAnsi="Open Sans"/>
+                <w:color w:val="070707"/>
+                <w:kern w:val="0"/>
+                <w:sz w:val="20"/>
+                <w:szCs w:val="20"/>
+                <w:lang w:val="en-US" w:eastAsia="zh-CN" w:bidi="hi-IN"/>
+              </w:rPr>
+              <w:t>1 Stk</w:t>
+            </w:r>
+          </w:p>
+        </w:tc>
+        <w:tc>
+          <w:tcPr>
+            <w:tcW w:w="4423" w:type="dxa"/>
+            <w:tcBorders/>
+            <w:shd w:color="auto" w:fill="FFFFFF" w:val="clear"/>
+            <w:tcMar>
+              <w:start w:w="56" w:type="dxa"/>
+              <w:end w:w="56" w:type="dxa"/>
+            </w:tcMar>
+          </w:tcPr>
+          <w:p>
+            <w:pPr>
+              <w:pStyle w:val="normal1"/>
+              <w:suppressAutoHyphens w:val="true"/>
+              <w:spacing w:lineRule="auto" w:line="278" w:before="40" w:after="0"/>
+              <w:ind w:end="314"/>
+              <w:jc w:val="start"/>
+              <w:rPr>
+                <w:color w:val="000000"/>
+              </w:rPr>
+            </w:pPr>
+            <w:r>
+              <w:rPr>
+                <w:rFonts w:eastAsia="Arimo" w:cs="Arimo" w:ascii="Arimo" w:hAnsi="Arimo"/>
+                <w:b/>
+                <w:color w:val="000000"/>
+                <w:kern w:val="0"/>
+                <w:sz w:val="20"/>
+                <w:szCs w:val="20"/>
+                <w:lang w:val="en-US" w:eastAsia="zh-CN" w:bidi="hi-IN"/>
+              </w:rPr>
+              <w:t>Auszuführende Arbeiten</w:t>
+            </w:r>
+          </w:p>
+        </w:tc>
+        <w:tc>
+          <w:tcPr>
+            <w:tcW w:w="2327" w:type="dxa"/>
+            <w:tcBorders/>
+            <w:shd w:color="auto" w:fill="FFFFFF" w:val="clear"/>
+            <w:tcMar>
+              <w:start w:w="56" w:type="dxa"/>
+              <w:end w:w="56" w:type="dxa"/>
+            </w:tcMar>
+          </w:tcPr>
+          <w:p>
+            <w:pPr>
+              <w:pStyle w:val="normal1"/>
+              <w:suppressAutoHyphens w:val="true"/>
+              <w:spacing w:lineRule="auto" w:line="278" w:before="40" w:after="0"/>
+              <w:ind w:end="314"/>
+              <w:jc w:val="center"/>
+              <w:rPr>
+                <w:color w:val="000000"/>
+              </w:rPr>
+            </w:pPr>
+            <w:r>
+              <w:rPr>
+                <w:rFonts w:eastAsia="Open Sans" w:cs="Open Sans" w:ascii="Open Sans" w:hAnsi="Open Sans"/>
+                <w:color w:val="000000"/>
+                <w:kern w:val="0"/>
+                <w:sz w:val="20"/>
+                <w:szCs w:val="20"/>
+                <w:lang w:val="en-US" w:eastAsia="zh-CN" w:bidi="hi-IN"/>
+              </w:rPr>
+              <w:t xml:space="preserve">1.065,00 €</w:t>
+            </w:r>
+          </w:p>
+        </w:tc>
+        <w:tc>
+          <w:tcPr>
+            <w:tcW w:w="1485" w:type="dxa"/>
+            <w:tcBorders/>
+            <w:shd w:color="auto" w:fill="FFFFFF" w:val="clear"/>
+            <w:tcMar>
+              <w:start w:w="56" w:type="dxa"/>
+              <w:end w:w="56" w:type="dxa"/>
+            </w:tcMar>
+          </w:tcPr>
+          <w:p>
+            <w:pPr>
+              <w:pStyle w:val="normal1"/>
+              <w:suppressAutoHyphens w:val="true"/>
+              <w:spacing w:lineRule="auto" w:line="278" w:before="40" w:after="0"/>
+              <w:ind w:start="-141" w:end="314"/>
+              <w:jc w:val="center"/>
+              <w:rPr>
+                <w:color w:val="000000"/>
+              </w:rPr>
+            </w:pPr>
+            <w:r>
+              <w:rPr>
+                <w:rFonts w:eastAsia="Open Sans" w:cs="Open Sans" w:ascii="Open Sans" w:hAnsi="Open Sans"/>
+                <w:color w:val="000000"/>
+                <w:kern w:val="0"/>
+                <w:sz w:val="20"/>
+                <w:szCs w:val="20"/>
+                <w:lang w:val="en-US" w:eastAsia="zh-CN" w:bidi="hi-IN"/>
+              </w:rPr>
+              <w:t xml:space="preserve">1.065,00 €</w:t>
+            </w:r>
+          </w:p>
+        </w:tc>
+      </w:tr>
+      <w:tr>
+        <w:trPr>
+          <w:trHeight w:val="1741" w:hRule="atLeast"/>
+        </w:trPr>
+        <w:tc>
+          <w:tcPr>
+            <w:tcW w:w="660" w:type="dxa"/>
             <w:tcBorders>
-              <w:top w:val="single" w:sz="8" w:space="0" w:color="FFFFFF"/>
               <w:start w:val="single" w:sz="8" w:space="0" w:color="FFFFFF"/>
               <w:bottom w:val="single" w:sz="8" w:space="0" w:color="FFFFFF"/>
               <w:end w:val="single" w:sz="8" w:space="0" w:color="FFFFFF"/>
@@ -920,21 +1077,54 @@
           <w:p>
             <w:pPr>
               <w:pStyle w:val="normal1"/>
+              <w:tabs>
+                <w:tab w:val="clear" w:pos="720"/>
+                <w:tab w:val="left" w:pos="750" w:leader="none"/>
+                <w:tab w:val="left" w:pos="1416" w:leader="none"/>
+              </w:tabs>
+              <w:suppressAutoHyphens w:val="true"/>
+              <w:spacing w:before="121" w:after="0"/>
+              <w:jc w:val="start"/>
+              <w:rPr>
+                <w:rFonts w:ascii="Open Sans" w:hAnsi="Open Sans" w:eastAsia="Open Sans" w:cs="Open Sans"/>
+                <w:color w:val="070707"/>
+                <w:sz w:val="20"/>
+                <w:szCs w:val="20"/>
+              </w:rPr>
+            </w:pPr>
+            <w:r>
+              <w:rPr>
+                <w:rFonts w:eastAsia="Open Sans" w:cs="Open Sans" w:ascii="Open Sans" w:hAnsi="Open Sans"/>
+                <w:color w:val="070707"/>
+                <w:kern w:val="0"/>
+                <w:sz w:val="20"/>
+                <w:szCs w:val="20"/>
+                <w:lang w:val="en-US" w:eastAsia="zh-CN" w:bidi="hi-IN"/>
+              </w:rPr>
+            </w:r>
+          </w:p>
+          <w:p>
+            <w:pPr>
+              <w:pStyle w:val="normal1"/>
               <w:suppressAutoHyphens w:val="true"/>
               <w:spacing w:before="0" w:after="0"/>
-              <w:jc w:val="center"/>
-              <w:rPr/>
-            </w:pPr>
-            <w:r>
-              <w:rPr>
-                <w:rFonts w:eastAsia="Calibri" w:cs="Calibri"/>
-                <w:color w:val="070707"/>
+              <w:jc w:val="start"/>
+              <w:rPr>
+                <w:rFonts w:ascii="Calibri" w:hAnsi="Calibri" w:eastAsia="Calibri" w:cs="Calibri"/>
                 <w:kern w:val="0"/>
                 <w:sz w:val="22"/>
                 <w:szCs w:val="22"/>
                 <w:lang w:val="en-US" w:eastAsia="zh-CN" w:bidi="hi-IN"/>
               </w:rPr>
-              <w:t xml:space="preserve">001</w:t>
+            </w:pPr>
+            <w:r>
+              <w:rPr>
+                <w:rFonts w:eastAsia="Calibri" w:cs="Calibri"/>
+                <w:kern w:val="0"/>
+                <w:sz w:val="22"/>
+                <w:szCs w:val="22"/>
+                <w:lang w:val="en-US" w:eastAsia="zh-CN" w:bidi="hi-IN"/>
+              </w:rPr>
             </w:r>
           </w:p>
         </w:tc>
@@ -942,7 +1132,6 @@
           <w:tcPr>
             <w:tcW w:w="885" w:type="dxa"/>
             <w:tcBorders>
-              <w:top w:val="single" w:sz="8" w:space="0" w:color="FFFFFF"/>
               <w:start w:val="single" w:sz="8" w:space="0" w:color="FFFFFF"/>
               <w:bottom w:val="single" w:sz="8" w:space="0" w:color="FFFFFF"/>
               <w:end w:val="single" w:sz="8" w:space="0" w:color="FFFFFF"/>
@@ -958,34 +1147,27 @@
               <w:pStyle w:val="normal1"/>
               <w:suppressAutoHyphens w:val="true"/>
               <w:spacing w:before="0" w:after="0"/>
-              <w:jc w:val="center"/>
-              <w:rPr>
-                <w:rFonts w:ascii="Open Sans" w:hAnsi="Open Sans" w:eastAsia="Open Sans" w:cs="Open Sans"/>
-                <w:color w:val="070707"/>
-                <w:kern w:val="0"/>
-                <w:sz w:val="20"/>
-                <w:szCs w:val="20"/>
-                <w:lang w:val="en-US" w:eastAsia="zh-CN" w:bidi="hi-IN"/>
-              </w:rPr>
-            </w:pPr>
-            <w:r>
-              <w:rPr>
-                <w:rFonts w:eastAsia="Open Sans" w:cs="Open Sans" w:ascii="Open Sans" w:hAnsi="Open Sans"/>
-                <w:color w:val="070707"/>
-                <w:kern w:val="0"/>
-                <w:sz w:val="20"/>
-                <w:szCs w:val="20"/>
-                <w:lang w:val="en-US" w:eastAsia="zh-CN" w:bidi="hi-IN"/>
-              </w:rPr>
-              <w:t xml:space="preserve">1 Stk</w:t>
+              <w:jc w:val="start"/>
+              <w:rPr>
+                <w:color w:val="000000"/>
+              </w:rPr>
+            </w:pPr>
+            <w:r>
+              <w:rPr>
+                <w:rFonts w:eastAsia="Calibri" w:cs="Calibri"/>
+                <w:color w:val="000000"/>
+                <w:kern w:val="0"/>
+                <w:sz w:val="22"/>
+                <w:szCs w:val="22"/>
+                <w:lang w:val="en-US" w:eastAsia="zh-CN" w:bidi="hi-IN"/>
+              </w:rPr>
             </w:r>
           </w:p>
         </w:tc>
         <w:tc>
           <w:tcPr>
-            <w:tcW w:w="4425" w:type="dxa"/>
+            <w:tcW w:w="4423" w:type="dxa"/>
             <w:tcBorders>
-              <w:top w:val="single" w:sz="8" w:space="0" w:color="FFFFFF"/>
               <w:start w:val="single" w:sz="8" w:space="0" w:color="FFFFFF"/>
               <w:bottom w:val="single" w:sz="8" w:space="0" w:color="FFFFFF"/>
               <w:end w:val="single" w:sz="8" w:space="0" w:color="FFFFFF"/>
@@ -998,105 +1180,69 @@
           </w:tcPr>
           <w:p>
             <w:pPr>
-              <w:pStyle w:val="BodyText"/>
+              <w:pStyle w:val="normal1"/>
               <w:suppressAutoHyphens w:val="true"/>
               <w:spacing w:lineRule="auto" w:line="278" w:before="0" w:after="0"/>
               <w:ind w:end="314"/>
               <w:jc w:val="start"/>
               <w:rPr>
                 <w:color w:val="000000"/>
-              </w:rPr>
-            </w:pPr>
-            <w:r>
-              <w:rPr>
-                <w:rFonts w:eastAsia="Arimo" w:cs="Arimo" w:ascii="Arimo" w:hAnsi="Arimo"/>
-                <w:b/>
-                <w:bCs/>
-                <w:color w:val="000000"/>
-                <w:kern w:val="0"/>
-                <w:sz w:val="20"/>
-                <w:szCs w:val="20"/>
-                <w:lang w:val="en-US" w:eastAsia="zh-CN" w:bidi="hi-IN"/>
-              </w:rPr>
-              <w:t xml:space="preserve">Liefern und Montieren einer Badewannentür</w:t>
-            </w:r>
-            <w:r>
-              <w:rPr>
-                <w:rFonts w:eastAsia="Arimo" w:cs="Arimo" w:ascii="Arimo" w:hAnsi="Arimo"/>
-                <w:b/>
-                <w:bCs w:val="false"/>
-                <w:color w:val="000000"/>
-                <w:kern w:val="0"/>
-                <w:sz w:val="20"/>
-                <w:szCs w:val="20"/>
-                <w:lang w:val="en-US" w:eastAsia="zh-CN" w:bidi="hi-IN"/>
-              </w:rPr>
-              <w:br/>
-            </w:r>
-            <w:r>
-              <w:rPr>
-                <w:rFonts w:eastAsia="Arimo" w:cs="Arimo" w:ascii="Arimo" w:hAnsi="Arimo"/>
-                <w:b w:val="false"/>
-                <w:bCs w:val="false"/>
-                <w:color w:val="000000"/>
-                <w:kern w:val="0"/>
-                <w:sz w:val="20"/>
-                <w:szCs w:val="20"/>
-                <w:lang w:val="en-US" w:eastAsia="zh-CN" w:bidi="hi-IN"/>
-              </w:rPr>
-              <w:t xml:space="preserve">• Liefern und Montieren einer Badewannentür (Universal/Standard) Höhe 40 cm, Breite 40,5 cm</w:t>
-              <w:br/>
-              <w:t xml:space="preserve">• inkl. dazugehörige Materialien</w:t>
-              <w:br/>
-              <w:t xml:space="preserve">• inkl. An- &amp; Abfahrten / Dieselzuschlag</w:t>
-              <w:br/>
-              <w:t xml:space="preserve">• inkl. Bereitstellung Maschinen / Werkzeug</w:t>
-              <w:br/>
-              <w:t xml:space="preserve">• inkl. Vorhaltung und Beräumung der Baustelle</w:t>
-              <w:br/>
-              <w:t xml:space="preserve">• inkl. Lieferkosten</w:t>
-            </w:r>
-          </w:p>
-          <w:p>
-            <w:pPr>
-              <w:pStyle w:val="BodyText"/>
+                <w:sz w:val="20"/>
+                <w:szCs w:val="20"/>
+              </w:rPr>
+            </w:pPr>
+            <w:r>
+              <w:rPr>
+                <w:rFonts w:eastAsia="Open Sans" w:cs="Open Sans" w:ascii="Open Sans" w:hAnsi="Open Sans"/>
+                <w:color w:val="000000"/>
+                <w:kern w:val="0"/>
+                <w:sz w:val="20"/>
+                <w:szCs w:val="20"/>
+                <w:lang w:val="en-US" w:eastAsia="zh-CN" w:bidi="hi-IN"/>
+              </w:rPr>
+              <w:t xml:space="preserve">- Anbringen zusätzlicher Haltegriffe</w:t>
+            </w:r>
+          </w:p>
+          <w:p>
+            <w:pPr>
+              <w:pStyle w:val="normal1"/>
               <w:suppressAutoHyphens w:val="true"/>
               <w:spacing w:lineRule="auto" w:line="278" w:before="0" w:after="0"/>
               <w:ind w:end="314"/>
               <w:jc w:val="start"/>
               <w:rPr>
                 <w:color w:val="000000"/>
-              </w:rPr>
-            </w:pPr>
-            <w:r>
-              <w:rPr>
-                <w:rFonts w:eastAsia="Arimo" w:cs="Arimo" w:ascii="Arimo" w:hAnsi="Arimo"/>
-                <w:b/>
-                <w:bCs w:val="false"/>
-                <w:color w:val="000000"/>
-                <w:kern w:val="0"/>
-                <w:sz w:val="20"/>
-                <w:szCs w:val="20"/>
-                <w:lang w:val="en-US" w:eastAsia="zh-CN" w:bidi="hi-IN"/>
-              </w:rPr>
-            </w:r>
-          </w:p>
-          <w:p>
-            <w:pPr>
-              <w:pStyle w:val="BodyText"/>
+                <w:sz w:val="20"/>
+                <w:szCs w:val="20"/>
+              </w:rPr>
+            </w:pPr>
+            <w:r>
+              <w:rPr>
+                <w:rFonts w:eastAsia="Calibri" w:cs="Calibri"/>
+                <w:color w:val="000000"/>
+                <w:kern w:val="0"/>
+                <w:sz w:val="20"/>
+                <w:szCs w:val="20"/>
+                <w:lang w:val="en-US" w:eastAsia="zh-CN" w:bidi="hi-IN"/>
+              </w:rPr>
+            </w:r>
+          </w:p>
+          <w:p>
+            <w:pPr>
+              <w:pStyle w:val="normal1"/>
               <w:suppressAutoHyphens w:val="true"/>
               <w:spacing w:lineRule="auto" w:line="278" w:before="0" w:after="0"/>
               <w:ind w:end="314"/>
               <w:jc w:val="start"/>
               <w:rPr>
                 <w:color w:val="000000"/>
-              </w:rPr>
-            </w:pPr>
-            <w:r>
-              <w:rPr>
-                <w:rFonts w:eastAsia="Arimo" w:cs="Arimo" w:ascii="Arimo" w:hAnsi="Arimo"/>
-                <w:b/>
-                <w:bCs w:val="false"/>
+                <w:sz w:val="20"/>
+                <w:szCs w:val="20"/>
+              </w:rPr>
+            </w:pPr>
+            <w:r>
+              <w:rPr>
+                <w:rFonts w:eastAsia="Open Sans" w:cs="Open Sans" w:ascii="Open Sans" w:hAnsi="Open Sans"/>
                 <w:color w:val="000000"/>
                 <w:kern w:val="0"/>
                 <w:sz w:val="20"/>
@@ -1108,193 +1254,84 @@
           </w:p>
           <w:p>
             <w:pPr>
-              <w:pStyle w:val="BodyText"/>
+              <w:pStyle w:val="normal1"/>
               <w:suppressAutoHyphens w:val="true"/>
               <w:spacing w:lineRule="auto" w:line="278" w:before="0" w:after="0"/>
               <w:ind w:end="314"/>
               <w:jc w:val="start"/>
               <w:rPr>
-                <w:rFonts w:ascii="Arimo" w:hAnsi="Arimo" w:eastAsia="Arimo" w:cs="Arimo"/>
-                <w:b w:val="false"/>
-                <w:bCs w:val="false"/>
-                <w:color w:val="000000"/>
-                <w:kern w:val="0"/>
-                <w:sz w:val="20"/>
-                <w:szCs w:val="20"/>
-                <w:lang w:val="en-US" w:eastAsia="zh-CN" w:bidi="hi-IN"/>
-              </w:rPr>
-            </w:pPr>
-            <w:r>
-              <w:rPr>
-                <w:rFonts w:eastAsia="Arimo" w:cs="Arimo" w:ascii="Arimo" w:hAnsi="Arimo"/>
-                <w:b w:val="false"/>
-                <w:bCs w:val="false"/>
-                <w:color w:val="000000"/>
-                <w:kern w:val="0"/>
-                <w:sz w:val="20"/>
-                <w:szCs w:val="20"/>
-                <w:lang w:val="en-US" w:eastAsia="zh-CN" w:bidi="hi-IN"/>
-              </w:rPr>
-              <w:t xml:space="preserve">- 20,00 km Kilometerpauschale</w:t>
-            </w:r>
-          </w:p>
-          <w:p>
-            <w:pPr>
-              <w:pStyle w:val="BodyText"/>
+                <w:color w:val="000000"/>
+                <w:sz w:val="20"/>
+                <w:szCs w:val="20"/>
+              </w:rPr>
+            </w:pPr>
+            <w:r>
+              <w:rPr>
+                <w:rFonts w:eastAsia="Open Sans" w:cs="Open Sans" w:ascii="Open Sans" w:hAnsi="Open Sans"/>
+                <w:color w:val="000000"/>
+                <w:kern w:val="0"/>
+                <w:sz w:val="20"/>
+                <w:szCs w:val="20"/>
+                <w:lang w:val="en-US" w:eastAsia="zh-CN" w:bidi="hi-IN"/>
+              </w:rPr>
+              <w:t xml:space="preserve">- 1,00 Stk Fahrzeugbereitstellung</w:t>
+            </w:r>
+          </w:p>
+          <w:p>
+            <w:pPr>
+              <w:pStyle w:val="normal1"/>
               <w:suppressAutoHyphens w:val="true"/>
               <w:spacing w:lineRule="auto" w:line="278" w:before="0" w:after="0"/>
               <w:ind w:end="314"/>
               <w:jc w:val="start"/>
-              <w:rPr/>
-            </w:pPr>
-            <w:r>
-              <w:rPr>
-                <w:rFonts w:eastAsia="Arimo" w:cs="Arimo" w:ascii="Arimo" w:hAnsi="Arimo"/>
-                <w:b w:val="false"/>
-                <w:bCs w:val="false"/>
-                <w:color w:val="000000"/>
-                <w:kern w:val="0"/>
-                <w:sz w:val="20"/>
-                <w:szCs w:val="20"/>
-                <w:lang w:val="en-US" w:eastAsia="zh-CN" w:bidi="hi-IN"/>
-              </w:rPr>
-              <w:t xml:space="preserve">- </w:t>
-            </w:r>
-            <w:r>
-              <w:rPr/>
-              <w:t xml:space="preserve">1,00</w:t>
-            </w:r>
-            <w:r>
-              <w:rPr>
-                <w:rFonts w:eastAsia="Arimo" w:cs="Arimo" w:ascii="Arimo" w:hAnsi="Arimo"/>
-                <w:b w:val="false"/>
-                <w:bCs w:val="false"/>
-                <w:color w:val="000000"/>
-                <w:kern w:val="0"/>
-                <w:sz w:val="20"/>
-                <w:szCs w:val="20"/>
-                <w:lang w:val="en-US" w:eastAsia="zh-CN" w:bidi="hi-IN"/>
-              </w:rPr>
-              <w:t xml:space="preserve"> Stk Lieferkosten Badewannentür</w:t>
-            </w:r>
-          </w:p>
-          <w:p>
-            <w:pPr>
-              <w:pStyle w:val="BodyText"/>
+              <w:rPr>
+                <w:color w:val="000000"/>
+                <w:sz w:val="20"/>
+                <w:szCs w:val="20"/>
+              </w:rPr>
+            </w:pPr>
+            <w:r>
+              <w:rPr>
+                <w:rFonts w:eastAsia="Open Sans" w:cs="Open Sans" w:ascii="Open Sans" w:hAnsi="Open Sans"/>
+                <w:color w:val="000000"/>
+                <w:kern w:val="0"/>
+                <w:sz w:val="20"/>
+                <w:szCs w:val="20"/>
+                <w:lang w:val="en-US" w:eastAsia="zh-CN" w:bidi="hi-IN"/>
+              </w:rPr>
+              <w:t xml:space="preserve">- 1,00 Stk Bereitstellung und Vorhaltung von Maschinen &amp; Werkzeugen</w:t>
+            </w:r>
+          </w:p>
+          <w:p>
+            <w:pPr>
+              <w:pStyle w:val="normal1"/>
               <w:suppressAutoHyphens w:val="true"/>
               <w:spacing w:lineRule="auto" w:line="278" w:before="0" w:after="0"/>
               <w:ind w:end="314"/>
               <w:jc w:val="start"/>
-              <w:rPr/>
-            </w:pPr>
-            <w:r>
-              <w:rPr>
-                <w:rFonts w:eastAsia="Arimo" w:cs="Arimo" w:ascii="Arimo" w:hAnsi="Arimo"/>
-                <w:b w:val="false"/>
-                <w:bCs w:val="false"/>
-                <w:color w:val="000000"/>
-                <w:kern w:val="0"/>
-                <w:sz w:val="20"/>
-                <w:szCs w:val="20"/>
-                <w:lang w:val="en-US" w:eastAsia="zh-CN" w:bidi="hi-IN"/>
-              </w:rPr>
-              <w:t xml:space="preserve">- </w:t>
-            </w:r>
-            <w:r>
-              <w:rPr/>
-              <w:t xml:space="preserve">1,00</w:t>
-            </w:r>
-            <w:r>
-              <w:rPr>
-                <w:rFonts w:eastAsia="Arimo" w:cs="Arimo" w:ascii="Arimo" w:hAnsi="Arimo"/>
-                <w:b w:val="false"/>
-                <w:bCs w:val="false"/>
-                <w:color w:val="000000"/>
-                <w:kern w:val="0"/>
-                <w:sz w:val="20"/>
-                <w:szCs w:val="20"/>
-                <w:lang w:val="en-US" w:eastAsia="zh-CN" w:bidi="hi-IN"/>
-              </w:rPr>
-              <w:t xml:space="preserve"> Stk Universal / Standard Tür</w:t>
-            </w:r>
-          </w:p>
-          <w:p>
-            <w:pPr>
-              <w:pStyle w:val="BodyText"/>
-              <w:suppressAutoHyphens w:val="true"/>
-              <w:spacing w:lineRule="auto" w:line="278" w:before="0" w:after="0"/>
-              <w:ind w:end="314"/>
-              <w:jc w:val="start"/>
-              <w:rPr/>
-            </w:pPr>
-            <w:r>
-              <w:rPr>
-                <w:rFonts w:eastAsia="Arimo" w:cs="Arimo" w:ascii="Arimo" w:hAnsi="Arimo"/>
-                <w:b w:val="false"/>
-                <w:bCs w:val="false"/>
-                <w:color w:val="000000"/>
-                <w:kern w:val="0"/>
-                <w:sz w:val="20"/>
-                <w:szCs w:val="20"/>
-                <w:lang w:val="en-US" w:eastAsia="zh-CN" w:bidi="hi-IN"/>
-              </w:rPr>
-              <w:t xml:space="preserve">- </w:t>
-            </w:r>
-            <w:r>
-              <w:rPr/>
-              <w:t xml:space="preserve">1,00</w:t>
-            </w:r>
-            <w:r>
-              <w:rPr>
-                <w:rFonts w:eastAsia="Arimo" w:cs="Arimo" w:ascii="Arimo" w:hAnsi="Arimo"/>
-                <w:b w:val="false"/>
-                <w:bCs w:val="false"/>
-                <w:color w:val="000000"/>
-                <w:kern w:val="0"/>
-                <w:sz w:val="20"/>
-                <w:szCs w:val="20"/>
-                <w:lang w:val="en-US" w:eastAsia="zh-CN" w:bidi="hi-IN"/>
-              </w:rPr>
-              <w:t xml:space="preserve"> Stk Kleinmaterial</w:t>
-            </w:r>
-          </w:p>
-          <w:p>
-            <w:pPr>
-              <w:pStyle w:val="BodyText"/>
-              <w:suppressAutoHyphens w:val="true"/>
-              <w:spacing w:lineRule="auto" w:line="278" w:before="0" w:after="0"/>
-              <w:ind w:end="314"/>
-              <w:jc w:val="start"/>
-              <w:rPr>
-                <w:rFonts w:ascii="Arimo" w:hAnsi="Arimo" w:eastAsia="Arimo" w:cs="Arimo"/>
-                <w:b w:val="false"/>
-                <w:bCs w:val="false"/>
-                <w:color w:val="000000"/>
-                <w:kern w:val="0"/>
-                <w:sz w:val="20"/>
-                <w:szCs w:val="20"/>
-                <w:lang w:val="en-US" w:eastAsia="zh-CN" w:bidi="hi-IN"/>
-              </w:rPr>
-            </w:pPr>
-            <w:r>
-              <w:rPr>
-                <w:rFonts w:eastAsia="Arimo" w:cs="Arimo" w:ascii="Arimo" w:hAnsi="Arimo"/>
-                <w:b w:val="false"/>
-                <w:bCs w:val="false"/>
-                <w:color w:val="000000"/>
-                <w:kern w:val="0"/>
-                <w:sz w:val="20"/>
-                <w:szCs w:val="20"/>
-                <w:lang w:val="en-US" w:eastAsia="zh-CN" w:bidi="hi-IN"/>
-              </w:rPr>
+              <w:rPr>
+                <w:color w:val="000000"/>
+                <w:sz w:val="20"/>
+                <w:szCs w:val="20"/>
+              </w:rPr>
+            </w:pPr>
+            <w:r>
+              <w:rPr>
+                <w:rFonts w:eastAsia="Open Sans" w:cs="Open Sans" w:ascii="Open Sans" w:hAnsi="Open Sans"/>
+                <w:color w:val="000000"/>
+                <w:kern w:val="0"/>
+                <w:sz w:val="20"/>
+                <w:szCs w:val="20"/>
+                <w:lang w:val="en-US" w:eastAsia="zh-CN" w:bidi="hi-IN"/>
+              </w:rPr>
+              <w:t xml:space="preserve">- 1,00 Stk Beräumung der Baustelle</w:t>
             </w:r>
           </w:p>
         </w:tc>
         <w:tc>
           <w:tcPr>
-            <w:tcW w:w="2325" w:type="dxa"/>
+            <w:tcW w:w="2327" w:type="dxa"/>
             <w:tcBorders>
-              <w:top w:val="single" w:sz="8" w:space="0" w:color="FFFFFF"/>
               <w:start w:val="single" w:sz="8" w:space="0" w:color="FFFFFF"/>
               <w:bottom w:val="single" w:sz="8" w:space="0" w:color="FFFFFF"/>
               <w:end w:val="single" w:sz="8" w:space="0" w:color="FFFFFF"/>
@@ -1311,29 +1348,27 @@
               <w:suppressAutoHyphens w:val="true"/>
               <w:spacing w:lineRule="auto" w:line="278" w:before="0" w:after="0"/>
               <w:ind w:end="314"/>
-              <w:jc w:val="center"/>
-              <w:rPr>
-                <w:color w:val="000000"/>
-              </w:rPr>
-            </w:pPr>
-            <w:r>
-              <w:rPr>
-                <w:rFonts w:eastAsia="Open Sans" w:cs="Open Sans" w:ascii="Open Sans" w:hAnsi="Open Sans"/>
-                <w:color w:val="000000"/>
-                <w:kern w:val="0"/>
-                <w:sz w:val="20"/>
-                <w:szCs w:val="20"/>
-                <w:lang w:val="en-US" w:eastAsia="zh-CN" w:bidi="hi-IN"/>
-              </w:rPr>
-              <w:t xml:space="preserve">2.980,67 €</w:t>
+              <w:jc w:val="end"/>
+              <w:rPr>
+                <w:color w:val="000000"/>
+              </w:rPr>
+            </w:pPr>
+            <w:r>
+              <w:rPr>
+                <w:rFonts w:eastAsia="Calibri" w:cs="Calibri"/>
+                <w:color w:val="000000"/>
+                <w:kern w:val="0"/>
+                <w:sz w:val="22"/>
+                <w:szCs w:val="22"/>
+                <w:lang w:val="en-US" w:eastAsia="zh-CN" w:bidi="hi-IN"/>
+              </w:rPr>
             </w:r>
           </w:p>
         </w:tc>
         <w:tc>
           <w:tcPr>
-            <w:tcW w:w="1481" w:type="dxa"/>
+            <w:tcW w:w="1485" w:type="dxa"/>
             <w:tcBorders>
-              <w:top w:val="single" w:sz="8" w:space="0" w:color="FFFFFF"/>
               <w:start w:val="single" w:sz="8" w:space="0" w:color="FFFFFF"/>
               <w:bottom w:val="single" w:sz="8" w:space="0" w:color="FFFFFF"/>
               <w:end w:val="single" w:sz="8" w:space="0" w:color="FFFFFF"/>
@@ -1343,28 +1378,28 @@
               <w:start w:w="56" w:type="dxa"/>
               <w:end w:w="56" w:type="dxa"/>
             </w:tcMar>
+            <w:vAlign w:val="center"/>
           </w:tcPr>
           <w:p>
             <w:pPr>
               <w:pStyle w:val="normal1"/>
               <w:suppressAutoHyphens w:val="true"/>
               <w:spacing w:lineRule="auto" w:line="278" w:before="0" w:after="0"/>
-              <w:ind w:start="-141" w:end="314"/>
-              <w:jc w:val="center"/>
-              <w:rPr>
-                <w:color w:val="000000"/>
-              </w:rPr>
-            </w:pPr>
-            <w:r>
-              <w:rPr>
-                <w:rFonts w:eastAsia="Open Sans" w:cs="Open Sans" w:ascii="Open Sans" w:hAnsi="Open Sans"/>
-                <w:color w:val="000000"/>
-                <w:kern w:val="0"/>
-                <w:sz w:val="20"/>
-                <w:szCs w:val="20"/>
-                <w:lang w:val="en-US" w:eastAsia="zh-CN" w:bidi="hi-IN"/>
-              </w:rPr>
-              <w:t xml:space="preserve">2.980,67 €</w:t>
+              <w:ind w:end="314"/>
+              <w:jc w:val="start"/>
+              <w:rPr>
+                <w:color w:val="000000"/>
+              </w:rPr>
+            </w:pPr>
+            <w:r>
+              <w:rPr>
+                <w:rFonts w:eastAsia="Calibri" w:cs="Calibri"/>
+                <w:color w:val="000000"/>
+                <w:kern w:val="0"/>
+                <w:sz w:val="22"/>
+                <w:szCs w:val="22"/>
+                <w:lang w:val="en-US" w:eastAsia="zh-CN" w:bidi="hi-IN"/>
+              </w:rPr>
             </w:r>
           </w:p>
         </w:tc>
@@ -1395,6 +1430,789 @@
         </w:rPr>
       </w:r>
     </w:p>
+    <w:tbl>
+      <w:tblPr>
+        <w:tblStyle w:val="TableNormal"/>
+        <w:tblW w:w="10050" w:type="dxa"/>
+        <w:jc w:val="start"/>
+        <w:tblInd w:w="1" w:type="dxa"/>
+        <w:tblLayout w:type="fixed"/>
+        <w:tblCellMar>
+          <w:top w:w="0" w:type="dxa"/>
+          <w:start w:w="56" w:type="dxa"/>
+          <w:bottom w:w="0" w:type="dxa"/>
+          <w:end w:w="56" w:type="dxa"/>
+        </w:tblCellMar>
+        <w:tblLook w:firstRow="0" w:noVBand="0" w:lastRow="0" w:firstColumn="0" w:lastColumn="0" w:noHBand="0" w:val="0000"/>
+      </w:tblPr>
+      <w:tblGrid>
+        <w:gridCol w:w="675"/>
+        <w:gridCol w:w="883"/>
+        <w:gridCol w:w="4410"/>
+        <w:gridCol w:w="2327"/>
+        <w:gridCol w:w="1755"/>
+      </w:tblGrid>
+      <w:tr>
+        <w:trPr>
+          <w:trHeight w:val="379" w:hRule="atLeast"/>
+        </w:trPr>
+        <w:tc>
+          <w:tcPr>
+            <w:tcW w:w="675" w:type="dxa"/>
+            <w:tcBorders/>
+            <w:shd w:color="auto" w:fill="FFFFFF" w:val="clear"/>
+          </w:tcPr>
+          <w:p>
+            <w:pPr>
+              <w:pStyle w:val="normal1"/>
+              <w:suppressAutoHyphens w:val="true"/>
+              <w:spacing w:before="0" w:after="0"/>
+              <w:jc w:val="start"/>
+              <w:rPr>
+                <w:rFonts w:ascii="Calibri" w:hAnsi="Calibri" w:eastAsia="Calibri" w:cs="Calibri"/>
+                <w:kern w:val="0"/>
+                <w:sz w:val="22"/>
+                <w:szCs w:val="22"/>
+                <w:lang w:val="en-US" w:eastAsia="zh-CN" w:bidi="hi-IN"/>
+              </w:rPr>
+            </w:pPr>
+            <w:r>
+              <w:rPr>
+                <w:rFonts w:eastAsia="Open Sans" w:cs="Open Sans" w:ascii="Open Sans" w:hAnsi="Open Sans"/>
+                <w:color w:val="070707"/>
+                <w:kern w:val="0"/>
+                <w:sz w:val="20"/>
+                <w:szCs w:val="20"/>
+                <w:lang w:val="en-US" w:eastAsia="zh-CN" w:bidi="hi-IN"/>
+              </w:rPr>
+              <w:t>002</w:t>
+            </w:r>
+          </w:p>
+        </w:tc>
+        <w:tc>
+          <w:tcPr>
+            <w:tcW w:w="883" w:type="dxa"/>
+            <w:tcBorders/>
+            <w:shd w:color="auto" w:fill="FFFFFF" w:val="clear"/>
+          </w:tcPr>
+          <w:p>
+            <w:pPr>
+              <w:pStyle w:val="normal1"/>
+              <w:suppressAutoHyphens w:val="true"/>
+              <w:spacing w:before="0" w:after="0"/>
+              <w:jc w:val="start"/>
+              <w:rPr>
+                <w:rFonts w:ascii="Calibri" w:hAnsi="Calibri" w:eastAsia="Calibri" w:cs="Calibri"/>
+                <w:kern w:val="0"/>
+                <w:sz w:val="22"/>
+                <w:szCs w:val="22"/>
+                <w:lang w:val="en-US" w:eastAsia="zh-CN" w:bidi="hi-IN"/>
+              </w:rPr>
+            </w:pPr>
+            <w:r>
+              <w:rPr>
+                <w:rFonts w:eastAsia="Open Sans" w:cs="Open Sans" w:ascii="Open Sans" w:hAnsi="Open Sans"/>
+                <w:color w:val="070707"/>
+                <w:kern w:val="0"/>
+                <w:sz w:val="20"/>
+                <w:szCs w:val="20"/>
+                <w:lang w:val="en-US" w:eastAsia="zh-CN" w:bidi="hi-IN"/>
+              </w:rPr>
+              <w:t>1 Stk</w:t>
+            </w:r>
+          </w:p>
+        </w:tc>
+        <w:tc>
+          <w:tcPr>
+            <w:tcW w:w="4410" w:type="dxa"/>
+            <w:tcBorders/>
+            <w:shd w:color="auto" w:fill="FFFFFF" w:val="clear"/>
+          </w:tcPr>
+          <w:p>
+            <w:pPr>
+              <w:pStyle w:val="normal1"/>
+              <w:suppressAutoHyphens w:val="true"/>
+              <w:spacing w:lineRule="auto" w:line="278" w:before="0" w:after="0"/>
+              <w:ind w:end="314"/>
+              <w:jc w:val="start"/>
+              <w:rPr>
+                <w:color w:val="000000"/>
+              </w:rPr>
+            </w:pPr>
+            <w:r>
+              <w:rPr>
+                <w:rFonts w:eastAsia="Arimo" w:cs="Arimo" w:ascii="Arimo" w:hAnsi="Arimo"/>
+                <w:b/>
+                <w:color w:val="000000"/>
+                <w:kern w:val="0"/>
+                <w:sz w:val="20"/>
+                <w:szCs w:val="20"/>
+                <w:lang w:val="en-US" w:eastAsia="zh-CN" w:bidi="hi-IN"/>
+              </w:rPr>
+              <w:t>Material für Badumbau</w:t>
+            </w:r>
+          </w:p>
+        </w:tc>
+        <w:tc>
+          <w:tcPr>
+            <w:tcW w:w="2327" w:type="dxa"/>
+            <w:tcBorders/>
+            <w:shd w:color="auto" w:fill="FFFFFF" w:val="clear"/>
+          </w:tcPr>
+          <w:p>
+            <w:pPr>
+              <w:pStyle w:val="normal1"/>
+              <w:suppressAutoHyphens w:val="true"/>
+              <w:spacing w:lineRule="auto" w:line="278" w:before="0" w:after="0"/>
+              <w:ind w:end="314"/>
+              <w:jc w:val="center"/>
+              <w:rPr>
+                <w:color w:val="000000"/>
+              </w:rPr>
+            </w:pPr>
+            <w:r>
+              <w:rPr>
+                <w:rFonts w:eastAsia="Open Sans" w:cs="Open Sans" w:ascii="Open Sans" w:hAnsi="Open Sans"/>
+                <w:color w:val="000000"/>
+                <w:kern w:val="0"/>
+                <w:sz w:val="20"/>
+                <w:szCs w:val="20"/>
+                <w:lang w:val="en-US" w:eastAsia="zh-CN" w:bidi="hi-IN"/>
+              </w:rPr>
+              <w:t xml:space="preserve">1.937,03 €</w:t>
+            </w:r>
+          </w:p>
+        </w:tc>
+        <w:tc>
+          <w:tcPr>
+            <w:tcW w:w="1755" w:type="dxa"/>
+            <w:tcBorders/>
+            <w:shd w:color="auto" w:fill="FFFFFF" w:val="clear"/>
+            <w:tcMar>
+              <w:start w:w="0" w:type="dxa"/>
+              <w:end w:w="0" w:type="dxa"/>
+            </w:tcMar>
+          </w:tcPr>
+          <w:p>
+            <w:pPr>
+              <w:pStyle w:val="normal1"/>
+              <w:suppressAutoHyphens w:val="true"/>
+              <w:spacing w:before="0" w:after="0"/>
+              <w:jc w:val="center"/>
+              <w:rPr>
+                <w:rFonts w:ascii="Calibri" w:hAnsi="Calibri" w:eastAsia="Calibri" w:cs="Calibri"/>
+                <w:kern w:val="0"/>
+                <w:sz w:val="22"/>
+                <w:szCs w:val="22"/>
+                <w:lang w:val="en-US" w:eastAsia="zh-CN" w:bidi="hi-IN"/>
+              </w:rPr>
+            </w:pPr>
+            <w:r>
+              <w:rPr>
+                <w:rFonts w:eastAsia="Calibri" w:cs="Calibri"/>
+                <w:kern w:val="0"/>
+                <w:sz w:val="22"/>
+                <w:szCs w:val="22"/>
+                <w:lang w:val="en-US" w:eastAsia="zh-CN" w:bidi="hi-IN"/>
+              </w:rPr>
+              <w:t xml:space="preserve">1.937,03 €</w:t>
+            </w:r>
+          </w:p>
+        </w:tc>
+      </w:tr>
+      <w:tr>
+        <w:trPr>
+          <w:trHeight w:val="1" w:hRule="atLeast"/>
+        </w:trPr>
+        <w:tc>
+          <w:tcPr>
+            <w:tcW w:w="675" w:type="dxa"/>
+            <w:tcBorders/>
+            <w:shd w:color="auto" w:fill="FFFFFF" w:val="clear"/>
+          </w:tcPr>
+          <w:p>
+            <w:pPr>
+              <w:pStyle w:val="normal1"/>
+              <w:suppressAutoHyphens w:val="true"/>
+              <w:spacing w:before="0" w:after="0"/>
+              <w:jc w:val="start"/>
+              <w:rPr>
+                <w:color w:val="000000"/>
+              </w:rPr>
+            </w:pPr>
+            <w:r>
+              <w:rPr>
+                <w:rFonts w:eastAsia="Calibri" w:cs="Calibri"/>
+                <w:color w:val="000000"/>
+                <w:kern w:val="0"/>
+                <w:sz w:val="22"/>
+                <w:szCs w:val="22"/>
+                <w:lang w:val="en-US" w:eastAsia="zh-CN" w:bidi="hi-IN"/>
+              </w:rPr>
+            </w:r>
+          </w:p>
+        </w:tc>
+        <w:tc>
+          <w:tcPr>
+            <w:tcW w:w="883" w:type="dxa"/>
+            <w:tcBorders/>
+            <w:shd w:color="auto" w:fill="FFFFFF" w:val="clear"/>
+          </w:tcPr>
+          <w:p>
+            <w:pPr>
+              <w:pStyle w:val="normal1"/>
+              <w:suppressAutoHyphens w:val="true"/>
+              <w:spacing w:before="0" w:after="0"/>
+              <w:jc w:val="start"/>
+              <w:rPr>
+                <w:color w:val="000000"/>
+              </w:rPr>
+            </w:pPr>
+            <w:r>
+              <w:rPr>
+                <w:rFonts w:eastAsia="Calibri" w:cs="Calibri"/>
+                <w:color w:val="000000"/>
+                <w:kern w:val="0"/>
+                <w:sz w:val="22"/>
+                <w:szCs w:val="22"/>
+                <w:lang w:val="en-US" w:eastAsia="zh-CN" w:bidi="hi-IN"/>
+              </w:rPr>
+            </w:r>
+          </w:p>
+        </w:tc>
+        <w:tc>
+          <w:tcPr>
+            <w:tcW w:w="4410" w:type="dxa"/>
+            <w:tcBorders/>
+            <w:shd w:color="auto" w:fill="FFFFFF" w:val="clear"/>
+          </w:tcPr>
+          <w:p>
+            <w:pPr>
+              <w:pStyle w:val="normal1"/>
+              <w:suppressAutoHyphens w:val="true"/>
+              <w:spacing w:lineRule="auto" w:line="278" w:before="0" w:after="0"/>
+              <w:ind w:end="314"/>
+              <w:jc w:val="start"/>
+              <w:rPr>
+                <w:rFonts w:ascii="Open Sans" w:hAnsi="Open Sans" w:eastAsia="Open Sans" w:cs="Open Sans"/>
+                <w:color w:val="000000"/>
+                <w:sz w:val="20"/>
+                <w:szCs w:val="20"/>
+              </w:rPr>
+            </w:pPr>
+            <w:r>
+              <w:rPr>
+                <w:rFonts w:eastAsia="Open Sans" w:cs="Open Sans" w:ascii="Open Sans" w:hAnsi="Open Sans"/>
+                <w:color w:val="000000"/>
+                <w:kern w:val="0"/>
+                <w:sz w:val="20"/>
+                <w:szCs w:val="20"/>
+                <w:lang w:val="en-US" w:eastAsia="zh-CN" w:bidi="hi-IN"/>
+              </w:rPr>
+              <w:t xml:space="preserve">- 1 Stk TRINNITY Wannenabdichtband-Set 3,4 m Nass-/Trockenanbindung entspr. DIN 18534</w:t>
+            </w:r>
+          </w:p>
+          <w:p>
+            <w:pPr>
+              <w:pStyle w:val="normal1"/>
+              <w:suppressAutoHyphens w:val="true"/>
+              <w:spacing w:lineRule="auto" w:line="278" w:before="0" w:after="0"/>
+              <w:ind w:end="314"/>
+              <w:jc w:val="start"/>
+              <w:rPr>
+                <w:rFonts w:ascii="Open Sans" w:hAnsi="Open Sans" w:eastAsia="Open Sans" w:cs="Open Sans"/>
+                <w:color w:val="000000"/>
+                <w:sz w:val="20"/>
+                <w:szCs w:val="20"/>
+              </w:rPr>
+            </w:pPr>
+            <w:r>
+              <w:rPr>
+                <w:rFonts w:eastAsia="Open Sans" w:cs="Open Sans" w:ascii="Open Sans" w:hAnsi="Open Sans"/>
+                <w:color w:val="000000"/>
+                <w:kern w:val="0"/>
+                <w:sz w:val="20"/>
+                <w:szCs w:val="20"/>
+                <w:lang w:val="en-US" w:eastAsia="zh-CN" w:bidi="hi-IN"/>
+              </w:rPr>
+              <w:t xml:space="preserve">- 1 Stk Ablaufgarnitur Rohbauset m.Sifon BH60mm f.flache Duschw.m.90mm Ablauf TRINNITY</w:t>
+            </w:r>
+          </w:p>
+          <w:p>
+            <w:pPr>
+              <w:pStyle w:val="normal1"/>
+              <w:suppressAutoHyphens w:val="true"/>
+              <w:spacing w:lineRule="auto" w:line="278" w:before="0" w:after="0"/>
+              <w:ind w:end="314"/>
+              <w:jc w:val="start"/>
+              <w:rPr>
+                <w:rFonts w:ascii="Open Sans" w:hAnsi="Open Sans" w:eastAsia="Open Sans" w:cs="Open Sans"/>
+                <w:color w:val="000000"/>
+                <w:sz w:val="20"/>
+                <w:szCs w:val="20"/>
+              </w:rPr>
+            </w:pPr>
+            <w:r>
+              <w:rPr>
+                <w:rFonts w:eastAsia="Open Sans" w:cs="Open Sans" w:ascii="Open Sans" w:hAnsi="Open Sans"/>
+                <w:color w:val="000000"/>
+                <w:kern w:val="0"/>
+                <w:sz w:val="20"/>
+                <w:szCs w:val="20"/>
+                <w:lang w:val="en-US" w:eastAsia="zh-CN" w:bidi="hi-IN"/>
+              </w:rPr>
+              <w:t xml:space="preserve">- 1 Stk Kleinmaterial</w:t>
+            </w:r>
+          </w:p>
+          <w:p>
+            <w:pPr>
+              <w:pStyle w:val="normal1"/>
+              <w:suppressAutoHyphens w:val="true"/>
+              <w:spacing w:lineRule="auto" w:line="278" w:before="0" w:after="0"/>
+              <w:ind w:end="314"/>
+              <w:jc w:val="start"/>
+              <w:rPr>
+                <w:rFonts w:ascii="Open Sans" w:hAnsi="Open Sans" w:eastAsia="Open Sans" w:cs="Open Sans"/>
+                <w:color w:val="000000"/>
+                <w:sz w:val="20"/>
+                <w:szCs w:val="20"/>
+              </w:rPr>
+            </w:pPr>
+            <w:r>
+              <w:rPr>
+                <w:rFonts w:eastAsia="Open Sans" w:cs="Open Sans" w:ascii="Open Sans" w:hAnsi="Open Sans"/>
+                <w:color w:val="000000"/>
+                <w:kern w:val="0"/>
+                <w:sz w:val="20"/>
+                <w:szCs w:val="20"/>
+                <w:lang w:val="en-US" w:eastAsia="zh-CN" w:bidi="hi-IN"/>
+              </w:rPr>
+              <w:t xml:space="preserve">- 1 Stk Stelzlager höhenverstellar Set</w:t>
+            </w:r>
+          </w:p>
+          <w:p>
+            <w:pPr>
+              <w:pStyle w:val="normal1"/>
+              <w:suppressAutoHyphens w:val="true"/>
+              <w:spacing w:lineRule="auto" w:line="278" w:before="0" w:after="0"/>
+              <w:ind w:end="314"/>
+              <w:jc w:val="start"/>
+              <w:rPr>
+                <w:rFonts w:ascii="Open Sans" w:hAnsi="Open Sans" w:eastAsia="Open Sans" w:cs="Open Sans"/>
+                <w:color w:val="000000"/>
+                <w:sz w:val="20"/>
+                <w:szCs w:val="20"/>
+              </w:rPr>
+            </w:pPr>
+            <w:r>
+              <w:rPr>
+                <w:rFonts w:eastAsia="Open Sans" w:cs="Open Sans" w:ascii="Open Sans" w:hAnsi="Open Sans"/>
+                <w:color w:val="000000"/>
+                <w:kern w:val="0"/>
+                <w:sz w:val="20"/>
+                <w:szCs w:val="20"/>
+                <w:lang w:val="en-US" w:eastAsia="zh-CN" w:bidi="hi-IN"/>
+              </w:rPr>
+              <w:t xml:space="preserve">- 3 Stk Wandverkleidung 3.0 Alu 1497×2550 mm — Farbe: Marmor weiß</w:t>
+            </w:r>
+          </w:p>
+          <w:p>
+            <w:pPr>
+              <w:pStyle w:val="normal1"/>
+              <w:suppressAutoHyphens w:val="true"/>
+              <w:spacing w:lineRule="auto" w:line="278" w:before="0" w:after="0"/>
+              <w:ind w:end="314"/>
+              <w:jc w:val="start"/>
+              <w:rPr>
+                <w:rFonts w:ascii="Open Sans" w:hAnsi="Open Sans" w:eastAsia="Open Sans" w:cs="Open Sans"/>
+                <w:color w:val="000000"/>
+                <w:sz w:val="20"/>
+                <w:szCs w:val="20"/>
+              </w:rPr>
+            </w:pPr>
+            <w:r>
+              <w:rPr>
+                <w:rFonts w:eastAsia="Open Sans" w:cs="Open Sans" w:ascii="Open Sans" w:hAnsi="Open Sans"/>
+                <w:color w:val="000000"/>
+                <w:kern w:val="0"/>
+                <w:sz w:val="20"/>
+                <w:szCs w:val="20"/>
+                <w:lang w:val="en-US" w:eastAsia="zh-CN" w:bidi="hi-IN"/>
+              </w:rPr>
+              <w:t xml:space="preserve">- 1 Stk TRINNITY Wandabdichtung BASIS-Set 5 qm DW bis 100 x 100 / BW bis 180 x 80 cm</w:t>
+            </w:r>
+          </w:p>
+          <w:p>
+            <w:pPr>
+              <w:pStyle w:val="normal1"/>
+              <w:suppressAutoHyphens w:val="true"/>
+              <w:spacing w:lineRule="auto" w:line="278" w:before="0" w:after="0"/>
+              <w:ind w:end="314"/>
+              <w:jc w:val="start"/>
+              <w:rPr>
+                <w:rFonts w:ascii="Open Sans" w:hAnsi="Open Sans" w:eastAsia="Open Sans" w:cs="Open Sans"/>
+                <w:color w:val="000000"/>
+                <w:sz w:val="20"/>
+                <w:szCs w:val="20"/>
+              </w:rPr>
+            </w:pPr>
+            <w:r>
+              <w:rPr>
+                <w:rFonts w:eastAsia="Open Sans" w:cs="Open Sans" w:ascii="Open Sans" w:hAnsi="Open Sans"/>
+                <w:color w:val="000000"/>
+                <w:kern w:val="0"/>
+                <w:sz w:val="20"/>
+                <w:szCs w:val="20"/>
+                <w:lang w:val="en-US" w:eastAsia="zh-CN" w:bidi="hi-IN"/>
+              </w:rPr>
+              <w:t xml:space="preserve">- 6 Pkg Flächenkleber (Wandverkleidung)</w:t>
+            </w:r>
+          </w:p>
+          <w:p>
+            <w:pPr>
+              <w:pStyle w:val="normal1"/>
+              <w:suppressAutoHyphens w:val="true"/>
+              <w:spacing w:lineRule="auto" w:line="278" w:before="0" w:after="0"/>
+              <w:ind w:end="314"/>
+              <w:jc w:val="start"/>
+              <w:rPr>
+                <w:rFonts w:ascii="Open Sans" w:hAnsi="Open Sans" w:eastAsia="Open Sans" w:cs="Open Sans"/>
+                <w:color w:val="000000"/>
+                <w:sz w:val="20"/>
+                <w:szCs w:val="20"/>
+              </w:rPr>
+            </w:pPr>
+            <w:r>
+              <w:rPr>
+                <w:rFonts w:eastAsia="Open Sans" w:cs="Open Sans" w:ascii="Open Sans" w:hAnsi="Open Sans"/>
+                <w:color w:val="000000"/>
+                <w:kern w:val="0"/>
+                <w:sz w:val="20"/>
+                <w:szCs w:val="20"/>
+                <w:lang w:val="en-US" w:eastAsia="zh-CN" w:bidi="hi-IN"/>
+              </w:rPr>
+              <w:t xml:space="preserve">- 1 Stk Abschlussprofil 3.0 255 cm silber eloxiert VIGOUR</w:t>
+            </w:r>
+          </w:p>
+          <w:p>
+            <w:pPr>
+              <w:pStyle w:val="normal1"/>
+              <w:suppressAutoHyphens w:val="true"/>
+              <w:spacing w:lineRule="auto" w:line="278" w:before="0" w:after="0"/>
+              <w:ind w:end="314"/>
+              <w:jc w:val="start"/>
+              <w:rPr>
+                <w:rFonts w:ascii="Open Sans" w:hAnsi="Open Sans" w:eastAsia="Open Sans" w:cs="Open Sans"/>
+                <w:color w:val="000000"/>
+                <w:sz w:val="20"/>
+                <w:szCs w:val="20"/>
+              </w:rPr>
+            </w:pPr>
+            <w:r>
+              <w:rPr>
+                <w:rFonts w:eastAsia="Open Sans" w:cs="Open Sans" w:ascii="Open Sans" w:hAnsi="Open Sans"/>
+                <w:color w:val="000000"/>
+                <w:kern w:val="0"/>
+                <w:sz w:val="20"/>
+                <w:szCs w:val="20"/>
+                <w:lang w:val="en-US" w:eastAsia="zh-CN" w:bidi="hi-IN"/>
+              </w:rPr>
+              <w:t xml:space="preserve">- 1 Stk CARE Sanitär Silikon Weiß 310ml</w:t>
+            </w:r>
+          </w:p>
+          <w:p>
+            <w:pPr>
+              <w:pStyle w:val="normal1"/>
+              <w:suppressAutoHyphens w:val="true"/>
+              <w:spacing w:lineRule="auto" w:line="278" w:before="0" w:after="0"/>
+              <w:ind w:end="314"/>
+              <w:jc w:val="start"/>
+              <w:rPr>
+                <w:rFonts w:ascii="Open Sans" w:hAnsi="Open Sans" w:eastAsia="Open Sans" w:cs="Open Sans"/>
+                <w:color w:val="000000"/>
+                <w:sz w:val="20"/>
+                <w:szCs w:val="20"/>
+              </w:rPr>
+            </w:pPr>
+            <w:r>
+              <w:rPr>
+                <w:rFonts w:eastAsia="Open Sans" w:cs="Open Sans" w:ascii="Open Sans" w:hAnsi="Open Sans"/>
+                <w:color w:val="000000"/>
+                <w:kern w:val="0"/>
+                <w:sz w:val="20"/>
+                <w:szCs w:val="20"/>
+                <w:lang w:val="en-US" w:eastAsia="zh-CN" w:bidi="hi-IN"/>
+              </w:rPr>
+              <w:t xml:space="preserve">- 1 Stk Haltegriff clivia plus 32/400mm m. Ros. Edelstahl glatt poliert,VIGOUR</w:t>
+            </w:r>
+          </w:p>
+        </w:tc>
+        <w:tc>
+          <w:tcPr>
+            <w:tcW w:w="2327" w:type="dxa"/>
+            <w:tcBorders/>
+            <w:shd w:color="auto" w:fill="FFFFFF" w:val="clear"/>
+          </w:tcPr>
+          <w:p>
+            <w:pPr>
+              <w:pStyle w:val="normal1"/>
+              <w:suppressAutoHyphens w:val="true"/>
+              <w:spacing w:lineRule="auto" w:line="278" w:before="0" w:after="0"/>
+              <w:ind w:end="314"/>
+              <w:jc w:val="start"/>
+              <w:rPr>
+                <w:color w:val="000000"/>
+              </w:rPr>
+            </w:pPr>
+            <w:r>
+              <w:rPr>
+                <w:rFonts w:eastAsia="Calibri" w:cs="Calibri"/>
+                <w:color w:val="000000"/>
+                <w:kern w:val="0"/>
+                <w:sz w:val="22"/>
+                <w:szCs w:val="22"/>
+                <w:lang w:val="en-US" w:eastAsia="zh-CN" w:bidi="hi-IN"/>
+              </w:rPr>
+            </w:r>
+          </w:p>
+        </w:tc>
+        <w:tc>
+          <w:tcPr>
+            <w:tcW w:w="1755" w:type="dxa"/>
+            <w:tcBorders/>
+            <w:shd w:color="auto" w:fill="FFFFFF" w:val="clear"/>
+            <w:vAlign w:val="center"/>
+          </w:tcPr>
+          <w:p>
+            <w:pPr>
+              <w:pStyle w:val="normal1"/>
+              <w:suppressAutoHyphens w:val="true"/>
+              <w:spacing w:lineRule="auto" w:line="278" w:before="0" w:after="0"/>
+              <w:ind w:end="314"/>
+              <w:jc w:val="start"/>
+              <w:rPr>
+                <w:color w:val="000000"/>
+              </w:rPr>
+            </w:pPr>
+            <w:r>
+              <w:rPr>
+                <w:rFonts w:eastAsia="Calibri" w:cs="Calibri"/>
+                <w:color w:val="000000"/>
+                <w:kern w:val="0"/>
+                <w:sz w:val="22"/>
+                <w:szCs w:val="22"/>
+                <w:lang w:val="en-US" w:eastAsia="zh-CN" w:bidi="hi-IN"/>
+              </w:rPr>
+            </w:r>
+          </w:p>
+        </w:tc>
+      </w:tr>
+      <w:tr>
+        <w:trPr>
+          <w:trHeight w:val="1" w:hRule="atLeast"/>
+        </w:trPr>
+        <w:tc>
+          <w:tcPr>
+            <w:tcW w:w="675" w:type="dxa"/>
+            <w:tcBorders>
+              <w:start w:val="single" w:sz="8" w:space="0" w:color="FFFFFF"/>
+              <w:bottom w:val="single" w:sz="8" w:space="0" w:color="FFFFFF"/>
+              <w:end w:val="single" w:sz="8" w:space="0" w:color="FFFFFF"/>
+            </w:tcBorders>
+            <w:shd w:color="auto" w:fill="FFFFFF" w:val="clear"/>
+          </w:tcPr>
+          <w:p>
+            <w:pPr>
+              <w:pStyle w:val="normal1"/>
+              <w:suppressAutoHyphens w:val="true"/>
+              <w:spacing w:lineRule="auto" w:line="278" w:before="0" w:after="0"/>
+              <w:ind w:end="-26"/>
+              <w:jc w:val="start"/>
+              <w:rPr>
+                <w:color w:val="000000"/>
+              </w:rPr>
+            </w:pPr>
+            <w:r>
+              <w:rPr>
+                <w:rFonts w:eastAsia="Open Sans" w:cs="Open Sans" w:ascii="Open Sans" w:hAnsi="Open Sans"/>
+                <w:color w:val="000000"/>
+                <w:kern w:val="0"/>
+                <w:sz w:val="20"/>
+                <w:szCs w:val="20"/>
+                <w:lang w:val="en-US" w:eastAsia="zh-CN" w:bidi="hi-IN"/>
+              </w:rPr>
+              <w:t xml:space="preserve">003</w:t>
+            </w:r>
+          </w:p>
+        </w:tc>
+        <w:tc>
+          <w:tcPr>
+            <w:tcW w:w="883" w:type="dxa"/>
+            <w:tcBorders>
+              <w:start w:val="single" w:sz="8" w:space="0" w:color="FFFFFF"/>
+              <w:bottom w:val="single" w:sz="8" w:space="0" w:color="FFFFFF"/>
+              <w:end w:val="single" w:sz="8" w:space="0" w:color="FFFFFF"/>
+            </w:tcBorders>
+            <w:shd w:color="auto" w:fill="FFFFFF" w:val="clear"/>
+          </w:tcPr>
+          <w:p>
+            <w:pPr>
+              <w:pStyle w:val="normal1"/>
+              <w:suppressAutoHyphens w:val="true"/>
+              <w:spacing w:lineRule="auto" w:line="278" w:before="0" w:after="0"/>
+              <w:ind w:end="314"/>
+              <w:jc w:val="start"/>
+              <w:rPr>
+                <w:color w:val="000000"/>
+              </w:rPr>
+            </w:pPr>
+            <w:r>
+              <w:rPr>
+                <w:rFonts w:eastAsia="Open Sans" w:cs="Open Sans" w:ascii="Open Sans" w:hAnsi="Open Sans"/>
+                <w:color w:val="000000"/>
+                <w:kern w:val="0"/>
+                <w:sz w:val="20"/>
+                <w:szCs w:val="20"/>
+                <w:lang w:val="en-US" w:eastAsia="zh-CN" w:bidi="hi-IN"/>
+              </w:rPr>
+              <w:t xml:space="preserve">1 Stk</w:t>
+            </w:r>
+          </w:p>
+        </w:tc>
+        <w:tc>
+          <w:tcPr>
+            <w:tcW w:w="4410" w:type="dxa"/>
+            <w:tcBorders>
+              <w:start w:val="single" w:sz="8" w:space="0" w:color="FFFFFF"/>
+              <w:bottom w:val="single" w:sz="8" w:space="0" w:color="FFFFFF"/>
+              <w:end w:val="single" w:sz="8" w:space="0" w:color="FFFFFF"/>
+            </w:tcBorders>
+            <w:shd w:color="auto" w:fill="FFFFFF" w:val="clear"/>
+          </w:tcPr>
+          <w:p>
+            <w:pPr>
+              <w:pStyle w:val="normal1"/>
+              <w:suppressAutoHyphens w:val="true"/>
+              <w:spacing w:lineRule="auto" w:line="278" w:before="0" w:after="0"/>
+              <w:ind w:end="314"/>
+              <w:jc w:val="start"/>
+              <w:rPr>
+                <w:rFonts w:ascii="Open Sans" w:hAnsi="Open Sans" w:eastAsia="Open Sans" w:cs="Open Sans"/>
+                <w:b/>
+                <w:color w:val="000000"/>
+                <w:sz w:val="20"/>
+                <w:szCs w:val="20"/>
+              </w:rPr>
+            </w:pPr>
+            <w:r>
+              <w:rPr>
+                <w:rFonts w:eastAsia="Open Sans" w:cs="Open Sans" w:ascii="Open Sans" w:hAnsi="Open Sans"/>
+                <w:b/>
+                <w:color w:val="000000"/>
+                <w:kern w:val="0"/>
+                <w:sz w:val="20"/>
+                <w:szCs w:val="20"/>
+                <w:lang w:val="en-US" w:eastAsia="zh-CN" w:bidi="hi-IN"/>
+              </w:rPr>
+              <w:t xml:space="preserve">Bestandkundenbonus:</w:t>
+            </w:r>
+          </w:p>
+          <w:p>
+            <w:pPr>
+              <w:pStyle w:val="normal1"/>
+              <w:suppressAutoHyphens w:val="true"/>
+              <w:spacing w:lineRule="auto" w:line="278" w:before="0" w:after="0"/>
+              <w:ind w:end="314"/>
+              <w:jc w:val="start"/>
+              <w:rPr>
+                <w:color w:val="000000"/>
+                <w:sz w:val="18"/>
+                <w:szCs w:val="18"/>
+              </w:rPr>
+            </w:pPr>
+            <w:r>
+              <w:rPr>
+                <w:rFonts w:eastAsia="Open Sans" w:cs="Open Sans" w:ascii="Open Sans" w:hAnsi="Open Sans"/>
+                <w:color w:val="000000"/>
+                <w:kern w:val="0"/>
+                <w:sz w:val="20"/>
+                <w:szCs w:val="20"/>
+                <w:lang w:val="en-US" w:eastAsia="zh-CN" w:bidi="hi-IN"/>
+              </w:rPr>
+              <w:t xml:space="preserve">-- Rabatt von 300 € ab einem Gesamtwert von 3.000</w:t>
+            </w:r>
+          </w:p>
+        </w:tc>
+        <w:tc>
+          <w:tcPr>
+            <w:tcW w:w="2327" w:type="dxa"/>
+            <w:tcBorders>
+              <w:start w:val="single" w:sz="8" w:space="0" w:color="FFFFFF"/>
+              <w:bottom w:val="single" w:sz="8" w:space="0" w:color="FFFFFF"/>
+              <w:end w:val="single" w:sz="8" w:space="0" w:color="FFFFFF"/>
+            </w:tcBorders>
+            <w:shd w:color="auto" w:fill="FFFFFF" w:val="clear"/>
+          </w:tcPr>
+          <w:p>
+            <w:pPr>
+              <w:pStyle w:val="normal1"/>
+              <w:suppressAutoHyphens w:val="true"/>
+              <w:spacing w:lineRule="auto" w:line="278" w:before="0" w:after="0"/>
+              <w:ind w:end="314"/>
+              <w:jc w:val="start"/>
+              <w:rPr>
+                <w:color w:val="000000"/>
+              </w:rPr>
+            </w:pPr>
+            <w:r>
+              <w:rPr>
+                <w:rFonts w:eastAsia="Open Sans" w:cs="Open Sans" w:ascii="Open Sans" w:hAnsi="Open Sans"/>
+                <w:color w:val="000000"/>
+                <w:kern w:val="0"/>
+                <w:sz w:val="20"/>
+                <w:szCs w:val="20"/>
+                <w:lang w:val="en-US" w:eastAsia="zh-CN" w:bidi="hi-IN"/>
+              </w:rPr>
+              <w:t xml:space="preserve">-252,10 €</w:t>
+            </w:r>
+          </w:p>
+        </w:tc>
+        <w:tc>
+          <w:tcPr>
+            <w:tcW w:w="1755" w:type="dxa"/>
+            <w:tcBorders>
+              <w:start w:val="single" w:sz="8" w:space="0" w:color="FFFFFF"/>
+              <w:bottom w:val="single" w:sz="8" w:space="0" w:color="FFFFFF"/>
+              <w:end w:val="single" w:sz="8" w:space="0" w:color="FFFFFF"/>
+            </w:tcBorders>
+            <w:shd w:color="auto" w:fill="FFFFFF" w:val="clear"/>
+          </w:tcPr>
+          <w:p>
+            <w:pPr>
+              <w:pStyle w:val="normal1"/>
+              <w:suppressAutoHyphens w:val="true"/>
+              <w:spacing w:lineRule="auto" w:line="278" w:before="0" w:after="0"/>
+              <w:ind w:end="314"/>
+              <w:jc w:val="center"/>
+              <w:rPr>
+                <w:color w:val="000000"/>
+              </w:rPr>
+            </w:pPr>
+            <w:r>
+              <w:rPr>
+                <w:rFonts w:eastAsia="Open Sans" w:cs="Open Sans" w:ascii="Open Sans" w:hAnsi="Open Sans"/>
+                <w:color w:val="000000"/>
+                <w:kern w:val="0"/>
+                <w:sz w:val="20"/>
+                <w:szCs w:val="20"/>
+                <w:lang w:val="en-US" w:eastAsia="zh-CN" w:bidi="hi-IN"/>
+              </w:rPr>
+              <w:t xml:space="preserve">-252,10 €</w:t>
+            </w:r>
+          </w:p>
+        </w:tc>
+      </w:tr>
+    </w:tbl>
     <w:p>
       <w:pPr>
         <w:pStyle w:val="normal1"/>
@@ -1521,7 +2339,12 @@
             </w:pPr>
             <w:r>
               <w:rPr>
-                <w:color w:val="000000"/>
+                <w:rFonts w:eastAsia="Calibri" w:cs="Calibri"/>
+                <w:color w:val="000000"/>
+                <w:kern w:val="0"/>
+                <w:sz w:val="22"/>
+                <w:szCs w:val="22"/>
+                <w:lang w:val="en-US" w:eastAsia="zh-CN" w:bidi="hi-IN"/>
               </w:rPr>
             </w:r>
           </w:p>
@@ -1550,7 +2373,12 @@
             </w:pPr>
             <w:r>
               <w:rPr>
-                <w:color w:val="000000"/>
+                <w:rFonts w:eastAsia="Calibri" w:cs="Calibri"/>
+                <w:color w:val="000000"/>
+                <w:kern w:val="0"/>
+                <w:sz w:val="22"/>
+                <w:szCs w:val="22"/>
+                <w:lang w:val="en-US" w:eastAsia="zh-CN" w:bidi="hi-IN"/>
               </w:rPr>
             </w:r>
           </w:p>
@@ -1588,7 +2416,7 @@
                 <w:szCs w:val="22"/>
                 <w:lang w:val="en-US" w:eastAsia="zh-CN" w:bidi="hi-IN"/>
               </w:rPr>
-              <w:t xml:space="preserve">3.267,88 €</w:t>
+              <w:t xml:space="preserve">2.749,93 €</w:t>
             </w:r>
             <w:r>
               <w:rPr>
@@ -1683,7 +2511,12 @@
             </w:pPr>
             <w:r>
               <w:rPr>
-                <w:color w:val="000000"/>
+                <w:rFonts w:eastAsia="Calibri" w:cs="Calibri"/>
+                <w:color w:val="000000"/>
+                <w:kern w:val="0"/>
+                <w:sz w:val="22"/>
+                <w:szCs w:val="22"/>
+                <w:lang w:val="en-US" w:eastAsia="zh-CN" w:bidi="hi-IN"/>
               </w:rPr>
             </w:r>
           </w:p>
@@ -1712,7 +2545,12 @@
             </w:pPr>
             <w:r>
               <w:rPr>
-                <w:color w:val="000000"/>
+                <w:rFonts w:eastAsia="Calibri" w:cs="Calibri"/>
+                <w:color w:val="000000"/>
+                <w:kern w:val="0"/>
+                <w:sz w:val="22"/>
+                <w:szCs w:val="22"/>
+                <w:lang w:val="en-US" w:eastAsia="zh-CN" w:bidi="hi-IN"/>
               </w:rPr>
             </w:r>
           </w:p>
@@ -1750,7 +2588,7 @@
                 <w:szCs w:val="22"/>
                 <w:lang w:val="en-US" w:eastAsia="zh-CN" w:bidi="hi-IN"/>
               </w:rPr>
-              <w:t xml:space="preserve">620,90 €</w:t>
+              <w:t xml:space="preserve">522,49 €</w:t>
             </w:r>
             <w:r>
               <w:rPr>
@@ -1846,7 +2684,12 @@
             </w:pPr>
             <w:r>
               <w:rPr>
-                <w:color w:val="000000"/>
+                <w:rFonts w:eastAsia="Calibri" w:cs="Calibri"/>
+                <w:color w:val="000000"/>
+                <w:kern w:val="0"/>
+                <w:sz w:val="22"/>
+                <w:szCs w:val="22"/>
+                <w:lang w:val="en-US" w:eastAsia="zh-CN" w:bidi="hi-IN"/>
               </w:rPr>
             </w:r>
           </w:p>
@@ -1875,7 +2718,12 @@
             </w:pPr>
             <w:r>
               <w:rPr>
-                <w:color w:val="000000"/>
+                <w:rFonts w:eastAsia="Calibri" w:cs="Calibri"/>
+                <w:color w:val="000000"/>
+                <w:kern w:val="0"/>
+                <w:sz w:val="22"/>
+                <w:szCs w:val="22"/>
+                <w:lang w:val="en-US" w:eastAsia="zh-CN" w:bidi="hi-IN"/>
               </w:rPr>
             </w:r>
           </w:p>
@@ -1913,7 +2761,7 @@
                 <w:szCs w:val="22"/>
                 <w:lang w:val="en-US" w:eastAsia="zh-CN" w:bidi="hi-IN"/>
               </w:rPr>
-              <w:t xml:space="preserve">3.888,78 €</w:t>
+              <w:t xml:space="preserve">3.272,42 €</w:t>
             </w:r>
             <w:r>
               <w:rPr>
@@ -1962,6 +2810,52 @@
           <w:lang w:val="de-DE"/>
         </w:rPr>
         <w:t xml:space="preserve">Es handelt sich hierbei um ein Festpreisangebot für die oben definierten Leistungen.</w:t>
+      </w:r>
+    </w:p>
+    <w:p>
+      <w:pPr>
+        <w:pStyle w:val="normal1"/>
+        <w:spacing w:before="23" w:after="0"/>
+        <w:rPr>
+          <w:rFonts w:ascii="Open Sans" w:hAnsi="Open Sans" w:eastAsia="Open Sans" w:cs="Open Sans"/>
+          <w:color w:val="000000"/>
+          <w:lang w:val="de-DE"/>
+        </w:rPr>
+      </w:pPr>
+      <w:r>
+        <w:rPr>
+          <w:rFonts w:eastAsia="Open Sans" w:cs="Open Sans" w:ascii="Open Sans" w:hAnsi="Open Sans"/>
+          <w:color w:val="000000"/>
+          <w:lang w:val="de-DE"/>
+        </w:rPr>
+      </w:r>
+    </w:p>
+    <w:p>
+      <w:pPr>
+        <w:pStyle w:val="normal1"/>
+        <w:spacing w:lineRule="auto" w:line="286"/>
+        <w:ind w:start="123"/>
+        <w:rPr>
+          <w:rFonts w:ascii="Open Sans" w:hAnsi="Open Sans" w:eastAsia="Open Sans" w:cs="Open Sans"/>
+          <w:color w:val="000000"/>
+          <w:lang w:val="de-DE"/>
+        </w:rPr>
+      </w:pPr>
+      <w:r>
+        <w:rPr>
+          <w:rFonts w:eastAsia="Open Sans Semibold" w:cs="Open Sans Semibold" w:ascii="Open Sans Semibold" w:hAnsi="Open Sans Semibold"/>
+          <w:color w:val="030303"/>
+          <w:lang w:val="de-DE"/>
+        </w:rPr>
+        <w:t xml:space="preserve">ACHTUNG:</w:t>
+      </w:r>
+      <w:r>
+        <w:rPr>
+          <w:rFonts w:eastAsia="Open Sans" w:cs="Open Sans" w:ascii="Open Sans" w:hAnsi="Open Sans"/>
+          <w:color w:val="030303"/>
+          <w:lang w:val="de-DE"/>
+        </w:rPr>
+        <w:t xml:space="preserve"> Ob eine ebenerdige Montage der Duschwanne möglich ist, kann erst nach dem Ausbau der bestehenden Wanne beurteilen werden. Sollten dabei zusätzliche oder weitere Leistungen erforderlich oder von Ihnen gewünscht sein, können zusätzliche Kosten entstehen.</w:t>
         <w:br/>
       </w:r>
     </w:p>
@@ -1986,43 +2880,6 @@
           <w:lang w:val="de-DE"/>
         </w:rPr>
         <w:t xml:space="preserve">Diese werden vorab mit Ihnen besprochen, bedürfen lhrer Zustimmung und werden auf Regiebasis nach tatsächlichem Aufwand abgerechnet. (Stundensatz-Facharbeiter: 69,50€ netto)</w:t>
-        <w:br/>
-        <w:br/>
-        <w:t xml:space="preserve">Der Selbstkostenanteil beträgt </w:t>
-      </w:r>
-      <w:r>
-        <w:rPr>
-          <w:rFonts w:eastAsia="Open Sans" w:cs="Open Sans" w:ascii="Open Sans" w:hAnsi="Open Sans"/>
-          <w:b/>
-          <w:color w:val="030303"/>
-          <w:lang w:val="de-DE"/>
-        </w:rPr>
-        <w:t xml:space="preserve">0,00 €</w:t>
-      </w:r>
-      <w:r>
-        <w:rPr>
-          <w:rFonts w:eastAsia="Open Sans" w:cs="Open Sans" w:ascii="Open Sans" w:hAnsi="Open Sans"/>
-          <w:color w:val="030303"/>
-          <w:lang w:val="de-DE"/>
-        </w:rPr>
-        <w:t xml:space="preserve"> unter Berücksichtigung eines gewährten Zuschusses durch die Pflegekasse i.H.v. </w:t>
-      </w:r>
-      <w:r>
-        <w:rPr>
-          <w:rFonts w:eastAsia="Open Sans" w:cs="Open Sans" w:ascii="Open Sans" w:hAnsi="Open Sans"/>
-          <w:b/>
-          <w:color w:val="030303"/>
-          <w:lang w:val="de-DE"/>
-        </w:rPr>
-        <w:t xml:space="preserve">4.180,00 €</w:t>
-      </w:r>
-      <w:r>
-        <w:rPr>
-          <w:rFonts w:eastAsia="Open Sans" w:cs="Open Sans" w:ascii="Open Sans" w:hAnsi="Open Sans"/>
-          <w:color w:val="030303"/>
-          <w:lang w:val="de-DE"/>
-        </w:rPr>
-        <w:t xml:space="preserve">.</w:t>
       </w:r>
     </w:p>
     <w:p>
@@ -2513,7 +3370,7 @@
               <w:rFonts w:eastAsia="Calibri" w:cs="Calibri"/>
               <w:lang w:val="en-US" w:eastAsia="zh-CN" w:bidi="hi-IN"/>
             </w:rPr>
-            <w:t>3</w:t>
+            <w:t>2</w:t>
           </w:r>
           <w:r>
             <w:rPr>
@@ -2573,7 +3430,7 @@
               <w:rFonts w:eastAsia="Calibri" w:cs="Calibri"/>
               <w:lang w:val="en-US" w:eastAsia="zh-CN" w:bidi="hi-IN"/>
             </w:rPr>
-            <w:t>3</w:t>
+            <w:t>2</w:t>
           </w:r>
           <w:r>
             <w:rPr>
@@ -2592,7 +3449,7 @@
   <w:p>
     <w:pPr>
       <w:pStyle w:val="normal1"/>
-      <w:spacing w:lineRule="auto" w:line="14" w:before="240" w:after="240"/>
+      <w:spacing w:lineRule="auto" w:line="14" w:before="240" w:after="0"/>
       <w:jc w:val="center"/>
       <w:rPr/>
     </w:pPr>
@@ -2802,7 +3659,7 @@
               <w:rFonts w:eastAsia="Calibri" w:cs="Calibri"/>
               <w:lang w:val="en-US" w:eastAsia="zh-CN" w:bidi="hi-IN"/>
             </w:rPr>
-            <w:t>3</w:t>
+            <w:t>2</w:t>
           </w:r>
           <w:r>
             <w:rPr>
@@ -2862,7 +3719,7 @@
               <w:rFonts w:eastAsia="Calibri" w:cs="Calibri"/>
               <w:lang w:val="en-US" w:eastAsia="zh-CN" w:bidi="hi-IN"/>
             </w:rPr>
-            <w:t>3</w:t>
+            <w:t>2</w:t>
           </w:r>
           <w:r>
             <w:rPr>
@@ -2881,7 +3738,7 @@
   <w:p>
     <w:pPr>
       <w:pStyle w:val="normal1"/>
-      <w:spacing w:lineRule="auto" w:line="14" w:before="240" w:after="240"/>
+      <w:spacing w:lineRule="auto" w:line="14" w:before="240" w:after="0"/>
       <w:jc w:val="center"/>
       <w:rPr/>
     </w:pPr>
@@ -2920,15 +3777,7 @@
   <w:p>
     <w:pPr>
       <w:pStyle w:val="normal1"/>
-      <w:rPr/>
-    </w:pPr>
-    <w:r>
-      <w:rPr/>
-    </w:r>
-  </w:p>
-  <w:p>
-    <w:pPr>
-      <w:pStyle w:val="normal1"/>
+      <w:spacing w:before="120" w:after="0"/>
       <w:ind w:start="7200"/>
       <w:rPr/>
     </w:pPr>
@@ -2991,15 +3840,7 @@
   <w:p>
     <w:pPr>
       <w:pStyle w:val="normal1"/>
-      <w:rPr/>
-    </w:pPr>
-    <w:r>
-      <w:rPr/>
-    </w:r>
-  </w:p>
-  <w:p>
-    <w:pPr>
-      <w:pStyle w:val="normal1"/>
+      <w:spacing w:before="120" w:after="0"/>
       <w:ind w:start="7200"/>
       <w:rPr/>
     </w:pPr>
@@ -3593,18 +4434,6 @@
       <w:u w:val="single"/>
     </w:rPr>
   </w:style>
-  <w:style w:type="character" w:styleId="NumberingSymbols">
-    <w:name w:val="Numbering Symbols"/>
-    <w:qFormat/>
-    <w:rPr/>
-  </w:style>
-  <w:style w:type="character" w:styleId="Bullets">
-    <w:name w:val="Bullets"/>
-    <w:qFormat/>
-    <w:rPr>
-      <w:rFonts w:ascii="OpenSymbol" w:hAnsi="OpenSymbol" w:eastAsia="OpenSymbol" w:cs="OpenSymbol"/>
-    </w:rPr>
-  </w:style>
   <w:style w:type="paragraph" w:styleId="Heading" w:customStyle="1">
     <w:name w:val="Heading"/>
     <w:basedOn w:val="Normal"/>
@@ -3736,29 +4565,6 @@
     <w:basedOn w:val="HeaderandFooter"/>
     <w:pPr/>
     <w:rPr/>
-  </w:style>
-  <w:style w:type="paragraph" w:styleId="TableContents">
-    <w:name w:val="Table Contents"/>
-    <w:basedOn w:val="Normal"/>
-    <w:qFormat/>
-    <w:pPr>
-      <w:widowControl w:val="false"/>
-      <w:suppressLineNumbers/>
-    </w:pPr>
-    <w:rPr/>
-  </w:style>
-  <w:style w:type="paragraph" w:styleId="TableHeading">
-    <w:name w:val="Table Heading"/>
-    <w:basedOn w:val="TableContents"/>
-    <w:qFormat/>
-    <w:pPr>
-      <w:suppressLineNumbers/>
-      <w:jc w:val="center"/>
-    </w:pPr>
-    <w:rPr>
-      <w:b/>
-      <w:bCs/>
-    </w:rPr>
   </w:style>
   <w:style w:type="numbering" w:styleId="NoList" w:default="1">
     <w:name w:val="No List"/>
@@ -3965,4 +4771,16 @@
     </a:fmtScheme>
   </a:themeElements>
 </a:theme>
+</file>
+
+<file path=customXml/item1.xml><?xml version="1.0" encoding="utf-8"?>
+<b:Sources xmlns:b="http://schemas.openxmlformats.org/officeDocument/2006/bibliography" xmlns="http://schemas.openxmlformats.org/officeDocument/2006/bibliography" SelectedStyle="\APASixthEditionOfficeOnline.xsl" StyleName="APA" Version="6"/>
+</file>
+
+<file path=customXml/itemProps1.xml><?xml version="1.0" encoding="utf-8"?>
+<ds:datastoreItem xmlns:ds="http://schemas.openxmlformats.org/officeDocument/2006/customXml" ds:itemID="{1DA076A3-A826-478E-933E-7998A844BFB4}">
+  <ds:schemaRefs>
+    <ds:schemaRef ds:uri="http://schemas.openxmlformats.org/officeDocument/2006/bibliography"/>
+  </ds:schemaRefs>
+</ds:datastoreItem>
 </file>
</xml_diff>

<commit_message>
update bwt kosten details
</commit_message>
<xml_diff>
--- a/out-Angebot.docx
+++ b/out-Angebot.docx
@@ -67,9 +67,9 @@
         <w:tblLook w:firstRow="0" w:noVBand="1" w:lastRow="0" w:firstColumn="0" w:lastColumn="0" w:noHBand="1" w:val="0600"/>
       </w:tblPr>
       <w:tblGrid>
-        <w:gridCol w:w="4809"/>
+        <w:gridCol w:w="4805"/>
         <w:gridCol w:w="2268"/>
-        <w:gridCol w:w="2958"/>
+        <w:gridCol w:w="2962"/>
       </w:tblGrid>
       <w:tr>
         <w:trPr>
@@ -77,7 +77,7 @@
         </w:trPr>
         <w:tc>
           <w:tcPr>
-            <w:tcW w:w="4809" w:type="dxa"/>
+            <w:tcW w:w="4805" w:type="dxa"/>
             <w:tcBorders>
               <w:top w:val="single" w:sz="8" w:space="0" w:color="FFFFFF"/>
               <w:start w:val="single" w:sz="8" w:space="0" w:color="FFFFFF"/>
@@ -104,7 +104,7 @@
                 <w:szCs w:val="22"/>
                 <w:lang w:val="en-US" w:eastAsia="zh-CN" w:bidi="hi-IN"/>
               </w:rPr>
-              <w:t xml:space="preserve">Frau</w:t>
+              <w:t xml:space="preserve">Herr</w:t>
             </w:r>
           </w:p>
           <w:p>
@@ -127,7 +127,7 @@
                 <w:szCs w:val="22"/>
                 <w:lang w:val="en-US" w:eastAsia="zh-CN" w:bidi="hi-IN"/>
               </w:rPr>
-              <w:t xml:space="preserve">Cade Baird</w:t>
+              <w:t xml:space="preserve">Lilah Perkins</w:t>
             </w:r>
           </w:p>
           <w:p>
@@ -150,7 +150,7 @@
                 <w:szCs w:val="22"/>
                 <w:lang w:val="en-US" w:eastAsia="zh-CN" w:bidi="hi-IN"/>
               </w:rPr>
-              <w:t xml:space="preserve">Do velit vero esse o</w:t>
+              <w:t xml:space="preserve">Illum quam quam non</w:t>
             </w:r>
           </w:p>
           <w:p>
@@ -175,7 +175,7 @@
                 <w:szCs w:val="22"/>
                 <w:lang w:val="en-US" w:eastAsia="zh-CN" w:bidi="hi-IN"/>
               </w:rPr>
-              <w:t xml:space="preserve">Debitis molestias et Qui mollit veritatis</w:t>
+              <w:t xml:space="preserve">Quae quaerat ut non  Assumenda lorem dign</w:t>
             </w:r>
           </w:p>
         </w:tc>
@@ -193,7 +193,7 @@
             <w:pPr>
               <w:pStyle w:val="normal1"/>
               <w:suppressAutoHyphens w:val="true"/>
-              <w:spacing w:lineRule="auto" w:line="276" w:before="0" w:after="0"/>
+              <w:spacing w:before="0" w:after="0"/>
               <w:ind w:end="127"/>
               <w:jc w:val="start"/>
               <w:rPr>
@@ -240,7 +240,7 @@
             <w:pPr>
               <w:pStyle w:val="normal1"/>
               <w:suppressAutoHyphens w:val="true"/>
-              <w:spacing w:lineRule="auto" w:line="276" w:before="0" w:after="0"/>
+              <w:spacing w:before="0" w:after="0"/>
               <w:ind w:end="127"/>
               <w:jc w:val="start"/>
               <w:rPr>
@@ -267,7 +267,7 @@
             <w:pPr>
               <w:pStyle w:val="normal1"/>
               <w:suppressAutoHyphens w:val="true"/>
-              <w:spacing w:lineRule="auto" w:line="276" w:before="0" w:after="0"/>
+              <w:spacing w:before="0" w:after="0"/>
               <w:ind w:end="127"/>
               <w:jc w:val="start"/>
               <w:rPr>
@@ -295,7 +295,7 @@
         </w:tc>
         <w:tc>
           <w:tcPr>
-            <w:tcW w:w="2958" w:type="dxa"/>
+            <w:tcW w:w="2962" w:type="dxa"/>
             <w:tcBorders>
               <w:top w:val="single" w:sz="8" w:space="0" w:color="FFFFFF"/>
               <w:start w:val="single" w:sz="8" w:space="0" w:color="FFFFFF"/>
@@ -307,7 +307,7 @@
             <w:pPr>
               <w:pStyle w:val="normal1"/>
               <w:suppressAutoHyphens w:val="true"/>
-              <w:spacing w:lineRule="auto" w:line="276" w:before="0" w:after="0"/>
+              <w:spacing w:before="0" w:after="0"/>
               <w:jc w:val="end"/>
               <w:rPr>
                 <w:rFonts w:ascii="Open Sans" w:hAnsi="Open Sans" w:eastAsia="Open Sans" w:cs="Open Sans"/>
@@ -322,7 +322,7 @@
                 <w:szCs w:val="22"/>
                 <w:lang w:val="de-DE" w:eastAsia="zh-CN" w:bidi="hi-IN"/>
               </w:rPr>
-              <w:t xml:space="preserve">ANG2025-1126-110539</w:t>
+              <w:t xml:space="preserve">ANG2025-1126-112639</w:t>
             </w:r>
             <w:r>
               <w:rPr>
@@ -350,7 +350,7 @@
             <w:pPr>
               <w:pStyle w:val="normal1"/>
               <w:suppressAutoHyphens w:val="true"/>
-              <w:spacing w:lineRule="auto" w:line="276" w:before="0" w:after="0"/>
+              <w:spacing w:before="0" w:after="0"/>
               <w:jc w:val="end"/>
               <w:rPr>
                 <w:rFonts w:ascii="Open Sans" w:hAnsi="Open Sans" w:eastAsia="Open Sans" w:cs="Open Sans"/>
@@ -368,7 +368,7 @@
                 <w:szCs w:val="22"/>
                 <w:lang w:val="de-DE" w:eastAsia="zh-CN" w:bidi="hi-IN"/>
               </w:rPr>
-              <w:t xml:space="preserve">27.01.1973</w:t>
+              <w:t xml:space="preserve">05.11.2021</w:t>
             </w:r>
             <w:r>
               <w:rPr>
@@ -410,7 +410,7 @@
                 <w:szCs w:val="22"/>
                 <w:lang w:val="de-DE" w:eastAsia="zh-CN" w:bidi="hi-IN"/>
               </w:rPr>
-              <w:t xml:space="preserve">Mary Dyer</w:t>
+              <w:t xml:space="preserve">Isabelle Bird</w:t>
             </w:r>
             <w:r>
               <w:rPr>
@@ -450,7 +450,7 @@
             <w:pPr>
               <w:pStyle w:val="normal1"/>
               <w:suppressAutoHyphens w:val="true"/>
-              <w:spacing w:lineRule="auto" w:line="276" w:before="0" w:after="0"/>
+              <w:spacing w:before="0" w:after="0"/>
               <w:jc w:val="end"/>
               <w:rPr>
                 <w:rFonts w:ascii="Open Sans" w:hAnsi="Open Sans" w:eastAsia="Open Sans" w:cs="Open Sans"/>
@@ -480,7 +480,7 @@
         </w:trPr>
         <w:tc>
           <w:tcPr>
-            <w:tcW w:w="4809" w:type="dxa"/>
+            <w:tcW w:w="4805" w:type="dxa"/>
             <w:tcBorders>
               <w:top w:val="single" w:sz="8" w:space="0" w:color="FFFFFF"/>
               <w:start w:val="single" w:sz="8" w:space="0" w:color="FFFFFF"/>
@@ -506,17 +506,16 @@
               <w:rPr>
                 <w:rFonts w:eastAsia="Open Sans" w:cs="Open Sans" w:ascii="Open Sans" w:hAnsi="Open Sans"/>
                 <w:color w:val="070707"/>
-                <w:kern w:val="0"/>
                 <w:sz w:val="17"/>
                 <w:szCs w:val="17"/>
-                <w:lang w:val="de-DE" w:eastAsia="zh-CN" w:bidi="hi-IN"/>
+                <w:lang w:val="de-DE"/>
               </w:rPr>
             </w:r>
           </w:p>
         </w:tc>
         <w:tc>
           <w:tcPr>
-            <w:tcW w:w="5226" w:type="dxa"/>
+            <w:tcW w:w="5230" w:type="dxa"/>
             <w:gridSpan w:val="2"/>
             <w:tcBorders>
               <w:top w:val="single" w:sz="8" w:space="0" w:color="FFFFFF"/>
@@ -560,7 +559,7 @@
                 <w:szCs w:val="22"/>
                 <w:lang w:val="en-US" w:eastAsia="zh-CN" w:bidi="hi-IN"/>
               </w:rPr>
-              <w:t xml:space="preserve">961</w:t>
+              <w:t xml:space="preserve">868</w:t>
             </w:r>
           </w:p>
         </w:tc>
@@ -611,7 +610,7 @@
           <w:sz w:val="24"/>
           <w:szCs w:val="24"/>
         </w:rPr>
-        <w:t xml:space="preserve">Ihr Angebot ANG2025-1126-110539</w:t>
+        <w:t xml:space="preserve">Ihr Angebot ANG2025-1126-112639</w:t>
       </w:r>
     </w:p>
     <w:p>
@@ -635,7 +634,7 @@
           <w:rFonts w:eastAsia="Open Sans" w:cs="Open Sans" w:ascii="Open Sans" w:hAnsi="Open Sans"/>
           <w:color w:val="000000"/>
         </w:rPr>
-        <w:t xml:space="preserve">Sehr geehrte Frau Baird,</w:t>
+        <w:t xml:space="preserve">Sehr geehrter Herr Perkins,</w:t>
         <w:br/>
       </w:r>
     </w:p>
@@ -694,24 +693,24 @@
     <w:tbl>
       <w:tblPr>
         <w:tblStyle w:val="TableNormal"/>
-        <w:tblW w:w="9780" w:type="dxa"/>
+        <w:tblW w:w="9746" w:type="dxa"/>
         <w:jc w:val="start"/>
-        <w:tblInd w:w="1" w:type="dxa"/>
+        <w:tblInd w:w="35" w:type="dxa"/>
         <w:tblLayout w:type="fixed"/>
         <w:tblCellMar>
           <w:top w:w="0" w:type="dxa"/>
-          <w:start w:w="0" w:type="dxa"/>
+          <w:start w:w="10" w:type="dxa"/>
           <w:bottom w:w="0" w:type="dxa"/>
-          <w:end w:w="0" w:type="dxa"/>
+          <w:end w:w="10" w:type="dxa"/>
         </w:tblCellMar>
         <w:tblLook w:firstRow="0" w:noVBand="0" w:lastRow="0" w:firstColumn="0" w:lastColumn="0" w:noHBand="0" w:val="0000"/>
       </w:tblPr>
       <w:tblGrid>
-        <w:gridCol w:w="660"/>
+        <w:gridCol w:w="630"/>
         <w:gridCol w:w="885"/>
-        <w:gridCol w:w="4423"/>
-        <w:gridCol w:w="2327"/>
-        <w:gridCol w:w="1485"/>
+        <w:gridCol w:w="4425"/>
+        <w:gridCol w:w="2325"/>
+        <w:gridCol w:w="1481"/>
       </w:tblGrid>
       <w:tr>
         <w:trPr>
@@ -719,8 +718,13 @@
         </w:trPr>
         <w:tc>
           <w:tcPr>
-            <w:tcW w:w="660" w:type="dxa"/>
-            <w:tcBorders/>
+            <w:tcW w:w="630" w:type="dxa"/>
+            <w:tcBorders>
+              <w:top w:val="single" w:sz="8" w:space="0" w:color="CCCCCC"/>
+              <w:start w:val="single" w:sz="8" w:space="0" w:color="CCCCCC"/>
+              <w:bottom w:val="single" w:sz="8" w:space="0" w:color="FFFFFF"/>
+              <w:end w:val="single" w:sz="8" w:space="0" w:color="CCCCCC"/>
+            </w:tcBorders>
             <w:shd w:color="auto" w:fill="CCCCCC" w:val="clear"/>
           </w:tcPr>
           <w:p>
@@ -753,7 +757,12 @@
         <w:tc>
           <w:tcPr>
             <w:tcW w:w="885" w:type="dxa"/>
-            <w:tcBorders/>
+            <w:tcBorders>
+              <w:top w:val="single" w:sz="8" w:space="0" w:color="CCCCCC"/>
+              <w:start w:val="single" w:sz="8" w:space="0" w:color="CCCCCC"/>
+              <w:bottom w:val="single" w:sz="8" w:space="0" w:color="FFFFFF"/>
+              <w:end w:val="single" w:sz="8" w:space="0" w:color="CCCCCC"/>
+            </w:tcBorders>
             <w:shd w:color="auto" w:fill="CCCCCC" w:val="clear"/>
           </w:tcPr>
           <w:p>
@@ -785,8 +794,13 @@
         </w:tc>
         <w:tc>
           <w:tcPr>
-            <w:tcW w:w="4423" w:type="dxa"/>
-            <w:tcBorders/>
+            <w:tcW w:w="4425" w:type="dxa"/>
+            <w:tcBorders>
+              <w:top w:val="single" w:sz="8" w:space="0" w:color="CCCCCC"/>
+              <w:start w:val="single" w:sz="8" w:space="0" w:color="CCCCCC"/>
+              <w:bottom w:val="single" w:sz="8" w:space="0" w:color="FFFFFF"/>
+              <w:end w:val="single" w:sz="8" w:space="0" w:color="CCCCCC"/>
+            </w:tcBorders>
             <w:shd w:color="auto" w:fill="CCCCCC" w:val="clear"/>
           </w:tcPr>
           <w:p>
@@ -815,8 +829,13 @@
         </w:tc>
         <w:tc>
           <w:tcPr>
-            <w:tcW w:w="2327" w:type="dxa"/>
-            <w:tcBorders/>
+            <w:tcW w:w="2325" w:type="dxa"/>
+            <w:tcBorders>
+              <w:top w:val="single" w:sz="8" w:space="0" w:color="CCCCCC"/>
+              <w:start w:val="single" w:sz="8" w:space="0" w:color="CCCCCC"/>
+              <w:bottom w:val="single" w:sz="8" w:space="0" w:color="FFFFFF"/>
+              <w:end w:val="single" w:sz="8" w:space="0" w:color="CCCCCC"/>
+            </w:tcBorders>
             <w:shd w:color="auto" w:fill="CCCCCC" w:val="clear"/>
           </w:tcPr>
           <w:p>
@@ -845,8 +864,13 @@
         </w:tc>
         <w:tc>
           <w:tcPr>
-            <w:tcW w:w="1485" w:type="dxa"/>
-            <w:tcBorders/>
+            <w:tcW w:w="1481" w:type="dxa"/>
+            <w:tcBorders>
+              <w:top w:val="single" w:sz="8" w:space="0" w:color="CCCCCC"/>
+              <w:start w:val="single" w:sz="8" w:space="0" w:color="CCCCCC"/>
+              <w:bottom w:val="single" w:sz="8" w:space="0" w:color="FFFFFF"/>
+              <w:end w:val="single" w:sz="8" w:space="0" w:color="CCCCCC"/>
+            </w:tcBorders>
             <w:shd w:color="auto" w:fill="CCCCCC" w:val="clear"/>
           </w:tcPr>
           <w:p>
@@ -876,194 +900,13 @@
       </w:tr>
       <w:tr>
         <w:trPr>
-          <w:trHeight w:val="315" w:hRule="atLeast"/>
+          <w:trHeight w:val="4717" w:hRule="atLeast"/>
         </w:trPr>
         <w:tc>
           <w:tcPr>
-            <w:tcW w:w="660" w:type="dxa"/>
-            <w:tcBorders/>
-            <w:shd w:color="auto" w:fill="FFFFFF" w:val="clear"/>
-            <w:tcMar>
-              <w:start w:w="56" w:type="dxa"/>
-              <w:end w:w="56" w:type="dxa"/>
-            </w:tcMar>
-          </w:tcPr>
-          <w:p>
-            <w:pPr>
-              <w:pStyle w:val="normal1"/>
-              <w:suppressAutoHyphens w:val="true"/>
-              <w:spacing w:before="40" w:after="0"/>
-              <w:jc w:val="start"/>
-              <w:rPr>
-                <w:rFonts w:ascii="Calibri" w:hAnsi="Calibri" w:eastAsia="Calibri" w:cs="Calibri"/>
-                <w:kern w:val="0"/>
-                <w:sz w:val="22"/>
-                <w:szCs w:val="22"/>
-                <w:lang w:val="en-US" w:eastAsia="zh-CN" w:bidi="hi-IN"/>
-              </w:rPr>
-            </w:pPr>
-            <w:r>
-              <w:rPr>
-                <w:rFonts w:eastAsia="Open Sans" w:cs="Open Sans" w:ascii="Open Sans" w:hAnsi="Open Sans"/>
-                <w:color w:val="070707"/>
-                <w:kern w:val="0"/>
-                <w:sz w:val="20"/>
-                <w:szCs w:val="20"/>
-                <w:lang w:val="en-US" w:eastAsia="zh-CN" w:bidi="hi-IN"/>
-              </w:rPr>
-              <w:t>001</w:t>
-            </w:r>
-          </w:p>
-        </w:tc>
-        <w:tc>
-          <w:tcPr>
-            <w:tcW w:w="885" w:type="dxa"/>
-            <w:tcBorders/>
-            <w:shd w:color="auto" w:fill="FFFFFF" w:val="clear"/>
-            <w:tcMar>
-              <w:start w:w="56" w:type="dxa"/>
-              <w:end w:w="56" w:type="dxa"/>
-            </w:tcMar>
-          </w:tcPr>
-          <w:p>
-            <w:pPr>
-              <w:pStyle w:val="normal1"/>
-              <w:suppressAutoHyphens w:val="true"/>
-              <w:spacing w:before="40" w:after="0"/>
-              <w:jc w:val="start"/>
-              <w:rPr>
-                <w:rFonts w:ascii="Calibri" w:hAnsi="Calibri" w:eastAsia="Calibri" w:cs="Calibri"/>
-                <w:kern w:val="0"/>
-                <w:sz w:val="22"/>
-                <w:szCs w:val="22"/>
-                <w:lang w:val="en-US" w:eastAsia="zh-CN" w:bidi="hi-IN"/>
-              </w:rPr>
-            </w:pPr>
-            <w:r>
-              <w:rPr>
-                <w:rFonts w:eastAsia="Open Sans" w:cs="Open Sans" w:ascii="Open Sans" w:hAnsi="Open Sans"/>
-                <w:color w:val="070707"/>
-                <w:kern w:val="0"/>
-                <w:sz w:val="20"/>
-                <w:szCs w:val="20"/>
-                <w:lang w:val="en-US" w:eastAsia="zh-CN" w:bidi="hi-IN"/>
-              </w:rPr>
-              <w:t>1 Stk</w:t>
-            </w:r>
-          </w:p>
-        </w:tc>
-        <w:tc>
-          <w:tcPr>
-            <w:tcW w:w="4423" w:type="dxa"/>
-            <w:tcBorders/>
-            <w:shd w:color="auto" w:fill="FFFFFF" w:val="clear"/>
-            <w:tcMar>
-              <w:start w:w="56" w:type="dxa"/>
-              <w:end w:w="56" w:type="dxa"/>
-            </w:tcMar>
-          </w:tcPr>
-          <w:p>
-            <w:pPr>
-              <w:pStyle w:val="normal1"/>
-              <w:suppressAutoHyphens w:val="true"/>
-              <w:spacing w:lineRule="auto" w:line="278" w:before="40" w:after="0"/>
-              <w:ind w:end="314"/>
-              <w:jc w:val="start"/>
-              <w:rPr>
-                <w:color w:val="000000"/>
-              </w:rPr>
-            </w:pPr>
-            <w:r>
-              <w:rPr>
-                <w:rFonts w:eastAsia="Arimo" w:cs="Arimo" w:ascii="Arimo" w:hAnsi="Arimo"/>
-                <w:b/>
-                <w:color w:val="000000"/>
-                <w:kern w:val="0"/>
-                <w:sz w:val="20"/>
-                <w:szCs w:val="20"/>
-                <w:lang w:val="en-US" w:eastAsia="zh-CN" w:bidi="hi-IN"/>
-              </w:rPr>
-              <w:t>Auszuführende Arbeiten</w:t>
-            </w:r>
-          </w:p>
-        </w:tc>
-        <w:tc>
-          <w:tcPr>
-            <w:tcW w:w="2327" w:type="dxa"/>
-            <w:tcBorders/>
-            <w:shd w:color="auto" w:fill="FFFFFF" w:val="clear"/>
-            <w:tcMar>
-              <w:start w:w="56" w:type="dxa"/>
-              <w:end w:w="56" w:type="dxa"/>
-            </w:tcMar>
-          </w:tcPr>
-          <w:p>
-            <w:pPr>
-              <w:pStyle w:val="normal1"/>
-              <w:suppressAutoHyphens w:val="true"/>
-              <w:spacing w:lineRule="auto" w:line="278" w:before="40" w:after="0"/>
-              <w:ind w:end="314"/>
-              <w:jc w:val="center"/>
-              <w:rPr>
-                <w:color w:val="000000"/>
-              </w:rPr>
-            </w:pPr>
-            <w:r>
-              <w:rPr>
-                <w:rFonts w:eastAsia="Open Sans" w:cs="Open Sans" w:ascii="Open Sans" w:hAnsi="Open Sans"/>
-                <w:color w:val="000000"/>
-                <w:kern w:val="0"/>
-                <w:sz w:val="20"/>
-                <w:szCs w:val="20"/>
-                <w:lang w:val="en-US" w:eastAsia="zh-CN" w:bidi="hi-IN"/>
-              </w:rPr>
-              <w:t xml:space="preserve">1.065,00 €</w:t>
-            </w:r>
-          </w:p>
-        </w:tc>
-        <w:tc>
-          <w:tcPr>
-            <w:tcW w:w="1485" w:type="dxa"/>
-            <w:tcBorders/>
-            <w:shd w:color="auto" w:fill="FFFFFF" w:val="clear"/>
-            <w:tcMar>
-              <w:start w:w="56" w:type="dxa"/>
-              <w:end w:w="56" w:type="dxa"/>
-            </w:tcMar>
-          </w:tcPr>
-          <w:p>
-            <w:pPr>
-              <w:pStyle w:val="normal1"/>
-              <w:suppressAutoHyphens w:val="true"/>
-              <w:spacing w:lineRule="auto" w:line="278" w:before="40" w:after="0"/>
-              <w:ind w:start="-141" w:end="314"/>
-              <w:jc w:val="center"/>
-              <w:rPr>
-                <w:color w:val="000000"/>
-              </w:rPr>
-            </w:pPr>
-            <w:r>
-              <w:rPr>
-                <w:rFonts w:eastAsia="Open Sans" w:cs="Open Sans" w:ascii="Open Sans" w:hAnsi="Open Sans"/>
-                <w:color w:val="000000"/>
-                <w:kern w:val="0"/>
-                <w:sz w:val="20"/>
-                <w:szCs w:val="20"/>
-                <w:lang w:val="en-US" w:eastAsia="zh-CN" w:bidi="hi-IN"/>
-              </w:rPr>
-              <w:t xml:space="preserve">1.065,00 €</w:t>
-            </w:r>
-          </w:p>
-        </w:tc>
-      </w:tr>
-      <w:tr>
-        <w:trPr>
-          <w:trHeight w:val="1741" w:hRule="atLeast"/>
-        </w:trPr>
-        <w:tc>
-          <w:tcPr>
-            <w:tcW w:w="660" w:type="dxa"/>
+            <w:tcW w:w="630" w:type="dxa"/>
             <w:tcBorders>
+              <w:top w:val="single" w:sz="8" w:space="0" w:color="FFFFFF"/>
               <w:start w:val="single" w:sz="8" w:space="0" w:color="FFFFFF"/>
               <w:bottom w:val="single" w:sz="8" w:space="0" w:color="FFFFFF"/>
               <w:end w:val="single" w:sz="8" w:space="0" w:color="FFFFFF"/>
@@ -1077,54 +920,21 @@
           <w:p>
             <w:pPr>
               <w:pStyle w:val="normal1"/>
-              <w:tabs>
-                <w:tab w:val="clear" w:pos="720"/>
-                <w:tab w:val="left" w:pos="750" w:leader="none"/>
-                <w:tab w:val="left" w:pos="1416" w:leader="none"/>
-              </w:tabs>
-              <w:suppressAutoHyphens w:val="true"/>
-              <w:spacing w:before="121" w:after="0"/>
-              <w:jc w:val="start"/>
-              <w:rPr>
-                <w:rFonts w:ascii="Open Sans" w:hAnsi="Open Sans" w:eastAsia="Open Sans" w:cs="Open Sans"/>
+              <w:suppressAutoHyphens w:val="true"/>
+              <w:spacing w:before="0" w:after="0"/>
+              <w:jc w:val="center"/>
+              <w:rPr/>
+            </w:pPr>
+            <w:r>
+              <w:rPr>
+                <w:rFonts w:eastAsia="Calibri" w:cs="Calibri"/>
                 <w:color w:val="070707"/>
-                <w:sz w:val="20"/>
-                <w:szCs w:val="20"/>
-              </w:rPr>
-            </w:pPr>
-            <w:r>
-              <w:rPr>
-                <w:rFonts w:eastAsia="Open Sans" w:cs="Open Sans" w:ascii="Open Sans" w:hAnsi="Open Sans"/>
-                <w:color w:val="070707"/>
-                <w:kern w:val="0"/>
-                <w:sz w:val="20"/>
-                <w:szCs w:val="20"/>
-                <w:lang w:val="en-US" w:eastAsia="zh-CN" w:bidi="hi-IN"/>
-              </w:rPr>
-            </w:r>
-          </w:p>
-          <w:p>
-            <w:pPr>
-              <w:pStyle w:val="normal1"/>
-              <w:suppressAutoHyphens w:val="true"/>
-              <w:spacing w:before="0" w:after="0"/>
-              <w:jc w:val="start"/>
-              <w:rPr>
-                <w:rFonts w:ascii="Calibri" w:hAnsi="Calibri" w:eastAsia="Calibri" w:cs="Calibri"/>
                 <w:kern w:val="0"/>
                 <w:sz w:val="22"/>
                 <w:szCs w:val="22"/>
                 <w:lang w:val="en-US" w:eastAsia="zh-CN" w:bidi="hi-IN"/>
               </w:rPr>
-            </w:pPr>
-            <w:r>
-              <w:rPr>
-                <w:rFonts w:eastAsia="Calibri" w:cs="Calibri"/>
-                <w:kern w:val="0"/>
-                <w:sz w:val="22"/>
-                <w:szCs w:val="22"/>
-                <w:lang w:val="en-US" w:eastAsia="zh-CN" w:bidi="hi-IN"/>
-              </w:rPr>
+              <w:t xml:space="preserve">001</w:t>
             </w:r>
           </w:p>
         </w:tc>
@@ -1132,6 +942,7 @@
           <w:tcPr>
             <w:tcW w:w="885" w:type="dxa"/>
             <w:tcBorders>
+              <w:top w:val="single" w:sz="8" w:space="0" w:color="FFFFFF"/>
               <w:start w:val="single" w:sz="8" w:space="0" w:color="FFFFFF"/>
               <w:bottom w:val="single" w:sz="8" w:space="0" w:color="FFFFFF"/>
               <w:end w:val="single" w:sz="8" w:space="0" w:color="FFFFFF"/>
@@ -1147,27 +958,34 @@
               <w:pStyle w:val="normal1"/>
               <w:suppressAutoHyphens w:val="true"/>
               <w:spacing w:before="0" w:after="0"/>
-              <w:jc w:val="start"/>
-              <w:rPr>
-                <w:color w:val="000000"/>
-              </w:rPr>
-            </w:pPr>
-            <w:r>
-              <w:rPr>
-                <w:rFonts w:eastAsia="Calibri" w:cs="Calibri"/>
-                <w:color w:val="000000"/>
-                <w:kern w:val="0"/>
-                <w:sz w:val="22"/>
-                <w:szCs w:val="22"/>
-                <w:lang w:val="en-US" w:eastAsia="zh-CN" w:bidi="hi-IN"/>
-              </w:rPr>
+              <w:jc w:val="center"/>
+              <w:rPr>
+                <w:rFonts w:ascii="Open Sans" w:hAnsi="Open Sans" w:eastAsia="Open Sans" w:cs="Open Sans"/>
+                <w:color w:val="070707"/>
+                <w:kern w:val="0"/>
+                <w:sz w:val="20"/>
+                <w:szCs w:val="20"/>
+                <w:lang w:val="en-US" w:eastAsia="zh-CN" w:bidi="hi-IN"/>
+              </w:rPr>
+            </w:pPr>
+            <w:r>
+              <w:rPr>
+                <w:rFonts w:eastAsia="Open Sans" w:cs="Open Sans" w:ascii="Open Sans" w:hAnsi="Open Sans"/>
+                <w:color w:val="070707"/>
+                <w:kern w:val="0"/>
+                <w:sz w:val="20"/>
+                <w:szCs w:val="20"/>
+                <w:lang w:val="en-US" w:eastAsia="zh-CN" w:bidi="hi-IN"/>
+              </w:rPr>
+              <w:t xml:space="preserve">1 Stk</w:t>
             </w:r>
           </w:p>
         </w:tc>
         <w:tc>
           <w:tcPr>
-            <w:tcW w:w="4423" w:type="dxa"/>
+            <w:tcW w:w="4425" w:type="dxa"/>
             <w:tcBorders>
+              <w:top w:val="single" w:sz="8" w:space="0" w:color="FFFFFF"/>
               <w:start w:val="single" w:sz="8" w:space="0" w:color="FFFFFF"/>
               <w:bottom w:val="single" w:sz="8" w:space="0" w:color="FFFFFF"/>
               <w:end w:val="single" w:sz="8" w:space="0" w:color="FFFFFF"/>
@@ -1180,73 +998,109 @@
           </w:tcPr>
           <w:p>
             <w:pPr>
-              <w:pStyle w:val="normal1"/>
+              <w:pStyle w:val="BodyText"/>
               <w:suppressAutoHyphens w:val="true"/>
               <w:spacing w:lineRule="auto" w:line="278" w:before="0" w:after="0"/>
               <w:ind w:end="314"/>
               <w:jc w:val="start"/>
               <w:rPr>
                 <w:color w:val="000000"/>
+              </w:rPr>
+            </w:pPr>
+            <w:r>
+              <w:rPr>
+                <w:rFonts w:eastAsia="Arimo" w:cs="Arimo" w:ascii="Arimo" w:hAnsi="Arimo"/>
+                <w:b/>
+                <w:bCs/>
+                <w:color w:val="000000"/>
+                <w:kern w:val="0"/>
                 <w:sz w:val="20"/>
                 <w:szCs w:val="20"/>
-              </w:rPr>
-            </w:pPr>
-            <w:r>
-              <w:rPr>
-                <w:rFonts w:eastAsia="Open Sans" w:cs="Open Sans" w:ascii="Open Sans" w:hAnsi="Open Sans"/>
+                <w:lang w:val="en-US" w:eastAsia="zh-CN" w:bidi="hi-IN"/>
+              </w:rPr>
+              <w:t xml:space="preserve">Liefern und Montieren einer Badewannentür</w:t>
+            </w:r>
+            <w:r>
+              <w:rPr>
+                <w:rFonts w:eastAsia="Arimo" w:cs="Arimo" w:ascii="Arimo" w:hAnsi="Arimo"/>
+                <w:b/>
+                <w:bCs w:val="false"/>
                 <w:color w:val="000000"/>
                 <w:kern w:val="0"/>
                 <w:sz w:val="20"/>
                 <w:szCs w:val="20"/>
                 <w:lang w:val="en-US" w:eastAsia="zh-CN" w:bidi="hi-IN"/>
               </w:rPr>
-              <w:t xml:space="preserve">- Anbringen zusätzlicher Haltegriffe</w:t>
-            </w:r>
-          </w:p>
-          <w:p>
-            <w:pPr>
-              <w:pStyle w:val="normal1"/>
+              <w:br/>
+            </w:r>
+            <w:r>
+              <w:rPr>
+                <w:rFonts w:eastAsia="Arimo" w:cs="Arimo" w:ascii="Arimo" w:hAnsi="Arimo"/>
+                <w:b w:val="false"/>
+                <w:bCs w:val="false"/>
+                <w:color w:val="000000"/>
+                <w:kern w:val="0"/>
+                <w:sz w:val="20"/>
+                <w:szCs w:val="20"/>
+                <w:lang w:val="en-US" w:eastAsia="zh-CN" w:bidi="hi-IN"/>
+              </w:rPr>
+              <w:t xml:space="preserve">• Liefern und Montieren einer Badewannentür (Universal/Standard) Höhe 40 cm, Breite 40,5 cm</w:t>
+              <w:br/>
+              <w:t xml:space="preserve">• inkl. dazugehörige Materialien</w:t>
+              <w:br/>
+              <w:t xml:space="preserve">• inkl. An- &amp; Abfahrten / Dieselzuschlag</w:t>
+              <w:br/>
+              <w:t xml:space="preserve">• inkl. Bereitstellung Maschinen / Werkzeug</w:t>
+              <w:br/>
+              <w:t xml:space="preserve">• inkl. Vorhaltung und Beräumung der Baustelle</w:t>
+              <w:br/>
+              <w:t xml:space="preserve">• inkl. Lieferkosten</w:t>
+            </w:r>
+          </w:p>
+          <w:p>
+            <w:pPr>
+              <w:pStyle w:val="BodyText"/>
               <w:suppressAutoHyphens w:val="true"/>
               <w:spacing w:lineRule="auto" w:line="278" w:before="0" w:after="0"/>
               <w:ind w:end="314"/>
               <w:jc w:val="start"/>
               <w:rPr>
                 <w:color w:val="000000"/>
+              </w:rPr>
+            </w:pPr>
+            <w:r>
+              <w:rPr>
+                <w:rFonts w:eastAsia="Arimo" w:cs="Arimo" w:ascii="Arimo" w:hAnsi="Arimo"/>
+                <w:b/>
+                <w:bCs w:val="false"/>
+                <w:color w:val="000000"/>
+                <w:kern w:val="0"/>
                 <w:sz w:val="20"/>
                 <w:szCs w:val="20"/>
-              </w:rPr>
-            </w:pPr>
-            <w:r>
-              <w:rPr>
-                <w:rFonts w:eastAsia="Calibri" w:cs="Calibri"/>
-                <w:color w:val="000000"/>
-                <w:kern w:val="0"/>
-                <w:sz w:val="20"/>
-                <w:szCs w:val="20"/>
-                <w:lang w:val="en-US" w:eastAsia="zh-CN" w:bidi="hi-IN"/>
-              </w:rPr>
-            </w:r>
-          </w:p>
-          <w:p>
-            <w:pPr>
-              <w:pStyle w:val="normal1"/>
+                <w:lang w:val="en-US" w:eastAsia="zh-CN" w:bidi="hi-IN"/>
+              </w:rPr>
+            </w:r>
+          </w:p>
+          <w:p>
+            <w:pPr>
+              <w:pStyle w:val="BodyText"/>
               <w:suppressAutoHyphens w:val="true"/>
               <w:spacing w:lineRule="auto" w:line="278" w:before="0" w:after="0"/>
               <w:ind w:end="314"/>
               <w:jc w:val="start"/>
               <w:rPr>
                 <w:color w:val="000000"/>
+              </w:rPr>
+            </w:pPr>
+            <w:r>
+              <w:rPr>
+                <w:rFonts w:eastAsia="Arimo" w:cs="Arimo" w:ascii="Arimo" w:hAnsi="Arimo"/>
+                <w:b/>
+                <w:bCs w:val="false"/>
+                <w:color w:val="000000"/>
+                <w:kern w:val="0"/>
                 <w:sz w:val="20"/>
                 <w:szCs w:val="20"/>
-              </w:rPr>
-            </w:pPr>
-            <w:r>
-              <w:rPr>
-                <w:rFonts w:eastAsia="Open Sans" w:cs="Open Sans" w:ascii="Open Sans" w:hAnsi="Open Sans"/>
-                <w:color w:val="000000"/>
-                <w:kern w:val="0"/>
-                <w:sz w:val="20"/>
-                <w:szCs w:val="20"/>
                 <w:lang w:val="en-US" w:eastAsia="zh-CN" w:bidi="hi-IN"/>
               </w:rPr>
               <w:t xml:space="preserve">Enthält je Einheit</w:t>
@@ -1254,84 +1108,193 @@
           </w:p>
           <w:p>
             <w:pPr>
-              <w:pStyle w:val="normal1"/>
+              <w:pStyle w:val="BodyText"/>
               <w:suppressAutoHyphens w:val="true"/>
               <w:spacing w:lineRule="auto" w:line="278" w:before="0" w:after="0"/>
               <w:ind w:end="314"/>
               <w:jc w:val="start"/>
               <w:rPr>
-                <w:color w:val="000000"/>
+                <w:rFonts w:ascii="Arimo" w:hAnsi="Arimo" w:eastAsia="Arimo" w:cs="Arimo"/>
+                <w:b w:val="false"/>
+                <w:bCs w:val="false"/>
+                <w:color w:val="000000"/>
+                <w:kern w:val="0"/>
                 <w:sz w:val="20"/>
                 <w:szCs w:val="20"/>
-              </w:rPr>
-            </w:pPr>
-            <w:r>
-              <w:rPr>
-                <w:rFonts w:eastAsia="Open Sans" w:cs="Open Sans" w:ascii="Open Sans" w:hAnsi="Open Sans"/>
+                <w:lang w:val="en-US" w:eastAsia="zh-CN" w:bidi="hi-IN"/>
+              </w:rPr>
+            </w:pPr>
+            <w:r>
+              <w:rPr>
+                <w:rFonts w:eastAsia="Arimo" w:cs="Arimo" w:ascii="Arimo" w:hAnsi="Arimo"/>
+                <w:b w:val="false"/>
+                <w:bCs w:val="false"/>
                 <w:color w:val="000000"/>
                 <w:kern w:val="0"/>
                 <w:sz w:val="20"/>
                 <w:szCs w:val="20"/>
                 <w:lang w:val="en-US" w:eastAsia="zh-CN" w:bidi="hi-IN"/>
               </w:rPr>
-              <w:t xml:space="preserve">- 1,00 Stk Fahrzeugbereitstellung</w:t>
-            </w:r>
-          </w:p>
-          <w:p>
-            <w:pPr>
-              <w:pStyle w:val="normal1"/>
+              <w:t xml:space="preserve">- 202,00 km Kilometerpauschale</w:t>
+            </w:r>
+          </w:p>
+          <w:p>
+            <w:pPr>
+              <w:pStyle w:val="BodyText"/>
               <w:suppressAutoHyphens w:val="true"/>
               <w:spacing w:lineRule="auto" w:line="278" w:before="0" w:after="0"/>
               <w:ind w:end="314"/>
               <w:jc w:val="start"/>
-              <w:rPr>
-                <w:color w:val="000000"/>
+              <w:rPr/>
+            </w:pPr>
+            <w:r>
+              <w:rPr>
+                <w:rFonts w:eastAsia="Arimo" w:cs="Arimo" w:ascii="Arimo" w:hAnsi="Arimo"/>
+                <w:b w:val="false"/>
+                <w:bCs w:val="false"/>
+                <w:color w:val="000000"/>
+                <w:kern w:val="0"/>
                 <w:sz w:val="20"/>
                 <w:szCs w:val="20"/>
-              </w:rPr>
-            </w:pPr>
-            <w:r>
-              <w:rPr>
-                <w:rFonts w:eastAsia="Open Sans" w:cs="Open Sans" w:ascii="Open Sans" w:hAnsi="Open Sans"/>
+                <w:lang w:val="en-US" w:eastAsia="zh-CN" w:bidi="hi-IN"/>
+              </w:rPr>
+              <w:t xml:space="preserve">- </w:t>
+            </w:r>
+            <w:r>
+              <w:rPr/>
+              <w:t xml:space="preserve">1,00</w:t>
+            </w:r>
+            <w:r>
+              <w:rPr>
+                <w:rFonts w:eastAsia="Arimo" w:cs="Arimo" w:ascii="Arimo" w:hAnsi="Arimo"/>
+                <w:b w:val="false"/>
+                <w:bCs w:val="false"/>
                 <w:color w:val="000000"/>
                 <w:kern w:val="0"/>
                 <w:sz w:val="20"/>
                 <w:szCs w:val="20"/>
                 <w:lang w:val="en-US" w:eastAsia="zh-CN" w:bidi="hi-IN"/>
               </w:rPr>
-              <w:t xml:space="preserve">- 1,00 Stk Bereitstellung und Vorhaltung von Maschinen &amp; Werkzeugen</w:t>
-            </w:r>
-          </w:p>
-          <w:p>
-            <w:pPr>
-              <w:pStyle w:val="normal1"/>
+              <w:t xml:space="preserve"> Stk Lieferkosten Badewannentür</w:t>
+            </w:r>
+          </w:p>
+          <w:p>
+            <w:pPr>
+              <w:pStyle w:val="BodyText"/>
               <w:suppressAutoHyphens w:val="true"/>
               <w:spacing w:lineRule="auto" w:line="278" w:before="0" w:after="0"/>
               <w:ind w:end="314"/>
               <w:jc w:val="start"/>
-              <w:rPr>
-                <w:color w:val="000000"/>
+              <w:rPr/>
+            </w:pPr>
+            <w:r>
+              <w:rPr>
+                <w:rFonts w:eastAsia="Arimo" w:cs="Arimo" w:ascii="Arimo" w:hAnsi="Arimo"/>
+                <w:b w:val="false"/>
+                <w:bCs w:val="false"/>
+                <w:color w:val="000000"/>
+                <w:kern w:val="0"/>
                 <w:sz w:val="20"/>
                 <w:szCs w:val="20"/>
-              </w:rPr>
-            </w:pPr>
-            <w:r>
-              <w:rPr>
-                <w:rFonts w:eastAsia="Open Sans" w:cs="Open Sans" w:ascii="Open Sans" w:hAnsi="Open Sans"/>
+                <w:lang w:val="en-US" w:eastAsia="zh-CN" w:bidi="hi-IN"/>
+              </w:rPr>
+              <w:t xml:space="preserve">- </w:t>
+            </w:r>
+            <w:r>
+              <w:rPr/>
+              <w:t xml:space="preserve">1,00</w:t>
+            </w:r>
+            <w:r>
+              <w:rPr>
+                <w:rFonts w:eastAsia="Arimo" w:cs="Arimo" w:ascii="Arimo" w:hAnsi="Arimo"/>
+                <w:b w:val="false"/>
+                <w:bCs w:val="false"/>
                 <w:color w:val="000000"/>
                 <w:kern w:val="0"/>
                 <w:sz w:val="20"/>
                 <w:szCs w:val="20"/>
                 <w:lang w:val="en-US" w:eastAsia="zh-CN" w:bidi="hi-IN"/>
               </w:rPr>
-              <w:t xml:space="preserve">- 1,00 Stk Beräumung der Baustelle</w:t>
+              <w:t xml:space="preserve"> Stk Universal / Standard Tür</w:t>
+            </w:r>
+          </w:p>
+          <w:p>
+            <w:pPr>
+              <w:pStyle w:val="BodyText"/>
+              <w:suppressAutoHyphens w:val="true"/>
+              <w:spacing w:lineRule="auto" w:line="278" w:before="0" w:after="0"/>
+              <w:ind w:end="314"/>
+              <w:jc w:val="start"/>
+              <w:rPr/>
+            </w:pPr>
+            <w:r>
+              <w:rPr>
+                <w:rFonts w:eastAsia="Arimo" w:cs="Arimo" w:ascii="Arimo" w:hAnsi="Arimo"/>
+                <w:b w:val="false"/>
+                <w:bCs w:val="false"/>
+                <w:color w:val="000000"/>
+                <w:kern w:val="0"/>
+                <w:sz w:val="20"/>
+                <w:szCs w:val="20"/>
+                <w:lang w:val="en-US" w:eastAsia="zh-CN" w:bidi="hi-IN"/>
+              </w:rPr>
+              <w:t xml:space="preserve">- </w:t>
+            </w:r>
+            <w:r>
+              <w:rPr/>
+              <w:t xml:space="preserve">1,00</w:t>
+            </w:r>
+            <w:r>
+              <w:rPr>
+                <w:rFonts w:eastAsia="Arimo" w:cs="Arimo" w:ascii="Arimo" w:hAnsi="Arimo"/>
+                <w:b w:val="false"/>
+                <w:bCs w:val="false"/>
+                <w:color w:val="000000"/>
+                <w:kern w:val="0"/>
+                <w:sz w:val="20"/>
+                <w:szCs w:val="20"/>
+                <w:lang w:val="en-US" w:eastAsia="zh-CN" w:bidi="hi-IN"/>
+              </w:rPr>
+              <w:t xml:space="preserve"> Stk Kleinmaterial</w:t>
+            </w:r>
+          </w:p>
+          <w:p>
+            <w:pPr>
+              <w:pStyle w:val="BodyText"/>
+              <w:suppressAutoHyphens w:val="true"/>
+              <w:spacing w:lineRule="auto" w:line="278" w:before="0" w:after="0"/>
+              <w:ind w:end="314"/>
+              <w:jc w:val="start"/>
+              <w:rPr>
+                <w:rFonts w:ascii="Arimo" w:hAnsi="Arimo" w:eastAsia="Arimo" w:cs="Arimo"/>
+                <w:b w:val="false"/>
+                <w:bCs w:val="false"/>
+                <w:color w:val="000000"/>
+                <w:kern w:val="0"/>
+                <w:sz w:val="20"/>
+                <w:szCs w:val="20"/>
+                <w:lang w:val="en-US" w:eastAsia="zh-CN" w:bidi="hi-IN"/>
+              </w:rPr>
+            </w:pPr>
+            <w:r>
+              <w:rPr>
+                <w:rFonts w:eastAsia="Arimo" w:cs="Arimo" w:ascii="Arimo" w:hAnsi="Arimo"/>
+                <w:b w:val="false"/>
+                <w:bCs w:val="false"/>
+                <w:color w:val="000000"/>
+                <w:kern w:val="0"/>
+                <w:sz w:val="20"/>
+                <w:szCs w:val="20"/>
+                <w:lang w:val="en-US" w:eastAsia="zh-CN" w:bidi="hi-IN"/>
+              </w:rPr>
             </w:r>
           </w:p>
         </w:tc>
         <w:tc>
           <w:tcPr>
-            <w:tcW w:w="2327" w:type="dxa"/>
+            <w:tcW w:w="2325" w:type="dxa"/>
             <w:tcBorders>
+              <w:top w:val="single" w:sz="8" w:space="0" w:color="FFFFFF"/>
               <w:start w:val="single" w:sz="8" w:space="0" w:color="FFFFFF"/>
               <w:bottom w:val="single" w:sz="8" w:space="0" w:color="FFFFFF"/>
               <w:end w:val="single" w:sz="8" w:space="0" w:color="FFFFFF"/>
@@ -1348,27 +1311,29 @@
               <w:suppressAutoHyphens w:val="true"/>
               <w:spacing w:lineRule="auto" w:line="278" w:before="0" w:after="0"/>
               <w:ind w:end="314"/>
-              <w:jc w:val="end"/>
-              <w:rPr>
-                <w:color w:val="000000"/>
-              </w:rPr>
-            </w:pPr>
-            <w:r>
-              <w:rPr>
-                <w:rFonts w:eastAsia="Calibri" w:cs="Calibri"/>
-                <w:color w:val="000000"/>
-                <w:kern w:val="0"/>
-                <w:sz w:val="22"/>
-                <w:szCs w:val="22"/>
-                <w:lang w:val="en-US" w:eastAsia="zh-CN" w:bidi="hi-IN"/>
-              </w:rPr>
+              <w:jc w:val="center"/>
+              <w:rPr>
+                <w:color w:val="000000"/>
+              </w:rPr>
+            </w:pPr>
+            <w:r>
+              <w:rPr>
+                <w:rFonts w:eastAsia="Open Sans" w:cs="Open Sans" w:ascii="Open Sans" w:hAnsi="Open Sans"/>
+                <w:color w:val="000000"/>
+                <w:kern w:val="0"/>
+                <w:sz w:val="20"/>
+                <w:szCs w:val="20"/>
+                <w:lang w:val="en-US" w:eastAsia="zh-CN" w:bidi="hi-IN"/>
+              </w:rPr>
+              <w:t xml:space="preserve">2.980,67 €</w:t>
             </w:r>
           </w:p>
         </w:tc>
         <w:tc>
           <w:tcPr>
-            <w:tcW w:w="1485" w:type="dxa"/>
+            <w:tcW w:w="1481" w:type="dxa"/>
             <w:tcBorders>
+              <w:top w:val="single" w:sz="8" w:space="0" w:color="FFFFFF"/>
               <w:start w:val="single" w:sz="8" w:space="0" w:color="FFFFFF"/>
               <w:bottom w:val="single" w:sz="8" w:space="0" w:color="FFFFFF"/>
               <w:end w:val="single" w:sz="8" w:space="0" w:color="FFFFFF"/>
@@ -1378,28 +1343,28 @@
               <w:start w:w="56" w:type="dxa"/>
               <w:end w:w="56" w:type="dxa"/>
             </w:tcMar>
-            <w:vAlign w:val="center"/>
           </w:tcPr>
           <w:p>
             <w:pPr>
               <w:pStyle w:val="normal1"/>
               <w:suppressAutoHyphens w:val="true"/>
               <w:spacing w:lineRule="auto" w:line="278" w:before="0" w:after="0"/>
-              <w:ind w:end="314"/>
-              <w:jc w:val="start"/>
-              <w:rPr>
-                <w:color w:val="000000"/>
-              </w:rPr>
-            </w:pPr>
-            <w:r>
-              <w:rPr>
-                <w:rFonts w:eastAsia="Calibri" w:cs="Calibri"/>
-                <w:color w:val="000000"/>
-                <w:kern w:val="0"/>
-                <w:sz w:val="22"/>
-                <w:szCs w:val="22"/>
-                <w:lang w:val="en-US" w:eastAsia="zh-CN" w:bidi="hi-IN"/>
-              </w:rPr>
+              <w:ind w:start="-141" w:end="314"/>
+              <w:jc w:val="center"/>
+              <w:rPr>
+                <w:color w:val="000000"/>
+              </w:rPr>
+            </w:pPr>
+            <w:r>
+              <w:rPr>
+                <w:rFonts w:eastAsia="Open Sans" w:cs="Open Sans" w:ascii="Open Sans" w:hAnsi="Open Sans"/>
+                <w:color w:val="000000"/>
+                <w:kern w:val="0"/>
+                <w:sz w:val="20"/>
+                <w:szCs w:val="20"/>
+                <w:lang w:val="en-US" w:eastAsia="zh-CN" w:bidi="hi-IN"/>
+              </w:rPr>
+              <w:t xml:space="preserve">2.980,67 €</w:t>
             </w:r>
           </w:p>
         </w:tc>
@@ -1430,789 +1395,6 @@
         </w:rPr>
       </w:r>
     </w:p>
-    <w:tbl>
-      <w:tblPr>
-        <w:tblStyle w:val="TableNormal"/>
-        <w:tblW w:w="10050" w:type="dxa"/>
-        <w:jc w:val="start"/>
-        <w:tblInd w:w="1" w:type="dxa"/>
-        <w:tblLayout w:type="fixed"/>
-        <w:tblCellMar>
-          <w:top w:w="0" w:type="dxa"/>
-          <w:start w:w="56" w:type="dxa"/>
-          <w:bottom w:w="0" w:type="dxa"/>
-          <w:end w:w="56" w:type="dxa"/>
-        </w:tblCellMar>
-        <w:tblLook w:firstRow="0" w:noVBand="0" w:lastRow="0" w:firstColumn="0" w:lastColumn="0" w:noHBand="0" w:val="0000"/>
-      </w:tblPr>
-      <w:tblGrid>
-        <w:gridCol w:w="675"/>
-        <w:gridCol w:w="883"/>
-        <w:gridCol w:w="4410"/>
-        <w:gridCol w:w="2327"/>
-        <w:gridCol w:w="1755"/>
-      </w:tblGrid>
-      <w:tr>
-        <w:trPr>
-          <w:trHeight w:val="379" w:hRule="atLeast"/>
-        </w:trPr>
-        <w:tc>
-          <w:tcPr>
-            <w:tcW w:w="675" w:type="dxa"/>
-            <w:tcBorders/>
-            <w:shd w:color="auto" w:fill="FFFFFF" w:val="clear"/>
-          </w:tcPr>
-          <w:p>
-            <w:pPr>
-              <w:pStyle w:val="normal1"/>
-              <w:suppressAutoHyphens w:val="true"/>
-              <w:spacing w:before="0" w:after="0"/>
-              <w:jc w:val="start"/>
-              <w:rPr>
-                <w:rFonts w:ascii="Calibri" w:hAnsi="Calibri" w:eastAsia="Calibri" w:cs="Calibri"/>
-                <w:kern w:val="0"/>
-                <w:sz w:val="22"/>
-                <w:szCs w:val="22"/>
-                <w:lang w:val="en-US" w:eastAsia="zh-CN" w:bidi="hi-IN"/>
-              </w:rPr>
-            </w:pPr>
-            <w:r>
-              <w:rPr>
-                <w:rFonts w:eastAsia="Open Sans" w:cs="Open Sans" w:ascii="Open Sans" w:hAnsi="Open Sans"/>
-                <w:color w:val="070707"/>
-                <w:kern w:val="0"/>
-                <w:sz w:val="20"/>
-                <w:szCs w:val="20"/>
-                <w:lang w:val="en-US" w:eastAsia="zh-CN" w:bidi="hi-IN"/>
-              </w:rPr>
-              <w:t>002</w:t>
-            </w:r>
-          </w:p>
-        </w:tc>
-        <w:tc>
-          <w:tcPr>
-            <w:tcW w:w="883" w:type="dxa"/>
-            <w:tcBorders/>
-            <w:shd w:color="auto" w:fill="FFFFFF" w:val="clear"/>
-          </w:tcPr>
-          <w:p>
-            <w:pPr>
-              <w:pStyle w:val="normal1"/>
-              <w:suppressAutoHyphens w:val="true"/>
-              <w:spacing w:before="0" w:after="0"/>
-              <w:jc w:val="start"/>
-              <w:rPr>
-                <w:rFonts w:ascii="Calibri" w:hAnsi="Calibri" w:eastAsia="Calibri" w:cs="Calibri"/>
-                <w:kern w:val="0"/>
-                <w:sz w:val="22"/>
-                <w:szCs w:val="22"/>
-                <w:lang w:val="en-US" w:eastAsia="zh-CN" w:bidi="hi-IN"/>
-              </w:rPr>
-            </w:pPr>
-            <w:r>
-              <w:rPr>
-                <w:rFonts w:eastAsia="Open Sans" w:cs="Open Sans" w:ascii="Open Sans" w:hAnsi="Open Sans"/>
-                <w:color w:val="070707"/>
-                <w:kern w:val="0"/>
-                <w:sz w:val="20"/>
-                <w:szCs w:val="20"/>
-                <w:lang w:val="en-US" w:eastAsia="zh-CN" w:bidi="hi-IN"/>
-              </w:rPr>
-              <w:t>1 Stk</w:t>
-            </w:r>
-          </w:p>
-        </w:tc>
-        <w:tc>
-          <w:tcPr>
-            <w:tcW w:w="4410" w:type="dxa"/>
-            <w:tcBorders/>
-            <w:shd w:color="auto" w:fill="FFFFFF" w:val="clear"/>
-          </w:tcPr>
-          <w:p>
-            <w:pPr>
-              <w:pStyle w:val="normal1"/>
-              <w:suppressAutoHyphens w:val="true"/>
-              <w:spacing w:lineRule="auto" w:line="278" w:before="0" w:after="0"/>
-              <w:ind w:end="314"/>
-              <w:jc w:val="start"/>
-              <w:rPr>
-                <w:color w:val="000000"/>
-              </w:rPr>
-            </w:pPr>
-            <w:r>
-              <w:rPr>
-                <w:rFonts w:eastAsia="Arimo" w:cs="Arimo" w:ascii="Arimo" w:hAnsi="Arimo"/>
-                <w:b/>
-                <w:color w:val="000000"/>
-                <w:kern w:val="0"/>
-                <w:sz w:val="20"/>
-                <w:szCs w:val="20"/>
-                <w:lang w:val="en-US" w:eastAsia="zh-CN" w:bidi="hi-IN"/>
-              </w:rPr>
-              <w:t>Material für Badumbau</w:t>
-            </w:r>
-          </w:p>
-        </w:tc>
-        <w:tc>
-          <w:tcPr>
-            <w:tcW w:w="2327" w:type="dxa"/>
-            <w:tcBorders/>
-            <w:shd w:color="auto" w:fill="FFFFFF" w:val="clear"/>
-          </w:tcPr>
-          <w:p>
-            <w:pPr>
-              <w:pStyle w:val="normal1"/>
-              <w:suppressAutoHyphens w:val="true"/>
-              <w:spacing w:lineRule="auto" w:line="278" w:before="0" w:after="0"/>
-              <w:ind w:end="314"/>
-              <w:jc w:val="center"/>
-              <w:rPr>
-                <w:color w:val="000000"/>
-              </w:rPr>
-            </w:pPr>
-            <w:r>
-              <w:rPr>
-                <w:rFonts w:eastAsia="Open Sans" w:cs="Open Sans" w:ascii="Open Sans" w:hAnsi="Open Sans"/>
-                <w:color w:val="000000"/>
-                <w:kern w:val="0"/>
-                <w:sz w:val="20"/>
-                <w:szCs w:val="20"/>
-                <w:lang w:val="en-US" w:eastAsia="zh-CN" w:bidi="hi-IN"/>
-              </w:rPr>
-              <w:t xml:space="preserve">1.937,03 €</w:t>
-            </w:r>
-          </w:p>
-        </w:tc>
-        <w:tc>
-          <w:tcPr>
-            <w:tcW w:w="1755" w:type="dxa"/>
-            <w:tcBorders/>
-            <w:shd w:color="auto" w:fill="FFFFFF" w:val="clear"/>
-            <w:tcMar>
-              <w:start w:w="0" w:type="dxa"/>
-              <w:end w:w="0" w:type="dxa"/>
-            </w:tcMar>
-          </w:tcPr>
-          <w:p>
-            <w:pPr>
-              <w:pStyle w:val="normal1"/>
-              <w:suppressAutoHyphens w:val="true"/>
-              <w:spacing w:before="0" w:after="0"/>
-              <w:jc w:val="center"/>
-              <w:rPr>
-                <w:rFonts w:ascii="Calibri" w:hAnsi="Calibri" w:eastAsia="Calibri" w:cs="Calibri"/>
-                <w:kern w:val="0"/>
-                <w:sz w:val="22"/>
-                <w:szCs w:val="22"/>
-                <w:lang w:val="en-US" w:eastAsia="zh-CN" w:bidi="hi-IN"/>
-              </w:rPr>
-            </w:pPr>
-            <w:r>
-              <w:rPr>
-                <w:rFonts w:eastAsia="Calibri" w:cs="Calibri"/>
-                <w:kern w:val="0"/>
-                <w:sz w:val="22"/>
-                <w:szCs w:val="22"/>
-                <w:lang w:val="en-US" w:eastAsia="zh-CN" w:bidi="hi-IN"/>
-              </w:rPr>
-              <w:t xml:space="preserve">1.937,03 €</w:t>
-            </w:r>
-          </w:p>
-        </w:tc>
-      </w:tr>
-      <w:tr>
-        <w:trPr>
-          <w:trHeight w:val="1" w:hRule="atLeast"/>
-        </w:trPr>
-        <w:tc>
-          <w:tcPr>
-            <w:tcW w:w="675" w:type="dxa"/>
-            <w:tcBorders/>
-            <w:shd w:color="auto" w:fill="FFFFFF" w:val="clear"/>
-          </w:tcPr>
-          <w:p>
-            <w:pPr>
-              <w:pStyle w:val="normal1"/>
-              <w:suppressAutoHyphens w:val="true"/>
-              <w:spacing w:before="0" w:after="0"/>
-              <w:jc w:val="start"/>
-              <w:rPr>
-                <w:color w:val="000000"/>
-              </w:rPr>
-            </w:pPr>
-            <w:r>
-              <w:rPr>
-                <w:rFonts w:eastAsia="Calibri" w:cs="Calibri"/>
-                <w:color w:val="000000"/>
-                <w:kern w:val="0"/>
-                <w:sz w:val="22"/>
-                <w:szCs w:val="22"/>
-                <w:lang w:val="en-US" w:eastAsia="zh-CN" w:bidi="hi-IN"/>
-              </w:rPr>
-            </w:r>
-          </w:p>
-        </w:tc>
-        <w:tc>
-          <w:tcPr>
-            <w:tcW w:w="883" w:type="dxa"/>
-            <w:tcBorders/>
-            <w:shd w:color="auto" w:fill="FFFFFF" w:val="clear"/>
-          </w:tcPr>
-          <w:p>
-            <w:pPr>
-              <w:pStyle w:val="normal1"/>
-              <w:suppressAutoHyphens w:val="true"/>
-              <w:spacing w:before="0" w:after="0"/>
-              <w:jc w:val="start"/>
-              <w:rPr>
-                <w:color w:val="000000"/>
-              </w:rPr>
-            </w:pPr>
-            <w:r>
-              <w:rPr>
-                <w:rFonts w:eastAsia="Calibri" w:cs="Calibri"/>
-                <w:color w:val="000000"/>
-                <w:kern w:val="0"/>
-                <w:sz w:val="22"/>
-                <w:szCs w:val="22"/>
-                <w:lang w:val="en-US" w:eastAsia="zh-CN" w:bidi="hi-IN"/>
-              </w:rPr>
-            </w:r>
-          </w:p>
-        </w:tc>
-        <w:tc>
-          <w:tcPr>
-            <w:tcW w:w="4410" w:type="dxa"/>
-            <w:tcBorders/>
-            <w:shd w:color="auto" w:fill="FFFFFF" w:val="clear"/>
-          </w:tcPr>
-          <w:p>
-            <w:pPr>
-              <w:pStyle w:val="normal1"/>
-              <w:suppressAutoHyphens w:val="true"/>
-              <w:spacing w:lineRule="auto" w:line="278" w:before="0" w:after="0"/>
-              <w:ind w:end="314"/>
-              <w:jc w:val="start"/>
-              <w:rPr>
-                <w:rFonts w:ascii="Open Sans" w:hAnsi="Open Sans" w:eastAsia="Open Sans" w:cs="Open Sans"/>
-                <w:color w:val="000000"/>
-                <w:sz w:val="20"/>
-                <w:szCs w:val="20"/>
-              </w:rPr>
-            </w:pPr>
-            <w:r>
-              <w:rPr>
-                <w:rFonts w:eastAsia="Open Sans" w:cs="Open Sans" w:ascii="Open Sans" w:hAnsi="Open Sans"/>
-                <w:color w:val="000000"/>
-                <w:kern w:val="0"/>
-                <w:sz w:val="20"/>
-                <w:szCs w:val="20"/>
-                <w:lang w:val="en-US" w:eastAsia="zh-CN" w:bidi="hi-IN"/>
-              </w:rPr>
-              <w:t xml:space="preserve">- 1 Stk TRINNITY Wannenabdichtband-Set 3,4 m Nass-/Trockenanbindung entspr. DIN 18534</w:t>
-            </w:r>
-          </w:p>
-          <w:p>
-            <w:pPr>
-              <w:pStyle w:val="normal1"/>
-              <w:suppressAutoHyphens w:val="true"/>
-              <w:spacing w:lineRule="auto" w:line="278" w:before="0" w:after="0"/>
-              <w:ind w:end="314"/>
-              <w:jc w:val="start"/>
-              <w:rPr>
-                <w:rFonts w:ascii="Open Sans" w:hAnsi="Open Sans" w:eastAsia="Open Sans" w:cs="Open Sans"/>
-                <w:color w:val="000000"/>
-                <w:sz w:val="20"/>
-                <w:szCs w:val="20"/>
-              </w:rPr>
-            </w:pPr>
-            <w:r>
-              <w:rPr>
-                <w:rFonts w:eastAsia="Open Sans" w:cs="Open Sans" w:ascii="Open Sans" w:hAnsi="Open Sans"/>
-                <w:color w:val="000000"/>
-                <w:kern w:val="0"/>
-                <w:sz w:val="20"/>
-                <w:szCs w:val="20"/>
-                <w:lang w:val="en-US" w:eastAsia="zh-CN" w:bidi="hi-IN"/>
-              </w:rPr>
-              <w:t xml:space="preserve">- 1 Stk Ablaufgarnitur Rohbauset m.Sifon BH60mm f.flache Duschw.m.90mm Ablauf TRINNITY</w:t>
-            </w:r>
-          </w:p>
-          <w:p>
-            <w:pPr>
-              <w:pStyle w:val="normal1"/>
-              <w:suppressAutoHyphens w:val="true"/>
-              <w:spacing w:lineRule="auto" w:line="278" w:before="0" w:after="0"/>
-              <w:ind w:end="314"/>
-              <w:jc w:val="start"/>
-              <w:rPr>
-                <w:rFonts w:ascii="Open Sans" w:hAnsi="Open Sans" w:eastAsia="Open Sans" w:cs="Open Sans"/>
-                <w:color w:val="000000"/>
-                <w:sz w:val="20"/>
-                <w:szCs w:val="20"/>
-              </w:rPr>
-            </w:pPr>
-            <w:r>
-              <w:rPr>
-                <w:rFonts w:eastAsia="Open Sans" w:cs="Open Sans" w:ascii="Open Sans" w:hAnsi="Open Sans"/>
-                <w:color w:val="000000"/>
-                <w:kern w:val="0"/>
-                <w:sz w:val="20"/>
-                <w:szCs w:val="20"/>
-                <w:lang w:val="en-US" w:eastAsia="zh-CN" w:bidi="hi-IN"/>
-              </w:rPr>
-              <w:t xml:space="preserve">- 1 Stk Kleinmaterial</w:t>
-            </w:r>
-          </w:p>
-          <w:p>
-            <w:pPr>
-              <w:pStyle w:val="normal1"/>
-              <w:suppressAutoHyphens w:val="true"/>
-              <w:spacing w:lineRule="auto" w:line="278" w:before="0" w:after="0"/>
-              <w:ind w:end="314"/>
-              <w:jc w:val="start"/>
-              <w:rPr>
-                <w:rFonts w:ascii="Open Sans" w:hAnsi="Open Sans" w:eastAsia="Open Sans" w:cs="Open Sans"/>
-                <w:color w:val="000000"/>
-                <w:sz w:val="20"/>
-                <w:szCs w:val="20"/>
-              </w:rPr>
-            </w:pPr>
-            <w:r>
-              <w:rPr>
-                <w:rFonts w:eastAsia="Open Sans" w:cs="Open Sans" w:ascii="Open Sans" w:hAnsi="Open Sans"/>
-                <w:color w:val="000000"/>
-                <w:kern w:val="0"/>
-                <w:sz w:val="20"/>
-                <w:szCs w:val="20"/>
-                <w:lang w:val="en-US" w:eastAsia="zh-CN" w:bidi="hi-IN"/>
-              </w:rPr>
-              <w:t xml:space="preserve">- 1 Stk Stelzlager höhenverstellar Set</w:t>
-            </w:r>
-          </w:p>
-          <w:p>
-            <w:pPr>
-              <w:pStyle w:val="normal1"/>
-              <w:suppressAutoHyphens w:val="true"/>
-              <w:spacing w:lineRule="auto" w:line="278" w:before="0" w:after="0"/>
-              <w:ind w:end="314"/>
-              <w:jc w:val="start"/>
-              <w:rPr>
-                <w:rFonts w:ascii="Open Sans" w:hAnsi="Open Sans" w:eastAsia="Open Sans" w:cs="Open Sans"/>
-                <w:color w:val="000000"/>
-                <w:sz w:val="20"/>
-                <w:szCs w:val="20"/>
-              </w:rPr>
-            </w:pPr>
-            <w:r>
-              <w:rPr>
-                <w:rFonts w:eastAsia="Open Sans" w:cs="Open Sans" w:ascii="Open Sans" w:hAnsi="Open Sans"/>
-                <w:color w:val="000000"/>
-                <w:kern w:val="0"/>
-                <w:sz w:val="20"/>
-                <w:szCs w:val="20"/>
-                <w:lang w:val="en-US" w:eastAsia="zh-CN" w:bidi="hi-IN"/>
-              </w:rPr>
-              <w:t xml:space="preserve">- 3 Stk Wandverkleidung 3.0 Alu 1497×2550 mm — Farbe: Marmor weiß</w:t>
-            </w:r>
-          </w:p>
-          <w:p>
-            <w:pPr>
-              <w:pStyle w:val="normal1"/>
-              <w:suppressAutoHyphens w:val="true"/>
-              <w:spacing w:lineRule="auto" w:line="278" w:before="0" w:after="0"/>
-              <w:ind w:end="314"/>
-              <w:jc w:val="start"/>
-              <w:rPr>
-                <w:rFonts w:ascii="Open Sans" w:hAnsi="Open Sans" w:eastAsia="Open Sans" w:cs="Open Sans"/>
-                <w:color w:val="000000"/>
-                <w:sz w:val="20"/>
-                <w:szCs w:val="20"/>
-              </w:rPr>
-            </w:pPr>
-            <w:r>
-              <w:rPr>
-                <w:rFonts w:eastAsia="Open Sans" w:cs="Open Sans" w:ascii="Open Sans" w:hAnsi="Open Sans"/>
-                <w:color w:val="000000"/>
-                <w:kern w:val="0"/>
-                <w:sz w:val="20"/>
-                <w:szCs w:val="20"/>
-                <w:lang w:val="en-US" w:eastAsia="zh-CN" w:bidi="hi-IN"/>
-              </w:rPr>
-              <w:t xml:space="preserve">- 1 Stk TRINNITY Wandabdichtung BASIS-Set 5 qm DW bis 100 x 100 / BW bis 180 x 80 cm</w:t>
-            </w:r>
-          </w:p>
-          <w:p>
-            <w:pPr>
-              <w:pStyle w:val="normal1"/>
-              <w:suppressAutoHyphens w:val="true"/>
-              <w:spacing w:lineRule="auto" w:line="278" w:before="0" w:after="0"/>
-              <w:ind w:end="314"/>
-              <w:jc w:val="start"/>
-              <w:rPr>
-                <w:rFonts w:ascii="Open Sans" w:hAnsi="Open Sans" w:eastAsia="Open Sans" w:cs="Open Sans"/>
-                <w:color w:val="000000"/>
-                <w:sz w:val="20"/>
-                <w:szCs w:val="20"/>
-              </w:rPr>
-            </w:pPr>
-            <w:r>
-              <w:rPr>
-                <w:rFonts w:eastAsia="Open Sans" w:cs="Open Sans" w:ascii="Open Sans" w:hAnsi="Open Sans"/>
-                <w:color w:val="000000"/>
-                <w:kern w:val="0"/>
-                <w:sz w:val="20"/>
-                <w:szCs w:val="20"/>
-                <w:lang w:val="en-US" w:eastAsia="zh-CN" w:bidi="hi-IN"/>
-              </w:rPr>
-              <w:t xml:space="preserve">- 6 Pkg Flächenkleber (Wandverkleidung)</w:t>
-            </w:r>
-          </w:p>
-          <w:p>
-            <w:pPr>
-              <w:pStyle w:val="normal1"/>
-              <w:suppressAutoHyphens w:val="true"/>
-              <w:spacing w:lineRule="auto" w:line="278" w:before="0" w:after="0"/>
-              <w:ind w:end="314"/>
-              <w:jc w:val="start"/>
-              <w:rPr>
-                <w:rFonts w:ascii="Open Sans" w:hAnsi="Open Sans" w:eastAsia="Open Sans" w:cs="Open Sans"/>
-                <w:color w:val="000000"/>
-                <w:sz w:val="20"/>
-                <w:szCs w:val="20"/>
-              </w:rPr>
-            </w:pPr>
-            <w:r>
-              <w:rPr>
-                <w:rFonts w:eastAsia="Open Sans" w:cs="Open Sans" w:ascii="Open Sans" w:hAnsi="Open Sans"/>
-                <w:color w:val="000000"/>
-                <w:kern w:val="0"/>
-                <w:sz w:val="20"/>
-                <w:szCs w:val="20"/>
-                <w:lang w:val="en-US" w:eastAsia="zh-CN" w:bidi="hi-IN"/>
-              </w:rPr>
-              <w:t xml:space="preserve">- 1 Stk Abschlussprofil 3.0 255 cm silber eloxiert VIGOUR</w:t>
-            </w:r>
-          </w:p>
-          <w:p>
-            <w:pPr>
-              <w:pStyle w:val="normal1"/>
-              <w:suppressAutoHyphens w:val="true"/>
-              <w:spacing w:lineRule="auto" w:line="278" w:before="0" w:after="0"/>
-              <w:ind w:end="314"/>
-              <w:jc w:val="start"/>
-              <w:rPr>
-                <w:rFonts w:ascii="Open Sans" w:hAnsi="Open Sans" w:eastAsia="Open Sans" w:cs="Open Sans"/>
-                <w:color w:val="000000"/>
-                <w:sz w:val="20"/>
-                <w:szCs w:val="20"/>
-              </w:rPr>
-            </w:pPr>
-            <w:r>
-              <w:rPr>
-                <w:rFonts w:eastAsia="Open Sans" w:cs="Open Sans" w:ascii="Open Sans" w:hAnsi="Open Sans"/>
-                <w:color w:val="000000"/>
-                <w:kern w:val="0"/>
-                <w:sz w:val="20"/>
-                <w:szCs w:val="20"/>
-                <w:lang w:val="en-US" w:eastAsia="zh-CN" w:bidi="hi-IN"/>
-              </w:rPr>
-              <w:t xml:space="preserve">- 1 Stk CARE Sanitär Silikon Weiß 310ml</w:t>
-            </w:r>
-          </w:p>
-          <w:p>
-            <w:pPr>
-              <w:pStyle w:val="normal1"/>
-              <w:suppressAutoHyphens w:val="true"/>
-              <w:spacing w:lineRule="auto" w:line="278" w:before="0" w:after="0"/>
-              <w:ind w:end="314"/>
-              <w:jc w:val="start"/>
-              <w:rPr>
-                <w:rFonts w:ascii="Open Sans" w:hAnsi="Open Sans" w:eastAsia="Open Sans" w:cs="Open Sans"/>
-                <w:color w:val="000000"/>
-                <w:sz w:val="20"/>
-                <w:szCs w:val="20"/>
-              </w:rPr>
-            </w:pPr>
-            <w:r>
-              <w:rPr>
-                <w:rFonts w:eastAsia="Open Sans" w:cs="Open Sans" w:ascii="Open Sans" w:hAnsi="Open Sans"/>
-                <w:color w:val="000000"/>
-                <w:kern w:val="0"/>
-                <w:sz w:val="20"/>
-                <w:szCs w:val="20"/>
-                <w:lang w:val="en-US" w:eastAsia="zh-CN" w:bidi="hi-IN"/>
-              </w:rPr>
-              <w:t xml:space="preserve">- 1 Stk Haltegriff clivia plus 32/400mm m. Ros. Edelstahl glatt poliert,VIGOUR</w:t>
-            </w:r>
-          </w:p>
-        </w:tc>
-        <w:tc>
-          <w:tcPr>
-            <w:tcW w:w="2327" w:type="dxa"/>
-            <w:tcBorders/>
-            <w:shd w:color="auto" w:fill="FFFFFF" w:val="clear"/>
-          </w:tcPr>
-          <w:p>
-            <w:pPr>
-              <w:pStyle w:val="normal1"/>
-              <w:suppressAutoHyphens w:val="true"/>
-              <w:spacing w:lineRule="auto" w:line="278" w:before="0" w:after="0"/>
-              <w:ind w:end="314"/>
-              <w:jc w:val="start"/>
-              <w:rPr>
-                <w:color w:val="000000"/>
-              </w:rPr>
-            </w:pPr>
-            <w:r>
-              <w:rPr>
-                <w:rFonts w:eastAsia="Calibri" w:cs="Calibri"/>
-                <w:color w:val="000000"/>
-                <w:kern w:val="0"/>
-                <w:sz w:val="22"/>
-                <w:szCs w:val="22"/>
-                <w:lang w:val="en-US" w:eastAsia="zh-CN" w:bidi="hi-IN"/>
-              </w:rPr>
-            </w:r>
-          </w:p>
-        </w:tc>
-        <w:tc>
-          <w:tcPr>
-            <w:tcW w:w="1755" w:type="dxa"/>
-            <w:tcBorders/>
-            <w:shd w:color="auto" w:fill="FFFFFF" w:val="clear"/>
-            <w:vAlign w:val="center"/>
-          </w:tcPr>
-          <w:p>
-            <w:pPr>
-              <w:pStyle w:val="normal1"/>
-              <w:suppressAutoHyphens w:val="true"/>
-              <w:spacing w:lineRule="auto" w:line="278" w:before="0" w:after="0"/>
-              <w:ind w:end="314"/>
-              <w:jc w:val="start"/>
-              <w:rPr>
-                <w:color w:val="000000"/>
-              </w:rPr>
-            </w:pPr>
-            <w:r>
-              <w:rPr>
-                <w:rFonts w:eastAsia="Calibri" w:cs="Calibri"/>
-                <w:color w:val="000000"/>
-                <w:kern w:val="0"/>
-                <w:sz w:val="22"/>
-                <w:szCs w:val="22"/>
-                <w:lang w:val="en-US" w:eastAsia="zh-CN" w:bidi="hi-IN"/>
-              </w:rPr>
-            </w:r>
-          </w:p>
-        </w:tc>
-      </w:tr>
-      <w:tr>
-        <w:trPr>
-          <w:trHeight w:val="1" w:hRule="atLeast"/>
-        </w:trPr>
-        <w:tc>
-          <w:tcPr>
-            <w:tcW w:w="675" w:type="dxa"/>
-            <w:tcBorders>
-              <w:start w:val="single" w:sz="8" w:space="0" w:color="FFFFFF"/>
-              <w:bottom w:val="single" w:sz="8" w:space="0" w:color="FFFFFF"/>
-              <w:end w:val="single" w:sz="8" w:space="0" w:color="FFFFFF"/>
-            </w:tcBorders>
-            <w:shd w:color="auto" w:fill="FFFFFF" w:val="clear"/>
-          </w:tcPr>
-          <w:p>
-            <w:pPr>
-              <w:pStyle w:val="normal1"/>
-              <w:suppressAutoHyphens w:val="true"/>
-              <w:spacing w:lineRule="auto" w:line="278" w:before="0" w:after="0"/>
-              <w:ind w:end="-26"/>
-              <w:jc w:val="start"/>
-              <w:rPr>
-                <w:color w:val="000000"/>
-              </w:rPr>
-            </w:pPr>
-            <w:r>
-              <w:rPr>
-                <w:rFonts w:eastAsia="Open Sans" w:cs="Open Sans" w:ascii="Open Sans" w:hAnsi="Open Sans"/>
-                <w:color w:val="000000"/>
-                <w:kern w:val="0"/>
-                <w:sz w:val="20"/>
-                <w:szCs w:val="20"/>
-                <w:lang w:val="en-US" w:eastAsia="zh-CN" w:bidi="hi-IN"/>
-              </w:rPr>
-              <w:t xml:space="preserve">003</w:t>
-            </w:r>
-          </w:p>
-        </w:tc>
-        <w:tc>
-          <w:tcPr>
-            <w:tcW w:w="883" w:type="dxa"/>
-            <w:tcBorders>
-              <w:start w:val="single" w:sz="8" w:space="0" w:color="FFFFFF"/>
-              <w:bottom w:val="single" w:sz="8" w:space="0" w:color="FFFFFF"/>
-              <w:end w:val="single" w:sz="8" w:space="0" w:color="FFFFFF"/>
-            </w:tcBorders>
-            <w:shd w:color="auto" w:fill="FFFFFF" w:val="clear"/>
-          </w:tcPr>
-          <w:p>
-            <w:pPr>
-              <w:pStyle w:val="normal1"/>
-              <w:suppressAutoHyphens w:val="true"/>
-              <w:spacing w:lineRule="auto" w:line="278" w:before="0" w:after="0"/>
-              <w:ind w:end="314"/>
-              <w:jc w:val="start"/>
-              <w:rPr>
-                <w:color w:val="000000"/>
-              </w:rPr>
-            </w:pPr>
-            <w:r>
-              <w:rPr>
-                <w:rFonts w:eastAsia="Open Sans" w:cs="Open Sans" w:ascii="Open Sans" w:hAnsi="Open Sans"/>
-                <w:color w:val="000000"/>
-                <w:kern w:val="0"/>
-                <w:sz w:val="20"/>
-                <w:szCs w:val="20"/>
-                <w:lang w:val="en-US" w:eastAsia="zh-CN" w:bidi="hi-IN"/>
-              </w:rPr>
-              <w:t xml:space="preserve">1 Stk</w:t>
-            </w:r>
-          </w:p>
-        </w:tc>
-        <w:tc>
-          <w:tcPr>
-            <w:tcW w:w="4410" w:type="dxa"/>
-            <w:tcBorders>
-              <w:start w:val="single" w:sz="8" w:space="0" w:color="FFFFFF"/>
-              <w:bottom w:val="single" w:sz="8" w:space="0" w:color="FFFFFF"/>
-              <w:end w:val="single" w:sz="8" w:space="0" w:color="FFFFFF"/>
-            </w:tcBorders>
-            <w:shd w:color="auto" w:fill="FFFFFF" w:val="clear"/>
-          </w:tcPr>
-          <w:p>
-            <w:pPr>
-              <w:pStyle w:val="normal1"/>
-              <w:suppressAutoHyphens w:val="true"/>
-              <w:spacing w:lineRule="auto" w:line="278" w:before="0" w:after="0"/>
-              <w:ind w:end="314"/>
-              <w:jc w:val="start"/>
-              <w:rPr>
-                <w:rFonts w:ascii="Open Sans" w:hAnsi="Open Sans" w:eastAsia="Open Sans" w:cs="Open Sans"/>
-                <w:b/>
-                <w:color w:val="000000"/>
-                <w:sz w:val="20"/>
-                <w:szCs w:val="20"/>
-              </w:rPr>
-            </w:pPr>
-            <w:r>
-              <w:rPr>
-                <w:rFonts w:eastAsia="Open Sans" w:cs="Open Sans" w:ascii="Open Sans" w:hAnsi="Open Sans"/>
-                <w:b/>
-                <w:color w:val="000000"/>
-                <w:kern w:val="0"/>
-                <w:sz w:val="20"/>
-                <w:szCs w:val="20"/>
-                <w:lang w:val="en-US" w:eastAsia="zh-CN" w:bidi="hi-IN"/>
-              </w:rPr>
-              <w:t xml:space="preserve">Bestandkundenbonus:</w:t>
-            </w:r>
-          </w:p>
-          <w:p>
-            <w:pPr>
-              <w:pStyle w:val="normal1"/>
-              <w:suppressAutoHyphens w:val="true"/>
-              <w:spacing w:lineRule="auto" w:line="278" w:before="0" w:after="0"/>
-              <w:ind w:end="314"/>
-              <w:jc w:val="start"/>
-              <w:rPr>
-                <w:color w:val="000000"/>
-                <w:sz w:val="18"/>
-                <w:szCs w:val="18"/>
-              </w:rPr>
-            </w:pPr>
-            <w:r>
-              <w:rPr>
-                <w:rFonts w:eastAsia="Open Sans" w:cs="Open Sans" w:ascii="Open Sans" w:hAnsi="Open Sans"/>
-                <w:color w:val="000000"/>
-                <w:kern w:val="0"/>
-                <w:sz w:val="20"/>
-                <w:szCs w:val="20"/>
-                <w:lang w:val="en-US" w:eastAsia="zh-CN" w:bidi="hi-IN"/>
-              </w:rPr>
-              <w:t xml:space="preserve">-- Rabatt von 300 € ab einem Gesamtwert von 3.000</w:t>
-            </w:r>
-          </w:p>
-        </w:tc>
-        <w:tc>
-          <w:tcPr>
-            <w:tcW w:w="2327" w:type="dxa"/>
-            <w:tcBorders>
-              <w:start w:val="single" w:sz="8" w:space="0" w:color="FFFFFF"/>
-              <w:bottom w:val="single" w:sz="8" w:space="0" w:color="FFFFFF"/>
-              <w:end w:val="single" w:sz="8" w:space="0" w:color="FFFFFF"/>
-            </w:tcBorders>
-            <w:shd w:color="auto" w:fill="FFFFFF" w:val="clear"/>
-          </w:tcPr>
-          <w:p>
-            <w:pPr>
-              <w:pStyle w:val="normal1"/>
-              <w:suppressAutoHyphens w:val="true"/>
-              <w:spacing w:lineRule="auto" w:line="278" w:before="0" w:after="0"/>
-              <w:ind w:end="314"/>
-              <w:jc w:val="start"/>
-              <w:rPr>
-                <w:color w:val="000000"/>
-              </w:rPr>
-            </w:pPr>
-            <w:r>
-              <w:rPr>
-                <w:rFonts w:eastAsia="Open Sans" w:cs="Open Sans" w:ascii="Open Sans" w:hAnsi="Open Sans"/>
-                <w:color w:val="000000"/>
-                <w:kern w:val="0"/>
-                <w:sz w:val="20"/>
-                <w:szCs w:val="20"/>
-                <w:lang w:val="en-US" w:eastAsia="zh-CN" w:bidi="hi-IN"/>
-              </w:rPr>
-              <w:t xml:space="preserve">-252,10 €</w:t>
-            </w:r>
-          </w:p>
-        </w:tc>
-        <w:tc>
-          <w:tcPr>
-            <w:tcW w:w="1755" w:type="dxa"/>
-            <w:tcBorders>
-              <w:start w:val="single" w:sz="8" w:space="0" w:color="FFFFFF"/>
-              <w:bottom w:val="single" w:sz="8" w:space="0" w:color="FFFFFF"/>
-              <w:end w:val="single" w:sz="8" w:space="0" w:color="FFFFFF"/>
-            </w:tcBorders>
-            <w:shd w:color="auto" w:fill="FFFFFF" w:val="clear"/>
-          </w:tcPr>
-          <w:p>
-            <w:pPr>
-              <w:pStyle w:val="normal1"/>
-              <w:suppressAutoHyphens w:val="true"/>
-              <w:spacing w:lineRule="auto" w:line="278" w:before="0" w:after="0"/>
-              <w:ind w:end="314"/>
-              <w:jc w:val="center"/>
-              <w:rPr>
-                <w:color w:val="000000"/>
-              </w:rPr>
-            </w:pPr>
-            <w:r>
-              <w:rPr>
-                <w:rFonts w:eastAsia="Open Sans" w:cs="Open Sans" w:ascii="Open Sans" w:hAnsi="Open Sans"/>
-                <w:color w:val="000000"/>
-                <w:kern w:val="0"/>
-                <w:sz w:val="20"/>
-                <w:szCs w:val="20"/>
-                <w:lang w:val="en-US" w:eastAsia="zh-CN" w:bidi="hi-IN"/>
-              </w:rPr>
-              <w:t xml:space="preserve">-252,10 €</w:t>
-            </w:r>
-          </w:p>
-        </w:tc>
-      </w:tr>
-    </w:tbl>
     <w:p>
       <w:pPr>
         <w:pStyle w:val="normal1"/>
@@ -2339,12 +1521,7 @@
             </w:pPr>
             <w:r>
               <w:rPr>
-                <w:rFonts w:eastAsia="Calibri" w:cs="Calibri"/>
-                <w:color w:val="000000"/>
-                <w:kern w:val="0"/>
-                <w:sz w:val="22"/>
-                <w:szCs w:val="22"/>
-                <w:lang w:val="en-US" w:eastAsia="zh-CN" w:bidi="hi-IN"/>
+                <w:color w:val="000000"/>
               </w:rPr>
             </w:r>
           </w:p>
@@ -2373,12 +1550,7 @@
             </w:pPr>
             <w:r>
               <w:rPr>
-                <w:rFonts w:eastAsia="Calibri" w:cs="Calibri"/>
-                <w:color w:val="000000"/>
-                <w:kern w:val="0"/>
-                <w:sz w:val="22"/>
-                <w:szCs w:val="22"/>
-                <w:lang w:val="en-US" w:eastAsia="zh-CN" w:bidi="hi-IN"/>
+                <w:color w:val="000000"/>
               </w:rPr>
             </w:r>
           </w:p>
@@ -2416,7 +1588,7 @@
                 <w:szCs w:val="22"/>
                 <w:lang w:val="en-US" w:eastAsia="zh-CN" w:bidi="hi-IN"/>
               </w:rPr>
-              <w:t xml:space="preserve">2.749,93 €</w:t>
+              <w:t xml:space="preserve">3.268,58 €</w:t>
             </w:r>
             <w:r>
               <w:rPr>
@@ -2511,12 +1683,7 @@
             </w:pPr>
             <w:r>
               <w:rPr>
-                <w:rFonts w:eastAsia="Calibri" w:cs="Calibri"/>
-                <w:color w:val="000000"/>
-                <w:kern w:val="0"/>
-                <w:sz w:val="22"/>
-                <w:szCs w:val="22"/>
-                <w:lang w:val="en-US" w:eastAsia="zh-CN" w:bidi="hi-IN"/>
+                <w:color w:val="000000"/>
               </w:rPr>
             </w:r>
           </w:p>
@@ -2545,12 +1712,7 @@
             </w:pPr>
             <w:r>
               <w:rPr>
-                <w:rFonts w:eastAsia="Calibri" w:cs="Calibri"/>
-                <w:color w:val="000000"/>
-                <w:kern w:val="0"/>
-                <w:sz w:val="22"/>
-                <w:szCs w:val="22"/>
-                <w:lang w:val="en-US" w:eastAsia="zh-CN" w:bidi="hi-IN"/>
+                <w:color w:val="000000"/>
               </w:rPr>
             </w:r>
           </w:p>
@@ -2588,7 +1750,7 @@
                 <w:szCs w:val="22"/>
                 <w:lang w:val="en-US" w:eastAsia="zh-CN" w:bidi="hi-IN"/>
               </w:rPr>
-              <w:t xml:space="preserve">522,49 €</w:t>
+              <w:t xml:space="preserve">621,03 €</w:t>
             </w:r>
             <w:r>
               <w:rPr>
@@ -2684,12 +1846,7 @@
             </w:pPr>
             <w:r>
               <w:rPr>
-                <w:rFonts w:eastAsia="Calibri" w:cs="Calibri"/>
-                <w:color w:val="000000"/>
-                <w:kern w:val="0"/>
-                <w:sz w:val="22"/>
-                <w:szCs w:val="22"/>
-                <w:lang w:val="en-US" w:eastAsia="zh-CN" w:bidi="hi-IN"/>
+                <w:color w:val="000000"/>
               </w:rPr>
             </w:r>
           </w:p>
@@ -2718,12 +1875,7 @@
             </w:pPr>
             <w:r>
               <w:rPr>
-                <w:rFonts w:eastAsia="Calibri" w:cs="Calibri"/>
-                <w:color w:val="000000"/>
-                <w:kern w:val="0"/>
-                <w:sz w:val="22"/>
-                <w:szCs w:val="22"/>
-                <w:lang w:val="en-US" w:eastAsia="zh-CN" w:bidi="hi-IN"/>
+                <w:color w:val="000000"/>
               </w:rPr>
             </w:r>
           </w:p>
@@ -2761,7 +1913,7 @@
                 <w:szCs w:val="22"/>
                 <w:lang w:val="en-US" w:eastAsia="zh-CN" w:bidi="hi-IN"/>
               </w:rPr>
-              <w:t xml:space="preserve">3.272,42 €</w:t>
+              <w:t xml:space="preserve">3.889,61 €</w:t>
             </w:r>
             <w:r>
               <w:rPr>
@@ -2810,52 +1962,6 @@
           <w:lang w:val="de-DE"/>
         </w:rPr>
         <w:t xml:space="preserve">Es handelt sich hierbei um ein Festpreisangebot für die oben definierten Leistungen.</w:t>
-      </w:r>
-    </w:p>
-    <w:p>
-      <w:pPr>
-        <w:pStyle w:val="normal1"/>
-        <w:spacing w:before="23" w:after="0"/>
-        <w:rPr>
-          <w:rFonts w:ascii="Open Sans" w:hAnsi="Open Sans" w:eastAsia="Open Sans" w:cs="Open Sans"/>
-          <w:color w:val="000000"/>
-          <w:lang w:val="de-DE"/>
-        </w:rPr>
-      </w:pPr>
-      <w:r>
-        <w:rPr>
-          <w:rFonts w:eastAsia="Open Sans" w:cs="Open Sans" w:ascii="Open Sans" w:hAnsi="Open Sans"/>
-          <w:color w:val="000000"/>
-          <w:lang w:val="de-DE"/>
-        </w:rPr>
-      </w:r>
-    </w:p>
-    <w:p>
-      <w:pPr>
-        <w:pStyle w:val="normal1"/>
-        <w:spacing w:lineRule="auto" w:line="286"/>
-        <w:ind w:start="123"/>
-        <w:rPr>
-          <w:rFonts w:ascii="Open Sans" w:hAnsi="Open Sans" w:eastAsia="Open Sans" w:cs="Open Sans"/>
-          <w:color w:val="000000"/>
-          <w:lang w:val="de-DE"/>
-        </w:rPr>
-      </w:pPr>
-      <w:r>
-        <w:rPr>
-          <w:rFonts w:eastAsia="Open Sans Semibold" w:cs="Open Sans Semibold" w:ascii="Open Sans Semibold" w:hAnsi="Open Sans Semibold"/>
-          <w:color w:val="030303"/>
-          <w:lang w:val="de-DE"/>
-        </w:rPr>
-        <w:t xml:space="preserve">ACHTUNG:</w:t>
-      </w:r>
-      <w:r>
-        <w:rPr>
-          <w:rFonts w:eastAsia="Open Sans" w:cs="Open Sans" w:ascii="Open Sans" w:hAnsi="Open Sans"/>
-          <w:color w:val="030303"/>
-          <w:lang w:val="de-DE"/>
-        </w:rPr>
-        <w:t xml:space="preserve"> Ob eine ebenerdige Montage der Duschwanne möglich ist, kann erst nach dem Ausbau der bestehenden Wanne beurteilen werden. Sollten dabei zusätzliche oder weitere Leistungen erforderlich oder von Ihnen gewünscht sein, können zusätzliche Kosten entstehen.</w:t>
         <w:br/>
       </w:r>
     </w:p>
@@ -3370,7 +2476,7 @@
               <w:rFonts w:eastAsia="Calibri" w:cs="Calibri"/>
               <w:lang w:val="en-US" w:eastAsia="zh-CN" w:bidi="hi-IN"/>
             </w:rPr>
-            <w:t>2</w:t>
+            <w:t>3</w:t>
           </w:r>
           <w:r>
             <w:rPr>
@@ -3430,7 +2536,7 @@
               <w:rFonts w:eastAsia="Calibri" w:cs="Calibri"/>
               <w:lang w:val="en-US" w:eastAsia="zh-CN" w:bidi="hi-IN"/>
             </w:rPr>
-            <w:t>2</w:t>
+            <w:t>3</w:t>
           </w:r>
           <w:r>
             <w:rPr>
@@ -3449,7 +2555,7 @@
   <w:p>
     <w:pPr>
       <w:pStyle w:val="normal1"/>
-      <w:spacing w:lineRule="auto" w:line="14" w:before="240" w:after="0"/>
+      <w:spacing w:lineRule="auto" w:line="14" w:before="240" w:after="240"/>
       <w:jc w:val="center"/>
       <w:rPr/>
     </w:pPr>
@@ -3659,7 +2765,7 @@
               <w:rFonts w:eastAsia="Calibri" w:cs="Calibri"/>
               <w:lang w:val="en-US" w:eastAsia="zh-CN" w:bidi="hi-IN"/>
             </w:rPr>
-            <w:t>2</w:t>
+            <w:t>3</w:t>
           </w:r>
           <w:r>
             <w:rPr>
@@ -3719,7 +2825,7 @@
               <w:rFonts w:eastAsia="Calibri" w:cs="Calibri"/>
               <w:lang w:val="en-US" w:eastAsia="zh-CN" w:bidi="hi-IN"/>
             </w:rPr>
-            <w:t>2</w:t>
+            <w:t>3</w:t>
           </w:r>
           <w:r>
             <w:rPr>
@@ -3738,7 +2844,7 @@
   <w:p>
     <w:pPr>
       <w:pStyle w:val="normal1"/>
-      <w:spacing w:lineRule="auto" w:line="14" w:before="240" w:after="0"/>
+      <w:spacing w:lineRule="auto" w:line="14" w:before="240" w:after="240"/>
       <w:jc w:val="center"/>
       <w:rPr/>
     </w:pPr>
@@ -3777,7 +2883,15 @@
   <w:p>
     <w:pPr>
       <w:pStyle w:val="normal1"/>
-      <w:spacing w:before="120" w:after="0"/>
+      <w:rPr/>
+    </w:pPr>
+    <w:r>
+      <w:rPr/>
+    </w:r>
+  </w:p>
+  <w:p>
+    <w:pPr>
+      <w:pStyle w:val="normal1"/>
       <w:ind w:start="7200"/>
       <w:rPr/>
     </w:pPr>
@@ -3840,7 +2954,15 @@
   <w:p>
     <w:pPr>
       <w:pStyle w:val="normal1"/>
-      <w:spacing w:before="120" w:after="0"/>
+      <w:rPr/>
+    </w:pPr>
+    <w:r>
+      <w:rPr/>
+    </w:r>
+  </w:p>
+  <w:p>
+    <w:pPr>
+      <w:pStyle w:val="normal1"/>
       <w:ind w:start="7200"/>
       <w:rPr/>
     </w:pPr>
@@ -4434,6 +3556,18 @@
       <w:u w:val="single"/>
     </w:rPr>
   </w:style>
+  <w:style w:type="character" w:styleId="NumberingSymbols">
+    <w:name w:val="Numbering Symbols"/>
+    <w:qFormat/>
+    <w:rPr/>
+  </w:style>
+  <w:style w:type="character" w:styleId="Bullets">
+    <w:name w:val="Bullets"/>
+    <w:qFormat/>
+    <w:rPr>
+      <w:rFonts w:ascii="OpenSymbol" w:hAnsi="OpenSymbol" w:eastAsia="OpenSymbol" w:cs="OpenSymbol"/>
+    </w:rPr>
+  </w:style>
   <w:style w:type="paragraph" w:styleId="Heading" w:customStyle="1">
     <w:name w:val="Heading"/>
     <w:basedOn w:val="Normal"/>
@@ -4565,6 +3699,29 @@
     <w:basedOn w:val="HeaderandFooter"/>
     <w:pPr/>
     <w:rPr/>
+  </w:style>
+  <w:style w:type="paragraph" w:styleId="TableContents">
+    <w:name w:val="Table Contents"/>
+    <w:basedOn w:val="Normal"/>
+    <w:qFormat/>
+    <w:pPr>
+      <w:widowControl w:val="false"/>
+      <w:suppressLineNumbers/>
+    </w:pPr>
+    <w:rPr/>
+  </w:style>
+  <w:style w:type="paragraph" w:styleId="TableHeading">
+    <w:name w:val="Table Heading"/>
+    <w:basedOn w:val="TableContents"/>
+    <w:qFormat/>
+    <w:pPr>
+      <w:suppressLineNumbers/>
+      <w:jc w:val="center"/>
+    </w:pPr>
+    <w:rPr>
+      <w:b/>
+      <w:bCs/>
+    </w:rPr>
   </w:style>
   <w:style w:type="numbering" w:styleId="NoList" w:default="1">
     <w:name w:val="No List"/>
@@ -4771,16 +3928,4 @@
     </a:fmtScheme>
   </a:themeElements>
 </a:theme>
-</file>
-
-<file path=customXml/item1.xml><?xml version="1.0" encoding="utf-8"?>
-<b:Sources xmlns:b="http://schemas.openxmlformats.org/officeDocument/2006/bibliography" xmlns="http://schemas.openxmlformats.org/officeDocument/2006/bibliography" SelectedStyle="\APASixthEditionOfficeOnline.xsl" StyleName="APA" Version="6"/>
-</file>
-
-<file path=customXml/itemProps1.xml><?xml version="1.0" encoding="utf-8"?>
-<ds:datastoreItem xmlns:ds="http://schemas.openxmlformats.org/officeDocument/2006/customXml" ds:itemID="{1DA076A3-A826-478E-933E-7998A844BFB4}">
-  <ds:schemaRefs>
-    <ds:schemaRef ds:uri="http://schemas.openxmlformats.org/officeDocument/2006/bibliography"/>
-  </ds:schemaRefs>
-</ds:datastoreItem>
 </file>
</xml_diff>

<commit_message>
update bwt bullet 7 in generated file
</commit_message>
<xml_diff>
--- a/out-Angebot.docx
+++ b/out-Angebot.docx
@@ -322,7 +322,7 @@
                 <w:szCs w:val="22"/>
                 <w:lang w:val="de-DE" w:eastAsia="zh-CN" w:bidi="hi-IN"/>
               </w:rPr>
-              <w:t xml:space="preserve">ANG2025-1126-112639</w:t>
+              <w:t xml:space="preserve">ANG2025-1126-122655</w:t>
             </w:r>
             <w:r>
               <w:rPr>
@@ -610,7 +610,7 @@
           <w:sz w:val="24"/>
           <w:szCs w:val="24"/>
         </w:rPr>
-        <w:t xml:space="preserve">Ihr Angebot ANG2025-1126-112639</w:t>
+        <w:t xml:space="preserve">Ihr Angebot ANG2025-1126-122655</w:t>
       </w:r>
     </w:p>
     <w:p>
@@ -1071,6 +1071,69 @@
             <w:r>
               <w:rPr>
                 <w:rFonts w:eastAsia="Arimo" w:cs="Arimo" w:ascii="Arimo" w:hAnsi="Arimo"/>
+                <w:b w:val="false"/>
+                <w:bCs w:val="false"/>
+                <w:color w:val="000000"/>
+                <w:kern w:val="0"/>
+                <w:sz w:val="20"/>
+                <w:szCs w:val="20"/>
+                <w:lang w:val="en-US" w:eastAsia="zh-CN" w:bidi="hi-IN"/>
+              </w:rPr>
+              <w:t xml:space="preserve">• </w:t>
+            </w:r>
+            <w:r>
+              <w:rPr>
+                <w:rFonts w:eastAsia="Arimo" w:cs="Arimo" w:ascii="Arimo" w:hAnsi="Arimo"/>
+                <w:b w:val="false"/>
+                <w:bCs w:val="false"/>
+                <w:color w:val="000000"/>
+                <w:kern w:val="0"/>
+                <w:sz w:val="20"/>
+                <w:szCs w:val="20"/>
+                <w:lang w:val="en-US" w:eastAsia="zh-CN" w:bidi="hi-IN"/>
+              </w:rPr>
+              <w:t xml:space="preserve">Montage Haltegriff 40 cm</w:t>
+            </w:r>
+          </w:p>
+          <w:p>
+            <w:pPr>
+              <w:pStyle w:val="BodyText"/>
+              <w:suppressAutoHyphens w:val="true"/>
+              <w:spacing w:lineRule="auto" w:line="278" w:before="0" w:after="0"/>
+              <w:ind w:end="314"/>
+              <w:jc w:val="start"/>
+              <w:rPr>
+                <w:color w:val="000000"/>
+              </w:rPr>
+            </w:pPr>
+            <w:r>
+              <w:rPr>
+                <w:rFonts w:eastAsia="Arimo" w:cs="Arimo" w:ascii="Arimo" w:hAnsi="Arimo"/>
+                <w:b w:val="false"/>
+                <w:bCs w:val="false"/>
+                <w:color w:val="000000"/>
+                <w:kern w:val="0"/>
+                <w:sz w:val="20"/>
+                <w:szCs w:val="20"/>
+                <w:lang w:val="en-US" w:eastAsia="zh-CN" w:bidi="hi-IN"/>
+              </w:rPr>
+              <w:t/>
+            </w:r>
+          </w:p>
+          <w:p>
+            <w:pPr>
+              <w:pStyle w:val="BodyText"/>
+              <w:suppressAutoHyphens w:val="true"/>
+              <w:spacing w:lineRule="auto" w:line="278" w:before="0" w:after="0"/>
+              <w:ind w:end="314"/>
+              <w:jc w:val="start"/>
+              <w:rPr>
+                <w:color w:val="000000"/>
+              </w:rPr>
+            </w:pPr>
+            <w:r>
+              <w:rPr>
+                <w:rFonts w:eastAsia="Arimo" w:cs="Arimo" w:ascii="Arimo" w:hAnsi="Arimo"/>
                 <w:b/>
                 <w:bCs w:val="false"/>
                 <w:color w:val="000000"/>
@@ -1365,6 +1428,253 @@
                 <w:lang w:val="en-US" w:eastAsia="zh-CN" w:bidi="hi-IN"/>
               </w:rPr>
               <w:t xml:space="preserve">2.980,67 €</w:t>
+            </w:r>
+          </w:p>
+        </w:tc>
+      </w:tr>
+      <w:tr>
+        <w:trPr>
+          <w:trHeight w:val="1741" w:hRule="atLeast"/>
+        </w:trPr>
+        <w:tc>
+          <w:tcPr>
+            <w:tcW w:w="630" w:type="dxa"/>
+            <w:tcBorders>
+              <w:top w:val="single" w:sz="8" w:space="0" w:color="FFFFFF"/>
+              <w:start w:val="single" w:sz="8" w:space="0" w:color="FFFFFF"/>
+              <w:bottom w:val="single" w:sz="8" w:space="0" w:color="FFFFFF"/>
+              <w:end w:val="single" w:sz="8" w:space="0" w:color="FFFFFF"/>
+            </w:tcBorders>
+            <w:shd w:color="auto" w:fill="FFFFFF" w:val="clear"/>
+            <w:tcMar>
+              <w:start w:w="56" w:type="dxa"/>
+              <w:end w:w="56" w:type="dxa"/>
+            </w:tcMar>
+          </w:tcPr>
+          <w:p>
+            <w:pPr>
+              <w:pStyle w:val="normal1"/>
+              <w:tabs>
+                <w:tab w:val="clear" w:pos="720"/>
+                <w:tab w:val="left" w:pos="750" w:leader="none"/>
+                <w:tab w:val="left" w:pos="1416" w:leader="none"/>
+              </w:tabs>
+              <w:suppressAutoHyphens w:val="true"/>
+              <w:spacing w:before="121" w:after="0"/>
+              <w:jc w:val="start"/>
+              <w:rPr>
+                <w:rFonts w:ascii="Open Sans" w:hAnsi="Open Sans" w:eastAsia="Open Sans" w:cs="Open Sans"/>
+                <w:color w:val="070707"/>
+                <w:sz w:val="20"/>
+                <w:szCs w:val="20"/>
+              </w:rPr>
+            </w:pPr>
+            <w:r>
+              <w:rPr>
+                <w:rFonts w:eastAsia="Open Sans" w:cs="Open Sans" w:ascii="Open Sans" w:hAnsi="Open Sans"/>
+                <w:color w:val="070707"/>
+                <w:sz w:val="20"/>
+                <w:szCs w:val="20"/>
+              </w:rPr>
+              <w:t xml:space="preserve">002 </w:t>
+            </w:r>
+          </w:p>
+          <w:p>
+            <w:pPr>
+              <w:pStyle w:val="normal1"/>
+              <w:suppressAutoHyphens w:val="true"/>
+              <w:spacing w:before="0" w:after="0"/>
+              <w:jc w:val="start"/>
+              <w:rPr>
+                <w:rFonts w:ascii="Calibri" w:hAnsi="Calibri" w:eastAsia="Calibri" w:cs="Calibri"/>
+                <w:kern w:val="0"/>
+                <w:sz w:val="22"/>
+                <w:szCs w:val="22"/>
+                <w:lang w:val="en-US" w:eastAsia="zh-CN" w:bidi="hi-IN"/>
+              </w:rPr>
+            </w:pPr>
+            <w:r>
+              <w:rPr>
+                <w:rFonts w:eastAsia="Calibri" w:cs="Calibri"/>
+                <w:kern w:val="0"/>
+                <w:sz w:val="22"/>
+                <w:szCs w:val="22"/>
+                <w:lang w:val="en-US" w:eastAsia="zh-CN" w:bidi="hi-IN"/>
+              </w:rPr>
+            </w:r>
+          </w:p>
+        </w:tc>
+        <w:tc>
+          <w:tcPr>
+            <w:tcW w:w="885" w:type="dxa"/>
+            <w:tcBorders>
+              <w:top w:val="single" w:sz="8" w:space="0" w:color="FFFFFF"/>
+              <w:start w:val="single" w:sz="8" w:space="0" w:color="FFFFFF"/>
+              <w:bottom w:val="single" w:sz="8" w:space="0" w:color="FFFFFF"/>
+              <w:end w:val="single" w:sz="8" w:space="0" w:color="FFFFFF"/>
+            </w:tcBorders>
+            <w:shd w:color="auto" w:fill="FFFFFF" w:val="clear"/>
+            <w:tcMar>
+              <w:start w:w="56" w:type="dxa"/>
+              <w:end w:w="56" w:type="dxa"/>
+            </w:tcMar>
+          </w:tcPr>
+          <w:p>
+            <w:pPr>
+              <w:pStyle w:val="normal1"/>
+              <w:jc w:val="start"/>
+              <w:rPr/>
+            </w:pPr>
+            <w:r>
+              <w:rPr/>
+              <w:t xml:space="preserve">1 Stk </w:t>
+            </w:r>
+          </w:p>
+        </w:tc>
+        <w:tc>
+          <w:tcPr>
+            <w:tcW w:w="4425" w:type="dxa"/>
+            <w:tcBorders>
+              <w:top w:val="single" w:sz="8" w:space="0" w:color="FFFFFF"/>
+              <w:start w:val="single" w:sz="8" w:space="0" w:color="FFFFFF"/>
+              <w:bottom w:val="single" w:sz="8" w:space="0" w:color="FFFFFF"/>
+              <w:end w:val="single" w:sz="8" w:space="0" w:color="FFFFFF"/>
+            </w:tcBorders>
+            <w:shd w:color="auto" w:fill="FFFFFF" w:val="clear"/>
+            <w:tcMar>
+              <w:start w:w="56" w:type="dxa"/>
+              <w:end w:w="56" w:type="dxa"/>
+            </w:tcMar>
+          </w:tcPr>
+          <w:p>
+            <w:pPr>
+              <w:pStyle w:val="BodyText"/>
+              <w:widowControl w:val="false"/>
+              <w:suppressAutoHyphens w:val="true"/>
+              <w:bidi w:val="0"/>
+              <w:spacing w:lineRule="auto" w:line="278" w:before="0" w:after="0"/>
+              <w:ind w:end="314"/>
+              <w:jc w:val="start"/>
+              <w:rPr/>
+            </w:pPr>
+            <w:r>
+              <w:rPr>
+                <w:rFonts w:eastAsia="Open Sans" w:cs="Open Sans" w:ascii="Open Sans" w:hAnsi="Open Sans"/>
+                <w:b/>
+                <w:bCs/>
+                <w:color w:val="000000"/>
+                <w:kern w:val="0"/>
+                <w:sz w:val="18"/>
+                <w:szCs w:val="18"/>
+                <w:lang w:val="en-US" w:eastAsia="zh-CN" w:bidi="hi-IN"/>
+              </w:rPr>
+              <w:t xml:space="preserve">Haltegriff clivia plus 32/400mm m. Ros. Edelstahl glatt poliert,VIGOUR</w:t>
+            </w:r>
+            <w:r>
+              <w:rPr>
+                <w:rFonts w:eastAsia="Arimo" w:cs="Arimo" w:ascii="Arimo" w:hAnsi="Arimo"/>
+                <w:b/>
+                <w:bCs/>
+                <w:color w:val="000000"/>
+                <w:kern w:val="0"/>
+                <w:sz w:val="20"/>
+                <w:szCs w:val="20"/>
+                <w:lang w:val="en-US" w:eastAsia="zh-CN" w:bidi="hi-IN"/>
+              </w:rPr>
+              <w:t/>
+            </w:r>
+            <w:r>
+              <w:rPr>
+                <w:rFonts w:eastAsia="Open Sans" w:cs="Open Sans" w:ascii="Open Sans" w:hAnsi="Open Sans"/>
+                <w:b/>
+                <w:bCs/>
+                <w:color w:val="000000"/>
+                <w:kern w:val="0"/>
+                <w:sz w:val="18"/>
+                <w:szCs w:val="18"/>
+                <w:lang w:val="en-US" w:eastAsia="zh-CN" w:bidi="hi-IN"/>
+              </w:rPr>
+              <w:t/>
+            </w:r>
+            <w:r>
+              <w:rPr>
+                <w:rFonts w:eastAsia="Open Sans" w:cs="Open Sans" w:ascii="Open Sans" w:hAnsi="Open Sans"/>
+                <w:color w:val="000000"/>
+                <w:kern w:val="0"/>
+                <w:sz w:val="18"/>
+                <w:szCs w:val="18"/>
+                <w:lang w:val="en-US" w:eastAsia="zh-CN" w:bidi="hi-IN"/>
+              </w:rPr>
+              <w:t xml:space="preserve"> </w:t>
+            </w:r>
+          </w:p>
+        </w:tc>
+        <w:tc>
+          <w:tcPr>
+            <w:tcW w:w="2325" w:type="dxa"/>
+            <w:tcBorders>
+              <w:top w:val="single" w:sz="8" w:space="0" w:color="FFFFFF"/>
+              <w:start w:val="single" w:sz="8" w:space="0" w:color="FFFFFF"/>
+              <w:bottom w:val="single" w:sz="8" w:space="0" w:color="FFFFFF"/>
+              <w:end w:val="single" w:sz="8" w:space="0" w:color="FFFFFF"/>
+            </w:tcBorders>
+            <w:shd w:color="auto" w:fill="FFFFFF" w:val="clear"/>
+            <w:tcMar>
+              <w:start w:w="56" w:type="dxa"/>
+              <w:end w:w="56" w:type="dxa"/>
+            </w:tcMar>
+          </w:tcPr>
+          <w:p>
+            <w:pPr>
+              <w:pStyle w:val="normal1"/>
+              <w:suppressAutoHyphens w:val="true"/>
+              <w:spacing w:lineRule="auto" w:line="278" w:before="0" w:after="0"/>
+              <w:ind w:end="314"/>
+              <w:jc w:val="start"/>
+              <w:rPr>
+                <w:color w:val="000000"/>
+              </w:rPr>
+            </w:pPr>
+            <w:r>
+              <w:rPr>
+                <w:color w:val="000000"/>
+              </w:rPr>
+              <w:t xml:space="preserve">64,77 € </w:t>
+            </w:r>
+          </w:p>
+        </w:tc>
+        <w:tc>
+          <w:tcPr>
+            <w:tcW w:w="1481" w:type="dxa"/>
+            <w:tcBorders>
+              <w:top w:val="single" w:sz="8" w:space="0" w:color="FFFFFF"/>
+              <w:start w:val="single" w:sz="8" w:space="0" w:color="FFFFFF"/>
+              <w:bottom w:val="single" w:sz="8" w:space="0" w:color="FFFFFF"/>
+              <w:end w:val="single" w:sz="8" w:space="0" w:color="FFFFFF"/>
+            </w:tcBorders>
+            <w:shd w:color="auto" w:fill="FFFFFF" w:val="clear"/>
+            <w:tcMar>
+              <w:start w:w="56" w:type="dxa"/>
+              <w:end w:w="56" w:type="dxa"/>
+            </w:tcMar>
+            <w:vAlign w:val="center"/>
+          </w:tcPr>
+          <w:p>
+            <w:pPr>
+              <w:pStyle w:val="normal1"/>
+              <w:suppressAutoHyphens w:val="true"/>
+              <w:spacing w:lineRule="auto" w:line="278" w:before="0" w:after="0"/>
+              <w:ind w:end="314"/>
+              <w:jc w:val="start"/>
+              <w:rPr>
+                <w:color w:val="000000"/>
+              </w:rPr>
+            </w:pPr>
+            <w:r>
+              <w:rPr>
+                <w:color w:val="000000"/>
+              </w:rPr>
+              <w:t xml:space="preserve">64,77 € </w:t>
             </w:r>
           </w:p>
         </w:tc>
@@ -1588,7 +1898,7 @@
                 <w:szCs w:val="22"/>
                 <w:lang w:val="en-US" w:eastAsia="zh-CN" w:bidi="hi-IN"/>
               </w:rPr>
-              <w:t xml:space="preserve">3.268,58 €</w:t>
+              <w:t xml:space="preserve">3.255,14 €</w:t>
             </w:r>
             <w:r>
               <w:rPr>
@@ -1750,7 +2060,7 @@
                 <w:szCs w:val="22"/>
                 <w:lang w:val="en-US" w:eastAsia="zh-CN" w:bidi="hi-IN"/>
               </w:rPr>
-              <w:t xml:space="preserve">621,03 €</w:t>
+              <w:t xml:space="preserve">618,48 €</w:t>
             </w:r>
             <w:r>
               <w:rPr>
@@ -1913,7 +2223,7 @@
                 <w:szCs w:val="22"/>
                 <w:lang w:val="en-US" w:eastAsia="zh-CN" w:bidi="hi-IN"/>
               </w:rPr>
-              <w:t xml:space="preserve">3.889,61 €</w:t>
+              <w:t xml:space="preserve">3.873,62 €</w:t>
             </w:r>
             <w:r>
               <w:rPr>

</xml_diff>

<commit_message>
update material cost for bwt offer only for the file generated
</commit_message>
<xml_diff>
--- a/out-Angebot.docx
+++ b/out-Angebot.docx
@@ -329,7 +329,7 @@
                 <w:sz w:val="22"/>
                 <w:szCs w:val="22"/>
               </w:rPr>
-              <w:t xml:space="preserve">ANG2025-1126-140733</w:t>
+              <w:t xml:space="preserve">ANG2025-1126-145735</w:t>
             </w:r>
             <w:r>
               <w:rPr>
@@ -601,7 +601,7 @@
           <w:sz w:val="24"/>
           <w:szCs w:val="24"/>
         </w:rPr>
-        <w:t xml:space="preserve">  Ihr Angebot ANG2025-1126-140733</w:t>
+        <w:t xml:space="preserve">  Ihr Angebot ANG2025-1126-145735</w:t>
       </w:r>
     </w:p>
     <w:p>
@@ -1468,7 +1468,7 @@
                 <w:sz w:val="18"/>
                 <w:szCs w:val="20"/>
               </w:rPr>
-              <w:t xml:space="preserve">2.980,67 €</w:t>
+              <w:t xml:space="preserve">3.260,37 €</w:t>
             </w:r>
           </w:p>
         </w:tc>
@@ -1509,7 +1509,7 @@
                 <w:sz w:val="18"/>
                 <w:szCs w:val="20"/>
               </w:rPr>
-              <w:t xml:space="preserve">2.980,67 €</w:t>
+              <w:t xml:space="preserve">3.260,37 €</w:t>
             </w:r>
             <w:r>
               <w:rPr>

</xml_diff>

<commit_message>
update template for bwt
</commit_message>
<xml_diff>
--- a/out-Angebot.docx
+++ b/out-Angebot.docx
@@ -329,7 +329,7 @@
                 <w:sz w:val="22"/>
                 <w:szCs w:val="22"/>
               </w:rPr>
-              <w:t xml:space="preserve">ANG2025-1126-145735</w:t>
+              <w:t xml:space="preserve">ANG2025-1126-153208</w:t>
             </w:r>
             <w:r>
               <w:rPr>
@@ -601,7 +601,7 @@
           <w:sz w:val="24"/>
           <w:szCs w:val="24"/>
         </w:rPr>
-        <w:t xml:space="preserve">  Ihr Angebot ANG2025-1126-145735</w:t>
+        <w:t xml:space="preserve">  Ihr Angebot ANG2025-1126-153208</w:t>
       </w:r>
     </w:p>
     <w:p>
@@ -703,7 +703,7 @@
       <w:tblGrid>
         <w:gridCol w:w="467"/>
         <w:gridCol w:w="757"/>
-        <w:gridCol w:w="6093"/>
+        <w:gridCol w:w="6094"/>
         <w:gridCol w:w="1399"/>
         <w:gridCol w:w="943"/>
       </w:tblGrid>
@@ -961,10 +961,12 @@
               <w:right w:w="2" w:type="dxa"/>
             </w:tcMar>
             <w:tcBorders>
-              <w:top w:val="single" w:color="FFFFFF" w:sz="8" w:space="0"/>
-              <w:left w:val="single" w:color="FFFFFF" w:sz="8" w:space="0"/>
-              <w:bottom w:val="single" w:color="FFFFFF" w:sz="8" w:space="0"/>
-              <w:right w:val="single" w:color="FFFFFF" w:sz="8" w:space="0"/>
+              <w:top w:val="nil"/>
+              <w:left w:val="nil"/>
+              <w:bottom w:val="nil"/>
+              <w:right w:val="nil"/>
+              <w:insideH w:val="single" w:color="000000" w:sz="8" w:space="0"/>
+              <w:insideV w:val="single" w:color="000000" w:sz="8" w:space="0"/>
             </w:tcBorders>
             <w:shd w:fill="FFFFFF" w:color="auto" w:val="clear"/>
             <w:vAlign w:val="top"/>
@@ -976,13 +978,16 @@
               <w:spacing w:before="0" w:after="0"/>
               <w:ind/>
               <w:jc w:val="left"/>
-              <w:rPr/>
-            </w:pPr>
-            <w:r>
-              <w:rPr>
-                <w:rFonts w:eastAsia="Calibri" w:cs="Calibri"/>
+              <w:rPr>
+                <w:rFonts w:ascii="Calibri" w:eastAsia="Calibri" w:hAnsi="Calibri" w:cs="Calibri"/>
+                <w:sz w:val="18"/>
+              </w:rPr>
+            </w:pPr>
+            <w:r>
+              <w:rPr>
+                <w:rFonts w:ascii="Calibri" w:eastAsia="Calibri" w:hAnsi="Calibri" w:cs="Calibri"/>
                 <w:color w:val="070707"/>
-                <w:sz w:val="22"/>
+                <w:sz w:val="18"/>
                 <w:szCs w:val="22"/>
               </w:rPr>
               <w:t xml:space="preserve">001</w:t>
@@ -991,7 +996,7 @@
         </w:tc>
         <w:tc>
           <w:tcPr>
-            <w:tcW w:w="757" w:type="dxa"/>
+            <w:tcW w:w="467" w:type="dxa"/>
             <w:tcMar>
               <w:top w:w="0" w:type="dxa"/>
               <w:left w:w="2" w:type="dxa"/>
@@ -999,10 +1004,10 @@
               <w:right w:w="2" w:type="dxa"/>
             </w:tcMar>
             <w:tcBorders>
-              <w:top w:val="single" w:color="FFFFFF" w:sz="8" w:space="0"/>
-              <w:left w:val="single" w:color="FFFFFF" w:sz="8" w:space="0"/>
-              <w:bottom w:val="single" w:color="FFFFFF" w:sz="8" w:space="0"/>
-              <w:right w:val="single" w:color="FFFFFF" w:sz="8" w:space="0"/>
+              <w:top w:val="nil"/>
+              <w:left w:val="nil"/>
+              <w:bottom w:val="nil"/>
+              <w:right w:val="nil"/>
             </w:tcBorders>
             <w:shd w:fill="FFFFFF" w:color="auto" w:val="clear"/>
             <w:vAlign w:val="top"/>
@@ -1015,17 +1020,17 @@
               <w:ind/>
               <w:jc w:val="left"/>
               <w:rPr>
-                <w:rFonts w:ascii="Open Sans" w:eastAsia="Open Sans" w:hAnsi="Open Sans" w:cs="Open Sans"/>
+                <w:rFonts w:ascii="Calibri" w:eastAsia="Calibri" w:hAnsi="Calibri" w:cs="Calibri"/>
                 <w:color w:val="070707"/>
-                <w:sz w:val="20"/>
+                <w:sz w:val="18"/>
                 <w:szCs w:val="20"/>
               </w:rPr>
             </w:pPr>
             <w:r>
               <w:rPr>
-                <w:rFonts w:ascii="Open Sans" w:eastAsia="Open Sans" w:hAnsi="Open Sans" w:cs="Open Sans"/>
+                <w:rFonts w:ascii="Calibri" w:eastAsia="Calibri" w:hAnsi="Calibri" w:cs="Calibri"/>
                 <w:color w:val="070707"/>
-                <w:sz w:val="20"/>
+                <w:sz w:val="18"/>
                 <w:szCs w:val="20"/>
               </w:rPr>
               <w:t xml:space="preserve">1 Stk</w:t>
@@ -1034,7 +1039,7 @@
         </w:tc>
         <w:tc>
           <w:tcPr>
-            <w:tcW w:w="6093" w:type="dxa"/>
+            <w:tcW w:w="467" w:type="dxa"/>
             <w:tcMar>
               <w:top w:w="0" w:type="dxa"/>
               <w:left w:w="2" w:type="dxa"/>
@@ -1042,10 +1047,12 @@
               <w:right w:w="2" w:type="dxa"/>
             </w:tcMar>
             <w:tcBorders>
-              <w:top w:val="single" w:color="FFFFFF" w:sz="8" w:space="0"/>
-              <w:left w:val="single" w:color="FFFFFF" w:sz="8" w:space="0"/>
-              <w:bottom w:val="single" w:color="FFFFFF" w:sz="8" w:space="0"/>
-              <w:right w:val="single" w:color="FFFFFF" w:sz="8" w:space="0"/>
+              <w:top w:val="nil"/>
+              <w:left w:val="nil"/>
+              <w:bottom w:val="nil"/>
+              <w:right w:val="nil"/>
+              <w:insideH w:val="single" w:color="000000" w:sz="8" w:space="0"/>
+              <w:insideV w:val="single" w:color="000000" w:sz="8" w:space="0"/>
             </w:tcBorders>
             <w:shd w:fill="FFFFFF" w:color="auto" w:val="clear"/>
             <w:vAlign w:val="top"/>
@@ -1433,7 +1440,7 @@
         </w:tc>
         <w:tc>
           <w:tcPr>
-            <w:tcW w:w="1399" w:type="dxa"/>
+            <w:tcW w:w="467" w:type="dxa"/>
             <w:tcMar>
               <w:top w:w="0" w:type="dxa"/>
               <w:left w:w="2" w:type="dxa"/>
@@ -1441,10 +1448,10 @@
               <w:right w:w="2" w:type="dxa"/>
             </w:tcMar>
             <w:tcBorders>
-              <w:top w:val="single" w:color="FFFFFF" w:sz="8" w:space="0"/>
-              <w:left w:val="single" w:color="FFFFFF" w:sz="8" w:space="0"/>
-              <w:bottom w:val="single" w:color="FFFFFF" w:sz="8" w:space="0"/>
-              <w:right w:val="single" w:color="FFFFFF" w:sz="8" w:space="0"/>
+              <w:top w:val="nil"/>
+              <w:left w:val="nil"/>
+              <w:bottom w:val="nil"/>
+              <w:right w:val="nil"/>
             </w:tcBorders>
             <w:shd w:fill="FFFFFF" w:color="auto" w:val="clear"/>
             <w:vAlign w:val="top"/>
@@ -1457,24 +1464,25 @@
               <w:ind w:right="34"/>
               <w:jc w:val="center"/>
               <w:rPr>
-                <w:color w:val="000000"/>
-                <w:sz w:val="18"/>
-              </w:rPr>
-            </w:pPr>
-            <w:r>
-              <w:rPr>
-                <w:rFonts w:ascii="Open Sans" w:eastAsia="Open Sans" w:hAnsi="Open Sans" w:cs="Open Sans"/>
+                <w:rFonts w:ascii="Calibri" w:eastAsia="Calibri" w:hAnsi="Calibri" w:cs="Calibri"/>
+                <w:color w:val="000000"/>
+                <w:sz w:val="18"/>
+              </w:rPr>
+            </w:pPr>
+            <w:r>
+              <w:rPr>
+                <w:rFonts w:ascii="Calibri" w:eastAsia="Calibri" w:hAnsi="Calibri" w:cs="Calibri"/>
                 <w:color w:val="000000"/>
                 <w:sz w:val="18"/>
                 <w:szCs w:val="20"/>
               </w:rPr>
-              <w:t xml:space="preserve">3.260,37 €</w:t>
+              <w:t xml:space="preserve">3.470,37 €</w:t>
             </w:r>
           </w:p>
         </w:tc>
         <w:tc>
           <w:tcPr>
-            <w:tcW w:w="943" w:type="dxa"/>
+            <w:tcW w:w="467" w:type="dxa"/>
             <w:tcMar>
               <w:top w:w="0" w:type="dxa"/>
               <w:left w:w="2" w:type="dxa"/>
@@ -1482,10 +1490,10 @@
               <w:right w:w="2" w:type="dxa"/>
             </w:tcMar>
             <w:tcBorders>
-              <w:top w:val="single" w:color="FFFFFF" w:sz="8" w:space="0"/>
-              <w:left w:val="single" w:color="FFFFFF" w:sz="8" w:space="0"/>
-              <w:bottom w:val="single" w:color="FFFFFF" w:sz="8" w:space="0"/>
-              <w:right w:val="single" w:color="FFFFFF" w:sz="8" w:space="0"/>
+              <w:top w:val="nil"/>
+              <w:left w:val="nil"/>
+              <w:bottom w:val="nil"/>
+              <w:right w:val="nil"/>
             </w:tcBorders>
             <w:shd w:fill="FFFFFF" w:color="auto" w:val="clear"/>
             <w:vAlign w:val="top"/>
@@ -1498,22 +1506,23 @@
               <w:ind w:left="-141" w:right="34"/>
               <w:jc w:val="center"/>
               <w:rPr>
-                <w:color w:val="000000"/>
-                <w:sz w:val="18"/>
-              </w:rPr>
-            </w:pPr>
-            <w:r>
-              <w:rPr>
-                <w:rFonts w:ascii="Open Sans" w:eastAsia="Open Sans" w:hAnsi="Open Sans" w:cs="Open Sans"/>
+                <w:rFonts w:ascii="Calibri" w:eastAsia="Calibri" w:hAnsi="Calibri" w:cs="Calibri"/>
+                <w:color w:val="000000"/>
+                <w:sz w:val="18"/>
+              </w:rPr>
+            </w:pPr>
+            <w:r>
+              <w:rPr>
+                <w:rFonts w:ascii="Calibri" w:eastAsia="Calibri" w:hAnsi="Calibri" w:cs="Calibri"/>
                 <w:color w:val="000000"/>
                 <w:sz w:val="18"/>
                 <w:szCs w:val="20"/>
               </w:rPr>
-              <w:t xml:space="preserve">3.260,37 €</w:t>
-            </w:r>
-            <w:r>
-              <w:rPr>
-                <w:rFonts w:ascii="Open Sans" w:eastAsia="Open Sans" w:hAnsi="Open Sans" w:cs="Open Sans"/>
+              <w:t xml:space="preserve">3.470,37 €</w:t>
+            </w:r>
+            <w:r>
+              <w:rPr>
+                <w:rFonts w:ascii="Calibri" w:eastAsia="Calibri" w:hAnsi="Calibri" w:cs="Calibri"/>
                 <w:color w:val="000000"/>
                 <w:sz w:val="18"/>
                 <w:szCs w:val="20"/>
@@ -1546,10 +1555,10 @@
               <w:right w:w="2" w:type="dxa"/>
             </w:tcMar>
             <w:tcBorders>
-              <w:top w:val="single" w:color="FFFFFF" w:sz="8" w:space="0"/>
-              <w:left w:val="single" w:color="FFFFFF" w:sz="8" w:space="0"/>
-              <w:bottom w:val="single" w:color="FFFFFF" w:sz="8" w:space="0"/>
-              <w:right w:val="single" w:color="FFFFFF" w:sz="8" w:space="0"/>
+              <w:top w:val="nil"/>
+              <w:left w:val="nil"/>
+              <w:bottom w:val="nil"/>
+              <w:right w:val="nil"/>
             </w:tcBorders>
             <w:shd w:fill="FFFFFF" w:color="auto" w:val="clear"/>
             <w:vAlign w:val="top"/>
@@ -1567,40 +1576,26 @@
                 <w:tab w:val="left" w:pos="1416.0000610351562"/>
               </w:tabs>
               <w:rPr>
-                <w:rFonts w:ascii="Open Sans" w:eastAsia="Open Sans" w:hAnsi="Open Sans" w:cs="Open Sans"/>
+                <w:rFonts w:ascii="Calibri" w:eastAsia="Calibri" w:hAnsi="Calibri" w:cs="Calibri"/>
                 <w:color w:val="070707"/>
-                <w:sz w:val="20"/>
+                <w:sz w:val="18"/>
                 <w:szCs w:val="20"/>
               </w:rPr>
             </w:pPr>
             <w:r>
               <w:rPr>
-                <w:rFonts w:ascii="Open Sans" w:eastAsia="Open Sans" w:hAnsi="Open Sans" w:cs="Open Sans"/>
+                <w:rFonts w:ascii="Calibri" w:eastAsia="Calibri" w:hAnsi="Calibri" w:cs="Calibri"/>
                 <w:color w:val="070707"/>
-                <w:sz w:val="20"/>
+                <w:sz w:val="18"/>
                 <w:szCs w:val="20"/>
               </w:rPr>
-              <w:t xml:space="preserve">002 </w:t>
-            </w:r>
-          </w:p>
-          <w:p>
-            <w:pPr>
-              <w:pBdr/>
-              <w:pStyle w:val="normal1"/>
-              <w:spacing w:before="100" w:beforeAutospacing="true" w:after="0" w:afterAutospacing="false" w:line="240" w:lineRule="auto"/>
-              <w:ind w:left="0" w:right="0"/>
-              <w:jc w:val="left"/>
-              <w:rPr>
-                <w:rFonts w:ascii="Calibri" w:eastAsia="Calibri" w:hAnsi="Calibri" w:cs="Calibri"/>
-                <w:sz w:val="22"/>
-                <w:szCs w:val="22"/>
-              </w:rPr>
-            </w:pPr>
+              <w:t xml:space="preserve">002</w:t>
+            </w:r>
           </w:p>
         </w:tc>
         <w:tc>
           <w:tcPr>
-            <w:tcW w:w="757" w:type="dxa"/>
+            <w:tcW w:w="467" w:type="dxa"/>
             <w:tcMar>
               <w:top w:w="0" w:type="dxa"/>
               <w:left w:w="2" w:type="dxa"/>
@@ -1608,10 +1603,10 @@
               <w:right w:w="2" w:type="dxa"/>
             </w:tcMar>
             <w:tcBorders>
-              <w:top w:val="single" w:color="FFFFFF" w:sz="8" w:space="0"/>
-              <w:left w:val="single" w:color="FFFFFF" w:sz="8" w:space="0"/>
-              <w:bottom w:val="single" w:color="FFFFFF" w:sz="8" w:space="0"/>
-              <w:right w:val="single" w:color="FFFFFF" w:sz="8" w:space="0"/>
+              <w:top w:val="nil"/>
+              <w:left w:val="nil"/>
+              <w:bottom w:val="nil"/>
+              <w:right w:val="nil"/>
             </w:tcBorders>
             <w:shd w:fill="FFFFFF" w:color="auto" w:val="clear"/>
             <w:vAlign w:val="top"/>
@@ -1623,17 +1618,23 @@
               <w:spacing w:before="100" w:beforeAutospacing="true" w:afterAutospacing="false" w:line="240" w:lineRule="auto"/>
               <w:ind w:left="0" w:right="0"/>
               <w:jc w:val="left"/>
-              <w:rPr/>
-            </w:pPr>
-            <w:r>
-              <w:rPr/>
+              <w:rPr>
+                <w:rFonts w:ascii="Calibri" w:eastAsia="Calibri" w:hAnsi="Calibri" w:cs="Calibri"/>
+                <w:sz w:val="18"/>
+              </w:rPr>
+            </w:pPr>
+            <w:r>
+              <w:rPr>
+                <w:rFonts w:ascii="Calibri" w:eastAsia="Calibri" w:hAnsi="Calibri" w:cs="Calibri"/>
+                <w:sz w:val="18"/>
+              </w:rPr>
               <w:t xml:space="preserve">1 Stk </w:t>
             </w:r>
           </w:p>
         </w:tc>
         <w:tc>
           <w:tcPr>
-            <w:tcW w:w="6093" w:type="dxa"/>
+            <w:tcW w:w="467" w:type="dxa"/>
             <w:tcMar>
               <w:top w:w="0" w:type="dxa"/>
               <w:left w:w="2" w:type="dxa"/>
@@ -1641,10 +1642,10 @@
               <w:right w:w="2" w:type="dxa"/>
             </w:tcMar>
             <w:tcBorders>
-              <w:top w:val="single" w:color="FFFFFF" w:sz="8" w:space="0"/>
-              <w:left w:val="single" w:color="FFFFFF" w:sz="8" w:space="0"/>
-              <w:bottom w:val="single" w:color="FFFFFF" w:sz="8" w:space="0"/>
-              <w:right w:val="single" w:color="FFFFFF" w:sz="8" w:space="0"/>
+              <w:top w:val="nil"/>
+              <w:left w:val="nil"/>
+              <w:bottom w:val="nil"/>
+              <w:right w:val="nil"/>
             </w:tcBorders>
             <w:shd w:fill="FFFFFF" w:color="auto" w:val="clear"/>
             <w:vAlign w:val="top"/>
@@ -1705,7 +1706,7 @@
         </w:tc>
         <w:tc>
           <w:tcPr>
-            <w:tcW w:w="1399" w:type="dxa"/>
+            <w:tcW w:w="467" w:type="dxa"/>
             <w:tcMar>
               <w:top w:w="0" w:type="dxa"/>
               <w:left w:w="2" w:type="dxa"/>
@@ -1713,10 +1714,10 @@
               <w:right w:w="2" w:type="dxa"/>
             </w:tcMar>
             <w:tcBorders>
-              <w:top w:val="single" w:color="FFFFFF" w:sz="8" w:space="0"/>
-              <w:left w:val="single" w:color="FFFFFF" w:sz="8" w:space="0"/>
-              <w:bottom w:val="single" w:color="FFFFFF" w:sz="8" w:space="0"/>
-              <w:right w:val="single" w:color="FFFFFF" w:sz="8" w:space="0"/>
+              <w:top w:val="nil"/>
+              <w:left w:val="nil"/>
+              <w:bottom w:val="nil"/>
+              <w:right w:val="nil"/>
             </w:tcBorders>
             <w:shd w:fill="FFFFFF" w:color="auto" w:val="clear"/>
             <w:vAlign w:val="top"/>
@@ -1729,12 +1730,14 @@
               <w:ind w:left="0" w:right="0"/>
               <w:jc w:val="left"/>
               <w:rPr>
-                <w:color w:val="000000"/>
-                <w:sz w:val="18"/>
-              </w:rPr>
-            </w:pPr>
-            <w:r>
-              <w:rPr>
+                <w:rFonts w:ascii="Calibri" w:eastAsia="Calibri" w:hAnsi="Calibri" w:cs="Calibri"/>
+                <w:color w:val="000000"/>
+                <w:sz w:val="18"/>
+              </w:rPr>
+            </w:pPr>
+            <w:r>
+              <w:rPr>
+                <w:rFonts w:ascii="Calibri" w:eastAsia="Calibri" w:hAnsi="Calibri" w:cs="Calibri"/>
                 <w:color w:val="000000"/>
                 <w:sz w:val="18"/>
               </w:rPr>
@@ -1744,7 +1747,7 @@
         </w:tc>
         <w:tc>
           <w:tcPr>
-            <w:tcW w:w="943" w:type="dxa"/>
+            <w:tcW w:w="467" w:type="dxa"/>
             <w:tcMar>
               <w:top w:w="0" w:type="dxa"/>
               <w:left w:w="2" w:type="dxa"/>
@@ -1752,13 +1755,13 @@
               <w:right w:w="2" w:type="dxa"/>
             </w:tcMar>
             <w:tcBorders>
-              <w:top w:val="single" w:color="FFFFFF" w:sz="8" w:space="0"/>
-              <w:left w:val="single" w:color="FFFFFF" w:sz="8" w:space="0"/>
-              <w:bottom w:val="single" w:color="FFFFFF" w:sz="8" w:space="0"/>
-              <w:right w:val="single" w:color="FFFFFF" w:sz="8" w:space="0"/>
+              <w:top w:val="nil"/>
+              <w:left w:val="nil"/>
+              <w:bottom w:val="nil"/>
+              <w:right w:val="nil"/>
             </w:tcBorders>
             <w:shd w:fill="FFFFFF" w:color="auto" w:val="clear"/>
-            <w:vAlign w:val="center"/>
+            <w:vAlign w:val="top"/>
           </w:tcPr>
           <w:p>
             <w:pPr>
@@ -1766,14 +1769,16 @@
               <w:pStyle w:val="normal1"/>
               <w:spacing w:before="100" w:beforeAutospacing="true" w:after="0" w:afterAutospacing="false" w:line="240" w:lineRule="auto"/>
               <w:ind w:left="0" w:right="0"/>
-              <w:jc w:val="left"/>
-              <w:rPr>
-                <w:color w:val="000000"/>
-                <w:sz w:val="18"/>
-              </w:rPr>
-            </w:pPr>
-            <w:r>
-              <w:rPr>
+              <w:jc w:val="both"/>
+              <w:rPr>
+                <w:rFonts w:ascii="Calibri" w:eastAsia="Calibri" w:hAnsi="Calibri" w:cs="Calibri"/>
+                <w:color w:val="000000"/>
+                <w:sz w:val="18"/>
+              </w:rPr>
+            </w:pPr>
+            <w:r>
+              <w:rPr>
+                <w:rFonts w:ascii="Calibri" w:eastAsia="Calibri" w:hAnsi="Calibri" w:cs="Calibri"/>
                 <w:color w:val="000000"/>
                 <w:sz w:val="18"/>
               </w:rPr>
@@ -1781,10 +1786,11 @@
             </w:r>
             <w:r>
               <w:rPr>
-                <w:color w:val="000000"/>
-                <w:sz w:val="18"/>
-              </w:rPr>
-              <w:t xml:space="preserve"> </w:t>
+                <w:rFonts w:ascii="Calibri" w:eastAsia="Calibri" w:hAnsi="Calibri" w:cs="Calibri"/>
+                <w:color w:val="000000"/>
+                <w:sz w:val="18"/>
+              </w:rPr>
+              <w:t/>
             </w:r>
           </w:p>
         </w:tc>
@@ -1809,28 +1815,11 @@
         </w:rPr>
       </w:pPr>
     </w:p>
-    <w:p>
-      <w:pPr>
-        <w:pBdr/>
-        <w:pStyle w:val="normal1"/>
-        <w:spacing w:before="121" w:after="0"/>
-        <w:ind/>
-        <w:tabs>
-          <w:tab w:val="clear" w:pos="720"/>
-          <w:tab w:val="left" w:pos="750"/>
-          <w:tab w:val="left" w:pos="1416.0000610351562"/>
-        </w:tabs>
-        <w:rPr>
-          <w:rFonts w:ascii="Open Sans" w:eastAsia="Open Sans" w:hAnsi="Open Sans" w:cs="Open Sans"/>
-          <w:color w:val="070707"/>
-          <w:sz w:val="20"/>
-          <w:szCs w:val="20"/>
-        </w:rPr>
-      </w:pPr>
-    </w:p>
     <w:tbl>
       <w:tblPr>
         <w:tblStyle w:val="TableNormal"/>
+        <w:tblDescription w:val=""/>
+        <w:tblCaption w:val=""/>
         <w:tblW w:w="9660" w:type="dxa"/>
         <w:jc w:val="left"/>
         <w:tblInd w:w="1" w:type="dxa"/>
@@ -1845,10 +1834,10 @@
         <w:tblLayout w:type="fixed"/>
       </w:tblPr>
       <w:tblGrid>
-        <w:gridCol w:w="3915"/>
-        <w:gridCol w:w="915"/>
-        <w:gridCol w:w="2102"/>
-        <w:gridCol w:w="2728"/>
+        <w:gridCol w:w="2415"/>
+        <w:gridCol w:w="2415"/>
+        <w:gridCol w:w="2415"/>
+        <w:gridCol w:w="2415"/>
       </w:tblGrid>
       <w:tr>
         <w:tblPrEx>
@@ -1861,11 +1850,69 @@
           </w:tblCellMar>
         </w:tblPrEx>
         <w:trPr>
-          <w:trHeight w:hRule="atLeast" w:val="1"/>
+          <w:trHeight w:hRule="atLeast" w:val="20"/>
         </w:trPr>
         <w:tc>
           <w:tcPr>
             <w:tcW w:w="3915" w:type="dxa"/>
+            <w:tcMar>
+              <w:top w:w="0" w:type="dxa"/>
+              <w:left w:w="88" w:type="dxa"/>
+              <w:bottom w:w="0" w:type="dxa"/>
+              <w:right w:w="8" w:type="dxa"/>
+            </w:tcMar>
+            <w:tcBorders>
+              <w:top w:val="single" w:color="FFFFFF" w:sz="8" w:space="0"/>
+              <w:left w:val="single" w:color="D9D9D9" w:sz="8" w:space="0"/>
+              <w:bottom w:val="single" w:color="FFFFFF" w:sz="8" w:space="0"/>
+              <w:right w:val="single" w:color="D9D9D9" w:sz="8" w:space="0"/>
+            </w:tcBorders>
+            <w:shd w:fill="D9D9D9" w:color="auto" w:val="clear"/>
+            <w:vAlign w:val="top"/>
+          </w:tcPr>
+          <w:p>
+            <w:pPr>
+              <w:pBdr/>
+              <w:pStyle w:val="normal1"/>
+              <w:spacing w:before="56" w:after="0"/>
+              <w:ind w:left="0"/>
+              <w:jc w:val="left"/>
+              <w:rPr>
+                <w:rFonts w:ascii="Calibri" w:eastAsia="Calibri" w:hAnsi="Calibri" w:cs="Calibri"/>
+                <w:sz w:val="22"/>
+                <w:szCs w:val="22"/>
+              </w:rPr>
+            </w:pPr>
+            <w:r>
+              <w:rPr>
+                <w:rFonts w:ascii="Open Sans Semibold" w:eastAsia="Open Sans Semibold" w:hAnsi="Open Sans Semibold" w:cs="Open Sans Semibold"/>
+                <w:color w:val="030303"/>
+                <w:sz w:val="20"/>
+                <w:szCs w:val="20"/>
+              </w:rPr>
+              <w:t/>
+            </w:r>
+            <w:r>
+              <w:rPr>
+                <w:rFonts w:ascii="Open Sans Semibold" w:eastAsia="Open Sans Semibold" w:hAnsi="Open Sans Semibold" w:cs="Open Sans Semibold"/>
+                <w:b/>
+                <w:color w:val="030303"/>
+                <w:sz w:val="20"/>
+                <w:szCs w:val="20"/>
+              </w:rPr>
+              <w:t xml:space="preserve">Nettobetrag</w:t>
+            </w:r>
+          </w:p>
+        </w:tc>
+        <w:tc>
+          <w:tcPr>
+            <w:tcW w:w="3915" w:type="dxa"/>
+            <w:tcMar>
+              <w:top w:w="0" w:type="dxa"/>
+              <w:left w:w="88" w:type="dxa"/>
+              <w:bottom w:w="0" w:type="dxa"/>
+              <w:right w:w="8" w:type="dxa"/>
+            </w:tcMar>
             <w:tcBorders>
               <w:top w:val="single" w:color="FFFFFF" w:sz="8" w:space="0"/>
               <w:left w:val="single" w:color="D9D9D9" w:sz="8" w:space="0"/>
@@ -1879,39 +1926,24 @@
             <w:pPr>
               <w:pBdr/>
               <w:pStyle w:val="normal1"/>
-              <w:spacing w:before="56" w:after="0"/>
-              <w:ind w:left="0"/>
+              <w:spacing w:before="0" w:after="0"/>
+              <w:ind/>
               <w:jc w:val="left"/>
               <w:rPr>
-                <w:rFonts w:ascii="Calibri" w:eastAsia="Calibri" w:hAnsi="Calibri" w:cs="Calibri"/>
-                <w:sz w:val="22"/>
-                <w:szCs w:val="22"/>
-              </w:rPr>
-            </w:pPr>
-            <w:r>
-              <w:rPr>
-                <w:rFonts w:ascii="Open Sans Semibold" w:eastAsia="Open Sans Semibold" w:hAnsi="Open Sans Semibold" w:cs="Open Sans Semibold"/>
-                <w:color w:val="030303"/>
-                <w:sz w:val="20"/>
-                <w:szCs w:val="20"/>
-              </w:rPr>
-              <w:t/>
-            </w:r>
-            <w:r>
-              <w:rPr>
-                <w:rFonts w:ascii="Open Sans Semibold" w:eastAsia="Open Sans Semibold" w:hAnsi="Open Sans Semibold" w:cs="Open Sans Semibold"/>
-                <w:b/>
-                <w:color w:val="030303"/>
-                <w:sz w:val="20"/>
-                <w:szCs w:val="20"/>
-              </w:rPr>
-              <w:t xml:space="preserve">Nettobetrag</w:t>
-            </w:r>
+                <w:color w:val="000000"/>
+              </w:rPr>
+            </w:pPr>
           </w:p>
         </w:tc>
         <w:tc>
           <w:tcPr>
-            <w:tcW w:w="915" w:type="dxa"/>
+            <w:tcW w:w="3915" w:type="dxa"/>
+            <w:tcMar>
+              <w:top w:w="0" w:type="dxa"/>
+              <w:left w:w="88" w:type="dxa"/>
+              <w:bottom w:w="0" w:type="dxa"/>
+              <w:right w:w="8" w:type="dxa"/>
+            </w:tcMar>
             <w:tcBorders>
               <w:top w:val="single" w:color="FFFFFF" w:sz="8" w:space="0"/>
               <w:left w:val="single" w:color="D9D9D9" w:sz="8" w:space="0"/>
@@ -1936,7 +1968,13 @@
         </w:tc>
         <w:tc>
           <w:tcPr>
-            <w:tcW w:w="2102" w:type="dxa"/>
+            <w:tcW w:w="3915" w:type="dxa"/>
+            <w:tcMar>
+              <w:top w:w="0" w:type="dxa"/>
+              <w:left w:w="88" w:type="dxa"/>
+              <w:bottom w:w="0" w:type="dxa"/>
+              <w:right w:w="8" w:type="dxa"/>
+            </w:tcMar>
             <w:tcBorders>
               <w:top w:val="single" w:color="FFFFFF" w:sz="8" w:space="0"/>
               <w:left w:val="single" w:color="D9D9D9" w:sz="8" w:space="0"/>
@@ -1950,33 +1988,9 @@
             <w:pPr>
               <w:pBdr/>
               <w:pStyle w:val="normal1"/>
-              <w:spacing w:before="0" w:after="0"/>
-              <w:ind/>
-              <w:jc w:val="left"/>
-              <w:rPr>
-                <w:color w:val="000000"/>
-              </w:rPr>
-            </w:pPr>
-          </w:p>
-        </w:tc>
-        <w:tc>
-          <w:tcPr>
-            <w:tcW w:w="2728" w:type="dxa"/>
-            <w:tcBorders>
-              <w:top w:val="single" w:color="FFFFFF" w:sz="8" w:space="0"/>
-              <w:left w:val="single" w:color="D9D9D9" w:sz="8" w:space="0"/>
-              <w:bottom w:val="single" w:color="FFFFFF" w:sz="8" w:space="0"/>
-              <w:right w:val="single" w:color="D9D9D9" w:sz="8" w:space="0"/>
-            </w:tcBorders>
-            <w:shd w:fill="D9D9D9" w:color="auto" w:val="clear"/>
-            <w:vAlign w:val="center"/>
-          </w:tcPr>
-          <w:p>
-            <w:pPr>
-              <w:pBdr/>
-              <w:pStyle w:val="normal1"/>
-              <w:spacing w:before="0" w:after="0" w:line="278" w:lineRule="auto"/>
-              <w:ind w:right="314"/>
+              <w:spacing w:before="0" w:beforeAutospacing="false" w:after="0" w:afterAutospacing="false" w:line="278" w:lineRule="auto"/>
+              <w:contextualSpacing/>
+              <w:ind w:left="0" w:right="314"/>
               <w:jc w:val="right"/>
               <w:rPr>
                 <w:color w:val="000000"/>
@@ -1990,7 +2004,7 @@
                 <w:sz w:val="22"/>
                 <w:szCs w:val="22"/>
               </w:rPr>
-              <w:t xml:space="preserve">3.325,14 €</w:t>
+              <w:t xml:space="preserve">3.535,14 €</w:t>
             </w:r>
             <w:r>
               <w:rPr>
@@ -2015,11 +2029,69 @@
           </w:tblCellMar>
         </w:tblPrEx>
         <w:trPr>
-          <w:trHeight w:hRule="atLeast" w:val="285"/>
+          <w:trHeight w:hRule="atLeast" w:val="20"/>
         </w:trPr>
         <w:tc>
           <w:tcPr>
             <w:tcW w:w="3915" w:type="dxa"/>
+            <w:tcMar>
+              <w:top w:w="0" w:type="dxa"/>
+              <w:left w:w="88" w:type="dxa"/>
+              <w:bottom w:w="0" w:type="dxa"/>
+              <w:right w:w="8" w:type="dxa"/>
+            </w:tcMar>
+            <w:tcBorders>
+              <w:top w:val="single" w:color="FFFFFF" w:sz="8" w:space="0"/>
+              <w:left w:val="single" w:color="FFFFFF" w:sz="8" w:space="0"/>
+              <w:bottom w:val="single" w:color="FFFFFF" w:sz="8" w:space="0"/>
+              <w:right w:val="single" w:color="FFFFFF" w:sz="8" w:space="0"/>
+            </w:tcBorders>
+            <w:shd w:fill="FFFFFF" w:color="auto" w:val="clear"/>
+            <w:vAlign w:val="top"/>
+          </w:tcPr>
+          <w:p>
+            <w:pPr>
+              <w:pBdr/>
+              <w:pStyle w:val="normal1"/>
+              <w:spacing w:before="57" w:after="0"/>
+              <w:ind/>
+              <w:jc w:val="left"/>
+              <w:rPr>
+                <w:rFonts w:ascii="Calibri" w:eastAsia="Calibri" w:hAnsi="Calibri" w:cs="Calibri"/>
+                <w:sz w:val="22"/>
+                <w:szCs w:val="22"/>
+              </w:rPr>
+            </w:pPr>
+            <w:r>
+              <w:rPr>
+                <w:rFonts w:ascii="Open Sans Semibold" w:eastAsia="Open Sans Semibold" w:hAnsi="Open Sans Semibold" w:cs="Open Sans Semibold"/>
+                <w:color w:val="030303"/>
+                <w:sz w:val="20"/>
+                <w:szCs w:val="20"/>
+              </w:rPr>
+              <w:t/>
+            </w:r>
+            <w:r>
+              <w:rPr>
+                <w:rFonts w:ascii="Open Sans Semibold" w:eastAsia="Open Sans Semibold" w:hAnsi="Open Sans Semibold" w:cs="Open Sans Semibold"/>
+                <w:b/>
+                <w:color w:val="030303"/>
+                <w:sz w:val="20"/>
+                <w:szCs w:val="20"/>
+              </w:rPr>
+              <w:t xml:space="preserve">zzgl. 19% MwSt.</w:t>
+            </w:r>
+          </w:p>
+        </w:tc>
+        <w:tc>
+          <w:tcPr>
+            <w:tcW w:w="3915" w:type="dxa"/>
+            <w:tcMar>
+              <w:top w:w="0" w:type="dxa"/>
+              <w:left w:w="88" w:type="dxa"/>
+              <w:bottom w:w="0" w:type="dxa"/>
+              <w:right w:w="8" w:type="dxa"/>
+            </w:tcMar>
             <w:tcBorders>
               <w:top w:val="single" w:color="FFFFFF" w:sz="8" w:space="0"/>
               <w:left w:val="single" w:color="FFFFFF" w:sz="8" w:space="0"/>
@@ -2033,39 +2105,24 @@
             <w:pPr>
               <w:pBdr/>
               <w:pStyle w:val="normal1"/>
-              <w:spacing w:before="57" w:after="0"/>
+              <w:spacing w:before="0" w:after="0"/>
               <w:ind/>
               <w:jc w:val="left"/>
               <w:rPr>
-                <w:rFonts w:ascii="Calibri" w:eastAsia="Calibri" w:hAnsi="Calibri" w:cs="Calibri"/>
-                <w:sz w:val="22"/>
-                <w:szCs w:val="22"/>
-              </w:rPr>
-            </w:pPr>
-            <w:r>
-              <w:rPr>
-                <w:rFonts w:ascii="Open Sans Semibold" w:eastAsia="Open Sans Semibold" w:hAnsi="Open Sans Semibold" w:cs="Open Sans Semibold"/>
-                <w:color w:val="030303"/>
-                <w:sz w:val="20"/>
-                <w:szCs w:val="20"/>
-              </w:rPr>
-              <w:t/>
-            </w:r>
-            <w:r>
-              <w:rPr>
-                <w:rFonts w:ascii="Open Sans Semibold" w:eastAsia="Open Sans Semibold" w:hAnsi="Open Sans Semibold" w:cs="Open Sans Semibold"/>
-                <w:b/>
-                <w:color w:val="030303"/>
-                <w:sz w:val="20"/>
-                <w:szCs w:val="20"/>
-              </w:rPr>
-              <w:t xml:space="preserve">zzgl. 19% MwSt.</w:t>
-            </w:r>
+                <w:color w:val="000000"/>
+              </w:rPr>
+            </w:pPr>
           </w:p>
         </w:tc>
         <w:tc>
           <w:tcPr>
-            <w:tcW w:w="915" w:type="dxa"/>
+            <w:tcW w:w="3915" w:type="dxa"/>
+            <w:tcMar>
+              <w:top w:w="0" w:type="dxa"/>
+              <w:left w:w="88" w:type="dxa"/>
+              <w:bottom w:w="0" w:type="dxa"/>
+              <w:right w:w="8" w:type="dxa"/>
+            </w:tcMar>
             <w:tcBorders>
               <w:top w:val="single" w:color="FFFFFF" w:sz="8" w:space="0"/>
               <w:left w:val="single" w:color="FFFFFF" w:sz="8" w:space="0"/>
@@ -2090,7 +2147,13 @@
         </w:tc>
         <w:tc>
           <w:tcPr>
-            <w:tcW w:w="2102" w:type="dxa"/>
+            <w:tcW w:w="3915" w:type="dxa"/>
+            <w:tcMar>
+              <w:top w:w="0" w:type="dxa"/>
+              <w:left w:w="88" w:type="dxa"/>
+              <w:bottom w:w="0" w:type="dxa"/>
+              <w:right w:w="8" w:type="dxa"/>
+            </w:tcMar>
             <w:tcBorders>
               <w:top w:val="single" w:color="FFFFFF" w:sz="8" w:space="0"/>
               <w:left w:val="single" w:color="FFFFFF" w:sz="8" w:space="0"/>
@@ -2104,33 +2167,9 @@
             <w:pPr>
               <w:pBdr/>
               <w:pStyle w:val="normal1"/>
-              <w:spacing w:before="0" w:after="0"/>
-              <w:ind/>
-              <w:jc w:val="left"/>
-              <w:rPr>
-                <w:color w:val="000000"/>
-              </w:rPr>
-            </w:pPr>
-          </w:p>
-        </w:tc>
-        <w:tc>
-          <w:tcPr>
-            <w:tcW w:w="2728" w:type="dxa"/>
-            <w:tcBorders>
-              <w:top w:val="single" w:color="FFFFFF" w:sz="8" w:space="0"/>
-              <w:left w:val="single" w:color="FFFFFF" w:sz="8" w:space="0"/>
-              <w:bottom w:val="single" w:color="FFFFFF" w:sz="8" w:space="0"/>
-              <w:right w:val="single" w:color="FFFFFF" w:sz="8" w:space="0"/>
-            </w:tcBorders>
-            <w:shd w:fill="FFFFFF" w:color="auto" w:val="clear"/>
-            <w:vAlign w:val="center"/>
-          </w:tcPr>
-          <w:p>
-            <w:pPr>
-              <w:pBdr/>
-              <w:pStyle w:val="normal1"/>
-              <w:spacing w:before="0" w:after="0" w:line="278" w:lineRule="auto"/>
-              <w:ind w:right="314"/>
+              <w:spacing w:before="0" w:beforeAutospacing="false" w:after="0" w:afterAutospacing="false" w:line="278" w:lineRule="auto"/>
+              <w:contextualSpacing/>
+              <w:ind w:left="0" w:right="314"/>
               <w:jc w:val="right"/>
               <w:rPr>
                 <w:color w:val="000000"/>
@@ -2144,7 +2183,7 @@
                 <w:sz w:val="22"/>
                 <w:szCs w:val="22"/>
               </w:rPr>
-              <w:t xml:space="preserve">631,78 €</w:t>
+              <w:t xml:space="preserve">671,68 €</w:t>
             </w:r>
             <w:r>
               <w:rPr>
@@ -2169,11 +2208,69 @@
           </w:tblCellMar>
         </w:tblPrEx>
         <w:trPr>
-          <w:trHeight w:hRule="atLeast" w:val="1"/>
+          <w:trHeight w:hRule="atLeast" w:val="20"/>
         </w:trPr>
         <w:tc>
           <w:tcPr>
             <w:tcW w:w="3915" w:type="dxa"/>
+            <w:tcMar>
+              <w:top w:w="0" w:type="dxa"/>
+              <w:left w:w="88" w:type="dxa"/>
+              <w:bottom w:w="0" w:type="dxa"/>
+              <w:right w:w="8" w:type="dxa"/>
+            </w:tcMar>
+            <w:tcBorders>
+              <w:top w:val="single" w:color="FFFFFF" w:sz="8" w:space="0"/>
+              <w:left w:val="single" w:color="D9D9D9" w:sz="8" w:space="0"/>
+              <w:bottom w:val="single" w:color="FFFFFF" w:sz="8" w:space="0"/>
+              <w:right w:val="single" w:color="D9D9D9" w:sz="8" w:space="0"/>
+            </w:tcBorders>
+            <w:shd w:fill="D9D9D9" w:color="auto" w:val="clear"/>
+            <w:vAlign w:val="top"/>
+          </w:tcPr>
+          <w:p>
+            <w:pPr>
+              <w:pBdr/>
+              <w:pStyle w:val="normal1"/>
+              <w:spacing w:before="56" w:after="0"/>
+              <w:ind w:left="0"/>
+              <w:jc w:val="left"/>
+              <w:rPr>
+                <w:rFonts w:ascii="Calibri" w:eastAsia="Calibri" w:hAnsi="Calibri" w:cs="Calibri"/>
+                <w:sz w:val="22"/>
+                <w:szCs w:val="22"/>
+              </w:rPr>
+            </w:pPr>
+            <w:r>
+              <w:rPr>
+                <w:rFonts w:ascii="Open Sans Semibold" w:eastAsia="Open Sans Semibold" w:hAnsi="Open Sans Semibold" w:cs="Open Sans Semibold"/>
+                <w:color w:val="030303"/>
+                <w:sz w:val="20"/>
+                <w:szCs w:val="20"/>
+              </w:rPr>
+              <w:t/>
+            </w:r>
+            <w:r>
+              <w:rPr>
+                <w:rFonts w:ascii="Open Sans Semibold" w:eastAsia="Open Sans Semibold" w:hAnsi="Open Sans Semibold" w:cs="Open Sans Semibold"/>
+                <w:b/>
+                <w:color w:val="030303"/>
+                <w:sz w:val="20"/>
+                <w:szCs w:val="20"/>
+              </w:rPr>
+              <w:t xml:space="preserve">Gesamtsumme</w:t>
+            </w:r>
+          </w:p>
+        </w:tc>
+        <w:tc>
+          <w:tcPr>
+            <w:tcW w:w="3915" w:type="dxa"/>
+            <w:tcMar>
+              <w:top w:w="0" w:type="dxa"/>
+              <w:left w:w="88" w:type="dxa"/>
+              <w:bottom w:w="0" w:type="dxa"/>
+              <w:right w:w="8" w:type="dxa"/>
+            </w:tcMar>
             <w:tcBorders>
               <w:top w:val="single" w:color="FFFFFF" w:sz="8" w:space="0"/>
               <w:left w:val="single" w:color="D9D9D9" w:sz="8" w:space="0"/>
@@ -2187,39 +2284,24 @@
             <w:pPr>
               <w:pBdr/>
               <w:pStyle w:val="normal1"/>
-              <w:spacing w:before="56" w:after="0"/>
-              <w:ind w:left="0"/>
+              <w:spacing w:before="0" w:after="0"/>
+              <w:ind/>
               <w:jc w:val="left"/>
               <w:rPr>
-                <w:rFonts w:ascii="Calibri" w:eastAsia="Calibri" w:hAnsi="Calibri" w:cs="Calibri"/>
-                <w:sz w:val="22"/>
-                <w:szCs w:val="22"/>
-              </w:rPr>
-            </w:pPr>
-            <w:r>
-              <w:rPr>
-                <w:rFonts w:ascii="Open Sans Semibold" w:eastAsia="Open Sans Semibold" w:hAnsi="Open Sans Semibold" w:cs="Open Sans Semibold"/>
-                <w:color w:val="030303"/>
-                <w:sz w:val="20"/>
-                <w:szCs w:val="20"/>
-              </w:rPr>
-              <w:t/>
-            </w:r>
-            <w:r>
-              <w:rPr>
-                <w:rFonts w:ascii="Open Sans Semibold" w:eastAsia="Open Sans Semibold" w:hAnsi="Open Sans Semibold" w:cs="Open Sans Semibold"/>
-                <w:b/>
-                <w:color w:val="030303"/>
-                <w:sz w:val="20"/>
-                <w:szCs w:val="20"/>
-              </w:rPr>
-              <w:t xml:space="preserve">Gesamtsumme</w:t>
-            </w:r>
+                <w:color w:val="000000"/>
+              </w:rPr>
+            </w:pPr>
           </w:p>
         </w:tc>
         <w:tc>
           <w:tcPr>
-            <w:tcW w:w="915" w:type="dxa"/>
+            <w:tcW w:w="3915" w:type="dxa"/>
+            <w:tcMar>
+              <w:top w:w="0" w:type="dxa"/>
+              <w:left w:w="88" w:type="dxa"/>
+              <w:bottom w:w="0" w:type="dxa"/>
+              <w:right w:w="8" w:type="dxa"/>
+            </w:tcMar>
             <w:tcBorders>
               <w:top w:val="single" w:color="FFFFFF" w:sz="8" w:space="0"/>
               <w:left w:val="single" w:color="D9D9D9" w:sz="8" w:space="0"/>
@@ -2244,7 +2326,13 @@
         </w:tc>
         <w:tc>
           <w:tcPr>
-            <w:tcW w:w="2102" w:type="dxa"/>
+            <w:tcW w:w="3915" w:type="dxa"/>
+            <w:tcMar>
+              <w:top w:w="0" w:type="dxa"/>
+              <w:left w:w="88" w:type="dxa"/>
+              <w:bottom w:w="0" w:type="dxa"/>
+              <w:right w:w="8" w:type="dxa"/>
+            </w:tcMar>
             <w:tcBorders>
               <w:top w:val="single" w:color="FFFFFF" w:sz="8" w:space="0"/>
               <w:left w:val="single" w:color="D9D9D9" w:sz="8" w:space="0"/>
@@ -2258,33 +2346,9 @@
             <w:pPr>
               <w:pBdr/>
               <w:pStyle w:val="normal1"/>
-              <w:spacing w:before="0" w:after="0"/>
-              <w:ind/>
-              <w:jc w:val="left"/>
-              <w:rPr>
-                <w:color w:val="000000"/>
-              </w:rPr>
-            </w:pPr>
-          </w:p>
-        </w:tc>
-        <w:tc>
-          <w:tcPr>
-            <w:tcW w:w="2728" w:type="dxa"/>
-            <w:tcBorders>
-              <w:top w:val="single" w:color="FFFFFF" w:sz="8" w:space="0"/>
-              <w:left w:val="single" w:color="D9D9D9" w:sz="8" w:space="0"/>
-              <w:bottom w:val="single" w:color="FFFFFF" w:sz="8" w:space="0"/>
-              <w:right w:val="single" w:color="D9D9D9" w:sz="8" w:space="0"/>
-            </w:tcBorders>
-            <w:shd w:fill="D9D9D9" w:color="auto" w:val="clear"/>
-            <w:vAlign w:val="center"/>
-          </w:tcPr>
-          <w:p>
-            <w:pPr>
-              <w:pBdr/>
-              <w:pStyle w:val="normal1"/>
-              <w:spacing w:before="0" w:after="0" w:line="278" w:lineRule="auto"/>
-              <w:ind w:right="314"/>
+              <w:spacing w:before="0" w:beforeAutospacing="false" w:after="0" w:afterAutospacing="false" w:line="278" w:lineRule="auto"/>
+              <w:contextualSpacing/>
+              <w:ind w:left="0" w:right="314"/>
               <w:jc w:val="right"/>
               <w:rPr>
                 <w:color w:val="000000"/>
@@ -2298,7 +2362,7 @@
                 <w:sz w:val="22"/>
                 <w:szCs w:val="22"/>
               </w:rPr>
-              <w:t xml:space="preserve">3.956,92 €</w:t>
+              <w:t xml:space="preserve">4.206,82 €</w:t>
             </w:r>
             <w:r>
               <w:rPr>

</xml_diff>

<commit_message>
update template for bu
</commit_message>
<xml_diff>
--- a/out-Angebot.docx
+++ b/out-Angebot.docx
@@ -66,9 +66,9 @@
         <w:tblLayout w:type="fixed"/>
       </w:tblPr>
       <w:tblGrid>
-        <w:gridCol w:w="4805"/>
+        <w:gridCol w:w="4809"/>
         <w:gridCol w:w="2268"/>
-        <w:gridCol w:w="2962"/>
+        <w:gridCol w:w="2958"/>
       </w:tblGrid>
       <w:tr>
         <w:tblPrEx>
@@ -85,7 +85,7 @@
         </w:trPr>
         <w:tc>
           <w:tcPr>
-            <w:tcW w:w="4805" w:type="dxa"/>
+            <w:tcW w:w="4809" w:type="dxa"/>
             <w:tcBorders>
               <w:top w:val="single" w:color="FFFFFF" w:sz="8" w:space="0"/>
               <w:left w:val="single" w:color="FFFFFF" w:sz="8" w:space="0"/>
@@ -112,7 +112,7 @@
                 <w:sz w:val="22"/>
                 <w:szCs w:val="22"/>
               </w:rPr>
-              <w:t xml:space="preserve">Herr</w:t>
+              <w:t xml:space="preserve">Frau</w:t>
             </w:r>
           </w:p>
           <w:p>
@@ -133,7 +133,7 @@
                 <w:sz w:val="22"/>
                 <w:szCs w:val="22"/>
               </w:rPr>
-              <w:t xml:space="preserve">Lilah Perkins</w:t>
+              <w:t xml:space="preserve">Indira Townsend</w:t>
             </w:r>
           </w:p>
           <w:p>
@@ -154,7 +154,7 @@
                 <w:sz w:val="22"/>
                 <w:szCs w:val="22"/>
               </w:rPr>
-              <w:t xml:space="preserve">Illum quam quam non</w:t>
+              <w:t xml:space="preserve">Officia nisi quia ap</w:t>
             </w:r>
           </w:p>
           <w:p>
@@ -177,7 +177,7 @@
                 <w:sz w:val="22"/>
                 <w:szCs w:val="22"/>
               </w:rPr>
-              <w:t xml:space="preserve">Quae quaerat ut non  Assumenda lorem dign</w:t>
+              <w:t xml:space="preserve">Consequatur velit  Deleniti voluptatem </w:t>
             </w:r>
           </w:p>
         </w:tc>
@@ -197,7 +197,7 @@
             <w:pPr>
               <w:pBdr/>
               <w:pStyle w:val="normal1"/>
-              <w:spacing w:before="0" w:after="0"/>
+              <w:spacing w:before="0" w:after="0" w:line="276" w:lineRule="auto"/>
               <w:ind w:right="127"/>
               <w:jc w:val="left"/>
               <w:rPr>
@@ -237,7 +237,7 @@
             <w:pPr>
               <w:pBdr/>
               <w:pStyle w:val="normal1"/>
-              <w:spacing w:before="0" w:after="0"/>
+              <w:spacing w:before="0" w:after="0" w:line="276" w:lineRule="auto"/>
               <w:ind w:right="127"/>
               <w:jc w:val="left"/>
               <w:rPr>
@@ -261,7 +261,7 @@
             <w:pPr>
               <w:pBdr/>
               <w:pStyle w:val="normal1"/>
-              <w:spacing w:before="0" w:after="0"/>
+              <w:spacing w:before="0" w:after="0" w:line="276" w:lineRule="auto"/>
               <w:ind w:right="127"/>
               <w:jc w:val="left"/>
               <w:rPr>
@@ -302,7 +302,7 @@
         </w:tc>
         <w:tc>
           <w:tcPr>
-            <w:tcW w:w="2962" w:type="dxa"/>
+            <w:tcW w:w="2958" w:type="dxa"/>
             <w:tcBorders>
               <w:top w:val="single" w:color="FFFFFF" w:sz="8" w:space="0"/>
               <w:left w:val="single" w:color="FFFFFF" w:sz="8" w:space="0"/>
@@ -316,7 +316,7 @@
             <w:pPr>
               <w:pBdr/>
               <w:pStyle w:val="normal1"/>
-              <w:spacing w:before="0" w:after="0"/>
+              <w:spacing w:before="0" w:after="0" w:line="276" w:lineRule="auto"/>
               <w:ind/>
               <w:jc w:val="right"/>
               <w:rPr>
@@ -329,7 +329,7 @@
                 <w:sz w:val="22"/>
                 <w:szCs w:val="22"/>
               </w:rPr>
-              <w:t xml:space="preserve">ANG2025-1126-155136</w:t>
+              <w:t xml:space="preserve">ANG2025-1126-170505</w:t>
             </w:r>
             <w:r>
               <w:rPr>
@@ -353,7 +353,7 @@
             <w:pPr>
               <w:pBdr/>
               <w:pStyle w:val="normal1"/>
-              <w:spacing w:before="0" w:after="0"/>
+              <w:spacing w:before="0" w:after="0" w:line="276" w:lineRule="auto"/>
               <w:ind/>
               <w:jc w:val="right"/>
               <w:rPr>
@@ -369,7 +369,7 @@
                 <w:sz w:val="22"/>
                 <w:szCs w:val="22"/>
               </w:rPr>
-              <w:t xml:space="preserve">05.11.2021</w:t>
+              <w:t xml:space="preserve">17.02.2010</w:t>
             </w:r>
             <w:r>
               <w:rPr>
@@ -403,7 +403,7 @@
                 <w:sz w:val="22"/>
                 <w:szCs w:val="22"/>
               </w:rPr>
-              <w:t xml:space="preserve">Isabelle Bird</w:t>
+              <w:t xml:space="preserve">Dennis Griffin</w:t>
             </w:r>
             <w:r>
               <w:rPr>
@@ -445,7 +445,7 @@
             <w:pPr>
               <w:pBdr/>
               <w:pStyle w:val="normal1"/>
-              <w:spacing w:before="0" w:after="0"/>
+              <w:spacing w:before="0" w:after="0" w:line="276" w:lineRule="auto"/>
               <w:ind/>
               <w:jc w:val="right"/>
               <w:rPr>
@@ -482,7 +482,7 @@
         </w:trPr>
         <w:tc>
           <w:tcPr>
-            <w:tcW w:w="4805" w:type="dxa"/>
+            <w:tcW w:w="4809" w:type="dxa"/>
             <w:tcBorders>
               <w:top w:val="single" w:color="FFFFFF" w:sz="8" w:space="0"/>
               <w:left w:val="single" w:color="FFFFFF" w:sz="8" w:space="0"/>
@@ -510,7 +510,7 @@
         </w:tc>
         <w:tc>
           <w:tcPr>
-            <w:tcW w:w="5230" w:type="dxa"/>
+            <w:tcW w:w="5226" w:type="dxa"/>
             <w:tcBorders>
               <w:top w:val="single" w:color="FFFFFF" w:sz="8" w:space="0"/>
               <w:left w:val="single" w:color="FFFFFF" w:sz="8" w:space="0"/>
@@ -561,7 +561,7 @@
                 <w:sz w:val="22"/>
                 <w:szCs w:val="22"/>
               </w:rPr>
-              <w:t xml:space="preserve">868</w:t>
+              <w:t xml:space="preserve">828</w:t>
             </w:r>
           </w:p>
         </w:tc>
@@ -601,7 +601,7 @@
           <w:sz w:val="24"/>
           <w:szCs w:val="24"/>
         </w:rPr>
-        <w:t xml:space="preserve">  Ihr Angebot ANG2025-1126-155136</w:t>
+        <w:t xml:space="preserve">  Ihr Angebot ANG2025-1126-170505</w:t>
       </w:r>
     </w:p>
     <w:p>
@@ -620,7 +620,7 @@
           <w:rFonts w:ascii="Open Sans" w:eastAsia="Open Sans" w:hAnsi="Open Sans" w:cs="Open Sans"/>
           <w:color w:val="000000"/>
         </w:rPr>
-        <w:t xml:space="preserve">  Sehr geehrter Herr Perkins,</w:t>
+        <w:t xml:space="preserve">  Sehr geehrte Frau Townsend,</w:t>
       </w:r>
       <w:r>
         <w:rPr>
@@ -685,34 +685,34 @@
     <w:tbl>
       <w:tblPr>
         <w:tblStyle w:val="TableNormal"/>
-        <w:tblW w:w="9660" w:type="dxa"/>
+        <w:tblW w:w="10035" w:type="dxa"/>
         <w:jc w:val="left"/>
         <w:tblInd w:w="1" w:type="dxa"/>
         <w:tblCellMar>
           <w:top w:w="0" w:type="dxa"/>
-          <w:left w:w="10" w:type="dxa"/>
+          <w:left w:w="0" w:type="dxa"/>
           <w:bottom w:w="0" w:type="dxa"/>
-          <w:right w:w="10" w:type="dxa"/>
+          <w:right w:w="0" w:type="dxa"/>
         </w:tblCellMar>
         <w:tblBorders/>
         <w:shd w:fill="auto" w:color="auto"/>
         <w:tblLayout w:type="fixed"/>
       </w:tblPr>
       <w:tblGrid>
-        <w:gridCol w:w="467"/>
-        <w:gridCol w:w="757"/>
-        <w:gridCol w:w="6094"/>
-        <w:gridCol w:w="1399"/>
-        <w:gridCol w:w="943"/>
+        <w:gridCol w:w="428"/>
+        <w:gridCol w:w="789"/>
+        <w:gridCol w:w="6332"/>
+        <w:gridCol w:w="1415"/>
+        <w:gridCol w:w="1072"/>
       </w:tblGrid>
       <w:tr>
         <w:tblPrEx>
           <w:tblBorders/>
           <w:tblCellMar>
             <w:top w:w="0" w:type="dxa"/>
-            <w:left w:w="10" w:type="dxa"/>
+            <w:left w:w="0" w:type="dxa"/>
             <w:bottom w:w="0" w:type="dxa"/>
-            <w:right w:w="10" w:type="dxa"/>
+            <w:right w:w="0" w:type="dxa"/>
           </w:tblCellMar>
         </w:tblPrEx>
         <w:trPr>
@@ -720,19 +720,8 @@
         </w:trPr>
         <w:tc>
           <w:tcPr>
-            <w:tcW w:w="467" w:type="dxa"/>
-            <w:tcMar>
-              <w:top w:w="0" w:type="dxa"/>
-              <w:left w:w="2" w:type="dxa"/>
-              <w:bottom w:w="0" w:type="dxa"/>
-              <w:right w:w="2" w:type="dxa"/>
-            </w:tcMar>
-            <w:tcBorders>
-              <w:top w:val="single" w:color="CCCCCC" w:sz="8" w:space="0"/>
-              <w:left w:val="single" w:color="CCCCCC" w:sz="8" w:space="0"/>
-              <w:bottom w:val="single" w:color="FFFFFF" w:sz="8" w:space="0"/>
-              <w:right w:val="single" w:color="CCCCCC" w:sz="8" w:space="0"/>
-            </w:tcBorders>
+            <w:tcW w:w="428" w:type="dxa"/>
+            <w:tcBorders/>
             <w:shd w:fill="CCCCCC" w:color="auto" w:val="clear"/>
             <w:vAlign w:val="top"/>
           </w:tcPr>
@@ -745,17 +734,15 @@
               <w:jc w:val="left"/>
               <w:rPr>
                 <w:rFonts w:ascii="Calibri" w:eastAsia="Calibri" w:hAnsi="Calibri" w:cs="Calibri"/>
-                <w:b/>
-                <w:sz w:val="20"/>
+                <w:sz w:val="22"/>
                 <w:szCs w:val="22"/>
               </w:rPr>
             </w:pPr>
             <w:r>
               <w:rPr>
                 <w:rFonts w:ascii="Open Sans" w:eastAsia="Open Sans" w:hAnsi="Open Sans" w:cs="Open Sans"/>
-                <w:b/>
                 <w:color w:val="070707"/>
-                <w:sz w:val="20"/>
+                <w:sz w:val="22"/>
                 <w:szCs w:val="22"/>
               </w:rPr>
               <w:t xml:space="preserve">Pos</w:t>
@@ -764,19 +751,8 @@
         </w:tc>
         <w:tc>
           <w:tcPr>
-            <w:tcW w:w="757" w:type="dxa"/>
-            <w:tcMar>
-              <w:top w:w="0" w:type="dxa"/>
-              <w:left w:w="2" w:type="dxa"/>
-              <w:bottom w:w="0" w:type="dxa"/>
-              <w:right w:w="2" w:type="dxa"/>
-            </w:tcMar>
-            <w:tcBorders>
-              <w:top w:val="single" w:color="CCCCCC" w:sz="8" w:space="0"/>
-              <w:left w:val="single" w:color="CCCCCC" w:sz="8" w:space="0"/>
-              <w:bottom w:val="single" w:color="FFFFFF" w:sz="8" w:space="0"/>
-              <w:right w:val="single" w:color="CCCCCC" w:sz="8" w:space="0"/>
-            </w:tcBorders>
+            <w:tcW w:w="789" w:type="dxa"/>
+            <w:tcBorders/>
             <w:shd w:fill="CCCCCC" w:color="auto" w:val="clear"/>
             <w:vAlign w:val="top"/>
           </w:tcPr>
@@ -789,17 +765,15 @@
               <w:jc w:val="left"/>
               <w:rPr>
                 <w:rFonts w:ascii="Calibri" w:eastAsia="Calibri" w:hAnsi="Calibri" w:cs="Calibri"/>
-                <w:b/>
-                <w:sz w:val="20"/>
+                <w:sz w:val="22"/>
                 <w:szCs w:val="22"/>
               </w:rPr>
             </w:pPr>
             <w:r>
               <w:rPr>
                 <w:rFonts w:ascii="Open Sans" w:eastAsia="Open Sans" w:hAnsi="Open Sans" w:cs="Open Sans"/>
-                <w:b/>
                 <w:color w:val="070707"/>
-                <w:sz w:val="20"/>
+                <w:sz w:val="22"/>
                 <w:szCs w:val="22"/>
               </w:rPr>
               <w:t xml:space="preserve">Menge</w:t>
@@ -808,19 +782,8 @@
         </w:tc>
         <w:tc>
           <w:tcPr>
-            <w:tcW w:w="6093" w:type="dxa"/>
-            <w:tcMar>
-              <w:top w:w="0" w:type="dxa"/>
-              <w:left w:w="2" w:type="dxa"/>
-              <w:bottom w:w="0" w:type="dxa"/>
-              <w:right w:w="2" w:type="dxa"/>
-            </w:tcMar>
-            <w:tcBorders>
-              <w:top w:val="single" w:color="CCCCCC" w:sz="8" w:space="0"/>
-              <w:left w:val="single" w:color="CCCCCC" w:sz="8" w:space="0"/>
-              <w:bottom w:val="single" w:color="FFFFFF" w:sz="8" w:space="0"/>
-              <w:right w:val="single" w:color="CCCCCC" w:sz="8" w:space="0"/>
-            </w:tcBorders>
+            <w:tcW w:w="6332" w:type="dxa"/>
+            <w:tcBorders/>
             <w:shd w:fill="CCCCCC" w:color="auto" w:val="clear"/>
             <w:vAlign w:val="top"/>
           </w:tcPr>
@@ -832,17 +795,14 @@
               <w:ind w:right="314"/>
               <w:jc w:val="left"/>
               <w:rPr>
-                <w:b/>
-                <w:color w:val="000000"/>
-                <w:sz w:val="20"/>
-              </w:rPr>
-            </w:pPr>
-            <w:r>
-              <w:rPr>
-                <w:rFonts w:ascii="Open Sans" w:eastAsia="Open Sans" w:hAnsi="Open Sans" w:cs="Open Sans"/>
-                <w:b/>
-                <w:color w:val="000000"/>
-                <w:sz w:val="20"/>
+                <w:color w:val="000000"/>
+              </w:rPr>
+            </w:pPr>
+            <w:r>
+              <w:rPr>
+                <w:rFonts w:ascii="Open Sans" w:eastAsia="Open Sans" w:hAnsi="Open Sans" w:cs="Open Sans"/>
+                <w:color w:val="000000"/>
+                <w:sz w:val="22"/>
                 <w:szCs w:val="22"/>
               </w:rPr>
               <w:t xml:space="preserve">Bezeichnung</w:t>
@@ -851,19 +811,8 @@
         </w:tc>
         <w:tc>
           <w:tcPr>
-            <w:tcW w:w="1399" w:type="dxa"/>
-            <w:tcMar>
-              <w:top w:w="0" w:type="dxa"/>
-              <w:left w:w="2" w:type="dxa"/>
-              <w:bottom w:w="0" w:type="dxa"/>
-              <w:right w:w="2" w:type="dxa"/>
-            </w:tcMar>
-            <w:tcBorders>
-              <w:top w:val="single" w:color="CCCCCC" w:sz="8" w:space="0"/>
-              <w:left w:val="single" w:color="CCCCCC" w:sz="8" w:space="0"/>
-              <w:bottom w:val="single" w:color="FFFFFF" w:sz="8" w:space="0"/>
-              <w:right w:val="single" w:color="CCCCCC" w:sz="8" w:space="0"/>
-            </w:tcBorders>
+            <w:tcW w:w="1415" w:type="dxa"/>
+            <w:tcBorders/>
             <w:shd w:fill="CCCCCC" w:color="auto" w:val="clear"/>
             <w:vAlign w:val="top"/>
           </w:tcPr>
@@ -871,21 +820,18 @@
             <w:pPr>
               <w:pBdr/>
               <w:pStyle w:val="normal1"/>
-              <w:spacing w:before="0" w:beforeAutospacing="false" w:after="0" w:afterAutospacing="false" w:line="278" w:lineRule="auto"/>
-              <w:ind w:left="-141" w:right="34"/>
+              <w:spacing w:before="0" w:beforeAutospacing="false" w:after="0" w:afterAutospacing="false" w:line="240" w:lineRule="auto"/>
+              <w:ind w:left="0" w:right="0"/>
               <w:jc w:val="center"/>
               <w:rPr>
-                <w:b/>
-                <w:color w:val="000000"/>
-                <w:sz w:val="20"/>
-              </w:rPr>
-            </w:pPr>
-            <w:r>
-              <w:rPr>
-                <w:rFonts w:ascii="Open Sans" w:eastAsia="Open Sans" w:hAnsi="Open Sans" w:cs="Open Sans"/>
-                <w:b/>
-                <w:color w:val="000000"/>
-                <w:sz w:val="20"/>
+                <w:color w:val="000000"/>
+              </w:rPr>
+            </w:pPr>
+            <w:r>
+              <w:rPr>
+                <w:rFonts w:ascii="Open Sans" w:eastAsia="Open Sans" w:hAnsi="Open Sans" w:cs="Open Sans"/>
+                <w:color w:val="000000"/>
+                <w:sz w:val="22"/>
                 <w:szCs w:val="22"/>
               </w:rPr>
               <w:t xml:space="preserve">Einheitspreis</w:t>
@@ -894,19 +840,8 @@
         </w:tc>
         <w:tc>
           <w:tcPr>
-            <w:tcW w:w="943" w:type="dxa"/>
-            <w:tcMar>
-              <w:top w:w="0" w:type="dxa"/>
-              <w:left w:w="2" w:type="dxa"/>
-              <w:bottom w:w="0" w:type="dxa"/>
-              <w:right w:w="2" w:type="dxa"/>
-            </w:tcMar>
-            <w:tcBorders>
-              <w:top w:val="single" w:color="CCCCCC" w:sz="8" w:space="0"/>
-              <w:left w:val="single" w:color="CCCCCC" w:sz="8" w:space="0"/>
-              <w:bottom w:val="single" w:color="FFFFFF" w:sz="8" w:space="0"/>
-              <w:right w:val="single" w:color="CCCCCC" w:sz="8" w:space="0"/>
-            </w:tcBorders>
+            <w:tcW w:w="1072" w:type="dxa"/>
+            <w:tcBorders/>
             <w:shd w:fill="CCCCCC" w:color="auto" w:val="clear"/>
             <w:vAlign w:val="top"/>
           </w:tcPr>
@@ -915,20 +850,17 @@
               <w:pBdr/>
               <w:pStyle w:val="normal1"/>
               <w:spacing w:before="0" w:beforeAutospacing="false" w:after="0" w:afterAutospacing="false" w:line="278" w:lineRule="auto"/>
-              <w:ind w:right="34"/>
-              <w:jc w:val="left"/>
-              <w:rPr>
-                <w:b/>
-                <w:color w:val="000000"/>
-                <w:sz w:val="20"/>
-              </w:rPr>
-            </w:pPr>
-            <w:r>
-              <w:rPr>
-                <w:rFonts w:ascii="Open Sans" w:eastAsia="Open Sans" w:hAnsi="Open Sans" w:cs="Open Sans"/>
-                <w:b/>
-                <w:color w:val="000000"/>
-                <w:sz w:val="20"/>
+              <w:ind w:left="0" w:right="0"/>
+              <w:jc w:val="center"/>
+              <w:rPr>
+                <w:color w:val="000000"/>
+              </w:rPr>
+            </w:pPr>
+            <w:r>
+              <w:rPr>
+                <w:rFonts w:ascii="Open Sans" w:eastAsia="Open Sans" w:hAnsi="Open Sans" w:cs="Open Sans"/>
+                <w:color w:val="000000"/>
+                <w:sz w:val="22"/>
                 <w:szCs w:val="22"/>
               </w:rPr>
               <w:t xml:space="preserve">Gesamt</w:t>
@@ -941,65 +873,22 @@
           <w:tblBorders/>
           <w:tblCellMar>
             <w:top w:w="0" w:type="dxa"/>
-            <w:left w:w="10" w:type="dxa"/>
+            <w:left w:w="0" w:type="dxa"/>
             <w:bottom w:w="0" w:type="dxa"/>
-            <w:right w:w="10" w:type="dxa"/>
+            <w:right w:w="0" w:type="dxa"/>
           </w:tblCellMar>
         </w:tblPrEx>
         <w:trPr>
-          <w:trHeight w:hRule="atLeast" w:val="1"/>
+          <w:trHeight w:hRule="atLeast" w:val="315"/>
         </w:trPr>
         <w:tc>
           <w:tcPr>
-            <w:tcW w:w="467" w:type="dxa"/>
+            <w:tcW w:w="428" w:type="dxa"/>
             <w:tcMar>
               <w:top w:w="0" w:type="dxa"/>
-              <w:left w:w="2" w:type="dxa"/>
+              <w:left w:w="0" w:type="dxa"/>
               <w:bottom w:w="0" w:type="dxa"/>
-              <w:right w:w="2" w:type="dxa"/>
-            </w:tcMar>
-            <w:tcBorders>
-              <w:top w:val="nil"/>
-              <w:left w:val="nil"/>
-              <w:bottom w:val="nil"/>
-              <w:right w:val="nil"/>
-              <w:insideH w:val="single" w:color="000000" w:sz="8" w:space="0"/>
-              <w:insideV w:val="single" w:color="000000" w:sz="8" w:space="0"/>
-            </w:tcBorders>
-            <w:shd w:fill="FFFFFF" w:color="auto" w:val="clear"/>
-            <w:vAlign w:val="top"/>
-          </w:tcPr>
-          <w:p>
-            <w:pPr>
-              <w:pBdr/>
-              <w:pStyle w:val="normal1"/>
-              <w:spacing w:before="0" w:after="0"/>
-              <w:ind/>
-              <w:jc w:val="left"/>
-              <w:rPr>
-                <w:rFonts w:ascii="Calibri" w:eastAsia="Calibri" w:hAnsi="Calibri" w:cs="Calibri"/>
-                <w:sz w:val="18"/>
-              </w:rPr>
-            </w:pPr>
-            <w:r>
-              <w:rPr>
-                <w:rFonts w:ascii="Calibri" w:eastAsia="Calibri" w:hAnsi="Calibri" w:cs="Calibri"/>
-                <w:color w:val="070707"/>
-                <w:sz w:val="18"/>
-                <w:szCs w:val="22"/>
-              </w:rPr>
-              <w:t xml:space="preserve">001</w:t>
-            </w:r>
-          </w:p>
-        </w:tc>
-        <w:tc>
-          <w:tcPr>
-            <w:tcW w:w="467" w:type="dxa"/>
-            <w:tcMar>
-              <w:top w:w="0" w:type="dxa"/>
-              <w:left w:w="2" w:type="dxa"/>
-              <w:bottom w:w="0" w:type="dxa"/>
-              <w:right w:w="2" w:type="dxa"/>
+              <w:right w:w="0" w:type="dxa"/>
             </w:tcMar>
             <w:tcBorders>
               <w:top w:val="nil"/>
@@ -1014,436 +903,34 @@
             <w:pPr>
               <w:pBdr/>
               <w:pStyle w:val="normal1"/>
-              <w:spacing w:before="0" w:after="0"/>
-              <w:ind/>
-              <w:jc w:val="left"/>
+              <w:spacing w:before="40" w:beforeAutospacing="false" w:after="0" w:afterAutospacing="false" w:line="278" w:lineRule="auto"/>
+              <w:ind w:right="0"/>
+              <w:jc w:val="center"/>
               <w:rPr>
                 <w:rFonts w:ascii="Calibri" w:eastAsia="Calibri" w:hAnsi="Calibri" w:cs="Calibri"/>
+                <w:sz w:val="18"/>
+                <w:szCs w:val="22"/>
+              </w:rPr>
+            </w:pPr>
+            <w:r>
+              <w:rPr>
+                <w:rFonts w:ascii="Open Sans" w:eastAsia="Open Sans" w:hAnsi="Open Sans" w:cs="Open Sans"/>
                 <w:color w:val="070707"/>
                 <w:sz w:val="18"/>
                 <w:szCs w:val="20"/>
               </w:rPr>
-            </w:pPr>
-            <w:r>
-              <w:rPr>
-                <w:rFonts w:ascii="Calibri" w:eastAsia="Calibri" w:hAnsi="Calibri" w:cs="Calibri"/>
-                <w:color w:val="070707"/>
-                <w:sz w:val="18"/>
-                <w:szCs w:val="20"/>
-              </w:rPr>
-              <w:t xml:space="preserve">1 Stk</w:t>
-            </w:r>
-          </w:p>
-        </w:tc>
-        <w:tc>
-          <w:tcPr>
-            <w:tcW w:w="467" w:type="dxa"/>
+              <w:t xml:space="preserve">001</w:t>
+            </w:r>
+          </w:p>
+        </w:tc>
+        <w:tc>
+          <w:tcPr>
+            <w:tcW w:w="789" w:type="dxa"/>
             <w:tcMar>
               <w:top w:w="0" w:type="dxa"/>
-              <w:left w:w="2" w:type="dxa"/>
+              <w:left w:w="0" w:type="dxa"/>
               <w:bottom w:w="0" w:type="dxa"/>
-              <w:right w:w="2" w:type="dxa"/>
-            </w:tcMar>
-            <w:tcBorders>
-              <w:top w:val="nil"/>
-              <w:left w:val="nil"/>
-              <w:bottom w:val="nil"/>
-              <w:right w:val="nil"/>
-              <w:insideH w:val="single" w:color="000000" w:sz="8" w:space="0"/>
-              <w:insideV w:val="single" w:color="000000" w:sz="8" w:space="0"/>
-            </w:tcBorders>
-            <w:shd w:fill="FFFFFF" w:color="auto" w:val="clear"/>
-            <w:vAlign w:val="top"/>
-          </w:tcPr>
-          <w:p>
-            <w:pPr>
-              <w:pBdr/>
-              <w:pStyle w:val="Body Text"/>
-              <w:spacing w:before="0" w:after="0" w:line="278" w:lineRule="auto"/>
-              <w:ind w:right="314"/>
-              <w:jc w:val="left"/>
-              <w:rPr>
-                <w:color w:val="000000"/>
-                <w:sz w:val="18"/>
-              </w:rPr>
-            </w:pPr>
-            <w:r>
-              <w:rPr>
-                <w:rFonts w:ascii="arial" w:eastAsia="arial" w:hAnsi="arial" w:cs="arial"/>
-                <w:b/>
-                <w:bCs/>
-                <w:color w:val="000000"/>
-                <w:sz w:val="20"/>
-                <w:szCs w:val="20"/>
-              </w:rPr>
-              <w:t xml:space="preserve">Liefern und Montieren einer Badewannentür</w:t>
-            </w:r>
-            <w:r>
-              <w:rPr>
-                <w:rFonts w:ascii="arial" w:eastAsia="arial" w:hAnsi="arial" w:cs="arial"/>
-                <w:b/>
-                <w:color w:val="000000"/>
-                <w:sz w:val="20"/>
-                <w:szCs w:val="20"/>
-              </w:rPr>
-              <w:br/>
-            </w:r>
-            <w:r>
-              <w:rPr>
-                <w:rFonts w:ascii="arial" w:eastAsia="arial" w:hAnsi="arial" w:cs="arial"/>
-                <w:b w:val="0"/>
-                <w:color w:val="000000"/>
-                <w:sz w:val="18"/>
-                <w:szCs w:val="20"/>
-              </w:rPr>
-              <w:t xml:space="preserve">• Liefern und Montieren einer Badewannentür (Universal/Standard) Höhe 40 cm, Breite 40,5 cm</w:t>
-            </w:r>
-            <w:r>
-              <w:rPr>
-                <w:rFonts w:ascii="arial" w:eastAsia="arial" w:hAnsi="arial" w:cs="arial"/>
-                <w:b w:val="0"/>
-                <w:color w:val="000000"/>
-                <w:sz w:val="18"/>
-                <w:szCs w:val="20"/>
-              </w:rPr>
-              <w:br/>
-            </w:r>
-            <w:r>
-              <w:rPr>
-                <w:rFonts w:ascii="arial" w:eastAsia="arial" w:hAnsi="arial" w:cs="arial"/>
-                <w:b w:val="0"/>
-                <w:color w:val="000000"/>
-                <w:sz w:val="18"/>
-                <w:szCs w:val="20"/>
-              </w:rPr>
-              <w:t xml:space="preserve">• inkl. dazugehörige Materialien</w:t>
-            </w:r>
-            <w:r>
-              <w:rPr>
-                <w:rFonts w:ascii="arial" w:eastAsia="arial" w:hAnsi="arial" w:cs="arial"/>
-                <w:b w:val="0"/>
-                <w:color w:val="000000"/>
-                <w:sz w:val="18"/>
-                <w:szCs w:val="20"/>
-              </w:rPr>
-              <w:br/>
-            </w:r>
-            <w:r>
-              <w:rPr>
-                <w:rFonts w:ascii="arial" w:eastAsia="arial" w:hAnsi="arial" w:cs="arial"/>
-                <w:b w:val="0"/>
-                <w:color w:val="000000"/>
-                <w:sz w:val="18"/>
-                <w:szCs w:val="20"/>
-              </w:rPr>
-              <w:t xml:space="preserve">• inkl. An- &amp; Abfahrten / Dieselzuschlag</w:t>
-            </w:r>
-            <w:r>
-              <w:rPr>
-                <w:rFonts w:ascii="arial" w:eastAsia="arial" w:hAnsi="arial" w:cs="arial"/>
-                <w:b w:val="0"/>
-                <w:color w:val="000000"/>
-                <w:sz w:val="18"/>
-                <w:szCs w:val="20"/>
-              </w:rPr>
-              <w:br/>
-            </w:r>
-            <w:r>
-              <w:rPr>
-                <w:rFonts w:ascii="arial" w:eastAsia="arial" w:hAnsi="arial" w:cs="arial"/>
-                <w:b w:val="0"/>
-                <w:color w:val="000000"/>
-                <w:sz w:val="18"/>
-                <w:szCs w:val="20"/>
-              </w:rPr>
-              <w:t xml:space="preserve">• inkl. Bereitstellung Maschinen / Werkzeug</w:t>
-            </w:r>
-            <w:r>
-              <w:rPr>
-                <w:rFonts w:ascii="arial" w:eastAsia="arial" w:hAnsi="arial" w:cs="arial"/>
-                <w:b w:val="0"/>
-                <w:color w:val="000000"/>
-                <w:sz w:val="18"/>
-                <w:szCs w:val="20"/>
-              </w:rPr>
-              <w:br/>
-            </w:r>
-            <w:r>
-              <w:rPr>
-                <w:rFonts w:ascii="arial" w:eastAsia="arial" w:hAnsi="arial" w:cs="arial"/>
-                <w:b w:val="0"/>
-                <w:color w:val="000000"/>
-                <w:sz w:val="18"/>
-                <w:szCs w:val="20"/>
-              </w:rPr>
-              <w:t xml:space="preserve">• inkl. Vorhaltung und Beräumung der Baustelle</w:t>
-            </w:r>
-            <w:r>
-              <w:rPr>
-                <w:rFonts w:ascii="arial" w:eastAsia="arial" w:hAnsi="arial" w:cs="arial"/>
-                <w:b w:val="0"/>
-                <w:color w:val="000000"/>
-                <w:sz w:val="18"/>
-                <w:szCs w:val="20"/>
-              </w:rPr>
-              <w:br/>
-            </w:r>
-            <w:r>
-              <w:rPr>
-                <w:rFonts w:ascii="arial" w:eastAsia="arial" w:hAnsi="arial" w:cs="arial"/>
-                <w:b w:val="0"/>
-                <w:color w:val="000000"/>
-                <w:sz w:val="18"/>
-                <w:szCs w:val="20"/>
-              </w:rPr>
-              <w:t xml:space="preserve">• inkl. Lieferkosten</w:t>
-            </w:r>
-          </w:p>
-          <w:p>
-            <w:pPr>
-              <w:pBdr/>
-              <w:pStyle w:val="Body Text"/>
-              <w:spacing w:before="0" w:after="0" w:line="278" w:lineRule="auto"/>
-              <w:ind w:right="314"/>
-              <w:jc w:val="left"/>
-              <w:rPr>
-                <w:color w:val="000000"/>
-                <w:sz w:val="18"/>
-              </w:rPr>
-            </w:pPr>
-            <w:r>
-              <w:rPr>
-                <w:rFonts w:ascii="arial" w:eastAsia="arial" w:hAnsi="arial" w:cs="arial"/>
-                <w:b w:val="0"/>
-                <w:color w:val="000000"/>
-                <w:sz w:val="18"/>
-                <w:szCs w:val="20"/>
-              </w:rPr>
-              <w:t xml:space="preserve">• Montage Haltegriff 40 cm</w:t>
-            </w:r>
-          </w:p>
-          <w:p>
-            <w:pPr>
-              <w:pBdr/>
-              <w:pStyle w:val="Body Text"/>
-              <w:spacing w:before="0" w:after="0" w:line="278" w:lineRule="auto"/>
-              <w:ind w:right="314"/>
-              <w:jc w:val="left"/>
-              <w:rPr>
-                <w:color w:val="000000"/>
-                <w:sz w:val="18"/>
-              </w:rPr>
-            </w:pPr>
-            <w:r>
-              <w:rPr>
-                <w:rFonts w:ascii="arial" w:eastAsia="arial" w:hAnsi="arial" w:cs="arial"/>
-                <w:b w:val="0"/>
-                <w:color w:val="000000"/>
-                <w:sz w:val="18"/>
-                <w:szCs w:val="20"/>
-              </w:rPr>
-              <w:t/>
-            </w:r>
-          </w:p>
-          <w:p>
-            <w:pPr>
-              <w:pBdr/>
-              <w:pStyle w:val="Body Text"/>
-              <w:spacing w:before="0" w:after="0" w:line="278" w:lineRule="auto"/>
-              <w:ind w:right="314"/>
-              <w:jc w:val="left"/>
-              <w:rPr>
-                <w:color w:val="000000"/>
-              </w:rPr>
-            </w:pPr>
-          </w:p>
-          <w:p>
-            <w:pPr>
-              <w:pBdr/>
-              <w:pStyle w:val="Body Text"/>
-              <w:spacing w:before="0" w:after="0" w:line="278" w:lineRule="auto"/>
-              <w:ind w:right="314"/>
-              <w:jc w:val="left"/>
-              <w:rPr>
-                <w:color w:val="000000"/>
-              </w:rPr>
-            </w:pPr>
-            <w:r>
-              <w:rPr>
-                <w:rFonts w:ascii="arial" w:eastAsia="arial" w:hAnsi="arial" w:cs="arial"/>
-                <w:b/>
-                <w:color w:val="000000"/>
-                <w:sz w:val="20"/>
-                <w:szCs w:val="20"/>
-              </w:rPr>
-              <w:t xml:space="preserve">Enthält je Einheit</w:t>
-            </w:r>
-          </w:p>
-          <w:p>
-            <w:pPr>
-              <w:pBdr/>
-              <w:pStyle w:val="Body Text"/>
-              <w:spacing w:before="0" w:after="0" w:line="278" w:lineRule="auto"/>
-              <w:ind w:right="314"/>
-              <w:jc w:val="left"/>
-              <w:rPr>
-                <w:rFonts w:ascii="arial" w:eastAsia="arial" w:hAnsi="arial" w:cs="arial"/>
-                <w:b w:val="0"/>
-                <w:color w:val="000000"/>
-                <w:sz w:val="18"/>
-                <w:szCs w:val="20"/>
-              </w:rPr>
-            </w:pPr>
-            <w:r>
-              <w:rPr>
-                <w:rFonts w:ascii="arial" w:eastAsia="arial" w:hAnsi="arial" w:cs="arial"/>
-                <w:b w:val="0"/>
-                <w:color w:val="000000"/>
-                <w:sz w:val="18"/>
-                <w:szCs w:val="20"/>
-              </w:rPr>
-              <w:t xml:space="preserve">- 202,00 km Kilometerpauschale</w:t>
-            </w:r>
-          </w:p>
-          <w:p>
-            <w:pPr>
-              <w:pBdr/>
-              <w:pStyle w:val="Body Text"/>
-              <w:spacing w:before="0" w:after="0" w:line="278" w:lineRule="auto"/>
-              <w:ind w:right="314"/>
-              <w:jc w:val="left"/>
-              <w:rPr>
-                <w:sz w:val="18"/>
-              </w:rPr>
-            </w:pPr>
-            <w:r>
-              <w:rPr>
-                <w:rFonts w:ascii="arial" w:eastAsia="arial" w:hAnsi="arial" w:cs="arial"/>
-                <w:b w:val="0"/>
-                <w:color w:val="000000"/>
-                <w:sz w:val="18"/>
-                <w:szCs w:val="20"/>
-              </w:rPr>
-              <w:t xml:space="preserve">- </w:t>
-            </w:r>
-            <w:r>
-              <w:rPr>
-                <w:sz w:val="18"/>
-              </w:rPr>
-              <w:t xml:space="preserve">1,00</w:t>
-            </w:r>
-            <w:r>
-              <w:rPr>
-                <w:rFonts w:ascii="arial" w:eastAsia="arial" w:hAnsi="arial" w:cs="arial"/>
-                <w:b w:val="0"/>
-                <w:color w:val="000000"/>
-                <w:sz w:val="18"/>
-                <w:szCs w:val="20"/>
-              </w:rPr>
-              <w:t xml:space="preserve"> Stk Lieferkosten Badewannentür</w:t>
-            </w:r>
-          </w:p>
-          <w:p>
-            <w:pPr>
-              <w:pBdr/>
-              <w:pStyle w:val="Body Text"/>
-              <w:spacing w:before="0" w:after="0" w:line="278" w:lineRule="auto"/>
-              <w:ind w:right="314"/>
-              <w:jc w:val="left"/>
-              <w:rPr>
-                <w:sz w:val="18"/>
-              </w:rPr>
-            </w:pPr>
-            <w:r>
-              <w:rPr>
-                <w:rFonts w:ascii="arial" w:eastAsia="arial" w:hAnsi="arial" w:cs="arial"/>
-                <w:b w:val="0"/>
-                <w:color w:val="000000"/>
-                <w:sz w:val="18"/>
-                <w:szCs w:val="20"/>
-              </w:rPr>
-              <w:t xml:space="preserve">- </w:t>
-            </w:r>
-            <w:r>
-              <w:rPr>
-                <w:sz w:val="18"/>
-              </w:rPr>
-              <w:t xml:space="preserve">1,00</w:t>
-            </w:r>
-            <w:r>
-              <w:rPr>
-                <w:rFonts w:ascii="arial" w:eastAsia="arial" w:hAnsi="arial" w:cs="arial"/>
-                <w:b w:val="0"/>
-                <w:color w:val="000000"/>
-                <w:sz w:val="18"/>
-                <w:szCs w:val="20"/>
-              </w:rPr>
-              <w:t xml:space="preserve"> Stk Universal / Standard Tür</w:t>
-            </w:r>
-          </w:p>
-          <w:p>
-            <w:pPr>
-              <w:pBdr/>
-              <w:pStyle w:val="Body Text"/>
-              <w:spacing w:before="0" w:after="0" w:line="278" w:lineRule="auto"/>
-              <w:ind w:right="314"/>
-              <w:jc w:val="left"/>
-              <w:rPr>
-                <w:sz w:val="18"/>
-              </w:rPr>
-            </w:pPr>
-            <w:r>
-              <w:rPr>
-                <w:rFonts w:ascii="arial" w:eastAsia="arial" w:hAnsi="arial" w:cs="arial"/>
-                <w:b w:val="0"/>
-                <w:color w:val="000000"/>
-                <w:sz w:val="18"/>
-                <w:szCs w:val="20"/>
-              </w:rPr>
-              <w:t xml:space="preserve">- </w:t>
-            </w:r>
-            <w:r>
-              <w:rPr>
-                <w:sz w:val="18"/>
-              </w:rPr>
-              <w:t xml:space="preserve">1,00</w:t>
-            </w:r>
-            <w:r>
-              <w:rPr>
-                <w:rFonts w:ascii="arial" w:eastAsia="arial" w:hAnsi="arial" w:cs="arial"/>
-                <w:b w:val="0"/>
-                <w:color w:val="000000"/>
-                <w:sz w:val="18"/>
-                <w:szCs w:val="20"/>
-              </w:rPr>
-              <w:t xml:space="preserve"> Stk Kleinmaterial</w:t>
-            </w:r>
-          </w:p>
-          <w:p>
-            <w:pPr>
-              <w:pBdr/>
-              <w:pStyle w:val="Body Text"/>
-              <w:spacing w:before="0" w:after="0" w:line="278" w:lineRule="auto"/>
-              <w:ind w:right="314"/>
-              <w:jc w:val="left"/>
-              <w:rPr>
-                <w:rFonts w:ascii="arial" w:eastAsia="arial" w:hAnsi="arial" w:cs="arial"/>
-                <w:b w:val="0"/>
-                <w:color w:val="000000"/>
-                <w:sz w:val="20"/>
-                <w:szCs w:val="20"/>
-              </w:rPr>
-            </w:pPr>
-          </w:p>
-        </w:tc>
-        <w:tc>
-          <w:tcPr>
-            <w:tcW w:w="467" w:type="dxa"/>
-            <w:tcMar>
-              <w:top w:w="0" w:type="dxa"/>
-              <w:left w:w="2" w:type="dxa"/>
-              <w:bottom w:w="0" w:type="dxa"/>
-              <w:right w:w="2" w:type="dxa"/>
+              <w:right w:w="0" w:type="dxa"/>
             </w:tcMar>
             <w:tcBorders>
               <w:top w:val="nil"/>
@@ -1458,34 +945,34 @@
             <w:pPr>
               <w:pBdr/>
               <w:pStyle w:val="normal1"/>
-              <w:spacing w:before="0" w:beforeAutospacing="false" w:after="0" w:afterAutospacing="false" w:line="278" w:lineRule="auto"/>
-              <w:ind w:right="34"/>
+              <w:spacing w:before="40" w:beforeAutospacing="false" w:after="0" w:afterAutospacing="false" w:line="278" w:lineRule="auto"/>
+              <w:ind w:right="0"/>
               <w:jc w:val="center"/>
               <w:rPr>
                 <w:rFonts w:ascii="Calibri" w:eastAsia="Calibri" w:hAnsi="Calibri" w:cs="Calibri"/>
-                <w:color w:val="000000"/>
                 <w:sz w:val="18"/>
-              </w:rPr>
-            </w:pPr>
-            <w:r>
-              <w:rPr>
-                <w:rFonts w:ascii="Calibri" w:eastAsia="Calibri" w:hAnsi="Calibri" w:cs="Calibri"/>
-                <w:color w:val="000000"/>
+                <w:szCs w:val="22"/>
+              </w:rPr>
+            </w:pPr>
+            <w:r>
+              <w:rPr>
+                <w:rFonts w:ascii="Open Sans" w:eastAsia="Open Sans" w:hAnsi="Open Sans" w:cs="Open Sans"/>
+                <w:color w:val="070707"/>
                 <w:sz w:val="18"/>
                 <w:szCs w:val="20"/>
               </w:rPr>
-              <w:t xml:space="preserve">3.470,37 €</w:t>
-            </w:r>
-          </w:p>
-        </w:tc>
-        <w:tc>
-          <w:tcPr>
-            <w:tcW w:w="467" w:type="dxa"/>
+              <w:t xml:space="preserve">1 Stk</w:t>
+            </w:r>
+          </w:p>
+        </w:tc>
+        <w:tc>
+          <w:tcPr>
+            <w:tcW w:w="6332" w:type="dxa"/>
             <w:tcMar>
               <w:top w:w="0" w:type="dxa"/>
-              <w:left w:w="2" w:type="dxa"/>
+              <w:left w:w="0" w:type="dxa"/>
               <w:bottom w:w="0" w:type="dxa"/>
-              <w:right w:w="2" w:type="dxa"/>
+              <w:right w:w="0" w:type="dxa"/>
             </w:tcMar>
             <w:tcBorders>
               <w:top w:val="nil"/>
@@ -1500,57 +987,33 @@
             <w:pPr>
               <w:pBdr/>
               <w:pStyle w:val="normal1"/>
-              <w:spacing w:before="0" w:beforeAutospacing="false" w:after="0" w:afterAutospacing="false" w:line="278" w:lineRule="auto"/>
-              <w:ind w:left="-141" w:right="34"/>
-              <w:jc w:val="center"/>
-              <w:rPr>
-                <w:rFonts w:ascii="Calibri" w:eastAsia="Calibri" w:hAnsi="Calibri" w:cs="Calibri"/>
-                <w:color w:val="000000"/>
-                <w:sz w:val="18"/>
-              </w:rPr>
-            </w:pPr>
-            <w:r>
-              <w:rPr>
-                <w:rFonts w:ascii="Calibri" w:eastAsia="Calibri" w:hAnsi="Calibri" w:cs="Calibri"/>
-                <w:color w:val="000000"/>
-                <w:sz w:val="18"/>
-                <w:szCs w:val="20"/>
-              </w:rPr>
-              <w:t xml:space="preserve">3.470,37 €</w:t>
-            </w:r>
-            <w:r>
-              <w:rPr>
-                <w:rFonts w:ascii="Calibri" w:eastAsia="Calibri" w:hAnsi="Calibri" w:cs="Calibri"/>
-                <w:color w:val="000000"/>
-                <w:sz w:val="18"/>
-                <w:szCs w:val="20"/>
-              </w:rPr>
-              <w:t/>
-            </w:r>
-          </w:p>
-        </w:tc>
-      </w:tr>
-      <w:tr>
-        <w:tblPrEx>
-          <w:tblBorders/>
-          <w:tblCellMar>
-            <w:top w:w="0" w:type="dxa"/>
-            <w:left w:w="10" w:type="dxa"/>
-            <w:bottom w:w="0" w:type="dxa"/>
-            <w:right w:w="10" w:type="dxa"/>
-          </w:tblCellMar>
-        </w:tblPrEx>
-        <w:trPr>
-          <w:trHeight w:hRule="atLeast" w:val="1"/>
-        </w:trPr>
-        <w:tc>
-          <w:tcPr>
-            <w:tcW w:w="467" w:type="dxa"/>
+              <w:spacing w:before="40" w:beforeAutospacing="false" w:after="0" w:afterAutospacing="false" w:line="278" w:lineRule="auto"/>
+              <w:ind w:right="0"/>
+              <w:jc w:val="left"/>
+              <w:rPr>
+                <w:color w:val="000000"/>
+              </w:rPr>
+            </w:pPr>
+            <w:r>
+              <w:rPr>
+                <w:rFonts w:ascii="arial" w:eastAsia="arial" w:hAnsi="arial" w:cs="arial"/>
+                <w:b/>
+                <w:color w:val="000000"/>
+                <w:sz w:val="20"/>
+                <w:szCs w:val="20"/>
+              </w:rPr>
+              <w:t xml:space="preserve">Auszuführende Arbeiten</w:t>
+            </w:r>
+          </w:p>
+        </w:tc>
+        <w:tc>
+          <w:tcPr>
+            <w:tcW w:w="1415" w:type="dxa"/>
             <w:tcMar>
               <w:top w:w="0" w:type="dxa"/>
-              <w:left w:w="2" w:type="dxa"/>
+              <w:left w:w="0" w:type="dxa"/>
               <w:bottom w:w="0" w:type="dxa"/>
-              <w:right w:w="2" w:type="dxa"/>
+              <w:right w:w="0" w:type="dxa"/>
             </w:tcMar>
             <w:tcBorders>
               <w:top w:val="nil"/>
@@ -1565,40 +1028,33 @@
             <w:pPr>
               <w:pBdr/>
               <w:pStyle w:val="normal1"/>
-              <w:spacing w:before="100" w:beforeAutospacing="true" w:after="0" w:afterAutospacing="false" w:line="240" w:lineRule="auto"/>
+              <w:spacing w:before="40" w:beforeAutospacing="false" w:after="0" w:afterAutospacing="false" w:line="278" w:lineRule="auto"/>
               <w:ind w:left="0" w:right="0"/>
-              <w:jc w:val="left"/>
-              <w:tabs>
-                <w:tab w:val="clear" w:pos="720"/>
-                <w:tab w:val="left" w:pos="750"/>
-                <w:tab w:val="left" w:pos="1416.0000610351562"/>
-              </w:tabs>
-              <w:rPr>
-                <w:rFonts w:ascii="Calibri" w:eastAsia="Calibri" w:hAnsi="Calibri" w:cs="Calibri"/>
-                <w:color w:val="070707"/>
-                <w:sz w:val="18"/>
-                <w:szCs w:val="20"/>
-              </w:rPr>
-            </w:pPr>
-            <w:r>
-              <w:rPr>
-                <w:rFonts w:ascii="Calibri" w:eastAsia="Calibri" w:hAnsi="Calibri" w:cs="Calibri"/>
-                <w:color w:val="070707"/>
-                <w:sz w:val="18"/>
-                <w:szCs w:val="20"/>
-              </w:rPr>
-              <w:t xml:space="preserve">002</w:t>
-            </w:r>
-          </w:p>
-        </w:tc>
-        <w:tc>
-          <w:tcPr>
-            <w:tcW w:w="467" w:type="dxa"/>
+              <w:jc w:val="center"/>
+              <w:rPr>
+                <w:rFonts w:ascii="Arial" w:eastAsia="Arial" w:hAnsi="Arial" w:cs="Arial"/>
+                <w:color w:val="000000"/>
+              </w:rPr>
+            </w:pPr>
+            <w:r>
+              <w:rPr>
+                <w:rFonts w:ascii="Arial" w:eastAsia="Arial" w:hAnsi="Arial" w:cs="Arial"/>
+                <w:color w:val="000000"/>
+                <w:sz w:val="20"/>
+                <w:szCs w:val="20"/>
+              </w:rPr>
+              <w:t xml:space="preserve">1.836,40 €</w:t>
+            </w:r>
+          </w:p>
+        </w:tc>
+        <w:tc>
+          <w:tcPr>
+            <w:tcW w:w="1072" w:type="dxa"/>
             <w:tcMar>
               <w:top w:w="0" w:type="dxa"/>
-              <w:left w:w="2" w:type="dxa"/>
+              <w:left w:w="0" w:type="dxa"/>
               <w:bottom w:w="0" w:type="dxa"/>
-              <w:right w:w="2" w:type="dxa"/>
+              <w:right w:w="0" w:type="dxa"/>
             </w:tcMar>
             <w:tcBorders>
               <w:top w:val="nil"/>
@@ -1613,31 +1069,47 @@
             <w:pPr>
               <w:pBdr/>
               <w:pStyle w:val="normal1"/>
-              <w:spacing w:before="100" w:beforeAutospacing="true" w:afterAutospacing="false" w:line="240" w:lineRule="auto"/>
+              <w:spacing w:before="40" w:beforeAutospacing="false" w:after="0" w:afterAutospacing="false" w:line="278" w:lineRule="auto"/>
               <w:ind w:left="0" w:right="0"/>
-              <w:jc w:val="left"/>
-              <w:rPr>
-                <w:rFonts w:ascii="Calibri" w:eastAsia="Calibri" w:hAnsi="Calibri" w:cs="Calibri"/>
-                <w:sz w:val="18"/>
-              </w:rPr>
-            </w:pPr>
-            <w:r>
-              <w:rPr>
-                <w:rFonts w:ascii="Calibri" w:eastAsia="Calibri" w:hAnsi="Calibri" w:cs="Calibri"/>
-                <w:sz w:val="18"/>
-              </w:rPr>
-              <w:t xml:space="preserve">1 Stk </w:t>
-            </w:r>
-          </w:p>
-        </w:tc>
-        <w:tc>
-          <w:tcPr>
-            <w:tcW w:w="467" w:type="dxa"/>
+              <w:jc w:val="center"/>
+              <w:rPr>
+                <w:rFonts w:ascii="Arial" w:eastAsia="Arial" w:hAnsi="Arial" w:cs="Arial"/>
+                <w:color w:val="000000"/>
+              </w:rPr>
+            </w:pPr>
+            <w:r>
+              <w:rPr>
+                <w:rFonts w:ascii="Arial" w:eastAsia="Arial" w:hAnsi="Arial" w:cs="Arial"/>
+                <w:color w:val="000000"/>
+                <w:sz w:val="20"/>
+                <w:szCs w:val="20"/>
+              </w:rPr>
+              <w:t xml:space="preserve">1.836,40 €</w:t>
+            </w:r>
+          </w:p>
+        </w:tc>
+      </w:tr>
+      <w:tr>
+        <w:tblPrEx>
+          <w:tblBorders/>
+          <w:tblCellMar>
+            <w:top w:w="0" w:type="dxa"/>
+            <w:left w:w="0" w:type="dxa"/>
+            <w:bottom w:w="0" w:type="dxa"/>
+            <w:right w:w="0" w:type="dxa"/>
+          </w:tblCellMar>
+        </w:tblPrEx>
+        <w:trPr>
+          <w:trHeight w:hRule="atLeast" w:val="1741"/>
+        </w:trPr>
+        <w:tc>
+          <w:tcPr>
+            <w:tcW w:w="428" w:type="dxa"/>
             <w:tcMar>
               <w:top w:w="0" w:type="dxa"/>
-              <w:left w:w="2" w:type="dxa"/>
+              <w:left w:w="56" w:type="dxa"/>
               <w:bottom w:w="0" w:type="dxa"/>
-              <w:right w:w="2" w:type="dxa"/>
+              <w:right w:w="56" w:type="dxa"/>
             </w:tcMar>
             <w:tcBorders>
               <w:top w:val="nil"/>
@@ -1651,65 +1123,46 @@
           <w:p>
             <w:pPr>
               <w:pBdr/>
-              <w:pStyle w:val="Body Text"/>
-              <w:spacing w:before="100" w:beforeAutospacing="true" w:after="0" w:afterAutospacing="false" w:line="240" w:lineRule="auto"/>
-              <w:widowControl w:val="0"/>
-              <w:ind w:left="0" w:right="0"/>
+              <w:pStyle w:val="normal1"/>
+              <w:spacing w:before="121" w:after="0"/>
+              <w:ind/>
               <w:jc w:val="left"/>
-              <w:rPr/>
-            </w:pPr>
-            <w:r>
-              <w:rPr>
-                <w:rFonts w:ascii="Open Sans" w:eastAsia="Open Sans" w:hAnsi="Open Sans" w:cs="Open Sans"/>
-                <w:b/>
-                <w:bCs/>
-                <w:color w:val="000000"/>
-                <w:sz w:val="18"/>
-                <w:szCs w:val="18"/>
-              </w:rPr>
-              <w:t xml:space="preserve">Haltegriff clivia plus 32/400mm m. Ros. Edelstahl glatt poliert,VIGOUR</w:t>
-            </w:r>
-            <w:r>
-              <w:rPr>
-                <w:rFonts w:ascii="arial" w:eastAsia="arial" w:hAnsi="arial" w:cs="arial"/>
-                <w:b/>
-                <w:bCs/>
-                <w:color w:val="000000"/>
-                <w:sz w:val="20"/>
-                <w:szCs w:val="20"/>
-              </w:rPr>
-              <w:t/>
-            </w:r>
-            <w:r>
-              <w:rPr>
-                <w:rFonts w:ascii="Open Sans" w:eastAsia="Open Sans" w:hAnsi="Open Sans" w:cs="Open Sans"/>
-                <w:b/>
-                <w:bCs/>
-                <w:color w:val="000000"/>
-                <w:sz w:val="18"/>
-                <w:szCs w:val="18"/>
-              </w:rPr>
-              <w:t/>
-            </w:r>
-            <w:r>
-              <w:rPr>
-                <w:rFonts w:ascii="Open Sans" w:eastAsia="Open Sans" w:hAnsi="Open Sans" w:cs="Open Sans"/>
-                <w:color w:val="000000"/>
-                <w:sz w:val="18"/>
-                <w:szCs w:val="18"/>
-              </w:rPr>
-              <w:t xml:space="preserve"> </w:t>
-            </w:r>
-          </w:p>
-        </w:tc>
-        <w:tc>
-          <w:tcPr>
-            <w:tcW w:w="467" w:type="dxa"/>
+              <w:tabs>
+                <w:tab w:val="clear" w:pos="720"/>
+                <w:tab w:val="left" w:pos="750"/>
+                <w:tab w:val="left" w:pos="1416.0000610351562"/>
+              </w:tabs>
+              <w:rPr>
+                <w:rFonts w:ascii="Open Sans" w:eastAsia="Open Sans" w:hAnsi="Open Sans" w:cs="Open Sans"/>
+                <w:color w:val="070707"/>
+                <w:sz w:val="20"/>
+                <w:szCs w:val="20"/>
+              </w:rPr>
+            </w:pPr>
+          </w:p>
+          <w:p>
+            <w:pPr>
+              <w:pBdr/>
+              <w:pStyle w:val="normal1"/>
+              <w:spacing w:before="0" w:after="0"/>
+              <w:ind/>
+              <w:jc w:val="left"/>
+              <w:rPr>
+                <w:rFonts w:ascii="Calibri" w:eastAsia="Calibri" w:hAnsi="Calibri" w:cs="Calibri"/>
+                <w:sz w:val="22"/>
+                <w:szCs w:val="22"/>
+              </w:rPr>
+            </w:pPr>
+          </w:p>
+        </w:tc>
+        <w:tc>
+          <w:tcPr>
+            <w:tcW w:w="789" w:type="dxa"/>
             <w:tcMar>
               <w:top w:w="0" w:type="dxa"/>
-              <w:left w:w="2" w:type="dxa"/>
+              <w:left w:w="56" w:type="dxa"/>
               <w:bottom w:w="0" w:type="dxa"/>
-              <w:right w:w="2" w:type="dxa"/>
+              <w:right w:w="56" w:type="dxa"/>
             </w:tcMar>
             <w:tcBorders>
               <w:top w:val="nil"/>
@@ -1724,33 +1177,23 @@
             <w:pPr>
               <w:pBdr/>
               <w:pStyle w:val="normal1"/>
-              <w:spacing w:before="100" w:beforeAutospacing="true" w:after="0" w:afterAutospacing="false" w:line="240" w:lineRule="auto"/>
-              <w:ind w:left="0" w:right="0"/>
-              <w:jc w:val="center"/>
-              <w:rPr>
-                <w:rFonts w:ascii="Calibri" w:eastAsia="Calibri" w:hAnsi="Calibri" w:cs="Calibri"/>
-                <w:color w:val="000000"/>
-                <w:sz w:val="18"/>
-              </w:rPr>
-            </w:pPr>
-            <w:r>
-              <w:rPr>
-                <w:rFonts w:ascii="Calibri" w:eastAsia="Calibri" w:hAnsi="Calibri" w:cs="Calibri"/>
-                <w:color w:val="000000"/>
-                <w:sz w:val="18"/>
-              </w:rPr>
-              <w:t xml:space="preserve">64,77 € </w:t>
-            </w:r>
-          </w:p>
-        </w:tc>
-        <w:tc>
-          <w:tcPr>
-            <w:tcW w:w="467" w:type="dxa"/>
+              <w:spacing w:before="0" w:after="0"/>
+              <w:ind/>
+              <w:jc w:val="left"/>
+              <w:rPr>
+                <w:color w:val="000000"/>
+              </w:rPr>
+            </w:pPr>
+          </w:p>
+        </w:tc>
+        <w:tc>
+          <w:tcPr>
+            <w:tcW w:w="6332" w:type="dxa"/>
             <w:tcMar>
               <w:top w:w="0" w:type="dxa"/>
-              <w:left w:w="2" w:type="dxa"/>
+              <w:left w:w="56" w:type="dxa"/>
               <w:bottom w:w="0" w:type="dxa"/>
-              <w:right w:w="2" w:type="dxa"/>
+              <w:right w:w="56" w:type="dxa"/>
             </w:tcMar>
             <w:tcBorders>
               <w:top w:val="nil"/>
@@ -1765,28 +1208,1009 @@
             <w:pPr>
               <w:pBdr/>
               <w:pStyle w:val="normal1"/>
-              <w:spacing w:before="100" w:beforeAutospacing="true" w:after="0" w:afterAutospacing="false" w:line="240" w:lineRule="auto"/>
+              <w:spacing w:before="0" w:beforeAutospacing="false" w:after="0" w:afterAutospacing="false" w:line="278" w:lineRule="auto"/>
+              <w:ind w:right="0"/>
+              <w:jc w:val="left"/>
+              <w:rPr>
+                <w:color w:val="000000"/>
+                <w:sz w:val="20"/>
+                <w:szCs w:val="20"/>
+              </w:rPr>
+            </w:pPr>
+          </w:p>
+          <w:p>
+            <w:pPr>
+              <w:pBdr/>
+              <w:pStyle w:val="normal1"/>
+              <w:spacing w:before="0" w:beforeAutospacing="false" w:after="0" w:afterAutospacing="false" w:line="278" w:lineRule="auto"/>
+              <w:ind w:right="0"/>
+              <w:jc w:val="left"/>
+              <w:rPr>
+                <w:color w:val="000000"/>
+                <w:sz w:val="20"/>
+                <w:szCs w:val="20"/>
+              </w:rPr>
+            </w:pPr>
+            <w:r>
+              <w:rPr>
+                <w:rFonts w:ascii="Open Sans" w:eastAsia="Open Sans" w:hAnsi="Open Sans" w:cs="Open Sans"/>
+                <w:color w:val="000000"/>
+                <w:sz w:val="20"/>
+                <w:szCs w:val="20"/>
+              </w:rPr>
+              <w:t xml:space="preserve">Enthält je Einheit</w:t>
+            </w:r>
+          </w:p>
+          <w:p>
+            <w:pPr>
+              <w:pBdr/>
+              <w:pStyle w:val="normal1"/>
+              <w:spacing w:before="0" w:beforeAutospacing="false" w:after="0" w:afterAutospacing="false" w:line="278" w:lineRule="auto"/>
+              <w:ind w:right="0"/>
+              <w:jc w:val="left"/>
+              <w:rPr>
+                <w:color w:val="000000"/>
+                <w:sz w:val="20"/>
+                <w:szCs w:val="20"/>
+              </w:rPr>
+            </w:pPr>
+            <w:r>
+              <w:rPr>
+                <w:rFonts w:ascii="Open Sans" w:eastAsia="Open Sans" w:hAnsi="Open Sans" w:cs="Open Sans"/>
+                <w:color w:val="000000"/>
+                <w:sz w:val="20"/>
+                <w:szCs w:val="20"/>
+              </w:rPr>
+              <w:t xml:space="preserve">- 1,00 Stk Fahrzeugbereitstellung</w:t>
+            </w:r>
+          </w:p>
+          <w:p>
+            <w:pPr>
+              <w:pBdr/>
+              <w:pStyle w:val="normal1"/>
+              <w:spacing w:before="0" w:beforeAutospacing="false" w:after="0" w:afterAutospacing="false" w:line="278" w:lineRule="auto"/>
+              <w:ind w:right="0"/>
+              <w:jc w:val="left"/>
+              <w:rPr>
+                <w:color w:val="000000"/>
+                <w:sz w:val="20"/>
+                <w:szCs w:val="20"/>
+              </w:rPr>
+            </w:pPr>
+            <w:r>
+              <w:rPr>
+                <w:rFonts w:ascii="Open Sans" w:eastAsia="Open Sans" w:hAnsi="Open Sans" w:cs="Open Sans"/>
+                <w:color w:val="000000"/>
+                <w:sz w:val="20"/>
+                <w:szCs w:val="20"/>
+              </w:rPr>
+              <w:t xml:space="preserve">- 1,00 Stk Bereitstellung und Vorhaltung von Maschinen &amp; Werkzeugen</w:t>
+            </w:r>
+          </w:p>
+          <w:p>
+            <w:pPr>
+              <w:pBdr/>
+              <w:pStyle w:val="normal1"/>
+              <w:spacing w:before="0" w:beforeAutospacing="false" w:after="0" w:afterAutospacing="false" w:line="278" w:lineRule="auto"/>
+              <w:ind w:right="0"/>
+              <w:jc w:val="left"/>
+              <w:rPr>
+                <w:color w:val="000000"/>
+                <w:sz w:val="20"/>
+                <w:szCs w:val="20"/>
+              </w:rPr>
+            </w:pPr>
+            <w:r>
+              <w:rPr>
+                <w:rFonts w:ascii="Open Sans" w:eastAsia="Open Sans" w:hAnsi="Open Sans" w:cs="Open Sans"/>
+                <w:color w:val="000000"/>
+                <w:sz w:val="20"/>
+                <w:szCs w:val="20"/>
+              </w:rPr>
+              <w:t xml:space="preserve">- 1,00 Stk Beräumung der Baustelle</w:t>
+            </w:r>
+          </w:p>
+          <w:p>
+            <w:pPr>
+              <w:pBdr/>
+              <w:pStyle w:val="normal1"/>
+              <w:spacing w:before="0" w:beforeAutospacing="false" w:after="0" w:afterAutospacing="false" w:line="278" w:lineRule="auto"/>
+              <w:ind w:right="0"/>
+              <w:jc w:val="left"/>
+              <w:rPr>
+                <w:color w:val="000000"/>
+                <w:sz w:val="20"/>
+                <w:szCs w:val="20"/>
+              </w:rPr>
+            </w:pPr>
+            <w:r>
+              <w:rPr>
+                <w:rFonts w:ascii="Open Sans" w:eastAsia="Open Sans" w:hAnsi="Open Sans" w:cs="Open Sans"/>
+                <w:color w:val="000000"/>
+                <w:sz w:val="20"/>
+                <w:szCs w:val="20"/>
+              </w:rPr>
+              <w:t xml:space="preserve">- 44 km Kilometerpauschale</w:t>
+            </w:r>
+          </w:p>
+        </w:tc>
+        <w:tc>
+          <w:tcPr>
+            <w:tcW w:w="1415" w:type="dxa"/>
+            <w:tcMar>
+              <w:top w:w="0" w:type="dxa"/>
+              <w:left w:w="56" w:type="dxa"/>
+              <w:bottom w:w="0" w:type="dxa"/>
+              <w:right w:w="56" w:type="dxa"/>
+            </w:tcMar>
+            <w:tcBorders>
+              <w:top w:val="nil"/>
+              <w:left w:val="nil"/>
+              <w:bottom w:val="nil"/>
+              <w:right w:val="nil"/>
+            </w:tcBorders>
+            <w:shd w:fill="FFFFFF" w:color="auto" w:val="clear"/>
+            <w:vAlign w:val="top"/>
+          </w:tcPr>
+          <w:p>
+            <w:pPr>
+              <w:pBdr/>
+              <w:pStyle w:val="normal1"/>
+              <w:spacing w:before="0" w:after="0" w:line="278" w:lineRule="auto"/>
+              <w:ind w:right="314"/>
+              <w:jc w:val="center"/>
+              <w:rPr>
+                <w:color w:val="000000"/>
+              </w:rPr>
+            </w:pPr>
+          </w:p>
+        </w:tc>
+        <w:tc>
+          <w:tcPr>
+            <w:tcW w:w="1072" w:type="dxa"/>
+            <w:tcMar>
+              <w:top w:w="0" w:type="dxa"/>
+              <w:left w:w="56" w:type="dxa"/>
+              <w:bottom w:w="0" w:type="dxa"/>
+              <w:right w:w="56" w:type="dxa"/>
+            </w:tcMar>
+            <w:tcBorders>
+              <w:top w:val="nil"/>
+              <w:left w:val="nil"/>
+              <w:bottom w:val="nil"/>
+              <w:right w:val="nil"/>
+            </w:tcBorders>
+            <w:shd w:fill="FFFFFF" w:color="auto" w:val="clear"/>
+            <w:vAlign w:val="center"/>
+          </w:tcPr>
+          <w:p>
+            <w:pPr>
+              <w:pBdr/>
+              <w:pStyle w:val="normal1"/>
+              <w:spacing w:before="0" w:after="0" w:line="278" w:lineRule="auto"/>
+              <w:ind w:right="314"/>
+              <w:jc w:val="center"/>
+              <w:rPr>
+                <w:color w:val="000000"/>
+              </w:rPr>
+            </w:pPr>
+          </w:p>
+        </w:tc>
+      </w:tr>
+    </w:tbl>
+    <w:p>
+      <w:pPr>
+        <w:pBdr/>
+        <w:pStyle w:val="normal1"/>
+        <w:spacing w:before="121" w:after="0"/>
+        <w:ind/>
+        <w:tabs>
+          <w:tab w:val="clear" w:pos="720"/>
+          <w:tab w:val="left" w:pos="750"/>
+          <w:tab w:val="left" w:pos="1416.0000610351562"/>
+        </w:tabs>
+        <w:rPr>
+          <w:rFonts w:ascii="Open Sans" w:eastAsia="Open Sans" w:hAnsi="Open Sans" w:cs="Open Sans"/>
+          <w:color w:val="070707"/>
+          <w:sz w:val="20"/>
+          <w:szCs w:val="20"/>
+        </w:rPr>
+      </w:pPr>
+    </w:p>
+    <w:tbl>
+      <w:tblPr>
+        <w:tblStyle w:val="TableNormal"/>
+        <w:tblW w:w="10050" w:type="dxa"/>
+        <w:jc w:val="left"/>
+        <w:tblInd w:w="1" w:type="dxa"/>
+        <w:tblCellMar>
+          <w:top w:w="0" w:type="dxa"/>
+          <w:left w:w="56" w:type="dxa"/>
+          <w:bottom w:w="0" w:type="dxa"/>
+          <w:right w:w="56" w:type="dxa"/>
+        </w:tblCellMar>
+        <w:tblBorders/>
+        <w:shd w:fill="auto" w:color="auto"/>
+        <w:tblLayout w:type="fixed"/>
+      </w:tblPr>
+      <w:tblGrid>
+        <w:gridCol w:w="425"/>
+        <w:gridCol w:w="789"/>
+        <w:gridCol w:w="6342"/>
+        <w:gridCol w:w="1417"/>
+        <w:gridCol w:w="1077"/>
+      </w:tblGrid>
+      <w:tr>
+        <w:tblPrEx>
+          <w:tblBorders/>
+          <w:tblCellMar>
+            <w:top w:w="0" w:type="dxa"/>
+            <w:left w:w="56" w:type="dxa"/>
+            <w:bottom w:w="0" w:type="dxa"/>
+            <w:right w:w="56" w:type="dxa"/>
+          </w:tblCellMar>
+        </w:tblPrEx>
+        <w:trPr>
+          <w:trHeight w:hRule="atLeast" w:val="379"/>
+        </w:trPr>
+        <w:tc>
+          <w:tcPr>
+            <w:tcW w:w="425" w:type="dxa"/>
+            <w:tcBorders>
+              <w:top w:val="nil"/>
+              <w:left w:val="nil"/>
+              <w:bottom w:val="nil"/>
+              <w:right w:val="nil"/>
+            </w:tcBorders>
+            <w:shd w:fill="FFFFFF" w:color="auto" w:val="clear"/>
+            <w:vAlign w:val="top"/>
+          </w:tcPr>
+          <w:p>
+            <w:pPr>
+              <w:pBdr/>
+              <w:pStyle w:val="normal1"/>
+              <w:spacing w:before="0" w:beforeAutospacing="false" w:after="0" w:afterAutospacing="false" w:line="240" w:lineRule="auto"/>
+              <w:ind w:right="0"/>
+              <w:jc w:val="center"/>
+              <w:rPr>
+                <w:rFonts w:ascii="Calibri" w:eastAsia="Calibri" w:hAnsi="Calibri" w:cs="Calibri"/>
+                <w:sz w:val="18"/>
+                <w:szCs w:val="22"/>
+              </w:rPr>
+            </w:pPr>
+            <w:r>
+              <w:rPr>
+                <w:rFonts w:ascii="Open Sans" w:eastAsia="Open Sans" w:hAnsi="Open Sans" w:cs="Open Sans"/>
+                <w:color w:val="070707"/>
+                <w:sz w:val="18"/>
+                <w:szCs w:val="20"/>
+              </w:rPr>
+              <w:t xml:space="preserve">002</w:t>
+            </w:r>
+          </w:p>
+        </w:tc>
+        <w:tc>
+          <w:tcPr>
+            <w:tcW w:w="789" w:type="dxa"/>
+            <w:tcBorders>
+              <w:top w:val="nil"/>
+              <w:left w:val="nil"/>
+              <w:bottom w:val="nil"/>
+              <w:right w:val="nil"/>
+            </w:tcBorders>
+            <w:shd w:fill="FFFFFF" w:color="auto" w:val="clear"/>
+            <w:vAlign w:val="top"/>
+          </w:tcPr>
+          <w:p>
+            <w:pPr>
+              <w:pBdr/>
+              <w:pStyle w:val="normal1"/>
+              <w:spacing w:before="0" w:beforeAutospacing="false" w:after="0" w:afterAutospacing="false" w:line="240" w:lineRule="auto"/>
+              <w:ind w:right="0"/>
+              <w:jc w:val="center"/>
+              <w:rPr>
+                <w:rFonts w:ascii="Calibri" w:eastAsia="Calibri" w:hAnsi="Calibri" w:cs="Calibri"/>
+                <w:sz w:val="18"/>
+                <w:szCs w:val="22"/>
+              </w:rPr>
+            </w:pPr>
+            <w:r>
+              <w:rPr>
+                <w:rFonts w:ascii="Open Sans" w:eastAsia="Open Sans" w:hAnsi="Open Sans" w:cs="Open Sans"/>
+                <w:color w:val="070707"/>
+                <w:sz w:val="18"/>
+                <w:szCs w:val="20"/>
+              </w:rPr>
+              <w:t xml:space="preserve">1 Stk</w:t>
+            </w:r>
+          </w:p>
+        </w:tc>
+        <w:tc>
+          <w:tcPr>
+            <w:tcW w:w="6342" w:type="dxa"/>
+            <w:tcBorders>
+              <w:top w:val="nil"/>
+              <w:left w:val="nil"/>
+              <w:bottom w:val="nil"/>
+              <w:right w:val="nil"/>
+            </w:tcBorders>
+            <w:shd w:fill="FFFFFF" w:color="auto" w:val="clear"/>
+            <w:vAlign w:val="top"/>
+          </w:tcPr>
+          <w:p>
+            <w:pPr>
+              <w:pBdr/>
+              <w:pStyle w:val="normal1"/>
+              <w:spacing w:before="0" w:beforeAutospacing="false" w:after="0" w:afterAutospacing="false" w:line="240" w:lineRule="auto"/>
+              <w:ind w:right="0"/>
+              <w:jc w:val="left"/>
+              <w:tabs>
+                <w:tab w:val="left" w:pos="6739.559999999997"/>
+                <w:tab w:val="left" w:pos="6907.559999999999"/>
+              </w:tabs>
+              <w:rPr>
+                <w:color w:val="000000"/>
+              </w:rPr>
+            </w:pPr>
+            <w:r>
+              <w:rPr>
+                <w:rFonts w:ascii="arial" w:eastAsia="arial" w:hAnsi="arial" w:cs="arial"/>
+                <w:b/>
+                <w:color w:val="000000"/>
+                <w:sz w:val="20"/>
+                <w:szCs w:val="20"/>
+              </w:rPr>
+              <w:t xml:space="preserve">Material für Badumbau</w:t>
+            </w:r>
+          </w:p>
+        </w:tc>
+        <w:tc>
+          <w:tcPr>
+            <w:tcW w:w="1417" w:type="dxa"/>
+            <w:tcBorders>
+              <w:top w:val="nil"/>
+              <w:left w:val="nil"/>
+              <w:bottom w:val="nil"/>
+              <w:right w:val="nil"/>
+            </w:tcBorders>
+            <w:shd w:fill="FFFFFF" w:color="auto" w:val="clear"/>
+            <w:vAlign w:val="top"/>
+          </w:tcPr>
+          <w:p>
+            <w:pPr>
+              <w:pBdr/>
+              <w:pStyle w:val="normal1"/>
+              <w:spacing w:before="0" w:beforeAutospacing="false" w:after="0" w:afterAutospacing="false" w:line="240" w:lineRule="auto"/>
               <w:ind w:left="0" w:right="0"/>
               <w:jc w:val="center"/>
               <w:rPr>
-                <w:rFonts w:ascii="Calibri" w:eastAsia="Calibri" w:hAnsi="Calibri" w:cs="Calibri"/>
+                <w:rFonts w:ascii="Arial" w:eastAsia="Arial" w:hAnsi="Arial" w:cs="Arial"/>
+                <w:color w:val="000000"/>
+                <w:sz w:val="20"/>
+              </w:rPr>
+            </w:pPr>
+            <w:r>
+              <w:rPr>
+                <w:rFonts w:ascii="Arial" w:eastAsia="Arial" w:hAnsi="Arial" w:cs="Arial"/>
+                <w:color w:val="000000"/>
+                <w:sz w:val="20"/>
+                <w:szCs w:val="20"/>
+              </w:rPr>
+              <w:t xml:space="preserve">861,51 €</w:t>
+            </w:r>
+          </w:p>
+        </w:tc>
+        <w:tc>
+          <w:tcPr>
+            <w:tcW w:w="1077" w:type="dxa"/>
+            <w:tcMar>
+              <w:top w:w="0" w:type="dxa"/>
+              <w:left w:w="0" w:type="dxa"/>
+              <w:bottom w:w="0" w:type="dxa"/>
+              <w:right w:w="0" w:type="dxa"/>
+            </w:tcMar>
+            <w:tcBorders>
+              <w:top w:val="nil"/>
+              <w:left w:val="nil"/>
+              <w:bottom w:val="nil"/>
+              <w:right w:val="nil"/>
+            </w:tcBorders>
+            <w:shd w:fill="FFFFFF" w:color="auto" w:val="clear"/>
+            <w:vAlign w:val="top"/>
+          </w:tcPr>
+          <w:p>
+            <w:pPr>
+              <w:pBdr/>
+              <w:pStyle w:val="normal1"/>
+              <w:spacing w:before="0" w:beforeAutospacing="false" w:after="0" w:afterAutospacing="false" w:line="240" w:lineRule="auto"/>
+              <w:ind w:right="0"/>
+              <w:jc w:val="center"/>
+              <w:rPr>
+                <w:rFonts w:ascii="Arial" w:eastAsia="Arial" w:hAnsi="Arial" w:cs="Arial"/>
+                <w:sz w:val="20"/>
+                <w:szCs w:val="22"/>
+              </w:rPr>
+            </w:pPr>
+            <w:r>
+              <w:rPr>
+                <w:rFonts w:ascii="Arial" w:eastAsia="Arial" w:hAnsi="Arial" w:cs="Arial"/>
+                <w:sz w:val="20"/>
+                <w:szCs w:val="22"/>
+              </w:rPr>
+              <w:t xml:space="preserve">861,51 €</w:t>
+            </w:r>
+          </w:p>
+        </w:tc>
+      </w:tr>
+      <w:tr>
+        <w:tblPrEx>
+          <w:tblBorders/>
+          <w:tblCellMar>
+            <w:top w:w="0" w:type="dxa"/>
+            <w:left w:w="56" w:type="dxa"/>
+            <w:bottom w:w="0" w:type="dxa"/>
+            <w:right w:w="56" w:type="dxa"/>
+          </w:tblCellMar>
+        </w:tblPrEx>
+        <w:trPr>
+          <w:trHeight w:hRule="atLeast" w:val="1"/>
+        </w:trPr>
+        <w:tc>
+          <w:tcPr>
+            <w:tcW w:w="425" w:type="dxa"/>
+            <w:tcBorders>
+              <w:top w:val="nil"/>
+              <w:left w:val="nil"/>
+              <w:bottom w:val="nil"/>
+              <w:right w:val="nil"/>
+            </w:tcBorders>
+            <w:shd w:fill="FFFFFF" w:color="auto" w:val="clear"/>
+            <w:vAlign w:val="top"/>
+          </w:tcPr>
+          <w:p>
+            <w:pPr>
+              <w:pBdr/>
+              <w:pStyle w:val="normal1"/>
+              <w:spacing w:before="0" w:after="0"/>
+              <w:ind/>
+              <w:jc w:val="left"/>
+              <w:rPr>
+                <w:color w:val="000000"/>
+              </w:rPr>
+            </w:pPr>
+          </w:p>
+        </w:tc>
+        <w:tc>
+          <w:tcPr>
+            <w:tcW w:w="789" w:type="dxa"/>
+            <w:tcBorders>
+              <w:top w:val="nil"/>
+              <w:left w:val="nil"/>
+              <w:bottom w:val="nil"/>
+              <w:right w:val="nil"/>
+            </w:tcBorders>
+            <w:shd w:fill="FFFFFF" w:color="auto" w:val="clear"/>
+            <w:vAlign w:val="top"/>
+          </w:tcPr>
+          <w:p>
+            <w:pPr>
+              <w:pBdr/>
+              <w:pStyle w:val="normal1"/>
+              <w:spacing w:before="0" w:after="0"/>
+              <w:ind/>
+              <w:jc w:val="left"/>
+              <w:rPr>
+                <w:color w:val="000000"/>
+              </w:rPr>
+            </w:pPr>
+          </w:p>
+        </w:tc>
+        <w:tc>
+          <w:tcPr>
+            <w:tcW w:w="6342" w:type="dxa"/>
+            <w:tcBorders>
+              <w:top w:val="nil"/>
+              <w:left w:val="nil"/>
+              <w:bottom w:val="nil"/>
+              <w:right w:val="nil"/>
+            </w:tcBorders>
+            <w:shd w:fill="FFFFFF" w:color="auto" w:val="clear"/>
+            <w:vAlign w:val="top"/>
+          </w:tcPr>
+          <w:p>
+            <w:pPr>
+              <w:pBdr/>
+              <w:pStyle w:val="normal1"/>
+              <w:spacing w:before="0" w:beforeAutospacing="false" w:after="0" w:afterAutospacing="false" w:line="278" w:lineRule="auto"/>
+              <w:ind w:right="0"/>
+              <w:jc w:val="left"/>
+              <w:rPr>
+                <w:rFonts w:ascii="Open Sans" w:eastAsia="Open Sans" w:hAnsi="Open Sans" w:cs="Open Sans"/>
+                <w:color w:val="000000"/>
+                <w:sz w:val="20"/>
+                <w:szCs w:val="20"/>
+              </w:rPr>
+            </w:pPr>
+            <w:r>
+              <w:rPr>
+                <w:rFonts w:ascii="Open Sans" w:eastAsia="Open Sans" w:hAnsi="Open Sans" w:cs="Open Sans"/>
+                <w:color w:val="000000"/>
+                <w:sz w:val="20"/>
+                <w:szCs w:val="20"/>
+              </w:rPr>
+              <w:t xml:space="preserve">- 1 Stk TRINNITY Wannenabdichtband-Set 3,4 m Nass-/Trockenanbindung entspr. DIN 18534</w:t>
+            </w:r>
+          </w:p>
+          <w:p>
+            <w:pPr>
+              <w:pBdr/>
+              <w:pStyle w:val="normal1"/>
+              <w:spacing w:before="0" w:beforeAutospacing="false" w:after="0" w:afterAutospacing="false" w:line="278" w:lineRule="auto"/>
+              <w:ind w:right="0"/>
+              <w:jc w:val="left"/>
+              <w:rPr>
+                <w:rFonts w:ascii="Open Sans" w:eastAsia="Open Sans" w:hAnsi="Open Sans" w:cs="Open Sans"/>
+                <w:color w:val="000000"/>
+                <w:sz w:val="20"/>
+                <w:szCs w:val="20"/>
+              </w:rPr>
+            </w:pPr>
+            <w:r>
+              <w:rPr>
+                <w:rFonts w:ascii="Open Sans" w:eastAsia="Open Sans" w:hAnsi="Open Sans" w:cs="Open Sans"/>
+                <w:color w:val="000000"/>
+                <w:sz w:val="20"/>
+                <w:szCs w:val="20"/>
+              </w:rPr>
+              <w:t xml:space="preserve">- 1 Stk Ablaufgarnitur Rohbauset m.Sifon BH60mm f.flache Duschw.m.90mm Ablauf TRINNITY</w:t>
+            </w:r>
+          </w:p>
+          <w:p>
+            <w:pPr>
+              <w:pBdr/>
+              <w:pStyle w:val="normal1"/>
+              <w:spacing w:before="0" w:beforeAutospacing="false" w:after="0" w:afterAutospacing="false" w:line="278" w:lineRule="auto"/>
+              <w:ind w:right="0"/>
+              <w:jc w:val="left"/>
+              <w:rPr>
+                <w:rFonts w:ascii="Open Sans" w:eastAsia="Open Sans" w:hAnsi="Open Sans" w:cs="Open Sans"/>
+                <w:color w:val="000000"/>
+                <w:sz w:val="20"/>
+                <w:szCs w:val="20"/>
+              </w:rPr>
+            </w:pPr>
+            <w:r>
+              <w:rPr>
+                <w:rFonts w:ascii="Open Sans" w:eastAsia="Open Sans" w:hAnsi="Open Sans" w:cs="Open Sans"/>
+                <w:color w:val="000000"/>
+                <w:sz w:val="20"/>
+                <w:szCs w:val="20"/>
+              </w:rPr>
+              <w:t xml:space="preserve">- 1 Stk Kleinmaterial</w:t>
+            </w:r>
+          </w:p>
+          <w:p>
+            <w:pPr>
+              <w:pBdr/>
+              <w:pStyle w:val="normal1"/>
+              <w:spacing w:before="0" w:beforeAutospacing="false" w:after="0" w:afterAutospacing="false" w:line="278" w:lineRule="auto"/>
+              <w:ind w:right="0"/>
+              <w:jc w:val="left"/>
+              <w:rPr>
+                <w:rFonts w:ascii="Open Sans" w:eastAsia="Open Sans" w:hAnsi="Open Sans" w:cs="Open Sans"/>
+                <w:color w:val="000000"/>
+                <w:sz w:val="20"/>
+                <w:szCs w:val="20"/>
+              </w:rPr>
+            </w:pPr>
+            <w:r>
+              <w:rPr>
+                <w:rFonts w:ascii="Open Sans" w:eastAsia="Open Sans" w:hAnsi="Open Sans" w:cs="Open Sans"/>
+                <w:color w:val="000000"/>
+                <w:sz w:val="20"/>
+                <w:szCs w:val="20"/>
+              </w:rPr>
+              <w:t xml:space="preserve">- 1 Stk Stelzlager höhenverstellar Set</w:t>
+            </w:r>
+          </w:p>
+          <w:p>
+            <w:pPr>
+              <w:pBdr/>
+              <w:pStyle w:val="normal1"/>
+              <w:spacing w:before="0" w:beforeAutospacing="false" w:after="0" w:afterAutospacing="false" w:line="278" w:lineRule="auto"/>
+              <w:ind w:right="0"/>
+              <w:jc w:val="left"/>
+              <w:rPr>
+                <w:rFonts w:ascii="Open Sans" w:eastAsia="Open Sans" w:hAnsi="Open Sans" w:cs="Open Sans"/>
+                <w:color w:val="000000"/>
+                <w:sz w:val="20"/>
+                <w:szCs w:val="20"/>
+              </w:rPr>
+            </w:pPr>
+            <w:r>
+              <w:rPr>
+                <w:rFonts w:ascii="Open Sans" w:eastAsia="Open Sans" w:hAnsi="Open Sans" w:cs="Open Sans"/>
+                <w:color w:val="000000"/>
+                <w:sz w:val="20"/>
+                <w:szCs w:val="20"/>
+              </w:rPr>
+              <w:t xml:space="preserve">- 1 Stk TRINNITY Wandabdichtung BASIS-Set 5 qm DW bis 100 x 100 / BW bis 180 x 80 cm</w:t>
+            </w:r>
+          </w:p>
+          <w:p>
+            <w:pPr>
+              <w:pBdr/>
+              <w:pStyle w:val="normal1"/>
+              <w:spacing w:before="0" w:beforeAutospacing="false" w:after="0" w:afterAutospacing="false" w:line="278" w:lineRule="auto"/>
+              <w:ind w:right="0"/>
+              <w:jc w:val="left"/>
+              <w:rPr>
+                <w:rFonts w:ascii="Open Sans" w:eastAsia="Open Sans" w:hAnsi="Open Sans" w:cs="Open Sans"/>
+                <w:color w:val="000000"/>
+                <w:sz w:val="20"/>
+                <w:szCs w:val="20"/>
+              </w:rPr>
+            </w:pPr>
+            <w:r>
+              <w:rPr>
+                <w:rFonts w:ascii="Open Sans" w:eastAsia="Open Sans" w:hAnsi="Open Sans" w:cs="Open Sans"/>
+                <w:color w:val="000000"/>
+                <w:sz w:val="20"/>
+                <w:szCs w:val="20"/>
+              </w:rPr>
+              <w:t xml:space="preserve">- 1 Pkg Flächenkleber (Wandverkleidung)</w:t>
+            </w:r>
+          </w:p>
+          <w:p>
+            <w:pPr>
+              <w:pBdr/>
+              <w:pStyle w:val="normal1"/>
+              <w:spacing w:before="0" w:beforeAutospacing="false" w:after="0" w:afterAutospacing="false" w:line="278" w:lineRule="auto"/>
+              <w:ind w:right="0"/>
+              <w:jc w:val="left"/>
+              <w:rPr>
+                <w:rFonts w:ascii="Open Sans" w:eastAsia="Open Sans" w:hAnsi="Open Sans" w:cs="Open Sans"/>
+                <w:color w:val="000000"/>
+                <w:sz w:val="20"/>
+                <w:szCs w:val="20"/>
+              </w:rPr>
+            </w:pPr>
+            <w:r>
+              <w:rPr>
+                <w:rFonts w:ascii="Open Sans" w:eastAsia="Open Sans" w:hAnsi="Open Sans" w:cs="Open Sans"/>
+                <w:color w:val="000000"/>
+                <w:sz w:val="20"/>
+                <w:szCs w:val="20"/>
+              </w:rPr>
+              <w:t xml:space="preserve">- 1 Stk Abschlussprofil 3.0 255 cm silber eloxiert VIGOUR</w:t>
+            </w:r>
+          </w:p>
+          <w:p>
+            <w:pPr>
+              <w:pBdr/>
+              <w:pStyle w:val="normal1"/>
+              <w:spacing w:before="0" w:beforeAutospacing="false" w:after="0" w:afterAutospacing="false" w:line="278" w:lineRule="auto"/>
+              <w:ind w:right="0"/>
+              <w:jc w:val="left"/>
+              <w:rPr>
+                <w:rFonts w:ascii="Open Sans" w:eastAsia="Open Sans" w:hAnsi="Open Sans" w:cs="Open Sans"/>
+                <w:color w:val="000000"/>
+                <w:sz w:val="20"/>
+                <w:szCs w:val="20"/>
+              </w:rPr>
+            </w:pPr>
+            <w:r>
+              <w:rPr>
+                <w:rFonts w:ascii="Open Sans" w:eastAsia="Open Sans" w:hAnsi="Open Sans" w:cs="Open Sans"/>
+                <w:color w:val="000000"/>
+                <w:sz w:val="20"/>
+                <w:szCs w:val="20"/>
+              </w:rPr>
+              <w:t xml:space="preserve">- 1 Stk CARE Sanitär Silikon Weiß 310ml</w:t>
+            </w:r>
+          </w:p>
+          <w:p>
+            <w:pPr>
+              <w:pBdr/>
+              <w:pStyle w:val="normal1"/>
+              <w:spacing w:before="0" w:beforeAutospacing="false" w:after="0" w:afterAutospacing="false" w:line="278" w:lineRule="auto"/>
+              <w:ind w:right="0"/>
+              <w:jc w:val="left"/>
+              <w:rPr>
+                <w:rFonts w:ascii="Open Sans" w:eastAsia="Open Sans" w:hAnsi="Open Sans" w:cs="Open Sans"/>
+                <w:color w:val="000000"/>
+                <w:sz w:val="20"/>
+                <w:szCs w:val="20"/>
+              </w:rPr>
+            </w:pPr>
+            <w:r>
+              <w:rPr>
+                <w:rFonts w:ascii="Open Sans" w:eastAsia="Open Sans" w:hAnsi="Open Sans" w:cs="Open Sans"/>
+                <w:color w:val="000000"/>
+                <w:sz w:val="20"/>
+                <w:szCs w:val="20"/>
+              </w:rPr>
+              <w:t xml:space="preserve">- 1 Stk Duschwanne 70 x 70 x 3 cm</w:t>
+            </w:r>
+          </w:p>
+        </w:tc>
+        <w:tc>
+          <w:tcPr>
+            <w:tcW w:w="1417" w:type="dxa"/>
+            <w:tcBorders>
+              <w:top w:val="nil"/>
+              <w:left w:val="nil"/>
+              <w:bottom w:val="nil"/>
+              <w:right w:val="nil"/>
+            </w:tcBorders>
+            <w:shd w:fill="FFFFFF" w:color="auto" w:val="clear"/>
+            <w:vAlign w:val="top"/>
+          </w:tcPr>
+          <w:p>
+            <w:pPr>
+              <w:pBdr/>
+              <w:pStyle w:val="normal1"/>
+              <w:spacing w:before="0" w:after="0" w:line="278" w:lineRule="auto"/>
+              <w:ind w:right="314"/>
+              <w:jc w:val="center"/>
+              <w:rPr>
+                <w:color w:val="000000"/>
+              </w:rPr>
+            </w:pPr>
+          </w:p>
+        </w:tc>
+        <w:tc>
+          <w:tcPr>
+            <w:tcW w:w="1077" w:type="dxa"/>
+            <w:tcBorders>
+              <w:top w:val="nil"/>
+              <w:left w:val="nil"/>
+              <w:bottom w:val="nil"/>
+              <w:right w:val="nil"/>
+            </w:tcBorders>
+            <w:shd w:fill="FFFFFF" w:color="auto" w:val="clear"/>
+            <w:vAlign w:val="center"/>
+          </w:tcPr>
+          <w:p>
+            <w:pPr>
+              <w:pBdr/>
+              <w:pStyle w:val="normal1"/>
+              <w:spacing w:before="0" w:after="0" w:line="278" w:lineRule="auto"/>
+              <w:ind w:right="314"/>
+              <w:jc w:val="center"/>
+              <w:rPr>
+                <w:color w:val="000000"/>
+              </w:rPr>
+            </w:pPr>
+          </w:p>
+        </w:tc>
+      </w:tr>
+      <w:tr>
+        <w:tblPrEx>
+          <w:tblBorders/>
+          <w:tblCellMar>
+            <w:top w:w="0" w:type="dxa"/>
+            <w:left w:w="56" w:type="dxa"/>
+            <w:bottom w:w="0" w:type="dxa"/>
+            <w:right w:w="56" w:type="dxa"/>
+          </w:tblCellMar>
+        </w:tblPrEx>
+        <w:trPr>
+          <w:trHeight w:hRule="atLeast" w:val="1"/>
+        </w:trPr>
+        <w:tc>
+          <w:tcPr>
+            <w:tcW w:w="425" w:type="dxa"/>
+            <w:tcBorders>
+              <w:top w:val="nil"/>
+              <w:left w:val="nil"/>
+              <w:bottom w:val="nil"/>
+              <w:right w:val="nil"/>
+            </w:tcBorders>
+            <w:shd w:fill="FFFFFF" w:color="auto" w:val="clear"/>
+            <w:vAlign w:val="top"/>
+          </w:tcPr>
+          <w:p>
+            <w:pPr>
+              <w:pBdr/>
+              <w:pStyle w:val="normal1"/>
+              <w:spacing w:before="0" w:after="0" w:line="278" w:lineRule="auto"/>
+              <w:ind w:right="-26"/>
+              <w:jc w:val="center"/>
+              <w:rPr>
                 <w:color w:val="000000"/>
                 <w:sz w:val="18"/>
               </w:rPr>
             </w:pPr>
             <w:r>
               <w:rPr>
-                <w:rFonts w:ascii="Calibri" w:eastAsia="Calibri" w:hAnsi="Calibri" w:cs="Calibri"/>
+                <w:rFonts w:ascii="Open Sans" w:eastAsia="Open Sans" w:hAnsi="Open Sans" w:cs="Open Sans"/>
                 <w:color w:val="000000"/>
                 <w:sz w:val="18"/>
-              </w:rPr>
-              <w:t xml:space="preserve">64,77 €</w:t>
-            </w:r>
-            <w:r>
-              <w:rPr>
-                <w:rFonts w:ascii="Calibri" w:eastAsia="Calibri" w:hAnsi="Calibri" w:cs="Calibri"/>
+                <w:szCs w:val="20"/>
+              </w:rPr>
+              <w:t xml:space="preserve">003</w:t>
+            </w:r>
+          </w:p>
+        </w:tc>
+        <w:tc>
+          <w:tcPr>
+            <w:tcW w:w="789" w:type="dxa"/>
+            <w:tcBorders>
+              <w:top w:val="nil"/>
+              <w:left w:val="nil"/>
+              <w:bottom w:val="nil"/>
+              <w:right w:val="nil"/>
+            </w:tcBorders>
+            <w:shd w:fill="FFFFFF" w:color="auto" w:val="clear"/>
+            <w:vAlign w:val="top"/>
+          </w:tcPr>
+          <w:p>
+            <w:pPr>
+              <w:pBdr/>
+              <w:pStyle w:val="normal1"/>
+              <w:spacing w:before="0" w:beforeAutospacing="false" w:after="0" w:afterAutospacing="false" w:line="278" w:lineRule="auto"/>
+              <w:ind w:right="0"/>
+              <w:jc w:val="center"/>
+              <w:rPr>
                 <w:color w:val="000000"/>
                 <w:sz w:val="18"/>
+              </w:rPr>
+            </w:pPr>
+            <w:r>
+              <w:rPr>
+                <w:rFonts w:ascii="Open Sans" w:eastAsia="Open Sans" w:hAnsi="Open Sans" w:cs="Open Sans"/>
+                <w:color w:val="000000"/>
+                <w:sz w:val="18"/>
+                <w:szCs w:val="20"/>
+              </w:rPr>
+              <w:t xml:space="preserve">1 Stk</w:t>
+            </w:r>
+          </w:p>
+        </w:tc>
+        <w:tc>
+          <w:tcPr>
+            <w:tcW w:w="6342" w:type="dxa"/>
+            <w:tcBorders>
+              <w:top w:val="nil"/>
+              <w:left w:val="nil"/>
+              <w:bottom w:val="nil"/>
+              <w:right w:val="nil"/>
+            </w:tcBorders>
+            <w:shd w:fill="FFFFFF" w:color="auto" w:val="clear"/>
+            <w:vAlign w:val="top"/>
+          </w:tcPr>
+          <w:p>
+            <w:pPr>
+              <w:pBdr/>
+              <w:pStyle w:val="normal1"/>
+              <w:spacing w:before="0" w:beforeAutospacing="false" w:after="0" w:afterAutospacing="false" w:line="278" w:lineRule="auto"/>
+              <w:ind w:right="0"/>
+              <w:jc w:val="left"/>
+              <w:rPr>
+                <w:rFonts w:ascii="Open Sans" w:eastAsia="Open Sans" w:hAnsi="Open Sans" w:cs="Open Sans"/>
+                <w:b/>
+                <w:color w:val="000000"/>
+                <w:sz w:val="20"/>
+                <w:szCs w:val="20"/>
+              </w:rPr>
+            </w:pPr>
+            <w:r>
+              <w:rPr>
+                <w:rFonts w:ascii="Open Sans" w:eastAsia="Open Sans" w:hAnsi="Open Sans" w:cs="Open Sans"/>
+                <w:b/>
+                <w:color w:val="000000"/>
+                <w:sz w:val="20"/>
+                <w:szCs w:val="20"/>
+              </w:rPr>
+              <w:t xml:space="preserve">Bestandkundenbonus:</w:t>
+            </w:r>
+          </w:p>
+          <w:p>
+            <w:pPr>
+              <w:pBdr/>
+              <w:pStyle w:val="normal1"/>
+              <w:spacing w:before="0" w:beforeAutospacing="false" w:after="0" w:afterAutospacing="false" w:line="278" w:lineRule="auto"/>
+              <w:ind w:right="0"/>
+              <w:jc w:val="left"/>
+              <w:rPr>
+                <w:color w:val="000000"/>
+                <w:sz w:val="18"/>
+                <w:szCs w:val="18"/>
+              </w:rPr>
+            </w:pPr>
+            <w:r>
+              <w:rPr>
+                <w:rFonts w:ascii="Open Sans" w:eastAsia="Open Sans" w:hAnsi="Open Sans" w:cs="Open Sans"/>
+                <w:color w:val="000000"/>
+                <w:sz w:val="20"/>
+                <w:szCs w:val="20"/>
+              </w:rPr>
+              <w:t xml:space="preserve">-- Rabatt von 300 € ab einem Gesamtwert von 3.000</w:t>
+            </w:r>
+          </w:p>
+        </w:tc>
+        <w:tc>
+          <w:tcPr>
+            <w:tcW w:w="1417" w:type="dxa"/>
+            <w:tcBorders>
+              <w:top w:val="nil"/>
+              <w:left w:val="nil"/>
+              <w:bottom w:val="nil"/>
+              <w:right w:val="nil"/>
+            </w:tcBorders>
+            <w:shd w:fill="FFFFFF" w:color="auto" w:val="clear"/>
+            <w:vAlign w:val="top"/>
+          </w:tcPr>
+          <w:p>
+            <w:pPr>
+              <w:pBdr/>
+              <w:pStyle w:val="normal1"/>
+              <w:spacing w:before="0" w:beforeAutospacing="false" w:after="0" w:afterAutospacing="false" w:line="278" w:lineRule="auto"/>
+              <w:ind w:right="0"/>
+              <w:jc w:val="center"/>
+              <w:rPr>
+                <w:color w:val="000000"/>
+              </w:rPr>
+            </w:pPr>
+            <w:r>
+              <w:rPr>
+                <w:rFonts w:ascii="Open Sans" w:eastAsia="Open Sans" w:hAnsi="Open Sans" w:cs="Open Sans"/>
+                <w:color w:val="000000"/>
+                <w:sz w:val="20"/>
+                <w:szCs w:val="20"/>
+              </w:rPr>
+              <w:t xml:space="preserve">-252,10 €</w:t>
+            </w:r>
+          </w:p>
+        </w:tc>
+        <w:tc>
+          <w:tcPr>
+            <w:tcW w:w="1077" w:type="dxa"/>
+            <w:tcBorders>
+              <w:top w:val="nil"/>
+              <w:left w:val="nil"/>
+              <w:bottom w:val="nil"/>
+              <w:right w:val="nil"/>
+            </w:tcBorders>
+            <w:shd w:fill="FFFFFF" w:color="auto" w:val="clear"/>
+            <w:vAlign w:val="top"/>
+          </w:tcPr>
+          <w:p>
+            <w:pPr>
+              <w:pBdr/>
+              <w:pStyle w:val="normal1"/>
+              <w:spacing w:before="0" w:beforeAutospacing="false" w:after="0" w:afterAutospacing="false" w:line="278" w:lineRule="auto"/>
+              <w:ind w:right="0"/>
+              <w:jc w:val="center"/>
+              <w:rPr>
+                <w:color w:val="000000"/>
+              </w:rPr>
+            </w:pPr>
+            <w:r>
+              <w:rPr>
+                <w:rFonts w:ascii="Open Sans" w:eastAsia="Open Sans" w:hAnsi="Open Sans" w:cs="Open Sans"/>
+                <w:color w:val="000000"/>
+                <w:sz w:val="20"/>
+                <w:szCs w:val="20"/>
+              </w:rPr>
+              <w:t xml:space="preserve">-252,10 €</w:t>
+            </w:r>
+            <w:r>
+              <w:rPr>
+                <w:rFonts w:ascii="Open Sans" w:eastAsia="Open Sans" w:hAnsi="Open Sans" w:cs="Open Sans"/>
+                <w:color w:val="000000"/>
+                <w:sz w:val="20"/>
+                <w:szCs w:val="20"/>
+              </w:rPr>
+              <w:t/>
+            </w:r>
+            <w:r>
+              <w:rPr>
+                <w:rFonts w:ascii="Open Sans" w:eastAsia="Open Sans" w:hAnsi="Open Sans" w:cs="Open Sans"/>
+                <w:color w:val="000000"/>
+                <w:sz w:val="20"/>
+                <w:szCs w:val="20"/>
               </w:rPr>
               <w:t/>
             </w:r>
@@ -1825,22 +2249,15 @@
           <w:bottom w:w="0" w:type="dxa"/>
           <w:right w:w="108" w:type="dxa"/>
         </w:tblCellMar>
-        <w:tblBorders>
-          <w:top w:val="single" w:color="e57373" w:sz="8" w:space="0"/>
-          <w:left w:val="single" w:color="000000" w:sz="8" w:space="0"/>
-          <w:bottom w:val="single" w:color="e57373" w:sz="8" w:space="0"/>
-          <w:right w:val="single" w:color="e57373" w:sz="8" w:space="0"/>
-          <w:insideH w:val="single" w:color="000000" w:sz="8" w:space="0"/>
-          <w:insideV w:val="single" w:color="000000" w:sz="8" w:space="0"/>
-        </w:tblBorders>
+        <w:tblBorders/>
         <w:shd w:fill="auto" w:color="auto"/>
         <w:tblLayout w:type="fixed"/>
       </w:tblPr>
       <w:tblGrid>
-        <w:gridCol w:w="2415"/>
-        <w:gridCol w:w="2415"/>
-        <w:gridCol w:w="2415"/>
-        <w:gridCol w:w="2415"/>
+        <w:gridCol w:w="3915"/>
+        <w:gridCol w:w="915"/>
+        <w:gridCol w:w="2102"/>
+        <w:gridCol w:w="2728"/>
       </w:tblGrid>
       <w:tr>
         <w:tblPrEx>
@@ -1853,32 +2270,26 @@
           </w:tblCellMar>
         </w:tblPrEx>
         <w:trPr>
-          <w:trHeight w:hRule="atLeast" w:val="20"/>
+          <w:trHeight w:hRule="atLeast" w:val="1"/>
         </w:trPr>
         <w:tc>
           <w:tcPr>
             <w:tcW w:w="3915" w:type="dxa"/>
-            <w:tcMar>
-              <w:top w:w="0" w:type="dxa"/>
-              <w:left w:w="88" w:type="dxa"/>
-              <w:bottom w:w="0" w:type="dxa"/>
-              <w:right w:w="8" w:type="dxa"/>
-            </w:tcMar>
             <w:tcBorders>
-              <w:top w:val="single" w:color="FFFFFF" w:sz="8" w:space="0"/>
-              <w:left w:val="single" w:color="D9D9D9" w:sz="8" w:space="0"/>
-              <w:bottom w:val="single" w:color="FFFFFF" w:sz="8" w:space="0"/>
-              <w:right w:val="single" w:color="D9D9D9" w:sz="8" w:space="0"/>
+              <w:top w:val="nil"/>
+              <w:left w:val="nil"/>
+              <w:bottom w:val="nil"/>
+              <w:right w:val="nil"/>
             </w:tcBorders>
             <w:shd w:fill="D9D9D9" w:color="auto" w:val="clear"/>
-            <w:vAlign w:val="top"/>
-          </w:tcPr>
-          <w:p>
-            <w:pPr>
-              <w:pBdr/>
-              <w:pStyle w:val="normal1"/>
-              <w:spacing w:before="0" w:after="0"/>
-              <w:ind w:left="0"/>
+            <w:vAlign w:val="center"/>
+          </w:tcPr>
+          <w:p>
+            <w:pPr>
+              <w:pBdr/>
+              <w:pStyle w:val="normal1"/>
+              <w:spacing w:before="56" w:after="0"/>
+              <w:ind w:left="50"/>
               <w:jc w:val="left"/>
               <w:rPr>
                 <w:rFonts w:ascii="Calibri" w:eastAsia="Calibri" w:hAnsi="Calibri" w:cs="Calibri"/>
@@ -1909,18 +2320,12 @@
         </w:tc>
         <w:tc>
           <w:tcPr>
-            <w:tcW w:w="3915" w:type="dxa"/>
-            <w:tcMar>
-              <w:top w:w="0" w:type="dxa"/>
-              <w:left w:w="88" w:type="dxa"/>
-              <w:bottom w:w="0" w:type="dxa"/>
-              <w:right w:w="8" w:type="dxa"/>
-            </w:tcMar>
+            <w:tcW w:w="915" w:type="dxa"/>
             <w:tcBorders>
-              <w:top w:val="single" w:color="FFFFFF" w:sz="8" w:space="0"/>
-              <w:left w:val="single" w:color="D9D9D9" w:sz="8" w:space="0"/>
-              <w:bottom w:val="single" w:color="FFFFFF" w:sz="8" w:space="0"/>
-              <w:right w:val="single" w:color="D9D9D9" w:sz="8" w:space="0"/>
+              <w:top w:val="nil"/>
+              <w:left w:val="nil"/>
+              <w:bottom w:val="nil"/>
+              <w:right w:val="nil"/>
             </w:tcBorders>
             <w:shd w:fill="D9D9D9" w:color="auto" w:val="clear"/>
             <w:vAlign w:val="center"/>
@@ -1940,18 +2345,12 @@
         </w:tc>
         <w:tc>
           <w:tcPr>
-            <w:tcW w:w="3915" w:type="dxa"/>
-            <w:tcMar>
-              <w:top w:w="0" w:type="dxa"/>
-              <w:left w:w="88" w:type="dxa"/>
-              <w:bottom w:w="0" w:type="dxa"/>
-              <w:right w:w="8" w:type="dxa"/>
-            </w:tcMar>
+            <w:tcW w:w="2102" w:type="dxa"/>
             <w:tcBorders>
-              <w:top w:val="single" w:color="FFFFFF" w:sz="8" w:space="0"/>
-              <w:left w:val="single" w:color="D9D9D9" w:sz="8" w:space="0"/>
-              <w:bottom w:val="single" w:color="FFFFFF" w:sz="8" w:space="0"/>
-              <w:right w:val="single" w:color="D9D9D9" w:sz="8" w:space="0"/>
+              <w:top w:val="nil"/>
+              <w:left w:val="nil"/>
+              <w:bottom w:val="nil"/>
+              <w:right w:val="nil"/>
             </w:tcBorders>
             <w:shd w:fill="D9D9D9" w:color="auto" w:val="clear"/>
             <w:vAlign w:val="center"/>
@@ -1971,18 +2370,12 @@
         </w:tc>
         <w:tc>
           <w:tcPr>
-            <w:tcW w:w="3915" w:type="dxa"/>
-            <w:tcMar>
-              <w:top w:w="0" w:type="dxa"/>
-              <w:left w:w="88" w:type="dxa"/>
-              <w:bottom w:w="0" w:type="dxa"/>
-              <w:right w:w="8" w:type="dxa"/>
-            </w:tcMar>
+            <w:tcW w:w="2728" w:type="dxa"/>
             <w:tcBorders>
-              <w:top w:val="single" w:color="FFFFFF" w:sz="8" w:space="0"/>
-              <w:left w:val="single" w:color="D9D9D9" w:sz="8" w:space="0"/>
-              <w:bottom w:val="single" w:color="FFFFFF" w:sz="8" w:space="0"/>
-              <w:right w:val="single" w:color="D9D9D9" w:sz="8" w:space="0"/>
+              <w:top w:val="nil"/>
+              <w:left w:val="nil"/>
+              <w:bottom w:val="nil"/>
+              <w:right w:val="nil"/>
             </w:tcBorders>
             <w:shd w:fill="D9D9D9" w:color="auto" w:val="clear"/>
             <w:vAlign w:val="center"/>
@@ -1991,9 +2384,8 @@
             <w:pPr>
               <w:pBdr/>
               <w:pStyle w:val="normal1"/>
-              <w:spacing w:before="0" w:beforeAutospacing="false" w:after="0" w:afterAutospacing="false" w:line="278" w:lineRule="auto"/>
-              <w:contextualSpacing/>
-              <w:ind w:left="0" w:right="314"/>
+              <w:spacing w:before="0" w:after="0" w:line="278" w:lineRule="auto"/>
+              <w:ind w:right="314"/>
               <w:jc w:val="right"/>
               <w:rPr>
                 <w:color w:val="000000"/>
@@ -2007,7 +2399,7 @@
                 <w:sz w:val="22"/>
                 <w:szCs w:val="22"/>
               </w:rPr>
-              <w:t xml:space="preserve">3.535,14 €</w:t>
+              <w:t xml:space="preserve">2.445,81 €</w:t>
             </w:r>
             <w:r>
               <w:rPr>
@@ -2032,32 +2424,26 @@
           </w:tblCellMar>
         </w:tblPrEx>
         <w:trPr>
-          <w:trHeight w:hRule="atLeast" w:val="54"/>
+          <w:trHeight w:hRule="atLeast" w:val="285"/>
         </w:trPr>
         <w:tc>
           <w:tcPr>
             <w:tcW w:w="3915" w:type="dxa"/>
-            <w:tcMar>
-              <w:top w:w="0" w:type="dxa"/>
-              <w:left w:w="88" w:type="dxa"/>
-              <w:bottom w:w="0" w:type="dxa"/>
-              <w:right w:w="8" w:type="dxa"/>
-            </w:tcMar>
             <w:tcBorders>
-              <w:top w:val="single" w:color="FFFFFF" w:sz="8" w:space="0"/>
-              <w:left w:val="single" w:color="FFFFFF" w:sz="8" w:space="0"/>
-              <w:bottom w:val="single" w:color="FFFFFF" w:sz="8" w:space="0"/>
-              <w:right w:val="single" w:color="FFFFFF" w:sz="8" w:space="0"/>
+              <w:top w:val="nil"/>
+              <w:left w:val="nil"/>
+              <w:bottom w:val="nil"/>
+              <w:right w:val="nil"/>
             </w:tcBorders>
             <w:shd w:fill="FFFFFF" w:color="auto" w:val="clear"/>
-            <w:vAlign w:val="top"/>
-          </w:tcPr>
-          <w:p>
-            <w:pPr>
-              <w:pBdr/>
-              <w:pStyle w:val="normal1"/>
-              <w:spacing w:before="0" w:after="0"/>
-              <w:ind w:right="0"/>
+            <w:vAlign w:val="center"/>
+          </w:tcPr>
+          <w:p>
+            <w:pPr>
+              <w:pBdr/>
+              <w:pStyle w:val="normal1"/>
+              <w:spacing w:before="57" w:after="0"/>
+              <w:ind/>
               <w:jc w:val="left"/>
               <w:rPr>
                 <w:rFonts w:ascii="Calibri" w:eastAsia="Calibri" w:hAnsi="Calibri" w:cs="Calibri"/>
@@ -2088,18 +2474,12 @@
         </w:tc>
         <w:tc>
           <w:tcPr>
-            <w:tcW w:w="3915" w:type="dxa"/>
-            <w:tcMar>
-              <w:top w:w="0" w:type="dxa"/>
-              <w:left w:w="88" w:type="dxa"/>
-              <w:bottom w:w="0" w:type="dxa"/>
-              <w:right w:w="8" w:type="dxa"/>
-            </w:tcMar>
+            <w:tcW w:w="915" w:type="dxa"/>
             <w:tcBorders>
-              <w:top w:val="single" w:color="FFFFFF" w:sz="8" w:space="0"/>
-              <w:left w:val="single" w:color="FFFFFF" w:sz="8" w:space="0"/>
-              <w:bottom w:val="single" w:color="FFFFFF" w:sz="8" w:space="0"/>
-              <w:right w:val="single" w:color="FFFFFF" w:sz="8" w:space="0"/>
+              <w:top w:val="nil"/>
+              <w:left w:val="nil"/>
+              <w:bottom w:val="nil"/>
+              <w:right w:val="nil"/>
             </w:tcBorders>
             <w:shd w:fill="FFFFFF" w:color="auto" w:val="clear"/>
             <w:vAlign w:val="center"/>
@@ -2119,18 +2499,12 @@
         </w:tc>
         <w:tc>
           <w:tcPr>
-            <w:tcW w:w="3915" w:type="dxa"/>
-            <w:tcMar>
-              <w:top w:w="0" w:type="dxa"/>
-              <w:left w:w="88" w:type="dxa"/>
-              <w:bottom w:w="0" w:type="dxa"/>
-              <w:right w:w="8" w:type="dxa"/>
-            </w:tcMar>
+            <w:tcW w:w="2102" w:type="dxa"/>
             <w:tcBorders>
-              <w:top w:val="single" w:color="FFFFFF" w:sz="8" w:space="0"/>
-              <w:left w:val="single" w:color="FFFFFF" w:sz="8" w:space="0"/>
-              <w:bottom w:val="single" w:color="FFFFFF" w:sz="8" w:space="0"/>
-              <w:right w:val="single" w:color="FFFFFF" w:sz="8" w:space="0"/>
+              <w:top w:val="nil"/>
+              <w:left w:val="nil"/>
+              <w:bottom w:val="nil"/>
+              <w:right w:val="nil"/>
             </w:tcBorders>
             <w:shd w:fill="FFFFFF" w:color="auto" w:val="clear"/>
             <w:vAlign w:val="center"/>
@@ -2150,18 +2524,12 @@
         </w:tc>
         <w:tc>
           <w:tcPr>
-            <w:tcW w:w="3915" w:type="dxa"/>
-            <w:tcMar>
-              <w:top w:w="0" w:type="dxa"/>
-              <w:left w:w="88" w:type="dxa"/>
-              <w:bottom w:w="0" w:type="dxa"/>
-              <w:right w:w="8" w:type="dxa"/>
-            </w:tcMar>
+            <w:tcW w:w="2728" w:type="dxa"/>
             <w:tcBorders>
-              <w:top w:val="single" w:color="FFFFFF" w:sz="8" w:space="0"/>
-              <w:left w:val="single" w:color="FFFFFF" w:sz="8" w:space="0"/>
-              <w:bottom w:val="single" w:color="FFFFFF" w:sz="8" w:space="0"/>
-              <w:right w:val="single" w:color="FFFFFF" w:sz="8" w:space="0"/>
+              <w:top w:val="nil"/>
+              <w:left w:val="nil"/>
+              <w:bottom w:val="nil"/>
+              <w:right w:val="nil"/>
             </w:tcBorders>
             <w:shd w:fill="FFFFFF" w:color="auto" w:val="clear"/>
             <w:vAlign w:val="center"/>
@@ -2170,9 +2538,8 @@
             <w:pPr>
               <w:pBdr/>
               <w:pStyle w:val="normal1"/>
-              <w:spacing w:before="0" w:beforeAutospacing="false" w:after="0" w:afterAutospacing="false" w:line="278" w:lineRule="auto"/>
-              <w:contextualSpacing/>
-              <w:ind w:left="0" w:right="314"/>
+              <w:spacing w:before="0" w:after="0" w:line="278" w:lineRule="auto"/>
+              <w:ind w:right="314"/>
               <w:jc w:val="right"/>
               <w:rPr>
                 <w:color w:val="000000"/>
@@ -2186,7 +2553,7 @@
                 <w:sz w:val="22"/>
                 <w:szCs w:val="22"/>
               </w:rPr>
-              <w:t xml:space="preserve">671,68 €</w:t>
+              <w:t xml:space="preserve">464,70 €</w:t>
             </w:r>
             <w:r>
               <w:rPr>
@@ -2211,32 +2578,26 @@
           </w:tblCellMar>
         </w:tblPrEx>
         <w:trPr>
-          <w:trHeight w:hRule="atLeast" w:val="20"/>
+          <w:trHeight w:hRule="atLeast" w:val="1"/>
         </w:trPr>
         <w:tc>
           <w:tcPr>
             <w:tcW w:w="3915" w:type="dxa"/>
-            <w:tcMar>
-              <w:top w:w="0" w:type="dxa"/>
-              <w:left w:w="88" w:type="dxa"/>
-              <w:bottom w:w="0" w:type="dxa"/>
-              <w:right w:w="8" w:type="dxa"/>
-            </w:tcMar>
             <w:tcBorders>
-              <w:top w:val="single" w:color="FFFFFF" w:sz="8" w:space="0"/>
-              <w:left w:val="single" w:color="D9D9D9" w:sz="8" w:space="0"/>
-              <w:bottom w:val="single" w:color="FFFFFF" w:sz="8" w:space="0"/>
-              <w:right w:val="single" w:color="D9D9D9" w:sz="8" w:space="0"/>
+              <w:top w:val="nil"/>
+              <w:left w:val="nil"/>
+              <w:bottom w:val="nil"/>
+              <w:right w:val="nil"/>
             </w:tcBorders>
             <w:shd w:fill="D9D9D9" w:color="auto" w:val="clear"/>
-            <w:vAlign w:val="top"/>
-          </w:tcPr>
-          <w:p>
-            <w:pPr>
-              <w:pBdr/>
-              <w:pStyle w:val="normal1"/>
-              <w:spacing w:before="0" w:after="0"/>
-              <w:ind w:left="0"/>
+            <w:vAlign w:val="center"/>
+          </w:tcPr>
+          <w:p>
+            <w:pPr>
+              <w:pBdr/>
+              <w:pStyle w:val="normal1"/>
+              <w:spacing w:before="56" w:after="0"/>
+              <w:ind w:left="50"/>
               <w:jc w:val="left"/>
               <w:rPr>
                 <w:rFonts w:ascii="Calibri" w:eastAsia="Calibri" w:hAnsi="Calibri" w:cs="Calibri"/>
@@ -2267,18 +2628,12 @@
         </w:tc>
         <w:tc>
           <w:tcPr>
-            <w:tcW w:w="3915" w:type="dxa"/>
-            <w:tcMar>
-              <w:top w:w="0" w:type="dxa"/>
-              <w:left w:w="88" w:type="dxa"/>
-              <w:bottom w:w="0" w:type="dxa"/>
-              <w:right w:w="8" w:type="dxa"/>
-            </w:tcMar>
+            <w:tcW w:w="915" w:type="dxa"/>
             <w:tcBorders>
-              <w:top w:val="single" w:color="FFFFFF" w:sz="8" w:space="0"/>
-              <w:left w:val="single" w:color="D9D9D9" w:sz="8" w:space="0"/>
-              <w:bottom w:val="single" w:color="FFFFFF" w:sz="8" w:space="0"/>
-              <w:right w:val="single" w:color="D9D9D9" w:sz="8" w:space="0"/>
+              <w:top w:val="nil"/>
+              <w:left w:val="nil"/>
+              <w:bottom w:val="nil"/>
+              <w:right w:val="nil"/>
             </w:tcBorders>
             <w:shd w:fill="D9D9D9" w:color="auto" w:val="clear"/>
             <w:vAlign w:val="center"/>
@@ -2298,18 +2653,12 @@
         </w:tc>
         <w:tc>
           <w:tcPr>
-            <w:tcW w:w="3915" w:type="dxa"/>
-            <w:tcMar>
-              <w:top w:w="0" w:type="dxa"/>
-              <w:left w:w="88" w:type="dxa"/>
-              <w:bottom w:w="0" w:type="dxa"/>
-              <w:right w:w="8" w:type="dxa"/>
-            </w:tcMar>
+            <w:tcW w:w="2102" w:type="dxa"/>
             <w:tcBorders>
-              <w:top w:val="single" w:color="FFFFFF" w:sz="8" w:space="0"/>
-              <w:left w:val="single" w:color="D9D9D9" w:sz="8" w:space="0"/>
-              <w:bottom w:val="single" w:color="FFFFFF" w:sz="8" w:space="0"/>
-              <w:right w:val="single" w:color="D9D9D9" w:sz="8" w:space="0"/>
+              <w:top w:val="nil"/>
+              <w:left w:val="nil"/>
+              <w:bottom w:val="nil"/>
+              <w:right w:val="nil"/>
             </w:tcBorders>
             <w:shd w:fill="D9D9D9" w:color="auto" w:val="clear"/>
             <w:vAlign w:val="center"/>
@@ -2329,18 +2678,12 @@
         </w:tc>
         <w:tc>
           <w:tcPr>
-            <w:tcW w:w="3915" w:type="dxa"/>
-            <w:tcMar>
-              <w:top w:w="0" w:type="dxa"/>
-              <w:left w:w="88" w:type="dxa"/>
-              <w:bottom w:w="0" w:type="dxa"/>
-              <w:right w:w="8" w:type="dxa"/>
-            </w:tcMar>
+            <w:tcW w:w="2728" w:type="dxa"/>
             <w:tcBorders>
-              <w:top w:val="single" w:color="FFFFFF" w:sz="8" w:space="0"/>
-              <w:left w:val="single" w:color="D9D9D9" w:sz="8" w:space="0"/>
-              <w:bottom w:val="single" w:color="FFFFFF" w:sz="8" w:space="0"/>
-              <w:right w:val="single" w:color="D9D9D9" w:sz="8" w:space="0"/>
+              <w:top w:val="nil"/>
+              <w:left w:val="nil"/>
+              <w:bottom w:val="nil"/>
+              <w:right w:val="nil"/>
             </w:tcBorders>
             <w:shd w:fill="D9D9D9" w:color="auto" w:val="clear"/>
             <w:vAlign w:val="center"/>
@@ -2349,9 +2692,8 @@
             <w:pPr>
               <w:pBdr/>
               <w:pStyle w:val="normal1"/>
-              <w:spacing w:before="0" w:beforeAutospacing="false" w:after="0" w:afterAutospacing="false" w:line="278" w:lineRule="auto"/>
-              <w:contextualSpacing/>
-              <w:ind w:left="0" w:right="314"/>
+              <w:spacing w:before="0" w:after="0" w:line="278" w:lineRule="auto"/>
+              <w:ind w:right="314"/>
               <w:jc w:val="right"/>
               <w:rPr>
                 <w:color w:val="000000"/>
@@ -2365,7 +2707,7 @@
                 <w:sz w:val="22"/>
                 <w:szCs w:val="22"/>
               </w:rPr>
-              <w:t xml:space="preserve">4.206,82 €</w:t>
+              <w:t xml:space="preserve">2.910,51 €</w:t>
             </w:r>
             <w:r>
               <w:rPr>
@@ -2409,6 +2751,44 @@
           <w:color w:val="030303"/>
         </w:rPr>
         <w:t xml:space="preserve">Es handelt sich hierbei um ein Festpreisangebot für die oben definierten Leistungen.</w:t>
+      </w:r>
+    </w:p>
+    <w:p>
+      <w:pPr>
+        <w:pBdr/>
+        <w:pStyle w:val="normal1"/>
+        <w:spacing w:before="23" w:after="0"/>
+        <w:ind/>
+        <w:rPr>
+          <w:rFonts w:ascii="Open Sans" w:eastAsia="Open Sans" w:hAnsi="Open Sans" w:cs="Open Sans"/>
+          <w:color w:val="000000"/>
+        </w:rPr>
+      </w:pPr>
+    </w:p>
+    <w:p>
+      <w:pPr>
+        <w:pBdr/>
+        <w:pStyle w:val="normal1"/>
+        <w:spacing w:line="286" w:lineRule="auto"/>
+        <w:ind w:left="123"/>
+        <w:rPr>
+          <w:rFonts w:ascii="Open Sans" w:eastAsia="Open Sans" w:hAnsi="Open Sans" w:cs="Open Sans"/>
+          <w:color w:val="000000"/>
+        </w:rPr>
+      </w:pPr>
+      <w:r>
+        <w:rPr>
+          <w:rFonts w:ascii="Open Sans Semibold" w:eastAsia="Open Sans Semibold" w:hAnsi="Open Sans Semibold" w:cs="Open Sans Semibold"/>
+          <w:color w:val="030303"/>
+        </w:rPr>
+        <w:t xml:space="preserve">ACHTUNG:</w:t>
+      </w:r>
+      <w:r>
+        <w:rPr>
+          <w:rFonts w:ascii="Open Sans" w:eastAsia="Open Sans" w:hAnsi="Open Sans" w:cs="Open Sans"/>
+          <w:color w:val="030303"/>
+        </w:rPr>
+        <w:t xml:space="preserve"> Ob eine ebenerdige Montage der Duschwanne möglich ist, kann erst nach dem Ausbau der bestehenden Wanne beurteilen werden. Sollten dabei zusätzliche oder weitere Leistungen erforderlich oder von Ihnen gewünscht sein, können zusätzliche Kosten entstehen.</w:t>
       </w:r>
       <w:r>
         <w:rPr>
@@ -2716,6 +3096,7 @@
       <w:pgSz w:w="12240" w:h="15840"/>
       <w:pgMar w:top="1440" w:right="1440" w:bottom="1440" w:left="1440" w:header="0" w:footer="0" w:gutter="0"/>
       <w:pgNumType w:fmt="Arabic"/>
+      <w:pgNumType w:start="1"/>
       <w:pgBorders/>
       <w:endnotePr>
         <w:pos w:val="docEnd"/>
@@ -2964,7 +3345,7 @@
               <w:sz w:val="22"/>
               <w:szCs w:val="22"/>
             </w:rPr>
-            <w:t xml:space="preserve">3</w:t>
+            <w:t xml:space="preserve">2</w:t>
           </w:r>
           <w:r>
             <w:rPr>
@@ -3012,7 +3393,7 @@
               <w:sz w:val="22"/>
               <w:szCs w:val="22"/>
             </w:rPr>
-            <w:t xml:space="preserve">3</w:t>
+            <w:t xml:space="preserve">2</w:t>
           </w:r>
           <w:r>
             <w:rPr>
@@ -3030,7 +3411,7 @@
     <w:pPr>
       <w:pBdr/>
       <w:pStyle w:val="normal1"/>
-      <w:spacing w:before="240" w:after="240" w:line="14" w:lineRule="auto"/>
+      <w:spacing w:before="240" w:after="0" w:line="14" w:lineRule="auto"/>
       <w:ind/>
       <w:jc w:val="center"/>
       <w:rPr/>
@@ -3312,7 +3693,7 @@
     <w:pPr>
       <w:pBdr/>
       <w:pStyle w:val="normal1"/>
-      <w:spacing w:before="240" w:after="240" w:line="14" w:lineRule="auto"/>
+      <w:spacing w:before="240" w:after="0" w:line="14" w:lineRule="auto"/>
       <w:ind/>
       <w:jc w:val="center"/>
       <w:rPr/>
@@ -3382,16 +3763,7 @@
     <w:pPr>
       <w:pBdr/>
       <w:pStyle w:val="normal1"/>
-      <w:spacing/>
-      <w:ind/>
-      <w:rPr/>
-    </w:pPr>
-  </w:p>
-  <w:p>
-    <w:pPr>
-      <w:pBdr/>
-      <w:pStyle w:val="normal1"/>
-      <w:spacing/>
+      <w:spacing w:before="120" w:after="0"/>
       <w:ind w:left="7200"/>
       <w:rPr/>
     </w:pPr>
@@ -3465,16 +3837,7 @@
     <w:pPr>
       <w:pBdr/>
       <w:pStyle w:val="normal1"/>
-      <w:spacing/>
-      <w:ind/>
-      <w:rPr/>
-    </w:pPr>
-  </w:p>
-  <w:p>
-    <w:pPr>
-      <w:pBdr/>
-      <w:pStyle w:val="normal1"/>
-      <w:spacing/>
+      <w:spacing w:before="120" w:after="0"/>
       <w:ind w:left="7200"/>
       <w:rPr/>
     </w:pPr>
@@ -3694,18 +4057,6 @@
       <w:u w:val="single"/>
     </w:rPr>
   </w:style>
-  <w:style w:type="character" w:styleId="Numbering Symbols">
-    <w:name w:val="Numbering Symbols"/>
-    <w:basedOn w:val="Default Paragraph Font"/>
-    <w:rPr/>
-  </w:style>
-  <w:style w:type="character" w:styleId="Bullets">
-    <w:name w:val="Bullets"/>
-    <w:basedOn w:val="Default Paragraph Font"/>
-    <w:rPr>
-      <w:rFonts w:ascii="Arial Unicode MS" w:eastAsia="Arial Unicode MS" w:hAnsi="Arial Unicode MS" w:cs="Arial Unicode MS"/>
-    </w:rPr>
-  </w:style>
   <w:style w:type="paragraph" w:styleId="Heading">
     <w:name w:val="Heading"/>
     <w:basedOn w:val="Normal"/>
@@ -3844,33 +4195,6 @@
       <w:ind/>
     </w:pPr>
     <w:rPr/>
-  </w:style>
-  <w:style w:type="paragraph" w:styleId="Table Contents">
-    <w:name w:val="Table Contents"/>
-    <w:basedOn w:val="Normal"/>
-    <w:next w:val="Table Contents"/>
-    <w:pPr>
-      <w:pBdr/>
-      <w:spacing/>
-      <w:widowControl w:val="0"/>
-      <w:ind/>
-    </w:pPr>
-    <w:rPr/>
-  </w:style>
-  <w:style w:type="paragraph" w:styleId="Table Heading">
-    <w:name w:val="Table Heading"/>
-    <w:basedOn w:val="Table Contents"/>
-    <w:next w:val="Table Heading"/>
-    <w:pPr>
-      <w:pBdr/>
-      <w:spacing/>
-      <w:ind/>
-      <w:jc w:val="center"/>
-    </w:pPr>
-    <w:rPr>
-      <w:b/>
-      <w:bCs/>
-    </w:rPr>
   </w:style>
   <w:style w:type="table" w:styleId="Normal Table">
     <w:name w:val="Normal Table"/>

</xml_diff>

<commit_message>
adding cl55 and cl65 in optional
</commit_message>
<xml_diff>
--- a/out-Angebot.docx
+++ b/out-Angebot.docx
@@ -66,9 +66,9 @@
         <w:tblLayout w:type="fixed"/>
       </w:tblPr>
       <w:tblGrid>
-        <w:gridCol w:w="4809"/>
+        <w:gridCol w:w="4805"/>
         <w:gridCol w:w="2268"/>
-        <w:gridCol w:w="2958"/>
+        <w:gridCol w:w="2962"/>
       </w:tblGrid>
       <w:tr>
         <w:tblPrEx>
@@ -85,7 +85,7 @@
         </w:trPr>
         <w:tc>
           <w:tcPr>
-            <w:tcW w:w="4809" w:type="dxa"/>
+            <w:tcW w:w="4805" w:type="dxa"/>
             <w:tcBorders>
               <w:top w:val="single" w:color="FFFFFF" w:sz="8" w:space="0"/>
               <w:left w:val="single" w:color="FFFFFF" w:sz="8" w:space="0"/>
@@ -133,7 +133,7 @@
                 <w:sz w:val="22"/>
                 <w:szCs w:val="22"/>
               </w:rPr>
-              <w:t xml:space="preserve">Omar Mcleod</w:t>
+              <w:t xml:space="preserve">Jason Vance</w:t>
             </w:r>
           </w:p>
           <w:p>
@@ -154,7 +154,7 @@
                 <w:sz w:val="22"/>
                 <w:szCs w:val="22"/>
               </w:rPr>
-              <w:t xml:space="preserve">Odit qui quia mollit</w:t>
+              <w:t xml:space="preserve">Incididunt aliquam a</w:t>
             </w:r>
           </w:p>
           <w:p>
@@ -177,7 +177,7 @@
                 <w:sz w:val="22"/>
                 <w:szCs w:val="22"/>
               </w:rPr>
-              <w:t xml:space="preserve">Quis nostrum suscipi Repellendus Facilis</w:t>
+              <w:t xml:space="preserve">Molestiae ut consequ In odio aperiam offi</w:t>
             </w:r>
           </w:p>
         </w:tc>
@@ -197,7 +197,7 @@
             <w:pPr>
               <w:pBdr/>
               <w:pStyle w:val="normal1"/>
-              <w:spacing w:before="0" w:after="0" w:line="276" w:lineRule="auto"/>
+              <w:spacing w:before="0" w:after="0"/>
               <w:ind w:right="127"/>
               <w:jc w:val="left"/>
               <w:rPr>
@@ -237,7 +237,7 @@
             <w:pPr>
               <w:pBdr/>
               <w:pStyle w:val="normal1"/>
-              <w:spacing w:before="0" w:after="0" w:line="276" w:lineRule="auto"/>
+              <w:spacing w:before="0" w:after="0"/>
               <w:ind w:right="127"/>
               <w:jc w:val="left"/>
               <w:rPr>
@@ -261,7 +261,7 @@
             <w:pPr>
               <w:pBdr/>
               <w:pStyle w:val="normal1"/>
-              <w:spacing w:before="0" w:after="0" w:line="276" w:lineRule="auto"/>
+              <w:spacing w:before="0" w:after="0"/>
               <w:ind w:right="127"/>
               <w:jc w:val="left"/>
               <w:rPr>
@@ -302,7 +302,7 @@
         </w:tc>
         <w:tc>
           <w:tcPr>
-            <w:tcW w:w="2958" w:type="dxa"/>
+            <w:tcW w:w="2962" w:type="dxa"/>
             <w:tcBorders>
               <w:top w:val="single" w:color="FFFFFF" w:sz="8" w:space="0"/>
               <w:left w:val="single" w:color="FFFFFF" w:sz="8" w:space="0"/>
@@ -316,7 +316,7 @@
             <w:pPr>
               <w:pBdr/>
               <w:pStyle w:val="normal1"/>
-              <w:spacing w:before="0" w:after="0" w:line="276" w:lineRule="auto"/>
+              <w:spacing w:before="0" w:after="0"/>
               <w:ind/>
               <w:jc w:val="right"/>
               <w:rPr>
@@ -329,7 +329,7 @@
                 <w:sz w:val="22"/>
                 <w:szCs w:val="22"/>
               </w:rPr>
-              <w:t xml:space="preserve">ANG2025-1127-095221</w:t>
+              <w:t xml:space="preserve">ANG2025-1127-104202</w:t>
             </w:r>
             <w:r>
               <w:rPr>
@@ -353,7 +353,7 @@
             <w:pPr>
               <w:pBdr/>
               <w:pStyle w:val="normal1"/>
-              <w:spacing w:before="0" w:after="0" w:line="276" w:lineRule="auto"/>
+              <w:spacing w:before="0" w:after="0"/>
               <w:ind/>
               <w:jc w:val="right"/>
               <w:rPr>
@@ -369,7 +369,7 @@
                 <w:sz w:val="22"/>
                 <w:szCs w:val="22"/>
               </w:rPr>
-              <w:t xml:space="preserve">10.06.1971</w:t>
+              <w:t xml:space="preserve">03.09.2016</w:t>
             </w:r>
             <w:r>
               <w:rPr>
@@ -403,7 +403,7 @@
                 <w:sz w:val="22"/>
                 <w:szCs w:val="22"/>
               </w:rPr>
-              <w:t xml:space="preserve">Hanna Carey</w:t>
+              <w:t xml:space="preserve">Lareina Patterson</w:t>
             </w:r>
             <w:r>
               <w:rPr>
@@ -445,7 +445,7 @@
             <w:pPr>
               <w:pBdr/>
               <w:pStyle w:val="normal1"/>
-              <w:spacing w:before="0" w:after="0" w:line="276" w:lineRule="auto"/>
+              <w:spacing w:before="0" w:after="0"/>
               <w:ind/>
               <w:jc w:val="right"/>
               <w:rPr>
@@ -482,7 +482,7 @@
         </w:trPr>
         <w:tc>
           <w:tcPr>
-            <w:tcW w:w="4809" w:type="dxa"/>
+            <w:tcW w:w="4805" w:type="dxa"/>
             <w:tcBorders>
               <w:top w:val="single" w:color="FFFFFF" w:sz="8" w:space="0"/>
               <w:left w:val="single" w:color="FFFFFF" w:sz="8" w:space="0"/>
@@ -510,7 +510,7 @@
         </w:tc>
         <w:tc>
           <w:tcPr>
-            <w:tcW w:w="5226" w:type="dxa"/>
+            <w:tcW w:w="5230" w:type="dxa"/>
             <w:tcBorders>
               <w:top w:val="single" w:color="FFFFFF" w:sz="8" w:space="0"/>
               <w:left w:val="single" w:color="FFFFFF" w:sz="8" w:space="0"/>
@@ -561,7 +561,7 @@
                 <w:sz w:val="22"/>
                 <w:szCs w:val="22"/>
               </w:rPr>
-              <w:t xml:space="preserve">343</w:t>
+              <w:t xml:space="preserve">632</w:t>
             </w:r>
           </w:p>
         </w:tc>
@@ -601,7 +601,7 @@
           <w:sz w:val="24"/>
           <w:szCs w:val="24"/>
         </w:rPr>
-        <w:t xml:space="preserve">  Ihr Angebot ANG2025-1127-095221</w:t>
+        <w:t xml:space="preserve">  Ihr Angebot ANG2025-1127-104202</w:t>
       </w:r>
     </w:p>
     <w:p>
@@ -620,7 +620,7 @@
           <w:rFonts w:ascii="Open Sans" w:eastAsia="Open Sans" w:hAnsi="Open Sans" w:cs="Open Sans"/>
           <w:color w:val="000000"/>
         </w:rPr>
-        <w:t xml:space="preserve">  Sehr geehrte Frau Mcleod,</w:t>
+        <w:t xml:space="preserve">  Sehr geehrte Frau Vance,</w:t>
       </w:r>
       <w:r>
         <w:rPr>
@@ -685,34 +685,34 @@
     <w:tbl>
       <w:tblPr>
         <w:tblStyle w:val="TableNormal"/>
-        <w:tblW w:w="10035" w:type="dxa"/>
+        <w:tblW w:w="9660" w:type="dxa"/>
         <w:jc w:val="left"/>
         <w:tblInd w:w="1" w:type="dxa"/>
         <w:tblCellMar>
           <w:top w:w="0" w:type="dxa"/>
-          <w:left w:w="0" w:type="dxa"/>
+          <w:left w:w="10" w:type="dxa"/>
           <w:bottom w:w="0" w:type="dxa"/>
-          <w:right w:w="0" w:type="dxa"/>
+          <w:right w:w="10" w:type="dxa"/>
         </w:tblCellMar>
         <w:tblBorders/>
         <w:shd w:fill="auto" w:color="auto"/>
         <w:tblLayout w:type="fixed"/>
       </w:tblPr>
       <w:tblGrid>
-        <w:gridCol w:w="428"/>
-        <w:gridCol w:w="789"/>
-        <w:gridCol w:w="6331"/>
-        <w:gridCol w:w="1415"/>
-        <w:gridCol w:w="1072"/>
+        <w:gridCol w:w="467"/>
+        <w:gridCol w:w="757"/>
+        <w:gridCol w:w="6094"/>
+        <w:gridCol w:w="1399"/>
+        <w:gridCol w:w="943"/>
       </w:tblGrid>
       <w:tr>
         <w:tblPrEx>
           <w:tblBorders/>
           <w:tblCellMar>
             <w:top w:w="0" w:type="dxa"/>
-            <w:left w:w="0" w:type="dxa"/>
+            <w:left w:w="10" w:type="dxa"/>
             <w:bottom w:w="0" w:type="dxa"/>
-            <w:right w:w="0" w:type="dxa"/>
+            <w:right w:w="10" w:type="dxa"/>
           </w:tblCellMar>
         </w:tblPrEx>
         <w:trPr>
@@ -720,8 +720,19 @@
         </w:trPr>
         <w:tc>
           <w:tcPr>
-            <w:tcW w:w="428" w:type="dxa"/>
-            <w:tcBorders/>
+            <w:tcW w:w="467" w:type="dxa"/>
+            <w:tcMar>
+              <w:top w:w="0" w:type="dxa"/>
+              <w:left w:w="2" w:type="dxa"/>
+              <w:bottom w:w="0" w:type="dxa"/>
+              <w:right w:w="2" w:type="dxa"/>
+            </w:tcMar>
+            <w:tcBorders>
+              <w:top w:val="single" w:color="CCCCCC" w:sz="8" w:space="0"/>
+              <w:left w:val="single" w:color="CCCCCC" w:sz="8" w:space="0"/>
+              <w:bottom w:val="single" w:color="FFFFFF" w:sz="8" w:space="0"/>
+              <w:right w:val="single" w:color="CCCCCC" w:sz="8" w:space="0"/>
+            </w:tcBorders>
             <w:shd w:fill="CCCCCC" w:color="auto" w:val="clear"/>
             <w:vAlign w:val="top"/>
           </w:tcPr>
@@ -729,20 +740,22 @@
             <w:pPr>
               <w:pBdr/>
               <w:pStyle w:val="normal1"/>
-              <w:spacing w:before="24" w:beforeAutospacing="false" w:after="24" w:afterAutospacing="false" w:line="240" w:lineRule="auto"/>
+              <w:spacing w:before="0" w:after="0"/>
               <w:ind/>
-              <w:jc w:val="center"/>
+              <w:jc w:val="left"/>
               <w:rPr>
                 <w:rFonts w:ascii="Calibri" w:eastAsia="Calibri" w:hAnsi="Calibri" w:cs="Calibri"/>
-                <w:sz w:val="22"/>
+                <w:b/>
+                <w:sz w:val="20"/>
                 <w:szCs w:val="22"/>
               </w:rPr>
             </w:pPr>
             <w:r>
               <w:rPr>
                 <w:rFonts w:ascii="Open Sans" w:eastAsia="Open Sans" w:hAnsi="Open Sans" w:cs="Open Sans"/>
+                <w:b/>
                 <w:color w:val="070707"/>
-                <w:sz w:val="22"/>
+                <w:sz w:val="20"/>
                 <w:szCs w:val="22"/>
               </w:rPr>
               <w:t xml:space="preserve">Pos</w:t>
@@ -751,8 +764,19 @@
         </w:tc>
         <w:tc>
           <w:tcPr>
-            <w:tcW w:w="789" w:type="dxa"/>
-            <w:tcBorders/>
+            <w:tcW w:w="757" w:type="dxa"/>
+            <w:tcMar>
+              <w:top w:w="0" w:type="dxa"/>
+              <w:left w:w="2" w:type="dxa"/>
+              <w:bottom w:w="0" w:type="dxa"/>
+              <w:right w:w="2" w:type="dxa"/>
+            </w:tcMar>
+            <w:tcBorders>
+              <w:top w:val="single" w:color="CCCCCC" w:sz="8" w:space="0"/>
+              <w:left w:val="single" w:color="CCCCCC" w:sz="8" w:space="0"/>
+              <w:bottom w:val="single" w:color="FFFFFF" w:sz="8" w:space="0"/>
+              <w:right w:val="single" w:color="CCCCCC" w:sz="8" w:space="0"/>
+            </w:tcBorders>
             <w:shd w:fill="CCCCCC" w:color="auto" w:val="clear"/>
             <w:vAlign w:val="top"/>
           </w:tcPr>
@@ -760,20 +784,22 @@
             <w:pPr>
               <w:pBdr/>
               <w:pStyle w:val="normal1"/>
-              <w:spacing w:before="24" w:beforeAutospacing="false" w:after="24" w:afterAutospacing="false" w:line="240" w:lineRule="auto"/>
+              <w:spacing w:before="0" w:after="0"/>
               <w:ind/>
-              <w:jc w:val="center"/>
+              <w:jc w:val="left"/>
               <w:rPr>
                 <w:rFonts w:ascii="Calibri" w:eastAsia="Calibri" w:hAnsi="Calibri" w:cs="Calibri"/>
-                <w:sz w:val="22"/>
+                <w:b/>
+                <w:sz w:val="20"/>
                 <w:szCs w:val="22"/>
               </w:rPr>
             </w:pPr>
             <w:r>
               <w:rPr>
                 <w:rFonts w:ascii="Open Sans" w:eastAsia="Open Sans" w:hAnsi="Open Sans" w:cs="Open Sans"/>
+                <w:b/>
                 <w:color w:val="070707"/>
-                <w:sz w:val="22"/>
+                <w:sz w:val="20"/>
                 <w:szCs w:val="22"/>
               </w:rPr>
               <w:t xml:space="preserve">Menge</w:t>
@@ -782,8 +808,19 @@
         </w:tc>
         <w:tc>
           <w:tcPr>
-            <w:tcW w:w="6332" w:type="dxa"/>
-            <w:tcBorders/>
+            <w:tcW w:w="6093" w:type="dxa"/>
+            <w:tcMar>
+              <w:top w:w="0" w:type="dxa"/>
+              <w:left w:w="2" w:type="dxa"/>
+              <w:bottom w:w="0" w:type="dxa"/>
+              <w:right w:w="2" w:type="dxa"/>
+            </w:tcMar>
+            <w:tcBorders>
+              <w:top w:val="single" w:color="CCCCCC" w:sz="8" w:space="0"/>
+              <w:left w:val="single" w:color="CCCCCC" w:sz="8" w:space="0"/>
+              <w:bottom w:val="single" w:color="FFFFFF" w:sz="8" w:space="0"/>
+              <w:right w:val="single" w:color="CCCCCC" w:sz="8" w:space="0"/>
+            </w:tcBorders>
             <w:shd w:fill="CCCCCC" w:color="auto" w:val="clear"/>
             <w:vAlign w:val="top"/>
           </w:tcPr>
@@ -791,18 +828,21 @@
             <w:pPr>
               <w:pBdr/>
               <w:pStyle w:val="normal1"/>
-              <w:spacing w:before="24" w:beforeAutospacing="false" w:after="24" w:afterAutospacing="false" w:line="240" w:lineRule="auto"/>
+              <w:spacing w:before="0" w:after="0" w:line="278" w:lineRule="auto"/>
               <w:ind w:right="314"/>
-              <w:jc w:val="both"/>
-              <w:rPr>
-                <w:color w:val="000000"/>
-              </w:rPr>
-            </w:pPr>
-            <w:r>
-              <w:rPr>
-                <w:rFonts w:ascii="Open Sans" w:eastAsia="Open Sans" w:hAnsi="Open Sans" w:cs="Open Sans"/>
-                <w:color w:val="000000"/>
-                <w:sz w:val="22"/>
+              <w:jc w:val="left"/>
+              <w:rPr>
+                <w:b/>
+                <w:color w:val="000000"/>
+                <w:sz w:val="20"/>
+              </w:rPr>
+            </w:pPr>
+            <w:r>
+              <w:rPr>
+                <w:rFonts w:ascii="Open Sans" w:eastAsia="Open Sans" w:hAnsi="Open Sans" w:cs="Open Sans"/>
+                <w:b/>
+                <w:color w:val="000000"/>
+                <w:sz w:val="20"/>
                 <w:szCs w:val="22"/>
               </w:rPr>
               <w:t xml:space="preserve">Bezeichnung</w:t>
@@ -811,8 +851,19 @@
         </w:tc>
         <w:tc>
           <w:tcPr>
-            <w:tcW w:w="1415" w:type="dxa"/>
-            <w:tcBorders/>
+            <w:tcW w:w="1399" w:type="dxa"/>
+            <w:tcMar>
+              <w:top w:w="0" w:type="dxa"/>
+              <w:left w:w="2" w:type="dxa"/>
+              <w:bottom w:w="0" w:type="dxa"/>
+              <w:right w:w="2" w:type="dxa"/>
+            </w:tcMar>
+            <w:tcBorders>
+              <w:top w:val="single" w:color="CCCCCC" w:sz="8" w:space="0"/>
+              <w:left w:val="single" w:color="CCCCCC" w:sz="8" w:space="0"/>
+              <w:bottom w:val="single" w:color="FFFFFF" w:sz="8" w:space="0"/>
+              <w:right w:val="single" w:color="CCCCCC" w:sz="8" w:space="0"/>
+            </w:tcBorders>
             <w:shd w:fill="CCCCCC" w:color="auto" w:val="clear"/>
             <w:vAlign w:val="top"/>
           </w:tcPr>
@@ -820,18 +871,21 @@
             <w:pPr>
               <w:pBdr/>
               <w:pStyle w:val="normal1"/>
-              <w:spacing w:before="24" w:beforeAutospacing="false" w:after="24" w:afterAutospacing="false" w:line="240" w:lineRule="auto"/>
-              <w:ind w:left="0" w:right="0"/>
+              <w:spacing w:before="0" w:beforeAutospacing="false" w:after="0" w:afterAutospacing="false" w:line="278" w:lineRule="auto"/>
+              <w:ind w:left="-141" w:right="34"/>
               <w:jc w:val="center"/>
               <w:rPr>
-                <w:color w:val="000000"/>
-              </w:rPr>
-            </w:pPr>
-            <w:r>
-              <w:rPr>
-                <w:rFonts w:ascii="Open Sans" w:eastAsia="Open Sans" w:hAnsi="Open Sans" w:cs="Open Sans"/>
-                <w:color w:val="000000"/>
-                <w:sz w:val="22"/>
+                <w:b/>
+                <w:color w:val="000000"/>
+                <w:sz w:val="20"/>
+              </w:rPr>
+            </w:pPr>
+            <w:r>
+              <w:rPr>
+                <w:rFonts w:ascii="Open Sans" w:eastAsia="Open Sans" w:hAnsi="Open Sans" w:cs="Open Sans"/>
+                <w:b/>
+                <w:color w:val="000000"/>
+                <w:sz w:val="20"/>
                 <w:szCs w:val="22"/>
               </w:rPr>
               <w:t xml:space="preserve">Einheitspreis</w:t>
@@ -840,8 +894,19 @@
         </w:tc>
         <w:tc>
           <w:tcPr>
-            <w:tcW w:w="1072" w:type="dxa"/>
-            <w:tcBorders/>
+            <w:tcW w:w="943" w:type="dxa"/>
+            <w:tcMar>
+              <w:top w:w="0" w:type="dxa"/>
+              <w:left w:w="2" w:type="dxa"/>
+              <w:bottom w:w="0" w:type="dxa"/>
+              <w:right w:w="2" w:type="dxa"/>
+            </w:tcMar>
+            <w:tcBorders>
+              <w:top w:val="single" w:color="CCCCCC" w:sz="8" w:space="0"/>
+              <w:left w:val="single" w:color="CCCCCC" w:sz="8" w:space="0"/>
+              <w:bottom w:val="single" w:color="FFFFFF" w:sz="8" w:space="0"/>
+              <w:right w:val="single" w:color="CCCCCC" w:sz="8" w:space="0"/>
+            </w:tcBorders>
             <w:shd w:fill="CCCCCC" w:color="auto" w:val="clear"/>
             <w:vAlign w:val="top"/>
           </w:tcPr>
@@ -849,18 +914,21 @@
             <w:pPr>
               <w:pBdr/>
               <w:pStyle w:val="normal1"/>
-              <w:spacing w:before="24" w:beforeAutospacing="false" w:after="24" w:afterAutospacing="false" w:line="240" w:lineRule="auto"/>
-              <w:ind w:left="0" w:right="0"/>
-              <w:jc w:val="center"/>
-              <w:rPr>
-                <w:color w:val="000000"/>
-              </w:rPr>
-            </w:pPr>
-            <w:r>
-              <w:rPr>
-                <w:rFonts w:ascii="Open Sans" w:eastAsia="Open Sans" w:hAnsi="Open Sans" w:cs="Open Sans"/>
-                <w:color w:val="000000"/>
-                <w:sz w:val="22"/>
+              <w:spacing w:before="0" w:beforeAutospacing="false" w:after="0" w:afterAutospacing="false" w:line="278" w:lineRule="auto"/>
+              <w:ind w:right="34"/>
+              <w:jc w:val="left"/>
+              <w:rPr>
+                <w:b/>
+                <w:color w:val="000000"/>
+                <w:sz w:val="20"/>
+              </w:rPr>
+            </w:pPr>
+            <w:r>
+              <w:rPr>
+                <w:rFonts w:ascii="Open Sans" w:eastAsia="Open Sans" w:hAnsi="Open Sans" w:cs="Open Sans"/>
+                <w:b/>
+                <w:color w:val="000000"/>
+                <w:sz w:val="20"/>
                 <w:szCs w:val="22"/>
               </w:rPr>
               <w:t xml:space="preserve">Gesamt</w:t>
@@ -873,22 +941,65 @@
           <w:tblBorders/>
           <w:tblCellMar>
             <w:top w:w="0" w:type="dxa"/>
-            <w:left w:w="0" w:type="dxa"/>
+            <w:left w:w="10" w:type="dxa"/>
             <w:bottom w:w="0" w:type="dxa"/>
-            <w:right w:w="0" w:type="dxa"/>
+            <w:right w:w="10" w:type="dxa"/>
           </w:tblCellMar>
         </w:tblPrEx>
         <w:trPr>
-          <w:trHeight w:hRule="atLeast" w:val="315"/>
+          <w:trHeight w:hRule="atLeast" w:val="1"/>
         </w:trPr>
         <w:tc>
           <w:tcPr>
-            <w:tcW w:w="428" w:type="dxa"/>
+            <w:tcW w:w="467" w:type="dxa"/>
             <w:tcMar>
               <w:top w:w="0" w:type="dxa"/>
-              <w:left w:w="0" w:type="dxa"/>
+              <w:left w:w="2" w:type="dxa"/>
               <w:bottom w:w="0" w:type="dxa"/>
-              <w:right w:w="0" w:type="dxa"/>
+              <w:right w:w="2" w:type="dxa"/>
+            </w:tcMar>
+            <w:tcBorders>
+              <w:top w:val="nil"/>
+              <w:left w:val="nil"/>
+              <w:bottom w:val="nil"/>
+              <w:right w:val="nil"/>
+              <w:insideH w:val="single" w:color="000000" w:sz="8" w:space="0"/>
+              <w:insideV w:val="single" w:color="000000" w:sz="8" w:space="0"/>
+            </w:tcBorders>
+            <w:shd w:fill="FFFFFF" w:color="auto" w:val="clear"/>
+            <w:vAlign w:val="top"/>
+          </w:tcPr>
+          <w:p>
+            <w:pPr>
+              <w:pBdr/>
+              <w:pStyle w:val="normal1"/>
+              <w:spacing w:before="0" w:after="0"/>
+              <w:ind/>
+              <w:jc w:val="left"/>
+              <w:rPr>
+                <w:rFonts w:ascii="Calibri" w:eastAsia="Calibri" w:hAnsi="Calibri" w:cs="Calibri"/>
+                <w:sz w:val="18"/>
+              </w:rPr>
+            </w:pPr>
+            <w:r>
+              <w:rPr>
+                <w:rFonts w:ascii="Calibri" w:eastAsia="Calibri" w:hAnsi="Calibri" w:cs="Calibri"/>
+                <w:color w:val="070707"/>
+                <w:sz w:val="18"/>
+                <w:szCs w:val="22"/>
+              </w:rPr>
+              <w:t xml:space="preserve">001</w:t>
+            </w:r>
+          </w:p>
+        </w:tc>
+        <w:tc>
+          <w:tcPr>
+            <w:tcW w:w="467" w:type="dxa"/>
+            <w:tcMar>
+              <w:top w:w="0" w:type="dxa"/>
+              <w:left w:w="2" w:type="dxa"/>
+              <w:bottom w:w="0" w:type="dxa"/>
+              <w:right w:w="2" w:type="dxa"/>
             </w:tcMar>
             <w:tcBorders>
               <w:top w:val="nil"/>
@@ -903,34 +1014,436 @@
             <w:pPr>
               <w:pBdr/>
               <w:pStyle w:val="normal1"/>
-              <w:spacing w:before="40" w:beforeAutospacing="false" w:after="0" w:afterAutospacing="false" w:line="240" w:lineRule="auto"/>
-              <w:ind w:right="0"/>
-              <w:jc w:val="center"/>
+              <w:spacing w:before="0" w:after="0"/>
+              <w:ind/>
+              <w:jc w:val="left"/>
               <w:rPr>
                 <w:rFonts w:ascii="Calibri" w:eastAsia="Calibri" w:hAnsi="Calibri" w:cs="Calibri"/>
-                <w:sz w:val="18"/>
-                <w:szCs w:val="22"/>
-              </w:rPr>
-            </w:pPr>
-            <w:r>
-              <w:rPr>
-                <w:rFonts w:ascii="Open Sans" w:eastAsia="Open Sans" w:hAnsi="Open Sans" w:cs="Open Sans"/>
                 <w:color w:val="070707"/>
                 <w:sz w:val="18"/>
                 <w:szCs w:val="20"/>
               </w:rPr>
-              <w:t xml:space="preserve">001</w:t>
+            </w:pPr>
+            <w:r>
+              <w:rPr>
+                <w:rFonts w:ascii="Calibri" w:eastAsia="Calibri" w:hAnsi="Calibri" w:cs="Calibri"/>
+                <w:color w:val="070707"/>
+                <w:sz w:val="18"/>
+                <w:szCs w:val="20"/>
+              </w:rPr>
+              <w:t xml:space="preserve">1 Stk</w:t>
             </w:r>
           </w:p>
         </w:tc>
         <w:tc>
           <w:tcPr>
-            <w:tcW w:w="789" w:type="dxa"/>
+            <w:tcW w:w="467" w:type="dxa"/>
             <w:tcMar>
               <w:top w:w="0" w:type="dxa"/>
-              <w:left w:w="0" w:type="dxa"/>
+              <w:left w:w="2" w:type="dxa"/>
               <w:bottom w:w="0" w:type="dxa"/>
-              <w:right w:w="0" w:type="dxa"/>
+              <w:right w:w="2" w:type="dxa"/>
+            </w:tcMar>
+            <w:tcBorders>
+              <w:top w:val="nil"/>
+              <w:left w:val="nil"/>
+              <w:bottom w:val="nil"/>
+              <w:right w:val="nil"/>
+              <w:insideH w:val="single" w:color="000000" w:sz="8" w:space="0"/>
+              <w:insideV w:val="single" w:color="000000" w:sz="8" w:space="0"/>
+            </w:tcBorders>
+            <w:shd w:fill="FFFFFF" w:color="auto" w:val="clear"/>
+            <w:vAlign w:val="top"/>
+          </w:tcPr>
+          <w:p>
+            <w:pPr>
+              <w:pBdr/>
+              <w:pStyle w:val="Body Text"/>
+              <w:spacing w:before="0" w:after="0" w:line="278" w:lineRule="auto"/>
+              <w:ind w:right="314"/>
+              <w:jc w:val="left"/>
+              <w:rPr>
+                <w:color w:val="000000"/>
+                <w:sz w:val="18"/>
+              </w:rPr>
+            </w:pPr>
+            <w:r>
+              <w:rPr>
+                <w:rFonts w:ascii="arial" w:eastAsia="arial" w:hAnsi="arial" w:cs="arial"/>
+                <w:b/>
+                <w:bCs/>
+                <w:color w:val="000000"/>
+                <w:sz w:val="20"/>
+                <w:szCs w:val="20"/>
+              </w:rPr>
+              <w:t xml:space="preserve">Liefern und Montieren einer Badewannentür</w:t>
+            </w:r>
+            <w:r>
+              <w:rPr>
+                <w:rFonts w:ascii="arial" w:eastAsia="arial" w:hAnsi="arial" w:cs="arial"/>
+                <w:b/>
+                <w:color w:val="000000"/>
+                <w:sz w:val="20"/>
+                <w:szCs w:val="20"/>
+              </w:rPr>
+              <w:br/>
+            </w:r>
+            <w:r>
+              <w:rPr>
+                <w:rFonts w:ascii="arial" w:eastAsia="arial" w:hAnsi="arial" w:cs="arial"/>
+                <w:b w:val="0"/>
+                <w:color w:val="000000"/>
+                <w:sz w:val="18"/>
+                <w:szCs w:val="20"/>
+              </w:rPr>
+              <w:t xml:space="preserve">• Liefern und Montieren einer Badewannentür (Universal/Standard) Höhe 40 cm, Breite 40,5 cm</w:t>
+            </w:r>
+            <w:r>
+              <w:rPr>
+                <w:rFonts w:ascii="arial" w:eastAsia="arial" w:hAnsi="arial" w:cs="arial"/>
+                <w:b w:val="0"/>
+                <w:color w:val="000000"/>
+                <w:sz w:val="18"/>
+                <w:szCs w:val="20"/>
+              </w:rPr>
+              <w:br/>
+            </w:r>
+            <w:r>
+              <w:rPr>
+                <w:rFonts w:ascii="arial" w:eastAsia="arial" w:hAnsi="arial" w:cs="arial"/>
+                <w:b w:val="0"/>
+                <w:color w:val="000000"/>
+                <w:sz w:val="18"/>
+                <w:szCs w:val="20"/>
+              </w:rPr>
+              <w:t xml:space="preserve">• inkl. dazugehörige Materialien</w:t>
+            </w:r>
+            <w:r>
+              <w:rPr>
+                <w:rFonts w:ascii="arial" w:eastAsia="arial" w:hAnsi="arial" w:cs="arial"/>
+                <w:b w:val="0"/>
+                <w:color w:val="000000"/>
+                <w:sz w:val="18"/>
+                <w:szCs w:val="20"/>
+              </w:rPr>
+              <w:br/>
+            </w:r>
+            <w:r>
+              <w:rPr>
+                <w:rFonts w:ascii="arial" w:eastAsia="arial" w:hAnsi="arial" w:cs="arial"/>
+                <w:b w:val="0"/>
+                <w:color w:val="000000"/>
+                <w:sz w:val="18"/>
+                <w:szCs w:val="20"/>
+              </w:rPr>
+              <w:t xml:space="preserve">• inkl. An- &amp; Abfahrten / Dieselzuschlag</w:t>
+            </w:r>
+            <w:r>
+              <w:rPr>
+                <w:rFonts w:ascii="arial" w:eastAsia="arial" w:hAnsi="arial" w:cs="arial"/>
+                <w:b w:val="0"/>
+                <w:color w:val="000000"/>
+                <w:sz w:val="18"/>
+                <w:szCs w:val="20"/>
+              </w:rPr>
+              <w:br/>
+            </w:r>
+            <w:r>
+              <w:rPr>
+                <w:rFonts w:ascii="arial" w:eastAsia="arial" w:hAnsi="arial" w:cs="arial"/>
+                <w:b w:val="0"/>
+                <w:color w:val="000000"/>
+                <w:sz w:val="18"/>
+                <w:szCs w:val="20"/>
+              </w:rPr>
+              <w:t xml:space="preserve">• inkl. Bereitstellung Maschinen / Werkzeug</w:t>
+            </w:r>
+            <w:r>
+              <w:rPr>
+                <w:rFonts w:ascii="arial" w:eastAsia="arial" w:hAnsi="arial" w:cs="arial"/>
+                <w:b w:val="0"/>
+                <w:color w:val="000000"/>
+                <w:sz w:val="18"/>
+                <w:szCs w:val="20"/>
+              </w:rPr>
+              <w:br/>
+            </w:r>
+            <w:r>
+              <w:rPr>
+                <w:rFonts w:ascii="arial" w:eastAsia="arial" w:hAnsi="arial" w:cs="arial"/>
+                <w:b w:val="0"/>
+                <w:color w:val="000000"/>
+                <w:sz w:val="18"/>
+                <w:szCs w:val="20"/>
+              </w:rPr>
+              <w:t xml:space="preserve">• inkl. Vorhaltung und Beräumung der Baustelle</w:t>
+            </w:r>
+            <w:r>
+              <w:rPr>
+                <w:rFonts w:ascii="arial" w:eastAsia="arial" w:hAnsi="arial" w:cs="arial"/>
+                <w:b w:val="0"/>
+                <w:color w:val="000000"/>
+                <w:sz w:val="18"/>
+                <w:szCs w:val="20"/>
+              </w:rPr>
+              <w:br/>
+            </w:r>
+            <w:r>
+              <w:rPr>
+                <w:rFonts w:ascii="arial" w:eastAsia="arial" w:hAnsi="arial" w:cs="arial"/>
+                <w:b w:val="0"/>
+                <w:color w:val="000000"/>
+                <w:sz w:val="18"/>
+                <w:szCs w:val="20"/>
+              </w:rPr>
+              <w:t xml:space="preserve">• inkl. Lieferkosten</w:t>
+            </w:r>
+          </w:p>
+          <w:p>
+            <w:pPr>
+              <w:pBdr/>
+              <w:pStyle w:val="Body Text"/>
+              <w:spacing w:before="0" w:after="0" w:line="278" w:lineRule="auto"/>
+              <w:ind w:right="314"/>
+              <w:jc w:val="left"/>
+              <w:rPr>
+                <w:color w:val="000000"/>
+                <w:sz w:val="18"/>
+              </w:rPr>
+            </w:pPr>
+            <w:r>
+              <w:rPr>
+                <w:rFonts w:ascii="arial" w:eastAsia="arial" w:hAnsi="arial" w:cs="arial"/>
+                <w:b w:val="0"/>
+                <w:color w:val="000000"/>
+                <w:sz w:val="18"/>
+                <w:szCs w:val="20"/>
+              </w:rPr>
+              <w:t xml:space="preserve">• Montage Haltegriff 60 cm</w:t>
+            </w:r>
+          </w:p>
+          <w:p>
+            <w:pPr>
+              <w:pBdr/>
+              <w:pStyle w:val="Body Text"/>
+              <w:spacing w:before="0" w:after="0" w:line="278" w:lineRule="auto"/>
+              <w:ind w:right="314"/>
+              <w:jc w:val="left"/>
+              <w:rPr>
+                <w:color w:val="000000"/>
+                <w:sz w:val="18"/>
+              </w:rPr>
+            </w:pPr>
+            <w:r>
+              <w:rPr>
+                <w:rFonts w:ascii="arial" w:eastAsia="arial" w:hAnsi="arial" w:cs="arial"/>
+                <w:b w:val="0"/>
+                <w:color w:val="000000"/>
+                <w:sz w:val="18"/>
+                <w:szCs w:val="20"/>
+              </w:rPr>
+              <w:t/>
+            </w:r>
+          </w:p>
+          <w:p>
+            <w:pPr>
+              <w:pBdr/>
+              <w:pStyle w:val="Body Text"/>
+              <w:spacing w:before="0" w:after="0" w:line="278" w:lineRule="auto"/>
+              <w:ind w:right="314"/>
+              <w:jc w:val="left"/>
+              <w:rPr>
+                <w:color w:val="000000"/>
+              </w:rPr>
+            </w:pPr>
+          </w:p>
+          <w:p>
+            <w:pPr>
+              <w:pBdr/>
+              <w:pStyle w:val="Body Text"/>
+              <w:spacing w:before="0" w:after="0" w:line="278" w:lineRule="auto"/>
+              <w:ind w:right="314"/>
+              <w:jc w:val="left"/>
+              <w:rPr>
+                <w:color w:val="000000"/>
+              </w:rPr>
+            </w:pPr>
+            <w:r>
+              <w:rPr>
+                <w:rFonts w:ascii="arial" w:eastAsia="arial" w:hAnsi="arial" w:cs="arial"/>
+                <w:b/>
+                <w:color w:val="000000"/>
+                <w:sz w:val="20"/>
+                <w:szCs w:val="20"/>
+              </w:rPr>
+              <w:t xml:space="preserve">Enthält je Einheit</w:t>
+            </w:r>
+          </w:p>
+          <w:p>
+            <w:pPr>
+              <w:pBdr/>
+              <w:pStyle w:val="Body Text"/>
+              <w:spacing w:before="0" w:after="0" w:line="278" w:lineRule="auto"/>
+              <w:ind w:right="314"/>
+              <w:jc w:val="left"/>
+              <w:rPr>
+                <w:rFonts w:ascii="arial" w:eastAsia="arial" w:hAnsi="arial" w:cs="arial"/>
+                <w:b w:val="0"/>
+                <w:color w:val="000000"/>
+                <w:sz w:val="18"/>
+                <w:szCs w:val="20"/>
+              </w:rPr>
+            </w:pPr>
+            <w:r>
+              <w:rPr>
+                <w:rFonts w:ascii="arial" w:eastAsia="arial" w:hAnsi="arial" w:cs="arial"/>
+                <w:b w:val="0"/>
+                <w:color w:val="000000"/>
+                <w:sz w:val="18"/>
+                <w:szCs w:val="20"/>
+              </w:rPr>
+              <w:t xml:space="preserve">- 44,00 km Kilometerpauschale</w:t>
+            </w:r>
+          </w:p>
+          <w:p>
+            <w:pPr>
+              <w:pBdr/>
+              <w:pStyle w:val="Body Text"/>
+              <w:spacing w:before="0" w:after="0" w:line="278" w:lineRule="auto"/>
+              <w:ind w:right="314"/>
+              <w:jc w:val="left"/>
+              <w:rPr>
+                <w:sz w:val="18"/>
+              </w:rPr>
+            </w:pPr>
+            <w:r>
+              <w:rPr>
+                <w:rFonts w:ascii="arial" w:eastAsia="arial" w:hAnsi="arial" w:cs="arial"/>
+                <w:b w:val="0"/>
+                <w:color w:val="000000"/>
+                <w:sz w:val="18"/>
+                <w:szCs w:val="20"/>
+              </w:rPr>
+              <w:t xml:space="preserve">- </w:t>
+            </w:r>
+            <w:r>
+              <w:rPr>
+                <w:sz w:val="18"/>
+              </w:rPr>
+              <w:t xml:space="preserve">1,00</w:t>
+            </w:r>
+            <w:r>
+              <w:rPr>
+                <w:rFonts w:ascii="arial" w:eastAsia="arial" w:hAnsi="arial" w:cs="arial"/>
+                <w:b w:val="0"/>
+                <w:color w:val="000000"/>
+                <w:sz w:val="18"/>
+                <w:szCs w:val="20"/>
+              </w:rPr>
+              <w:t xml:space="preserve"> Stk Lieferkosten Badewannentür</w:t>
+            </w:r>
+          </w:p>
+          <w:p>
+            <w:pPr>
+              <w:pBdr/>
+              <w:pStyle w:val="Body Text"/>
+              <w:spacing w:before="0" w:after="0" w:line="278" w:lineRule="auto"/>
+              <w:ind w:right="314"/>
+              <w:jc w:val="left"/>
+              <w:rPr>
+                <w:sz w:val="18"/>
+              </w:rPr>
+            </w:pPr>
+            <w:r>
+              <w:rPr>
+                <w:rFonts w:ascii="arial" w:eastAsia="arial" w:hAnsi="arial" w:cs="arial"/>
+                <w:b w:val="0"/>
+                <w:color w:val="000000"/>
+                <w:sz w:val="18"/>
+                <w:szCs w:val="20"/>
+              </w:rPr>
+              <w:t xml:space="preserve">- </w:t>
+            </w:r>
+            <w:r>
+              <w:rPr>
+                <w:sz w:val="18"/>
+              </w:rPr>
+              <w:t xml:space="preserve">1,00</w:t>
+            </w:r>
+            <w:r>
+              <w:rPr>
+                <w:rFonts w:ascii="arial" w:eastAsia="arial" w:hAnsi="arial" w:cs="arial"/>
+                <w:b w:val="0"/>
+                <w:color w:val="000000"/>
+                <w:sz w:val="18"/>
+                <w:szCs w:val="20"/>
+              </w:rPr>
+              <w:t xml:space="preserve"> Stk Universal / Standard Tür</w:t>
+            </w:r>
+          </w:p>
+          <w:p>
+            <w:pPr>
+              <w:pBdr/>
+              <w:pStyle w:val="Body Text"/>
+              <w:spacing w:before="0" w:after="0" w:line="278" w:lineRule="auto"/>
+              <w:ind w:right="314"/>
+              <w:jc w:val="left"/>
+              <w:rPr>
+                <w:sz w:val="18"/>
+              </w:rPr>
+            </w:pPr>
+            <w:r>
+              <w:rPr>
+                <w:rFonts w:ascii="arial" w:eastAsia="arial" w:hAnsi="arial" w:cs="arial"/>
+                <w:b w:val="0"/>
+                <w:color w:val="000000"/>
+                <w:sz w:val="18"/>
+                <w:szCs w:val="20"/>
+              </w:rPr>
+              <w:t xml:space="preserve">- </w:t>
+            </w:r>
+            <w:r>
+              <w:rPr>
+                <w:sz w:val="18"/>
+              </w:rPr>
+              <w:t xml:space="preserve">1,00</w:t>
+            </w:r>
+            <w:r>
+              <w:rPr>
+                <w:rFonts w:ascii="arial" w:eastAsia="arial" w:hAnsi="arial" w:cs="arial"/>
+                <w:b w:val="0"/>
+                <w:color w:val="000000"/>
+                <w:sz w:val="18"/>
+                <w:szCs w:val="20"/>
+              </w:rPr>
+              <w:t xml:space="preserve"> Stk Kleinmaterial</w:t>
+            </w:r>
+          </w:p>
+          <w:p>
+            <w:pPr>
+              <w:pBdr/>
+              <w:pStyle w:val="Body Text"/>
+              <w:spacing w:before="0" w:after="0" w:line="278" w:lineRule="auto"/>
+              <w:ind w:right="314"/>
+              <w:jc w:val="left"/>
+              <w:rPr>
+                <w:rFonts w:ascii="arial" w:eastAsia="arial" w:hAnsi="arial" w:cs="arial"/>
+                <w:b w:val="0"/>
+                <w:color w:val="000000"/>
+                <w:sz w:val="20"/>
+                <w:szCs w:val="20"/>
+              </w:rPr>
+            </w:pPr>
+          </w:p>
+        </w:tc>
+        <w:tc>
+          <w:tcPr>
+            <w:tcW w:w="467" w:type="dxa"/>
+            <w:tcMar>
+              <w:top w:w="0" w:type="dxa"/>
+              <w:left w:w="2" w:type="dxa"/>
+              <w:bottom w:w="0" w:type="dxa"/>
+              <w:right w:w="2" w:type="dxa"/>
             </w:tcMar>
             <w:tcBorders>
               <w:top w:val="nil"/>
@@ -945,34 +1458,34 @@
             <w:pPr>
               <w:pBdr/>
               <w:pStyle w:val="normal1"/>
-              <w:spacing w:before="40" w:beforeAutospacing="false" w:after="0" w:afterAutospacing="false" w:line="240" w:lineRule="auto"/>
-              <w:ind w:right="0"/>
+              <w:spacing w:before="0" w:beforeAutospacing="false" w:after="0" w:afterAutospacing="false" w:line="278" w:lineRule="auto"/>
+              <w:ind w:right="34"/>
               <w:jc w:val="center"/>
               <w:rPr>
                 <w:rFonts w:ascii="Calibri" w:eastAsia="Calibri" w:hAnsi="Calibri" w:cs="Calibri"/>
-                <w:sz w:val="18"/>
-                <w:szCs w:val="22"/>
-              </w:rPr>
-            </w:pPr>
-            <w:r>
-              <w:rPr>
-                <w:rFonts w:ascii="Open Sans" w:eastAsia="Open Sans" w:hAnsi="Open Sans" w:cs="Open Sans"/>
-                <w:color w:val="070707"/>
+                <w:color w:val="000000"/>
+                <w:sz w:val="18"/>
+              </w:rPr>
+            </w:pPr>
+            <w:r>
+              <w:rPr>
+                <w:rFonts w:ascii="Calibri" w:eastAsia="Calibri" w:hAnsi="Calibri" w:cs="Calibri"/>
+                <w:color w:val="000000"/>
                 <w:sz w:val="18"/>
                 <w:szCs w:val="20"/>
               </w:rPr>
-              <w:t xml:space="preserve">1 Stk</w:t>
+              <w:t xml:space="preserve">3.189,67 €</w:t>
             </w:r>
           </w:p>
         </w:tc>
         <w:tc>
           <w:tcPr>
-            <w:tcW w:w="6332" w:type="dxa"/>
+            <w:tcW w:w="467" w:type="dxa"/>
             <w:tcMar>
               <w:top w:w="0" w:type="dxa"/>
-              <w:left w:w="0" w:type="dxa"/>
+              <w:left w:w="2" w:type="dxa"/>
               <w:bottom w:w="0" w:type="dxa"/>
-              <w:right w:w="0" w:type="dxa"/>
+              <w:right w:w="2" w:type="dxa"/>
             </w:tcMar>
             <w:tcBorders>
               <w:top w:val="nil"/>
@@ -987,34 +1500,57 @@
             <w:pPr>
               <w:pBdr/>
               <w:pStyle w:val="normal1"/>
-              <w:spacing w:before="40" w:beforeAutospacing="false" w:after="0" w:afterAutospacing="false" w:line="240" w:lineRule="auto"/>
-              <w:ind w:right="0"/>
-              <w:jc w:val="both"/>
-              <w:rPr>
-                <w:color w:val="000000"/>
-                <w:sz w:val="18"/>
-              </w:rPr>
-            </w:pPr>
-            <w:r>
-              <w:rPr>
-                <w:rFonts w:ascii="arial" w:eastAsia="arial" w:hAnsi="arial" w:cs="arial"/>
-                <w:b/>
+              <w:spacing w:before="0" w:beforeAutospacing="false" w:after="0" w:afterAutospacing="false" w:line="278" w:lineRule="auto"/>
+              <w:ind w:left="-141" w:right="34"/>
+              <w:jc w:val="center"/>
+              <w:rPr>
+                <w:rFonts w:ascii="Calibri" w:eastAsia="Calibri" w:hAnsi="Calibri" w:cs="Calibri"/>
+                <w:color w:val="000000"/>
+                <w:sz w:val="18"/>
+              </w:rPr>
+            </w:pPr>
+            <w:r>
+              <w:rPr>
+                <w:rFonts w:ascii="Calibri" w:eastAsia="Calibri" w:hAnsi="Calibri" w:cs="Calibri"/>
                 <w:color w:val="000000"/>
                 <w:sz w:val="18"/>
                 <w:szCs w:val="20"/>
               </w:rPr>
-              <w:t xml:space="preserve">Auszuführende Arbeiten</w:t>
+              <w:t xml:space="preserve">3.189,67 €</w:t>
+            </w:r>
+            <w:r>
+              <w:rPr>
+                <w:rFonts w:ascii="Calibri" w:eastAsia="Calibri" w:hAnsi="Calibri" w:cs="Calibri"/>
+                <w:color w:val="000000"/>
+                <w:sz w:val="18"/>
+                <w:szCs w:val="20"/>
+              </w:rPr>
+              <w:t/>
             </w:r>
           </w:p>
         </w:tc>
+      </w:tr>
+      <w:tr>
+        <w:tblPrEx>
+          <w:tblBorders/>
+          <w:tblCellMar>
+            <w:top w:w="0" w:type="dxa"/>
+            <w:left w:w="10" w:type="dxa"/>
+            <w:bottom w:w="0" w:type="dxa"/>
+            <w:right w:w="10" w:type="dxa"/>
+          </w:tblCellMar>
+        </w:tblPrEx>
+        <w:trPr>
+          <w:trHeight w:hRule="atLeast" w:val="1"/>
+        </w:trPr>
         <w:tc>
           <w:tcPr>
-            <w:tcW w:w="1415" w:type="dxa"/>
+            <w:tcW w:w="467" w:type="dxa"/>
             <w:tcMar>
               <w:top w:w="0" w:type="dxa"/>
-              <w:left w:w="0" w:type="dxa"/>
+              <w:left w:w="2" w:type="dxa"/>
               <w:bottom w:w="0" w:type="dxa"/>
-              <w:right w:w="0" w:type="dxa"/>
+              <w:right w:w="2" w:type="dxa"/>
             </w:tcMar>
             <w:tcBorders>
               <w:top w:val="nil"/>
@@ -1029,33 +1565,40 @@
             <w:pPr>
               <w:pBdr/>
               <w:pStyle w:val="normal1"/>
-              <w:spacing w:before="40" w:beforeAutospacing="false" w:after="0" w:afterAutospacing="false" w:line="240" w:lineRule="auto"/>
+              <w:spacing w:before="100" w:beforeAutospacing="true" w:after="0" w:afterAutospacing="false" w:line="240" w:lineRule="auto"/>
               <w:ind w:left="0" w:right="0"/>
-              <w:jc w:val="center"/>
-              <w:rPr>
-                <w:rFonts w:ascii="Arial" w:eastAsia="Arial" w:hAnsi="Arial" w:cs="Arial"/>
-                <w:color w:val="000000"/>
-              </w:rPr>
-            </w:pPr>
-            <w:r>
-              <w:rPr>
-                <w:rFonts w:ascii="Arial" w:eastAsia="Arial" w:hAnsi="Arial" w:cs="Arial"/>
-                <w:color w:val="000000"/>
-                <w:sz w:val="20"/>
+              <w:jc w:val="left"/>
+              <w:tabs>
+                <w:tab w:val="clear" w:pos="720"/>
+                <w:tab w:val="left" w:pos="750"/>
+                <w:tab w:val="left" w:pos="1416.0000610351562"/>
+              </w:tabs>
+              <w:rPr>
+                <w:rFonts w:ascii="Calibri" w:eastAsia="Calibri" w:hAnsi="Calibri" w:cs="Calibri"/>
+                <w:color w:val="070707"/>
+                <w:sz w:val="18"/>
                 <w:szCs w:val="20"/>
               </w:rPr>
-              <w:t xml:space="preserve">1.836,40 €</w:t>
+            </w:pPr>
+            <w:r>
+              <w:rPr>
+                <w:rFonts w:ascii="Calibri" w:eastAsia="Calibri" w:hAnsi="Calibri" w:cs="Calibri"/>
+                <w:color w:val="070707"/>
+                <w:sz w:val="18"/>
+                <w:szCs w:val="20"/>
+              </w:rPr>
+              <w:t xml:space="preserve">002</w:t>
             </w:r>
           </w:p>
         </w:tc>
         <w:tc>
           <w:tcPr>
-            <w:tcW w:w="1072" w:type="dxa"/>
+            <w:tcW w:w="467" w:type="dxa"/>
             <w:tcMar>
               <w:top w:w="0" w:type="dxa"/>
-              <w:left w:w="0" w:type="dxa"/>
+              <w:left w:w="2" w:type="dxa"/>
               <w:bottom w:w="0" w:type="dxa"/>
-              <w:right w:w="0" w:type="dxa"/>
+              <w:right w:w="2" w:type="dxa"/>
             </w:tcMar>
             <w:tcBorders>
               <w:top w:val="nil"/>
@@ -1070,47 +1613,31 @@
             <w:pPr>
               <w:pBdr/>
               <w:pStyle w:val="normal1"/>
-              <w:spacing w:before="40" w:beforeAutospacing="false" w:after="0" w:afterAutospacing="false" w:line="240" w:lineRule="auto"/>
+              <w:spacing w:before="100" w:beforeAutospacing="true" w:afterAutospacing="false" w:line="240" w:lineRule="auto"/>
               <w:ind w:left="0" w:right="0"/>
-              <w:jc w:val="center"/>
-              <w:rPr>
-                <w:rFonts w:ascii="Arial" w:eastAsia="Arial" w:hAnsi="Arial" w:cs="Arial"/>
-                <w:color w:val="000000"/>
-              </w:rPr>
-            </w:pPr>
-            <w:r>
-              <w:rPr>
-                <w:rFonts w:ascii="Arial" w:eastAsia="Arial" w:hAnsi="Arial" w:cs="Arial"/>
-                <w:color w:val="000000"/>
-                <w:sz w:val="20"/>
-                <w:szCs w:val="20"/>
-              </w:rPr>
-              <w:t xml:space="preserve">1.836,40 €</w:t>
+              <w:jc w:val="left"/>
+              <w:rPr>
+                <w:rFonts w:ascii="Calibri" w:eastAsia="Calibri" w:hAnsi="Calibri" w:cs="Calibri"/>
+                <w:sz w:val="18"/>
+              </w:rPr>
+            </w:pPr>
+            <w:r>
+              <w:rPr>
+                <w:rFonts w:ascii="Calibri" w:eastAsia="Calibri" w:hAnsi="Calibri" w:cs="Calibri"/>
+                <w:sz w:val="18"/>
+              </w:rPr>
+              <w:t xml:space="preserve">1 Stk </w:t>
             </w:r>
           </w:p>
         </w:tc>
-      </w:tr>
-      <w:tr>
-        <w:tblPrEx>
-          <w:tblBorders/>
-          <w:tblCellMar>
-            <w:top w:w="0" w:type="dxa"/>
-            <w:left w:w="0" w:type="dxa"/>
-            <w:bottom w:w="0" w:type="dxa"/>
-            <w:right w:w="0" w:type="dxa"/>
-          </w:tblCellMar>
-        </w:tblPrEx>
-        <w:trPr>
-          <w:trHeight w:hRule="atLeast" w:val="1741"/>
-        </w:trPr>
         <w:tc>
           <w:tcPr>
-            <w:tcW w:w="428" w:type="dxa"/>
+            <w:tcW w:w="467" w:type="dxa"/>
             <w:tcMar>
               <w:top w:w="0" w:type="dxa"/>
-              <w:left w:w="56" w:type="dxa"/>
+              <w:left w:w="2" w:type="dxa"/>
               <w:bottom w:w="0" w:type="dxa"/>
-              <w:right w:w="56" w:type="dxa"/>
+              <w:right w:w="2" w:type="dxa"/>
             </w:tcMar>
             <w:tcBorders>
               <w:top w:val="nil"/>
@@ -1124,46 +1651,65 @@
           <w:p>
             <w:pPr>
               <w:pBdr/>
-              <w:pStyle w:val="normal1"/>
-              <w:spacing w:before="121" w:after="0"/>
-              <w:ind/>
-              <w:jc w:val="center"/>
-              <w:tabs>
-                <w:tab w:val="clear" w:pos="720"/>
-                <w:tab w:val="left" w:pos="750"/>
-                <w:tab w:val="left" w:pos="1416.0000610351562"/>
-              </w:tabs>
-              <w:rPr>
-                <w:rFonts w:ascii="Open Sans" w:eastAsia="Open Sans" w:hAnsi="Open Sans" w:cs="Open Sans"/>
-                <w:color w:val="070707"/>
+              <w:pStyle w:val="Body Text"/>
+              <w:spacing w:before="100" w:beforeAutospacing="true" w:after="0" w:afterAutospacing="false" w:line="240" w:lineRule="auto"/>
+              <w:widowControl w:val="0"/>
+              <w:ind w:left="0" w:right="0"/>
+              <w:jc w:val="left"/>
+              <w:rPr/>
+            </w:pPr>
+            <w:r>
+              <w:rPr>
+                <w:rFonts w:ascii="Open Sans" w:eastAsia="Open Sans" w:hAnsi="Open Sans" w:cs="Open Sans"/>
+                <w:b/>
+                <w:bCs/>
+                <w:color w:val="000000"/>
+                <w:sz w:val="18"/>
+                <w:szCs w:val="18"/>
+              </w:rPr>
+              <w:t xml:space="preserve">Haltegriff clivia plus 32/600mm m. Ros. Edelstahl glatt poliert,VIGOUR</w:t>
+            </w:r>
+            <w:r>
+              <w:rPr>
+                <w:rFonts w:ascii="arial" w:eastAsia="arial" w:hAnsi="arial" w:cs="arial"/>
+                <w:b/>
+                <w:bCs/>
+                <w:color w:val="000000"/>
                 <w:sz w:val="20"/>
                 <w:szCs w:val="20"/>
               </w:rPr>
-            </w:pPr>
-          </w:p>
-          <w:p>
-            <w:pPr>
-              <w:pBdr/>
-              <w:pStyle w:val="normal1"/>
-              <w:spacing w:before="0" w:after="0"/>
-              <w:ind/>
-              <w:jc w:val="center"/>
-              <w:rPr>
-                <w:rFonts w:ascii="Calibri" w:eastAsia="Calibri" w:hAnsi="Calibri" w:cs="Calibri"/>
-                <w:sz w:val="22"/>
-                <w:szCs w:val="22"/>
-              </w:rPr>
-            </w:pPr>
+              <w:t/>
+            </w:r>
+            <w:r>
+              <w:rPr>
+                <w:rFonts w:ascii="Open Sans" w:eastAsia="Open Sans" w:hAnsi="Open Sans" w:cs="Open Sans"/>
+                <w:b/>
+                <w:bCs/>
+                <w:color w:val="000000"/>
+                <w:sz w:val="18"/>
+                <w:szCs w:val="18"/>
+              </w:rPr>
+              <w:t/>
+            </w:r>
+            <w:r>
+              <w:rPr>
+                <w:rFonts w:ascii="Open Sans" w:eastAsia="Open Sans" w:hAnsi="Open Sans" w:cs="Open Sans"/>
+                <w:color w:val="000000"/>
+                <w:sz w:val="18"/>
+                <w:szCs w:val="18"/>
+              </w:rPr>
+              <w:t xml:space="preserve"> </w:t>
+            </w:r>
           </w:p>
         </w:tc>
         <w:tc>
           <w:tcPr>
-            <w:tcW w:w="789" w:type="dxa"/>
+            <w:tcW w:w="467" w:type="dxa"/>
             <w:tcMar>
               <w:top w:w="0" w:type="dxa"/>
-              <w:left w:w="56" w:type="dxa"/>
+              <w:left w:w="2" w:type="dxa"/>
               <w:bottom w:w="0" w:type="dxa"/>
-              <w:right w:w="56" w:type="dxa"/>
+              <w:right w:w="2" w:type="dxa"/>
             </w:tcMar>
             <w:tcBorders>
               <w:top w:val="nil"/>
@@ -1178,23 +1724,33 @@
             <w:pPr>
               <w:pBdr/>
               <w:pStyle w:val="normal1"/>
-              <w:spacing w:before="0" w:after="0"/>
-              <w:ind/>
+              <w:spacing w:before="100" w:beforeAutospacing="true" w:after="0" w:afterAutospacing="false" w:line="240" w:lineRule="auto"/>
+              <w:ind w:left="0" w:right="0"/>
               <w:jc w:val="center"/>
               <w:rPr>
-                <w:color w:val="000000"/>
-              </w:rPr>
-            </w:pPr>
+                <w:rFonts w:ascii="Calibri" w:eastAsia="Calibri" w:hAnsi="Calibri" w:cs="Calibri"/>
+                <w:color w:val="000000"/>
+                <w:sz w:val="18"/>
+              </w:rPr>
+            </w:pPr>
+            <w:r>
+              <w:rPr>
+                <w:rFonts w:ascii="Calibri" w:eastAsia="Calibri" w:hAnsi="Calibri" w:cs="Calibri"/>
+                <w:color w:val="000000"/>
+                <w:sz w:val="18"/>
+              </w:rPr>
+              <w:t xml:space="preserve">73,00 € </w:t>
+            </w:r>
           </w:p>
         </w:tc>
         <w:tc>
           <w:tcPr>
-            <w:tcW w:w="6332" w:type="dxa"/>
+            <w:tcW w:w="467" w:type="dxa"/>
             <w:tcMar>
               <w:top w:w="0" w:type="dxa"/>
-              <w:left w:w="56" w:type="dxa"/>
+              <w:left w:w="2" w:type="dxa"/>
               <w:bottom w:w="0" w:type="dxa"/>
-              <w:right w:w="56" w:type="dxa"/>
+              <w:right w:w="2" w:type="dxa"/>
             </w:tcMar>
             <w:tcBorders>
               <w:top w:val="nil"/>
@@ -1209,192 +1765,31 @@
             <w:pPr>
               <w:pBdr/>
               <w:pStyle w:val="normal1"/>
-              <w:spacing w:before="0" w:beforeAutospacing="false" w:after="0" w:afterAutospacing="false" w:line="278" w:lineRule="auto"/>
-              <w:ind w:right="0"/>
-              <w:jc w:val="left"/>
-              <w:rPr>
-                <w:color w:val="000000"/>
-                <w:sz w:val="20"/>
-                <w:szCs w:val="20"/>
-              </w:rPr>
-            </w:pPr>
-          </w:p>
-          <w:p>
-            <w:pPr>
-              <w:pBdr/>
-              <w:pStyle w:val="normal1"/>
-              <w:spacing w:before="0" w:beforeAutospacing="false" w:after="0" w:afterAutospacing="false" w:line="278" w:lineRule="auto"/>
-              <w:ind w:right="0"/>
-              <w:jc w:val="left"/>
-              <w:rPr>
-                <w:color w:val="000000"/>
-                <w:sz w:val="20"/>
-                <w:szCs w:val="20"/>
-              </w:rPr>
-            </w:pPr>
-            <w:r>
-              <w:rPr>
-                <w:rFonts w:ascii="Open Sans" w:eastAsia="Open Sans" w:hAnsi="Open Sans" w:cs="Open Sans"/>
-                <w:color w:val="000000"/>
-                <w:sz w:val="20"/>
-                <w:szCs w:val="20"/>
-              </w:rPr>
-              <w:t xml:space="preserve">Enthält je Einheit</w:t>
-            </w:r>
-          </w:p>
-          <w:p>
-            <w:pPr>
-              <w:pBdr/>
-              <w:pStyle w:val="normal1"/>
-              <w:spacing w:before="0" w:beforeAutospacing="false" w:after="0" w:afterAutospacing="false" w:line="278" w:lineRule="auto"/>
-              <w:ind w:right="0"/>
-              <w:jc w:val="left"/>
-              <w:rPr>
-                <w:color w:val="000000"/>
-                <w:sz w:val="20"/>
-                <w:szCs w:val="20"/>
-              </w:rPr>
-            </w:pPr>
-            <w:r>
-              <w:rPr>
-                <w:rFonts w:ascii="Open Sans" w:eastAsia="Open Sans" w:hAnsi="Open Sans" w:cs="Open Sans"/>
-                <w:color w:val="000000"/>
-                <w:sz w:val="20"/>
-                <w:szCs w:val="20"/>
-              </w:rPr>
-              <w:t xml:space="preserve">- 1,00 Stk Fahrzeugbereitstellung</w:t>
-            </w:r>
-          </w:p>
-          <w:p>
-            <w:pPr>
-              <w:pBdr/>
-              <w:pStyle w:val="normal1"/>
-              <w:spacing w:before="0" w:beforeAutospacing="false" w:after="0" w:afterAutospacing="false" w:line="278" w:lineRule="auto"/>
-              <w:ind w:right="0"/>
-              <w:jc w:val="left"/>
-              <w:rPr>
-                <w:color w:val="000000"/>
-                <w:sz w:val="20"/>
-                <w:szCs w:val="20"/>
-              </w:rPr>
-            </w:pPr>
-            <w:r>
-              <w:rPr>
-                <w:rFonts w:ascii="Open Sans" w:eastAsia="Open Sans" w:hAnsi="Open Sans" w:cs="Open Sans"/>
-                <w:color w:val="000000"/>
-                <w:sz w:val="20"/>
-                <w:szCs w:val="20"/>
-              </w:rPr>
-              <w:t xml:space="preserve">- 1,00 Stk Bereitstellung und Vorhaltung von Maschinen &amp; Werkzeugen</w:t>
-            </w:r>
-          </w:p>
-          <w:p>
-            <w:pPr>
-              <w:pBdr/>
-              <w:pStyle w:val="normal1"/>
-              <w:spacing w:before="0" w:beforeAutospacing="false" w:after="0" w:afterAutospacing="false" w:line="278" w:lineRule="auto"/>
-              <w:ind w:right="0"/>
-              <w:jc w:val="left"/>
-              <w:rPr>
-                <w:color w:val="000000"/>
-                <w:sz w:val="20"/>
-                <w:szCs w:val="20"/>
-              </w:rPr>
-            </w:pPr>
-            <w:r>
-              <w:rPr>
-                <w:rFonts w:ascii="Open Sans" w:eastAsia="Open Sans" w:hAnsi="Open Sans" w:cs="Open Sans"/>
-                <w:color w:val="000000"/>
-                <w:sz w:val="20"/>
-                <w:szCs w:val="20"/>
-              </w:rPr>
-              <w:t xml:space="preserve">- 1,00 Stk Beräumung der Baustelle</w:t>
-            </w:r>
-          </w:p>
-          <w:p>
-            <w:pPr>
-              <w:pBdr/>
-              <w:pStyle w:val="normal1"/>
-              <w:spacing w:before="0" w:beforeAutospacing="false" w:after="0" w:afterAutospacing="false" w:line="278" w:lineRule="auto"/>
-              <w:ind w:right="0"/>
-              <w:jc w:val="left"/>
-              <w:rPr>
-                <w:color w:val="000000"/>
-                <w:sz w:val="20"/>
-                <w:szCs w:val="20"/>
-              </w:rPr>
-            </w:pPr>
-            <w:r>
-              <w:rPr>
-                <w:rFonts w:ascii="Open Sans" w:eastAsia="Open Sans" w:hAnsi="Open Sans" w:cs="Open Sans"/>
-                <w:color w:val="000000"/>
-                <w:sz w:val="20"/>
-                <w:szCs w:val="20"/>
-              </w:rPr>
-              <w:t xml:space="preserve">- 44 km Kilometerpauschale</w:t>
-            </w:r>
-          </w:p>
-        </w:tc>
-        <w:tc>
-          <w:tcPr>
-            <w:tcW w:w="1415" w:type="dxa"/>
-            <w:tcMar>
-              <w:top w:w="0" w:type="dxa"/>
-              <w:left w:w="56" w:type="dxa"/>
-              <w:bottom w:w="0" w:type="dxa"/>
-              <w:right w:w="56" w:type="dxa"/>
-            </w:tcMar>
-            <w:tcBorders>
-              <w:top w:val="nil"/>
-              <w:left w:val="nil"/>
-              <w:bottom w:val="nil"/>
-              <w:right w:val="nil"/>
-            </w:tcBorders>
-            <w:shd w:fill="FFFFFF" w:color="auto" w:val="clear"/>
-            <w:vAlign w:val="top"/>
-          </w:tcPr>
-          <w:p>
-            <w:pPr>
-              <w:pBdr/>
-              <w:pStyle w:val="normal1"/>
-              <w:spacing w:before="0" w:after="0" w:line="278" w:lineRule="auto"/>
-              <w:ind w:right="314"/>
+              <w:spacing w:before="100" w:beforeAutospacing="true" w:after="0" w:afterAutospacing="false" w:line="240" w:lineRule="auto"/>
+              <w:ind w:left="0" w:right="0"/>
               <w:jc w:val="center"/>
               <w:rPr>
-                <w:color w:val="000000"/>
-              </w:rPr>
-            </w:pPr>
-          </w:p>
-        </w:tc>
-        <w:tc>
-          <w:tcPr>
-            <w:tcW w:w="1072" w:type="dxa"/>
-            <w:tcMar>
-              <w:top w:w="0" w:type="dxa"/>
-              <w:left w:w="56" w:type="dxa"/>
-              <w:bottom w:w="0" w:type="dxa"/>
-              <w:right w:w="56" w:type="dxa"/>
-            </w:tcMar>
-            <w:tcBorders>
-              <w:top w:val="nil"/>
-              <w:left w:val="nil"/>
-              <w:bottom w:val="nil"/>
-              <w:right w:val="nil"/>
-            </w:tcBorders>
-            <w:shd w:fill="FFFFFF" w:color="auto" w:val="clear"/>
-            <w:vAlign w:val="center"/>
-          </w:tcPr>
-          <w:p>
-            <w:pPr>
-              <w:pBdr/>
-              <w:pStyle w:val="normal1"/>
-              <w:spacing w:before="0" w:after="0" w:line="278" w:lineRule="auto"/>
-              <w:ind w:right="314"/>
-              <w:jc w:val="center"/>
-              <w:rPr>
-                <w:color w:val="000000"/>
-              </w:rPr>
-            </w:pPr>
+                <w:rFonts w:ascii="Calibri" w:eastAsia="Calibri" w:hAnsi="Calibri" w:cs="Calibri"/>
+                <w:color w:val="000000"/>
+                <w:sz w:val="18"/>
+              </w:rPr>
+            </w:pPr>
+            <w:r>
+              <w:rPr>
+                <w:rFonts w:ascii="Calibri" w:eastAsia="Calibri" w:hAnsi="Calibri" w:cs="Calibri"/>
+                <w:color w:val="000000"/>
+                <w:sz w:val="18"/>
+              </w:rPr>
+              <w:t xml:space="preserve">73,00 €</w:t>
+            </w:r>
+            <w:r>
+              <w:rPr>
+                <w:rFonts w:ascii="Calibri" w:eastAsia="Calibri" w:hAnsi="Calibri" w:cs="Calibri"/>
+                <w:color w:val="000000"/>
+                <w:sz w:val="18"/>
+              </w:rPr>
+              <w:t/>
+            </w:r>
           </w:p>
         </w:tc>
       </w:tr>
@@ -1421,658 +1816,35 @@
     <w:tbl>
       <w:tblPr>
         <w:tblStyle w:val="TableNormal"/>
-        <w:tblW w:w="10050" w:type="dxa"/>
+        <w:tblW w:w="9660" w:type="dxa"/>
         <w:jc w:val="left"/>
         <w:tblInd w:w="1" w:type="dxa"/>
         <w:tblCellMar>
           <w:top w:w="0" w:type="dxa"/>
-          <w:left w:w="56" w:type="dxa"/>
+          <w:left w:w="108" w:type="dxa"/>
           <w:bottom w:w="0" w:type="dxa"/>
-          <w:right w:w="56" w:type="dxa"/>
-        </w:tblCellMar>
-        <w:tblBorders/>
-        <w:shd w:fill="auto" w:color="auto"/>
-        <w:tblLayout w:type="fixed"/>
-      </w:tblPr>
-      <w:tblGrid>
-        <w:gridCol w:w="425"/>
-        <w:gridCol w:w="789"/>
-        <w:gridCol w:w="6342"/>
-        <w:gridCol w:w="1417"/>
-        <w:gridCol w:w="1077"/>
-      </w:tblGrid>
-      <w:tr>
-        <w:tblPrEx>
-          <w:tblBorders/>
-          <w:tblCellMar>
-            <w:top w:w="0" w:type="dxa"/>
-            <w:left w:w="56" w:type="dxa"/>
-            <w:bottom w:w="0" w:type="dxa"/>
-            <w:right w:w="56" w:type="dxa"/>
-          </w:tblCellMar>
-        </w:tblPrEx>
-        <w:trPr>
-          <w:trHeight w:hRule="atLeast" w:val="379"/>
-        </w:trPr>
-        <w:tc>
-          <w:tcPr>
-            <w:tcW w:w="425" w:type="dxa"/>
-            <w:tcBorders>
-              <w:top w:val="nil"/>
-              <w:left w:val="nil"/>
-              <w:bottom w:val="nil"/>
-              <w:right w:val="nil"/>
-            </w:tcBorders>
-            <w:shd w:fill="FFFFFF" w:color="auto" w:val="clear"/>
-            <w:vAlign w:val="top"/>
-          </w:tcPr>
-          <w:p>
-            <w:pPr>
-              <w:pBdr/>
-              <w:pStyle w:val="normal1"/>
-              <w:spacing w:before="10" w:beforeAutospacing="false" w:after="10" w:afterAutospacing="false" w:line="240" w:lineRule="auto"/>
-              <w:ind w:right="0"/>
-              <w:jc w:val="center"/>
-              <w:rPr>
-                <w:rFonts w:ascii="Calibri" w:eastAsia="Calibri" w:hAnsi="Calibri" w:cs="Calibri"/>
-                <w:sz w:val="18"/>
-                <w:szCs w:val="22"/>
-              </w:rPr>
-            </w:pPr>
-            <w:r>
-              <w:rPr>
-                <w:rFonts w:ascii="Open Sans" w:eastAsia="Open Sans" w:hAnsi="Open Sans" w:cs="Open Sans"/>
-                <w:color w:val="070707"/>
-                <w:sz w:val="18"/>
-                <w:szCs w:val="20"/>
-              </w:rPr>
-              <w:t xml:space="preserve">002</w:t>
-            </w:r>
-          </w:p>
-        </w:tc>
-        <w:tc>
-          <w:tcPr>
-            <w:tcW w:w="789" w:type="dxa"/>
-            <w:tcBorders>
-              <w:top w:val="nil"/>
-              <w:left w:val="nil"/>
-              <w:bottom w:val="nil"/>
-              <w:right w:val="nil"/>
-            </w:tcBorders>
-            <w:shd w:fill="FFFFFF" w:color="auto" w:val="clear"/>
-            <w:vAlign w:val="top"/>
-          </w:tcPr>
-          <w:p>
-            <w:pPr>
-              <w:pBdr/>
-              <w:pStyle w:val="normal1"/>
-              <w:spacing w:before="10" w:beforeAutospacing="false" w:after="10" w:afterAutospacing="false" w:line="240" w:lineRule="auto"/>
-              <w:ind w:right="0"/>
-              <w:jc w:val="center"/>
-              <w:rPr>
-                <w:rFonts w:ascii="Calibri" w:eastAsia="Calibri" w:hAnsi="Calibri" w:cs="Calibri"/>
-                <w:sz w:val="18"/>
-                <w:szCs w:val="22"/>
-              </w:rPr>
-            </w:pPr>
-            <w:r>
-              <w:rPr>
-                <w:rFonts w:ascii="Open Sans" w:eastAsia="Open Sans" w:hAnsi="Open Sans" w:cs="Open Sans"/>
-                <w:color w:val="070707"/>
-                <w:sz w:val="18"/>
-                <w:szCs w:val="20"/>
-              </w:rPr>
-              <w:t xml:space="preserve">1 Stk</w:t>
-            </w:r>
-          </w:p>
-        </w:tc>
-        <w:tc>
-          <w:tcPr>
-            <w:tcW w:w="6342" w:type="dxa"/>
-            <w:tcBorders>
-              <w:top w:val="nil"/>
-              <w:left w:val="nil"/>
-              <w:bottom w:val="nil"/>
-              <w:right w:val="nil"/>
-            </w:tcBorders>
-            <w:shd w:fill="FFFFFF" w:color="auto" w:val="clear"/>
-            <w:vAlign w:val="top"/>
-          </w:tcPr>
-          <w:p>
-            <w:pPr>
-              <w:pBdr/>
-              <w:pStyle w:val="normal1"/>
-              <w:spacing w:before="10" w:beforeAutospacing="false" w:after="10" w:afterAutospacing="false" w:line="240" w:lineRule="auto"/>
-              <w:ind w:right="0"/>
-              <w:jc w:val="both"/>
-              <w:tabs>
-                <w:tab w:val="left" w:pos="6739.6002197265625"/>
-                <w:tab w:val="left" w:pos="6907.60009765625"/>
-              </w:tabs>
-              <w:rPr>
-                <w:color w:val="000000"/>
-                <w:sz w:val="18"/>
-              </w:rPr>
-            </w:pPr>
-            <w:r>
-              <w:rPr>
-                <w:rFonts w:ascii="arial" w:eastAsia="arial" w:hAnsi="arial" w:cs="arial"/>
-                <w:b/>
-                <w:color w:val="000000"/>
-                <w:sz w:val="18"/>
-                <w:szCs w:val="20"/>
-              </w:rPr>
-              <w:t xml:space="preserve">Material für Badumbau</w:t>
-            </w:r>
-          </w:p>
-        </w:tc>
-        <w:tc>
-          <w:tcPr>
-            <w:tcW w:w="1417" w:type="dxa"/>
-            <w:tcBorders>
-              <w:top w:val="nil"/>
-              <w:left w:val="nil"/>
-              <w:bottom w:val="nil"/>
-              <w:right w:val="nil"/>
-            </w:tcBorders>
-            <w:shd w:fill="FFFFFF" w:color="auto" w:val="clear"/>
-            <w:vAlign w:val="top"/>
-          </w:tcPr>
-          <w:p>
-            <w:pPr>
-              <w:pBdr/>
-              <w:pStyle w:val="normal1"/>
-              <w:spacing w:before="10" w:beforeAutospacing="false" w:after="10" w:afterAutospacing="false" w:line="240" w:lineRule="auto"/>
-              <w:ind w:left="0" w:right="0"/>
-              <w:jc w:val="center"/>
-              <w:rPr>
-                <w:rFonts w:ascii="Arial" w:eastAsia="Arial" w:hAnsi="Arial" w:cs="Arial"/>
-                <w:color w:val="000000"/>
-                <w:sz w:val="20"/>
-              </w:rPr>
-            </w:pPr>
-            <w:r>
-              <w:rPr>
-                <w:rFonts w:ascii="Arial" w:eastAsia="Arial" w:hAnsi="Arial" w:cs="Arial"/>
-                <w:color w:val="000000"/>
-                <w:sz w:val="20"/>
-                <w:szCs w:val="20"/>
-              </w:rPr>
-              <w:t xml:space="preserve">1.286,00 €</w:t>
-            </w:r>
-          </w:p>
-        </w:tc>
-        <w:tc>
-          <w:tcPr>
-            <w:tcW w:w="1077" w:type="dxa"/>
-            <w:tcMar>
-              <w:top w:w="0" w:type="dxa"/>
-              <w:left w:w="0" w:type="dxa"/>
-              <w:bottom w:w="0" w:type="dxa"/>
-              <w:right w:w="0" w:type="dxa"/>
-            </w:tcMar>
-            <w:tcBorders>
-              <w:top w:val="nil"/>
-              <w:left w:val="nil"/>
-              <w:bottom w:val="nil"/>
-              <w:right w:val="nil"/>
-            </w:tcBorders>
-            <w:shd w:fill="FFFFFF" w:color="auto" w:val="clear"/>
-            <w:vAlign w:val="top"/>
-          </w:tcPr>
-          <w:p>
-            <w:pPr>
-              <w:pBdr/>
-              <w:pStyle w:val="normal1"/>
-              <w:spacing w:before="10" w:beforeAutospacing="false" w:after="10" w:afterAutospacing="false" w:line="240" w:lineRule="auto"/>
-              <w:ind w:right="0"/>
-              <w:jc w:val="center"/>
-              <w:rPr>
-                <w:rFonts w:ascii="Arial" w:eastAsia="Arial" w:hAnsi="Arial" w:cs="Arial"/>
-                <w:sz w:val="20"/>
-                <w:szCs w:val="22"/>
-              </w:rPr>
-            </w:pPr>
-            <w:r>
-              <w:rPr>
-                <w:rFonts w:ascii="Arial" w:eastAsia="Arial" w:hAnsi="Arial" w:cs="Arial"/>
-                <w:sz w:val="20"/>
-                <w:szCs w:val="22"/>
-              </w:rPr>
-              <w:t xml:space="preserve">1.286,00 €</w:t>
-            </w:r>
-          </w:p>
-        </w:tc>
-      </w:tr>
-      <w:tr>
-        <w:tblPrEx>
-          <w:tblBorders/>
-          <w:tblCellMar>
-            <w:top w:w="0" w:type="dxa"/>
-            <w:left w:w="56" w:type="dxa"/>
-            <w:bottom w:w="0" w:type="dxa"/>
-            <w:right w:w="56" w:type="dxa"/>
-          </w:tblCellMar>
-        </w:tblPrEx>
-        <w:trPr>
-          <w:trHeight w:hRule="atLeast" w:val="1"/>
-        </w:trPr>
-        <w:tc>
-          <w:tcPr>
-            <w:tcW w:w="425" w:type="dxa"/>
-            <w:tcBorders>
-              <w:top w:val="nil"/>
-              <w:left w:val="nil"/>
-              <w:bottom w:val="nil"/>
-              <w:right w:val="nil"/>
-            </w:tcBorders>
-            <w:shd w:fill="FFFFFF" w:color="auto" w:val="clear"/>
-            <w:vAlign w:val="top"/>
-          </w:tcPr>
-          <w:p>
-            <w:pPr>
-              <w:pBdr/>
-              <w:pStyle w:val="normal1"/>
-              <w:spacing w:before="0" w:after="0"/>
-              <w:ind/>
-              <w:jc w:val="center"/>
-              <w:rPr>
-                <w:color w:val="000000"/>
-              </w:rPr>
-            </w:pPr>
-          </w:p>
-        </w:tc>
-        <w:tc>
-          <w:tcPr>
-            <w:tcW w:w="789" w:type="dxa"/>
-            <w:tcBorders>
-              <w:top w:val="nil"/>
-              <w:left w:val="nil"/>
-              <w:bottom w:val="nil"/>
-              <w:right w:val="nil"/>
-            </w:tcBorders>
-            <w:shd w:fill="FFFFFF" w:color="auto" w:val="clear"/>
-            <w:vAlign w:val="top"/>
-          </w:tcPr>
-          <w:p>
-            <w:pPr>
-              <w:pBdr/>
-              <w:pStyle w:val="normal1"/>
-              <w:spacing w:before="0" w:after="0"/>
-              <w:ind/>
-              <w:jc w:val="center"/>
-              <w:rPr>
-                <w:color w:val="000000"/>
-              </w:rPr>
-            </w:pPr>
-          </w:p>
-        </w:tc>
-        <w:tc>
-          <w:tcPr>
-            <w:tcW w:w="6342" w:type="dxa"/>
-            <w:tcBorders>
-              <w:top w:val="nil"/>
-              <w:left w:val="nil"/>
-              <w:bottom w:val="nil"/>
-              <w:right w:val="nil"/>
-            </w:tcBorders>
-            <w:shd w:fill="FFFFFF" w:color="auto" w:val="clear"/>
-            <w:vAlign w:val="top"/>
-          </w:tcPr>
-          <w:p>
-            <w:pPr>
-              <w:pBdr/>
-              <w:pStyle w:val="normal1"/>
-              <w:spacing w:before="0" w:beforeAutospacing="false" w:after="0" w:afterAutospacing="false" w:line="278" w:lineRule="auto"/>
-              <w:ind w:right="0"/>
-              <w:jc w:val="left"/>
-              <w:rPr>
-                <w:rFonts w:ascii="Open Sans" w:eastAsia="Open Sans" w:hAnsi="Open Sans" w:cs="Open Sans"/>
-                <w:color w:val="000000"/>
-                <w:sz w:val="20"/>
-                <w:szCs w:val="20"/>
-              </w:rPr>
-            </w:pPr>
-            <w:r>
-              <w:rPr>
-                <w:rFonts w:ascii="Open Sans" w:eastAsia="Open Sans" w:hAnsi="Open Sans" w:cs="Open Sans"/>
-                <w:color w:val="000000"/>
-                <w:sz w:val="20"/>
-                <w:szCs w:val="20"/>
-              </w:rPr>
-              <w:t xml:space="preserve">- 1 Stk TRINNITY Wannenabdichtband-Set 3,4 m Nass-/Trockenanbindung entspr. DIN 18534</w:t>
-            </w:r>
-          </w:p>
-          <w:p>
-            <w:pPr>
-              <w:pBdr/>
-              <w:pStyle w:val="normal1"/>
-              <w:spacing w:before="0" w:beforeAutospacing="false" w:after="0" w:afterAutospacing="false" w:line="278" w:lineRule="auto"/>
-              <w:ind w:right="0"/>
-              <w:jc w:val="left"/>
-              <w:rPr>
-                <w:rFonts w:ascii="Open Sans" w:eastAsia="Open Sans" w:hAnsi="Open Sans" w:cs="Open Sans"/>
-                <w:color w:val="000000"/>
-                <w:sz w:val="20"/>
-                <w:szCs w:val="20"/>
-              </w:rPr>
-            </w:pPr>
-            <w:r>
-              <w:rPr>
-                <w:rFonts w:ascii="Open Sans" w:eastAsia="Open Sans" w:hAnsi="Open Sans" w:cs="Open Sans"/>
-                <w:color w:val="000000"/>
-                <w:sz w:val="20"/>
-                <w:szCs w:val="20"/>
-              </w:rPr>
-              <w:t xml:space="preserve">- 1 Stk Ablaufgarnitur Rohbauset m.Sifon BH60mm f.flache Duschw.m.90mm Ablauf TRINNITY</w:t>
-            </w:r>
-          </w:p>
-          <w:p>
-            <w:pPr>
-              <w:pBdr/>
-              <w:pStyle w:val="normal1"/>
-              <w:spacing w:before="0" w:beforeAutospacing="false" w:after="0" w:afterAutospacing="false" w:line="278" w:lineRule="auto"/>
-              <w:ind w:right="0"/>
-              <w:jc w:val="left"/>
-              <w:rPr>
-                <w:rFonts w:ascii="Open Sans" w:eastAsia="Open Sans" w:hAnsi="Open Sans" w:cs="Open Sans"/>
-                <w:color w:val="000000"/>
-                <w:sz w:val="20"/>
-                <w:szCs w:val="20"/>
-              </w:rPr>
-            </w:pPr>
-            <w:r>
-              <w:rPr>
-                <w:rFonts w:ascii="Open Sans" w:eastAsia="Open Sans" w:hAnsi="Open Sans" w:cs="Open Sans"/>
-                <w:color w:val="000000"/>
-                <w:sz w:val="20"/>
-                <w:szCs w:val="20"/>
-              </w:rPr>
-              <w:t xml:space="preserve">- 1 Stk Kleinmaterial</w:t>
-            </w:r>
-          </w:p>
-          <w:p>
-            <w:pPr>
-              <w:pBdr/>
-              <w:pStyle w:val="normal1"/>
-              <w:spacing w:before="0" w:beforeAutospacing="false" w:after="0" w:afterAutospacing="false" w:line="278" w:lineRule="auto"/>
-              <w:ind w:right="0"/>
-              <w:jc w:val="left"/>
-              <w:rPr>
-                <w:rFonts w:ascii="Open Sans" w:eastAsia="Open Sans" w:hAnsi="Open Sans" w:cs="Open Sans"/>
-                <w:color w:val="000000"/>
-                <w:sz w:val="20"/>
-                <w:szCs w:val="20"/>
-              </w:rPr>
-            </w:pPr>
-            <w:r>
-              <w:rPr>
-                <w:rFonts w:ascii="Open Sans" w:eastAsia="Open Sans" w:hAnsi="Open Sans" w:cs="Open Sans"/>
-                <w:color w:val="000000"/>
-                <w:sz w:val="20"/>
-                <w:szCs w:val="20"/>
-              </w:rPr>
-              <w:t xml:space="preserve">- 1 Stk Stelzlager höhenverstellar Set</w:t>
-            </w:r>
-          </w:p>
-          <w:p>
-            <w:pPr>
-              <w:pBdr/>
-              <w:pStyle w:val="normal1"/>
-              <w:spacing w:before="0" w:beforeAutospacing="false" w:after="0" w:afterAutospacing="false" w:line="278" w:lineRule="auto"/>
-              <w:ind w:right="0"/>
-              <w:jc w:val="left"/>
-              <w:rPr>
-                <w:rFonts w:ascii="Open Sans" w:eastAsia="Open Sans" w:hAnsi="Open Sans" w:cs="Open Sans"/>
-                <w:color w:val="000000"/>
-                <w:sz w:val="20"/>
-                <w:szCs w:val="20"/>
-              </w:rPr>
-            </w:pPr>
-            <w:r>
-              <w:rPr>
-                <w:rFonts w:ascii="Open Sans" w:eastAsia="Open Sans" w:hAnsi="Open Sans" w:cs="Open Sans"/>
-                <w:color w:val="000000"/>
-                <w:sz w:val="20"/>
-                <w:szCs w:val="20"/>
-              </w:rPr>
-              <w:t xml:space="preserve">- 1 Stk Wandverkleidung 3.0 Alu 997×2550 mm — Farbe: Marmor weiß</w:t>
-            </w:r>
-          </w:p>
-          <w:p>
-            <w:pPr>
-              <w:pBdr/>
-              <w:pStyle w:val="normal1"/>
-              <w:spacing w:before="0" w:beforeAutospacing="false" w:after="0" w:afterAutospacing="false" w:line="278" w:lineRule="auto"/>
-              <w:ind w:right="0"/>
-              <w:jc w:val="left"/>
-              <w:rPr>
-                <w:rFonts w:ascii="Open Sans" w:eastAsia="Open Sans" w:hAnsi="Open Sans" w:cs="Open Sans"/>
-                <w:color w:val="000000"/>
-                <w:sz w:val="20"/>
-                <w:szCs w:val="20"/>
-              </w:rPr>
-            </w:pPr>
-            <w:r>
-              <w:rPr>
-                <w:rFonts w:ascii="Open Sans" w:eastAsia="Open Sans" w:hAnsi="Open Sans" w:cs="Open Sans"/>
-                <w:color w:val="000000"/>
-                <w:sz w:val="20"/>
-                <w:szCs w:val="20"/>
-              </w:rPr>
-              <w:t xml:space="preserve">- 1 Stk Wandverkleidung 3.0 Alu 1497×2550 mm — Farbe: Marmor weiß</w:t>
-            </w:r>
-          </w:p>
-          <w:p>
-            <w:pPr>
-              <w:pBdr/>
-              <w:pStyle w:val="normal1"/>
-              <w:spacing w:before="0" w:beforeAutospacing="false" w:after="0" w:afterAutospacing="false" w:line="278" w:lineRule="auto"/>
-              <w:ind w:right="0"/>
-              <w:jc w:val="left"/>
-              <w:rPr>
-                <w:rFonts w:ascii="Open Sans" w:eastAsia="Open Sans" w:hAnsi="Open Sans" w:cs="Open Sans"/>
-                <w:color w:val="000000"/>
-                <w:sz w:val="20"/>
-                <w:szCs w:val="20"/>
-              </w:rPr>
-            </w:pPr>
-            <w:r>
-              <w:rPr>
-                <w:rFonts w:ascii="Open Sans" w:eastAsia="Open Sans" w:hAnsi="Open Sans" w:cs="Open Sans"/>
-                <w:color w:val="000000"/>
-                <w:sz w:val="20"/>
-                <w:szCs w:val="20"/>
-              </w:rPr>
-              <w:t xml:space="preserve">- 1 Stk TRINNITY Wandabdichtung BASIS-Set 5 qm DW bis 100 x 100 / BW bis 180 x 80 cm</w:t>
-            </w:r>
-          </w:p>
-          <w:p>
-            <w:pPr>
-              <w:pBdr/>
-              <w:pStyle w:val="normal1"/>
-              <w:spacing w:before="0" w:beforeAutospacing="false" w:after="0" w:afterAutospacing="false" w:line="278" w:lineRule="auto"/>
-              <w:ind w:right="0"/>
-              <w:jc w:val="left"/>
-              <w:rPr>
-                <w:rFonts w:ascii="Open Sans" w:eastAsia="Open Sans" w:hAnsi="Open Sans" w:cs="Open Sans"/>
-                <w:color w:val="000000"/>
-                <w:sz w:val="20"/>
-                <w:szCs w:val="20"/>
-              </w:rPr>
-            </w:pPr>
-            <w:r>
-              <w:rPr>
-                <w:rFonts w:ascii="Open Sans" w:eastAsia="Open Sans" w:hAnsi="Open Sans" w:cs="Open Sans"/>
-                <w:color w:val="000000"/>
-                <w:sz w:val="20"/>
-                <w:szCs w:val="20"/>
-              </w:rPr>
-              <w:t xml:space="preserve">- 4 Pkg Flächenkleber (Wandverkleidung)</w:t>
-            </w:r>
-          </w:p>
-          <w:p>
-            <w:pPr>
-              <w:pBdr/>
-              <w:pStyle w:val="normal1"/>
-              <w:spacing w:before="0" w:beforeAutospacing="false" w:after="0" w:afterAutospacing="false" w:line="278" w:lineRule="auto"/>
-              <w:ind w:right="0"/>
-              <w:jc w:val="left"/>
-              <w:rPr>
-                <w:rFonts w:ascii="Open Sans" w:eastAsia="Open Sans" w:hAnsi="Open Sans" w:cs="Open Sans"/>
-                <w:color w:val="000000"/>
-                <w:sz w:val="20"/>
-                <w:szCs w:val="20"/>
-              </w:rPr>
-            </w:pPr>
-            <w:r>
-              <w:rPr>
-                <w:rFonts w:ascii="Open Sans" w:eastAsia="Open Sans" w:hAnsi="Open Sans" w:cs="Open Sans"/>
-                <w:color w:val="000000"/>
-                <w:sz w:val="20"/>
-                <w:szCs w:val="20"/>
-              </w:rPr>
-              <w:t xml:space="preserve">- 1 Stk Abschlussprofil 3.0 255 cm silber eloxiert VIGOUR</w:t>
-            </w:r>
-          </w:p>
-          <w:p>
-            <w:pPr>
-              <w:pBdr/>
-              <w:pStyle w:val="normal1"/>
-              <w:spacing w:before="0" w:beforeAutospacing="false" w:after="0" w:afterAutospacing="false" w:line="278" w:lineRule="auto"/>
-              <w:ind w:right="0"/>
-              <w:jc w:val="left"/>
-              <w:rPr>
-                <w:rFonts w:ascii="Open Sans" w:eastAsia="Open Sans" w:hAnsi="Open Sans" w:cs="Open Sans"/>
-                <w:color w:val="000000"/>
-                <w:sz w:val="20"/>
-                <w:szCs w:val="20"/>
-              </w:rPr>
-            </w:pPr>
-            <w:r>
-              <w:rPr>
-                <w:rFonts w:ascii="Open Sans" w:eastAsia="Open Sans" w:hAnsi="Open Sans" w:cs="Open Sans"/>
-                <w:color w:val="000000"/>
-                <w:sz w:val="20"/>
-                <w:szCs w:val="20"/>
-              </w:rPr>
-              <w:t xml:space="preserve">- 1 Stk CARE Sanitär Silikon Weiß 310ml</w:t>
-            </w:r>
-          </w:p>
-        </w:tc>
-        <w:tc>
-          <w:tcPr>
-            <w:tcW w:w="1417" w:type="dxa"/>
-            <w:tcBorders>
-              <w:top w:val="nil"/>
-              <w:left w:val="nil"/>
-              <w:bottom w:val="nil"/>
-              <w:right w:val="nil"/>
-            </w:tcBorders>
-            <w:shd w:fill="FFFFFF" w:color="auto" w:val="clear"/>
-            <w:vAlign w:val="top"/>
-          </w:tcPr>
-          <w:p>
-            <w:pPr>
-              <w:pBdr/>
-              <w:pStyle w:val="normal1"/>
-              <w:spacing w:before="0" w:after="0" w:line="278" w:lineRule="auto"/>
-              <w:ind w:right="314"/>
-              <w:jc w:val="center"/>
-              <w:rPr>
-                <w:color w:val="000000"/>
-              </w:rPr>
-            </w:pPr>
-          </w:p>
-        </w:tc>
-        <w:tc>
-          <w:tcPr>
-            <w:tcW w:w="1077" w:type="dxa"/>
-            <w:tcBorders>
-              <w:top w:val="nil"/>
-              <w:left w:val="nil"/>
-              <w:bottom w:val="nil"/>
-              <w:right w:val="nil"/>
-            </w:tcBorders>
-            <w:shd w:fill="FFFFFF" w:color="auto" w:val="clear"/>
-            <w:vAlign w:val="center"/>
-          </w:tcPr>
-          <w:p>
-            <w:pPr>
-              <w:pBdr/>
-              <w:pStyle w:val="normal1"/>
-              <w:spacing w:before="0" w:after="0" w:line="278" w:lineRule="auto"/>
-              <w:ind w:right="314"/>
-              <w:jc w:val="center"/>
-              <w:rPr>
-                <w:color w:val="000000"/>
-              </w:rPr>
-            </w:pPr>
-          </w:p>
-        </w:tc>
-      </w:tr>
-    </w:tbl>
-    <w:p>
-      <w:pPr>
-        <w:pBdr/>
-        <w:pStyle w:val="normal1"/>
-        <w:spacing w:before="121" w:after="0"/>
-        <w:ind/>
-        <w:tabs>
-          <w:tab w:val="clear" w:pos="720"/>
-          <w:tab w:val="left" w:pos="750"/>
-          <w:tab w:val="left" w:pos="1416.0000610351562"/>
-        </w:tabs>
-        <w:rPr>
-          <w:rFonts w:ascii="Open Sans" w:eastAsia="Open Sans" w:hAnsi="Open Sans" w:cs="Open Sans"/>
-          <w:color w:val="070707"/>
-          <w:sz w:val="20"/>
-          <w:szCs w:val="20"/>
-        </w:rPr>
-      </w:pPr>
-    </w:p>
-    <w:tbl>
-      <w:tblPr>
-        <w:tblStyle w:val="TableNormal"/>
-        <w:tblDescription w:val=""/>
-        <w:tblCaption w:val=""/>
-        <w:tblW w:w="9549" w:type="dxa"/>
-        <w:jc w:val="right"/>
-        <w:tblInd w:w="0" w:type="dxa"/>
-        <w:tblCellMar>
-          <w:top w:w="0" w:type="dxa"/>
-          <w:left w:w="100" w:type="dxa"/>
-          <w:bottom w:w="0" w:type="dxa"/>
-          <w:right w:w="0" w:type="dxa"/>
+          <w:right w:w="108" w:type="dxa"/>
         </w:tblCellMar>
         <w:tblBorders>
-          <w:top w:val="nil"/>
-          <w:left w:val="nil"/>
-          <w:bottom w:val="nil"/>
-          <w:right w:val="nil"/>
-          <w:insideH w:val="nil"/>
-          <w:insideV w:val="nil"/>
+          <w:top w:val="single" w:color="e57373" w:sz="8" w:space="0"/>
+          <w:left w:val="single" w:color="000000" w:sz="8" w:space="0"/>
+          <w:bottom w:val="single" w:color="e57373" w:sz="8" w:space="0"/>
+          <w:right w:val="single" w:color="e57373" w:sz="8" w:space="0"/>
+          <w:insideH w:val="single" w:color="000000" w:sz="8" w:space="0"/>
+          <w:insideV w:val="single" w:color="000000" w:sz="8" w:space="0"/>
         </w:tblBorders>
         <w:shd w:fill="auto" w:color="auto"/>
         <w:tblLayout w:type="fixed"/>
       </w:tblPr>
       <w:tblGrid>
-        <w:gridCol w:w="16"/>
-        <w:gridCol w:w="2371"/>
-        <w:gridCol w:w="2387"/>
-        <w:gridCol w:w="3482"/>
-        <w:gridCol w:w="1293"/>
+        <w:gridCol w:w="2415"/>
+        <w:gridCol w:w="2415"/>
+        <w:gridCol w:w="2415"/>
+        <w:gridCol w:w="2415"/>
       </w:tblGrid>
       <w:tr>
         <w:tblPrEx>
-          <w:tblBorders>
-            <w:top w:val="nil"/>
-            <w:left w:val="nil"/>
-            <w:bottom w:val="nil"/>
-            <w:right w:val="nil"/>
-            <w:insideH w:val="nil"/>
-            <w:insideV w:val="nil"/>
-          </w:tblBorders>
+          <w:tblBorders/>
           <w:tblCellMar>
             <w:top w:w="0" w:type="dxa"/>
             <w:left w:w="108" w:type="dxa"/>
@@ -2082,31 +1854,32 @@
         </w:tblPrEx>
         <w:trPr>
           <w:trHeight w:hRule="atLeast" w:val="20"/>
-          <w:gridBefore w:val="1"/>
-          <w:wBefore w:w="16" w:type="dxa"/>
-          <w:cantSplit/>
         </w:trPr>
         <w:tc>
           <w:tcPr>
-            <w:tcW w:w="2375" w:type="dxa"/>
+            <w:tcW w:w="3915" w:type="dxa"/>
+            <w:tcMar>
+              <w:top w:w="0" w:type="dxa"/>
+              <w:left w:w="88" w:type="dxa"/>
+              <w:bottom w:w="0" w:type="dxa"/>
+              <w:right w:w="8" w:type="dxa"/>
+            </w:tcMar>
             <w:tcBorders>
-              <w:top w:val="nil"/>
-              <w:left w:val="nil"/>
-              <w:bottom w:val="nil"/>
-              <w:right w:val="nil"/>
+              <w:top w:val="single" w:color="FFFFFF" w:sz="8" w:space="0"/>
+              <w:left w:val="single" w:color="D9D9D9" w:sz="8" w:space="0"/>
+              <w:bottom w:val="single" w:color="FFFFFF" w:sz="8" w:space="0"/>
+              <w:right w:val="single" w:color="D9D9D9" w:sz="8" w:space="0"/>
             </w:tcBorders>
             <w:shd w:fill="D9D9D9" w:color="auto" w:val="clear"/>
-            <w:vAlign w:val="center"/>
+            <w:vAlign w:val="top"/>
           </w:tcPr>
           <w:p>
             <w:pPr>
               <w:pBdr/>
               <w:pStyle w:val="normal1"/>
-              <w:keepNext/>
-              <w:keepLines/>
-              <w:spacing w:before="0" w:beforeAutospacing="false" w:after="0" w:afterAutospacing="false" w:line="240" w:lineRule="auto"/>
-              <w:ind w:left="50" w:right="0"/>
-              <w:jc w:val="both"/>
+              <w:spacing w:before="0" w:after="0"/>
+              <w:ind w:left="0"/>
+              <w:jc w:val="left"/>
               <w:rPr>
                 <w:rFonts w:ascii="Calibri" w:eastAsia="Calibri" w:hAnsi="Calibri" w:cs="Calibri"/>
                 <w:sz w:val="22"/>
@@ -2136,12 +1909,18 @@
         </w:tc>
         <w:tc>
           <w:tcPr>
-            <w:tcW w:w="2391" w:type="dxa"/>
+            <w:tcW w:w="3915" w:type="dxa"/>
+            <w:tcMar>
+              <w:top w:w="0" w:type="dxa"/>
+              <w:left w:w="88" w:type="dxa"/>
+              <w:bottom w:w="0" w:type="dxa"/>
+              <w:right w:w="8" w:type="dxa"/>
+            </w:tcMar>
             <w:tcBorders>
-              <w:top w:val="nil"/>
-              <w:left w:val="nil"/>
-              <w:bottom w:val="nil"/>
-              <w:right w:val="nil"/>
+              <w:top w:val="single" w:color="FFFFFF" w:sz="8" w:space="0"/>
+              <w:left w:val="single" w:color="D9D9D9" w:sz="8" w:space="0"/>
+              <w:bottom w:val="single" w:color="FFFFFF" w:sz="8" w:space="0"/>
+              <w:right w:val="single" w:color="D9D9D9" w:sz="8" w:space="0"/>
             </w:tcBorders>
             <w:shd w:fill="D9D9D9" w:color="auto" w:val="clear"/>
             <w:vAlign w:val="center"/>
@@ -2150,11 +1929,9 @@
             <w:pPr>
               <w:pBdr/>
               <w:pStyle w:val="normal1"/>
-              <w:keepNext/>
-              <w:keepLines/>
-              <w:spacing w:before="0" w:beforeAutospacing="false" w:after="0" w:afterAutospacing="false" w:line="240" w:lineRule="auto"/>
+              <w:spacing w:before="0" w:after="0"/>
               <w:ind/>
-              <w:jc w:val="both"/>
+              <w:jc w:val="left"/>
               <w:rPr>
                 <w:color w:val="000000"/>
               </w:rPr>
@@ -2163,12 +1940,18 @@
         </w:tc>
         <w:tc>
           <w:tcPr>
-            <w:tcW w:w="3487" w:type="dxa"/>
+            <w:tcW w:w="3915" w:type="dxa"/>
+            <w:tcMar>
+              <w:top w:w="0" w:type="dxa"/>
+              <w:left w:w="88" w:type="dxa"/>
+              <w:bottom w:w="0" w:type="dxa"/>
+              <w:right w:w="8" w:type="dxa"/>
+            </w:tcMar>
             <w:tcBorders>
-              <w:top w:val="nil"/>
-              <w:left w:val="nil"/>
-              <w:bottom w:val="nil"/>
-              <w:right w:val="nil"/>
+              <w:top w:val="single" w:color="FFFFFF" w:sz="8" w:space="0"/>
+              <w:left w:val="single" w:color="D9D9D9" w:sz="8" w:space="0"/>
+              <w:bottom w:val="single" w:color="FFFFFF" w:sz="8" w:space="0"/>
+              <w:right w:val="single" w:color="D9D9D9" w:sz="8" w:space="0"/>
             </w:tcBorders>
             <w:shd w:fill="D9D9D9" w:color="auto" w:val="clear"/>
             <w:vAlign w:val="center"/>
@@ -2177,11 +1960,9 @@
             <w:pPr>
               <w:pBdr/>
               <w:pStyle w:val="normal1"/>
-              <w:keepNext/>
-              <w:keepLines/>
-              <w:spacing w:before="0" w:beforeAutospacing="false" w:after="0" w:afterAutospacing="false" w:line="240" w:lineRule="auto"/>
+              <w:spacing w:before="0" w:after="0"/>
               <w:ind/>
-              <w:jc w:val="both"/>
+              <w:jc w:val="left"/>
               <w:rPr>
                 <w:color w:val="000000"/>
               </w:rPr>
@@ -2190,12 +1971,18 @@
         </w:tc>
         <w:tc>
           <w:tcPr>
-            <w:tcW w:w="1295" w:type="dxa"/>
+            <w:tcW w:w="3915" w:type="dxa"/>
+            <w:tcMar>
+              <w:top w:w="0" w:type="dxa"/>
+              <w:left w:w="88" w:type="dxa"/>
+              <w:bottom w:w="0" w:type="dxa"/>
+              <w:right w:w="8" w:type="dxa"/>
+            </w:tcMar>
             <w:tcBorders>
-              <w:top w:val="nil"/>
-              <w:left w:val="nil"/>
-              <w:bottom w:val="nil"/>
-              <w:right w:val="nil"/>
+              <w:top w:val="single" w:color="FFFFFF" w:sz="8" w:space="0"/>
+              <w:left w:val="single" w:color="D9D9D9" w:sz="8" w:space="0"/>
+              <w:bottom w:val="single" w:color="FFFFFF" w:sz="8" w:space="0"/>
+              <w:right w:val="single" w:color="D9D9D9" w:sz="8" w:space="0"/>
             </w:tcBorders>
             <w:shd w:fill="D9D9D9" w:color="auto" w:val="clear"/>
             <w:vAlign w:val="center"/>
@@ -2204,11 +1991,10 @@
             <w:pPr>
               <w:pBdr/>
               <w:pStyle w:val="normal1"/>
-              <w:keepNext/>
-              <w:keepLines/>
-              <w:spacing w:before="0" w:beforeAutospacing="false" w:after="0" w:afterAutospacing="false" w:line="240" w:lineRule="auto"/>
-              <w:ind w:right="0"/>
-              <w:jc w:val="both"/>
+              <w:spacing w:before="0" w:beforeAutospacing="false" w:after="0" w:afterAutospacing="false" w:line="278" w:lineRule="auto"/>
+              <w:contextualSpacing/>
+              <w:ind w:left="0" w:right="314"/>
+              <w:jc w:val="right"/>
               <w:rPr>
                 <w:color w:val="000000"/>
               </w:rPr>
@@ -2221,7 +2007,7 @@
                 <w:sz w:val="22"/>
                 <w:szCs w:val="22"/>
               </w:rPr>
-              <w:t xml:space="preserve">3.122,40 €</w:t>
+              <w:t xml:space="preserve">3.262,67 €</w:t>
             </w:r>
             <w:r>
               <w:rPr>
@@ -2237,14 +2023,186 @@
       </w:tr>
       <w:tr>
         <w:tblPrEx>
-          <w:tblBorders>
-            <w:top w:val="nil"/>
-            <w:left w:val="nil"/>
-            <w:bottom w:val="nil"/>
-            <w:right w:val="nil"/>
-            <w:insideH w:val="nil"/>
-            <w:insideV w:val="nil"/>
-          </w:tblBorders>
+          <w:tblBorders/>
+          <w:tblCellMar>
+            <w:top w:w="0" w:type="dxa"/>
+            <w:left w:w="108" w:type="dxa"/>
+            <w:bottom w:w="0" w:type="dxa"/>
+            <w:right w:w="108" w:type="dxa"/>
+          </w:tblCellMar>
+        </w:tblPrEx>
+        <w:trPr>
+          <w:trHeight w:hRule="atLeast" w:val="54"/>
+        </w:trPr>
+        <w:tc>
+          <w:tcPr>
+            <w:tcW w:w="3915" w:type="dxa"/>
+            <w:tcMar>
+              <w:top w:w="0" w:type="dxa"/>
+              <w:left w:w="88" w:type="dxa"/>
+              <w:bottom w:w="0" w:type="dxa"/>
+              <w:right w:w="8" w:type="dxa"/>
+            </w:tcMar>
+            <w:tcBorders>
+              <w:top w:val="single" w:color="FFFFFF" w:sz="8" w:space="0"/>
+              <w:left w:val="single" w:color="FFFFFF" w:sz="8" w:space="0"/>
+              <w:bottom w:val="single" w:color="FFFFFF" w:sz="8" w:space="0"/>
+              <w:right w:val="single" w:color="FFFFFF" w:sz="8" w:space="0"/>
+            </w:tcBorders>
+            <w:shd w:fill="FFFFFF" w:color="auto" w:val="clear"/>
+            <w:vAlign w:val="top"/>
+          </w:tcPr>
+          <w:p>
+            <w:pPr>
+              <w:pBdr/>
+              <w:pStyle w:val="normal1"/>
+              <w:spacing w:before="0" w:after="0"/>
+              <w:ind w:right="0"/>
+              <w:jc w:val="left"/>
+              <w:rPr>
+                <w:rFonts w:ascii="Calibri" w:eastAsia="Calibri" w:hAnsi="Calibri" w:cs="Calibri"/>
+                <w:sz w:val="22"/>
+                <w:szCs w:val="22"/>
+              </w:rPr>
+            </w:pPr>
+            <w:r>
+              <w:rPr>
+                <w:rFonts w:ascii="Open Sans Semibold" w:eastAsia="Open Sans Semibold" w:hAnsi="Open Sans Semibold" w:cs="Open Sans Semibold"/>
+                <w:color w:val="030303"/>
+                <w:sz w:val="20"/>
+                <w:szCs w:val="20"/>
+              </w:rPr>
+              <w:t/>
+            </w:r>
+            <w:r>
+              <w:rPr>
+                <w:rFonts w:ascii="Open Sans Semibold" w:eastAsia="Open Sans Semibold" w:hAnsi="Open Sans Semibold" w:cs="Open Sans Semibold"/>
+                <w:b/>
+                <w:color w:val="030303"/>
+                <w:sz w:val="20"/>
+                <w:szCs w:val="20"/>
+              </w:rPr>
+              <w:t xml:space="preserve">zzgl. 19% MwSt.</w:t>
+            </w:r>
+          </w:p>
+        </w:tc>
+        <w:tc>
+          <w:tcPr>
+            <w:tcW w:w="3915" w:type="dxa"/>
+            <w:tcMar>
+              <w:top w:w="0" w:type="dxa"/>
+              <w:left w:w="88" w:type="dxa"/>
+              <w:bottom w:w="0" w:type="dxa"/>
+              <w:right w:w="8" w:type="dxa"/>
+            </w:tcMar>
+            <w:tcBorders>
+              <w:top w:val="single" w:color="FFFFFF" w:sz="8" w:space="0"/>
+              <w:left w:val="single" w:color="FFFFFF" w:sz="8" w:space="0"/>
+              <w:bottom w:val="single" w:color="FFFFFF" w:sz="8" w:space="0"/>
+              <w:right w:val="single" w:color="FFFFFF" w:sz="8" w:space="0"/>
+            </w:tcBorders>
+            <w:shd w:fill="FFFFFF" w:color="auto" w:val="clear"/>
+            <w:vAlign w:val="center"/>
+          </w:tcPr>
+          <w:p>
+            <w:pPr>
+              <w:pBdr/>
+              <w:pStyle w:val="normal1"/>
+              <w:spacing w:before="0" w:after="0"/>
+              <w:ind/>
+              <w:jc w:val="left"/>
+              <w:rPr>
+                <w:color w:val="000000"/>
+              </w:rPr>
+            </w:pPr>
+          </w:p>
+        </w:tc>
+        <w:tc>
+          <w:tcPr>
+            <w:tcW w:w="3915" w:type="dxa"/>
+            <w:tcMar>
+              <w:top w:w="0" w:type="dxa"/>
+              <w:left w:w="88" w:type="dxa"/>
+              <w:bottom w:w="0" w:type="dxa"/>
+              <w:right w:w="8" w:type="dxa"/>
+            </w:tcMar>
+            <w:tcBorders>
+              <w:top w:val="single" w:color="FFFFFF" w:sz="8" w:space="0"/>
+              <w:left w:val="single" w:color="FFFFFF" w:sz="8" w:space="0"/>
+              <w:bottom w:val="single" w:color="FFFFFF" w:sz="8" w:space="0"/>
+              <w:right w:val="single" w:color="FFFFFF" w:sz="8" w:space="0"/>
+            </w:tcBorders>
+            <w:shd w:fill="FFFFFF" w:color="auto" w:val="clear"/>
+            <w:vAlign w:val="center"/>
+          </w:tcPr>
+          <w:p>
+            <w:pPr>
+              <w:pBdr/>
+              <w:pStyle w:val="normal1"/>
+              <w:spacing w:before="0" w:after="0"/>
+              <w:ind/>
+              <w:jc w:val="left"/>
+              <w:rPr>
+                <w:color w:val="000000"/>
+              </w:rPr>
+            </w:pPr>
+          </w:p>
+        </w:tc>
+        <w:tc>
+          <w:tcPr>
+            <w:tcW w:w="3915" w:type="dxa"/>
+            <w:tcMar>
+              <w:top w:w="0" w:type="dxa"/>
+              <w:left w:w="88" w:type="dxa"/>
+              <w:bottom w:w="0" w:type="dxa"/>
+              <w:right w:w="8" w:type="dxa"/>
+            </w:tcMar>
+            <w:tcBorders>
+              <w:top w:val="single" w:color="FFFFFF" w:sz="8" w:space="0"/>
+              <w:left w:val="single" w:color="FFFFFF" w:sz="8" w:space="0"/>
+              <w:bottom w:val="single" w:color="FFFFFF" w:sz="8" w:space="0"/>
+              <w:right w:val="single" w:color="FFFFFF" w:sz="8" w:space="0"/>
+            </w:tcBorders>
+            <w:shd w:fill="FFFFFF" w:color="auto" w:val="clear"/>
+            <w:vAlign w:val="center"/>
+          </w:tcPr>
+          <w:p>
+            <w:pPr>
+              <w:pBdr/>
+              <w:pStyle w:val="normal1"/>
+              <w:spacing w:before="0" w:beforeAutospacing="false" w:after="0" w:afterAutospacing="false" w:line="278" w:lineRule="auto"/>
+              <w:contextualSpacing/>
+              <w:ind w:left="0" w:right="314"/>
+              <w:jc w:val="right"/>
+              <w:rPr>
+                <w:color w:val="000000"/>
+              </w:rPr>
+            </w:pPr>
+            <w:r>
+              <w:rPr>
+                <w:rFonts w:ascii="Open Sans Semibold" w:eastAsia="Open Sans Semibold" w:hAnsi="Open Sans Semibold" w:cs="Open Sans Semibold"/>
+                <w:b/>
+                <w:color w:val="000000"/>
+                <w:sz w:val="22"/>
+                <w:szCs w:val="22"/>
+              </w:rPr>
+              <w:t xml:space="preserve">619,91 €</w:t>
+            </w:r>
+            <w:r>
+              <w:rPr>
+                <w:rFonts w:ascii="Open Sans Semibold" w:eastAsia="Open Sans Semibold" w:hAnsi="Open Sans Semibold" w:cs="Open Sans Semibold"/>
+                <w:color w:val="000000"/>
+                <w:sz w:val="22"/>
+                <w:szCs w:val="22"/>
+              </w:rPr>
+              <w:t/>
+            </w:r>
+          </w:p>
+        </w:tc>
+      </w:tr>
+      <w:tr>
+        <w:tblPrEx>
+          <w:tblBorders/>
           <w:tblCellMar>
             <w:top w:w="0" w:type="dxa"/>
             <w:left w:w="108" w:type="dxa"/>
@@ -2254,31 +2212,32 @@
         </w:tblPrEx>
         <w:trPr>
           <w:trHeight w:hRule="atLeast" w:val="20"/>
-          <w:gridBefore w:val="1"/>
-          <w:wBefore w:w="16" w:type="dxa"/>
-          <w:cantSplit/>
         </w:trPr>
         <w:tc>
           <w:tcPr>
-            <w:tcW w:w="2375" w:type="dxa"/>
+            <w:tcW w:w="3915" w:type="dxa"/>
+            <w:tcMar>
+              <w:top w:w="0" w:type="dxa"/>
+              <w:left w:w="88" w:type="dxa"/>
+              <w:bottom w:w="0" w:type="dxa"/>
+              <w:right w:w="8" w:type="dxa"/>
+            </w:tcMar>
             <w:tcBorders>
-              <w:top w:val="nil"/>
-              <w:left w:val="nil"/>
-              <w:bottom w:val="nil"/>
-              <w:right w:val="nil"/>
+              <w:top w:val="single" w:color="FFFFFF" w:sz="8" w:space="0"/>
+              <w:left w:val="single" w:color="D9D9D9" w:sz="8" w:space="0"/>
+              <w:bottom w:val="single" w:color="FFFFFF" w:sz="8" w:space="0"/>
+              <w:right w:val="single" w:color="D9D9D9" w:sz="8" w:space="0"/>
             </w:tcBorders>
-            <w:shd w:fill="FFFFFF" w:color="auto" w:val="clear"/>
-            <w:vAlign w:val="center"/>
+            <w:shd w:fill="D9D9D9" w:color="auto" w:val="clear"/>
+            <w:vAlign w:val="top"/>
           </w:tcPr>
           <w:p>
             <w:pPr>
               <w:pBdr/>
               <w:pStyle w:val="normal1"/>
-              <w:keepNext/>
-              <w:keepLines/>
-              <w:spacing w:before="0" w:beforeAutospacing="false" w:after="0" w:afterAutospacing="false" w:line="240" w:lineRule="auto"/>
-              <w:ind w:right="0"/>
-              <w:jc w:val="both"/>
+              <w:spacing w:before="0" w:after="0"/>
+              <w:ind w:left="0"/>
+              <w:jc w:val="left"/>
               <w:rPr>
                 <w:rFonts w:ascii="Calibri" w:eastAsia="Calibri" w:hAnsi="Calibri" w:cs="Calibri"/>
                 <w:sz w:val="22"/>
@@ -2302,142 +2261,24 @@
                 <w:sz w:val="20"/>
                 <w:szCs w:val="20"/>
               </w:rPr>
-              <w:t xml:space="preserve">zzgl. 19% MwSt.</w:t>
+              <w:t xml:space="preserve">Gesamtsumme</w:t>
             </w:r>
           </w:p>
         </w:tc>
         <w:tc>
           <w:tcPr>
-            <w:tcW w:w="2391" w:type="dxa"/>
+            <w:tcW w:w="3915" w:type="dxa"/>
+            <w:tcMar>
+              <w:top w:w="0" w:type="dxa"/>
+              <w:left w:w="88" w:type="dxa"/>
+              <w:bottom w:w="0" w:type="dxa"/>
+              <w:right w:w="8" w:type="dxa"/>
+            </w:tcMar>
             <w:tcBorders>
-              <w:top w:val="nil"/>
-              <w:left w:val="nil"/>
-              <w:bottom w:val="nil"/>
-              <w:right w:val="nil"/>
-            </w:tcBorders>
-            <w:shd w:fill="FFFFFF" w:color="auto" w:val="clear"/>
-            <w:vAlign w:val="center"/>
-          </w:tcPr>
-          <w:p>
-            <w:pPr>
-              <w:pBdr/>
-              <w:pStyle w:val="normal1"/>
-              <w:keepNext/>
-              <w:keepLines/>
-              <w:spacing w:before="0" w:beforeAutospacing="false" w:after="0" w:afterAutospacing="false" w:line="240" w:lineRule="auto"/>
-              <w:ind/>
-              <w:jc w:val="both"/>
-              <w:rPr>
-                <w:color w:val="000000"/>
-              </w:rPr>
-            </w:pPr>
-          </w:p>
-        </w:tc>
-        <w:tc>
-          <w:tcPr>
-            <w:tcW w:w="3487" w:type="dxa"/>
-            <w:tcBorders>
-              <w:top w:val="nil"/>
-              <w:left w:val="nil"/>
-              <w:bottom w:val="nil"/>
-              <w:right w:val="nil"/>
-            </w:tcBorders>
-            <w:shd w:fill="FFFFFF" w:color="auto" w:val="clear"/>
-            <w:vAlign w:val="center"/>
-          </w:tcPr>
-          <w:p>
-            <w:pPr>
-              <w:pBdr/>
-              <w:pStyle w:val="normal1"/>
-              <w:keepNext/>
-              <w:keepLines/>
-              <w:spacing w:before="0" w:beforeAutospacing="false" w:after="0" w:afterAutospacing="false" w:line="240" w:lineRule="auto"/>
-              <w:ind/>
-              <w:jc w:val="both"/>
-              <w:rPr>
-                <w:color w:val="000000"/>
-              </w:rPr>
-            </w:pPr>
-          </w:p>
-        </w:tc>
-        <w:tc>
-          <w:tcPr>
-            <w:tcW w:w="1295" w:type="dxa"/>
-            <w:tcBorders>
-              <w:top w:val="nil"/>
-              <w:left w:val="nil"/>
-              <w:bottom w:val="nil"/>
-              <w:right w:val="nil"/>
-            </w:tcBorders>
-            <w:shd w:fill="FFFFFF" w:color="auto" w:val="clear"/>
-            <w:vAlign w:val="center"/>
-          </w:tcPr>
-          <w:p>
-            <w:pPr>
-              <w:pBdr/>
-              <w:pStyle w:val="normal1"/>
-              <w:keepNext/>
-              <w:keepLines/>
-              <w:spacing w:before="0" w:beforeAutospacing="false" w:after="0" w:afterAutospacing="false" w:line="240" w:lineRule="auto"/>
-              <w:ind w:right="0"/>
-              <w:jc w:val="both"/>
-              <w:rPr>
-                <w:color w:val="000000"/>
-              </w:rPr>
-            </w:pPr>
-            <w:r>
-              <w:rPr>
-                <w:rFonts w:ascii="Open Sans Semibold" w:eastAsia="Open Sans Semibold" w:hAnsi="Open Sans Semibold" w:cs="Open Sans Semibold"/>
-                <w:b/>
-                <w:color w:val="000000"/>
-                <w:sz w:val="22"/>
-                <w:szCs w:val="22"/>
-              </w:rPr>
-              <w:t xml:space="preserve">593,26 €</w:t>
-            </w:r>
-            <w:r>
-              <w:rPr>
-                <w:rFonts w:ascii="Open Sans Semibold" w:eastAsia="Open Sans Semibold" w:hAnsi="Open Sans Semibold" w:cs="Open Sans Semibold"/>
-                <w:color w:val="000000"/>
-                <w:sz w:val="22"/>
-                <w:szCs w:val="22"/>
-              </w:rPr>
-              <w:t/>
-            </w:r>
-          </w:p>
-        </w:tc>
-      </w:tr>
-      <w:tr>
-        <w:tblPrEx>
-          <w:tblBorders>
-            <w:top w:val="nil"/>
-            <w:left w:val="nil"/>
-            <w:bottom w:val="nil"/>
-            <w:right w:val="nil"/>
-            <w:insideH w:val="nil"/>
-            <w:insideV w:val="nil"/>
-          </w:tblBorders>
-          <w:tblCellMar>
-            <w:top w:w="0" w:type="dxa"/>
-            <w:left w:w="108" w:type="dxa"/>
-            <w:bottom w:w="0" w:type="dxa"/>
-            <w:right w:w="108" w:type="dxa"/>
-          </w:tblCellMar>
-        </w:tblPrEx>
-        <w:trPr>
-          <w:trHeight w:hRule="atLeast" w:val="20"/>
-          <w:gridBefore w:val="1"/>
-          <w:wBefore w:w="16" w:type="dxa"/>
-          <w:cantSplit/>
-        </w:trPr>
-        <w:tc>
-          <w:tcPr>
-            <w:tcW w:w="2375" w:type="dxa"/>
-            <w:tcBorders>
-              <w:top w:val="nil"/>
-              <w:left w:val="nil"/>
-              <w:bottom w:val="nil"/>
-              <w:right w:val="nil"/>
+              <w:top w:val="single" w:color="FFFFFF" w:sz="8" w:space="0"/>
+              <w:left w:val="single" w:color="D9D9D9" w:sz="8" w:space="0"/>
+              <w:bottom w:val="single" w:color="FFFFFF" w:sz="8" w:space="0"/>
+              <w:right w:val="single" w:color="D9D9D9" w:sz="8" w:space="0"/>
             </w:tcBorders>
             <w:shd w:fill="D9D9D9" w:color="auto" w:val="clear"/>
             <w:vAlign w:val="center"/>
@@ -2446,46 +2287,29 @@
             <w:pPr>
               <w:pBdr/>
               <w:pStyle w:val="normal1"/>
-              <w:keepNext/>
-              <w:keepLines/>
-              <w:spacing w:before="0" w:beforeAutospacing="false" w:after="0" w:afterAutospacing="false" w:line="240" w:lineRule="auto"/>
-              <w:ind w:left="50" w:right="0"/>
-              <w:jc w:val="both"/>
-              <w:rPr>
-                <w:rFonts w:ascii="Calibri" w:eastAsia="Calibri" w:hAnsi="Calibri" w:cs="Calibri"/>
-                <w:sz w:val="22"/>
-                <w:szCs w:val="22"/>
-              </w:rPr>
-            </w:pPr>
-            <w:r>
-              <w:rPr>
-                <w:rFonts w:ascii="Open Sans Semibold" w:eastAsia="Open Sans Semibold" w:hAnsi="Open Sans Semibold" w:cs="Open Sans Semibold"/>
-                <w:color w:val="030303"/>
-                <w:sz w:val="20"/>
-                <w:szCs w:val="20"/>
-              </w:rPr>
-              <w:t/>
-            </w:r>
-            <w:r>
-              <w:rPr>
-                <w:rFonts w:ascii="Open Sans Semibold" w:eastAsia="Open Sans Semibold" w:hAnsi="Open Sans Semibold" w:cs="Open Sans Semibold"/>
-                <w:b/>
-                <w:color w:val="030303"/>
-                <w:sz w:val="20"/>
-                <w:szCs w:val="20"/>
-              </w:rPr>
-              <w:t xml:space="preserve">Gesamtsumme</w:t>
-            </w:r>
+              <w:spacing w:before="0" w:after="0"/>
+              <w:ind/>
+              <w:jc w:val="left"/>
+              <w:rPr>
+                <w:color w:val="000000"/>
+              </w:rPr>
+            </w:pPr>
           </w:p>
         </w:tc>
         <w:tc>
           <w:tcPr>
-            <w:tcW w:w="2391" w:type="dxa"/>
+            <w:tcW w:w="3915" w:type="dxa"/>
+            <w:tcMar>
+              <w:top w:w="0" w:type="dxa"/>
+              <w:left w:w="88" w:type="dxa"/>
+              <w:bottom w:w="0" w:type="dxa"/>
+              <w:right w:w="8" w:type="dxa"/>
+            </w:tcMar>
             <w:tcBorders>
-              <w:top w:val="nil"/>
-              <w:left w:val="nil"/>
-              <w:bottom w:val="nil"/>
-              <w:right w:val="nil"/>
+              <w:top w:val="single" w:color="FFFFFF" w:sz="8" w:space="0"/>
+              <w:left w:val="single" w:color="D9D9D9" w:sz="8" w:space="0"/>
+              <w:bottom w:val="single" w:color="FFFFFF" w:sz="8" w:space="0"/>
+              <w:right w:val="single" w:color="D9D9D9" w:sz="8" w:space="0"/>
             </w:tcBorders>
             <w:shd w:fill="D9D9D9" w:color="auto" w:val="clear"/>
             <w:vAlign w:val="center"/>
@@ -2494,11 +2318,9 @@
             <w:pPr>
               <w:pBdr/>
               <w:pStyle w:val="normal1"/>
-              <w:keepNext/>
-              <w:keepLines/>
-              <w:spacing w:before="0" w:beforeAutospacing="false" w:after="0" w:afterAutospacing="false" w:line="240" w:lineRule="auto"/>
+              <w:spacing w:before="0" w:after="0"/>
               <w:ind/>
-              <w:jc w:val="both"/>
+              <w:jc w:val="left"/>
               <w:rPr>
                 <w:color w:val="000000"/>
               </w:rPr>
@@ -2507,12 +2329,18 @@
         </w:tc>
         <w:tc>
           <w:tcPr>
-            <w:tcW w:w="3487" w:type="dxa"/>
+            <w:tcW w:w="3915" w:type="dxa"/>
+            <w:tcMar>
+              <w:top w:w="0" w:type="dxa"/>
+              <w:left w:w="88" w:type="dxa"/>
+              <w:bottom w:w="0" w:type="dxa"/>
+              <w:right w:w="8" w:type="dxa"/>
+            </w:tcMar>
             <w:tcBorders>
-              <w:top w:val="nil"/>
-              <w:left w:val="nil"/>
-              <w:bottom w:val="nil"/>
-              <w:right w:val="nil"/>
+              <w:top w:val="single" w:color="FFFFFF" w:sz="8" w:space="0"/>
+              <w:left w:val="single" w:color="D9D9D9" w:sz="8" w:space="0"/>
+              <w:bottom w:val="single" w:color="FFFFFF" w:sz="8" w:space="0"/>
+              <w:right w:val="single" w:color="D9D9D9" w:sz="8" w:space="0"/>
             </w:tcBorders>
             <w:shd w:fill="D9D9D9" w:color="auto" w:val="clear"/>
             <w:vAlign w:val="center"/>
@@ -2521,38 +2349,10 @@
             <w:pPr>
               <w:pBdr/>
               <w:pStyle w:val="normal1"/>
-              <w:keepNext/>
-              <w:keepLines/>
-              <w:spacing w:before="0" w:beforeAutospacing="false" w:after="0" w:afterAutospacing="false" w:line="240" w:lineRule="auto"/>
-              <w:ind/>
-              <w:jc w:val="both"/>
-              <w:rPr>
-                <w:color w:val="000000"/>
-              </w:rPr>
-            </w:pPr>
-          </w:p>
-        </w:tc>
-        <w:tc>
-          <w:tcPr>
-            <w:tcW w:w="1295" w:type="dxa"/>
-            <w:tcBorders>
-              <w:top w:val="nil"/>
-              <w:left w:val="nil"/>
-              <w:bottom w:val="nil"/>
-              <w:right w:val="nil"/>
-            </w:tcBorders>
-            <w:shd w:fill="D9D9D9" w:color="auto" w:val="clear"/>
-            <w:vAlign w:val="center"/>
-          </w:tcPr>
-          <w:p>
-            <w:pPr>
-              <w:pBdr/>
-              <w:pStyle w:val="normal1"/>
-              <w:keepNext/>
-              <w:keepLines/>
-              <w:spacing w:before="0" w:beforeAutospacing="false" w:after="0" w:afterAutospacing="false" w:line="240" w:lineRule="auto"/>
-              <w:ind w:right="0"/>
-              <w:jc w:val="both"/>
+              <w:spacing w:before="0" w:beforeAutospacing="false" w:after="0" w:afterAutospacing="false" w:line="278" w:lineRule="auto"/>
+              <w:contextualSpacing/>
+              <w:ind w:left="0" w:right="314"/>
+              <w:jc w:val="right"/>
               <w:rPr>
                 <w:color w:val="000000"/>
               </w:rPr>
@@ -2565,7 +2365,7 @@
                 <w:sz w:val="22"/>
                 <w:szCs w:val="22"/>
               </w:rPr>
-              <w:t xml:space="preserve">3.715,66 €</w:t>
+              <w:t xml:space="preserve">3.882,58 €</w:t>
             </w:r>
             <w:r>
               <w:rPr>
@@ -2609,44 +2409,6 @@
           <w:color w:val="030303"/>
         </w:rPr>
         <w:t xml:space="preserve">Es handelt sich hierbei um ein Festpreisangebot für die oben definierten Leistungen.</w:t>
-      </w:r>
-    </w:p>
-    <w:p>
-      <w:pPr>
-        <w:pBdr/>
-        <w:pStyle w:val="normal1"/>
-        <w:spacing w:before="23" w:after="0"/>
-        <w:ind/>
-        <w:rPr>
-          <w:rFonts w:ascii="Open Sans" w:eastAsia="Open Sans" w:hAnsi="Open Sans" w:cs="Open Sans"/>
-          <w:color w:val="000000"/>
-        </w:rPr>
-      </w:pPr>
-    </w:p>
-    <w:p>
-      <w:pPr>
-        <w:pBdr/>
-        <w:pStyle w:val="normal1"/>
-        <w:spacing w:line="286" w:lineRule="auto"/>
-        <w:ind w:left="123"/>
-        <w:rPr>
-          <w:rFonts w:ascii="Open Sans" w:eastAsia="Open Sans" w:hAnsi="Open Sans" w:cs="Open Sans"/>
-          <w:color w:val="000000"/>
-        </w:rPr>
-      </w:pPr>
-      <w:r>
-        <w:rPr>
-          <w:rFonts w:ascii="Open Sans Semibold" w:eastAsia="Open Sans Semibold" w:hAnsi="Open Sans Semibold" w:cs="Open Sans Semibold"/>
-          <w:color w:val="030303"/>
-        </w:rPr>
-        <w:t xml:space="preserve">ACHTUNG:</w:t>
-      </w:r>
-      <w:r>
-        <w:rPr>
-          <w:rFonts w:ascii="Open Sans" w:eastAsia="Open Sans" w:hAnsi="Open Sans" w:cs="Open Sans"/>
-          <w:color w:val="030303"/>
-        </w:rPr>
-        <w:t xml:space="preserve"> Ob eine ebenerdige Montage der Duschwanne möglich ist, kann erst nach dem Ausbau der bestehenden Wanne beurteilen werden. Sollten dabei zusätzliche oder weitere Leistungen erforderlich oder von Ihnen gewünscht sein, können zusätzliche Kosten entstehen.</w:t>
       </w:r>
       <w:r>
         <w:rPr>
@@ -2954,7 +2716,6 @@
       <w:pgSz w:w="12240" w:h="15840"/>
       <w:pgMar w:top="1440" w:right="1440" w:bottom="1440" w:left="1440" w:header="0" w:footer="0" w:gutter="0"/>
       <w:pgNumType w:fmt="Arabic"/>
-      <w:pgNumType w:start="1"/>
       <w:pgBorders/>
       <w:endnotePr>
         <w:pos w:val="docEnd"/>
@@ -3203,7 +2964,7 @@
               <w:sz w:val="22"/>
               <w:szCs w:val="22"/>
             </w:rPr>
-            <w:t xml:space="preserve">2</w:t>
+            <w:t xml:space="preserve">3</w:t>
           </w:r>
           <w:r>
             <w:rPr>
@@ -3251,7 +3012,7 @@
               <w:sz w:val="22"/>
               <w:szCs w:val="22"/>
             </w:rPr>
-            <w:t xml:space="preserve">2</w:t>
+            <w:t xml:space="preserve">3</w:t>
           </w:r>
           <w:r>
             <w:rPr>
@@ -3269,7 +3030,7 @@
     <w:pPr>
       <w:pBdr/>
       <w:pStyle w:val="normal1"/>
-      <w:spacing w:before="240" w:after="0" w:line="14" w:lineRule="auto"/>
+      <w:spacing w:before="240" w:after="240" w:line="14" w:lineRule="auto"/>
       <w:ind/>
       <w:jc w:val="center"/>
       <w:rPr/>
@@ -3551,7 +3312,7 @@
     <w:pPr>
       <w:pBdr/>
       <w:pStyle w:val="normal1"/>
-      <w:spacing w:before="240" w:after="0" w:line="14" w:lineRule="auto"/>
+      <w:spacing w:before="240" w:after="240" w:line="14" w:lineRule="auto"/>
       <w:ind/>
       <w:jc w:val="center"/>
       <w:rPr/>
@@ -3621,7 +3382,16 @@
     <w:pPr>
       <w:pBdr/>
       <w:pStyle w:val="normal1"/>
-      <w:spacing w:before="120" w:after="0"/>
+      <w:spacing/>
+      <w:ind/>
+      <w:rPr/>
+    </w:pPr>
+  </w:p>
+  <w:p>
+    <w:pPr>
+      <w:pBdr/>
+      <w:pStyle w:val="normal1"/>
+      <w:spacing/>
       <w:ind w:left="7200"/>
       <w:rPr/>
     </w:pPr>
@@ -3695,7 +3465,16 @@
     <w:pPr>
       <w:pBdr/>
       <w:pStyle w:val="normal1"/>
-      <w:spacing w:before="120" w:after="0"/>
+      <w:spacing/>
+      <w:ind/>
+      <w:rPr/>
+    </w:pPr>
+  </w:p>
+  <w:p>
+    <w:pPr>
+      <w:pBdr/>
+      <w:pStyle w:val="normal1"/>
+      <w:spacing/>
       <w:ind w:left="7200"/>
       <w:rPr/>
     </w:pPr>
@@ -3915,6 +3694,18 @@
       <w:u w:val="single"/>
     </w:rPr>
   </w:style>
+  <w:style w:type="character" w:styleId="Numbering Symbols">
+    <w:name w:val="Numbering Symbols"/>
+    <w:basedOn w:val="Default Paragraph Font"/>
+    <w:rPr/>
+  </w:style>
+  <w:style w:type="character" w:styleId="Bullets">
+    <w:name w:val="Bullets"/>
+    <w:basedOn w:val="Default Paragraph Font"/>
+    <w:rPr>
+      <w:rFonts w:ascii="Arial Unicode MS" w:eastAsia="Arial Unicode MS" w:hAnsi="Arial Unicode MS" w:cs="Arial Unicode MS"/>
+    </w:rPr>
+  </w:style>
   <w:style w:type="paragraph" w:styleId="Heading">
     <w:name w:val="Heading"/>
     <w:basedOn w:val="Normal"/>
@@ -4053,6 +3844,33 @@
       <w:ind/>
     </w:pPr>
     <w:rPr/>
+  </w:style>
+  <w:style w:type="paragraph" w:styleId="Table Contents">
+    <w:name w:val="Table Contents"/>
+    <w:basedOn w:val="Normal"/>
+    <w:next w:val="Table Contents"/>
+    <w:pPr>
+      <w:pBdr/>
+      <w:spacing/>
+      <w:widowControl w:val="0"/>
+      <w:ind/>
+    </w:pPr>
+    <w:rPr/>
+  </w:style>
+  <w:style w:type="paragraph" w:styleId="Table Heading">
+    <w:name w:val="Table Heading"/>
+    <w:basedOn w:val="Table Contents"/>
+    <w:next w:val="Table Heading"/>
+    <w:pPr>
+      <w:pBdr/>
+      <w:spacing/>
+      <w:ind/>
+      <w:jc w:val="center"/>
+    </w:pPr>
+    <w:rPr>
+      <w:b/>
+      <w:bCs/>
+    </w:rPr>
   </w:style>
   <w:style w:type="table" w:styleId="Normal Table">
     <w:name w:val="Normal Table"/>

</xml_diff>

<commit_message>
not substracting aufshlag of haltigriffe if there is haltgriff rabatt
</commit_message>
<xml_diff>
--- a/out-Angebot.docx
+++ b/out-Angebot.docx
@@ -66,9 +66,9 @@
         <w:tblLayout w:type="fixed"/>
       </w:tblPr>
       <w:tblGrid>
-        <w:gridCol w:w="4805"/>
+        <w:gridCol w:w="4809"/>
         <w:gridCol w:w="2268"/>
-        <w:gridCol w:w="2962"/>
+        <w:gridCol w:w="2958"/>
       </w:tblGrid>
       <w:tr>
         <w:tblPrEx>
@@ -85,7 +85,7 @@
         </w:trPr>
         <w:tc>
           <w:tcPr>
-            <w:tcW w:w="4805" w:type="dxa"/>
+            <w:tcW w:w="4809" w:type="dxa"/>
             <w:tcBorders>
               <w:top w:val="single" w:color="FFFFFF" w:sz="8" w:space="0"/>
               <w:left w:val="single" w:color="FFFFFF" w:sz="8" w:space="0"/>
@@ -133,7 +133,7 @@
                 <w:sz w:val="22"/>
                 <w:szCs w:val="22"/>
               </w:rPr>
-              <w:t xml:space="preserve">Jason Vance</w:t>
+              <w:t xml:space="preserve">Richard Odonnell</w:t>
             </w:r>
           </w:p>
           <w:p>
@@ -154,7 +154,7 @@
                 <w:sz w:val="22"/>
                 <w:szCs w:val="22"/>
               </w:rPr>
-              <w:t xml:space="preserve">Incididunt aliquam a</w:t>
+              <w:t xml:space="preserve">Est dolore repellen</w:t>
             </w:r>
           </w:p>
           <w:p>
@@ -177,7 +177,7 @@
                 <w:sz w:val="22"/>
                 <w:szCs w:val="22"/>
               </w:rPr>
-              <w:t xml:space="preserve">Molestiae ut consequ In odio aperiam offi</w:t>
+              <w:t xml:space="preserve">Neque libero cumque  Enim dolore beatae i</w:t>
             </w:r>
           </w:p>
         </w:tc>
@@ -197,7 +197,7 @@
             <w:pPr>
               <w:pBdr/>
               <w:pStyle w:val="normal1"/>
-              <w:spacing w:before="0" w:after="0"/>
+              <w:spacing w:before="0" w:after="0" w:line="276" w:lineRule="auto"/>
               <w:ind w:right="127"/>
               <w:jc w:val="left"/>
               <w:rPr>
@@ -237,7 +237,7 @@
             <w:pPr>
               <w:pBdr/>
               <w:pStyle w:val="normal1"/>
-              <w:spacing w:before="0" w:after="0"/>
+              <w:spacing w:before="0" w:after="0" w:line="276" w:lineRule="auto"/>
               <w:ind w:right="127"/>
               <w:jc w:val="left"/>
               <w:rPr>
@@ -261,7 +261,7 @@
             <w:pPr>
               <w:pBdr/>
               <w:pStyle w:val="normal1"/>
-              <w:spacing w:before="0" w:after="0"/>
+              <w:spacing w:before="0" w:after="0" w:line="276" w:lineRule="auto"/>
               <w:ind w:right="127"/>
               <w:jc w:val="left"/>
               <w:rPr>
@@ -302,7 +302,7 @@
         </w:tc>
         <w:tc>
           <w:tcPr>
-            <w:tcW w:w="2962" w:type="dxa"/>
+            <w:tcW w:w="2958" w:type="dxa"/>
             <w:tcBorders>
               <w:top w:val="single" w:color="FFFFFF" w:sz="8" w:space="0"/>
               <w:left w:val="single" w:color="FFFFFF" w:sz="8" w:space="0"/>
@@ -316,7 +316,7 @@
             <w:pPr>
               <w:pBdr/>
               <w:pStyle w:val="normal1"/>
-              <w:spacing w:before="0" w:after="0"/>
+              <w:spacing w:before="0" w:after="0" w:line="276" w:lineRule="auto"/>
               <w:ind/>
               <w:jc w:val="right"/>
               <w:rPr>
@@ -329,7 +329,7 @@
                 <w:sz w:val="22"/>
                 <w:szCs w:val="22"/>
               </w:rPr>
-              <w:t xml:space="preserve">ANG2025-1127-104202</w:t>
+              <w:t xml:space="preserve">ANG2025-1128-081946</w:t>
             </w:r>
             <w:r>
               <w:rPr>
@@ -353,7 +353,7 @@
             <w:pPr>
               <w:pBdr/>
               <w:pStyle w:val="normal1"/>
-              <w:spacing w:before="0" w:after="0"/>
+              <w:spacing w:before="0" w:after="0" w:line="276" w:lineRule="auto"/>
               <w:ind/>
               <w:jc w:val="right"/>
               <w:rPr>
@@ -369,7 +369,7 @@
                 <w:sz w:val="22"/>
                 <w:szCs w:val="22"/>
               </w:rPr>
-              <w:t xml:space="preserve">03.09.2016</w:t>
+              <w:t xml:space="preserve">18.10.1988</w:t>
             </w:r>
             <w:r>
               <w:rPr>
@@ -403,7 +403,7 @@
                 <w:sz w:val="22"/>
                 <w:szCs w:val="22"/>
               </w:rPr>
-              <w:t xml:space="preserve">Lareina Patterson</w:t>
+              <w:t xml:space="preserve">Amal Keller</w:t>
             </w:r>
             <w:r>
               <w:rPr>
@@ -445,7 +445,7 @@
             <w:pPr>
               <w:pBdr/>
               <w:pStyle w:val="normal1"/>
-              <w:spacing w:before="0" w:after="0"/>
+              <w:spacing w:before="0" w:after="0" w:line="276" w:lineRule="auto"/>
               <w:ind/>
               <w:jc w:val="right"/>
               <w:rPr>
@@ -482,7 +482,7 @@
         </w:trPr>
         <w:tc>
           <w:tcPr>
-            <w:tcW w:w="4805" w:type="dxa"/>
+            <w:tcW w:w="4809" w:type="dxa"/>
             <w:tcBorders>
               <w:top w:val="single" w:color="FFFFFF" w:sz="8" w:space="0"/>
               <w:left w:val="single" w:color="FFFFFF" w:sz="8" w:space="0"/>
@@ -510,7 +510,7 @@
         </w:tc>
         <w:tc>
           <w:tcPr>
-            <w:tcW w:w="5230" w:type="dxa"/>
+            <w:tcW w:w="5226" w:type="dxa"/>
             <w:tcBorders>
               <w:top w:val="single" w:color="FFFFFF" w:sz="8" w:space="0"/>
               <w:left w:val="single" w:color="FFFFFF" w:sz="8" w:space="0"/>
@@ -561,7 +561,7 @@
                 <w:sz w:val="22"/>
                 <w:szCs w:val="22"/>
               </w:rPr>
-              <w:t xml:space="preserve">632</w:t>
+              <w:t xml:space="preserve">963</w:t>
             </w:r>
           </w:p>
         </w:tc>
@@ -601,7 +601,7 @@
           <w:sz w:val="24"/>
           <w:szCs w:val="24"/>
         </w:rPr>
-        <w:t xml:space="preserve">  Ihr Angebot ANG2025-1127-104202</w:t>
+        <w:t xml:space="preserve">  Ihr Angebot ANG2025-1128-081946</w:t>
       </w:r>
     </w:p>
     <w:p>
@@ -620,7 +620,7 @@
           <w:rFonts w:ascii="Open Sans" w:eastAsia="Open Sans" w:hAnsi="Open Sans" w:cs="Open Sans"/>
           <w:color w:val="000000"/>
         </w:rPr>
-        <w:t xml:space="preserve">  Sehr geehrte Frau Vance,</w:t>
+        <w:t xml:space="preserve">  Sehr geehrte Frau Odonnell,</w:t>
       </w:r>
       <w:r>
         <w:rPr>
@@ -685,34 +685,34 @@
     <w:tbl>
       <w:tblPr>
         <w:tblStyle w:val="TableNormal"/>
-        <w:tblW w:w="9660" w:type="dxa"/>
+        <w:tblW w:w="10035" w:type="dxa"/>
         <w:jc w:val="left"/>
         <w:tblInd w:w="1" w:type="dxa"/>
         <w:tblCellMar>
           <w:top w:w="0" w:type="dxa"/>
-          <w:left w:w="10" w:type="dxa"/>
+          <w:left w:w="0" w:type="dxa"/>
           <w:bottom w:w="0" w:type="dxa"/>
-          <w:right w:w="10" w:type="dxa"/>
+          <w:right w:w="0" w:type="dxa"/>
         </w:tblCellMar>
         <w:tblBorders/>
         <w:shd w:fill="auto" w:color="auto"/>
         <w:tblLayout w:type="fixed"/>
       </w:tblPr>
       <w:tblGrid>
-        <w:gridCol w:w="467"/>
-        <w:gridCol w:w="757"/>
-        <w:gridCol w:w="6094"/>
-        <w:gridCol w:w="1399"/>
-        <w:gridCol w:w="943"/>
+        <w:gridCol w:w="428"/>
+        <w:gridCol w:w="789"/>
+        <w:gridCol w:w="6331"/>
+        <w:gridCol w:w="1415"/>
+        <w:gridCol w:w="1072"/>
       </w:tblGrid>
       <w:tr>
         <w:tblPrEx>
           <w:tblBorders/>
           <w:tblCellMar>
             <w:top w:w="0" w:type="dxa"/>
-            <w:left w:w="10" w:type="dxa"/>
+            <w:left w:w="0" w:type="dxa"/>
             <w:bottom w:w="0" w:type="dxa"/>
-            <w:right w:w="10" w:type="dxa"/>
+            <w:right w:w="0" w:type="dxa"/>
           </w:tblCellMar>
         </w:tblPrEx>
         <w:trPr>
@@ -720,19 +720,8 @@
         </w:trPr>
         <w:tc>
           <w:tcPr>
-            <w:tcW w:w="467" w:type="dxa"/>
-            <w:tcMar>
-              <w:top w:w="0" w:type="dxa"/>
-              <w:left w:w="2" w:type="dxa"/>
-              <w:bottom w:w="0" w:type="dxa"/>
-              <w:right w:w="2" w:type="dxa"/>
-            </w:tcMar>
-            <w:tcBorders>
-              <w:top w:val="single" w:color="CCCCCC" w:sz="8" w:space="0"/>
-              <w:left w:val="single" w:color="CCCCCC" w:sz="8" w:space="0"/>
-              <w:bottom w:val="single" w:color="FFFFFF" w:sz="8" w:space="0"/>
-              <w:right w:val="single" w:color="CCCCCC" w:sz="8" w:space="0"/>
-            </w:tcBorders>
+            <w:tcW w:w="428" w:type="dxa"/>
+            <w:tcBorders/>
             <w:shd w:fill="CCCCCC" w:color="auto" w:val="clear"/>
             <w:vAlign w:val="top"/>
           </w:tcPr>
@@ -740,22 +729,20 @@
             <w:pPr>
               <w:pBdr/>
               <w:pStyle w:val="normal1"/>
-              <w:spacing w:before="0" w:after="0"/>
+              <w:spacing w:before="24" w:beforeAutospacing="false" w:after="24" w:afterAutospacing="false" w:line="240" w:lineRule="auto"/>
               <w:ind/>
-              <w:jc w:val="left"/>
+              <w:jc w:val="center"/>
               <w:rPr>
                 <w:rFonts w:ascii="Calibri" w:eastAsia="Calibri" w:hAnsi="Calibri" w:cs="Calibri"/>
-                <w:b/>
-                <w:sz w:val="20"/>
+                <w:sz w:val="22"/>
                 <w:szCs w:val="22"/>
               </w:rPr>
             </w:pPr>
             <w:r>
               <w:rPr>
                 <w:rFonts w:ascii="Open Sans" w:eastAsia="Open Sans" w:hAnsi="Open Sans" w:cs="Open Sans"/>
-                <w:b/>
                 <w:color w:val="070707"/>
-                <w:sz w:val="20"/>
+                <w:sz w:val="22"/>
                 <w:szCs w:val="22"/>
               </w:rPr>
               <w:t xml:space="preserve">Pos</w:t>
@@ -764,19 +751,8 @@
         </w:tc>
         <w:tc>
           <w:tcPr>
-            <w:tcW w:w="757" w:type="dxa"/>
-            <w:tcMar>
-              <w:top w:w="0" w:type="dxa"/>
-              <w:left w:w="2" w:type="dxa"/>
-              <w:bottom w:w="0" w:type="dxa"/>
-              <w:right w:w="2" w:type="dxa"/>
-            </w:tcMar>
-            <w:tcBorders>
-              <w:top w:val="single" w:color="CCCCCC" w:sz="8" w:space="0"/>
-              <w:left w:val="single" w:color="CCCCCC" w:sz="8" w:space="0"/>
-              <w:bottom w:val="single" w:color="FFFFFF" w:sz="8" w:space="0"/>
-              <w:right w:val="single" w:color="CCCCCC" w:sz="8" w:space="0"/>
-            </w:tcBorders>
+            <w:tcW w:w="789" w:type="dxa"/>
+            <w:tcBorders/>
             <w:shd w:fill="CCCCCC" w:color="auto" w:val="clear"/>
             <w:vAlign w:val="top"/>
           </w:tcPr>
@@ -784,22 +760,20 @@
             <w:pPr>
               <w:pBdr/>
               <w:pStyle w:val="normal1"/>
-              <w:spacing w:before="0" w:after="0"/>
+              <w:spacing w:before="24" w:beforeAutospacing="false" w:after="24" w:afterAutospacing="false" w:line="240" w:lineRule="auto"/>
               <w:ind/>
-              <w:jc w:val="left"/>
+              <w:jc w:val="center"/>
               <w:rPr>
                 <w:rFonts w:ascii="Calibri" w:eastAsia="Calibri" w:hAnsi="Calibri" w:cs="Calibri"/>
-                <w:b/>
-                <w:sz w:val="20"/>
+                <w:sz w:val="22"/>
                 <w:szCs w:val="22"/>
               </w:rPr>
             </w:pPr>
             <w:r>
               <w:rPr>
                 <w:rFonts w:ascii="Open Sans" w:eastAsia="Open Sans" w:hAnsi="Open Sans" w:cs="Open Sans"/>
-                <w:b/>
                 <w:color w:val="070707"/>
-                <w:sz w:val="20"/>
+                <w:sz w:val="22"/>
                 <w:szCs w:val="22"/>
               </w:rPr>
               <w:t xml:space="preserve">Menge</w:t>
@@ -808,19 +782,8 @@
         </w:tc>
         <w:tc>
           <w:tcPr>
-            <w:tcW w:w="6093" w:type="dxa"/>
-            <w:tcMar>
-              <w:top w:w="0" w:type="dxa"/>
-              <w:left w:w="2" w:type="dxa"/>
-              <w:bottom w:w="0" w:type="dxa"/>
-              <w:right w:w="2" w:type="dxa"/>
-            </w:tcMar>
-            <w:tcBorders>
-              <w:top w:val="single" w:color="CCCCCC" w:sz="8" w:space="0"/>
-              <w:left w:val="single" w:color="CCCCCC" w:sz="8" w:space="0"/>
-              <w:bottom w:val="single" w:color="FFFFFF" w:sz="8" w:space="0"/>
-              <w:right w:val="single" w:color="CCCCCC" w:sz="8" w:space="0"/>
-            </w:tcBorders>
+            <w:tcW w:w="6332" w:type="dxa"/>
+            <w:tcBorders/>
             <w:shd w:fill="CCCCCC" w:color="auto" w:val="clear"/>
             <w:vAlign w:val="top"/>
           </w:tcPr>
@@ -828,21 +791,18 @@
             <w:pPr>
               <w:pBdr/>
               <w:pStyle w:val="normal1"/>
-              <w:spacing w:before="0" w:after="0" w:line="278" w:lineRule="auto"/>
+              <w:spacing w:before="24" w:beforeAutospacing="false" w:after="24" w:afterAutospacing="false" w:line="240" w:lineRule="auto"/>
               <w:ind w:right="314"/>
-              <w:jc w:val="left"/>
-              <w:rPr>
-                <w:b/>
-                <w:color w:val="000000"/>
-                <w:sz w:val="20"/>
-              </w:rPr>
-            </w:pPr>
-            <w:r>
-              <w:rPr>
-                <w:rFonts w:ascii="Open Sans" w:eastAsia="Open Sans" w:hAnsi="Open Sans" w:cs="Open Sans"/>
-                <w:b/>
-                <w:color w:val="000000"/>
-                <w:sz w:val="20"/>
+              <w:jc w:val="both"/>
+              <w:rPr>
+                <w:color w:val="000000"/>
+              </w:rPr>
+            </w:pPr>
+            <w:r>
+              <w:rPr>
+                <w:rFonts w:ascii="Open Sans" w:eastAsia="Open Sans" w:hAnsi="Open Sans" w:cs="Open Sans"/>
+                <w:color w:val="000000"/>
+                <w:sz w:val="22"/>
                 <w:szCs w:val="22"/>
               </w:rPr>
               <w:t xml:space="preserve">Bezeichnung</w:t>
@@ -851,19 +811,8 @@
         </w:tc>
         <w:tc>
           <w:tcPr>
-            <w:tcW w:w="1399" w:type="dxa"/>
-            <w:tcMar>
-              <w:top w:w="0" w:type="dxa"/>
-              <w:left w:w="2" w:type="dxa"/>
-              <w:bottom w:w="0" w:type="dxa"/>
-              <w:right w:w="2" w:type="dxa"/>
-            </w:tcMar>
-            <w:tcBorders>
-              <w:top w:val="single" w:color="CCCCCC" w:sz="8" w:space="0"/>
-              <w:left w:val="single" w:color="CCCCCC" w:sz="8" w:space="0"/>
-              <w:bottom w:val="single" w:color="FFFFFF" w:sz="8" w:space="0"/>
-              <w:right w:val="single" w:color="CCCCCC" w:sz="8" w:space="0"/>
-            </w:tcBorders>
+            <w:tcW w:w="1415" w:type="dxa"/>
+            <w:tcBorders/>
             <w:shd w:fill="CCCCCC" w:color="auto" w:val="clear"/>
             <w:vAlign w:val="top"/>
           </w:tcPr>
@@ -871,21 +820,18 @@
             <w:pPr>
               <w:pBdr/>
               <w:pStyle w:val="normal1"/>
-              <w:spacing w:before="0" w:beforeAutospacing="false" w:after="0" w:afterAutospacing="false" w:line="278" w:lineRule="auto"/>
-              <w:ind w:left="-141" w:right="34"/>
+              <w:spacing w:before="24" w:beforeAutospacing="false" w:after="24" w:afterAutospacing="false" w:line="240" w:lineRule="auto"/>
+              <w:ind w:left="0" w:right="0"/>
               <w:jc w:val="center"/>
               <w:rPr>
-                <w:b/>
-                <w:color w:val="000000"/>
-                <w:sz w:val="20"/>
-              </w:rPr>
-            </w:pPr>
-            <w:r>
-              <w:rPr>
-                <w:rFonts w:ascii="Open Sans" w:eastAsia="Open Sans" w:hAnsi="Open Sans" w:cs="Open Sans"/>
-                <w:b/>
-                <w:color w:val="000000"/>
-                <w:sz w:val="20"/>
+                <w:color w:val="000000"/>
+              </w:rPr>
+            </w:pPr>
+            <w:r>
+              <w:rPr>
+                <w:rFonts w:ascii="Open Sans" w:eastAsia="Open Sans" w:hAnsi="Open Sans" w:cs="Open Sans"/>
+                <w:color w:val="000000"/>
+                <w:sz w:val="22"/>
                 <w:szCs w:val="22"/>
               </w:rPr>
               <w:t xml:space="preserve">Einheitspreis</w:t>
@@ -894,19 +840,8 @@
         </w:tc>
         <w:tc>
           <w:tcPr>
-            <w:tcW w:w="943" w:type="dxa"/>
-            <w:tcMar>
-              <w:top w:w="0" w:type="dxa"/>
-              <w:left w:w="2" w:type="dxa"/>
-              <w:bottom w:w="0" w:type="dxa"/>
-              <w:right w:w="2" w:type="dxa"/>
-            </w:tcMar>
-            <w:tcBorders>
-              <w:top w:val="single" w:color="CCCCCC" w:sz="8" w:space="0"/>
-              <w:left w:val="single" w:color="CCCCCC" w:sz="8" w:space="0"/>
-              <w:bottom w:val="single" w:color="FFFFFF" w:sz="8" w:space="0"/>
-              <w:right w:val="single" w:color="CCCCCC" w:sz="8" w:space="0"/>
-            </w:tcBorders>
+            <w:tcW w:w="1072" w:type="dxa"/>
+            <w:tcBorders/>
             <w:shd w:fill="CCCCCC" w:color="auto" w:val="clear"/>
             <w:vAlign w:val="top"/>
           </w:tcPr>
@@ -914,21 +849,18 @@
             <w:pPr>
               <w:pBdr/>
               <w:pStyle w:val="normal1"/>
-              <w:spacing w:before="0" w:beforeAutospacing="false" w:after="0" w:afterAutospacing="false" w:line="278" w:lineRule="auto"/>
-              <w:ind w:right="34"/>
-              <w:jc w:val="left"/>
-              <w:rPr>
-                <w:b/>
-                <w:color w:val="000000"/>
-                <w:sz w:val="20"/>
-              </w:rPr>
-            </w:pPr>
-            <w:r>
-              <w:rPr>
-                <w:rFonts w:ascii="Open Sans" w:eastAsia="Open Sans" w:hAnsi="Open Sans" w:cs="Open Sans"/>
-                <w:b/>
-                <w:color w:val="000000"/>
-                <w:sz w:val="20"/>
+              <w:spacing w:before="24" w:beforeAutospacing="false" w:after="24" w:afterAutospacing="false" w:line="240" w:lineRule="auto"/>
+              <w:ind w:left="0" w:right="0"/>
+              <w:jc w:val="center"/>
+              <w:rPr>
+                <w:color w:val="000000"/>
+              </w:rPr>
+            </w:pPr>
+            <w:r>
+              <w:rPr>
+                <w:rFonts w:ascii="Open Sans" w:eastAsia="Open Sans" w:hAnsi="Open Sans" w:cs="Open Sans"/>
+                <w:color w:val="000000"/>
+                <w:sz w:val="22"/>
                 <w:szCs w:val="22"/>
               </w:rPr>
               <w:t xml:space="preserve">Gesamt</w:t>
@@ -941,65 +873,22 @@
           <w:tblBorders/>
           <w:tblCellMar>
             <w:top w:w="0" w:type="dxa"/>
-            <w:left w:w="10" w:type="dxa"/>
+            <w:left w:w="0" w:type="dxa"/>
             <w:bottom w:w="0" w:type="dxa"/>
-            <w:right w:w="10" w:type="dxa"/>
+            <w:right w:w="0" w:type="dxa"/>
           </w:tblCellMar>
         </w:tblPrEx>
         <w:trPr>
-          <w:trHeight w:hRule="atLeast" w:val="1"/>
+          <w:trHeight w:hRule="atLeast" w:val="315"/>
         </w:trPr>
         <w:tc>
           <w:tcPr>
-            <w:tcW w:w="467" w:type="dxa"/>
+            <w:tcW w:w="428" w:type="dxa"/>
             <w:tcMar>
               <w:top w:w="0" w:type="dxa"/>
-              <w:left w:w="2" w:type="dxa"/>
+              <w:left w:w="0" w:type="dxa"/>
               <w:bottom w:w="0" w:type="dxa"/>
-              <w:right w:w="2" w:type="dxa"/>
-            </w:tcMar>
-            <w:tcBorders>
-              <w:top w:val="nil"/>
-              <w:left w:val="nil"/>
-              <w:bottom w:val="nil"/>
-              <w:right w:val="nil"/>
-              <w:insideH w:val="single" w:color="000000" w:sz="8" w:space="0"/>
-              <w:insideV w:val="single" w:color="000000" w:sz="8" w:space="0"/>
-            </w:tcBorders>
-            <w:shd w:fill="FFFFFF" w:color="auto" w:val="clear"/>
-            <w:vAlign w:val="top"/>
-          </w:tcPr>
-          <w:p>
-            <w:pPr>
-              <w:pBdr/>
-              <w:pStyle w:val="normal1"/>
-              <w:spacing w:before="0" w:after="0"/>
-              <w:ind/>
-              <w:jc w:val="left"/>
-              <w:rPr>
-                <w:rFonts w:ascii="Calibri" w:eastAsia="Calibri" w:hAnsi="Calibri" w:cs="Calibri"/>
-                <w:sz w:val="18"/>
-              </w:rPr>
-            </w:pPr>
-            <w:r>
-              <w:rPr>
-                <w:rFonts w:ascii="Calibri" w:eastAsia="Calibri" w:hAnsi="Calibri" w:cs="Calibri"/>
-                <w:color w:val="070707"/>
-                <w:sz w:val="18"/>
-                <w:szCs w:val="22"/>
-              </w:rPr>
-              <w:t xml:space="preserve">001</w:t>
-            </w:r>
-          </w:p>
-        </w:tc>
-        <w:tc>
-          <w:tcPr>
-            <w:tcW w:w="467" w:type="dxa"/>
-            <w:tcMar>
-              <w:top w:w="0" w:type="dxa"/>
-              <w:left w:w="2" w:type="dxa"/>
-              <w:bottom w:w="0" w:type="dxa"/>
-              <w:right w:w="2" w:type="dxa"/>
+              <w:right w:w="0" w:type="dxa"/>
             </w:tcMar>
             <w:tcBorders>
               <w:top w:val="nil"/>
@@ -1014,436 +903,34 @@
             <w:pPr>
               <w:pBdr/>
               <w:pStyle w:val="normal1"/>
-              <w:spacing w:before="0" w:after="0"/>
-              <w:ind/>
-              <w:jc w:val="left"/>
+              <w:spacing w:before="40" w:beforeAutospacing="false" w:after="0" w:afterAutospacing="false" w:line="240" w:lineRule="auto"/>
+              <w:ind w:right="0"/>
+              <w:jc w:val="center"/>
               <w:rPr>
                 <w:rFonts w:ascii="Calibri" w:eastAsia="Calibri" w:hAnsi="Calibri" w:cs="Calibri"/>
+                <w:sz w:val="18"/>
+                <w:szCs w:val="22"/>
+              </w:rPr>
+            </w:pPr>
+            <w:r>
+              <w:rPr>
+                <w:rFonts w:ascii="Open Sans" w:eastAsia="Open Sans" w:hAnsi="Open Sans" w:cs="Open Sans"/>
                 <w:color w:val="070707"/>
                 <w:sz w:val="18"/>
                 <w:szCs w:val="20"/>
               </w:rPr>
-            </w:pPr>
-            <w:r>
-              <w:rPr>
-                <w:rFonts w:ascii="Calibri" w:eastAsia="Calibri" w:hAnsi="Calibri" w:cs="Calibri"/>
-                <w:color w:val="070707"/>
-                <w:sz w:val="18"/>
-                <w:szCs w:val="20"/>
-              </w:rPr>
-              <w:t xml:space="preserve">1 Stk</w:t>
-            </w:r>
-          </w:p>
-        </w:tc>
-        <w:tc>
-          <w:tcPr>
-            <w:tcW w:w="467" w:type="dxa"/>
+              <w:t xml:space="preserve">001</w:t>
+            </w:r>
+          </w:p>
+        </w:tc>
+        <w:tc>
+          <w:tcPr>
+            <w:tcW w:w="789" w:type="dxa"/>
             <w:tcMar>
               <w:top w:w="0" w:type="dxa"/>
-              <w:left w:w="2" w:type="dxa"/>
+              <w:left w:w="0" w:type="dxa"/>
               <w:bottom w:w="0" w:type="dxa"/>
-              <w:right w:w="2" w:type="dxa"/>
-            </w:tcMar>
-            <w:tcBorders>
-              <w:top w:val="nil"/>
-              <w:left w:val="nil"/>
-              <w:bottom w:val="nil"/>
-              <w:right w:val="nil"/>
-              <w:insideH w:val="single" w:color="000000" w:sz="8" w:space="0"/>
-              <w:insideV w:val="single" w:color="000000" w:sz="8" w:space="0"/>
-            </w:tcBorders>
-            <w:shd w:fill="FFFFFF" w:color="auto" w:val="clear"/>
-            <w:vAlign w:val="top"/>
-          </w:tcPr>
-          <w:p>
-            <w:pPr>
-              <w:pBdr/>
-              <w:pStyle w:val="Body Text"/>
-              <w:spacing w:before="0" w:after="0" w:line="278" w:lineRule="auto"/>
-              <w:ind w:right="314"/>
-              <w:jc w:val="left"/>
-              <w:rPr>
-                <w:color w:val="000000"/>
-                <w:sz w:val="18"/>
-              </w:rPr>
-            </w:pPr>
-            <w:r>
-              <w:rPr>
-                <w:rFonts w:ascii="arial" w:eastAsia="arial" w:hAnsi="arial" w:cs="arial"/>
-                <w:b/>
-                <w:bCs/>
-                <w:color w:val="000000"/>
-                <w:sz w:val="20"/>
-                <w:szCs w:val="20"/>
-              </w:rPr>
-              <w:t xml:space="preserve">Liefern und Montieren einer Badewannentür</w:t>
-            </w:r>
-            <w:r>
-              <w:rPr>
-                <w:rFonts w:ascii="arial" w:eastAsia="arial" w:hAnsi="arial" w:cs="arial"/>
-                <w:b/>
-                <w:color w:val="000000"/>
-                <w:sz w:val="20"/>
-                <w:szCs w:val="20"/>
-              </w:rPr>
-              <w:br/>
-            </w:r>
-            <w:r>
-              <w:rPr>
-                <w:rFonts w:ascii="arial" w:eastAsia="arial" w:hAnsi="arial" w:cs="arial"/>
-                <w:b w:val="0"/>
-                <w:color w:val="000000"/>
-                <w:sz w:val="18"/>
-                <w:szCs w:val="20"/>
-              </w:rPr>
-              <w:t xml:space="preserve">• Liefern und Montieren einer Badewannentür (Universal/Standard) Höhe 40 cm, Breite 40,5 cm</w:t>
-            </w:r>
-            <w:r>
-              <w:rPr>
-                <w:rFonts w:ascii="arial" w:eastAsia="arial" w:hAnsi="arial" w:cs="arial"/>
-                <w:b w:val="0"/>
-                <w:color w:val="000000"/>
-                <w:sz w:val="18"/>
-                <w:szCs w:val="20"/>
-              </w:rPr>
-              <w:br/>
-            </w:r>
-            <w:r>
-              <w:rPr>
-                <w:rFonts w:ascii="arial" w:eastAsia="arial" w:hAnsi="arial" w:cs="arial"/>
-                <w:b w:val="0"/>
-                <w:color w:val="000000"/>
-                <w:sz w:val="18"/>
-                <w:szCs w:val="20"/>
-              </w:rPr>
-              <w:t xml:space="preserve">• inkl. dazugehörige Materialien</w:t>
-            </w:r>
-            <w:r>
-              <w:rPr>
-                <w:rFonts w:ascii="arial" w:eastAsia="arial" w:hAnsi="arial" w:cs="arial"/>
-                <w:b w:val="0"/>
-                <w:color w:val="000000"/>
-                <w:sz w:val="18"/>
-                <w:szCs w:val="20"/>
-              </w:rPr>
-              <w:br/>
-            </w:r>
-            <w:r>
-              <w:rPr>
-                <w:rFonts w:ascii="arial" w:eastAsia="arial" w:hAnsi="arial" w:cs="arial"/>
-                <w:b w:val="0"/>
-                <w:color w:val="000000"/>
-                <w:sz w:val="18"/>
-                <w:szCs w:val="20"/>
-              </w:rPr>
-              <w:t xml:space="preserve">• inkl. An- &amp; Abfahrten / Dieselzuschlag</w:t>
-            </w:r>
-            <w:r>
-              <w:rPr>
-                <w:rFonts w:ascii="arial" w:eastAsia="arial" w:hAnsi="arial" w:cs="arial"/>
-                <w:b w:val="0"/>
-                <w:color w:val="000000"/>
-                <w:sz w:val="18"/>
-                <w:szCs w:val="20"/>
-              </w:rPr>
-              <w:br/>
-            </w:r>
-            <w:r>
-              <w:rPr>
-                <w:rFonts w:ascii="arial" w:eastAsia="arial" w:hAnsi="arial" w:cs="arial"/>
-                <w:b w:val="0"/>
-                <w:color w:val="000000"/>
-                <w:sz w:val="18"/>
-                <w:szCs w:val="20"/>
-              </w:rPr>
-              <w:t xml:space="preserve">• inkl. Bereitstellung Maschinen / Werkzeug</w:t>
-            </w:r>
-            <w:r>
-              <w:rPr>
-                <w:rFonts w:ascii="arial" w:eastAsia="arial" w:hAnsi="arial" w:cs="arial"/>
-                <w:b w:val="0"/>
-                <w:color w:val="000000"/>
-                <w:sz w:val="18"/>
-                <w:szCs w:val="20"/>
-              </w:rPr>
-              <w:br/>
-            </w:r>
-            <w:r>
-              <w:rPr>
-                <w:rFonts w:ascii="arial" w:eastAsia="arial" w:hAnsi="arial" w:cs="arial"/>
-                <w:b w:val="0"/>
-                <w:color w:val="000000"/>
-                <w:sz w:val="18"/>
-                <w:szCs w:val="20"/>
-              </w:rPr>
-              <w:t xml:space="preserve">• inkl. Vorhaltung und Beräumung der Baustelle</w:t>
-            </w:r>
-            <w:r>
-              <w:rPr>
-                <w:rFonts w:ascii="arial" w:eastAsia="arial" w:hAnsi="arial" w:cs="arial"/>
-                <w:b w:val="0"/>
-                <w:color w:val="000000"/>
-                <w:sz w:val="18"/>
-                <w:szCs w:val="20"/>
-              </w:rPr>
-              <w:br/>
-            </w:r>
-            <w:r>
-              <w:rPr>
-                <w:rFonts w:ascii="arial" w:eastAsia="arial" w:hAnsi="arial" w:cs="arial"/>
-                <w:b w:val="0"/>
-                <w:color w:val="000000"/>
-                <w:sz w:val="18"/>
-                <w:szCs w:val="20"/>
-              </w:rPr>
-              <w:t xml:space="preserve">• inkl. Lieferkosten</w:t>
-            </w:r>
-          </w:p>
-          <w:p>
-            <w:pPr>
-              <w:pBdr/>
-              <w:pStyle w:val="Body Text"/>
-              <w:spacing w:before="0" w:after="0" w:line="278" w:lineRule="auto"/>
-              <w:ind w:right="314"/>
-              <w:jc w:val="left"/>
-              <w:rPr>
-                <w:color w:val="000000"/>
-                <w:sz w:val="18"/>
-              </w:rPr>
-            </w:pPr>
-            <w:r>
-              <w:rPr>
-                <w:rFonts w:ascii="arial" w:eastAsia="arial" w:hAnsi="arial" w:cs="arial"/>
-                <w:b w:val="0"/>
-                <w:color w:val="000000"/>
-                <w:sz w:val="18"/>
-                <w:szCs w:val="20"/>
-              </w:rPr>
-              <w:t xml:space="preserve">• Montage Haltegriff 60 cm</w:t>
-            </w:r>
-          </w:p>
-          <w:p>
-            <w:pPr>
-              <w:pBdr/>
-              <w:pStyle w:val="Body Text"/>
-              <w:spacing w:before="0" w:after="0" w:line="278" w:lineRule="auto"/>
-              <w:ind w:right="314"/>
-              <w:jc w:val="left"/>
-              <w:rPr>
-                <w:color w:val="000000"/>
-                <w:sz w:val="18"/>
-              </w:rPr>
-            </w:pPr>
-            <w:r>
-              <w:rPr>
-                <w:rFonts w:ascii="arial" w:eastAsia="arial" w:hAnsi="arial" w:cs="arial"/>
-                <w:b w:val="0"/>
-                <w:color w:val="000000"/>
-                <w:sz w:val="18"/>
-                <w:szCs w:val="20"/>
-              </w:rPr>
-              <w:t/>
-            </w:r>
-          </w:p>
-          <w:p>
-            <w:pPr>
-              <w:pBdr/>
-              <w:pStyle w:val="Body Text"/>
-              <w:spacing w:before="0" w:after="0" w:line="278" w:lineRule="auto"/>
-              <w:ind w:right="314"/>
-              <w:jc w:val="left"/>
-              <w:rPr>
-                <w:color w:val="000000"/>
-              </w:rPr>
-            </w:pPr>
-          </w:p>
-          <w:p>
-            <w:pPr>
-              <w:pBdr/>
-              <w:pStyle w:val="Body Text"/>
-              <w:spacing w:before="0" w:after="0" w:line="278" w:lineRule="auto"/>
-              <w:ind w:right="314"/>
-              <w:jc w:val="left"/>
-              <w:rPr>
-                <w:color w:val="000000"/>
-              </w:rPr>
-            </w:pPr>
-            <w:r>
-              <w:rPr>
-                <w:rFonts w:ascii="arial" w:eastAsia="arial" w:hAnsi="arial" w:cs="arial"/>
-                <w:b/>
-                <w:color w:val="000000"/>
-                <w:sz w:val="20"/>
-                <w:szCs w:val="20"/>
-              </w:rPr>
-              <w:t xml:space="preserve">Enthält je Einheit</w:t>
-            </w:r>
-          </w:p>
-          <w:p>
-            <w:pPr>
-              <w:pBdr/>
-              <w:pStyle w:val="Body Text"/>
-              <w:spacing w:before="0" w:after="0" w:line="278" w:lineRule="auto"/>
-              <w:ind w:right="314"/>
-              <w:jc w:val="left"/>
-              <w:rPr>
-                <w:rFonts w:ascii="arial" w:eastAsia="arial" w:hAnsi="arial" w:cs="arial"/>
-                <w:b w:val="0"/>
-                <w:color w:val="000000"/>
-                <w:sz w:val="18"/>
-                <w:szCs w:val="20"/>
-              </w:rPr>
-            </w:pPr>
-            <w:r>
-              <w:rPr>
-                <w:rFonts w:ascii="arial" w:eastAsia="arial" w:hAnsi="arial" w:cs="arial"/>
-                <w:b w:val="0"/>
-                <w:color w:val="000000"/>
-                <w:sz w:val="18"/>
-                <w:szCs w:val="20"/>
-              </w:rPr>
-              <w:t xml:space="preserve">- 44,00 km Kilometerpauschale</w:t>
-            </w:r>
-          </w:p>
-          <w:p>
-            <w:pPr>
-              <w:pBdr/>
-              <w:pStyle w:val="Body Text"/>
-              <w:spacing w:before="0" w:after="0" w:line="278" w:lineRule="auto"/>
-              <w:ind w:right="314"/>
-              <w:jc w:val="left"/>
-              <w:rPr>
-                <w:sz w:val="18"/>
-              </w:rPr>
-            </w:pPr>
-            <w:r>
-              <w:rPr>
-                <w:rFonts w:ascii="arial" w:eastAsia="arial" w:hAnsi="arial" w:cs="arial"/>
-                <w:b w:val="0"/>
-                <w:color w:val="000000"/>
-                <w:sz w:val="18"/>
-                <w:szCs w:val="20"/>
-              </w:rPr>
-              <w:t xml:space="preserve">- </w:t>
-            </w:r>
-            <w:r>
-              <w:rPr>
-                <w:sz w:val="18"/>
-              </w:rPr>
-              <w:t xml:space="preserve">1,00</w:t>
-            </w:r>
-            <w:r>
-              <w:rPr>
-                <w:rFonts w:ascii="arial" w:eastAsia="arial" w:hAnsi="arial" w:cs="arial"/>
-                <w:b w:val="0"/>
-                <w:color w:val="000000"/>
-                <w:sz w:val="18"/>
-                <w:szCs w:val="20"/>
-              </w:rPr>
-              <w:t xml:space="preserve"> Stk Lieferkosten Badewannentür</w:t>
-            </w:r>
-          </w:p>
-          <w:p>
-            <w:pPr>
-              <w:pBdr/>
-              <w:pStyle w:val="Body Text"/>
-              <w:spacing w:before="0" w:after="0" w:line="278" w:lineRule="auto"/>
-              <w:ind w:right="314"/>
-              <w:jc w:val="left"/>
-              <w:rPr>
-                <w:sz w:val="18"/>
-              </w:rPr>
-            </w:pPr>
-            <w:r>
-              <w:rPr>
-                <w:rFonts w:ascii="arial" w:eastAsia="arial" w:hAnsi="arial" w:cs="arial"/>
-                <w:b w:val="0"/>
-                <w:color w:val="000000"/>
-                <w:sz w:val="18"/>
-                <w:szCs w:val="20"/>
-              </w:rPr>
-              <w:t xml:space="preserve">- </w:t>
-            </w:r>
-            <w:r>
-              <w:rPr>
-                <w:sz w:val="18"/>
-              </w:rPr>
-              <w:t xml:space="preserve">1,00</w:t>
-            </w:r>
-            <w:r>
-              <w:rPr>
-                <w:rFonts w:ascii="arial" w:eastAsia="arial" w:hAnsi="arial" w:cs="arial"/>
-                <w:b w:val="0"/>
-                <w:color w:val="000000"/>
-                <w:sz w:val="18"/>
-                <w:szCs w:val="20"/>
-              </w:rPr>
-              <w:t xml:space="preserve"> Stk Universal / Standard Tür</w:t>
-            </w:r>
-          </w:p>
-          <w:p>
-            <w:pPr>
-              <w:pBdr/>
-              <w:pStyle w:val="Body Text"/>
-              <w:spacing w:before="0" w:after="0" w:line="278" w:lineRule="auto"/>
-              <w:ind w:right="314"/>
-              <w:jc w:val="left"/>
-              <w:rPr>
-                <w:sz w:val="18"/>
-              </w:rPr>
-            </w:pPr>
-            <w:r>
-              <w:rPr>
-                <w:rFonts w:ascii="arial" w:eastAsia="arial" w:hAnsi="arial" w:cs="arial"/>
-                <w:b w:val="0"/>
-                <w:color w:val="000000"/>
-                <w:sz w:val="18"/>
-                <w:szCs w:val="20"/>
-              </w:rPr>
-              <w:t xml:space="preserve">- </w:t>
-            </w:r>
-            <w:r>
-              <w:rPr>
-                <w:sz w:val="18"/>
-              </w:rPr>
-              <w:t xml:space="preserve">1,00</w:t>
-            </w:r>
-            <w:r>
-              <w:rPr>
-                <w:rFonts w:ascii="arial" w:eastAsia="arial" w:hAnsi="arial" w:cs="arial"/>
-                <w:b w:val="0"/>
-                <w:color w:val="000000"/>
-                <w:sz w:val="18"/>
-                <w:szCs w:val="20"/>
-              </w:rPr>
-              <w:t xml:space="preserve"> Stk Kleinmaterial</w:t>
-            </w:r>
-          </w:p>
-          <w:p>
-            <w:pPr>
-              <w:pBdr/>
-              <w:pStyle w:val="Body Text"/>
-              <w:spacing w:before="0" w:after="0" w:line="278" w:lineRule="auto"/>
-              <w:ind w:right="314"/>
-              <w:jc w:val="left"/>
-              <w:rPr>
-                <w:rFonts w:ascii="arial" w:eastAsia="arial" w:hAnsi="arial" w:cs="arial"/>
-                <w:b w:val="0"/>
-                <w:color w:val="000000"/>
-                <w:sz w:val="20"/>
-                <w:szCs w:val="20"/>
-              </w:rPr>
-            </w:pPr>
-          </w:p>
-        </w:tc>
-        <w:tc>
-          <w:tcPr>
-            <w:tcW w:w="467" w:type="dxa"/>
-            <w:tcMar>
-              <w:top w:w="0" w:type="dxa"/>
-              <w:left w:w="2" w:type="dxa"/>
-              <w:bottom w:w="0" w:type="dxa"/>
-              <w:right w:w="2" w:type="dxa"/>
+              <w:right w:w="0" w:type="dxa"/>
             </w:tcMar>
             <w:tcBorders>
               <w:top w:val="nil"/>
@@ -1458,34 +945,34 @@
             <w:pPr>
               <w:pBdr/>
               <w:pStyle w:val="normal1"/>
-              <w:spacing w:before="0" w:beforeAutospacing="false" w:after="0" w:afterAutospacing="false" w:line="278" w:lineRule="auto"/>
-              <w:ind w:right="34"/>
+              <w:spacing w:before="40" w:beforeAutospacing="false" w:after="0" w:afterAutospacing="false" w:line="240" w:lineRule="auto"/>
+              <w:ind w:right="0"/>
               <w:jc w:val="center"/>
               <w:rPr>
                 <w:rFonts w:ascii="Calibri" w:eastAsia="Calibri" w:hAnsi="Calibri" w:cs="Calibri"/>
-                <w:color w:val="000000"/>
                 <w:sz w:val="18"/>
-              </w:rPr>
-            </w:pPr>
-            <w:r>
-              <w:rPr>
-                <w:rFonts w:ascii="Calibri" w:eastAsia="Calibri" w:hAnsi="Calibri" w:cs="Calibri"/>
-                <w:color w:val="000000"/>
+                <w:szCs w:val="22"/>
+              </w:rPr>
+            </w:pPr>
+            <w:r>
+              <w:rPr>
+                <w:rFonts w:ascii="Open Sans" w:eastAsia="Open Sans" w:hAnsi="Open Sans" w:cs="Open Sans"/>
+                <w:color w:val="070707"/>
                 <w:sz w:val="18"/>
                 <w:szCs w:val="20"/>
               </w:rPr>
-              <w:t xml:space="preserve">3.189,67 €</w:t>
-            </w:r>
-          </w:p>
-        </w:tc>
-        <w:tc>
-          <w:tcPr>
-            <w:tcW w:w="467" w:type="dxa"/>
+              <w:t xml:space="preserve">1 Stk</w:t>
+            </w:r>
+          </w:p>
+        </w:tc>
+        <w:tc>
+          <w:tcPr>
+            <w:tcW w:w="6332" w:type="dxa"/>
             <w:tcMar>
               <w:top w:w="0" w:type="dxa"/>
-              <w:left w:w="2" w:type="dxa"/>
+              <w:left w:w="0" w:type="dxa"/>
               <w:bottom w:w="0" w:type="dxa"/>
-              <w:right w:w="2" w:type="dxa"/>
+              <w:right w:w="0" w:type="dxa"/>
             </w:tcMar>
             <w:tcBorders>
               <w:top w:val="nil"/>
@@ -1500,57 +987,34 @@
             <w:pPr>
               <w:pBdr/>
               <w:pStyle w:val="normal1"/>
-              <w:spacing w:before="0" w:beforeAutospacing="false" w:after="0" w:afterAutospacing="false" w:line="278" w:lineRule="auto"/>
-              <w:ind w:left="-141" w:right="34"/>
-              <w:jc w:val="center"/>
-              <w:rPr>
-                <w:rFonts w:ascii="Calibri" w:eastAsia="Calibri" w:hAnsi="Calibri" w:cs="Calibri"/>
+              <w:spacing w:before="40" w:beforeAutospacing="false" w:after="0" w:afterAutospacing="false" w:line="240" w:lineRule="auto"/>
+              <w:ind w:right="0"/>
+              <w:jc w:val="both"/>
+              <w:rPr>
                 <w:color w:val="000000"/>
                 <w:sz w:val="18"/>
               </w:rPr>
             </w:pPr>
             <w:r>
               <w:rPr>
-                <w:rFonts w:ascii="Calibri" w:eastAsia="Calibri" w:hAnsi="Calibri" w:cs="Calibri"/>
+                <w:rFonts w:ascii="arial" w:eastAsia="arial" w:hAnsi="arial" w:cs="arial"/>
+                <w:b/>
                 <w:color w:val="000000"/>
                 <w:sz w:val="18"/>
                 <w:szCs w:val="20"/>
               </w:rPr>
-              <w:t xml:space="preserve">3.189,67 €</w:t>
-            </w:r>
-            <w:r>
-              <w:rPr>
-                <w:rFonts w:ascii="Calibri" w:eastAsia="Calibri" w:hAnsi="Calibri" w:cs="Calibri"/>
-                <w:color w:val="000000"/>
-                <w:sz w:val="18"/>
-                <w:szCs w:val="20"/>
-              </w:rPr>
-              <w:t/>
-            </w:r>
-          </w:p>
-        </w:tc>
-      </w:tr>
-      <w:tr>
-        <w:tblPrEx>
-          <w:tblBorders/>
-          <w:tblCellMar>
-            <w:top w:w="0" w:type="dxa"/>
-            <w:left w:w="10" w:type="dxa"/>
-            <w:bottom w:w="0" w:type="dxa"/>
-            <w:right w:w="10" w:type="dxa"/>
-          </w:tblCellMar>
-        </w:tblPrEx>
-        <w:trPr>
-          <w:trHeight w:hRule="atLeast" w:val="1"/>
-        </w:trPr>
-        <w:tc>
-          <w:tcPr>
-            <w:tcW w:w="467" w:type="dxa"/>
+              <w:t xml:space="preserve">Auszuführende Arbeiten</w:t>
+            </w:r>
+          </w:p>
+        </w:tc>
+        <w:tc>
+          <w:tcPr>
+            <w:tcW w:w="1415" w:type="dxa"/>
             <w:tcMar>
               <w:top w:w="0" w:type="dxa"/>
-              <w:left w:w="2" w:type="dxa"/>
+              <w:left w:w="0" w:type="dxa"/>
               <w:bottom w:w="0" w:type="dxa"/>
-              <w:right w:w="2" w:type="dxa"/>
+              <w:right w:w="0" w:type="dxa"/>
             </w:tcMar>
             <w:tcBorders>
               <w:top w:val="nil"/>
@@ -1565,40 +1029,33 @@
             <w:pPr>
               <w:pBdr/>
               <w:pStyle w:val="normal1"/>
-              <w:spacing w:before="100" w:beforeAutospacing="true" w:after="0" w:afterAutospacing="false" w:line="240" w:lineRule="auto"/>
+              <w:spacing w:before="40" w:beforeAutospacing="false" w:after="0" w:afterAutospacing="false" w:line="240" w:lineRule="auto"/>
               <w:ind w:left="0" w:right="0"/>
-              <w:jc w:val="left"/>
-              <w:tabs>
-                <w:tab w:val="clear" w:pos="720"/>
-                <w:tab w:val="left" w:pos="750"/>
-                <w:tab w:val="left" w:pos="1416.0000610351562"/>
-              </w:tabs>
-              <w:rPr>
-                <w:rFonts w:ascii="Calibri" w:eastAsia="Calibri" w:hAnsi="Calibri" w:cs="Calibri"/>
-                <w:color w:val="070707"/>
-                <w:sz w:val="18"/>
-                <w:szCs w:val="20"/>
-              </w:rPr>
-            </w:pPr>
-            <w:r>
-              <w:rPr>
-                <w:rFonts w:ascii="Calibri" w:eastAsia="Calibri" w:hAnsi="Calibri" w:cs="Calibri"/>
-                <w:color w:val="070707"/>
-                <w:sz w:val="18"/>
-                <w:szCs w:val="20"/>
-              </w:rPr>
-              <w:t xml:space="preserve">002</w:t>
-            </w:r>
-          </w:p>
-        </w:tc>
-        <w:tc>
-          <w:tcPr>
-            <w:tcW w:w="467" w:type="dxa"/>
+              <w:jc w:val="center"/>
+              <w:rPr>
+                <w:rFonts w:ascii="Arial" w:eastAsia="Arial" w:hAnsi="Arial" w:cs="Arial"/>
+                <w:color w:val="000000"/>
+              </w:rPr>
+            </w:pPr>
+            <w:r>
+              <w:rPr>
+                <w:rFonts w:ascii="Arial" w:eastAsia="Arial" w:hAnsi="Arial" w:cs="Arial"/>
+                <w:color w:val="000000"/>
+                <w:sz w:val="20"/>
+                <w:szCs w:val="20"/>
+              </w:rPr>
+              <w:t xml:space="preserve">1.065,00 €</w:t>
+            </w:r>
+          </w:p>
+        </w:tc>
+        <w:tc>
+          <w:tcPr>
+            <w:tcW w:w="1072" w:type="dxa"/>
             <w:tcMar>
               <w:top w:w="0" w:type="dxa"/>
-              <w:left w:w="2" w:type="dxa"/>
+              <w:left w:w="0" w:type="dxa"/>
               <w:bottom w:w="0" w:type="dxa"/>
-              <w:right w:w="2" w:type="dxa"/>
+              <w:right w:w="0" w:type="dxa"/>
             </w:tcMar>
             <w:tcBorders>
               <w:top w:val="nil"/>
@@ -1613,31 +1070,47 @@
             <w:pPr>
               <w:pBdr/>
               <w:pStyle w:val="normal1"/>
-              <w:spacing w:before="100" w:beforeAutospacing="true" w:afterAutospacing="false" w:line="240" w:lineRule="auto"/>
+              <w:spacing w:before="40" w:beforeAutospacing="false" w:after="0" w:afterAutospacing="false" w:line="240" w:lineRule="auto"/>
               <w:ind w:left="0" w:right="0"/>
-              <w:jc w:val="left"/>
-              <w:rPr>
-                <w:rFonts w:ascii="Calibri" w:eastAsia="Calibri" w:hAnsi="Calibri" w:cs="Calibri"/>
-                <w:sz w:val="18"/>
-              </w:rPr>
-            </w:pPr>
-            <w:r>
-              <w:rPr>
-                <w:rFonts w:ascii="Calibri" w:eastAsia="Calibri" w:hAnsi="Calibri" w:cs="Calibri"/>
-                <w:sz w:val="18"/>
-              </w:rPr>
-              <w:t xml:space="preserve">1 Stk </w:t>
-            </w:r>
-          </w:p>
-        </w:tc>
-        <w:tc>
-          <w:tcPr>
-            <w:tcW w:w="467" w:type="dxa"/>
+              <w:jc w:val="center"/>
+              <w:rPr>
+                <w:rFonts w:ascii="Arial" w:eastAsia="Arial" w:hAnsi="Arial" w:cs="Arial"/>
+                <w:color w:val="000000"/>
+              </w:rPr>
+            </w:pPr>
+            <w:r>
+              <w:rPr>
+                <w:rFonts w:ascii="Arial" w:eastAsia="Arial" w:hAnsi="Arial" w:cs="Arial"/>
+                <w:color w:val="000000"/>
+                <w:sz w:val="20"/>
+                <w:szCs w:val="20"/>
+              </w:rPr>
+              <w:t xml:space="preserve">1.065,00 €</w:t>
+            </w:r>
+          </w:p>
+        </w:tc>
+      </w:tr>
+      <w:tr>
+        <w:tblPrEx>
+          <w:tblBorders/>
+          <w:tblCellMar>
+            <w:top w:w="0" w:type="dxa"/>
+            <w:left w:w="0" w:type="dxa"/>
+            <w:bottom w:w="0" w:type="dxa"/>
+            <w:right w:w="0" w:type="dxa"/>
+          </w:tblCellMar>
+        </w:tblPrEx>
+        <w:trPr>
+          <w:trHeight w:hRule="atLeast" w:val="1741"/>
+        </w:trPr>
+        <w:tc>
+          <w:tcPr>
+            <w:tcW w:w="428" w:type="dxa"/>
             <w:tcMar>
               <w:top w:w="0" w:type="dxa"/>
-              <w:left w:w="2" w:type="dxa"/>
+              <w:left w:w="56" w:type="dxa"/>
               <w:bottom w:w="0" w:type="dxa"/>
-              <w:right w:w="2" w:type="dxa"/>
+              <w:right w:w="56" w:type="dxa"/>
             </w:tcMar>
             <w:tcBorders>
               <w:top w:val="nil"/>
@@ -1651,65 +1124,46 @@
           <w:p>
             <w:pPr>
               <w:pBdr/>
-              <w:pStyle w:val="Body Text"/>
-              <w:spacing w:before="100" w:beforeAutospacing="true" w:after="0" w:afterAutospacing="false" w:line="240" w:lineRule="auto"/>
-              <w:widowControl w:val="0"/>
-              <w:ind w:left="0" w:right="0"/>
-              <w:jc w:val="left"/>
-              <w:rPr/>
-            </w:pPr>
-            <w:r>
-              <w:rPr>
-                <w:rFonts w:ascii="Open Sans" w:eastAsia="Open Sans" w:hAnsi="Open Sans" w:cs="Open Sans"/>
-                <w:b/>
-                <w:bCs/>
-                <w:color w:val="000000"/>
-                <w:sz w:val="18"/>
-                <w:szCs w:val="18"/>
-              </w:rPr>
-              <w:t xml:space="preserve">Haltegriff clivia plus 32/600mm m. Ros. Edelstahl glatt poliert,VIGOUR</w:t>
-            </w:r>
-            <w:r>
-              <w:rPr>
-                <w:rFonts w:ascii="arial" w:eastAsia="arial" w:hAnsi="arial" w:cs="arial"/>
-                <w:b/>
-                <w:bCs/>
-                <w:color w:val="000000"/>
+              <w:pStyle w:val="normal1"/>
+              <w:spacing w:before="121" w:after="0"/>
+              <w:ind/>
+              <w:jc w:val="center"/>
+              <w:tabs>
+                <w:tab w:val="clear" w:pos="720"/>
+                <w:tab w:val="left" w:pos="750"/>
+                <w:tab w:val="left" w:pos="1416.0000610351562"/>
+              </w:tabs>
+              <w:rPr>
+                <w:rFonts w:ascii="Open Sans" w:eastAsia="Open Sans" w:hAnsi="Open Sans" w:cs="Open Sans"/>
+                <w:color w:val="070707"/>
                 <w:sz w:val="20"/>
                 <w:szCs w:val="20"/>
               </w:rPr>
-              <w:t/>
-            </w:r>
-            <w:r>
-              <w:rPr>
-                <w:rFonts w:ascii="Open Sans" w:eastAsia="Open Sans" w:hAnsi="Open Sans" w:cs="Open Sans"/>
-                <w:b/>
-                <w:bCs/>
-                <w:color w:val="000000"/>
-                <w:sz w:val="18"/>
-                <w:szCs w:val="18"/>
-              </w:rPr>
-              <w:t/>
-            </w:r>
-            <w:r>
-              <w:rPr>
-                <w:rFonts w:ascii="Open Sans" w:eastAsia="Open Sans" w:hAnsi="Open Sans" w:cs="Open Sans"/>
-                <w:color w:val="000000"/>
-                <w:sz w:val="18"/>
-                <w:szCs w:val="18"/>
-              </w:rPr>
-              <w:t xml:space="preserve"> </w:t>
-            </w:r>
-          </w:p>
-        </w:tc>
-        <w:tc>
-          <w:tcPr>
-            <w:tcW w:w="467" w:type="dxa"/>
+            </w:pPr>
+          </w:p>
+          <w:p>
+            <w:pPr>
+              <w:pBdr/>
+              <w:pStyle w:val="normal1"/>
+              <w:spacing w:before="0" w:after="0"/>
+              <w:ind/>
+              <w:jc w:val="center"/>
+              <w:rPr>
+                <w:rFonts w:ascii="Calibri" w:eastAsia="Calibri" w:hAnsi="Calibri" w:cs="Calibri"/>
+                <w:sz w:val="22"/>
+                <w:szCs w:val="22"/>
+              </w:rPr>
+            </w:pPr>
+          </w:p>
+        </w:tc>
+        <w:tc>
+          <w:tcPr>
+            <w:tcW w:w="789" w:type="dxa"/>
             <w:tcMar>
               <w:top w:w="0" w:type="dxa"/>
-              <w:left w:w="2" w:type="dxa"/>
+              <w:left w:w="56" w:type="dxa"/>
               <w:bottom w:w="0" w:type="dxa"/>
-              <w:right w:w="2" w:type="dxa"/>
+              <w:right w:w="56" w:type="dxa"/>
             </w:tcMar>
             <w:tcBorders>
               <w:top w:val="nil"/>
@@ -1724,33 +1178,23 @@
             <w:pPr>
               <w:pBdr/>
               <w:pStyle w:val="normal1"/>
-              <w:spacing w:before="100" w:beforeAutospacing="true" w:after="0" w:afterAutospacing="false" w:line="240" w:lineRule="auto"/>
-              <w:ind w:left="0" w:right="0"/>
+              <w:spacing w:before="0" w:after="0"/>
+              <w:ind/>
               <w:jc w:val="center"/>
               <w:rPr>
-                <w:rFonts w:ascii="Calibri" w:eastAsia="Calibri" w:hAnsi="Calibri" w:cs="Calibri"/>
-                <w:color w:val="000000"/>
-                <w:sz w:val="18"/>
-              </w:rPr>
-            </w:pPr>
-            <w:r>
-              <w:rPr>
-                <w:rFonts w:ascii="Calibri" w:eastAsia="Calibri" w:hAnsi="Calibri" w:cs="Calibri"/>
-                <w:color w:val="000000"/>
-                <w:sz w:val="18"/>
-              </w:rPr>
-              <w:t xml:space="preserve">73,00 € </w:t>
-            </w:r>
-          </w:p>
-        </w:tc>
-        <w:tc>
-          <w:tcPr>
-            <w:tcW w:w="467" w:type="dxa"/>
+                <w:color w:val="000000"/>
+              </w:rPr>
+            </w:pPr>
+          </w:p>
+        </w:tc>
+        <w:tc>
+          <w:tcPr>
+            <w:tcW w:w="6332" w:type="dxa"/>
             <w:tcMar>
               <w:top w:w="0" w:type="dxa"/>
-              <w:left w:w="2" w:type="dxa"/>
+              <w:left w:w="56" w:type="dxa"/>
               <w:bottom w:w="0" w:type="dxa"/>
-              <w:right w:w="2" w:type="dxa"/>
+              <w:right w:w="56" w:type="dxa"/>
             </w:tcMar>
             <w:tcBorders>
               <w:top w:val="nil"/>
@@ -1765,31 +1209,169 @@
             <w:pPr>
               <w:pBdr/>
               <w:pStyle w:val="normal1"/>
-              <w:spacing w:before="100" w:beforeAutospacing="true" w:after="0" w:afterAutospacing="false" w:line="240" w:lineRule="auto"/>
-              <w:ind w:left="0" w:right="0"/>
+              <w:spacing w:before="0" w:beforeAutospacing="false" w:after="0" w:afterAutospacing="false" w:line="278" w:lineRule="auto"/>
+              <w:ind w:right="0"/>
+              <w:jc w:val="left"/>
+              <w:rPr>
+                <w:color w:val="000000"/>
+                <w:sz w:val="20"/>
+                <w:szCs w:val="20"/>
+              </w:rPr>
+            </w:pPr>
+          </w:p>
+          <w:p>
+            <w:pPr>
+              <w:pBdr/>
+              <w:pStyle w:val="normal1"/>
+              <w:spacing w:before="0" w:beforeAutospacing="false" w:after="0" w:afterAutospacing="false" w:line="278" w:lineRule="auto"/>
+              <w:ind w:right="0"/>
+              <w:jc w:val="left"/>
+              <w:rPr>
+                <w:color w:val="000000"/>
+                <w:sz w:val="20"/>
+                <w:szCs w:val="20"/>
+              </w:rPr>
+            </w:pPr>
+            <w:r>
+              <w:rPr>
+                <w:rFonts w:ascii="Open Sans" w:eastAsia="Open Sans" w:hAnsi="Open Sans" w:cs="Open Sans"/>
+                <w:color w:val="000000"/>
+                <w:sz w:val="20"/>
+                <w:szCs w:val="20"/>
+              </w:rPr>
+              <w:t xml:space="preserve">Enthält je Einheit</w:t>
+            </w:r>
+          </w:p>
+          <w:p>
+            <w:pPr>
+              <w:pBdr/>
+              <w:pStyle w:val="normal1"/>
+              <w:spacing w:before="0" w:beforeAutospacing="false" w:after="0" w:afterAutospacing="false" w:line="278" w:lineRule="auto"/>
+              <w:ind w:right="0"/>
+              <w:jc w:val="left"/>
+              <w:rPr>
+                <w:color w:val="000000"/>
+                <w:sz w:val="20"/>
+                <w:szCs w:val="20"/>
+              </w:rPr>
+            </w:pPr>
+            <w:r>
+              <w:rPr>
+                <w:rFonts w:ascii="Open Sans" w:eastAsia="Open Sans" w:hAnsi="Open Sans" w:cs="Open Sans"/>
+                <w:color w:val="000000"/>
+                <w:sz w:val="20"/>
+                <w:szCs w:val="20"/>
+              </w:rPr>
+              <w:t xml:space="preserve">- 1,00 Stk Fahrzeugbereitstellung</w:t>
+            </w:r>
+          </w:p>
+          <w:p>
+            <w:pPr>
+              <w:pBdr/>
+              <w:pStyle w:val="normal1"/>
+              <w:spacing w:before="0" w:beforeAutospacing="false" w:after="0" w:afterAutospacing="false" w:line="278" w:lineRule="auto"/>
+              <w:ind w:right="0"/>
+              <w:jc w:val="left"/>
+              <w:rPr>
+                <w:color w:val="000000"/>
+                <w:sz w:val="20"/>
+                <w:szCs w:val="20"/>
+              </w:rPr>
+            </w:pPr>
+            <w:r>
+              <w:rPr>
+                <w:rFonts w:ascii="Open Sans" w:eastAsia="Open Sans" w:hAnsi="Open Sans" w:cs="Open Sans"/>
+                <w:color w:val="000000"/>
+                <w:sz w:val="20"/>
+                <w:szCs w:val="20"/>
+              </w:rPr>
+              <w:t xml:space="preserve">- 1,00 Stk Bereitstellung und Vorhaltung von Maschinen &amp; Werkzeugen</w:t>
+            </w:r>
+          </w:p>
+          <w:p>
+            <w:pPr>
+              <w:pBdr/>
+              <w:pStyle w:val="normal1"/>
+              <w:spacing w:before="0" w:beforeAutospacing="false" w:after="0" w:afterAutospacing="false" w:line="278" w:lineRule="auto"/>
+              <w:ind w:right="0"/>
+              <w:jc w:val="left"/>
+              <w:rPr>
+                <w:color w:val="000000"/>
+                <w:sz w:val="20"/>
+                <w:szCs w:val="20"/>
+              </w:rPr>
+            </w:pPr>
+            <w:r>
+              <w:rPr>
+                <w:rFonts w:ascii="Open Sans" w:eastAsia="Open Sans" w:hAnsi="Open Sans" w:cs="Open Sans"/>
+                <w:color w:val="000000"/>
+                <w:sz w:val="20"/>
+                <w:szCs w:val="20"/>
+              </w:rPr>
+              <w:t xml:space="preserve">- 1,00 Stk Beräumung der Baustelle</w:t>
+            </w:r>
+          </w:p>
+        </w:tc>
+        <w:tc>
+          <w:tcPr>
+            <w:tcW w:w="1415" w:type="dxa"/>
+            <w:tcMar>
+              <w:top w:w="0" w:type="dxa"/>
+              <w:left w:w="56" w:type="dxa"/>
+              <w:bottom w:w="0" w:type="dxa"/>
+              <w:right w:w="56" w:type="dxa"/>
+            </w:tcMar>
+            <w:tcBorders>
+              <w:top w:val="nil"/>
+              <w:left w:val="nil"/>
+              <w:bottom w:val="nil"/>
+              <w:right w:val="nil"/>
+            </w:tcBorders>
+            <w:shd w:fill="FFFFFF" w:color="auto" w:val="clear"/>
+            <w:vAlign w:val="top"/>
+          </w:tcPr>
+          <w:p>
+            <w:pPr>
+              <w:pBdr/>
+              <w:pStyle w:val="normal1"/>
+              <w:spacing w:before="0" w:after="0" w:line="278" w:lineRule="auto"/>
+              <w:ind w:right="314"/>
               <w:jc w:val="center"/>
               <w:rPr>
-                <w:rFonts w:ascii="Calibri" w:eastAsia="Calibri" w:hAnsi="Calibri" w:cs="Calibri"/>
-                <w:color w:val="000000"/>
-                <w:sz w:val="18"/>
-              </w:rPr>
-            </w:pPr>
-            <w:r>
-              <w:rPr>
-                <w:rFonts w:ascii="Calibri" w:eastAsia="Calibri" w:hAnsi="Calibri" w:cs="Calibri"/>
-                <w:color w:val="000000"/>
-                <w:sz w:val="18"/>
-              </w:rPr>
-              <w:t xml:space="preserve">73,00 €</w:t>
-            </w:r>
-            <w:r>
-              <w:rPr>
-                <w:rFonts w:ascii="Calibri" w:eastAsia="Calibri" w:hAnsi="Calibri" w:cs="Calibri"/>
-                <w:color w:val="000000"/>
-                <w:sz w:val="18"/>
-              </w:rPr>
-              <w:t/>
-            </w:r>
+                <w:color w:val="000000"/>
+              </w:rPr>
+            </w:pPr>
+          </w:p>
+        </w:tc>
+        <w:tc>
+          <w:tcPr>
+            <w:tcW w:w="1072" w:type="dxa"/>
+            <w:tcMar>
+              <w:top w:w="0" w:type="dxa"/>
+              <w:left w:w="56" w:type="dxa"/>
+              <w:bottom w:w="0" w:type="dxa"/>
+              <w:right w:w="56" w:type="dxa"/>
+            </w:tcMar>
+            <w:tcBorders>
+              <w:top w:val="nil"/>
+              <w:left w:val="nil"/>
+              <w:bottom w:val="nil"/>
+              <w:right w:val="nil"/>
+            </w:tcBorders>
+            <w:shd w:fill="FFFFFF" w:color="auto" w:val="clear"/>
+            <w:vAlign w:val="center"/>
+          </w:tcPr>
+          <w:p>
+            <w:pPr>
+              <w:pBdr/>
+              <w:pStyle w:val="normal1"/>
+              <w:spacing w:before="0" w:after="0" w:line="278" w:lineRule="auto"/>
+              <w:ind w:right="314"/>
+              <w:jc w:val="center"/>
+              <w:rPr>
+                <w:color w:val="000000"/>
+              </w:rPr>
+            </w:pPr>
           </w:p>
         </w:tc>
       </w:tr>
@@ -1816,35 +1398,844 @@
     <w:tbl>
       <w:tblPr>
         <w:tblStyle w:val="TableNormal"/>
-        <w:tblW w:w="9660" w:type="dxa"/>
+        <w:tblW w:w="10050" w:type="dxa"/>
         <w:jc w:val="left"/>
         <w:tblInd w:w="1" w:type="dxa"/>
         <w:tblCellMar>
           <w:top w:w="0" w:type="dxa"/>
-          <w:left w:w="108" w:type="dxa"/>
+          <w:left w:w="56" w:type="dxa"/>
           <w:bottom w:w="0" w:type="dxa"/>
-          <w:right w:w="108" w:type="dxa"/>
+          <w:right w:w="56" w:type="dxa"/>
+        </w:tblCellMar>
+        <w:tblBorders/>
+        <w:shd w:fill="auto" w:color="auto"/>
+        <w:tblLayout w:type="fixed"/>
+      </w:tblPr>
+      <w:tblGrid>
+        <w:gridCol w:w="425"/>
+        <w:gridCol w:w="789"/>
+        <w:gridCol w:w="6342"/>
+        <w:gridCol w:w="1417"/>
+        <w:gridCol w:w="1077"/>
+      </w:tblGrid>
+      <w:tr>
+        <w:tblPrEx>
+          <w:tblBorders/>
+          <w:tblCellMar>
+            <w:top w:w="0" w:type="dxa"/>
+            <w:left w:w="56" w:type="dxa"/>
+            <w:bottom w:w="0" w:type="dxa"/>
+            <w:right w:w="56" w:type="dxa"/>
+          </w:tblCellMar>
+        </w:tblPrEx>
+        <w:trPr>
+          <w:trHeight w:hRule="atLeast" w:val="379"/>
+        </w:trPr>
+        <w:tc>
+          <w:tcPr>
+            <w:tcW w:w="425" w:type="dxa"/>
+            <w:tcBorders>
+              <w:top w:val="nil"/>
+              <w:left w:val="nil"/>
+              <w:bottom w:val="nil"/>
+              <w:right w:val="nil"/>
+            </w:tcBorders>
+            <w:shd w:fill="FFFFFF" w:color="auto" w:val="clear"/>
+            <w:vAlign w:val="top"/>
+          </w:tcPr>
+          <w:p>
+            <w:pPr>
+              <w:pBdr/>
+              <w:pStyle w:val="normal1"/>
+              <w:spacing w:before="10" w:beforeAutospacing="false" w:after="10" w:afterAutospacing="false" w:line="240" w:lineRule="auto"/>
+              <w:ind w:right="0"/>
+              <w:jc w:val="center"/>
+              <w:rPr>
+                <w:rFonts w:ascii="Calibri" w:eastAsia="Calibri" w:hAnsi="Calibri" w:cs="Calibri"/>
+                <w:sz w:val="18"/>
+                <w:szCs w:val="22"/>
+              </w:rPr>
+            </w:pPr>
+            <w:r>
+              <w:rPr>
+                <w:rFonts w:ascii="Open Sans" w:eastAsia="Open Sans" w:hAnsi="Open Sans" w:cs="Open Sans"/>
+                <w:color w:val="070707"/>
+                <w:sz w:val="18"/>
+                <w:szCs w:val="20"/>
+              </w:rPr>
+              <w:t xml:space="preserve">002</w:t>
+            </w:r>
+          </w:p>
+        </w:tc>
+        <w:tc>
+          <w:tcPr>
+            <w:tcW w:w="789" w:type="dxa"/>
+            <w:tcBorders>
+              <w:top w:val="nil"/>
+              <w:left w:val="nil"/>
+              <w:bottom w:val="nil"/>
+              <w:right w:val="nil"/>
+            </w:tcBorders>
+            <w:shd w:fill="FFFFFF" w:color="auto" w:val="clear"/>
+            <w:vAlign w:val="top"/>
+          </w:tcPr>
+          <w:p>
+            <w:pPr>
+              <w:pBdr/>
+              <w:pStyle w:val="normal1"/>
+              <w:spacing w:before="10" w:beforeAutospacing="false" w:after="10" w:afterAutospacing="false" w:line="240" w:lineRule="auto"/>
+              <w:ind w:right="0"/>
+              <w:jc w:val="center"/>
+              <w:rPr>
+                <w:rFonts w:ascii="Calibri" w:eastAsia="Calibri" w:hAnsi="Calibri" w:cs="Calibri"/>
+                <w:sz w:val="18"/>
+                <w:szCs w:val="22"/>
+              </w:rPr>
+            </w:pPr>
+            <w:r>
+              <w:rPr>
+                <w:rFonts w:ascii="Open Sans" w:eastAsia="Open Sans" w:hAnsi="Open Sans" w:cs="Open Sans"/>
+                <w:color w:val="070707"/>
+                <w:sz w:val="18"/>
+                <w:szCs w:val="20"/>
+              </w:rPr>
+              <w:t xml:space="preserve">1 Stk</w:t>
+            </w:r>
+          </w:p>
+        </w:tc>
+        <w:tc>
+          <w:tcPr>
+            <w:tcW w:w="6342" w:type="dxa"/>
+            <w:tcBorders>
+              <w:top w:val="nil"/>
+              <w:left w:val="nil"/>
+              <w:bottom w:val="nil"/>
+              <w:right w:val="nil"/>
+            </w:tcBorders>
+            <w:shd w:fill="FFFFFF" w:color="auto" w:val="clear"/>
+            <w:vAlign w:val="top"/>
+          </w:tcPr>
+          <w:p>
+            <w:pPr>
+              <w:pBdr/>
+              <w:pStyle w:val="normal1"/>
+              <w:spacing w:before="10" w:beforeAutospacing="false" w:after="10" w:afterAutospacing="false" w:line="240" w:lineRule="auto"/>
+              <w:ind w:right="0"/>
+              <w:jc w:val="both"/>
+              <w:tabs>
+                <w:tab w:val="left" w:pos="6739.6002197265625"/>
+                <w:tab w:val="left" w:pos="6907.60009765625"/>
+              </w:tabs>
+              <w:rPr>
+                <w:color w:val="000000"/>
+                <w:sz w:val="18"/>
+              </w:rPr>
+            </w:pPr>
+            <w:r>
+              <w:rPr>
+                <w:rFonts w:ascii="arial" w:eastAsia="arial" w:hAnsi="arial" w:cs="arial"/>
+                <w:b/>
+                <w:color w:val="000000"/>
+                <w:sz w:val="18"/>
+                <w:szCs w:val="20"/>
+              </w:rPr>
+              <w:t xml:space="preserve">Material für Badumbau</w:t>
+            </w:r>
+          </w:p>
+        </w:tc>
+        <w:tc>
+          <w:tcPr>
+            <w:tcW w:w="1417" w:type="dxa"/>
+            <w:tcBorders>
+              <w:top w:val="nil"/>
+              <w:left w:val="nil"/>
+              <w:bottom w:val="nil"/>
+              <w:right w:val="nil"/>
+            </w:tcBorders>
+            <w:shd w:fill="FFFFFF" w:color="auto" w:val="clear"/>
+            <w:vAlign w:val="top"/>
+          </w:tcPr>
+          <w:p>
+            <w:pPr>
+              <w:pBdr/>
+              <w:pStyle w:val="normal1"/>
+              <w:spacing w:before="10" w:beforeAutospacing="false" w:after="10" w:afterAutospacing="false" w:line="240" w:lineRule="auto"/>
+              <w:ind w:left="0" w:right="0"/>
+              <w:jc w:val="center"/>
+              <w:rPr>
+                <w:rFonts w:ascii="Arial" w:eastAsia="Arial" w:hAnsi="Arial" w:cs="Arial"/>
+                <w:color w:val="000000"/>
+                <w:sz w:val="20"/>
+              </w:rPr>
+            </w:pPr>
+            <w:r>
+              <w:rPr>
+                <w:rFonts w:ascii="Arial" w:eastAsia="Arial" w:hAnsi="Arial" w:cs="Arial"/>
+                <w:color w:val="000000"/>
+                <w:sz w:val="20"/>
+                <w:szCs w:val="20"/>
+              </w:rPr>
+              <w:t xml:space="preserve">585,43 €</w:t>
+            </w:r>
+          </w:p>
+        </w:tc>
+        <w:tc>
+          <w:tcPr>
+            <w:tcW w:w="1077" w:type="dxa"/>
+            <w:tcMar>
+              <w:top w:w="0" w:type="dxa"/>
+              <w:left w:w="0" w:type="dxa"/>
+              <w:bottom w:w="0" w:type="dxa"/>
+              <w:right w:w="0" w:type="dxa"/>
+            </w:tcMar>
+            <w:tcBorders>
+              <w:top w:val="nil"/>
+              <w:left w:val="nil"/>
+              <w:bottom w:val="nil"/>
+              <w:right w:val="nil"/>
+            </w:tcBorders>
+            <w:shd w:fill="FFFFFF" w:color="auto" w:val="clear"/>
+            <w:vAlign w:val="top"/>
+          </w:tcPr>
+          <w:p>
+            <w:pPr>
+              <w:pBdr/>
+              <w:pStyle w:val="normal1"/>
+              <w:spacing w:before="10" w:beforeAutospacing="false" w:after="10" w:afterAutospacing="false" w:line="240" w:lineRule="auto"/>
+              <w:ind w:right="0"/>
+              <w:jc w:val="center"/>
+              <w:rPr>
+                <w:rFonts w:ascii="Arial" w:eastAsia="Arial" w:hAnsi="Arial" w:cs="Arial"/>
+                <w:sz w:val="20"/>
+                <w:szCs w:val="22"/>
+              </w:rPr>
+            </w:pPr>
+            <w:r>
+              <w:rPr>
+                <w:rFonts w:ascii="Arial" w:eastAsia="Arial" w:hAnsi="Arial" w:cs="Arial"/>
+                <w:sz w:val="20"/>
+                <w:szCs w:val="22"/>
+              </w:rPr>
+              <w:t xml:space="preserve">585,43 €</w:t>
+            </w:r>
+          </w:p>
+        </w:tc>
+      </w:tr>
+      <w:tr>
+        <w:tblPrEx>
+          <w:tblBorders/>
+          <w:tblCellMar>
+            <w:top w:w="0" w:type="dxa"/>
+            <w:left w:w="56" w:type="dxa"/>
+            <w:bottom w:w="0" w:type="dxa"/>
+            <w:right w:w="56" w:type="dxa"/>
+          </w:tblCellMar>
+        </w:tblPrEx>
+        <w:trPr>
+          <w:trHeight w:hRule="atLeast" w:val="1"/>
+        </w:trPr>
+        <w:tc>
+          <w:tcPr>
+            <w:tcW w:w="425" w:type="dxa"/>
+            <w:tcBorders>
+              <w:top w:val="nil"/>
+              <w:left w:val="nil"/>
+              <w:bottom w:val="nil"/>
+              <w:right w:val="nil"/>
+            </w:tcBorders>
+            <w:shd w:fill="FFFFFF" w:color="auto" w:val="clear"/>
+            <w:vAlign w:val="top"/>
+          </w:tcPr>
+          <w:p>
+            <w:pPr>
+              <w:pBdr/>
+              <w:pStyle w:val="normal1"/>
+              <w:spacing w:before="0" w:after="0"/>
+              <w:ind/>
+              <w:jc w:val="center"/>
+              <w:rPr>
+                <w:color w:val="000000"/>
+              </w:rPr>
+            </w:pPr>
+          </w:p>
+        </w:tc>
+        <w:tc>
+          <w:tcPr>
+            <w:tcW w:w="789" w:type="dxa"/>
+            <w:tcBorders>
+              <w:top w:val="nil"/>
+              <w:left w:val="nil"/>
+              <w:bottom w:val="nil"/>
+              <w:right w:val="nil"/>
+            </w:tcBorders>
+            <w:shd w:fill="FFFFFF" w:color="auto" w:val="clear"/>
+            <w:vAlign w:val="top"/>
+          </w:tcPr>
+          <w:p>
+            <w:pPr>
+              <w:pBdr/>
+              <w:pStyle w:val="normal1"/>
+              <w:spacing w:before="0" w:after="0"/>
+              <w:ind/>
+              <w:jc w:val="center"/>
+              <w:rPr>
+                <w:color w:val="000000"/>
+              </w:rPr>
+            </w:pPr>
+          </w:p>
+        </w:tc>
+        <w:tc>
+          <w:tcPr>
+            <w:tcW w:w="6342" w:type="dxa"/>
+            <w:tcBorders>
+              <w:top w:val="nil"/>
+              <w:left w:val="nil"/>
+              <w:bottom w:val="nil"/>
+              <w:right w:val="nil"/>
+            </w:tcBorders>
+            <w:shd w:fill="FFFFFF" w:color="auto" w:val="clear"/>
+            <w:vAlign w:val="top"/>
+          </w:tcPr>
+          <w:p>
+            <w:pPr>
+              <w:pBdr/>
+              <w:pStyle w:val="normal1"/>
+              <w:spacing w:before="0" w:beforeAutospacing="false" w:after="0" w:afterAutospacing="false" w:line="278" w:lineRule="auto"/>
+              <w:ind w:right="0"/>
+              <w:jc w:val="left"/>
+              <w:rPr>
+                <w:rFonts w:ascii="Open Sans" w:eastAsia="Open Sans" w:hAnsi="Open Sans" w:cs="Open Sans"/>
+                <w:color w:val="000000"/>
+                <w:sz w:val="20"/>
+                <w:szCs w:val="20"/>
+              </w:rPr>
+            </w:pPr>
+            <w:r>
+              <w:rPr>
+                <w:rFonts w:ascii="Open Sans" w:eastAsia="Open Sans" w:hAnsi="Open Sans" w:cs="Open Sans"/>
+                <w:color w:val="000000"/>
+                <w:sz w:val="20"/>
+                <w:szCs w:val="20"/>
+              </w:rPr>
+              <w:t xml:space="preserve">- 1 Stk TRINNITY Wannenabdichtband-Set 3,4 m Nass-/Trockenanbindung entspr. DIN 18534</w:t>
+            </w:r>
+          </w:p>
+          <w:p>
+            <w:pPr>
+              <w:pBdr/>
+              <w:pStyle w:val="normal1"/>
+              <w:spacing w:before="0" w:beforeAutospacing="false" w:after="0" w:afterAutospacing="false" w:line="278" w:lineRule="auto"/>
+              <w:ind w:right="0"/>
+              <w:jc w:val="left"/>
+              <w:rPr>
+                <w:rFonts w:ascii="Open Sans" w:eastAsia="Open Sans" w:hAnsi="Open Sans" w:cs="Open Sans"/>
+                <w:color w:val="000000"/>
+                <w:sz w:val="20"/>
+                <w:szCs w:val="20"/>
+              </w:rPr>
+            </w:pPr>
+            <w:r>
+              <w:rPr>
+                <w:rFonts w:ascii="Open Sans" w:eastAsia="Open Sans" w:hAnsi="Open Sans" w:cs="Open Sans"/>
+                <w:color w:val="000000"/>
+                <w:sz w:val="20"/>
+                <w:szCs w:val="20"/>
+              </w:rPr>
+              <w:t xml:space="preserve">- 1 Stk Ablaufgarnitur Rohbauset m.Sifon BH60mm f.flache Duschw.m.90mm Ablauf TRINNITY</w:t>
+            </w:r>
+          </w:p>
+          <w:p>
+            <w:pPr>
+              <w:pBdr/>
+              <w:pStyle w:val="normal1"/>
+              <w:spacing w:before="0" w:beforeAutospacing="false" w:after="0" w:afterAutospacing="false" w:line="278" w:lineRule="auto"/>
+              <w:ind w:right="0"/>
+              <w:jc w:val="left"/>
+              <w:rPr>
+                <w:rFonts w:ascii="Open Sans" w:eastAsia="Open Sans" w:hAnsi="Open Sans" w:cs="Open Sans"/>
+                <w:color w:val="000000"/>
+                <w:sz w:val="20"/>
+                <w:szCs w:val="20"/>
+              </w:rPr>
+            </w:pPr>
+            <w:r>
+              <w:rPr>
+                <w:rFonts w:ascii="Open Sans" w:eastAsia="Open Sans" w:hAnsi="Open Sans" w:cs="Open Sans"/>
+                <w:color w:val="000000"/>
+                <w:sz w:val="20"/>
+                <w:szCs w:val="20"/>
+              </w:rPr>
+              <w:t xml:space="preserve">- 1 Stk Kleinmaterial</w:t>
+            </w:r>
+          </w:p>
+          <w:p>
+            <w:pPr>
+              <w:pBdr/>
+              <w:pStyle w:val="normal1"/>
+              <w:spacing w:before="0" w:beforeAutospacing="false" w:after="0" w:afterAutospacing="false" w:line="278" w:lineRule="auto"/>
+              <w:ind w:right="0"/>
+              <w:jc w:val="left"/>
+              <w:rPr>
+                <w:rFonts w:ascii="Open Sans" w:eastAsia="Open Sans" w:hAnsi="Open Sans" w:cs="Open Sans"/>
+                <w:color w:val="000000"/>
+                <w:sz w:val="20"/>
+                <w:szCs w:val="20"/>
+              </w:rPr>
+            </w:pPr>
+            <w:r>
+              <w:rPr>
+                <w:rFonts w:ascii="Open Sans" w:eastAsia="Open Sans" w:hAnsi="Open Sans" w:cs="Open Sans"/>
+                <w:color w:val="000000"/>
+                <w:sz w:val="20"/>
+                <w:szCs w:val="20"/>
+              </w:rPr>
+              <w:t xml:space="preserve">- 1 Stk Stelzlager höhenverstellar Set</w:t>
+            </w:r>
+          </w:p>
+          <w:p>
+            <w:pPr>
+              <w:pBdr/>
+              <w:pStyle w:val="normal1"/>
+              <w:spacing w:before="0" w:beforeAutospacing="false" w:after="0" w:afterAutospacing="false" w:line="278" w:lineRule="auto"/>
+              <w:ind w:right="0"/>
+              <w:jc w:val="left"/>
+              <w:rPr>
+                <w:rFonts w:ascii="Open Sans" w:eastAsia="Open Sans" w:hAnsi="Open Sans" w:cs="Open Sans"/>
+                <w:color w:val="000000"/>
+                <w:sz w:val="20"/>
+                <w:szCs w:val="20"/>
+              </w:rPr>
+            </w:pPr>
+            <w:r>
+              <w:rPr>
+                <w:rFonts w:ascii="Open Sans" w:eastAsia="Open Sans" w:hAnsi="Open Sans" w:cs="Open Sans"/>
+                <w:color w:val="000000"/>
+                <w:sz w:val="20"/>
+                <w:szCs w:val="20"/>
+              </w:rPr>
+              <w:t xml:space="preserve">- 1 Stk TRINNITY Wandabdichtung BASIS-Set 5 qm DW bis 100 x 100 / BW bis 180 x 80 cm</w:t>
+            </w:r>
+          </w:p>
+          <w:p>
+            <w:pPr>
+              <w:pBdr/>
+              <w:pStyle w:val="normal1"/>
+              <w:spacing w:before="0" w:beforeAutospacing="false" w:after="0" w:afterAutospacing="false" w:line="278" w:lineRule="auto"/>
+              <w:ind w:right="0"/>
+              <w:jc w:val="left"/>
+              <w:rPr>
+                <w:rFonts w:ascii="Open Sans" w:eastAsia="Open Sans" w:hAnsi="Open Sans" w:cs="Open Sans"/>
+                <w:color w:val="000000"/>
+                <w:sz w:val="20"/>
+                <w:szCs w:val="20"/>
+              </w:rPr>
+            </w:pPr>
+            <w:r>
+              <w:rPr>
+                <w:rFonts w:ascii="Open Sans" w:eastAsia="Open Sans" w:hAnsi="Open Sans" w:cs="Open Sans"/>
+                <w:color w:val="000000"/>
+                <w:sz w:val="20"/>
+                <w:szCs w:val="20"/>
+              </w:rPr>
+              <w:t xml:space="preserve">- 1 Pkg Flächenkleber (Wandverkleidung)</w:t>
+            </w:r>
+          </w:p>
+          <w:p>
+            <w:pPr>
+              <w:pBdr/>
+              <w:pStyle w:val="normal1"/>
+              <w:spacing w:before="0" w:beforeAutospacing="false" w:after="0" w:afterAutospacing="false" w:line="278" w:lineRule="auto"/>
+              <w:ind w:right="0"/>
+              <w:jc w:val="left"/>
+              <w:rPr>
+                <w:rFonts w:ascii="Open Sans" w:eastAsia="Open Sans" w:hAnsi="Open Sans" w:cs="Open Sans"/>
+                <w:color w:val="000000"/>
+                <w:sz w:val="20"/>
+                <w:szCs w:val="20"/>
+              </w:rPr>
+            </w:pPr>
+            <w:r>
+              <w:rPr>
+                <w:rFonts w:ascii="Open Sans" w:eastAsia="Open Sans" w:hAnsi="Open Sans" w:cs="Open Sans"/>
+                <w:color w:val="000000"/>
+                <w:sz w:val="20"/>
+                <w:szCs w:val="20"/>
+              </w:rPr>
+              <w:t xml:space="preserve">- 1 Stk Abschlussprofil 3.0 255 cm silber eloxiert VIGOUR</w:t>
+            </w:r>
+          </w:p>
+          <w:p>
+            <w:pPr>
+              <w:pBdr/>
+              <w:pStyle w:val="normal1"/>
+              <w:spacing w:before="0" w:beforeAutospacing="false" w:after="0" w:afterAutospacing="false" w:line="278" w:lineRule="auto"/>
+              <w:ind w:right="0"/>
+              <w:jc w:val="left"/>
+              <w:rPr>
+                <w:rFonts w:ascii="Open Sans" w:eastAsia="Open Sans" w:hAnsi="Open Sans" w:cs="Open Sans"/>
+                <w:color w:val="000000"/>
+                <w:sz w:val="20"/>
+                <w:szCs w:val="20"/>
+              </w:rPr>
+            </w:pPr>
+            <w:r>
+              <w:rPr>
+                <w:rFonts w:ascii="Open Sans" w:eastAsia="Open Sans" w:hAnsi="Open Sans" w:cs="Open Sans"/>
+                <w:color w:val="000000"/>
+                <w:sz w:val="20"/>
+                <w:szCs w:val="20"/>
+              </w:rPr>
+              <w:t xml:space="preserve">- 1 Stk CARE Sanitär Silikon Weiß 310ml</w:t>
+            </w:r>
+          </w:p>
+        </w:tc>
+        <w:tc>
+          <w:tcPr>
+            <w:tcW w:w="1417" w:type="dxa"/>
+            <w:tcBorders>
+              <w:top w:val="nil"/>
+              <w:left w:val="nil"/>
+              <w:bottom w:val="nil"/>
+              <w:right w:val="nil"/>
+            </w:tcBorders>
+            <w:shd w:fill="FFFFFF" w:color="auto" w:val="clear"/>
+            <w:vAlign w:val="top"/>
+          </w:tcPr>
+          <w:p>
+            <w:pPr>
+              <w:pBdr/>
+              <w:pStyle w:val="normal1"/>
+              <w:spacing w:before="0" w:after="0" w:line="278" w:lineRule="auto"/>
+              <w:ind w:right="314"/>
+              <w:jc w:val="center"/>
+              <w:rPr>
+                <w:color w:val="000000"/>
+              </w:rPr>
+            </w:pPr>
+          </w:p>
+        </w:tc>
+        <w:tc>
+          <w:tcPr>
+            <w:tcW w:w="1077" w:type="dxa"/>
+            <w:tcBorders>
+              <w:top w:val="nil"/>
+              <w:left w:val="nil"/>
+              <w:bottom w:val="nil"/>
+              <w:right w:val="nil"/>
+            </w:tcBorders>
+            <w:shd w:fill="FFFFFF" w:color="auto" w:val="clear"/>
+            <w:vAlign w:val="center"/>
+          </w:tcPr>
+          <w:p>
+            <w:pPr>
+              <w:pBdr/>
+              <w:pStyle w:val="normal1"/>
+              <w:spacing w:before="0" w:after="0" w:line="278" w:lineRule="auto"/>
+              <w:ind w:right="314"/>
+              <w:jc w:val="center"/>
+              <w:rPr>
+                <w:color w:val="000000"/>
+              </w:rPr>
+            </w:pPr>
+          </w:p>
+        </w:tc>
+      </w:tr>
+      <w:tr>
+        <w:tblPrEx>
+          <w:tblBorders/>
+          <w:tblCellMar>
+            <w:top w:w="0" w:type="dxa"/>
+            <w:left w:w="56" w:type="dxa"/>
+            <w:bottom w:w="0" w:type="dxa"/>
+            <w:right w:w="56" w:type="dxa"/>
+          </w:tblCellMar>
+        </w:tblPrEx>
+        <w:trPr>
+          <w:trHeight w:hRule="atLeast" w:val="1"/>
+        </w:trPr>
+        <w:tc>
+          <w:tcPr>
+            <w:tcW w:w="425" w:type="dxa"/>
+            <w:tcBorders>
+              <w:top w:val="nil"/>
+              <w:left w:val="nil"/>
+              <w:bottom w:val="nil"/>
+              <w:right w:val="nil"/>
+            </w:tcBorders>
+            <w:shd w:fill="FFFFFF" w:color="auto" w:val="clear"/>
+            <w:vAlign w:val="top"/>
+          </w:tcPr>
+          <w:p>
+            <w:pPr>
+              <w:pBdr/>
+              <w:pStyle w:val="normal1"/>
+              <w:spacing w:before="0" w:after="0" w:line="278" w:lineRule="auto"/>
+              <w:ind w:right="-26"/>
+              <w:jc w:val="center"/>
+              <w:rPr>
+                <w:color w:val="000000"/>
+                <w:sz w:val="18"/>
+              </w:rPr>
+            </w:pPr>
+            <w:r>
+              <w:rPr>
+                <w:rFonts w:ascii="Open Sans" w:eastAsia="Open Sans" w:hAnsi="Open Sans" w:cs="Open Sans"/>
+                <w:color w:val="000000"/>
+                <w:sz w:val="18"/>
+                <w:szCs w:val="20"/>
+              </w:rPr>
+              <w:t xml:space="preserve">003</w:t>
+            </w:r>
+          </w:p>
+        </w:tc>
+        <w:tc>
+          <w:tcPr>
+            <w:tcW w:w="789" w:type="dxa"/>
+            <w:tcBorders>
+              <w:top w:val="nil"/>
+              <w:left w:val="nil"/>
+              <w:bottom w:val="nil"/>
+              <w:right w:val="nil"/>
+            </w:tcBorders>
+            <w:shd w:fill="FFFFFF" w:color="auto" w:val="clear"/>
+            <w:vAlign w:val="top"/>
+          </w:tcPr>
+          <w:p>
+            <w:pPr>
+              <w:pBdr/>
+              <w:pStyle w:val="normal1"/>
+              <w:spacing w:before="0" w:beforeAutospacing="false" w:after="0" w:afterAutospacing="false" w:line="278" w:lineRule="auto"/>
+              <w:ind w:right="0"/>
+              <w:jc w:val="center"/>
+              <w:rPr>
+                <w:color w:val="000000"/>
+                <w:sz w:val="18"/>
+              </w:rPr>
+            </w:pPr>
+            <w:r>
+              <w:rPr>
+                <w:rFonts w:ascii="Open Sans" w:eastAsia="Open Sans" w:hAnsi="Open Sans" w:cs="Open Sans"/>
+                <w:color w:val="000000"/>
+                <w:sz w:val="18"/>
+                <w:szCs w:val="20"/>
+              </w:rPr>
+              <w:t xml:space="preserve">1 Stk</w:t>
+            </w:r>
+          </w:p>
+        </w:tc>
+        <w:tc>
+          <w:tcPr>
+            <w:tcW w:w="6342" w:type="dxa"/>
+            <w:tcBorders>
+              <w:top w:val="nil"/>
+              <w:left w:val="nil"/>
+              <w:bottom w:val="nil"/>
+              <w:right w:val="nil"/>
+            </w:tcBorders>
+            <w:shd w:fill="FFFFFF" w:color="auto" w:val="clear"/>
+            <w:vAlign w:val="top"/>
+          </w:tcPr>
+          <w:p>
+            <w:pPr>
+              <w:pBdr/>
+              <w:pStyle w:val="normal1"/>
+              <w:spacing w:before="0" w:beforeAutospacing="false" w:after="0" w:afterAutospacing="false" w:line="278" w:lineRule="auto"/>
+              <w:ind w:right="0"/>
+              <w:jc w:val="left"/>
+              <w:rPr>
+                <w:rFonts w:ascii="Open Sans" w:eastAsia="Open Sans" w:hAnsi="Open Sans" w:cs="Open Sans"/>
+                <w:b/>
+                <w:color w:val="000000"/>
+                <w:sz w:val="20"/>
+                <w:szCs w:val="20"/>
+              </w:rPr>
+            </w:pPr>
+            <w:r>
+              <w:rPr>
+                <w:rFonts w:ascii="Open Sans" w:eastAsia="Open Sans" w:hAnsi="Open Sans" w:cs="Open Sans"/>
+                <w:b/>
+                <w:color w:val="000000"/>
+                <w:sz w:val="20"/>
+                <w:szCs w:val="20"/>
+              </w:rPr>
+              <w:t xml:space="preserve">Aktion: Haltegriff</w:t>
+            </w:r>
+          </w:p>
+          <w:p>
+            <w:pPr>
+              <w:pBdr/>
+              <w:pStyle w:val="normal1"/>
+              <w:spacing w:before="0" w:beforeAutospacing="false" w:after="0" w:afterAutospacing="false" w:line="278" w:lineRule="auto"/>
+              <w:ind w:right="0"/>
+              <w:jc w:val="left"/>
+              <w:rPr>
+                <w:color w:val="000000"/>
+                <w:sz w:val="18"/>
+                <w:szCs w:val="18"/>
+              </w:rPr>
+            </w:pPr>
+            <w:r>
+              <w:rPr>
+                <w:rFonts w:ascii="Open Sans" w:eastAsia="Open Sans" w:hAnsi="Open Sans" w:cs="Open Sans"/>
+                <w:color w:val="000000"/>
+                <w:sz w:val="20"/>
+                <w:szCs w:val="20"/>
+              </w:rPr>
+              <w:t xml:space="preserve">1 Haltegriff gratis im Wert von 175 € inkl. Lieferung und Montage</w:t>
+            </w:r>
+          </w:p>
+        </w:tc>
+        <w:tc>
+          <w:tcPr>
+            <w:tcW w:w="1417" w:type="dxa"/>
+            <w:tcBorders>
+              <w:top w:val="nil"/>
+              <w:left w:val="nil"/>
+              <w:bottom w:val="nil"/>
+              <w:right w:val="nil"/>
+            </w:tcBorders>
+            <w:shd w:fill="FFFFFF" w:color="auto" w:val="clear"/>
+            <w:vAlign w:val="top"/>
+          </w:tcPr>
+          <w:p>
+            <w:pPr>
+              <w:pBdr/>
+              <w:pStyle w:val="normal1"/>
+              <w:spacing w:before="0" w:beforeAutospacing="false" w:after="0" w:afterAutospacing="false" w:line="278" w:lineRule="auto"/>
+              <w:ind w:right="0"/>
+              <w:jc w:val="center"/>
+              <w:rPr>
+                <w:rFonts w:ascii="Arial" w:eastAsia="Arial" w:hAnsi="Arial" w:cs="Arial"/>
+                <w:color w:val="000000"/>
+              </w:rPr>
+            </w:pPr>
+            <w:r>
+              <w:rPr>
+                <w:rFonts w:ascii="Arial" w:eastAsia="Arial" w:hAnsi="Arial" w:cs="Arial"/>
+                <w:color w:val="000000"/>
+                <w:sz w:val="20"/>
+                <w:szCs w:val="20"/>
+              </w:rPr>
+              <w:t xml:space="preserve">0,00 €</w:t>
+            </w:r>
+          </w:p>
+        </w:tc>
+        <w:tc>
+          <w:tcPr>
+            <w:tcW w:w="1077" w:type="dxa"/>
+            <w:tcBorders>
+              <w:top w:val="nil"/>
+              <w:left w:val="nil"/>
+              <w:bottom w:val="nil"/>
+              <w:right w:val="nil"/>
+            </w:tcBorders>
+            <w:shd w:fill="FFFFFF" w:color="auto" w:val="clear"/>
+            <w:vAlign w:val="top"/>
+          </w:tcPr>
+          <w:p>
+            <w:pPr>
+              <w:pBdr/>
+              <w:pStyle w:val="normal1"/>
+              <w:spacing w:before="0" w:beforeAutospacing="false" w:after="0" w:afterAutospacing="false" w:line="278" w:lineRule="auto"/>
+              <w:ind w:right="0"/>
+              <w:jc w:val="center"/>
+              <w:rPr>
+                <w:rFonts w:ascii="Arial" w:eastAsia="Arial" w:hAnsi="Arial" w:cs="Arial"/>
+                <w:color w:val="000000"/>
+              </w:rPr>
+            </w:pPr>
+            <w:r>
+              <w:rPr>
+                <w:rFonts w:ascii="Arial" w:eastAsia="Arial" w:hAnsi="Arial" w:cs="Arial"/>
+                <w:color w:val="000000"/>
+                <w:sz w:val="20"/>
+                <w:szCs w:val="20"/>
+              </w:rPr>
+              <w:t xml:space="preserve">0,00 €</w:t>
+            </w:r>
+            <w:r>
+              <w:rPr>
+                <w:rFonts w:ascii="Arial" w:eastAsia="Arial" w:hAnsi="Arial" w:cs="Arial"/>
+                <w:color w:val="000000"/>
+                <w:sz w:val="20"/>
+                <w:szCs w:val="20"/>
+              </w:rPr>
+              <w:t/>
+            </w:r>
+            <w:r>
+              <w:rPr>
+                <w:rFonts w:ascii="Arial" w:eastAsia="Arial" w:hAnsi="Arial" w:cs="Arial"/>
+                <w:color w:val="000000"/>
+                <w:sz w:val="20"/>
+                <w:szCs w:val="20"/>
+              </w:rPr>
+              <w:t/>
+            </w:r>
+          </w:p>
+        </w:tc>
+      </w:tr>
+    </w:tbl>
+    <w:p>
+      <w:pPr>
+        <w:pBdr/>
+        <w:pStyle w:val="normal1"/>
+        <w:spacing w:before="121" w:after="0"/>
+        <w:ind/>
+        <w:tabs>
+          <w:tab w:val="clear" w:pos="720"/>
+          <w:tab w:val="left" w:pos="750"/>
+          <w:tab w:val="left" w:pos="1416.0000610351562"/>
+        </w:tabs>
+        <w:rPr>
+          <w:rFonts w:ascii="Open Sans" w:eastAsia="Open Sans" w:hAnsi="Open Sans" w:cs="Open Sans"/>
+          <w:color w:val="070707"/>
+          <w:sz w:val="20"/>
+          <w:szCs w:val="20"/>
+        </w:rPr>
+      </w:pPr>
+    </w:p>
+    <w:tbl>
+      <w:tblPr>
+        <w:tblStyle w:val="TableNormal"/>
+        <w:tblDescription w:val=""/>
+        <w:tblCaption w:val=""/>
+        <w:tblW w:w="9549" w:type="dxa"/>
+        <w:jc w:val="right"/>
+        <w:tblInd w:w="0" w:type="dxa"/>
+        <w:tblCellMar>
+          <w:top w:w="0" w:type="dxa"/>
+          <w:left w:w="100" w:type="dxa"/>
+          <w:bottom w:w="0" w:type="dxa"/>
+          <w:right w:w="0" w:type="dxa"/>
         </w:tblCellMar>
         <w:tblBorders>
-          <w:top w:val="single" w:color="e57373" w:sz="8" w:space="0"/>
-          <w:left w:val="single" w:color="000000" w:sz="8" w:space="0"/>
-          <w:bottom w:val="single" w:color="e57373" w:sz="8" w:space="0"/>
-          <w:right w:val="single" w:color="e57373" w:sz="8" w:space="0"/>
-          <w:insideH w:val="single" w:color="000000" w:sz="8" w:space="0"/>
-          <w:insideV w:val="single" w:color="000000" w:sz="8" w:space="0"/>
+          <w:top w:val="nil"/>
+          <w:left w:val="nil"/>
+          <w:bottom w:val="nil"/>
+          <w:right w:val="nil"/>
+          <w:insideH w:val="nil"/>
+          <w:insideV w:val="nil"/>
         </w:tblBorders>
         <w:shd w:fill="auto" w:color="auto"/>
         <w:tblLayout w:type="fixed"/>
       </w:tblPr>
       <w:tblGrid>
-        <w:gridCol w:w="2415"/>
-        <w:gridCol w:w="2415"/>
-        <w:gridCol w:w="2415"/>
-        <w:gridCol w:w="2415"/>
+        <w:gridCol w:w="16"/>
+        <w:gridCol w:w="2371"/>
+        <w:gridCol w:w="2387"/>
+        <w:gridCol w:w="3482"/>
+        <w:gridCol w:w="1293"/>
       </w:tblGrid>
       <w:tr>
         <w:tblPrEx>
-          <w:tblBorders/>
+          <w:tblBorders>
+            <w:top w:val="nil"/>
+            <w:left w:val="nil"/>
+            <w:bottom w:val="nil"/>
+            <w:right w:val="nil"/>
+            <w:insideH w:val="nil"/>
+            <w:insideV w:val="nil"/>
+          </w:tblBorders>
           <w:tblCellMar>
             <w:top w:w="0" w:type="dxa"/>
             <w:left w:w="108" w:type="dxa"/>
@@ -1854,32 +2245,31 @@
         </w:tblPrEx>
         <w:trPr>
           <w:trHeight w:hRule="atLeast" w:val="20"/>
+          <w:gridBefore w:val="1"/>
+          <w:wBefore w:w="16" w:type="dxa"/>
+          <w:cantSplit/>
         </w:trPr>
         <w:tc>
           <w:tcPr>
-            <w:tcW w:w="3915" w:type="dxa"/>
-            <w:tcMar>
-              <w:top w:w="0" w:type="dxa"/>
-              <w:left w:w="88" w:type="dxa"/>
-              <w:bottom w:w="0" w:type="dxa"/>
-              <w:right w:w="8" w:type="dxa"/>
-            </w:tcMar>
+            <w:tcW w:w="2375" w:type="dxa"/>
             <w:tcBorders>
-              <w:top w:val="single" w:color="FFFFFF" w:sz="8" w:space="0"/>
-              <w:left w:val="single" w:color="D9D9D9" w:sz="8" w:space="0"/>
-              <w:bottom w:val="single" w:color="FFFFFF" w:sz="8" w:space="0"/>
-              <w:right w:val="single" w:color="D9D9D9" w:sz="8" w:space="0"/>
+              <w:top w:val="nil"/>
+              <w:left w:val="nil"/>
+              <w:bottom w:val="nil"/>
+              <w:right w:val="nil"/>
             </w:tcBorders>
             <w:shd w:fill="D9D9D9" w:color="auto" w:val="clear"/>
-            <w:vAlign w:val="top"/>
-          </w:tcPr>
-          <w:p>
-            <w:pPr>
-              <w:pBdr/>
-              <w:pStyle w:val="normal1"/>
-              <w:spacing w:before="0" w:after="0"/>
-              <w:ind w:left="0"/>
-              <w:jc w:val="left"/>
+            <w:vAlign w:val="center"/>
+          </w:tcPr>
+          <w:p>
+            <w:pPr>
+              <w:pBdr/>
+              <w:pStyle w:val="normal1"/>
+              <w:keepNext/>
+              <w:keepLines/>
+              <w:spacing w:before="0" w:beforeAutospacing="false" w:after="0" w:afterAutospacing="false" w:line="240" w:lineRule="auto"/>
+              <w:ind w:left="50" w:right="0"/>
+              <w:jc w:val="both"/>
               <w:rPr>
                 <w:rFonts w:ascii="Calibri" w:eastAsia="Calibri" w:hAnsi="Calibri" w:cs="Calibri"/>
                 <w:sz w:val="22"/>
@@ -1909,18 +2299,12 @@
         </w:tc>
         <w:tc>
           <w:tcPr>
-            <w:tcW w:w="3915" w:type="dxa"/>
-            <w:tcMar>
-              <w:top w:w="0" w:type="dxa"/>
-              <w:left w:w="88" w:type="dxa"/>
-              <w:bottom 